<commit_message>
Wave 5: reframe as AI/ML PhD; publication plan on 200-pt ITiT conferences only
- Venues verified in the 5.01.2024 ministerial list xlsx: NeurIPS, ICML, ICLR, CVPR, ICCV, ECCV, AAAI, IJCAI, RSS = 200 pts
- §11: NeurIPS 2027 (May 2027), ICML 2027 as early option
- §6: ML distribution-shift paragraph + 5 verified refs

Closes #11, closes #12

Co-Authored-By: Claude Opus 5.5 <noreply@anthropic.com>
</commit_message>
<xml_diff>
--- a/output/IPB_Grzegorz_Piotrowski.docx
+++ b/output/IPB_Grzegorz_Piotrowski.docx
@@ -1098,7 +1098,7 @@
           <w:rFonts w:cstheme="minorHAnsi"/>
           <w:lang w:val="en-US"/>
         </w:rPr>
-        <w:t xml:space="preserve"> Efektywne pod względem danych przenoszenie polityk nawigacji robotów mobilnych z symulacji do rzeczywistości z wykorzystaniem neuronowej rekonstrukcji scen (podejście real-to-sim-to-real)</w:t>
+        <w:t xml:space="preserve"> Efektywne pod względem danych uczenie maszynowe na podstawie neuronowych rekonstrukcji scen: zmniejszanie luki między symulacją a rzeczywistością dla polityk nawigacji wizyjnej przy ograniczonym budżecie danych rzeczywistych</w:t>
       </w:r>
       <w:bookmarkStart w:id="0" w:name="_Hlk95566638"/>
     </w:p>
@@ -1120,7 +1120,7 @@
           <w:rFonts w:cstheme="minorHAnsi"/>
           <w:lang w:val="en-US"/>
         </w:rPr>
-        <w:t xml:space="preserve"> Data-efficient sim-to-real transfer of mobile-robot navigation policies using real-to-sim-to-real neural scene reconstruction</w:t>
+        <w:t xml:space="preserve"> Data-efficient machine learning from neural scene reconstructions: closing the simulation-to-reality gap for visual navigation policies under a limited real-data budget</w:t>
       </w:r>
     </w:p>
     <w:bookmarkEnd w:id="0"/>
@@ -1862,7 +1862,7 @@
                 <w:rFonts w:cstheme="minorHAnsi"/>
                 <w:lang w:val="en-US"/>
               </w:rPr>
-              <w:t xml:space="preserve"> Literature review: sim-to-real transfer, domain randomization, neural scene reconstruction (NeRF, 3D Gaussian Splatting), learning-based navigation. </w:t>
+              <w:t xml:space="preserve"> Literature review: sim-to-real transfer and domain randomization, learning from synthetic data, representation learning under distribution shift, neural scene reconstruction (NeRF, 3D Gaussian Splatting), learning-based navigation. </w:t>
             </w:r>
             <w:r>
               <w:rPr>
@@ -1961,7 +1961,7 @@
                 <w:rFonts w:cstheme="minorHAnsi"/>
                 <w:lang w:val="en-US"/>
               </w:rPr>
-              <w:t xml:space="preserve"> Research questions, hypotheses and methods; survey of reconstruction and simulation tools (candidates in §9). </w:t>
+              <w:t xml:space="preserve"> Research questions, hypotheses and methods; survey of public benchmarks, datasets, simulators and reconstruction tools (candidates in §9). </w:t>
             </w:r>
             <w:r>
               <w:rPr>
@@ -2053,7 +2053,7 @@
                 <w:b/>
                 <w:lang w:val="en-US"/>
               </w:rPr>
-              <w:t xml:space="preserve">Stage I – real-to-sim pipeline (RQ1, H1).</w:t>
+              <w:t xml:space="preserve">Stage I – learning from reconstructions (RQ1).</w:t>
             </w:r>
           </w:p>
           <w:p>
@@ -2074,7 +2074,7 @@
                 <w:rFonts w:cstheme="minorHAnsi"/>
                 <w:lang w:val="en-US"/>
               </w:rPr>
-              <w:t xml:space="preserve"> Tool selection (simulator, reconstruction method) and capture-to-simulator pipeline (SfM + 3DGS + collision mesh); fidelity validation on ≥ 2 indoor scenes; first policies trained in reconstructed vs. generic scenes (simulation only). </w:t>
+              <w:t xml:space="preserve"> Choice of benchmark scenes, simulator and reconstruction method; pipeline from real video to a trainable scene (camera poses, 3D Gaussian Splatting, collision mesh); fidelity report on ≥ 10 public scenes; pre-registration of the evaluation protocol (§7). </w:t>
             </w:r>
             <w:r>
               <w:rPr>
@@ -2089,97 +2089,7 @@
                 <w:rFonts w:cstheme="minorHAnsi"/>
                 <w:lang w:val="en-US"/>
               </w:rPr>
-              <w:t xml:space="preserve"> tool-selection note, pipeline code, fidelity report (PSNR/SSIM/LPIPS, geometric error). Place: K46, WCSS. </w:t>
-            </w:r>
-            <w:r>
-              <w:rPr>
-                <w:rFonts w:cstheme="minorHAnsi"/>
-                <w:b/>
-                <w:lang w:val="en-US"/>
-              </w:rPr>
-              <w:t xml:space="preserve">T3.2a</w:t>
-            </w:r>
-            <w:r>
-              <w:rPr>
-                <w:rFonts w:cstheme="minorHAnsi"/>
-                <w:lang w:val="en-US"/>
-              </w:rPr>
-              <w:t xml:space="preserve"> Test stand: written agreement on robot access (planned cooperation with the K29 Denali laboratory, or another PWr platform) and sensor decision (SzD Minigrant application if a sensor must be bought). </w:t>
-            </w:r>
-            <w:r>
-              <w:rPr>
-                <w:rFonts w:cstheme="minorHAnsi"/>
-                <w:i/>
-                <w:lang w:val="en-US"/>
-              </w:rPr>
-              <w:t xml:space="preserve">D:</w:t>
-            </w:r>
-            <w:r>
-              <w:rPr>
-                <w:rFonts w:cstheme="minorHAnsi"/>
-                <w:lang w:val="en-US"/>
-              </w:rPr>
-              <w:t xml:space="preserve"> agreement, </w:t>
-            </w:r>
-            <w:r>
-              <w:rPr>
-                <w:rFonts w:cstheme="minorHAnsi"/>
-                <w:b/>
-                <w:lang w:val="en-US"/>
-              </w:rPr>
-              <w:t xml:space="preserve">by Nov 2026</w:t>
-            </w:r>
-            <w:r>
-              <w:rPr>
-                <w:rFonts w:cstheme="minorHAnsi"/>
-                <w:lang w:val="en-US"/>
-              </w:rPr>
-              <w:t xml:space="preserve">. </w:t>
-            </w:r>
-            <w:r>
-              <w:rPr>
-                <w:rFonts w:cstheme="minorHAnsi"/>
-                <w:b/>
-                <w:lang w:val="en-US"/>
-              </w:rPr>
-              <w:t xml:space="preserve">T3.2b</w:t>
-            </w:r>
-            <w:r>
-              <w:rPr>
-                <w:rFonts w:cstheme="minorHAnsi"/>
-                <w:lang w:val="en-US"/>
-              </w:rPr>
-              <w:t xml:space="preserve"> Pilot deployment of a policy trained in one reconstructed scene; ROS 2 logging. </w:t>
-            </w:r>
-            <w:r>
-              <w:rPr>
-                <w:rFonts w:cstheme="minorHAnsi"/>
-                <w:i/>
-                <w:lang w:val="en-US"/>
-              </w:rPr>
-              <w:t xml:space="preserve">D:</w:t>
-            </w:r>
-            <w:r>
-              <w:rPr>
-                <w:rFonts w:cstheme="minorHAnsi"/>
-                <w:lang w:val="en-US"/>
-              </w:rPr>
-              <w:t xml:space="preserve"> pilot results. Place: Denali. </w:t>
-            </w:r>
-            <w:r>
-              <w:rPr>
-                <w:rFonts w:cstheme="minorHAnsi"/>
-                <w:i/>
-                <w:lang w:val="en-US"/>
-              </w:rPr>
-              <w:t xml:space="preserve">Decision point:</w:t>
-            </w:r>
-            <w:r>
-              <w:rPr>
-                <w:rFonts w:cstheme="minorHAnsi"/>
-                <w:lang w:val="en-US"/>
-              </w:rPr>
-              <w:t xml:space="preserve"> without robot access by end of Jan 2027, the pilot moves to the start of sem. 4 and Stage I is also evaluated offline on public real-world navigation datasets.</w:t>
+              <w:t xml:space="preserve"> code, fidelity report, protocol in the repository. Place: K46, WCSS.</w:t>
             </w:r>
           </w:p>
           <w:p>
@@ -2193,6 +2103,57 @@
                 <w:b/>
                 <w:lang w:val="en-US"/>
               </w:rPr>
+              <w:t xml:space="preserve">T3.2</w:t>
+            </w:r>
+            <w:r>
+              <w:rPr>
+                <w:rFonts w:cstheme="minorHAnsi"/>
+                <w:lang w:val="en-US"/>
+              </w:rPr>
+              <w:t xml:space="preserve"> Validation stand: written agreement on robot access (planned cooperation with the K29 Denali laboratory, or another PWr platform) and sensor decision (SzD Minigrant application if a sensor must be bought). </w:t>
+            </w:r>
+            <w:r>
+              <w:rPr>
+                <w:rFonts w:cstheme="minorHAnsi"/>
+                <w:i/>
+                <w:lang w:val="en-US"/>
+              </w:rPr>
+              <w:t xml:space="preserve">D:</w:t>
+            </w:r>
+            <w:r>
+              <w:rPr>
+                <w:rFonts w:cstheme="minorHAnsi"/>
+                <w:lang w:val="en-US"/>
+              </w:rPr>
+              <w:t xml:space="preserve"> agreement, </w:t>
+            </w:r>
+            <w:r>
+              <w:rPr>
+                <w:rFonts w:cstheme="minorHAnsi"/>
+                <w:b/>
+                <w:lang w:val="en-US"/>
+              </w:rPr>
+              <w:t xml:space="preserve">by Nov 2026</w:t>
+            </w:r>
+            <w:r>
+              <w:rPr>
+                <w:rFonts w:cstheme="minorHAnsi"/>
+                <w:lang w:val="en-US"/>
+              </w:rPr>
+              <w:t xml:space="preserve">.</w:t>
+            </w:r>
+          </w:p>
+          <w:p>
+            <w:pPr>
+              <w:spacing w:after="40" w:line="240" w:lineRule="auto"/>
+              <w:jc w:val="left"/>
+            </w:pPr>
+            <w:r>
+              <w:rPr>
+                <w:rFonts w:cstheme="minorHAnsi"/>
+                <w:b/>
+                <w:lang w:val="en-US"/>
+              </w:rPr>
               <w:t xml:space="preserve">T3.3</w:t>
             </w:r>
             <w:r>
@@ -2200,7 +2161,22 @@
                 <w:rFonts w:cstheme="minorHAnsi"/>
                 <w:lang w:val="en-US"/>
               </w:rPr>
-              <w:t xml:space="preserve"> </w:t>
+              <w:t xml:space="preserve"> First policies trained in reconstructed vs. generic scenes (tier A). </w:t>
+            </w:r>
+            <w:r>
+              <w:rPr>
+                <w:rFonts w:cstheme="minorHAnsi"/>
+                <w:i/>
+                <w:lang w:val="en-US"/>
+              </w:rPr>
+              <w:t xml:space="preserve">D:</w:t>
+            </w:r>
+            <w:r>
+              <w:rPr>
+                <w:rFonts w:cstheme="minorHAnsi"/>
+                <w:lang w:val="en-US"/>
+              </w:rPr>
+              <w:t xml:space="preserve"> first results; decision by </w:t>
             </w:r>
             <w:r>
               <w:rPr>
@@ -2208,29 +2184,14 @@
                 <w:b/>
                 <w:lang w:val="en-US"/>
               </w:rPr>
-              <w:t xml:space="preserve">Prepare and submit an article to IEEE RA-L</w:t>
-            </w:r>
-            <w:r>
-              <w:rPr>
-                <w:rFonts w:cstheme="minorHAnsi"/>
-                <w:lang w:val="en-US"/>
-              </w:rPr>
-              <w:t xml:space="preserve"> (fallback: IROS 2027, deadline 1 Mar 2027): Stage I pipeline, fidelity validation and simulation results; the real-robot pilot is included if available but is not a precondition. </w:t>
-            </w:r>
-            <w:r>
-              <w:rPr>
-                <w:rFonts w:cstheme="minorHAnsi"/>
-                <w:i/>
-                <w:lang w:val="en-US"/>
-              </w:rPr>
-              <w:t xml:space="preserve">D:</w:t>
-            </w:r>
-            <w:r>
-              <w:rPr>
-                <w:rFonts w:cstheme="minorHAnsi"/>
-                <w:lang w:val="en-US"/>
-              </w:rPr>
-              <w:t xml:space="preserve"> submission, </w:t>
+              <w:t xml:space="preserve">Jan 2027</w:t>
+            </w:r>
+            <w:r>
+              <w:rPr>
+                <w:rFonts w:cstheme="minorHAnsi"/>
+                <w:lang w:val="en-US"/>
+              </w:rPr>
+              <w:t xml:space="preserve"> whether they suffice for the early option, </w:t>
             </w:r>
             <w:r>
               <w:rPr>
@@ -2238,14 +2199,14 @@
                 <w:b/>
                 <w:lang w:val="en-US"/>
               </w:rPr>
-              <w:t xml:space="preserve">February 2027</w:t>
-            </w:r>
-            <w:r>
-              <w:rPr>
-                <w:rFonts w:cstheme="minorHAnsi"/>
-                <w:lang w:val="en-US"/>
-              </w:rPr>
-              <w:t xml:space="preserve"> (§11).</w:t>
+              <w:t xml:space="preserve">ICML 2027</w:t>
+            </w:r>
+            <w:r>
+              <w:rPr>
+                <w:rFonts w:cstheme="minorHAnsi"/>
+                <w:lang w:val="en-US"/>
+              </w:rPr>
+              <w:t xml:space="preserve"> (paper submitted) or not (work continues to NeurIPS 2027).</w:t>
             </w:r>
             <w:permEnd w:id="1413760106"/>
           </w:p>
@@ -2322,7 +2283,7 @@
                 <w:b/>
                 <w:lang w:val="en-US"/>
               </w:rPr>
-              <w:t xml:space="preserve">Stage II – policy learning and real-robot transfer (RQ1–RQ2, H1, H4).</w:t>
+              <w:t xml:space="preserve">Stage II – real-data budget (RQ1–RQ2, H1, H4).</w:t>
             </w:r>
           </w:p>
           <w:p>
@@ -2343,7 +2304,7 @@
                 <w:rFonts w:cstheme="minorHAnsi"/>
                 <w:lang w:val="en-US"/>
               </w:rPr>
-              <w:t xml:space="preserve"> Train RL / imitation-learning policies in reconstructed scenes; real-robot evaluation of H1 against the generic-simulator and real-data-only baselines in ≥ 2 scenes, plus the first real-data-budget curve (RQ2). </w:t>
+              <w:t xml:space="preserve"> Training in reconstructions vs. generic and real-data-only baselines across budgets on tiers A–B; real-robot pilot in one PWr environment (tier C). </w:t>
             </w:r>
             <w:r>
               <w:rPr>
@@ -2358,7 +2319,7 @@
                 <w:rFonts w:cstheme="minorHAnsi"/>
                 <w:lang w:val="en-US"/>
               </w:rPr>
-              <w:t xml:space="preserve"> experimental dataset and analysis of results (</w:t>
+              <w:t xml:space="preserve"> budget–performance curves, pilot results (</w:t>
             </w:r>
             <w:r>
               <w:rPr>
@@ -2366,14 +2327,14 @@
                 <w:b/>
                 <w:lang w:val="en-US"/>
               </w:rPr>
-              <w:t xml:space="preserve">H1 completed</w:t>
-            </w:r>
-            <w:r>
-              <w:rPr>
-                <w:rFonts w:cstheme="minorHAnsi"/>
-                <w:lang w:val="en-US"/>
-              </w:rPr>
-              <w:t xml:space="preserve">). Place: K46, Denali, WCSS.</w:t>
+              <w:t xml:space="preserve">H1 completed on tier A</w:t>
+            </w:r>
+            <w:r>
+              <w:rPr>
+                <w:rFonts w:cstheme="minorHAnsi"/>
+                <w:lang w:val="en-US"/>
+              </w:rPr>
+              <w:t xml:space="preserve">). Place: K46, WCSS, Denali. Without robot access by Mar 2027, the pilot moves to sem. 5; H1 is decided on tier A either way.</w:t>
             </w:r>
           </w:p>
           <w:p>
@@ -2394,7 +2355,22 @@
                 <w:rFonts w:cstheme="minorHAnsi"/>
                 <w:lang w:val="en-US"/>
               </w:rPr>
-              <w:t xml:space="preserve"> Grants and international activity: NCN PRELUDIUM application (call expected spring 2027); poster at an international summer/winter school; invitation of a foreign co-author for the Stage II article; host-lab choice and NAWA Bekker application for the semester-6 visit. </w:t>
+              <w:t xml:space="preserve"> </w:t>
+            </w:r>
+            <w:r>
+              <w:rPr>
+                <w:rFonts w:cstheme="minorHAnsi"/>
+                <w:b/>
+                <w:lang w:val="en-US"/>
+              </w:rPr>
+              <w:t xml:space="preserve">Prepare and submit an article to NeurIPS 2027</w:t>
+            </w:r>
+            <w:r>
+              <w:rPr>
+                <w:rFonts w:cstheme="minorHAnsi"/>
+                <w:lang w:val="en-US"/>
+              </w:rPr>
+              <w:t xml:space="preserve"> (Stages I–II). </w:t>
             </w:r>
             <w:r>
               <w:rPr>
@@ -2409,7 +2385,22 @@
                 <w:rFonts w:cstheme="minorHAnsi"/>
                 <w:lang w:val="en-US"/>
               </w:rPr>
-              <w:t xml:space="preserve"> submitted applications, poster.</w:t>
+              <w:t xml:space="preserve"> submission, </w:t>
+            </w:r>
+            <w:r>
+              <w:rPr>
+                <w:rFonts w:cstheme="minorHAnsi"/>
+                <w:b/>
+                <w:lang w:val="en-US"/>
+              </w:rPr>
+              <w:t xml:space="preserve">May 2027</w:t>
+            </w:r>
+            <w:r>
+              <w:rPr>
+                <w:rFonts w:cstheme="minorHAnsi"/>
+                <w:lang w:val="en-US"/>
+              </w:rPr>
+              <w:t xml:space="preserve"> (§11).</w:t>
             </w:r>
           </w:p>
           <w:p>
@@ -2430,7 +2421,7 @@
                 <w:rFonts w:cstheme="minorHAnsi"/>
                 <w:lang w:val="en-US"/>
               </w:rPr>
-              <w:t xml:space="preserve"> Preparation of the mid-term evaluation. </w:t>
+              <w:t xml:space="preserve"> Grants, international activity and mid-term: NCN PRELUDIUM application; poster at an international summer school; foreign co-author sought for P2; NAWA Bekker application for the sem. 6 visit; autoreferat (≤ 5 pages) and 15-min presentation (~mid-Oct 2027). </w:t>
             </w:r>
             <w:r>
               <w:rPr>
@@ -2445,7 +2436,7 @@
                 <w:rFonts w:cstheme="minorHAnsi"/>
                 <w:lang w:val="en-US"/>
               </w:rPr>
-              <w:t xml:space="preserve"> autoreferat (≤ 5 pages) and 15-min presentation (deadline ~mid-Oct 2027).</w:t>
+              <w:t xml:space="preserve"> applications, poster, autoreferat.</w:t>
             </w:r>
             <w:permEnd w:id="379417658"/>
           </w:p>
@@ -2538,7 +2529,7 @@
                 <w:b/>
                 <w:lang w:val="en-US"/>
               </w:rPr>
-              <w:t xml:space="preserve">Stage III – closing the loop (RQ4, H3, H4).</w:t>
+              <w:t xml:space="preserve">Stage III – predictivity and correction (RQ4, H3, H4).</w:t>
             </w:r>
           </w:p>
           <w:p>
@@ -2559,7 +2550,7 @@
                 <w:rFonts w:cstheme="minorHAnsi"/>
                 <w:lang w:val="en-US"/>
               </w:rPr>
-              <w:t xml:space="preserve"> Paired sim/real rollouts; SRCC of reconstructed vs. generic simulation. </w:t>
+              <w:t xml:space="preserve"> SRCC of reconstructed vs. generic simulation over ≥ 10 policy variants on tier A, validated with paired rollouts on the robot (tier C). </w:t>
             </w:r>
             <w:r>
               <w:rPr>
@@ -2610,7 +2601,7 @@
                 <w:rFonts w:cstheme="minorHAnsi"/>
                 <w:lang w:val="en-US"/>
               </w:rPr>
-              <w:t xml:space="preserve"> Real-to-sim correction of appearance and dynamics from a few real rollouts; data-budget comparison with real-data-only training (H4). </w:t>
+              <w:t xml:space="preserve"> Correction of appearance and dynamics from a few real rollouts; budget comparison with real-data-only learning. </w:t>
             </w:r>
             <w:r>
               <w:rPr>
@@ -2625,7 +2616,7 @@
                 <w:rFonts w:cstheme="minorHAnsi"/>
                 <w:lang w:val="en-US"/>
               </w:rPr>
-              <w:t xml:space="preserve"> analysis of results. Place: K46, Denali.</w:t>
+              <w:t xml:space="preserve"> analysis of results. Place: K46, WCSS, Denali.</w:t>
             </w:r>
           </w:p>
           <w:p>
@@ -2646,7 +2637,37 @@
                 <w:rFonts w:cstheme="minorHAnsi"/>
                 <w:lang w:val="en-US"/>
               </w:rPr>
-              <w:t xml:space="preserve"> Article with Stage II results submitted to RSS 2028 or IEEE RA-L. </w:t>
+              <w:t xml:space="preserve"> </w:t>
+            </w:r>
+            <w:r>
+              <w:rPr>
+                <w:rFonts w:cstheme="minorHAnsi"/>
+                <w:b/>
+                <w:lang w:val="en-US"/>
+              </w:rPr>
+              <w:t xml:space="preserve">Article P2</w:t>
+            </w:r>
+            <w:r>
+              <w:rPr>
+                <w:rFonts w:cstheme="minorHAnsi"/>
+                <w:lang w:val="en-US"/>
+              </w:rPr>
+              <w:t xml:space="preserve"> (Stage III) submitted to </w:t>
+            </w:r>
+            <w:r>
+              <w:rPr>
+                <w:rFonts w:cstheme="minorHAnsi"/>
+                <w:b/>
+                <w:lang w:val="en-US"/>
+              </w:rPr>
+              <w:t xml:space="preserve">CVPR 2028</w:t>
+            </w:r>
+            <w:r>
+              <w:rPr>
+                <w:rFonts w:cstheme="minorHAnsi"/>
+                <w:lang w:val="en-US"/>
+              </w:rPr>
+              <w:t xml:space="preserve"> (~Nov 2027; ICLR 2028, ~late Sep 2027, if ready earlier). If P1 was rejected, its revision goes to CVPR 2028 or ICML 2028 (~Jan 2028). </w:t>
             </w:r>
             <w:r>
               <w:rPr>
@@ -2661,7 +2682,7 @@
                 <w:rFonts w:cstheme="minorHAnsi"/>
                 <w:lang w:val="en-US"/>
               </w:rPr>
-              <w:t xml:space="preserve"> submission.</w:t>
+              <w:t xml:space="preserve"> submission(s).</w:t>
             </w:r>
             <w:permEnd w:id="930623221"/>
           </w:p>
@@ -2739,7 +2760,7 @@
                 <w:b/>
                 <w:lang w:val="en-US"/>
               </w:rPr>
-              <w:t xml:space="preserve">Stage IV – generalization (RQ3, H2).</w:t>
+              <w:t xml:space="preserve">Stage IV – generalization and representations (RQ3, H2).</w:t>
             </w:r>
           </w:p>
           <w:p>
@@ -2760,7 +2781,7 @@
                 <w:rFonts w:cstheme="minorHAnsi"/>
                 <w:lang w:val="en-US"/>
               </w:rPr>
-              <w:t xml:space="preserve"> Augmentation of reconstructed scenes (object rearrangement, lighting, sensor noise, dynamic obstacles); evaluation in real environments that were not captured. </w:t>
+              <w:t xml:space="preserve"> Augmentation of reconstructed scenes and representation alignment between reconstructed and real observations; evaluation on held-out scenes (tier A), real-world datasets (tier B) and uncaptured PWr or host-lab environments (tier C). </w:t>
             </w:r>
             <w:r>
               <w:rPr>
@@ -2826,7 +2847,7 @@
                 <w:rFonts w:cstheme="minorHAnsi"/>
                 <w:lang w:val="en-US"/>
               </w:rPr>
-              <w:t xml:space="preserve"> (3 months, NAWA Bekker; if not funded, a 5–30-day Erasmus+ short-term mobility to a European lab; hosts in §12): experiments in new environments / on a second robot. </w:t>
+              <w:t xml:space="preserve"> (3 months, NAWA Bekker; if not funded, a 5–30-day Erasmus+ short-term mobility to a European lab; hosts in §12): joint experiments. </w:t>
             </w:r>
             <w:r>
               <w:rPr>
@@ -2841,7 +2862,7 @@
                 <w:rFonts w:cstheme="minorHAnsi"/>
                 <w:lang w:val="en-US"/>
               </w:rPr>
-              <w:t xml:space="preserve"> visit report, joint experiments.</w:t>
+              <w:t xml:space="preserve"> visit report.</w:t>
             </w:r>
           </w:p>
           <w:p>
@@ -2862,7 +2883,52 @@
                 <w:rFonts w:cstheme="minorHAnsi"/>
                 <w:lang w:val="en-US"/>
               </w:rPr>
-              <w:t xml:space="preserve"> Article with Stage III results submitted to IROS 2028 or IEEE RA-L. </w:t>
+              <w:t xml:space="preserve"> </w:t>
+            </w:r>
+            <w:r>
+              <w:rPr>
+                <w:rFonts w:cstheme="minorHAnsi"/>
+                <w:b/>
+                <w:lang w:val="en-US"/>
+              </w:rPr>
+              <w:t xml:space="preserve">Article P3</w:t>
+            </w:r>
+            <w:r>
+              <w:rPr>
+                <w:rFonts w:cstheme="minorHAnsi"/>
+                <w:lang w:val="en-US"/>
+              </w:rPr>
+              <w:t xml:space="preserve"> (Stage IV) submitted to </w:t>
+            </w:r>
+            <w:r>
+              <w:rPr>
+                <w:rFonts w:cstheme="minorHAnsi"/>
+                <w:b/>
+                <w:lang w:val="en-US"/>
+              </w:rPr>
+              <w:t xml:space="preserve">ECCV 2028</w:t>
+            </w:r>
+            <w:r>
+              <w:rPr>
+                <w:rFonts w:cstheme="minorHAnsi"/>
+                <w:lang w:val="en-US"/>
+              </w:rPr>
+              <w:t xml:space="preserve"> (~Mar 2028) or </w:t>
+            </w:r>
+            <w:r>
+              <w:rPr>
+                <w:rFonts w:cstheme="minorHAnsi"/>
+                <w:b/>
+                <w:lang w:val="en-US"/>
+              </w:rPr>
+              <w:t xml:space="preserve">NeurIPS 2028</w:t>
+            </w:r>
+            <w:r>
+              <w:rPr>
+                <w:rFonts w:cstheme="minorHAnsi"/>
+                <w:lang w:val="en-US"/>
+              </w:rPr>
+              <w:t xml:space="preserve"> (~May 2028). </w:t>
             </w:r>
             <w:r>
               <w:rPr>
@@ -2955,7 +3021,7 @@
                 <w:b/>
                 <w:lang w:val="en-US"/>
               </w:rPr>
-              <w:t xml:space="preserve">Stage IV – consolidation.</w:t>
+              <w:t xml:space="preserve">Consolidation (RQ2, H4).</w:t>
             </w:r>
           </w:p>
           <w:p>
@@ -2976,7 +3042,7 @@
                 <w:rFonts w:cstheme="minorHAnsi"/>
                 <w:lang w:val="en-US"/>
               </w:rPr>
-              <w:t xml:space="preserve"> Full comparison study (real-data budget vs. success rate, all baselines). </w:t>
+              <w:t xml:space="preserve"> Full real-data-budget study over all baselines with real-robot validation. </w:t>
             </w:r>
             <w:r>
               <w:rPr>
@@ -3027,7 +3093,7 @@
                 <w:rFonts w:cstheme="minorHAnsi"/>
                 <w:lang w:val="en-US"/>
               </w:rPr>
-              <w:t xml:space="preserve"> Release of code, reconstructed scenes and real-world evaluation data. </w:t>
+              <w:t xml:space="preserve"> Release of code, reconstructed scenes and evaluation protocol. </w:t>
             </w:r>
             <w:r>
               <w:rPr>
@@ -3063,7 +3129,7 @@
                 <w:rFonts w:cstheme="minorHAnsi"/>
                 <w:lang w:val="en-US"/>
               </w:rPr>
-              <w:t xml:space="preserve"> Journal article summarizing the method (Robotics and Autonomous Systems or IEEE RA-L); start of dissertation writing. </w:t>
+              <w:t xml:space="preserve"> Optional article P4 (consolidated study) to ICLR 2029 (~late Sep 2028) or CVPR 2029 (~Nov 2028); start of dissertation writing. </w:t>
             </w:r>
             <w:r>
               <w:rPr>
@@ -3078,7 +3144,7 @@
                 <w:rFonts w:cstheme="minorHAnsi"/>
                 <w:lang w:val="en-US"/>
               </w:rPr>
-              <w:t xml:space="preserve"> submission, dissertation outline.</w:t>
+              <w:t xml:space="preserve"> submission (optional), dissertation outline.</w:t>
             </w:r>
             <w:permEnd w:id="565201535"/>
           </w:p>
@@ -3228,7 +3294,7 @@
                 <w:rFonts w:cstheme="minorHAnsi"/>
                 <w:lang w:val="en-US"/>
               </w:rPr>
-              <w:t xml:space="preserve"> Responses to reviews of pending articles. </w:t>
+              <w:t xml:space="preserve"> Responses to reviews and camera-ready versions of pending articles. </w:t>
             </w:r>
             <w:r>
               <w:rPr>
@@ -3920,7 +3986,37 @@
           <w:rFonts w:cstheme="minorHAnsi"/>
           <w:lang w:val="en-US"/>
         </w:rPr>
-        <w:t xml:space="preserve">Autonomous mobile robots such as service robots, warehouse and inspection platforms, and delivery vehicles depend on perception-driven navigation policies. Modern learning-based approaches (deep reinforcement learning, imitation learning, large pretrained navigation models) outperform hand-engineered pipelines in unstructured scenes, but they are extremely data-hungry. Near-perfect point-goal navigation in simulation took billions of frames of experience. Collecting data at that scale on real robots is slow, expensive, and risky for the hardware and for people.</w:t>
+        <w:t xml:space="preserve">Modern machine learning is limited less by models than by </w:t>
+      </w:r>
+      <w:r>
+        <w:rPr>
+          <w:rFonts w:cstheme="minorHAnsi"/>
+          <w:b/>
+          <w:lang w:val="en-US"/>
+        </w:rPr>
+        <w:t xml:space="preserve">data in the target domain</w:t>
+      </w:r>
+      <w:r>
+        <w:rPr>
+          <w:rFonts w:cstheme="minorHAnsi"/>
+          <w:lang w:val="en-US"/>
+        </w:rPr>
+        <w:t xml:space="preserve">. Deep reinforcement learning, imitation learning and large pretrained models learn strong behaviour, but only from very large amounts of experience: near-perfect point-goal navigation in simulation took billions of frames. In many applications such data can only come from the real world, where it is slow, expensive and sometimes risky to collect. The central question is therefore how to learn well from </w:t>
+      </w:r>
+      <w:r>
+        <w:rPr>
+          <w:rFonts w:cstheme="minorHAnsi"/>
+          <w:b/>
+          <w:lang w:val="en-US"/>
+        </w:rPr>
+        <w:t xml:space="preserve">a small, fixed budget of real data</w:t>
+      </w:r>
+      <w:r>
+        <w:rPr>
+          <w:rFonts w:cstheme="minorHAnsi"/>
+          <w:lang w:val="en-US"/>
+        </w:rPr>
+        <w:t xml:space="preserve">.</w:t>
       </w:r>
     </w:p>
     <w:p>
@@ -3933,7 +4029,7 @@
           <w:rFonts w:cstheme="minorHAnsi"/>
           <w:lang w:val="en-US"/>
         </w:rPr>
-        <w:t xml:space="preserve">Simulation is the natural alternative, but policies trained in simulation often fail when deployed on a real robot. This is the </w:t>
+        <w:t xml:space="preserve">Simulation and synthetic data are the usual answer, but models trained on them often fail on real inputs. This </w:t>
       </w:r>
       <w:r>
         <w:rPr>
@@ -3948,7 +4044,7 @@
           <w:rFonts w:cstheme="minorHAnsi"/>
           <w:lang w:val="en-US"/>
         </w:rPr>
-        <w:t xml:space="preserve">: differences in appearance (textures, lighting, sensor noise), geometry, and dynamics (friction, actuation delays). The standard remedy, domain randomization, requires careful manual design and still gives no guarantee for a particular target environment. The opposite option, training directly on real data, does not scale.</w:t>
+        <w:t xml:space="preserve"> is a distribution shift between training and deployment data: in appearance (textures, lighting, sensor noise), geometry and dynamics. Domain randomization widens the training distribution by hand and still gives no guarantee for a particular target domain; training directly on real data does not scale.</w:t>
       </w:r>
     </w:p>
     <w:p>
@@ -3959,29 +4055,22 @@
       <w:r>
         <w:rPr>
           <w:rFonts w:cstheme="minorHAnsi"/>
-          <w:lang w:val="en-US"/>
-        </w:rPr>
-        <w:t xml:space="preserve">Recent progress in </w:t>
-      </w:r>
-      <w:r>
-        <w:rPr>
-          <w:rFonts w:cstheme="minorHAnsi"/>
-          <w:b/>
-          <w:lang w:val="en-US"/>
-        </w:rPr>
-        <w:t xml:space="preserve">neural scene reconstruction</w:t>
-      </w:r>
-      <w:r>
-        <w:rPr>
-          <w:rFonts w:cstheme="minorHAnsi"/>
-          <w:lang w:val="en-US"/>
-        </w:rPr>
-        <w:t xml:space="preserve"> (Neural Radiance Fields, 3D Gaussian Splatting) makes a third path possible: </w:t>
-      </w:r>
-      <w:r>
-        <w:rPr>
-          <w:rFonts w:cstheme="minorHAnsi"/>
-          <w:b/>
+          <w:b/>
+          <w:lang w:val="en-US"/>
+        </w:rPr>
+        <w:t xml:space="preserve">Neural scene reconstruction</w:t>
+      </w:r>
+      <w:r>
+        <w:rPr>
+          <w:rFonts w:cstheme="minorHAnsi"/>
+          <w:lang w:val="en-US"/>
+        </w:rPr>
+        <w:t xml:space="preserve"> (Neural Radiance Fields, 3D Gaussian Splatting) opens a third path. A few minutes of real video are turned into a photorealistic, interactive model of the target environment, in which a model can be trained at scale (</w:t>
+      </w:r>
+      <w:r>
+        <w:rPr>
+          <w:rFonts w:cstheme="minorHAnsi"/>
+          <w:i/>
           <w:lang w:val="en-US"/>
         </w:rPr>
         <w:t xml:space="preserve">real-to-sim-to-real</w:t>
@@ -3991,37 +4080,37 @@
           <w:rFonts w:cstheme="minorHAnsi"/>
           <w:lang w:val="en-US"/>
         </w:rPr>
-        <w:t xml:space="preserve">. A few minutes of real-world capture are turned into a photorealistic, interactive simulation of the target environment. The policy is trained there at scale and then deployed back on the real robot. This shifts the cost from collecting </w:t>
-      </w:r>
-      <w:r>
-        <w:rPr>
-          <w:rFonts w:cstheme="minorHAnsi"/>
-          <w:i/>
-          <w:lang w:val="en-US"/>
-        </w:rPr>
-        <w:t xml:space="preserve">robot experience</w:t>
-      </w:r>
-      <w:r>
-        <w:rPr>
-          <w:rFonts w:cstheme="minorHAnsi"/>
-          <w:lang w:val="en-US"/>
-        </w:rPr>
-        <w:t xml:space="preserve"> to collecting </w:t>
-      </w:r>
-      <w:r>
-        <w:rPr>
-          <w:rFonts w:cstheme="minorHAnsi"/>
-          <w:i/>
-          <w:lang w:val="en-US"/>
-        </w:rPr>
-        <w:t xml:space="preserve">cheap scene captures</w:t>
-      </w:r>
-      <w:r>
-        <w:rPr>
-          <w:rFonts w:cstheme="minorHAnsi"/>
-          <w:lang w:val="en-US"/>
-        </w:rPr>
-        <w:t xml:space="preserve">. It is a promising way out of the data bottleneck, but it has not yet been studied systematically for mobile-robot navigation. Open questions include how much real data is really needed, how to generalize beyond the captured scenes, and how to correct the simulation with feedback from real rollouts.</w:t>
+        <w:t xml:space="preserve">). This moves the cost from collecting experience to collecting cheap captures. It raises open machine-learning questions that have not been studied systematically: how performance </w:t>
+      </w:r>
+      <w:r>
+        <w:rPr>
+          <w:rFonts w:cstheme="minorHAnsi"/>
+          <w:b/>
+          <w:lang w:val="en-US"/>
+        </w:rPr>
+        <w:t xml:space="preserve">scales with the real-data budget</w:t>
+      </w:r>
+      <w:r>
+        <w:rPr>
+          <w:rFonts w:cstheme="minorHAnsi"/>
+          <w:lang w:val="en-US"/>
+        </w:rPr>
+        <w:t xml:space="preserve">, which </w:t>
+      </w:r>
+      <w:r>
+        <w:rPr>
+          <w:rFonts w:cstheme="minorHAnsi"/>
+          <w:b/>
+          <w:lang w:val="en-US"/>
+        </w:rPr>
+        <w:t xml:space="preserve">representations</w:t>
+      </w:r>
+      <w:r>
+        <w:rPr>
+          <w:rFonts w:cstheme="minorHAnsi"/>
+          <w:lang w:val="en-US"/>
+        </w:rPr>
+        <w:t xml:space="preserve"> make the reconstructed and real data distributions close enough, how to generalize beyond the captured scenes, and how a few real observations can correct the simulation.</w:t>
       </w:r>
     </w:p>
     <w:p>
@@ -4042,7 +4131,7 @@
           <w:rFonts w:cstheme="minorHAnsi"/>
           <w:lang w:val="en-US"/>
         </w:rPr>
-        <w:t xml:space="preserve"> The core problems are problems of </w:t>
+        <w:t xml:space="preserve"> The research object is a learning methodology, which places it in </w:t>
       </w:r>
       <w:r>
         <w:rPr>
@@ -4057,7 +4146,22 @@
           <w:rFonts w:cstheme="minorHAnsi"/>
           <w:lang w:val="en-US"/>
         </w:rPr>
-        <w:t xml:space="preserve">: learning algorithms, data-efficient training methodology, software for building simulators from sensor data, and methods for evaluating whether simulation results can be trusted. The robot is the test platform, not the object of the research. The topic fits the machine learning, computer vision and representation learning work of the Department of Artificial Intelligence (K46), and the computation-heavy parts (3D reconstruction, large-scale policy training) can run on the GPU infrastructure available to PWr researchers (WCSS, PLGrid). Its main result, a measured answer to "how much real data is enough", is useful to both researchers and practitioners, whatever the outcome.</w:t>
+        <w:t xml:space="preserve">: data-efficient learning, learning from reconstructed and synthetic data, representation learning under distribution shift, and methods for testing whether results obtained in simulation can be trusted. </w:t>
+      </w:r>
+      <w:r>
+        <w:rPr>
+          <w:rFonts w:cstheme="minorHAnsi"/>
+          <w:b/>
+          <w:lang w:val="en-US"/>
+        </w:rPr>
+        <w:t xml:space="preserve">Visual navigation</w:t>
+      </w:r>
+      <w:r>
+        <w:rPr>
+          <w:rFonts w:cstheme="minorHAnsi"/>
+          <w:lang w:val="en-US"/>
+        </w:rPr>
+        <w:t xml:space="preserve"> of mobile robots is the application and testbed, chosen because public simulators, benchmarks and real-world datasets allow controlled, reproducible measurement of the gap. The main evaluation uses these public resources; trials on a real robot validate the conclusions. The topic fits the representation learning, computer vision and generative modelling work of the Department of Artificial Intelligence (K46). The computation-heavy parts (3D reconstruction, large-scale training) can run on the GPU infrastructure available to PWr researchers (WCSS, PLGrid). Its main result, a measured answer to "how much real data is enough", is useful whatever the outcome.</w:t>
       </w:r>
     </w:p>
     <w:p>
@@ -4078,7 +4182,7 @@
           <w:rFonts w:cstheme="minorHAnsi"/>
           <w:lang w:val="en-US"/>
         </w:rPr>
-        <w:t xml:space="preserve"> indoor service and assistive robotics, logistics and warehouse automation, inspection of industrial facilities, last-mile delivery, and rapid deployment of robots in new buildings with minimal on-site data collection. The methods also carry over to other embodied systems, such as manipulators and drones, and to digital twins of real environments more generally.</w:t>
+        <w:t xml:space="preserve"> service, assistive and warehouse robotics, inspection and last-mile delivery, and rapid deployment of learned systems in new buildings with minimal on-site data collection. More broadly, the methods apply wherever models are trained on reconstructed or synthetic data and deployed on real sensor data: other embodied agents (manipulators, drones), digital twins, and perception models for autonomous systems.</w:t>
       </w:r>
     </w:p>
     <w:permEnd w:id="1178868985"/>
@@ -4578,6 +4682,57 @@
           <w:b/>
           <w:lang w:val="en-US"/>
         </w:rPr>
+        <w:t xml:space="preserve">Learning under distribution shift.</w:t>
+      </w:r>
+      <w:r>
+        <w:rPr>
+          <w:rFonts w:cstheme="minorHAnsi"/>
+          <w:lang w:val="en-US"/>
+        </w:rPr>
+        <w:t xml:space="preserve"> From a machine-learning perspective, the sim-to-real gap is a domain shift between training and deployment data. Unsupervised domain adaptation aligns feature distributions across domains adversarially [31] or at both pixel and feature level [32]. Neural scaling laws [33] describe how performance grows with the amount of data, but it is not known how </w:t>
+      </w:r>
+      <w:r>
+        <w:rPr>
+          <w:rFonts w:cstheme="minorHAnsi"/>
+          <w:i/>
+          <w:lang w:val="en-US"/>
+        </w:rPr>
+        <w:t xml:space="preserve">real</w:t>
+      </w:r>
+      <w:r>
+        <w:rPr>
+          <w:rFonts w:cstheme="minorHAnsi"/>
+          <w:lang w:val="en-US"/>
+        </w:rPr>
+        <w:t xml:space="preserve"> and </w:t>
+      </w:r>
+      <w:r>
+        <w:rPr>
+          <w:rFonts w:cstheme="minorHAnsi"/>
+          <w:i/>
+          <w:lang w:val="en-US"/>
+        </w:rPr>
+        <w:t xml:space="preserve">reconstructed</w:t>
+      </w:r>
+      <w:r>
+        <w:rPr>
+          <w:rFonts w:cstheme="minorHAnsi"/>
+          <w:lang w:val="en-US"/>
+        </w:rPr>
+        <w:t xml:space="preserve"> data trade off. Large 3D scene datasets (HM3D [34], ScanNet++ [35]) now make it possible to study this question in a controlled way, where real captures act as a proxy for reality.</w:t>
+      </w:r>
+    </w:p>
+    <w:p>
+      <w:pPr>
+        <w:spacing w:after="120" w:line="240" w:lineRule="auto"/>
+        <w:jc w:val="both"/>
+      </w:pPr>
+      <w:r>
+        <w:rPr>
+          <w:rFonts w:cstheme="minorHAnsi"/>
+          <w:b/>
+          <w:lang w:val="en-US"/>
+        </w:rPr>
         <w:t xml:space="preserve">Research gap.</w:t>
       </w:r>
       <w:r>
@@ -5038,6 +5193,76 @@
         <w:t xml:space="preserve">[30] G. Chhablani et al., "EmbodiedSplat," ICCV, 2025.</w:t>
       </w:r>
     </w:p>
+    <w:p>
+      <w:pPr>
+        <w:spacing w:after="0" w:line="240" w:lineRule="auto"/>
+        <w:ind w:left="397" w:hanging="397"/>
+        <w:jc w:val="left"/>
+      </w:pPr>
+      <w:r>
+        <w:rPr>
+          <w:rFonts w:cstheme="minorHAnsi"/>
+          <w:lang w:val="en-US"/>
+        </w:rPr>
+        <w:t xml:space="preserve">[31] Y. Ganin et al., "Domain-Adversarial Training of Neural Networks," JMLR, 2016.</w:t>
+      </w:r>
+    </w:p>
+    <w:p>
+      <w:pPr>
+        <w:spacing w:after="0" w:line="240" w:lineRule="auto"/>
+        <w:ind w:left="397" w:hanging="397"/>
+        <w:jc w:val="left"/>
+      </w:pPr>
+      <w:r>
+        <w:rPr>
+          <w:rFonts w:cstheme="minorHAnsi"/>
+          <w:lang w:val="en-US"/>
+        </w:rPr>
+        <w:t xml:space="preserve">[32] J. Hoffman et al., "CyCADA: Cycle-Consistent Adversarial Domain Adaptation," ICML, 2018.</w:t>
+      </w:r>
+    </w:p>
+    <w:p>
+      <w:pPr>
+        <w:spacing w:after="0" w:line="240" w:lineRule="auto"/>
+        <w:ind w:left="397" w:hanging="397"/>
+        <w:jc w:val="left"/>
+      </w:pPr>
+      <w:r>
+        <w:rPr>
+          <w:rFonts w:cstheme="minorHAnsi"/>
+          <w:lang w:val="en-US"/>
+        </w:rPr>
+        <w:t xml:space="preserve">[33] J. Kaplan et al., "Scaling Laws for Neural Language Models," arXiv:2001.08361, 2020.</w:t>
+      </w:r>
+    </w:p>
+    <w:p>
+      <w:pPr>
+        <w:spacing w:after="0" w:line="240" w:lineRule="auto"/>
+        <w:ind w:left="397" w:hanging="397"/>
+        <w:jc w:val="left"/>
+      </w:pPr>
+      <w:r>
+        <w:rPr>
+          <w:rFonts w:cstheme="minorHAnsi"/>
+          <w:lang w:val="en-US"/>
+        </w:rPr>
+        <w:t xml:space="preserve">[34] S. K. Ramakrishnan et al., "Habitat-Matterport 3D Dataset (HM3D)," NeurIPS Datasets and Benchmarks, 2021.</w:t>
+      </w:r>
+    </w:p>
+    <w:p>
+      <w:pPr>
+        <w:spacing w:after="0" w:line="240" w:lineRule="auto"/>
+        <w:ind w:left="397" w:hanging="397"/>
+        <w:jc w:val="left"/>
+      </w:pPr>
+      <w:r>
+        <w:rPr>
+          <w:rFonts w:cstheme="minorHAnsi"/>
+          <w:lang w:val="en-US"/>
+        </w:rPr>
+        <w:t xml:space="preserve">[35] C. Yeshwanth et al., "ScanNet++: A High-Fidelity Dataset of 3D Indoor Scenes," ICCV, 2023.</w:t>
+      </w:r>
+    </w:p>
     <w:permEnd w:id="174659581"/>
     <w:p>
       <w:pPr>
@@ -5277,7 +5502,7 @@
           <w:rFonts w:cstheme="minorHAnsi"/>
           <w:lang w:val="en-US"/>
         </w:rPr>
-        <w:t xml:space="preserve"> A photorealistic, interactive simulation reconstructed from a few minutes of real-world capture of the target environment lets learned mobile-robot navigation policies reach real-world performance not worse than policies trained on real robot experience, while needing at least ten times less real-world data.</w:t>
+        <w:t xml:space="preserve"> Learning in a photorealistic simulation reconstructed from a small budget of real observations, with representations aligned between reconstructed and real data, yields navigation policies that perform in the target domain not worse than policies learned from ≥ 10× more real data.</w:t>
       </w:r>
     </w:p>
     <w:p>
@@ -5313,7 +5538,7 @@
           <w:rFonts w:cstheme="minorHAnsi"/>
           <w:lang w:val="en-US"/>
         </w:rPr>
-        <w:t xml:space="preserve"> (the real-data-budget study). RQ3/H2 (generalization) and RQ4/H3 (closed-loop correction, predictivity) are extensions.</w:t>
+        <w:t xml:space="preserve"> (the real-data-budget study). RQ3/H2 (generalization, representations) and RQ4/H3 (correction, predictivity) are extensions.</w:t>
       </w:r>
     </w:p>
     <w:p>
@@ -5334,7 +5559,7 @@
           <w:rFonts w:cstheme="minorHAnsi"/>
           <w:lang w:val="en-US"/>
         </w:rPr>
-        <w:t xml:space="preserve"> Can a simulation reconstructed from minutes of RGB(-D) video of the target environment (</w:t>
+        <w:t xml:space="preserve"> Does learning in a reconstruction built from minutes of real video of the target environment (</w:t>
       </w:r>
       <w:r>
         <w:rPr>
@@ -5349,7 +5574,7 @@
           <w:rFonts w:cstheme="minorHAnsi"/>
           <w:lang w:val="en-US"/>
         </w:rPr>
-        <w:t xml:space="preserve">), with policies deployed back on the robot (</w:t>
+        <w:t xml:space="preserve">), with deployment on real observations (</w:t>
       </w:r>
       <w:r>
         <w:rPr>
@@ -5364,7 +5589,7 @@
           <w:rFonts w:cstheme="minorHAnsi"/>
           <w:lang w:val="en-US"/>
         </w:rPr>
-        <w:t xml:space="preserve">), close the visual and geometric gap for learned navigation?</w:t>
+        <w:t xml:space="preserve">), close the appearance and geometry gap?</w:t>
       </w:r>
     </w:p>
     <w:p>
@@ -5385,7 +5610,7 @@
           <w:rFonts w:cstheme="minorHAnsi"/>
           <w:lang w:val="en-US"/>
         </w:rPr>
-        <w:t xml:space="preserve"> How does deployed performance scale with the real-data budget, and what budget suffices compared with training on real robot experience?</w:t>
+        <w:t xml:space="preserve"> How does target-domain performance scale with the real-data budget, and what budget suffices compared with learning from real data alone?</w:t>
       </w:r>
     </w:p>
     <w:p>
@@ -5406,7 +5631,7 @@
           <w:rFonts w:cstheme="minorHAnsi"/>
           <w:lang w:val="en-US"/>
         </w:rPr>
-        <w:t xml:space="preserve"> How should reconstructed scenes be augmented so that policies generalize to environments that were </w:t>
+        <w:t xml:space="preserve"> Which data augmentation and representation-learning objectives (aligning reconstructed and real observations) let policies generalize to environments that were </w:t>
       </w:r>
       <w:r>
         <w:rPr>
@@ -5442,7 +5667,7 @@
           <w:rFonts w:cstheme="minorHAnsi"/>
           <w:lang w:val="en-US"/>
         </w:rPr>
-        <w:t xml:space="preserve"> Can a few real rollouts iteratively correct the simulation (appearance, dynamics)?</w:t>
+        <w:t xml:space="preserve"> Can a few real rollouts correct the simulation so that it predicts real performance?</w:t>
       </w:r>
     </w:p>
     <w:p>
@@ -5456,29 +5681,104 @@
           <w:b/>
           <w:lang w:val="en-US"/>
         </w:rPr>
-        <w:t xml:space="preserve">Common protocol.</w:t>
-      </w:r>
-      <w:r>
-        <w:rPr>
-          <w:rFonts w:cstheme="minorHAnsi"/>
-          <w:lang w:val="en-US"/>
-        </w:rPr>
-        <w:t xml:space="preserve"> 20 fixed start–goal pairs × 3 trials per policy and environment (60 episodes). Metrics: success rate (SR; primary), SPL, collisions. </w:t>
-      </w:r>
-      <w:r>
-        <w:rPr>
-          <w:rFonts w:cstheme="minorHAnsi"/>
-          <w:i/>
-          <w:lang w:val="en-US"/>
-        </w:rPr>
-        <w:t xml:space="preserve">Real-data budget</w:t>
-      </w:r>
-      <w:r>
-        <w:rPr>
-          <w:rFonts w:cstheme="minorHAnsi"/>
-          <w:lang w:val="en-US"/>
-        </w:rPr>
-        <w:t xml:space="preserve"> B = minutes of real data collection (capture plus robot rollouts). The real-data-only baseline is a pretrained navigation model fine-tuned by behaviour cloning on teleoperated trajectories of budget B; the generic-simulator baseline uses a public scene dataset of the simulator chosen in T3.1. Tests are one-sided (α = 0.05) with bootstrap confidence bounds over start–goal pairs and Holm correction within each hypothesis. All values are pre-registered in the project repository; changes are logged with reasons.</w:t>
+        <w:t xml:space="preserve">Evaluation tiers.</w:t>
+      </w:r>
+      <w:r>
+        <w:rPr>
+          <w:rFonts w:cstheme="minorHAnsi"/>
+          <w:lang w:val="en-US"/>
+        </w:rPr>
+        <w:t xml:space="preserve"> (A) </w:t>
+      </w:r>
+      <w:r>
+        <w:rPr>
+          <w:rFonts w:cstheme="minorHAnsi"/>
+          <w:i/>
+          <w:lang w:val="en-US"/>
+        </w:rPr>
+        <w:t xml:space="preserve">Benchmark, primary:</w:t>
+      </w:r>
+      <w:r>
+        <w:rPr>
+          <w:rFonts w:cstheme="minorHAnsi"/>
+          <w:lang w:val="en-US"/>
+        </w:rPr>
+        <w:t xml:space="preserve"> ≥ 10 public indoor scenes with real video and a reference 3D scan, which serves in the simulator as the target domain ("proxy reality"); some scenes are held out as uncaptured. (B) </w:t>
+      </w:r>
+      <w:r>
+        <w:rPr>
+          <w:rFonts w:cstheme="minorHAnsi"/>
+          <w:i/>
+          <w:lang w:val="en-US"/>
+        </w:rPr>
+        <w:t xml:space="preserve">Real-world datasets:</w:t>
+      </w:r>
+      <w:r>
+        <w:rPr>
+          <w:rFonts w:cstheme="minorHAnsi"/>
+          <w:lang w:val="en-US"/>
+        </w:rPr>
+        <w:t xml:space="preserve"> held-out real frames for representation metrics. (C) </w:t>
+      </w:r>
+      <w:r>
+        <w:rPr>
+          <w:rFonts w:cstheme="minorHAnsi"/>
+          <w:i/>
+          <w:lang w:val="en-US"/>
+        </w:rPr>
+        <w:t xml:space="preserve">Real-robot validation:</w:t>
+      </w:r>
+      <w:r>
+        <w:rPr>
+          <w:rFonts w:cstheme="minorHAnsi"/>
+          <w:lang w:val="en-US"/>
+        </w:rPr>
+        <w:t xml:space="preserve"> ≥ 2 PWr environments, 20 start–goal pairs × 3 trials per policy. Metrics: success rate (SR; primary), SPL, collisions. </w:t>
+      </w:r>
+      <w:r>
+        <w:rPr>
+          <w:rFonts w:cstheme="minorHAnsi"/>
+          <w:i/>
+          <w:lang w:val="en-US"/>
+        </w:rPr>
+        <w:t xml:space="preserve">Budget</w:t>
+      </w:r>
+      <w:r>
+        <w:rPr>
+          <w:rFonts w:cstheme="minorHAnsi"/>
+          <w:lang w:val="en-US"/>
+        </w:rPr>
+        <w:t xml:space="preserve"> B = minutes of target-domain data (capture plus real experience). Baselines: a pretrained navigation model fine-tuned by behaviour cloning on target-domain trajectories of budget B (</w:t>
+      </w:r>
+      <w:r>
+        <w:rPr>
+          <w:rFonts w:cstheme="minorHAnsi"/>
+          <w:i/>
+          <w:lang w:val="en-US"/>
+        </w:rPr>
+        <w:t xml:space="preserve">real-data-only</w:t>
+      </w:r>
+      <w:r>
+        <w:rPr>
+          <w:rFonts w:cstheme="minorHAnsi"/>
+          <w:lang w:val="en-US"/>
+        </w:rPr>
+        <w:t xml:space="preserve">), and the same policy trained on the simulator's public scenes with domain randomization (</w:t>
+      </w:r>
+      <w:r>
+        <w:rPr>
+          <w:rFonts w:cstheme="minorHAnsi"/>
+          <w:i/>
+          <w:lang w:val="en-US"/>
+        </w:rPr>
+        <w:t xml:space="preserve">generic</w:t>
+      </w:r>
+      <w:r>
+        <w:rPr>
+          <w:rFonts w:cstheme="minorHAnsi"/>
+          <w:lang w:val="en-US"/>
+        </w:rPr>
+        <w:t xml:space="preserve">). Tests are one-sided (α = 0.05), bootstrapped over scenes (A) or start–goal pairs (C), Holm-corrected within each hypothesis. Tier A decides, tier C validates. Values are pre-registered in the repository.</w:t>
       </w:r>
     </w:p>
     <w:p>
@@ -5499,7 +5799,7 @@
           <w:rFonts w:cstheme="minorHAnsi"/>
           <w:lang w:val="en-US"/>
         </w:rPr>
-        <w:t xml:space="preserve"> A policy trained only in the reconstruction of the target environment (a) reaches a higher real-world SR than the same policy trained in a generic simulator with domain randomization, and (b) is </w:t>
+        <w:t xml:space="preserve"> A policy trained only in the reconstruction (a) beats the generic baseline in SR and (b) is </w:t>
       </w:r>
       <w:r>
         <w:rPr>
@@ -5514,7 +5814,7 @@
           <w:rFonts w:cstheme="minorHAnsi"/>
           <w:lang w:val="en-US"/>
         </w:rPr>
-        <w:t xml:space="preserve"> to a policy trained on real robot data with a ≥ 10× larger budget: the lower 95% confidence bound of SR_recon − SR_real, pooled over ≥ 2 environments (120 episodes per policy), is above −15 pp. This gives ≈ 90% power at SR ≈ 0.8, rechecked after the pilot.</w:t>
+        <w:t xml:space="preserve"> to the real-data-only baseline with a ≥ 10× larger budget: the lower 95% bound of SR_recon − SR_real is above −10 pp on tier A, and above −15 pp on tier C (120 pooled episodes per policy; ≈ 90% power at SR ≈ 0.8).</w:t>
       </w:r>
     </w:p>
     <w:p>
@@ -5535,7 +5835,7 @@
           <w:rFonts w:cstheme="minorHAnsi"/>
           <w:lang w:val="en-US"/>
         </w:rPr>
-        <w:t xml:space="preserve"> In uncaptured environments, reconstruction + targeted augmentation reaches a higher SR than both reconstruction alone and generic domain randomization alone.</w:t>
+        <w:t xml:space="preserve"> In uncaptured scenes, reconstruction + augmentation + representation alignment reaches a higher SR than reconstruction alone and than the generic baseline, and alignment lowers the feature distance between reconstructed and real frames (tier B) against the unaligned encoder.</w:t>
       </w:r>
     </w:p>
     <w:p>
@@ -5556,7 +5856,7 @@
           <w:rFonts w:cstheme="minorHAnsi"/>
           <w:lang w:val="en-US"/>
         </w:rPr>
-        <w:t xml:space="preserve"> Over ≥ 10 policy variants, the Sim-vs-Real Correlation Coefficient (SRCC) of the reconstructed simulation is higher than that of a generic simulator (95% CI of the difference excludes 0) and does not drop after real-rollout refinement (lower 95% CI bound of the change ≥ −0.1).</w:t>
+        <w:t xml:space="preserve"> Over ≥ 10 policy variants, the Sim-vs-Real Correlation Coefficient (SRCC) of the reconstruction is higher than that of a generic simulator (95% CI of the difference excludes 0) and does not drop after refinement from real rollouts (lower 95% bound of the change ≥ −0.1).</w:t>
       </w:r>
     </w:p>
     <w:p>
@@ -5577,7 +5877,7 @@
           <w:rFonts w:cstheme="minorHAnsi"/>
           <w:lang w:val="en-US"/>
         </w:rPr>
-        <w:t xml:space="preserve"> The full pipeline, including refinement from a few real rollouts, reaches a target SR τ (best real-data-only SR minus 10 pp) with B_pipeline(τ) ≤ 0.1 · B_real(τ): the upper 95% CI bound of the ratio is ≤ 0.1. If real-data-only training misses τ within the largest feasible budget B_max, the ratio is reported as a bound. Otherwise the budget curve still answers RQ2.</w:t>
+        <w:t xml:space="preserve"> The full pipeline reaches a target SR τ (best real-data-only SR minus 10 pp) with B_pipeline(τ) ≤ 0.1 · B_real(τ): the upper 95% bound of the ratio, from fitted budget–SR scaling curves, is ≤ 0.1. If real-data-only training misses τ within the largest feasible budget, the ratio is reported as a bound; either way the curves answer RQ2.</w:t>
       </w:r>
     </w:p>
     <w:permEnd w:id="1295260508"/>
@@ -5887,7 +6187,7 @@
           <w:rFonts w:cstheme="minorHAnsi"/>
           <w:lang w:val="en-US"/>
         </w:rPr>
-        <w:t xml:space="preserve">). Its contributions are learning algorithms, data-efficient training methodology, software, data and evaluation methodology for machine learning in autonomous systems. The robot is the test platform; control design and mechanical engineering are not the object of the research.</w:t>
+        <w:t xml:space="preserve">), in the area of machine learning. Its contributions are learning methodology, representation learning, evaluation methodology, software and data. Visual navigation of mobile robots is the application and testbed; control design and mechanical engineering are not the object of the research.</w:t>
       </w:r>
     </w:p>
     <w:p>
@@ -5908,7 +6208,22 @@
           <w:rFonts w:cstheme="minorHAnsi"/>
           <w:lang w:val="en-US"/>
         </w:rPr>
-        <w:t xml:space="preserve"> The first systematic, quantitative characterization, to our knowledge, of how the deployed performance of learned mobile-robot navigation policies depends on the </w:t>
+        <w:t xml:space="preserve"> The first systematic, quantitative characterization, to our knowledge, of how performance of policies learned from </w:t>
+      </w:r>
+      <w:r>
+        <w:rPr>
+          <w:rFonts w:cstheme="minorHAnsi"/>
+          <w:b/>
+          <w:lang w:val="en-US"/>
+        </w:rPr>
+        <w:t xml:space="preserve">neural scene reconstructions</w:t>
+      </w:r>
+      <w:r>
+        <w:rPr>
+          <w:rFonts w:cstheme="minorHAnsi"/>
+          <w:lang w:val="en-US"/>
+        </w:rPr>
+        <w:t xml:space="preserve"> scales with the </w:t>
       </w:r>
       <w:r>
         <w:rPr>
@@ -5923,7 +6238,7 @@
           <w:rFonts w:cstheme="minorHAnsi"/>
           <w:lang w:val="en-US"/>
         </w:rPr>
-        <w:t xml:space="preserve"> in a real-to-sim-to-real pipeline. It answers "how much real data is enough" with measured budget–success-rate curves and a non-inferiority comparison against policies trained on real robot experience. This is the result the dissertation stands on.</w:t>
+        <w:t xml:space="preserve"> of the target domain. It answers "how much real data is enough" with measured budget–success-rate scaling curves and a non-inferiority comparison against learning from real data alone, on public benchmarks and validated on a real robot. This is the result the dissertation stands on.</w:t>
       </w:r>
     </w:p>
     <w:p>
@@ -5936,7 +6251,7 @@
           <w:rFonts w:cstheme="minorHAnsi"/>
           <w:lang w:val="en-US"/>
         </w:rPr>
-        <w:t xml:space="preserve">Contributions, in ITiT terms:</w:t>
+        <w:t xml:space="preserve">Contributions to machine learning methodology:</w:t>
       </w:r>
     </w:p>
     <w:p>
@@ -5958,14 +6273,14 @@
           <w:b/>
           <w:lang w:val="en-US"/>
         </w:rPr>
-        <w:t xml:space="preserve">Data-efficient training methodology (core; RQ2, H4).</w:t>
-      </w:r>
-      <w:r>
-        <w:rPr>
-          <w:rFonts w:cstheme="minorHAnsi"/>
-          <w:lang w:val="en-US"/>
-        </w:rPr>
-        <w:t xml:space="preserve"> A procedure for training navigation policies under an explicit real-data budget. It covers scene capture and a small number of real rollouts, and the budget–performance curves that quantify the trade-off.</w:t>
+        <w:t xml:space="preserve">Data-efficient learning under a real-data budget (core; RQ2, H4).</w:t>
+      </w:r>
+      <w:r>
+        <w:rPr>
+          <w:rFonts w:cstheme="minorHAnsi"/>
+          <w:lang w:val="en-US"/>
+        </w:rPr>
+        <w:t xml:space="preserve"> A training procedure that treats the amount of real target-domain data (captures and a few real rollouts) as an explicit budget, and scaling curves that quantify the trade-off between real data and deployed performance.</w:t>
       </w:r>
     </w:p>
     <w:p>
@@ -5987,14 +6302,14 @@
           <w:b/>
           <w:lang w:val="en-US"/>
         </w:rPr>
-        <w:t xml:space="preserve">Software pipeline (core; RQ1, H1).</w:t>
-      </w:r>
-      <w:r>
-        <w:rPr>
-          <w:rFonts w:cstheme="minorHAnsi"/>
-          <w:lang w:val="en-US"/>
-        </w:rPr>
-        <w:t xml:space="preserve"> A reproducible, open real-to-sim-to-real pipeline that turns short RGB(-D) captures into interactive, photorealistic training environments (3D Gaussian Splatting for appearance, extracted geometry for collisions) inside a GPU simulator.</w:t>
+        <w:t xml:space="preserve">Learning from reconstructed data (core; RQ1, H1).</w:t>
+      </w:r>
+      <w:r>
+        <w:rPr>
+          <w:rFonts w:cstheme="minorHAnsi"/>
+          <w:lang w:val="en-US"/>
+        </w:rPr>
+        <w:t xml:space="preserve"> Evidence of when training on photorealistic reconstructions (3D Gaussian Splatting for appearance, extracted geometry for collisions) closes the distribution gap to real observations, compared with generic simulation and domain randomization.</w:t>
       </w:r>
     </w:p>
     <w:p>
@@ -6016,14 +6331,14 @@
           <w:b/>
           <w:lang w:val="en-US"/>
         </w:rPr>
-        <w:t xml:space="preserve">Learning algorithm for generalization (extension; RQ3, H2).</w:t>
-      </w:r>
-      <w:r>
-        <w:rPr>
-          <w:rFonts w:cstheme="minorHAnsi"/>
-          <w:lang w:val="en-US"/>
-        </w:rPr>
-        <w:t xml:space="preserve"> A scheme for augmenting reconstructed scenes so that policies transfer to environments that were never captured. It connects the digital-twin and domain-randomization lines of research.</w:t>
+        <w:t xml:space="preserve">Representation learning across the sim-real gap (extension; RQ3, H2).</w:t>
+      </w:r>
+      <w:r>
+        <w:rPr>
+          <w:rFonts w:cstheme="minorHAnsi"/>
+          <w:lang w:val="en-US"/>
+        </w:rPr>
+        <w:t xml:space="preserve"> Augmentation of reconstructed scenes combined with representation-alignment objectives between reconstructed and real observations, so that policies generalize to environments that were never captured. It connects the digital-twin and domain-randomization lines of research.</w:t>
       </w:r>
     </w:p>
     <w:p>
@@ -6045,14 +6360,27 @@
           <w:b/>
           <w:lang w:val="en-US"/>
         </w:rPr>
-        <w:t xml:space="preserve">Closed-loop simulation correction and evaluation methodology (extension; RQ4, H3).</w:t>
-      </w:r>
-      <w:r>
-        <w:rPr>
-          <w:rFonts w:cstheme="minorHAnsi"/>
-          <w:lang w:val="en-US"/>
-        </w:rPr>
-        <w:t xml:space="preserve"> A method to update simulation parameters from a few real rollouts, and a protocol for measuring how well simulation predicts real performance (SRCC, pre-specified margins and decision rules), so that sim-to-real claims can be tested rather than asserted.</w:t>
+        <w:t xml:space="preserve">Closed-loop correction and evaluation methodology (extension; RQ4, H3).</w:t>
+      </w:r>
+      <w:r>
+        <w:rPr>
+          <w:rFonts w:cstheme="minorHAnsi"/>
+          <w:lang w:val="en-US"/>
+        </w:rPr>
+        <w:t xml:space="preserve"> A method to update the simulation from a few real rollouts, and a protocol for measuring how well simulation predicts real performance (SRCC, pre-specified margins and decision rules), so that sim-to-real claims are tested rather than asserted.</w:t>
+      </w:r>
+    </w:p>
+    <w:p>
+      <w:pPr>
+        <w:spacing w:after="120" w:line="240" w:lineRule="auto"/>
+        <w:jc w:val="both"/>
+      </w:pPr>
+      <w:r>
+        <w:rPr>
+          <w:rFonts w:cstheme="minorHAnsi"/>
+          <w:lang w:val="en-US"/>
+        </w:rPr>
+        <w:t xml:space="preserve">Contributions in engineering terms (ITiT):</w:t>
       </w:r>
     </w:p>
     <w:p>
@@ -6074,14 +6402,14 @@
           <w:b/>
           <w:lang w:val="en-US"/>
         </w:rPr>
-        <w:t xml:space="preserve">Data and benchmark (supports all RQs).</w:t>
-      </w:r>
-      <w:r>
-        <w:rPr>
-          <w:rFonts w:cstheme="minorHAnsi"/>
-          <w:lang w:val="en-US"/>
-        </w:rPr>
-        <w:t xml:space="preserve"> Released code, reconstructed environments and a real-world evaluation set with fixed start–goal pairs, supporting reproducible sim-to-real benchmarking.</w:t>
+        <w:t xml:space="preserve">Software and data (support all RQs).</w:t>
+      </w:r>
+      <w:r>
+        <w:rPr>
+          <w:rFonts w:cstheme="minorHAnsi"/>
+          <w:lang w:val="en-US"/>
+        </w:rPr>
+        <w:t xml:space="preserve"> An open, reproducible pipeline that turns short RGB(-D) video into interactive training environments inside a GPU simulator, and released code, reconstructed scenes and an evaluation set with fixed episodes for reproducible sim-to-real benchmarking.</w:t>
       </w:r>
     </w:p>
     <w:p>
@@ -6102,7 +6430,7 @@
           <w:rFonts w:cstheme="minorHAnsi"/>
           <w:lang w:val="en-US"/>
         </w:rPr>
-        <w:t xml:space="preserve"> Collecting robot experience is the main cost of learning-based robotics. Replacing most of it with cheap scene captures and simulation lowers the cost and time of deploying learned systems in new environments. The evaluation methodology (item 4) is reusable for other simulators and embodied-AI tasks.</w:t>
+        <w:t xml:space="preserve"> Target-domain data is the main cost of deploying learned systems. Showing how far cheap captures and reconstruction can replace it, and which representations make this work, is relevant to machine learning under distribution shift in general, not only to robotics. The evaluation methodology (item 4) is reusable for other simulators and embodied-AI tasks.</w:t>
       </w:r>
     </w:p>
     <w:p>
@@ -6123,7 +6451,7 @@
           <w:rFonts w:cstheme="minorHAnsi"/>
           <w:lang w:val="en-US"/>
         </w:rPr>
-        <w:t xml:space="preserve"> Results are planned for venues assigned to ITiT on the ministerial list (5.01.2024): IEEE RA-L (200 pts), RSS (200 pts), IEEE/RSJ IROS (140 pts) and Robotics and Autonomous Systems (140 pts), as in §3, §9, §11 and §12.</w:t>
+        <w:t xml:space="preserve"> Results are planned for peer-reviewed conferences worth 200 points and assigned to ITiT on the ministerial list of 5.01.2024: NeurIPS, ICML and ICLR (machine learning), CVPR, ICCV and ECCV (computer vision), and RSS (robot learning), as in §3, §11 and §12.</w:t>
       </w:r>
     </w:p>
     <w:permEnd w:id="1098318749"/>
@@ -6402,7 +6730,7 @@
           <w:rFonts w:cstheme="minorHAnsi"/>
           <w:lang w:val="en-US"/>
         </w:rPr>
-        <w:t xml:space="preserve">The research follows four stages (I–IV) matching §3; for each we give the method, data, metric and success criterion. Stage II (H1 and the real-data budget, RQ1–RQ2) is the core of the dissertation; Stages III–IV extend it.</w:t>
+        <w:t xml:space="preserve">The research follows four stages (I–IV) matching §3; for each we give the method, data, metric and success criterion. Stages I–II (H1 and the real-data budget, RQ1–RQ2) are the core of the dissertation; Stages III–IV extend it. Every hypothesis is decided on public benchmarks and datasets and validated on a real robot (the three evaluation tiers of §7).</w:t>
       </w:r>
     </w:p>
     <w:p>
@@ -6416,14 +6744,59 @@
           <w:b/>
           <w:lang w:val="en-US"/>
         </w:rPr>
-        <w:t xml:space="preserve">Test stand and data.</w:t>
-      </w:r>
-      <w:r>
-        <w:rPr>
-          <w:rFonts w:cstheme="minorHAnsi"/>
-          <w:lang w:val="en-US"/>
-        </w:rPr>
-        <w:t xml:space="preserve"> Real-robot experiments use a mobile-robot platform available at PWr (planned cooperation with the K29 "Denali" Autonomous Robots Laboratory, which operates Pioneer 3-DX and DrRobot Jaguar 4x4 robots under ROS 2; terms agreed in sem. 3, T3.2a). The robot carries an RGB-D camera and uses wheel odometry; if no suitable sensor is available, one is bought from an SzD Minigrant. A fixed capture protocol records short RGB-D video of each environment (minutes per scene) and a small number of teleoperated trajectories. The </w:t>
+        <w:t xml:space="preserve">Data and evaluation tiers.</w:t>
+      </w:r>
+      <w:r>
+        <w:rPr>
+          <w:rFonts w:cstheme="minorHAnsi"/>
+          <w:lang w:val="en-US"/>
+        </w:rPr>
+        <w:t xml:space="preserve"> </w:t>
+      </w:r>
+      <w:r>
+        <w:rPr>
+          <w:rFonts w:cstheme="minorHAnsi"/>
+          <w:i/>
+          <w:lang w:val="en-US"/>
+        </w:rPr>
+        <w:t xml:space="preserve">Tier A (benchmark, primary):</w:t>
+      </w:r>
+      <w:r>
+        <w:rPr>
+          <w:rFonts w:cstheme="minorHAnsi"/>
+          <w:lang w:val="en-US"/>
+        </w:rPr>
+        <w:t xml:space="preserve"> ≥ 10 public indoor scenes that have both real video and a reference 3D scan, e.g. ScanNet++ (laser scans, DSLR images and iPhone RGB-D video of real rooms); the reference scan, loaded into a GPU simulator (Habitat or Isaac Sim / Isaac Lab, chosen in T3.1), is the target domain, and some scenes are held out as uncaptured. Large public scene sets (e.g. HM3D) train the generic baseline. </w:t>
+      </w:r>
+      <w:r>
+        <w:rPr>
+          <w:rFonts w:cstheme="minorHAnsi"/>
+          <w:i/>
+          <w:lang w:val="en-US"/>
+        </w:rPr>
+        <w:t xml:space="preserve">Tier B (real-world datasets):</w:t>
+      </w:r>
+      <w:r>
+        <w:rPr>
+          <w:rFonts w:cstheme="minorHAnsi"/>
+          <w:lang w:val="en-US"/>
+        </w:rPr>
+        <w:t xml:space="preserve"> held-out real frames and trajectories from public navigation datasets (e.g. SCAND, RECON) for representation metrics and offline checks. </w:t>
+      </w:r>
+      <w:r>
+        <w:rPr>
+          <w:rFonts w:cstheme="minorHAnsi"/>
+          <w:i/>
+          <w:lang w:val="en-US"/>
+        </w:rPr>
+        <w:t xml:space="preserve">Tier C (real-robot validation):</w:t>
+      </w:r>
+      <w:r>
+        <w:rPr>
+          <w:rFonts w:cstheme="minorHAnsi"/>
+          <w:lang w:val="en-US"/>
+        </w:rPr>
+        <w:t xml:space="preserve"> ≥ 2 PWr environments with a mobile robot (planned cooperation with the K29 "Denali" Autonomous Robots Laboratory: Pioneer 3-DX and DrRobot Jaguar 4x4 under ROS 2; agreement in T3.2), with an RGB-D camera and wheel odometry; a sensor is bought from an SzD Minigrant if needed. The </w:t>
       </w:r>
       <w:r>
         <w:rPr>
@@ -6438,37 +6811,22 @@
           <w:rFonts w:cstheme="minorHAnsi"/>
           <w:lang w:val="en-US"/>
         </w:rPr>
-        <w:t xml:space="preserve"> (capture minutes, number of real rollouts) is an explicit experimental variable. </w:t>
-      </w:r>
-      <w:r>
-        <w:rPr>
-          <w:rFonts w:cstheme="minorHAnsi"/>
-          <w:i/>
-          <w:lang w:val="en-US"/>
-        </w:rPr>
-        <w:t xml:space="preserve">Estimated robot time</w:t>
-      </w:r>
-      <w:r>
-        <w:rPr>
-          <w:rFonts w:cstheme="minorHAnsi"/>
-          <w:lang w:val="en-US"/>
-        </w:rPr>
-        <w:t xml:space="preserve"> (at ~2 min per episode including reset): about 35 robot-hours in Stage II (6 policies × 120 episodes, plus teleoperated data for the real-data-only baseline) and about 20 in Stage III (≥ 10 variants × 60 episodes); resets are scripted and the H1 core comparisons are run first. </w:t>
-      </w:r>
-      <w:r>
-        <w:rPr>
-          <w:rFonts w:cstheme="minorHAnsi"/>
-          <w:b/>
-          <w:lang w:val="en-US"/>
-        </w:rPr>
-        <w:t xml:space="preserve">Fallback</w:t>
-      </w:r>
-      <w:r>
-        <w:rPr>
-          <w:rFonts w:cstheme="minorHAnsi"/>
-          <w:lang w:val="en-US"/>
-        </w:rPr>
-        <w:t xml:space="preserve"> if robot access is delayed: offline evaluation on public real-world navigation datasets (e.g. SCAND, RECON)  with real-robot deployment moved to the next semester. Compute: WCSS Lem (NVIDIA H100) and PLGrid allocations (to be applied for), plus departmental GPUs .</w:t>
+        <w:t xml:space="preserve"> B (minutes of target-domain data: capture video plus real experience) is an explicit experimental variable: on tier A it is set by subsampling the scene's video and the number of rollouts in the reference scan. </w:t>
+      </w:r>
+      <w:r>
+        <w:rPr>
+          <w:rFonts w:cstheme="minorHAnsi"/>
+          <w:i/>
+          <w:lang w:val="en-US"/>
+        </w:rPr>
+        <w:t xml:space="preserve">Estimated robot time:</w:t>
+      </w:r>
+      <w:r>
+        <w:rPr>
+          <w:rFonts w:cstheme="minorHAnsi"/>
+          <w:lang w:val="en-US"/>
+        </w:rPr>
+        <w:t xml:space="preserve"> about 16 robot-hours per validation campaign (4 policies × 120 episodes at ~2 min per episode including reset), in sem. 4–5 and sem. 7. Compute: WCSS Lem (NVIDIA H100) and PLGrid allocations (to be applied for), plus departmental GPUs .</w:t>
       </w:r>
     </w:p>
     <w:p>
@@ -6482,7 +6840,7 @@
           <w:b/>
           <w:lang w:val="en-US"/>
         </w:rPr>
-        <w:t xml:space="preserve">Stage I – real-to-sim reconstruction (RQ1; sem. 3).</w:t>
+        <w:t xml:space="preserve">Stage I – learning from reconstructions (RQ1; sem. 3).</w:t>
       </w:r>
     </w:p>
     <w:p>
@@ -6511,7 +6869,7 @@
           <w:rFonts w:cstheme="minorHAnsi"/>
           <w:lang w:val="en-US"/>
         </w:rPr>
-        <w:t xml:space="preserve"> camera poses from Structure-from-Motion (COLMAP) or RGB-D SLAM; appearance from 3D Gaussian Splatting (NeRF as baseline); collision geometry from TSDF depth fusion or mesh extraction; import into a GPU simulator (Isaac Sim / Isaac Lab or Habitat, chosen in T3.1) with rendering from the reconstruction and physics from the mesh.</w:t>
+        <w:t xml:space="preserve"> camera poses from Structure-from-Motion (COLMAP) or the dataset's poses; appearance from 3D Gaussian Splatting (NeRF as baseline); collision geometry from depth fusion or mesh extraction; import into the simulator with rendering from the reconstruction and physics from the mesh.</w:t>
       </w:r>
     </w:p>
     <w:p>
@@ -6533,14 +6891,28 @@
           <w:i/>
           <w:lang w:val="en-US"/>
         </w:rPr>
-        <w:t xml:space="preserve">Data/equipment:</w:t>
-      </w:r>
-      <w:r>
-        <w:rPr>
-          <w:rFonts w:cstheme="minorHAnsi"/>
-          <w:lang w:val="en-US"/>
-        </w:rPr>
-        <w:t xml:space="preserve"> RGB-D captures of ≥ 2 indoor scenes at PWr (corridors, labs, offices).</w:t>
+        <w:t xml:space="preserve">Metric and success criterion:</w:t>
+      </w:r>
+      <w:r>
+        <w:rPr>
+          <w:rFonts w:cstheme="minorHAnsi"/>
+          <w:lang w:val="en-US"/>
+        </w:rPr>
+        <w:t xml:space="preserve"> PSNR, SSIM and LPIPS on held-out views and depth error against the reference scan. A scene passes if its held-out PSNR is within a margin X dB of the value reported for 3DGS [21] on comparable indoor scenes (X fixed in the repository before Stage II) and its collision mesh has no holes on the evaluation paths.</w:t>
+      </w:r>
+    </w:p>
+    <w:p>
+      <w:pPr>
+        <w:spacing w:after="120" w:line="240" w:lineRule="auto"/>
+        <w:jc w:val="both"/>
+      </w:pPr>
+      <w:r>
+        <w:rPr>
+          <w:rFonts w:cstheme="minorHAnsi"/>
+          <w:b/>
+          <w:lang w:val="en-US"/>
+        </w:rPr>
+        <w:t xml:space="preserve">Stage II – learning under a real-data budget (RQ1–RQ2, H1, H4; sem. 3–4).</w:t>
       </w:r>
     </w:p>
     <w:p>
@@ -6562,28 +6934,14 @@
           <w:i/>
           <w:lang w:val="en-US"/>
         </w:rPr>
-        <w:t xml:space="preserve">Metric and success criterion:</w:t>
-      </w:r>
-      <w:r>
-        <w:rPr>
-          <w:rFonts w:cstheme="minorHAnsi"/>
-          <w:lang w:val="en-US"/>
-        </w:rPr>
-        <w:t xml:space="preserve"> PSNR, SSIM and LPIPS on held-out real views, and depth error against sensor depth. A scene passes if its held-out PSNR is within a margin X dB of the value reported for 3DGS [21] on comparable indoor scenes (X fixed in the repository before Stage II) and its collision mesh has no holes on the evaluation paths.</w:t>
-      </w:r>
-    </w:p>
-    <w:p>
-      <w:pPr>
-        <w:spacing w:after="120" w:line="240" w:lineRule="auto"/>
-        <w:jc w:val="both"/>
-      </w:pPr>
-      <w:r>
-        <w:rPr>
-          <w:rFonts w:cstheme="minorHAnsi"/>
-          <w:b/>
-          <w:lang w:val="en-US"/>
-        </w:rPr>
-        <w:t xml:space="preserve">Stage II – policy learning and real-robot transfer (RQ1–RQ2, H1, H4; sem. 3–4).</w:t>
+        <w:t xml:space="preserve">Method:</w:t>
+      </w:r>
+      <w:r>
+        <w:rPr>
+          <w:rFonts w:cstheme="minorHAnsi"/>
+          <w:lang w:val="en-US"/>
+        </w:rPr>
+        <w:t xml:space="preserve"> (i) deep reinforcement learning (PPO / DD-PPO) for point-goal and image-goal navigation, trained at scale in the reconstructions; (ii) imitation learning and fine-tuning of pretrained navigation models (GNM, ViNT, NoMaD) on trajectories generated in simulation. Input: RGB(-D); output: velocity commands.</w:t>
       </w:r>
     </w:p>
     <w:p>
@@ -6605,14 +6963,14 @@
           <w:i/>
           <w:lang w:val="en-US"/>
         </w:rPr>
-        <w:t xml:space="preserve">Method:</w:t>
-      </w:r>
-      <w:r>
-        <w:rPr>
-          <w:rFonts w:cstheme="minorHAnsi"/>
-          <w:lang w:val="en-US"/>
-        </w:rPr>
-        <w:t xml:space="preserve"> (i) deep reinforcement learning (PPO / DD-PPO) for point-goal and image-goal navigation, trained at scale in the reconstructed scenes; (ii) imitation learning and fine-tuning of pretrained navigation models (GNM, ViNT, NoMaD) on trajectories generated in simulation. Input: RGB(-D); output: velocity commands.</w:t>
+        <w:t xml:space="preserve">Baselines (§7):</w:t>
+      </w:r>
+      <w:r>
+        <w:rPr>
+          <w:rFonts w:cstheme="minorHAnsi"/>
+          <w:lang w:val="en-US"/>
+        </w:rPr>
+        <w:t xml:space="preserve"> the same policy trained on generic public scenes with domain randomization; the real-data-only baseline, a pretrained model fine-tuned by behaviour cloning on target-domain trajectories of budget B, at matched and ≥ 10× larger budgets; pretrained models zero-shot.</w:t>
       </w:r>
     </w:p>
     <w:p>
@@ -6634,14 +6992,28 @@
           <w:i/>
           <w:lang w:val="en-US"/>
         </w:rPr>
-        <w:t xml:space="preserve">Baselines:</w:t>
-      </w:r>
-      <w:r>
-        <w:rPr>
-          <w:rFonts w:cstheme="minorHAnsi"/>
-          <w:lang w:val="en-US"/>
-        </w:rPr>
-        <w:t xml:space="preserve"> the same policy trained in a generic simulator (public scene dataset, with and without domain randomization); a pretrained model fine-tuned by behaviour cloning on teleoperated real trajectories at matched and ≥ 10× larger budgets; pretrained models zero-shot.</w:t>
+        <w:t xml:space="preserve">Metric and success criterion:</w:t>
+      </w:r>
+      <w:r>
+        <w:rPr>
+          <w:rFonts w:cstheme="minorHAnsi"/>
+          <w:lang w:val="en-US"/>
+        </w:rPr>
+        <w:t xml:space="preserve"> success rate (primary), SPL and collisions as a function of B; budget–SR scaling curves fitted per method; H1 and H4 decision rules in §7 on tier A, with the robot pilot (tier C, one environment) as the first validation.</w:t>
+      </w:r>
+    </w:p>
+    <w:p>
+      <w:pPr>
+        <w:spacing w:after="120" w:line="240" w:lineRule="auto"/>
+        <w:jc w:val="both"/>
+      </w:pPr>
+      <w:r>
+        <w:rPr>
+          <w:rFonts w:cstheme="minorHAnsi"/>
+          <w:b/>
+          <w:lang w:val="en-US"/>
+        </w:rPr>
+        <w:t xml:space="preserve">Stage III – predictivity and correction (RQ4, H3, H4; sem. 4–5).</w:t>
       </w:r>
     </w:p>
     <w:p>
@@ -6663,28 +7035,29 @@
           <w:i/>
           <w:lang w:val="en-US"/>
         </w:rPr>
-        <w:t xml:space="preserve">Metric and success criterion:</w:t>
-      </w:r>
-      <w:r>
-        <w:rPr>
-          <w:rFonts w:cstheme="minorHAnsi"/>
-          <w:lang w:val="en-US"/>
-        </w:rPr>
-        <w:t xml:space="preserve"> success rate (primary), SPL, collisions and interventions under the §7 protocol, and success rate as a function of the real-data budget B; H1 decision rules in §7. The real-robot pilot (one scene) runs in sem. 3 if robot access is agreed, otherwise at the start of sem. 4; the H1 study in ≥ 2 environments is completed by the end of sem. 4 (before the mid-term).</w:t>
-      </w:r>
-    </w:p>
-    <w:p>
-      <w:pPr>
-        <w:spacing w:after="120" w:line="240" w:lineRule="auto"/>
-        <w:jc w:val="both"/>
-      </w:pPr>
-      <w:r>
-        <w:rPr>
-          <w:rFonts w:cstheme="minorHAnsi"/>
-          <w:b/>
-          <w:lang w:val="en-US"/>
-        </w:rPr>
-        <w:t xml:space="preserve">Stage III – closing the loop and sim-to-real validation (RQ4, H3, H4; sem. 5).</w:t>
+        <w:t xml:space="preserve">Validation protocol:</w:t>
+      </w:r>
+      <w:r>
+        <w:rPr>
+          <w:rFonts w:cstheme="minorHAnsi"/>
+          <w:lang w:val="en-US"/>
+        </w:rPr>
+        <w:t xml:space="preserve"> paired rollouts in simulation and in the target domain on the same start–goal pairs. Over ≥ 10 policy variants we compute the </w:t>
+      </w:r>
+      <w:r>
+        <w:rPr>
+          <w:rFonts w:cstheme="minorHAnsi"/>
+          <w:b/>
+          <w:lang w:val="en-US"/>
+        </w:rPr>
+        <w:t xml:space="preserve">Sim-vs-Real Correlation Coefficient (SRCC)</w:t>
+      </w:r>
+      <w:r>
+        <w:rPr>
+          <w:rFonts w:cstheme="minorHAnsi"/>
+          <w:lang w:val="en-US"/>
+        </w:rPr>
+        <w:t xml:space="preserve"> between simulated and target-domain success/SPL for the reconstructed and the generic simulator, on tier A and on the robot (tier C), and relate per-scene fidelity (Stage I) to the transfer gap.</w:t>
       </w:r>
     </w:p>
     <w:p>
@@ -6706,29 +7079,14 @@
           <w:i/>
           <w:lang w:val="en-US"/>
         </w:rPr>
-        <w:t xml:space="preserve">Validation protocol:</w:t>
-      </w:r>
-      <w:r>
-        <w:rPr>
-          <w:rFonts w:cstheme="minorHAnsi"/>
-          <w:lang w:val="en-US"/>
-        </w:rPr>
-        <w:t xml:space="preserve"> paired simulated and real rollouts on the same start–goal pairs. Over ≥ 10 policy variants we compute the </w:t>
-      </w:r>
-      <w:r>
-        <w:rPr>
-          <w:rFonts w:cstheme="minorHAnsi"/>
-          <w:b/>
-          <w:lang w:val="en-US"/>
-        </w:rPr>
-        <w:t xml:space="preserve">Sim-vs-Real Correlation Coefficient (SRCC)</w:t>
-      </w:r>
-      <w:r>
-        <w:rPr>
-          <w:rFonts w:cstheme="minorHAnsi"/>
-          <w:lang w:val="en-US"/>
-        </w:rPr>
-        <w:t xml:space="preserve"> between simulated and real success/SPL for (a) the reconstructed and (b) the generic simulator, and relate per-scene fidelity (Stage I metrics) to the transfer gap.</w:t>
+        <w:t xml:space="preserve">Method:</w:t>
+      </w:r>
+      <w:r>
+        <w:rPr>
+          <w:rFonts w:cstheme="minorHAnsi"/>
+          <w:lang w:val="en-US"/>
+        </w:rPr>
+        <w:t xml:space="preserve"> the discrepancy between target-domain and replayed trajectories updates the scene (re-capture of poorly reconstructed regions) and fits dynamics and sensor parameters (system identification, adaptive randomization in the style of SimOpt); the policy is then fine-tuned in the corrected simulation.</w:t>
       </w:r>
     </w:p>
     <w:p>
@@ -6750,14 +7108,14 @@
           <w:i/>
           <w:lang w:val="en-US"/>
         </w:rPr>
-        <w:t xml:space="preserve">Method:</w:t>
-      </w:r>
-      <w:r>
-        <w:rPr>
-          <w:rFonts w:cstheme="minorHAnsi"/>
-          <w:lang w:val="en-US"/>
-        </w:rPr>
-        <w:t xml:space="preserve"> the discrepancy between real and replayed trajectories is used to update the scene (re-capture of poorly reconstructed regions) and to fit dynamics and sensor parameters (system identification, adaptive randomization in the style of SimOpt); the policy is then fine-tuned in the corrected simulation. The number of real rollouts per iteration is small and reported.</w:t>
+        <w:t xml:space="preserve">Metric and success criterion:</w:t>
+      </w:r>
+      <w:r>
+        <w:rPr>
+          <w:rFonts w:cstheme="minorHAnsi"/>
+          <w:lang w:val="en-US"/>
+        </w:rPr>
+        <w:t xml:space="preserve"> SRCC with bootstrap confidence intervals; target-domain rollouts needed to reach the target success rate compared with real-data-only learning; H3 and H4 decision rules in §7.</w:t>
       </w:r>
     </w:p>
     <w:p>
@@ -6779,14 +7137,28 @@
           <w:i/>
           <w:lang w:val="en-US"/>
         </w:rPr>
-        <w:t xml:space="preserve">Metric and success criterion:</w:t>
-      </w:r>
-      <w:r>
-        <w:rPr>
-          <w:rFonts w:cstheme="minorHAnsi"/>
-          <w:lang w:val="en-US"/>
-        </w:rPr>
-        <w:t xml:space="preserve"> SRCC with bootstrap confidence intervals; real rollouts needed to reach the target success rate compared with real-data-only training; H3 and H4 decision rules in §7.</w:t>
+        <w:t xml:space="preserve">Fallback</w:t>
+      </w:r>
+      <w:r>
+        <w:rPr>
+          <w:rFonts w:cstheme="minorHAnsi"/>
+          <w:lang w:val="en-US"/>
+        </w:rPr>
+        <w:t xml:space="preserve"> (low SRCC or no gain): reported as a negative finding, with the error attributed to appearance, geometry or dynamics by ablation; Stage II conclusions do not depend on this stage.</w:t>
+      </w:r>
+    </w:p>
+    <w:p>
+      <w:pPr>
+        <w:spacing w:after="120" w:line="240" w:lineRule="auto"/>
+        <w:jc w:val="both"/>
+      </w:pPr>
+      <w:r>
+        <w:rPr>
+          <w:rFonts w:cstheme="minorHAnsi"/>
+          <w:b/>
+          <w:lang w:val="en-US"/>
+        </w:rPr>
+        <w:t xml:space="preserve">Stage IV – generalization and representations (RQ3, H2, H4; sem. 6–7).</w:t>
       </w:r>
     </w:p>
     <w:p>
@@ -6808,28 +7180,29 @@
           <w:i/>
           <w:lang w:val="en-US"/>
         </w:rPr>
-        <w:t xml:space="preserve">Fallback</w:t>
-      </w:r>
-      <w:r>
-        <w:rPr>
-          <w:rFonts w:cstheme="minorHAnsi"/>
-          <w:lang w:val="en-US"/>
-        </w:rPr>
-        <w:t xml:space="preserve"> (low SRCC or no gain): reported as a negative finding, with the error attributed to appearance, geometry or dynamics by ablation; Stage II conclusions do not depend on this stage.</w:t>
-      </w:r>
-    </w:p>
-    <w:p>
-      <w:pPr>
-        <w:spacing w:after="120" w:line="240" w:lineRule="auto"/>
-        <w:jc w:val="both"/>
-      </w:pPr>
-      <w:r>
-        <w:rPr>
-          <w:rFonts w:cstheme="minorHAnsi"/>
-          <w:b/>
-          <w:lang w:val="en-US"/>
-        </w:rPr>
-        <w:t xml:space="preserve">Stage IV – generalization and consolidation (RQ3, H2, H4; sem. 6–7).</w:t>
+        <w:t xml:space="preserve">Method:</w:t>
+      </w:r>
+      <w:r>
+        <w:rPr>
+          <w:rFonts w:cstheme="minorHAnsi"/>
+          <w:lang w:val="en-US"/>
+        </w:rPr>
+        <w:t xml:space="preserve"> augmentation of reconstructed scenes (object insertion and rearrangement, lighting and appearance randomization, sensor noise, simulated pedestrians) and </w:t>
+      </w:r>
+      <w:r>
+        <w:rPr>
+          <w:rFonts w:cstheme="minorHAnsi"/>
+          <w:b/>
+          <w:lang w:val="en-US"/>
+        </w:rPr>
+        <w:t xml:space="preserve">representation alignment</w:t>
+      </w:r>
+      <w:r>
+        <w:rPr>
+          <w:rFonts w:cstheme="minorHAnsi"/>
+          <w:lang w:val="en-US"/>
+        </w:rPr>
+        <w:t xml:space="preserve">: an auxiliary objective that brings encoder features of reconstructed and real observations of the same place together (e.g. contrastive or distribution-matching losses). Ablation: generic + randomization vs. reconstruction only vs. reconstruction + augmentation vs. + alignment.</w:t>
       </w:r>
     </w:p>
     <w:p>
@@ -6851,14 +7224,14 @@
           <w:i/>
           <w:lang w:val="en-US"/>
         </w:rPr>
-        <w:t xml:space="preserve">Method:</w:t>
-      </w:r>
-      <w:r>
-        <w:rPr>
-          <w:rFonts w:cstheme="minorHAnsi"/>
-          <w:lang w:val="en-US"/>
-        </w:rPr>
-        <w:t xml:space="preserve"> augmentation of reconstructed scenes: object insertion and rearrangement, lighting and appearance randomization, sensor noise and latency, dynamics randomization, simulated pedestrians. Ablation: generic simulator + domain randomization vs. reconstruction only vs. reconstruction + augmentation.</w:t>
+        <w:t xml:space="preserve">Data:</w:t>
+      </w:r>
+      <w:r>
+        <w:rPr>
+          <w:rFonts w:cstheme="minorHAnsi"/>
+          <w:lang w:val="en-US"/>
+        </w:rPr>
+        <w:t xml:space="preserve"> held-out uncaptured scenes (tier A), real frames (tier B), and uncaptured real environments at PWr and, during the foreign visit, at the host lab (tier C).</w:t>
       </w:r>
     </w:p>
     <w:p>
@@ -6880,50 +7253,6 @@
           <w:i/>
           <w:lang w:val="en-US"/>
         </w:rPr>
-        <w:t xml:space="preserve">Data/equipment:</w:t>
-      </w:r>
-      <w:r>
-        <w:rPr>
-          <w:rFonts w:cstheme="minorHAnsi"/>
-          <w:lang w:val="en-US"/>
-        </w:rPr>
-        <w:t xml:space="preserve"> captured (target) and </w:t>
-      </w:r>
-      <w:r>
-        <w:rPr>
-          <w:rFonts w:cstheme="minorHAnsi"/>
-          <w:b/>
-          <w:lang w:val="en-US"/>
-        </w:rPr>
-        <w:t xml:space="preserve">uncaptured</w:t>
-      </w:r>
-      <w:r>
-        <w:rPr>
-          <w:rFonts w:cstheme="minorHAnsi"/>
-          <w:lang w:val="en-US"/>
-        </w:rPr>
-        <w:t xml:space="preserve"> (unseen) real environments at PWr and, during the foreign visit, at the host lab.</w:t>
-      </w:r>
-    </w:p>
-    <w:p>
-      <w:pPr>
-        <w:spacing w:after="40" w:line="240" w:lineRule="auto"/>
-        <w:ind w:left="284" w:hanging="284"/>
-        <w:jc w:val="both"/>
-      </w:pPr>
-      <w:r>
-        <w:rPr>
-          <w:rFonts w:cstheme="minorHAnsi"/>
-          <w:lang w:val="en-US"/>
-        </w:rPr>
-        <w:t xml:space="preserve">•	</w:t>
-      </w:r>
-      <w:r>
-        <w:rPr>
-          <w:rFonts w:cstheme="minorHAnsi"/>
-          <w:i/>
-          <w:lang w:val="en-US"/>
-        </w:rPr>
         <w:t xml:space="preserve">Metric and success criterion:</w:t>
       </w:r>
       <w:r>
@@ -6931,7 +7260,7 @@
           <w:rFonts w:cstheme="minorHAnsi"/>
           <w:lang w:val="en-US"/>
         </w:rPr>
-        <w:t xml:space="preserve"> success rate and SPL in unseen environments (H2 decision rule in §7); the full real-data-budget curve over all baselines.</w:t>
+        <w:t xml:space="preserve"> success rate and SPL in uncaptured scenes, and the feature-distribution distance between reconstructed and real frames (H2 rule in §7); the full budget curve over all baselines (H4, sem. 7).</w:t>
       </w:r>
     </w:p>
     <w:p>
@@ -6945,14 +7274,14 @@
           <w:b/>
           <w:lang w:val="en-US"/>
         </w:rPr>
-        <w:t xml:space="preserve">Statistics, reproducibility and dissemination.</w:t>
-      </w:r>
-      <w:r>
-        <w:rPr>
-          <w:rFonts w:cstheme="minorHAnsi"/>
-          <w:lang w:val="en-US"/>
-        </w:rPr>
-        <w:t xml:space="preserve"> All real-robot comparisons follow the §7 protocol. Code, configurations and scenes are versioned, logged and released where permitted. Each stage is published in listed venues: IEEE RA-L, RSS, IROS or Robotics and Autonomous Systems (§3, §11).</w:t>
+        <w:t xml:space="preserve">Statistics and reproducibility.</w:t>
+      </w:r>
+      <w:r>
+        <w:rPr>
+          <w:rFonts w:cstheme="minorHAnsi"/>
+          <w:lang w:val="en-US"/>
+        </w:rPr>
+        <w:t xml:space="preserve"> All comparisons follow the §7 protocol, which is pre-registered in the project repository before each stage; changes are logged with reasons. Code, configurations and reconstructed scenes are versioned and released where the dataset licences permit.</w:t>
       </w:r>
     </w:p>
     <w:permEnd w:id="32011344"/>
@@ -7221,7 +7550,7 @@
           <w:rFonts w:cstheme="minorHAnsi"/>
           <w:lang w:val="pl-PL"/>
         </w:rPr>
-        <w:t xml:space="preserve">Roboty mobilne, na przykład w magazynach, szpitalach czy biurach, coraz częściej uczą się poruszać samodzielnie dzięki metodom sztucznej inteligencji. Takie uczenie wymaga jednak ogromnej liczby przykładów, często milionów prób i błędów. Zebranie ich na prawdziwym robocie trwa bardzo długo, jest kosztowne i może prowadzić do uszkodzeń sprzętu. Dlatego roboty uczy się zwykle w symulacji komputerowej, czyli w wirtualnym świecie przypominającym grę. Problem polega na tym, że świat wirtualny różni się od prawdziwego: inaczej wyglądają ściany, światło i przedmioty, a robot zachowuje się inaczej na śliskiej podłodze. Robot wyszkolony w symulacji często gubi się po przeniesieniu do rzeczywistości.</w:t>
+        <w:t xml:space="preserve">Współczesna sztuczna inteligencja uczy się na przykładach i zwykle potrzebuje ich ogromnej liczby. W wielu zastosowaniach dobre przykłady pochodzą jednak tylko z prawdziwego świata, a ich zbieranie jest powolne, drogie, a czasem ryzykowne. Dobrym przykładem są roboty mobilne, na przykład w magazynach, szpitalach czy biurach. Aby robot nauczył się samodzielnie poruszać, potrzebuje milionów prób i błędów. Dlatego uczy się go zwykle w symulacji komputerowej, czyli w wirtualnym świecie przypominającym grę. Świat wirtualny różni się jednak od prawdziwego: inaczej wyglądają ściany, światło i przedmioty. Model sztucznej inteligencji wyuczony w symulacji często zawodzi, gdy zobaczy prawdziwe obrazy.</w:t>
       </w:r>
     </w:p>
     <w:p>
@@ -7234,7 +7563,7 @@
           <w:rFonts w:cstheme="minorHAnsi"/>
           <w:lang w:val="pl-PL"/>
         </w:rPr>
-        <w:t xml:space="preserve">Celem rozprawy jest opracowanie metody, która pozwoli nauczyć robota mobilnego nawigacji w konkretnym miejscu przy użyciu bardzo małej ilości prawdziwych danych. Pomysł polega na nagraniu krótkiego filmu z danego miejsca, na przykład korytarza lub biura. Na jego podstawie metody sztucznej inteligencji odtwarzające trójwymiarowe sceny tworzą wierną, fotorealistyczną cyfrową kopię tego miejsca. W tej kopii robot może bezpiecznie i szybko ćwiczyć miliony razy, a następnie wrócić do prawdziwego świata. Informacje z kilku prawdziwych przejazdów posłużą dodatkowo do poprawiania symulacji tak, by coraz lepiej odpowiadała rzeczywistości. Metoda zostanie sprawdzona na prawdziwym robocie w budynkach Politechniki Wrocławskiej i porównana z robotami uczonymi w zwykłej symulacji.</w:t>
+        <w:t xml:space="preserve">Celem rozprawy jest opracowanie metod uczenia maszynowego, które pozwolą sztucznej inteligencji dobrze działać w prawdziwym świecie przy bardzo małej ilości prawdziwych danych. Pomysł polega na nagraniu krótkiego filmu z danego miejsca, na przykład korytarza lub biura. Na jego podstawie metody sztucznej inteligencji odtwarzające trójwymiarowe sceny tworzą wierną, fotorealistyczną cyfrową kopię tego miejsca. W tej kopii model może bezpiecznie i szybko ćwiczyć miliony razy. Zbadamy też, jak nauczyć model takiego „widzenia” świata, by obrazy z kopii i z rzeczywistości były dla niego podobne, oraz jak kilka prawdziwych prób może poprawić symulację. Jako zadanie testowe posłuży nawigacja robota mobilnego. Metody zostaną sprawdzone przede wszystkim na publicznie dostępnych wirtualnych budynkach i zbiorach prawdziwych nagrań, a następnie potwierdzone na prawdziwym robocie w budynkach Politechniki Wrocławskiej.</w:t>
       </w:r>
     </w:p>
     <w:p>
@@ -7247,7 +7576,7 @@
           <w:rFonts w:cstheme="minorHAnsi"/>
           <w:lang w:val="pl-PL"/>
         </w:rPr>
-        <w:t xml:space="preserve">Badania pokażą, ile prawdziwych danych naprawdę potrzeba, aby robot działał niezawodnie, oraz jak sprawić, by radził sobie również w miejscach, których wcześniej nie widział. Spodziewanym efektem jest znaczne obniżenie kosztu i czasu wdrażania autonomicznych robotów w nowych budynkach, co może przyspieszyć ich wykorzystanie w logistyce, opiece i przemyśle. Opracowane oprogramowanie i dane zostaną udostępnione publicznie.</w:t>
+        <w:t xml:space="preserve">Badania pokażą, ile prawdziwych danych naprawdę potrzeba, aby wyuczony model działał niezawodnie, oraz jak sprawić, by radził sobie również w miejscach, których wcześniej nie widział. Spodziewanym efektem jest znaczne obniżenie kosztu i czasu wdrażania systemów sztucznej inteligencji w nowych miejscach, co może przyspieszyć wykorzystanie robotów w logistyce, opiece i przemyśle. Opracowane oprogramowanie i dane zostaną udostępnione publicznie.</w:t>
       </w:r>
     </w:p>
     <w:permEnd w:id="301016009"/>
@@ -7302,7 +7631,7 @@
           <w:rFonts w:cstheme="minorHAnsi"/>
           <w:lang w:val="en-US"/>
         </w:rPr>
-        <w:t xml:space="preserve">Mobile robots, for example in warehouses, hospitals or offices, increasingly learn to move on their own using artificial intelligence. This learning needs an enormous number of examples, often millions of trials and errors. Collecting them on a real robot takes a very long time, is expensive and can damage the hardware. That is why robots are usually trained in a computer simulation, a virtual world similar to a video game. The problem is that the virtual world differs from the real one: walls, light and objects look different, and the robot behaves differently on a slippery floor. A robot trained in simulation often gets lost when moved to reality.</w:t>
+        <w:t xml:space="preserve">Modern artificial intelligence learns from examples, and it usually needs an enormous number of them. In many applications, however, good examples come only from the real world, where collecting them is slow, expensive and sometimes risky. Mobile robots, for example in warehouses, hospitals or offices, are a good example. For a robot to learn to move on its own, it needs millions of trials and errors. That is why it is usually trained in a computer simulation, a virtual world similar to a video game. The virtual world, however, differs from the real one: walls, light and objects look different. An artificial intelligence model trained in simulation often fails when it sees real images.</w:t>
       </w:r>
     </w:p>
     <w:p>
@@ -7315,7 +7644,7 @@
           <w:rFonts w:cstheme="minorHAnsi"/>
           <w:lang w:val="en-US"/>
         </w:rPr>
-        <w:t xml:space="preserve">The goal of this dissertation is to develop a method that teaches a mobile robot to navigate a specific place using very little real data. The idea is to record a short video of a place, such as a corridor or an office. From this video, artificial intelligence methods that reconstruct three-dimensional scenes create a faithful, photorealistic digital copy of the place. In this copy the robot can practice safely and quickly millions of times, and then return to the real world. Information from a few real runs will also be used to correct the simulation so that it matches reality more and more closely. The method will be tested on a real robot in the buildings of Wrocław University of Science and Technology and compared with robots trained in an ordinary simulation.</w:t>
+        <w:t xml:space="preserve">The goal of this dissertation is to develop machine learning methods that let artificial intelligence work well in the real world using very little real data. The idea is to record a short video of a place, such as a corridor or an office. From this video, artificial intelligence methods that reconstruct three-dimensional scenes create a faithful, photorealistic digital copy of the place. In this copy the model can practice safely and quickly millions of times. We will also study how to teach the model to "see" the world so that images from the copy and from reality look similar to it, and how a few real trials can correct the simulation. Mobile-robot navigation will serve as the test task. The methods will be tested mainly on publicly available virtual buildings and collections of real recordings, and then confirmed on a real robot in the buildings of Wrocław University of Science and Technology.</w:t>
       </w:r>
     </w:p>
     <w:p>
@@ -7328,7 +7657,7 @@
           <w:rFonts w:cstheme="minorHAnsi"/>
           <w:lang w:val="en-US"/>
         </w:rPr>
-        <w:t xml:space="preserve">The research will show how much real data is truly needed for a robot to work reliably, and how to make it cope with places it has never seen before. The expected result is a significant reduction in the cost and time of deploying autonomous robots in new buildings, which may speed up their use in logistics, care and industry. The software and data developed will be made publicly available.</w:t>
+        <w:t xml:space="preserve">The research will show how much real data is truly needed for a trained model to work reliably, and how to make it cope with places it has never seen before. The expected result is a significant reduction in the cost and time of deploying artificial intelligence systems in new places, which may speed up the use of robots in logistics, care and industry. The software and data developed will be made publicly available.</w:t>
       </w:r>
     </w:p>
     <w:permEnd w:id="305530072"/>
@@ -7706,7 +8035,7 @@
           <w:b/>
           <w:lang w:val="en-US"/>
         </w:rPr>
-        <w:t xml:space="preserve">February 2027 / luty 2027</w:t>
+        <w:t xml:space="preserve">May 2027 / maj 2027</w:t>
       </w:r>
     </w:p>
     <w:p>
@@ -7719,22 +8048,22 @@
           <w:rFonts w:cstheme="minorHAnsi"/>
           <w:lang w:val="en-US"/>
         </w:rPr>
-        <w:t xml:space="preserve">Article submitted for review to </w:t>
-      </w:r>
-      <w:r>
-        <w:rPr>
-          <w:rFonts w:cstheme="minorHAnsi"/>
-          <w:b/>
-          <w:lang w:val="en-US"/>
-        </w:rPr>
-        <w:t xml:space="preserve">IEEE Robotics and Automation Letters (RA-L)</w:t>
-      </w:r>
-      <w:r>
-        <w:rPr>
-          <w:rFonts w:cstheme="minorHAnsi"/>
-          <w:lang w:val="en-US"/>
-        </w:rPr>
-        <w:t xml:space="preserve">, ISSN 2377-3766, with a planned presentation at IEEE/RSJ IROS 2027 (if the RA-L–IROS window is offered). It reports the Stage I pipeline and its validation (T3.3); the real-robot pilot is included if available but is not required. RA-L is worth </w:t>
+        <w:t xml:space="preserve">Paper submitted for review to the </w:t>
+      </w:r>
+      <w:r>
+        <w:rPr>
+          <w:rFonts w:cstheme="minorHAnsi"/>
+          <w:b/>
+          <w:lang w:val="en-US"/>
+        </w:rPr>
+        <w:t xml:space="preserve">Conference on Neural Information Processing Systems (NeurIPS 2027)</w:t>
+      </w:r>
+      <w:r>
+        <w:rPr>
+          <w:rFonts w:cstheme="minorHAnsi"/>
+          <w:lang w:val="en-US"/>
+        </w:rPr>
+        <w:t xml:space="preserve">, peer-reviewed international conference proceedings worth </w:t>
       </w:r>
       <w:r>
         <w:rPr>
@@ -7749,7 +8078,7 @@
           <w:rFonts w:cstheme="minorHAnsi"/>
           <w:lang w:val="en-US"/>
         </w:rPr>
-        <w:t xml:space="preserve"> on the ministerial list and is assigned to the discipline </w:t>
+        <w:t xml:space="preserve"> on the ministerial list (conference Lp. 87), assigned to the discipline </w:t>
       </w:r>
       <w:r>
         <w:rPr>
@@ -7764,7 +8093,22 @@
           <w:rFonts w:cstheme="minorHAnsi"/>
           <w:lang w:val="en-US"/>
         </w:rPr>
-        <w:t xml:space="preserve">.</w:t>
+        <w:t xml:space="preserve">. It reports Stages I–II (learning from reconstructed scenes and the first real-data-budget curve on public benchmarks; task T4.2). If the results are ready earlier, the paper goes to </w:t>
+      </w:r>
+      <w:r>
+        <w:rPr>
+          <w:rFonts w:cstheme="minorHAnsi"/>
+          <w:b/>
+          <w:lang w:val="en-US"/>
+        </w:rPr>
+        <w:t xml:space="preserve">ICML 2027</w:t>
+      </w:r>
+      <w:r>
+        <w:rPr>
+          <w:rFonts w:cstheme="minorHAnsi"/>
+          <w:lang w:val="en-US"/>
+        </w:rPr>
+        <w:t xml:space="preserve"> (expected deadline late January 2027, also 200 points). If it is rejected, the revised paper is resubmitted to the next 200-point conference (§12).</w:t>
       </w:r>
     </w:p>
     <w:permEnd w:id="641100817"/>
@@ -8028,14 +8372,14 @@
           <w:b/>
           <w:lang w:val="en-US"/>
         </w:rPr>
-        <w:t xml:space="preserve">Planned outputs by year</w:t>
-      </w:r>
-      <w:r>
-        <w:rPr>
-          <w:rFonts w:cstheme="minorHAnsi"/>
-          <w:lang w:val="en-US"/>
-        </w:rPr>
-        <w:t xml:space="preserve"> (points: ministerial list of 5.01.2024; re-checked against the 2027 list).</w:t>
+        <w:t xml:space="preserve">Planned outputs by year.</w:t>
+      </w:r>
+      <w:r>
+        <w:rPr>
+          <w:rFonts w:cstheme="minorHAnsi"/>
+          <w:lang w:val="en-US"/>
+        </w:rPr>
+        <w:t xml:space="preserve"> All papers target 200-point conferences assigned to the discipline (ministerial list of 5.01.2024; points to be re-checked against the new list expected in early 2027).</w:t>
       </w:r>
     </w:p>
     <w:tbl>
@@ -8046,9 +8390,9 @@
       </w:tblPr>
       <w:tblGrid>
         <w:gridCol w:w="1269"/>
-        <w:gridCol w:w="4364"/>
-        <w:gridCol w:w="1527"/>
-        <w:gridCol w:w="1912"/>
+        <w:gridCol w:w="4316"/>
+        <w:gridCol w:w="1549"/>
+        <w:gridCol w:w="1938"/>
       </w:tblGrid>
       <w:tr>
         <w:tc>
@@ -8072,7 +8416,7 @@
         </w:tc>
         <w:tc>
           <w:tcPr>
-            <w:tcW w:w="4364" w:type="dxa"/>
+            <w:tcW w:w="4316" w:type="dxa"/>
           </w:tcPr>
           <w:p>
             <w:pPr>
@@ -8085,13 +8429,13 @@
                 <w:b/>
                 <w:lang w:val="en-US"/>
               </w:rPr>
-              <w:t xml:space="preserve">Papers (venue, points)</w:t>
+              <w:t xml:space="preserve">Papers (planned submission, 200 points each)</w:t>
             </w:r>
           </w:p>
         </w:tc>
         <w:tc>
           <w:tcPr>
-            <w:tcW w:w="1527" w:type="dxa"/>
+            <w:tcW w:w="1549" w:type="dxa"/>
           </w:tcPr>
           <w:p>
             <w:pPr>
@@ -8110,7 +8454,7 @@
         </w:tc>
         <w:tc>
           <w:tcPr>
-            <w:tcW w:w="1912" w:type="dxa"/>
+            <w:tcW w:w="1938" w:type="dxa"/>
           </w:tcPr>
           <w:p>
             <w:pPr>
@@ -8149,7 +8493,7 @@
         </w:tc>
         <w:tc>
           <w:tcPr>
-            <w:tcW w:w="4364" w:type="dxa"/>
+            <w:tcW w:w="4316" w:type="dxa"/>
           </w:tcPr>
           <w:p>
             <w:pPr>
@@ -8167,7 +8511,7 @@
         </w:tc>
         <w:tc>
           <w:tcPr>
-            <w:tcW w:w="1527" w:type="dxa"/>
+            <w:tcW w:w="1549" w:type="dxa"/>
           </w:tcPr>
           <w:p>
             <w:pPr>
@@ -8185,7 +8529,7 @@
         </w:tc>
         <w:tc>
           <w:tcPr>
-            <w:tcW w:w="1912" w:type="dxa"/>
+            <w:tcW w:w="1938" w:type="dxa"/>
           </w:tcPr>
           <w:p>
             <w:pPr>
@@ -8223,7 +8567,7 @@
         </w:tc>
         <w:tc>
           <w:tcPr>
-            <w:tcW w:w="4364" w:type="dxa"/>
+            <w:tcW w:w="4316" w:type="dxa"/>
           </w:tcPr>
           <w:p>
             <w:pPr>
@@ -8235,13 +8579,13 @@
                 <w:rFonts w:cstheme="minorHAnsi"/>
                 <w:lang w:val="en-US"/>
               </w:rPr>
-              <w:t xml:space="preserve">Stage I: IEEE RA-L (200), Feb 2027 (§11)</w:t>
+              <w:t xml:space="preserve">P1, Stages I–II: NeurIPS 2027, May 2027 (§11); early option ICML 2027</w:t>
             </w:r>
           </w:p>
         </w:tc>
         <w:tc>
           <w:tcPr>
-            <w:tcW w:w="1527" w:type="dxa"/>
+            <w:tcW w:w="1549" w:type="dxa"/>
           </w:tcPr>
           <w:p>
             <w:pPr>
@@ -8253,13 +8597,13 @@
                 <w:rFonts w:cstheme="minorHAnsi"/>
                 <w:lang w:val="en-US"/>
               </w:rPr>
-              <w:t xml:space="preserve">SzD Minigrant; NCN Preludium</w:t>
+              <w:t xml:space="preserve">SzD Minigrant; NCN PRELUDIUM</w:t>
             </w:r>
           </w:p>
         </w:tc>
         <w:tc>
           <w:tcPr>
-            <w:tcW w:w="1912" w:type="dxa"/>
+            <w:tcW w:w="1938" w:type="dxa"/>
           </w:tcPr>
           <w:p>
             <w:pPr>
@@ -8271,7 +8615,7 @@
                 <w:rFonts w:cstheme="minorHAnsi"/>
                 <w:lang w:val="en-US"/>
               </w:rPr>
-              <w:t xml:space="preserve">Summer/winter school poster</w:t>
+              <w:t xml:space="preserve">Summer school poster</w:t>
             </w:r>
           </w:p>
         </w:tc>
@@ -8297,7 +8641,7 @@
         </w:tc>
         <w:tc>
           <w:tcPr>
-            <w:tcW w:w="4364" w:type="dxa"/>
+            <w:tcW w:w="4316" w:type="dxa"/>
           </w:tcPr>
           <w:p>
             <w:pPr>
@@ -8309,13 +8653,13 @@
                 <w:rFonts w:cstheme="minorHAnsi"/>
                 <w:lang w:val="en-US"/>
               </w:rPr>
-              <w:t xml:space="preserve">Stage II: RSS 2028 (200) or RA-L (200); Stage III: IROS 2028 (140) or RA-L (200)</w:t>
+              <w:t xml:space="preserve">P2, Stage III: CVPR 2028 or ICLR 2028; P3, Stage IV: ECCV 2028 or NeurIPS 2028</w:t>
             </w:r>
           </w:p>
         </w:tc>
         <w:tc>
           <w:tcPr>
-            <w:tcW w:w="1527" w:type="dxa"/>
+            <w:tcW w:w="1549" w:type="dxa"/>
           </w:tcPr>
           <w:p>
             <w:pPr>
@@ -8333,7 +8677,7 @@
         </w:tc>
         <w:tc>
           <w:tcPr>
-            <w:tcW w:w="1912" w:type="dxa"/>
+            <w:tcW w:w="1938" w:type="dxa"/>
           </w:tcPr>
           <w:p>
             <w:pPr>
@@ -8371,7 +8715,7 @@
         </w:tc>
         <w:tc>
           <w:tcPr>
-            <w:tcW w:w="4364" w:type="dxa"/>
+            <w:tcW w:w="4316" w:type="dxa"/>
           </w:tcPr>
           <w:p>
             <w:pPr>
@@ -8383,13 +8727,13 @@
                 <w:rFonts w:cstheme="minorHAnsi"/>
                 <w:lang w:val="en-US"/>
               </w:rPr>
-              <w:t xml:space="preserve">Summary: Robotics and Autonomous Systems (140) or RA-L (200)</w:t>
+              <w:t xml:space="preserve">Optional P4, consolidated study: ICLR 2029 or CVPR 2029</w:t>
             </w:r>
           </w:p>
         </w:tc>
         <w:tc>
           <w:tcPr>
-            <w:tcW w:w="1527" w:type="dxa"/>
+            <w:tcW w:w="1549" w:type="dxa"/>
           </w:tcPr>
           <w:p>
             <w:pPr>
@@ -8407,7 +8751,7 @@
         </w:tc>
         <w:tc>
           <w:tcPr>
-            <w:tcW w:w="1912" w:type="dxa"/>
+            <w:tcW w:w="1938" w:type="dxa"/>
           </w:tcPr>
           <w:p>
             <w:pPr>
@@ -8439,17 +8783,9 @@
       <w:r>
         <w:rPr>
           <w:rFonts w:cstheme="minorHAnsi"/>
-          <w:b/>
-          <w:lang w:val="en-US"/>
-        </w:rPr>
-        <w:t xml:space="preserve">Foreign research visit (candidate hosts, not yet contacted).</w:t>
-      </w:r>
-      <w:r>
-        <w:rPr>
-          <w:rFonts w:cstheme="minorHAnsi"/>
-          <w:lang w:val="en-US"/>
-        </w:rPr>
-        <w:t xml:space="preserve"> (1) Multi-robot Systems Lab, Stanford University (M. Schwager): Gaussian-splatting scene models and navigation. (2) Z. Kira's group, Georgia Tech: EmbodiedSplat [30]. A European host, which also opens the Erasmus+ short-term route (5–30 days), is sought with the supervisor in sem. 4, together with a foreign co-author for the Stage II article.</w:t>
+          <w:lang w:val="en-US"/>
+        </w:rPr>
+        <w:t xml:space="preserve">P1–P3 are the thematically linked core of the dissertation; P4 is optional. A paper on the real-robot validation may alternatively go to RSS (also 200 points).</w:t>
       </w:r>
     </w:p>
     <w:p>
@@ -8463,6 +8799,27 @@
           <w:b/>
           <w:lang w:val="en-US"/>
         </w:rPr>
+        <w:t xml:space="preserve">Foreign research visit (candidate hosts, not yet contacted).</w:t>
+      </w:r>
+      <w:r>
+        <w:rPr>
+          <w:rFonts w:cstheme="minorHAnsi"/>
+          <w:lang w:val="en-US"/>
+        </w:rPr>
+        <w:t xml:space="preserve"> (1) Multi-robot Systems Lab, Stanford University (M. Schwager): Gaussian-splatting scene models and navigation. (2) Z. Kira's group, Georgia Tech: EmbodiedSplat [30]. A European host, which also opens the Erasmus+ short-term route (5–30 days), is sought with the supervisor in sem. 4, together with a foreign co-author for P2.</w:t>
+      </w:r>
+    </w:p>
+    <w:p>
+      <w:pPr>
+        <w:spacing w:after="120" w:line="240" w:lineRule="auto"/>
+        <w:jc w:val="both"/>
+      </w:pPr>
+      <w:r>
+        <w:rPr>
+          <w:rFonts w:cstheme="minorHAnsi"/>
+          <w:b/>
+          <w:lang w:val="en-US"/>
+        </w:rPr>
         <w:t xml:space="preserve">Collaboration at PWr.</w:t>
       </w:r>
       <w:r>
@@ -8470,7 +8827,7 @@
           <w:rFonts w:cstheme="minorHAnsi"/>
           <w:lang w:val="en-US"/>
         </w:rPr>
-        <w:t xml:space="preserve"> K46 has no mobile-robot laboratory, so real-robot experiments are planned with the </w:t>
+        <w:t xml:space="preserve"> Real-robot validation is planned with the </w:t>
       </w:r>
       <w:r>
         <w:rPr>
@@ -8485,7 +8842,7 @@
           <w:rFonts w:cstheme="minorHAnsi"/>
           <w:lang w:val="en-US"/>
         </w:rPr>
-        <w:t xml:space="preserve"> Autonomous Robots Laboratory (K29, W12N; Pioneer 3-DX, Jaguar 4x4, ROS 2); a written agreement is task T3.2a (Nov 2026). Consultations on 3D reconstruction with K46's genwro.AI group are possible.</w:t>
+        <w:t xml:space="preserve"> Autonomous Robots Laboratory (K29, W12N; Pioneer 3-DX, Jaguar 4x4, ROS 2); a written agreement is task T3.2 (Nov 2026). Consultations on 3D reconstruction with K46's genwro.AI group are possible.</w:t>
       </w:r>
     </w:p>
     <w:p>
@@ -8528,14 +8885,14 @@
           <w:i/>
           <w:lang w:val="en-US"/>
         </w:rPr>
-        <w:t xml:space="preserve">No robot access or sensor</w:t>
-      </w:r>
-      <w:r>
-        <w:rPr>
-          <w:rFonts w:cstheme="minorHAnsi"/>
-          <w:lang w:val="en-US"/>
-        </w:rPr>
-        <w:t xml:space="preserve"> (3–4): decision point end of Jan 2027 (§3); public real-world datasets and simulation meanwhile; Minigrant/Preludium funds for a sensor; the ROS 2 pipeline can move to another robot.</w:t>
+        <w:t xml:space="preserve">Rejection at a top venue</w:t>
+      </w:r>
+      <w:r>
+        <w:rPr>
+          <w:rFonts w:cstheme="minorHAnsi"/>
+          <w:lang w:val="en-US"/>
+        </w:rPr>
+        <w:t xml:space="preserve"> (4–7): acceptance at these conferences is selective, so every paper has a resubmission path inside the 200-point set, to the next deadline 2–4 months later (e.g. NeurIPS → ICLR or CVPR → ICML → ECCV/ICCV), after revision using the reviews. With three core papers and several yearly deadlines, the degree requirement does not depend on one decision.</w:t>
       </w:r>
     </w:p>
     <w:p>
@@ -8557,14 +8914,14 @@
           <w:i/>
           <w:lang w:val="en-US"/>
         </w:rPr>
-        <w:t xml:space="preserve">Robot time exceeds lab access</w:t>
-      </w:r>
-      <w:r>
-        <w:rPr>
-          <w:rFonts w:cstheme="minorHAnsi"/>
-          <w:lang w:val="en-US"/>
-        </w:rPr>
-        <w:t xml:space="preserve"> (4–5): ~35 robot-hours in Stage II (§9); scripted resets, H1 core comparisons first, fewer policy variants.</w:t>
+        <w:t xml:space="preserve">Changing venue points</w:t>
+      </w:r>
+      <w:r>
+        <w:rPr>
+          <w:rFonts w:cstheme="minorHAnsi"/>
+          <w:lang w:val="en-US"/>
+        </w:rPr>
+        <w:t xml:space="preserve"> (sem. 3–4): the new list may change points; venues are re-checked when it appears, and the plan keeps several 200-point alternatives per paper.</w:t>
       </w:r>
     </w:p>
     <w:p>
@@ -8586,14 +8943,14 @@
           <w:i/>
           <w:lang w:val="en-US"/>
         </w:rPr>
-        <w:t xml:space="preserve">Sim-to-real validation fails</w:t>
-      </w:r>
-      <w:r>
-        <w:rPr>
-          <w:rFonts w:cstheme="minorHAnsi"/>
-          <w:lang w:val="en-US"/>
-        </w:rPr>
-        <w:t xml:space="preserve"> (4–5): pre-specified SRCC protocol; a negative result still answers RQ2.</w:t>
+        <w:t xml:space="preserve">No robot access or sensor</w:t>
+      </w:r>
+      <w:r>
+        <w:rPr>
+          <w:rFonts w:cstheme="minorHAnsi"/>
+          <w:lang w:val="en-US"/>
+        </w:rPr>
+        <w:t xml:space="preserve"> (3–5): the hypotheses are decided on public benchmarks and datasets; the robot only validates, so validation can move by a semester or to another PWr robot.</w:t>
       </w:r>
     </w:p>
     <w:p>
@@ -8622,7 +8979,7 @@
           <w:rFonts w:cstheme="minorHAnsi"/>
           <w:lang w:val="en-US"/>
         </w:rPr>
-        <w:t xml:space="preserve"> (3–4): depth priors, scene splitting, mesh rendering.</w:t>
+        <w:t xml:space="preserve"> (3–4): depth priors, scene splitting, other scenes from the public dataset.</w:t>
       </w:r>
     </w:p>
     <w:p>
@@ -8644,14 +9001,14 @@
           <w:i/>
           <w:lang w:val="en-US"/>
         </w:rPr>
-        <w:t xml:space="preserve">Changing venue points</w:t>
-      </w:r>
-      <w:r>
-        <w:rPr>
-          <w:rFonts w:cstheme="minorHAnsi"/>
-          <w:lang w:val="en-US"/>
-        </w:rPr>
-        <w:t xml:space="preserve"> (3): re-check the 2027 list; keep a 140/200-point alternative.</w:t>
+        <w:t xml:space="preserve">Sim-to-real predictivity fails</w:t>
+      </w:r>
+      <w:r>
+        <w:rPr>
+          <w:rFonts w:cstheme="minorHAnsi"/>
+          <w:lang w:val="en-US"/>
+        </w:rPr>
+        <w:t xml:space="preserve"> (4–5): pre-specified SRCC protocol; a negative result still answers RQ4.</w:t>
       </w:r>
     </w:p>
     <w:p>
@@ -8693,7 +9050,7 @@
           <w:rFonts w:cstheme="minorHAnsi"/>
           <w:lang w:val="en-US"/>
         </w:rPr>
-        <w:t xml:space="preserve"> Captures avoid or anonymize personal data (GDPR, PWr rules).</w:t>
+        <w:t xml:space="preserve"> Own captures avoid or anonymize personal data (GDPR, PWr rules); public datasets are used under their licences.</w:t>
       </w:r>
     </w:p>
     <w:permEnd w:id="1742865563"/>

</xml_diff>

<commit_message>
§3: explicit research targets, tasks and deliverables for semesters 1-2
Co-Authored-By: Claude Opus 5.5 <noreply@anthropic.com>
</commit_message>
<xml_diff>
--- a/output/IPB_Grzegorz_Piotrowski.docx
+++ b/output/IPB_Grzegorz_Piotrowski.docx
@@ -1841,7 +1841,7 @@
                 <w:b/>
                 <w:lang w:val="en-US"/>
               </w:rPr>
-              <w:t xml:space="preserve">Preparatory phase.</w:t>
+              <w:t xml:space="preserve">Research target: define the problem and map the state of the art.</w:t>
             </w:r>
           </w:p>
           <w:p>
@@ -1862,7 +1862,7 @@
                 <w:rFonts w:cstheme="minorHAnsi"/>
                 <w:lang w:val="en-US"/>
               </w:rPr>
-              <w:t xml:space="preserve"> Literature review: sim-to-real transfer and domain randomization, learning from synthetic data, representation learning under distribution shift, neural scene reconstruction (NeRF, 3D Gaussian Splatting), learning-based navigation. </w:t>
+              <w:t xml:space="preserve"> Systematic literature review in four areas: (a) sim-to-real transfer and domain randomization, (b) learning under distribution shift and domain adaptation, (c) neural scene reconstruction (NeRF, 3D Gaussian Splatting), (d) learning-based visual navigation. </w:t>
             </w:r>
             <w:r>
               <w:rPr>
@@ -1877,7 +1877,79 @@
                 <w:rFonts w:cstheme="minorHAnsi"/>
                 <w:lang w:val="en-US"/>
               </w:rPr>
-              <w:t xml:space="preserve"> annotated bibliography and gap statement (basis of §6). Place: K46.</w:t>
+              <w:t xml:space="preserve"> annotated bibliography and a written research-gap statement (basis of §6).</w:t>
+            </w:r>
+          </w:p>
+          <w:p>
+            <w:pPr>
+              <w:spacing w:after="40" w:line="240" w:lineRule="auto"/>
+              <w:jc w:val="left"/>
+            </w:pPr>
+            <w:r>
+              <w:rPr>
+                <w:rFonts w:cstheme="minorHAnsi"/>
+                <w:b/>
+                <w:lang w:val="en-US"/>
+              </w:rPr>
+              <w:t xml:space="preserve">T1.2</w:t>
+            </w:r>
+            <w:r>
+              <w:rPr>
+                <w:rFonts w:cstheme="minorHAnsi"/>
+                <w:lang w:val="en-US"/>
+              </w:rPr>
+              <w:t xml:space="preserve"> Identification of the open problem: how much real data sim-to-real transfer needs, and whether reconstructed scenes can replace real data. </w:t>
+            </w:r>
+            <w:r>
+              <w:rPr>
+                <w:rFonts w:cstheme="minorHAnsi"/>
+                <w:i/>
+                <w:lang w:val="en-US"/>
+              </w:rPr>
+              <w:t xml:space="preserve">D:</w:t>
+            </w:r>
+            <w:r>
+              <w:rPr>
+                <w:rFonts w:cstheme="minorHAnsi"/>
+                <w:lang w:val="en-US"/>
+              </w:rPr>
+              <w:t xml:space="preserve"> problem statement and preliminary research questions, discussed with the supervisor.</w:t>
+            </w:r>
+          </w:p>
+          <w:p>
+            <w:pPr>
+              <w:spacing w:after="40" w:line="240" w:lineRule="auto"/>
+              <w:jc w:val="left"/>
+            </w:pPr>
+            <w:r>
+              <w:rPr>
+                <w:rFonts w:cstheme="minorHAnsi"/>
+                <w:b/>
+                <w:lang w:val="en-US"/>
+              </w:rPr>
+              <w:t xml:space="preserve">T1.3</w:t>
+            </w:r>
+            <w:r>
+              <w:rPr>
+                <w:rFonts w:cstheme="minorHAnsi"/>
+                <w:lang w:val="en-US"/>
+              </w:rPr>
+              <w:t xml:space="preserve"> Doctoral School courses of semester 1. </w:t>
+            </w:r>
+            <w:r>
+              <w:rPr>
+                <w:rFonts w:cstheme="minorHAnsi"/>
+                <w:i/>
+                <w:lang w:val="en-US"/>
+              </w:rPr>
+              <w:t xml:space="preserve">D:</w:t>
+            </w:r>
+            <w:r>
+              <w:rPr>
+                <w:rFonts w:cstheme="minorHAnsi"/>
+                <w:lang w:val="en-US"/>
+              </w:rPr>
+              <w:t xml:space="preserve"> completed courses. Place: K46.</w:t>
             </w:r>
             <w:permEnd w:id="717358524"/>
           </w:p>
@@ -1954,6 +2026,20 @@
                 <w:b/>
                 <w:lang w:val="en-US"/>
               </w:rPr>
+              <w:t xml:space="preserve">Research target: formulate the research plan and select the experimental basis.</w:t>
+            </w:r>
+          </w:p>
+          <w:p>
+            <w:pPr>
+              <w:spacing w:after="40" w:line="240" w:lineRule="auto"/>
+              <w:jc w:val="left"/>
+            </w:pPr>
+            <w:r>
+              <w:rPr>
+                <w:rFonts w:cstheme="minorHAnsi"/>
+                <w:b/>
+                <w:lang w:val="en-US"/>
+              </w:rPr>
               <w:t xml:space="preserve">T2.1</w:t>
             </w:r>
             <w:r>
@@ -1961,7 +2047,7 @@
                 <w:rFonts w:cstheme="minorHAnsi"/>
                 <w:lang w:val="en-US"/>
               </w:rPr>
-              <w:t xml:space="preserve"> Research questions, hypotheses and methods; survey of public benchmarks, datasets, simulators and reconstruction tools (candidates in §9). </w:t>
+              <w:t xml:space="preserve"> Formulation of the thesis, research questions RQ1–RQ4 and hypotheses H1–H4 with measurable decision rules and evaluation tiers A–C. </w:t>
             </w:r>
             <w:r>
               <w:rPr>
@@ -1976,7 +2062,94 @@
                 <w:rFonts w:cstheme="minorHAnsi"/>
                 <w:lang w:val="en-US"/>
               </w:rPr>
-              <w:t xml:space="preserve"> this IPB, agreed with the supervisor and signed by 30.09.2026. Place: K46.</w:t>
+              <w:t xml:space="preserve"> §7 and §9 of this IPB.</w:t>
+            </w:r>
+          </w:p>
+          <w:p>
+            <w:pPr>
+              <w:spacing w:after="40" w:line="240" w:lineRule="auto"/>
+              <w:jc w:val="left"/>
+            </w:pPr>
+            <w:r>
+              <w:rPr>
+                <w:rFonts w:cstheme="minorHAnsi"/>
+                <w:b/>
+                <w:lang w:val="en-US"/>
+              </w:rPr>
+              <w:t xml:space="preserve">T2.2</w:t>
+            </w:r>
+            <w:r>
+              <w:rPr>
+                <w:rFonts w:cstheme="minorHAnsi"/>
+                <w:lang w:val="en-US"/>
+              </w:rPr>
+              <w:t xml:space="preserve"> Comparative survey of public benchmarks and datasets (e.g. ScanNet++, HM3D), simulators (e.g. Habitat-Sim) and 3D Gaussian Splatting implementations against the needs of RQ1–RQ4 (real video + reference scan, licence, compute cost). </w:t>
+            </w:r>
+            <w:r>
+              <w:rPr>
+                <w:rFonts w:cstheme="minorHAnsi"/>
+                <w:i/>
+                <w:lang w:val="en-US"/>
+              </w:rPr>
+              <w:t xml:space="preserve">D:</w:t>
+            </w:r>
+            <w:r>
+              <w:rPr>
+                <w:rFonts w:cstheme="minorHAnsi"/>
+                <w:lang w:val="en-US"/>
+              </w:rPr>
+              <w:t xml:space="preserve"> tool-selection note with a shortlist for Stage I.</w:t>
+            </w:r>
+          </w:p>
+          <w:p>
+            <w:pPr>
+              <w:spacing w:after="40" w:line="240" w:lineRule="auto"/>
+              <w:jc w:val="left"/>
+            </w:pPr>
+            <w:r>
+              <w:rPr>
+                <w:rFonts w:cstheme="minorHAnsi"/>
+                <w:b/>
+                <w:lang w:val="en-US"/>
+              </w:rPr>
+              <w:t xml:space="preserve">T2.3</w:t>
+            </w:r>
+            <w:r>
+              <w:rPr>
+                <w:rFonts w:cstheme="minorHAnsi"/>
+                <w:lang w:val="en-US"/>
+              </w:rPr>
+              <w:t xml:space="preserve"> Individual Research Plan agreed with the supervisor. </w:t>
+            </w:r>
+            <w:r>
+              <w:rPr>
+                <w:rFonts w:cstheme="minorHAnsi"/>
+                <w:i/>
+                <w:lang w:val="en-US"/>
+              </w:rPr>
+              <w:t xml:space="preserve">D:</w:t>
+            </w:r>
+            <w:r>
+              <w:rPr>
+                <w:rFonts w:cstheme="minorHAnsi"/>
+                <w:lang w:val="en-US"/>
+              </w:rPr>
+              <w:t xml:space="preserve"> this IPB, signed and submitted by </w:t>
+            </w:r>
+            <w:r>
+              <w:rPr>
+                <w:rFonts w:cstheme="minorHAnsi"/>
+                <w:b/>
+                <w:lang w:val="en-US"/>
+              </w:rPr>
+              <w:t xml:space="preserve">30.09.2026</w:t>
+            </w:r>
+            <w:r>
+              <w:rPr>
+                <w:rFonts w:cstheme="minorHAnsi"/>
+                <w:lang w:val="en-US"/>
+              </w:rPr>
+              <w:t xml:space="preserve">. Place: K46.</w:t>
             </w:r>
             <w:permEnd w:id="1791499248"/>
           </w:p>
@@ -2074,7 +2247,7 @@
                 <w:rFonts w:cstheme="minorHAnsi"/>
                 <w:lang w:val="en-US"/>
               </w:rPr>
-              <w:t xml:space="preserve"> Choice of benchmark scenes, simulator and reconstruction method; pipeline from real video to a trainable scene (camera poses, 3D Gaussian Splatting, collision mesh); fidelity report on ≥ 10 public scenes; pre-registration of the evaluation protocol (§7). </w:t>
+              <w:t xml:space="preserve"> Final choice of benchmark scenes, simulator and reconstruction method from the T2.2 shortlist; pipeline from real video to a trainable scene (camera poses, 3D Gaussian Splatting, collision mesh); fidelity report on ≥ 10 public scenes; pre-registration of the evaluation protocol (§7). </w:t>
             </w:r>
             <w:r>
               <w:rPr>

</xml_diff>

<commit_message>
Wave 6: broaden to general digital-twin policy learning (navigation primary, manipulation as cross-task generalization, twin pipeline as contribution)
Closes #14, closes #15

Co-Authored-By: Claude Opus 5.5 <noreply@anthropic.com>
</commit_message>
<xml_diff>
--- a/output/IPB_Grzegorz_Piotrowski.docx
+++ b/output/IPB_Grzegorz_Piotrowski.docx
@@ -1098,7 +1098,7 @@
           <w:rFonts w:cstheme="minorHAnsi"/>
           <w:lang w:val="en-US"/>
         </w:rPr>
-        <w:t xml:space="preserve"> Efektywne pod względem danych uczenie maszynowe na podstawie neuronowych rekonstrukcji scen: zmniejszanie luki między symulacją a rzeczywistością dla polityk nawigacji wizyjnej przy ograniczonym budżecie danych rzeczywistych</w:t>
+        <w:t xml:space="preserve"> Efektywne pod względem danych uczenie polityk agentów ucieleśnionych w cyfrowych bliźniakach otrzymanych z neuronowej rekonstrukcji scen rzeczywistych, przy ograniczonym budżecie danych rzeczywistych, na przykładzie nawigacji wizyjnej i manipulacji robotycznej</w:t>
       </w:r>
       <w:bookmarkStart w:id="0" w:name="_Hlk95566638"/>
     </w:p>
@@ -1120,7 +1120,7 @@
           <w:rFonts w:cstheme="minorHAnsi"/>
           <w:lang w:val="en-US"/>
         </w:rPr>
-        <w:t xml:space="preserve"> Data-efficient machine learning from neural scene reconstructions: closing the simulation-to-reality gap for visual navigation policies under a limited real-data budget</w:t>
+        <w:t xml:space="preserve"> Data-efficient learning of embodied policies in digital twins built by neural reconstruction of real scenes under a limited real-data budget, with visual navigation and robotic manipulation as applications</w:t>
       </w:r>
     </w:p>
     <w:bookmarkEnd w:id="0"/>
@@ -2226,7 +2226,7 @@
                 <w:b/>
                 <w:lang w:val="en-US"/>
               </w:rPr>
-              <w:t xml:space="preserve">Stage I – learning from reconstructions (RQ1).</w:t>
+              <w:t xml:space="preserve">Stage I – digital-twin pipeline and learning from reconstructions (RQ1).</w:t>
             </w:r>
           </w:p>
           <w:p>
@@ -2247,7 +2247,7 @@
                 <w:rFonts w:cstheme="minorHAnsi"/>
                 <w:lang w:val="en-US"/>
               </w:rPr>
-              <w:t xml:space="preserve"> Final choice of benchmark scenes, simulator and reconstruction method from the T2.2 shortlist; pipeline from real video to a trainable scene (camera poses, 3D Gaussian Splatting, collision mesh); fidelity report on ≥ 10 public scenes; pre-registration of the evaluation protocol (§7). </w:t>
+              <w:t xml:space="preserve"> Final choice of benchmark scenes, simulator and reconstruction method from the T2.2 shortlist; task-agnostic pipeline from a short real capture to a simulation-ready twin (camera poses, 3D Gaussian Splatting, collision mesh) with a written capture protocol; fidelity–cost report on ≥ 10 public scenes (PSNR/SSIM/LPIPS and depth error vs. capture minutes and GPU-hours); pre-registration of the evaluation protocol (§7). </w:t>
             </w:r>
             <w:r>
               <w:rPr>
@@ -2262,7 +2262,7 @@
                 <w:rFonts w:cstheme="minorHAnsi"/>
                 <w:lang w:val="en-US"/>
               </w:rPr>
-              <w:t xml:space="preserve"> code, fidelity report, protocol in the repository. Place: K46, WCSS.</w:t>
+              <w:t xml:space="preserve"> pipeline code, capture protocol, fidelity–cost report and evaluation protocol in the repository. Place: K46, WCSS.</w:t>
             </w:r>
           </w:p>
           <w:p>
@@ -2933,7 +2933,7 @@
                 <w:b/>
                 <w:lang w:val="en-US"/>
               </w:rPr>
-              <w:t xml:space="preserve">Stage IV – generalization and representations (RQ3, H2).</w:t>
+              <w:t xml:space="preserve">Stage IV – cross-scene and cross-task generalization (RQ3, H2).</w:t>
             </w:r>
           </w:p>
           <w:p>
@@ -2954,7 +2954,7 @@
                 <w:rFonts w:cstheme="minorHAnsi"/>
                 <w:lang w:val="en-US"/>
               </w:rPr>
-              <w:t xml:space="preserve"> Augmentation of reconstructed scenes and representation alignment between reconstructed and real observations; evaluation on held-out scenes (tier A), real-world datasets (tier B) and uncaptured PWr or host-lab environments (tier C). </w:t>
+              <w:t xml:space="preserve"> (a) </w:t>
             </w:r>
             <w:r>
               <w:rPr>
@@ -2962,6 +2962,36 @@
                 <w:i/>
                 <w:lang w:val="en-US"/>
               </w:rPr>
+              <w:t xml:space="preserve">Navigation:</w:t>
+            </w:r>
+            <w:r>
+              <w:rPr>
+                <w:rFonts w:cstheme="minorHAnsi"/>
+                <w:lang w:val="en-US"/>
+              </w:rPr>
+              <w:t xml:space="preserve"> augmentation of reconstructed scenes and representation alignment between reconstructed and real observations; evaluation on held-out scenes (tier A), real-world datasets (tier B) and uncaptured PWr or host-lab environments (tier C). (b) </w:t>
+            </w:r>
+            <w:r>
+              <w:rPr>
+                <w:rFonts w:cstheme="minorHAnsi"/>
+                <w:i/>
+                <w:lang w:val="en-US"/>
+              </w:rPr>
+              <w:t xml:space="preserve">Manipulation:</w:t>
+            </w:r>
+            <w:r>
+              <w:rPr>
+                <w:rFonts w:cstheme="minorHAnsi"/>
+                <w:lang w:val="en-US"/>
+              </w:rPr>
+              <w:t xml:space="preserve"> twins of public tabletop scenes and objects built with the unchanged Stage I pipeline; pick-and-place policies trained in a public GPU simulator (ManiSkill3) and evaluated in public real-to-sim environments (SIMPLER), with the same ablation (generic vs. twin only vs. twin + augmentation + alignment) and a real-data-only baseline; simulation-only if time is short (§12). </w:t>
+            </w:r>
+            <w:r>
+              <w:rPr>
+                <w:rFonts w:cstheme="minorHAnsi"/>
+                <w:i/>
+                <w:lang w:val="en-US"/>
+              </w:rPr>
               <w:t xml:space="preserve">D:</w:t>
             </w:r>
             <w:r>
@@ -2969,7 +2999,7 @@
                 <w:rFonts w:cstheme="minorHAnsi"/>
                 <w:lang w:val="en-US"/>
               </w:rPr>
-              <w:t xml:space="preserve"> ablation study (</w:t>
+              <w:t xml:space="preserve"> ablation study and cross-task results (</w:t>
             </w:r>
             <w:r>
               <w:rPr>
@@ -2984,7 +3014,7 @@
                 <w:rFonts w:cstheme="minorHAnsi"/>
                 <w:lang w:val="en-US"/>
               </w:rPr>
-              <w:t xml:space="preserve">).</w:t>
+              <w:t xml:space="preserve">). Place: K46, WCSS; optional validation on a manipulator of the K29 Robotics Laboratory.</w:t>
             </w:r>
           </w:p>
           <w:p>
@@ -3071,7 +3101,7 @@
                 <w:rFonts w:cstheme="minorHAnsi"/>
                 <w:lang w:val="en-US"/>
               </w:rPr>
-              <w:t xml:space="preserve"> (Stage IV) submitted to </w:t>
+              <w:t xml:space="preserve"> (Stage IV, cross-task: navigation → manipulation) submitted to </w:t>
             </w:r>
             <w:r>
               <w:rPr>
@@ -3101,7 +3131,7 @@
                 <w:rFonts w:cstheme="minorHAnsi"/>
                 <w:lang w:val="en-US"/>
               </w:rPr>
-              <w:t xml:space="preserve"> (~May 2028). </w:t>
+              <w:t xml:space="preserve"> (~May 2028), or RSS 2028. </w:t>
             </w:r>
             <w:r>
               <w:rPr>
@@ -4174,7 +4204,7 @@
           <w:rFonts w:cstheme="minorHAnsi"/>
           <w:lang w:val="en-US"/>
         </w:rPr>
-        <w:t xml:space="preserve">. Deep reinforcement learning, imitation learning and large pretrained models learn strong behaviour, but only from very large amounts of experience: near-perfect point-goal navigation in simulation took billions of frames. In many applications such data can only come from the real world, where it is slow, expensive and sometimes risky to collect. The central question is therefore how to learn well from </w:t>
+        <w:t xml:space="preserve">. Deep reinforcement learning, imitation learning and large pretrained models learn strong behaviour, but only from very large amounts of experience: near-perfect point-goal navigation in simulation took billions of frames. For embodied agents (mobile robots, manipulators) such data can only come from the real world, where it is slow, expensive and sometimes risky to collect. The central question is therefore how to learn well from </w:t>
       </w:r>
       <w:r>
         <w:rPr>
@@ -4202,7 +4232,7 @@
           <w:rFonts w:cstheme="minorHAnsi"/>
           <w:lang w:val="en-US"/>
         </w:rPr>
-        <w:t xml:space="preserve">Simulation and synthetic data are the usual answer, but models trained on them often fail on real inputs. This </w:t>
+        <w:t xml:space="preserve">Simulation is the usual answer, but policies trained there often fail on real inputs. This </w:t>
       </w:r>
       <w:r>
         <w:rPr>
@@ -4217,7 +4247,7 @@
           <w:rFonts w:cstheme="minorHAnsi"/>
           <w:lang w:val="en-US"/>
         </w:rPr>
-        <w:t xml:space="preserve"> is a distribution shift between training and deployment data: in appearance (textures, lighting, sensor noise), geometry and dynamics. Domain randomization widens the training distribution by hand and still gives no guarantee for a particular target domain; training directly on real data does not scale.</w:t>
+        <w:t xml:space="preserve"> is a distribution shift between training and deployment data in appearance, geometry and dynamics. Domain randomization widens the training distribution by hand and still gives no guarantee for a particular target domain; training directly on real data does not scale.</w:t>
       </w:r>
     </w:p>
     <w:p>
@@ -4231,14 +4261,14 @@
           <w:b/>
           <w:lang w:val="en-US"/>
         </w:rPr>
-        <w:t xml:space="preserve">Neural scene reconstruction</w:t>
-      </w:r>
-      <w:r>
-        <w:rPr>
-          <w:rFonts w:cstheme="minorHAnsi"/>
-          <w:lang w:val="en-US"/>
-        </w:rPr>
-        <w:t xml:space="preserve"> (Neural Radiance Fields, 3D Gaussian Splatting) opens a third path. A few minutes of real video are turned into a photorealistic, interactive model of the target environment, in which a model can be trained at scale (</w:t>
+        <w:t xml:space="preserve">Digital twins built by neural scene reconstruction</w:t>
+      </w:r>
+      <w:r>
+        <w:rPr>
+          <w:rFonts w:cstheme="minorHAnsi"/>
+          <w:lang w:val="en-US"/>
+        </w:rPr>
+        <w:t xml:space="preserve"> (Neural Radiance Fields, 3D Gaussian Splatting) open a third path. A few minutes of real video are turned into a photorealistic, interactive model of the target scene, in which a policy can be trained at scale (</w:t>
       </w:r>
       <w:r>
         <w:rPr>
@@ -4283,7 +4313,22 @@
           <w:rFonts w:cstheme="minorHAnsi"/>
           <w:lang w:val="en-US"/>
         </w:rPr>
-        <w:t xml:space="preserve"> make the reconstructed and real data distributions close enough, how to generalize beyond the captured scenes, and how a few real observations can correct the simulation.</w:t>
+        <w:t xml:space="preserve"> bring reconstructed and real data close enough, how to generalize beyond the captured scenes </w:t>
+      </w:r>
+      <w:r>
+        <w:rPr>
+          <w:rFonts w:cstheme="minorHAnsi"/>
+          <w:b/>
+          <w:lang w:val="en-US"/>
+        </w:rPr>
+        <w:t xml:space="preserve">and to other tasks and embodiments</w:t>
+      </w:r>
+      <w:r>
+        <w:rPr>
+          <w:rFonts w:cstheme="minorHAnsi"/>
+          <w:lang w:val="en-US"/>
+        </w:rPr>
+        <w:t xml:space="preserve">, how a few real observations can correct the simulation, and what a twin costs to build and how faithful it is.</w:t>
       </w:r>
     </w:p>
     <w:p>
@@ -4304,7 +4349,7 @@
           <w:rFonts w:cstheme="minorHAnsi"/>
           <w:lang w:val="en-US"/>
         </w:rPr>
-        <w:t xml:space="preserve"> The research object is a learning methodology, which places it in </w:t>
+        <w:t xml:space="preserve"> The research object is a general, task-agnostic learning methodology, which places it in </w:t>
       </w:r>
       <w:r>
         <w:rPr>
@@ -4319,7 +4364,7 @@
           <w:rFonts w:cstheme="minorHAnsi"/>
           <w:lang w:val="en-US"/>
         </w:rPr>
-        <w:t xml:space="preserve">: data-efficient learning, learning from reconstructed and synthetic data, representation learning under distribution shift, and methods for testing whether results obtained in simulation can be trusted. </w:t>
+        <w:t xml:space="preserve">: data-efficient learning, learning from reconstructed data, representation learning under distribution shift, and methods for testing whether results from simulation can be trusted. </w:t>
       </w:r>
       <w:r>
         <w:rPr>
@@ -4334,7 +4379,22 @@
           <w:rFonts w:cstheme="minorHAnsi"/>
           <w:lang w:val="en-US"/>
         </w:rPr>
-        <w:t xml:space="preserve"> of mobile robots is the application and testbed, chosen because public simulators, benchmarks and real-world datasets allow controlled, reproducible measurement of the gap. The main evaluation uses these public resources; trials on a real robot validate the conclusions. The topic fits the representation learning, computer vision and generative modelling work of the Department of Artificial Intelligence (K46). The computation-heavy parts (3D reconstruction, large-scale training) can run on the GPU infrastructure available to PWr researchers (WCSS, PLGrid). Its main result, a measured answer to "how much real data is enough", is useful whatever the outcome.</w:t>
+        <w:t xml:space="preserve"> is the primary testbed, because public simulators, benchmarks and real-world datasets allow controlled, reproducible measurement of the gap; trials on a real robot validate the conclusions. </w:t>
+      </w:r>
+      <w:r>
+        <w:rPr>
+          <w:rFonts w:cstheme="minorHAnsi"/>
+          <w:b/>
+          <w:lang w:val="en-US"/>
+        </w:rPr>
+        <w:t xml:space="preserve">Robotic manipulation</w:t>
+      </w:r>
+      <w:r>
+        <w:rPr>
+          <w:rFonts w:cstheme="minorHAnsi"/>
+          <w:lang w:val="en-US"/>
+        </w:rPr>
+        <w:t xml:space="preserve"> (e.g. tabletop pick-and-place in reconstructed scenes) is the generalization domain: it tests, mainly on public simulators and benchmarks, that the method is not specific to one task or robot. The topic fits the representation learning, computer vision and generative modelling work of the Department of Artificial Intelligence (K46). The computation-heavy parts can run on the GPU infrastructure available to PWr researchers (WCSS, PLGrid). The main result, a measured answer to "how much real data is enough", is useful whatever the outcome.</w:t>
       </w:r>
     </w:p>
     <w:p>
@@ -4355,7 +4415,7 @@
           <w:rFonts w:cstheme="minorHAnsi"/>
           <w:lang w:val="en-US"/>
         </w:rPr>
-        <w:t xml:space="preserve"> service, assistive and warehouse robotics, inspection and last-mile delivery, and rapid deployment of learned systems in new buildings with minimal on-site data collection. More broadly, the methods apply wherever models are trained on reconstructed or synthetic data and deployed on real sensor data: other embodied agents (manipulators, drones), digital twins, and perception models for autonomous systems.</w:t>
+        <w:t xml:space="preserve"> service, assistive and warehouse robotics, inspection and delivery, flexible industrial manipulation, and rapid deployment of learned systems in new buildings and workcells with minimal on-site data collection. More broadly, the methods apply wherever models are trained on reconstructed or synthetic data and deployed on real sensor data: other embodied agents, industrial digital twins, and perception for autonomous systems.</w:t>
       </w:r>
     </w:p>
     <w:permEnd w:id="1178868985"/>
@@ -4733,7 +4793,7 @@
           <w:rFonts w:cstheme="minorHAnsi"/>
           <w:lang w:val="en-US"/>
         </w:rPr>
-        <w:t xml:space="preserve"> Photorealistic simulators such as Habitat [1, 2] and CARLA [3] made large-scale training of embodied agents possible. Wijmans et al. [4] reached near-perfect point-goal navigation, but only after 2.5 billion frames of simulated experience, a volume out of reach on physical robots. </w:t>
+        <w:t xml:space="preserve"> Photorealistic simulators such as Habitat [1, 2] and CARLA [3] made large-scale training of embodied agents possible. Wijmans et al. [4] reached near-perfect point-goal navigation only after 2.5 billion simulated frames, a volume out of reach on physical robots. </w:t>
       </w:r>
       <w:r>
         <w:rPr>
@@ -4748,7 +4808,7 @@
           <w:rFonts w:cstheme="minorHAnsi"/>
           <w:lang w:val="en-US"/>
         </w:rPr>
-        <w:t xml:space="preserve"> (GNM [5], ViNT [6], NoMaD [7]) are trained on pooled real-robot datasets, and Open X-Embodiment [8] shows that robot learning scales with data. Collecting such data is still costly, and every new environment or platform typically needs more real-world data.</w:t>
+        <w:t xml:space="preserve"> (GNM [5], ViNT [6], NoMaD [7]) are trained on pooled real-robot datasets, and Open X-Embodiment [8] shows that robot learning scales with data. Such data is costly, and every new environment or platform typically needs more of it.</w:t>
       </w:r>
     </w:p>
     <w:p>
@@ -4769,7 +4829,7 @@
           <w:rFonts w:cstheme="minorHAnsi"/>
           <w:lang w:val="en-US"/>
         </w:rPr>
-        <w:t xml:space="preserve"> Policies trained in simulation degrade on real hardware because of differences in appearance, geometry and dynamics [9, 10]. Kadian et al. [11] showed that simulation performance can be a poor predictor of real-world performance unless the simulator is carefully tuned, and introduced the Sim-vs-Real Correlation Coefficient (SRCC) to measure it. Truong et al. [12] found that lower-fidelity simulation with abstracted dynamics can transfer better for navigation. So </w:t>
+        <w:t xml:space="preserve"> Policies trained in simulation degrade on real hardware because of differences in appearance, geometry and dynamics [9, 10]. Kadian et al. [11] showed that simulation can poorly predict real-world performance and introduced the Sim-vs-Real Correlation Coefficient (SRCC) to measure it. Truong et al. [12] found that lower-fidelity simulation can transfer better, so </w:t>
       </w:r>
       <w:r>
         <w:rPr>
@@ -4784,7 +4844,7 @@
           <w:rFonts w:cstheme="minorHAnsi"/>
           <w:lang w:val="en-US"/>
         </w:rPr>
-        <w:t xml:space="preserve"> aspects of reality to model is itself an open question.</w:t>
+        <w:t xml:space="preserve"> aspects of reality to model is itself open.</w:t>
       </w:r>
     </w:p>
     <w:p>
@@ -4805,7 +4865,7 @@
           <w:rFonts w:cstheme="minorHAnsi"/>
           <w:lang w:val="en-US"/>
         </w:rPr>
-        <w:t xml:space="preserve"> Domain randomization trains policies on widely varied synthetic appearance [13, 14] or dynamics [15], so that reality looks like just another variation. It powers landmark results in agile flight [16] and drone racing [17]. Its drawbacks are hand-tuned randomization ranges and robustness bought at the cost of performance in the specific target domain. Adaptive approaches fit simulation parameters to real rollouts [18], and domain adaptation [19] reduces the amount of real data needed, but does not remove the need for it.</w:t>
+        <w:t xml:space="preserve"> Domain randomization trains policies on widely varied synthetic appearance [13, 14] or dynamics [15], so that reality is just another variation, as in agile flight [16] and drone racing [17]. Its drawbacks are hand-tuned ranges and lower target-domain performance. Adaptive approaches fit simulation parameters to real rollouts [18], and domain adaptation [19] reduces, but does not remove, the need for real data.</w:t>
       </w:r>
     </w:p>
     <w:p>
@@ -4826,7 +4886,7 @@
           <w:rFonts w:cstheme="minorHAnsi"/>
           <w:lang w:val="en-US"/>
         </w:rPr>
-        <w:t xml:space="preserve"> Neural Radiance Fields [20] and 3D Gaussian Splatting (3DGS) [21] produce photorealistic novel views from ordinary image captures, and 3DGS renders in real time. This allows </w:t>
+        <w:t xml:space="preserve"> Neural Radiance Fields [20] and 3D Gaussian Splatting (3DGS) [21] render photorealistic novel views from ordinary images, 3DGS in real time. This allows </w:t>
       </w:r>
       <w:r>
         <w:rPr>
@@ -4841,7 +4901,7 @@
           <w:rFonts w:cstheme="minorHAnsi"/>
           <w:lang w:val="en-US"/>
         </w:rPr>
-        <w:t xml:space="preserve"> simulators built from real data: NeRF2Real [22] trained bipedal skills inside a NeRF of the target scene, and RialTo [23] robustified manipulation policies in digital twins built from small amounts of real data. Since 2024 the idea has reached navigation: 3DGS simulators gave direct sim-to-real transfer of visual drone navigation [24–26]; VR-Robo [27] transferred RGB-only legged goal-reaching policies from a 3DGS twin with mesh-based physics; Vid2Sim [28] built urban simulators from monocular video and reported a 68.3% real-world success-rate gain over prior simulators; ReaDy-Go [29] added animated humans as moving obstacles. Closest to this dissertation, EmbodiedSplat [30] fine-tunes pretrained image-goal navigation policies in meshes reconstructed from 20–30-minute phone captures of indoor scenes, improves real-robot success rate in a captured scene, and reports high SRCC for the reconstructed meshes. These navigation systems use a fixed capture per scene: none varies the amount of real data (capture length, real rollouts) or compares against policies trained on real robot experience at matched budgets. The closest such analysis, in manipulation, is RialTo's ablation over 0–15 real demonstrations [23]. Multi-room scenes, collision geometry and generalization to environments that were never captured also remain open.</w:t>
+        <w:t xml:space="preserve"> simulators built from real data; NeRF2Real [22] trained bipedal skills inside a NeRF of the target scene. Since 2024 the idea has reached navigation: 3DGS twins transferred visual drone [24–26] and RGB-only legged [27] navigation policies directly to reality, Vid2Sim [28] built urban simulators from monocular video (a 68.3% real-world success-rate gain over prior simulators), and ReaDy-Go [29] added moving humans. Closest to this dissertation, EmbodiedSplat [30] fine-tunes pretrained image-goal policies in meshes from 20–30-minute phone captures, improves real-robot success in a captured scene and reports high SRCC. These systems use a fixed capture per scene: none varies the amount of real data or compares against policies trained on real robot experience at matched budgets.</w:t>
       </w:r>
     </w:p>
     <w:p>
@@ -4855,44 +4915,14 @@
           <w:b/>
           <w:lang w:val="en-US"/>
         </w:rPr>
-        <w:t xml:space="preserve">Learning under distribution shift.</w:t>
-      </w:r>
-      <w:r>
-        <w:rPr>
-          <w:rFonts w:cstheme="minorHAnsi"/>
-          <w:lang w:val="en-US"/>
-        </w:rPr>
-        <w:t xml:space="preserve"> From a machine-learning perspective, the sim-to-real gap is a domain shift between training and deployment data. Unsupervised domain adaptation aligns feature distributions across domains adversarially [31] or at both pixel and feature level [32]. Neural scaling laws [33] describe how performance grows with the amount of data, but it is not known how </w:t>
-      </w:r>
-      <w:r>
-        <w:rPr>
-          <w:rFonts w:cstheme="minorHAnsi"/>
-          <w:i/>
-          <w:lang w:val="en-US"/>
-        </w:rPr>
-        <w:t xml:space="preserve">real</w:t>
-      </w:r>
-      <w:r>
-        <w:rPr>
-          <w:rFonts w:cstheme="minorHAnsi"/>
-          <w:lang w:val="en-US"/>
-        </w:rPr>
-        <w:t xml:space="preserve"> and </w:t>
-      </w:r>
-      <w:r>
-        <w:rPr>
-          <w:rFonts w:cstheme="minorHAnsi"/>
-          <w:i/>
-          <w:lang w:val="en-US"/>
-        </w:rPr>
-        <w:t xml:space="preserve">reconstructed</w:t>
-      </w:r>
-      <w:r>
-        <w:rPr>
-          <w:rFonts w:cstheme="minorHAnsi"/>
-          <w:lang w:val="en-US"/>
-        </w:rPr>
-        <w:t xml:space="preserve"> data trade off. Large 3D scene datasets (HM3D [34], ScanNet++ [35]) now make it possible to study this question in a controlled way, where real captures act as a proxy for reality.</w:t>
+        <w:t xml:space="preserve">Digital twins for manipulation.</w:t>
+      </w:r>
+      <w:r>
+        <w:rPr>
+          <w:rFonts w:cstheme="minorHAnsi"/>
+          <w:lang w:val="en-US"/>
+        </w:rPr>
+        <w:t xml:space="preserve"> RialTo [23] robustifies manipulation policies by reinforcement learning in twins built from little real data; its ablation over 0–15 real demonstrations is the closest analysis of a real-data budget. SplatSim [36] renders simulation with Gaussian splats and transfers RGB manipulation policies zero-shot (86.25% real success vs. 97.5% for policies trained on real data). SIMPLER [37] shows that simulated evaluation of manipulation policies correlates strongly with real evaluation, and the GPU simulator ManiSkill3 [38] includes real-world digital-twin environments. Each work builds its twin for one task and embodiment; whether one pipeline serves navigation and manipulation, and at what capture and compute cost, has not been measured.</w:t>
       </w:r>
     </w:p>
     <w:p>
@@ -4906,6 +4936,57 @@
           <w:b/>
           <w:lang w:val="en-US"/>
         </w:rPr>
+        <w:t xml:space="preserve">Learning under distribution shift.</w:t>
+      </w:r>
+      <w:r>
+        <w:rPr>
+          <w:rFonts w:cstheme="minorHAnsi"/>
+          <w:lang w:val="en-US"/>
+        </w:rPr>
+        <w:t xml:space="preserve"> In machine-learning terms the sim-to-real gap is a domain shift. Unsupervised domain adaptation aligns feature distributions adversarially [31] or at pixel and feature level [32]. Scaling laws [33] describe how performance grows with data, but not how </w:t>
+      </w:r>
+      <w:r>
+        <w:rPr>
+          <w:rFonts w:cstheme="minorHAnsi"/>
+          <w:i/>
+          <w:lang w:val="en-US"/>
+        </w:rPr>
+        <w:t xml:space="preserve">real</w:t>
+      </w:r>
+      <w:r>
+        <w:rPr>
+          <w:rFonts w:cstheme="minorHAnsi"/>
+          <w:lang w:val="en-US"/>
+        </w:rPr>
+        <w:t xml:space="preserve"> and </w:t>
+      </w:r>
+      <w:r>
+        <w:rPr>
+          <w:rFonts w:cstheme="minorHAnsi"/>
+          <w:i/>
+          <w:lang w:val="en-US"/>
+        </w:rPr>
+        <w:t xml:space="preserve">reconstructed</w:t>
+      </w:r>
+      <w:r>
+        <w:rPr>
+          <w:rFonts w:cstheme="minorHAnsi"/>
+          <w:lang w:val="en-US"/>
+        </w:rPr>
+        <w:t xml:space="preserve"> data trade off. 3D scene datasets (HM3D [34], ScanNet++ [35]) allow a controlled study, with real captures as a proxy for reality.</w:t>
+      </w:r>
+    </w:p>
+    <w:p>
+      <w:pPr>
+        <w:spacing w:after="120" w:line="240" w:lineRule="auto"/>
+        <w:jc w:val="both"/>
+      </w:pPr>
+      <w:r>
+        <w:rPr>
+          <w:rFonts w:cstheme="minorHAnsi"/>
+          <w:b/>
+          <w:lang w:val="en-US"/>
+        </w:rPr>
         <w:t xml:space="preserve">Research gap.</w:t>
       </w:r>
       <w:r>
@@ -4921,14 +5002,14 @@
           <w:b/>
           <w:lang w:val="en-US"/>
         </w:rPr>
-        <w:t xml:space="preserve">trade-off between real-data budget and deployed navigation performance</w:t>
-      </w:r>
-      <w:r>
-        <w:rPr>
-          <w:rFonts w:cstheme="minorHAnsi"/>
-          <w:lang w:val="en-US"/>
-        </w:rPr>
-        <w:t xml:space="preserve"> in a real-to-sim-to-real pipeline. We also lack methods that (i) combine reconstructed scenes with targeted randomization to generalize beyond the captured environments, and (ii) use a small number of real rollouts to iteratively correct the simulation. This dissertation addresses that gap.</w:t>
+        <w:t xml:space="preserve">trade-off between real-data budget and deployed policy performance</w:t>
+      </w:r>
+      <w:r>
+        <w:rPr>
+          <w:rFonts w:cstheme="minorHAnsi"/>
+          <w:lang w:val="en-US"/>
+        </w:rPr>
+        <w:t xml:space="preserve"> in real-to-sim-to-real learning, nor a twin-building protocol with measured cost and fidelity across tasks. Also missing are methods that (i) combine twins with augmentation and representation alignment to generalize to uncaptured scenes and new tasks, and (ii) correct the twin from a few real rollouts. This dissertation addresses that gap in navigation, with manipulation as the generalization domain.</w:t>
       </w:r>
     </w:p>
     <w:p>
@@ -5265,7 +5346,7 @@
           <w:rFonts w:cstheme="minorHAnsi"/>
           <w:lang w:val="en-US"/>
         </w:rPr>
-        <w:t xml:space="preserve">[23] M. Torne Villasevil et al., "Reconciling Reality through Simulation," RSS, 2024.</w:t>
+        <w:t xml:space="preserve">[23] M. Torne et al., "Reconciling Reality through Simulation," RSS, 2024.</w:t>
       </w:r>
     </w:p>
     <w:p>
@@ -5391,7 +5472,7 @@
           <w:rFonts w:cstheme="minorHAnsi"/>
           <w:lang w:val="en-US"/>
         </w:rPr>
-        <w:t xml:space="preserve">[32] J. Hoffman et al., "CyCADA: Cycle-Consistent Adversarial Domain Adaptation," ICML, 2018.</w:t>
+        <w:t xml:space="preserve">[32] J. Hoffman et al., "CyCADA," ICML, 2018.</w:t>
       </w:r>
     </w:p>
     <w:p>
@@ -5419,7 +5500,7 @@
           <w:rFonts w:cstheme="minorHAnsi"/>
           <w:lang w:val="en-US"/>
         </w:rPr>
-        <w:t xml:space="preserve">[34] S. K. Ramakrishnan et al., "Habitat-Matterport 3D Dataset (HM3D)," NeurIPS Datasets and Benchmarks, 2021.</w:t>
+        <w:t xml:space="preserve">[34] S. K. Ramakrishnan et al., "Habitat-Matterport 3D Dataset," NeurIPS Datasets and Benchmarks, 2021.</w:t>
       </w:r>
     </w:p>
     <w:p>
@@ -5433,7 +5514,49 @@
           <w:rFonts w:cstheme="minorHAnsi"/>
           <w:lang w:val="en-US"/>
         </w:rPr>
-        <w:t xml:space="preserve">[35] C. Yeshwanth et al., "ScanNet++: A High-Fidelity Dataset of 3D Indoor Scenes," ICCV, 2023.</w:t>
+        <w:t xml:space="preserve">[35] C. Yeshwanth et al., "ScanNet++," ICCV, 2023.</w:t>
+      </w:r>
+    </w:p>
+    <w:p>
+      <w:pPr>
+        <w:spacing w:after="0" w:line="240" w:lineRule="auto"/>
+        <w:ind w:left="397" w:hanging="397"/>
+        <w:jc w:val="left"/>
+      </w:pPr>
+      <w:r>
+        <w:rPr>
+          <w:rFonts w:cstheme="minorHAnsi"/>
+          <w:lang w:val="en-US"/>
+        </w:rPr>
+        <w:t xml:space="preserve">[36] M. N. Qureshi et al., "SplatSim," ICRA, 2025.</w:t>
+      </w:r>
+    </w:p>
+    <w:p>
+      <w:pPr>
+        <w:spacing w:after="0" w:line="240" w:lineRule="auto"/>
+        <w:ind w:left="397" w:hanging="397"/>
+        <w:jc w:val="left"/>
+      </w:pPr>
+      <w:r>
+        <w:rPr>
+          <w:rFonts w:cstheme="minorHAnsi"/>
+          <w:lang w:val="en-US"/>
+        </w:rPr>
+        <w:t xml:space="preserve">[37] X. Li et al., "Evaluating Real-World Robot Manipulation Policies in Simulation," CoRL, 2024.</w:t>
+      </w:r>
+    </w:p>
+    <w:p>
+      <w:pPr>
+        <w:spacing w:after="0" w:line="240" w:lineRule="auto"/>
+        <w:ind w:left="397" w:hanging="397"/>
+        <w:jc w:val="left"/>
+      </w:pPr>
+      <w:r>
+        <w:rPr>
+          <w:rFonts w:cstheme="minorHAnsi"/>
+          <w:lang w:val="en-US"/>
+        </w:rPr>
+        <w:t xml:space="preserve">[38] S. Tao et al., "ManiSkill3," RSS, 2025.</w:t>
       </w:r>
     </w:p>
     <w:permEnd w:id="174659581"/>
@@ -5675,7 +5798,7 @@
           <w:rFonts w:cstheme="minorHAnsi"/>
           <w:lang w:val="en-US"/>
         </w:rPr>
-        <w:t xml:space="preserve"> Learning in a photorealistic simulation reconstructed from a small budget of real observations, with representations aligned between reconstructed and real data, yields navigation policies that perform in the target domain not worse than policies learned from ≥ 10× more real data.</w:t>
+        <w:t xml:space="preserve"> Embodied policies learned in a digital twin reconstructed from a small budget of real observations, with aligned representations, perform in the target domain not worse than policies learned from ≥ 10× more real data, and the method transfers across scenes and tasks. Visual navigation is the primary testbed; robotic manipulation tests generalization.</w:t>
       </w:r>
     </w:p>
     <w:p>
@@ -5711,7 +5834,7 @@
           <w:rFonts w:cstheme="minorHAnsi"/>
           <w:lang w:val="en-US"/>
         </w:rPr>
-        <w:t xml:space="preserve"> (the real-data-budget study). RQ3/H2 (generalization, representations) and RQ4/H3 (correction, predictivity) are extensions.</w:t>
+        <w:t xml:space="preserve"> (real-data budget, navigation). RQ3/H2 (cross-scene and cross-task generalization) and RQ4/H3 (correction, predictivity) are extensions.</w:t>
       </w:r>
     </w:p>
     <w:p>
@@ -5732,7 +5855,7 @@
           <w:rFonts w:cstheme="minorHAnsi"/>
           <w:lang w:val="en-US"/>
         </w:rPr>
-        <w:t xml:space="preserve"> Does learning in a reconstruction built from minutes of real video of the target environment (</w:t>
+        <w:t xml:space="preserve"> Does training an embodied policy in a twin built from minutes of real video of the target scene (</w:t>
       </w:r>
       <w:r>
         <w:rPr>
@@ -5747,7 +5870,7 @@
           <w:rFonts w:cstheme="minorHAnsi"/>
           <w:lang w:val="en-US"/>
         </w:rPr>
-        <w:t xml:space="preserve">), with deployment on real observations (</w:t>
+        <w:t xml:space="preserve">), then deploying it on real observations (</w:t>
       </w:r>
       <w:r>
         <w:rPr>
@@ -5804,7 +5927,7 @@
           <w:rFonts w:cstheme="minorHAnsi"/>
           <w:lang w:val="en-US"/>
         </w:rPr>
-        <w:t xml:space="preserve"> Which data augmentation and representation-learning objectives (aligning reconstructed and real observations) let policies generalize to environments that were </w:t>
+        <w:t xml:space="preserve"> Which augmentation and representation-alignment objectives let policies generalize to scenes that were </w:t>
       </w:r>
       <w:r>
         <w:rPr>
@@ -5819,7 +5942,7 @@
           <w:rFonts w:cstheme="minorHAnsi"/>
           <w:lang w:val="en-US"/>
         </w:rPr>
-        <w:t xml:space="preserve"> captured?</w:t>
+        <w:t xml:space="preserve"> captured and to another task and embodiment (navigation → manipulation)?</w:t>
       </w:r>
     </w:p>
     <w:p>
@@ -5840,7 +5963,7 @@
           <w:rFonts w:cstheme="minorHAnsi"/>
           <w:lang w:val="en-US"/>
         </w:rPr>
-        <w:t xml:space="preserve"> Can a few real rollouts correct the simulation so that it predicts real performance?</w:t>
+        <w:t xml:space="preserve"> Can a few real rollouts correct the twin so that it predicts real performance?</w:t>
       </w:r>
     </w:p>
     <w:p>
@@ -5854,59 +5977,44 @@
           <w:b/>
           <w:lang w:val="en-US"/>
         </w:rPr>
-        <w:t xml:space="preserve">Evaluation tiers.</w:t>
-      </w:r>
-      <w:r>
-        <w:rPr>
-          <w:rFonts w:cstheme="minorHAnsi"/>
-          <w:lang w:val="en-US"/>
-        </w:rPr>
-        <w:t xml:space="preserve"> (A) </w:t>
-      </w:r>
-      <w:r>
-        <w:rPr>
-          <w:rFonts w:cstheme="minorHAnsi"/>
-          <w:i/>
-          <w:lang w:val="en-US"/>
-        </w:rPr>
-        <w:t xml:space="preserve">Benchmark, primary:</w:t>
-      </w:r>
-      <w:r>
-        <w:rPr>
-          <w:rFonts w:cstheme="minorHAnsi"/>
-          <w:lang w:val="en-US"/>
-        </w:rPr>
-        <w:t xml:space="preserve"> ≥ 10 public indoor scenes with real video and a reference 3D scan, which serves in the simulator as the target domain ("proxy reality"); some scenes are held out as uncaptured. (B) </w:t>
-      </w:r>
-      <w:r>
-        <w:rPr>
-          <w:rFonts w:cstheme="minorHAnsi"/>
-          <w:i/>
-          <w:lang w:val="en-US"/>
-        </w:rPr>
-        <w:t xml:space="preserve">Real-world datasets:</w:t>
-      </w:r>
-      <w:r>
-        <w:rPr>
-          <w:rFonts w:cstheme="minorHAnsi"/>
-          <w:lang w:val="en-US"/>
-        </w:rPr>
-        <w:t xml:space="preserve"> held-out real frames for representation metrics. (C) </w:t>
-      </w:r>
-      <w:r>
-        <w:rPr>
-          <w:rFonts w:cstheme="minorHAnsi"/>
-          <w:i/>
-          <w:lang w:val="en-US"/>
-        </w:rPr>
-        <w:t xml:space="preserve">Real-robot validation:</w:t>
-      </w:r>
-      <w:r>
-        <w:rPr>
-          <w:rFonts w:cstheme="minorHAnsi"/>
-          <w:lang w:val="en-US"/>
-        </w:rPr>
-        <w:t xml:space="preserve"> ≥ 2 PWr environments, 20 start–goal pairs × 3 trials per policy. Metrics: success rate (SR; primary), SPL, collisions. </w:t>
+        <w:t xml:space="preserve">Evaluation.</w:t>
+      </w:r>
+      <w:r>
+        <w:rPr>
+          <w:rFonts w:cstheme="minorHAnsi"/>
+          <w:lang w:val="en-US"/>
+        </w:rPr>
+        <w:t xml:space="preserve"> </w:t>
+      </w:r>
+      <w:r>
+        <w:rPr>
+          <w:rFonts w:cstheme="minorHAnsi"/>
+          <w:i/>
+          <w:lang w:val="en-US"/>
+        </w:rPr>
+        <w:t xml:space="preserve">Navigation:</w:t>
+      </w:r>
+      <w:r>
+        <w:rPr>
+          <w:rFonts w:cstheme="minorHAnsi"/>
+          <w:lang w:val="en-US"/>
+        </w:rPr>
+        <w:t xml:space="preserve"> (A, primary) ≥ 10 public indoor scenes with real video and a reference 3D scan that serves as the target domain ("proxy reality"), some held out as uncaptured; (B) real-world datasets for representation metrics; (C) real-robot validation in ≥ 2 PWr environments, 20 start–goal pairs × 3 trials per policy. Metrics: success rate (SR; primary), SPL, collisions. </w:t>
+      </w:r>
+      <w:r>
+        <w:rPr>
+          <w:rFonts w:cstheme="minorHAnsi"/>
+          <w:i/>
+          <w:lang w:val="en-US"/>
+        </w:rPr>
+        <w:t xml:space="preserve">Manipulation:</w:t>
+      </w:r>
+      <w:r>
+        <w:rPr>
+          <w:rFonts w:cstheme="minorHAnsi"/>
+          <w:lang w:val="en-US"/>
+        </w:rPr>
+        <w:t xml:space="preserve"> tabletop pick-and-place in twins of public scenes and objects in a public simulator; metric: task SR. </w:t>
       </w:r>
       <w:r>
         <w:rPr>
@@ -5921,7 +6029,7 @@
           <w:rFonts w:cstheme="minorHAnsi"/>
           <w:lang w:val="en-US"/>
         </w:rPr>
-        <w:t xml:space="preserve"> B = minutes of target-domain data (capture plus real experience). Baselines: a pretrained navigation model fine-tuned by behaviour cloning on target-domain trajectories of budget B (</w:t>
+        <w:t xml:space="preserve"> B = minutes of target-domain data (capture plus real experience). Baselines: a pretrained policy fine-tuned by behaviour cloning on target-domain data of budget B (</w:t>
       </w:r>
       <w:r>
         <w:rPr>
@@ -5936,7 +6044,7 @@
           <w:rFonts w:cstheme="minorHAnsi"/>
           <w:lang w:val="en-US"/>
         </w:rPr>
-        <w:t xml:space="preserve">), and the same policy trained on the simulator's public scenes with domain randomization (</w:t>
+        <w:t xml:space="preserve">), and the same policy trained with domain randomization on generic scenes (</w:t>
       </w:r>
       <w:r>
         <w:rPr>
@@ -5951,7 +6059,7 @@
           <w:rFonts w:cstheme="minorHAnsi"/>
           <w:lang w:val="en-US"/>
         </w:rPr>
-        <w:t xml:space="preserve">). Tests are one-sided (α = 0.05), bootstrapped over scenes (A) or start–goal pairs (C), Holm-corrected within each hypothesis. Tier A decides, tier C validates. Values are pre-registered in the repository.</w:t>
+        <w:t xml:space="preserve">). Tests: one-sided (α = 0.05), bootstrapped over scenes or start–goal pairs, Holm-corrected per hypothesis, pre-registered in the repository.</w:t>
       </w:r>
     </w:p>
     <w:p>
@@ -5972,7 +6080,7 @@
           <w:rFonts w:cstheme="minorHAnsi"/>
           <w:lang w:val="en-US"/>
         </w:rPr>
-        <w:t xml:space="preserve"> A policy trained only in the reconstruction (a) beats the generic baseline in SR and (b) is </w:t>
+        <w:t xml:space="preserve"> A navigation policy trained only in the twin (a) beats the generic baseline in SR and (b) is </w:t>
       </w:r>
       <w:r>
         <w:rPr>
@@ -5987,7 +6095,7 @@
           <w:rFonts w:cstheme="minorHAnsi"/>
           <w:lang w:val="en-US"/>
         </w:rPr>
-        <w:t xml:space="preserve"> to the real-data-only baseline with a ≥ 10× larger budget: the lower 95% bound of SR_recon − SR_real is above −10 pp on tier A, and above −15 pp on tier C (120 pooled episodes per policy; ≈ 90% power at SR ≈ 0.8).</w:t>
+        <w:t xml:space="preserve"> to the real-data-only baseline with a ≥ 10× larger budget: the lower 95% bound of SR_twin − SR_real is above −10 pp on tier A and above −15 pp on tier C (120 pooled episodes per policy; ≈ 90% power at SR ≈ 0.8).</w:t>
       </w:r>
     </w:p>
     <w:p>
@@ -6008,7 +6116,7 @@
           <w:rFonts w:cstheme="minorHAnsi"/>
           <w:lang w:val="en-US"/>
         </w:rPr>
-        <w:t xml:space="preserve"> In uncaptured scenes, reconstruction + augmentation + representation alignment reaches a higher SR than reconstruction alone and than the generic baseline, and alignment lowers the feature distance between reconstructed and real frames (tier B) against the unaligned encoder.</w:t>
+        <w:t xml:space="preserve"> In uncaptured navigation scenes, and in manipulation with an unchanged pipeline, twin + augmentation + representation alignment reaches a higher SR than the twin alone and than the generic baseline, and alignment lowers the feature distance between reconstructed and real frames (tier B).</w:t>
       </w:r>
     </w:p>
     <w:p>
@@ -6029,7 +6137,7 @@
           <w:rFonts w:cstheme="minorHAnsi"/>
           <w:lang w:val="en-US"/>
         </w:rPr>
-        <w:t xml:space="preserve"> Over ≥ 10 policy variants, the Sim-vs-Real Correlation Coefficient (SRCC) of the reconstruction is higher than that of a generic simulator (95% CI of the difference excludes 0) and does not drop after refinement from real rollouts (lower 95% bound of the change ≥ −0.1).</w:t>
+        <w:t xml:space="preserve"> Over ≥ 10 navigation policy variants, the Sim-vs-Real Correlation Coefficient (SRCC) of the twin is higher than that of a generic simulator (95% CI of the difference excludes 0) and does not drop after refinement from real rollouts (lower 95% bound of the change ≥ −0.1).</w:t>
       </w:r>
     </w:p>
     <w:p>
@@ -6050,7 +6158,7 @@
           <w:rFonts w:cstheme="minorHAnsi"/>
           <w:lang w:val="en-US"/>
         </w:rPr>
-        <w:t xml:space="preserve"> The full pipeline reaches a target SR τ (best real-data-only SR minus 10 pp) with B_pipeline(τ) ≤ 0.1 · B_real(τ): the upper 95% bound of the ratio, from fitted budget–SR scaling curves, is ≤ 0.1. If real-data-only training misses τ within the largest feasible budget, the ratio is reported as a bound; either way the curves answer RQ2.</w:t>
+        <w:t xml:space="preserve"> The full pipeline reaches a target navigation SR τ (best real-data-only SR minus 10 pp) with B_pipeline(τ) ≤ 0.1 · B_real(τ): the upper 95% bound of the ratio, from fitted budget–SR scaling curves, is ≤ 0.1. If real-data-only training misses τ within the largest feasible budget, the ratio is reported as a bound.</w:t>
       </w:r>
     </w:p>
     <w:permEnd w:id="1295260508"/>
@@ -6360,7 +6468,22 @@
           <w:rFonts w:cstheme="minorHAnsi"/>
           <w:lang w:val="en-US"/>
         </w:rPr>
-        <w:t xml:space="preserve">), in the area of machine learning. Its contributions are learning methodology, representation learning, evaluation methodology, software and data. Visual navigation of mobile robots is the application and testbed; control design and mechanical engineering are not the object of the research.</w:t>
+        <w:t xml:space="preserve">), in the area of machine learning. Its object is a general, task-agnostic methodology for learning embodied policies in </w:t>
+      </w:r>
+      <w:r>
+        <w:rPr>
+          <w:rFonts w:cstheme="minorHAnsi"/>
+          <w:b/>
+          <w:lang w:val="en-US"/>
+        </w:rPr>
+        <w:t xml:space="preserve">digital twins</w:t>
+      </w:r>
+      <w:r>
+        <w:rPr>
+          <w:rFonts w:cstheme="minorHAnsi"/>
+          <w:lang w:val="en-US"/>
+        </w:rPr>
+        <w:t xml:space="preserve"> built by neural reconstruction of real scenes (real → twin → policy → real). Visual navigation is the primary testbed and robotic manipulation the generalization domain; control design and mechanical engineering are not the object of the research.</w:t>
       </w:r>
     </w:p>
     <w:p>
@@ -6381,15 +6504,15 @@
           <w:rFonts w:cstheme="minorHAnsi"/>
           <w:lang w:val="en-US"/>
         </w:rPr>
-        <w:t xml:space="preserve"> The first systematic, quantitative characterization, to our knowledge, of how performance of policies learned from </w:t>
-      </w:r>
-      <w:r>
-        <w:rPr>
-          <w:rFonts w:cstheme="minorHAnsi"/>
-          <w:b/>
-          <w:lang w:val="en-US"/>
-        </w:rPr>
-        <w:t xml:space="preserve">neural scene reconstructions</w:t>
+        <w:t xml:space="preserve"> The first systematic, quantitative characterization, to our knowledge, of how performance of policies learned in </w:t>
+      </w:r>
+      <w:r>
+        <w:rPr>
+          <w:rFonts w:cstheme="minorHAnsi"/>
+          <w:b/>
+          <w:lang w:val="en-US"/>
+        </w:rPr>
+        <w:t xml:space="preserve">neural-reconstruction twins</w:t>
       </w:r>
       <w:r>
         <w:rPr>
@@ -6411,7 +6534,7 @@
           <w:rFonts w:cstheme="minorHAnsi"/>
           <w:lang w:val="en-US"/>
         </w:rPr>
-        <w:t xml:space="preserve"> of the target domain. It answers "how much real data is enough" with measured budget–success-rate scaling curves and a non-inferiority comparison against learning from real data alone, on public benchmarks and validated on a real robot. This is the result the dissertation stands on.</w:t>
+        <w:t xml:space="preserve"> of the target domain. It answers "how much real data is enough" with measured budget–success-rate scaling curves and a non-inferiority comparison against learning from real data alone, on public navigation benchmarks and validated on a real robot.</w:t>
       </w:r>
     </w:p>
     <w:p>
@@ -6482,7 +6605,7 @@
           <w:rFonts w:cstheme="minorHAnsi"/>
           <w:lang w:val="en-US"/>
         </w:rPr>
-        <w:t xml:space="preserve"> Evidence of when training on photorealistic reconstructions (3D Gaussian Splatting for appearance, extracted geometry for collisions) closes the distribution gap to real observations, compared with generic simulation and domain randomization.</w:t>
+        <w:t xml:space="preserve"> Evidence of when training in photorealistic twins (3D Gaussian Splatting for appearance, extracted geometry for collisions) closes the distribution gap to real observations, compared with generic simulation and domain randomization.</w:t>
       </w:r>
     </w:p>
     <w:p>
@@ -6504,14 +6627,14 @@
           <w:b/>
           <w:lang w:val="en-US"/>
         </w:rPr>
-        <w:t xml:space="preserve">Representation learning across the sim-real gap (extension; RQ3, H2).</w:t>
-      </w:r>
-      <w:r>
-        <w:rPr>
-          <w:rFonts w:cstheme="minorHAnsi"/>
-          <w:lang w:val="en-US"/>
-        </w:rPr>
-        <w:t xml:space="preserve"> Augmentation of reconstructed scenes combined with representation-alignment objectives between reconstructed and real observations, so that policies generalize to environments that were never captured. It connects the digital-twin and domain-randomization lines of research.</w:t>
+        <w:t xml:space="preserve">Cross-scene and cross-task generalization (extension; RQ3, H2).</w:t>
+      </w:r>
+      <w:r>
+        <w:rPr>
+          <w:rFonts w:cstheme="minorHAnsi"/>
+          <w:lang w:val="en-US"/>
+        </w:rPr>
+        <w:t xml:space="preserve"> Augmentation of reconstructed scenes combined with representation alignment between reconstructed and real observations, so that policies generalize to scenes that were never captured, and evidence that the same pipeline transfers from navigation to manipulation. It connects the digital-twin and domain-randomization lines of research.</w:t>
       </w:r>
     </w:p>
     <w:p>
@@ -6540,7 +6663,7 @@
           <w:rFonts w:cstheme="minorHAnsi"/>
           <w:lang w:val="en-US"/>
         </w:rPr>
-        <w:t xml:space="preserve"> A method to update the simulation from a few real rollouts, and a protocol for measuring how well simulation predicts real performance (SRCC, pre-specified margins and decision rules), so that sim-to-real claims are tested rather than asserted.</w:t>
+        <w:t xml:space="preserve"> A method to update the twin from a few real rollouts, and a protocol for measuring how well simulation predicts real performance (SRCC, pre-specified margins and decision rules), so that sim-to-real claims are tested, not asserted.</w:t>
       </w:r>
     </w:p>
     <w:p>
@@ -6575,14 +6698,14 @@
           <w:b/>
           <w:lang w:val="en-US"/>
         </w:rPr>
-        <w:t xml:space="preserve">Software and data (support all RQs).</w:t>
-      </w:r>
-      <w:r>
-        <w:rPr>
-          <w:rFonts w:cstheme="minorHAnsi"/>
-          <w:lang w:val="en-US"/>
-        </w:rPr>
-        <w:t xml:space="preserve"> An open, reproducible pipeline that turns short RGB(-D) video into interactive training environments inside a GPU simulator, and released code, reconstructed scenes and an evaluation set with fixed episodes for reproducible sim-to-real benchmarking.</w:t>
+        <w:t xml:space="preserve">Digital-twin pipeline, software and data (supports all RQs).</w:t>
+      </w:r>
+      <w:r>
+        <w:rPr>
+          <w:rFonts w:cstheme="minorHAnsi"/>
+          <w:lang w:val="en-US"/>
+        </w:rPr>
+        <w:t xml:space="preserve"> A reusable, task-agnostic pipeline and protocol that turns a short RGB(-D) capture into a simulation-ready twin, with measured cost (capture minutes, compute hours) and fidelity metrics; released code, reconstructed scenes and evaluation sets with fixed episodes for reproducible sim-to-real benchmarking in navigation and manipulation.</w:t>
       </w:r>
     </w:p>
     <w:p>
@@ -6603,7 +6726,7 @@
           <w:rFonts w:cstheme="minorHAnsi"/>
           <w:lang w:val="en-US"/>
         </w:rPr>
-        <w:t xml:space="preserve"> Target-domain data is the main cost of deploying learned systems. Showing how far cheap captures and reconstruction can replace it, and which representations make this work, is relevant to machine learning under distribution shift in general, not only to robotics. The evaluation methodology (item 4) is reusable for other simulators and embodied-AI tasks.</w:t>
+        <w:t xml:space="preserve"> Target-domain data is the main cost of deploying learned systems. Showing how far cheap captures and reconstruction can replace it, across tasks and embodiments, and which representations make this work, is relevant to machine learning under distribution shift in general. The evaluation methodology (item 4) is reusable for other simulators and embodied-AI tasks.</w:t>
       </w:r>
     </w:p>
     <w:p>
@@ -6624,7 +6747,7 @@
           <w:rFonts w:cstheme="minorHAnsi"/>
           <w:lang w:val="en-US"/>
         </w:rPr>
-        <w:t xml:space="preserve"> Results are planned for peer-reviewed conferences worth 200 points and assigned to ITiT on the ministerial list of 5.01.2024: NeurIPS, ICML and ICLR (machine learning), CVPR, ICCV and ECCV (computer vision), and RSS (robot learning), as in §3, §11 and §12.</w:t>
+        <w:t xml:space="preserve"> Results are planned for peer-reviewed conferences worth 200 points and assigned to ITiT on the ministerial list of 5.01.2024: NeurIPS, ICML and ICLR (machine learning), CVPR, ICCV and ECCV (computer vision), and RSS (robot learning), as in §3, §11 and §12; the cross-task (manipulation) study is paper P3.</w:t>
       </w:r>
     </w:p>
     <w:permEnd w:id="1098318749"/>
@@ -6903,7 +7026,7 @@
           <w:rFonts w:cstheme="minorHAnsi"/>
           <w:lang w:val="en-US"/>
         </w:rPr>
-        <w:t xml:space="preserve">The research follows four stages (I–IV) matching §3; for each we give the method, data, metric and success criterion. Stages I–II (H1 and the real-data budget, RQ1–RQ2) are the core of the dissertation; Stages III–IV extend it. Every hypothesis is decided on public benchmarks and datasets and validated on a real robot (the three evaluation tiers of §7).</w:t>
+        <w:t xml:space="preserve">The research follows four stages (I–IV) matching §3; for each we give the method, data, metric and success criterion. The pipeline (real → twin → policy → real) is task-agnostic: visual navigation is the primary testbed, where H1, H3 and H4 are decided on public benchmarks and datasets and validated on a real robot (the three evaluation tiers of §7); manipulation tests cross-task generalization (H2, Stage IV). Stages I–II (H1 and the real-data budget, RQ1–RQ2) are the core; Stages III–IV extend it.</w:t>
       </w:r>
     </w:p>
     <w:p>
@@ -7013,7 +7136,7 @@
           <w:b/>
           <w:lang w:val="en-US"/>
         </w:rPr>
-        <w:t xml:space="preserve">Stage I – learning from reconstructions (RQ1; sem. 3).</w:t>
+        <w:t xml:space="preserve">Stage I – digital-twin pipeline and learning from reconstructions (RQ1; sem. 3).</w:t>
       </w:r>
     </w:p>
     <w:p>
@@ -7042,7 +7165,7 @@
           <w:rFonts w:cstheme="minorHAnsi"/>
           <w:lang w:val="en-US"/>
         </w:rPr>
-        <w:t xml:space="preserve"> camera poses from Structure-from-Motion (COLMAP) or the dataset's poses; appearance from 3D Gaussian Splatting (NeRF as baseline); collision geometry from depth fusion or mesh extraction; import into the simulator with rendering from the reconstruction and physics from the mesh.</w:t>
+        <w:t xml:space="preserve"> one task-agnostic pipeline from a short RGB(-D) capture to a simulation-ready twin: camera poses from Structure-from-Motion (COLMAP) or the dataset's poses; appearance from 3D Gaussian Splatting (NeRF as baseline); collision geometry from depth fusion or mesh extraction; export to the simulator with rendering from the reconstruction and physics from the mesh. The same pipeline serves rooms (navigation) and tabletop scenes and objects (manipulation).</w:t>
       </w:r>
     </w:p>
     <w:p>
@@ -7064,28 +7187,14 @@
           <w:i/>
           <w:lang w:val="en-US"/>
         </w:rPr>
-        <w:t xml:space="preserve">Metric and success criterion:</w:t>
-      </w:r>
-      <w:r>
-        <w:rPr>
-          <w:rFonts w:cstheme="minorHAnsi"/>
-          <w:lang w:val="en-US"/>
-        </w:rPr>
-        <w:t xml:space="preserve"> PSNR, SSIM and LPIPS on held-out views and depth error against the reference scan. A scene passes if its held-out PSNR is within a margin X dB of the value reported for 3DGS [21] on comparable indoor scenes (X fixed in the repository before Stage II) and its collision mesh has no holes on the evaluation paths.</w:t>
-      </w:r>
-    </w:p>
-    <w:p>
-      <w:pPr>
-        <w:spacing w:after="120" w:line="240" w:lineRule="auto"/>
-        <w:jc w:val="both"/>
-      </w:pPr>
-      <w:r>
-        <w:rPr>
-          <w:rFonts w:cstheme="minorHAnsi"/>
-          <w:b/>
-          <w:lang w:val="en-US"/>
-        </w:rPr>
-        <w:t xml:space="preserve">Stage II – learning under a real-data budget (RQ1–RQ2, H1, H4; sem. 3–4).</w:t>
+        <w:t xml:space="preserve">Protocol and cost:</w:t>
+      </w:r>
+      <w:r>
+        <w:rPr>
+          <w:rFonts w:cstheme="minorHAnsi"/>
+          <w:lang w:val="en-US"/>
+        </w:rPr>
+        <w:t xml:space="preserve"> a written capture protocol (camera path, duration, lighting, coverage check); for each twin we log capture minutes, operator minutes and GPU-hours of reconstruction and mesh extraction.</w:t>
       </w:r>
     </w:p>
     <w:p>
@@ -7107,14 +7216,28 @@
           <w:i/>
           <w:lang w:val="en-US"/>
         </w:rPr>
-        <w:t xml:space="preserve">Method:</w:t>
-      </w:r>
-      <w:r>
-        <w:rPr>
-          <w:rFonts w:cstheme="minorHAnsi"/>
-          <w:lang w:val="en-US"/>
-        </w:rPr>
-        <w:t xml:space="preserve"> (i) deep reinforcement learning (PPO / DD-PPO) for point-goal and image-goal navigation, trained at scale in the reconstructions; (ii) imitation learning and fine-tuning of pretrained navigation models (GNM, ViNT, NoMaD) on trajectories generated in simulation. Input: RGB(-D); output: velocity commands.</w:t>
+        <w:t xml:space="preserve">Fidelity metrics and success criterion:</w:t>
+      </w:r>
+      <w:r>
+        <w:rPr>
+          <w:rFonts w:cstheme="minorHAnsi"/>
+          <w:lang w:val="en-US"/>
+        </w:rPr>
+        <w:t xml:space="preserve"> PSNR, SSIM and LPIPS on held-out views; depth error and Chamfer distance of the collision mesh to the reference scan. A scene passes if its held-out PSNR is within a margin X dB of the value reported for 3DGS [21] on comparable indoor scenes (X fixed in the repository before Stage II) and its collision mesh has no holes on the evaluation paths. Fidelity–cost curves (fidelity vs. capture minutes) are reported and later related to the transfer gap (Stage III).</w:t>
+      </w:r>
+    </w:p>
+    <w:p>
+      <w:pPr>
+        <w:spacing w:after="120" w:line="240" w:lineRule="auto"/>
+        <w:jc w:val="both"/>
+      </w:pPr>
+      <w:r>
+        <w:rPr>
+          <w:rFonts w:cstheme="minorHAnsi"/>
+          <w:b/>
+          <w:lang w:val="en-US"/>
+        </w:rPr>
+        <w:t xml:space="preserve">Stage II – learning under a real-data budget (RQ1–RQ2, H1, H4; sem. 3–4).</w:t>
       </w:r>
     </w:p>
     <w:p>
@@ -7136,14 +7259,14 @@
           <w:i/>
           <w:lang w:val="en-US"/>
         </w:rPr>
-        <w:t xml:space="preserve">Baselines (§7):</w:t>
-      </w:r>
-      <w:r>
-        <w:rPr>
-          <w:rFonts w:cstheme="minorHAnsi"/>
-          <w:lang w:val="en-US"/>
-        </w:rPr>
-        <w:t xml:space="preserve"> the same policy trained on generic public scenes with domain randomization; the real-data-only baseline, a pretrained model fine-tuned by behaviour cloning on target-domain trajectories of budget B, at matched and ≥ 10× larger budgets; pretrained models zero-shot.</w:t>
+        <w:t xml:space="preserve">Method:</w:t>
+      </w:r>
+      <w:r>
+        <w:rPr>
+          <w:rFonts w:cstheme="minorHAnsi"/>
+          <w:lang w:val="en-US"/>
+        </w:rPr>
+        <w:t xml:space="preserve"> (i) deep reinforcement learning (PPO / DD-PPO) for point-goal and image-goal navigation, trained at scale in the reconstructions; (ii) imitation learning and fine-tuning of pretrained navigation models (GNM, ViNT, NoMaD) on trajectories generated in simulation. Input: RGB(-D); output: velocity commands.</w:t>
       </w:r>
     </w:p>
     <w:p>
@@ -7165,28 +7288,14 @@
           <w:i/>
           <w:lang w:val="en-US"/>
         </w:rPr>
-        <w:t xml:space="preserve">Metric and success criterion:</w:t>
-      </w:r>
-      <w:r>
-        <w:rPr>
-          <w:rFonts w:cstheme="minorHAnsi"/>
-          <w:lang w:val="en-US"/>
-        </w:rPr>
-        <w:t xml:space="preserve"> success rate (primary), SPL and collisions as a function of B; budget–SR scaling curves fitted per method; H1 and H4 decision rules in §7 on tier A, with the robot pilot (tier C, one environment) as the first validation.</w:t>
-      </w:r>
-    </w:p>
-    <w:p>
-      <w:pPr>
-        <w:spacing w:after="120" w:line="240" w:lineRule="auto"/>
-        <w:jc w:val="both"/>
-      </w:pPr>
-      <w:r>
-        <w:rPr>
-          <w:rFonts w:cstheme="minorHAnsi"/>
-          <w:b/>
-          <w:lang w:val="en-US"/>
-        </w:rPr>
-        <w:t xml:space="preserve">Stage III – predictivity and correction (RQ4, H3, H4; sem. 4–5).</w:t>
+        <w:t xml:space="preserve">Baselines (§7):</w:t>
+      </w:r>
+      <w:r>
+        <w:rPr>
+          <w:rFonts w:cstheme="minorHAnsi"/>
+          <w:lang w:val="en-US"/>
+        </w:rPr>
+        <w:t xml:space="preserve"> the same policy trained on generic public scenes with domain randomization; the real-data-only baseline, a pretrained model fine-tuned by behaviour cloning on target-domain trajectories of budget B, at matched and ≥ 10× larger budgets; pretrained models zero-shot.</w:t>
       </w:r>
     </w:p>
     <w:p>
@@ -7208,29 +7317,28 @@
           <w:i/>
           <w:lang w:val="en-US"/>
         </w:rPr>
-        <w:t xml:space="preserve">Validation protocol:</w:t>
-      </w:r>
-      <w:r>
-        <w:rPr>
-          <w:rFonts w:cstheme="minorHAnsi"/>
-          <w:lang w:val="en-US"/>
-        </w:rPr>
-        <w:t xml:space="preserve"> paired rollouts in simulation and in the target domain on the same start–goal pairs. Over ≥ 10 policy variants we compute the </w:t>
-      </w:r>
-      <w:r>
-        <w:rPr>
-          <w:rFonts w:cstheme="minorHAnsi"/>
-          <w:b/>
-          <w:lang w:val="en-US"/>
-        </w:rPr>
-        <w:t xml:space="preserve">Sim-vs-Real Correlation Coefficient (SRCC)</w:t>
-      </w:r>
-      <w:r>
-        <w:rPr>
-          <w:rFonts w:cstheme="minorHAnsi"/>
-          <w:lang w:val="en-US"/>
-        </w:rPr>
-        <w:t xml:space="preserve"> between simulated and target-domain success/SPL for the reconstructed and the generic simulator, on tier A and on the robot (tier C), and relate per-scene fidelity (Stage I) to the transfer gap.</w:t>
+        <w:t xml:space="preserve">Metric and success criterion:</w:t>
+      </w:r>
+      <w:r>
+        <w:rPr>
+          <w:rFonts w:cstheme="minorHAnsi"/>
+          <w:lang w:val="en-US"/>
+        </w:rPr>
+        <w:t xml:space="preserve"> success rate (primary), SPL and collisions as a function of B; budget–SR scaling curves fitted per method; H1 and H4 decision rules in §7 on tier A, with the robot pilot (tier C, one environment) as the first validation.</w:t>
+      </w:r>
+    </w:p>
+    <w:p>
+      <w:pPr>
+        <w:spacing w:after="120" w:line="240" w:lineRule="auto"/>
+        <w:jc w:val="both"/>
+      </w:pPr>
+      <w:r>
+        <w:rPr>
+          <w:rFonts w:cstheme="minorHAnsi"/>
+          <w:b/>
+          <w:lang w:val="en-US"/>
+        </w:rPr>
+        <w:t xml:space="preserve">Stage III – predictivity and correction (RQ4, H3, H4; sem. 4–5).</w:t>
       </w:r>
     </w:p>
     <w:p>
@@ -7252,14 +7360,29 @@
           <w:i/>
           <w:lang w:val="en-US"/>
         </w:rPr>
-        <w:t xml:space="preserve">Method:</w:t>
-      </w:r>
-      <w:r>
-        <w:rPr>
-          <w:rFonts w:cstheme="minorHAnsi"/>
-          <w:lang w:val="en-US"/>
-        </w:rPr>
-        <w:t xml:space="preserve"> the discrepancy between target-domain and replayed trajectories updates the scene (re-capture of poorly reconstructed regions) and fits dynamics and sensor parameters (system identification, adaptive randomization in the style of SimOpt); the policy is then fine-tuned in the corrected simulation.</w:t>
+        <w:t xml:space="preserve">Validation protocol:</w:t>
+      </w:r>
+      <w:r>
+        <w:rPr>
+          <w:rFonts w:cstheme="minorHAnsi"/>
+          <w:lang w:val="en-US"/>
+        </w:rPr>
+        <w:t xml:space="preserve"> paired rollouts in simulation and in the target domain on the same start–goal pairs. Over ≥ 10 policy variants we compute the </w:t>
+      </w:r>
+      <w:r>
+        <w:rPr>
+          <w:rFonts w:cstheme="minorHAnsi"/>
+          <w:b/>
+          <w:lang w:val="en-US"/>
+        </w:rPr>
+        <w:t xml:space="preserve">Sim-vs-Real Correlation Coefficient (SRCC)</w:t>
+      </w:r>
+      <w:r>
+        <w:rPr>
+          <w:rFonts w:cstheme="minorHAnsi"/>
+          <w:lang w:val="en-US"/>
+        </w:rPr>
+        <w:t xml:space="preserve"> between simulated and target-domain success/SPL for the reconstructed and the generic simulator, on tier A and on the robot (tier C), and relate per-scene fidelity (Stage I) to the transfer gap.</w:t>
       </w:r>
     </w:p>
     <w:p>
@@ -7281,14 +7404,14 @@
           <w:i/>
           <w:lang w:val="en-US"/>
         </w:rPr>
-        <w:t xml:space="preserve">Metric and success criterion:</w:t>
-      </w:r>
-      <w:r>
-        <w:rPr>
-          <w:rFonts w:cstheme="minorHAnsi"/>
-          <w:lang w:val="en-US"/>
-        </w:rPr>
-        <w:t xml:space="preserve"> SRCC with bootstrap confidence intervals; target-domain rollouts needed to reach the target success rate compared with real-data-only learning; H3 and H4 decision rules in §7.</w:t>
+        <w:t xml:space="preserve">Method:</w:t>
+      </w:r>
+      <w:r>
+        <w:rPr>
+          <w:rFonts w:cstheme="minorHAnsi"/>
+          <w:lang w:val="en-US"/>
+        </w:rPr>
+        <w:t xml:space="preserve"> the discrepancy between target-domain and replayed trajectories updates the scene (re-capture of poorly reconstructed regions) and fits dynamics and sensor parameters (system identification, adaptive randomization in the style of SimOpt); the policy is then fine-tuned in the corrected simulation.</w:t>
       </w:r>
     </w:p>
     <w:p>
@@ -7310,28 +7433,14 @@
           <w:i/>
           <w:lang w:val="en-US"/>
         </w:rPr>
-        <w:t xml:space="preserve">Fallback</w:t>
-      </w:r>
-      <w:r>
-        <w:rPr>
-          <w:rFonts w:cstheme="minorHAnsi"/>
-          <w:lang w:val="en-US"/>
-        </w:rPr>
-        <w:t xml:space="preserve"> (low SRCC or no gain): reported as a negative finding, with the error attributed to appearance, geometry or dynamics by ablation; Stage II conclusions do not depend on this stage.</w:t>
-      </w:r>
-    </w:p>
-    <w:p>
-      <w:pPr>
-        <w:spacing w:after="120" w:line="240" w:lineRule="auto"/>
-        <w:jc w:val="both"/>
-      </w:pPr>
-      <w:r>
-        <w:rPr>
-          <w:rFonts w:cstheme="minorHAnsi"/>
-          <w:b/>
-          <w:lang w:val="en-US"/>
-        </w:rPr>
-        <w:t xml:space="preserve">Stage IV – generalization and representations (RQ3, H2, H4; sem. 6–7).</w:t>
+        <w:t xml:space="preserve">Metric and success criterion:</w:t>
+      </w:r>
+      <w:r>
+        <w:rPr>
+          <w:rFonts w:cstheme="minorHAnsi"/>
+          <w:lang w:val="en-US"/>
+        </w:rPr>
+        <w:t xml:space="preserve"> SRCC with bootstrap confidence intervals; target-domain rollouts needed to reach the target success rate compared with real-data-only learning; H3 and H4 decision rules in §7.</w:t>
       </w:r>
     </w:p>
     <w:p>
@@ -7353,29 +7462,28 @@
           <w:i/>
           <w:lang w:val="en-US"/>
         </w:rPr>
-        <w:t xml:space="preserve">Method:</w:t>
-      </w:r>
-      <w:r>
-        <w:rPr>
-          <w:rFonts w:cstheme="minorHAnsi"/>
-          <w:lang w:val="en-US"/>
-        </w:rPr>
-        <w:t xml:space="preserve"> augmentation of reconstructed scenes (object insertion and rearrangement, lighting and appearance randomization, sensor noise, simulated pedestrians) and </w:t>
-      </w:r>
-      <w:r>
-        <w:rPr>
-          <w:rFonts w:cstheme="minorHAnsi"/>
-          <w:b/>
-          <w:lang w:val="en-US"/>
-        </w:rPr>
-        <w:t xml:space="preserve">representation alignment</w:t>
-      </w:r>
-      <w:r>
-        <w:rPr>
-          <w:rFonts w:cstheme="minorHAnsi"/>
-          <w:lang w:val="en-US"/>
-        </w:rPr>
-        <w:t xml:space="preserve">: an auxiliary objective that brings encoder features of reconstructed and real observations of the same place together (e.g. contrastive or distribution-matching losses). Ablation: generic + randomization vs. reconstruction only vs. reconstruction + augmentation vs. + alignment.</w:t>
+        <w:t xml:space="preserve">Fallback</w:t>
+      </w:r>
+      <w:r>
+        <w:rPr>
+          <w:rFonts w:cstheme="minorHAnsi"/>
+          <w:lang w:val="en-US"/>
+        </w:rPr>
+        <w:t xml:space="preserve"> (low SRCC or no gain): reported as a negative finding, with the error attributed to appearance, geometry or dynamics by ablation; Stage II conclusions do not depend on this stage.</w:t>
+      </w:r>
+    </w:p>
+    <w:p>
+      <w:pPr>
+        <w:spacing w:after="120" w:line="240" w:lineRule="auto"/>
+        <w:jc w:val="both"/>
+      </w:pPr>
+      <w:r>
+        <w:rPr>
+          <w:rFonts w:cstheme="minorHAnsi"/>
+          <w:b/>
+          <w:lang w:val="en-US"/>
+        </w:rPr>
+        <w:t xml:space="preserve">Stage IV – cross-scene and cross-task generalization (RQ3, H2, H4; sem. 6–7).</w:t>
       </w:r>
     </w:p>
     <w:p>
@@ -7397,14 +7505,29 @@
           <w:i/>
           <w:lang w:val="en-US"/>
         </w:rPr>
-        <w:t xml:space="preserve">Data:</w:t>
-      </w:r>
-      <w:r>
-        <w:rPr>
-          <w:rFonts w:cstheme="minorHAnsi"/>
-          <w:lang w:val="en-US"/>
-        </w:rPr>
-        <w:t xml:space="preserve"> held-out uncaptured scenes (tier A), real frames (tier B), and uncaptured real environments at PWr and, during the foreign visit, at the host lab (tier C).</w:t>
+        <w:t xml:space="preserve">Method:</w:t>
+      </w:r>
+      <w:r>
+        <w:rPr>
+          <w:rFonts w:cstheme="minorHAnsi"/>
+          <w:lang w:val="en-US"/>
+        </w:rPr>
+        <w:t xml:space="preserve"> augmentation of reconstructed scenes (object insertion and rearrangement, lighting and appearance randomization, sensor noise, simulated pedestrians) and </w:t>
+      </w:r>
+      <w:r>
+        <w:rPr>
+          <w:rFonts w:cstheme="minorHAnsi"/>
+          <w:b/>
+          <w:lang w:val="en-US"/>
+        </w:rPr>
+        <w:t xml:space="preserve">representation alignment</w:t>
+      </w:r>
+      <w:r>
+        <w:rPr>
+          <w:rFonts w:cstheme="minorHAnsi"/>
+          <w:lang w:val="en-US"/>
+        </w:rPr>
+        <w:t xml:space="preserve">: an auxiliary objective that brings encoder features of reconstructed and real observations of the same place together (e.g. contrastive or distribution-matching losses). Ablation: generic + randomization vs. reconstruction only vs. reconstruction + augmentation vs. + alignment.</w:t>
       </w:r>
     </w:p>
     <w:p>
@@ -7426,6 +7549,64 @@
           <w:i/>
           <w:lang w:val="en-US"/>
         </w:rPr>
+        <w:t xml:space="preserve">Data:</w:t>
+      </w:r>
+      <w:r>
+        <w:rPr>
+          <w:rFonts w:cstheme="minorHAnsi"/>
+          <w:lang w:val="en-US"/>
+        </w:rPr>
+        <w:t xml:space="preserve"> held-out uncaptured scenes (tier A), real frames (tier B), and uncaptured real environments at PWr and, during the foreign visit, at the host lab (tier C).</w:t>
+      </w:r>
+    </w:p>
+    <w:p>
+      <w:pPr>
+        <w:spacing w:after="40" w:line="240" w:lineRule="auto"/>
+        <w:ind w:left="284" w:hanging="284"/>
+        <w:jc w:val="both"/>
+      </w:pPr>
+      <w:r>
+        <w:rPr>
+          <w:rFonts w:cstheme="minorHAnsi"/>
+          <w:lang w:val="en-US"/>
+        </w:rPr>
+        <w:t xml:space="preserve">•	</w:t>
+      </w:r>
+      <w:r>
+        <w:rPr>
+          <w:rFonts w:cstheme="minorHAnsi"/>
+          <w:i/>
+          <w:lang w:val="en-US"/>
+        </w:rPr>
+        <w:t xml:space="preserve">Cross-task study (manipulation, sem. 6):</w:t>
+      </w:r>
+      <w:r>
+        <w:rPr>
+          <w:rFonts w:cstheme="minorHAnsi"/>
+          <w:lang w:val="en-US"/>
+        </w:rPr>
+        <w:t xml:space="preserve"> the Stage I pipeline, unchanged, builds twins of public tabletop scenes and objects; pick-and-place policies are trained in them by imitation and reinforcement learning in the GPU simulator ManiSkill3 [38] and evaluated in public real-to-sim environments (SIMPLER [37], whose simulated results correlate with real robots) as proxy reality. Same ablation as for navigation (generic vs. twin only vs. twin + augmentation + alignment), plus behaviour cloning on public real demonstrations (Open X-Embodiment [8]) at matched budget. Metric: task success rate (H2 rule in §7). Real validation on a PWr manipulator is optional.</w:t>
+      </w:r>
+    </w:p>
+    <w:p>
+      <w:pPr>
+        <w:spacing w:after="40" w:line="240" w:lineRule="auto"/>
+        <w:ind w:left="284" w:hanging="284"/>
+        <w:jc w:val="both"/>
+      </w:pPr>
+      <w:r>
+        <w:rPr>
+          <w:rFonts w:cstheme="minorHAnsi"/>
+          <w:lang w:val="en-US"/>
+        </w:rPr>
+        <w:t xml:space="preserve">•	</w:t>
+      </w:r>
+      <w:r>
+        <w:rPr>
+          <w:rFonts w:cstheme="minorHAnsi"/>
+          <w:i/>
+          <w:lang w:val="en-US"/>
+        </w:rPr>
         <w:t xml:space="preserve">Metric and success criterion:</w:t>
       </w:r>
       <w:r>
@@ -7723,7 +7904,7 @@
           <w:rFonts w:cstheme="minorHAnsi"/>
           <w:lang w:val="pl-PL"/>
         </w:rPr>
-        <w:t xml:space="preserve">Współczesna sztuczna inteligencja uczy się na przykładach i zwykle potrzebuje ich ogromnej liczby. W wielu zastosowaniach dobre przykłady pochodzą jednak tylko z prawdziwego świata, a ich zbieranie jest powolne, drogie, a czasem ryzykowne. Dobrym przykładem są roboty mobilne, na przykład w magazynach, szpitalach czy biurach. Aby robot nauczył się samodzielnie poruszać, potrzebuje milionów prób i błędów. Dlatego uczy się go zwykle w symulacji komputerowej, czyli w wirtualnym świecie przypominającym grę. Świat wirtualny różni się jednak od prawdziwego: inaczej wyglądają ściany, światło i przedmioty. Model sztucznej inteligencji wyuczony w symulacji często zawodzi, gdy zobaczy prawdziwe obrazy.</w:t>
+        <w:t xml:space="preserve">Współczesna sztuczna inteligencja uczy się na przykładach i zwykle potrzebuje ich ogromnej liczby. W wielu zastosowaniach dobre przykłady pochodzą jednak tylko z prawdziwego świata, a ich zbieranie jest powolne, drogie, a czasem ryzykowne. Dobrym przykładem są roboty, na przykład w magazynach, szpitalach, biurach czy fabrykach. Aby robot nauczył się samodzielnie poruszać lub chwytać przedmioty, potrzebuje milionów prób i błędów. Dlatego uczy się go zwykle w symulacji komputerowej, czyli w wirtualnym świecie przypominającym grę. Świat wirtualny różni się jednak od prawdziwego: inaczej wyglądają ściany, światło i przedmioty. Model sztucznej inteligencji wyuczony w symulacji często zawodzi, gdy zobaczy prawdziwe obrazy.</w:t>
       </w:r>
     </w:p>
     <w:p>
@@ -7736,7 +7917,7 @@
           <w:rFonts w:cstheme="minorHAnsi"/>
           <w:lang w:val="pl-PL"/>
         </w:rPr>
-        <w:t xml:space="preserve">Celem rozprawy jest opracowanie metod uczenia maszynowego, które pozwolą sztucznej inteligencji dobrze działać w prawdziwym świecie przy bardzo małej ilości prawdziwych danych. Pomysł polega na nagraniu krótkiego filmu z danego miejsca, na przykład korytarza lub biura. Na jego podstawie metody sztucznej inteligencji odtwarzające trójwymiarowe sceny tworzą wierną, fotorealistyczną cyfrową kopię tego miejsca. W tej kopii model może bezpiecznie i szybko ćwiczyć miliony razy. Zbadamy też, jak nauczyć model takiego „widzenia” świata, by obrazy z kopii i z rzeczywistości były dla niego podobne, oraz jak kilka prawdziwych prób może poprawić symulację. Jako zadanie testowe posłuży nawigacja robota mobilnego. Metody zostaną sprawdzone przede wszystkim na publicznie dostępnych wirtualnych budynkach i zbiorach prawdziwych nagrań, a następnie potwierdzone na prawdziwym robocie w budynkach Politechniki Wrocławskiej.</w:t>
+        <w:t xml:space="preserve">Celem rozprawy jest opracowanie metod uczenia maszynowego, które pozwolą sztucznej inteligencji dobrze działać w prawdziwym świecie przy bardzo małej ilości prawdziwych danych. Pomysł polega na nagraniu krótkiego filmu z danego miejsca, na przykład korytarza, biura lub stołu roboczego. Na jego podstawie metody sztucznej inteligencji odtwarzające trójwymiarowe sceny tworzą wierną, fotorealistyczną cyfrową kopię tego miejsca, tzw. cyfrowego bliźniaka. Opracujemy uniwersalny sposób budowania takich kopii i zmierzymy, ile kosztuje ich wykonanie i jak wiernie odwzorowują rzeczywistość. W tej kopii model może bezpiecznie i szybko ćwiczyć miliony razy. Zbadamy też, jak nauczyć model takiego „widzenia” świata, by obrazy z kopii i z rzeczywistości były dla niego podobne, oraz jak kilka prawdziwych prób może poprawić symulację. Głównym zadaniem testowym będzie nawigacja robota mobilnego. Metody zostaną sprawdzone przede wszystkim na publicznie dostępnych wirtualnych budynkach i zbiorach prawdziwych nagrań, a następnie potwierdzone na prawdziwym robocie w budynkach Politechniki Wrocławskiej. Aby pokazać, że podejście działa także w innych zadaniach, zastosujemy je również do chwytania i przenoszenia przedmiotów przez ramię robota, przede wszystkim w publicznie dostępnych symulatorach.</w:t>
       </w:r>
     </w:p>
     <w:p>
@@ -7749,7 +7930,7 @@
           <w:rFonts w:cstheme="minorHAnsi"/>
           <w:lang w:val="pl-PL"/>
         </w:rPr>
-        <w:t xml:space="preserve">Badania pokażą, ile prawdziwych danych naprawdę potrzeba, aby wyuczony model działał niezawodnie, oraz jak sprawić, by radził sobie również w miejscach, których wcześniej nie widział. Spodziewanym efektem jest znaczne obniżenie kosztu i czasu wdrażania systemów sztucznej inteligencji w nowych miejscach, co może przyspieszyć wykorzystanie robotów w logistyce, opiece i przemyśle. Opracowane oprogramowanie i dane zostaną udostępnione publicznie.</w:t>
+        <w:t xml:space="preserve">Badania pokażą, ile prawdziwych danych naprawdę potrzeba, aby wyuczony model działał niezawodnie, oraz jak sprawić, by radził sobie również w miejscach, których wcześniej nie widział, i w innych zadaniach. Spodziewanym efektem jest znaczne obniżenie kosztu i czasu wdrażania systemów sztucznej inteligencji w nowych miejscach, co może przyspieszyć wykorzystanie robotów w logistyce, opiece i przemyśle. Opracowane oprogramowanie i dane zostaną udostępnione publicznie.</w:t>
       </w:r>
     </w:p>
     <w:permEnd w:id="301016009"/>
@@ -7804,7 +7985,7 @@
           <w:rFonts w:cstheme="minorHAnsi"/>
           <w:lang w:val="en-US"/>
         </w:rPr>
-        <w:t xml:space="preserve">Modern artificial intelligence learns from examples, and it usually needs an enormous number of them. In many applications, however, good examples come only from the real world, where collecting them is slow, expensive and sometimes risky. Mobile robots, for example in warehouses, hospitals or offices, are a good example. For a robot to learn to move on its own, it needs millions of trials and errors. That is why it is usually trained in a computer simulation, a virtual world similar to a video game. The virtual world, however, differs from the real one: walls, light and objects look different. An artificial intelligence model trained in simulation often fails when it sees real images.</w:t>
+        <w:t xml:space="preserve">Modern artificial intelligence learns from examples, and it usually needs an enormous number of them. In many applications, however, good examples come only from the real world, where collecting them is slow, expensive and sometimes risky. Robots, for example in warehouses, hospitals, offices or factories, are a good example. For a robot to learn to move or grasp objects on its own, it needs millions of trials and errors. That is why it is usually trained in a computer simulation, a virtual world similar to a video game. The virtual world, however, differs from the real one: walls, light and objects look different. An artificial intelligence model trained in simulation often fails when it sees real images.</w:t>
       </w:r>
     </w:p>
     <w:p>
@@ -7817,7 +7998,7 @@
           <w:rFonts w:cstheme="minorHAnsi"/>
           <w:lang w:val="en-US"/>
         </w:rPr>
-        <w:t xml:space="preserve">The goal of this dissertation is to develop machine learning methods that let artificial intelligence work well in the real world using very little real data. The idea is to record a short video of a place, such as a corridor or an office. From this video, artificial intelligence methods that reconstruct three-dimensional scenes create a faithful, photorealistic digital copy of the place. In this copy the model can practice safely and quickly millions of times. We will also study how to teach the model to "see" the world so that images from the copy and from reality look similar to it, and how a few real trials can correct the simulation. Mobile-robot navigation will serve as the test task. The methods will be tested mainly on publicly available virtual buildings and collections of real recordings, and then confirmed on a real robot in the buildings of Wrocław University of Science and Technology.</w:t>
+        <w:t xml:space="preserve">The goal of this dissertation is to develop machine learning methods that let artificial intelligence work well in the real world using very little real data. The idea is to record a short video of a place, such as a corridor, an office or a workbench. From this video, artificial intelligence methods that reconstruct three-dimensional scenes create a faithful, photorealistic digital copy of the place, a so-called digital twin. We will develop a universal way of building such copies and measure how much they cost to make and how faithfully they reproduce reality. In this copy the model can practice safely and quickly millions of times. We will also study how to teach the model to "see" the world so that images from the copy and from reality look similar to it, and how a few real trials can correct the simulation. Mobile-robot navigation will be the main test task. The methods will be tested mainly on publicly available virtual buildings and collections of real recordings, and then confirmed on a real robot in the buildings of Wrocław University of Science and Technology. To show that the approach also works in other tasks, we will also apply it to grasping and moving objects with a robot arm, mainly in publicly available simulators.</w:t>
       </w:r>
     </w:p>
     <w:p>
@@ -7830,7 +8011,7 @@
           <w:rFonts w:cstheme="minorHAnsi"/>
           <w:lang w:val="en-US"/>
         </w:rPr>
-        <w:t xml:space="preserve">The research will show how much real data is truly needed for a trained model to work reliably, and how to make it cope with places it has never seen before. The expected result is a significant reduction in the cost and time of deploying artificial intelligence systems in new places, which may speed up the use of robots in logistics, care and industry. The software and data developed will be made publicly available.</w:t>
+        <w:t xml:space="preserve">The research will show how much real data is truly needed for a trained model to work reliably, and how to make it cope with places it has never seen before and with other tasks. The expected result is a significant reduction in the cost and time of deploying artificial intelligence systems in new places, which may speed up the use of robots in logistics, care and industry. The software and data developed will be made publicly available.</w:t>
       </w:r>
     </w:p>
     <w:permEnd w:id="305530072"/>
@@ -8563,9 +8744,9 @@
       </w:tblPr>
       <w:tblGrid>
         <w:gridCol w:w="1269"/>
-        <w:gridCol w:w="4316"/>
-        <w:gridCol w:w="1549"/>
-        <w:gridCol w:w="1938"/>
+        <w:gridCol w:w="4525"/>
+        <w:gridCol w:w="1456"/>
+        <w:gridCol w:w="1822"/>
       </w:tblGrid>
       <w:tr>
         <w:tc>
@@ -8589,7 +8770,7 @@
         </w:tc>
         <w:tc>
           <w:tcPr>
-            <w:tcW w:w="4316" w:type="dxa"/>
+            <w:tcW w:w="4525" w:type="dxa"/>
           </w:tcPr>
           <w:p>
             <w:pPr>
@@ -8608,7 +8789,7 @@
         </w:tc>
         <w:tc>
           <w:tcPr>
-            <w:tcW w:w="1549" w:type="dxa"/>
+            <w:tcW w:w="1456" w:type="dxa"/>
           </w:tcPr>
           <w:p>
             <w:pPr>
@@ -8627,7 +8808,7 @@
         </w:tc>
         <w:tc>
           <w:tcPr>
-            <w:tcW w:w="1938" w:type="dxa"/>
+            <w:tcW w:w="1822" w:type="dxa"/>
           </w:tcPr>
           <w:p>
             <w:pPr>
@@ -8666,7 +8847,7 @@
         </w:tc>
         <w:tc>
           <w:tcPr>
-            <w:tcW w:w="4316" w:type="dxa"/>
+            <w:tcW w:w="4525" w:type="dxa"/>
           </w:tcPr>
           <w:p>
             <w:pPr>
@@ -8684,7 +8865,7 @@
         </w:tc>
         <w:tc>
           <w:tcPr>
-            <w:tcW w:w="1549" w:type="dxa"/>
+            <w:tcW w:w="1456" w:type="dxa"/>
           </w:tcPr>
           <w:p>
             <w:pPr>
@@ -8702,7 +8883,7 @@
         </w:tc>
         <w:tc>
           <w:tcPr>
-            <w:tcW w:w="1938" w:type="dxa"/>
+            <w:tcW w:w="1822" w:type="dxa"/>
           </w:tcPr>
           <w:p>
             <w:pPr>
@@ -8740,7 +8921,7 @@
         </w:tc>
         <w:tc>
           <w:tcPr>
-            <w:tcW w:w="4316" w:type="dxa"/>
+            <w:tcW w:w="4525" w:type="dxa"/>
           </w:tcPr>
           <w:p>
             <w:pPr>
@@ -8758,7 +8939,7 @@
         </w:tc>
         <w:tc>
           <w:tcPr>
-            <w:tcW w:w="1549" w:type="dxa"/>
+            <w:tcW w:w="1456" w:type="dxa"/>
           </w:tcPr>
           <w:p>
             <w:pPr>
@@ -8776,7 +8957,7 @@
         </w:tc>
         <w:tc>
           <w:tcPr>
-            <w:tcW w:w="1938" w:type="dxa"/>
+            <w:tcW w:w="1822" w:type="dxa"/>
           </w:tcPr>
           <w:p>
             <w:pPr>
@@ -8814,7 +8995,7 @@
         </w:tc>
         <w:tc>
           <w:tcPr>
-            <w:tcW w:w="4316" w:type="dxa"/>
+            <w:tcW w:w="4525" w:type="dxa"/>
           </w:tcPr>
           <w:p>
             <w:pPr>
@@ -8826,13 +9007,13 @@
                 <w:rFonts w:cstheme="minorHAnsi"/>
                 <w:lang w:val="en-US"/>
               </w:rPr>
-              <w:t xml:space="preserve">P2, Stage III: CVPR 2028 or ICLR 2028; P3, Stage IV: ECCV 2028 or NeurIPS 2028</w:t>
+              <w:t xml:space="preserve">P2 (Stage III): CVPR or ICLR 2028; P3 (Stage IV, cross-task): ECCV, NeurIPS or RSS 2028</w:t>
             </w:r>
           </w:p>
         </w:tc>
         <w:tc>
           <w:tcPr>
-            <w:tcW w:w="1549" w:type="dxa"/>
+            <w:tcW w:w="1456" w:type="dxa"/>
           </w:tcPr>
           <w:p>
             <w:pPr>
@@ -8850,7 +9031,7 @@
         </w:tc>
         <w:tc>
           <w:tcPr>
-            <w:tcW w:w="1938" w:type="dxa"/>
+            <w:tcW w:w="1822" w:type="dxa"/>
           </w:tcPr>
           <w:p>
             <w:pPr>
@@ -8888,7 +9069,7 @@
         </w:tc>
         <w:tc>
           <w:tcPr>
-            <w:tcW w:w="4316" w:type="dxa"/>
+            <w:tcW w:w="4525" w:type="dxa"/>
           </w:tcPr>
           <w:p>
             <w:pPr>
@@ -8906,7 +9087,7 @@
         </w:tc>
         <w:tc>
           <w:tcPr>
-            <w:tcW w:w="1549" w:type="dxa"/>
+            <w:tcW w:w="1456" w:type="dxa"/>
           </w:tcPr>
           <w:p>
             <w:pPr>
@@ -8924,7 +9105,7 @@
         </w:tc>
         <w:tc>
           <w:tcPr>
-            <w:tcW w:w="1938" w:type="dxa"/>
+            <w:tcW w:w="1822" w:type="dxa"/>
           </w:tcPr>
           <w:p>
             <w:pPr>
@@ -8958,7 +9139,7 @@
           <w:rFonts w:cstheme="minorHAnsi"/>
           <w:lang w:val="en-US"/>
         </w:rPr>
-        <w:t xml:space="preserve">P1–P3 are the thematically linked core of the dissertation; P4 is optional. A paper on the real-robot validation may alternatively go to RSS (also 200 points).</w:t>
+        <w:t xml:space="preserve">P1–P3 are the thematically linked core of the dissertation; P4 is optional.</w:t>
       </w:r>
     </w:p>
     <w:p>
@@ -8979,7 +9160,7 @@
           <w:rFonts w:cstheme="minorHAnsi"/>
           <w:lang w:val="en-US"/>
         </w:rPr>
-        <w:t xml:space="preserve"> (1) Multi-robot Systems Lab, Stanford University (M. Schwager): Gaussian-splatting scene models and navigation. (2) Z. Kira's group, Georgia Tech: EmbodiedSplat [30]. A European host, which also opens the Erasmus+ short-term route (5–30 days), is sought with the supervisor in sem. 4, together with a foreign co-author for P2.</w:t>
+        <w:t xml:space="preserve"> (1) Multi-robot Systems Lab, Stanford University (M. Schwager): Gaussian-splatting scene models and navigation. (2) Z. Kira's group, Georgia Tech: EmbodiedSplat [30]. A European host (which also opens the Erasmus+ 5–30-day route) is sought with the supervisor in sem. 4, with a foreign co-author for P2.</w:t>
       </w:r>
     </w:p>
     <w:p>
@@ -9015,7 +9196,7 @@
           <w:rFonts w:cstheme="minorHAnsi"/>
           <w:lang w:val="en-US"/>
         </w:rPr>
-        <w:t xml:space="preserve"> Autonomous Robots Laboratory (K29, W12N; Pioneer 3-DX, Jaguar 4x4, ROS 2); a written agreement is task T3.2 (Nov 2026). Consultations on 3D reconstruction with K46's genwro.AI group are possible.</w:t>
+        <w:t xml:space="preserve"> Autonomous Robots Laboratory (K29, W12N; Pioneer 3-DX, Jaguar 4x4, ROS 2); a written agreement is task T3.2 (Nov 2026). Optional manipulation validation may use K29's Robotics Laboratory arms. Consultations on 3D reconstruction with K46's genwro.AI group are possible.</w:t>
       </w:r>
     </w:p>
     <w:p>
@@ -9065,7 +9246,7 @@
           <w:rFonts w:cstheme="minorHAnsi"/>
           <w:lang w:val="en-US"/>
         </w:rPr>
-        <w:t xml:space="preserve"> (4–7): acceptance at these conferences is selective, so every paper has a resubmission path inside the 200-point set, to the next deadline 2–4 months later (e.g. NeurIPS → ICLR or CVPR → ICML → ECCV/ICCV), after revision using the reviews. With three core papers and several yearly deadlines, the degree requirement does not depend on one decision.</w:t>
+        <w:t xml:space="preserve"> (4–7): every paper has a resubmission path inside the 200-point set, to the next deadline 2–4 months later (e.g. NeurIPS → ICLR or CVPR → ICML → ECCV/ICCV), after revision. With three core papers and several yearly deadlines, the degree requirement does not depend on one decision.</w:t>
       </w:r>
     </w:p>
     <w:p>
@@ -9123,7 +9304,7 @@
           <w:rFonts w:cstheme="minorHAnsi"/>
           <w:lang w:val="en-US"/>
         </w:rPr>
-        <w:t xml:space="preserve"> (3–5): the hypotheses are decided on public benchmarks and datasets; the robot only validates, so validation can move by a semester or to another PWr robot.</w:t>
+        <w:t xml:space="preserve"> (3–5): hypotheses are decided on public benchmarks and datasets; the robot only validates, so it can move by a semester or to another PWr robot.</w:t>
       </w:r>
     </w:p>
     <w:p>
@@ -9186,6 +9367,35 @@
     </w:p>
     <w:p>
       <w:pPr>
+        <w:spacing w:after="40" w:line="240" w:lineRule="auto"/>
+        <w:ind w:left="284" w:hanging="284"/>
+        <w:jc w:val="both"/>
+      </w:pPr>
+      <w:r>
+        <w:rPr>
+          <w:rFonts w:cstheme="minorHAnsi"/>
+          <w:lang w:val="en-US"/>
+        </w:rPr>
+        <w:t xml:space="preserve">•	</w:t>
+      </w:r>
+      <w:r>
+        <w:rPr>
+          <w:rFonts w:cstheme="minorHAnsi"/>
+          <w:i/>
+          <w:lang w:val="en-US"/>
+        </w:rPr>
+        <w:t xml:space="preserve">Scope creep from manipulation</w:t>
+      </w:r>
+      <w:r>
+        <w:rPr>
+          <w:rFonts w:cstheme="minorHAnsi"/>
+          <w:lang w:val="en-US"/>
+        </w:rPr>
+        <w:t xml:space="preserve"> (6–7): a generalization study on the Stage I pipeline and public simulators; if time is short, it is reduced to simulation-only experiments.</w:t>
+      </w:r>
+    </w:p>
+    <w:p>
+      <w:pPr>
         <w:spacing w:after="120" w:line="240" w:lineRule="auto"/>
         <w:jc w:val="both"/>
       </w:pPr>
@@ -9202,7 +9412,7 @@
           <w:rFonts w:cstheme="minorHAnsi"/>
           <w:lang w:val="en-US"/>
         </w:rPr>
-        <w:t xml:space="preserve"> A pre-PhD NLP paper (ACL 2025 Student Research Workshop) gives experience in representation learning; it is not part of the dissertation.</w:t>
+        <w:t xml:space="preserve"> A pre-PhD NLP paper (ACL 2025 SRW) gives experience in representation learning; it is not part of the dissertation.</w:t>
       </w:r>
     </w:p>
     <w:p>

</xml_diff>

<commit_message>
Wave 9: rewrite IPB around representation-level thesis (measure, localize, predict twin-to-real transfer)
Closes #22, closes #23

Co-Authored-By: Claude Opus 5.5 <noreply@anthropic.com>
</commit_message>
<xml_diff>
--- a/output/IPB_Grzegorz_Piotrowski.docx
+++ b/output/IPB_Grzegorz_Piotrowski.docx
@@ -1098,7 +1098,7 @@
           <w:rFonts w:cstheme="minorHAnsi"/>
           <w:lang w:val="en-US"/>
         </w:rPr>
-        <w:t xml:space="preserve"> Efektywne pod względem danych uczenie polityk agentów ucieleśnionych w cyfrowych bliźniakach otrzymanych z neuronowej rekonstrukcji scen rzeczywistych, przy ograniczonym budżecie danych rzeczywistych, na przykładzie nawigacji wizyjnej i manipulacji robotycznej</w:t>
+        <w:t xml:space="preserve"> Reprezentacje wewnętrzne jako miara i predyktor przenoszenia do świata rzeczywistego polityk agentów ucieleśnionych uczonych w cyfrowych bliźniakach z neuronowej rekonstrukcji scen, przy ograniczonym budżecie danych rzeczywistych</w:t>
       </w:r>
       <w:bookmarkStart w:id="0" w:name="_Hlk95566638"/>
     </w:p>
@@ -1120,7 +1120,7 @@
           <w:rFonts w:cstheme="minorHAnsi"/>
           <w:lang w:val="en-US"/>
         </w:rPr>
-        <w:t xml:space="preserve"> Data-efficient learning of embodied policies in digital twins built by neural reconstruction of real scenes under a limited real-data budget, with visual navigation and robotic manipulation as applications</w:t>
+        <w:t xml:space="preserve"> Internal representations as a measure and predictor of the real-world transfer of embodied policies learned in neural-reconstruction digital twins under a limited real-data budget</w:t>
       </w:r>
     </w:p>
     <w:bookmarkEnd w:id="0"/>
@@ -2047,7 +2047,7 @@
                 <w:rFonts w:cstheme="minorHAnsi"/>
                 <w:lang w:val="en-US"/>
               </w:rPr>
-              <w:t xml:space="preserve"> Formulation of the thesis, research questions RQ1–RQ4 and hypotheses H1–H4 with measurable decision rules and evaluation tiers A–C. </w:t>
+              <w:t xml:space="preserve"> Formulation of the representation-level thesis, research questions RQ1–RQ4 (measure, predict, use, generalize) and hypotheses H1–H4 with measurable decision rules and evaluation tiers A–C. </w:t>
             </w:r>
             <w:r>
               <w:rPr>
@@ -2226,7 +2226,7 @@
                 <w:b/>
                 <w:lang w:val="en-US"/>
               </w:rPr>
-              <w:t xml:space="preserve">Stage I – digital-twin pipeline and learning from reconstructions (RQ1).</w:t>
+              <w:t xml:space="preserve">Stage I – paired-frame benchmark (RQ1, H1).</w:t>
             </w:r>
           </w:p>
           <w:p>
@@ -2247,7 +2247,7 @@
                 <w:rFonts w:cstheme="minorHAnsi"/>
                 <w:lang w:val="en-US"/>
               </w:rPr>
-              <w:t xml:space="preserve"> Final choice of benchmark scenes, simulator and reconstruction method from the T2.2 shortlist; task-agnostic pipeline from a short real capture to a simulation-ready twin (camera poses, 3D Gaussian Splatting, collision mesh) with a written capture protocol; fidelity–cost report on ≥ 10 public scenes (PSNR/SSIM/LPIPS and depth error vs. capture minutes and GPU-hours); pre-registration of the evaluation protocol (§7). </w:t>
+              <w:t xml:space="preserve"> Final choice of ≥ 10 public scenes with real captures and reference scans, simulator and existing 3DGS pipeline from the T2.2 shortlist; twins built at ≥ 4 capture budgets; paired real/twin frames of the same pose with fidelity and cost logs; pre-registration of the evaluation protocol (§7). </w:t>
             </w:r>
             <w:r>
               <w:rPr>
@@ -2262,7 +2262,7 @@
                 <w:rFonts w:cstheme="minorHAnsi"/>
                 <w:lang w:val="en-US"/>
               </w:rPr>
-              <w:t xml:space="preserve"> pipeline code, capture protocol, fidelity–cost report and evaluation protocol in the repository. Place: K46, WCSS.</w:t>
+              <w:t xml:space="preserve"> benchmark v0 (data scripts, code) and protocol in the repository. Place: K46, WCSS.</w:t>
             </w:r>
           </w:p>
           <w:p>
@@ -2334,7 +2334,7 @@
                 <w:rFonts w:cstheme="minorHAnsi"/>
                 <w:lang w:val="en-US"/>
               </w:rPr>
-              <w:t xml:space="preserve"> First policies trained in reconstructed vs. generic scenes (tier A). </w:t>
+              <w:t xml:space="preserve"> Layer-wise gap measurement (linear CKA, linear probes) for ≥ 10 frozen encoders; pilot of policy-zoo training that fixes the zoo size. </w:t>
             </w:r>
             <w:r>
               <w:rPr>
@@ -2349,7 +2349,7 @@
                 <w:rFonts w:cstheme="minorHAnsi"/>
                 <w:lang w:val="en-US"/>
               </w:rPr>
-              <w:t xml:space="preserve"> first results; decision by </w:t>
+              <w:t xml:space="preserve"> first H1 results (concentration, budget trend, encoder differences) and pilot report, </w:t>
             </w:r>
             <w:r>
               <w:rPr>
@@ -2357,29 +2357,14 @@
                 <w:b/>
                 <w:lang w:val="en-US"/>
               </w:rPr>
-              <w:t xml:space="preserve">Jan 2027</w:t>
-            </w:r>
-            <w:r>
-              <w:rPr>
-                <w:rFonts w:cstheme="minorHAnsi"/>
-                <w:lang w:val="en-US"/>
-              </w:rPr>
-              <w:t xml:space="preserve"> whether they suffice for the early option, </w:t>
-            </w:r>
-            <w:r>
-              <w:rPr>
-                <w:rFonts w:cstheme="minorHAnsi"/>
-                <w:b/>
-                <w:lang w:val="en-US"/>
-              </w:rPr>
-              <w:t xml:space="preserve">ICML 2027</w:t>
-            </w:r>
-            <w:r>
-              <w:rPr>
-                <w:rFonts w:cstheme="minorHAnsi"/>
-                <w:lang w:val="en-US"/>
-              </w:rPr>
-              <w:t xml:space="preserve"> (paper submitted) or not (work continues to NeurIPS 2027).</w:t>
+              <w:t xml:space="preserve">by Feb 2027</w:t>
+            </w:r>
+            <w:r>
+              <w:rPr>
+                <w:rFonts w:cstheme="minorHAnsi"/>
+                <w:lang w:val="en-US"/>
+              </w:rPr>
+              <w:t xml:space="preserve">.</w:t>
             </w:r>
             <w:permEnd w:id="1413760106"/>
           </w:p>
@@ -2456,7 +2441,7 @@
                 <w:b/>
                 <w:lang w:val="en-US"/>
               </w:rPr>
-              <w:t xml:space="preserve">Stage II – real-data budget (RQ1–RQ2, H1, H4).</w:t>
+              <w:t xml:space="preserve">Stage I completed, Stage II started (RQ1–RQ2, H1–H2).</w:t>
             </w:r>
           </w:p>
           <w:p>
@@ -2477,7 +2462,7 @@
                 <w:rFonts w:cstheme="minorHAnsi"/>
                 <w:lang w:val="en-US"/>
               </w:rPr>
-              <w:t xml:space="preserve"> Training in reconstructions vs. generic and real-data-only baselines across budgets on tiers A–B; real-robot pilot in one PWr environment (tier C). </w:t>
+              <w:t xml:space="preserve"> Navigation policies on each frozen encoder trained in the twins and tested in proxy reality (tier A); robustness ranking vs. twin→real success; gap localization inside twin-trained policies; generation of the policy zoo (≥ 200 navigation policies with twin and proxy-real labels). </w:t>
             </w:r>
             <w:r>
               <w:rPr>
@@ -2492,7 +2477,7 @@
                 <w:rFonts w:cstheme="minorHAnsi"/>
                 <w:lang w:val="en-US"/>
               </w:rPr>
-              <w:t xml:space="preserve"> budget–performance curves, pilot results (</w:t>
+              <w:t xml:space="preserve"> </w:t>
             </w:r>
             <w:r>
               <w:rPr>
@@ -2507,7 +2492,22 @@
                 <w:rFonts w:cstheme="minorHAnsi"/>
                 <w:lang w:val="en-US"/>
               </w:rPr>
-              <w:t xml:space="preserve">). Place: K46, WCSS, Denali. Without robot access by Mar 2027, the pilot moves to sem. 5; H1 is decided on tier A either way.</w:t>
+              <w:t xml:space="preserve">; zoo v1, </w:t>
+            </w:r>
+            <w:r>
+              <w:rPr>
+                <w:rFonts w:cstheme="minorHAnsi"/>
+                <w:b/>
+                <w:lang w:val="en-US"/>
+              </w:rPr>
+              <w:t xml:space="preserve">by Sep 2027</w:t>
+            </w:r>
+            <w:r>
+              <w:rPr>
+                <w:rFonts w:cstheme="minorHAnsi"/>
+                <w:lang w:val="en-US"/>
+              </w:rPr>
+              <w:t xml:space="preserve">. Place: K46, WCSS.</w:t>
             </w:r>
           </w:p>
           <w:p>
@@ -2536,14 +2536,14 @@
                 <w:b/>
                 <w:lang w:val="en-US"/>
               </w:rPr>
-              <w:t xml:space="preserve">Prepare and submit an article to NeurIPS 2027</w:t>
-            </w:r>
-            <w:r>
-              <w:rPr>
-                <w:rFonts w:cstheme="minorHAnsi"/>
-                <w:lang w:val="en-US"/>
-              </w:rPr>
-              <w:t xml:space="preserve"> (Stages I–II). </w:t>
+              <w:t xml:space="preserve">Prepare and submit article P1 to NeurIPS 2027</w:t>
+            </w:r>
+            <w:r>
+              <w:rPr>
+                <w:rFonts w:cstheme="minorHAnsi"/>
+                <w:lang w:val="en-US"/>
+              </w:rPr>
+              <w:t xml:space="preserve"> (paired-frame benchmark and gap localization, RQ1; Datasets &amp; Benchmarks or main track). </w:t>
             </w:r>
             <w:r>
               <w:rPr>
@@ -2573,7 +2573,7 @@
                 <w:rFonts w:cstheme="minorHAnsi"/>
                 <w:lang w:val="en-US"/>
               </w:rPr>
-              <w:t xml:space="preserve"> (§11).</w:t>
+              <w:t xml:space="preserve"> (§11); benchmark released with the paper.</w:t>
             </w:r>
           </w:p>
           <w:p>
@@ -2702,7 +2702,7 @@
                 <w:b/>
                 <w:lang w:val="en-US"/>
               </w:rPr>
-              <w:t xml:space="preserve">Stage III – predictivity and correction (RQ4, H3, H4).</w:t>
+              <w:t xml:space="preserve">Stage II – transfer forecasting (RQ2, H2).</w:t>
             </w:r>
           </w:p>
           <w:p>
@@ -2723,7 +2723,7 @@
                 <w:rFonts w:cstheme="minorHAnsi"/>
                 <w:lang w:val="en-US"/>
               </w:rPr>
-              <w:t xml:space="preserve"> SRCC of reconstructed vs. generic simulation over ≥ 10 policy variants on tier A, validated with paired rollouts on the robot (tier C). </w:t>
+              <w:t xml:space="preserve"> Transfer predictors on the zoo (graph neural network over layers, weight-space metanetwork) vs. baselines (twin SR, PSNR/LPIPS, simulator-level predictivity) on held-out scenes; hidden-state failure monitors calibrated conformally in the twin and tested on real data (tiers A, B). </w:t>
             </w:r>
             <w:r>
               <w:rPr>
@@ -2738,7 +2738,7 @@
                 <w:rFonts w:cstheme="minorHAnsi"/>
                 <w:lang w:val="en-US"/>
               </w:rPr>
-              <w:t xml:space="preserve"> validation report (</w:t>
+              <w:t xml:space="preserve"> </w:t>
             </w:r>
             <w:r>
               <w:rPr>
@@ -2746,14 +2746,14 @@
                 <w:b/>
                 <w:lang w:val="en-US"/>
               </w:rPr>
-              <w:t xml:space="preserve">H3 completed</w:t>
-            </w:r>
-            <w:r>
-              <w:rPr>
-                <w:rFonts w:cstheme="minorHAnsi"/>
-                <w:lang w:val="en-US"/>
-              </w:rPr>
-              <w:t xml:space="preserve">).</w:t>
+              <w:t xml:space="preserve">H2 completed</w:t>
+            </w:r>
+            <w:r>
+              <w:rPr>
+                <w:rFonts w:cstheme="minorHAnsi"/>
+                <w:lang w:val="en-US"/>
+              </w:rPr>
+              <w:t xml:space="preserve">. Place: K46, WCSS.</w:t>
             </w:r>
           </w:p>
           <w:p>
@@ -2774,7 +2774,7 @@
                 <w:rFonts w:cstheme="minorHAnsi"/>
                 <w:lang w:val="en-US"/>
               </w:rPr>
-              <w:t xml:space="preserve"> Correction of appearance and dynamics from a few real rollouts; budget comparison with real-data-only learning. </w:t>
+              <w:t xml:space="preserve"> First robot validation campaign (tier C, 8 zoo policies, 2 PWr environments): do forecasts rank real outcomes as on tier A? </w:t>
             </w:r>
             <w:r>
               <w:rPr>
@@ -2789,7 +2789,7 @@
                 <w:rFonts w:cstheme="minorHAnsi"/>
                 <w:lang w:val="en-US"/>
               </w:rPr>
-              <w:t xml:space="preserve"> analysis of results. Place: K46, WCSS, Denali.</w:t>
+              <w:t xml:space="preserve"> validation report. Place: Denali. Without robot access, the campaign moves to sem. 7; H1–H2 are decided on tier A either way.</w:t>
             </w:r>
           </w:p>
           <w:p>
@@ -2825,7 +2825,7 @@
                 <w:rFonts w:cstheme="minorHAnsi"/>
                 <w:lang w:val="en-US"/>
               </w:rPr>
-              <w:t xml:space="preserve"> (Stage III) submitted to </w:t>
+              <w:t xml:space="preserve"> (forecasting transfer and failure from internals) submitted to </w:t>
             </w:r>
             <w:r>
               <w:rPr>
@@ -2840,7 +2840,7 @@
                 <w:rFonts w:cstheme="minorHAnsi"/>
                 <w:lang w:val="en-US"/>
               </w:rPr>
-              <w:t xml:space="preserve"> (~Nov 2027; ICLR 2028, ~late Sep 2027, if ready earlier). If P1 was rejected, its revision goes to CVPR 2028 or ICML 2028 (~Jan 2028). </w:t>
+              <w:t xml:space="preserve"> (~Nov 2027; ICLR 2028, ~late Sep 2027, if ready earlier). If P1 was rejected, its revision goes to CVPR 2028. </w:t>
             </w:r>
             <w:r>
               <w:rPr>
@@ -2933,7 +2933,7 @@
                 <w:b/>
                 <w:lang w:val="en-US"/>
               </w:rPr>
-              <w:t xml:space="preserve">Stage IV – cross-scene and cross-task generalization (RQ3, H2).</w:t>
+              <w:t xml:space="preserve">Stages III–IV – using the forecasts; cross-task transfer (RQ3–RQ4, H3–H4).</w:t>
             </w:r>
           </w:p>
           <w:p>
@@ -2962,14 +2962,14 @@
                 <w:i/>
                 <w:lang w:val="en-US"/>
               </w:rPr>
-              <w:t xml:space="preserve">Navigation:</w:t>
-            </w:r>
-            <w:r>
-              <w:rPr>
-                <w:rFonts w:cstheme="minorHAnsi"/>
-                <w:lang w:val="en-US"/>
-              </w:rPr>
-              <w:t xml:space="preserve"> augmentation of reconstructed scenes and representation alignment between reconstructed and real observations; evaluation on held-out scenes (tier A), real-world datasets (tier B) and uncaptured PWr or host-lab environments (tier C). (b) </w:t>
+              <w:t xml:space="preserve">Budget allocation:</w:t>
+            </w:r>
+            <w:r>
+              <w:rPr>
+                <w:rFonts w:cstheme="minorHAnsi"/>
+                <w:lang w:val="en-US"/>
+              </w:rPr>
+              <w:t xml:space="preserve"> forecast-guided weighting of twin data, capture selection and rollout selection vs. uniform and random allocation; budget–performance curves (capture minutes + real rollouts). (b) </w:t>
             </w:r>
             <w:r>
               <w:rPr>
@@ -2984,7 +2984,7 @@
                 <w:rFonts w:cstheme="minorHAnsi"/>
                 <w:lang w:val="en-US"/>
               </w:rPr>
-              <w:t xml:space="preserve"> twins of public tabletop scenes and objects built with the unchanged Stage I pipeline; pick-and-place policies trained in a public GPU simulator (ManiSkill3) and evaluated in public real-to-sim environments (SIMPLER), with the same ablation (generic vs. twin only vs. twin + augmentation + alignment) and a real-data-only baseline; simulation-only if time is short (§12). </w:t>
+              <w:t xml:space="preserve"> policy zoo in ManiSkill3 twins, labels from SIMPLER paired sim/real evaluations; the navigation predictor applied without retraining, compared with generic-simulator SRCC and a frozen world-model evaluator. </w:t>
             </w:r>
             <w:r>
               <w:rPr>
@@ -2999,7 +2999,7 @@
                 <w:rFonts w:cstheme="minorHAnsi"/>
                 <w:lang w:val="en-US"/>
               </w:rPr>
-              <w:t xml:space="preserve"> ablation study and cross-task results (</w:t>
+              <w:t xml:space="preserve"> </w:t>
             </w:r>
             <w:r>
               <w:rPr>
@@ -3007,14 +3007,14 @@
                 <w:b/>
                 <w:lang w:val="en-US"/>
               </w:rPr>
-              <w:t xml:space="preserve">H2 completed</w:t>
-            </w:r>
-            <w:r>
-              <w:rPr>
-                <w:rFonts w:cstheme="minorHAnsi"/>
-                <w:lang w:val="en-US"/>
-              </w:rPr>
-              <w:t xml:space="preserve">). Place: K46, WCSS; optional validation on a manipulator of the K29 Robotics Laboratory.</w:t>
+              <w:t xml:space="preserve">H3 and H4 completed</w:t>
+            </w:r>
+            <w:r>
+              <w:rPr>
+                <w:rFonts w:cstheme="minorHAnsi"/>
+                <w:lang w:val="en-US"/>
+              </w:rPr>
+              <w:t xml:space="preserve"> on tiers A–B. Place: K46, WCSS.</w:t>
             </w:r>
           </w:p>
           <w:p>
@@ -3101,7 +3101,7 @@
                 <w:rFonts w:cstheme="minorHAnsi"/>
                 <w:lang w:val="en-US"/>
               </w:rPr>
-              <w:t xml:space="preserve"> (Stage IV, cross-task: navigation → manipulation) submitted to </w:t>
+              <w:t xml:space="preserve"> (budget allocation and cross-task transfer) submitted to </w:t>
             </w:r>
             <w:r>
               <w:rPr>
@@ -3109,6 +3109,21 @@
                 <w:b/>
                 <w:lang w:val="en-US"/>
               </w:rPr>
+              <w:t xml:space="preserve">NeurIPS 2028</w:t>
+            </w:r>
+            <w:r>
+              <w:rPr>
+                <w:rFonts w:cstheme="minorHAnsi"/>
+                <w:lang w:val="en-US"/>
+              </w:rPr>
+              <w:t xml:space="preserve"> (~May 2028) or </w:t>
+            </w:r>
+            <w:r>
+              <w:rPr>
+                <w:rFonts w:cstheme="minorHAnsi"/>
+                <w:b/>
+                <w:lang w:val="en-US"/>
+              </w:rPr>
               <w:t xml:space="preserve">ECCV 2028</w:t>
             </w:r>
             <w:r>
@@ -3116,22 +3131,7 @@
                 <w:rFonts w:cstheme="minorHAnsi"/>
                 <w:lang w:val="en-US"/>
               </w:rPr>
-              <w:t xml:space="preserve"> (~Mar 2028) or </w:t>
-            </w:r>
-            <w:r>
-              <w:rPr>
-                <w:rFonts w:cstheme="minorHAnsi"/>
-                <w:b/>
-                <w:lang w:val="en-US"/>
-              </w:rPr>
-              <w:t xml:space="preserve">NeurIPS 2028</w:t>
-            </w:r>
-            <w:r>
-              <w:rPr>
-                <w:rFonts w:cstheme="minorHAnsi"/>
-                <w:lang w:val="en-US"/>
-              </w:rPr>
-              <w:t xml:space="preserve"> (~May 2028), or RSS 2028. </w:t>
+              <w:t xml:space="preserve"> (~Mar 2028). </w:t>
             </w:r>
             <w:r>
               <w:rPr>
@@ -3224,7 +3224,7 @@
                 <w:b/>
                 <w:lang w:val="en-US"/>
               </w:rPr>
-              <w:t xml:space="preserve">Consolidation (RQ2, H4).</w:t>
+              <w:t xml:space="preserve">Consolidation (RQ1–RQ4).</w:t>
             </w:r>
           </w:p>
           <w:p>
@@ -3245,7 +3245,7 @@
                 <w:rFonts w:cstheme="minorHAnsi"/>
                 <w:lang w:val="en-US"/>
               </w:rPr>
-              <w:t xml:space="preserve"> Full real-data-budget study over all baselines with real-robot validation. </w:t>
+              <w:t xml:space="preserve"> Second robot validation campaign (tier C) of the forecasts and of guided rollout selection; final analysis of H1–H4 across tiers. </w:t>
             </w:r>
             <w:r>
               <w:rPr>
@@ -3260,22 +3260,7 @@
                 <w:rFonts w:cstheme="minorHAnsi"/>
                 <w:lang w:val="en-US"/>
               </w:rPr>
-              <w:t xml:space="preserve"> final results (</w:t>
-            </w:r>
-            <w:r>
-              <w:rPr>
-                <w:rFonts w:cstheme="minorHAnsi"/>
-                <w:b/>
-                <w:lang w:val="en-US"/>
-              </w:rPr>
-              <w:t xml:space="preserve">H4 completed</w:t>
-            </w:r>
-            <w:r>
-              <w:rPr>
-                <w:rFonts w:cstheme="minorHAnsi"/>
-                <w:lang w:val="en-US"/>
-              </w:rPr>
-              <w:t xml:space="preserve">).</w:t>
+              <w:t xml:space="preserve"> final results. Place: K46, Denali.</w:t>
             </w:r>
           </w:p>
           <w:p>
@@ -3296,7 +3281,7 @@
                 <w:rFonts w:cstheme="minorHAnsi"/>
                 <w:lang w:val="en-US"/>
               </w:rPr>
-              <w:t xml:space="preserve"> Release of code, reconstructed scenes and evaluation protocol. </w:t>
+              <w:t xml:space="preserve"> Release of code, paired-frame benchmark and policy zoo. </w:t>
             </w:r>
             <w:r>
               <w:rPr>
@@ -4204,22 +4189,22 @@
           <w:rFonts w:cstheme="minorHAnsi"/>
           <w:lang w:val="en-US"/>
         </w:rPr>
-        <w:t xml:space="preserve">. Deep reinforcement learning, imitation learning and large pretrained models learn strong behaviour, but only from very large amounts of experience: near-perfect point-goal navigation in simulation took billions of frames. For embodied agents (mobile robots, manipulators) such data can only come from the real world, where it is slow, expensive and sometimes risky to collect. The central question is therefore how to learn well from </w:t>
-      </w:r>
-      <w:r>
-        <w:rPr>
-          <w:rFonts w:cstheme="minorHAnsi"/>
-          <w:b/>
-          <w:lang w:val="en-US"/>
-        </w:rPr>
-        <w:t xml:space="preserve">a small, fixed budget of real data</w:t>
-      </w:r>
-      <w:r>
-        <w:rPr>
-          <w:rFonts w:cstheme="minorHAnsi"/>
-          <w:lang w:val="en-US"/>
-        </w:rPr>
-        <w:t xml:space="preserve">.</w:t>
+        <w:t xml:space="preserve">. Embodied agents (mobile robots, manipulators) learn strong behaviour only from very large amounts of experience, often millions of trials or more. In the real world such data is slow, expensive and sometimes risky to collect, so a policy is usually trained in simulation and then deployed on real sensor data, where it often fails (the </w:t>
+      </w:r>
+      <w:r>
+        <w:rPr>
+          <w:rFonts w:cstheme="minorHAnsi"/>
+          <w:b/>
+          <w:lang w:val="en-US"/>
+        </w:rPr>
+        <w:t xml:space="preserve">sim-to-real gap</w:t>
+      </w:r>
+      <w:r>
+        <w:rPr>
+          <w:rFonts w:cstheme="minorHAnsi"/>
+          <w:lang w:val="en-US"/>
+        </w:rPr>
+        <w:t xml:space="preserve">).</w:t>
       </w:r>
     </w:p>
     <w:p>
@@ -4230,24 +4215,62 @@
       <w:r>
         <w:rPr>
           <w:rFonts w:cstheme="minorHAnsi"/>
-          <w:lang w:val="en-US"/>
-        </w:rPr>
-        <w:t xml:space="preserve">Simulation is the usual answer, but policies trained there often fail on real inputs. This </w:t>
-      </w:r>
-      <w:r>
-        <w:rPr>
-          <w:rFonts w:cstheme="minorHAnsi"/>
-          <w:b/>
-          <w:lang w:val="en-US"/>
-        </w:rPr>
-        <w:t xml:space="preserve">sim-to-real gap</w:t>
-      </w:r>
-      <w:r>
-        <w:rPr>
-          <w:rFonts w:cstheme="minorHAnsi"/>
-          <w:lang w:val="en-US"/>
-        </w:rPr>
-        <w:t xml:space="preserve"> is a distribution shift between training and deployment data in appearance, geometry and dynamics. Domain randomization widens the training distribution by hand and still gives no guarantee for a particular target domain; training directly on real data does not scale.</w:t>
+          <w:b/>
+          <w:lang w:val="en-US"/>
+        </w:rPr>
+        <w:t xml:space="preserve">Digital twins built by neural scene reconstruction</w:t>
+      </w:r>
+      <w:r>
+        <w:rPr>
+          <w:rFonts w:cstheme="minorHAnsi"/>
+          <w:lang w:val="en-US"/>
+        </w:rPr>
+        <w:t xml:space="preserve"> (3D Gaussian Splatting, Neural Radiance Fields) turn a few minutes of real video into a photorealistic, interactive model of the target scene, in which a policy can be trained at scale. Building such twins has quickly become routine: dozens of papers a year and more than ten open-source twin simulators. The open question has moved from </w:t>
+      </w:r>
+      <w:r>
+        <w:rPr>
+          <w:rFonts w:cstheme="minorHAnsi"/>
+          <w:i/>
+          <w:lang w:val="en-US"/>
+        </w:rPr>
+        <w:t xml:space="preserve">how to build a twin</w:t>
+      </w:r>
+      <w:r>
+        <w:rPr>
+          <w:rFonts w:cstheme="minorHAnsi"/>
+          <w:lang w:val="en-US"/>
+        </w:rPr>
+        <w:t xml:space="preserve"> to </w:t>
+      </w:r>
+      <w:r>
+        <w:rPr>
+          <w:rFonts w:cstheme="minorHAnsi"/>
+          <w:i/>
+          <w:lang w:val="en-US"/>
+        </w:rPr>
+        <w:t xml:space="preserve">when a policy trained in it can be trusted in reality</w:t>
+      </w:r>
+      <w:r>
+        <w:rPr>
+          <w:rFonts w:cstheme="minorHAnsi"/>
+          <w:lang w:val="en-US"/>
+        </w:rPr>
+        <w:t xml:space="preserve">. Today this is answered in two unsatisfying ways: by running the policy in the real world (slow and costly, which is what the twin was meant to avoid) or by image-quality scores of the reconstruction, which are known to track real performance poorly. Neither says </w:t>
+      </w:r>
+      <w:r>
+        <w:rPr>
+          <w:rFonts w:cstheme="minorHAnsi"/>
+          <w:b/>
+          <w:lang w:val="en-US"/>
+        </w:rPr>
+        <w:t xml:space="preserve">where</w:t>
+      </w:r>
+      <w:r>
+        <w:rPr>
+          <w:rFonts w:cstheme="minorHAnsi"/>
+          <w:lang w:val="en-US"/>
+        </w:rPr>
+        <w:t xml:space="preserve"> the gap arises, and neither tells how to spend the few real observations one can afford.</w:t>
       </w:r>
     </w:p>
     <w:p>
@@ -4261,74 +4284,29 @@
           <w:b/>
           <w:lang w:val="en-US"/>
         </w:rPr>
-        <w:t xml:space="preserve">Digital twins built by neural scene reconstruction</w:t>
-      </w:r>
-      <w:r>
-        <w:rPr>
-          <w:rFonts w:cstheme="minorHAnsi"/>
-          <w:lang w:val="en-US"/>
-        </w:rPr>
-        <w:t xml:space="preserve"> (Neural Radiance Fields, 3D Gaussian Splatting) open a third path. A few minutes of real video are turned into a photorealistic, interactive model of the target scene, in which a policy can be trained at scale (</w:t>
-      </w:r>
-      <w:r>
-        <w:rPr>
-          <w:rFonts w:cstheme="minorHAnsi"/>
-          <w:i/>
-          <w:lang w:val="en-US"/>
-        </w:rPr>
-        <w:t xml:space="preserve">real-to-sim-to-real</w:t>
-      </w:r>
-      <w:r>
-        <w:rPr>
-          <w:rFonts w:cstheme="minorHAnsi"/>
-          <w:lang w:val="en-US"/>
-        </w:rPr>
-        <w:t xml:space="preserve">). This moves the cost from collecting experience to collecting cheap captures. It raises open machine-learning questions that have not been studied systematically: how performance </w:t>
-      </w:r>
-      <w:r>
-        <w:rPr>
-          <w:rFonts w:cstheme="minorHAnsi"/>
-          <w:b/>
-          <w:lang w:val="en-US"/>
-        </w:rPr>
-        <w:t xml:space="preserve">scales with the real-data budget</w:t>
-      </w:r>
-      <w:r>
-        <w:rPr>
-          <w:rFonts w:cstheme="minorHAnsi"/>
-          <w:lang w:val="en-US"/>
-        </w:rPr>
-        <w:t xml:space="preserve">, which </w:t>
-      </w:r>
-      <w:r>
-        <w:rPr>
-          <w:rFonts w:cstheme="minorHAnsi"/>
-          <w:b/>
-          <w:lang w:val="en-US"/>
-        </w:rPr>
-        <w:t xml:space="preserve">representations</w:t>
-      </w:r>
-      <w:r>
-        <w:rPr>
-          <w:rFonts w:cstheme="minorHAnsi"/>
-          <w:lang w:val="en-US"/>
-        </w:rPr>
-        <w:t xml:space="preserve"> bring reconstructed and real data close enough, how to generalize beyond the captured scenes </w:t>
-      </w:r>
-      <w:r>
-        <w:rPr>
-          <w:rFonts w:cstheme="minorHAnsi"/>
-          <w:b/>
-          <w:lang w:val="en-US"/>
-        </w:rPr>
-        <w:t xml:space="preserve">and to other tasks and embodiments</w:t>
-      </w:r>
-      <w:r>
-        <w:rPr>
-          <w:rFonts w:cstheme="minorHAnsi"/>
-          <w:lang w:val="en-US"/>
-        </w:rPr>
-        <w:t xml:space="preserve">, how a few real observations can correct the simulation, and what a twin costs to build and how faithful it is.</w:t>
+        <w:t xml:space="preserve">Why representations.</w:t>
+      </w:r>
+      <w:r>
+        <w:rPr>
+          <w:rFonts w:cstheme="minorHAnsi"/>
+          <w:lang w:val="en-US"/>
+        </w:rPr>
+        <w:t xml:space="preserve"> Whatever a policy does, it does through its internal representations: the features its encoder and layers compute from an image. This is where reconstructed and real inputs either meet or diverge. Machine learning now has mature tools to read representations: layer-wise probing, representational similarity (e.g. centred kernel alignment), and learning on network weights (metanetworks over model populations). They have been used to predict the accuracy and generalization of image classifiers and other networks from their weights, but not the real-world transfer of policies trained in twins. The dissertation asks whether this transfer can be </w:t>
+      </w:r>
+      <w:r>
+        <w:rPr>
+          <w:rFonts w:cstheme="minorHAnsi"/>
+          <w:b/>
+          <w:lang w:val="en-US"/>
+        </w:rPr>
+        <w:t xml:space="preserve">measured, localized and predicted from representations</w:t>
+      </w:r>
+      <w:r>
+        <w:rPr>
+          <w:rFonts w:cstheme="minorHAnsi"/>
+          <w:lang w:val="en-US"/>
+        </w:rPr>
+        <w:t xml:space="preserve"> without real rollouts, and whether such forecasts let a small real-data budget be spent where it matters: which twin data to weight, what to capture, and which real trials to run.</w:t>
       </w:r>
     </w:p>
     <w:p>
@@ -4349,7 +4327,7 @@
           <w:rFonts w:cstheme="minorHAnsi"/>
           <w:lang w:val="en-US"/>
         </w:rPr>
-        <w:t xml:space="preserve"> The research object is a general, task-agnostic learning methodology, which places it in </w:t>
+        <w:t xml:space="preserve"> The object is a learning and evaluation methodology, not a robot or a simulator, which places it in </w:t>
       </w:r>
       <w:r>
         <w:rPr>
@@ -4364,7 +4342,7 @@
           <w:rFonts w:cstheme="minorHAnsi"/>
           <w:lang w:val="en-US"/>
         </w:rPr>
-        <w:t xml:space="preserve">: data-efficient learning, learning from reconstructed data, representation learning under distribution shift, and methods for testing whether results from simulation can be trusted. </w:t>
+        <w:t xml:space="preserve"> (representation learning, learning under distribution shift, model analysis). The student uses existing twin pipelines and simulators and does not develop new ones. </w:t>
       </w:r>
       <w:r>
         <w:rPr>
@@ -4379,22 +4357,22 @@
           <w:rFonts w:cstheme="minorHAnsi"/>
           <w:lang w:val="en-US"/>
         </w:rPr>
-        <w:t xml:space="preserve"> is the primary testbed, because public simulators, benchmarks and real-world datasets allow controlled, reproducible measurement of the gap; trials on a real robot validate the conclusions. </w:t>
-      </w:r>
-      <w:r>
-        <w:rPr>
-          <w:rFonts w:cstheme="minorHAnsi"/>
-          <w:b/>
-          <w:lang w:val="en-US"/>
-        </w:rPr>
-        <w:t xml:space="preserve">Robotic manipulation</w:t>
-      </w:r>
-      <w:r>
-        <w:rPr>
-          <w:rFonts w:cstheme="minorHAnsi"/>
-          <w:lang w:val="en-US"/>
-        </w:rPr>
-        <w:t xml:space="preserve"> (e.g. tabletop pick-and-place in reconstructed scenes) is the generalization domain: it tests, mainly on public simulators and benchmarks, that the method is not specific to one task or robot. The topic fits the representation learning, computer vision and generative modelling work of the Department of Artificial Intelligence (K46). The computation-heavy parts can run on the GPU infrastructure available to PWr researchers (WCSS, PLGrid). The main result, a measured answer to "how much real data is enough", is useful whatever the outcome.</w:t>
+        <w:t xml:space="preserve"> is the primary testbed, because public scene datasets with real captures allow controlled, reproducible measurement without an own robot; </w:t>
+      </w:r>
+      <w:r>
+        <w:rPr>
+          <w:rFonts w:cstheme="minorHAnsi"/>
+          <w:b/>
+          <w:lang w:val="en-US"/>
+        </w:rPr>
+        <w:t xml:space="preserve">robotic manipulation</w:t>
+      </w:r>
+      <w:r>
+        <w:rPr>
+          <w:rFonts w:cstheme="minorHAnsi"/>
+          <w:lang w:val="en-US"/>
+        </w:rPr>
+        <w:t xml:space="preserve"> tests that the findings carry over to another task. Trials on a real robot (planned cooperation with a PWr robotics laboratory) validate, but do not decide, the conclusions. The topic fits the Department of Artificial Intelligence (K46), whose research groups include representation learning on graphs and models in weight space. The computation runs on the GPU infrastructure available to PWr researchers (WCSS, PLGrid). A benchmark of paired real and reconstructed data and a measured answer to "which representations survive reconstruction" are useful whatever the hypotheses' outcome.</w:t>
       </w:r>
     </w:p>
     <w:p>
@@ -4415,7 +4393,7 @@
           <w:rFonts w:cstheme="minorHAnsi"/>
           <w:lang w:val="en-US"/>
         </w:rPr>
-        <w:t xml:space="preserve"> service, assistive and warehouse robotics, inspection and delivery, flexible industrial manipulation, and rapid deployment of learned systems in new buildings and workcells with minimal on-site data collection. More broadly, the methods apply wherever models are trained on reconstructed or synthetic data and deployed on real sensor data: other embodied agents, industrial digital twins, and perception for autonomous systems.</w:t>
+        <w:t xml:space="preserve"> faster and cheaper deployment of learned robots in new buildings and workcells (service, assistive, warehouse and inspection robotics, flexible manipulation); pre-deployment screening of candidate policies and safety monitors that flag likely failures; choosing which visual foundation models to use in twin-based training; and, beyond robotics, any system trained on reconstructed or synthetic data and deployed on real sensor data (industrial digital twins, perception for autonomous systems).</w:t>
       </w:r>
     </w:p>
     <w:permEnd w:id="1178868985"/>
@@ -4786,29 +4764,44 @@
           <w:b/>
           <w:lang w:val="en-US"/>
         </w:rPr>
-        <w:t xml:space="preserve">Learning-based navigation and its data demands.</w:t>
-      </w:r>
-      <w:r>
-        <w:rPr>
-          <w:rFonts w:cstheme="minorHAnsi"/>
-          <w:lang w:val="en-US"/>
-        </w:rPr>
-        <w:t xml:space="preserve"> Photorealistic simulators such as Habitat [1, 2] and CARLA [3] made large-scale training of embodied agents possible. Wijmans et al. [4] reached near-perfect point-goal navigation only after 2.5 billion simulated frames, a volume out of reach on physical robots. </w:t>
-      </w:r>
-      <w:r>
-        <w:rPr>
-          <w:rFonts w:cstheme="minorHAnsi"/>
-          <w:i/>
-          <w:lang w:val="en-US"/>
-        </w:rPr>
-        <w:t xml:space="preserve">Navigation foundation models</w:t>
-      </w:r>
-      <w:r>
-        <w:rPr>
-          <w:rFonts w:cstheme="minorHAnsi"/>
-          <w:lang w:val="en-US"/>
-        </w:rPr>
-        <w:t xml:space="preserve"> (GNM [5], ViNT [6], NoMaD [7]) are trained on pooled real-robot datasets, and Open X-Embodiment [8] shows that robot learning scales with data. Such data is costly, and every new environment or platform typically needs more of it.</w:t>
+        <w:t xml:space="preserve">Digital twins have become a commodity.</w:t>
+      </w:r>
+      <w:r>
+        <w:rPr>
+          <w:rFonts w:cstheme="minorHAnsi"/>
+          <w:lang w:val="en-US"/>
+        </w:rPr>
+        <w:t xml:space="preserve"> Photorealistic simulators such as Habitat [1] and domain randomization [2] made large-scale training of embodied agents possible. 3D Gaussian Splatting (3DGS) [3] now turns a short phone or camera capture into a real-time, photorealistic </w:t>
+      </w:r>
+      <w:r>
+        <w:rPr>
+          <w:rFonts w:cstheme="minorHAnsi"/>
+          <w:i/>
+          <w:lang w:val="en-US"/>
+        </w:rPr>
+        <w:t xml:space="preserve">digital twin</w:t>
+      </w:r>
+      <w:r>
+        <w:rPr>
+          <w:rFonts w:cstheme="minorHAnsi"/>
+          <w:lang w:val="en-US"/>
+        </w:rPr>
+        <w:t xml:space="preserve">. Twin-trained policies transfer to real robots in navigation (EmbodiedSplat [4], Vid2Sim [5], GaussGym [6]) and manipulation (RialTo [7], SplatSim [8]), and GPU simulators ship twin environments (ManiSkill3 [9]). Building twins is therefore no longer the bottleneck. The open question is </w:t>
+      </w:r>
+      <w:r>
+        <w:rPr>
+          <w:rFonts w:cstheme="minorHAnsi"/>
+          <w:b/>
+          <w:lang w:val="en-US"/>
+        </w:rPr>
+        <w:t xml:space="preserve">when a twin-trained policy will work in reality, and why</w:t>
+      </w:r>
+      <w:r>
+        <w:rPr>
+          <w:rFonts w:cstheme="minorHAnsi"/>
+          <w:lang w:val="en-US"/>
+        </w:rPr>
+        <w:t xml:space="preserve">.</w:t>
       </w:r>
     </w:p>
     <w:p>
@@ -4822,29 +4815,29 @@
           <w:b/>
           <w:lang w:val="en-US"/>
         </w:rPr>
-        <w:t xml:space="preserve">The sim-to-real gap.</w:t>
-      </w:r>
-      <w:r>
-        <w:rPr>
-          <w:rFonts w:cstheme="minorHAnsi"/>
-          <w:lang w:val="en-US"/>
-        </w:rPr>
-        <w:t xml:space="preserve"> Policies trained in simulation degrade on real hardware because of differences in appearance, geometry and dynamics [9, 10]. Kadian et al. [11] showed that simulation can poorly predict real-world performance and introduced the Sim-vs-Real Correlation Coefficient (SRCC) to measure it. Truong et al. [12] found that lower-fidelity simulation can transfer better, so </w:t>
-      </w:r>
-      <w:r>
-        <w:rPr>
-          <w:rFonts w:cstheme="minorHAnsi"/>
-          <w:i/>
-          <w:lang w:val="en-US"/>
-        </w:rPr>
-        <w:t xml:space="preserve">which</w:t>
-      </w:r>
-      <w:r>
-        <w:rPr>
-          <w:rFonts w:cstheme="minorHAnsi"/>
-          <w:lang w:val="en-US"/>
-        </w:rPr>
-        <w:t xml:space="preserve"> aspects of reality to model is itself open.</w:t>
+        <w:t xml:space="preserve">Predicting real performance from simulation.</w:t>
+      </w:r>
+      <w:r>
+        <w:rPr>
+          <w:rFonts w:cstheme="minorHAnsi"/>
+          <w:lang w:val="en-US"/>
+        </w:rPr>
+        <w:t xml:space="preserve"> Kadian et al. [10] introduced the Sim-vs-Real Correlation Coefficient (SRCC) and showed that simulation can poorly predict real navigation results. Truong et al. [11] found that lower-fidelity simulation can transfer better, so image fidelity is not the same as transfer. SIMPLER [12] reports strong sim-real correlation for manipulation evaluation, and pretrained visual representations rank similarly in simulation and reality [13]. All of these measure transfer at the level of </w:t>
+      </w:r>
+      <w:r>
+        <w:rPr>
+          <w:rFonts w:cstheme="minorHAnsi"/>
+          <w:i/>
+          <w:lang w:val="en-US"/>
+        </w:rPr>
+        <w:t xml:space="preserve">simulators</w:t>
+      </w:r>
+      <w:r>
+        <w:rPr>
+          <w:rFonts w:cstheme="minorHAnsi"/>
+          <w:lang w:val="en-US"/>
+        </w:rPr>
+        <w:t xml:space="preserve"> and success rates, after deployment.</w:t>
       </w:r>
     </w:p>
     <w:p>
@@ -4858,14 +4851,22 @@
           <w:b/>
           <w:lang w:val="en-US"/>
         </w:rPr>
-        <w:t xml:space="preserve">Domain randomization and adaptation.</w:t>
-      </w:r>
-      <w:r>
-        <w:rPr>
-          <w:rFonts w:cstheme="minorHAnsi"/>
-          <w:lang w:val="en-US"/>
-        </w:rPr>
-        <w:t xml:space="preserve"> Domain randomization trains policies on widely varied synthetic appearance [13, 14] or dynamics [15], so that reality is just another variation, as in agile flight [16] and drone racing [17]. Its drawbacks are hand-tuned ranges and lower target-domain performance. Adaptive approaches fit simulation parameters to real rollouts [18], and domain adaptation [19] reduces, but does not remove, the need for real data.</w:t>
+        <w:t xml:space="preserve">The representation gap.</w:t>
+      </w:r>
+      <w:r>
+        <w:rPr>
+          <w:rFonts w:cstheme="minorHAnsi"/>
+          <w:lang w:val="en-US"/>
+        </w:rPr>
+        <w:t xml:space="preserve"> Sim-and-real co-training works with few real demonstrations [14], domain adaptation aligns sim and real features [15], and a mechanistic analysis finds that "structured representation alignment" is the primary effect of co-training [16]. ScanNet++ [17] pairs real captures of rooms with reference scans. Linear probes [18] and centered kernel alignment (CKA) [19] measure what each layer encodes and how similar two representations are. Frozen image and video encoders (DINOv2 [20], V-JEPA 2 [21]) are common policy backbones, and probing of vision-language-action models shows that action fine-tuning degrades their visual representations [22]. However, </w:t>
+      </w:r>
+      <w:r>
+        <w:rPr>
+          <w:rFonts w:cstheme="minorHAnsi"/>
+          <w:b/>
+          <w:lang w:val="en-US"/>
+        </w:rPr>
+        <w:t xml:space="preserve">no study has measured, on paired real and twin-rendered frames of the same pose, where inside encoders and policies the twin-vs-real gap arises, or how it shrinks with the capture budget.</w:t>
       </w:r>
     </w:p>
     <w:p>
@@ -4879,29 +4880,29 @@
           <w:b/>
           <w:lang w:val="en-US"/>
         </w:rPr>
-        <w:t xml:space="preserve">Neural scene reconstruction and real-to-sim-to-real.</w:t>
-      </w:r>
-      <w:r>
-        <w:rPr>
-          <w:rFonts w:cstheme="minorHAnsi"/>
-          <w:lang w:val="en-US"/>
-        </w:rPr>
-        <w:t xml:space="preserve"> Neural Radiance Fields [20] and 3D Gaussian Splatting (3DGS) [21] render photorealistic novel views from ordinary images, 3DGS in real time. This allows </w:t>
-      </w:r>
-      <w:r>
-        <w:rPr>
-          <w:rFonts w:cstheme="minorHAnsi"/>
-          <w:i/>
-          <w:lang w:val="en-US"/>
-        </w:rPr>
-        <w:t xml:space="preserve">digital-twin</w:t>
-      </w:r>
-      <w:r>
-        <w:rPr>
-          <w:rFonts w:cstheme="minorHAnsi"/>
-          <w:lang w:val="en-US"/>
-        </w:rPr>
-        <w:t xml:space="preserve"> simulators built from real data; NeRF2Real [22] trained bipedal skills inside a NeRF of the target scene. Since 2024 the idea has reached navigation: 3DGS twins transferred visual drone [24–26] and RGB-only legged [27] navigation policies directly to reality, Vid2Sim [28] built urban simulators from monocular video (a 68.3% real-world success-rate gain over prior simulators), and ReaDy-Go [29] added moving humans. Closest to this dissertation, EmbodiedSplat [30] fine-tunes pretrained image-goal policies in meshes from 20–30-minute phone captures, improves real-robot success in a captured scene and reports high SRCC. These systems use a fixed capture per scene: none varies the amount of real data or compares against policies trained on real robot experience at matched budgets.</w:t>
+        <w:t xml:space="preserve">Predicting performance from model internals.</w:t>
+      </w:r>
+      <w:r>
+        <w:rPr>
+          <w:rFonts w:cstheme="minorHAnsi"/>
+          <w:lang w:val="en-US"/>
+        </w:rPr>
+        <w:t xml:space="preserve"> Accuracy under distribution shift can be estimated from unlabeled target data [23]. A network's accuracy can be predicted from its weights alone [24], and populations of trained models ("model zoos" [25]) are now inputs to weight-space learning: equivariant metanetworks [26] and graph neural networks over the computational graph [27] predict generalization. They have been tested on image classifiers and implicit neural representations, </w:t>
+      </w:r>
+      <w:r>
+        <w:rPr>
+          <w:rFonts w:cstheme="minorHAnsi"/>
+          <w:b/>
+          <w:lang w:val="en-US"/>
+        </w:rPr>
+        <w:t xml:space="preserve">not on embodied policies or twin-to-real transfer</w:t>
+      </w:r>
+      <w:r>
+        <w:rPr>
+          <w:rFonts w:cstheme="minorHAnsi"/>
+          <w:lang w:val="en-US"/>
+        </w:rPr>
+        <w:t xml:space="preserve">.</w:t>
       </w:r>
     </w:p>
     <w:p>
@@ -4915,14 +4916,29 @@
           <w:b/>
           <w:lang w:val="en-US"/>
         </w:rPr>
-        <w:t xml:space="preserve">Digital twins for manipulation.</w:t>
-      </w:r>
-      <w:r>
-        <w:rPr>
-          <w:rFonts w:cstheme="minorHAnsi"/>
-          <w:lang w:val="en-US"/>
-        </w:rPr>
-        <w:t xml:space="preserve"> RialTo [23] robustifies manipulation policies by reinforcement learning in twins built from little real data; its ablation over 0–15 real demonstrations is the closest analysis of a real-data budget. SplatSim [36] renders simulation with Gaussian splats and transfers RGB manipulation policies zero-shot (86.25% real success vs. 97.5% for policies trained on real data). SIMPLER [37] shows that simulated evaluation of manipulation policies correlates strongly with real evaluation, and the GPU simulator ManiSkill3 [38] includes real-world digital-twin environments. Each work builds its twin for one task and embodiment; whether one pipeline serves navigation and manipulation, and at what capture and compute cost, has not been measured.</w:t>
+        <w:t xml:space="preserve">Failure prediction and calibrated monitoring.</w:t>
+      </w:r>
+      <w:r>
+        <w:rPr>
+          <w:rFonts w:cstheme="minorHAnsi"/>
+          <w:lang w:val="en-US"/>
+        </w:rPr>
+        <w:t xml:space="preserve"> Conformal prediction [28] gives distribution-free guarantees. FAIL-Detect [29] detects failures of imitation policies without failure data and calibrates thresholds with conformal prediction, and SAFE [30] finds that the features of vision-language-action models encode task success and failure across tasks. These monitors are calibrated and tested in the </w:t>
+      </w:r>
+      <w:r>
+        <w:rPr>
+          <w:rFonts w:cstheme="minorHAnsi"/>
+          <w:i/>
+          <w:lang w:val="en-US"/>
+        </w:rPr>
+        <w:t xml:space="preserve">same</w:t>
+      </w:r>
+      <w:r>
+        <w:rPr>
+          <w:rFonts w:cstheme="minorHAnsi"/>
+          <w:lang w:val="en-US"/>
+        </w:rPr>
+        <w:t xml:space="preserve"> domain. Whether a monitor calibrated in the twin keeps its coverage on real data has not been studied.</w:t>
       </w:r>
     </w:p>
     <w:p>
@@ -4936,44 +4952,14 @@
           <w:b/>
           <w:lang w:val="en-US"/>
         </w:rPr>
-        <w:t xml:space="preserve">Learning under distribution shift.</w:t>
-      </w:r>
-      <w:r>
-        <w:rPr>
-          <w:rFonts w:cstheme="minorHAnsi"/>
-          <w:lang w:val="en-US"/>
-        </w:rPr>
-        <w:t xml:space="preserve"> In machine-learning terms the sim-to-real gap is a domain shift. Unsupervised domain adaptation aligns feature distributions adversarially [31] or at pixel and feature level [32]. Scaling laws [33] describe how performance grows with data, but not how </w:t>
-      </w:r>
-      <w:r>
-        <w:rPr>
-          <w:rFonts w:cstheme="minorHAnsi"/>
-          <w:i/>
-          <w:lang w:val="en-US"/>
-        </w:rPr>
-        <w:t xml:space="preserve">real</w:t>
-      </w:r>
-      <w:r>
-        <w:rPr>
-          <w:rFonts w:cstheme="minorHAnsi"/>
-          <w:lang w:val="en-US"/>
-        </w:rPr>
-        <w:t xml:space="preserve"> and </w:t>
-      </w:r>
-      <w:r>
-        <w:rPr>
-          <w:rFonts w:cstheme="minorHAnsi"/>
-          <w:i/>
-          <w:lang w:val="en-US"/>
-        </w:rPr>
-        <w:t xml:space="preserve">reconstructed</w:t>
-      </w:r>
-      <w:r>
-        <w:rPr>
-          <w:rFonts w:cstheme="minorHAnsi"/>
-          <w:lang w:val="en-US"/>
-        </w:rPr>
-        <w:t xml:space="preserve"> data trade off. 3D scene datasets (HM3D [34], ScanNet++ [35]) allow a controlled study, with real captures as a proxy for reality.</w:t>
+        <w:t xml:space="preserve">Spending a small real-data budget.</w:t>
+      </w:r>
+      <w:r>
+        <w:rPr>
+          <w:rFonts w:cstheme="minorHAnsi"/>
+          <w:lang w:val="en-US"/>
+        </w:rPr>
+        <w:t xml:space="preserve"> Data attribution estimates how training examples affect predictions [31], and CUPID [32] ranks robot demonstrations by their influence on closed-loop success. Prediction-powered inference [33] combines many cheap predictions with a few labels, and SureSim [34] uses it to correct simulated evaluation with a few paired real trials. Learned world models are also proposed as policy evaluators [35]. These tools treat the policy as a black box; none uses its internal representations to decide which twin data to weight, what to capture or which real rollouts to collect.</w:t>
       </w:r>
     </w:p>
     <w:p>
@@ -4994,22 +4980,22 @@
           <w:rFonts w:cstheme="minorHAnsi"/>
           <w:lang w:val="en-US"/>
         </w:rPr>
-        <w:t xml:space="preserve"> There is no systematic study of the </w:t>
-      </w:r>
-      <w:r>
-        <w:rPr>
-          <w:rFonts w:cstheme="minorHAnsi"/>
-          <w:b/>
-          <w:lang w:val="en-US"/>
-        </w:rPr>
-        <w:t xml:space="preserve">trade-off between real-data budget and deployed policy performance</w:t>
-      </w:r>
-      <w:r>
-        <w:rPr>
-          <w:rFonts w:cstheme="minorHAnsi"/>
-          <w:lang w:val="en-US"/>
-        </w:rPr>
-        <w:t xml:space="preserve"> in real-to-sim-to-real learning, nor a twin-building protocol with measured cost and fidelity across tasks. Also missing are methods that (i) combine twins with augmentation and representation alignment to generalize to uncaptured scenes and new tasks, and (ii) correct the twin from a few real rollouts. This dissertation addresses that gap in navigation, with manipulation as the generalization domain.</w:t>
+        <w:t xml:space="preserve"> Twins are widely available, but there is </w:t>
+      </w:r>
+      <w:r>
+        <w:rPr>
+          <w:rFonts w:cstheme="minorHAnsi"/>
+          <w:b/>
+          <w:lang w:val="en-US"/>
+        </w:rPr>
+        <w:t xml:space="preserve">no representation-level account of how twin-trained policies transfer to reality</w:t>
+      </w:r>
+      <w:r>
+        <w:rPr>
+          <w:rFonts w:cstheme="minorHAnsi"/>
+          <w:lang w:val="en-US"/>
+        </w:rPr>
+        <w:t xml:space="preserve">. Missing are (i) a paired real/twin benchmark that localizes the gap inside encoders and policies across capture budgets, (ii) predictors of real transfer and failure from policy internals (weights, hidden states) that beat simulator-level and image-fidelity baselines, (iii) methods that use such forecasts to spend a limited real-data budget, and (iv) evidence that these measures carry over from navigation to manipulation. This dissertation addresses that gap.</w:t>
       </w:r>
     </w:p>
     <w:p>
@@ -5052,7 +5038,7 @@
           <w:rFonts w:cstheme="minorHAnsi"/>
           <w:lang w:val="en-US"/>
         </w:rPr>
-        <w:t xml:space="preserve">[2] A. Szot et al., "Habitat 2.0," NeurIPS, 2021.</w:t>
+        <w:t xml:space="preserve">[2] J. Tobin et al., "Domain Randomization for Transferring Deep Neural Networks…," IROS, 2017.</w:t>
       </w:r>
     </w:p>
     <w:p>
@@ -5066,7 +5052,7 @@
           <w:rFonts w:cstheme="minorHAnsi"/>
           <w:lang w:val="en-US"/>
         </w:rPr>
-        <w:t xml:space="preserve">[3] A. Dosovitskiy et al., "CARLA," CoRL, 2017.</w:t>
+        <w:t xml:space="preserve">[3] B. Kerbl et al., "3D Gaussian Splatting," ACM TOG, 2023.</w:t>
       </w:r>
     </w:p>
     <w:p>
@@ -5080,7 +5066,7 @@
           <w:rFonts w:cstheme="minorHAnsi"/>
           <w:lang w:val="en-US"/>
         </w:rPr>
-        <w:t xml:space="preserve">[4] E. Wijmans et al., "DD-PPO," ICLR, 2020.</w:t>
+        <w:t xml:space="preserve">[4] G. Chhablani et al., "EmbodiedSplat," ICCV, 2025.</w:t>
       </w:r>
     </w:p>
     <w:p>
@@ -5094,7 +5080,7 @@
           <w:rFonts w:cstheme="minorHAnsi"/>
           <w:lang w:val="en-US"/>
         </w:rPr>
-        <w:t xml:space="preserve">[5] D. Shah et al., "GNM," ICRA, 2023.</w:t>
+        <w:t xml:space="preserve">[5] Z. Xie et al., "Vid2Sim," CVPR, 2025.</w:t>
       </w:r>
     </w:p>
     <w:p>
@@ -5108,7 +5094,7 @@
           <w:rFonts w:cstheme="minorHAnsi"/>
           <w:lang w:val="en-US"/>
         </w:rPr>
-        <w:t xml:space="preserve">[6] D. Shah et al., "ViNT," CoRL, 2023.</w:t>
+        <w:t xml:space="preserve">[6] A. Escontrela et al., "GaussGym," arXiv:2510.15352, 2025.</w:t>
       </w:r>
     </w:p>
     <w:p>
@@ -5122,7 +5108,7 @@
           <w:rFonts w:cstheme="minorHAnsi"/>
           <w:lang w:val="en-US"/>
         </w:rPr>
-        <w:t xml:space="preserve">[7] A. Sridhar et al., "NoMaD," ICRA, 2024.</w:t>
+        <w:t xml:space="preserve">[7] M. Torne et al., "Reconciling Reality through Simulation," RSS, 2024.</w:t>
       </w:r>
     </w:p>
     <w:p>
@@ -5136,7 +5122,7 @@
           <w:rFonts w:cstheme="minorHAnsi"/>
           <w:lang w:val="en-US"/>
         </w:rPr>
-        <w:t xml:space="preserve">[8] Open X-Embodiment Collaboration, "Open X-Embodiment," ICRA, 2024.</w:t>
+        <w:t xml:space="preserve">[8] M. N. Qureshi et al., "SplatSim," ICRA, 2025.</w:t>
       </w:r>
     </w:p>
     <w:p>
@@ -5150,7 +5136,7 @@
           <w:rFonts w:cstheme="minorHAnsi"/>
           <w:lang w:val="en-US"/>
         </w:rPr>
-        <w:t xml:space="preserve">[9] W. Zhao et al., "Sim-to-Real Transfer in Deep Reinforcement Learning for Robotics," IEEE SSCI, 2020.</w:t>
+        <w:t xml:space="preserve">[9] S. Tao et al., "ManiSkill3," RSS, 2025.</w:t>
       </w:r>
     </w:p>
     <w:p>
@@ -5164,7 +5150,7 @@
           <w:rFonts w:cstheme="minorHAnsi"/>
           <w:lang w:val="en-US"/>
         </w:rPr>
-        <w:t xml:space="preserve">[10] S. Höfer et al., "Sim2Real in Robotics and Automation," IEEE T-ASE, 2021.</w:t>
+        <w:t xml:space="preserve">[10] A. Kadian et al., "Sim2Real Predictivity," IEEE RA-L, 2020.</w:t>
       </w:r>
     </w:p>
     <w:p>
@@ -5178,7 +5164,7 @@
           <w:rFonts w:cstheme="minorHAnsi"/>
           <w:lang w:val="en-US"/>
         </w:rPr>
-        <w:t xml:space="preserve">[11] A. Kadian et al., "Sim2Real Predictivity," IEEE RA-L, 2020.</w:t>
+        <w:t xml:space="preserve">[11] J. Truong et al., "Rethinking Sim2Real," CoRL, 2022.</w:t>
       </w:r>
     </w:p>
     <w:p>
@@ -5192,7 +5178,7 @@
           <w:rFonts w:cstheme="minorHAnsi"/>
           <w:lang w:val="en-US"/>
         </w:rPr>
-        <w:t xml:space="preserve">[12] J. Truong et al., "Rethinking Sim2Real," CoRL, 2022.</w:t>
+        <w:t xml:space="preserve">[12] X. Li et al., "Evaluating Real-World Robot Manipulation Policies…," CoRL, 2024.</w:t>
       </w:r>
     </w:p>
     <w:p>
@@ -5206,7 +5192,7 @@
           <w:rFonts w:cstheme="minorHAnsi"/>
           <w:lang w:val="en-US"/>
         </w:rPr>
-        <w:t xml:space="preserve">[13] J. Tobin et al., "Domain Randomization for Transferring Deep Neural Networks from Simulation to the Real World," IROS, 2017.</w:t>
+        <w:t xml:space="preserve">[13] S. Silwal et al., "What Do We Learn from a Large-Scale Study of Pre-Trained Visual…," ICRA, 2024.</w:t>
       </w:r>
     </w:p>
     <w:p>
@@ -5220,7 +5206,7 @@
           <w:rFonts w:cstheme="minorHAnsi"/>
           <w:lang w:val="en-US"/>
         </w:rPr>
-        <w:t xml:space="preserve">[14] J. Tremblay et al., "Training Deep Networks with Synthetic Data," CVPRW, 2018.</w:t>
+        <w:t xml:space="preserve">[14] A. Maddukuri et al., "Sim-and-Real Co-Training," RSS, 2025.</w:t>
       </w:r>
     </w:p>
     <w:p>
@@ -5234,7 +5220,7 @@
           <w:rFonts w:cstheme="minorHAnsi"/>
           <w:lang w:val="en-US"/>
         </w:rPr>
-        <w:t xml:space="preserve">[15] X. B. Peng et al., "Sim-to-Real Transfer of Robotic Control with Dynamics Randomization," ICRA, 2018.</w:t>
+        <w:t xml:space="preserve">[15] S. Cheng et al., "Generalizable Domain Adaptation for Sim-and-Real…," NeurIPS, 2025.</w:t>
       </w:r>
     </w:p>
     <w:p>
@@ -5248,7 +5234,7 @@
           <w:rFonts w:cstheme="minorHAnsi"/>
           <w:lang w:val="en-US"/>
         </w:rPr>
-        <w:t xml:space="preserve">[16] A. Loquercio et al., "Learning High-Speed Flight in the Wild," Sci. Robot., 2021.</w:t>
+        <w:t xml:space="preserve">[16] Y. Lei et al., "A Mechanistic Analysis of Sim-and-Real Co-Training…," arXiv:2604.13645, 2026.</w:t>
       </w:r>
     </w:p>
     <w:p>
@@ -5262,7 +5248,7 @@
           <w:rFonts w:cstheme="minorHAnsi"/>
           <w:lang w:val="en-US"/>
         </w:rPr>
-        <w:t xml:space="preserve">[17] E. Kaufmann et al., "Champion-level drone racing using deep reinforcement learning," Nature, 2023.</w:t>
+        <w:t xml:space="preserve">[17] C. Yeshwanth et al., "ScanNet++," ICCV, 2023.</w:t>
       </w:r>
     </w:p>
     <w:p>
@@ -5276,7 +5262,7 @@
           <w:rFonts w:cstheme="minorHAnsi"/>
           <w:lang w:val="en-US"/>
         </w:rPr>
-        <w:t xml:space="preserve">[18] Y. Chebotar et al., "Closing the Sim-to-Real Loop," ICRA, 2019.</w:t>
+        <w:t xml:space="preserve">[18] G. Alain, Y. Bengio, "Understanding Intermediate Layers Using Linear…," arXiv:1610.01644, 2016.</w:t>
       </w:r>
     </w:p>
     <w:p>
@@ -5290,7 +5276,7 @@
           <w:rFonts w:cstheme="minorHAnsi"/>
           <w:lang w:val="en-US"/>
         </w:rPr>
-        <w:t xml:space="preserve">[19] K. Bousmalis et al., "Using Simulation and Domain Adaptation to Improve Efficiency of Deep Robotic Grasping," ICRA, 2018.</w:t>
+        <w:t xml:space="preserve">[19] S. Kornblith et al., "Similarity of Neural Network Representations…," ICML, 2019.</w:t>
       </w:r>
     </w:p>
     <w:p>
@@ -5304,7 +5290,7 @@
           <w:rFonts w:cstheme="minorHAnsi"/>
           <w:lang w:val="en-US"/>
         </w:rPr>
-        <w:t xml:space="preserve">[20] B. Mildenhall et al., "NeRF," ECCV, 2020.</w:t>
+        <w:t xml:space="preserve">[20] M. Oquab et al., "DINOv2," TMLR, 2024.</w:t>
       </w:r>
     </w:p>
     <w:p>
@@ -5318,7 +5304,7 @@
           <w:rFonts w:cstheme="minorHAnsi"/>
           <w:lang w:val="en-US"/>
         </w:rPr>
-        <w:t xml:space="preserve">[21] B. Kerbl et al., "3D Gaussian Splatting for Real-Time Radiance Field Rendering," ACM TOG, 2023.</w:t>
+        <w:t xml:space="preserve">[21] M. Assran et al., "V-JEPA 2," arXiv:2506.09985, 2025.</w:t>
       </w:r>
     </w:p>
     <w:p>
@@ -5332,7 +5318,7 @@
           <w:rFonts w:cstheme="minorHAnsi"/>
           <w:lang w:val="en-US"/>
         </w:rPr>
-        <w:t xml:space="preserve">[22] A. Byravan et al., "NeRF2Real," ICRA, 2023.</w:t>
+        <w:t xml:space="preserve">[22] N. Kachaev et al., "Don't Blind Your VLA," arXiv:2510.25616, 2025.</w:t>
       </w:r>
     </w:p>
     <w:p>
@@ -5346,7 +5332,7 @@
           <w:rFonts w:cstheme="minorHAnsi"/>
           <w:lang w:val="en-US"/>
         </w:rPr>
-        <w:t xml:space="preserve">[23] M. Torne et al., "Reconciling Reality through Simulation," RSS, 2024.</w:t>
+        <w:t xml:space="preserve">[23] S. Garg et al., "Leveraging Unlabeled Data to Predict OOD Performance," ICLR, 2022.</w:t>
       </w:r>
     </w:p>
     <w:p>
@@ -5360,7 +5346,7 @@
           <w:rFonts w:cstheme="minorHAnsi"/>
           <w:lang w:val="en-US"/>
         </w:rPr>
-        <w:t xml:space="preserve">[24] A. Quach et al., "Gaussian Splatting to Real World Flight Navigation Transfer with Liquid Networks," arXiv:2406.15149, 2024.</w:t>
+        <w:t xml:space="preserve">[24] T. Unterthiner et al., "Predicting Neural Network Accuracy…," arXiv:2002.11448, 2020.</w:t>
       </w:r>
     </w:p>
     <w:p>
@@ -5374,7 +5360,7 @@
           <w:rFonts w:cstheme="minorHAnsi"/>
           <w:lang w:val="en-US"/>
         </w:rPr>
-        <w:t xml:space="preserve">[25] J. Low et al., "SOUS VIDE," IEEE RA-L, 2025.</w:t>
+        <w:t xml:space="preserve">[25] K. Schürholt et al., "Model Zoos," NeurIPS Datasets and Benchmarks, 2022.</w:t>
       </w:r>
     </w:p>
     <w:p>
@@ -5388,7 +5374,7 @@
           <w:rFonts w:cstheme="minorHAnsi"/>
           <w:lang w:val="en-US"/>
         </w:rPr>
-        <w:t xml:space="preserve">[26] Q. Chen et al., "GRaD-Nav," IROS, 2025.</w:t>
+        <w:t xml:space="preserve">[26] A. Navon et al., "Equivariant Architectures for Deep Weight Spaces," ICML, 2023.</w:t>
       </w:r>
     </w:p>
     <w:p>
@@ -5402,7 +5388,7 @@
           <w:rFonts w:cstheme="minorHAnsi"/>
           <w:lang w:val="en-US"/>
         </w:rPr>
-        <w:t xml:space="preserve">[27] S. Zhu et al., "VR-Robo," IEEE RA-L, 2025.</w:t>
+        <w:t xml:space="preserve">[27] M. Kofinas et al., "Graph Neural Networks for Learning Equivariant…," ICLR, 2024.</w:t>
       </w:r>
     </w:p>
     <w:p>
@@ -5416,7 +5402,7 @@
           <w:rFonts w:cstheme="minorHAnsi"/>
           <w:lang w:val="en-US"/>
         </w:rPr>
-        <w:t xml:space="preserve">[28] Z. Xie et al., "Vid2Sim," CVPR, 2025.</w:t>
+        <w:t xml:space="preserve">[28] A. N. Angelopoulos, S. Bates, "A Gentle Introduction to Conformal…," arXiv:2107.07511, 2021.</w:t>
       </w:r>
     </w:p>
     <w:p>
@@ -5430,7 +5416,7 @@
           <w:rFonts w:cstheme="minorHAnsi"/>
           <w:lang w:val="en-US"/>
         </w:rPr>
-        <w:t xml:space="preserve">[29] S. Yoo et al., "ReaDy-Go," IEEE RA-L, 2026.</w:t>
+        <w:t xml:space="preserve">[29] C. Xu et al., "Can We Detect Failures Without Failure Data?," RSS, 2025.</w:t>
       </w:r>
     </w:p>
     <w:p>
@@ -5444,7 +5430,7 @@
           <w:rFonts w:cstheme="minorHAnsi"/>
           <w:lang w:val="en-US"/>
         </w:rPr>
-        <w:t xml:space="preserve">[30] G. Chhablani et al., "EmbodiedSplat," ICCV, 2025.</w:t>
+        <w:t xml:space="preserve">[30] Q. Gu et al., "SAFE," NeurIPS, 2025.</w:t>
       </w:r>
     </w:p>
     <w:p>
@@ -5458,7 +5444,7 @@
           <w:rFonts w:cstheme="minorHAnsi"/>
           <w:lang w:val="en-US"/>
         </w:rPr>
-        <w:t xml:space="preserve">[31] Y. Ganin et al., "Domain-Adversarial Training of Neural Networks," JMLR, 2016.</w:t>
+        <w:t xml:space="preserve">[31] S. M. Park et al., "TRAK," ICML, 2023.</w:t>
       </w:r>
     </w:p>
     <w:p>
@@ -5472,7 +5458,7 @@
           <w:rFonts w:cstheme="minorHAnsi"/>
           <w:lang w:val="en-US"/>
         </w:rPr>
-        <w:t xml:space="preserve">[32] J. Hoffman et al., "CyCADA," ICML, 2018.</w:t>
+        <w:t xml:space="preserve">[32] C. Agia et al., "CUPID," arXiv:2506.19121, 2025.</w:t>
       </w:r>
     </w:p>
     <w:p>
@@ -5486,7 +5472,7 @@
           <w:rFonts w:cstheme="minorHAnsi"/>
           <w:lang w:val="en-US"/>
         </w:rPr>
-        <w:t xml:space="preserve">[33] J. Kaplan et al., "Scaling Laws for Neural Language Models," arXiv:2001.08361, 2020.</w:t>
+        <w:t xml:space="preserve">[33] A. N. Angelopoulos et al., "Prediction-Powered Inference," Science, 2023.</w:t>
       </w:r>
     </w:p>
     <w:p>
@@ -5500,7 +5486,7 @@
           <w:rFonts w:cstheme="minorHAnsi"/>
           <w:lang w:val="en-US"/>
         </w:rPr>
-        <w:t xml:space="preserve">[34] S. K. Ramakrishnan et al., "Habitat-Matterport 3D Dataset," NeurIPS Datasets and Benchmarks, 2021.</w:t>
+        <w:t xml:space="preserve">[34] A. Badithela et al., "Reliable and Scalable Robot Policy Evaluation…," arXiv:2510.04354, 2025.</w:t>
       </w:r>
     </w:p>
     <w:p>
@@ -5514,49 +5500,7 @@
           <w:rFonts w:cstheme="minorHAnsi"/>
           <w:lang w:val="en-US"/>
         </w:rPr>
-        <w:t xml:space="preserve">[35] C. Yeshwanth et al., "ScanNet++," ICCV, 2023.</w:t>
-      </w:r>
-    </w:p>
-    <w:p>
-      <w:pPr>
-        <w:spacing w:after="0" w:line="240" w:lineRule="auto"/>
-        <w:ind w:left="397" w:hanging="397"/>
-        <w:jc w:val="left"/>
-      </w:pPr>
-      <w:r>
-        <w:rPr>
-          <w:rFonts w:cstheme="minorHAnsi"/>
-          <w:lang w:val="en-US"/>
-        </w:rPr>
-        <w:t xml:space="preserve">[36] M. N. Qureshi et al., "SplatSim," ICRA, 2025.</w:t>
-      </w:r>
-    </w:p>
-    <w:p>
-      <w:pPr>
-        <w:spacing w:after="0" w:line="240" w:lineRule="auto"/>
-        <w:ind w:left="397" w:hanging="397"/>
-        <w:jc w:val="left"/>
-      </w:pPr>
-      <w:r>
-        <w:rPr>
-          <w:rFonts w:cstheme="minorHAnsi"/>
-          <w:lang w:val="en-US"/>
-        </w:rPr>
-        <w:t xml:space="preserve">[37] X. Li et al., "Evaluating Real-World Robot Manipulation Policies in Simulation," CoRL, 2024.</w:t>
-      </w:r>
-    </w:p>
-    <w:p>
-      <w:pPr>
-        <w:spacing w:after="0" w:line="240" w:lineRule="auto"/>
-        <w:ind w:left="397" w:hanging="397"/>
-        <w:jc w:val="left"/>
-      </w:pPr>
-      <w:r>
-        <w:rPr>
-          <w:rFonts w:cstheme="minorHAnsi"/>
-          <w:lang w:val="en-US"/>
-        </w:rPr>
-        <w:t xml:space="preserve">[38] S. Tao et al., "ManiSkill3," RSS, 2025.</w:t>
+        <w:t xml:space="preserve">[35] Y. Li et al., "WorldEval," arXiv:2505.19017, 2025.</w:t>
       </w:r>
     </w:p>
     <w:permEnd w:id="174659581"/>
@@ -5798,7 +5742,22 @@
           <w:rFonts w:cstheme="minorHAnsi"/>
           <w:lang w:val="en-US"/>
         </w:rPr>
-        <w:t xml:space="preserve"> Embodied policies learned in a digital twin reconstructed from a small budget of real observations, with aligned representations, perform in the target domain not worse than policies learned from ≥ 10× more real data, and the method transfers across scenes and tasks. Visual navigation is the primary testbed; robotic manipulation tests generalization.</w:t>
+        <w:t xml:space="preserve"> How well embodied policies trained in neural-reconstruction digital twins transfer to the real world can be </w:t>
+      </w:r>
+      <w:r>
+        <w:rPr>
+          <w:rFonts w:cstheme="minorHAnsi"/>
+          <w:b/>
+          <w:lang w:val="en-US"/>
+        </w:rPr>
+        <w:t xml:space="preserve">measured, localized and predicted from their internal representations</w:t>
+      </w:r>
+      <w:r>
+        <w:rPr>
+          <w:rFonts w:cstheme="minorHAnsi"/>
+          <w:lang w:val="en-US"/>
+        </w:rPr>
+        <w:t xml:space="preserve">, and this lets a limited real-data budget be spent where it matters. Navigation is the primary testbed; manipulation is the cross-task test. RQ1–RQ2 (H1–H2) are the core of the dissertation; RQ3–RQ4 (H3–H4) build on them.</w:t>
       </w:r>
     </w:p>
     <w:p>
@@ -5812,29 +5771,104 @@
           <w:b/>
           <w:lang w:val="en-US"/>
         </w:rPr>
-        <w:t xml:space="preserve">Core and extensions.</w:t>
-      </w:r>
-      <w:r>
-        <w:rPr>
-          <w:rFonts w:cstheme="minorHAnsi"/>
-          <w:lang w:val="en-US"/>
-        </w:rPr>
-        <w:t xml:space="preserve"> The dissertation stands on </w:t>
-      </w:r>
-      <w:r>
-        <w:rPr>
-          <w:rFonts w:cstheme="minorHAnsi"/>
-          <w:b/>
-          <w:lang w:val="en-US"/>
-        </w:rPr>
-        <w:t xml:space="preserve">RQ1–RQ2 with H1 and H4</w:t>
-      </w:r>
-      <w:r>
-        <w:rPr>
-          <w:rFonts w:cstheme="minorHAnsi"/>
-          <w:lang w:val="en-US"/>
-        </w:rPr>
-        <w:t xml:space="preserve"> (real-data budget, navigation). RQ3/H2 (cross-scene and cross-task generalization) and RQ4/H3 (correction, predictivity) are extensions.</w:t>
+        <w:t xml:space="preserve">Setting.</w:t>
+      </w:r>
+      <w:r>
+        <w:rPr>
+          <w:rFonts w:cstheme="minorHAnsi"/>
+          <w:lang w:val="en-US"/>
+        </w:rPr>
+        <w:t xml:space="preserve"> A </w:t>
+      </w:r>
+      <w:r>
+        <w:rPr>
+          <w:rFonts w:cstheme="minorHAnsi"/>
+          <w:i/>
+          <w:lang w:val="en-US"/>
+        </w:rPr>
+        <w:t xml:space="preserve">twin</w:t>
+      </w:r>
+      <w:r>
+        <w:rPr>
+          <w:rFonts w:cstheme="minorHAnsi"/>
+          <w:lang w:val="en-US"/>
+        </w:rPr>
+        <w:t xml:space="preserve"> is a 3D Gaussian Splatting reconstruction of a real scene built from a short capture; the </w:t>
+      </w:r>
+      <w:r>
+        <w:rPr>
+          <w:rFonts w:cstheme="minorHAnsi"/>
+          <w:i/>
+          <w:lang w:val="en-US"/>
+        </w:rPr>
+        <w:t xml:space="preserve">capture budget</w:t>
+      </w:r>
+      <w:r>
+        <w:rPr>
+          <w:rFonts w:cstheme="minorHAnsi"/>
+          <w:lang w:val="en-US"/>
+        </w:rPr>
+        <w:t xml:space="preserve"> is the number of capture minutes (views). Evaluation tiers: </w:t>
+      </w:r>
+      <w:r>
+        <w:rPr>
+          <w:rFonts w:cstheme="minorHAnsi"/>
+          <w:b/>
+          <w:lang w:val="en-US"/>
+        </w:rPr>
+        <w:t xml:space="preserve">(A)</w:t>
+      </w:r>
+      <w:r>
+        <w:rPr>
+          <w:rFonts w:cstheme="minorHAnsi"/>
+          <w:lang w:val="en-US"/>
+        </w:rPr>
+        <w:t xml:space="preserve"> proxy reality on public scene datasets with real captures and reference scans (≥ 10 scenes, some held out), which decides the hypotheses; </w:t>
+      </w:r>
+      <w:r>
+        <w:rPr>
+          <w:rFonts w:cstheme="minorHAnsi"/>
+          <w:b/>
+          <w:lang w:val="en-US"/>
+        </w:rPr>
+        <w:t xml:space="preserve">(B)</w:t>
+      </w:r>
+      <w:r>
+        <w:rPr>
+          <w:rFonts w:cstheme="minorHAnsi"/>
+          <w:lang w:val="en-US"/>
+        </w:rPr>
+        <w:t xml:space="preserve"> public real-world datasets and published real evaluations with real outcomes; </w:t>
+      </w:r>
+      <w:r>
+        <w:rPr>
+          <w:rFonts w:cstheme="minorHAnsi"/>
+          <w:b/>
+          <w:lang w:val="en-US"/>
+        </w:rPr>
+        <w:t xml:space="preserve">(C)</w:t>
+      </w:r>
+      <w:r>
+        <w:rPr>
+          <w:rFonts w:cstheme="minorHAnsi"/>
+          <w:lang w:val="en-US"/>
+        </w:rPr>
+        <w:t xml:space="preserve"> real-robot trials, validation only. A </w:t>
+      </w:r>
+      <w:r>
+        <w:rPr>
+          <w:rFonts w:cstheme="minorHAnsi"/>
+          <w:i/>
+          <w:lang w:val="en-US"/>
+        </w:rPr>
+        <w:t xml:space="preserve">policy zoo</w:t>
+      </w:r>
+      <w:r>
+        <w:rPr>
+          <w:rFonts w:cstheme="minorHAnsi"/>
+          <w:lang w:val="en-US"/>
+        </w:rPr>
+        <w:t xml:space="preserve"> (≥ 200 navigation policies varying scene, capture budget, architecture and training data) supplies the population for RQ2–RQ4. Tests are one-sided, α = 0.05, bootstrapped over scenes, Holm-corrected within each hypothesis and pre-registered in the repository. All thresholds are design choices to be confirmed with the supervisor.</w:t>
       </w:r>
     </w:p>
     <w:p>
@@ -5848,44 +5882,14 @@
           <w:b/>
           <w:lang w:val="en-US"/>
         </w:rPr>
-        <w:t xml:space="preserve">RQ1.</w:t>
-      </w:r>
-      <w:r>
-        <w:rPr>
-          <w:rFonts w:cstheme="minorHAnsi"/>
-          <w:lang w:val="en-US"/>
-        </w:rPr>
-        <w:t xml:space="preserve"> Does training an embodied policy in a twin built from minutes of real video of the target scene (</w:t>
-      </w:r>
-      <w:r>
-        <w:rPr>
-          <w:rFonts w:cstheme="minorHAnsi"/>
-          <w:i/>
-          <w:lang w:val="en-US"/>
-        </w:rPr>
-        <w:t xml:space="preserve">real-to-sim</w:t>
-      </w:r>
-      <w:r>
-        <w:rPr>
-          <w:rFonts w:cstheme="minorHAnsi"/>
-          <w:lang w:val="en-US"/>
-        </w:rPr>
-        <w:t xml:space="preserve">), then deploying it on real observations (</w:t>
-      </w:r>
-      <w:r>
-        <w:rPr>
-          <w:rFonts w:cstheme="minorHAnsi"/>
-          <w:i/>
-          <w:lang w:val="en-US"/>
-        </w:rPr>
-        <w:t xml:space="preserve">sim-to-real</w:t>
-      </w:r>
-      <w:r>
-        <w:rPr>
-          <w:rFonts w:cstheme="minorHAnsi"/>
-          <w:lang w:val="en-US"/>
-        </w:rPr>
-        <w:t xml:space="preserve">), close the appearance and geometry gap?</w:t>
+        <w:t xml:space="preserve">RQ1 (measure and localize).</w:t>
+      </w:r>
+      <w:r>
+        <w:rPr>
+          <w:rFonts w:cstheme="minorHAnsi"/>
+          <w:lang w:val="en-US"/>
+        </w:rPr>
+        <w:t xml:space="preserve"> Where inside frozen encoders and twin-trained policies does the twin-vs-real gap arise, and how does it depend on the capture budget?</w:t>
       </w:r>
     </w:p>
     <w:p>
@@ -5899,14 +5903,29 @@
           <w:b/>
           <w:lang w:val="en-US"/>
         </w:rPr>
-        <w:t xml:space="preserve">RQ2.</w:t>
-      </w:r>
-      <w:r>
-        <w:rPr>
-          <w:rFonts w:cstheme="minorHAnsi"/>
-          <w:lang w:val="en-US"/>
-        </w:rPr>
-        <w:t xml:space="preserve"> How does target-domain performance scale with the real-data budget, and what budget suffices compared with learning from real data alone?</w:t>
+        <w:t xml:space="preserve">H1.</w:t>
+      </w:r>
+      <w:r>
+        <w:rPr>
+          <w:rFonts w:cstheme="minorHAnsi"/>
+          <w:lang w:val="en-US"/>
+        </w:rPr>
+        <w:t xml:space="preserve"> On paired real and twin-rendered frames of the same pose, the representation gap (1 − linear CKA, and the drop of linear-probe accuracy) (a) is </w:t>
+      </w:r>
+      <w:r>
+        <w:rPr>
+          <w:rFonts w:cstheme="minorHAnsi"/>
+          <w:i/>
+          <w:lang w:val="en-US"/>
+        </w:rPr>
+        <w:t xml:space="preserve">concentrated</w:t>
+      </w:r>
+      <w:r>
+        <w:rPr>
+          <w:rFonts w:cstheme="minorHAnsi"/>
+          <w:lang w:val="en-US"/>
+        </w:rPr>
+        <w:t xml:space="preserve">: the third of layers with the largest gap holds ≥ 50% of the summed gap in ≥ 80% of scenes; (b) decreases monotonically with the capture budget (trend test over ≥ 4 budgets); (c) differs between ≥ 10 frozen encoders (Friedman test); and (d) the encoders' robustness ranking predicts their downstream twin→real success rate (SR) with Spearman ρ ≥ 0.6.</w:t>
       </w:r>
     </w:p>
     <w:p>
@@ -5920,29 +5939,14 @@
           <w:b/>
           <w:lang w:val="en-US"/>
         </w:rPr>
-        <w:t xml:space="preserve">RQ3.</w:t>
-      </w:r>
-      <w:r>
-        <w:rPr>
-          <w:rFonts w:cstheme="minorHAnsi"/>
-          <w:lang w:val="en-US"/>
-        </w:rPr>
-        <w:t xml:space="preserve"> Which augmentation and representation-alignment objectives let policies generalize to scenes that were </w:t>
-      </w:r>
-      <w:r>
-        <w:rPr>
-          <w:rFonts w:cstheme="minorHAnsi"/>
-          <w:i/>
-          <w:lang w:val="en-US"/>
-        </w:rPr>
-        <w:t xml:space="preserve">not</w:t>
-      </w:r>
-      <w:r>
-        <w:rPr>
-          <w:rFonts w:cstheme="minorHAnsi"/>
-          <w:lang w:val="en-US"/>
-        </w:rPr>
-        <w:t xml:space="preserve"> captured and to another task and embodiment (navigation → manipulation)?</w:t>
+        <w:t xml:space="preserve">RQ2 (predict).</w:t>
+      </w:r>
+      <w:r>
+        <w:rPr>
+          <w:rFonts w:cstheme="minorHAnsi"/>
+          <w:lang w:val="en-US"/>
+        </w:rPr>
+        <w:t xml:space="preserve"> Can a twin-trained policy's real-world transfer and failures be forecast from its internals (hidden states, weights) without real rollouts?</w:t>
       </w:r>
     </w:p>
     <w:p>
@@ -5956,14 +5960,14 @@
           <w:b/>
           <w:lang w:val="en-US"/>
         </w:rPr>
-        <w:t xml:space="preserve">RQ4.</w:t>
-      </w:r>
-      <w:r>
-        <w:rPr>
-          <w:rFonts w:cstheme="minorHAnsi"/>
-          <w:lang w:val="en-US"/>
-        </w:rPr>
-        <w:t xml:space="preserve"> Can a few real rollouts correct the twin so that it predicts real performance?</w:t>
+        <w:t xml:space="preserve">H2.</w:t>
+      </w:r>
+      <w:r>
+        <w:rPr>
+          <w:rFonts w:cstheme="minorHAnsi"/>
+          <w:lang w:val="en-US"/>
+        </w:rPr>
+        <w:t xml:space="preserve"> (a) A predictor trained on the zoo (GNN over layers or weight-space metanetwork) predicts the twin→real SR gap on held-out scenes with ≥ 20% lower mean absolute error than the best of three baselines (twin SR alone, image fidelity PSNR/LPIPS, simulator-level predictivity); the lower 95% bound of the relative reduction must be &gt; 0. (b) Hidden-state failure monitors calibrated conformally in the twin at 90% coverage keep coverage ≥ 85% on real data (ε = 5 pp).</w:t>
       </w:r>
     </w:p>
     <w:p>
@@ -5977,89 +5981,14 @@
           <w:b/>
           <w:lang w:val="en-US"/>
         </w:rPr>
-        <w:t xml:space="preserve">Evaluation.</w:t>
-      </w:r>
-      <w:r>
-        <w:rPr>
-          <w:rFonts w:cstheme="minorHAnsi"/>
-          <w:lang w:val="en-US"/>
-        </w:rPr>
-        <w:t xml:space="preserve"> </w:t>
-      </w:r>
-      <w:r>
-        <w:rPr>
-          <w:rFonts w:cstheme="minorHAnsi"/>
-          <w:i/>
-          <w:lang w:val="en-US"/>
-        </w:rPr>
-        <w:t xml:space="preserve">Navigation:</w:t>
-      </w:r>
-      <w:r>
-        <w:rPr>
-          <w:rFonts w:cstheme="minorHAnsi"/>
-          <w:lang w:val="en-US"/>
-        </w:rPr>
-        <w:t xml:space="preserve"> (A, primary) ≥ 10 public indoor scenes with real video and a reference 3D scan that serves as the target domain ("proxy reality"), some held out as uncaptured; (B) real-world datasets for representation metrics; (C) real-robot validation in ≥ 2 PWr environments, 20 start–goal pairs × 3 trials per policy. Metrics: success rate (SR; primary), SPL, collisions. </w:t>
-      </w:r>
-      <w:r>
-        <w:rPr>
-          <w:rFonts w:cstheme="minorHAnsi"/>
-          <w:i/>
-          <w:lang w:val="en-US"/>
-        </w:rPr>
-        <w:t xml:space="preserve">Manipulation:</w:t>
-      </w:r>
-      <w:r>
-        <w:rPr>
-          <w:rFonts w:cstheme="minorHAnsi"/>
-          <w:lang w:val="en-US"/>
-        </w:rPr>
-        <w:t xml:space="preserve"> tabletop pick-and-place in twins of public scenes and objects in a public simulator; metric: task SR. </w:t>
-      </w:r>
-      <w:r>
-        <w:rPr>
-          <w:rFonts w:cstheme="minorHAnsi"/>
-          <w:i/>
-          <w:lang w:val="en-US"/>
-        </w:rPr>
-        <w:t xml:space="preserve">Budget</w:t>
-      </w:r>
-      <w:r>
-        <w:rPr>
-          <w:rFonts w:cstheme="minorHAnsi"/>
-          <w:lang w:val="en-US"/>
-        </w:rPr>
-        <w:t xml:space="preserve"> B = minutes of target-domain data (capture plus real experience). Baselines: a pretrained policy fine-tuned by behaviour cloning on target-domain data of budget B (</w:t>
-      </w:r>
-      <w:r>
-        <w:rPr>
-          <w:rFonts w:cstheme="minorHAnsi"/>
-          <w:i/>
-          <w:lang w:val="en-US"/>
-        </w:rPr>
-        <w:t xml:space="preserve">real-data-only</w:t>
-      </w:r>
-      <w:r>
-        <w:rPr>
-          <w:rFonts w:cstheme="minorHAnsi"/>
-          <w:lang w:val="en-US"/>
-        </w:rPr>
-        <w:t xml:space="preserve">), and the same policy trained with domain randomization on generic scenes (</w:t>
-      </w:r>
-      <w:r>
-        <w:rPr>
-          <w:rFonts w:cstheme="minorHAnsi"/>
-          <w:i/>
-          <w:lang w:val="en-US"/>
-        </w:rPr>
-        <w:t xml:space="preserve">generic</w:t>
-      </w:r>
-      <w:r>
-        <w:rPr>
-          <w:rFonts w:cstheme="minorHAnsi"/>
-          <w:lang w:val="en-US"/>
-        </w:rPr>
-        <w:t xml:space="preserve">). Tests: one-sided (α = 0.05), bootstrapped over scenes or start–goal pairs, Holm-corrected per hypothesis, pre-registered in the repository.</w:t>
+        <w:t xml:space="preserve">RQ3 (use).</w:t>
+      </w:r>
+      <w:r>
+        <w:rPr>
+          <w:rFonts w:cstheme="minorHAnsi"/>
+          <w:lang w:val="en-US"/>
+        </w:rPr>
+        <w:t xml:space="preserve"> Can these measures and forecasts allocate a limited real-data budget: which twin data to weight, what to capture and which real rollouts to collect?</w:t>
       </w:r>
     </w:p>
     <w:p>
@@ -6073,29 +6002,14 @@
           <w:b/>
           <w:lang w:val="en-US"/>
         </w:rPr>
-        <w:t xml:space="preserve">H1 (RQ1, core).</w:t>
-      </w:r>
-      <w:r>
-        <w:rPr>
-          <w:rFonts w:cstheme="minorHAnsi"/>
-          <w:lang w:val="en-US"/>
-        </w:rPr>
-        <w:t xml:space="preserve"> A navigation policy trained only in the twin (a) beats the generic baseline in SR and (b) is </w:t>
-      </w:r>
-      <w:r>
-        <w:rPr>
-          <w:rFonts w:cstheme="minorHAnsi"/>
-          <w:b/>
-          <w:lang w:val="en-US"/>
-        </w:rPr>
-        <w:t xml:space="preserve">non-inferior</w:t>
-      </w:r>
-      <w:r>
-        <w:rPr>
-          <w:rFonts w:cstheme="minorHAnsi"/>
-          <w:lang w:val="en-US"/>
-        </w:rPr>
-        <w:t xml:space="preserve"> to the real-data-only baseline with a ≥ 10× larger budget: the lower 95% bound of SR_twin − SR_real is above −10 pp on tier A and above −15 pp on tier C (120 pooled episodes per policy; ≈ 90% power at SR ≈ 0.8).</w:t>
+        <w:t xml:space="preserve">H3.</w:t>
+      </w:r>
+      <w:r>
+        <w:rPr>
+          <w:rFonts w:cstheme="minorHAnsi"/>
+          <w:lang w:val="en-US"/>
+        </w:rPr>
+        <w:t xml:space="preserve"> Forecast-guided weighting, capture and rollout selection reaches the target real SR τ with ≥ 30% less real data (capture minutes + real rollouts) than uniform or random allocation: B_guided(τ) ≤ 0.7 · B_uniform(τ) on fitted budget–performance curves, with the upper 95% bound of the ratio &lt; 1. τ is fixed in the pre-registration as the SR that uniform allocation reaches at the largest budget.</w:t>
       </w:r>
     </w:p>
     <w:p>
@@ -6109,14 +6023,14 @@
           <w:b/>
           <w:lang w:val="en-US"/>
         </w:rPr>
-        <w:t xml:space="preserve">H2 (RQ3).</w:t>
-      </w:r>
-      <w:r>
-        <w:rPr>
-          <w:rFonts w:cstheme="minorHAnsi"/>
-          <w:lang w:val="en-US"/>
-        </w:rPr>
-        <w:t xml:space="preserve"> In uncaptured navigation scenes, and in manipulation with an unchanged pipeline, twin + augmentation + representation alignment reaches a higher SR than the twin alone and than the generic baseline, and alignment lowers the feature distance between reconstructed and real frames (tier B).</w:t>
+        <w:t xml:space="preserve">RQ4 (generalize).</w:t>
+      </w:r>
+      <w:r>
+        <w:rPr>
+          <w:rFonts w:cstheme="minorHAnsi"/>
+          <w:lang w:val="en-US"/>
+        </w:rPr>
+        <w:t xml:space="preserve"> Do the gap measures and predictors transfer across tasks and simulator families?</w:t>
       </w:r>
     </w:p>
     <w:p>
@@ -6130,14 +6044,14 @@
           <w:b/>
           <w:lang w:val="en-US"/>
         </w:rPr>
-        <w:t xml:space="preserve">H3 (RQ4).</w:t>
-      </w:r>
-      <w:r>
-        <w:rPr>
-          <w:rFonts w:cstheme="minorHAnsi"/>
-          <w:lang w:val="en-US"/>
-        </w:rPr>
-        <w:t xml:space="preserve"> Over ≥ 10 navigation policy variants, the Sim-vs-Real Correlation Coefficient (SRCC) of the twin is higher than that of a generic simulator (95% CI of the difference excludes 0) and does not drop after refinement from real rollouts (lower 95% bound of the change ≥ −0.1).</w:t>
+        <w:t xml:space="preserve">H4.</w:t>
+      </w:r>
+      <w:r>
+        <w:rPr>
+          <w:rFonts w:cstheme="minorHAnsi"/>
+          <w:lang w:val="en-US"/>
+        </w:rPr>
+        <w:t xml:space="preserve"> (a) A predictor trained on the navigation zoo, applied to a manipulation zoo without retraining, ranks policies by real outcome with Spearman ρ ≥ 0.5. (b) Its rank correlation with real outcomes exceeds that of a generic simulator (Sim-vs-Real Correlation Coefficient, SRCC) and of a learned world-model evaluator (95% CI of each paired difference excludes 0).</w:t>
       </w:r>
     </w:p>
     <w:p>
@@ -6151,14 +6065,14 @@
           <w:b/>
           <w:lang w:val="en-US"/>
         </w:rPr>
-        <w:t xml:space="preserve">H4 (RQ2, core).</w:t>
-      </w:r>
-      <w:r>
-        <w:rPr>
-          <w:rFonts w:cstheme="minorHAnsi"/>
-          <w:lang w:val="en-US"/>
-        </w:rPr>
-        <w:t xml:space="preserve"> The full pipeline reaches a target navigation SR τ (best real-data-only SR minus 10 pp) with B_pipeline(τ) ≤ 0.1 · B_real(τ): the upper 95% bound of the ratio, from fitted budget–SR scaling curves, is ≤ 0.1. If real-data-only training misses τ within the largest feasible budget, the ratio is reported as a bound.</w:t>
+        <w:t xml:space="preserve">Decision rule.</w:t>
+      </w:r>
+      <w:r>
+        <w:rPr>
+          <w:rFonts w:cstheme="minorHAnsi"/>
+          <w:lang w:val="en-US"/>
+        </w:rPr>
+        <w:t xml:space="preserve"> A hypothesis is supported when all its parts pass on tier A; tiers B and C report agreement and are not used to tune thresholds.</w:t>
       </w:r>
     </w:p>
     <w:permEnd w:id="1295260508"/>
@@ -6468,22 +6382,22 @@
           <w:rFonts w:cstheme="minorHAnsi"/>
           <w:lang w:val="en-US"/>
         </w:rPr>
-        <w:t xml:space="preserve">), in the area of machine learning. Its object is a general, task-agnostic methodology for learning embodied policies in </w:t>
-      </w:r>
-      <w:r>
-        <w:rPr>
-          <w:rFonts w:cstheme="minorHAnsi"/>
-          <w:b/>
-          <w:lang w:val="en-US"/>
-        </w:rPr>
-        <w:t xml:space="preserve">digital twins</w:t>
-      </w:r>
-      <w:r>
-        <w:rPr>
-          <w:rFonts w:cstheme="minorHAnsi"/>
-          <w:lang w:val="en-US"/>
-        </w:rPr>
-        <w:t xml:space="preserve"> built by neural reconstruction of real scenes (real → twin → policy → real). Visual navigation is the primary testbed and robotic manipulation the generalization domain; control design and mechanical engineering are not the object of the research.</w:t>
+        <w:t xml:space="preserve">), in the area of machine learning. Its object is the </w:t>
+      </w:r>
+      <w:r>
+        <w:rPr>
+          <w:rFonts w:cstheme="minorHAnsi"/>
+          <w:b/>
+          <w:lang w:val="en-US"/>
+        </w:rPr>
+        <w:t xml:space="preserve">internal representations</w:t>
+      </w:r>
+      <w:r>
+        <w:rPr>
+          <w:rFonts w:cstheme="minorHAnsi"/>
+          <w:lang w:val="en-US"/>
+        </w:rPr>
+        <w:t xml:space="preserve"> of encoders and embodied policies trained in digital twins built by neural reconstruction of real scenes, used to measure, localize and predict how well the policies transfer to reality. Visual navigation is the primary testbed and robotic manipulation the cross-task test. Building twins or simulators, control design and mechanical engineering are not the object of the research.</w:t>
       </w:r>
     </w:p>
     <w:p>
@@ -6497,44 +6411,29 @@
           <w:b/>
           <w:lang w:val="en-US"/>
         </w:rPr>
-        <w:t xml:space="preserve">Key original contribution (core, RQ1–RQ2, H1 + H4).</w:t>
-      </w:r>
-      <w:r>
-        <w:rPr>
-          <w:rFonts w:cstheme="minorHAnsi"/>
-          <w:lang w:val="en-US"/>
-        </w:rPr>
-        <w:t xml:space="preserve"> The first systematic, quantitative characterization, to our knowledge, of how performance of policies learned in </w:t>
-      </w:r>
-      <w:r>
-        <w:rPr>
-          <w:rFonts w:cstheme="minorHAnsi"/>
-          <w:b/>
-          <w:lang w:val="en-US"/>
-        </w:rPr>
-        <w:t xml:space="preserve">neural-reconstruction twins</w:t>
-      </w:r>
-      <w:r>
-        <w:rPr>
-          <w:rFonts w:cstheme="minorHAnsi"/>
-          <w:lang w:val="en-US"/>
-        </w:rPr>
-        <w:t xml:space="preserve"> scales with the </w:t>
-      </w:r>
-      <w:r>
-        <w:rPr>
-          <w:rFonts w:cstheme="minorHAnsi"/>
-          <w:b/>
-          <w:lang w:val="en-US"/>
-        </w:rPr>
-        <w:t xml:space="preserve">real-data budget</w:t>
-      </w:r>
-      <w:r>
-        <w:rPr>
-          <w:rFonts w:cstheme="minorHAnsi"/>
-          <w:lang w:val="en-US"/>
-        </w:rPr>
-        <w:t xml:space="preserve"> of the target domain. It answers "how much real data is enough" with measured budget–success-rate scaling curves and a non-inferiority comparison against learning from real data alone, on public navigation benchmarks and validated on a real robot.</w:t>
+        <w:t xml:space="preserve">Key original contribution (core, RQ1–RQ2, H1–H2).</w:t>
+      </w:r>
+      <w:r>
+        <w:rPr>
+          <w:rFonts w:cstheme="minorHAnsi"/>
+          <w:lang w:val="en-US"/>
+        </w:rPr>
+        <w:t xml:space="preserve"> To our knowledge, the first demonstration that the twin-to-real transfer of embodied policies can be </w:t>
+      </w:r>
+      <w:r>
+        <w:rPr>
+          <w:rFonts w:cstheme="minorHAnsi"/>
+          <w:b/>
+          <w:lang w:val="en-US"/>
+        </w:rPr>
+        <w:t xml:space="preserve">read from their representations</w:t>
+      </w:r>
+      <w:r>
+        <w:rPr>
+          <w:rFonts w:cstheme="minorHAnsi"/>
+          <w:lang w:val="en-US"/>
+        </w:rPr>
+        <w:t xml:space="preserve">: where in the network the gap arises, how it shrinks with the capture budget, and how large it will be for a given policy, forecast from its hidden states or weights without real rollouts.</w:t>
       </w:r>
     </w:p>
     <w:p>
@@ -6569,14 +6468,14 @@
           <w:b/>
           <w:lang w:val="en-US"/>
         </w:rPr>
-        <w:t xml:space="preserve">Data-efficient learning under a real-data budget (core; RQ2, H4).</w:t>
-      </w:r>
-      <w:r>
-        <w:rPr>
-          <w:rFonts w:cstheme="minorHAnsi"/>
-          <w:lang w:val="en-US"/>
-        </w:rPr>
-        <w:t xml:space="preserve"> A training procedure that treats the amount of real target-domain data (captures and a few real rollouts) as an explicit budget, and scaling curves that quantify the trade-off between real data and deployed performance.</w:t>
+        <w:t xml:space="preserve">Measuring and localizing the reconstruction gap (core; RQ1, H1).</w:t>
+      </w:r>
+      <w:r>
+        <w:rPr>
+          <w:rFonts w:cstheme="minorHAnsi"/>
+          <w:lang w:val="en-US"/>
+        </w:rPr>
+        <w:t xml:space="preserve"> A layer-wise analysis of paired real and twin-rendered observations (representational similarity, probing) that locates the gap inside frozen visual encoders and policies, relates it to the capture budget, and ranks encoders by robustness to reconstruction artifacts, tested against downstream transfer.</w:t>
       </w:r>
     </w:p>
     <w:p>
@@ -6598,14 +6497,14 @@
           <w:b/>
           <w:lang w:val="en-US"/>
         </w:rPr>
-        <w:t xml:space="preserve">Learning from reconstructed data (core; RQ1, H1).</w:t>
-      </w:r>
-      <w:r>
-        <w:rPr>
-          <w:rFonts w:cstheme="minorHAnsi"/>
-          <w:lang w:val="en-US"/>
-        </w:rPr>
-        <w:t xml:space="preserve"> Evidence of when training in photorealistic twins (3D Gaussian Splatting for appearance, extracted geometry for collisions) closes the distribution gap to real observations, compared with generic simulation and domain randomization.</w:t>
+        <w:t xml:space="preserve">Forecasting transfer and failure from internals (core; RQ2, H2).</w:t>
+      </w:r>
+      <w:r>
+        <w:rPr>
+          <w:rFonts w:cstheme="minorHAnsi"/>
+          <w:lang w:val="en-US"/>
+        </w:rPr>
+        <w:t xml:space="preserve"> Predictors learned over a population of twin-trained policies (graph networks over layers, weight-space metanetworks) that estimate a policy's real performance before deployment, and hidden-state failure monitors whose statistical coverage is checked across the twin-to-real shift. This brings weight-space learning and model analysis to embodied policies and distribution shift.</w:t>
       </w:r>
     </w:p>
     <w:p>
@@ -6627,14 +6526,14 @@
           <w:b/>
           <w:lang w:val="en-US"/>
         </w:rPr>
-        <w:t xml:space="preserve">Cross-scene and cross-task generalization (extension; RQ3, H2).</w:t>
-      </w:r>
-      <w:r>
-        <w:rPr>
-          <w:rFonts w:cstheme="minorHAnsi"/>
-          <w:lang w:val="en-US"/>
-        </w:rPr>
-        <w:t xml:space="preserve"> Augmentation of reconstructed scenes combined with representation alignment between reconstructed and real observations, so that policies generalize to scenes that were never captured, and evidence that the same pipeline transfers from navigation to manipulation. It connects the digital-twin and domain-randomization lines of research.</w:t>
+        <w:t xml:space="preserve">Representation-guided use of a real-data budget (RQ3, H3).</w:t>
+      </w:r>
+      <w:r>
+        <w:rPr>
+          <w:rFonts w:cstheme="minorHAnsi"/>
+          <w:lang w:val="en-US"/>
+        </w:rPr>
+        <w:t xml:space="preserve"> Methods that use the measures and forecasts to weight twin training data, choose what to capture and select which real rollouts to collect, quantified by budget–performance curves against uniform and random allocation.</w:t>
       </w:r>
     </w:p>
     <w:p>
@@ -6656,14 +6555,14 @@
           <w:b/>
           <w:lang w:val="en-US"/>
         </w:rPr>
-        <w:t xml:space="preserve">Closed-loop correction and evaluation methodology (extension; RQ4, H3).</w:t>
-      </w:r>
-      <w:r>
-        <w:rPr>
-          <w:rFonts w:cstheme="minorHAnsi"/>
-          <w:lang w:val="en-US"/>
-        </w:rPr>
-        <w:t xml:space="preserve"> A method to update the twin from a few real rollouts, and a protocol for measuring how well simulation predicts real performance (SRCC, pre-specified margins and decision rules), so that sim-to-real claims are tested, not asserted.</w:t>
+        <w:t xml:space="preserve">Generalization of the measures (RQ4, H4).</w:t>
+      </w:r>
+      <w:r>
+        <w:rPr>
+          <w:rFonts w:cstheme="minorHAnsi"/>
+          <w:lang w:val="en-US"/>
+        </w:rPr>
+        <w:t xml:space="preserve"> Evidence of whether representation-based predictors carry over from navigation to manipulation and across simulator families, compared with simulation-based predictivity (SRCC) and a learned world-model evaluator.</w:t>
       </w:r>
     </w:p>
     <w:p>
@@ -6698,14 +6597,14 @@
           <w:b/>
           <w:lang w:val="en-US"/>
         </w:rPr>
-        <w:t xml:space="preserve">Digital-twin pipeline, software and data (supports all RQs).</w:t>
-      </w:r>
-      <w:r>
-        <w:rPr>
-          <w:rFonts w:cstheme="minorHAnsi"/>
-          <w:lang w:val="en-US"/>
-        </w:rPr>
-        <w:t xml:space="preserve"> A reusable, task-agnostic pipeline and protocol that turns a short RGB(-D) capture into a simulation-ready twin, with measured cost (capture minutes, compute hours) and fidelity metrics; released code, reconstructed scenes and evaluation sets with fixed episodes for reproducible sim-to-real benchmarking in navigation and manipulation.</w:t>
+        <w:t xml:space="preserve">Benchmark, data and software (supports all RQs).</w:t>
+      </w:r>
+      <w:r>
+        <w:rPr>
+          <w:rFonts w:cstheme="minorHAnsi"/>
+          <w:lang w:val="en-US"/>
+        </w:rPr>
+        <w:t xml:space="preserve"> A public benchmark of paired real and twin-rendered frames at graded capture budgets, a released zoo of twin-trained policies with twin and real outcomes, and evaluation code with pre-registered protocols, built on existing open-source twin pipelines and simulators. It gives other groups a reproducible way to test sim-to-real claims and to screen policies and encoders before a costly real deployment.</w:t>
       </w:r>
     </w:p>
     <w:p>
@@ -6726,7 +6625,7 @@
           <w:rFonts w:cstheme="minorHAnsi"/>
           <w:lang w:val="en-US"/>
         </w:rPr>
-        <w:t xml:space="preserve"> Target-domain data is the main cost of deploying learned systems. Showing how far cheap captures and reconstruction can replace it, across tasks and embodiments, and which representations make this work, is relevant to machine learning under distribution shift in general. The evaluation methodology (item 4) is reusable for other simulators and embodied-AI tasks.</w:t>
+        <w:t xml:space="preserve"> Real target-domain data is the main cost of deploying learned systems, and trained models are increasingly deployed on data unlike their training data. Showing that transfer can be diagnosed and forecast from a model's internals, and that such forecasts save real data, is relevant to machine learning under distribution shift and to model evaluation in general, beyond robotics.</w:t>
       </w:r>
     </w:p>
     <w:p>
@@ -6747,7 +6646,7 @@
           <w:rFonts w:cstheme="minorHAnsi"/>
           <w:lang w:val="en-US"/>
         </w:rPr>
-        <w:t xml:space="preserve"> Results are planned for peer-reviewed conferences worth 200 points and assigned to ITiT on the ministerial list of 5.01.2024: NeurIPS, ICML and ICLR (machine learning), CVPR, ICCV and ECCV (computer vision), and RSS (robot learning), as in §3, §11 and §12; the cross-task (manipulation) study is paper P3.</w:t>
+        <w:t xml:space="preserve"> Results are planned for peer-reviewed conferences worth 200 points and assigned to ITiT on the ministerial list of 5.01.2024: NeurIPS, ICML and ICLR (machine learning) and CVPR, ICCV and ECCV (computer vision), as in §3, §11 and §12. P1 (RQ1, benchmark and localization) targets NeurIPS 2027; P2 (RQ2) ICLR or CVPR 2028; P3 (RQ3–RQ4, including manipulation) ECCV or NeurIPS 2028.</w:t>
       </w:r>
     </w:p>
     <w:permEnd w:id="1098318749"/>
@@ -7026,7 +6925,7 @@
           <w:rFonts w:cstheme="minorHAnsi"/>
           <w:lang w:val="en-US"/>
         </w:rPr>
-        <w:t xml:space="preserve">The research follows four stages (I–IV) matching §3; for each we give the method, data, metric and success criterion. The pipeline (real → twin → policy → real) is task-agnostic: visual navigation is the primary testbed, where H1, H3 and H4 are decided on public benchmarks and datasets and validated on a real robot (the three evaluation tiers of §7); manipulation tests cross-task generalization (H2, Stage IV). Stages I–II (H1 and the real-data budget, RQ1–RQ2) are the core; Stages III–IV extend it.</w:t>
+        <w:t xml:space="preserve">The research follows four stages (I–IV) that match §3 and the research questions of §7. For each stage we give the method, data, metric and success criterion. The student uses existing open-source 3D Gaussian Splatting (3DGS) pipelines and simulators and does not develop new ones. Stages I–II (RQ1–RQ2) are the core; Stages III–IV (RQ3–RQ4) build on them.</w:t>
       </w:r>
     </w:p>
     <w:p>
@@ -7055,74 +6954,74 @@
           <w:i/>
           <w:lang w:val="en-US"/>
         </w:rPr>
-        <w:t xml:space="preserve">Tier A (benchmark, primary):</w:t>
-      </w:r>
-      <w:r>
-        <w:rPr>
-          <w:rFonts w:cstheme="minorHAnsi"/>
-          <w:lang w:val="en-US"/>
-        </w:rPr>
-        <w:t xml:space="preserve"> ≥ 10 public indoor scenes that have both real video and a reference 3D scan, e.g. ScanNet++ (laser scans, DSLR images and iPhone RGB-D video of real rooms); the reference scan, loaded into a GPU simulator (Habitat or Isaac Sim / Isaac Lab, chosen in T3.1), is the target domain, and some scenes are held out as uncaptured. Large public scene sets (e.g. HM3D) train the generic baseline. </w:t>
-      </w:r>
-      <w:r>
-        <w:rPr>
-          <w:rFonts w:cstheme="minorHAnsi"/>
-          <w:i/>
-          <w:lang w:val="en-US"/>
-        </w:rPr>
-        <w:t xml:space="preserve">Tier B (real-world datasets):</w:t>
-      </w:r>
-      <w:r>
-        <w:rPr>
-          <w:rFonts w:cstheme="minorHAnsi"/>
-          <w:lang w:val="en-US"/>
-        </w:rPr>
-        <w:t xml:space="preserve"> held-out real frames and trajectories from public navigation datasets (e.g. SCAND, RECON) for representation metrics and offline checks. </w:t>
-      </w:r>
-      <w:r>
-        <w:rPr>
-          <w:rFonts w:cstheme="minorHAnsi"/>
-          <w:i/>
-          <w:lang w:val="en-US"/>
-        </w:rPr>
-        <w:t xml:space="preserve">Tier C (real-robot validation):</w:t>
-      </w:r>
-      <w:r>
-        <w:rPr>
-          <w:rFonts w:cstheme="minorHAnsi"/>
-          <w:lang w:val="en-US"/>
-        </w:rPr>
-        <w:t xml:space="preserve"> ≥ 2 PWr environments with a mobile robot (planned cooperation with the K29 "Denali" Autonomous Robots Laboratory: Pioneer 3-DX and DrRobot Jaguar 4x4 under ROS 2; agreement in T3.2), with an RGB-D camera and wheel odometry; a sensor is bought from an SzD Minigrant if needed. The </w:t>
-      </w:r>
-      <w:r>
-        <w:rPr>
-          <w:rFonts w:cstheme="minorHAnsi"/>
-          <w:b/>
-          <w:lang w:val="en-US"/>
-        </w:rPr>
-        <w:t xml:space="preserve">real-data budget</w:t>
-      </w:r>
-      <w:r>
-        <w:rPr>
-          <w:rFonts w:cstheme="minorHAnsi"/>
-          <w:lang w:val="en-US"/>
-        </w:rPr>
-        <w:t xml:space="preserve"> B (minutes of target-domain data: capture video plus real experience) is an explicit experimental variable: on tier A it is set by subsampling the scene's video and the number of rollouts in the reference scan. </w:t>
-      </w:r>
-      <w:r>
-        <w:rPr>
-          <w:rFonts w:cstheme="minorHAnsi"/>
-          <w:i/>
-          <w:lang w:val="en-US"/>
-        </w:rPr>
-        <w:t xml:space="preserve">Estimated robot time:</w:t>
-      </w:r>
-      <w:r>
-        <w:rPr>
-          <w:rFonts w:cstheme="minorHAnsi"/>
-          <w:lang w:val="en-US"/>
-        </w:rPr>
-        <w:t xml:space="preserve"> about 16 robot-hours per validation campaign (4 policies × 120 episodes at ~2 min per episode including reset), in sem. 4–5 and sem. 7. Compute: WCSS Lem (NVIDIA H100) and PLGrid allocations (to be applied for), plus departmental GPUs .</w:t>
+        <w:t xml:space="preserve">Tier A (proxy reality; decides the hypotheses):</w:t>
+      </w:r>
+      <w:r>
+        <w:rPr>
+          <w:rFonts w:cstheme="minorHAnsi"/>
+          <w:lang w:val="en-US"/>
+        </w:rPr>
+        <w:t xml:space="preserve"> ≥ 10 public indoor scenes that have real captures and a reference laser scan, e.g. ScanNet++ [17]. The reference scan, rendered in a GPU simulator (Habitat [1] or an Isaac-based 3DGS renderer such as GaussGym [6], chosen in T3.1), is the "real" target domain. The twin is a 3DGS reconstruction built from a subsample of the scene's real capture. The </w:t>
+      </w:r>
+      <w:r>
+        <w:rPr>
+          <w:rFonts w:cstheme="minorHAnsi"/>
+          <w:b/>
+          <w:lang w:val="en-US"/>
+        </w:rPr>
+        <w:t xml:space="preserve">capture budget</w:t>
+      </w:r>
+      <w:r>
+        <w:rPr>
+          <w:rFonts w:cstheme="minorHAnsi"/>
+          <w:lang w:val="en-US"/>
+        </w:rPr>
+        <w:t xml:space="preserve"> (≥ 4 levels of capture minutes or views) is set by subsampling. Some scenes are held out. </w:t>
+      </w:r>
+      <w:r>
+        <w:rPr>
+          <w:rFonts w:cstheme="minorHAnsi"/>
+          <w:i/>
+          <w:lang w:val="en-US"/>
+        </w:rPr>
+        <w:t xml:space="preserve">Tier B (real outcomes):</w:t>
+      </w:r>
+      <w:r>
+        <w:rPr>
+          <w:rFonts w:cstheme="minorHAnsi"/>
+          <w:lang w:val="en-US"/>
+        </w:rPr>
+        <w:t xml:space="preserve"> public real-world navigation datasets for representation metrics and published paired sim/real evaluations of manipulation policies (SIMPLER [12]). </w:t>
+      </w:r>
+      <w:r>
+        <w:rPr>
+          <w:rFonts w:cstheme="minorHAnsi"/>
+          <w:i/>
+          <w:lang w:val="en-US"/>
+        </w:rPr>
+        <w:t xml:space="preserve">Tier C (validation only):</w:t>
+      </w:r>
+      <w:r>
+        <w:rPr>
+          <w:rFonts w:cstheme="minorHAnsi"/>
+          <w:lang w:val="en-US"/>
+        </w:rPr>
+        <w:t xml:space="preserve"> ≥ 2 PWr environments with a mobile robot (planned cooperation with the K29 "Denali" Autonomous Robots Laboratory; agreement in T3.2), RGB-D camera and wheel odometry. </w:t>
+      </w:r>
+      <w:r>
+        <w:rPr>
+          <w:rFonts w:cstheme="minorHAnsi"/>
+          <w:i/>
+          <w:lang w:val="en-US"/>
+        </w:rPr>
+        <w:t xml:space="preserve">Compute:</w:t>
+      </w:r>
+      <w:r>
+        <w:rPr>
+          <w:rFonts w:cstheme="minorHAnsi"/>
+          <w:lang w:val="en-US"/>
+        </w:rPr>
+        <w:t xml:space="preserve"> WCSS Lem (NVIDIA H100) and PLGrid allocations (to be applied for) .</w:t>
       </w:r>
     </w:p>
     <w:p>
@@ -7136,7 +7035,7 @@
           <w:b/>
           <w:lang w:val="en-US"/>
         </w:rPr>
-        <w:t xml:space="preserve">Stage I – digital-twin pipeline and learning from reconstructions (RQ1; sem. 3).</w:t>
+        <w:t xml:space="preserve">Stage I – paired-frame benchmark and gap localization (RQ1, H1; sem. 3–4).</w:t>
       </w:r>
     </w:p>
     <w:p>
@@ -7158,14 +7057,29 @@
           <w:i/>
           <w:lang w:val="en-US"/>
         </w:rPr>
-        <w:t xml:space="preserve">Method:</w:t>
-      </w:r>
-      <w:r>
-        <w:rPr>
-          <w:rFonts w:cstheme="minorHAnsi"/>
-          <w:lang w:val="en-US"/>
-        </w:rPr>
-        <w:t xml:space="preserve"> one task-agnostic pipeline from a short RGB(-D) capture to a simulation-ready twin: camera poses from Structure-from-Motion (COLMAP) or the dataset's poses; appearance from 3D Gaussian Splatting (NeRF as baseline); collision geometry from depth fusion or mesh extraction; export to the simulator with rendering from the reconstruction and physics from the mesh. The same pipeline serves rooms (navigation) and tabletop scenes and objects (manipulation).</w:t>
+        <w:t xml:space="preserve">Benchmark:</w:t>
+      </w:r>
+      <w:r>
+        <w:rPr>
+          <w:rFonts w:cstheme="minorHAnsi"/>
+          <w:lang w:val="en-US"/>
+        </w:rPr>
+        <w:t xml:space="preserve"> for every scene and capture budget we render twin frames at the camera poses of held-out real frames, which gives </w:t>
+      </w:r>
+      <w:r>
+        <w:rPr>
+          <w:rFonts w:cstheme="minorHAnsi"/>
+          <w:b/>
+          <w:lang w:val="en-US"/>
+        </w:rPr>
+        <w:t xml:space="preserve">paired real/twin frames of the same pose</w:t>
+      </w:r>
+      <w:r>
+        <w:rPr>
+          <w:rFonts w:cstheme="minorHAnsi"/>
+          <w:lang w:val="en-US"/>
+        </w:rPr>
+        <w:t xml:space="preserve">, plus per-scene fidelity (PSNR, SSIM, LPIPS, depth error) and cost (capture minutes, GPU-hours).</w:t>
       </w:r>
     </w:p>
     <w:p>
@@ -7187,14 +7101,14 @@
           <w:i/>
           <w:lang w:val="en-US"/>
         </w:rPr>
-        <w:t xml:space="preserve">Protocol and cost:</w:t>
-      </w:r>
-      <w:r>
-        <w:rPr>
-          <w:rFonts w:cstheme="minorHAnsi"/>
-          <w:lang w:val="en-US"/>
-        </w:rPr>
-        <w:t xml:space="preserve"> a written capture protocol (camera path, duration, lighting, coverage check); for each twin we log capture minutes, operator minutes and GPU-hours of reconstruction and mesh extraction.</w:t>
+        <w:t xml:space="preserve">Encoders:</w:t>
+      </w:r>
+      <w:r>
+        <w:rPr>
+          <w:rFonts w:cstheme="minorHAnsi"/>
+          <w:lang w:val="en-US"/>
+        </w:rPr>
+        <w:t xml:space="preserve"> ≥ 10 frozen image and video encoders used as policy backbones (e.g. DINOv2 [20], CLIP-type, V-JEPA 2 [21]), plus the encoders inside twin-trained policies.</w:t>
       </w:r>
     </w:p>
     <w:p>
@@ -7216,28 +7130,44 @@
           <w:i/>
           <w:lang w:val="en-US"/>
         </w:rPr>
-        <w:t xml:space="preserve">Fidelity metrics and success criterion:</w:t>
-      </w:r>
-      <w:r>
-        <w:rPr>
-          <w:rFonts w:cstheme="minorHAnsi"/>
-          <w:lang w:val="en-US"/>
-        </w:rPr>
-        <w:t xml:space="preserve"> PSNR, SSIM and LPIPS on held-out views; depth error and Chamfer distance of the collision mesh to the reference scan. A scene passes if its held-out PSNR is within a margin X dB of the value reported for 3DGS [21] on comparable indoor scenes (X fixed in the repository before Stage II) and its collision mesh has no holes on the evaluation paths. Fidelity–cost curves (fidelity vs. capture minutes) are reported and later related to the transfer gap (Stage III).</w:t>
-      </w:r>
-    </w:p>
-    <w:p>
-      <w:pPr>
-        <w:spacing w:after="120" w:line="240" w:lineRule="auto"/>
-        <w:jc w:val="both"/>
-      </w:pPr>
-      <w:r>
-        <w:rPr>
-          <w:rFonts w:cstheme="minorHAnsi"/>
-          <w:b/>
-          <w:lang w:val="en-US"/>
-        </w:rPr>
-        <w:t xml:space="preserve">Stage II – learning under a real-data budget (RQ1–RQ2, H1, H4; sem. 3–4).</w:t>
+        <w:t xml:space="preserve">Method:</w:t>
+      </w:r>
+      <w:r>
+        <w:rPr>
+          <w:rFonts w:cstheme="minorHAnsi"/>
+          <w:lang w:val="en-US"/>
+        </w:rPr>
+        <w:t xml:space="preserve"> for each layer, </w:t>
+      </w:r>
+      <w:r>
+        <w:rPr>
+          <w:rFonts w:cstheme="minorHAnsi"/>
+          <w:b/>
+          <w:lang w:val="en-US"/>
+        </w:rPr>
+        <w:t xml:space="preserve">linear CKA</w:t>
+      </w:r>
+      <w:r>
+        <w:rPr>
+          <w:rFonts w:cstheme="minorHAnsi"/>
+          <w:lang w:val="en-US"/>
+        </w:rPr>
+        <w:t xml:space="preserve"> [19] between real and twin activations, and </w:t>
+      </w:r>
+      <w:r>
+        <w:rPr>
+          <w:rFonts w:cstheme="minorHAnsi"/>
+          <w:b/>
+          <w:lang w:val="en-US"/>
+        </w:rPr>
+        <w:t xml:space="preserve">linear probes</w:t>
+      </w:r>
+      <w:r>
+        <w:rPr>
+          <w:rFonts w:cstheme="minorHAnsi"/>
+          <w:lang w:val="en-US"/>
+        </w:rPr>
+        <w:t xml:space="preserve"> [18] trained on twin features and tested on real features (targets: depth, semantic class, relative goal direction). Gap = 1 − CKA and the probe-accuracy drop.</w:t>
       </w:r>
     </w:p>
     <w:p>
@@ -7259,14 +7189,28 @@
           <w:i/>
           <w:lang w:val="en-US"/>
         </w:rPr>
-        <w:t xml:space="preserve">Method:</w:t>
-      </w:r>
-      <w:r>
-        <w:rPr>
-          <w:rFonts w:cstheme="minorHAnsi"/>
-          <w:lang w:val="en-US"/>
-        </w:rPr>
-        <w:t xml:space="preserve"> (i) deep reinforcement learning (PPO / DD-PPO) for point-goal and image-goal navigation, trained at scale in the reconstructions; (ii) imitation learning and fine-tuning of pretrained navigation models (GNM, ViNT, NoMaD) on trajectories generated in simulation. Input: RGB(-D); output: velocity commands.</w:t>
+        <w:t xml:space="preserve">Success criterion (H1):</w:t>
+      </w:r>
+      <w:r>
+        <w:rPr>
+          <w:rFonts w:cstheme="minorHAnsi"/>
+          <w:lang w:val="en-US"/>
+        </w:rPr>
+        <w:t xml:space="preserve"> concentration of the gap in layers, monotonic decrease with the capture budget, differences between encoders, and a robustness ranking that predicts downstream twin→real success rate (SR) with Spearman ρ ≥ 0.6. Downstream SR comes from navigation policies trained on each frozen encoder in the twins and tested in tier A. Decision rules are those of §7.</w:t>
+      </w:r>
+    </w:p>
+    <w:p>
+      <w:pPr>
+        <w:spacing w:after="120" w:line="240" w:lineRule="auto"/>
+        <w:jc w:val="both"/>
+      </w:pPr>
+      <w:r>
+        <w:rPr>
+          <w:rFonts w:cstheme="minorHAnsi"/>
+          <w:b/>
+          <w:lang w:val="en-US"/>
+        </w:rPr>
+        <w:t xml:space="preserve">Stage II – policy zoo and transfer forecasting (RQ2, H2; sem. 4–5).</w:t>
       </w:r>
     </w:p>
     <w:p>
@@ -7288,14 +7232,14 @@
           <w:i/>
           <w:lang w:val="en-US"/>
         </w:rPr>
-        <w:t xml:space="preserve">Baselines (§7):</w:t>
-      </w:r>
-      <w:r>
-        <w:rPr>
-          <w:rFonts w:cstheme="minorHAnsi"/>
-          <w:lang w:val="en-US"/>
-        </w:rPr>
-        <w:t xml:space="preserve"> the same policy trained on generic public scenes with domain randomization; the real-data-only baseline, a pretrained model fine-tuned by behaviour cloning on target-domain trajectories of budget B, at matched and ≥ 10× larger budgets; pretrained models zero-shot.</w:t>
+        <w:t xml:space="preserve">Policy zoo:</w:t>
+      </w:r>
+      <w:r>
+        <w:rPr>
+          <w:rFonts w:cstheme="minorHAnsi"/>
+          <w:lang w:val="en-US"/>
+        </w:rPr>
+        <w:t xml:space="preserve"> ≥ 200 point-goal and image-goal navigation policies trained in the twins by reinforcement learning (PPO / DD-PPO) and imitation of a privileged planner. They vary scene, capture budget, encoder, architecture, training data and seed. Each policy is evaluated in its twin and in tier A, which gives the label: the twin→real SR gap. Small policies and shared frozen encoders keep the zoo within academic compute (a pilot in sem. 3 fixes the final size).</w:t>
       </w:r>
     </w:p>
     <w:p>
@@ -7317,28 +7261,29 @@
           <w:i/>
           <w:lang w:val="en-US"/>
         </w:rPr>
-        <w:t xml:space="preserve">Metric and success criterion:</w:t>
-      </w:r>
-      <w:r>
-        <w:rPr>
-          <w:rFonts w:cstheme="minorHAnsi"/>
-          <w:lang w:val="en-US"/>
-        </w:rPr>
-        <w:t xml:space="preserve"> success rate (primary), SPL and collisions as a function of B; budget–SR scaling curves fitted per method; H1 and H4 decision rules in §7 on tier A, with the robot pilot (tier C, one environment) as the first validation.</w:t>
-      </w:r>
-    </w:p>
-    <w:p>
-      <w:pPr>
-        <w:spacing w:after="120" w:line="240" w:lineRule="auto"/>
-        <w:jc w:val="both"/>
-      </w:pPr>
-      <w:r>
-        <w:rPr>
-          <w:rFonts w:cstheme="minorHAnsi"/>
-          <w:b/>
-          <w:lang w:val="en-US"/>
-        </w:rPr>
-        <w:t xml:space="preserve">Stage III – predictivity and correction (RQ4, H3, H4; sem. 4–5).</w:t>
+        <w:t xml:space="preserve">Predictors:</w:t>
+      </w:r>
+      <w:r>
+        <w:rPr>
+          <w:rFonts w:cstheme="minorHAnsi"/>
+          <w:lang w:val="en-US"/>
+        </w:rPr>
+        <w:t xml:space="preserve"> (i) a graph neural network over per-layer hidden-state statistics on a fixed probe set of twin frames (the student's prior method for forecasting from hidden states); (ii) weight-space metanetworks [26, 27]. </w:t>
+      </w:r>
+      <w:r>
+        <w:rPr>
+          <w:rFonts w:cstheme="minorHAnsi"/>
+          <w:i/>
+          <w:lang w:val="en-US"/>
+        </w:rPr>
+        <w:t xml:space="preserve">Baselines:</w:t>
+      </w:r>
+      <w:r>
+        <w:rPr>
+          <w:rFonts w:cstheme="minorHAnsi"/>
+          <w:lang w:val="en-US"/>
+        </w:rPr>
+        <w:t xml:space="preserve"> twin SR alone, image fidelity (PSNR/LPIPS), and simulator-level predictivity (SRCC-style rollout estimates [10]). Splits are by held-out scene. Ablations keep fidelity fixed and vary the policy, so that the predictor cannot rely only on twin quality.</w:t>
       </w:r>
     </w:p>
     <w:p>
@@ -7360,29 +7305,14 @@
           <w:i/>
           <w:lang w:val="en-US"/>
         </w:rPr>
-        <w:t xml:space="preserve">Validation protocol:</w:t>
-      </w:r>
-      <w:r>
-        <w:rPr>
-          <w:rFonts w:cstheme="minorHAnsi"/>
-          <w:lang w:val="en-US"/>
-        </w:rPr>
-        <w:t xml:space="preserve"> paired rollouts in simulation and in the target domain on the same start–goal pairs. Over ≥ 10 policy variants we compute the </w:t>
-      </w:r>
-      <w:r>
-        <w:rPr>
-          <w:rFonts w:cstheme="minorHAnsi"/>
-          <w:b/>
-          <w:lang w:val="en-US"/>
-        </w:rPr>
-        <w:t xml:space="preserve">Sim-vs-Real Correlation Coefficient (SRCC)</w:t>
-      </w:r>
-      <w:r>
-        <w:rPr>
-          <w:rFonts w:cstheme="minorHAnsi"/>
-          <w:lang w:val="en-US"/>
-        </w:rPr>
-        <w:t xml:space="preserve"> between simulated and target-domain success/SPL for the reconstructed and the generic simulator, on tier A and on the robot (tier C), and relate per-scene fidelity (Stage I) to the transfer gap.</w:t>
+        <w:t xml:space="preserve">Failure monitors:</w:t>
+      </w:r>
+      <w:r>
+        <w:rPr>
+          <w:rFonts w:cstheme="minorHAnsi"/>
+          <w:lang w:val="en-US"/>
+        </w:rPr>
+        <w:t xml:space="preserve"> hidden-state failure scores (in the style of [29, 30]) with thresholds set by split conformal prediction [28] at 90% coverage in the twin; coverage is measured on tier A and tier B.</w:t>
       </w:r>
     </w:p>
     <w:p>
@@ -7404,14 +7334,28 @@
           <w:i/>
           <w:lang w:val="en-US"/>
         </w:rPr>
-        <w:t xml:space="preserve">Method:</w:t>
-      </w:r>
-      <w:r>
-        <w:rPr>
-          <w:rFonts w:cstheme="minorHAnsi"/>
-          <w:lang w:val="en-US"/>
-        </w:rPr>
-        <w:t xml:space="preserve"> the discrepancy between target-domain and replayed trajectories updates the scene (re-capture of poorly reconstructed regions) and fits dynamics and sensor parameters (system identification, adaptive randomization in the style of SimOpt); the policy is then fine-tuned in the corrected simulation.</w:t>
+        <w:t xml:space="preserve">Success criterion (H2):</w:t>
+      </w:r>
+      <w:r>
+        <w:rPr>
+          <w:rFonts w:cstheme="minorHAnsi"/>
+          <w:lang w:val="en-US"/>
+        </w:rPr>
+        <w:t xml:space="preserve"> ≥ 20% lower MAE than the best baseline (lower 95% bound of the reduction &gt; 0), and real coverage ≥ 85% (ε = 5 pp).</w:t>
+      </w:r>
+    </w:p>
+    <w:p>
+      <w:pPr>
+        <w:spacing w:after="120" w:line="240" w:lineRule="auto"/>
+        <w:jc w:val="both"/>
+      </w:pPr>
+      <w:r>
+        <w:rPr>
+          <w:rFonts w:cstheme="minorHAnsi"/>
+          <w:b/>
+          <w:lang w:val="en-US"/>
+        </w:rPr>
+        <w:t xml:space="preserve">Stage III – budget-allocation experiments (RQ3, H3; sem. 6).</w:t>
       </w:r>
     </w:p>
     <w:p>
@@ -7433,14 +7377,14 @@
           <w:i/>
           <w:lang w:val="en-US"/>
         </w:rPr>
-        <w:t xml:space="preserve">Metric and success criterion:</w:t>
-      </w:r>
-      <w:r>
-        <w:rPr>
-          <w:rFonts w:cstheme="minorHAnsi"/>
-          <w:lang w:val="en-US"/>
-        </w:rPr>
-        <w:t xml:space="preserve"> SRCC with bootstrap confidence intervals; target-domain rollouts needed to reach the target success rate compared with real-data-only learning; H3 and H4 decision rules in §7.</w:t>
+        <w:t xml:space="preserve">Levers:</w:t>
+      </w:r>
+      <w:r>
+        <w:rPr>
+          <w:rFonts w:cstheme="minorHAnsi"/>
+          <w:lang w:val="en-US"/>
+        </w:rPr>
+        <w:t xml:space="preserve"> (a) weighting of twin training data by representation distance to a small real set; (b) capture selection, i.e. which scenes or regions to (re)capture, guided by the localized gap from Stage I; (c) rollout selection, i.e. which real rollouts to collect, guided by the Stage II forecasts and their uncertainty. Real SR is estimated from few rollouts with prediction-powered inference [33, 34].</w:t>
       </w:r>
     </w:p>
     <w:p>
@@ -7462,28 +7406,14 @@
           <w:i/>
           <w:lang w:val="en-US"/>
         </w:rPr>
-        <w:t xml:space="preserve">Fallback</w:t>
-      </w:r>
-      <w:r>
-        <w:rPr>
-          <w:rFonts w:cstheme="minorHAnsi"/>
-          <w:lang w:val="en-US"/>
-        </w:rPr>
-        <w:t xml:space="preserve"> (low SRCC or no gain): reported as a negative finding, with the error attributed to appearance, geometry or dynamics by ablation; Stage II conclusions do not depend on this stage.</w:t>
-      </w:r>
-    </w:p>
-    <w:p>
-      <w:pPr>
-        <w:spacing w:after="120" w:line="240" w:lineRule="auto"/>
-        <w:jc w:val="both"/>
-      </w:pPr>
-      <w:r>
-        <w:rPr>
-          <w:rFonts w:cstheme="minorHAnsi"/>
-          <w:b/>
-          <w:lang w:val="en-US"/>
-        </w:rPr>
-        <w:t xml:space="preserve">Stage IV – cross-scene and cross-task generalization (RQ3, H2, H4; sem. 6–7).</w:t>
+        <w:t xml:space="preserve">Baselines:</w:t>
+      </w:r>
+      <w:r>
+        <w:rPr>
+          <w:rFonts w:cstheme="minorHAnsi"/>
+          <w:lang w:val="en-US"/>
+        </w:rPr>
+        <w:t xml:space="preserve"> uniform and random allocation of the same budget. Analysis: attribution of real successes and failures to twin data [31, 32].</w:t>
       </w:r>
     </w:p>
     <w:p>
@@ -7505,29 +7435,28 @@
           <w:i/>
           <w:lang w:val="en-US"/>
         </w:rPr>
-        <w:t xml:space="preserve">Method:</w:t>
-      </w:r>
-      <w:r>
-        <w:rPr>
-          <w:rFonts w:cstheme="minorHAnsi"/>
-          <w:lang w:val="en-US"/>
-        </w:rPr>
-        <w:t xml:space="preserve"> augmentation of reconstructed scenes (object insertion and rearrangement, lighting and appearance randomization, sensor noise, simulated pedestrians) and </w:t>
-      </w:r>
-      <w:r>
-        <w:rPr>
-          <w:rFonts w:cstheme="minorHAnsi"/>
-          <w:b/>
-          <w:lang w:val="en-US"/>
-        </w:rPr>
-        <w:t xml:space="preserve">representation alignment</w:t>
-      </w:r>
-      <w:r>
-        <w:rPr>
-          <w:rFonts w:cstheme="minorHAnsi"/>
-          <w:lang w:val="en-US"/>
-        </w:rPr>
-        <w:t xml:space="preserve">: an auxiliary objective that brings encoder features of reconstructed and real observations of the same place together (e.g. contrastive or distribution-matching losses). Ablation: generic + randomization vs. reconstruction only vs. reconstruction + augmentation vs. + alignment.</w:t>
+        <w:t xml:space="preserve">Success criterion (H3):</w:t>
+      </w:r>
+      <w:r>
+        <w:rPr>
+          <w:rFonts w:cstheme="minorHAnsi"/>
+          <w:lang w:val="en-US"/>
+        </w:rPr>
+        <w:t xml:space="preserve"> budget–performance curves (real data = capture minutes + real rollouts) fitted per method; guided allocation reaches the target SR τ with ≤ 0.7 of the uniform budget (upper 95% bound of the ratio &lt; 1).</w:t>
+      </w:r>
+    </w:p>
+    <w:p>
+      <w:pPr>
+        <w:spacing w:after="120" w:line="240" w:lineRule="auto"/>
+        <w:jc w:val="both"/>
+      </w:pPr>
+      <w:r>
+        <w:rPr>
+          <w:rFonts w:cstheme="minorHAnsi"/>
+          <w:b/>
+          <w:lang w:val="en-US"/>
+        </w:rPr>
+        <w:t xml:space="preserve">Stage IV – cross-task and cross-simulator generalization (RQ4, H4; sem. 6–7).</w:t>
       </w:r>
     </w:p>
     <w:p>
@@ -7549,14 +7478,14 @@
           <w:i/>
           <w:lang w:val="en-US"/>
         </w:rPr>
-        <w:t xml:space="preserve">Data:</w:t>
-      </w:r>
-      <w:r>
-        <w:rPr>
-          <w:rFonts w:cstheme="minorHAnsi"/>
-          <w:lang w:val="en-US"/>
-        </w:rPr>
-        <w:t xml:space="preserve"> held-out uncaptured scenes (tier A), real frames (tier B), and uncaptured real environments at PWr and, during the foreign visit, at the host lab (tier C).</w:t>
+        <w:t xml:space="preserve">Manipulation zoo:</w:t>
+      </w:r>
+      <w:r>
+        <w:rPr>
+          <w:rFonts w:cstheme="minorHAnsi"/>
+          <w:lang w:val="en-US"/>
+        </w:rPr>
+        <w:t xml:space="preserve"> pick-and-place policies trained in twins of tabletop scenes in ManiSkill3 [9]; labels from SIMPLER [12] environments and their published paired sim/real evaluations (tier B).</w:t>
       </w:r>
     </w:p>
     <w:p>
@@ -7578,14 +7507,29 @@
           <w:i/>
           <w:lang w:val="en-US"/>
         </w:rPr>
-        <w:t xml:space="preserve">Cross-task study (manipulation, sem. 6):</w:t>
-      </w:r>
-      <w:r>
-        <w:rPr>
-          <w:rFonts w:cstheme="minorHAnsi"/>
-          <w:lang w:val="en-US"/>
-        </w:rPr>
-        <w:t xml:space="preserve"> the Stage I pipeline, unchanged, builds twins of public tabletop scenes and objects; pick-and-place policies are trained in them by imitation and reinforcement learning in the GPU simulator ManiSkill3 [38] and evaluated in public real-to-sim environments (SIMPLER [37], whose simulated results correlate with real robots) as proxy reality. Same ablation as for navigation (generic vs. twin only vs. twin + augmentation + alignment), plus behaviour cloning on public real demonstrations (Open X-Embodiment [8]) at matched budget. Metric: task success rate (H2 rule in §7). Real validation on a PWr manipulator is optional.</w:t>
+        <w:t xml:space="preserve">Method:</w:t>
+      </w:r>
+      <w:r>
+        <w:rPr>
+          <w:rFonts w:cstheme="minorHAnsi"/>
+          <w:lang w:val="en-US"/>
+        </w:rPr>
+        <w:t xml:space="preserve"> the navigation-trained predictor is applied without retraining. </w:t>
+      </w:r>
+      <w:r>
+        <w:rPr>
+          <w:rFonts w:cstheme="minorHAnsi"/>
+          <w:i/>
+          <w:lang w:val="en-US"/>
+        </w:rPr>
+        <w:t xml:space="preserve">Comparators:</w:t>
+      </w:r>
+      <w:r>
+        <w:rPr>
+          <w:rFonts w:cstheme="minorHAnsi"/>
+          <w:lang w:val="en-US"/>
+        </w:rPr>
+        <w:t xml:space="preserve"> SRCC of a generic simulator [10] and a frozen learned world model used as a policy evaluator (in the style of [35]); world models are not trained.</w:t>
       </w:r>
     </w:p>
     <w:p>
@@ -7607,14 +7551,35 @@
           <w:i/>
           <w:lang w:val="en-US"/>
         </w:rPr>
-        <w:t xml:space="preserve">Metric and success criterion:</w:t>
-      </w:r>
-      <w:r>
-        <w:rPr>
-          <w:rFonts w:cstheme="minorHAnsi"/>
-          <w:lang w:val="en-US"/>
-        </w:rPr>
-        <w:t xml:space="preserve"> success rate and SPL in uncaptured scenes, and the feature-distribution distance between reconstructed and real frames (H2 rule in §7); the full budget curve over all baselines (H4, sem. 7).</w:t>
+        <w:t xml:space="preserve">Success criterion (H4):</w:t>
+      </w:r>
+      <w:r>
+        <w:rPr>
+          <w:rFonts w:cstheme="minorHAnsi"/>
+          <w:lang w:val="en-US"/>
+        </w:rPr>
+        <w:t xml:space="preserve"> Spearman ρ ≥ 0.5 on manipulation, and a higher rank correlation with real outcomes than both comparators (95% CI of each paired difference excludes 0).</w:t>
+      </w:r>
+    </w:p>
+    <w:p>
+      <w:pPr>
+        <w:spacing w:after="120" w:line="240" w:lineRule="auto"/>
+        <w:jc w:val="both"/>
+      </w:pPr>
+      <w:r>
+        <w:rPr>
+          <w:rFonts w:cstheme="minorHAnsi"/>
+          <w:b/>
+          <w:lang w:val="en-US"/>
+        </w:rPr>
+        <w:t xml:space="preserve">Tier C validation.</w:t>
+      </w:r>
+      <w:r>
+        <w:rPr>
+          <w:rFonts w:cstheme="minorHAnsi"/>
+          <w:lang w:val="en-US"/>
+        </w:rPr>
+        <w:t xml:space="preserve"> Two robot campaigns (sem. 5 and 7) check that tier-A conclusions carry over: 8 zoo policies × 60 episodes (2 environments × 10 start–goal pairs × 3 trials), about 16 robot-hours per campaign at ~2 min per episode. Tier C is reported as agreement and is never used to tune thresholds.</w:t>
       </w:r>
     </w:p>
     <w:p>
@@ -7635,7 +7600,7 @@
           <w:rFonts w:cstheme="minorHAnsi"/>
           <w:lang w:val="en-US"/>
         </w:rPr>
-        <w:t xml:space="preserve"> All comparisons follow the §7 protocol, which is pre-registered in the project repository before each stage; changes are logged with reasons. Code, configurations and reconstructed scenes are versioned and released where the dataset licences permit.</w:t>
+        <w:t xml:space="preserve"> Tests are one-sided (α = 0.05), bootstrapped over scenes and Holm-corrected within each hypothesis, as in §7. The protocol is pre-registered in the project repository before each stage, and changes are logged with reasons. Code, the paired-frame benchmark and the policy zoo are released where the dataset licences permit.</w:t>
       </w:r>
     </w:p>
     <w:permEnd w:id="32011344"/>
@@ -7904,7 +7869,7 @@
           <w:rFonts w:cstheme="minorHAnsi"/>
           <w:lang w:val="pl-PL"/>
         </w:rPr>
-        <w:t xml:space="preserve">Współczesna sztuczna inteligencja uczy się na przykładach i zwykle potrzebuje ich ogromnej liczby. W wielu zastosowaniach dobre przykłady pochodzą jednak tylko z prawdziwego świata, a ich zbieranie jest powolne, drogie, a czasem ryzykowne. Dobrym przykładem są roboty, na przykład w magazynach, szpitalach, biurach czy fabrykach. Aby robot nauczył się samodzielnie poruszać lub chwytać przedmioty, potrzebuje milionów prób i błędów. Dlatego uczy się go zwykle w symulacji komputerowej, czyli w wirtualnym świecie przypominającym grę. Świat wirtualny różni się jednak od prawdziwego: inaczej wyglądają ściany, światło i przedmioty. Model sztucznej inteligencji wyuczony w symulacji często zawodzi, gdy zobaczy prawdziwe obrazy.</w:t>
+        <w:t xml:space="preserve">Roboty uczą się dziś samodzielnego działania, na przykład poruszania się po budynku lub chwytania przedmiotów, metodą prób i błędów. Potrzebują do tego milionów prób, więc zwykle ćwiczą w symulacji komputerowej. Coraz częściej jest nią cyfrowy bliźniak: wierna, fotorealistyczna kopia prawdziwego miejsca, którą metody sztucznej inteligencji potrafią odtworzyć z krótkiego filmu nagranego telefonem. Kopia nigdy nie jest jednak idealna. Bywa rozmyta, ma drobne zniekształcenia i inaczej oddaje światło. Robot, który świetnie radzi sobie w kopii, może więc zawieść w prawdziwym świecie. Dziś można to sprawdzić tylko, wypuszczając go do prawdziwego budynku, a to jest powolne i kosztowne.</w:t>
       </w:r>
     </w:p>
     <w:p>
@@ -7917,7 +7882,7 @@
           <w:rFonts w:cstheme="minorHAnsi"/>
           <w:lang w:val="pl-PL"/>
         </w:rPr>
-        <w:t xml:space="preserve">Celem rozprawy jest opracowanie metod uczenia maszynowego, które pozwolą sztucznej inteligencji dobrze działać w prawdziwym świecie przy bardzo małej ilości prawdziwych danych. Pomysł polega na nagraniu krótkiego filmu z danego miejsca, na przykład korytarza, biura lub stołu roboczego. Na jego podstawie metody sztucznej inteligencji odtwarzające trójwymiarowe sceny tworzą wierną, fotorealistyczną cyfrową kopię tego miejsca, tzw. cyfrowego bliźniaka. Opracujemy uniwersalny sposób budowania takich kopii i zmierzymy, ile kosztuje ich wykonanie i jak wiernie odwzorowują rzeczywistość. W tej kopii model może bezpiecznie i szybko ćwiczyć miliony razy. Zbadamy też, jak nauczyć model takiego „widzenia” świata, by obrazy z kopii i z rzeczywistości były dla niego podobne, oraz jak kilka prawdziwych prób może poprawić symulację. Głównym zadaniem testowym będzie nawigacja robota mobilnego. Metody zostaną sprawdzone przede wszystkim na publicznie dostępnych wirtualnych budynkach i zbiorach prawdziwych nagrań, a następnie potwierdzone na prawdziwym robocie w budynkach Politechniki Wrocławskiej. Aby pokazać, że podejście działa także w innych zadaniach, zastosujemy je również do chwytania i przenoszenia przedmiotów przez ramię robota, przede wszystkim w publicznie dostępnych symulatorach.</w:t>
+        <w:t xml:space="preserve">Celem rozprawy jest sprawdzenie, czy da się to przewidzieć wcześniej, zaglądając „do głowy” robota. Model sztucznej inteligencji, który steruje robotem, przetwarza każdy obraz na wewnętrzny opis tego, co widzi. Zbadamy, czy obraz z kopii i obraz z rzeczywistości tego samego miejsca są przez model opisywane podobnie, w której części modelu pojawiają się różnice i jak maleją, gdy nagranie jest dłuższe. Następnie nauczymy osobny model przewidywać na podstawie tych wewnętrznych opisów, jak dobrze robot poradzi sobie w rzeczywistości i kiedy może popełnić błąd, zanim zostanie tam wysłany. Na koniec sprawdzimy, czy takie prognozy pomagają mądrze wydać niewielki zasób prawdziwych danych: co warto nagrać i które próby w rzeczywistości przeprowadzić. Głównym zadaniem testowym będzie nawigacja robota mobilnego, a sprawdzianem uniwersalności chwytanie przedmiotów ramieniem robota. Badania będą prowadzone przede wszystkim na publicznie dostępnych nagraniach i trójwymiarowych skanach prawdziwych budynków, a wybrane wyniki zostaną potwierdzone na prawdziwym robocie.</w:t>
       </w:r>
     </w:p>
     <w:p>
@@ -7930,7 +7895,7 @@
           <w:rFonts w:cstheme="minorHAnsi"/>
           <w:lang w:val="pl-PL"/>
         </w:rPr>
-        <w:t xml:space="preserve">Badania pokażą, ile prawdziwych danych naprawdę potrzeba, aby wyuczony model działał niezawodnie, oraz jak sprawić, by radził sobie również w miejscach, których wcześniej nie widział, i w innych zadaniach. Spodziewanym efektem jest znaczne obniżenie kosztu i czasu wdrażania systemów sztucznej inteligencji w nowych miejscach, co może przyspieszyć wykorzystanie robotów w logistyce, opiece i przemyśle. Opracowane oprogramowanie i dane zostaną udostępnione publicznie.</w:t>
+        <w:t xml:space="preserve">Spodziewanym efektem są metody, które pozwolą ocenić robota wyuczonego w cyfrowej kopii, zanim trafi do prawdziwego świata, oraz zmniejszyć liczbę kosztownych prób w rzeczywistości. Może to przyspieszyć i potanić wdrażanie robotów w magazynach, szpitalach, biurach i fabrykach. Opracowane oprogramowanie, dane i wyuczone modele zostaną udostępnione publicznie.</w:t>
       </w:r>
     </w:p>
     <w:permEnd w:id="301016009"/>
@@ -7985,7 +7950,7 @@
           <w:rFonts w:cstheme="minorHAnsi"/>
           <w:lang w:val="en-US"/>
         </w:rPr>
-        <w:t xml:space="preserve">Modern artificial intelligence learns from examples, and it usually needs an enormous number of them. In many applications, however, good examples come only from the real world, where collecting them is slow, expensive and sometimes risky. Robots, for example in warehouses, hospitals, offices or factories, are a good example. For a robot to learn to move or grasp objects on its own, it needs millions of trials and errors. That is why it is usually trained in a computer simulation, a virtual world similar to a video game. The virtual world, however, differs from the real one: walls, light and objects look different. An artificial intelligence model trained in simulation often fails when it sees real images.</w:t>
+        <w:t xml:space="preserve">Robots today learn to act on their own, for example to move around a building or to grasp objects, by trial and error. They need millions of trials, so they usually practise in a computer simulation. Increasingly, this is a digital twin: a faithful, photorealistic copy of a real place that artificial intelligence methods can reconstruct from a short video recorded with a phone. The copy, however, is never perfect. It can be blurry, have small distortions and render light differently. A robot that does very well in the copy may therefore fail in the real world. Today this can only be checked by sending it into a real building, which is slow and costly.</w:t>
       </w:r>
     </w:p>
     <w:p>
@@ -7998,7 +7963,7 @@
           <w:rFonts w:cstheme="minorHAnsi"/>
           <w:lang w:val="en-US"/>
         </w:rPr>
-        <w:t xml:space="preserve">The goal of this dissertation is to develop machine learning methods that let artificial intelligence work well in the real world using very little real data. The idea is to record a short video of a place, such as a corridor, an office or a workbench. From this video, artificial intelligence methods that reconstruct three-dimensional scenes create a faithful, photorealistic digital copy of the place, a so-called digital twin. We will develop a universal way of building such copies and measure how much they cost to make and how faithfully they reproduce reality. In this copy the model can practice safely and quickly millions of times. We will also study how to teach the model to "see" the world so that images from the copy and from reality look similar to it, and how a few real trials can correct the simulation. Mobile-robot navigation will be the main test task. The methods will be tested mainly on publicly available virtual buildings and collections of real recordings, and then confirmed on a real robot in the buildings of Wrocław University of Science and Technology. To show that the approach also works in other tasks, we will also apply it to grasping and moving objects with a robot arm, mainly in publicly available simulators.</w:t>
+        <w:t xml:space="preserve">The goal of this dissertation is to find out whether this can be predicted earlier by looking "inside the head" of the robot. The artificial intelligence model that controls the robot turns every image into an internal description of what it sees. We will study whether an image from the copy and an image from reality of the same place are described similarly by the model, in which part of the model differences appear, and how they shrink when the recording is longer. Next, we will teach a separate model to predict from these internal descriptions how well the robot will cope in reality and when it may make a mistake, before it is sent there. Finally, we will check whether such forecasts help to spend a small amount of real data wisely: what is worth recording and which trials in reality to carry out. Mobile-robot navigation will be the main test task, and grasping objects with a robot arm will test how universal the approach is. The research will be carried out mainly on publicly available recordings and three-dimensional scans of real buildings, and selected results will be confirmed on a real robot.</w:t>
       </w:r>
     </w:p>
     <w:p>
@@ -8011,7 +7976,7 @@
           <w:rFonts w:cstheme="minorHAnsi"/>
           <w:lang w:val="en-US"/>
         </w:rPr>
-        <w:t xml:space="preserve">The research will show how much real data is truly needed for a trained model to work reliably, and how to make it cope with places it has never seen before and with other tasks. The expected result is a significant reduction in the cost and time of deploying artificial intelligence systems in new places, which may speed up the use of robots in logistics, care and industry. The software and data developed will be made publicly available.</w:t>
+        <w:t xml:space="preserve">The expected result is methods that make it possible to assess a robot trained in a digital copy before it reaches the real world, and to reduce the number of costly trials in reality. This may make deploying robots in warehouses, hospitals, offices and factories faster and cheaper. The software, data and trained models developed will be made publicly available.</w:t>
       </w:r>
     </w:p>
     <w:permEnd w:id="305530072"/>
@@ -8402,7 +8367,22 @@
           <w:rFonts w:cstheme="minorHAnsi"/>
           <w:lang w:val="en-US"/>
         </w:rPr>
-        <w:t xml:space="preserve">Paper submitted for review to the </w:t>
+        <w:t xml:space="preserve">Paper </w:t>
+      </w:r>
+      <w:r>
+        <w:rPr>
+          <w:rFonts w:cstheme="minorHAnsi"/>
+          <w:b/>
+          <w:lang w:val="en-US"/>
+        </w:rPr>
+        <w:t xml:space="preserve">P1</w:t>
+      </w:r>
+      <w:r>
+        <w:rPr>
+          <w:rFonts w:cstheme="minorHAnsi"/>
+          <w:lang w:val="en-US"/>
+        </w:rPr>
+        <w:t xml:space="preserve"> submitted for review to the </w:t>
       </w:r>
       <w:r>
         <w:rPr>
@@ -8417,7 +8397,7 @@
           <w:rFonts w:cstheme="minorHAnsi"/>
           <w:lang w:val="en-US"/>
         </w:rPr>
-        <w:t xml:space="preserve">, peer-reviewed international conference proceedings worth </w:t>
+        <w:t xml:space="preserve">, main track or Datasets &amp; Benchmarks track. NeurIPS is peer-reviewed international conference proceedings worth </w:t>
       </w:r>
       <w:r>
         <w:rPr>
@@ -8447,22 +8427,22 @@
           <w:rFonts w:cstheme="minorHAnsi"/>
           <w:lang w:val="en-US"/>
         </w:rPr>
-        <w:t xml:space="preserve">. It reports Stages I–II (learning from reconstructed scenes and the first real-data-budget curve on public benchmarks; task T4.2). If the results are ready earlier, the paper goes to </w:t>
-      </w:r>
-      <w:r>
-        <w:rPr>
-          <w:rFonts w:cstheme="minorHAnsi"/>
-          <w:b/>
-          <w:lang w:val="en-US"/>
-        </w:rPr>
-        <w:t xml:space="preserve">ICML 2027</w:t>
-      </w:r>
-      <w:r>
-        <w:rPr>
-          <w:rFonts w:cstheme="minorHAnsi"/>
-          <w:lang w:val="en-US"/>
-        </w:rPr>
-        <w:t xml:space="preserve"> (expected deadline late January 2027, also 200 points). If it is rejected, the revised paper is resubmitted to the next 200-point conference (§12).</w:t>
+        <w:t xml:space="preserve">. P1 reports Stage I (RQ1): a benchmark of paired real and twin-rendered frames and the localization of the twin-vs-real gap inside frozen encoders and twin-trained policies (task T4.2). If it is rejected, the revised paper goes to </w:t>
+      </w:r>
+      <w:r>
+        <w:rPr>
+          <w:rFonts w:cstheme="minorHAnsi"/>
+          <w:b/>
+          <w:lang w:val="en-US"/>
+        </w:rPr>
+        <w:t xml:space="preserve">CVPR 2028</w:t>
+      </w:r>
+      <w:r>
+        <w:rPr>
+          <w:rFonts w:cstheme="minorHAnsi"/>
+          <w:lang w:val="en-US"/>
+        </w:rPr>
+        <w:t xml:space="preserve"> (expected deadline November 2027, also 200 points), and then to the next 200-point conference (§12).</w:t>
       </w:r>
     </w:p>
     <w:permEnd w:id="641100817"/>
@@ -8744,9 +8724,10 @@
       </w:tblPr>
       <w:tblGrid>
         <w:gridCol w:w="1269"/>
-        <w:gridCol w:w="4525"/>
-        <w:gridCol w:w="1456"/>
-        <w:gridCol w:w="1822"/>
+        <w:gridCol w:w="3540"/>
+        <w:gridCol w:w="1269"/>
+        <w:gridCol w:w="1383"/>
+        <w:gridCol w:w="1611"/>
       </w:tblGrid>
       <w:tr>
         <w:tc>
@@ -8770,7 +8751,7 @@
         </w:tc>
         <w:tc>
           <w:tcPr>
-            <w:tcW w:w="4525" w:type="dxa"/>
+            <w:tcW w:w="3540" w:type="dxa"/>
           </w:tcPr>
           <w:p>
             <w:pPr>
@@ -8789,7 +8770,7 @@
         </w:tc>
         <w:tc>
           <w:tcPr>
-            <w:tcW w:w="1456" w:type="dxa"/>
+            <w:tcW w:w="1269" w:type="dxa"/>
           </w:tcPr>
           <w:p>
             <w:pPr>
@@ -8802,13 +8783,32 @@
                 <w:b/>
                 <w:lang w:val="en-US"/>
               </w:rPr>
-              <w:t xml:space="preserve">Grants</w:t>
+              <w:t xml:space="preserve">Data and code</w:t>
             </w:r>
           </w:p>
         </w:tc>
         <w:tc>
           <w:tcPr>
-            <w:tcW w:w="1822" w:type="dxa"/>
+            <w:tcW w:w="1383" w:type="dxa"/>
+          </w:tcPr>
+          <w:p>
+            <w:pPr>
+              <w:spacing w:after="0" w:line="240" w:lineRule="auto"/>
+              <w:jc w:val="left"/>
+            </w:pPr>
+            <w:r>
+              <w:rPr>
+                <w:rFonts w:cstheme="minorHAnsi"/>
+                <w:b/>
+                <w:lang w:val="en-US"/>
+              </w:rPr>
+              <w:t xml:space="preserve">Grants</w:t>
+            </w:r>
+          </w:p>
+        </w:tc>
+        <w:tc>
+          <w:tcPr>
+            <w:tcW w:w="1611" w:type="dxa"/>
           </w:tcPr>
           <w:p>
             <w:pPr>
@@ -8847,7 +8847,7 @@
         </w:tc>
         <w:tc>
           <w:tcPr>
-            <w:tcW w:w="4525" w:type="dxa"/>
+            <w:tcW w:w="3540" w:type="dxa"/>
           </w:tcPr>
           <w:p>
             <w:pPr>
@@ -8865,7 +8865,7 @@
         </w:tc>
         <w:tc>
           <w:tcPr>
-            <w:tcW w:w="1456" w:type="dxa"/>
+            <w:tcW w:w="1269" w:type="dxa"/>
           </w:tcPr>
           <w:p>
             <w:pPr>
@@ -8883,7 +8883,25 @@
         </w:tc>
         <w:tc>
           <w:tcPr>
-            <w:tcW w:w="1822" w:type="dxa"/>
+            <w:tcW w:w="1383" w:type="dxa"/>
+          </w:tcPr>
+          <w:p>
+            <w:pPr>
+              <w:spacing w:after="0" w:line="240" w:lineRule="auto"/>
+              <w:jc w:val="left"/>
+            </w:pPr>
+            <w:r>
+              <w:rPr>
+                <w:rFonts w:cstheme="minorHAnsi"/>
+                <w:lang w:val="en-US"/>
+              </w:rPr>
+              <w:t xml:space="preserve">—</w:t>
+            </w:r>
+          </w:p>
+        </w:tc>
+        <w:tc>
+          <w:tcPr>
+            <w:tcW w:w="1611" w:type="dxa"/>
           </w:tcPr>
           <w:p>
             <w:pPr>
@@ -8921,7 +8939,7 @@
         </w:tc>
         <w:tc>
           <w:tcPr>
-            <w:tcW w:w="4525" w:type="dxa"/>
+            <w:tcW w:w="3540" w:type="dxa"/>
           </w:tcPr>
           <w:p>
             <w:pPr>
@@ -8933,13 +8951,13 @@
                 <w:rFonts w:cstheme="minorHAnsi"/>
                 <w:lang w:val="en-US"/>
               </w:rPr>
-              <w:t xml:space="preserve">P1, Stages I–II: NeurIPS 2027, May 2027 (§11); early option ICML 2027</w:t>
+              <w:t xml:space="preserve">P1 (RQ1, paired-frame benchmark and gap localization): NeurIPS 2027, May 2027 (§11)</w:t>
             </w:r>
           </w:p>
         </w:tc>
         <w:tc>
           <w:tcPr>
-            <w:tcW w:w="1456" w:type="dxa"/>
+            <w:tcW w:w="1269" w:type="dxa"/>
           </w:tcPr>
           <w:p>
             <w:pPr>
@@ -8951,13 +8969,31 @@
                 <w:rFonts w:cstheme="minorHAnsi"/>
                 <w:lang w:val="en-US"/>
               </w:rPr>
-              <w:t xml:space="preserve">SzD Minigrant; NCN PRELUDIUM</w:t>
+              <w:t xml:space="preserve">Benchmark v1</w:t>
             </w:r>
           </w:p>
         </w:tc>
         <w:tc>
           <w:tcPr>
-            <w:tcW w:w="1822" w:type="dxa"/>
+            <w:tcW w:w="1383" w:type="dxa"/>
+          </w:tcPr>
+          <w:p>
+            <w:pPr>
+              <w:spacing w:after="0" w:line="240" w:lineRule="auto"/>
+              <w:jc w:val="left"/>
+            </w:pPr>
+            <w:r>
+              <w:rPr>
+                <w:rFonts w:cstheme="minorHAnsi"/>
+                <w:lang w:val="en-US"/>
+              </w:rPr>
+              <w:t xml:space="preserve">SzD Minigrant; NCN PRELUDIUM</w:t>
+            </w:r>
+          </w:p>
+        </w:tc>
+        <w:tc>
+          <w:tcPr>
+            <w:tcW w:w="1611" w:type="dxa"/>
           </w:tcPr>
           <w:p>
             <w:pPr>
@@ -8995,7 +9031,7 @@
         </w:tc>
         <w:tc>
           <w:tcPr>
-            <w:tcW w:w="4525" w:type="dxa"/>
+            <w:tcW w:w="3540" w:type="dxa"/>
           </w:tcPr>
           <w:p>
             <w:pPr>
@@ -9007,13 +9043,13 @@
                 <w:rFonts w:cstheme="minorHAnsi"/>
                 <w:lang w:val="en-US"/>
               </w:rPr>
-              <w:t xml:space="preserve">P2 (Stage III): CVPR or ICLR 2028; P3 (Stage IV, cross-task): ECCV, NeurIPS or RSS 2028</w:t>
+              <w:t xml:space="preserve">P2 (RQ2, forecasting transfer and failure): CVPR or ICLR 2028; P3 (RQ3–RQ4, budget allocation, manipulation): NeurIPS or ECCV 2028</w:t>
             </w:r>
           </w:p>
         </w:tc>
         <w:tc>
           <w:tcPr>
-            <w:tcW w:w="1456" w:type="dxa"/>
+            <w:tcW w:w="1269" w:type="dxa"/>
           </w:tcPr>
           <w:p>
             <w:pPr>
@@ -9025,13 +9061,31 @@
                 <w:rFonts w:cstheme="minorHAnsi"/>
                 <w:lang w:val="en-US"/>
               </w:rPr>
-              <w:t xml:space="preserve">NAWA Bekker</w:t>
+              <w:t xml:space="preserve">Policy zoo</w:t>
             </w:r>
           </w:p>
         </w:tc>
         <w:tc>
           <w:tcPr>
-            <w:tcW w:w="1822" w:type="dxa"/>
+            <w:tcW w:w="1383" w:type="dxa"/>
+          </w:tcPr>
+          <w:p>
+            <w:pPr>
+              <w:spacing w:after="0" w:line="240" w:lineRule="auto"/>
+              <w:jc w:val="left"/>
+            </w:pPr>
+            <w:r>
+              <w:rPr>
+                <w:rFonts w:cstheme="minorHAnsi"/>
+                <w:lang w:val="en-US"/>
+              </w:rPr>
+              <w:t xml:space="preserve">NAWA Bekker</w:t>
+            </w:r>
+          </w:p>
+        </w:tc>
+        <w:tc>
+          <w:tcPr>
+            <w:tcW w:w="1611" w:type="dxa"/>
           </w:tcPr>
           <w:p>
             <w:pPr>
@@ -9069,7 +9123,7 @@
         </w:tc>
         <w:tc>
           <w:tcPr>
-            <w:tcW w:w="4525" w:type="dxa"/>
+            <w:tcW w:w="3540" w:type="dxa"/>
           </w:tcPr>
           <w:p>
             <w:pPr>
@@ -9087,7 +9141,7 @@
         </w:tc>
         <w:tc>
           <w:tcPr>
-            <w:tcW w:w="1456" w:type="dxa"/>
+            <w:tcW w:w="1269" w:type="dxa"/>
           </w:tcPr>
           <w:p>
             <w:pPr>
@@ -9099,13 +9153,13 @@
                 <w:rFonts w:cstheme="minorHAnsi"/>
                 <w:lang w:val="en-US"/>
               </w:rPr>
-              <w:t xml:space="preserve">—</w:t>
+              <w:t xml:space="preserve">Full release</w:t>
             </w:r>
           </w:p>
         </w:tc>
         <w:tc>
           <w:tcPr>
-            <w:tcW w:w="1822" w:type="dxa"/>
+            <w:tcW w:w="1383" w:type="dxa"/>
           </w:tcPr>
           <w:p>
             <w:pPr>
@@ -9117,7 +9171,25 @@
                 <w:rFonts w:cstheme="minorHAnsi"/>
                 <w:lang w:val="en-US"/>
               </w:rPr>
-              <w:t xml:space="preserve">Code and data release; dissertation</w:t>
+              <w:t xml:space="preserve">—</w:t>
+            </w:r>
+          </w:p>
+        </w:tc>
+        <w:tc>
+          <w:tcPr>
+            <w:tcW w:w="1611" w:type="dxa"/>
+          </w:tcPr>
+          <w:p>
+            <w:pPr>
+              <w:spacing w:after="0" w:line="240" w:lineRule="auto"/>
+              <w:jc w:val="left"/>
+            </w:pPr>
+            <w:r>
+              <w:rPr>
+                <w:rFonts w:cstheme="minorHAnsi"/>
+                <w:lang w:val="en-US"/>
+              </w:rPr>
+              <w:t xml:space="preserve">Dissertation</w:t>
             </w:r>
           </w:p>
         </w:tc>
@@ -9160,7 +9232,7 @@
           <w:rFonts w:cstheme="minorHAnsi"/>
           <w:lang w:val="en-US"/>
         </w:rPr>
-        <w:t xml:space="preserve"> (1) Multi-robot Systems Lab, Stanford University (M. Schwager): Gaussian-splatting scene models and navigation. (2) Z. Kira's group, Georgia Tech: EmbodiedSplat [30]. A European host (which also opens the Erasmus+ 5–30-day route) is sought with the supervisor in sem. 4, with a foreign co-author for P2.</w:t>
+        <w:t xml:space="preserve"> (1) Z. Kira's group, Georgia Tech: EmbodiedSplat [4]. (2) Multi-robot Systems Lab, Stanford University (M. Schwager): Gaussian-splatting scene models and navigation. A European host (Erasmus+ route) and a foreign co-author for P2 are sought with the supervisor in sem. 4.</w:t>
       </w:r>
     </w:p>
     <w:p>
@@ -9196,7 +9268,7 @@
           <w:rFonts w:cstheme="minorHAnsi"/>
           <w:lang w:val="en-US"/>
         </w:rPr>
-        <w:t xml:space="preserve"> Autonomous Robots Laboratory (K29, W12N; Pioneer 3-DX, Jaguar 4x4, ROS 2); a written agreement is task T3.2 (Nov 2026). Optional manipulation validation may use K29's Robotics Laboratory arms. Consultations on 3D reconstruction with K46's genwro.AI group are possible.</w:t>
+        <w:t xml:space="preserve"> Autonomous Robots Laboratory (K29, W12N; Pioneer 3-DX, Jaguar 4x4, ROS 2); a written agreement is task T3.2 (Nov 2026).</w:t>
       </w:r>
     </w:p>
     <w:p>
@@ -9239,14 +9311,14 @@
           <w:i/>
           <w:lang w:val="en-US"/>
         </w:rPr>
-        <w:t xml:space="preserve">Rejection at a top venue</w:t>
-      </w:r>
-      <w:r>
-        <w:rPr>
-          <w:rFonts w:cstheme="minorHAnsi"/>
-          <w:lang w:val="en-US"/>
-        </w:rPr>
-        <w:t xml:space="preserve"> (4–7): every paper has a resubmission path inside the 200-point set, to the next deadline 2–4 months later (e.g. NeurIPS → ICLR or CVPR → ICML → ECCV/ICCV), after revision. With three core papers and several yearly deadlines, the degree requirement does not depend on one decision.</w:t>
+        <w:t xml:space="preserve">Policy zoo too small</w:t>
+      </w:r>
+      <w:r>
+        <w:rPr>
+          <w:rFonts w:cstheme="minorHAnsi"/>
+          <w:lang w:val="en-US"/>
+        </w:rPr>
+        <w:t xml:space="preserve"> (4–5): small policies, shared frozen encoders, imitation of a privileged planner; the sem. 3 pilot fixes the size; WCSS and PLGrid grants.</w:t>
       </w:r>
     </w:p>
     <w:p>
@@ -9268,14 +9340,14 @@
           <w:i/>
           <w:lang w:val="en-US"/>
         </w:rPr>
-        <w:t xml:space="preserve">Changing venue points</w:t>
-      </w:r>
-      <w:r>
-        <w:rPr>
-          <w:rFonts w:cstheme="minorHAnsi"/>
-          <w:lang w:val="en-US"/>
-        </w:rPr>
-        <w:t xml:space="preserve"> (sem. 3–4): the new list may change points; venues are re-checked when it appears, and the plan keeps several 200-point alternatives per paper.</w:t>
+        <w:t xml:space="preserve">Twin–real pairs unavailable</w:t>
+      </w:r>
+      <w:r>
+        <w:rPr>
+          <w:rFonts w:cstheme="minorHAnsi"/>
+          <w:lang w:val="en-US"/>
+        </w:rPr>
+        <w:t xml:space="preserve"> (3): licence or quality limits on the chosen dataset. Other public datasets with real captures and reference scans, and own captures at PWr.</w:t>
       </w:r>
     </w:p>
     <w:p>
@@ -9297,14 +9369,14 @@
           <w:i/>
           <w:lang w:val="en-US"/>
         </w:rPr>
-        <w:t xml:space="preserve">No robot access or sensor</w:t>
-      </w:r>
-      <w:r>
-        <w:rPr>
-          <w:rFonts w:cstheme="minorHAnsi"/>
-          <w:lang w:val="en-US"/>
-        </w:rPr>
-        <w:t xml:space="preserve"> (3–5): hypotheses are decided on public benchmarks and datasets; the robot only validates, so it can move by a semester or to another PWr robot.</w:t>
+        <w:t xml:space="preserve">Scooping</w:t>
+      </w:r>
+      <w:r>
+        <w:rPr>
+          <w:rFonts w:cstheme="minorHAnsi"/>
+          <w:lang w:val="en-US"/>
+        </w:rPr>
+        <w:t xml:space="preserve"> (3–6): related lines (failure detection, policy interpretability) move fast. Early preprints and benchmark release, monthly literature monitoring; the zoo and weight-space angle differentiate the work.</w:t>
       </w:r>
     </w:p>
     <w:p>
@@ -9326,14 +9398,14 @@
           <w:i/>
           <w:lang w:val="en-US"/>
         </w:rPr>
-        <w:t xml:space="preserve">Poor reconstruction of low-texture or large scenes</w:t>
-      </w:r>
-      <w:r>
-        <w:rPr>
-          <w:rFonts w:cstheme="minorHAnsi"/>
-          <w:lang w:val="en-US"/>
-        </w:rPr>
-        <w:t xml:space="preserve"> (3–4): depth priors, scene splitting, other scenes from the public dataset.</w:t>
+        <w:t xml:space="preserve">Predictor learns only twin fidelity</w:t>
+      </w:r>
+      <w:r>
+        <w:rPr>
+          <w:rFonts w:cstheme="minorHAnsi"/>
+          <w:lang w:val="en-US"/>
+        </w:rPr>
+        <w:t xml:space="preserve"> (5): ablations with fixed fidelity; a negative result still answers RQ2.</w:t>
       </w:r>
     </w:p>
     <w:p>
@@ -9355,14 +9427,14 @@
           <w:i/>
           <w:lang w:val="en-US"/>
         </w:rPr>
-        <w:t xml:space="preserve">Sim-to-real predictivity fails</w:t>
-      </w:r>
-      <w:r>
-        <w:rPr>
-          <w:rFonts w:cstheme="minorHAnsi"/>
-          <w:lang w:val="en-US"/>
-        </w:rPr>
-        <w:t xml:space="preserve"> (4–5): pre-specified SRCC protocol; a negative result still answers RQ4.</w:t>
+        <w:t xml:space="preserve">Proxy reality differs from reality</w:t>
+      </w:r>
+      <w:r>
+        <w:rPr>
+          <w:rFonts w:cstheme="minorHAnsi"/>
+          <w:lang w:val="en-US"/>
+        </w:rPr>
+        <w:t xml:space="preserve"> (5–7): tier C campaigns check agreement; they can move by a semester.</w:t>
       </w:r>
     </w:p>
     <w:p>
@@ -9384,14 +9456,29 @@
           <w:i/>
           <w:lang w:val="en-US"/>
         </w:rPr>
-        <w:t xml:space="preserve">Scope creep from manipulation</w:t>
-      </w:r>
-      <w:r>
-        <w:rPr>
-          <w:rFonts w:cstheme="minorHAnsi"/>
-          <w:lang w:val="en-US"/>
-        </w:rPr>
-        <w:t xml:space="preserve"> (6–7): a generalization study on the Stage I pipeline and public simulators; if time is short, it is reduced to simulation-only experiments.</w:t>
+        <w:t xml:space="preserve">Rejection at a top venue</w:t>
+      </w:r>
+      <w:r>
+        <w:rPr>
+          <w:rFonts w:cstheme="minorHAnsi"/>
+          <w:lang w:val="en-US"/>
+        </w:rPr>
+        <w:t xml:space="preserve"> (4–7): every paper has a resubmission path inside the 200-point set, 2–4 months later (e.g. NeurIPS → CVPR → ICML → ECCV/ICCV). The degree requirement does not depend on one decision. </w:t>
+      </w:r>
+      <w:r>
+        <w:rPr>
+          <w:rFonts w:cstheme="minorHAnsi"/>
+          <w:i/>
+          <w:lang w:val="en-US"/>
+        </w:rPr>
+        <w:t xml:space="preserve">Changing venue points</w:t>
+      </w:r>
+      <w:r>
+        <w:rPr>
+          <w:rFonts w:cstheme="minorHAnsi"/>
+          <w:lang w:val="en-US"/>
+        </w:rPr>
+        <w:t xml:space="preserve"> (3–4): venues are re-checked when the new list appears.</w:t>
       </w:r>
     </w:p>
     <w:p>
@@ -9412,7 +9499,7 @@
           <w:rFonts w:cstheme="minorHAnsi"/>
           <w:lang w:val="en-US"/>
         </w:rPr>
-        <w:t xml:space="preserve"> A pre-PhD NLP paper (ACL 2025 SRW) gives experience in representation learning; it is not part of the dissertation.</w:t>
+        <w:t xml:space="preserve"> A pre-PhD NLP paper (ACL 2025 SRW) forecasts from hidden states with a graph neural network over layers; Stage II adapts the method, but the paper is not part of the dissertation.</w:t>
       </w:r>
     </w:p>
     <w:p>
@@ -9433,7 +9520,7 @@
           <w:rFonts w:cstheme="minorHAnsi"/>
           <w:lang w:val="en-US"/>
         </w:rPr>
-        <w:t xml:space="preserve"> Own captures avoid or anonymize personal data (GDPR, PWr rules); public datasets are used under their licences.</w:t>
+        <w:t xml:space="preserve"> Own captures anonymize personal data (GDPR); public datasets are used under their licences.</w:t>
       </w:r>
     </w:p>
     <w:permEnd w:id="1742865563"/>

</xml_diff>

<commit_message>
Wave 10: review-2 of pivoted IPB, P0/P1 fixes applied, docx rebuilt
Closes #24

Co-Authored-By: Claude Opus 5.5 <noreply@anthropic.com>
</commit_message>
<xml_diff>
--- a/output/IPB_Grzegorz_Piotrowski.docx
+++ b/output/IPB_Grzegorz_Piotrowski.docx
@@ -2462,7 +2462,22 @@
                 <w:rFonts w:cstheme="minorHAnsi"/>
                 <w:lang w:val="en-US"/>
               </w:rPr>
-              <w:t xml:space="preserve"> Navigation policies on each frozen encoder trained in the twins and tested in proxy reality (tier A); robustness ranking vs. twin→real success; gap localization inside twin-trained policies; generation of the policy zoo (≥ 200 navigation policies with twin and proxy-real labels). </w:t>
+              <w:t xml:space="preserve"> Navigation policies on each frozen encoder trained in the twins and tested in proxy reality (tier A); robustness ranking vs. twin→real success (first result for P1 </w:t>
+            </w:r>
+            <w:r>
+              <w:rPr>
+                <w:rFonts w:cstheme="minorHAnsi"/>
+                <w:b/>
+                <w:lang w:val="en-US"/>
+              </w:rPr>
+              <w:t xml:space="preserve">by Apr 2027</w:t>
+            </w:r>
+            <w:r>
+              <w:rPr>
+                <w:rFonts w:cstheme="minorHAnsi"/>
+                <w:lang w:val="en-US"/>
+              </w:rPr>
+              <w:t xml:space="preserve">); gap localization inside twin-trained policies; generation of the policy zoo (≥ 200 navigation policies with twin and proxy-real labels). </w:t>
             </w:r>
             <w:r>
               <w:rPr>
@@ -2543,7 +2558,7 @@
                 <w:rFonts w:cstheme="minorHAnsi"/>
                 <w:lang w:val="en-US"/>
               </w:rPr>
-              <w:t xml:space="preserve"> (paired-frame benchmark and gap localization, RQ1; Datasets &amp; Benchmarks or main track). </w:t>
+              <w:t xml:space="preserve"> (paired-frame benchmark and gap localization in frozen encoders, H1(a–c), with the first H1(d) result; RQ1; Datasets &amp; Benchmarks or main track). </w:t>
             </w:r>
             <w:r>
               <w:rPr>
@@ -2594,7 +2609,7 @@
                 <w:rFonts w:cstheme="minorHAnsi"/>
                 <w:lang w:val="en-US"/>
               </w:rPr>
-              <w:t xml:space="preserve"> Grants, international activity and mid-term: NCN PRELUDIUM application; poster at an international summer school; foreign co-author sought for P2; NAWA Bekker application for the sem. 6 visit; autoreferat (≤ 5 pages) and 15-min presentation (~mid-Oct 2027). </w:t>
+              <w:t xml:space="preserve"> Grants and international activity: NCN PRELUDIUM application; poster at an international summer school; foreign co-author sought for P2; NAWA Bekker application for the sem. 6 visit. </w:t>
             </w:r>
             <w:r>
               <w:rPr>
@@ -2609,7 +2624,7 @@
                 <w:rFonts w:cstheme="minorHAnsi"/>
                 <w:lang w:val="en-US"/>
               </w:rPr>
-              <w:t xml:space="preserve"> applications, poster, autoreferat.</w:t>
+              <w:t xml:space="preserve"> applications, poster.</w:t>
             </w:r>
             <w:permEnd w:id="379417658"/>
           </w:p>
@@ -2694,7 +2709,7 @@
                 <w:rFonts w:cstheme="minorHAnsi"/>
                 <w:lang w:val="en-US"/>
               </w:rPr>
-              <w:t xml:space="preserve"> (Nov 2027). </w:t>
+              <w:t xml:space="preserve"> (Nov 2027): autoreferat (≤ 5 pages, ~mid-Oct 2027) and 15-min presentation. </w:t>
             </w:r>
             <w:r>
               <w:rPr>
@@ -2723,7 +2738,7 @@
                 <w:rFonts w:cstheme="minorHAnsi"/>
                 <w:lang w:val="en-US"/>
               </w:rPr>
-              <w:t xml:space="preserve"> Transfer predictors on the zoo (graph neural network over layers, weight-space metanetwork) vs. baselines (twin SR, PSNR/LPIPS, simulator-level predictivity) on held-out scenes; hidden-state failure monitors calibrated conformally in the twin and tested on real data (tiers A, B). </w:t>
+              <w:t xml:space="preserve"> Transfer predictors on the zoo (graph neural network over layers, weight-space metanetwork) vs. baselines (twin SR, PSNR/LPIPS, simulator-level predictivity) on held-out scenes; hidden-state failure monitors calibrated conformally in the twin and tested in proxy reality (tier A); Stage III set-up (allocation levers implemented, Jan–Feb 2028). </w:t>
             </w:r>
             <w:r>
               <w:rPr>
@@ -2984,7 +2999,7 @@
                 <w:rFonts w:cstheme="minorHAnsi"/>
                 <w:lang w:val="en-US"/>
               </w:rPr>
-              <w:t xml:space="preserve"> policy zoo in ManiSkill3 twins, labels from SIMPLER paired sim/real evaluations; the navigation predictor applied without retraining, compared with generic-simulator SRCC and a frozen world-model evaluator. </w:t>
+              <w:t xml:space="preserve"> public policies with published SIMPLER paired sim/real results (≥ 12 policy–task pairs); the navigation predictor applied without retraining, compared with generic-simulator SRCC and a frozen world-model evaluator. </w:t>
             </w:r>
             <w:r>
               <w:rPr>
@@ -3007,14 +3022,59 @@
                 <w:b/>
                 <w:lang w:val="en-US"/>
               </w:rPr>
-              <w:t xml:space="preserve">H3 and H4 completed</w:t>
-            </w:r>
-            <w:r>
-              <w:rPr>
-                <w:rFonts w:cstheme="minorHAnsi"/>
-                <w:lang w:val="en-US"/>
-              </w:rPr>
-              <w:t xml:space="preserve"> on tiers A–B. Place: K46, WCSS.</w:t>
+              <w:t xml:space="preserve">H3 completed</w:t>
+            </w:r>
+            <w:r>
+              <w:rPr>
+                <w:rFonts w:cstheme="minorHAnsi"/>
+                <w:lang w:val="en-US"/>
+              </w:rPr>
+              <w:t xml:space="preserve"> (tier A, </w:t>
+            </w:r>
+            <w:r>
+              <w:rPr>
+                <w:rFonts w:cstheme="minorHAnsi"/>
+                <w:b/>
+                <w:lang w:val="en-US"/>
+              </w:rPr>
+              <w:t xml:space="preserve">by Apr 2028</w:t>
+            </w:r>
+            <w:r>
+              <w:rPr>
+                <w:rFonts w:cstheme="minorHAnsi"/>
+                <w:lang w:val="en-US"/>
+              </w:rPr>
+              <w:t xml:space="preserve">), </w:t>
+            </w:r>
+            <w:r>
+              <w:rPr>
+                <w:rFonts w:cstheme="minorHAnsi"/>
+                <w:b/>
+                <w:lang w:val="en-US"/>
+              </w:rPr>
+              <w:t xml:space="preserve">H4 completed</w:t>
+            </w:r>
+            <w:r>
+              <w:rPr>
+                <w:rFonts w:cstheme="minorHAnsi"/>
+                <w:lang w:val="en-US"/>
+              </w:rPr>
+              <w:t xml:space="preserve"> (tier B, </w:t>
+            </w:r>
+            <w:r>
+              <w:rPr>
+                <w:rFonts w:cstheme="minorHAnsi"/>
+                <w:b/>
+                <w:lang w:val="en-US"/>
+              </w:rPr>
+              <w:t xml:space="preserve">by Sep 2028</w:t>
+            </w:r>
+            <w:r>
+              <w:rPr>
+                <w:rFonts w:cstheme="minorHAnsi"/>
+                <w:lang w:val="en-US"/>
+              </w:rPr>
+              <w:t xml:space="preserve">). Place: K46, WCSS.</w:t>
             </w:r>
           </w:p>
           <w:p>
@@ -3101,7 +3161,7 @@
                 <w:rFonts w:cstheme="minorHAnsi"/>
                 <w:lang w:val="en-US"/>
               </w:rPr>
-              <w:t xml:space="preserve"> (budget allocation and cross-task transfer) submitted to </w:t>
+              <w:t xml:space="preserve"> (budget allocation with the first cross-task results) submitted to </w:t>
             </w:r>
             <w:r>
               <w:rPr>
@@ -3116,7 +3176,7 @@
                 <w:rFonts w:cstheme="minorHAnsi"/>
                 <w:lang w:val="en-US"/>
               </w:rPr>
-              <w:t xml:space="preserve"> (~May 2028) or </w:t>
+              <w:t xml:space="preserve"> (~May 2028); if not ready, to </w:t>
             </w:r>
             <w:r>
               <w:rPr>
@@ -3124,14 +3184,14 @@
                 <w:b/>
                 <w:lang w:val="en-US"/>
               </w:rPr>
-              <w:t xml:space="preserve">ECCV 2028</w:t>
-            </w:r>
-            <w:r>
-              <w:rPr>
-                <w:rFonts w:cstheme="minorHAnsi"/>
-                <w:lang w:val="en-US"/>
-              </w:rPr>
-              <w:t xml:space="preserve"> (~Mar 2028). </w:t>
+              <w:t xml:space="preserve">ICLR 2029</w:t>
+            </w:r>
+            <w:r>
+              <w:rPr>
+                <w:rFonts w:cstheme="minorHAnsi"/>
+                <w:lang w:val="en-US"/>
+              </w:rPr>
+              <w:t xml:space="preserve"> (~late Sep 2028). </w:t>
             </w:r>
             <w:r>
               <w:rPr>
@@ -4189,7 +4249,7 @@
           <w:rFonts w:cstheme="minorHAnsi"/>
           <w:lang w:val="en-US"/>
         </w:rPr>
-        <w:t xml:space="preserve">. Embodied agents (mobile robots, manipulators) learn strong behaviour only from very large amounts of experience, often millions of trials or more. In the real world such data is slow, expensive and sometimes risky to collect, so a policy is usually trained in simulation and then deployed on real sensor data, where it often fails (the </w:t>
+        <w:t xml:space="preserve">. Embodied agents (mobile robots, manipulators) learn strong behaviour only from very large amounts of experience. In the real world such data is slow, expensive and sometimes risky to collect, so a policy is usually trained in simulation and then deployed on real sensor data, where it often fails (the </w:t>
       </w:r>
       <w:r>
         <w:rPr>
@@ -4255,7 +4315,7 @@
           <w:rFonts w:cstheme="minorHAnsi"/>
           <w:lang w:val="en-US"/>
         </w:rPr>
-        <w:t xml:space="preserve">. Today this is answered in two unsatisfying ways: by running the policy in the real world (slow and costly, which is what the twin was meant to avoid) or by image-quality scores of the reconstruction, which are known to track real performance poorly. Neither says </w:t>
+        <w:t xml:space="preserve">. Today this is answered in two unsatisfying ways: by running the policy in the real world (slow and costly, which is what the twin was meant to avoid) or by image-quality scores of the reconstruction, which need not track real performance (lower-fidelity simulation can even transfer better). Neither says </w:t>
       </w:r>
       <w:r>
         <w:rPr>
@@ -4866,7 +4926,7 @@
           <w:b/>
           <w:lang w:val="en-US"/>
         </w:rPr>
-        <w:t xml:space="preserve">no study has measured, on paired real and twin-rendered frames of the same pose, where inside encoders and policies the twin-vs-real gap arises, or how it shrinks with the capture budget.</w:t>
+        <w:t xml:space="preserve">we found no study that measured, on paired real and twin-rendered frames of the same pose, where inside encoders and policies the twin-vs-real gap arises, or how it shrinks with the capture budget.</w:t>
       </w:r>
     </w:p>
     <w:p>
@@ -4887,7 +4947,7 @@
           <w:rFonts w:cstheme="minorHAnsi"/>
           <w:lang w:val="en-US"/>
         </w:rPr>
-        <w:t xml:space="preserve"> Accuracy under distribution shift can be estimated from unlabeled target data [23]. A network's accuracy can be predicted from its weights alone [24], and populations of trained models ("model zoos" [25]) are now inputs to weight-space learning: equivariant metanetworks [26] and graph neural networks over the computational graph [27] predict generalization. They have been tested on image classifiers and implicit neural representations, </w:t>
+        <w:t xml:space="preserve"> Accuracy under distribution shift can be estimated from unlabeled target data [23]. A network's accuracy can be predicted from its weights alone [24], and populations of trained models ("model zoos" [25]) are now inputs to weight-space learning: equivariant metanetworks [26] learn directly on weights, and graph neural networks over the computational graph [27] predict generalization. They have been tested on image classifiers and implicit neural representations, </w:t>
       </w:r>
       <w:r>
         <w:rPr>
@@ -5868,7 +5928,7 @@
           <w:rFonts w:cstheme="minorHAnsi"/>
           <w:lang w:val="en-US"/>
         </w:rPr>
-        <w:t xml:space="preserve"> (≥ 200 navigation policies varying scene, capture budget, architecture and training data) supplies the population for RQ2–RQ4. Tests are one-sided, α = 0.05, bootstrapped over scenes, Holm-corrected within each hypothesis and pre-registered in the repository. All thresholds are design choices to be confirmed with the supervisor.</w:t>
+        <w:t xml:space="preserve"> (≥ 200 navigation policies varying scene, capture budget, architecture and training data) supplies the population for RQ2–RQ4. Tests are one-sided, α = 0.05, bootstrapped over scenes, Holm-corrected within each hypothesis and pre-registered in the repository. All thresholds are design choices fixed in that pre-registration.</w:t>
       </w:r>
     </w:p>
     <w:p>
@@ -6009,7 +6069,7 @@
           <w:rFonts w:cstheme="minorHAnsi"/>
           <w:lang w:val="en-US"/>
         </w:rPr>
-        <w:t xml:space="preserve"> Forecast-guided weighting, capture and rollout selection reaches the target real SR τ with ≥ 30% less real data (capture minutes + real rollouts) than uniform or random allocation: B_guided(τ) ≤ 0.7 · B_uniform(τ) on fitted budget–performance curves, with the upper 95% bound of the ratio &lt; 1. τ is fixed in the pre-registration as the SR that uniform allocation reaches at the largest budget.</w:t>
+        <w:t xml:space="preserve"> Forecast-guided weighting, capture and rollout selection reaches the target real SR τ with ≥ 30% less real data than uniform or random allocation (capture minutes + real rollouts, converted to one operator-time cost at a pre-registered rate): B_guided(τ) ≤ 0.7 · B_uniform(τ) on fitted budget–performance curves, with the upper 95% bound of the ratio &lt; 1. τ is fixed in the pre-registration as the SR that uniform allocation reaches at the largest budget.</w:t>
       </w:r>
     </w:p>
     <w:p>
@@ -6051,7 +6111,7 @@
           <w:rFonts w:cstheme="minorHAnsi"/>
           <w:lang w:val="en-US"/>
         </w:rPr>
-        <w:t xml:space="preserve"> (a) A predictor trained on the navigation zoo, applied to a manipulation zoo without retraining, ranks policies by real outcome with Spearman ρ ≥ 0.5. (b) Its rank correlation with real outcomes exceeds that of a generic simulator (Sim-vs-Real Correlation Coefficient, SRCC) and of a learned world-model evaluator (95% CI of each paired difference excludes 0).</w:t>
+        <w:t xml:space="preserve"> (a) A predictor trained on the navigation zoo, applied without retraining to manipulation policies with published paired sim/real results (≥ 12 policy–task pairs), ranks them by real outcome with Spearman ρ ≥ 0.5. (b) Its rank correlation with real outcomes exceeds that of a generic simulator (Sim-vs-Real Correlation Coefficient, SRCC) and of a learned world-model evaluator (95% CI of each paired difference excludes 0).</w:t>
       </w:r>
     </w:p>
     <w:p>
@@ -6418,7 +6478,7 @@
           <w:rFonts w:cstheme="minorHAnsi"/>
           <w:lang w:val="en-US"/>
         </w:rPr>
-        <w:t xml:space="preserve"> To our knowledge, the first demonstration that the twin-to-real transfer of embodied policies can be </w:t>
+        <w:t xml:space="preserve"> To our knowledge, the first systematic test of whether the twin-to-real transfer of embodied policies can be </w:t>
       </w:r>
       <w:r>
         <w:rPr>
@@ -6625,7 +6685,7 @@
           <w:rFonts w:cstheme="minorHAnsi"/>
           <w:lang w:val="en-US"/>
         </w:rPr>
-        <w:t xml:space="preserve"> Real target-domain data is the main cost of deploying learned systems, and trained models are increasingly deployed on data unlike their training data. Showing that transfer can be diagnosed and forecast from a model's internals, and that such forecasts save real data, is relevant to machine learning under distribution shift and to model evaluation in general, beyond robotics.</w:t>
+        <w:t xml:space="preserve"> Real target-domain data is the main cost of deploying learned systems, and trained models are increasingly deployed on data unlike their training data. Testing whether transfer can be diagnosed and forecast from a model's internals, and whether such forecasts save real data, is relevant to machine learning under distribution shift and to model evaluation in general, beyond robotics.</w:t>
       </w:r>
     </w:p>
     <w:p>
@@ -6646,7 +6706,7 @@
           <w:rFonts w:cstheme="minorHAnsi"/>
           <w:lang w:val="en-US"/>
         </w:rPr>
-        <w:t xml:space="preserve"> Results are planned for peer-reviewed conferences worth 200 points and assigned to ITiT on the ministerial list of 5.01.2024: NeurIPS, ICML and ICLR (machine learning) and CVPR, ICCV and ECCV (computer vision), as in §3, §11 and §12. P1 (RQ1, benchmark and localization) targets NeurIPS 2027; P2 (RQ2) ICLR or CVPR 2028; P3 (RQ3–RQ4, including manipulation) ECCV or NeurIPS 2028.</w:t>
+        <w:t xml:space="preserve"> Results are planned for peer-reviewed conferences worth 200 points and assigned to ITiT on the ministerial list of 5.01.2024: NeurIPS and ICLR (machine learning) and CVPR (computer vision), with ICML, ICCV and ECCV for resubmissions, as in §3, §11 and §12. P1 (RQ1, benchmark and localization) targets NeurIPS 2027; P2 (RQ2) ICLR or CVPR 2028; P3 (RQ3–RQ4, including manipulation) NeurIPS 2028.</w:t>
       </w:r>
     </w:p>
     <w:permEnd w:id="1098318749"/>
@@ -6976,7 +7036,7 @@
           <w:rFonts w:cstheme="minorHAnsi"/>
           <w:lang w:val="en-US"/>
         </w:rPr>
-        <w:t xml:space="preserve"> (≥ 4 levels of capture minutes or views) is set by subsampling. Some scenes are held out. </w:t>
+        <w:t xml:space="preserve"> (≥ 4 levels of capture minutes or views) is set by subsampling. Some scenes are held out. Frame-level measures use the real images; closed-loop outcomes use the rendered scan, and the gap between scan renders and real images is measured with the same tools, so the proxy's own error is known. </w:t>
       </w:r>
       <w:r>
         <w:rPr>
@@ -7268,7 +7328,7 @@
           <w:rFonts w:cstheme="minorHAnsi"/>
           <w:lang w:val="en-US"/>
         </w:rPr>
-        <w:t xml:space="preserve"> (i) a graph neural network over per-layer hidden-state statistics on a fixed probe set of twin frames (the student's prior method for forecasting from hidden states); (ii) weight-space metanetworks [26, 27]. </w:t>
+        <w:t xml:space="preserve"> (i) a graph neural network over per-layer hidden-state statistics on a fixed probe set of twin frames and, where available, unlabelled real frames of the capture (no real rollouts; the student's prior method for forecasting from hidden states); (ii) weight-space metanetworks [26, 27]. </w:t>
       </w:r>
       <w:r>
         <w:rPr>
@@ -7283,7 +7343,7 @@
           <w:rFonts w:cstheme="minorHAnsi"/>
           <w:lang w:val="en-US"/>
         </w:rPr>
-        <w:t xml:space="preserve"> twin SR alone, image fidelity (PSNR/LPIPS), and simulator-level predictivity (SRCC-style rollout estimates [10]). Splits are by held-out scene. Ablations keep fidelity fixed and vary the policy, so that the predictor cannot rely only on twin quality.</w:t>
+        <w:t xml:space="preserve"> twin SR alone, image fidelity (PSNR/LPIPS), and simulator-level predictivity: real SR predicted from twin SR by the sim-to-real mapping fitted on training scenes [10]. Splits are by held-out scene. Ablations keep fidelity fixed and vary the policy, so that the predictor cannot rely only on twin quality.</w:t>
       </w:r>
     </w:p>
     <w:p>
@@ -7312,7 +7372,7 @@
           <w:rFonts w:cstheme="minorHAnsi"/>
           <w:lang w:val="en-US"/>
         </w:rPr>
-        <w:t xml:space="preserve"> hidden-state failure scores (in the style of [29, 30]) with thresholds set by split conformal prediction [28] at 90% coverage in the twin; coverage is measured on tier A and tier B.</w:t>
+        <w:t xml:space="preserve"> hidden-state failure scores (in the style of [29, 30]) with thresholds set by split conformal prediction [28] at 90% coverage in the twin; coverage is measured on tier A closed-loop rollouts (tier C reports agreement).</w:t>
       </w:r>
     </w:p>
     <w:p>
@@ -7355,7 +7415,7 @@
           <w:b/>
           <w:lang w:val="en-US"/>
         </w:rPr>
-        <w:t xml:space="preserve">Stage III – budget-allocation experiments (RQ3, H3; sem. 6).</w:t>
+        <w:t xml:space="preserve">Stage III – budget-allocation experiments (RQ3, H3; sem. 5–6).</w:t>
       </w:r>
     </w:p>
     <w:p>
@@ -7442,7 +7502,7 @@
           <w:rFonts w:cstheme="minorHAnsi"/>
           <w:lang w:val="en-US"/>
         </w:rPr>
-        <w:t xml:space="preserve"> budget–performance curves (real data = capture minutes + real rollouts) fitted per method; guided allocation reaches the target SR τ with ≤ 0.7 of the uniform budget (upper 95% bound of the ratio &lt; 1).</w:t>
+        <w:t xml:space="preserve"> budget–performance curves (real data = capture minutes + real rollouts in one operator-time cost) fitted per method; guided allocation reaches the target SR τ with ≤ 0.7 of the uniform budget (upper 95% bound of the ratio &lt; 1).</w:t>
       </w:r>
     </w:p>
     <w:p>
@@ -7456,7 +7516,7 @@
           <w:b/>
           <w:lang w:val="en-US"/>
         </w:rPr>
-        <w:t xml:space="preserve">Stage IV – cross-task and cross-simulator generalization (RQ4, H4; sem. 6–7).</w:t>
+        <w:t xml:space="preserve">Stage IV – cross-task and cross-simulator generalization (RQ4, H4; sem. 6).</w:t>
       </w:r>
     </w:p>
     <w:p>
@@ -7478,14 +7538,14 @@
           <w:i/>
           <w:lang w:val="en-US"/>
         </w:rPr>
-        <w:t xml:space="preserve">Manipulation zoo:</w:t>
-      </w:r>
-      <w:r>
-        <w:rPr>
-          <w:rFonts w:cstheme="minorHAnsi"/>
-          <w:lang w:val="en-US"/>
-        </w:rPr>
-        <w:t xml:space="preserve"> pick-and-place policies trained in twins of tabletop scenes in ManiSkill3 [9]; labels from SIMPLER [12] environments and their published paired sim/real evaluations (tier B).</w:t>
+        <w:t xml:space="preserve">Manipulation set:</w:t>
+      </w:r>
+      <w:r>
+        <w:rPr>
+          <w:rFonts w:cstheme="minorHAnsi"/>
+          <w:lang w:val="en-US"/>
+        </w:rPr>
+        <w:t xml:space="preserve"> public manipulation policies evaluated in the SIMPLER [12] replicas of real set-ups, with their published paired sim/real results as labels (tier B; ≥ 12 policy–task pairs). These policies are trained on real data, so the test asks whether performance in a simulated replica holds in reality.</w:t>
       </w:r>
     </w:p>
     <w:p>
@@ -7514,7 +7574,7 @@
           <w:rFonts w:cstheme="minorHAnsi"/>
           <w:lang w:val="en-US"/>
         </w:rPr>
-        <w:t xml:space="preserve"> the navigation-trained predictor is applied without retraining. </w:t>
+        <w:t xml:space="preserve"> the navigation-trained hidden-state predictor, which does not depend on the architecture, is applied without retraining. </w:t>
       </w:r>
       <w:r>
         <w:rPr>
@@ -7869,7 +7929,7 @@
           <w:rFonts w:cstheme="minorHAnsi"/>
           <w:lang w:val="pl-PL"/>
         </w:rPr>
-        <w:t xml:space="preserve">Roboty uczą się dziś samodzielnego działania, na przykład poruszania się po budynku lub chwytania przedmiotów, metodą prób i błędów. Potrzebują do tego milionów prób, więc zwykle ćwiczą w symulacji komputerowej. Coraz częściej jest nią cyfrowy bliźniak: wierna, fotorealistyczna kopia prawdziwego miejsca, którą metody sztucznej inteligencji potrafią odtworzyć z krótkiego filmu nagranego telefonem. Kopia nigdy nie jest jednak idealna. Bywa rozmyta, ma drobne zniekształcenia i inaczej oddaje światło. Robot, który świetnie radzi sobie w kopii, może więc zawieść w prawdziwym świecie. Dziś można to sprawdzić tylko, wypuszczając go do prawdziwego budynku, a to jest powolne i kosztowne.</w:t>
+        <w:t xml:space="preserve">Roboty uczą się dziś samodzielnego działania, na przykład poruszania się po budynku lub chwytania przedmiotów, metodą prób i błędów. Potrzebują do tego bardzo wielu prób, więc zwykle ćwiczą w symulacji komputerowej. Coraz częściej jest nią cyfrowy bliźniak: wierna, fotorealistyczna kopia prawdziwego miejsca, którą metody sztucznej inteligencji potrafią odtworzyć z krótkiego filmu nagranego telefonem. Kopia nigdy nie jest jednak idealna. Bywa rozmyta, ma drobne zniekształcenia i inaczej oddaje światło. Robot, który świetnie radzi sobie w kopii, może więc zawieść w prawdziwym świecie. Dziś można to sprawdzić tylko, wypuszczając go do prawdziwego budynku, a to jest powolne i kosztowne.</w:t>
       </w:r>
     </w:p>
     <w:p>
@@ -7950,7 +8010,7 @@
           <w:rFonts w:cstheme="minorHAnsi"/>
           <w:lang w:val="en-US"/>
         </w:rPr>
-        <w:t xml:space="preserve">Robots today learn to act on their own, for example to move around a building or to grasp objects, by trial and error. They need millions of trials, so they usually practise in a computer simulation. Increasingly, this is a digital twin: a faithful, photorealistic copy of a real place that artificial intelligence methods can reconstruct from a short video recorded with a phone. The copy, however, is never perfect. It can be blurry, have small distortions and render light differently. A robot that does very well in the copy may therefore fail in the real world. Today this can only be checked by sending it into a real building, which is slow and costly.</w:t>
+        <w:t xml:space="preserve">Robots today learn to act on their own, for example to move around a building or to grasp objects, by trial and error. They need a very large number of trials, so they usually practise in a computer simulation. Increasingly, this is a digital twin: a faithful, photorealistic copy of a real place that artificial intelligence methods can reconstruct from a short video recorded with a phone. The copy, however, is never perfect. It can be blurry, have small distortions and render light differently. A robot that does very well in the copy may therefore fail in the real world. Today this can only be checked by sending it into a real building, which is slow and costly.</w:t>
       </w:r>
     </w:p>
     <w:p>
@@ -8427,7 +8487,7 @@
           <w:rFonts w:cstheme="minorHAnsi"/>
           <w:lang w:val="en-US"/>
         </w:rPr>
-        <w:t xml:space="preserve">. P1 reports Stage I (RQ1): a benchmark of paired real and twin-rendered frames and the localization of the twin-vs-real gap inside frozen encoders and twin-trained policies (task T4.2). If it is rejected, the revised paper goes to </w:t>
+        <w:t xml:space="preserve">. P1 reports Stage I (RQ1): a benchmark of paired real and twin-rendered frames, the localization of the twin-vs-real gap inside frozen encoders, and a first test of whether encoder robustness predicts the transfer of twin-trained policies (task T4.2). If it is rejected, the revised paper goes to </w:t>
       </w:r>
       <w:r>
         <w:rPr>
@@ -8713,7 +8773,7 @@
           <w:rFonts w:cstheme="minorHAnsi"/>
           <w:lang w:val="en-US"/>
         </w:rPr>
-        <w:t xml:space="preserve"> All papers target 200-point conferences assigned to the discipline (ministerial list of 5.01.2024; points to be re-checked against the new list expected in early 2027).</w:t>
+        <w:t xml:space="preserve"> All papers target 200-point conferences assigned to the discipline (list of 5.01.2024; re-checked against the new list).</w:t>
       </w:r>
     </w:p>
     <w:tbl>
@@ -8724,10 +8784,10 @@
       </w:tblPr>
       <w:tblGrid>
         <w:gridCol w:w="1269"/>
-        <w:gridCol w:w="3540"/>
+        <w:gridCol w:w="3684"/>
         <w:gridCol w:w="1269"/>
-        <w:gridCol w:w="1383"/>
-        <w:gridCol w:w="1611"/>
+        <w:gridCol w:w="1238"/>
+        <w:gridCol w:w="1612"/>
       </w:tblGrid>
       <w:tr>
         <w:tc>
@@ -8751,7 +8811,7 @@
         </w:tc>
         <w:tc>
           <w:tcPr>
-            <w:tcW w:w="3540" w:type="dxa"/>
+            <w:tcW w:w="3684" w:type="dxa"/>
           </w:tcPr>
           <w:p>
             <w:pPr>
@@ -8789,7 +8849,7 @@
         </w:tc>
         <w:tc>
           <w:tcPr>
-            <w:tcW w:w="1383" w:type="dxa"/>
+            <w:tcW w:w="1238" w:type="dxa"/>
           </w:tcPr>
           <w:p>
             <w:pPr>
@@ -8808,7 +8868,7 @@
         </w:tc>
         <w:tc>
           <w:tcPr>
-            <w:tcW w:w="1611" w:type="dxa"/>
+            <w:tcW w:w="1612" w:type="dxa"/>
           </w:tcPr>
           <w:p>
             <w:pPr>
@@ -8847,7 +8907,7 @@
         </w:tc>
         <w:tc>
           <w:tcPr>
-            <w:tcW w:w="3540" w:type="dxa"/>
+            <w:tcW w:w="3684" w:type="dxa"/>
           </w:tcPr>
           <w:p>
             <w:pPr>
@@ -8883,7 +8943,7 @@
         </w:tc>
         <w:tc>
           <w:tcPr>
-            <w:tcW w:w="1383" w:type="dxa"/>
+            <w:tcW w:w="1238" w:type="dxa"/>
           </w:tcPr>
           <w:p>
             <w:pPr>
@@ -8901,7 +8961,7 @@
         </w:tc>
         <w:tc>
           <w:tcPr>
-            <w:tcW w:w="1611" w:type="dxa"/>
+            <w:tcW w:w="1612" w:type="dxa"/>
           </w:tcPr>
           <w:p>
             <w:pPr>
@@ -8939,7 +8999,7 @@
         </w:tc>
         <w:tc>
           <w:tcPr>
-            <w:tcW w:w="3540" w:type="dxa"/>
+            <w:tcW w:w="3684" w:type="dxa"/>
           </w:tcPr>
           <w:p>
             <w:pPr>
@@ -8975,7 +9035,7 @@
         </w:tc>
         <w:tc>
           <w:tcPr>
-            <w:tcW w:w="1383" w:type="dxa"/>
+            <w:tcW w:w="1238" w:type="dxa"/>
           </w:tcPr>
           <w:p>
             <w:pPr>
@@ -8987,13 +9047,13 @@
                 <w:rFonts w:cstheme="minorHAnsi"/>
                 <w:lang w:val="en-US"/>
               </w:rPr>
-              <w:t xml:space="preserve">SzD Minigrant; NCN PRELUDIUM</w:t>
+              <w:t xml:space="preserve">SzD Minigrant; NCN PRELUDIUM; NAWA Bekker</w:t>
             </w:r>
           </w:p>
         </w:tc>
         <w:tc>
           <w:tcPr>
-            <w:tcW w:w="1611" w:type="dxa"/>
+            <w:tcW w:w="1612" w:type="dxa"/>
           </w:tcPr>
           <w:p>
             <w:pPr>
@@ -9031,7 +9091,7 @@
         </w:tc>
         <w:tc>
           <w:tcPr>
-            <w:tcW w:w="3540" w:type="dxa"/>
+            <w:tcW w:w="3684" w:type="dxa"/>
           </w:tcPr>
           <w:p>
             <w:pPr>
@@ -9043,7 +9103,7 @@
                 <w:rFonts w:cstheme="minorHAnsi"/>
                 <w:lang w:val="en-US"/>
               </w:rPr>
-              <w:t xml:space="preserve">P2 (RQ2, forecasting transfer and failure): CVPR or ICLR 2028; P3 (RQ3–RQ4, budget allocation, manipulation): NeurIPS or ECCV 2028</w:t>
+              <w:t xml:space="preserve">P2 (RQ2, forecasting transfer and failure): CVPR or ICLR 2028; P3 (RQ3–RQ4, budget allocation, manipulation): NeurIPS 2028</w:t>
             </w:r>
           </w:p>
         </w:tc>
@@ -9067,7 +9127,7 @@
         </w:tc>
         <w:tc>
           <w:tcPr>
-            <w:tcW w:w="1383" w:type="dxa"/>
+            <w:tcW w:w="1238" w:type="dxa"/>
           </w:tcPr>
           <w:p>
             <w:pPr>
@@ -9079,13 +9139,13 @@
                 <w:rFonts w:cstheme="minorHAnsi"/>
                 <w:lang w:val="en-US"/>
               </w:rPr>
-              <w:t xml:space="preserve">NAWA Bekker</w:t>
+              <w:t xml:space="preserve">—</w:t>
             </w:r>
           </w:p>
         </w:tc>
         <w:tc>
           <w:tcPr>
-            <w:tcW w:w="1611" w:type="dxa"/>
+            <w:tcW w:w="1612" w:type="dxa"/>
           </w:tcPr>
           <w:p>
             <w:pPr>
@@ -9123,7 +9183,7 @@
         </w:tc>
         <w:tc>
           <w:tcPr>
-            <w:tcW w:w="3540" w:type="dxa"/>
+            <w:tcW w:w="3684" w:type="dxa"/>
           </w:tcPr>
           <w:p>
             <w:pPr>
@@ -9159,7 +9219,7 @@
         </w:tc>
         <w:tc>
           <w:tcPr>
-            <w:tcW w:w="1383" w:type="dxa"/>
+            <w:tcW w:w="1238" w:type="dxa"/>
           </w:tcPr>
           <w:p>
             <w:pPr>
@@ -9177,7 +9237,7 @@
         </w:tc>
         <w:tc>
           <w:tcPr>
-            <w:tcW w:w="1611" w:type="dxa"/>
+            <w:tcW w:w="1612" w:type="dxa"/>
           </w:tcPr>
           <w:p>
             <w:pPr>
@@ -9232,7 +9292,7 @@
           <w:rFonts w:cstheme="minorHAnsi"/>
           <w:lang w:val="en-US"/>
         </w:rPr>
-        <w:t xml:space="preserve"> (1) Z. Kira's group, Georgia Tech: EmbodiedSplat [4]. (2) Multi-robot Systems Lab, Stanford University (M. Schwager): Gaussian-splatting scene models and navigation. A European host (Erasmus+ route) and a foreign co-author for P2 are sought with the supervisor in sem. 4.</w:t>
+        <w:t xml:space="preserve"> (1) Z. Kira's group, Georgia Tech: EmbodiedSplat [4]. (2) Multi-robot Systems Lab, Stanford University (M. Schwager): Gaussian-splatting scene models and navigation. A European host (Erasmus+ route) from the weight-space learning community (authors of [25–27]) and a foreign co-author for P2 are sought with the supervisor in sem. 4.</w:t>
       </w:r>
     </w:p>
     <w:p>
@@ -9376,7 +9436,7 @@
           <w:rFonts w:cstheme="minorHAnsi"/>
           <w:lang w:val="en-US"/>
         </w:rPr>
-        <w:t xml:space="preserve"> (3–6): related lines (failure detection, policy interpretability) move fast. Early preprints and benchmark release, monthly literature monitoring; the zoo and weight-space angle differentiate the work.</w:t>
+        <w:t xml:space="preserve"> (3–6): failure detection and policy interpretability move fast. Early preprints, benchmark release, monthly literature monitoring; the zoo and weight-space angle differentiate the work.</w:t>
       </w:r>
     </w:p>
     <w:p>
@@ -9463,22 +9523,7 @@
           <w:rFonts w:cstheme="minorHAnsi"/>
           <w:lang w:val="en-US"/>
         </w:rPr>
-        <w:t xml:space="preserve"> (4–7): every paper has a resubmission path inside the 200-point set, 2–4 months later (e.g. NeurIPS → CVPR → ICML → ECCV/ICCV). The degree requirement does not depend on one decision. </w:t>
-      </w:r>
-      <w:r>
-        <w:rPr>
-          <w:rFonts w:cstheme="minorHAnsi"/>
-          <w:i/>
-          <w:lang w:val="en-US"/>
-        </w:rPr>
-        <w:t xml:space="preserve">Changing venue points</w:t>
-      </w:r>
-      <w:r>
-        <w:rPr>
-          <w:rFonts w:cstheme="minorHAnsi"/>
-          <w:lang w:val="en-US"/>
-        </w:rPr>
-        <w:t xml:space="preserve"> (3–4): venues are re-checked when the new list appears.</w:t>
+        <w:t xml:space="preserve"> (4–7): every paper has a resubmission path inside the 200-point set, 2–4 months later (e.g. NeurIPS → CVPR → ICML → ECCV/ICCV), so the degree requirement does not depend on one decision.</w:t>
       </w:r>
     </w:p>
     <w:p>

</xml_diff>

<commit_message>
Wave 11: rewrite IPB for data-efficient real-to-sim-to-real (capture less, robust training on imperfect twins, few real rollouts, budget law)
Closes #25, closes #26

Co-Authored-By: Claude Opus 5.5 <noreply@anthropic.com>
</commit_message>
<xml_diff>
--- a/output/IPB_Grzegorz_Piotrowski.docx
+++ b/output/IPB_Grzegorz_Piotrowski.docx
@@ -1098,7 +1098,7 @@
           <w:rFonts w:cstheme="minorHAnsi"/>
           <w:lang w:val="en-US"/>
         </w:rPr>
-        <w:t xml:space="preserve"> Reprezentacje wewnętrzne jako miara i predyktor przenoszenia do świata rzeczywistego polityk agentów ucieleśnionych uczonych w cyfrowych bliźniakach z neuronowej rekonstrukcji scen, przy ograniczonym budżecie danych rzeczywistych</w:t>
+        <w:t xml:space="preserve"> Uczenie polityk agentów ucieleśnionych w pętli rzeczywistość–symulacja–rzeczywistość przy ograniczonym budżecie danych rzeczywistych z wykorzystaniem cyfrowych bliźniaków z neuronowej rekonstrukcji scen</w:t>
       </w:r>
       <w:bookmarkStart w:id="0" w:name="_Hlk95566638"/>
     </w:p>
@@ -1120,7 +1120,7 @@
           <w:rFonts w:cstheme="minorHAnsi"/>
           <w:lang w:val="en-US"/>
         </w:rPr>
-        <w:t xml:space="preserve"> Internal representations as a measure and predictor of the real-world transfer of embodied policies learned in neural-reconstruction digital twins under a limited real-data budget</w:t>
+        <w:t xml:space="preserve"> Learning embodied policies in the real-to-sim-to-real loop under a limited real-data budget with digital twins from neural scene reconstruction</w:t>
       </w:r>
     </w:p>
     <w:bookmarkEnd w:id="0"/>
@@ -2047,7 +2047,7 @@
                 <w:rFonts w:cstheme="minorHAnsi"/>
                 <w:lang w:val="en-US"/>
               </w:rPr>
-              <w:t xml:space="preserve"> Formulation of the representation-level thesis, research questions RQ1–RQ4 (measure, predict, use, generalize) and hypotheses H1–H4 with measurable decision rules and evaluation tiers A–C. </w:t>
+              <w:t xml:space="preserve"> Formulation of the data-efficient real-to-sim-to-real thesis, research questions RQ1–RQ4 (capture less, train robustly on an imperfect twin, collect few real rollouts, budget of the whole loop) and hypotheses H1–H4 with measurable decision rules and evaluation tiers A–C. </w:t>
             </w:r>
             <w:r>
               <w:rPr>
@@ -2226,7 +2226,7 @@
                 <w:b/>
                 <w:lang w:val="en-US"/>
               </w:rPr>
-              <w:t xml:space="preserve">Stage I – paired-frame benchmark (RQ1, H1).</w:t>
+              <w:t xml:space="preserve">Stage I – capture less (RQ1, H1).</w:t>
             </w:r>
           </w:p>
           <w:p>
@@ -2247,7 +2247,7 @@
                 <w:rFonts w:cstheme="minorHAnsi"/>
                 <w:lang w:val="en-US"/>
               </w:rPr>
-              <w:t xml:space="preserve"> Final choice of ≥ 10 public scenes with real captures and reference scans, simulator and existing 3DGS pipeline from the T2.2 shortlist; twins built at ≥ 4 capture budgets; paired real/twin frames of the same pose with fidelity and cost logs; pre-registration of the evaluation protocol (§7). </w:t>
+              <w:t xml:space="preserve"> Tier A set-up: final choice of ≥ 10 public scenes with dense real captures and reference scans, simulator and existing 3DGS pipeline from the T2.2 shortlist; reference twins ("reality") and training twins at ≥ 4 capture budgets; navigation policy training in the twins; pre-registration of the protocol (§7, §9). </w:t>
             </w:r>
             <w:r>
               <w:rPr>
@@ -2262,7 +2262,22 @@
                 <w:rFonts w:cstheme="minorHAnsi"/>
                 <w:lang w:val="en-US"/>
               </w:rPr>
-              <w:t xml:space="preserve"> benchmark v0 (data scripts, code) and protocol in the repository. Place: K46, WCSS.</w:t>
+              <w:t xml:space="preserve"> working loop and protocol in the repository, </w:t>
+            </w:r>
+            <w:r>
+              <w:rPr>
+                <w:rFonts w:cstheme="minorHAnsi"/>
+                <w:b/>
+                <w:lang w:val="en-US"/>
+              </w:rPr>
+              <w:t xml:space="preserve">by Dec 2026</w:t>
+            </w:r>
+            <w:r>
+              <w:rPr>
+                <w:rFonts w:cstheme="minorHAnsi"/>
+                <w:lang w:val="en-US"/>
+              </w:rPr>
+              <w:t xml:space="preserve">. Place: K46, WCSS.</w:t>
             </w:r>
           </w:p>
           <w:p>
@@ -2334,7 +2349,7 @@
                 <w:rFonts w:cstheme="minorHAnsi"/>
                 <w:lang w:val="en-US"/>
               </w:rPr>
-              <w:t xml:space="preserve"> Layer-wise gap measurement (linear CKA, linear probes) for ≥ 10 frozen encoders; pilot of policy-zoo training that fixes the zoo size. </w:t>
+              <w:t xml:space="preserve"> Task-aware, uncertainty-guided capture vs. uniform and reconstruction-only view selection. </w:t>
             </w:r>
             <w:r>
               <w:rPr>
@@ -2349,7 +2364,7 @@
                 <w:rFonts w:cstheme="minorHAnsi"/>
                 <w:lang w:val="en-US"/>
               </w:rPr>
-              <w:t xml:space="preserve"> first H1 results (concentration, budget trend, encoder differences) and pilot report, </w:t>
+              <w:t xml:space="preserve"> first budget–success curves (first H1 result), </w:t>
             </w:r>
             <w:r>
               <w:rPr>
@@ -2441,7 +2456,7 @@
                 <w:b/>
                 <w:lang w:val="en-US"/>
               </w:rPr>
-              <w:t xml:space="preserve">Stage I completed, Stage II started (RQ1–RQ2, H1–H2).</w:t>
+              <w:t xml:space="preserve">Stage I completed; Stage II – train robustly on an imperfect twin (RQ1–RQ2, H1–H2).</w:t>
             </w:r>
           </w:p>
           <w:p>
@@ -2462,7 +2477,22 @@
                 <w:rFonts w:cstheme="minorHAnsi"/>
                 <w:lang w:val="en-US"/>
               </w:rPr>
-              <w:t xml:space="preserve"> Navigation policies on each frozen encoder trained in the twins and tested in proxy reality (tier A); robustness ranking vs. twin→real success (first result for P1 </w:t>
+              <w:t xml:space="preserve"> Uncertainty-aware augmentation and representation-based weighting of twin data vs. uniform domain randomization at an equal capture budget. </w:t>
+            </w:r>
+            <w:r>
+              <w:rPr>
+                <w:rFonts w:cstheme="minorHAnsi"/>
+                <w:i/>
+                <w:lang w:val="en-US"/>
+              </w:rPr>
+              <w:t xml:space="preserve">D:</w:t>
+            </w:r>
+            <w:r>
+              <w:rPr>
+                <w:rFonts w:cstheme="minorHAnsi"/>
+                <w:lang w:val="en-US"/>
+              </w:rPr>
+              <w:t xml:space="preserve"> </w:t>
             </w:r>
             <w:r>
               <w:rPr>
@@ -2470,6 +2500,21 @@
                 <w:b/>
                 <w:lang w:val="en-US"/>
               </w:rPr>
+              <w:t xml:space="preserve">H1 completed</w:t>
+            </w:r>
+            <w:r>
+              <w:rPr>
+                <w:rFonts w:cstheme="minorHAnsi"/>
+                <w:lang w:val="en-US"/>
+              </w:rPr>
+              <w:t xml:space="preserve"> and first H2 result on tier A, </w:t>
+            </w:r>
+            <w:r>
+              <w:rPr>
+                <w:rFonts w:cstheme="minorHAnsi"/>
+                <w:b/>
+                <w:lang w:val="en-US"/>
+              </w:rPr>
               <w:t xml:space="preserve">by Apr 2027</w:t>
             </w:r>
             <w:r>
@@ -2477,22 +2522,7 @@
                 <w:rFonts w:cstheme="minorHAnsi"/>
                 <w:lang w:val="en-US"/>
               </w:rPr>
-              <w:t xml:space="preserve">); gap localization inside twin-trained policies; generation of the policy zoo (≥ 200 navigation policies with twin and proxy-real labels). </w:t>
-            </w:r>
-            <w:r>
-              <w:rPr>
-                <w:rFonts w:cstheme="minorHAnsi"/>
-                <w:i/>
-                <w:lang w:val="en-US"/>
-              </w:rPr>
-              <w:t xml:space="preserve">D:</w:t>
-            </w:r>
-            <w:r>
-              <w:rPr>
-                <w:rFonts w:cstheme="minorHAnsi"/>
-                <w:lang w:val="en-US"/>
-              </w:rPr>
-              <w:t xml:space="preserve"> </w:t>
+              <w:t xml:space="preserve">; </w:t>
             </w:r>
             <w:r>
               <w:rPr>
@@ -2500,22 +2530,7 @@
                 <w:b/>
                 <w:lang w:val="en-US"/>
               </w:rPr>
-              <w:t xml:space="preserve">H1 completed on tier A</w:t>
-            </w:r>
-            <w:r>
-              <w:rPr>
-                <w:rFonts w:cstheme="minorHAnsi"/>
-                <w:lang w:val="en-US"/>
-              </w:rPr>
-              <w:t xml:space="preserve">; zoo v1, </w:t>
-            </w:r>
-            <w:r>
-              <w:rPr>
-                <w:rFonts w:cstheme="minorHAnsi"/>
-                <w:b/>
-                <w:lang w:val="en-US"/>
-              </w:rPr>
-              <w:t xml:space="preserve">by Sep 2027</w:t>
+              <w:t xml:space="preserve">H2 completed, by Jul 2027</w:t>
             </w:r>
             <w:r>
               <w:rPr>
@@ -2558,7 +2573,7 @@
                 <w:rFonts w:cstheme="minorHAnsi"/>
                 <w:lang w:val="en-US"/>
               </w:rPr>
-              <w:t xml:space="preserve"> (paired-frame benchmark and gap localization in frozen encoders, H1(a–c), with the first H1(d) result; RQ1; Datasets &amp; Benchmarks or main track). </w:t>
+              <w:t xml:space="preserve"> (task-aware capture and uncertainty-aware training, RQ1–RQ2). </w:t>
             </w:r>
             <w:r>
               <w:rPr>
@@ -2588,7 +2603,7 @@
                 <w:rFonts w:cstheme="minorHAnsi"/>
                 <w:lang w:val="en-US"/>
               </w:rPr>
-              <w:t xml:space="preserve"> (§11); benchmark released with the paper.</w:t>
+              <w:t xml:space="preserve"> (§11).</w:t>
             </w:r>
           </w:p>
           <w:p>
@@ -2603,6 +2618,57 @@
                 <w:lang w:val="en-US"/>
               </w:rPr>
               <w:t xml:space="preserve">T4.3</w:t>
+            </w:r>
+            <w:r>
+              <w:rPr>
+                <w:rFonts w:cstheme="minorHAnsi"/>
+                <w:lang w:val="en-US"/>
+              </w:rPr>
+              <w:t xml:space="preserve"> Stage III set-up: rollout-selection and correction code on tier A (Jul–Sep 2027). </w:t>
+            </w:r>
+            <w:r>
+              <w:rPr>
+                <w:rFonts w:cstheme="minorHAnsi"/>
+                <w:i/>
+                <w:lang w:val="en-US"/>
+              </w:rPr>
+              <w:t xml:space="preserve">D:</w:t>
+            </w:r>
+            <w:r>
+              <w:rPr>
+                <w:rFonts w:cstheme="minorHAnsi"/>
+                <w:lang w:val="en-US"/>
+              </w:rPr>
+              <w:t xml:space="preserve"> first H3 result, </w:t>
+            </w:r>
+            <w:r>
+              <w:rPr>
+                <w:rFonts w:cstheme="minorHAnsi"/>
+                <w:b/>
+                <w:lang w:val="en-US"/>
+              </w:rPr>
+              <w:t xml:space="preserve">by Sep 2027</w:t>
+            </w:r>
+            <w:r>
+              <w:rPr>
+                <w:rFonts w:cstheme="minorHAnsi"/>
+                <w:lang w:val="en-US"/>
+              </w:rPr>
+              <w:t xml:space="preserve">.</w:t>
+            </w:r>
+          </w:p>
+          <w:p>
+            <w:pPr>
+              <w:spacing w:after="40" w:line="240" w:lineRule="auto"/>
+              <w:jc w:val="left"/>
+            </w:pPr>
+            <w:r>
+              <w:rPr>
+                <w:rFonts w:cstheme="minorHAnsi"/>
+                <w:b/>
+                <w:lang w:val="en-US"/>
+              </w:rPr>
+              <w:t xml:space="preserve">T4.4</w:t>
             </w:r>
             <w:r>
               <w:rPr>
@@ -2717,7 +2783,7 @@
                 <w:b/>
                 <w:lang w:val="en-US"/>
               </w:rPr>
-              <w:t xml:space="preserve">Stage II – transfer forecasting (RQ2, H2).</w:t>
+              <w:t xml:space="preserve">Stage III – collect few real rollouts (RQ3, H3).</w:t>
             </w:r>
           </w:p>
           <w:p>
@@ -2738,7 +2804,7 @@
                 <w:rFonts w:cstheme="minorHAnsi"/>
                 <w:lang w:val="en-US"/>
               </w:rPr>
-              <w:t xml:space="preserve"> Transfer predictors on the zoo (graph neural network over layers, weight-space metanetwork) vs. baselines (twin SR, PSNR/LPIPS, simulator-level predictivity) on held-out scenes; hidden-state failure monitors calibrated conformally in the twin and tested in proxy reality (tier A); Stage III set-up (allocation levers implemented, Jan–Feb 2028). </w:t>
+              <w:t xml:space="preserve"> Active selection of real rollouts (predicted gap, uncertainty) vs. random selection; correction of the twin and fine-tuning of the policy with the selected rollouts. </w:t>
             </w:r>
             <w:r>
               <w:rPr>
@@ -2761,7 +2827,22 @@
                 <w:b/>
                 <w:lang w:val="en-US"/>
               </w:rPr>
-              <w:t xml:space="preserve">H2 completed</w:t>
+              <w:t xml:space="preserve">H3 completed</w:t>
+            </w:r>
+            <w:r>
+              <w:rPr>
+                <w:rFonts w:cstheme="minorHAnsi"/>
+                <w:lang w:val="en-US"/>
+              </w:rPr>
+              <w:t xml:space="preserve"> on tier A, </w:t>
+            </w:r>
+            <w:r>
+              <w:rPr>
+                <w:rFonts w:cstheme="minorHAnsi"/>
+                <w:b/>
+                <w:lang w:val="en-US"/>
+              </w:rPr>
+              <w:t xml:space="preserve">by Feb 2028</w:t>
             </w:r>
             <w:r>
               <w:rPr>
@@ -2789,7 +2870,7 @@
                 <w:rFonts w:cstheme="minorHAnsi"/>
                 <w:lang w:val="en-US"/>
               </w:rPr>
-              <w:t xml:space="preserve"> First robot validation campaign (tier C, 8 zoo policies, 2 PWr environments): do forecasts rank real outcomes as on tier A? </w:t>
+              <w:t xml:space="preserve"> First robot validation campaign (tier C, 2 PWr rooms, ~8 robot-hours): own captures, twins, uniform capture vs. the loop. </w:t>
             </w:r>
             <w:r>
               <w:rPr>
@@ -2804,7 +2885,7 @@
                 <w:rFonts w:cstheme="minorHAnsi"/>
                 <w:lang w:val="en-US"/>
               </w:rPr>
-              <w:t xml:space="preserve"> validation report. Place: Denali. Without robot access, the campaign moves to sem. 7; H1–H2 are decided on tier A either way.</w:t>
+              <w:t xml:space="preserve"> validation report. Place: Denali. Without robot access, the campaign moves to sem. 7; H1–H3 are decided on tier A either way.</w:t>
             </w:r>
           </w:p>
           <w:p>
@@ -2840,7 +2921,7 @@
                 <w:rFonts w:cstheme="minorHAnsi"/>
                 <w:lang w:val="en-US"/>
               </w:rPr>
-              <w:t xml:space="preserve"> (forecasting transfer and failure from internals) submitted to </w:t>
+              <w:t xml:space="preserve"> (active real-rollout selection and twin correction, RQ3) submitted to </w:t>
             </w:r>
             <w:r>
               <w:rPr>
@@ -2855,7 +2936,7 @@
                 <w:rFonts w:cstheme="minorHAnsi"/>
                 <w:lang w:val="en-US"/>
               </w:rPr>
-              <w:t xml:space="preserve"> (~Nov 2027; ICLR 2028, ~late Sep 2027, if ready earlier). If P1 was rejected, its revision goes to CVPR 2028. </w:t>
+              <w:t xml:space="preserve"> (~Nov 2027; ICLR 2028, ~late Sep 2027, if ready earlier). If P1 was rejected, its revision goes to CVPR 2028 or ICLR 2028. </w:t>
             </w:r>
             <w:r>
               <w:rPr>
@@ -2948,7 +3029,7 @@
                 <w:b/>
                 <w:lang w:val="en-US"/>
               </w:rPr>
-              <w:t xml:space="preserve">Stages III–IV – using the forecasts; cross-task transfer (RQ3–RQ4, H3–H4).</w:t>
+              <w:t xml:space="preserve">Stage IV – budget of the whole loop; cross-task test (RQ4, H4).</w:t>
             </w:r>
           </w:p>
           <w:p>
@@ -2969,7 +3050,7 @@
                 <w:rFonts w:cstheme="minorHAnsi"/>
                 <w:lang w:val="en-US"/>
               </w:rPr>
-              <w:t xml:space="preserve"> (a) </w:t>
+              <w:t xml:space="preserve"> (a) Real-data budget curves of the full loop vs. real-only learning ("exchange rate") on tier A; (b) the same pipeline, unchanged, on manipulation scenes, with published paired sim/real results as tier-B check. </w:t>
             </w:r>
             <w:r>
               <w:rPr>
@@ -2977,36 +3058,6 @@
                 <w:i/>
                 <w:lang w:val="en-US"/>
               </w:rPr>
-              <w:t xml:space="preserve">Budget allocation:</w:t>
-            </w:r>
-            <w:r>
-              <w:rPr>
-                <w:rFonts w:cstheme="minorHAnsi"/>
-                <w:lang w:val="en-US"/>
-              </w:rPr>
-              <w:t xml:space="preserve"> forecast-guided weighting of twin data, capture selection and rollout selection vs. uniform and random allocation; budget–performance curves (capture minutes + real rollouts). (b) </w:t>
-            </w:r>
-            <w:r>
-              <w:rPr>
-                <w:rFonts w:cstheme="minorHAnsi"/>
-                <w:i/>
-                <w:lang w:val="en-US"/>
-              </w:rPr>
-              <w:t xml:space="preserve">Manipulation:</w:t>
-            </w:r>
-            <w:r>
-              <w:rPr>
-                <w:rFonts w:cstheme="minorHAnsi"/>
-                <w:lang w:val="en-US"/>
-              </w:rPr>
-              <w:t xml:space="preserve"> public policies with published SIMPLER paired sim/real results (≥ 12 policy–task pairs); the navigation predictor applied without retraining, compared with generic-simulator SRCC and a frozen world-model evaluator. </w:t>
-            </w:r>
-            <w:r>
-              <w:rPr>
-                <w:rFonts w:cstheme="minorHAnsi"/>
-                <w:i/>
-                <w:lang w:val="en-US"/>
-              </w:rPr>
               <w:t xml:space="preserve">D:</w:t>
             </w:r>
             <w:r>
@@ -3014,7 +3065,7 @@
                 <w:rFonts w:cstheme="minorHAnsi"/>
                 <w:lang w:val="en-US"/>
               </w:rPr>
-              <w:t xml:space="preserve"> </w:t>
+              <w:t xml:space="preserve"> navigation result </w:t>
             </w:r>
             <w:r>
               <w:rPr>
@@ -3022,14 +3073,14 @@
                 <w:b/>
                 <w:lang w:val="en-US"/>
               </w:rPr>
-              <w:t xml:space="preserve">H3 completed</w:t>
-            </w:r>
-            <w:r>
-              <w:rPr>
-                <w:rFonts w:cstheme="minorHAnsi"/>
-                <w:lang w:val="en-US"/>
-              </w:rPr>
-              <w:t xml:space="preserve"> (tier A, </w:t>
+              <w:t xml:space="preserve">by Apr 2028</w:t>
+            </w:r>
+            <w:r>
+              <w:rPr>
+                <w:rFonts w:cstheme="minorHAnsi"/>
+                <w:lang w:val="en-US"/>
+              </w:rPr>
+              <w:t xml:space="preserve">; </w:t>
             </w:r>
             <w:r>
               <w:rPr>
@@ -3037,44 +3088,14 @@
                 <w:b/>
                 <w:lang w:val="en-US"/>
               </w:rPr>
-              <w:t xml:space="preserve">by Apr 2028</w:t>
-            </w:r>
-            <w:r>
-              <w:rPr>
-                <w:rFonts w:cstheme="minorHAnsi"/>
-                <w:lang w:val="en-US"/>
-              </w:rPr>
-              <w:t xml:space="preserve">), </w:t>
-            </w:r>
-            <w:r>
-              <w:rPr>
-                <w:rFonts w:cstheme="minorHAnsi"/>
-                <w:b/>
-                <w:lang w:val="en-US"/>
-              </w:rPr>
-              <w:t xml:space="preserve">H4 completed</w:t>
-            </w:r>
-            <w:r>
-              <w:rPr>
-                <w:rFonts w:cstheme="minorHAnsi"/>
-                <w:lang w:val="en-US"/>
-              </w:rPr>
-              <w:t xml:space="preserve"> (tier B, </w:t>
-            </w:r>
-            <w:r>
-              <w:rPr>
-                <w:rFonts w:cstheme="minorHAnsi"/>
-                <w:b/>
-                <w:lang w:val="en-US"/>
-              </w:rPr>
-              <w:t xml:space="preserve">by Sep 2028</w:t>
-            </w:r>
-            <w:r>
-              <w:rPr>
-                <w:rFonts w:cstheme="minorHAnsi"/>
-                <w:lang w:val="en-US"/>
-              </w:rPr>
-              <w:t xml:space="preserve">). Place: K46, WCSS.</w:t>
+              <w:t xml:space="preserve">H4 completed, by Sep 2028</w:t>
+            </w:r>
+            <w:r>
+              <w:rPr>
+                <w:rFonts w:cstheme="minorHAnsi"/>
+                <w:lang w:val="en-US"/>
+              </w:rPr>
+              <w:t xml:space="preserve">. Place: K46, WCSS.</w:t>
             </w:r>
           </w:p>
           <w:p>
@@ -3161,7 +3182,7 @@
                 <w:rFonts w:cstheme="minorHAnsi"/>
                 <w:lang w:val="en-US"/>
               </w:rPr>
-              <w:t xml:space="preserve"> (budget allocation with the first cross-task results) submitted to </w:t>
+              <w:t xml:space="preserve"> (budget law of the full loop, with first manipulation results) submitted to </w:t>
             </w:r>
             <w:r>
               <w:rPr>
@@ -3305,7 +3326,7 @@
                 <w:rFonts w:cstheme="minorHAnsi"/>
                 <w:lang w:val="en-US"/>
               </w:rPr>
-              <w:t xml:space="preserve"> Second robot validation campaign (tier C) of the forecasts and of guided rollout selection; final analysis of H1–H4 across tiers. </w:t>
+              <w:t xml:space="preserve"> Second robot validation campaign (tier C) of the full loop; final analysis of H1–H4 across tiers. </w:t>
             </w:r>
             <w:r>
               <w:rPr>
@@ -3341,7 +3362,7 @@
                 <w:rFonts w:cstheme="minorHAnsi"/>
                 <w:lang w:val="en-US"/>
               </w:rPr>
-              <w:t xml:space="preserve"> Release of code, paired-frame benchmark and policy zoo. </w:t>
+              <w:t xml:space="preserve"> Release of code and experiment scripts. </w:t>
             </w:r>
             <w:r>
               <w:rPr>
@@ -4285,52 +4306,37 @@
           <w:rFonts w:cstheme="minorHAnsi"/>
           <w:lang w:val="en-US"/>
         </w:rPr>
-        <w:t xml:space="preserve"> (3D Gaussian Splatting, Neural Radiance Fields) turn a few minutes of real video into a photorealistic, interactive model of the target scene, in which a policy can be trained at scale. Building such twins has quickly become routine: dozens of papers a year and more than ten open-source twin simulators. The open question has moved from </w:t>
-      </w:r>
-      <w:r>
-        <w:rPr>
-          <w:rFonts w:cstheme="minorHAnsi"/>
-          <w:i/>
-          <w:lang w:val="en-US"/>
-        </w:rPr>
-        <w:t xml:space="preserve">how to build a twin</w:t>
-      </w:r>
-      <w:r>
-        <w:rPr>
-          <w:rFonts w:cstheme="minorHAnsi"/>
-          <w:lang w:val="en-US"/>
-        </w:rPr>
-        <w:t xml:space="preserve"> to </w:t>
-      </w:r>
-      <w:r>
-        <w:rPr>
-          <w:rFonts w:cstheme="minorHAnsi"/>
-          <w:i/>
-          <w:lang w:val="en-US"/>
-        </w:rPr>
-        <w:t xml:space="preserve">when a policy trained in it can be trusted in reality</w:t>
-      </w:r>
-      <w:r>
-        <w:rPr>
-          <w:rFonts w:cstheme="minorHAnsi"/>
-          <w:lang w:val="en-US"/>
-        </w:rPr>
-        <w:t xml:space="preserve">. Today this is answered in two unsatisfying ways: by running the policy in the real world (slow and costly, which is what the twin was meant to avoid) or by image-quality scores of the reconstruction, which need not track real performance (lower-fidelity simulation can even transfer better). Neither says </w:t>
-      </w:r>
-      <w:r>
-        <w:rPr>
-          <w:rFonts w:cstheme="minorHAnsi"/>
-          <w:b/>
-          <w:lang w:val="en-US"/>
-        </w:rPr>
-        <w:t xml:space="preserve">where</w:t>
-      </w:r>
-      <w:r>
-        <w:rPr>
-          <w:rFonts w:cstheme="minorHAnsi"/>
-          <w:lang w:val="en-US"/>
-        </w:rPr>
-        <w:t xml:space="preserve"> the gap arises, and neither tells how to spend the few real observations one can afford.</w:t>
+        <w:t xml:space="preserve"> (3D Gaussian Splatting, Neural Radiance Fields) turn a short real capture into a photorealistic model of the target scene, in which a policy can be trained at scale. This gives a </w:t>
+      </w:r>
+      <w:r>
+        <w:rPr>
+          <w:rFonts w:cstheme="minorHAnsi"/>
+          <w:b/>
+          <w:lang w:val="en-US"/>
+        </w:rPr>
+        <w:t xml:space="preserve">real-to-sim-to-real loop</w:t>
+      </w:r>
+      <w:r>
+        <w:rPr>
+          <w:rFonts w:cstheme="minorHAnsi"/>
+          <w:lang w:val="en-US"/>
+        </w:rPr>
+        <w:t xml:space="preserve">: capture the real scene, build a twin, train the policy in the twin, run a few real trials, correct the twin and the policy, deploy. Building twins has quickly become routine, with dozens of papers a year and more than ten open-source twin simulators. What remains open is the </w:t>
+      </w:r>
+      <w:r>
+        <w:rPr>
+          <w:rFonts w:cstheme="minorHAnsi"/>
+          <w:b/>
+          <w:lang w:val="en-US"/>
+        </w:rPr>
+        <w:t xml:space="preserve">real data</w:t>
+      </w:r>
+      <w:r>
+        <w:rPr>
+          <w:rFonts w:cstheme="minorHAnsi"/>
+          <w:lang w:val="en-US"/>
+        </w:rPr>
+        <w:t xml:space="preserve"> the loop consumes. Each step spends it: the capture, the real data used to make training robust to what the twin got wrong, and the real trials used to check and correct the policy. Today these amounts are chosen by habit: the scene is recorded uniformly, the policy is trained with generic randomization, and real trials are picked at random or by hand. How much real data a twin actually saves, especially for navigation, has not been measured.</w:t>
       </w:r>
     </w:p>
     <w:p>
@@ -4344,29 +4350,59 @@
           <w:b/>
           <w:lang w:val="en-US"/>
         </w:rPr>
-        <w:t xml:space="preserve">Why representations.</w:t>
-      </w:r>
-      <w:r>
-        <w:rPr>
-          <w:rFonts w:cstheme="minorHAnsi"/>
-          <w:lang w:val="en-US"/>
-        </w:rPr>
-        <w:t xml:space="preserve"> Whatever a policy does, it does through its internal representations: the features its encoder and layers compute from an image. This is where reconstructed and real inputs either meet or diverge. Machine learning now has mature tools to read representations: layer-wise probing, representational similarity (e.g. centred kernel alignment), and learning on network weights (metanetworks over model populations). They have been used to predict the accuracy and generalization of image classifiers and other networks from their weights, but not the real-world transfer of policies trained in twins. The dissertation asks whether this transfer can be </w:t>
-      </w:r>
-      <w:r>
-        <w:rPr>
-          <w:rFonts w:cstheme="minorHAnsi"/>
-          <w:b/>
-          <w:lang w:val="en-US"/>
-        </w:rPr>
-        <w:t xml:space="preserve">measured, localized and predicted from representations</w:t>
-      </w:r>
-      <w:r>
-        <w:rPr>
-          <w:rFonts w:cstheme="minorHAnsi"/>
-          <w:lang w:val="en-US"/>
-        </w:rPr>
-        <w:t xml:space="preserve"> without real rollouts, and whether such forecasts let a small real-data budget be spent where it matters: which twin data to weight, what to capture, and which real trials to run.</w:t>
+        <w:t xml:space="preserve">What the dissertation proposes.</w:t>
+      </w:r>
+      <w:r>
+        <w:rPr>
+          <w:rFonts w:cstheme="minorHAnsi"/>
+          <w:lang w:val="en-US"/>
+        </w:rPr>
+        <w:t xml:space="preserve"> The real data needed by the loop can be reduced by </w:t>
+      </w:r>
+      <w:r>
+        <w:rPr>
+          <w:rFonts w:cstheme="minorHAnsi"/>
+          <w:b/>
+          <w:lang w:val="en-US"/>
+        </w:rPr>
+        <w:t xml:space="preserve">allocating it actively</w:t>
+      </w:r>
+      <w:r>
+        <w:rPr>
+          <w:rFonts w:cstheme="minorHAnsi"/>
+          <w:lang w:val="en-US"/>
+        </w:rPr>
+        <w:t xml:space="preserve">: capture only what the policy needs to build the twin, train so that the policy is robust to the twin's errors, and collect only the few real rollouts that close the remaining gap. Two signals, both available without extra real data, guide these choices: the </w:t>
+      </w:r>
+      <w:r>
+        <w:rPr>
+          <w:rFonts w:cstheme="minorHAnsi"/>
+          <w:b/>
+          <w:lang w:val="en-US"/>
+        </w:rPr>
+        <w:t xml:space="preserve">uncertainty of the reconstruction</w:t>
+      </w:r>
+      <w:r>
+        <w:rPr>
+          <w:rFonts w:cstheme="minorHAnsi"/>
+          <w:lang w:val="en-US"/>
+        </w:rPr>
+        <w:t xml:space="preserve"> (where the twin is unreliable) and the </w:t>
+      </w:r>
+      <w:r>
+        <w:rPr>
+          <w:rFonts w:cstheme="minorHAnsi"/>
+          <w:b/>
+          <w:lang w:val="en-US"/>
+        </w:rPr>
+        <w:t xml:space="preserve">policy's own internal representations</w:t>
+      </w:r>
+      <w:r>
+        <w:rPr>
+          <w:rFonts w:cstheme="minorHAnsi"/>
+          <w:lang w:val="en-US"/>
+        </w:rPr>
+        <w:t xml:space="preserve"> (where twin and real inputs look different to the policy). The result is measured as a budget–performance curve: how much real data the loop needs to reach a given real success rate, compared with uniform allocation and with learning from real data only.</w:t>
       </w:r>
     </w:p>
     <w:p>
@@ -4387,7 +4423,7 @@
           <w:rFonts w:cstheme="minorHAnsi"/>
           <w:lang w:val="en-US"/>
         </w:rPr>
-        <w:t xml:space="preserve"> The object is a learning and evaluation methodology, not a robot or a simulator, which places it in </w:t>
+        <w:t xml:space="preserve"> The object is a data-efficient learning methodology (active learning, learning under distribution shift, uncertainty estimation), not a robot, a simulator or a benchmark, which places it in </w:t>
       </w:r>
       <w:r>
         <w:rPr>
@@ -4402,7 +4438,7 @@
           <w:rFonts w:cstheme="minorHAnsi"/>
           <w:lang w:val="en-US"/>
         </w:rPr>
-        <w:t xml:space="preserve"> (representation learning, learning under distribution shift, model analysis). The student uses existing twin pipelines and simulators and does not develop new ones. </w:t>
+        <w:t xml:space="preserve">. The student uses existing twin pipelines, simulators and public datasets and does not develop new ones. </w:t>
       </w:r>
       <w:r>
         <w:rPr>
@@ -4417,7 +4453,7 @@
           <w:rFonts w:cstheme="minorHAnsi"/>
           <w:lang w:val="en-US"/>
         </w:rPr>
-        <w:t xml:space="preserve"> is the primary testbed, because public scene datasets with real captures allow controlled, reproducible measurement without an own robot; </w:t>
+        <w:t xml:space="preserve"> is the primary testbed, because public scene datasets with dense real captures make it possible to count real data exactly without an own robot; </w:t>
       </w:r>
       <w:r>
         <w:rPr>
@@ -4432,7 +4468,7 @@
           <w:rFonts w:cstheme="minorHAnsi"/>
           <w:lang w:val="en-US"/>
         </w:rPr>
-        <w:t xml:space="preserve"> tests that the findings carry over to another task. Trials on a real robot (planned cooperation with a PWr robotics laboratory) validate, but do not decide, the conclusions. The topic fits the Department of Artificial Intelligence (K46), whose research groups include representation learning on graphs and models in weight space. The computation runs on the GPU infrastructure available to PWr researchers (WCSS, PLGrid). A benchmark of paired real and reconstructed data and a measured answer to "which representations survive reconstruction" are useful whatever the hypotheses' outcome.</w:t>
+        <w:t xml:space="preserve"> tests that the methods carry over to another task. Trials on a real robot (planned cooperation with a PWr robotics laboratory) validate, but do not decide, the conclusions. The topic fits the Department of Artificial Intelligence (K46), whose research groups include representation learning. The computation runs on the GPU infrastructure available to PWr researchers (WCSS, PLGrid).</w:t>
       </w:r>
     </w:p>
     <w:p>
@@ -4453,7 +4489,7 @@
           <w:rFonts w:cstheme="minorHAnsi"/>
           <w:lang w:val="en-US"/>
         </w:rPr>
-        <w:t xml:space="preserve"> faster and cheaper deployment of learned robots in new buildings and workcells (service, assistive, warehouse and inspection robotics, flexible manipulation); pre-deployment screening of candidate policies and safety monitors that flag likely failures; choosing which visual foundation models to use in twin-based training; and, beyond robotics, any system trained on reconstructed or synthetic data and deployed on real sensor data (industrial digital twins, perception for autonomous systems).</w:t>
+        <w:t xml:space="preserve"> faster and cheaper deployment of learned robots in new buildings and workcells (service, assistive, warehouse and inspection robotics, flexible manipulation), with less time spent recording scenes and supervising real trials; guidance on how to record a site for a twin; and, beyond robotics, any system trained on reconstructed or synthetic data and deployed on real sensor data (industrial digital twins, perception for autonomous systems), where real data must be collected on a budget.</w:t>
       </w:r>
     </w:p>
     <w:permEnd w:id="1178868985"/>
@@ -4824,14 +4860,14 @@
           <w:b/>
           <w:lang w:val="en-US"/>
         </w:rPr>
-        <w:t xml:space="preserve">Digital twins have become a commodity.</w:t>
-      </w:r>
-      <w:r>
-        <w:rPr>
-          <w:rFonts w:cstheme="minorHAnsi"/>
-          <w:lang w:val="en-US"/>
-        </w:rPr>
-        <w:t xml:space="preserve"> Photorealistic simulators such as Habitat [1] and domain randomization [2] made large-scale training of embodied agents possible. 3D Gaussian Splatting (3DGS) [3] now turns a short phone or camera capture into a real-time, photorealistic </w:t>
+        <w:t xml:space="preserve">Real-to-sim-to-real with neural digital twins.</w:t>
+      </w:r>
+      <w:r>
+        <w:rPr>
+          <w:rFonts w:cstheme="minorHAnsi"/>
+          <w:lang w:val="en-US"/>
+        </w:rPr>
+        <w:t xml:space="preserve"> Simulators such as Habitat [1] made large-scale training of embodied agents possible, but a generic simulator is not the robot's scene. 3D Gaussian Splatting (3DGS) [2] now turns a short camera capture into a real-time, photorealistic </w:t>
       </w:r>
       <w:r>
         <w:rPr>
@@ -4846,22 +4882,22 @@
           <w:rFonts w:cstheme="minorHAnsi"/>
           <w:lang w:val="en-US"/>
         </w:rPr>
-        <w:t xml:space="preserve">. Twin-trained policies transfer to real robots in navigation (EmbodiedSplat [4], Vid2Sim [5], GaussGym [6]) and manipulation (RialTo [7], SplatSim [8]), and GPU simulators ship twin environments (ManiSkill3 [9]). Building twins is therefore no longer the bottleneck. The open question is </w:t>
-      </w:r>
-      <w:r>
-        <w:rPr>
-          <w:rFonts w:cstheme="minorHAnsi"/>
-          <w:b/>
-          <w:lang w:val="en-US"/>
-        </w:rPr>
-        <w:t xml:space="preserve">when a twin-trained policy will work in reality, and why</w:t>
-      </w:r>
-      <w:r>
-        <w:rPr>
-          <w:rFonts w:cstheme="minorHAnsi"/>
-          <w:lang w:val="en-US"/>
-        </w:rPr>
-        <w:t xml:space="preserve">.</w:t>
+        <w:t xml:space="preserve"> of that scene. Policies trained in such twins transfer to real robots in navigation (EmbodiedSplat [3], Vid2Sim [4], GaussGym [5]) and manipulation (RialTo [6], SplatSim [7]), and GPU simulators ship twin environments (ManiSkill3 [8]). Building a twin is no longer the bottleneck; </w:t>
+      </w:r>
+      <w:r>
+        <w:rPr>
+          <w:rFonts w:cstheme="minorHAnsi"/>
+          <w:b/>
+          <w:lang w:val="en-US"/>
+        </w:rPr>
+        <w:t xml:space="preserve">real data</w:t>
+      </w:r>
+      <w:r>
+        <w:rPr>
+          <w:rFonts w:cstheme="minorHAnsi"/>
+          <w:lang w:val="en-US"/>
+        </w:rPr>
+        <w:t xml:space="preserve"> is: the capture that builds the twin and the real rollouts that correct the policy. Current systems fix this cost by hand. EmbodiedSplat uses a 20–30-minute phone capture per scene, and RialTo builds its twins from "small amounts of real-world data"; its ablation over 0–15 real demonstrations is the closest published analysis of a real-data budget.</w:t>
       </w:r>
     </w:p>
     <w:p>
@@ -4875,29 +4911,22 @@
           <w:b/>
           <w:lang w:val="en-US"/>
         </w:rPr>
-        <w:t xml:space="preserve">Predicting real performance from simulation.</w:t>
-      </w:r>
-      <w:r>
-        <w:rPr>
-          <w:rFonts w:cstheme="minorHAnsi"/>
-          <w:lang w:val="en-US"/>
-        </w:rPr>
-        <w:t xml:space="preserve"> Kadian et al. [10] introduced the Sim-vs-Real Correlation Coefficient (SRCC) and showed that simulation can poorly predict real navigation results. Truong et al. [11] found that lower-fidelity simulation can transfer better, so image fidelity is not the same as transfer. SIMPLER [12] reports strong sim-real correlation for manipulation evaluation, and pretrained visual representations rank similarly in simulation and reality [13]. All of these measure transfer at the level of </w:t>
-      </w:r>
-      <w:r>
-        <w:rPr>
-          <w:rFonts w:cstheme="minorHAnsi"/>
-          <w:i/>
-          <w:lang w:val="en-US"/>
-        </w:rPr>
-        <w:t xml:space="preserve">simulators</w:t>
-      </w:r>
-      <w:r>
-        <w:rPr>
-          <w:rFonts w:cstheme="minorHAnsi"/>
-          <w:lang w:val="en-US"/>
-        </w:rPr>
-        <w:t xml:space="preserve"> and success rates, after deployment.</w:t>
+        <w:t xml:space="preserve">How much real data does transfer need?</w:t>
+      </w:r>
+      <w:r>
+        <w:rPr>
+          <w:rFonts w:cstheme="minorHAnsi"/>
+          <w:lang w:val="en-US"/>
+        </w:rPr>
+        <w:t xml:space="preserve"> Real-only scaling studies relate performance to the number of real demonstrations in manipulation [9]; in navigation, diversity matters more than quantity and more data from a known location saturates quickly [10]. On the twin side, CASHER [11] reports performance that scales super-linearly with human effort, X-Sim [12] matches behaviour cloning with ten times less data-collection time, and sim-and-real co-training raises real success by 38% on average [13]. Simulation can poorly predict real navigation results (Sim-vs-Real Correlation Coefficient, SRCC [14]), and lower-fidelity simulation can transfer better [15], so more capture is not automatically better. All of these report results at fixed or hand-chosen budgets. </w:t>
+      </w:r>
+      <w:r>
+        <w:rPr>
+          <w:rFonts w:cstheme="minorHAnsi"/>
+          <w:b/>
+          <w:lang w:val="en-US"/>
+        </w:rPr>
+        <w:t xml:space="preserve">We found no study that varies the capture budget of a twin as an experimental variable in navigation, or that fits real-data budget curves for the whole loop against real-only learning.</w:t>
       </w:r>
     </w:p>
     <w:p>
@@ -4911,22 +4940,14 @@
           <w:b/>
           <w:lang w:val="en-US"/>
         </w:rPr>
-        <w:t xml:space="preserve">The representation gap.</w:t>
-      </w:r>
-      <w:r>
-        <w:rPr>
-          <w:rFonts w:cstheme="minorHAnsi"/>
-          <w:lang w:val="en-US"/>
-        </w:rPr>
-        <w:t xml:space="preserve"> Sim-and-real co-training works with few real demonstrations [14], domain adaptation aligns sim and real features [15], and a mechanistic analysis finds that "structured representation alignment" is the primary effect of co-training [16]. ScanNet++ [17] pairs real captures of rooms with reference scans. Linear probes [18] and centered kernel alignment (CKA) [19] measure what each layer encodes and how similar two representations are. Frozen image and video encoders (DINOv2 [20], V-JEPA 2 [21]) are common policy backbones, and probing of vision-language-action models shows that action fine-tuning degrades their visual representations [22]. However, </w:t>
-      </w:r>
-      <w:r>
-        <w:rPr>
-          <w:rFonts w:cstheme="minorHAnsi"/>
-          <w:b/>
-          <w:lang w:val="en-US"/>
-        </w:rPr>
-        <w:t xml:space="preserve">we found no study that measured, on paired real and twin-rendered frames of the same pose, where inside encoders and policies the twin-vs-real gap arises, or how it shrinks with the capture budget.</w:t>
+        <w:t xml:space="preserve">Capturing less: active reconstruction and its uncertainty.</w:t>
+      </w:r>
+      <w:r>
+        <w:rPr>
+          <w:rFonts w:cstheme="minorHAnsi"/>
+          <w:lang w:val="en-US"/>
+        </w:rPr>
+        <w:t xml:space="preserve"> Active view selection chooses the images that improve a reconstruction most: FisherRF [16] maximizes the expected information gain on radiance-field parameters, GenNBV [17] learns a next-best-view policy that generalizes across scenes, and Bayes' Rays [18] estimates a volumetric uncertainty field for a trained neural radiance field. Their objective is reconstruction quality or coverage, not what a downstream policy needs; task-aware capture for twins has only 0–2 Semantic Scholar hits per year (2023–2026). ScanNet++ [19] pairs real captures of rooms with reference laser scans, so capture budgets can be varied offline.</w:t>
       </w:r>
     </w:p>
     <w:p>
@@ -4940,29 +4961,28 @@
           <w:b/>
           <w:lang w:val="en-US"/>
         </w:rPr>
-        <w:t xml:space="preserve">Predicting performance from model internals.</w:t>
-      </w:r>
-      <w:r>
-        <w:rPr>
-          <w:rFonts w:cstheme="minorHAnsi"/>
-          <w:lang w:val="en-US"/>
-        </w:rPr>
-        <w:t xml:space="preserve"> Accuracy under distribution shift can be estimated from unlabeled target data [23]. A network's accuracy can be predicted from its weights alone [24], and populations of trained models ("model zoos" [25]) are now inputs to weight-space learning: equivariant metanetworks [26] learn directly on weights, and graph neural networks over the computational graph [27] predict generalization. They have been tested on image classifiers and implicit neural representations, </w:t>
-      </w:r>
-      <w:r>
-        <w:rPr>
-          <w:rFonts w:cstheme="minorHAnsi"/>
-          <w:b/>
-          <w:lang w:val="en-US"/>
-        </w:rPr>
-        <w:t xml:space="preserve">not on embodied policies or twin-to-real transfer</w:t>
-      </w:r>
-      <w:r>
-        <w:rPr>
-          <w:rFonts w:cstheme="minorHAnsi"/>
-          <w:lang w:val="en-US"/>
-        </w:rPr>
-        <w:t xml:space="preserve">.</w:t>
+        <w:t xml:space="preserve">Training robustly on an imperfect twin.</w:t>
+      </w:r>
+      <w:r>
+        <w:rPr>
+          <w:rFonts w:cstheme="minorHAnsi"/>
+          <w:lang w:val="en-US"/>
+        </w:rPr>
+        <w:t xml:space="preserve"> Domain randomization varies appearance [20] or dynamics [21] uniformly within hand-set ranges, and SimOpt [22] adapts the randomization distribution from a few real rollouts. Domain adaptation aligns sim and real features in co-training [23], and a mechanistic analysis finds that representation alignment is the main effect of co-training [24]. Frozen encoders such as DINOv2</w:t>
+      </w:r>
+    </w:p>
+    <w:p>
+      <w:pPr>
+        <w:spacing w:after="0" w:line="240" w:lineRule="auto"/>
+        <w:ind w:left="397" w:hanging="397"/>
+        <w:jc w:val="left"/>
+      </w:pPr>
+      <w:r>
+        <w:rPr>
+          <w:rFonts w:cstheme="minorHAnsi"/>
+          <w:lang w:val="en-US"/>
+        </w:rPr>
+        <w:t xml:space="preserve">[25] allow twin and real frames to be compared, and Phys2Real [26] trains with uncertainty over physical</w:t>
       </w:r>
     </w:p>
     <w:p>
@@ -4973,32 +4993,24 @@
       <w:r>
         <w:rPr>
           <w:rFonts w:cstheme="minorHAnsi"/>
-          <w:b/>
-          <w:lang w:val="en-US"/>
-        </w:rPr>
-        <w:t xml:space="preserve">Failure prediction and calibrated monitoring.</w:t>
-      </w:r>
-      <w:r>
-        <w:rPr>
-          <w:rFonts w:cstheme="minorHAnsi"/>
-          <w:lang w:val="en-US"/>
-        </w:rPr>
-        <w:t xml:space="preserve"> Conformal prediction [28] gives distribution-free guarantees. FAIL-Detect [29] detects failures of imitation policies without failure data and calibrates thresholds with conformal prediction, and SAFE [30] finds that the features of vision-language-action models encode task success and failure across tasks. These monitors are calibrated and tested in the </w:t>
-      </w:r>
-      <w:r>
-        <w:rPr>
-          <w:rFonts w:cstheme="minorHAnsi"/>
-          <w:i/>
-          <w:lang w:val="en-US"/>
-        </w:rPr>
-        <w:t xml:space="preserve">same</w:t>
-      </w:r>
-      <w:r>
-        <w:rPr>
-          <w:rFonts w:cstheme="minorHAnsi"/>
-          <w:lang w:val="en-US"/>
-        </w:rPr>
-        <w:t xml:space="preserve"> domain. Whether a monitor calibrated in the twin keeps its coverage on real data has not been studied.</w:t>
+          <w:lang w:val="en-US"/>
+        </w:rPr>
+        <w:t xml:space="preserve">parameters. Still, a twin's own </w:t>
+      </w:r>
+      <w:r>
+        <w:rPr>
+          <w:rFonts w:cstheme="minorHAnsi"/>
+          <w:b/>
+          <w:lang w:val="en-US"/>
+        </w:rPr>
+        <w:t xml:space="preserve">reconstruction uncertainty</w:t>
+      </w:r>
+      <w:r>
+        <w:rPr>
+          <w:rFonts w:cstheme="minorHAnsi"/>
+          <w:lang w:val="en-US"/>
+        </w:rPr>
+        <w:t xml:space="preserve"> is rarely used as a training signal (0–1 hits per year), and weighting twin samples by their representation distance to a small real set appeared in one paper in 2023–2026.</w:t>
       </w:r>
     </w:p>
     <w:p>
@@ -5012,14 +5024,28 @@
           <w:b/>
           <w:lang w:val="en-US"/>
         </w:rPr>
-        <w:t xml:space="preserve">Spending a small real-data budget.</w:t>
-      </w:r>
-      <w:r>
-        <w:rPr>
-          <w:rFonts w:cstheme="minorHAnsi"/>
-          <w:lang w:val="en-US"/>
-        </w:rPr>
-        <w:t xml:space="preserve"> Data attribution estimates how training examples affect predictions [31], and CUPID [32] ranks robot demonstrations by their influence on closed-loop success. Prediction-powered inference [33] combines many cheap predictions with a few labels, and SureSim [34] uses it to correct simulated evaluation with a few paired real trials. Learned world models are also proposed as policy evaluators [35]. These tools treat the policy as a black box; none uses its internal representations to decide which twin data to weight, what to capture or which real rollouts to collect.</w:t>
+        <w:t xml:space="preserve">Collecting few real rollouts.</w:t>
+      </w:r>
+      <w:r>
+        <w:rPr>
+          <w:rFonts w:cstheme="minorHAnsi"/>
+          <w:lang w:val="en-US"/>
+        </w:rPr>
+        <w:t xml:space="preserve"> Active learning selects the most informative real samples for sim-to-real adaptation in grasping [27], AMF [28] chooses which tasks to demonstrate under a demonstration budget, and active experiment selection reduces the cost of real evaluation [29]. CUPID [30] and DataMIL [31] select training data by its influence on closed-loop success. Prediction-powered inference [32] combines many cheap predictions with a few labels, SureSim [33] applies it to simulated and real trials, and SIMPLER</w:t>
+      </w:r>
+    </w:p>
+    <w:p>
+      <w:pPr>
+        <w:spacing w:after="0" w:line="240" w:lineRule="auto"/>
+        <w:ind w:left="397" w:hanging="397"/>
+        <w:jc w:val="left"/>
+      </w:pPr>
+      <w:r>
+        <w:rPr>
+          <w:rFonts w:cstheme="minorHAnsi"/>
+          <w:lang w:val="en-US"/>
+        </w:rPr>
+        <w:t xml:space="preserve">[34] shows that simulated evaluation of manipulation policies can track real evaluation. GaussTwin [35]</w:t>
       </w:r>
     </w:p>
     <w:p>
@@ -5030,6 +5056,19 @@
       <w:r>
         <w:rPr>
           <w:rFonts w:cstheme="minorHAnsi"/>
+          <w:lang w:val="en-US"/>
+        </w:rPr>
+        <w:t xml:space="preserve">corrects a 3DGS twin from photometric error. These methods select demonstrations, tasks or trials; none selects the real rollouts that should correct a reconstructed twin and its policy.</w:t>
+      </w:r>
+    </w:p>
+    <w:p>
+      <w:pPr>
+        <w:spacing w:after="120" w:line="240" w:lineRule="auto"/>
+        <w:jc w:val="both"/>
+      </w:pPr>
+      <w:r>
+        <w:rPr>
+          <w:rFonts w:cstheme="minorHAnsi"/>
           <w:b/>
           <w:lang w:val="en-US"/>
         </w:rPr>
@@ -5040,22 +5079,7 @@
           <w:rFonts w:cstheme="minorHAnsi"/>
           <w:lang w:val="en-US"/>
         </w:rPr>
-        <w:t xml:space="preserve"> Twins are widely available, but there is </w:t>
-      </w:r>
-      <w:r>
-        <w:rPr>
-          <w:rFonts w:cstheme="minorHAnsi"/>
-          <w:b/>
-          <w:lang w:val="en-US"/>
-        </w:rPr>
-        <w:t xml:space="preserve">no representation-level account of how twin-trained policies transfer to reality</w:t>
-      </w:r>
-      <w:r>
-        <w:rPr>
-          <w:rFonts w:cstheme="minorHAnsi"/>
-          <w:lang w:val="en-US"/>
-        </w:rPr>
-        <w:t xml:space="preserve">. Missing are (i) a paired real/twin benchmark that localizes the gap inside encoders and policies across capture budgets, (ii) predictors of real transfer and failure from policy internals (weights, hidden states) that beat simulator-level and image-fidelity baselines, (iii) methods that use such forecasts to spend a limited real-data budget, and (iv) evidence that these measures carry over from navigation to manipulation. This dissertation addresses that gap.</w:t>
+        <w:t xml:space="preserve"> Real-to-sim-to-real works, but its real-data cost is set by hand and spent uniformly. Missing are (i) task-aware, uncertainty-guided capture judged by downstream policy success rather than image quality (RQ1), (ii) training that uses the twin's reconstruction uncertainty and its representation distance to a small real set (RQ2), (iii) active selection of the few real rollouts that correct the twin and the policy (RQ3), and (iv) a total real-data budget curve of the full loop against real-only learning, in navigation and manipulation (RQ4). This dissertation addresses that gap.</w:t>
       </w:r>
     </w:p>
     <w:p>
@@ -5098,7 +5122,7 @@
           <w:rFonts w:cstheme="minorHAnsi"/>
           <w:lang w:val="en-US"/>
         </w:rPr>
-        <w:t xml:space="preserve">[2] J. Tobin et al., "Domain Randomization for Transferring Deep Neural Networks…," IROS, 2017.</w:t>
+        <w:t xml:space="preserve">[2] B. Kerbl et al., "3D Gaussian Splatting," ACM TOG, 2023.</w:t>
       </w:r>
     </w:p>
     <w:p>
@@ -5112,7 +5136,7 @@
           <w:rFonts w:cstheme="minorHAnsi"/>
           <w:lang w:val="en-US"/>
         </w:rPr>
-        <w:t xml:space="preserve">[3] B. Kerbl et al., "3D Gaussian Splatting," ACM TOG, 2023.</w:t>
+        <w:t xml:space="preserve">[3] G. Chhablani et al., "EmbodiedSplat," ICCV, 2025.</w:t>
       </w:r>
     </w:p>
     <w:p>
@@ -5126,7 +5150,7 @@
           <w:rFonts w:cstheme="minorHAnsi"/>
           <w:lang w:val="en-US"/>
         </w:rPr>
-        <w:t xml:space="preserve">[4] G. Chhablani et al., "EmbodiedSplat," ICCV, 2025.</w:t>
+        <w:t xml:space="preserve">[4] Z. Xie et al., "Vid2Sim," CVPR, 2025.</w:t>
       </w:r>
     </w:p>
     <w:p>
@@ -5140,7 +5164,7 @@
           <w:rFonts w:cstheme="minorHAnsi"/>
           <w:lang w:val="en-US"/>
         </w:rPr>
-        <w:t xml:space="preserve">[5] Z. Xie et al., "Vid2Sim," CVPR, 2025.</w:t>
+        <w:t xml:space="preserve">[5] A. Escontrela et al., "GaussGym," arXiv:2510.15352, 2025.</w:t>
       </w:r>
     </w:p>
     <w:p>
@@ -5154,7 +5178,7 @@
           <w:rFonts w:cstheme="minorHAnsi"/>
           <w:lang w:val="en-US"/>
         </w:rPr>
-        <w:t xml:space="preserve">[6] A. Escontrela et al., "GaussGym," arXiv:2510.15352, 2025.</w:t>
+        <w:t xml:space="preserve">[6] M. Torne et al., "Reconciling Reality through Simulation," RSS, 2024.</w:t>
       </w:r>
     </w:p>
     <w:p>
@@ -5168,7 +5192,7 @@
           <w:rFonts w:cstheme="minorHAnsi"/>
           <w:lang w:val="en-US"/>
         </w:rPr>
-        <w:t xml:space="preserve">[7] M. Torne et al., "Reconciling Reality through Simulation," RSS, 2024.</w:t>
+        <w:t xml:space="preserve">[7] M. N. Qureshi et al., "SplatSim," ICRA, 2025.</w:t>
       </w:r>
     </w:p>
     <w:p>
@@ -5182,7 +5206,7 @@
           <w:rFonts w:cstheme="minorHAnsi"/>
           <w:lang w:val="en-US"/>
         </w:rPr>
-        <w:t xml:space="preserve">[8] M. N. Qureshi et al., "SplatSim," ICRA, 2025.</w:t>
+        <w:t xml:space="preserve">[8] S. Tao et al., "ManiSkill3," RSS, 2025.</w:t>
       </w:r>
     </w:p>
     <w:p>
@@ -5196,7 +5220,7 @@
           <w:rFonts w:cstheme="minorHAnsi"/>
           <w:lang w:val="en-US"/>
         </w:rPr>
-        <w:t xml:space="preserve">[9] S. Tao et al., "ManiSkill3," RSS, 2025.</w:t>
+        <w:t xml:space="preserve">[9] F. Lin et al., "Data Scaling Laws in Imitation Learning…," ICLR, 2025.</w:t>
       </w:r>
     </w:p>
     <w:p>
@@ -5210,7 +5234,7 @@
           <w:rFonts w:cstheme="minorHAnsi"/>
           <w:lang w:val="en-US"/>
         </w:rPr>
-        <w:t xml:space="preserve">[10] A. Kadian et al., "Sim2Real Predictivity," IEEE RA-L, 2020.</w:t>
+        <w:t xml:space="preserve">[10] L. Suomela et al., "Data Scaling for Navigation…," IEEE RA-L, 2026.</w:t>
       </w:r>
     </w:p>
     <w:p>
@@ -5224,7 +5248,7 @@
           <w:rFonts w:cstheme="minorHAnsi"/>
           <w:lang w:val="en-US"/>
         </w:rPr>
-        <w:t xml:space="preserve">[11] J. Truong et al., "Rethinking Sim2Real," CoRL, 2022.</w:t>
+        <w:t xml:space="preserve">[11] M. Torne et al., "Robot Learning with Super-Linear Scaling," arXiv:2412.01770, 2024.</w:t>
       </w:r>
     </w:p>
     <w:p>
@@ -5238,7 +5262,7 @@
           <w:rFonts w:cstheme="minorHAnsi"/>
           <w:lang w:val="en-US"/>
         </w:rPr>
-        <w:t xml:space="preserve">[12] X. Li et al., "Evaluating Real-World Robot Manipulation Policies…," CoRL, 2024.</w:t>
+        <w:t xml:space="preserve">[12] P. Dan et al., "X-Sim," arXiv:2505.07096, 2025.</w:t>
       </w:r>
     </w:p>
     <w:p>
@@ -5252,7 +5276,7 @@
           <w:rFonts w:cstheme="minorHAnsi"/>
           <w:lang w:val="en-US"/>
         </w:rPr>
-        <w:t xml:space="preserve">[13] S. Silwal et al., "What Do We Learn from a Large-Scale Study of Pre-Trained Visual…," ICRA, 2024.</w:t>
+        <w:t xml:space="preserve">[13] A. Maddukuri et al., "Sim-and-Real Co-Training," RSS, 2025.</w:t>
       </w:r>
     </w:p>
     <w:p>
@@ -5266,7 +5290,7 @@
           <w:rFonts w:cstheme="minorHAnsi"/>
           <w:lang w:val="en-US"/>
         </w:rPr>
-        <w:t xml:space="preserve">[14] A. Maddukuri et al., "Sim-and-Real Co-Training," RSS, 2025.</w:t>
+        <w:t xml:space="preserve">[14] A. Kadian et al., "Sim2Real Predictivity," IEEE RA-L, 2020.</w:t>
       </w:r>
     </w:p>
     <w:p>
@@ -5280,7 +5304,7 @@
           <w:rFonts w:cstheme="minorHAnsi"/>
           <w:lang w:val="en-US"/>
         </w:rPr>
-        <w:t xml:space="preserve">[15] S. Cheng et al., "Generalizable Domain Adaptation for Sim-and-Real…," NeurIPS, 2025.</w:t>
+        <w:t xml:space="preserve">[15] J. Truong et al., "Rethinking Sim2Real," CoRL, 2022.</w:t>
       </w:r>
     </w:p>
     <w:p>
@@ -5294,7 +5318,7 @@
           <w:rFonts w:cstheme="minorHAnsi"/>
           <w:lang w:val="en-US"/>
         </w:rPr>
-        <w:t xml:space="preserve">[16] Y. Lei et al., "A Mechanistic Analysis of Sim-and-Real Co-Training…," arXiv:2604.13645, 2026.</w:t>
+        <w:t xml:space="preserve">[16] W. Jiang et al., "FisherRF," ECCV, 2024.</w:t>
       </w:r>
     </w:p>
     <w:p>
@@ -5308,7 +5332,7 @@
           <w:rFonts w:cstheme="minorHAnsi"/>
           <w:lang w:val="en-US"/>
         </w:rPr>
-        <w:t xml:space="preserve">[17] C. Yeshwanth et al., "ScanNet++," ICCV, 2023.</w:t>
+        <w:t xml:space="preserve">[17] X. Chen et al., "GenNBV," CVPR, 2024.</w:t>
       </w:r>
     </w:p>
     <w:p>
@@ -5322,7 +5346,7 @@
           <w:rFonts w:cstheme="minorHAnsi"/>
           <w:lang w:val="en-US"/>
         </w:rPr>
-        <w:t xml:space="preserve">[18] G. Alain, Y. Bengio, "Understanding Intermediate Layers Using Linear…," arXiv:1610.01644, 2016.</w:t>
+        <w:t xml:space="preserve">[18] L. Goli et al., "Bayes' Rays," CVPR, 2024.</w:t>
       </w:r>
     </w:p>
     <w:p>
@@ -5336,7 +5360,7 @@
           <w:rFonts w:cstheme="minorHAnsi"/>
           <w:lang w:val="en-US"/>
         </w:rPr>
-        <w:t xml:space="preserve">[19] S. Kornblith et al., "Similarity of Neural Network Representations…," ICML, 2019.</w:t>
+        <w:t xml:space="preserve">[19] C. Yeshwanth et al., "ScanNet++," ICCV, 2023.</w:t>
       </w:r>
     </w:p>
     <w:p>
@@ -5350,7 +5374,7 @@
           <w:rFonts w:cstheme="minorHAnsi"/>
           <w:lang w:val="en-US"/>
         </w:rPr>
-        <w:t xml:space="preserve">[20] M. Oquab et al., "DINOv2," TMLR, 2024.</w:t>
+        <w:t xml:space="preserve">[20] J. Tobin et al., "Domain Randomization…," IROS, 2017.</w:t>
       </w:r>
     </w:p>
     <w:p>
@@ -5364,7 +5388,7 @@
           <w:rFonts w:cstheme="minorHAnsi"/>
           <w:lang w:val="en-US"/>
         </w:rPr>
-        <w:t xml:space="preserve">[21] M. Assran et al., "V-JEPA 2," arXiv:2506.09985, 2025.</w:t>
+        <w:t xml:space="preserve">[21] X. B. Peng et al., "Sim-to-Real Transfer… with Dynamics Randomization," ICRA, 2018.</w:t>
       </w:r>
     </w:p>
     <w:p>
@@ -5378,7 +5402,7 @@
           <w:rFonts w:cstheme="minorHAnsi"/>
           <w:lang w:val="en-US"/>
         </w:rPr>
-        <w:t xml:space="preserve">[22] N. Kachaev et al., "Don't Blind Your VLA," arXiv:2510.25616, 2025.</w:t>
+        <w:t xml:space="preserve">[22] Y. Chebotar et al., "Closing the Sim-to-Real Loop," ICRA, 2019.</w:t>
       </w:r>
     </w:p>
     <w:p>
@@ -5392,7 +5416,7 @@
           <w:rFonts w:cstheme="minorHAnsi"/>
           <w:lang w:val="en-US"/>
         </w:rPr>
-        <w:t xml:space="preserve">[23] S. Garg et al., "Leveraging Unlabeled Data to Predict OOD Performance," ICLR, 2022.</w:t>
+        <w:t xml:space="preserve">[23] S. Cheng et al., "Generalizable Domain Adaptation for Sim-and-Real…," NeurIPS, 2025.</w:t>
       </w:r>
     </w:p>
     <w:p>
@@ -5406,7 +5430,7 @@
           <w:rFonts w:cstheme="minorHAnsi"/>
           <w:lang w:val="en-US"/>
         </w:rPr>
-        <w:t xml:space="preserve">[24] T. Unterthiner et al., "Predicting Neural Network Accuracy…," arXiv:2002.11448, 2020.</w:t>
+        <w:t xml:space="preserve">[24] Y. Lei et al., "A Mechanistic Analysis of Sim-and-Real Co-Training…," arXiv:2604.13645, 2026.</w:t>
       </w:r>
     </w:p>
     <w:p>
@@ -5420,7 +5444,7 @@
           <w:rFonts w:cstheme="minorHAnsi"/>
           <w:lang w:val="en-US"/>
         </w:rPr>
-        <w:t xml:space="preserve">[25] K. Schürholt et al., "Model Zoos," NeurIPS Datasets and Benchmarks, 2022.</w:t>
+        <w:t xml:space="preserve">[25] M. Oquab et al., "DINOv2," TMLR, 2024.</w:t>
       </w:r>
     </w:p>
     <w:p>
@@ -5434,7 +5458,7 @@
           <w:rFonts w:cstheme="minorHAnsi"/>
           <w:lang w:val="en-US"/>
         </w:rPr>
-        <w:t xml:space="preserve">[26] A. Navon et al., "Equivariant Architectures for Deep Weight Spaces," ICML, 2023.</w:t>
+        <w:t xml:space="preserve">[26] M. Wang et al., "Phys2Real," arXiv:2510.11689, 2025.</w:t>
       </w:r>
     </w:p>
     <w:p>
@@ -5448,7 +5472,7 @@
           <w:rFonts w:cstheme="minorHAnsi"/>
           <w:lang w:val="en-US"/>
         </w:rPr>
-        <w:t xml:space="preserve">[27] M. Kofinas et al., "Graph Neural Networks for Learning Equivariant…," ICLR, 2024.</w:t>
+        <w:t xml:space="preserve">[27] M. Gilles et al., "MetaMVUC," IEEE RA-L, 2025.</w:t>
       </w:r>
     </w:p>
     <w:p>
@@ -5462,7 +5486,7 @@
           <w:rFonts w:cstheme="minorHAnsi"/>
           <w:lang w:val="en-US"/>
         </w:rPr>
-        <w:t xml:space="preserve">[28] A. N. Angelopoulos, S. Bates, "A Gentle Introduction to Conformal…," arXiv:2107.07511, 2021.</w:t>
+        <w:t xml:space="preserve">[28] M. Bagatella et al., "Active Fine-Tuning of Multi-Task Policies," ICML, 2025.</w:t>
       </w:r>
     </w:p>
     <w:p>
@@ -5476,7 +5500,7 @@
           <w:rFonts w:cstheme="minorHAnsi"/>
           <w:lang w:val="en-US"/>
         </w:rPr>
-        <w:t xml:space="preserve">[29] C. Xu et al., "Can We Detect Failures Without Failure Data?," RSS, 2025.</w:t>
+        <w:t xml:space="preserve">[29] A. Anwar et al., "Efficient Evaluation of Multi-Task Robot Policies…," arXiv:2502.09829, 2025.</w:t>
       </w:r>
     </w:p>
     <w:p>
@@ -5490,7 +5514,7 @@
           <w:rFonts w:cstheme="minorHAnsi"/>
           <w:lang w:val="en-US"/>
         </w:rPr>
-        <w:t xml:space="preserve">[30] Q. Gu et al., "SAFE," NeurIPS, 2025.</w:t>
+        <w:t xml:space="preserve">[30] C. Agia et al., "CUPID," arXiv:2506.19121, 2025.</w:t>
       </w:r>
     </w:p>
     <w:p>
@@ -5504,7 +5528,7 @@
           <w:rFonts w:cstheme="minorHAnsi"/>
           <w:lang w:val="en-US"/>
         </w:rPr>
-        <w:t xml:space="preserve">[31] S. M. Park et al., "TRAK," ICML, 2023.</w:t>
+        <w:t xml:space="preserve">[31] S. Dass et al., "DataMIL," arXiv:2505.09603, 2025.</w:t>
       </w:r>
     </w:p>
     <w:p>
@@ -5518,7 +5542,7 @@
           <w:rFonts w:cstheme="minorHAnsi"/>
           <w:lang w:val="en-US"/>
         </w:rPr>
-        <w:t xml:space="preserve">[32] C. Agia et al., "CUPID," arXiv:2506.19121, 2025.</w:t>
+        <w:t xml:space="preserve">[32] A. N. Angelopoulos et al., "Prediction-Powered Inference," Science, 2023.</w:t>
       </w:r>
     </w:p>
     <w:p>
@@ -5532,7 +5556,7 @@
           <w:rFonts w:cstheme="minorHAnsi"/>
           <w:lang w:val="en-US"/>
         </w:rPr>
-        <w:t xml:space="preserve">[33] A. N. Angelopoulos et al., "Prediction-Powered Inference," Science, 2023.</w:t>
+        <w:t xml:space="preserve">[33] A. Badithela et al., "Reliable and Scalable Robot Policy Evaluation…," arXiv:2510.04354, 2025.</w:t>
       </w:r>
     </w:p>
     <w:p>
@@ -5546,7 +5570,7 @@
           <w:rFonts w:cstheme="minorHAnsi"/>
           <w:lang w:val="en-US"/>
         </w:rPr>
-        <w:t xml:space="preserve">[34] A. Badithela et al., "Reliable and Scalable Robot Policy Evaluation…," arXiv:2510.04354, 2025.</w:t>
+        <w:t xml:space="preserve">[34] X. Li et al., "Evaluating Real-World Robot Manipulation Policies…," CoRL, 2024.</w:t>
       </w:r>
     </w:p>
     <w:p>
@@ -5560,7 +5584,7 @@
           <w:rFonts w:cstheme="minorHAnsi"/>
           <w:lang w:val="en-US"/>
         </w:rPr>
-        <w:t xml:space="preserve">[35] Y. Li et al., "WorldEval," arXiv:2505.19017, 2025.</w:t>
+        <w:t xml:space="preserve">[35] Y. Cai et al., "GaussTwin," arXiv:2603.05108, 2026.</w:t>
       </w:r>
     </w:p>
     <w:permEnd w:id="174659581"/>
@@ -5802,22 +5826,22 @@
           <w:rFonts w:cstheme="minorHAnsi"/>
           <w:lang w:val="en-US"/>
         </w:rPr>
-        <w:t xml:space="preserve"> How well embodied policies trained in neural-reconstruction digital twins transfer to the real world can be </w:t>
-      </w:r>
-      <w:r>
-        <w:rPr>
-          <w:rFonts w:cstheme="minorHAnsi"/>
-          <w:b/>
-          <w:lang w:val="en-US"/>
-        </w:rPr>
-        <w:t xml:space="preserve">measured, localized and predicted from their internal representations</w:t>
-      </w:r>
-      <w:r>
-        <w:rPr>
-          <w:rFonts w:cstheme="minorHAnsi"/>
-          <w:lang w:val="en-US"/>
-        </w:rPr>
-        <w:t xml:space="preserve">, and this lets a limited real-data budget be spent where it matters. Navigation is the primary testbed; manipulation is the cross-task test. RQ1–RQ2 (H1–H2) are the core of the dissertation; RQ3–RQ4 (H3–H4) build on them.</w:t>
+        <w:t xml:space="preserve"> The real data needed in a real-to-sim-to-real loop can be reduced substantially by </w:t>
+      </w:r>
+      <w:r>
+        <w:rPr>
+          <w:rFonts w:cstheme="minorHAnsi"/>
+          <w:b/>
+          <w:lang w:val="en-US"/>
+        </w:rPr>
+        <w:t xml:space="preserve">allocating it actively</w:t>
+      </w:r>
+      <w:r>
+        <w:rPr>
+          <w:rFonts w:cstheme="minorHAnsi"/>
+          <w:lang w:val="en-US"/>
+        </w:rPr>
+        <w:t xml:space="preserve">: capture only what the policy needs to build the twin, train so that the policy is robust to what the twin got wrong, and collect only the few real rollouts that close the remaining gap. Reconstruction uncertainty and the policy's own representations guide all three steps. Testbeds: navigation (primary), manipulation (cross-task).</w:t>
       </w:r>
     </w:p>
     <w:p>
@@ -5831,14 +5855,29 @@
           <w:b/>
           <w:lang w:val="en-US"/>
         </w:rPr>
-        <w:t xml:space="preserve">Setting.</w:t>
-      </w:r>
-      <w:r>
-        <w:rPr>
-          <w:rFonts w:cstheme="minorHAnsi"/>
-          <w:lang w:val="en-US"/>
-        </w:rPr>
-        <w:t xml:space="preserve"> A </w:t>
+        <w:t xml:space="preserve">Tier A protocol (proxy reality).</w:t>
+      </w:r>
+      <w:r>
+        <w:rPr>
+          <w:rFonts w:cstheme="minorHAnsi"/>
+          <w:lang w:val="en-US"/>
+        </w:rPr>
+        <w:t xml:space="preserve"> On ≥ 10 public indoor scenes with dense real captures and reference scans (e.g. ScanNet++, some held out), a </w:t>
+      </w:r>
+      <w:r>
+        <w:rPr>
+          <w:rFonts w:cstheme="minorHAnsi"/>
+          <w:b/>
+          <w:lang w:val="en-US"/>
+        </w:rPr>
+        <w:t xml:space="preserve">high-fidelity reference built from the full capture plays "reality"</w:t>
+      </w:r>
+      <w:r>
+        <w:rPr>
+          <w:rFonts w:cstheme="minorHAnsi"/>
+          <w:lang w:val="en-US"/>
+        </w:rPr>
+        <w:t xml:space="preserve">; a 3D Gaussian Splatting </w:t>
       </w:r>
       <w:r>
         <w:rPr>
@@ -5853,82 +5892,7 @@
           <w:rFonts w:cstheme="minorHAnsi"/>
           <w:lang w:val="en-US"/>
         </w:rPr>
-        <w:t xml:space="preserve"> is a 3D Gaussian Splatting reconstruction of a real scene built from a short capture; the </w:t>
-      </w:r>
-      <w:r>
-        <w:rPr>
-          <w:rFonts w:cstheme="minorHAnsi"/>
-          <w:i/>
-          <w:lang w:val="en-US"/>
-        </w:rPr>
-        <w:t xml:space="preserve">capture budget</w:t>
-      </w:r>
-      <w:r>
-        <w:rPr>
-          <w:rFonts w:cstheme="minorHAnsi"/>
-          <w:lang w:val="en-US"/>
-        </w:rPr>
-        <w:t xml:space="preserve"> is the number of capture minutes (views). Evaluation tiers: </w:t>
-      </w:r>
-      <w:r>
-        <w:rPr>
-          <w:rFonts w:cstheme="minorHAnsi"/>
-          <w:b/>
-          <w:lang w:val="en-US"/>
-        </w:rPr>
-        <w:t xml:space="preserve">(A)</w:t>
-      </w:r>
-      <w:r>
-        <w:rPr>
-          <w:rFonts w:cstheme="minorHAnsi"/>
-          <w:lang w:val="en-US"/>
-        </w:rPr>
-        <w:t xml:space="preserve"> proxy reality on public scene datasets with real captures and reference scans (≥ 10 scenes, some held out), which decides the hypotheses; </w:t>
-      </w:r>
-      <w:r>
-        <w:rPr>
-          <w:rFonts w:cstheme="minorHAnsi"/>
-          <w:b/>
-          <w:lang w:val="en-US"/>
-        </w:rPr>
-        <w:t xml:space="preserve">(B)</w:t>
-      </w:r>
-      <w:r>
-        <w:rPr>
-          <w:rFonts w:cstheme="minorHAnsi"/>
-          <w:lang w:val="en-US"/>
-        </w:rPr>
-        <w:t xml:space="preserve"> public real-world datasets and published real evaluations with real outcomes; </w:t>
-      </w:r>
-      <w:r>
-        <w:rPr>
-          <w:rFonts w:cstheme="minorHAnsi"/>
-          <w:b/>
-          <w:lang w:val="en-US"/>
-        </w:rPr>
-        <w:t xml:space="preserve">(C)</w:t>
-      </w:r>
-      <w:r>
-        <w:rPr>
-          <w:rFonts w:cstheme="minorHAnsi"/>
-          <w:lang w:val="en-US"/>
-        </w:rPr>
-        <w:t xml:space="preserve"> real-robot trials, validation only. A </w:t>
-      </w:r>
-      <w:r>
-        <w:rPr>
-          <w:rFonts w:cstheme="minorHAnsi"/>
-          <w:i/>
-          <w:lang w:val="en-US"/>
-        </w:rPr>
-        <w:t xml:space="preserve">policy zoo</w:t>
-      </w:r>
-      <w:r>
-        <w:rPr>
-          <w:rFonts w:cstheme="minorHAnsi"/>
-          <w:lang w:val="en-US"/>
-        </w:rPr>
-        <w:t xml:space="preserve"> (≥ 200 navigation policies varying scene, capture budget, architecture and training data) supplies the population for RQ2–RQ4. Tests are one-sided, α = 0.05, bootstrapped over scenes, Holm-corrected within each hypothesis and pre-registered in the repository. All thresholds are design choices fixed in that pre-registration.</w:t>
+        <w:t xml:space="preserve"> built from a subset of the real views is the training simulator. Real data is counted exactly: capture = real views given to the twin, real rollouts = episodes in the reference, summed in one operator-time cost at a fixed rate. SR = success rate in the reference. Tier A decides; tier B (public real-world data, published paired sim/real results) and tier C (real robot) only report agreement. Tests are one-sided, α = 0.05, bootstrapped over scenes and seeds, Holm-corrected within each hypothesis and pre-registered with all thresholds.</w:t>
       </w:r>
     </w:p>
     <w:p>
@@ -5942,14 +5906,14 @@
           <w:b/>
           <w:lang w:val="en-US"/>
         </w:rPr>
-        <w:t xml:space="preserve">RQ1 (measure and localize).</w:t>
-      </w:r>
-      <w:r>
-        <w:rPr>
-          <w:rFonts w:cstheme="minorHAnsi"/>
-          <w:lang w:val="en-US"/>
-        </w:rPr>
-        <w:t xml:space="preserve"> Where inside frozen encoders and twin-trained policies does the twin-vs-real gap arise, and how does it depend on the capture budget?</w:t>
+        <w:t xml:space="preserve">RQ1 (real → sim: capture less).</w:t>
+      </w:r>
+      <w:r>
+        <w:rPr>
+          <w:rFonts w:cstheme="minorHAnsi"/>
+          <w:lang w:val="en-US"/>
+        </w:rPr>
+        <w:t xml:space="preserve"> How little capture does a twin good enough for policy learning need, and can the task guide the capture?</w:t>
       </w:r>
     </w:p>
     <w:p>
@@ -5970,22 +5934,22 @@
           <w:rFonts w:cstheme="minorHAnsi"/>
           <w:lang w:val="en-US"/>
         </w:rPr>
-        <w:t xml:space="preserve"> On paired real and twin-rendered frames of the same pose, the representation gap (1 − linear CKA, and the drop of linear-probe accuracy) (a) is </w:t>
-      </w:r>
-      <w:r>
-        <w:rPr>
-          <w:rFonts w:cstheme="minorHAnsi"/>
-          <w:i/>
-          <w:lang w:val="en-US"/>
-        </w:rPr>
-        <w:t xml:space="preserve">concentrated</w:t>
-      </w:r>
-      <w:r>
-        <w:rPr>
-          <w:rFonts w:cstheme="minorHAnsi"/>
-          <w:lang w:val="en-US"/>
-        </w:rPr>
-        <w:t xml:space="preserve">: the third of layers with the largest gap holds ≥ 50% of the summed gap in ≥ 80% of scenes; (b) decreases monotonically with the capture budget (trend test over ≥ 4 budgets); (c) differs between ≥ 10 frozen encoders (Friedman test); and (d) the encoders' robustness ranking predicts their downstream twin→real success rate (SR) with Spearman ρ ≥ 0.6.</w:t>
+        <w:t xml:space="preserve"> Task-aware, uncertainty-guided capture (next views chosen where task-relevant regions have high reconstruction uncertainty) reaches the SR of uniform capture with ≥ 40% fewer views. </w:t>
+      </w:r>
+      <w:r>
+        <w:rPr>
+          <w:rFonts w:cstheme="minorHAnsi"/>
+          <w:i/>
+          <w:lang w:val="en-US"/>
+        </w:rPr>
+        <w:t xml:space="preserve">Decision:</w:t>
+      </w:r>
+      <w:r>
+        <w:rPr>
+          <w:rFonts w:cstheme="minorHAnsi"/>
+          <w:lang w:val="en-US"/>
+        </w:rPr>
+        <w:t xml:space="preserve"> on fitted capture–SR curves, C_task(τ₁) ≤ 0.6 · C_uniform(τ₁), and the upper 95% bound of C_task / C_recon (reconstruction-only view selection) is &lt; 1; τ₁ = SR of uniform capture at its largest budget.</w:t>
       </w:r>
     </w:p>
     <w:p>
@@ -5999,14 +5963,14 @@
           <w:b/>
           <w:lang w:val="en-US"/>
         </w:rPr>
-        <w:t xml:space="preserve">RQ2 (predict).</w:t>
-      </w:r>
-      <w:r>
-        <w:rPr>
-          <w:rFonts w:cstheme="minorHAnsi"/>
-          <w:lang w:val="en-US"/>
-        </w:rPr>
-        <w:t xml:space="preserve"> Can a twin-trained policy's real-world transfer and failures be forecast from its internals (hidden states, weights) without real rollouts?</w:t>
+        <w:t xml:space="preserve">RQ2 (in sim: train robustly on an imperfect twin).</w:t>
+      </w:r>
+      <w:r>
+        <w:rPr>
+          <w:rFonts w:cstheme="minorHAnsi"/>
+          <w:lang w:val="en-US"/>
+        </w:rPr>
+        <w:t xml:space="preserve"> How should a policy be trained to be robust to the twin's reconstruction errors?</w:t>
       </w:r>
     </w:p>
     <w:p>
@@ -6027,7 +5991,22 @@
           <w:rFonts w:cstheme="minorHAnsi"/>
           <w:lang w:val="en-US"/>
         </w:rPr>
-        <w:t xml:space="preserve"> (a) A predictor trained on the zoo (GNN over layers or weight-space metanetwork) predicts the twin→real SR gap on held-out scenes with ≥ 20% lower mean absolute error than the best of three baselines (twin SR alone, image fidelity PSNR/LPIPS, simulator-level predictivity); the lower 95% bound of the relative reduction must be &gt; 0. (b) Hidden-state failure monitors calibrated conformally in the twin at 90% coverage keep coverage ≥ 85% on real data (ε = 5 pp).</w:t>
+        <w:t xml:space="preserve"> Uncertainty-aware training (augmentation and sample weights from per-region reconstruction uncertainty and from the representation distance to a few real images) improves real transfer over uniform domain randomization at an equal capture budget. </w:t>
+      </w:r>
+      <w:r>
+        <w:rPr>
+          <w:rFonts w:cstheme="minorHAnsi"/>
+          <w:i/>
+          <w:lang w:val="en-US"/>
+        </w:rPr>
+        <w:t xml:space="preserve">Decision:</w:t>
+      </w:r>
+      <w:r>
+        <w:rPr>
+          <w:rFonts w:cstheme="minorHAnsi"/>
+          <w:lang w:val="en-US"/>
+        </w:rPr>
+        <w:t xml:space="preserve"> mean paired SR gain ≥ 10 pp on held-out scenes, lower 95% bound &gt; 0, at each of ≥ 2 capture budgets.</w:t>
       </w:r>
     </w:p>
     <w:p>
@@ -6041,14 +6020,14 @@
           <w:b/>
           <w:lang w:val="en-US"/>
         </w:rPr>
-        <w:t xml:space="preserve">RQ3 (use).</w:t>
-      </w:r>
-      <w:r>
-        <w:rPr>
-          <w:rFonts w:cstheme="minorHAnsi"/>
-          <w:lang w:val="en-US"/>
-        </w:rPr>
-        <w:t xml:space="preserve"> Can these measures and forecasts allocate a limited real-data budget: which twin data to weight, what to capture and which real rollouts to collect?</w:t>
+        <w:t xml:space="preserve">RQ3 (sim → real: collect few real rollouts).</w:t>
+      </w:r>
+      <w:r>
+        <w:rPr>
+          <w:rFonts w:cstheme="minorHAnsi"/>
+          <w:lang w:val="en-US"/>
+        </w:rPr>
+        <w:t xml:space="preserve"> Which few real rollouts close the remaining gap, and how should they correct the twin and the policy?</w:t>
       </w:r>
     </w:p>
     <w:p>
@@ -6069,7 +6048,22 @@
           <w:rFonts w:cstheme="minorHAnsi"/>
           <w:lang w:val="en-US"/>
         </w:rPr>
-        <w:t xml:space="preserve"> Forecast-guided weighting, capture and rollout selection reaches the target real SR τ with ≥ 30% less real data than uniform or random allocation (capture minutes + real rollouts, converted to one operator-time cost at a pre-registered rate): B_guided(τ) ≤ 0.7 · B_uniform(τ) on fitted budget–performance curves, with the upper 95% bound of the ratio &lt; 1. τ is fixed in the pre-registration as the SR that uniform allocation reaches at the largest budget.</w:t>
+        <w:t xml:space="preserve"> Real rollouts selected actively (by predicted gap or uncertainty) and used for twin and policy correction reach the target SR with ≥ 50% fewer rollouts than random selection. </w:t>
+      </w:r>
+      <w:r>
+        <w:rPr>
+          <w:rFonts w:cstheme="minorHAnsi"/>
+          <w:i/>
+          <w:lang w:val="en-US"/>
+        </w:rPr>
+        <w:t xml:space="preserve">Decision:</w:t>
+      </w:r>
+      <w:r>
+        <w:rPr>
+          <w:rFonts w:cstheme="minorHAnsi"/>
+          <w:lang w:val="en-US"/>
+        </w:rPr>
+        <w:t xml:space="preserve"> N_active(τ₃) ≤ 0.5 · N_random(τ₃) on fitted rollout–SR curves, upper 95% bound of the ratio &lt; 1; τ₃ = SR of random selection at its largest budget.</w:t>
       </w:r>
     </w:p>
     <w:p>
@@ -6083,14 +6077,14 @@
           <w:b/>
           <w:lang w:val="en-US"/>
         </w:rPr>
-        <w:t xml:space="preserve">RQ4 (generalize).</w:t>
-      </w:r>
-      <w:r>
-        <w:rPr>
-          <w:rFonts w:cstheme="minorHAnsi"/>
-          <w:lang w:val="en-US"/>
-        </w:rPr>
-        <w:t xml:space="preserve"> Do the gap measures and predictors transfer across tasks and simulator families?</w:t>
+        <w:t xml:space="preserve">RQ4 (whole loop: budget and generalization).</w:t>
+      </w:r>
+      <w:r>
+        <w:rPr>
+          <w:rFonts w:cstheme="minorHAnsi"/>
+          <w:lang w:val="en-US"/>
+        </w:rPr>
+        <w:t xml:space="preserve"> What real-data budget does the full loop need compared with real-only learning, and does it hold beyond navigation?</w:t>
       </w:r>
     </w:p>
     <w:p>
@@ -6111,7 +6105,22 @@
           <w:rFonts w:cstheme="minorHAnsi"/>
           <w:lang w:val="en-US"/>
         </w:rPr>
-        <w:t xml:space="preserve"> (a) A predictor trained on the navigation zoo, applied without retraining to manipulation policies with published paired sim/real results (≥ 12 policy–task pairs), ranks them by real outcome with Spearman ρ ≥ 0.5. (b) Its rank correlation with real outcomes exceeds that of a generic simulator (Sim-vs-Real Correlation Coefficient, SRCC) and of a learned world-model evaluator (95% CI of each paired difference excludes 0).</w:t>
+        <w:t xml:space="preserve"> (a) The full loop (H1–H3 combined) reaches the target SR with ≤ 10% of the real data needed by real-only learning (trained directly in the reference, every interaction counted as real data). </w:t>
+      </w:r>
+      <w:r>
+        <w:rPr>
+          <w:rFonts w:cstheme="minorHAnsi"/>
+          <w:i/>
+          <w:lang w:val="en-US"/>
+        </w:rPr>
+        <w:t xml:space="preserve">Decision:</w:t>
+      </w:r>
+      <w:r>
+        <w:rPr>
+          <w:rFonts w:cstheme="minorHAnsi"/>
+          <w:lang w:val="en-US"/>
+        </w:rPr>
+        <w:t xml:space="preserve"> B_loop(τ₄) ≤ 0.1 · B_real(τ₄), upper 95% bound of the ratio &lt; 0.2; τ₄ = SR of real-only learning at its largest budget. The budget curve ("exchange rate" of twin to real data) is also reported for a uniform loop and for a learned world model as the simulator. (b) With the pipeline and hyperparameters unchanged, on manipulation B_loop / B_real has an upper 95% bound &lt; 1 and the H1–H3 effects keep their sign.</w:t>
       </w:r>
     </w:p>
     <w:p>
@@ -6132,7 +6141,7 @@
           <w:rFonts w:cstheme="minorHAnsi"/>
           <w:lang w:val="en-US"/>
         </w:rPr>
-        <w:t xml:space="preserve"> A hypothesis is supported when all its parts pass on tier A; tiers B and C report agreement and are not used to tune thresholds.</w:t>
+        <w:t xml:space="preserve"> A hypothesis holds when all its parts pass on tier A; a failed one is reported as a measured budget curve and does not block the next step, which has its own baseline.</w:t>
       </w:r>
     </w:p>
     <w:permEnd w:id="1295260508"/>
@@ -6450,14 +6459,29 @@
           <w:b/>
           <w:lang w:val="en-US"/>
         </w:rPr>
-        <w:t xml:space="preserve">internal representations</w:t>
-      </w:r>
-      <w:r>
-        <w:rPr>
-          <w:rFonts w:cstheme="minorHAnsi"/>
-          <w:lang w:val="en-US"/>
-        </w:rPr>
-        <w:t xml:space="preserve"> of encoders and embodied policies trained in digital twins built by neural reconstruction of real scenes, used to measure, localize and predict how well the policies transfer to reality. Visual navigation is the primary testbed and robotic manipulation the cross-task test. Building twins or simulators, control design and mechanical engineering are not the object of the research.</w:t>
+        <w:t xml:space="preserve">real-to-sim-to-real learning loop</w:t>
+      </w:r>
+      <w:r>
+        <w:rPr>
+          <w:rFonts w:cstheme="minorHAnsi"/>
+          <w:lang w:val="en-US"/>
+        </w:rPr>
+        <w:t xml:space="preserve"> of embodied policies with digital twins built by neural reconstruction of real scenes, and how to make this loop work with </w:t>
+      </w:r>
+      <w:r>
+        <w:rPr>
+          <w:rFonts w:cstheme="minorHAnsi"/>
+          <w:b/>
+          <w:lang w:val="en-US"/>
+        </w:rPr>
+        <w:t xml:space="preserve">less real data</w:t>
+      </w:r>
+      <w:r>
+        <w:rPr>
+          <w:rFonts w:cstheme="minorHAnsi"/>
+          <w:lang w:val="en-US"/>
+        </w:rPr>
+        <w:t xml:space="preserve">. Visual navigation is the primary testbed and robotic manipulation the cross-task test. Building twins, simulators or benchmarks, control design and mechanical engineering are not the object of the research; the student uses existing tools and public data.</w:t>
       </w:r>
     </w:p>
     <w:p>
@@ -6471,29 +6495,29 @@
           <w:b/>
           <w:lang w:val="en-US"/>
         </w:rPr>
-        <w:t xml:space="preserve">Key original contribution (core, RQ1–RQ2, H1–H2).</w:t>
-      </w:r>
-      <w:r>
-        <w:rPr>
-          <w:rFonts w:cstheme="minorHAnsi"/>
-          <w:lang w:val="en-US"/>
-        </w:rPr>
-        <w:t xml:space="preserve"> To our knowledge, the first systematic test of whether the twin-to-real transfer of embodied policies can be </w:t>
-      </w:r>
-      <w:r>
-        <w:rPr>
-          <w:rFonts w:cstheme="minorHAnsi"/>
-          <w:b/>
-          <w:lang w:val="en-US"/>
-        </w:rPr>
-        <w:t xml:space="preserve">read from their representations</w:t>
-      </w:r>
-      <w:r>
-        <w:rPr>
-          <w:rFonts w:cstheme="minorHAnsi"/>
-          <w:lang w:val="en-US"/>
-        </w:rPr>
-        <w:t xml:space="preserve">: where in the network the gap arises, how it shrinks with the capture budget, and how large it will be for a given policy, forecast from its hidden states or weights without real rollouts.</w:t>
+        <w:t xml:space="preserve">Key original contribution.</w:t>
+      </w:r>
+      <w:r>
+        <w:rPr>
+          <w:rFonts w:cstheme="minorHAnsi"/>
+          <w:lang w:val="en-US"/>
+        </w:rPr>
+        <w:t xml:space="preserve"> To our knowledge, the first treatment of the real data in the whole real-to-sim-to-real loop as </w:t>
+      </w:r>
+      <w:r>
+        <w:rPr>
+          <w:rFonts w:cstheme="minorHAnsi"/>
+          <w:b/>
+          <w:lang w:val="en-US"/>
+        </w:rPr>
+        <w:t xml:space="preserve">one budget to be allocated actively</w:t>
+      </w:r>
+      <w:r>
+        <w:rPr>
+          <w:rFonts w:cstheme="minorHAnsi"/>
+          <w:lang w:val="en-US"/>
+        </w:rPr>
+        <w:t xml:space="preserve">, with a method for each step of the loop and a measured budget law for navigation, where no real-data-budget curves have been published.</w:t>
       </w:r>
     </w:p>
     <w:p>
@@ -6528,14 +6552,14 @@
           <w:b/>
           <w:lang w:val="en-US"/>
         </w:rPr>
-        <w:t xml:space="preserve">Measuring and localizing the reconstruction gap (core; RQ1, H1).</w:t>
-      </w:r>
-      <w:r>
-        <w:rPr>
-          <w:rFonts w:cstheme="minorHAnsi"/>
-          <w:lang w:val="en-US"/>
-        </w:rPr>
-        <w:t xml:space="preserve"> A layer-wise analysis of paired real and twin-rendered observations (representational similarity, probing) that locates the gap inside frozen visual encoders and policies, relates it to the capture budget, and ranks encoders by robustness to reconstruction artifacts, tested against downstream transfer.</w:t>
+        <w:t xml:space="preserve">Capture less (RQ1, H1).</w:t>
+      </w:r>
+      <w:r>
+        <w:rPr>
+          <w:rFonts w:cstheme="minorHAnsi"/>
+          <w:lang w:val="en-US"/>
+        </w:rPr>
+        <w:t xml:space="preserve"> A task-aware capture method that chooses which real views to record for a twin from the reconstruction's uncertainty in the regions that matter for the policy, instead of for image quality alone, and a test of how much capture it saves against uniform and reconstruction-only view selection.</w:t>
       </w:r>
     </w:p>
     <w:p>
@@ -6557,14 +6581,14 @@
           <w:b/>
           <w:lang w:val="en-US"/>
         </w:rPr>
-        <w:t xml:space="preserve">Forecasting transfer and failure from internals (core; RQ2, H2).</w:t>
-      </w:r>
-      <w:r>
-        <w:rPr>
-          <w:rFonts w:cstheme="minorHAnsi"/>
-          <w:lang w:val="en-US"/>
-        </w:rPr>
-        <w:t xml:space="preserve"> Predictors learned over a population of twin-trained policies (graph networks over layers, weight-space metanetworks) that estimate a policy's real performance before deployment, and hidden-state failure monitors whose statistical coverage is checked across the twin-to-real shift. This brings weight-space learning and model analysis to embodied policies and distribution shift.</w:t>
+        <w:t xml:space="preserve">Train robustly on an imperfect twin (RQ2, H2).</w:t>
+      </w:r>
+      <w:r>
+        <w:rPr>
+          <w:rFonts w:cstheme="minorHAnsi"/>
+          <w:lang w:val="en-US"/>
+        </w:rPr>
+        <w:t xml:space="preserve"> An uncertainty-aware training method that turns per-region reconstruction uncertainty and the representation distance to a small set of real images into augmentation and sample weights, compared with uniform domain randomization at an equal capture budget.</w:t>
       </w:r>
     </w:p>
     <w:p>
@@ -6586,14 +6610,14 @@
           <w:b/>
           <w:lang w:val="en-US"/>
         </w:rPr>
-        <w:t xml:space="preserve">Representation-guided use of a real-data budget (RQ3, H3).</w:t>
-      </w:r>
-      <w:r>
-        <w:rPr>
-          <w:rFonts w:cstheme="minorHAnsi"/>
-          <w:lang w:val="en-US"/>
-        </w:rPr>
-        <w:t xml:space="preserve"> Methods that use the measures and forecasts to weight twin training data, choose what to capture and select which real rollouts to collect, quantified by budget–performance curves against uniform and random allocation.</w:t>
+        <w:t xml:space="preserve">Collect few real rollouts (RQ3, H3).</w:t>
+      </w:r>
+      <w:r>
+        <w:rPr>
+          <w:rFonts w:cstheme="minorHAnsi"/>
+          <w:lang w:val="en-US"/>
+        </w:rPr>
+        <w:t xml:space="preserve"> An active selection method for real rollouts, driven by the predicted twin-to-real gap and its uncertainty, together with a procedure that uses the selected rollouts to correct both the twin and the policy, compared with random selection.</w:t>
       </w:r>
     </w:p>
     <w:p>
@@ -6615,14 +6639,14 @@
           <w:b/>
           <w:lang w:val="en-US"/>
         </w:rPr>
-        <w:t xml:space="preserve">Generalization of the measures (RQ4, H4).</w:t>
-      </w:r>
-      <w:r>
-        <w:rPr>
-          <w:rFonts w:cstheme="minorHAnsi"/>
-          <w:lang w:val="en-US"/>
-        </w:rPr>
-        <w:t xml:space="preserve"> Evidence of whether representation-based predictors carry over from navigation to manipulation and across simulator families, compared with simulation-based predictivity (SRCC) and a learned world-model evaluator.</w:t>
+        <w:t xml:space="preserve">A budget law for the loop (RQ4, H4).</w:t>
+      </w:r>
+      <w:r>
+        <w:rPr>
+          <w:rFonts w:cstheme="minorHAnsi"/>
+          <w:lang w:val="en-US"/>
+        </w:rPr>
+        <w:t xml:space="preserve"> Budget–performance curves of the full loop that give the "exchange rate" between twin and real data (how much real data the loop needs, relative to learning from real data only, to reach a given real success rate), compared with a uniform loop and a learned world model used as the simulator, and a test of whether the loop carries over unchanged from navigation to manipulation.</w:t>
       </w:r>
     </w:p>
     <w:p>
@@ -6657,14 +6681,14 @@
           <w:b/>
           <w:lang w:val="en-US"/>
         </w:rPr>
-        <w:t xml:space="preserve">Benchmark, data and software (supports all RQs).</w:t>
-      </w:r>
-      <w:r>
-        <w:rPr>
-          <w:rFonts w:cstheme="minorHAnsi"/>
-          <w:lang w:val="en-US"/>
-        </w:rPr>
-        <w:t xml:space="preserve"> A public benchmark of paired real and twin-rendered frames at graded capture budgets, a released zoo of twin-trained policies with twin and real outcomes, and evaluation code with pre-registered protocols, built on existing open-source twin pipelines and simulators. It gives other groups a reproducible way to test sim-to-real claims and to screen policies and encoders before a costly real deployment.</w:t>
+        <w:t xml:space="preserve">Evaluation protocol and software (supports all RQs).</w:t>
+      </w:r>
+      <w:r>
+        <w:rPr>
+          <w:rFonts w:cstheme="minorHAnsi"/>
+          <w:lang w:val="en-US"/>
+        </w:rPr>
+        <w:t xml:space="preserve"> A proxy-reality protocol on public scene datasets that counts real data exactly without a robot (a high-fidelity reference as "reality", a low-budget twin as the simulator), and open-source code for the three methods and the budget curves, built on existing twin pipelines and simulators. It tells a practitioner how much to record and how many real trials to plan for a new site.</w:t>
       </w:r>
     </w:p>
     <w:p>
@@ -6685,7 +6709,7 @@
           <w:rFonts w:cstheme="minorHAnsi"/>
           <w:lang w:val="en-US"/>
         </w:rPr>
-        <w:t xml:space="preserve"> Real target-domain data is the main cost of deploying learned systems, and trained models are increasingly deployed on data unlike their training data. Testing whether transfer can be diagnosed and forecast from a model's internals, and whether such forecasts save real data, is relevant to machine learning under distribution shift and to model evaluation in general, beyond robotics.</w:t>
+        <w:t xml:space="preserve"> Real target-domain data is the main cost of deploying learned systems, and models are increasingly trained on reconstructed or synthetic data and deployed on real sensor data. Methods that decide where real data is worth spending, and a measured law of how much of it a twin can replace, are relevant to active learning, learning under distribution shift and uncertainty estimation in general, beyond robotics.</w:t>
       </w:r>
     </w:p>
     <w:p>
@@ -6706,7 +6730,7 @@
           <w:rFonts w:cstheme="minorHAnsi"/>
           <w:lang w:val="en-US"/>
         </w:rPr>
-        <w:t xml:space="preserve"> Results are planned for peer-reviewed conferences worth 200 points and assigned to ITiT on the ministerial list of 5.01.2024: NeurIPS and ICLR (machine learning) and CVPR (computer vision), with ICML, ICCV and ECCV for resubmissions, as in §3, §11 and §12. P1 (RQ1, benchmark and localization) targets NeurIPS 2027; P2 (RQ2) ICLR or CVPR 2028; P3 (RQ3–RQ4, including manipulation) NeurIPS 2028.</w:t>
+        <w:t xml:space="preserve"> Results are planned for peer-reviewed conferences worth 200 points and assigned to ITiT on the ministerial list of 5.01.2024: NeurIPS and ICLR (machine learning) and CVPR (computer vision), with ICML, ICCV and ECCV for resubmissions, as in §3, §11 and §12. P1 (RQ1–RQ2, task-aware capture and uncertainty-aware training) targets NeurIPS 2027; P2 (RQ3, active real-rollout selection and twin correction) ICLR or CVPR 2028; P3 (RQ4, budget law and manipulation) NeurIPS 2028, with ICLR 2029 as the fallback.</w:t>
       </w:r>
     </w:p>
     <w:permEnd w:id="1098318749"/>
@@ -6985,7 +7009,21 @@
           <w:rFonts w:cstheme="minorHAnsi"/>
           <w:lang w:val="en-US"/>
         </w:rPr>
-        <w:t xml:space="preserve">The research follows four stages (I–IV) that match §3 and the research questions of §7. For each stage we give the method, data, metric and success criterion. The student uses existing open-source 3D Gaussian Splatting (3DGS) pipelines and simulators and does not develop new ones. Stages I–II (RQ1–RQ2) are the core; Stages III–IV (RQ3–RQ4) build on them.</w:t>
+        <w:t xml:space="preserve">The research follows the real-to-sim-to-real loop: real capture → twin → policy training in the twin → a few real rollouts → correction of the twin and the policy → deployment. Four stages (I–IV) match §3 and the research questions of §7: capture less (RQ1), train robustly on an imperfect twin (RQ2), collect few real rollouts (RQ3), and measure the budget of the whole loop (RQ4). For each stage we give the method, data, metric and success criterion. Twins are built with existing open-source 3D Gaussian Splatting (3DGS)</w:t>
+      </w:r>
+    </w:p>
+    <w:p>
+      <w:pPr>
+        <w:spacing w:after="0" w:line="240" w:lineRule="auto"/>
+        <w:ind w:left="397" w:hanging="397"/>
+        <w:jc w:val="left"/>
+      </w:pPr>
+      <w:r>
+        <w:rPr>
+          <w:rFonts w:cstheme="minorHAnsi"/>
+          <w:lang w:val="en-US"/>
+        </w:rPr>
+        <w:t xml:space="preserve">[2] pipelines and simulators; the student develops neither a simulator nor a benchmark. Visual navigation</w:t>
       </w:r>
     </w:p>
     <w:p>
@@ -6996,92 +7034,9 @@
       <w:r>
         <w:rPr>
           <w:rFonts w:cstheme="minorHAnsi"/>
-          <w:b/>
-          <w:lang w:val="en-US"/>
-        </w:rPr>
-        <w:t xml:space="preserve">Data and evaluation tiers.</w:t>
-      </w:r>
-      <w:r>
-        <w:rPr>
-          <w:rFonts w:cstheme="minorHAnsi"/>
-          <w:lang w:val="en-US"/>
-        </w:rPr>
-        <w:t xml:space="preserve"> </w:t>
-      </w:r>
-      <w:r>
-        <w:rPr>
-          <w:rFonts w:cstheme="minorHAnsi"/>
-          <w:i/>
-          <w:lang w:val="en-US"/>
-        </w:rPr>
-        <w:t xml:space="preserve">Tier A (proxy reality; decides the hypotheses):</w:t>
-      </w:r>
-      <w:r>
-        <w:rPr>
-          <w:rFonts w:cstheme="minorHAnsi"/>
-          <w:lang w:val="en-US"/>
-        </w:rPr>
-        <w:t xml:space="preserve"> ≥ 10 public indoor scenes that have real captures and a reference laser scan, e.g. ScanNet++ [17]. The reference scan, rendered in a GPU simulator (Habitat [1] or an Isaac-based 3DGS renderer such as GaussGym [6], chosen in T3.1), is the "real" target domain. The twin is a 3DGS reconstruction built from a subsample of the scene's real capture. The </w:t>
-      </w:r>
-      <w:r>
-        <w:rPr>
-          <w:rFonts w:cstheme="minorHAnsi"/>
-          <w:b/>
-          <w:lang w:val="en-US"/>
-        </w:rPr>
-        <w:t xml:space="preserve">capture budget</w:t>
-      </w:r>
-      <w:r>
-        <w:rPr>
-          <w:rFonts w:cstheme="minorHAnsi"/>
-          <w:lang w:val="en-US"/>
-        </w:rPr>
-        <w:t xml:space="preserve"> (≥ 4 levels of capture minutes or views) is set by subsampling. Some scenes are held out. Frame-level measures use the real images; closed-loop outcomes use the rendered scan, and the gap between scan renders and real images is measured with the same tools, so the proxy's own error is known. </w:t>
-      </w:r>
-      <w:r>
-        <w:rPr>
-          <w:rFonts w:cstheme="minorHAnsi"/>
-          <w:i/>
-          <w:lang w:val="en-US"/>
-        </w:rPr>
-        <w:t xml:space="preserve">Tier B (real outcomes):</w:t>
-      </w:r>
-      <w:r>
-        <w:rPr>
-          <w:rFonts w:cstheme="minorHAnsi"/>
-          <w:lang w:val="en-US"/>
-        </w:rPr>
-        <w:t xml:space="preserve"> public real-world navigation datasets for representation metrics and published paired sim/real evaluations of manipulation policies (SIMPLER [12]). </w:t>
-      </w:r>
-      <w:r>
-        <w:rPr>
-          <w:rFonts w:cstheme="minorHAnsi"/>
-          <w:i/>
-          <w:lang w:val="en-US"/>
-        </w:rPr>
-        <w:t xml:space="preserve">Tier C (validation only):</w:t>
-      </w:r>
-      <w:r>
-        <w:rPr>
-          <w:rFonts w:cstheme="minorHAnsi"/>
-          <w:lang w:val="en-US"/>
-        </w:rPr>
-        <w:t xml:space="preserve"> ≥ 2 PWr environments with a mobile robot (planned cooperation with the K29 "Denali" Autonomous Robots Laboratory; agreement in T3.2), RGB-D camera and wheel odometry. </w:t>
-      </w:r>
-      <w:r>
-        <w:rPr>
-          <w:rFonts w:cstheme="minorHAnsi"/>
-          <w:i/>
-          <w:lang w:val="en-US"/>
-        </w:rPr>
-        <w:t xml:space="preserve">Compute:</w:t>
-      </w:r>
-      <w:r>
-        <w:rPr>
-          <w:rFonts w:cstheme="minorHAnsi"/>
-          <w:lang w:val="en-US"/>
-        </w:rPr>
-        <w:t xml:space="preserve"> WCSS Lem (NVIDIA H100) and PLGrid allocations (to be applied for) .</w:t>
+          <w:lang w:val="en-US"/>
+        </w:rPr>
+        <w:t xml:space="preserve">(point-goal and image-goal) is the primary task; manipulation is the cross-task test in Stage IV.</w:t>
       </w:r>
     </w:p>
     <w:p>
@@ -7095,7 +7050,148 @@
           <w:b/>
           <w:lang w:val="en-US"/>
         </w:rPr>
-        <w:t xml:space="preserve">Stage I – paired-frame benchmark and gap localization (RQ1, H1; sem. 3–4).</w:t>
+        <w:t xml:space="preserve">Tier A protocol: proxy reality (decides the hypotheses).</w:t>
+      </w:r>
+      <w:r>
+        <w:rPr>
+          <w:rFonts w:cstheme="minorHAnsi"/>
+          <w:lang w:val="en-US"/>
+        </w:rPr>
+        <w:t xml:space="preserve"> Real robots make "real data" slow to collect and hard to count, so the hypotheses are decided on public real scans. For ≥ 10 indoor scenes with dense real captures and reference laser scans (e.g. ScanNet++ [19]), a </w:t>
+      </w:r>
+      <w:r>
+        <w:rPr>
+          <w:rFonts w:cstheme="minorHAnsi"/>
+          <w:b/>
+          <w:lang w:val="en-US"/>
+        </w:rPr>
+        <w:t xml:space="preserve">reference twin</w:t>
+      </w:r>
+      <w:r>
+        <w:rPr>
+          <w:rFonts w:cstheme="minorHAnsi"/>
+          <w:lang w:val="en-US"/>
+        </w:rPr>
+        <w:t xml:space="preserve"> built from the full capture and the scan plays "reality", rendered in a GPU simulator (Habitat [1] or a 3DGS renderer such as GaussGym [5], chosen in T3.1). The </w:t>
+      </w:r>
+      <w:r>
+        <w:rPr>
+          <w:rFonts w:cstheme="minorHAnsi"/>
+          <w:b/>
+          <w:lang w:val="en-US"/>
+        </w:rPr>
+        <w:t xml:space="preserve">training twin</w:t>
+      </w:r>
+      <w:r>
+        <w:rPr>
+          <w:rFonts w:cstheme="minorHAnsi"/>
+          <w:lang w:val="en-US"/>
+        </w:rPr>
+        <w:t xml:space="preserve"> is a 3DGS reconstruction built from a subset of the same capture. This makes every unit of real data countable: </w:t>
+      </w:r>
+      <w:r>
+        <w:rPr>
+          <w:rFonts w:cstheme="minorHAnsi"/>
+          <w:i/>
+          <w:lang w:val="en-US"/>
+        </w:rPr>
+        <w:t xml:space="preserve">capture</w:t>
+      </w:r>
+      <w:r>
+        <w:rPr>
+          <w:rFonts w:cstheme="minorHAnsi"/>
+          <w:lang w:val="en-US"/>
+        </w:rPr>
+        <w:t xml:space="preserve"> = views selected from the recorded pool (converted to capture minutes at the recording rate), </w:t>
+      </w:r>
+      <w:r>
+        <w:rPr>
+          <w:rFonts w:cstheme="minorHAnsi"/>
+          <w:i/>
+          <w:lang w:val="en-US"/>
+        </w:rPr>
+        <w:t xml:space="preserve">real rollouts</w:t>
+      </w:r>
+      <w:r>
+        <w:rPr>
+          <w:rFonts w:cstheme="minorHAnsi"/>
+          <w:lang w:val="en-US"/>
+        </w:rPr>
+        <w:t xml:space="preserve"> and </w:t>
+      </w:r>
+      <w:r>
+        <w:rPr>
+          <w:rFonts w:cstheme="minorHAnsi"/>
+          <w:i/>
+          <w:lang w:val="en-US"/>
+        </w:rPr>
+        <w:t xml:space="preserve">real demonstrations</w:t>
+      </w:r>
+      <w:r>
+        <w:rPr>
+          <w:rFonts w:cstheme="minorHAnsi"/>
+          <w:lang w:val="en-US"/>
+        </w:rPr>
+        <w:t xml:space="preserve"> = episodes in the reference twin. Both are summed in one operator-time cost at a rate fixed in the pre-registration. Some scenes are held out for all tuning. The proxy's own error is reported: renders of the reference twin are compared with held-out real images (PSNR, LPIPS, depth error), and tier C checks that tier-A conclusions hold on a robot. </w:t>
+      </w:r>
+      <w:r>
+        <w:rPr>
+          <w:rFonts w:cstheme="minorHAnsi"/>
+          <w:i/>
+          <w:lang w:val="en-US"/>
+        </w:rPr>
+        <w:t xml:space="preserve">Tier B:</w:t>
+      </w:r>
+      <w:r>
+        <w:rPr>
+          <w:rFonts w:cstheme="minorHAnsi"/>
+          <w:lang w:val="en-US"/>
+        </w:rPr>
+        <w:t xml:space="preserve"> public real-world datasets and published paired sim/real results (SIMPLER [34]). </w:t>
+      </w:r>
+      <w:r>
+        <w:rPr>
+          <w:rFonts w:cstheme="minorHAnsi"/>
+          <w:i/>
+          <w:lang w:val="en-US"/>
+        </w:rPr>
+        <w:t xml:space="preserve">Tier C (validation only):</w:t>
+      </w:r>
+      <w:r>
+        <w:rPr>
+          <w:rFonts w:cstheme="minorHAnsi"/>
+          <w:lang w:val="en-US"/>
+        </w:rPr>
+        <w:t xml:space="preserve"> ≥ 2 PWr rooms captured with a phone or RGB-D camera and a mobile robot (planned cooperation with the K29 "Denali" Autonomous Robots Laboratory, agreement in T3.2). </w:t>
+      </w:r>
+      <w:r>
+        <w:rPr>
+          <w:rFonts w:cstheme="minorHAnsi"/>
+          <w:i/>
+          <w:lang w:val="en-US"/>
+        </w:rPr>
+        <w:t xml:space="preserve">Compute:</w:t>
+      </w:r>
+      <w:r>
+        <w:rPr>
+          <w:rFonts w:cstheme="minorHAnsi"/>
+          <w:lang w:val="en-US"/>
+        </w:rPr>
+        <w:t xml:space="preserve"> WCSS Lem (NVIDIA H100) and PLGrid allocations (to be applied for). Policies are trained by reinforcement learning (PPO) and by imitation of a shortest-path planner in the twin; small policies on frozen visual encoders keep the compute academic.</w:t>
+      </w:r>
+    </w:p>
+    <w:p>
+      <w:pPr>
+        <w:spacing w:after="120" w:line="240" w:lineRule="auto"/>
+        <w:jc w:val="both"/>
+      </w:pPr>
+      <w:r>
+        <w:rPr>
+          <w:rFonts w:cstheme="minorHAnsi"/>
+          <w:b/>
+          <w:lang w:val="en-US"/>
+        </w:rPr>
+        <w:t xml:space="preserve">Stage I – task-aware capture (RQ1, H1; sem. 3–4).</w:t>
       </w:r>
     </w:p>
     <w:p>
@@ -7117,29 +7213,29 @@
           <w:i/>
           <w:lang w:val="en-US"/>
         </w:rPr>
-        <w:t xml:space="preserve">Benchmark:</w:t>
-      </w:r>
-      <w:r>
-        <w:rPr>
-          <w:rFonts w:cstheme="minorHAnsi"/>
-          <w:lang w:val="en-US"/>
-        </w:rPr>
-        <w:t xml:space="preserve"> for every scene and capture budget we render twin frames at the camera poses of held-out real frames, which gives </w:t>
-      </w:r>
-      <w:r>
-        <w:rPr>
-          <w:rFonts w:cstheme="minorHAnsi"/>
-          <w:b/>
-          <w:lang w:val="en-US"/>
-        </w:rPr>
-        <w:t xml:space="preserve">paired real/twin frames of the same pose</w:t>
-      </w:r>
-      <w:r>
-        <w:rPr>
-          <w:rFonts w:cstheme="minorHAnsi"/>
-          <w:lang w:val="en-US"/>
-        </w:rPr>
-        <w:t xml:space="preserve">, plus per-scene fidelity (PSNR, SSIM, LPIPS, depth error) and cost (capture minutes, GPU-hours).</w:t>
+        <w:t xml:space="preserve">Method:</w:t>
+      </w:r>
+      <w:r>
+        <w:rPr>
+          <w:rFonts w:cstheme="minorHAnsi"/>
+          <w:lang w:val="en-US"/>
+        </w:rPr>
+        <w:t xml:space="preserve"> per-region reconstruction uncertainty of the current twin (Fisher information [16] or a Bayes' Rays-type [18] field, adapted to 3DGS) is weighted by </w:t>
+      </w:r>
+      <w:r>
+        <w:rPr>
+          <w:rFonts w:cstheme="minorHAnsi"/>
+          <w:b/>
+          <w:lang w:val="en-US"/>
+        </w:rPr>
+        <w:t xml:space="preserve">task relevance</w:t>
+      </w:r>
+      <w:r>
+        <w:rPr>
+          <w:rFonts w:cstheme="minorHAnsi"/>
+          <w:lang w:val="en-US"/>
+        </w:rPr>
+        <w:t xml:space="preserve">, i.e. how often a pilot policy trained in the current twin visits or attends to the region on sampled start–goal paths. The next views are chosen greedily where task-weighted uncertainty is highest, in rounds, until the budget is spent.</w:t>
       </w:r>
     </w:p>
     <w:p>
@@ -7161,14 +7257,14 @@
           <w:i/>
           <w:lang w:val="en-US"/>
         </w:rPr>
-        <w:t xml:space="preserve">Encoders:</w:t>
-      </w:r>
-      <w:r>
-        <w:rPr>
-          <w:rFonts w:cstheme="minorHAnsi"/>
-          <w:lang w:val="en-US"/>
-        </w:rPr>
-        <w:t xml:space="preserve"> ≥ 10 frozen image and video encoders used as policy backbones (e.g. DINOv2 [20], CLIP-type, V-JEPA 2 [21]), plus the encoders inside twin-trained policies.</w:t>
+        <w:t xml:space="preserve">Baselines:</w:t>
+      </w:r>
+      <w:r>
+        <w:rPr>
+          <w:rFonts w:cstheme="minorHAnsi"/>
+          <w:lang w:val="en-US"/>
+        </w:rPr>
+        <w:t xml:space="preserve"> uniform subsampling of the capture, and reconstruction-only next-best-view (FisherRF-type [16]) at the same budget.</w:t>
       </w:r>
     </w:p>
     <w:p>
@@ -7190,44 +7286,14 @@
           <w:i/>
           <w:lang w:val="en-US"/>
         </w:rPr>
-        <w:t xml:space="preserve">Method:</w:t>
-      </w:r>
-      <w:r>
-        <w:rPr>
-          <w:rFonts w:cstheme="minorHAnsi"/>
-          <w:lang w:val="en-US"/>
-        </w:rPr>
-        <w:t xml:space="preserve"> for each layer, </w:t>
-      </w:r>
-      <w:r>
-        <w:rPr>
-          <w:rFonts w:cstheme="minorHAnsi"/>
-          <w:b/>
-          <w:lang w:val="en-US"/>
-        </w:rPr>
-        <w:t xml:space="preserve">linear CKA</w:t>
-      </w:r>
-      <w:r>
-        <w:rPr>
-          <w:rFonts w:cstheme="minorHAnsi"/>
-          <w:lang w:val="en-US"/>
-        </w:rPr>
-        <w:t xml:space="preserve"> [19] between real and twin activations, and </w:t>
-      </w:r>
-      <w:r>
-        <w:rPr>
-          <w:rFonts w:cstheme="minorHAnsi"/>
-          <w:b/>
-          <w:lang w:val="en-US"/>
-        </w:rPr>
-        <w:t xml:space="preserve">linear probes</w:t>
-      </w:r>
-      <w:r>
-        <w:rPr>
-          <w:rFonts w:cstheme="minorHAnsi"/>
-          <w:lang w:val="en-US"/>
-        </w:rPr>
-        <w:t xml:space="preserve"> [18] trained on twin features and tested on real features (targets: depth, semantic class, relative goal direction). Gap = 1 − CKA and the probe-accuracy drop.</w:t>
+        <w:t xml:space="preserve">Metric:</w:t>
+      </w:r>
+      <w:r>
+        <w:rPr>
+          <w:rFonts w:cstheme="minorHAnsi"/>
+          <w:lang w:val="en-US"/>
+        </w:rPr>
+        <w:t xml:space="preserve"> budget–success-rate (SR) curves on tier A, with ≥ 4 capture budgets; capture needed to reach the SR that uniform capture reaches at the largest budget. Image fidelity (PSNR, LPIPS) is reported but is not the target.</w:t>
       </w:r>
     </w:p>
     <w:p>
@@ -7256,7 +7322,7 @@
           <w:rFonts w:cstheme="minorHAnsi"/>
           <w:lang w:val="en-US"/>
         </w:rPr>
-        <w:t xml:space="preserve"> concentration of the gap in layers, monotonic decrease with the capture budget, differences between encoders, and a robustness ranking that predicts downstream twin→real success rate (SR) with Spearman ρ ≥ 0.6. Downstream SR comes from navigation policies trained on each frozen encoder in the twins and tested in tier A. Decision rules are those of §7.</w:t>
+        <w:t xml:space="preserve"> ≥ 40% fewer views than uniform capture at equal SR, and fewer than reconstruction-only selection (upper 95% bound of the ratio &lt; 1), as in §7.</w:t>
       </w:r>
     </w:p>
     <w:p>
@@ -7270,7 +7336,7 @@
           <w:b/>
           <w:lang w:val="en-US"/>
         </w:rPr>
-        <w:t xml:space="preserve">Stage II – policy zoo and transfer forecasting (RQ2, H2; sem. 4–5).</w:t>
+        <w:t xml:space="preserve">Stage II – uncertainty-aware training on an imperfect twin (RQ2, H2; sem. 4).</w:t>
       </w:r>
     </w:p>
     <w:p>
@@ -7292,14 +7358,14 @@
           <w:i/>
           <w:lang w:val="en-US"/>
         </w:rPr>
-        <w:t xml:space="preserve">Policy zoo:</w:t>
-      </w:r>
-      <w:r>
-        <w:rPr>
-          <w:rFonts w:cstheme="minorHAnsi"/>
-          <w:lang w:val="en-US"/>
-        </w:rPr>
-        <w:t xml:space="preserve"> ≥ 200 point-goal and image-goal navigation policies trained in the twins by reinforcement learning (PPO / DD-PPO) and imitation of a privileged planner. They vary scene, capture budget, encoder, architecture, training data and seed. Each policy is evaluated in its twin and in tier A, which gives the label: the twin→real SR gap. Small policies and shared frozen encoders keep the zoo within academic compute (a pilot in sem. 3 fixes the final size).</w:t>
+        <w:t xml:space="preserve">Method:</w:t>
+      </w:r>
+      <w:r>
+        <w:rPr>
+          <w:rFonts w:cstheme="minorHAnsi"/>
+          <w:lang w:val="en-US"/>
+        </w:rPr>
+        <w:t xml:space="preserve"> (a) augmentation whose strength follows per-region reconstruction uncertainty (appearance and geometry perturbations where the twin is unsure, little where it is sure); (b) sample weighting of twin frames by their representation distance (frozen DINOv2 [25] features) to a few real images. The images come from the capture itself, so they cost no extra real data.</w:t>
       </w:r>
     </w:p>
     <w:p>
@@ -7321,21 +7387,6 @@
           <w:i/>
           <w:lang w:val="en-US"/>
         </w:rPr>
-        <w:t xml:space="preserve">Predictors:</w:t>
-      </w:r>
-      <w:r>
-        <w:rPr>
-          <w:rFonts w:cstheme="minorHAnsi"/>
-          <w:lang w:val="en-US"/>
-        </w:rPr>
-        <w:t xml:space="preserve"> (i) a graph neural network over per-layer hidden-state statistics on a fixed probe set of twin frames and, where available, unlabelled real frames of the capture (no real rollouts; the student's prior method for forecasting from hidden states); (ii) weight-space metanetworks [26, 27]. </w:t>
-      </w:r>
-      <w:r>
-        <w:rPr>
-          <w:rFonts w:cstheme="minorHAnsi"/>
-          <w:i/>
-          <w:lang w:val="en-US"/>
-        </w:rPr>
         <w:t xml:space="preserve">Baselines:</w:t>
       </w:r>
       <w:r>
@@ -7343,7 +7394,7 @@
           <w:rFonts w:cstheme="minorHAnsi"/>
           <w:lang w:val="en-US"/>
         </w:rPr>
-        <w:t xml:space="preserve"> twin SR alone, image fidelity (PSNR/LPIPS), and simulator-level predictivity: real SR predicted from twin SR by the sim-to-real mapping fitted on training scenes [10]. Splits are by held-out scene. Ablations keep fidelity fixed and vary the policy, so that the predictor cannot rely only on twin quality.</w:t>
+        <w:t xml:space="preserve"> uniform domain randomization [20] with tuned ranges, no randomization, and feature alignment [23] as an extra comparator; all at the same capture budget.</w:t>
       </w:r>
     </w:p>
     <w:p>
@@ -7365,14 +7416,28 @@
           <w:i/>
           <w:lang w:val="en-US"/>
         </w:rPr>
-        <w:t xml:space="preserve">Failure monitors:</w:t>
-      </w:r>
-      <w:r>
-        <w:rPr>
-          <w:rFonts w:cstheme="minorHAnsi"/>
-          <w:lang w:val="en-US"/>
-        </w:rPr>
-        <w:t xml:space="preserve"> hidden-state failure scores (in the style of [29, 30]) with thresholds set by split conformal prediction [28] at 90% coverage in the twin; coverage is measured on tier A closed-loop rollouts (tier C reports agreement).</w:t>
+        <w:t xml:space="preserve">Metric and criterion (H2):</w:t>
+      </w:r>
+      <w:r>
+        <w:rPr>
+          <w:rFonts w:cstheme="minorHAnsi"/>
+          <w:lang w:val="en-US"/>
+        </w:rPr>
+        <w:t xml:space="preserve"> tier-A SR on held-out scenes, paired by scene; ≥ 10 pp higher SR than uniform domain randomization at an equal capture budget (lower 95% bound &gt; 0), at each of ≥ 2 budgets.</w:t>
+      </w:r>
+    </w:p>
+    <w:p>
+      <w:pPr>
+        <w:spacing w:after="120" w:line="240" w:lineRule="auto"/>
+        <w:jc w:val="both"/>
+      </w:pPr>
+      <w:r>
+        <w:rPr>
+          <w:rFonts w:cstheme="minorHAnsi"/>
+          <w:b/>
+          <w:lang w:val="en-US"/>
+        </w:rPr>
+        <w:t xml:space="preserve">Stage III – few real rollouts and correction (RQ3, H3; end of sem. 4 – sem. 5).</w:t>
       </w:r>
     </w:p>
     <w:p>
@@ -7394,28 +7459,14 @@
           <w:i/>
           <w:lang w:val="en-US"/>
         </w:rPr>
-        <w:t xml:space="preserve">Success criterion (H2):</w:t>
-      </w:r>
-      <w:r>
-        <w:rPr>
-          <w:rFonts w:cstheme="minorHAnsi"/>
-          <w:lang w:val="en-US"/>
-        </w:rPr>
-        <w:t xml:space="preserve"> ≥ 20% lower MAE than the best baseline (lower 95% bound of the reduction &gt; 0), and real coverage ≥ 85% (ε = 5 pp).</w:t>
-      </w:r>
-    </w:p>
-    <w:p>
-      <w:pPr>
-        <w:spacing w:after="120" w:line="240" w:lineRule="auto"/>
-        <w:jc w:val="both"/>
-      </w:pPr>
-      <w:r>
-        <w:rPr>
-          <w:rFonts w:cstheme="minorHAnsi"/>
-          <w:b/>
-          <w:lang w:val="en-US"/>
-        </w:rPr>
-        <w:t xml:space="preserve">Stage III – budget-allocation experiments (RQ3, H3; sem. 5–6).</w:t>
+        <w:t xml:space="preserve">Selection:</w:t>
+      </w:r>
+      <w:r>
+        <w:rPr>
+          <w:rFonts w:cstheme="minorHAnsi"/>
+          <w:lang w:val="en-US"/>
+        </w:rPr>
+        <w:t xml:space="preserve"> candidate real rollouts (start–goal pairs) are scored by the predicted twin-to-real gap: disagreement of a small policy ensemble, plus the reconstruction uncertainty along the planned path. The top-k are executed in reality (tier A: the reference twin).</w:t>
       </w:r>
     </w:p>
     <w:p>
@@ -7437,14 +7488,14 @@
           <w:i/>
           <w:lang w:val="en-US"/>
         </w:rPr>
-        <w:t xml:space="preserve">Levers:</w:t>
-      </w:r>
-      <w:r>
-        <w:rPr>
-          <w:rFonts w:cstheme="minorHAnsi"/>
-          <w:lang w:val="en-US"/>
-        </w:rPr>
-        <w:t xml:space="preserve"> (a) weighting of twin training data by representation distance to a small real set; (b) capture selection, i.e. which scenes or regions to (re)capture, guided by the localized gap from Stage I; (c) rollout selection, i.e. which real rollouts to collect, guided by the Stage II forecasts and their uncertainty. Real SR is estimated from few rollouts with prediction-powered inference [33, 34].</w:t>
+        <w:t xml:space="preserve">Use:</w:t>
+      </w:r>
+      <w:r>
+        <w:rPr>
+          <w:rFonts w:cstheme="minorHAnsi"/>
+          <w:lang w:val="en-US"/>
+        </w:rPr>
+        <w:t xml:space="preserve"> the rollouts (i) correct the twin, by re-capturing or re-weighting the regions where real and twin observations disagree (photometric correction in the style of [35]), and (ii) fine-tune the policy by co-training with the real rollouts [13]. Real SR is estimated from few trials with prediction-powered inference [32, 33].</w:t>
       </w:r>
     </w:p>
     <w:p>
@@ -7473,7 +7524,7 @@
           <w:rFonts w:cstheme="minorHAnsi"/>
           <w:lang w:val="en-US"/>
         </w:rPr>
-        <w:t xml:space="preserve"> uniform and random allocation of the same budget. Analysis: attribution of real successes and failures to twin data [31, 32].</w:t>
+        <w:t xml:space="preserve"> random selection and uniform coverage of the same number of rollouts; related selection rules [27–29] as comparators where they apply.</w:t>
       </w:r>
     </w:p>
     <w:p>
@@ -7502,7 +7553,7 @@
           <w:rFonts w:cstheme="minorHAnsi"/>
           <w:lang w:val="en-US"/>
         </w:rPr>
-        <w:t xml:space="preserve"> budget–performance curves (real data = capture minutes + real rollouts in one operator-time cost) fitted per method; guided allocation reaches the target SR τ with ≤ 0.7 of the uniform budget (upper 95% bound of the ratio &lt; 1).</w:t>
+        <w:t xml:space="preserve"> the target SR is reached with ≥ 50% fewer real rollouts than random selection (upper 95% bound of the ratio &lt; 1).</w:t>
       </w:r>
     </w:p>
     <w:p>
@@ -7516,7 +7567,7 @@
           <w:b/>
           <w:lang w:val="en-US"/>
         </w:rPr>
-        <w:t xml:space="preserve">Stage IV – cross-task and cross-simulator generalization (RQ4, H4; sem. 6).</w:t>
+        <w:t xml:space="preserve">Stage IV – budget of the whole loop and cross-task test (RQ4, H4; sem. 6).</w:t>
       </w:r>
     </w:p>
     <w:p>
@@ -7538,14 +7589,29 @@
           <w:i/>
           <w:lang w:val="en-US"/>
         </w:rPr>
-        <w:t xml:space="preserve">Manipulation set:</w:t>
-      </w:r>
-      <w:r>
-        <w:rPr>
-          <w:rFonts w:cstheme="minorHAnsi"/>
-          <w:lang w:val="en-US"/>
-        </w:rPr>
-        <w:t xml:space="preserve"> public manipulation policies evaluated in the SIMPLER [12] replicas of real set-ups, with their published paired sim/real results as labels (tier B; ≥ 12 policy–task pairs). These policies are trained on real data, so the test asks whether performance in a simulated replica holds in reality.</w:t>
+        <w:t xml:space="preserve">Budget curve:</w:t>
+      </w:r>
+      <w:r>
+        <w:rPr>
+          <w:rFonts w:cstheme="minorHAnsi"/>
+          <w:lang w:val="en-US"/>
+        </w:rPr>
+        <w:t xml:space="preserve"> total real data (capture + rollouts, one operator-time cost) against real SR for the full loop (Stages I–III) and for </w:t>
+      </w:r>
+      <w:r>
+        <w:rPr>
+          <w:rFonts w:cstheme="minorHAnsi"/>
+          <w:b/>
+          <w:lang w:val="en-US"/>
+        </w:rPr>
+        <w:t xml:space="preserve">real-only learning</w:t>
+      </w:r>
+      <w:r>
+        <w:rPr>
+          <w:rFonts w:cstheme="minorHAnsi"/>
+          <w:lang w:val="en-US"/>
+        </w:rPr>
+        <w:t xml:space="preserve">, i.e. a policy trained only on data collected in the reference with the same encoder and algorithm, every interaction counted as real data. The "exchange rate" is the ratio of the budgets that reach the target SR; real-only scaling results [9, 10] give the expected curve shapes. The curve is also reported for a uniform loop (no Stage I–III guidance) and for a frozen, pretrained world model used as the simulator (comparator only; not trained).</w:t>
       </w:r>
     </w:p>
     <w:p>
@@ -7567,29 +7633,14 @@
           <w:i/>
           <w:lang w:val="en-US"/>
         </w:rPr>
-        <w:t xml:space="preserve">Method:</w:t>
-      </w:r>
-      <w:r>
-        <w:rPr>
-          <w:rFonts w:cstheme="minorHAnsi"/>
-          <w:lang w:val="en-US"/>
-        </w:rPr>
-        <w:t xml:space="preserve"> the navigation-trained hidden-state predictor, which does not depend on the architecture, is applied without retraining. </w:t>
-      </w:r>
-      <w:r>
-        <w:rPr>
-          <w:rFonts w:cstheme="minorHAnsi"/>
-          <w:i/>
-          <w:lang w:val="en-US"/>
-        </w:rPr>
-        <w:t xml:space="preserve">Comparators:</w:t>
-      </w:r>
-      <w:r>
-        <w:rPr>
-          <w:rFonts w:cstheme="minorHAnsi"/>
-          <w:lang w:val="en-US"/>
-        </w:rPr>
-        <w:t xml:space="preserve"> SRCC of a generic simulator [10] and a frozen learned world model used as a policy evaluator (in the style of [35]); world models are not trained.</w:t>
+        <w:t xml:space="preserve">Manipulation:</w:t>
+      </w:r>
+      <w:r>
+        <w:rPr>
+          <w:rFonts w:cstheme="minorHAnsi"/>
+          <w:lang w:val="en-US"/>
+        </w:rPr>
+        <w:t xml:space="preserve"> the same pipeline, unchanged, on public manipulation scenes with twin environments (ManiSkill3 [8]) under the tier-A protocol; published paired sim/real results (SIMPLER [34]) check that the proxy ranks policies as reality does (tier B).</w:t>
       </w:r>
     </w:p>
     <w:p>
@@ -7618,7 +7669,7 @@
           <w:rFonts w:cstheme="minorHAnsi"/>
           <w:lang w:val="en-US"/>
         </w:rPr>
-        <w:t xml:space="preserve"> Spearman ρ ≥ 0.5 on manipulation, and a higher rank correlation with real outcomes than both comparators (95% CI of each paired difference excludes 0).</w:t>
+        <w:t xml:space="preserve"> the loop reaches the target SR with ≤ 10% of the real data needed by real-only learning (upper 95% bound of the ratio &lt; 0.2); on manipulation, with pipeline and hyperparameters unchanged, the ratio's upper bound is &lt; 1 and the H1–H3 effects keep their sign.</w:t>
       </w:r>
     </w:p>
     <w:p>
@@ -7639,7 +7690,7 @@
           <w:rFonts w:cstheme="minorHAnsi"/>
           <w:lang w:val="en-US"/>
         </w:rPr>
-        <w:t xml:space="preserve"> Two robot campaigns (sem. 5 and 7) check that tier-A conclusions carry over: 8 zoo policies × 60 episodes (2 environments × 10 start–goal pairs × 3 trials), about 16 robot-hours per campaign at ~2 min per episode. Tier C is reported as agreement and is never used to tune thresholds.</w:t>
+        <w:t xml:space="preserve"> Two robot campaigns (sem. 5 and 7) in 2 PWr rooms: phone or RGB-D capture, twins, policies with uniform capture versus the loop, and the few selected real rollouts. About 8 robot-hours per campaign (3 policies × 2 rooms × 30 episodes at ~2 min each, plus 2 × 20 selected rollouts). Tier C is reported as agreement with tier A and is never used to tune thresholds.</w:t>
       </w:r>
     </w:p>
     <w:p>
@@ -7660,7 +7711,7 @@
           <w:rFonts w:cstheme="minorHAnsi"/>
           <w:lang w:val="en-US"/>
         </w:rPr>
-        <w:t xml:space="preserve"> Tests are one-sided (α = 0.05), bootstrapped over scenes and Holm-corrected within each hypothesis, as in §7. The protocol is pre-registered in the project repository before each stage, and changes are logged with reasons. Code, the paired-frame benchmark and the policy zoo are released where the dataset licences permit.</w:t>
+        <w:t xml:space="preserve"> Tests are one-sided (α = 0.05), bootstrapped over scenes and seeds, Holm-corrected within each hypothesis, as in §7. The protocol is pre-registered in the project repository before each stage, and changes are logged with reasons. Code and scripts are released where the dataset licences permit.</w:t>
       </w:r>
     </w:p>
     <w:permEnd w:id="32011344"/>
@@ -7929,7 +7980,7 @@
           <w:rFonts w:cstheme="minorHAnsi"/>
           <w:lang w:val="pl-PL"/>
         </w:rPr>
-        <w:t xml:space="preserve">Roboty uczą się dziś samodzielnego działania, na przykład poruszania się po budynku lub chwytania przedmiotów, metodą prób i błędów. Potrzebują do tego bardzo wielu prób, więc zwykle ćwiczą w symulacji komputerowej. Coraz częściej jest nią cyfrowy bliźniak: wierna, fotorealistyczna kopia prawdziwego miejsca, którą metody sztucznej inteligencji potrafią odtworzyć z krótkiego filmu nagranego telefonem. Kopia nigdy nie jest jednak idealna. Bywa rozmyta, ma drobne zniekształcenia i inaczej oddaje światło. Robot, który świetnie radzi sobie w kopii, może więc zawieść w prawdziwym świecie. Dziś można to sprawdzić tylko, wypuszczając go do prawdziwego budynku, a to jest powolne i kosztowne.</w:t>
+        <w:t xml:space="preserve">Roboty uczą się dziś samodzielnego działania, na przykład poruszania się po budynku lub chwytania przedmiotów, metodą prób i błędów. Potrzebują do tego bardzo wielu prób, więc zwykle ćwiczą w symulacji komputerowej. Coraz częściej jest nią cyfrowy bliźniak: wierna, fotorealistyczna kopia prawdziwego miejsca, którą metody sztucznej inteligencji potrafią odtworzyć z krótkiego nagrania. Powstaje w ten sposób pętla: nagrywamy prawdziwe miejsce, budujemy jego kopię, uczymy w niej robota, sprawdzamy go w rzeczywistości, poprawiamy i dopiero wtedy wdrażamy. Każdy z tych kroków wymaga jednak prawdziwych danych, czyli nagrań i prób w prawdziwym świecie, a ich zbieranie jest powolne i kosztowne.</w:t>
       </w:r>
     </w:p>
     <w:p>
@@ -7942,7 +7993,7 @@
           <w:rFonts w:cstheme="minorHAnsi"/>
           <w:lang w:val="pl-PL"/>
         </w:rPr>
-        <w:t xml:space="preserve">Celem rozprawy jest sprawdzenie, czy da się to przewidzieć wcześniej, zaglądając „do głowy” robota. Model sztucznej inteligencji, który steruje robotem, przetwarza każdy obraz na wewnętrzny opis tego, co widzi. Zbadamy, czy obraz z kopii i obraz z rzeczywistości tego samego miejsca są przez model opisywane podobnie, w której części modelu pojawiają się różnice i jak maleją, gdy nagranie jest dłuższe. Następnie nauczymy osobny model przewidywać na podstawie tych wewnętrznych opisów, jak dobrze robot poradzi sobie w rzeczywistości i kiedy może popełnić błąd, zanim zostanie tam wysłany. Na koniec sprawdzimy, czy takie prognozy pomagają mądrze wydać niewielki zasób prawdziwych danych: co warto nagrać i które próby w rzeczywistości przeprowadzić. Głównym zadaniem testowym będzie nawigacja robota mobilnego, a sprawdzianem uniwersalności chwytanie przedmiotów ramieniem robota. Badania będą prowadzone przede wszystkim na publicznie dostępnych nagraniach i trójwymiarowych skanach prawdziwych budynków, a wybrane wyniki zostaną potwierdzone na prawdziwym robocie.</w:t>
+        <w:t xml:space="preserve">Celem rozprawy jest sprawdzenie, jak przejść przez tę pętlę z jak najmniejszą ilością prawdziwych danych. Zamiast nagrywać wszystko po równo, będziemy nagrywać przede wszystkim te miejsca, które są ważne dla zadania robota i których kopia jest jeszcze niepewna. Ponieważ kopia nigdy nie jest idealna, nauczymy robota tak, aby nie polegał na jej niepewnych fragmentach i radził sobie z jej błędami. Na koniec wybierzemy tylko te nieliczne próby w rzeczywistości, które najwięcej mówią o tym, gdzie robot jeszcze zawodzi, i wykorzystamy je do poprawienia zarówno kopii, jak i robota. Wskazówek dostarczy sama kopia, która wie, gdzie jest niepewna, oraz sposób, w jaki model sterujący robotem opisuje to, co widzi. Głównym zadaniem testowym będzie nawigacja robota mobilnego, a sprawdzianem uniwersalności chwytanie przedmiotów ramieniem robota. Badania będą prowadzone przede wszystkim na publicznie dostępnych nagraniach i trójwymiarowych skanach prawdziwych budynków, a wybrane wyniki zostaną potwierdzone na prawdziwym robocie.</w:t>
       </w:r>
     </w:p>
     <w:p>
@@ -7955,7 +8006,7 @@
           <w:rFonts w:cstheme="minorHAnsi"/>
           <w:lang w:val="pl-PL"/>
         </w:rPr>
-        <w:t xml:space="preserve">Spodziewanym efektem są metody, które pozwolą ocenić robota wyuczonego w cyfrowej kopii, zanim trafi do prawdziwego świata, oraz zmniejszyć liczbę kosztownych prób w rzeczywistości. Może to przyspieszyć i potanić wdrażanie robotów w magazynach, szpitalach, biurach i fabrykach. Opracowane oprogramowanie, dane i wyuczone modele zostaną udostępnione publicznie.</w:t>
+        <w:t xml:space="preserve">Spodziewanym efektem są metody, które pozwolą nagrywać mniej, uczyć skuteczniej i wykonywać mniej kosztownych prób w rzeczywistości, oraz pomiar, ile prawdziwych danych potrzeba, gdy robot uczy się w cyfrowej kopii. Może to przyspieszyć i potanić wdrażanie robotów w magazynach, szpitalach, biurach i fabrykach. Opracowane oprogramowanie zostanie udostępnione publicznie.</w:t>
       </w:r>
     </w:p>
     <w:permEnd w:id="301016009"/>
@@ -8010,7 +8061,7 @@
           <w:rFonts w:cstheme="minorHAnsi"/>
           <w:lang w:val="en-US"/>
         </w:rPr>
-        <w:t xml:space="preserve">Robots today learn to act on their own, for example to move around a building or to grasp objects, by trial and error. They need a very large number of trials, so they usually practise in a computer simulation. Increasingly, this is a digital twin: a faithful, photorealistic copy of a real place that artificial intelligence methods can reconstruct from a short video recorded with a phone. The copy, however, is never perfect. It can be blurry, have small distortions and render light differently. A robot that does very well in the copy may therefore fail in the real world. Today this can only be checked by sending it into a real building, which is slow and costly.</w:t>
+        <w:t xml:space="preserve">Robots today learn to act on their own, for example to move around a building or to grasp objects, by trial and error. They need a very large number of trials, so they usually practise in a computer simulation. Increasingly, this is a digital twin: a faithful, photorealistic copy of a real place that artificial intelligence methods can reconstruct from a short recording. This creates a loop: we record the real place, build its copy, train the robot in it, check it in reality, correct it and only then deploy it. Each of these steps, however, needs real data, that is, recordings and trials in the real world, and collecting them is slow and costly.</w:t>
       </w:r>
     </w:p>
     <w:p>
@@ -8023,7 +8074,7 @@
           <w:rFonts w:cstheme="minorHAnsi"/>
           <w:lang w:val="en-US"/>
         </w:rPr>
-        <w:t xml:space="preserve">The goal of this dissertation is to find out whether this can be predicted earlier by looking "inside the head" of the robot. The artificial intelligence model that controls the robot turns every image into an internal description of what it sees. We will study whether an image from the copy and an image from reality of the same place are described similarly by the model, in which part of the model differences appear, and how they shrink when the recording is longer. Next, we will teach a separate model to predict from these internal descriptions how well the robot will cope in reality and when it may make a mistake, before it is sent there. Finally, we will check whether such forecasts help to spend a small amount of real data wisely: what is worth recording and which trials in reality to carry out. Mobile-robot navigation will be the main test task, and grasping objects with a robot arm will test how universal the approach is. The research will be carried out mainly on publicly available recordings and three-dimensional scans of real buildings, and selected results will be confirmed on a real robot.</w:t>
+        <w:t xml:space="preserve">The goal of this dissertation is to find out how to go through this loop with as little real data as possible. Instead of recording everything evenly, we will record mainly the places that matter for the robot's task and whose copy is still uncertain. Because the copy is never perfect, we will train the robot so that it does not rely on the uncertain parts of the copy and copes with its errors. Finally, we will choose only the few trials in reality that tell the most about where the robot still fails, and use them to correct both the copy and the robot. Guidance will come from the copy itself, which knows where it is uncertain, and from the way the model that controls the robot describes what it sees. Mobile-robot navigation will be the main test task, and grasping objects with a robot arm will test how universal the approach is. The research will be carried out mainly on publicly available recordings and three-dimensional scans of real buildings, and selected results will be confirmed on a real robot.</w:t>
       </w:r>
     </w:p>
     <w:p>
@@ -8036,7 +8087,7 @@
           <w:rFonts w:cstheme="minorHAnsi"/>
           <w:lang w:val="en-US"/>
         </w:rPr>
-        <w:t xml:space="preserve">The expected result is methods that make it possible to assess a robot trained in a digital copy before it reaches the real world, and to reduce the number of costly trials in reality. This may make deploying robots in warehouses, hospitals, offices and factories faster and cheaper. The software, data and trained models developed will be made publicly available.</w:t>
+        <w:t xml:space="preserve">The expected result is methods that make it possible to record less, train more effectively and carry out fewer costly trials in reality, and a measurement of how much real data is needed when a robot learns in a digital copy. This may make deploying robots in warehouses, hospitals, offices and factories faster and cheaper. The software developed will be made publicly available.</w:t>
       </w:r>
     </w:p>
     <w:permEnd w:id="305530072"/>
@@ -8442,7 +8493,7 @@
           <w:rFonts w:cstheme="minorHAnsi"/>
           <w:lang w:val="en-US"/>
         </w:rPr>
-        <w:t xml:space="preserve"> submitted for review to the </w:t>
+        <w:t xml:space="preserve"> submitted for review to the main track of the </w:t>
       </w:r>
       <w:r>
         <w:rPr>
@@ -8457,7 +8508,7 @@
           <w:rFonts w:cstheme="minorHAnsi"/>
           <w:lang w:val="en-US"/>
         </w:rPr>
-        <w:t xml:space="preserve">, main track or Datasets &amp; Benchmarks track. NeurIPS is peer-reviewed international conference proceedings worth </w:t>
+        <w:t xml:space="preserve">. NeurIPS is peer-reviewed international conference proceedings worth </w:t>
       </w:r>
       <w:r>
         <w:rPr>
@@ -8487,7 +8538,7 @@
           <w:rFonts w:cstheme="minorHAnsi"/>
           <w:lang w:val="en-US"/>
         </w:rPr>
-        <w:t xml:space="preserve">. P1 reports Stage I (RQ1): a benchmark of paired real and twin-rendered frames, the localization of the twin-vs-real gap inside frozen encoders, and a first test of whether encoder robustness predicts the transfer of twin-trained policies (task T4.2). If it is rejected, the revised paper goes to </w:t>
+        <w:t xml:space="preserve">. P1 reports Stages I–II (RQ1–RQ2): task-aware, uncertainty-guided capture of digital twins and uncertainty-aware training of policies on imperfect twins, evaluated by the real data they save (task T4.2). If it is rejected, the revised paper goes to </w:t>
       </w:r>
       <w:r>
         <w:rPr>
@@ -8766,14 +8817,14 @@
           <w:b/>
           <w:lang w:val="en-US"/>
         </w:rPr>
-        <w:t xml:space="preserve">Planned outputs by year.</w:t>
-      </w:r>
-      <w:r>
-        <w:rPr>
-          <w:rFonts w:cstheme="minorHAnsi"/>
-          <w:lang w:val="en-US"/>
-        </w:rPr>
-        <w:t xml:space="preserve"> All papers target 200-point conferences assigned to the discipline (list of 5.01.2024; re-checked against the new list).</w:t>
+        <w:t xml:space="preserve">Planned outputs by year</w:t>
+      </w:r>
+      <w:r>
+        <w:rPr>
+          <w:rFonts w:cstheme="minorHAnsi"/>
+          <w:lang w:val="en-US"/>
+        </w:rPr>
+        <w:t xml:space="preserve"> (200-point conferences assigned to the discipline, list of 5.01.2024).</w:t>
       </w:r>
     </w:p>
     <w:tbl>
@@ -8784,9 +8835,9 @@
       </w:tblPr>
       <w:tblGrid>
         <w:gridCol w:w="1269"/>
-        <w:gridCol w:w="3684"/>
+        <w:gridCol w:w="3714"/>
         <w:gridCol w:w="1269"/>
-        <w:gridCol w:w="1238"/>
+        <w:gridCol w:w="1208"/>
         <w:gridCol w:w="1612"/>
       </w:tblGrid>
       <w:tr>
@@ -8811,7 +8862,7 @@
         </w:tc>
         <w:tc>
           <w:tcPr>
-            <w:tcW w:w="3684" w:type="dxa"/>
+            <w:tcW w:w="3714" w:type="dxa"/>
           </w:tcPr>
           <w:p>
             <w:pPr>
@@ -8843,13 +8894,13 @@
                 <w:b/>
                 <w:lang w:val="en-US"/>
               </w:rPr>
-              <w:t xml:space="preserve">Data and code</w:t>
+              <w:t xml:space="preserve">Code</w:t>
             </w:r>
           </w:p>
         </w:tc>
         <w:tc>
           <w:tcPr>
-            <w:tcW w:w="1238" w:type="dxa"/>
+            <w:tcW w:w="1208" w:type="dxa"/>
           </w:tcPr>
           <w:p>
             <w:pPr>
@@ -8907,7 +8958,7 @@
         </w:tc>
         <w:tc>
           <w:tcPr>
-            <w:tcW w:w="3684" w:type="dxa"/>
+            <w:tcW w:w="3714" w:type="dxa"/>
           </w:tcPr>
           <w:p>
             <w:pPr>
@@ -8943,7 +8994,7 @@
         </w:tc>
         <w:tc>
           <w:tcPr>
-            <w:tcW w:w="1238" w:type="dxa"/>
+            <w:tcW w:w="1208" w:type="dxa"/>
           </w:tcPr>
           <w:p>
             <w:pPr>
@@ -8999,7 +9050,7 @@
         </w:tc>
         <w:tc>
           <w:tcPr>
-            <w:tcW w:w="3684" w:type="dxa"/>
+            <w:tcW w:w="3714" w:type="dxa"/>
           </w:tcPr>
           <w:p>
             <w:pPr>
@@ -9011,7 +9062,7 @@
                 <w:rFonts w:cstheme="minorHAnsi"/>
                 <w:lang w:val="en-US"/>
               </w:rPr>
-              <w:t xml:space="preserve">P1 (RQ1, paired-frame benchmark and gap localization): NeurIPS 2027, May 2027 (§11)</w:t>
+              <w:t xml:space="preserve">P1 (RQ1–RQ2, task-aware capture, uncertainty-aware training): NeurIPS 2027, May 2027 (§11)</w:t>
             </w:r>
           </w:p>
         </w:tc>
@@ -9029,13 +9080,13 @@
                 <w:rFonts w:cstheme="minorHAnsi"/>
                 <w:lang w:val="en-US"/>
               </w:rPr>
-              <w:t xml:space="preserve">Benchmark v1</w:t>
+              <w:t xml:space="preserve">Loop on tier A</w:t>
             </w:r>
           </w:p>
         </w:tc>
         <w:tc>
           <w:tcPr>
-            <w:tcW w:w="1238" w:type="dxa"/>
+            <w:tcW w:w="1208" w:type="dxa"/>
           </w:tcPr>
           <w:p>
             <w:pPr>
@@ -9091,7 +9142,7 @@
         </w:tc>
         <w:tc>
           <w:tcPr>
-            <w:tcW w:w="3684" w:type="dxa"/>
+            <w:tcW w:w="3714" w:type="dxa"/>
           </w:tcPr>
           <w:p>
             <w:pPr>
@@ -9103,7 +9154,7 @@
                 <w:rFonts w:cstheme="minorHAnsi"/>
                 <w:lang w:val="en-US"/>
               </w:rPr>
-              <w:t xml:space="preserve">P2 (RQ2, forecasting transfer and failure): CVPR or ICLR 2028; P3 (RQ3–RQ4, budget allocation, manipulation): NeurIPS 2028</w:t>
+              <w:t xml:space="preserve">P2 (RQ3, few real rollouts, twin correction): CVPR or ICLR 2028; P3 (RQ4, budget of the full loop, manipulation): NeurIPS 2028</w:t>
             </w:r>
           </w:p>
         </w:tc>
@@ -9121,13 +9172,13 @@
                 <w:rFonts w:cstheme="minorHAnsi"/>
                 <w:lang w:val="en-US"/>
               </w:rPr>
-              <w:t xml:space="preserve">Policy zoo</w:t>
+              <w:t xml:space="preserve">Rollout selection</w:t>
             </w:r>
           </w:p>
         </w:tc>
         <w:tc>
           <w:tcPr>
-            <w:tcW w:w="1238" w:type="dxa"/>
+            <w:tcW w:w="1208" w:type="dxa"/>
           </w:tcPr>
           <w:p>
             <w:pPr>
@@ -9183,7 +9234,7 @@
         </w:tc>
         <w:tc>
           <w:tcPr>
-            <w:tcW w:w="3684" w:type="dxa"/>
+            <w:tcW w:w="3714" w:type="dxa"/>
           </w:tcPr>
           <w:p>
             <w:pPr>
@@ -9219,7 +9270,7 @@
         </w:tc>
         <w:tc>
           <w:tcPr>
-            <w:tcW w:w="1238" w:type="dxa"/>
+            <w:tcW w:w="1208" w:type="dxa"/>
           </w:tcPr>
           <w:p>
             <w:pPr>
@@ -9271,7 +9322,7 @@
           <w:rFonts w:cstheme="minorHAnsi"/>
           <w:lang w:val="en-US"/>
         </w:rPr>
-        <w:t xml:space="preserve">P1–P3 are the thematically linked core of the dissertation; P4 is optional.</w:t>
+        <w:t xml:space="preserve">P1–P3 are the linked core of the dissertation; P4 is optional.</w:t>
       </w:r>
     </w:p>
     <w:p>
@@ -9292,7 +9343,7 @@
           <w:rFonts w:cstheme="minorHAnsi"/>
           <w:lang w:val="en-US"/>
         </w:rPr>
-        <w:t xml:space="preserve"> (1) Z. Kira's group, Georgia Tech: EmbodiedSplat [4]. (2) Multi-robot Systems Lab, Stanford University (M. Schwager): Gaussian-splatting scene models and navigation. A European host (Erasmus+ route) from the weight-space learning community (authors of [25–27]) and a foreign co-author for P2 are sought with the supervisor in sem. 4.</w:t>
+        <w:t xml:space="preserve"> (1) Z. Kira's group, Georgia Tech: EmbodiedSplat [3]. (2) Multi-robot Systems Lab, Stanford University (M. Schwager): Gaussian-splatting scene models and navigation. A European host (Erasmus+ route) working on active reconstruction or sim-to-real transfer, and a foreign co-author for P2, are sought with the supervisor in sem. 4.</w:t>
       </w:r>
     </w:p>
     <w:p>
@@ -9313,7 +9364,7 @@
           <w:rFonts w:cstheme="minorHAnsi"/>
           <w:lang w:val="en-US"/>
         </w:rPr>
-        <w:t xml:space="preserve"> Real-robot validation is planned with the </w:t>
+        <w:t xml:space="preserve"> Robot validation is planned with the K29 </w:t>
       </w:r>
       <w:r>
         <w:rPr>
@@ -9328,7 +9379,7 @@
           <w:rFonts w:cstheme="minorHAnsi"/>
           <w:lang w:val="en-US"/>
         </w:rPr>
-        <w:t xml:space="preserve"> Autonomous Robots Laboratory (K29, W12N; Pioneer 3-DX, Jaguar 4x4, ROS 2); a written agreement is task T3.2 (Nov 2026).</w:t>
+        <w:t xml:space="preserve"> laboratory (Pioneer 3-DX, Jaguar 4x4, ROS 2); a written agreement is task T3.2 (Nov 2026).</w:t>
       </w:r>
     </w:p>
     <w:p>
@@ -9371,14 +9422,14 @@
           <w:i/>
           <w:lang w:val="en-US"/>
         </w:rPr>
-        <w:t xml:space="preserve">Policy zoo too small</w:t>
-      </w:r>
-      <w:r>
-        <w:rPr>
-          <w:rFonts w:cstheme="minorHAnsi"/>
-          <w:lang w:val="en-US"/>
-        </w:rPr>
-        <w:t xml:space="preserve"> (4–5): small policies, shared frozen encoders, imitation of a privileged planner; the sem. 3 pilot fixes the size; WCSS and PLGrid grants.</w:t>
+        <w:t xml:space="preserve">Task-aware capture gives no gain</w:t>
+      </w:r>
+      <w:r>
+        <w:rPr>
+          <w:rFonts w:cstheme="minorHAnsi"/>
+          <w:lang w:val="en-US"/>
+        </w:rPr>
+        <w:t xml:space="preserve"> (3–4): the measured capture–SR curves still answer RQ1, and Stages II–III have their own baselines (§7).</w:t>
       </w:r>
     </w:p>
     <w:p>
@@ -9400,14 +9451,14 @@
           <w:i/>
           <w:lang w:val="en-US"/>
         </w:rPr>
-        <w:t xml:space="preserve">Twin–real pairs unavailable</w:t>
-      </w:r>
-      <w:r>
-        <w:rPr>
-          <w:rFonts w:cstheme="minorHAnsi"/>
-          <w:lang w:val="en-US"/>
-        </w:rPr>
-        <w:t xml:space="preserve"> (3): licence or quality limits on the chosen dataset. Other public datasets with real captures and reference scans, and own captures at PWr.</w:t>
+        <w:t xml:space="preserve">3DGS uncertainty is poorly calibrated</w:t>
+      </w:r>
+      <w:r>
+        <w:rPr>
+          <w:rFonts w:cstheme="minorHAnsi"/>
+          <w:lang w:val="en-US"/>
+        </w:rPr>
+        <w:t xml:space="preserve"> (3–4): two estimators and an ensemble fallback, checked against the reference twin.</w:t>
       </w:r>
     </w:p>
     <w:p>
@@ -9429,14 +9480,14 @@
           <w:i/>
           <w:lang w:val="en-US"/>
         </w:rPr>
-        <w:t xml:space="preserve">Scooping</w:t>
-      </w:r>
-      <w:r>
-        <w:rPr>
-          <w:rFonts w:cstheme="minorHAnsi"/>
-          <w:lang w:val="en-US"/>
-        </w:rPr>
-        <w:t xml:space="preserve"> (3–6): failure detection and policy interpretability move fast. Early preprints, benchmark release, monthly literature monitoring; the zoo and weight-space angle differentiate the work.</w:t>
+        <w:t xml:space="preserve">Proxy reality is easier than reality</w:t>
+      </w:r>
+      <w:r>
+        <w:rPr>
+          <w:rFonts w:cstheme="minorHAnsi"/>
+          <w:lang w:val="en-US"/>
+        </w:rPr>
+        <w:t xml:space="preserve"> (4–7): the proxy's own error is reported; tier C checks the direction of the effects.</w:t>
       </w:r>
     </w:p>
     <w:p>
@@ -9458,14 +9509,14 @@
           <w:i/>
           <w:lang w:val="en-US"/>
         </w:rPr>
-        <w:t xml:space="preserve">Predictor learns only twin fidelity</w:t>
-      </w:r>
-      <w:r>
-        <w:rPr>
-          <w:rFonts w:cstheme="minorHAnsi"/>
-          <w:lang w:val="en-US"/>
-        </w:rPr>
-        <w:t xml:space="preserve"> (5): ablations with fixed fidelity; a negative result still answers RQ2.</w:t>
+        <w:t xml:space="preserve">Real-only learning is strong at small budgets</w:t>
+      </w:r>
+      <w:r>
+        <w:rPr>
+          <w:rFonts w:cstheme="minorHAnsi"/>
+          <w:lang w:val="en-US"/>
+        </w:rPr>
+        <w:t xml:space="preserve"> (6): gains saturate quickly in a known location [10]; H4 is reported as a full budget curve.</w:t>
       </w:r>
     </w:p>
     <w:p>
@@ -9487,14 +9538,14 @@
           <w:i/>
           <w:lang w:val="en-US"/>
         </w:rPr>
-        <w:t xml:space="preserve">Proxy reality differs from reality</w:t>
-      </w:r>
-      <w:r>
-        <w:rPr>
-          <w:rFonts w:cstheme="minorHAnsi"/>
-          <w:lang w:val="en-US"/>
-        </w:rPr>
-        <w:t xml:space="preserve"> (5–7): tier C campaigns check agreement; they can move by a semester.</w:t>
+        <w:t xml:space="preserve">Scooping</w:t>
+      </w:r>
+      <w:r>
+        <w:rPr>
+          <w:rFonts w:cstheme="minorHAnsi"/>
+          <w:lang w:val="en-US"/>
+        </w:rPr>
+        <w:t xml:space="preserve"> (3–6): twin-based robot learning moves fast [3–7, 11]; early preprints, monthly monitoring.</w:t>
       </w:r>
     </w:p>
     <w:p>
@@ -9516,6 +9567,35 @@
           <w:i/>
           <w:lang w:val="en-US"/>
         </w:rPr>
+        <w:t xml:space="preserve">Dataset licence or robot access</w:t>
+      </w:r>
+      <w:r>
+        <w:rPr>
+          <w:rFonts w:cstheme="minorHAnsi"/>
+          <w:lang w:val="en-US"/>
+        </w:rPr>
+        <w:t xml:space="preserve"> (3, 5): other public scans with reference geometry, own phone captures of PWr rooms; without a robot, tier C moves by a semester and hypotheses are still decided on tier A.</w:t>
+      </w:r>
+    </w:p>
+    <w:p>
+      <w:pPr>
+        <w:spacing w:after="40" w:line="240" w:lineRule="auto"/>
+        <w:ind w:left="284" w:hanging="284"/>
+        <w:jc w:val="both"/>
+      </w:pPr>
+      <w:r>
+        <w:rPr>
+          <w:rFonts w:cstheme="minorHAnsi"/>
+          <w:lang w:val="en-US"/>
+        </w:rPr>
+        <w:t xml:space="preserve">•	</w:t>
+      </w:r>
+      <w:r>
+        <w:rPr>
+          <w:rFonts w:cstheme="minorHAnsi"/>
+          <w:i/>
+          <w:lang w:val="en-US"/>
+        </w:rPr>
         <w:t xml:space="preserve">Rejection at a top venue</w:t>
       </w:r>
       <w:r>
@@ -9523,7 +9603,7 @@
           <w:rFonts w:cstheme="minorHAnsi"/>
           <w:lang w:val="en-US"/>
         </w:rPr>
-        <w:t xml:space="preserve"> (4–7): every paper has a resubmission path inside the 200-point set, 2–4 months later (e.g. NeurIPS → CVPR → ICML → ECCV/ICCV), so the degree requirement does not depend on one decision.</w:t>
+        <w:t xml:space="preserve"> (4–7): each paper has a resubmission path inside the 200-point set 2–4 months later (NeurIPS → CVPR → ICML → ECCV/ICCV).</w:t>
       </w:r>
     </w:p>
     <w:p>
@@ -9544,7 +9624,7 @@
           <w:rFonts w:cstheme="minorHAnsi"/>
           <w:lang w:val="en-US"/>
         </w:rPr>
-        <w:t xml:space="preserve"> A pre-PhD NLP paper (ACL 2025 SRW) forecasts from hidden states with a graph neural network over layers; Stage II adapts the method, but the paper is not part of the dissertation.</w:t>
+        <w:t xml:space="preserve"> A pre-PhD NLP paper (ACL 2025 SRW, forecasting from hidden states); not part of the dissertation.</w:t>
       </w:r>
     </w:p>
     <w:p>
@@ -9565,7 +9645,7 @@
           <w:rFonts w:cstheme="minorHAnsi"/>
           <w:lang w:val="en-US"/>
         </w:rPr>
-        <w:t xml:space="preserve"> Own captures anonymize personal data (GDPR); public datasets are used under their licences.</w:t>
+        <w:t xml:space="preserve"> Own captures are anonymized (GDPR); public datasets are used under their licences.</w:t>
       </w:r>
     </w:p>
     <w:permEnd w:id="1742865563"/>

</xml_diff>

<commit_message>
Wave 12: review-3 of pivot v2, P0/P1 fixes (non-circular proxy reality, fair real-only baseline, results-before-papers), docx rebuilt
Closes #27

Co-Authored-By: Claude Opus 5.5 <noreply@anthropic.com>
</commit_message>
<xml_diff>
--- a/output/IPB_Grzegorz_Piotrowski.docx
+++ b/output/IPB_Grzegorz_Piotrowski.docx
@@ -2247,7 +2247,7 @@
                 <w:rFonts w:cstheme="minorHAnsi"/>
                 <w:lang w:val="en-US"/>
               </w:rPr>
-              <w:t xml:space="preserve"> Tier A set-up: final choice of ≥ 10 public scenes with dense real captures and reference scans, simulator and existing 3DGS pipeline from the T2.2 shortlist; reference twins ("reality") and training twins at ≥ 4 capture budgets; navigation policy training in the twins; pre-registration of the protocol (§7, §9). </w:t>
+              <w:t xml:space="preserve"> Tier A set-up: final choice of ≥ 20 public scenes (10 held out) with laser scans and separate phone captures, simulator and existing 3DGS pipeline from the T2.2 shortlist; references ("reality") and training twins at ≥ 4 capture budgets; pilot fixing task difficulty (below the SR ceiling) and the capture-cost model; imitation-learned navigation policies in the twins; pre-registration of the protocol (§7, §9). </w:t>
             </w:r>
             <w:r>
               <w:rPr>
@@ -2349,7 +2349,7 @@
                 <w:rFonts w:cstheme="minorHAnsi"/>
                 <w:lang w:val="en-US"/>
               </w:rPr>
-              <w:t xml:space="preserve"> Task-aware, uncertainty-guided capture vs. uniform and reconstruction-only view selection. </w:t>
+              <w:t xml:space="preserve"> Task-aware, uncertainty-guided capture vs. uniform, reconstruction-only and risk-weighted view selection. </w:t>
             </w:r>
             <w:r>
               <w:rPr>
@@ -2573,7 +2573,7 @@
                 <w:rFonts w:cstheme="minorHAnsi"/>
                 <w:lang w:val="en-US"/>
               </w:rPr>
-              <w:t xml:space="preserve"> (task-aware capture and uncertainty-aware training, RQ1–RQ2). </w:t>
+              <w:t xml:space="preserve"> (RQ1–RQ2: task-aware capture, H1, and first uncertainty-aware training results, H2). </w:t>
             </w:r>
             <w:r>
               <w:rPr>
@@ -2842,7 +2842,7 @@
                 <w:b/>
                 <w:lang w:val="en-US"/>
               </w:rPr>
-              <w:t xml:space="preserve">by Feb 2028</w:t>
+              <w:t xml:space="preserve">by Jan 2028</w:t>
             </w:r>
             <w:r>
               <w:rPr>
@@ -2929,14 +2929,14 @@
                 <w:b/>
                 <w:lang w:val="en-US"/>
               </w:rPr>
-              <w:t xml:space="preserve">CVPR 2028</w:t>
-            </w:r>
-            <w:r>
-              <w:rPr>
-                <w:rFonts w:cstheme="minorHAnsi"/>
-                <w:lang w:val="en-US"/>
-              </w:rPr>
-              <w:t xml:space="preserve"> (~Nov 2027; ICLR 2028, ~late Sep 2027, if ready earlier). If P1 was rejected, its revision goes to CVPR 2028 or ICLR 2028. </w:t>
+              <w:t xml:space="preserve">ICML 2028</w:t>
+            </w:r>
+            <w:r>
+              <w:rPr>
+                <w:rFonts w:cstheme="minorHAnsi"/>
+                <w:lang w:val="en-US"/>
+              </w:rPr>
+              <w:t xml:space="preserve"> (~late Jan 2028; CVPR 2028, ~Nov 2027, only if H3 is complete by then). If P1 was rejected, its revision goes to CVPR 2028. </w:t>
             </w:r>
             <w:r>
               <w:rPr>
@@ -4336,7 +4336,7 @@
           <w:rFonts w:cstheme="minorHAnsi"/>
           <w:lang w:val="en-US"/>
         </w:rPr>
-        <w:t xml:space="preserve"> the loop consumes. Each step spends it: the capture, the real data used to make training robust to what the twin got wrong, and the real trials used to check and correct the policy. Today these amounts are chosen by habit: the scene is recorded uniformly, the policy is trained with generic randomization, and real trials are picked at random or by hand. How much real data a twin actually saves, especially for navigation, has not been measured.</w:t>
+        <w:t xml:space="preserve"> the loop consumes. Each step spends it: the capture, the real data used to make training robust to what the twin got wrong, and the real trials used to check and correct the policy. Today these amounts are chosen by habit: the scene is recorded uniformly, the policy is trained with generic randomization, and real trials are picked at random or by hand. How much real data a twin actually saves, especially for navigation, has, to our knowledge, not been measured.</w:t>
       </w:r>
     </w:p>
     <w:p>
@@ -4372,7 +4372,7 @@
           <w:rFonts w:cstheme="minorHAnsi"/>
           <w:lang w:val="en-US"/>
         </w:rPr>
-        <w:t xml:space="preserve">: capture only what the policy needs to build the twin, train so that the policy is robust to the twin's errors, and collect only the few real rollouts that close the remaining gap. Two signals, both available without extra real data, guide these choices: the </w:t>
+        <w:t xml:space="preserve">: capture only what the policy needs to build the twin, train so that the policy is robust to the twin's errors, and collect only the few real rollouts that close the remaining gap. Two signals, both computed from data the loop already collects, guide these choices: the </w:t>
       </w:r>
       <w:r>
         <w:rPr>
@@ -4867,7 +4867,7 @@
           <w:rFonts w:cstheme="minorHAnsi"/>
           <w:lang w:val="en-US"/>
         </w:rPr>
-        <w:t xml:space="preserve"> Simulators such as Habitat [1] made large-scale training of embodied agents possible, but a generic simulator is not the robot's scene. 3D Gaussian Splatting (3DGS) [2] now turns a short camera capture into a real-time, photorealistic </w:t>
+        <w:t xml:space="preserve"> Simulators such as Habitat [1] enable large-scale training of embodied agents, but not in the robot's own scene. 3D Gaussian Splatting (3DGS) [2] now turns a short camera capture into a real-time, photorealistic </w:t>
       </w:r>
       <w:r>
         <w:rPr>
@@ -4882,7 +4882,7 @@
           <w:rFonts w:cstheme="minorHAnsi"/>
           <w:lang w:val="en-US"/>
         </w:rPr>
-        <w:t xml:space="preserve"> of that scene. Policies trained in such twins transfer to real robots in navigation (EmbodiedSplat [3], Vid2Sim [4], GaussGym [5]) and manipulation (RialTo [6], SplatSim [7]), and GPU simulators ship twin environments (ManiSkill3 [8]). Building a twin is no longer the bottleneck; </w:t>
+        <w:t xml:space="preserve"> of that scene. Policies trained in such twins transfer to real robots in navigation and locomotion (EmbodiedSplat [3], Vid2Sim [4], GaussGym [5]) and manipulation (RialTo [6], SplatSim [7]), and GPU simulators ship twin environments (ManiSkill3 [8]). Building a twin is no longer the bottleneck; </w:t>
       </w:r>
       <w:r>
         <w:rPr>
@@ -4897,7 +4897,7 @@
           <w:rFonts w:cstheme="minorHAnsi"/>
           <w:lang w:val="en-US"/>
         </w:rPr>
-        <w:t xml:space="preserve"> is: the capture that builds the twin and the real rollouts that correct the policy. Current systems fix this cost by hand. EmbodiedSplat uses a 20–30-minute phone capture per scene, and RialTo builds its twins from "small amounts of real-world data"; its ablation over 0–15 real demonstrations is the closest published analysis of a real-data budget.</w:t>
+        <w:t xml:space="preserve"> is: the capture that builds the twin and the real rollouts that correct the policy. Current systems fix this cost by hand: EmbodiedSplat uses a 20–30-minute phone capture per scene, and RialTo's ablation over 0–15 real demonstrations is the closest published analysis of a real-data budget.</w:t>
       </w:r>
     </w:p>
     <w:p>
@@ -4918,7 +4918,7 @@
           <w:rFonts w:cstheme="minorHAnsi"/>
           <w:lang w:val="en-US"/>
         </w:rPr>
-        <w:t xml:space="preserve"> Real-only scaling studies relate performance to the number of real demonstrations in manipulation [9]; in navigation, diversity matters more than quantity and more data from a known location saturates quickly [10]. On the twin side, CASHER [11] reports performance that scales super-linearly with human effort, X-Sim [12] matches behaviour cloning with ten times less data-collection time, and sim-and-real co-training raises real success by 38% on average [13]. Simulation can poorly predict real navigation results (Sim-vs-Real Correlation Coefficient, SRCC [14]), and lower-fidelity simulation can transfer better [15], so more capture is not automatically better. All of these report results at fixed or hand-chosen budgets. </w:t>
+        <w:t xml:space="preserve"> Real-only scaling studies relate performance to the number of real demonstrations in manipulation [9]; in navigation, diversity matters more than quantity and more data from a known location saturates quickly [10]. On the twin side, CASHER [11] reports performance that scales super-linearly with human effort, X-Sim [12] matches behaviour cloning with ten times less data-collection time, and sim-and-real co-training raises real success by 38% on average [13]. Simulation can poorly predict real navigation results [14], and lower-fidelity simulation can transfer better [15], so more capture is not automatically better. All of these report results at fixed or hand-chosen budgets. </w:t>
       </w:r>
       <w:r>
         <w:rPr>
@@ -4947,7 +4947,7 @@
           <w:rFonts w:cstheme="minorHAnsi"/>
           <w:lang w:val="en-US"/>
         </w:rPr>
-        <w:t xml:space="preserve"> Active view selection chooses the images that improve a reconstruction most: FisherRF [16] maximizes the expected information gain on radiance-field parameters, GenNBV [17] learns a next-best-view policy that generalizes across scenes, and Bayes' Rays [18] estimates a volumetric uncertainty field for a trained neural radiance field. Their objective is reconstruction quality or coverage, not what a downstream policy needs; task-aware capture for twins has only 0–2 Semantic Scholar hits per year (2023–2026). ScanNet++ [19] pairs real captures of rooms with reference laser scans, so capture budgets can be varied offline.</w:t>
+        <w:t xml:space="preserve"> Active view selection chooses the images that improve a reconstruction most: FisherRF [16] maximizes the expected information gain on radiance-field parameters, GenNBV [17] learns a next-best-view policy that generalizes across scenes, and Bayes' Rays [18] estimates a volumetric uncertainty field for a trained neural radiance field. Risk-aware view acquisition [19] weights FisherRF by safety-critical regions during exploration. Their objective is reconstruction quality, coverage or safe exploration, not the success of a policy trained in the twin; we found at most two task-aware capture papers a year in 2023–2026. ScanNet++ [20] pairs laser scans with DSLR images and a separate phone stream, so capture budgets can be varied offline.</w:t>
       </w:r>
     </w:p>
     <w:p>
@@ -4968,7 +4968,43 @@
           <w:rFonts w:cstheme="minorHAnsi"/>
           <w:lang w:val="en-US"/>
         </w:rPr>
-        <w:t xml:space="preserve"> Domain randomization varies appearance [20] or dynamics [21] uniformly within hand-set ranges, and SimOpt [22] adapts the randomization distribution from a few real rollouts. Domain adaptation aligns sim and real features in co-training [23], and a mechanistic analysis finds that representation alignment is the main effect of co-training [24]. Frozen encoders such as DINOv2</w:t>
+        <w:t xml:space="preserve"> Domain randomization varies appearance [21] or dynamics [22] uniformly within hand-set ranges, and SimOpt [23] adapts the randomization distribution from a few real rollouts. Domain adaptation aligns sim and real features in co-training [24], and a mechanistic analysis finds that representation alignment is the main effect of co-training [25]. Frozen encoders (DINOv2 [26]) make twin and real frames comparable, and Phys2Real [27] trains with uncertainty over physical parameters. Still, a twin's own </w:t>
+      </w:r>
+      <w:r>
+        <w:rPr>
+          <w:rFonts w:cstheme="minorHAnsi"/>
+          <w:b/>
+          <w:lang w:val="en-US"/>
+        </w:rPr>
+        <w:t xml:space="preserve">reconstruction uncertainty</w:t>
+      </w:r>
+      <w:r>
+        <w:rPr>
+          <w:rFonts w:cstheme="minorHAnsi"/>
+          <w:lang w:val="en-US"/>
+        </w:rPr>
+        <w:t xml:space="preserve"> is rarely used as a training signal, and weighting twin samples by representation distance to a small real set appeared in one paper in 2023–2026.</w:t>
+      </w:r>
+    </w:p>
+    <w:p>
+      <w:pPr>
+        <w:spacing w:after="120" w:line="240" w:lineRule="auto"/>
+        <w:jc w:val="both"/>
+      </w:pPr>
+      <w:r>
+        <w:rPr>
+          <w:rFonts w:cstheme="minorHAnsi"/>
+          <w:b/>
+          <w:lang w:val="en-US"/>
+        </w:rPr>
+        <w:t xml:space="preserve">Collecting few real rollouts.</w:t>
+      </w:r>
+      <w:r>
+        <w:rPr>
+          <w:rFonts w:cstheme="minorHAnsi"/>
+          <w:lang w:val="en-US"/>
+        </w:rPr>
+        <w:t xml:space="preserve"> Active learning selects the most informative real samples for sim-to-real adaptation in grasping [28], AMF [29] chooses which tasks to demonstrate under a budget, and active experiment selection reduces the cost of real evaluation [30]. CUPID [31] and DataMIL [32] select training data by its influence on closed-loop success. Prediction-powered inference [33] combines many cheap predictions with a few labels, SureSim [34] applies it to simulated and real trials, and SIMPLER</w:t>
       </w:r>
     </w:p>
     <w:p>
@@ -4982,7 +5018,7 @@
           <w:rFonts w:cstheme="minorHAnsi"/>
           <w:lang w:val="en-US"/>
         </w:rPr>
-        <w:t xml:space="preserve">[25] allow twin and real frames to be compared, and Phys2Real [26] trains with uncertainty over physical</w:t>
+        <w:t xml:space="preserve">[35] shows that simulated evaluation of manipulation policies can track real evaluation. GaussTwin [36]</w:t>
       </w:r>
     </w:p>
     <w:p>
@@ -4995,22 +5031,7 @@
           <w:rFonts w:cstheme="minorHAnsi"/>
           <w:lang w:val="en-US"/>
         </w:rPr>
-        <w:t xml:space="preserve">parameters. Still, a twin's own </w:t>
-      </w:r>
-      <w:r>
-        <w:rPr>
-          <w:rFonts w:cstheme="minorHAnsi"/>
-          <w:b/>
-          <w:lang w:val="en-US"/>
-        </w:rPr>
-        <w:t xml:space="preserve">reconstruction uncertainty</w:t>
-      </w:r>
-      <w:r>
-        <w:rPr>
-          <w:rFonts w:cstheme="minorHAnsi"/>
-          <w:lang w:val="en-US"/>
-        </w:rPr>
-        <w:t xml:space="preserve"> is rarely used as a training signal (0–1 hits per year), and weighting twin samples by their representation distance to a small real set appeared in one paper in 2023–2026.</w:t>
+        <w:t xml:space="preserve">corrects a 3DGS twin from photometric error. They select demonstrations, tasks or trials, not the real rollouts that should correct a reconstructed twin and its policy.</w:t>
       </w:r>
     </w:p>
     <w:p>
@@ -5024,14 +5045,29 @@
           <w:b/>
           <w:lang w:val="en-US"/>
         </w:rPr>
-        <w:t xml:space="preserve">Collecting few real rollouts.</w:t>
-      </w:r>
-      <w:r>
-        <w:rPr>
-          <w:rFonts w:cstheme="minorHAnsi"/>
-          <w:lang w:val="en-US"/>
-        </w:rPr>
-        <w:t xml:space="preserve"> Active learning selects the most informative real samples for sim-to-real adaptation in grasping [27], AMF [28] chooses which tasks to demonstrate under a demonstration budget, and active experiment selection reduces the cost of real evaluation [29]. CUPID [30] and DataMIL [31] select training data by its influence on closed-loop success. Prediction-powered inference [32] combines many cheap predictions with a few labels, SureSim [33] applies it to simulated and real trials, and SIMPLER</w:t>
+        <w:t xml:space="preserve">Research gap.</w:t>
+      </w:r>
+      <w:r>
+        <w:rPr>
+          <w:rFonts w:cstheme="minorHAnsi"/>
+          <w:lang w:val="en-US"/>
+        </w:rPr>
+        <w:t xml:space="preserve"> Real-to-sim-to-real works, but its real-data cost is set by hand and spent uniformly. Missing are (i) task-aware, uncertainty-guided capture judged by downstream policy success rather than image quality (RQ1), (ii) training driven by reconstruction uncertainty and representation distance to a small real set (RQ2), (iii) active selection of the few real rollouts that correct the twin and the policy (RQ3), and (iv) a total real-data budget curve of the full loop against real-only learning, in navigation and manipulation (RQ4).</w:t>
+      </w:r>
+    </w:p>
+    <w:p>
+      <w:pPr>
+        <w:keepNext/>
+        <w:spacing w:after="60" w:line="240" w:lineRule="auto"/>
+        <w:jc w:val="left"/>
+      </w:pPr>
+      <w:r>
+        <w:rPr>
+          <w:rFonts w:cstheme="minorHAnsi"/>
+          <w:b/>
+          <w:lang w:val="en-US"/>
+        </w:rPr>
+        <w:t xml:space="preserve">References</w:t>
       </w:r>
     </w:p>
     <w:p>
@@ -5045,56 +5081,7 @@
           <w:rFonts w:cstheme="minorHAnsi"/>
           <w:lang w:val="en-US"/>
         </w:rPr>
-        <w:t xml:space="preserve">[34] shows that simulated evaluation of manipulation policies can track real evaluation. GaussTwin [35]</w:t>
-      </w:r>
-    </w:p>
-    <w:p>
-      <w:pPr>
-        <w:spacing w:after="120" w:line="240" w:lineRule="auto"/>
-        <w:jc w:val="both"/>
-      </w:pPr>
-      <w:r>
-        <w:rPr>
-          <w:rFonts w:cstheme="minorHAnsi"/>
-          <w:lang w:val="en-US"/>
-        </w:rPr>
-        <w:t xml:space="preserve">corrects a 3DGS twin from photometric error. These methods select demonstrations, tasks or trials; none selects the real rollouts that should correct a reconstructed twin and its policy.</w:t>
-      </w:r>
-    </w:p>
-    <w:p>
-      <w:pPr>
-        <w:spacing w:after="120" w:line="240" w:lineRule="auto"/>
-        <w:jc w:val="both"/>
-      </w:pPr>
-      <w:r>
-        <w:rPr>
-          <w:rFonts w:cstheme="minorHAnsi"/>
-          <w:b/>
-          <w:lang w:val="en-US"/>
-        </w:rPr>
-        <w:t xml:space="preserve">Research gap.</w:t>
-      </w:r>
-      <w:r>
-        <w:rPr>
-          <w:rFonts w:cstheme="minorHAnsi"/>
-          <w:lang w:val="en-US"/>
-        </w:rPr>
-        <w:t xml:space="preserve"> Real-to-sim-to-real works, but its real-data cost is set by hand and spent uniformly. Missing are (i) task-aware, uncertainty-guided capture judged by downstream policy success rather than image quality (RQ1), (ii) training that uses the twin's reconstruction uncertainty and its representation distance to a small real set (RQ2), (iii) active selection of the few real rollouts that correct the twin and the policy (RQ3), and (iv) a total real-data budget curve of the full loop against real-only learning, in navigation and manipulation (RQ4). This dissertation addresses that gap.</w:t>
-      </w:r>
-    </w:p>
-    <w:p>
-      <w:pPr>
-        <w:keepNext/>
-        <w:spacing w:after="60" w:line="240" w:lineRule="auto"/>
-        <w:jc w:val="left"/>
-      </w:pPr>
-      <w:r>
-        <w:rPr>
-          <w:rFonts w:cstheme="minorHAnsi"/>
-          <w:b/>
-          <w:lang w:val="en-US"/>
-        </w:rPr>
-        <w:t xml:space="preserve">References</w:t>
+        <w:t xml:space="preserve">[1] M. Savva et al., "Habitat," ICCV, 2019.</w:t>
       </w:r>
     </w:p>
     <w:p>
@@ -5108,7 +5095,7 @@
           <w:rFonts w:cstheme="minorHAnsi"/>
           <w:lang w:val="en-US"/>
         </w:rPr>
-        <w:t xml:space="preserve">[1] M. Savva et al., "Habitat," ICCV, 2019.</w:t>
+        <w:t xml:space="preserve">[2] B. Kerbl et al., "3D Gaussian Splatting," ACM TOG, 2023.</w:t>
       </w:r>
     </w:p>
     <w:p>
@@ -5122,7 +5109,7 @@
           <w:rFonts w:cstheme="minorHAnsi"/>
           <w:lang w:val="en-US"/>
         </w:rPr>
-        <w:t xml:space="preserve">[2] B. Kerbl et al., "3D Gaussian Splatting," ACM TOG, 2023.</w:t>
+        <w:t xml:space="preserve">[3] G. Chhablani et al., "EmbodiedSplat," ICCV, 2025.</w:t>
       </w:r>
     </w:p>
     <w:p>
@@ -5136,7 +5123,7 @@
           <w:rFonts w:cstheme="minorHAnsi"/>
           <w:lang w:val="en-US"/>
         </w:rPr>
-        <w:t xml:space="preserve">[3] G. Chhablani et al., "EmbodiedSplat," ICCV, 2025.</w:t>
+        <w:t xml:space="preserve">[4] Z. Xie et al., "Vid2Sim," CVPR, 2025.</w:t>
       </w:r>
     </w:p>
     <w:p>
@@ -5150,7 +5137,7 @@
           <w:rFonts w:cstheme="minorHAnsi"/>
           <w:lang w:val="en-US"/>
         </w:rPr>
-        <w:t xml:space="preserve">[4] Z. Xie et al., "Vid2Sim," CVPR, 2025.</w:t>
+        <w:t xml:space="preserve">[5] A. Escontrela et al., "GaussGym," arXiv:2510.15352, 2025.</w:t>
       </w:r>
     </w:p>
     <w:p>
@@ -5164,7 +5151,7 @@
           <w:rFonts w:cstheme="minorHAnsi"/>
           <w:lang w:val="en-US"/>
         </w:rPr>
-        <w:t xml:space="preserve">[5] A. Escontrela et al., "GaussGym," arXiv:2510.15352, 2025.</w:t>
+        <w:t xml:space="preserve">[6] M. Torne et al., "Reconciling Reality through Simulation," RSS, 2024.</w:t>
       </w:r>
     </w:p>
     <w:p>
@@ -5178,7 +5165,7 @@
           <w:rFonts w:cstheme="minorHAnsi"/>
           <w:lang w:val="en-US"/>
         </w:rPr>
-        <w:t xml:space="preserve">[6] M. Torne et al., "Reconciling Reality through Simulation," RSS, 2024.</w:t>
+        <w:t xml:space="preserve">[7] M. N. Qureshi et al., "SplatSim," ICRA, 2025.</w:t>
       </w:r>
     </w:p>
     <w:p>
@@ -5192,7 +5179,7 @@
           <w:rFonts w:cstheme="minorHAnsi"/>
           <w:lang w:val="en-US"/>
         </w:rPr>
-        <w:t xml:space="preserve">[7] M. N. Qureshi et al., "SplatSim," ICRA, 2025.</w:t>
+        <w:t xml:space="preserve">[8] S. Tao et al., "ManiSkill3," RSS, 2025.</w:t>
       </w:r>
     </w:p>
     <w:p>
@@ -5206,7 +5193,7 @@
           <w:rFonts w:cstheme="minorHAnsi"/>
           <w:lang w:val="en-US"/>
         </w:rPr>
-        <w:t xml:space="preserve">[8] S. Tao et al., "ManiSkill3," RSS, 2025.</w:t>
+        <w:t xml:space="preserve">[9] F. Lin et al., "Data Scaling Laws in Imitation Learning…," ICLR, 2025.</w:t>
       </w:r>
     </w:p>
     <w:p>
@@ -5220,7 +5207,7 @@
           <w:rFonts w:cstheme="minorHAnsi"/>
           <w:lang w:val="en-US"/>
         </w:rPr>
-        <w:t xml:space="preserve">[9] F. Lin et al., "Data Scaling Laws in Imitation Learning…," ICLR, 2025.</w:t>
+        <w:t xml:space="preserve">[10] L. Suomela et al., "Data Scaling for Navigation…," IEEE RA-L, 2026.</w:t>
       </w:r>
     </w:p>
     <w:p>
@@ -5234,7 +5221,7 @@
           <w:rFonts w:cstheme="minorHAnsi"/>
           <w:lang w:val="en-US"/>
         </w:rPr>
-        <w:t xml:space="preserve">[10] L. Suomela et al., "Data Scaling for Navigation…," IEEE RA-L, 2026.</w:t>
+        <w:t xml:space="preserve">[11] M. Torne et al., "Robot Learning with Super-Linear Scaling," arXiv:2412.01770, 2024.</w:t>
       </w:r>
     </w:p>
     <w:p>
@@ -5248,7 +5235,7 @@
           <w:rFonts w:cstheme="minorHAnsi"/>
           <w:lang w:val="en-US"/>
         </w:rPr>
-        <w:t xml:space="preserve">[11] M. Torne et al., "Robot Learning with Super-Linear Scaling," arXiv:2412.01770, 2024.</w:t>
+        <w:t xml:space="preserve">[12] P. Dan et al., "X-Sim," arXiv:2505.07096, 2025.</w:t>
       </w:r>
     </w:p>
     <w:p>
@@ -5262,7 +5249,7 @@
           <w:rFonts w:cstheme="minorHAnsi"/>
           <w:lang w:val="en-US"/>
         </w:rPr>
-        <w:t xml:space="preserve">[12] P. Dan et al., "X-Sim," arXiv:2505.07096, 2025.</w:t>
+        <w:t xml:space="preserve">[13] A. Maddukuri et al., "Sim-and-Real Co-Training," RSS, 2025.</w:t>
       </w:r>
     </w:p>
     <w:p>
@@ -5276,7 +5263,7 @@
           <w:rFonts w:cstheme="minorHAnsi"/>
           <w:lang w:val="en-US"/>
         </w:rPr>
-        <w:t xml:space="preserve">[13] A. Maddukuri et al., "Sim-and-Real Co-Training," RSS, 2025.</w:t>
+        <w:t xml:space="preserve">[14] A. Kadian et al., "Sim2Real Predictivity," IEEE RA-L, 2020.</w:t>
       </w:r>
     </w:p>
     <w:p>
@@ -5290,7 +5277,7 @@
           <w:rFonts w:cstheme="minorHAnsi"/>
           <w:lang w:val="en-US"/>
         </w:rPr>
-        <w:t xml:space="preserve">[14] A. Kadian et al., "Sim2Real Predictivity," IEEE RA-L, 2020.</w:t>
+        <w:t xml:space="preserve">[15] J. Truong et al., "Rethinking Sim2Real," CoRL, 2022.</w:t>
       </w:r>
     </w:p>
     <w:p>
@@ -5304,7 +5291,7 @@
           <w:rFonts w:cstheme="minorHAnsi"/>
           <w:lang w:val="en-US"/>
         </w:rPr>
-        <w:t xml:space="preserve">[15] J. Truong et al., "Rethinking Sim2Real," CoRL, 2022.</w:t>
+        <w:t xml:space="preserve">[16] W. Jiang et al., "FisherRF," ECCV, 2024.</w:t>
       </w:r>
     </w:p>
     <w:p>
@@ -5318,7 +5305,7 @@
           <w:rFonts w:cstheme="minorHAnsi"/>
           <w:lang w:val="en-US"/>
         </w:rPr>
-        <w:t xml:space="preserve">[16] W. Jiang et al., "FisherRF," ECCV, 2024.</w:t>
+        <w:t xml:space="preserve">[17] X. Chen et al., "GenNBV," CVPR, 2024.</w:t>
       </w:r>
     </w:p>
     <w:p>
@@ -5332,7 +5319,7 @@
           <w:rFonts w:cstheme="minorHAnsi"/>
           <w:lang w:val="en-US"/>
         </w:rPr>
-        <w:t xml:space="preserve">[17] X. Chen et al., "GenNBV," CVPR, 2024.</w:t>
+        <w:t xml:space="preserve">[18] L. Goli et al., "Bayes' Rays," CVPR, 2024.</w:t>
       </w:r>
     </w:p>
     <w:p>
@@ -5346,7 +5333,7 @@
           <w:rFonts w:cstheme="minorHAnsi"/>
           <w:lang w:val="en-US"/>
         </w:rPr>
-        <w:t xml:space="preserve">[18] L. Goli et al., "Bayes' Rays," CVPR, 2024.</w:t>
+        <w:t xml:space="preserve">[19] G. Liu et al., "Risk-Aware Active View Acquisition…," arXiv:2403.11396, 2024.</w:t>
       </w:r>
     </w:p>
     <w:p>
@@ -5360,7 +5347,7 @@
           <w:rFonts w:cstheme="minorHAnsi"/>
           <w:lang w:val="en-US"/>
         </w:rPr>
-        <w:t xml:space="preserve">[19] C. Yeshwanth et al., "ScanNet++," ICCV, 2023.</w:t>
+        <w:t xml:space="preserve">[20] C. Yeshwanth et al., "ScanNet++," ICCV, 2023.</w:t>
       </w:r>
     </w:p>
     <w:p>
@@ -5374,7 +5361,7 @@
           <w:rFonts w:cstheme="minorHAnsi"/>
           <w:lang w:val="en-US"/>
         </w:rPr>
-        <w:t xml:space="preserve">[20] J. Tobin et al., "Domain Randomization…," IROS, 2017.</w:t>
+        <w:t xml:space="preserve">[21] J. Tobin et al., "Domain Randomization…," IROS, 2017.</w:t>
       </w:r>
     </w:p>
     <w:p>
@@ -5388,7 +5375,7 @@
           <w:rFonts w:cstheme="minorHAnsi"/>
           <w:lang w:val="en-US"/>
         </w:rPr>
-        <w:t xml:space="preserve">[21] X. B. Peng et al., "Sim-to-Real Transfer… with Dynamics Randomization," ICRA, 2018.</w:t>
+        <w:t xml:space="preserve">[22] X. B. Peng et al., "Sim-to-Real Transfer… with Dynamics Randomization," ICRA, 2018.</w:t>
       </w:r>
     </w:p>
     <w:p>
@@ -5402,7 +5389,7 @@
           <w:rFonts w:cstheme="minorHAnsi"/>
           <w:lang w:val="en-US"/>
         </w:rPr>
-        <w:t xml:space="preserve">[22] Y. Chebotar et al., "Closing the Sim-to-Real Loop," ICRA, 2019.</w:t>
+        <w:t xml:space="preserve">[23] Y. Chebotar et al., "Closing the Sim-to-Real Loop," ICRA, 2019.</w:t>
       </w:r>
     </w:p>
     <w:p>
@@ -5416,7 +5403,7 @@
           <w:rFonts w:cstheme="minorHAnsi"/>
           <w:lang w:val="en-US"/>
         </w:rPr>
-        <w:t xml:space="preserve">[23] S. Cheng et al., "Generalizable Domain Adaptation for Sim-and-Real…," NeurIPS, 2025.</w:t>
+        <w:t xml:space="preserve">[24] S. Cheng et al., "Generalizable Domain Adaptation for Sim-and-Real…," NeurIPS, 2025.</w:t>
       </w:r>
     </w:p>
     <w:p>
@@ -5430,7 +5417,7 @@
           <w:rFonts w:cstheme="minorHAnsi"/>
           <w:lang w:val="en-US"/>
         </w:rPr>
-        <w:t xml:space="preserve">[24] Y. Lei et al., "A Mechanistic Analysis of Sim-and-Real Co-Training…," arXiv:2604.13645, 2026.</w:t>
+        <w:t xml:space="preserve">[25] Y. Lei et al., "A Mechanistic Analysis of Sim-and-Real Co-Training…," arXiv:2604.13645, 2026.</w:t>
       </w:r>
     </w:p>
     <w:p>
@@ -5444,7 +5431,7 @@
           <w:rFonts w:cstheme="minorHAnsi"/>
           <w:lang w:val="en-US"/>
         </w:rPr>
-        <w:t xml:space="preserve">[25] M. Oquab et al., "DINOv2," TMLR, 2024.</w:t>
+        <w:t xml:space="preserve">[26] M. Oquab et al., "DINOv2," TMLR, 2024.</w:t>
       </w:r>
     </w:p>
     <w:p>
@@ -5458,7 +5445,7 @@
           <w:rFonts w:cstheme="minorHAnsi"/>
           <w:lang w:val="en-US"/>
         </w:rPr>
-        <w:t xml:space="preserve">[26] M. Wang et al., "Phys2Real," arXiv:2510.11689, 2025.</w:t>
+        <w:t xml:space="preserve">[27] M. Wang et al., "Phys2Real," arXiv:2510.11689, 2025.</w:t>
       </w:r>
     </w:p>
     <w:p>
@@ -5472,7 +5459,7 @@
           <w:rFonts w:cstheme="minorHAnsi"/>
           <w:lang w:val="en-US"/>
         </w:rPr>
-        <w:t xml:space="preserve">[27] M. Gilles et al., "MetaMVUC," IEEE RA-L, 2025.</w:t>
+        <w:t xml:space="preserve">[28] M. Gilles et al., "MetaMVUC," IEEE RA-L, 2025.</w:t>
       </w:r>
     </w:p>
     <w:p>
@@ -5486,7 +5473,7 @@
           <w:rFonts w:cstheme="minorHAnsi"/>
           <w:lang w:val="en-US"/>
         </w:rPr>
-        <w:t xml:space="preserve">[28] M. Bagatella et al., "Active Fine-Tuning of Multi-Task Policies," ICML, 2025.</w:t>
+        <w:t xml:space="preserve">[29] M. Bagatella et al., "Active Fine-Tuning of Multi-Task Policies," ICML, 2025.</w:t>
       </w:r>
     </w:p>
     <w:p>
@@ -5500,7 +5487,7 @@
           <w:rFonts w:cstheme="minorHAnsi"/>
           <w:lang w:val="en-US"/>
         </w:rPr>
-        <w:t xml:space="preserve">[29] A. Anwar et al., "Efficient Evaluation of Multi-Task Robot Policies…," arXiv:2502.09829, 2025.</w:t>
+        <w:t xml:space="preserve">[30] A. Anwar et al., "Efficient Evaluation of Multi-Task Robot Policies…," arXiv:2502.09829, 2025.</w:t>
       </w:r>
     </w:p>
     <w:p>
@@ -5514,7 +5501,7 @@
           <w:rFonts w:cstheme="minorHAnsi"/>
           <w:lang w:val="en-US"/>
         </w:rPr>
-        <w:t xml:space="preserve">[30] C. Agia et al., "CUPID," arXiv:2506.19121, 2025.</w:t>
+        <w:t xml:space="preserve">[31] C. Agia et al., "CUPID," arXiv:2506.19121, 2025.</w:t>
       </w:r>
     </w:p>
     <w:p>
@@ -5528,7 +5515,7 @@
           <w:rFonts w:cstheme="minorHAnsi"/>
           <w:lang w:val="en-US"/>
         </w:rPr>
-        <w:t xml:space="preserve">[31] S. Dass et al., "DataMIL," arXiv:2505.09603, 2025.</w:t>
+        <w:t xml:space="preserve">[32] S. Dass et al., "DataMIL," arXiv:2505.09603, 2025.</w:t>
       </w:r>
     </w:p>
     <w:p>
@@ -5542,7 +5529,7 @@
           <w:rFonts w:cstheme="minorHAnsi"/>
           <w:lang w:val="en-US"/>
         </w:rPr>
-        <w:t xml:space="preserve">[32] A. N. Angelopoulos et al., "Prediction-Powered Inference," Science, 2023.</w:t>
+        <w:t xml:space="preserve">[33] A. N. Angelopoulos et al., "Prediction-Powered Inference," Science, 2023.</w:t>
       </w:r>
     </w:p>
     <w:p>
@@ -5556,7 +5543,7 @@
           <w:rFonts w:cstheme="minorHAnsi"/>
           <w:lang w:val="en-US"/>
         </w:rPr>
-        <w:t xml:space="preserve">[33] A. Badithela et al., "Reliable and Scalable Robot Policy Evaluation…," arXiv:2510.04354, 2025.</w:t>
+        <w:t xml:space="preserve">[34] A. Badithela et al., "Reliable and Scalable Robot Policy Evaluation…," arXiv:2510.04354, 2025.</w:t>
       </w:r>
     </w:p>
     <w:p>
@@ -5570,7 +5557,7 @@
           <w:rFonts w:cstheme="minorHAnsi"/>
           <w:lang w:val="en-US"/>
         </w:rPr>
-        <w:t xml:space="preserve">[34] X. Li et al., "Evaluating Real-World Robot Manipulation Policies…," CoRL, 2024.</w:t>
+        <w:t xml:space="preserve">[35] X. Li et al., "Evaluating Real-World Robot Manipulation Policies…," CoRL, 2024.</w:t>
       </w:r>
     </w:p>
     <w:p>
@@ -5584,7 +5571,7 @@
           <w:rFonts w:cstheme="minorHAnsi"/>
           <w:lang w:val="en-US"/>
         </w:rPr>
-        <w:t xml:space="preserve">[35] Y. Cai et al., "GaussTwin," arXiv:2603.05108, 2026.</w:t>
+        <w:t xml:space="preserve">[36] Y. Cai et al., "GaussTwin," arXiv:2603.05108, 2026.</w:t>
       </w:r>
     </w:p>
     <w:permEnd w:id="174659581"/>
@@ -5862,15 +5849,15 @@
           <w:rFonts w:cstheme="minorHAnsi"/>
           <w:lang w:val="en-US"/>
         </w:rPr>
-        <w:t xml:space="preserve"> On ≥ 10 public indoor scenes with dense real captures and reference scans (e.g. ScanNet++, some held out), a </w:t>
-      </w:r>
-      <w:r>
-        <w:rPr>
-          <w:rFonts w:cstheme="minorHAnsi"/>
-          <w:b/>
-          <w:lang w:val="en-US"/>
-        </w:rPr>
-        <w:t xml:space="preserve">high-fidelity reference built from the full capture plays "reality"</w:t>
+        <w:t xml:space="preserve"> On ≥ 20 public indoor scenes (e.g. ScanNet++; 10 held out from all tuning), a </w:t>
+      </w:r>
+      <w:r>
+        <w:rPr>
+          <w:rFonts w:cstheme="minorHAnsi"/>
+          <w:b/>
+          <w:lang w:val="en-US"/>
+        </w:rPr>
+        <w:t xml:space="preserve">reference built from the laser scan and DSLR images plays "reality"</w:t>
       </w:r>
       <w:r>
         <w:rPr>
@@ -5892,7 +5879,7 @@
           <w:rFonts w:cstheme="minorHAnsi"/>
           <w:lang w:val="en-US"/>
         </w:rPr>
-        <w:t xml:space="preserve"> built from a subset of the real views is the training simulator. Real data is counted exactly: capture = real views given to the twin, real rollouts = episodes in the reference, summed in one operator-time cost at a fixed rate. SR = success rate in the reference. Tier A decides; tier B (public real-world data, published paired sim/real results) and tier C (real robot) only report agreement. Tests are one-sided, α = 0.05, bootstrapped over scenes and seeds, Holm-corrected within each hypothesis and pre-registered with all thresholds.</w:t>
+        <w:t xml:space="preserve"> built from a subset of the separate phone capture is the training simulator, so twin and reference share neither images nor reconstruction method. Real data is counted exactly: capture = views given to the twin, real rollouts and demonstrations = episodes in the reference, summed in one operator-time cost at a fixed rate. SR = success rate in the reference. Tier A decides; tiers B (public real-world data) and C (real robot) only report agreement. Tests are one-sided, α = 0.05, bootstrapped over scenes and seeds, Holm-corrected within each hypothesis and pre-registered.</w:t>
       </w:r>
     </w:p>
     <w:p>
@@ -5991,7 +5978,7 @@
           <w:rFonts w:cstheme="minorHAnsi"/>
           <w:lang w:val="en-US"/>
         </w:rPr>
-        <w:t xml:space="preserve"> Uncertainty-aware training (augmentation and sample weights from per-region reconstruction uncertainty and from the representation distance to a few real images) improves real transfer over uniform domain randomization at an equal capture budget. </w:t>
+        <w:t xml:space="preserve"> Uncertainty-aware training (augmentation and sample weights from per-region reconstruction uncertainty and from the representation distance to a few held-out capture images) improves real transfer over uniform domain randomization at an equal capture budget. </w:t>
       </w:r>
       <w:r>
         <w:rPr>
@@ -6105,7 +6092,7 @@
           <w:rFonts w:cstheme="minorHAnsi"/>
           <w:lang w:val="en-US"/>
         </w:rPr>
-        <w:t xml:space="preserve"> (a) The full loop (H1–H3 combined) reaches the target SR with ≤ 10% of the real data needed by real-only learning (trained directly in the reference, every interaction counted as real data). </w:t>
+        <w:t xml:space="preserve"> (a) The full loop (H1–H3 combined) reaches the target SR with ≤ 10% of the real data needed by real-only learning (imitation of demonstrations collected in the reference, same encoder and initialization). </w:t>
       </w:r>
       <w:r>
         <w:rPr>
@@ -6120,7 +6107,7 @@
           <w:rFonts w:cstheme="minorHAnsi"/>
           <w:lang w:val="en-US"/>
         </w:rPr>
-        <w:t xml:space="preserve"> B_loop(τ₄) ≤ 0.1 · B_real(τ₄), upper 95% bound of the ratio &lt; 0.2; τ₄ = SR of real-only learning at its largest budget. The budget curve ("exchange rate" of twin to real data) is also reported for a uniform loop and for a learned world model as the simulator. (b) With the pipeline and hyperparameters unchanged, on manipulation B_loop / B_real has an upper 95% bound &lt; 1 and the H1–H3 effects keep their sign.</w:t>
+        <w:t xml:space="preserve"> B_loop(τ₄) ≤ 0.1 · B_real(τ₄), upper 95% bound of the ratio &lt; 0.2; τ₄ = SR of real-only learning at its largest budget. The curve is also reported for a uniform loop and for a world model as the simulator. (b) With the three allocation methods and their hyperparameters unchanged, on manipulation B_loop / B_real has an upper 95% bound &lt; 1 and the H1–H3 effects keep their sign.</w:t>
       </w:r>
     </w:p>
     <w:p>
@@ -6481,7 +6468,7 @@
           <w:rFonts w:cstheme="minorHAnsi"/>
           <w:lang w:val="en-US"/>
         </w:rPr>
-        <w:t xml:space="preserve">. Visual navigation is the primary testbed and robotic manipulation the cross-task test. Building twins, simulators or benchmarks, control design and mechanical engineering are not the object of the research; the student uses existing tools and public data.</w:t>
+        <w:t xml:space="preserve">. Building twins, simulators or benchmarks, control design and mechanical engineering are not the object of the research; the student uses existing tools and public data.</w:t>
       </w:r>
     </w:p>
     <w:p>
@@ -6517,7 +6504,7 @@
           <w:rFonts w:cstheme="minorHAnsi"/>
           <w:lang w:val="en-US"/>
         </w:rPr>
-        <w:t xml:space="preserve">, with a method for each step of the loop and a measured budget law for navigation, where no real-data-budget curves have been published.</w:t>
+        <w:t xml:space="preserve">, with a method for each step of the loop and measured real-data budget curves for navigation, where none have been published.</w:t>
       </w:r>
     </w:p>
     <w:p>
@@ -6639,14 +6626,14 @@
           <w:b/>
           <w:lang w:val="en-US"/>
         </w:rPr>
-        <w:t xml:space="preserve">A budget law for the loop (RQ4, H4).</w:t>
-      </w:r>
-      <w:r>
-        <w:rPr>
-          <w:rFonts w:cstheme="minorHAnsi"/>
-          <w:lang w:val="en-US"/>
-        </w:rPr>
-        <w:t xml:space="preserve"> Budget–performance curves of the full loop that give the "exchange rate" between twin and real data (how much real data the loop needs, relative to learning from real data only, to reach a given real success rate), compared with a uniform loop and a learned world model used as the simulator, and a test of whether the loop carries over unchanged from navigation to manipulation.</w:t>
+        <w:t xml:space="preserve">Budget curves for the loop (RQ4, H4).</w:t>
+      </w:r>
+      <w:r>
+        <w:rPr>
+          <w:rFonts w:cstheme="minorHAnsi"/>
+          <w:lang w:val="en-US"/>
+        </w:rPr>
+        <w:t xml:space="preserve"> Budget–performance curves of the full loop that give the "exchange rate" between twin and real data (how much real data the loop needs, relative to learning from real data only, to reach a given real success rate), compared with a uniform loop and a world model as the simulator, and a test of whether the methods carry over unchanged to manipulation.</w:t>
       </w:r>
     </w:p>
     <w:p>
@@ -6688,7 +6675,7 @@
           <w:rFonts w:cstheme="minorHAnsi"/>
           <w:lang w:val="en-US"/>
         </w:rPr>
-        <w:t xml:space="preserve"> A proxy-reality protocol on public scene datasets that counts real data exactly without a robot (a high-fidelity reference as "reality", a low-budget twin as the simulator), and open-source code for the three methods and the budget curves, built on existing twin pipelines and simulators. It tells a practitioner how much to record and how many real trials to plan for a new site.</w:t>
+        <w:t xml:space="preserve"> A proxy-reality protocol on public scene datasets that counts real data exactly without a robot (a laser-scan reference as "reality", a low-budget twin from a separate capture as the simulator), and open-source code for the three methods and the budget curves, built on existing twin pipelines and simulators. It tells practitioners roughly how much to record and how many real trials to plan for a new site.</w:t>
       </w:r>
     </w:p>
     <w:p>
@@ -6709,7 +6696,7 @@
           <w:rFonts w:cstheme="minorHAnsi"/>
           <w:lang w:val="en-US"/>
         </w:rPr>
-        <w:t xml:space="preserve"> Real target-domain data is the main cost of deploying learned systems, and models are increasingly trained on reconstructed or synthetic data and deployed on real sensor data. Methods that decide where real data is worth spending, and a measured law of how much of it a twin can replace, are relevant to active learning, learning under distribution shift and uncertainty estimation in general, beyond robotics.</w:t>
+        <w:t xml:space="preserve"> Real target-domain data is the main cost of deploying learned systems, and models are increasingly trained on reconstructed or synthetic data and deployed on real sensor data. Methods that decide where real data is worth spending, and a measured estimate of how much of it a twin can replace, are relevant to active learning, learning under distribution shift and uncertainty estimation in general, beyond robotics.</w:t>
       </w:r>
     </w:p>
     <w:p>
@@ -6730,7 +6717,7 @@
           <w:rFonts w:cstheme="minorHAnsi"/>
           <w:lang w:val="en-US"/>
         </w:rPr>
-        <w:t xml:space="preserve"> Results are planned for peer-reviewed conferences worth 200 points and assigned to ITiT on the ministerial list of 5.01.2024: NeurIPS and ICLR (machine learning) and CVPR (computer vision), with ICML, ICCV and ECCV for resubmissions, as in §3, §11 and §12. P1 (RQ1–RQ2, task-aware capture and uncertainty-aware training) targets NeurIPS 2027; P2 (RQ3, active real-rollout selection and twin correction) ICLR or CVPR 2028; P3 (RQ4, budget law and manipulation) NeurIPS 2028, with ICLR 2029 as the fallback.</w:t>
+        <w:t xml:space="preserve"> Results are planned for peer-reviewed conferences worth 200 points and assigned to ITiT on the ministerial list of 5.01.2024: NeurIPS, ICML and ICLR (machine learning) and CVPR (computer vision), with ICCV and ECCV for resubmissions, as in §3, §11 and §12. P1 (RQ1–RQ2, task-aware capture and first uncertainty-aware training results) targets NeurIPS 2027; P2 (RQ3, active real-rollout selection and twin correction) ICML 2028 or CVPR 2028; P3 (RQ4, budget law and manipulation) NeurIPS 2028, with ICLR 2029 as the fallback.</w:t>
       </w:r>
     </w:p>
     <w:permEnd w:id="1098318749"/>
@@ -7023,7 +7010,7 @@
           <w:rFonts w:cstheme="minorHAnsi"/>
           <w:lang w:val="en-US"/>
         </w:rPr>
-        <w:t xml:space="preserve">[2] pipelines and simulators; the student develops neither a simulator nor a benchmark. Visual navigation</w:t>
+        <w:t xml:space="preserve">[2] pipelines and simulators; the student develops neither a simulator nor a benchmark. Visual navigation is the</w:t>
       </w:r>
     </w:p>
     <w:p>
@@ -7036,7 +7023,7 @@
           <w:rFonts w:cstheme="minorHAnsi"/>
           <w:lang w:val="en-US"/>
         </w:rPr>
-        <w:t xml:space="preserve">(point-goal and image-goal) is the primary task; manipulation is the cross-task test in Stage IV.</w:t>
+        <w:t xml:space="preserve">primary task; manipulation is the cross-task test in Stage IV.</w:t>
       </w:r>
     </w:p>
     <w:p>
@@ -7057,22 +7044,22 @@
           <w:rFonts w:cstheme="minorHAnsi"/>
           <w:lang w:val="en-US"/>
         </w:rPr>
-        <w:t xml:space="preserve"> Real robots make "real data" slow to collect and hard to count, so the hypotheses are decided on public real scans. For ≥ 10 indoor scenes with dense real captures and reference laser scans (e.g. ScanNet++ [19]), a </w:t>
-      </w:r>
-      <w:r>
-        <w:rPr>
-          <w:rFonts w:cstheme="minorHAnsi"/>
-          <w:b/>
-          <w:lang w:val="en-US"/>
-        </w:rPr>
-        <w:t xml:space="preserve">reference twin</w:t>
-      </w:r>
-      <w:r>
-        <w:rPr>
-          <w:rFonts w:cstheme="minorHAnsi"/>
-          <w:lang w:val="en-US"/>
-        </w:rPr>
-        <w:t xml:space="preserve"> built from the full capture and the scan plays "reality", rendered in a GPU simulator (Habitat [1] or a 3DGS renderer such as GaussGym [5], chosen in T3.1). The </w:t>
+        <w:t xml:space="preserve"> The hypotheses are decided on public real scans, where real data can be counted. ScanNet++ [20] gives each scene a laser scan, DSLR images and a separate phone RGB-D stream. On ≥ 20 scenes (10 held out from all tuning), the </w:t>
+      </w:r>
+      <w:r>
+        <w:rPr>
+          <w:rFonts w:cstheme="minorHAnsi"/>
+          <w:b/>
+          <w:lang w:val="en-US"/>
+        </w:rPr>
+        <w:t xml:space="preserve">reference</w:t>
+      </w:r>
+      <w:r>
+        <w:rPr>
+          <w:rFonts w:cstheme="minorHAnsi"/>
+          <w:lang w:val="en-US"/>
+        </w:rPr>
+        <w:t xml:space="preserve"> is the laser-scan mesh textured from the DSLR images and rendered in Habitat [1] with a robot-camera model (height, field of view, noise); it plays "reality". The </w:t>
       </w:r>
       <w:r>
         <w:rPr>
@@ -7087,7 +7074,7 @@
           <w:rFonts w:cstheme="minorHAnsi"/>
           <w:lang w:val="en-US"/>
         </w:rPr>
-        <w:t xml:space="preserve"> is a 3DGS reconstruction built from a subset of the same capture. This makes every unit of real data countable: </w:t>
+        <w:t xml:space="preserve"> is a 3DGS reconstruction from a subset of the phone stream, run in the simulator as a mesh (as in EmbodiedSplat [3]) or with a 3DGS renderer (GaussGym [5]), chosen in T3.1. Twin and reference share neither images nor reconstruction method. The largest capture budget stays below the full stream. Every unit of real data is countable: </w:t>
       </w:r>
       <w:r>
         <w:rPr>
@@ -7102,7 +7089,7 @@
           <w:rFonts w:cstheme="minorHAnsi"/>
           <w:lang w:val="en-US"/>
         </w:rPr>
-        <w:t xml:space="preserve"> = views selected from the recorded pool (converted to capture minutes at the recording rate), </w:t>
+        <w:t xml:space="preserve"> = views selected from the phone pool, </w:t>
       </w:r>
       <w:r>
         <w:rPr>
@@ -7132,7 +7119,7 @@
           <w:rFonts w:cstheme="minorHAnsi"/>
           <w:lang w:val="en-US"/>
         </w:rPr>
-        <w:t xml:space="preserve"> = episodes in the reference twin. Both are summed in one operator-time cost at a rate fixed in the pre-registration. Some scenes are held out for all tuning. The proxy's own error is reported: renders of the reference twin are compared with held-out real images (PSNR, LPIPS, depth error), and tier C checks that tier-A conclusions hold on a robot. </w:t>
+        <w:t xml:space="preserve"> = episodes in the reference; both are summed in one operator-time cost at a pre-registered rate. The proxy's own error is reported (reference renders vs. held-out real images: PSNR, LPIPS, depth error); every hypothesis is re-checked for sign with a second reference (3DGS from all DSLR images), and tier C checks the conclusions on a robot. </w:t>
       </w:r>
       <w:r>
         <w:rPr>
@@ -7147,7 +7134,7 @@
           <w:rFonts w:cstheme="minorHAnsi"/>
           <w:lang w:val="en-US"/>
         </w:rPr>
-        <w:t xml:space="preserve"> public real-world datasets and published paired sim/real results (SIMPLER [34]). </w:t>
+        <w:t xml:space="preserve"> public real-world datasets and published paired sim/real results (SIMPLER [35]). </w:t>
       </w:r>
       <w:r>
         <w:rPr>
@@ -7177,7 +7164,7 @@
           <w:rFonts w:cstheme="minorHAnsi"/>
           <w:lang w:val="en-US"/>
         </w:rPr>
-        <w:t xml:space="preserve"> WCSS Lem (NVIDIA H100) and PLGrid allocations (to be applied for). Policies are trained by reinforcement learning (PPO) and by imitation of a shortest-path planner in the twin; small policies on frozen visual encoders keep the compute academic.</w:t>
+        <w:t xml:space="preserve"> WCSS Lem (NVIDIA H100) and PLGrid allocations (to be applied for). Tasks are image-goal and point-goal navigation with a pre-registered minimum geodesic distance, set in the T3.1 pilot so that SR stays below its ceiling; SPL is reported as well. Policies are small heads on frozen visual encoders, trained mainly by imitation of a shortest-path planner in the twin (PPO on a subset), which keeps the compute academic.</w:t>
       </w:r>
     </w:p>
     <w:p>
@@ -7235,7 +7222,7 @@
           <w:rFonts w:cstheme="minorHAnsi"/>
           <w:lang w:val="en-US"/>
         </w:rPr>
-        <w:t xml:space="preserve">, i.e. how often a pilot policy trained in the current twin visits or attends to the region on sampled start–goal paths. The next views are chosen greedily where task-weighted uncertainty is highest, in rounds, until the budget is spent.</w:t>
+        <w:t xml:space="preserve">: how often planner paths on sampled start–goal pairs pass through the region (geometry only, no training), or, as a variant, how much a pilot policy attends to it. The next views are chosen greedily where task-weighted uncertainty is highest, in rounds, until the budget is spent. Candidates are limited to the recorded pool; capture time is also estimated as a walking tour through the chosen viewpoints.</w:t>
       </w:r>
     </w:p>
     <w:p>
@@ -7264,7 +7251,7 @@
           <w:rFonts w:cstheme="minorHAnsi"/>
           <w:lang w:val="en-US"/>
         </w:rPr>
-        <w:t xml:space="preserve"> uniform subsampling of the capture, and reconstruction-only next-best-view (FisherRF-type [16]) at the same budget.</w:t>
+        <w:t xml:space="preserve"> uniform subsampling of the capture, reconstruction-only next-best-view (FisherRF-type [16]) and risk-weighted view selection [19], at the same budget.</w:t>
       </w:r>
     </w:p>
     <w:p>
@@ -7365,7 +7352,7 @@
           <w:rFonts w:cstheme="minorHAnsi"/>
           <w:lang w:val="en-US"/>
         </w:rPr>
-        <w:t xml:space="preserve"> (a) augmentation whose strength follows per-region reconstruction uncertainty (appearance and geometry perturbations where the twin is unsure, little where it is sure); (b) sample weighting of twin frames by their representation distance (frozen DINOv2 [25] features) to a few real images. The images come from the capture itself, so they cost no extra real data.</w:t>
+        <w:t xml:space="preserve"> (a) augmentation whose strength follows per-region reconstruction uncertainty (appearance and geometry perturbations where the twin is unsure, little where it is sure); (b) down-weighting twin frames that lie far from a few real images in frozen DINOv2 [26] feature space (nearest-neighbour distance). The real images are a held-out slice of the capture, not used to fit the twin, and count towards the capture budget.</w:t>
       </w:r>
     </w:p>
     <w:p>
@@ -7394,7 +7381,7 @@
           <w:rFonts w:cstheme="minorHAnsi"/>
           <w:lang w:val="en-US"/>
         </w:rPr>
-        <w:t xml:space="preserve"> uniform domain randomization [20] with tuned ranges, no randomization, and feature alignment [23] as an extra comparator; all at the same capture budget.</w:t>
+        <w:t xml:space="preserve"> uniform domain randomization [21] with tuned ranges, no randomization, and feature alignment [24] as an extra comparator; all at the same capture budget.</w:t>
       </w:r>
     </w:p>
     <w:p>
@@ -7495,7 +7482,7 @@
           <w:rFonts w:cstheme="minorHAnsi"/>
           <w:lang w:val="en-US"/>
         </w:rPr>
-        <w:t xml:space="preserve"> the rollouts (i) correct the twin, by re-capturing or re-weighting the regions where real and twin observations disagree (photometric correction in the style of [35]), and (ii) fine-tune the policy by co-training with the real rollouts [13]. Real SR is estimated from few trials with prediction-powered inference [32, 33].</w:t>
+        <w:t xml:space="preserve"> the rollouts (i) correct the twin, by re-capturing or re-weighting the regions where real and twin observations disagree (photometric correction in the style of [36]; re-captured views count towards the budget), and (ii) fine-tune the policy by co-training with the real rollouts [13]. Real SR is estimated from few trials with prediction-powered inference [33, 34].</w:t>
       </w:r>
     </w:p>
     <w:p>
@@ -7524,7 +7511,7 @@
           <w:rFonts w:cstheme="minorHAnsi"/>
           <w:lang w:val="en-US"/>
         </w:rPr>
-        <w:t xml:space="preserve"> random selection and uniform coverage of the same number of rollouts; related selection rules [27–29] as comparators where they apply.</w:t>
+        <w:t xml:space="preserve"> random selection and uniform coverage of the same number of rollouts; related selection rules [28–30] as comparators where they apply.</w:t>
       </w:r>
     </w:p>
     <w:p>
@@ -7611,7 +7598,7 @@
           <w:rFonts w:cstheme="minorHAnsi"/>
           <w:lang w:val="en-US"/>
         </w:rPr>
-        <w:t xml:space="preserve">, i.e. a policy trained only on data collected in the reference with the same encoder and algorithm, every interaction counted as real data. The "exchange rate" is the ratio of the budgets that reach the target SR; real-only scaling results [9, 10] give the expected curve shapes. The curve is also reported for a uniform loop (no Stage I–III guidance) and for a frozen, pretrained world model used as the simulator (comparator only; not trained).</w:t>
+        <w:t xml:space="preserve">: imitation of planner demonstrations collected in the reference, with the same frozen encoder and initialization, the data-efficient real-only recipe (real-only PPO for completeness). The "exchange rate" is the ratio of the budgets that reach the target SR; real-only scaling results [9, 10] give the expected curve shapes. The curve is also reported for a uniform loop (no Stage I–III guidance) and for a released pretrained world model used as the simulator (comparator only; not trained).</w:t>
       </w:r>
     </w:p>
     <w:p>
@@ -7640,7 +7627,7 @@
           <w:rFonts w:cstheme="minorHAnsi"/>
           <w:lang w:val="en-US"/>
         </w:rPr>
-        <w:t xml:space="preserve"> the same pipeline, unchanged, on public manipulation scenes with twin environments (ManiSkill3 [8]) under the tier-A protocol; published paired sim/real results (SIMPLER [34]) check that the proxy ranks policies as reality does (tier B).</w:t>
+        <w:t xml:space="preserve"> the three allocation methods, with hyperparameters unchanged, on public manipulation scenes (ManiSkill3 [8]): the simulator's own rendering plays "reality" and a 3DGS twin from a subset of its views is the training simulator. Physics is shared, so this tests the visual part of the loop, which is stated as a limitation; the policy learner is the task's standard one. Published paired sim/real results (SIMPLER [35]) check that the proxy ranks policies as reality does (tier B).</w:t>
       </w:r>
     </w:p>
     <w:p>
@@ -7669,7 +7656,7 @@
           <w:rFonts w:cstheme="minorHAnsi"/>
           <w:lang w:val="en-US"/>
         </w:rPr>
-        <w:t xml:space="preserve"> the loop reaches the target SR with ≤ 10% of the real data needed by real-only learning (upper 95% bound of the ratio &lt; 0.2); on manipulation, with pipeline and hyperparameters unchanged, the ratio's upper bound is &lt; 1 and the H1–H3 effects keep their sign.</w:t>
+        <w:t xml:space="preserve"> the loop reaches the target SR with ≤ 10% of the real data needed by real-only learning (upper 95% bound of the ratio &lt; 0.2); on manipulation the ratio's upper bound is &lt; 1 and the H1–H3 effects keep their sign.</w:t>
       </w:r>
     </w:p>
     <w:p>
@@ -7711,7 +7698,7 @@
           <w:rFonts w:cstheme="minorHAnsi"/>
           <w:lang w:val="en-US"/>
         </w:rPr>
-        <w:t xml:space="preserve"> Tests are one-sided (α = 0.05), bootstrapped over scenes and seeds, Holm-corrected within each hypothesis, as in §7. The protocol is pre-registered in the project repository before each stage, and changes are logged with reasons. Code and scripts are released where the dataset licences permit.</w:t>
+        <w:t xml:space="preserve"> Tests follow §7. The protocol is pre-registered in the project repository before each stage, and changes are logged with reasons. Code and scripts are released where the dataset licences permit.</w:t>
       </w:r>
     </w:p>
     <w:permEnd w:id="32011344"/>
@@ -8538,7 +8525,7 @@
           <w:rFonts w:cstheme="minorHAnsi"/>
           <w:lang w:val="en-US"/>
         </w:rPr>
-        <w:t xml:space="preserve">. P1 reports Stages I–II (RQ1–RQ2): task-aware, uncertainty-guided capture of digital twins and uncertainty-aware training of policies on imperfect twins, evaluated by the real data they save (task T4.2). If it is rejected, the revised paper goes to </w:t>
+        <w:t xml:space="preserve">. P1 reports Stage I and the first Stage II results (RQ1–RQ2): task-aware, uncertainty-guided capture of digital twins (H1) and uncertainty-aware training of policies on imperfect twins (first H2 results), evaluated by the real data they save (task T4.2). If it is rejected, the revised paper goes to </w:t>
       </w:r>
       <w:r>
         <w:rPr>
@@ -9062,7 +9049,7 @@
                 <w:rFonts w:cstheme="minorHAnsi"/>
                 <w:lang w:val="en-US"/>
               </w:rPr>
-              <w:t xml:space="preserve">P1 (RQ1–RQ2, task-aware capture, uncertainty-aware training): NeurIPS 2027, May 2027 (§11)</w:t>
+              <w:t xml:space="preserve">P1 (RQ1–RQ2, task-aware capture, first uncertainty-aware training results): NeurIPS 2027, May 2027 (§11)</w:t>
             </w:r>
           </w:p>
         </w:tc>
@@ -9154,7 +9141,7 @@
                 <w:rFonts w:cstheme="minorHAnsi"/>
                 <w:lang w:val="en-US"/>
               </w:rPr>
-              <w:t xml:space="preserve">P2 (RQ3, few real rollouts, twin correction): CVPR or ICLR 2028; P3 (RQ4, budget of the full loop, manipulation): NeurIPS 2028</w:t>
+              <w:t xml:space="preserve">P2 (RQ3, few real rollouts, twin correction): ICML or CVPR 2028; P3 (RQ4, budget of the full loop, manipulation): NeurIPS 2028</w:t>
             </w:r>
           </w:p>
         </w:tc>
@@ -9487,7 +9474,7 @@
           <w:rFonts w:cstheme="minorHAnsi"/>
           <w:lang w:val="en-US"/>
         </w:rPr>
-        <w:t xml:space="preserve"> (4–7): the proxy's own error is reported; tier C checks the direction of the effects.</w:t>
+        <w:t xml:space="preserve"> (4–7): twin and reference come from separate captures, a second reference checks the sign, the proxy's own error is reported, and tier C checks the direction.</w:t>
       </w:r>
     </w:p>
     <w:p>

</xml_diff>

<commit_message>
Wave 13: generalize to domain-agnostic real-to-sim-to-real (manipulation + navigation as equal testbeds, twins incl. system identification)
Closes #28, closes #29

Co-Authored-By: Claude Opus 5.5 <noreply@anthropic.com>
</commit_message>
<xml_diff>
--- a/output/IPB_Grzegorz_Piotrowski.docx
+++ b/output/IPB_Grzegorz_Piotrowski.docx
@@ -1098,7 +1098,7 @@
           <w:rFonts w:cstheme="minorHAnsi"/>
           <w:lang w:val="en-US"/>
         </w:rPr>
-        <w:t xml:space="preserve"> Uczenie polityk agentów ucieleśnionych w pętli rzeczywistość–symulacja–rzeczywistość przy ograniczonym budżecie danych rzeczywistych z wykorzystaniem cyfrowych bliźniaków z neuronowej rekonstrukcji scen</w:t>
+        <w:t xml:space="preserve"> Aktywna alokacja ograniczonych danych rzeczywistych w pętli rzeczywistość–symulacja–rzeczywistość: budowa cyfrowych bliźniaków, uczenie w nich i przenoszenie wyników do rzeczywistości</w:t>
       </w:r>
       <w:bookmarkStart w:id="0" w:name="_Hlk95566638"/>
     </w:p>
@@ -1120,7 +1120,7 @@
           <w:rFonts w:cstheme="minorHAnsi"/>
           <w:lang w:val="en-US"/>
         </w:rPr>
-        <w:t xml:space="preserve"> Learning embodied policies in the real-to-sim-to-real loop under a limited real-data budget with digital twins from neural scene reconstruction</w:t>
+        <w:t xml:space="preserve"> Active allocation of limited real data in the real-to-sim-to-real loop: building digital twins, learning in them and transferring the results back to reality</w:t>
       </w:r>
     </w:p>
     <w:bookmarkEnd w:id="0"/>
@@ -2047,7 +2047,7 @@
                 <w:rFonts w:cstheme="minorHAnsi"/>
                 <w:lang w:val="en-US"/>
               </w:rPr>
-              <w:t xml:space="preserve"> Formulation of the data-efficient real-to-sim-to-real thesis, research questions RQ1–RQ4 (capture less, train robustly on an imperfect twin, collect few real rollouts, budget of the whole loop) and hypotheses H1–H4 with measurable decision rules and evaluation tiers A–C. </w:t>
+              <w:t xml:space="preserve"> Formulation of the data-efficient real-to-sim-to-real thesis, research questions RQ1–RQ4 (capture less, learn robustly in an imperfect twin, few real data, budget of the whole loop) and hypotheses H1–H4 with measurable decision rules and evaluation tiers A–C. </w:t>
             </w:r>
             <w:r>
               <w:rPr>
@@ -2247,7 +2247,7 @@
                 <w:rFonts w:cstheme="minorHAnsi"/>
                 <w:lang w:val="en-US"/>
               </w:rPr>
-              <w:t xml:space="preserve"> Tier A set-up: final choice of ≥ 20 public scenes (10 held out) with laser scans and separate phone captures, simulator and existing 3DGS pipeline from the T2.2 shortlist; references ("reality") and training twins at ≥ 4 capture budgets; pilot fixing task difficulty (below the SR ceiling) and the capture-cost model; imitation-learned navigation policies in the twins; pre-registration of the protocol (§7, §9). </w:t>
+              <w:t xml:space="preserve"> Tier A set-up in both testbeds (§9): navigation, ≥ 20 public scenes (10 held out) with laser-scan references and separate phone captures; manipulation, ≥ 20 simulator task–object configurations (10 held out) with held-out physical parameters. Existing 3DGS pipeline and system identification from the T2.2 shortlist; twins at ≥ 4 capture budgets; pilot fixing task difficulty (below the P ceiling) and the operator-time cost model; imitation-learned policies in the twins; pre-registration of the protocol (§7, §9). </w:t>
             </w:r>
             <w:r>
               <w:rPr>
@@ -2262,7 +2262,7 @@
                 <w:rFonts w:cstheme="minorHAnsi"/>
                 <w:lang w:val="en-US"/>
               </w:rPr>
-              <w:t xml:space="preserve"> working loop and protocol in the repository, </w:t>
+              <w:t xml:space="preserve"> working loop and protocol in the repository for both testbeds, </w:t>
             </w:r>
             <w:r>
               <w:rPr>
@@ -2270,7 +2270,7 @@
                 <w:b/>
                 <w:lang w:val="en-US"/>
               </w:rPr>
-              <w:t xml:space="preserve">by Dec 2026</w:t>
+              <w:t xml:space="preserve">by Jan 2027</w:t>
             </w:r>
             <w:r>
               <w:rPr>
@@ -2298,7 +2298,7 @@
                 <w:rFonts w:cstheme="minorHAnsi"/>
                 <w:lang w:val="en-US"/>
               </w:rPr>
-              <w:t xml:space="preserve"> Validation stand: written agreement on robot access (planned cooperation with the K29 Denali laboratory, or another PWr platform) and sensor decision (SzD Minigrant application if a sensor must be bought). </w:t>
+              <w:t xml:space="preserve"> Validation stand: written agreement on robot access (planned cooperation with the K29 Denali laboratory for the mobile robot; a PWr manipulator if available) and sensor decision (SzD Minigrant application if a sensor must be bought). </w:t>
             </w:r>
             <w:r>
               <w:rPr>
@@ -2349,7 +2349,7 @@
                 <w:rFonts w:cstheme="minorHAnsi"/>
                 <w:lang w:val="en-US"/>
               </w:rPr>
-              <w:t xml:space="preserve"> Task-aware, uncertainty-guided capture vs. uniform, reconstruction-only and risk-weighted view selection. </w:t>
+              <w:t xml:space="preserve"> Task-aware, uncertainty-guided capture of views and interactions vs. uniform, task-blind and risk-weighted selection. </w:t>
             </w:r>
             <w:r>
               <w:rPr>
@@ -2456,7 +2456,7 @@
                 <w:b/>
                 <w:lang w:val="en-US"/>
               </w:rPr>
-              <w:t xml:space="preserve">Stage I completed; Stage II – train robustly on an imperfect twin (RQ1–RQ2, H1–H2).</w:t>
+              <w:t xml:space="preserve">Stage I completed; Stage II – learn robustly in an imperfect twin (RQ1–RQ2, H1–H2).</w:t>
             </w:r>
           </w:p>
           <w:p>
@@ -2477,7 +2477,7 @@
                 <w:rFonts w:cstheme="minorHAnsi"/>
                 <w:lang w:val="en-US"/>
               </w:rPr>
-              <w:t xml:space="preserve"> Uncertainty-aware augmentation and representation-based weighting of twin data vs. uniform domain randomization at an equal capture budget. </w:t>
+              <w:t xml:space="preserve"> Uncertainty-aware randomization (appearance, geometry, physical parameters) and representation-based weighting of twin samples vs. uniform domain randomization at an equal capture budget, in both testbeds. </w:t>
             </w:r>
             <w:r>
               <w:rPr>
@@ -2573,7 +2573,7 @@
                 <w:rFonts w:cstheme="minorHAnsi"/>
                 <w:lang w:val="en-US"/>
               </w:rPr>
-              <w:t xml:space="preserve"> (RQ1–RQ2: task-aware capture, H1, and first uncertainty-aware training results, H2). </w:t>
+              <w:t xml:space="preserve"> (RQ1–RQ2: task-aware capture, H1, and first uncertainty-aware learning results, H2, in manipulation and navigation). </w:t>
             </w:r>
             <w:r>
               <w:rPr>
@@ -2624,7 +2624,7 @@
                 <w:rFonts w:cstheme="minorHAnsi"/>
                 <w:lang w:val="en-US"/>
               </w:rPr>
-              <w:t xml:space="preserve"> Stage III set-up: rollout-selection and correction code on tier A (Jul–Sep 2027). </w:t>
+              <w:t xml:space="preserve"> Stage III set-up: trial-selection and correction code on tier A (Jul–Sep 2027). </w:t>
             </w:r>
             <w:r>
               <w:rPr>
@@ -2783,7 +2783,7 @@
                 <w:b/>
                 <w:lang w:val="en-US"/>
               </w:rPr>
-              <w:t xml:space="preserve">Stage III – collect few real rollouts (RQ3, H3).</w:t>
+              <w:t xml:space="preserve">Stage III – collect few real data (RQ3, H3).</w:t>
             </w:r>
           </w:p>
           <w:p>
@@ -2804,7 +2804,7 @@
                 <w:rFonts w:cstheme="minorHAnsi"/>
                 <w:lang w:val="en-US"/>
               </w:rPr>
-              <w:t xml:space="preserve"> Active selection of real rollouts (predicted gap, uncertainty) vs. random selection; correction of the twin and fine-tuning of the policy with the selected rollouts. </w:t>
+              <w:t xml:space="preserve"> Active selection of real trials (predicted gap, uncertainty) vs. random selection; correction of the twin (appearance and physical parameters) and fine-tuning of the policy with the selected trials, in both testbeds. </w:t>
             </w:r>
             <w:r>
               <w:rPr>
@@ -2870,7 +2870,7 @@
                 <w:rFonts w:cstheme="minorHAnsi"/>
                 <w:lang w:val="en-US"/>
               </w:rPr>
-              <w:t xml:space="preserve"> First robot validation campaign (tier C, 2 PWr rooms, ~8 robot-hours): own captures, twins, uniform capture vs. the loop. </w:t>
+              <w:t xml:space="preserve"> First robot validation campaign (tier C, 2 PWr settings, ~8 robot-hours): own captures, twins, uniform capture vs. the loop. </w:t>
             </w:r>
             <w:r>
               <w:rPr>
@@ -2885,7 +2885,7 @@
                 <w:rFonts w:cstheme="minorHAnsi"/>
                 <w:lang w:val="en-US"/>
               </w:rPr>
-              <w:t xml:space="preserve"> validation report. Place: Denali. Without robot access, the campaign moves to sem. 7; H1–H3 are decided on tier A either way.</w:t>
+              <w:t xml:space="preserve"> validation report. Place: Denali (and the manipulator's lab, if agreed). Without robot access, the campaign moves to sem. 7; H1–H3 are decided on tier A either way.</w:t>
             </w:r>
           </w:p>
           <w:p>
@@ -2921,7 +2921,7 @@
                 <w:rFonts w:cstheme="minorHAnsi"/>
                 <w:lang w:val="en-US"/>
               </w:rPr>
-              <w:t xml:space="preserve"> (active real-rollout selection and twin correction, RQ3) submitted to </w:t>
+              <w:t xml:space="preserve"> (active selection of few real data and twin correction, RQ3) submitted to </w:t>
             </w:r>
             <w:r>
               <w:rPr>
@@ -3029,7 +3029,7 @@
                 <w:b/>
                 <w:lang w:val="en-US"/>
               </w:rPr>
-              <w:t xml:space="preserve">Stage IV – budget of the whole loop; cross-task test (RQ4, H4).</w:t>
+              <w:t xml:space="preserve">Stage IV – budget of the whole loop in both testbeds (RQ4, H4).</w:t>
             </w:r>
           </w:p>
           <w:p>
@@ -3050,7 +3050,7 @@
                 <w:rFonts w:cstheme="minorHAnsi"/>
                 <w:lang w:val="en-US"/>
               </w:rPr>
-              <w:t xml:space="preserve"> (a) Real-data budget curves of the full loop vs. real-only learning ("exchange rate") on tier A; (b) the same pipeline, unchanged, on manipulation scenes, with published paired sim/real results as tier-B check. </w:t>
+              <w:t xml:space="preserve"> Real-data budget curves of the full loop vs. real-only learning ("exchange rate") on tier A in manipulation and navigation, with the allocation methods unchanged, plus the tier-B check against published paired sim/real evaluations. </w:t>
             </w:r>
             <w:r>
               <w:rPr>
@@ -3065,7 +3065,7 @@
                 <w:rFonts w:cstheme="minorHAnsi"/>
                 <w:lang w:val="en-US"/>
               </w:rPr>
-              <w:t xml:space="preserve"> navigation result </w:t>
+              <w:t xml:space="preserve"> first-testbed result </w:t>
             </w:r>
             <w:r>
               <w:rPr>
@@ -3182,7 +3182,7 @@
                 <w:rFonts w:cstheme="minorHAnsi"/>
                 <w:lang w:val="en-US"/>
               </w:rPr>
-              <w:t xml:space="preserve"> (budget law of the full loop, with first manipulation results) submitted to </w:t>
+              <w:t xml:space="preserve"> (budget law of the full loop across both testbeds) submitted to </w:t>
             </w:r>
             <w:r>
               <w:rPr>
@@ -3326,7 +3326,7 @@
                 <w:rFonts w:cstheme="minorHAnsi"/>
                 <w:lang w:val="en-US"/>
               </w:rPr>
-              <w:t xml:space="preserve"> Second robot validation campaign (tier C) of the full loop; final analysis of H1–H4 across tiers. </w:t>
+              <w:t xml:space="preserve"> Second robot validation campaign (tier C) of the full loop; final analysis of H1–H4 across tiers and testbeds. </w:t>
             </w:r>
             <w:r>
               <w:rPr>
@@ -4270,7 +4270,7 @@
           <w:rFonts w:cstheme="minorHAnsi"/>
           <w:lang w:val="en-US"/>
         </w:rPr>
-        <w:t xml:space="preserve">. Embodied agents (mobile robots, manipulators) learn strong behaviour only from very large amounts of experience. In the real world such data is slow, expensive and sometimes risky to collect, so a policy is usually trained in simulation and then deployed on real sensor data, where it often fails (the </w:t>
+        <w:t xml:space="preserve">. Systems that act in or measure the physical world, such as robot manipulators, mobile robots and other autonomous or perception systems, need large amounts of experience, and in the real world that data is slow, expensive and sometimes risky to collect. A policy or model is therefore often trained in simulation and then used on real data, where it often performs worse (the </w:t>
       </w:r>
       <w:r>
         <w:rPr>
@@ -4299,14 +4299,14 @@
           <w:b/>
           <w:lang w:val="en-US"/>
         </w:rPr>
-        <w:t xml:space="preserve">Digital twins built by neural scene reconstruction</w:t>
-      </w:r>
-      <w:r>
-        <w:rPr>
-          <w:rFonts w:cstheme="minorHAnsi"/>
-          <w:lang w:val="en-US"/>
-        </w:rPr>
-        <w:t xml:space="preserve"> (3D Gaussian Splatting, Neural Radiance Fields) turn a short real capture into a photorealistic model of the target scene, in which a policy can be trained at scale. This gives a </w:t>
+        <w:t xml:space="preserve">Digital twins</w:t>
+      </w:r>
+      <w:r>
+        <w:rPr>
+          <w:rFonts w:cstheme="minorHAnsi"/>
+          <w:lang w:val="en-US"/>
+        </w:rPr>
+        <w:t xml:space="preserve"> built from real data narrow this gap. Neural scene reconstruction (3D Gaussian Splatting, Neural Radiance Fields) turns a short real capture into a photorealistic model of the geometry and appearance of a scene, and system identification estimates its physical and dynamic parameters (masses, friction, actuation) from a few real interactions. This gives a </w:t>
       </w:r>
       <w:r>
         <w:rPr>
@@ -4321,7 +4321,7 @@
           <w:rFonts w:cstheme="minorHAnsi"/>
           <w:lang w:val="en-US"/>
         </w:rPr>
-        <w:t xml:space="preserve">: capture the real scene, build a twin, train the policy in the twin, run a few real trials, correct the twin and the policy, deploy. Building twins has quickly become routine, with dozens of papers a year and more than ten open-source twin simulators. What remains open is the </w:t>
+        <w:t xml:space="preserve">: collect real data, build a twin, learn in the twin, check and correct with a little more real data, deploy. Building twins has quickly become routine, with dozens of papers a year and more than ten open-source twin simulators. What remains open is the </w:t>
       </w:r>
       <w:r>
         <w:rPr>
@@ -4336,7 +4336,7 @@
           <w:rFonts w:cstheme="minorHAnsi"/>
           <w:lang w:val="en-US"/>
         </w:rPr>
-        <w:t xml:space="preserve"> the loop consumes. Each step spends it: the capture, the real data used to make training robust to what the twin got wrong, and the real trials used to check and correct the policy. Today these amounts are chosen by habit: the scene is recorded uniformly, the policy is trained with generic randomization, and real trials are picked at random or by hand. How much real data a twin actually saves, especially for navigation, has, to our knowledge, not been measured.</w:t>
+        <w:t xml:space="preserve"> the loop consumes. Each step spends it: the capture that builds the twin, the real data used to make learning robust to what the twin got wrong, and the real-world trials or interactions used to check and correct the result. Today these amounts are chosen by habit: data is collected uniformly, learning uses generic randomization, and real trials are picked at random or by hand. How much real data a twin actually saves has, to our knowledge, not been measured systematically across tasks.</w:t>
       </w:r>
     </w:p>
     <w:p>
@@ -4372,37 +4372,37 @@
           <w:rFonts w:cstheme="minorHAnsi"/>
           <w:lang w:val="en-US"/>
         </w:rPr>
-        <w:t xml:space="preserve">: capture only what the policy needs to build the twin, train so that the policy is robust to the twin's errors, and collect only the few real rollouts that close the remaining gap. Two signals, both computed from data the loop already collects, guide these choices: the </w:t>
-      </w:r>
-      <w:r>
-        <w:rPr>
-          <w:rFonts w:cstheme="minorHAnsi"/>
-          <w:b/>
-          <w:lang w:val="en-US"/>
-        </w:rPr>
-        <w:t xml:space="preserve">uncertainty of the reconstruction</w:t>
-      </w:r>
-      <w:r>
-        <w:rPr>
-          <w:rFonts w:cstheme="minorHAnsi"/>
-          <w:lang w:val="en-US"/>
-        </w:rPr>
-        <w:t xml:space="preserve"> (where the twin is unreliable) and the </w:t>
-      </w:r>
-      <w:r>
-        <w:rPr>
-          <w:rFonts w:cstheme="minorHAnsi"/>
-          <w:b/>
-          <w:lang w:val="en-US"/>
-        </w:rPr>
-        <w:t xml:space="preserve">policy's own internal representations</w:t>
-      </w:r>
-      <w:r>
-        <w:rPr>
-          <w:rFonts w:cstheme="minorHAnsi"/>
-          <w:lang w:val="en-US"/>
-        </w:rPr>
-        <w:t xml:space="preserve"> (where twin and real inputs look different to the policy). The result is measured as a budget–performance curve: how much real data the loop needs to reach a given real success rate, compared with uniform allocation and with learning from real data only.</w:t>
+        <w:t xml:space="preserve">: collect only the data the task needs to build the twin, learn so that the result is robust to the twin's errors, and collect only the few real-world data or interactions that close the remaining gap. Two signals, both computed from data the loop already collects, guide these choices: the </w:t>
+      </w:r>
+      <w:r>
+        <w:rPr>
+          <w:rFonts w:cstheme="minorHAnsi"/>
+          <w:b/>
+          <w:lang w:val="en-US"/>
+        </w:rPr>
+        <w:t xml:space="preserve">uncertainty of the twin</w:t>
+      </w:r>
+      <w:r>
+        <w:rPr>
+          <w:rFonts w:cstheme="minorHAnsi"/>
+          <w:lang w:val="en-US"/>
+        </w:rPr>
+        <w:t xml:space="preserve"> (where its reconstruction or its identified parameters are unreliable) and the </w:t>
+      </w:r>
+      <w:r>
+        <w:rPr>
+          <w:rFonts w:cstheme="minorHAnsi"/>
+          <w:b/>
+          <w:lang w:val="en-US"/>
+        </w:rPr>
+        <w:t xml:space="preserve">learned model's own internal representations</w:t>
+      </w:r>
+      <w:r>
+        <w:rPr>
+          <w:rFonts w:cstheme="minorHAnsi"/>
+          <w:lang w:val="en-US"/>
+        </w:rPr>
+        <w:t xml:space="preserve"> (where twin and real inputs look different to it). The result is measured as a budget–performance curve: how much real data the loop needs to reach a given real task performance, compared with uniform allocation and with learning from real data only.</w:t>
       </w:r>
     </w:p>
     <w:p>
@@ -4423,7 +4423,7 @@
           <w:rFonts w:cstheme="minorHAnsi"/>
           <w:lang w:val="en-US"/>
         </w:rPr>
-        <w:t xml:space="preserve"> The object is a data-efficient learning methodology (active learning, learning under distribution shift, uncertainty estimation), not a robot, a simulator or a benchmark, which places it in </w:t>
+        <w:t xml:space="preserve"> The object is a general, task- and domain-agnostic data-efficient learning methodology (active learning, learning under distribution shift, uncertainty estimation), not a particular robot, task, simulator or benchmark, which places it in </w:t>
       </w:r>
       <w:r>
         <w:rPr>
@@ -4438,22 +4438,7 @@
           <w:rFonts w:cstheme="minorHAnsi"/>
           <w:lang w:val="en-US"/>
         </w:rPr>
-        <w:t xml:space="preserve">. The student uses existing twin pipelines, simulators and public datasets and does not develop new ones. </w:t>
-      </w:r>
-      <w:r>
-        <w:rPr>
-          <w:rFonts w:cstheme="minorHAnsi"/>
-          <w:b/>
-          <w:lang w:val="en-US"/>
-        </w:rPr>
-        <w:t xml:space="preserve">Visual navigation</w:t>
-      </w:r>
-      <w:r>
-        <w:rPr>
-          <w:rFonts w:cstheme="minorHAnsi"/>
-          <w:lang w:val="en-US"/>
-        </w:rPr>
-        <w:t xml:space="preserve"> is the primary testbed, because public scene datasets with dense real captures make it possible to count real data exactly without an own robot; </w:t>
+        <w:t xml:space="preserve">. The student uses existing twin pipelines, simulators and public datasets and does not develop new ones. The methods are tested with the same settings on two testbeds of equal status, </w:t>
       </w:r>
       <w:r>
         <w:rPr>
@@ -4468,7 +4453,22 @@
           <w:rFonts w:cstheme="minorHAnsi"/>
           <w:lang w:val="en-US"/>
         </w:rPr>
-        <w:t xml:space="preserve"> tests that the methods carry over to another task. Trials on a real robot (planned cooperation with a PWr robotics laboratory) validate, but do not decide, the conclusions. The topic fits the Department of Artificial Intelligence (K46), whose research groups include representation learning. The computation runs on the GPU infrastructure available to PWr researchers (WCSS, PLGrid).</w:t>
+        <w:t xml:space="preserve"> and </w:t>
+      </w:r>
+      <w:r>
+        <w:rPr>
+          <w:rFonts w:cstheme="minorHAnsi"/>
+          <w:b/>
+          <w:lang w:val="en-US"/>
+        </w:rPr>
+        <w:t xml:space="preserve">visual navigation</w:t>
+      </w:r>
+      <w:r>
+        <w:rPr>
+          <w:rFonts w:cstheme="minorHAnsi"/>
+          <w:lang w:val="en-US"/>
+        </w:rPr>
+        <w:t xml:space="preserve">, where public data make it possible to count real data exactly without an own robot. Trials on a real robot (planned cooperation with a PWr robotics laboratory) validate, but do not decide, the conclusions. The topic fits the Department of Artificial Intelligence (K46), whose research groups include representation learning. The computation runs on the GPU infrastructure available to PWr researchers (WCSS, PLGrid).</w:t>
       </w:r>
     </w:p>
     <w:p>
@@ -4489,7 +4489,7 @@
           <w:rFonts w:cstheme="minorHAnsi"/>
           <w:lang w:val="en-US"/>
         </w:rPr>
-        <w:t xml:space="preserve"> faster and cheaper deployment of learned robots in new buildings and workcells (service, assistive, warehouse and inspection robotics, flexible manipulation), with less time spent recording scenes and supervising real trials; guidance on how to record a site for a twin; and, beyond robotics, any system trained on reconstructed or synthetic data and deployed on real sensor data (industrial digital twins, perception for autonomous systems), where real data must be collected on a budget.</w:t>
+        <w:t xml:space="preserve"> faster and cheaper deployment of learned systems in new places, such as robot workcells, warehouses, buildings and inspection sites, with less time spent collecting data and supervising real trials; guidance on how much real data to collect for a twin; and, beyond robotics, any model trained on reconstructed or simulated data and used on real sensor data (industrial digital twins, perception for autonomous systems), where real data must be collected on a budget.</w:t>
       </w:r>
     </w:p>
     <w:permEnd w:id="1178868985"/>
@@ -4860,14 +4860,14 @@
           <w:b/>
           <w:lang w:val="en-US"/>
         </w:rPr>
-        <w:t xml:space="preserve">Real-to-sim-to-real with neural digital twins.</w:t>
-      </w:r>
-      <w:r>
-        <w:rPr>
-          <w:rFonts w:cstheme="minorHAnsi"/>
-          <w:lang w:val="en-US"/>
-        </w:rPr>
-        <w:t xml:space="preserve"> Simulators such as Habitat [1] enable large-scale training of embodied agents, but not in the robot's own scene. 3D Gaussian Splatting (3DGS) [2] now turns a short camera capture into a real-time, photorealistic </w:t>
+        <w:t xml:space="preserve">Real-to-sim-to-real with digital twins.</w:t>
+      </w:r>
+      <w:r>
+        <w:rPr>
+          <w:rFonts w:cstheme="minorHAnsi"/>
+          <w:lang w:val="en-US"/>
+        </w:rPr>
+        <w:t xml:space="preserve"> A real-to-sim-to-real loop builds a simulation of the target scene or object (a </w:t>
       </w:r>
       <w:r>
         <w:rPr>
@@ -4882,7 +4882,7 @@
           <w:rFonts w:cstheme="minorHAnsi"/>
           <w:lang w:val="en-US"/>
         </w:rPr>
-        <w:t xml:space="preserve"> of that scene. Policies trained in such twins transfer to real robots in navigation and locomotion (EmbodiedSplat [3], Vid2Sim [4], GaussGym [5]) and manipulation (RialTo [6], SplatSim [7]), and GPU simulators ship twin environments (ManiSkill3 [8]). Building a twin is no longer the bottleneck; </w:t>
+        <w:t xml:space="preserve">) from real data, learns a policy or model in it and transfers it back. Generic simulators such as Habitat [1] train at scale, but not in the target scene. 3D Gaussian Splatting (3DGS) [2] turns a short camera capture into a real-time, photorealistic twin of geometry and appearance, and policies trained in such twins transfer in manipulation (RialTo [3], SplatSim [4]) and in navigation and locomotion (EmbodiedSplat [5], Vid2Sim [6], GaussGym [7]); GPU simulators ship twin environments (ManiSkill3 [8]). The physical side is identified from real data: BayesSim [9] infers a posterior over simulator parameters from real trajectories, and PhysTwin [10] recovers the geometry, physical properties and appearance of deformable objects from sparse videos. Building a twin is no longer the bottleneck; </w:t>
       </w:r>
       <w:r>
         <w:rPr>
@@ -4897,7 +4897,7 @@
           <w:rFonts w:cstheme="minorHAnsi"/>
           <w:lang w:val="en-US"/>
         </w:rPr>
-        <w:t xml:space="preserve"> is: the capture that builds the twin and the real rollouts that correct the policy. Current systems fix this cost by hand: EmbodiedSplat uses a 20–30-minute phone capture per scene, and RialTo's ablation over 0–15 real demonstrations is the closest published analysis of a real-data budget.</w:t>
+        <w:t xml:space="preserve"> is: the capture that builds the twin and the real-world data or interactions that correct it and the policy. Current systems fix this cost by hand: EmbodiedSplat uses a 20–30-minute phone capture per scene, and RialTo's ablation over 0–15 real demonstrations is the closest published analysis of a real-data budget.</w:t>
       </w:r>
     </w:p>
     <w:p>
@@ -4918,15 +4918,15 @@
           <w:rFonts w:cstheme="minorHAnsi"/>
           <w:lang w:val="en-US"/>
         </w:rPr>
-        <w:t xml:space="preserve"> Real-only scaling studies relate performance to the number of real demonstrations in manipulation [9]; in navigation, diversity matters more than quantity and more data from a known location saturates quickly [10]. On the twin side, CASHER [11] reports performance that scales super-linearly with human effort, X-Sim [12] matches behaviour cloning with ten times less data-collection time, and sim-and-real co-training raises real success by 38% on average [13]. Simulation can poorly predict real navigation results [14], and lower-fidelity simulation can transfer better [15], so more capture is not automatically better. All of these report results at fixed or hand-chosen budgets. </w:t>
-      </w:r>
-      <w:r>
-        <w:rPr>
-          <w:rFonts w:cstheme="minorHAnsi"/>
-          <w:b/>
-          <w:lang w:val="en-US"/>
-        </w:rPr>
-        <w:t xml:space="preserve">We found no study that varies the capture budget of a twin as an experimental variable in navigation, or that fits real-data budget curves for the whole loop against real-only learning.</w:t>
+        <w:t xml:space="preserve"> Real-only scaling studies relate performance to the number of real demonstrations in manipulation [11]; in navigation, diversity matters more than quantity and more data from a known location saturates quickly [12]. On the twin side, CASHER [13] reports performance that scales super-linearly with human effort, X-Sim [14] matches behaviour cloning with ten times less data-collection time, and sim-and-real co-training raises real success by 38% on average [15]. Lower-fidelity simulation can transfer better [16], so more capture is not automatically better. All of these report results at fixed or hand-chosen budgets in one domain. </w:t>
+      </w:r>
+      <w:r>
+        <w:rPr>
+          <w:rFonts w:cstheme="minorHAnsi"/>
+          <w:b/>
+          <w:lang w:val="en-US"/>
+        </w:rPr>
+        <w:t xml:space="preserve">We found no study that varies the real-data budget of a twin as an experimental variable, or that fits real-data budget curves of the whole loop against real-only learning across domains.</w:t>
       </w:r>
     </w:p>
     <w:p>
@@ -4940,14 +4940,14 @@
           <w:b/>
           <w:lang w:val="en-US"/>
         </w:rPr>
-        <w:t xml:space="preserve">Capturing less: active reconstruction and its uncertainty.</w:t>
-      </w:r>
-      <w:r>
-        <w:rPr>
-          <w:rFonts w:cstheme="minorHAnsi"/>
-          <w:lang w:val="en-US"/>
-        </w:rPr>
-        <w:t xml:space="preserve"> Active view selection chooses the images that improve a reconstruction most: FisherRF [16] maximizes the expected information gain on radiance-field parameters, GenNBV [17] learns a next-best-view policy that generalizes across scenes, and Bayes' Rays [18] estimates a volumetric uncertainty field for a trained neural radiance field. Risk-aware view acquisition [19] weights FisherRF by safety-critical regions during exploration. Their objective is reconstruction quality, coverage or safe exploration, not the success of a policy trained in the twin; we found at most two task-aware capture papers a year in 2023–2026. ScanNet++ [20] pairs laser scans with DSLR images and a separate phone stream, so capture budgets can be varied offline.</w:t>
+        <w:t xml:space="preserve">Capturing less: active reconstruction and active identification.</w:t>
+      </w:r>
+      <w:r>
+        <w:rPr>
+          <w:rFonts w:cstheme="minorHAnsi"/>
+          <w:lang w:val="en-US"/>
+        </w:rPr>
+        <w:t xml:space="preserve"> Active view selection chooses the images that improve a reconstruction most: FisherRF [17] maximizes the expected information gain on radiance-field parameters, GenNBV [18] learns a next-best-view policy that generalizes across scenes, and Bayes' Rays [19] estimates a volumetric uncertainty field for a trained neural radiance field. Risk-aware view acquisition [20] weights FisherRF by safety-critical regions during exploration. For physical parameters, ASID [21] uses an initial simulator to design exploration that collects a small amount of informative real data for identifying articulation, mass and other parameters. Their objective is reconstruction quality, safe exploration or parameter accuracy, not the success of a policy trained in the twin; we found at most two task-aware capture papers a year in 2023–2026. Public data allow budgets to be varied offline: ScanNet++ [22] pairs laser scans with DSLR images and a separate phone stream.</w:t>
       </w:r>
     </w:p>
     <w:p>
@@ -4961,14 +4961,14 @@
           <w:b/>
           <w:lang w:val="en-US"/>
         </w:rPr>
-        <w:t xml:space="preserve">Training robustly on an imperfect twin.</w:t>
-      </w:r>
-      <w:r>
-        <w:rPr>
-          <w:rFonts w:cstheme="minorHAnsi"/>
-          <w:lang w:val="en-US"/>
-        </w:rPr>
-        <w:t xml:space="preserve"> Domain randomization varies appearance [21] or dynamics [22] uniformly within hand-set ranges, and SimOpt [23] adapts the randomization distribution from a few real rollouts. Domain adaptation aligns sim and real features in co-training [24], and a mechanistic analysis finds that representation alignment is the main effect of co-training [25]. Frozen encoders (DINOv2 [26]) make twin and real frames comparable, and Phys2Real [27] trains with uncertainty over physical parameters. Still, a twin's own </w:t>
+        <w:t xml:space="preserve">Learning robustly in an imperfect twin.</w:t>
+      </w:r>
+      <w:r>
+        <w:rPr>
+          <w:rFonts w:cstheme="minorHAnsi"/>
+          <w:lang w:val="en-US"/>
+        </w:rPr>
+        <w:t xml:space="preserve"> Domain randomization varies appearance [23] or dynamics [24] uniformly within hand-set ranges, and SimOpt [25] adapts the randomization distribution from a few real rollouts. Domain adaptation aligns sim and real features in co-training [26]. Frozen encoders (DINOv2 [27]) make twin and real samples comparable, and Phys2Real [28] trains with uncertainty over physical parameters. Still, a twin's own </w:t>
       </w:r>
       <w:r>
         <w:rPr>
@@ -4997,14 +4997,50 @@
           <w:b/>
           <w:lang w:val="en-US"/>
         </w:rPr>
-        <w:t xml:space="preserve">Collecting few real rollouts.</w:t>
-      </w:r>
-      <w:r>
-        <w:rPr>
-          <w:rFonts w:cstheme="minorHAnsi"/>
-          <w:lang w:val="en-US"/>
-        </w:rPr>
-        <w:t xml:space="preserve"> Active learning selects the most informative real samples for sim-to-real adaptation in grasping [28], AMF [29] chooses which tasks to demonstrate under a budget, and active experiment selection reduces the cost of real evaluation [30]. CUPID [31] and DataMIL [32] select training data by its influence on closed-loop success. Prediction-powered inference [33] combines many cheap predictions with a few labels, SureSim [34] applies it to simulated and real trials, and SIMPLER</w:t>
+        <w:t xml:space="preserve">Collecting few real data.</w:t>
+      </w:r>
+      <w:r>
+        <w:rPr>
+          <w:rFonts w:cstheme="minorHAnsi"/>
+          <w:lang w:val="en-US"/>
+        </w:rPr>
+        <w:t xml:space="preserve"> Active learning selects the most informative real samples for sim-to-real adaptation in grasping [29], AMF [30] chooses which tasks to demonstrate under a budget, and active experiment selection reduces the cost of real evaluation [31]. Prediction-powered inference [32] combines many cheap predictions with a few labels, SureSim [33] applies it to simulated and real trials, and SIMPLER [34] shows, on paired simulated and real evaluations, that simulation can track real performance of manipulation policies. GaussTwin [35] corrects a 3DGS twin from photometric error. They select demonstrations, tasks or trials, not the real data that should correct a twin and its policy.</w:t>
+      </w:r>
+    </w:p>
+    <w:p>
+      <w:pPr>
+        <w:spacing w:after="120" w:line="240" w:lineRule="auto"/>
+        <w:jc w:val="both"/>
+      </w:pPr>
+      <w:r>
+        <w:rPr>
+          <w:rFonts w:cstheme="minorHAnsi"/>
+          <w:b/>
+          <w:lang w:val="en-US"/>
+        </w:rPr>
+        <w:t xml:space="preserve">Research gap.</w:t>
+      </w:r>
+      <w:r>
+        <w:rPr>
+          <w:rFonts w:cstheme="minorHAnsi"/>
+          <w:lang w:val="en-US"/>
+        </w:rPr>
+        <w:t xml:space="preserve"> Real-to-sim-to-real works, but its real-data cost is set by hand and spent uniformly, and each study measures it in one domain. Missing are (i) task-aware, uncertainty-guided capture of both appearance and physical parameters, judged by downstream success rather than reconstruction or parameter accuracy (RQ1), (ii) learning driven by the twin's uncertainty and by representation distance to a small real set (RQ2), (iii) active selection of the few real data that correct the twin and the policy (RQ3), and (iv) a total real-data budget curve of the full loop against real-only learning, measured the same way in manipulation and navigation (RQ4).</w:t>
+      </w:r>
+    </w:p>
+    <w:p>
+      <w:pPr>
+        <w:keepNext/>
+        <w:spacing w:after="60" w:line="240" w:lineRule="auto"/>
+        <w:jc w:val="left"/>
+      </w:pPr>
+      <w:r>
+        <w:rPr>
+          <w:rFonts w:cstheme="minorHAnsi"/>
+          <w:b/>
+          <w:lang w:val="en-US"/>
+        </w:rPr>
+        <w:t xml:space="preserve">References</w:t>
       </w:r>
     </w:p>
     <w:p>
@@ -5018,56 +5054,7 @@
           <w:rFonts w:cstheme="minorHAnsi"/>
           <w:lang w:val="en-US"/>
         </w:rPr>
-        <w:t xml:space="preserve">[35] shows that simulated evaluation of manipulation policies can track real evaluation. GaussTwin [36]</w:t>
-      </w:r>
-    </w:p>
-    <w:p>
-      <w:pPr>
-        <w:spacing w:after="120" w:line="240" w:lineRule="auto"/>
-        <w:jc w:val="both"/>
-      </w:pPr>
-      <w:r>
-        <w:rPr>
-          <w:rFonts w:cstheme="minorHAnsi"/>
-          <w:lang w:val="en-US"/>
-        </w:rPr>
-        <w:t xml:space="preserve">corrects a 3DGS twin from photometric error. They select demonstrations, tasks or trials, not the real rollouts that should correct a reconstructed twin and its policy.</w:t>
-      </w:r>
-    </w:p>
-    <w:p>
-      <w:pPr>
-        <w:spacing w:after="120" w:line="240" w:lineRule="auto"/>
-        <w:jc w:val="both"/>
-      </w:pPr>
-      <w:r>
-        <w:rPr>
-          <w:rFonts w:cstheme="minorHAnsi"/>
-          <w:b/>
-          <w:lang w:val="en-US"/>
-        </w:rPr>
-        <w:t xml:space="preserve">Research gap.</w:t>
-      </w:r>
-      <w:r>
-        <w:rPr>
-          <w:rFonts w:cstheme="minorHAnsi"/>
-          <w:lang w:val="en-US"/>
-        </w:rPr>
-        <w:t xml:space="preserve"> Real-to-sim-to-real works, but its real-data cost is set by hand and spent uniformly. Missing are (i) task-aware, uncertainty-guided capture judged by downstream policy success rather than image quality (RQ1), (ii) training driven by reconstruction uncertainty and representation distance to a small real set (RQ2), (iii) active selection of the few real rollouts that correct the twin and the policy (RQ3), and (iv) a total real-data budget curve of the full loop against real-only learning, in navigation and manipulation (RQ4).</w:t>
-      </w:r>
-    </w:p>
-    <w:p>
-      <w:pPr>
-        <w:keepNext/>
-        <w:spacing w:after="60" w:line="240" w:lineRule="auto"/>
-        <w:jc w:val="left"/>
-      </w:pPr>
-      <w:r>
-        <w:rPr>
-          <w:rFonts w:cstheme="minorHAnsi"/>
-          <w:b/>
-          <w:lang w:val="en-US"/>
-        </w:rPr>
-        <w:t xml:space="preserve">References</w:t>
+        <w:t xml:space="preserve">[1] M. Savva et al., "Habitat," ICCV, 2019.</w:t>
       </w:r>
     </w:p>
     <w:p>
@@ -5081,7 +5068,7 @@
           <w:rFonts w:cstheme="minorHAnsi"/>
           <w:lang w:val="en-US"/>
         </w:rPr>
-        <w:t xml:space="preserve">[1] M. Savva et al., "Habitat," ICCV, 2019.</w:t>
+        <w:t xml:space="preserve">[2] B. Kerbl et al., "3D Gaussian Splatting," ACM TOG, 2023.</w:t>
       </w:r>
     </w:p>
     <w:p>
@@ -5095,7 +5082,7 @@
           <w:rFonts w:cstheme="minorHAnsi"/>
           <w:lang w:val="en-US"/>
         </w:rPr>
-        <w:t xml:space="preserve">[2] B. Kerbl et al., "3D Gaussian Splatting," ACM TOG, 2023.</w:t>
+        <w:t xml:space="preserve">[3] M. Torne et al., "Reconciling Reality through Simulation," RSS, 2024.</w:t>
       </w:r>
     </w:p>
     <w:p>
@@ -5109,7 +5096,7 @@
           <w:rFonts w:cstheme="minorHAnsi"/>
           <w:lang w:val="en-US"/>
         </w:rPr>
-        <w:t xml:space="preserve">[3] G. Chhablani et al., "EmbodiedSplat," ICCV, 2025.</w:t>
+        <w:t xml:space="preserve">[4] M. N. Qureshi et al., "SplatSim," ICRA, 2025.</w:t>
       </w:r>
     </w:p>
     <w:p>
@@ -5123,7 +5110,7 @@
           <w:rFonts w:cstheme="minorHAnsi"/>
           <w:lang w:val="en-US"/>
         </w:rPr>
-        <w:t xml:space="preserve">[4] Z. Xie et al., "Vid2Sim," CVPR, 2025.</w:t>
+        <w:t xml:space="preserve">[5] G. Chhablani et al., "EmbodiedSplat," ICCV, 2025.</w:t>
       </w:r>
     </w:p>
     <w:p>
@@ -5137,7 +5124,7 @@
           <w:rFonts w:cstheme="minorHAnsi"/>
           <w:lang w:val="en-US"/>
         </w:rPr>
-        <w:t xml:space="preserve">[5] A. Escontrela et al., "GaussGym," arXiv:2510.15352, 2025.</w:t>
+        <w:t xml:space="preserve">[6] Z. Xie et al., "Vid2Sim," CVPR, 2025.</w:t>
       </w:r>
     </w:p>
     <w:p>
@@ -5151,7 +5138,7 @@
           <w:rFonts w:cstheme="minorHAnsi"/>
           <w:lang w:val="en-US"/>
         </w:rPr>
-        <w:t xml:space="preserve">[6] M. Torne et al., "Reconciling Reality through Simulation," RSS, 2024.</w:t>
+        <w:t xml:space="preserve">[7] A. Escontrela et al., "GaussGym," arXiv:2510.15352, 2025.</w:t>
       </w:r>
     </w:p>
     <w:p>
@@ -5165,7 +5152,7 @@
           <w:rFonts w:cstheme="minorHAnsi"/>
           <w:lang w:val="en-US"/>
         </w:rPr>
-        <w:t xml:space="preserve">[7] M. N. Qureshi et al., "SplatSim," ICRA, 2025.</w:t>
+        <w:t xml:space="preserve">[8] S. Tao et al., "ManiSkill3," RSS, 2025.</w:t>
       </w:r>
     </w:p>
     <w:p>
@@ -5179,7 +5166,7 @@
           <w:rFonts w:cstheme="minorHAnsi"/>
           <w:lang w:val="en-US"/>
         </w:rPr>
-        <w:t xml:space="preserve">[8] S. Tao et al., "ManiSkill3," RSS, 2025.</w:t>
+        <w:t xml:space="preserve">[9] F. Ramos et al., "BayesSim," RSS, 2019.</w:t>
       </w:r>
     </w:p>
     <w:p>
@@ -5193,7 +5180,7 @@
           <w:rFonts w:cstheme="minorHAnsi"/>
           <w:lang w:val="en-US"/>
         </w:rPr>
-        <w:t xml:space="preserve">[9] F. Lin et al., "Data Scaling Laws in Imitation Learning…," ICLR, 2025.</w:t>
+        <w:t xml:space="preserve">[10] H. Jiang et al., "PhysTwin," ICCV, 2025.</w:t>
       </w:r>
     </w:p>
     <w:p>
@@ -5207,7 +5194,7 @@
           <w:rFonts w:cstheme="minorHAnsi"/>
           <w:lang w:val="en-US"/>
         </w:rPr>
-        <w:t xml:space="preserve">[10] L. Suomela et al., "Data Scaling for Navigation…," IEEE RA-L, 2026.</w:t>
+        <w:t xml:space="preserve">[11] F. Lin et al., "Data Scaling Laws in Imitation Learning…," ICLR, 2025.</w:t>
       </w:r>
     </w:p>
     <w:p>
@@ -5221,7 +5208,7 @@
           <w:rFonts w:cstheme="minorHAnsi"/>
           <w:lang w:val="en-US"/>
         </w:rPr>
-        <w:t xml:space="preserve">[11] M. Torne et al., "Robot Learning with Super-Linear Scaling," arXiv:2412.01770, 2024.</w:t>
+        <w:t xml:space="preserve">[12] L. Suomela et al., "Data Scaling for Navigation…," IEEE RA-L, 2026.</w:t>
       </w:r>
     </w:p>
     <w:p>
@@ -5235,7 +5222,7 @@
           <w:rFonts w:cstheme="minorHAnsi"/>
           <w:lang w:val="en-US"/>
         </w:rPr>
-        <w:t xml:space="preserve">[12] P. Dan et al., "X-Sim," arXiv:2505.07096, 2025.</w:t>
+        <w:t xml:space="preserve">[13] M. Torne et al., "Robot Learning with Super-Linear Scaling," arXiv:2412.01770, 2024.</w:t>
       </w:r>
     </w:p>
     <w:p>
@@ -5249,7 +5236,7 @@
           <w:rFonts w:cstheme="minorHAnsi"/>
           <w:lang w:val="en-US"/>
         </w:rPr>
-        <w:t xml:space="preserve">[13] A. Maddukuri et al., "Sim-and-Real Co-Training," RSS, 2025.</w:t>
+        <w:t xml:space="preserve">[14] P. Dan et al., "X-Sim," arXiv:2505.07096, 2025.</w:t>
       </w:r>
     </w:p>
     <w:p>
@@ -5263,7 +5250,7 @@
           <w:rFonts w:cstheme="minorHAnsi"/>
           <w:lang w:val="en-US"/>
         </w:rPr>
-        <w:t xml:space="preserve">[14] A. Kadian et al., "Sim2Real Predictivity," IEEE RA-L, 2020.</w:t>
+        <w:t xml:space="preserve">[15] A. Maddukuri et al., "Sim-and-Real Co-Training," RSS, 2025.</w:t>
       </w:r>
     </w:p>
     <w:p>
@@ -5277,7 +5264,7 @@
           <w:rFonts w:cstheme="minorHAnsi"/>
           <w:lang w:val="en-US"/>
         </w:rPr>
-        <w:t xml:space="preserve">[15] J. Truong et al., "Rethinking Sim2Real," CoRL, 2022.</w:t>
+        <w:t xml:space="preserve">[16] J. Truong et al., "Rethinking Sim2Real," CoRL, 2022.</w:t>
       </w:r>
     </w:p>
     <w:p>
@@ -5291,7 +5278,7 @@
           <w:rFonts w:cstheme="minorHAnsi"/>
           <w:lang w:val="en-US"/>
         </w:rPr>
-        <w:t xml:space="preserve">[16] W. Jiang et al., "FisherRF," ECCV, 2024.</w:t>
+        <w:t xml:space="preserve">[17] W. Jiang et al., "FisherRF," ECCV, 2024.</w:t>
       </w:r>
     </w:p>
     <w:p>
@@ -5305,7 +5292,7 @@
           <w:rFonts w:cstheme="minorHAnsi"/>
           <w:lang w:val="en-US"/>
         </w:rPr>
-        <w:t xml:space="preserve">[17] X. Chen et al., "GenNBV," CVPR, 2024.</w:t>
+        <w:t xml:space="preserve">[18] X. Chen et al., "GenNBV," CVPR, 2024.</w:t>
       </w:r>
     </w:p>
     <w:p>
@@ -5319,7 +5306,7 @@
           <w:rFonts w:cstheme="minorHAnsi"/>
           <w:lang w:val="en-US"/>
         </w:rPr>
-        <w:t xml:space="preserve">[18] L. Goli et al., "Bayes' Rays," CVPR, 2024.</w:t>
+        <w:t xml:space="preserve">[19] L. Goli et al., "Bayes' Rays," CVPR, 2024.</w:t>
       </w:r>
     </w:p>
     <w:p>
@@ -5333,7 +5320,7 @@
           <w:rFonts w:cstheme="minorHAnsi"/>
           <w:lang w:val="en-US"/>
         </w:rPr>
-        <w:t xml:space="preserve">[19] G. Liu et al., "Risk-Aware Active View Acquisition…," arXiv:2403.11396, 2024.</w:t>
+        <w:t xml:space="preserve">[20] G. Liu et al., "Risk-Aware Active View Acquisition…," arXiv:2403.11396, 2024.</w:t>
       </w:r>
     </w:p>
     <w:p>
@@ -5347,7 +5334,7 @@
           <w:rFonts w:cstheme="minorHAnsi"/>
           <w:lang w:val="en-US"/>
         </w:rPr>
-        <w:t xml:space="preserve">[20] C. Yeshwanth et al., "ScanNet++," ICCV, 2023.</w:t>
+        <w:t xml:space="preserve">[21] M. Memmel et al., "ASID," arXiv:2404.12308, 2024.</w:t>
       </w:r>
     </w:p>
     <w:p>
@@ -5361,7 +5348,7 @@
           <w:rFonts w:cstheme="minorHAnsi"/>
           <w:lang w:val="en-US"/>
         </w:rPr>
-        <w:t xml:space="preserve">[21] J. Tobin et al., "Domain Randomization…," IROS, 2017.</w:t>
+        <w:t xml:space="preserve">[22] C. Yeshwanth et al., "ScanNet++," ICCV, 2023.</w:t>
       </w:r>
     </w:p>
     <w:p>
@@ -5375,7 +5362,7 @@
           <w:rFonts w:cstheme="minorHAnsi"/>
           <w:lang w:val="en-US"/>
         </w:rPr>
-        <w:t xml:space="preserve">[22] X. B. Peng et al., "Sim-to-Real Transfer… with Dynamics Randomization," ICRA, 2018.</w:t>
+        <w:t xml:space="preserve">[23] J. Tobin et al., "Domain Randomization…," IROS, 2017.</w:t>
       </w:r>
     </w:p>
     <w:p>
@@ -5389,7 +5376,7 @@
           <w:rFonts w:cstheme="minorHAnsi"/>
           <w:lang w:val="en-US"/>
         </w:rPr>
-        <w:t xml:space="preserve">[23] Y. Chebotar et al., "Closing the Sim-to-Real Loop," ICRA, 2019.</w:t>
+        <w:t xml:space="preserve">[24] X. B. Peng et al., "Sim-to-Real Transfer… with Dynamics Randomization," ICRA, 2018.</w:t>
       </w:r>
     </w:p>
     <w:p>
@@ -5403,7 +5390,7 @@
           <w:rFonts w:cstheme="minorHAnsi"/>
           <w:lang w:val="en-US"/>
         </w:rPr>
-        <w:t xml:space="preserve">[24] S. Cheng et al., "Generalizable Domain Adaptation for Sim-and-Real…," NeurIPS, 2025.</w:t>
+        <w:t xml:space="preserve">[25] Y. Chebotar et al., "Closing the Sim-to-Real Loop," ICRA, 2019.</w:t>
       </w:r>
     </w:p>
     <w:p>
@@ -5417,7 +5404,7 @@
           <w:rFonts w:cstheme="minorHAnsi"/>
           <w:lang w:val="en-US"/>
         </w:rPr>
-        <w:t xml:space="preserve">[25] Y. Lei et al., "A Mechanistic Analysis of Sim-and-Real Co-Training…," arXiv:2604.13645, 2026.</w:t>
+        <w:t xml:space="preserve">[26] S. Cheng et al., "Generalizable Domain Adaptation for Sim-and-Real…," NeurIPS, 2025.</w:t>
       </w:r>
     </w:p>
     <w:p>
@@ -5431,7 +5418,7 @@
           <w:rFonts w:cstheme="minorHAnsi"/>
           <w:lang w:val="en-US"/>
         </w:rPr>
-        <w:t xml:space="preserve">[26] M. Oquab et al., "DINOv2," TMLR, 2024.</w:t>
+        <w:t xml:space="preserve">[27] M. Oquab et al., "DINOv2," TMLR, 2024.</w:t>
       </w:r>
     </w:p>
     <w:p>
@@ -5445,7 +5432,7 @@
           <w:rFonts w:cstheme="minorHAnsi"/>
           <w:lang w:val="en-US"/>
         </w:rPr>
-        <w:t xml:space="preserve">[27] M. Wang et al., "Phys2Real," arXiv:2510.11689, 2025.</w:t>
+        <w:t xml:space="preserve">[28] M. Wang et al., "Phys2Real," arXiv:2510.11689, 2025.</w:t>
       </w:r>
     </w:p>
     <w:p>
@@ -5459,7 +5446,7 @@
           <w:rFonts w:cstheme="minorHAnsi"/>
           <w:lang w:val="en-US"/>
         </w:rPr>
-        <w:t xml:space="preserve">[28] M. Gilles et al., "MetaMVUC," IEEE RA-L, 2025.</w:t>
+        <w:t xml:space="preserve">[29] M. Gilles et al., "MetaMVUC," IEEE RA-L, 2025.</w:t>
       </w:r>
     </w:p>
     <w:p>
@@ -5473,7 +5460,7 @@
           <w:rFonts w:cstheme="minorHAnsi"/>
           <w:lang w:val="en-US"/>
         </w:rPr>
-        <w:t xml:space="preserve">[29] M. Bagatella et al., "Active Fine-Tuning of Multi-Task Policies," ICML, 2025.</w:t>
+        <w:t xml:space="preserve">[30] M. Bagatella et al., "Active Fine-Tuning of Multi-Task Policies," ICML, 2025.</w:t>
       </w:r>
     </w:p>
     <w:p>
@@ -5487,7 +5474,7 @@
           <w:rFonts w:cstheme="minorHAnsi"/>
           <w:lang w:val="en-US"/>
         </w:rPr>
-        <w:t xml:space="preserve">[30] A. Anwar et al., "Efficient Evaluation of Multi-Task Robot Policies…," arXiv:2502.09829, 2025.</w:t>
+        <w:t xml:space="preserve">[31] A. Anwar et al., "Efficient Evaluation of Multi-Task Robot Policies…," arXiv:2502.09829, 2025.</w:t>
       </w:r>
     </w:p>
     <w:p>
@@ -5501,7 +5488,7 @@
           <w:rFonts w:cstheme="minorHAnsi"/>
           <w:lang w:val="en-US"/>
         </w:rPr>
-        <w:t xml:space="preserve">[31] C. Agia et al., "CUPID," arXiv:2506.19121, 2025.</w:t>
+        <w:t xml:space="preserve">[32] A. N. Angelopoulos et al., "Prediction-Powered Inference," Science, 2023.</w:t>
       </w:r>
     </w:p>
     <w:p>
@@ -5515,7 +5502,7 @@
           <w:rFonts w:cstheme="minorHAnsi"/>
           <w:lang w:val="en-US"/>
         </w:rPr>
-        <w:t xml:space="preserve">[32] S. Dass et al., "DataMIL," arXiv:2505.09603, 2025.</w:t>
+        <w:t xml:space="preserve">[33] A. Badithela et al., "Reliable and Scalable Robot Policy Evaluation…," arXiv:2510.04354, 2025.</w:t>
       </w:r>
     </w:p>
     <w:p>
@@ -5529,7 +5516,7 @@
           <w:rFonts w:cstheme="minorHAnsi"/>
           <w:lang w:val="en-US"/>
         </w:rPr>
-        <w:t xml:space="preserve">[33] A. N. Angelopoulos et al., "Prediction-Powered Inference," Science, 2023.</w:t>
+        <w:t xml:space="preserve">[34] X. Li et al., "Evaluating Real-World Robot Manipulation Policies…," CoRL, 2024.</w:t>
       </w:r>
     </w:p>
     <w:p>
@@ -5543,35 +5530,7 @@
           <w:rFonts w:cstheme="minorHAnsi"/>
           <w:lang w:val="en-US"/>
         </w:rPr>
-        <w:t xml:space="preserve">[34] A. Badithela et al., "Reliable and Scalable Robot Policy Evaluation…," arXiv:2510.04354, 2025.</w:t>
-      </w:r>
-    </w:p>
-    <w:p>
-      <w:pPr>
-        <w:spacing w:after="0" w:line="240" w:lineRule="auto"/>
-        <w:ind w:left="397" w:hanging="397"/>
-        <w:jc w:val="left"/>
-      </w:pPr>
-      <w:r>
-        <w:rPr>
-          <w:rFonts w:cstheme="minorHAnsi"/>
-          <w:lang w:val="en-US"/>
-        </w:rPr>
-        <w:t xml:space="preserve">[35] X. Li et al., "Evaluating Real-World Robot Manipulation Policies…," CoRL, 2024.</w:t>
-      </w:r>
-    </w:p>
-    <w:p>
-      <w:pPr>
-        <w:spacing w:after="0" w:line="240" w:lineRule="auto"/>
-        <w:ind w:left="397" w:hanging="397"/>
-        <w:jc w:val="left"/>
-      </w:pPr>
-      <w:r>
-        <w:rPr>
-          <w:rFonts w:cstheme="minorHAnsi"/>
-          <w:lang w:val="en-US"/>
-        </w:rPr>
-        <w:t xml:space="preserve">[36] Y. Cai et al., "GaussTwin," arXiv:2603.05108, 2026.</w:t>
+        <w:t xml:space="preserve">[35] Y. Cai et al., "GaussTwin," arXiv:2603.05108, 2026.</w:t>
       </w:r>
     </w:p>
     <w:permEnd w:id="174659581"/>
@@ -5828,7 +5787,7 @@
           <w:rFonts w:cstheme="minorHAnsi"/>
           <w:lang w:val="en-US"/>
         </w:rPr>
-        <w:t xml:space="preserve">: capture only what the policy needs to build the twin, train so that the policy is robust to what the twin got wrong, and collect only the few real rollouts that close the remaining gap. Reconstruction uncertainty and the policy's own representations guide all three steps. Testbeds: navigation (primary), manipulation (cross-task).</w:t>
+        <w:t xml:space="preserve">: collect only the data the task needs to build the twin, learn so that the policy or model is robust to what the twin got wrong, and collect only the few real-world data that close the remaining gap. The twin's uncertainty and the model's own representations guide all three steps. Testbeds (equal status, same settings): robotic manipulation and visual navigation.</w:t>
       </w:r>
     </w:p>
     <w:p>
@@ -5849,22 +5808,22 @@
           <w:rFonts w:cstheme="minorHAnsi"/>
           <w:lang w:val="en-US"/>
         </w:rPr>
-        <w:t xml:space="preserve"> On ≥ 20 public indoor scenes (e.g. ScanNet++; 10 held out from all tuning), a </w:t>
-      </w:r>
-      <w:r>
-        <w:rPr>
-          <w:rFonts w:cstheme="minorHAnsi"/>
-          <w:b/>
-          <w:lang w:val="en-US"/>
-        </w:rPr>
-        <w:t xml:space="preserve">reference built from the laser scan and DSLR images plays "reality"</w:t>
-      </w:r>
-      <w:r>
-        <w:rPr>
-          <w:rFonts w:cstheme="minorHAnsi"/>
-          <w:lang w:val="en-US"/>
-        </w:rPr>
-        <w:t xml:space="preserve">; a 3D Gaussian Splatting </w:t>
+        <w:t xml:space="preserve"> In each testbed a </w:t>
+      </w:r>
+      <w:r>
+        <w:rPr>
+          <w:rFonts w:cstheme="minorHAnsi"/>
+          <w:b/>
+          <w:lang w:val="en-US"/>
+        </w:rPr>
+        <w:t xml:space="preserve">reference from a separate, higher-fidelity source plays "reality"</w:t>
+      </w:r>
+      <w:r>
+        <w:rPr>
+          <w:rFonts w:cstheme="minorHAnsi"/>
+          <w:lang w:val="en-US"/>
+        </w:rPr>
+        <w:t xml:space="preserve">, and the </w:t>
       </w:r>
       <w:r>
         <w:rPr>
@@ -5879,7 +5838,7 @@
           <w:rFonts w:cstheme="minorHAnsi"/>
           <w:lang w:val="en-US"/>
         </w:rPr>
-        <w:t xml:space="preserve"> built from a subset of the separate phone capture is the training simulator, so twin and reference share neither images nor reconstruction method. Real data is counted exactly: capture = views given to the twin, real rollouts and demonstrations = episodes in the reference, summed in one operator-time cost at a fixed rate. SR = success rate in the reference. Tier A decides; tiers B (public real-world data) and C (real robot) only report agreement. Tests are one-sided, α = 0.05, bootstrapped over scenes and seeds, Holm-corrected within each hypothesis and pre-registered.</w:t>
+        <w:t xml:space="preserve"> (neural reconstruction plus system identification) is built from a subset of a separate, cheaper capture, so the two share no data. Navigation: ≥ 20 public indoor scenes (10 held out), laser-scan and DSLR reference, twin from the phone capture. Manipulation: a physics simulator with held-out physical parameters and its own rendering, the weaker proxy, checked by tier B (published paired sim/real evaluations of real policies). Real data: capture = views and interaction samples given to the twin, real trials and demonstrations = episodes in the reference, summed in one operator-time cost. Metric P: task success rate in the reference. Tier A decides H1–H3 in both testbeds; tiers B and C (real robot) report agreement. Tests: one-sided, α = 0.05, scene/seed bootstrap, Holm-corrected per hypothesis, pre-registered.</w:t>
       </w:r>
     </w:p>
     <w:p>
@@ -5900,7 +5859,7 @@
           <w:rFonts w:cstheme="minorHAnsi"/>
           <w:lang w:val="en-US"/>
         </w:rPr>
-        <w:t xml:space="preserve"> How little capture does a twin good enough for policy learning need, and can the task guide the capture?</w:t>
+        <w:t xml:space="preserve"> How little real data does a useful twin need, and can the task guide it?</w:t>
       </w:r>
     </w:p>
     <w:p>
@@ -5921,7 +5880,7 @@
           <w:rFonts w:cstheme="minorHAnsi"/>
           <w:lang w:val="en-US"/>
         </w:rPr>
-        <w:t xml:space="preserve"> Task-aware, uncertainty-guided capture (next views chosen where task-relevant regions have high reconstruction uncertainty) reaches the SR of uniform capture with ≥ 40% fewer views. </w:t>
+        <w:t xml:space="preserve"> Task-aware, uncertainty-guided capture (next data where task-relevant parts of the twin are most uncertain) reaches the P of uniform capture with ≥ 40% less capture. </w:t>
       </w:r>
       <w:r>
         <w:rPr>
@@ -5936,7 +5895,7 @@
           <w:rFonts w:cstheme="minorHAnsi"/>
           <w:lang w:val="en-US"/>
         </w:rPr>
-        <w:t xml:space="preserve"> on fitted capture–SR curves, C_task(τ₁) ≤ 0.6 · C_uniform(τ₁), and the upper 95% bound of C_task / C_recon (reconstruction-only view selection) is &lt; 1; τ₁ = SR of uniform capture at its largest budget.</w:t>
+        <w:t xml:space="preserve"> on fitted capture–P curves, C_task(τ₁) ≤ 0.6 · C_uniform(τ₁), and the upper 95% bound of C_task / C_recon (task-blind uncertainty selection) is &lt; 1; τ₁ = P of uniform capture at its largest budget.</w:t>
       </w:r>
     </w:p>
     <w:p>
@@ -5950,14 +5909,14 @@
           <w:b/>
           <w:lang w:val="en-US"/>
         </w:rPr>
-        <w:t xml:space="preserve">RQ2 (in sim: train robustly on an imperfect twin).</w:t>
-      </w:r>
-      <w:r>
-        <w:rPr>
-          <w:rFonts w:cstheme="minorHAnsi"/>
-          <w:lang w:val="en-US"/>
-        </w:rPr>
-        <w:t xml:space="preserve"> How should a policy be trained to be robust to the twin's reconstruction errors?</w:t>
+        <w:t xml:space="preserve">RQ2 (in sim: learn robustly in an imperfect twin).</w:t>
+      </w:r>
+      <w:r>
+        <w:rPr>
+          <w:rFonts w:cstheme="minorHAnsi"/>
+          <w:lang w:val="en-US"/>
+        </w:rPr>
+        <w:t xml:space="preserve"> How should learning in the twin be made robust to its errors?</w:t>
       </w:r>
     </w:p>
     <w:p>
@@ -5978,7 +5937,7 @@
           <w:rFonts w:cstheme="minorHAnsi"/>
           <w:lang w:val="en-US"/>
         </w:rPr>
-        <w:t xml:space="preserve"> Uncertainty-aware training (augmentation and sample weights from per-region reconstruction uncertainty and from the representation distance to a few held-out capture images) improves real transfer over uniform domain randomization at an equal capture budget. </w:t>
+        <w:t xml:space="preserve"> Uncertainty-aware training (augmentation and sample weights from the twin's uncertainty and from the representation distance to a few held-out real samples) improves transfer over uniform domain randomization at an equal capture budget. </w:t>
       </w:r>
       <w:r>
         <w:rPr>
@@ -5993,7 +5952,7 @@
           <w:rFonts w:cstheme="minorHAnsi"/>
           <w:lang w:val="en-US"/>
         </w:rPr>
-        <w:t xml:space="preserve"> mean paired SR gain ≥ 10 pp on held-out scenes, lower 95% bound &gt; 0, at each of ≥ 2 capture budgets.</w:t>
+        <w:t xml:space="preserve"> mean paired P gain ≥ 10 pp on held-out scenes, lower 95% bound &gt; 0, at each of ≥ 2 capture budgets.</w:t>
       </w:r>
     </w:p>
     <w:p>
@@ -6007,14 +5966,14 @@
           <w:b/>
           <w:lang w:val="en-US"/>
         </w:rPr>
-        <w:t xml:space="preserve">RQ3 (sim → real: collect few real rollouts).</w:t>
-      </w:r>
-      <w:r>
-        <w:rPr>
-          <w:rFonts w:cstheme="minorHAnsi"/>
-          <w:lang w:val="en-US"/>
-        </w:rPr>
-        <w:t xml:space="preserve"> Which few real rollouts close the remaining gap, and how should they correct the twin and the policy?</w:t>
+        <w:t xml:space="preserve">RQ3 (sim → real: few real data).</w:t>
+      </w:r>
+      <w:r>
+        <w:rPr>
+          <w:rFonts w:cstheme="minorHAnsi"/>
+          <w:lang w:val="en-US"/>
+        </w:rPr>
+        <w:t xml:space="preserve"> Which few real-world data close the remaining gap, and how should they correct twin and model?</w:t>
       </w:r>
     </w:p>
     <w:p>
@@ -6035,7 +5994,7 @@
           <w:rFonts w:cstheme="minorHAnsi"/>
           <w:lang w:val="en-US"/>
         </w:rPr>
-        <w:t xml:space="preserve"> Real rollouts selected actively (by predicted gap or uncertainty) and used for twin and policy correction reach the target SR with ≥ 50% fewer rollouts than random selection. </w:t>
+        <w:t xml:space="preserve"> Actively selected real trials (by predicted gap or uncertainty), used to correct twin and model, reach the target P with ≥ 50% fewer than random selection. </w:t>
       </w:r>
       <w:r>
         <w:rPr>
@@ -6050,7 +6009,7 @@
           <w:rFonts w:cstheme="minorHAnsi"/>
           <w:lang w:val="en-US"/>
         </w:rPr>
-        <w:t xml:space="preserve"> N_active(τ₃) ≤ 0.5 · N_random(τ₃) on fitted rollout–SR curves, upper 95% bound of the ratio &lt; 1; τ₃ = SR of random selection at its largest budget.</w:t>
+        <w:t xml:space="preserve"> N_active(τ₃) ≤ 0.5 · N_random(τ₃) on fitted trial–P curves, upper 95% bound of the ratio &lt; 1; τ₃ = P of random selection at its largest budget.</w:t>
       </w:r>
     </w:p>
     <w:p>
@@ -6064,14 +6023,14 @@
           <w:b/>
           <w:lang w:val="en-US"/>
         </w:rPr>
-        <w:t xml:space="preserve">RQ4 (whole loop: budget and generalization).</w:t>
-      </w:r>
-      <w:r>
-        <w:rPr>
-          <w:rFonts w:cstheme="minorHAnsi"/>
-          <w:lang w:val="en-US"/>
-        </w:rPr>
-        <w:t xml:space="preserve"> What real-data budget does the full loop need compared with real-only learning, and does it hold beyond navigation?</w:t>
+        <w:t xml:space="preserve">RQ4 (whole loop: budget and generality).</w:t>
+      </w:r>
+      <w:r>
+        <w:rPr>
+          <w:rFonts w:cstheme="minorHAnsi"/>
+          <w:lang w:val="en-US"/>
+        </w:rPr>
+        <w:t xml:space="preserve"> What real-data budget does the full loop need versus real-only learning, across domains?</w:t>
       </w:r>
     </w:p>
     <w:p>
@@ -6092,7 +6051,7 @@
           <w:rFonts w:cstheme="minorHAnsi"/>
           <w:lang w:val="en-US"/>
         </w:rPr>
-        <w:t xml:space="preserve"> (a) The full loop (H1–H3 combined) reaches the target SR with ≤ 10% of the real data needed by real-only learning (imitation of demonstrations collected in the reference, same encoder and initialization). </w:t>
+        <w:t xml:space="preserve"> (a) In each testbed the full loop (H1–H3) reaches the target P with ≤ 10% of the real data needed by real-only learning (imitation of demonstrations in the reference, same encoder and initialization). </w:t>
       </w:r>
       <w:r>
         <w:rPr>
@@ -6107,7 +6066,7 @@
           <w:rFonts w:cstheme="minorHAnsi"/>
           <w:lang w:val="en-US"/>
         </w:rPr>
-        <w:t xml:space="preserve"> B_loop(τ₄) ≤ 0.1 · B_real(τ₄), upper 95% bound of the ratio &lt; 0.2; τ₄ = SR of real-only learning at its largest budget. The curve is also reported for a uniform loop and for a world model as the simulator. (b) With the three allocation methods and their hyperparameters unchanged, on manipulation B_loop / B_real has an upper 95% bound &lt; 1 and the H1–H3 effects keep their sign.</w:t>
+        <w:t xml:space="preserve"> B_loop(τ₄) ≤ 0.1 · B_real(τ₄), upper 95% bound of the ratio &lt; 0.2; τ₄ = P of real-only learning at its largest budget; also reported: a uniform loop and a world-model simulator. (b) This holds in both testbeds with the allocation methods and their hyperparameters unchanged, the H1–H3 effects keep their sign, and tier B agrees in direction.</w:t>
       </w:r>
     </w:p>
     <w:p>
@@ -6128,7 +6087,7 @@
           <w:rFonts w:cstheme="minorHAnsi"/>
           <w:lang w:val="en-US"/>
         </w:rPr>
-        <w:t xml:space="preserve"> A hypothesis holds when all its parts pass on tier A; a failed one is reported as a measured budget curve and does not block the next step, which has its own baseline.</w:t>
+        <w:t xml:space="preserve"> A hypothesis holds when all its parts pass; a failed one is reported as a measured budget curve and does not block the next step.</w:t>
       </w:r>
     </w:p>
     <w:permEnd w:id="1295260508"/>
@@ -6453,7 +6412,7 @@
           <w:rFonts w:cstheme="minorHAnsi"/>
           <w:lang w:val="en-US"/>
         </w:rPr>
-        <w:t xml:space="preserve"> of embodied policies with digital twins built by neural reconstruction of real scenes, and how to make this loop work with </w:t>
+        <w:t xml:space="preserve"> in general, task- and domain-agnostic: building a digital twin (appearance, geometry and, where relevant, physical parameters) from limited real data, learning a policy or model in it and transferring the result back to reality, and how to make this loop work with </w:t>
       </w:r>
       <w:r>
         <w:rPr>
@@ -6504,7 +6463,7 @@
           <w:rFonts w:cstheme="minorHAnsi"/>
           <w:lang w:val="en-US"/>
         </w:rPr>
-        <w:t xml:space="preserve">, with a method for each step of the loop and measured real-data budget curves for navigation, where none have been published.</w:t>
+        <w:t xml:space="preserve">, with a method for each step of the loop and real-data budget curves measured with the same methods in two domains, robotic manipulation and visual navigation.</w:t>
       </w:r>
     </w:p>
     <w:p>
@@ -6546,7 +6505,7 @@
           <w:rFonts w:cstheme="minorHAnsi"/>
           <w:lang w:val="en-US"/>
         </w:rPr>
-        <w:t xml:space="preserve"> A task-aware capture method that chooses which real views to record for a twin from the reconstruction's uncertainty in the regions that matter for the policy, instead of for image quality alone, and a test of how much capture it saves against uniform and reconstruction-only view selection.</w:t>
+        <w:t xml:space="preserve"> A task-aware capture method that chooses which real data to collect for a twin (views for its appearance and geometry, interactions for its physical parameters) from the twin's uncertainty in the parts that matter for the task, instead of for reconstruction quality alone, and a test of how much capture it saves against uniform and task-blind selection.</w:t>
       </w:r>
     </w:p>
     <w:p>
@@ -6568,14 +6527,14 @@
           <w:b/>
           <w:lang w:val="en-US"/>
         </w:rPr>
-        <w:t xml:space="preserve">Train robustly on an imperfect twin (RQ2, H2).</w:t>
-      </w:r>
-      <w:r>
-        <w:rPr>
-          <w:rFonts w:cstheme="minorHAnsi"/>
-          <w:lang w:val="en-US"/>
-        </w:rPr>
-        <w:t xml:space="preserve"> An uncertainty-aware training method that turns per-region reconstruction uncertainty and the representation distance to a small set of real images into augmentation and sample weights, compared with uniform domain randomization at an equal capture budget.</w:t>
+        <w:t xml:space="preserve">Learn robustly in an imperfect twin (RQ2, H2).</w:t>
+      </w:r>
+      <w:r>
+        <w:rPr>
+          <w:rFonts w:cstheme="minorHAnsi"/>
+          <w:lang w:val="en-US"/>
+        </w:rPr>
+        <w:t xml:space="preserve"> An uncertainty-aware training method that turns the twin's per-region and per-parameter uncertainty and the representation distance to a small set of real samples into augmentation and sample weights, compared with uniform domain randomization at an equal capture budget.</w:t>
       </w:r>
     </w:p>
     <w:p>
@@ -6597,14 +6556,14 @@
           <w:b/>
           <w:lang w:val="en-US"/>
         </w:rPr>
-        <w:t xml:space="preserve">Collect few real rollouts (RQ3, H3).</w:t>
-      </w:r>
-      <w:r>
-        <w:rPr>
-          <w:rFonts w:cstheme="minorHAnsi"/>
-          <w:lang w:val="en-US"/>
-        </w:rPr>
-        <w:t xml:space="preserve"> An active selection method for real rollouts, driven by the predicted twin-to-real gap and its uncertainty, together with a procedure that uses the selected rollouts to correct both the twin and the policy, compared with random selection.</w:t>
+        <w:t xml:space="preserve">Transfer with few real data (RQ3, H3).</w:t>
+      </w:r>
+      <w:r>
+        <w:rPr>
+          <w:rFonts w:cstheme="minorHAnsi"/>
+          <w:lang w:val="en-US"/>
+        </w:rPr>
+        <w:t xml:space="preserve"> An active selection method for real-world trials or interactions, driven by the predicted twin-to-real gap and its uncertainty, and a procedure that uses them to correct both the twin and the learned model, compared with random selection.</w:t>
       </w:r>
     </w:p>
     <w:p>
@@ -6633,7 +6592,7 @@
           <w:rFonts w:cstheme="minorHAnsi"/>
           <w:lang w:val="en-US"/>
         </w:rPr>
-        <w:t xml:space="preserve"> Budget–performance curves of the full loop that give the "exchange rate" between twin and real data (how much real data the loop needs, relative to learning from real data only, to reach a given real success rate), compared with a uniform loop and a world model as the simulator, and a test of whether the methods carry over unchanged to manipulation.</w:t>
+        <w:t xml:space="preserve"> Budget–performance curves of the full loop that give the "exchange rate" between twin and real data (how much real data the loop needs, relative to learning from real data only, to reach a given real task performance), and a test of whether the methods hold unchanged in both domains.</w:t>
       </w:r>
     </w:p>
     <w:p>
@@ -6675,7 +6634,7 @@
           <w:rFonts w:cstheme="minorHAnsi"/>
           <w:lang w:val="en-US"/>
         </w:rPr>
-        <w:t xml:space="preserve"> A proxy-reality protocol on public scene datasets that counts real data exactly without a robot (a laser-scan reference as "reality", a low-budget twin from a separate capture as the simulator), and open-source code for the three methods and the budget curves, built on existing twin pipelines and simulators. It tells practitioners roughly how much to record and how many real trials to plan for a new site.</w:t>
+        <w:t xml:space="preserve"> A proxy-reality protocol on public data that counts real data exactly without a robot (a reference from a separate, higher-fidelity source as "reality", a low-budget twin from a separate capture as the simulator), applied in each domain, and open-source code for the three methods and the budget curves, built on existing twin pipelines and simulators. It tells practitioners roughly how much real data to collect for a new task or site.</w:t>
       </w:r>
     </w:p>
     <w:p>
@@ -6696,7 +6655,7 @@
           <w:rFonts w:cstheme="minorHAnsi"/>
           <w:lang w:val="en-US"/>
         </w:rPr>
-        <w:t xml:space="preserve"> Real target-domain data is the main cost of deploying learned systems, and models are increasingly trained on reconstructed or synthetic data and deployed on real sensor data. Methods that decide where real data is worth spending, and a measured estimate of how much of it a twin can replace, are relevant to active learning, learning under distribution shift and uncertainty estimation in general, beyond robotics.</w:t>
+        <w:t xml:space="preserve"> Real target-domain data is the main cost of deploying learned systems. Methods that decide where it is worth spending, and a measured estimate of how much of it a twin can replace, are relevant to active learning, learning under distribution shift and uncertainty estimation in general, beyond robotics.</w:t>
       </w:r>
     </w:p>
     <w:p>
@@ -6717,7 +6676,7 @@
           <w:rFonts w:cstheme="minorHAnsi"/>
           <w:lang w:val="en-US"/>
         </w:rPr>
-        <w:t xml:space="preserve"> Results are planned for peer-reviewed conferences worth 200 points and assigned to ITiT on the ministerial list of 5.01.2024: NeurIPS, ICML and ICLR (machine learning) and CVPR (computer vision), with ICCV and ECCV for resubmissions, as in §3, §11 and §12. P1 (RQ1–RQ2, task-aware capture and first uncertainty-aware training results) targets NeurIPS 2027; P2 (RQ3, active real-rollout selection and twin correction) ICML 2028 or CVPR 2028; P3 (RQ4, budget law and manipulation) NeurIPS 2028, with ICLR 2029 as the fallback.</w:t>
+        <w:t xml:space="preserve"> Results are planned for peer-reviewed conferences worth 200 points and assigned to ITiT on the ministerial list of 5.01.2024: NeurIPS, ICML and ICLR (machine learning) and CVPR (computer vision), with ICCV and ECCV for resubmissions. P1 (RQ1–RQ2, task-aware capture and first uncertainty-aware training results) targets NeurIPS 2027; P2 (RQ3, active selection of real data and twin correction) ICML 2028 or CVPR 2028; P3 (RQ4, budget curves in both domains) NeurIPS 2028, with ICLR 2029 as the fallback.</w:t>
       </w:r>
     </w:p>
     <w:permEnd w:id="1098318749"/>
@@ -6996,21 +6955,7 @@
           <w:rFonts w:cstheme="minorHAnsi"/>
           <w:lang w:val="en-US"/>
         </w:rPr>
-        <w:t xml:space="preserve">The research follows the real-to-sim-to-real loop: real capture → twin → policy training in the twin → a few real rollouts → correction of the twin and the policy → deployment. Four stages (I–IV) match §3 and the research questions of §7: capture less (RQ1), train robustly on an imperfect twin (RQ2), collect few real rollouts (RQ3), and measure the budget of the whole loop (RQ4). For each stage we give the method, data, metric and success criterion. Twins are built with existing open-source 3D Gaussian Splatting (3DGS)</w:t>
-      </w:r>
-    </w:p>
-    <w:p>
-      <w:pPr>
-        <w:spacing w:after="0" w:line="240" w:lineRule="auto"/>
-        <w:ind w:left="397" w:hanging="397"/>
-        <w:jc w:val="left"/>
-      </w:pPr>
-      <w:r>
-        <w:rPr>
-          <w:rFonts w:cstheme="minorHAnsi"/>
-          <w:lang w:val="en-US"/>
-        </w:rPr>
-        <w:t xml:space="preserve">[2] pipelines and simulators; the student develops neither a simulator nor a benchmark. Visual navigation is the</w:t>
+        <w:t xml:space="preserve">The research follows the loop: real data → twin → learning in the twin → a few real trials → correction of the twin and the policy → deployment. Four stages (I–IV) match §3 and the research questions of §7: capture less (RQ1), learn robustly in an imperfect twin (RQ2), collect few real data (RQ3), and measure the budget of the whole loop (RQ4). The methods are domain-agnostic: they act on the twin's uncertainty, on task relevance measured in the twin and on learned representations. The twin has two parts: geometry and appearance, reconstructed with existing open-source 3D Gaussian Splatting (3DGS) [2] pipelines, and physical or dynamic parameters, identified from real interactions as a posterior (BayesSim-type [9]). No simulator or benchmark is developed. Robotic manipulation and visual navigation are equal testbeds with the same protocol.</w:t>
       </w:r>
     </w:p>
     <w:p>
@@ -7021,19 +6966,6 @@
       <w:r>
         <w:rPr>
           <w:rFonts w:cstheme="minorHAnsi"/>
-          <w:lang w:val="en-US"/>
-        </w:rPr>
-        <w:t xml:space="preserve">primary task; manipulation is the cross-task test in Stage IV.</w:t>
-      </w:r>
-    </w:p>
-    <w:p>
-      <w:pPr>
-        <w:spacing w:after="120" w:line="240" w:lineRule="auto"/>
-        <w:jc w:val="both"/>
-      </w:pPr>
-      <w:r>
-        <w:rPr>
-          <w:rFonts w:cstheme="minorHAnsi"/>
           <w:b/>
           <w:lang w:val="en-US"/>
         </w:rPr>
@@ -7044,82 +6976,52 @@
           <w:rFonts w:cstheme="minorHAnsi"/>
           <w:lang w:val="en-US"/>
         </w:rPr>
-        <w:t xml:space="preserve"> The hypotheses are decided on public real scans, where real data can be counted. ScanNet++ [20] gives each scene a laser scan, DSLR images and a separate phone RGB-D stream. On ≥ 20 scenes (10 held out from all tuning), the </w:t>
-      </w:r>
-      <w:r>
-        <w:rPr>
-          <w:rFonts w:cstheme="minorHAnsi"/>
-          <w:b/>
-          <w:lang w:val="en-US"/>
-        </w:rPr>
-        <w:t xml:space="preserve">reference</w:t>
-      </w:r>
-      <w:r>
-        <w:rPr>
-          <w:rFonts w:cstheme="minorHAnsi"/>
-          <w:lang w:val="en-US"/>
-        </w:rPr>
-        <w:t xml:space="preserve"> is the laser-scan mesh textured from the DSLR images and rendered in Habitat [1] with a robot-camera model (height, field of view, noise); it plays "reality". The </w:t>
-      </w:r>
-      <w:r>
-        <w:rPr>
-          <w:rFonts w:cstheme="minorHAnsi"/>
-          <w:b/>
-          <w:lang w:val="en-US"/>
-        </w:rPr>
-        <w:t xml:space="preserve">training twin</w:t>
-      </w:r>
-      <w:r>
-        <w:rPr>
-          <w:rFonts w:cstheme="minorHAnsi"/>
-          <w:lang w:val="en-US"/>
-        </w:rPr>
-        <w:t xml:space="preserve"> is a 3DGS reconstruction from a subset of the phone stream, run in the simulator as a mesh (as in EmbodiedSplat [3]) or with a 3DGS renderer (GaussGym [5]), chosen in T3.1. Twin and reference share neither images nor reconstruction method. The largest capture budget stays below the full stream. Every unit of real data is countable: </w:t>
-      </w:r>
-      <w:r>
-        <w:rPr>
-          <w:rFonts w:cstheme="minorHAnsi"/>
-          <w:i/>
-          <w:lang w:val="en-US"/>
-        </w:rPr>
-        <w:t xml:space="preserve">capture</w:t>
-      </w:r>
-      <w:r>
-        <w:rPr>
-          <w:rFonts w:cstheme="minorHAnsi"/>
-          <w:lang w:val="en-US"/>
-        </w:rPr>
-        <w:t xml:space="preserve"> = views selected from the phone pool, </w:t>
-      </w:r>
-      <w:r>
-        <w:rPr>
-          <w:rFonts w:cstheme="minorHAnsi"/>
-          <w:i/>
-          <w:lang w:val="en-US"/>
-        </w:rPr>
-        <w:t xml:space="preserve">real rollouts</w:t>
-      </w:r>
-      <w:r>
-        <w:rPr>
-          <w:rFonts w:cstheme="minorHAnsi"/>
-          <w:lang w:val="en-US"/>
-        </w:rPr>
-        <w:t xml:space="preserve"> and </w:t>
-      </w:r>
-      <w:r>
-        <w:rPr>
-          <w:rFonts w:cstheme="minorHAnsi"/>
-          <w:i/>
-          <w:lang w:val="en-US"/>
-        </w:rPr>
-        <w:t xml:space="preserve">real demonstrations</w:t>
-      </w:r>
-      <w:r>
-        <w:rPr>
-          <w:rFonts w:cstheme="minorHAnsi"/>
-          <w:lang w:val="en-US"/>
-        </w:rPr>
-        <w:t xml:space="preserve"> = episodes in the reference; both are summed in one operator-time cost at a pre-registered rate. The proxy's own error is reported (reference renders vs. held-out real images: PSNR, LPIPS, depth error); every hypothesis is re-checked for sign with a second reference (3DGS from all DSLR images), and tier C checks the conclusions on a robot. </w:t>
+        <w:t xml:space="preserve"> In each testbed, "reality" is a reference from a separate, higher-fidelity source, and the twin is built from a subset of a separate, cheaper capture, so twin and reference share no data. </w:t>
+      </w:r>
+      <w:r>
+        <w:rPr>
+          <w:rFonts w:cstheme="minorHAnsi"/>
+          <w:i/>
+          <w:lang w:val="en-US"/>
+        </w:rPr>
+        <w:t xml:space="preserve">Navigation:</w:t>
+      </w:r>
+      <w:r>
+        <w:rPr>
+          <w:rFonts w:cstheme="minorHAnsi"/>
+          <w:lang w:val="en-US"/>
+        </w:rPr>
+        <w:t xml:space="preserve"> ScanNet++ [22] gives each scene a laser scan, DSLR images and a separate phone RGB-D stream. On ≥ 20 scenes (10 held out from all tuning), the reference is the laser-scan mesh textured from the DSLR images and rendered in Habitat [1] with a robot-camera model; the twin is 3DGS from a subset of the phone stream, run as a mesh (as in EmbodiedSplat [5]) or with a 3DGS renderer (GaussGym [7]); its physical part is the robot's actuation noise. Tasks: image-goal and point-goal navigation with a minimum geodesic distance set in a pilot so that P stays below its ceiling. </w:t>
+      </w:r>
+      <w:r>
+        <w:rPr>
+          <w:rFonts w:cstheme="minorHAnsi"/>
+          <w:i/>
+          <w:lang w:val="en-US"/>
+        </w:rPr>
+        <w:t xml:space="preserve">Manipulation:</w:t>
+      </w:r>
+      <w:r>
+        <w:rPr>
+          <w:rFonts w:cstheme="minorHAnsi"/>
+          <w:lang w:val="en-US"/>
+        </w:rPr>
+        <w:t xml:space="preserve"> ManiSkill3 [8] tasks (≥ 20 task–object configurations, 10 held out), where reality is the simulator with held-out ground-truth physical parameters (mass, friction, articulation) and its own rendering, and the twin is 3DGS from a subset of its views plus parameters identified from a few recorded interactions. Physics engine and object models are shared, so this is the weaker proxy (unmodelled dynamics are not tested); tier B checks it. </w:t>
+      </w:r>
+      <w:r>
+        <w:rPr>
+          <w:rFonts w:cstheme="minorHAnsi"/>
+          <w:i/>
+          <w:lang w:val="en-US"/>
+        </w:rPr>
+        <w:t xml:space="preserve">Both:</w:t>
+      </w:r>
+      <w:r>
+        <w:rPr>
+          <w:rFonts w:cstheme="minorHAnsi"/>
+          <w:lang w:val="en-US"/>
+        </w:rPr>
+        <w:t xml:space="preserve"> real data is counted exactly: capture = views and interaction samples given to the twin, real trials and demonstrations = episodes in the reference, summed in one operator-time cost at a pre-registered rate; the largest budget stays below the full capture. In navigation the proxy's error to held-out real images is reported (PSNR, LPIPS, depth) and each hypothesis is re-checked for sign with a second reference (3DGS from all DSLR images). </w:t>
       </w:r>
       <w:r>
         <w:rPr>
@@ -7134,22 +7036,7 @@
           <w:rFonts w:cstheme="minorHAnsi"/>
           <w:lang w:val="en-US"/>
         </w:rPr>
-        <w:t xml:space="preserve"> public real-world datasets and published paired sim/real results (SIMPLER [35]). </w:t>
-      </w:r>
-      <w:r>
-        <w:rPr>
-          <w:rFonts w:cstheme="minorHAnsi"/>
-          <w:i/>
-          <w:lang w:val="en-US"/>
-        </w:rPr>
-        <w:t xml:space="preserve">Tier C (validation only):</w:t>
-      </w:r>
-      <w:r>
-        <w:rPr>
-          <w:rFonts w:cstheme="minorHAnsi"/>
-          <w:lang w:val="en-US"/>
-        </w:rPr>
-        <w:t xml:space="preserve"> ≥ 2 PWr rooms captured with a phone or RGB-D camera and a mobile robot (planned cooperation with the K29 "Denali" Autonomous Robots Laboratory, agreement in T3.2). </w:t>
+        <w:t xml:space="preserve"> the twin must rank manipulation policies as published paired sim/real evaluations do (SIMPLER [34]). </w:t>
       </w:r>
       <w:r>
         <w:rPr>
@@ -7164,7 +7051,7 @@
           <w:rFonts w:cstheme="minorHAnsi"/>
           <w:lang w:val="en-US"/>
         </w:rPr>
-        <w:t xml:space="preserve"> WCSS Lem (NVIDIA H100) and PLGrid allocations (to be applied for). Tasks are image-goal and point-goal navigation with a pre-registered minimum geodesic distance, set in the T3.1 pilot so that SR stays below its ceiling; SPL is reported as well. Policies are small heads on frozen visual encoders, trained mainly by imitation of a shortest-path planner in the twin (PPO on a subset), which keeps the compute academic.</w:t>
+        <w:t xml:space="preserve"> WCSS Lem (NVIDIA H100), PLGrid (to be applied for). Policies are small heads on frozen visual encoders, trained mainly by imitation of a privileged expert in the twin (shortest-path planner; motion-planning expert), with reinforcement learning on a subset. P = task success rate.</w:t>
       </w:r>
     </w:p>
     <w:p>
@@ -7207,7 +7094,7 @@
           <w:rFonts w:cstheme="minorHAnsi"/>
           <w:lang w:val="en-US"/>
         </w:rPr>
-        <w:t xml:space="preserve"> per-region reconstruction uncertainty of the current twin (Fisher information [16] or a Bayes' Rays-type [18] field, adapted to 3DGS) is weighted by </w:t>
+        <w:t xml:space="preserve"> the twin's uncertainty, per region (Fisher information [17] or a Bayes' Rays-type [19] field, adapted to 3DGS) and per physical parameter (posterior spread), is weighted by </w:t>
       </w:r>
       <w:r>
         <w:rPr>
@@ -7222,7 +7109,7 @@
           <w:rFonts w:cstheme="minorHAnsi"/>
           <w:lang w:val="en-US"/>
         </w:rPr>
-        <w:t xml:space="preserve">: how often planner paths on sampled start–goal pairs pass through the region (geometry only, no training), or, as a variant, how much a pilot policy attends to it. The next views are chosen greedily where task-weighted uncertainty is highest, in rounds, until the budget is spent. Candidates are limited to the recorded pool; capture time is also estimated as a walking tour through the chosen viewpoints.</w:t>
+        <w:t xml:space="preserve"> measured in the current twin without training: how often expert trajectories pass through a region, and how much the expert's success changes across a parameter's posterior. The next views or interactions are chosen greedily where task-weighted uncertainty is highest until the budget is spent. Candidates come from the recorded pool; capture time is also estimated as a tour of the chosen views.</w:t>
       </w:r>
     </w:p>
     <w:p>
@@ -7251,7 +7138,7 @@
           <w:rFonts w:cstheme="minorHAnsi"/>
           <w:lang w:val="en-US"/>
         </w:rPr>
-        <w:t xml:space="preserve"> uniform subsampling of the capture, reconstruction-only next-best-view (FisherRF-type [16]) and risk-weighted view selection [19], at the same budget.</w:t>
+        <w:t xml:space="preserve"> uniform capture, task-blind uncertainty selection (FisherRF-type next-best-view [17]; ASID-type exploration for parameter accuracy [21]) and risk-weighted view selection [20], at the same budget.</w:t>
       </w:r>
     </w:p>
     <w:p>
@@ -7280,7 +7167,7 @@
           <w:rFonts w:cstheme="minorHAnsi"/>
           <w:lang w:val="en-US"/>
         </w:rPr>
-        <w:t xml:space="preserve"> budget–success-rate (SR) curves on tier A, with ≥ 4 capture budgets; capture needed to reach the SR that uniform capture reaches at the largest budget. Image fidelity (PSNR, LPIPS) is reported but is not the target.</w:t>
+        <w:t xml:space="preserve"> budget–P curves on tier A with ≥ 4 capture budgets per testbed; capture needed to reach the P that uniform capture reaches at the largest budget.</w:t>
       </w:r>
     </w:p>
     <w:p>
@@ -7309,7 +7196,7 @@
           <w:rFonts w:cstheme="minorHAnsi"/>
           <w:lang w:val="en-US"/>
         </w:rPr>
-        <w:t xml:space="preserve"> ≥ 40% fewer views than uniform capture at equal SR, and fewer than reconstruction-only selection (upper 95% bound of the ratio &lt; 1), as in §7.</w:t>
+        <w:t xml:space="preserve"> ≥ 40% less capture than uniform at equal P, and less than task-blind selection (upper 95% bound of the ratio &lt; 1), as in §7.</w:t>
       </w:r>
     </w:p>
     <w:p>
@@ -7323,7 +7210,7 @@
           <w:b/>
           <w:lang w:val="en-US"/>
         </w:rPr>
-        <w:t xml:space="preserve">Stage II – uncertainty-aware training on an imperfect twin (RQ2, H2; sem. 4).</w:t>
+        <w:t xml:space="preserve">Stage II – uncertainty-aware learning in an imperfect twin (RQ2, H2; sem. 4).</w:t>
       </w:r>
     </w:p>
     <w:p>
@@ -7352,7 +7239,7 @@
           <w:rFonts w:cstheme="minorHAnsi"/>
           <w:lang w:val="en-US"/>
         </w:rPr>
-        <w:t xml:space="preserve"> (a) augmentation whose strength follows per-region reconstruction uncertainty (appearance and geometry perturbations where the twin is unsure, little where it is sure); (b) down-weighting twin frames that lie far from a few real images in frozen DINOv2 [26] feature space (nearest-neighbour distance). The real images are a held-out slice of the capture, not used to fit the twin, and count towards the capture budget.</w:t>
+        <w:t xml:space="preserve"> (a) randomization whose strength follows the twin's uncertainty: appearance and geometry perturbations per region, and physical parameters sampled from their identified posterior instead of hand-set ranges; (b) down-weighting twin samples that lie far from a few real samples in frozen DINOv2 [27] feature space. The real samples are a held-out slice of the capture, not used to fit the twin, and count towards the budget.</w:t>
       </w:r>
     </w:p>
     <w:p>
@@ -7381,7 +7268,7 @@
           <w:rFonts w:cstheme="minorHAnsi"/>
           <w:lang w:val="en-US"/>
         </w:rPr>
-        <w:t xml:space="preserve"> uniform domain randomization [21] with tuned ranges, no randomization, and feature alignment [24] as an extra comparator; all at the same capture budget.</w:t>
+        <w:t xml:space="preserve"> uniform domain randomization of appearance [23] and dynamics [24] with tuned ranges, no randomization, and feature alignment [26] as an extra comparator; all at the same capture budget.</w:t>
       </w:r>
     </w:p>
     <w:p>
@@ -7410,7 +7297,7 @@
           <w:rFonts w:cstheme="minorHAnsi"/>
           <w:lang w:val="en-US"/>
         </w:rPr>
-        <w:t xml:space="preserve"> tier-A SR on held-out scenes, paired by scene; ≥ 10 pp higher SR than uniform domain randomization at an equal capture budget (lower 95% bound &gt; 0), at each of ≥ 2 budgets.</w:t>
+        <w:t xml:space="preserve"> tier-A P on held-out scenes, paired by scene; ≥ 10 pp higher P than uniform domain randomization at an equal capture budget (lower 95% bound &gt; 0), at each of ≥ 2 budgets.</w:t>
       </w:r>
     </w:p>
     <w:p>
@@ -7424,7 +7311,7 @@
           <w:b/>
           <w:lang w:val="en-US"/>
         </w:rPr>
-        <w:t xml:space="preserve">Stage III – few real rollouts and correction (RQ3, H3; end of sem. 4 – sem. 5).</w:t>
+        <w:t xml:space="preserve">Stage III – few real trials and correction (RQ3, H3; end of sem. 4 – sem. 5).</w:t>
       </w:r>
     </w:p>
     <w:p>
@@ -7453,7 +7340,7 @@
           <w:rFonts w:cstheme="minorHAnsi"/>
           <w:lang w:val="en-US"/>
         </w:rPr>
-        <w:t xml:space="preserve"> candidate real rollouts (start–goal pairs) are scored by the predicted twin-to-real gap: disagreement of a small policy ensemble, plus the reconstruction uncertainty along the planned path. The top-k are executed in reality (tier A: the reference twin).</w:t>
+        <w:t xml:space="preserve"> candidate real trials (start–goal pairs, object configurations) are scored by the predicted twin-to-real gap: disagreement of a small policy ensemble plus the twin's uncertainty along the planned trajectory. The top-k are executed in reality (tier A: the reference).</w:t>
       </w:r>
     </w:p>
     <w:p>
@@ -7482,7 +7369,7 @@
           <w:rFonts w:cstheme="minorHAnsi"/>
           <w:lang w:val="en-US"/>
         </w:rPr>
-        <w:t xml:space="preserve"> the rollouts (i) correct the twin, by re-capturing or re-weighting the regions where real and twin observations disagree (photometric correction in the style of [36]; re-captured views count towards the budget), and (ii) fine-tune the policy by co-training with the real rollouts [13]. Real SR is estimated from few trials with prediction-powered inference [33, 34].</w:t>
+        <w:t xml:space="preserve"> the trials (i) correct the twin, by re-capturing or re-weighting regions where real and twin observations disagree (photometric correction as in [35]; re-captured views are counted) and by updating the physical-parameter posterior [9, 25]; and (ii) fine-tune the policy by co-training with the real trials [15]. Real P is estimated from few trials with prediction-powered inference [32, 33].</w:t>
       </w:r>
     </w:p>
     <w:p>
@@ -7511,7 +7398,7 @@
           <w:rFonts w:cstheme="minorHAnsi"/>
           <w:lang w:val="en-US"/>
         </w:rPr>
-        <w:t xml:space="preserve"> random selection and uniform coverage of the same number of rollouts; related selection rules [28–30] as comparators where they apply.</w:t>
+        <w:t xml:space="preserve"> random selection and uniform coverage of the same number of trials; selection rules [29–31] where they apply.</w:t>
       </w:r>
     </w:p>
     <w:p>
@@ -7540,7 +7427,7 @@
           <w:rFonts w:cstheme="minorHAnsi"/>
           <w:lang w:val="en-US"/>
         </w:rPr>
-        <w:t xml:space="preserve"> the target SR is reached with ≥ 50% fewer real rollouts than random selection (upper 95% bound of the ratio &lt; 1).</w:t>
+        <w:t xml:space="preserve"> the target P is reached with ≥ 50% fewer real trials than random selection (upper 95% bound of the ratio &lt; 1).</w:t>
       </w:r>
     </w:p>
     <w:p>
@@ -7554,7 +7441,7 @@
           <w:b/>
           <w:lang w:val="en-US"/>
         </w:rPr>
-        <w:t xml:space="preserve">Stage IV – budget of the whole loop and cross-task test (RQ4, H4; sem. 6).</w:t>
+        <w:t xml:space="preserve">Stage IV – budget of the whole loop in both testbeds (RQ4, H4; sem. 6).</w:t>
       </w:r>
     </w:p>
     <w:p>
@@ -7583,7 +7470,7 @@
           <w:rFonts w:cstheme="minorHAnsi"/>
           <w:lang w:val="en-US"/>
         </w:rPr>
-        <w:t xml:space="preserve"> total real data (capture + rollouts, one operator-time cost) against real SR for the full loop (Stages I–III) and for </w:t>
+        <w:t xml:space="preserve"> total real data (capture + trials, one operator-time cost) against P for the full loop (Stages I–III) and for </w:t>
       </w:r>
       <w:r>
         <w:rPr>
@@ -7598,7 +7485,7 @@
           <w:rFonts w:cstheme="minorHAnsi"/>
           <w:lang w:val="en-US"/>
         </w:rPr>
-        <w:t xml:space="preserve">: imitation of planner demonstrations collected in the reference, with the same frozen encoder and initialization, the data-efficient real-only recipe (real-only PPO for completeness). The "exchange rate" is the ratio of the budgets that reach the target SR; real-only scaling results [9, 10] give the expected curve shapes. The curve is also reported for a uniform loop (no Stage I–III guidance) and for a released pretrained world model used as the simulator (comparator only; not trained).</w:t>
+        <w:t xml:space="preserve">: imitation of expert demonstrations collected in the reference with the same frozen encoder and initialization (real-only reinforcement learning also shown). The "exchange rate" is the ratio of the budgets that reach the target P; real-only scaling results [11, 12] suggest the curve shapes. The curve is also reported for a uniform loop and for a released pretrained world model as the simulator (not trained).</w:t>
       </w:r>
     </w:p>
     <w:p>
@@ -7620,35 +7507,6 @@
           <w:i/>
           <w:lang w:val="en-US"/>
         </w:rPr>
-        <w:t xml:space="preserve">Manipulation:</w:t>
-      </w:r>
-      <w:r>
-        <w:rPr>
-          <w:rFonts w:cstheme="minorHAnsi"/>
-          <w:lang w:val="en-US"/>
-        </w:rPr>
-        <w:t xml:space="preserve"> the three allocation methods, with hyperparameters unchanged, on public manipulation scenes (ManiSkill3 [8]): the simulator's own rendering plays "reality" and a 3DGS twin from a subset of its views is the training simulator. Physics is shared, so this tests the visual part of the loop, which is stated as a limitation; the policy learner is the task's standard one. Published paired sim/real results (SIMPLER [35]) check that the proxy ranks policies as reality does (tier B).</w:t>
-      </w:r>
-    </w:p>
-    <w:p>
-      <w:pPr>
-        <w:spacing w:after="40" w:line="240" w:lineRule="auto"/>
-        <w:ind w:left="284" w:hanging="284"/>
-        <w:jc w:val="both"/>
-      </w:pPr>
-      <w:r>
-        <w:rPr>
-          <w:rFonts w:cstheme="minorHAnsi"/>
-          <w:lang w:val="en-US"/>
-        </w:rPr>
-        <w:t xml:space="preserve">•	</w:t>
-      </w:r>
-      <w:r>
-        <w:rPr>
-          <w:rFonts w:cstheme="minorHAnsi"/>
-          <w:i/>
-          <w:lang w:val="en-US"/>
-        </w:rPr>
         <w:t xml:space="preserve">Success criterion (H4):</w:t>
       </w:r>
       <w:r>
@@ -7656,7 +7514,7 @@
           <w:rFonts w:cstheme="minorHAnsi"/>
           <w:lang w:val="en-US"/>
         </w:rPr>
-        <w:t xml:space="preserve"> the loop reaches the target SR with ≤ 10% of the real data needed by real-only learning (upper 95% bound of the ratio &lt; 0.2); on manipulation the ratio's upper bound is &lt; 1 and the H1–H3 effects keep their sign.</w:t>
+        <w:t xml:space="preserve"> with the three allocation methods and their hyperparameters unchanged (the learner is each task's standard one), in each testbed the loop reaches the target P with ≤ 10% of the real data needed by real-only learning (upper 95% bound of the ratio &lt; 0.2), the H1–H3 effects keep their sign, and tier B agrees in direction.</w:t>
       </w:r>
     </w:p>
     <w:p>
@@ -7677,7 +7535,7 @@
           <w:rFonts w:cstheme="minorHAnsi"/>
           <w:lang w:val="en-US"/>
         </w:rPr>
-        <w:t xml:space="preserve"> Two robot campaigns (sem. 5 and 7) in 2 PWr rooms: phone or RGB-D capture, twins, policies with uniform capture versus the loop, and the few selected real rollouts. About 8 robot-hours per campaign (3 policies × 2 rooms × 30 episodes at ~2 min each, plus 2 × 20 selected rollouts). Tier C is reported as agreement with tier A and is never used to tune thresholds.</w:t>
+        <w:t xml:space="preserve"> Two robot campaigns (sem. 5 and 7) with own phone or RGB-D captures at PWr: a mobile robot in 2 rooms and, where access is agreed, a tabletop manipulator. Uniform capture versus the loop, plus the few selected trials; about 8 robot-hours per campaign (3 policies × 2 settings × 30 episodes at ~2 min, plus 2 × 20 trials). Tier C reports agreement only and never tunes thresholds.</w:t>
       </w:r>
     </w:p>
     <w:p>
@@ -7698,7 +7556,7 @@
           <w:rFonts w:cstheme="minorHAnsi"/>
           <w:lang w:val="en-US"/>
         </w:rPr>
-        <w:t xml:space="preserve"> Tests follow §7. The protocol is pre-registered in the project repository before each stage, and changes are logged with reasons. Code and scripts are released where the dataset licences permit.</w:t>
+        <w:t xml:space="preserve"> Tests follow §7; the protocol is pre-registered before each stage and changes are logged. Code is released where the dataset licences permit.</w:t>
       </w:r>
     </w:p>
     <w:permEnd w:id="32011344"/>
@@ -7967,7 +7825,7 @@
           <w:rFonts w:cstheme="minorHAnsi"/>
           <w:lang w:val="pl-PL"/>
         </w:rPr>
-        <w:t xml:space="preserve">Roboty uczą się dziś samodzielnego działania, na przykład poruszania się po budynku lub chwytania przedmiotów, metodą prób i błędów. Potrzebują do tego bardzo wielu prób, więc zwykle ćwiczą w symulacji komputerowej. Coraz częściej jest nią cyfrowy bliźniak: wierna, fotorealistyczna kopia prawdziwego miejsca, którą metody sztucznej inteligencji potrafią odtworzyć z krótkiego nagrania. Powstaje w ten sposób pętla: nagrywamy prawdziwe miejsce, budujemy jego kopię, uczymy w niej robota, sprawdzamy go w rzeczywistości, poprawiamy i dopiero wtedy wdrażamy. Każdy z tych kroków wymaga jednak prawdziwych danych, czyli nagrań i prób w prawdziwym świecie, a ich zbieranie jest powolne i kosztowne.</w:t>
+        <w:t xml:space="preserve">Systemy sztucznej inteligencji, które działają w prawdziwym świecie, na przykład roboty chwytające przedmioty lub poruszające się po budynkach, uczą się na bardzo wielu przykładach i próbach. W rzeczywistości zbieranie takich danych jest powolne i kosztowne, dlatego systemy te często ćwiczą w symulacji komputerowej. Coraz częściej jest nią cyfrowy bliźniak: wierna kopia prawdziwego miejsca lub urządzenia, którą można odtworzyć z nagrań i pomiarów, łącznie z wyglądem, kształtem i tym, jak rzeczy się poruszają. Powstaje w ten sposób pętla: zbieramy dane w rzeczywistości, budujemy kopię, uczymy w niej system, sprawdzamy go w rzeczywistości, poprawiamy i dopiero wtedy wdrażamy. Każdy z tych kroków wymaga jednak prawdziwych danych, a ich zbieranie jest kosztowne.</w:t>
       </w:r>
     </w:p>
     <w:p>
@@ -7980,7 +7838,7 @@
           <w:rFonts w:cstheme="minorHAnsi"/>
           <w:lang w:val="pl-PL"/>
         </w:rPr>
-        <w:t xml:space="preserve">Celem rozprawy jest sprawdzenie, jak przejść przez tę pętlę z jak najmniejszą ilością prawdziwych danych. Zamiast nagrywać wszystko po równo, będziemy nagrywać przede wszystkim te miejsca, które są ważne dla zadania robota i których kopia jest jeszcze niepewna. Ponieważ kopia nigdy nie jest idealna, nauczymy robota tak, aby nie polegał na jej niepewnych fragmentach i radził sobie z jej błędami. Na koniec wybierzemy tylko te nieliczne próby w rzeczywistości, które najwięcej mówią o tym, gdzie robot jeszcze zawodzi, i wykorzystamy je do poprawienia zarówno kopii, jak i robota. Wskazówek dostarczy sama kopia, która wie, gdzie jest niepewna, oraz sposób, w jaki model sterujący robotem opisuje to, co widzi. Głównym zadaniem testowym będzie nawigacja robota mobilnego, a sprawdzianem uniwersalności chwytanie przedmiotów ramieniem robota. Badania będą prowadzone przede wszystkim na publicznie dostępnych nagraniach i trójwymiarowych skanach prawdziwych budynków, a wybrane wyniki zostaną potwierdzone na prawdziwym robocie.</w:t>
+        <w:t xml:space="preserve">Celem rozprawy jest sprawdzenie, jak przejść przez tę pętlę z jak najmniejszą ilością prawdziwych danych, niezależnie od zadania. Zamiast zbierać wszystko po równo, będziemy zbierać przede wszystkim te dane, które są ważne dla zadania i o których kopia wie jeszcze za mało. Ponieważ kopia nigdy nie jest idealna, nauczymy system tak, aby nie polegał na jej niepewnych fragmentach i radził sobie z jej błędami. Na koniec wybierzemy tylko te nieliczne próby w rzeczywistości, które najwięcej mówią o tym, gdzie system jeszcze zawodzi, i wykorzystamy je do poprawienia zarówno kopii, jak i systemu. Wskazówek dostarczy sama kopia, która wie, gdzie jest niepewna, oraz sposób, w jaki uczony system opisuje to, co widzi. Te same metody sprawdzimy na dwóch różnych zadaniach: chwytaniu przedmiotów ramieniem robota i poruszaniu się robota po budynkach. Badania będą prowadzone przede wszystkim na publicznie dostępnych danych, a wybrane wyniki zostaną potwierdzone na prawdziwym robocie.</w:t>
       </w:r>
     </w:p>
     <w:p>
@@ -7993,7 +7851,7 @@
           <w:rFonts w:cstheme="minorHAnsi"/>
           <w:lang w:val="pl-PL"/>
         </w:rPr>
-        <w:t xml:space="preserve">Spodziewanym efektem są metody, które pozwolą nagrywać mniej, uczyć skuteczniej i wykonywać mniej kosztownych prób w rzeczywistości, oraz pomiar, ile prawdziwych danych potrzeba, gdy robot uczy się w cyfrowej kopii. Może to przyspieszyć i potanić wdrażanie robotów w magazynach, szpitalach, biurach i fabrykach. Opracowane oprogramowanie zostanie udostępnione publicznie.</w:t>
+        <w:t xml:space="preserve">Spodziewanym efektem są metody, które pozwolą zbierać mniej danych, uczyć skuteczniej i wykonywać mniej kosztownych prób w rzeczywistości, oraz pomiar, ile prawdziwych danych potrzeba, gdy system uczy się w cyfrowej kopii. Może to przyspieszyć i potanić wdrażanie uczących się systemów w fabrykach, magazynach, szpitalach i biurach. Opracowane oprogramowanie zostanie udostępnione publicznie.</w:t>
       </w:r>
     </w:p>
     <w:permEnd w:id="301016009"/>
@@ -8048,7 +7906,7 @@
           <w:rFonts w:cstheme="minorHAnsi"/>
           <w:lang w:val="en-US"/>
         </w:rPr>
-        <w:t xml:space="preserve">Robots today learn to act on their own, for example to move around a building or to grasp objects, by trial and error. They need a very large number of trials, so they usually practise in a computer simulation. Increasingly, this is a digital twin: a faithful, photorealistic copy of a real place that artificial intelligence methods can reconstruct from a short recording. This creates a loop: we record the real place, build its copy, train the robot in it, check it in reality, correct it and only then deploy it. Each of these steps, however, needs real data, that is, recordings and trials in the real world, and collecting them is slow and costly.</w:t>
+        <w:t xml:space="preserve">Artificial intelligence systems that act in the real world, for example robots that grasp objects or move around buildings, learn from a very large number of examples and trials. In reality, collecting such data is slow and costly, so these systems often practise in a computer simulation. Increasingly, this is a digital twin: a faithful copy of a real place or device that can be rebuilt from recordings and measurements, including how things look, their shape and how they move. This creates a loop: we collect data in reality, build the copy, train the system in it, check it in reality, correct it and only then deploy it. Each of these steps, however, needs real data, and collecting it is costly.</w:t>
       </w:r>
     </w:p>
     <w:p>
@@ -8061,7 +7919,7 @@
           <w:rFonts w:cstheme="minorHAnsi"/>
           <w:lang w:val="en-US"/>
         </w:rPr>
-        <w:t xml:space="preserve">The goal of this dissertation is to find out how to go through this loop with as little real data as possible. Instead of recording everything evenly, we will record mainly the places that matter for the robot's task and whose copy is still uncertain. Because the copy is never perfect, we will train the robot so that it does not rely on the uncertain parts of the copy and copes with its errors. Finally, we will choose only the few trials in reality that tell the most about where the robot still fails, and use them to correct both the copy and the robot. Guidance will come from the copy itself, which knows where it is uncertain, and from the way the model that controls the robot describes what it sees. Mobile-robot navigation will be the main test task, and grasping objects with a robot arm will test how universal the approach is. The research will be carried out mainly on publicly available recordings and three-dimensional scans of real buildings, and selected results will be confirmed on a real robot.</w:t>
+        <w:t xml:space="preserve">The goal of this dissertation is to find out how to go through this loop with as little real data as possible, whatever the task. Instead of collecting everything evenly, we will collect mainly the data that matters for the task and about which the copy still knows too little. Because the copy is never perfect, we will train the system so that it does not rely on the uncertain parts of the copy and copes with its errors. Finally, we will choose only the few trials in reality that tell the most about where the system still fails, and use them to correct both the copy and the system. Guidance will come from the copy itself, which knows where it is uncertain, and from the way the learning system describes what it sees. We will test the same methods on two different tasks: grasping objects with a robot arm and a robot moving around buildings. The research will be carried out mainly on publicly available data, and selected results will be confirmed on a real robot.</w:t>
       </w:r>
     </w:p>
     <w:p>
@@ -8074,7 +7932,7 @@
           <w:rFonts w:cstheme="minorHAnsi"/>
           <w:lang w:val="en-US"/>
         </w:rPr>
-        <w:t xml:space="preserve">The expected result is methods that make it possible to record less, train more effectively and carry out fewer costly trials in reality, and a measurement of how much real data is needed when a robot learns in a digital copy. This may make deploying robots in warehouses, hospitals, offices and factories faster and cheaper. The software developed will be made publicly available.</w:t>
+        <w:t xml:space="preserve">The expected result is methods that make it possible to collect less data, train more effectively and carry out fewer costly trials in reality, and a measurement of how much real data is needed when a system learns in a digital copy. This may make deploying learning systems in factories, warehouses, hospitals and offices faster and cheaper. The software developed will be made publicly available.</w:t>
       </w:r>
     </w:p>
     <w:permEnd w:id="305530072"/>
@@ -8525,7 +8383,7 @@
           <w:rFonts w:cstheme="minorHAnsi"/>
           <w:lang w:val="en-US"/>
         </w:rPr>
-        <w:t xml:space="preserve">. P1 reports Stage I and the first Stage II results (RQ1–RQ2): task-aware, uncertainty-guided capture of digital twins (H1) and uncertainty-aware training of policies on imperfect twins (first H2 results), evaluated by the real data they save (task T4.2). If it is rejected, the revised paper goes to </w:t>
+        <w:t xml:space="preserve">. P1 reports Stage I and the first Stage II results (RQ1–RQ2): task-aware, uncertainty-guided capture of real data for digital twins (H1) and uncertainty-aware learning in imperfect twins (first H2 results), evaluated in manipulation and navigation by the real data they save (task T4.2). If it is rejected, the revised paper goes to </w:t>
       </w:r>
       <w:r>
         <w:rPr>
@@ -8822,9 +8680,9 @@
       </w:tblPr>
       <w:tblGrid>
         <w:gridCol w:w="1269"/>
-        <w:gridCol w:w="3714"/>
+        <w:gridCol w:w="3707"/>
         <w:gridCol w:w="1269"/>
-        <w:gridCol w:w="1208"/>
+        <w:gridCol w:w="1215"/>
         <w:gridCol w:w="1612"/>
       </w:tblGrid>
       <w:tr>
@@ -8849,7 +8707,7 @@
         </w:tc>
         <w:tc>
           <w:tcPr>
-            <w:tcW w:w="3714" w:type="dxa"/>
+            <w:tcW w:w="3707" w:type="dxa"/>
           </w:tcPr>
           <w:p>
             <w:pPr>
@@ -8887,7 +8745,7 @@
         </w:tc>
         <w:tc>
           <w:tcPr>
-            <w:tcW w:w="1208" w:type="dxa"/>
+            <w:tcW w:w="1215" w:type="dxa"/>
           </w:tcPr>
           <w:p>
             <w:pPr>
@@ -8945,7 +8803,7 @@
         </w:tc>
         <w:tc>
           <w:tcPr>
-            <w:tcW w:w="3714" w:type="dxa"/>
+            <w:tcW w:w="3707" w:type="dxa"/>
           </w:tcPr>
           <w:p>
             <w:pPr>
@@ -8981,7 +8839,7 @@
         </w:tc>
         <w:tc>
           <w:tcPr>
-            <w:tcW w:w="1208" w:type="dxa"/>
+            <w:tcW w:w="1215" w:type="dxa"/>
           </w:tcPr>
           <w:p>
             <w:pPr>
@@ -9037,7 +8895,7 @@
         </w:tc>
         <w:tc>
           <w:tcPr>
-            <w:tcW w:w="3714" w:type="dxa"/>
+            <w:tcW w:w="3707" w:type="dxa"/>
           </w:tcPr>
           <w:p>
             <w:pPr>
@@ -9049,7 +8907,7 @@
                 <w:rFonts w:cstheme="minorHAnsi"/>
                 <w:lang w:val="en-US"/>
               </w:rPr>
-              <w:t xml:space="preserve">P1 (RQ1–RQ2, task-aware capture, first uncertainty-aware training results): NeurIPS 2027, May 2027 (§11)</w:t>
+              <w:t xml:space="preserve">P1 (RQ1–RQ2, task-aware capture, first H2 results): NeurIPS 2027, May 2027 (§11)</w:t>
             </w:r>
           </w:p>
         </w:tc>
@@ -9073,7 +8931,7 @@
         </w:tc>
         <w:tc>
           <w:tcPr>
-            <w:tcW w:w="1208" w:type="dxa"/>
+            <w:tcW w:w="1215" w:type="dxa"/>
           </w:tcPr>
           <w:p>
             <w:pPr>
@@ -9129,7 +8987,7 @@
         </w:tc>
         <w:tc>
           <w:tcPr>
-            <w:tcW w:w="3714" w:type="dxa"/>
+            <w:tcW w:w="3707" w:type="dxa"/>
           </w:tcPr>
           <w:p>
             <w:pPr>
@@ -9141,7 +8999,7 @@
                 <w:rFonts w:cstheme="minorHAnsi"/>
                 <w:lang w:val="en-US"/>
               </w:rPr>
-              <w:t xml:space="preserve">P2 (RQ3, few real rollouts, twin correction): ICML or CVPR 2028; P3 (RQ4, budget of the full loop, manipulation): NeurIPS 2028</w:t>
+              <w:t xml:space="preserve">P2 (RQ3, few real data, twin correction): ICML or CVPR 2028; P3 (RQ4, budget of the full loop in both testbeds): NeurIPS 2028</w:t>
             </w:r>
           </w:p>
         </w:tc>
@@ -9159,13 +9017,13 @@
                 <w:rFonts w:cstheme="minorHAnsi"/>
                 <w:lang w:val="en-US"/>
               </w:rPr>
-              <w:t xml:space="preserve">Rollout selection</w:t>
+              <w:t xml:space="preserve">Trial selection</w:t>
             </w:r>
           </w:p>
         </w:tc>
         <w:tc>
           <w:tcPr>
-            <w:tcW w:w="1208" w:type="dxa"/>
+            <w:tcW w:w="1215" w:type="dxa"/>
           </w:tcPr>
           <w:p>
             <w:pPr>
@@ -9221,7 +9079,7 @@
         </w:tc>
         <w:tc>
           <w:tcPr>
-            <w:tcW w:w="3714" w:type="dxa"/>
+            <w:tcW w:w="3707" w:type="dxa"/>
           </w:tcPr>
           <w:p>
             <w:pPr>
@@ -9257,7 +9115,7 @@
         </w:tc>
         <w:tc>
           <w:tcPr>
-            <w:tcW w:w="1208" w:type="dxa"/>
+            <w:tcW w:w="1215" w:type="dxa"/>
           </w:tcPr>
           <w:p>
             <w:pPr>
@@ -9330,7 +9188,7 @@
           <w:rFonts w:cstheme="minorHAnsi"/>
           <w:lang w:val="en-US"/>
         </w:rPr>
-        <w:t xml:space="preserve"> (1) Z. Kira's group, Georgia Tech: EmbodiedSplat [3]. (2) Multi-robot Systems Lab, Stanford University (M. Schwager): Gaussian-splatting scene models and navigation. A European host (Erasmus+ route) working on active reconstruction or sim-to-real transfer, and a foreign co-author for P2, are sought with the supervisor in sem. 4.</w:t>
+        <w:t xml:space="preserve"> (1) Z. Kira's group, Georgia Tech: EmbodiedSplat [5]. (2) Multi-robot Systems Lab, Stanford University (M. Schwager): Gaussian-splatting scene models. A European host (Erasmus+ route) working on active reconstruction or sim-to-real transfer, and a foreign co-author for P2, are sought with the supervisor in sem. 4.</w:t>
       </w:r>
     </w:p>
     <w:p>
@@ -9366,7 +9224,7 @@
           <w:rFonts w:cstheme="minorHAnsi"/>
           <w:lang w:val="en-US"/>
         </w:rPr>
-        <w:t xml:space="preserve"> laboratory (Pioneer 3-DX, Jaguar 4x4, ROS 2); a written agreement is task T3.2 (Nov 2026).</w:t>
+        <w:t xml:space="preserve"> laboratory (Pioneer 3-DX, Jaguar 4x4, ROS 2) and, if available, a PWr manipulator; a written agreement is task T3.2 (Nov 2026).</w:t>
       </w:r>
     </w:p>
     <w:p>
@@ -9416,7 +9274,7 @@
           <w:rFonts w:cstheme="minorHAnsi"/>
           <w:lang w:val="en-US"/>
         </w:rPr>
-        <w:t xml:space="preserve"> (3–4): the measured capture–SR curves still answer RQ1, and Stages II–III have their own baselines (§7).</w:t>
+        <w:t xml:space="preserve"> (3–4): the measured capture–P curves still answer RQ1, and Stages II–III have their own baselines (§7).</w:t>
       </w:r>
     </w:p>
     <w:p>
@@ -9438,14 +9296,14 @@
           <w:i/>
           <w:lang w:val="en-US"/>
         </w:rPr>
-        <w:t xml:space="preserve">3DGS uncertainty is poorly calibrated</w:t>
-      </w:r>
-      <w:r>
-        <w:rPr>
-          <w:rFonts w:cstheme="minorHAnsi"/>
-          <w:lang w:val="en-US"/>
-        </w:rPr>
-        <w:t xml:space="preserve"> (3–4): two estimators and an ensemble fallback, checked against the reference twin.</w:t>
+        <w:t xml:space="preserve">Twin uncertainty is poorly calibrated</w:t>
+      </w:r>
+      <w:r>
+        <w:rPr>
+          <w:rFonts w:cstheme="minorHAnsi"/>
+          <w:lang w:val="en-US"/>
+        </w:rPr>
+        <w:t xml:space="preserve"> (3–4): two estimators and an ensemble fallback, checked against the reference.</w:t>
       </w:r>
     </w:p>
     <w:p>
@@ -9474,7 +9332,7 @@
           <w:rFonts w:cstheme="minorHAnsi"/>
           <w:lang w:val="en-US"/>
         </w:rPr>
-        <w:t xml:space="preserve"> (4–7): twin and reference come from separate captures, a second reference checks the sign, the proxy's own error is reported, and tier C checks the direction.</w:t>
+        <w:t xml:space="preserve"> (4–7): separate sources for twin and reference; tiers B and C check the direction (§9).</w:t>
       </w:r>
     </w:p>
     <w:p>
@@ -9503,7 +9361,7 @@
           <w:rFonts w:cstheme="minorHAnsi"/>
           <w:lang w:val="en-US"/>
         </w:rPr>
-        <w:t xml:space="preserve"> (6): gains saturate quickly in a known location [10]; H4 is reported as a full budget curve.</w:t>
+        <w:t xml:space="preserve"> (6): gains saturate quickly in a known location [12]; H4 is reported as a full budget curve.</w:t>
       </w:r>
     </w:p>
     <w:p>
@@ -9532,7 +9390,7 @@
           <w:rFonts w:cstheme="minorHAnsi"/>
           <w:lang w:val="en-US"/>
         </w:rPr>
-        <w:t xml:space="preserve"> (3–6): twin-based robot learning moves fast [3–7, 11]; early preprints, monthly monitoring.</w:t>
+        <w:t xml:space="preserve"> (3–6): twin-based robot learning moves fast [3–7, 13]; early preprints, monthly monitoring.</w:t>
       </w:r>
     </w:p>
     <w:p>

</xml_diff>

<commit_message>
Wave 14: reframe as one method that needs less real data (C1-C3 components, H4 thesis incl. >=2x vs existing pipeline)
Closes #30

Co-Authored-By: Claude Opus 5.5 <noreply@anthropic.com>
</commit_message>
<xml_diff>
--- a/output/IPB_Grzegorz_Piotrowski.docx
+++ b/output/IPB_Grzegorz_Piotrowski.docx
@@ -1098,7 +1098,7 @@
           <w:rFonts w:cstheme="minorHAnsi"/>
           <w:lang w:val="en-US"/>
         </w:rPr>
-        <w:t xml:space="preserve"> Aktywna alokacja ograniczonych danych rzeczywistych w pętli rzeczywistość–symulacja–rzeczywistość: budowa cyfrowych bliźniaków, uczenie w nich i przenoszenie wyników do rzeczywistości</w:t>
+        <w:t xml:space="preserve"> Metoda uczenia w pętli rzeczywistość–symulacja–rzeczywistość wymagająca mniej danych rzeczywistych: ukierunkowane na zadanie zbieranie danych do budowy cyfrowych bliźniaków, uczenie w nich z uwzględnieniem niepewności i aktywny wybór nielicznych danych rzeczywistych</w:t>
       </w:r>
       <w:bookmarkStart w:id="0" w:name="_Hlk95566638"/>
     </w:p>
@@ -1120,7 +1120,7 @@
           <w:rFonts w:cstheme="minorHAnsi"/>
           <w:lang w:val="en-US"/>
         </w:rPr>
-        <w:t xml:space="preserve"> Active allocation of limited real data in the real-to-sim-to-real loop: building digital twins, learning in them and transferring the results back to reality</w:t>
+        <w:t xml:space="preserve"> A method for learning in the real-to-sim-to-real loop that needs less real data: task-aware capture for building digital twins, uncertainty-aware learning in them and active selection of few real-world data</w:t>
       </w:r>
     </w:p>
     <w:bookmarkEnd w:id="0"/>
@@ -2226,7 +2226,7 @@
                 <w:b/>
                 <w:lang w:val="en-US"/>
               </w:rPr>
-              <w:t xml:space="preserve">Stage I – capture less (RQ1, H1).</w:t>
+              <w:t xml:space="preserve">Stage I – method component C1: capture less (RQ1, H1).</w:t>
             </w:r>
           </w:p>
           <w:p>
@@ -2349,7 +2349,7 @@
                 <w:rFonts w:cstheme="minorHAnsi"/>
                 <w:lang w:val="en-US"/>
               </w:rPr>
-              <w:t xml:space="preserve"> Task-aware, uncertainty-guided capture of views and interactions vs. uniform, task-blind and risk-weighted selection. </w:t>
+              <w:t xml:space="preserve"> C1: task-aware, uncertainty-guided capture of views and interactions vs. uniform, task-blind and risk-weighted selection. </w:t>
             </w:r>
             <w:r>
               <w:rPr>
@@ -2456,7 +2456,7 @@
                 <w:b/>
                 <w:lang w:val="en-US"/>
               </w:rPr>
-              <w:t xml:space="preserve">Stage I completed; Stage II – learn robustly in an imperfect twin (RQ1–RQ2, H1–H2).</w:t>
+              <w:t xml:space="preserve">Stage I completed; Stage II – method component C2: learn robustly in an imperfect twin (RQ1–RQ2, H1–H2).</w:t>
             </w:r>
           </w:p>
           <w:p>
@@ -2477,7 +2477,7 @@
                 <w:rFonts w:cstheme="minorHAnsi"/>
                 <w:lang w:val="en-US"/>
               </w:rPr>
-              <w:t xml:space="preserve"> Uncertainty-aware randomization (appearance, geometry, physical parameters) and representation-based weighting of twin samples vs. uniform domain randomization at an equal capture budget, in both testbeds. </w:t>
+              <w:t xml:space="preserve"> C2: uncertainty-aware randomization (appearance, geometry, physical parameters) and representation-based weighting of twin samples vs. uniform domain randomization at an equal capture budget, in both testbeds. </w:t>
             </w:r>
             <w:r>
               <w:rPr>
@@ -2573,7 +2573,7 @@
                 <w:rFonts w:cstheme="minorHAnsi"/>
                 <w:lang w:val="en-US"/>
               </w:rPr>
-              <w:t xml:space="preserve"> (RQ1–RQ2: task-aware capture, H1, and first uncertainty-aware learning results, H2, in manipulation and navigation). </w:t>
+              <w:t xml:space="preserve"> (method component C1, H1, and first results of C2, H2, in manipulation and navigation). </w:t>
             </w:r>
             <w:r>
               <w:rPr>
@@ -2624,7 +2624,7 @@
                 <w:rFonts w:cstheme="minorHAnsi"/>
                 <w:lang w:val="en-US"/>
               </w:rPr>
-              <w:t xml:space="preserve"> Stage III set-up: trial-selection and correction code on tier A (Jul–Sep 2027). </w:t>
+              <w:t xml:space="preserve"> Stage III set-up: C3 trial-selection and correction code on tier A (Jul–Sep 2027). </w:t>
             </w:r>
             <w:r>
               <w:rPr>
@@ -2783,7 +2783,7 @@
                 <w:b/>
                 <w:lang w:val="en-US"/>
               </w:rPr>
-              <w:t xml:space="preserve">Stage III – collect few real data (RQ3, H3).</w:t>
+              <w:t xml:space="preserve">Stage III – method component C3: collect few real data (RQ3, H3).</w:t>
             </w:r>
           </w:p>
           <w:p>
@@ -2804,7 +2804,7 @@
                 <w:rFonts w:cstheme="minorHAnsi"/>
                 <w:lang w:val="en-US"/>
               </w:rPr>
-              <w:t xml:space="preserve"> Active selection of real trials (predicted gap, uncertainty) vs. random selection; correction of the twin (appearance and physical parameters) and fine-tuning of the policy with the selected trials, in both testbeds. </w:t>
+              <w:t xml:space="preserve"> C3: active selection of real trials (predicted gap, uncertainty) vs. random selection; correction of the twin (appearance and physical parameters) and fine-tuning of the policy with the selected trials, in both testbeds. </w:t>
             </w:r>
             <w:r>
               <w:rPr>
@@ -2870,7 +2870,7 @@
                 <w:rFonts w:cstheme="minorHAnsi"/>
                 <w:lang w:val="en-US"/>
               </w:rPr>
-              <w:t xml:space="preserve"> First robot validation campaign (tier C, 2 PWr settings, ~8 robot-hours): own captures, twins, uniform capture vs. the loop. </w:t>
+              <w:t xml:space="preserve"> First robot validation campaign (tier C, 2 PWr settings, ~8 robot-hours): own captures, twins, uniform capture vs. the method. </w:t>
             </w:r>
             <w:r>
               <w:rPr>
@@ -2921,7 +2921,7 @@
                 <w:rFonts w:cstheme="minorHAnsi"/>
                 <w:lang w:val="en-US"/>
               </w:rPr>
-              <w:t xml:space="preserve"> (active selection of few real data and twin correction, RQ3) submitted to </w:t>
+              <w:t xml:space="preserve"> (method component C3: active selection of few real data and twin correction, RQ3) submitted to </w:t>
             </w:r>
             <w:r>
               <w:rPr>
@@ -3029,7 +3029,7 @@
                 <w:b/>
                 <w:lang w:val="en-US"/>
               </w:rPr>
-              <w:t xml:space="preserve">Stage IV – budget of the whole loop in both testbeds (RQ4, H4).</w:t>
+              <w:t xml:space="preserve">Stage IV – the whole method in both testbeds (RQ4, H4, the thesis).</w:t>
             </w:r>
           </w:p>
           <w:p>
@@ -3050,7 +3050,7 @@
                 <w:rFonts w:cstheme="minorHAnsi"/>
                 <w:lang w:val="en-US"/>
               </w:rPr>
-              <w:t xml:space="preserve"> Real-data budget curves of the full loop vs. real-only learning ("exchange rate") on tier A in manipulation and navigation, with the allocation methods unchanged, plus the tier-B check against published paired sim/real evaluations. </w:t>
+              <w:t xml:space="preserve"> Real-data budget curves of the whole method vs. real-only learning ("exchange rate") and vs. the strongest existing real-to-sim-to-real pipeline on tier A in manipulation and navigation, with C1–C3 unchanged, plus the tier-B check against published paired sim/real evaluations. </w:t>
             </w:r>
             <w:r>
               <w:rPr>
@@ -3182,7 +3182,7 @@
                 <w:rFonts w:cstheme="minorHAnsi"/>
                 <w:lang w:val="en-US"/>
               </w:rPr>
-              <w:t xml:space="preserve"> (budget law of the full loop across both testbeds) submitted to </w:t>
+              <w:t xml:space="preserve"> (the whole method against real-only learning and the existing pipeline in both testbeds; working title "budget law") submitted to </w:t>
             </w:r>
             <w:r>
               <w:rPr>
@@ -3326,7 +3326,7 @@
                 <w:rFonts w:cstheme="minorHAnsi"/>
                 <w:lang w:val="en-US"/>
               </w:rPr>
-              <w:t xml:space="preserve"> Second robot validation campaign (tier C) of the full loop; final analysis of H1–H4 across tiers and testbeds. </w:t>
+              <w:t xml:space="preserve"> Second robot validation campaign (tier C) of the whole method; final analysis of H1–H4 across tiers and testbeds. </w:t>
             </w:r>
             <w:r>
               <w:rPr>
@@ -3362,7 +3362,7 @@
                 <w:rFonts w:cstheme="minorHAnsi"/>
                 <w:lang w:val="en-US"/>
               </w:rPr>
-              <w:t xml:space="preserve"> Release of code and experiment scripts. </w:t>
+              <w:t xml:space="preserve"> Release of the method's code and experiment scripts. </w:t>
             </w:r>
             <w:r>
               <w:rPr>
@@ -4321,7 +4321,7 @@
           <w:rFonts w:cstheme="minorHAnsi"/>
           <w:lang w:val="en-US"/>
         </w:rPr>
-        <w:t xml:space="preserve">: collect real data, build a twin, learn in the twin, check and correct with a little more real data, deploy. Building twins has quickly become routine, with dozens of papers a year and more than ten open-source twin simulators. What remains open is the </w:t>
+        <w:t xml:space="preserve">: collect real data, build a twin, learn in the twin, check and correct with a little more real data, deploy. Building twins has become routine, with dozens of papers a year and more than ten open-source twin simulators. What remains open is the </w:t>
       </w:r>
       <w:r>
         <w:rPr>
@@ -4350,29 +4350,44 @@
           <w:b/>
           <w:lang w:val="en-US"/>
         </w:rPr>
-        <w:t xml:space="preserve">What the dissertation proposes.</w:t>
-      </w:r>
-      <w:r>
-        <w:rPr>
-          <w:rFonts w:cstheme="minorHAnsi"/>
-          <w:lang w:val="en-US"/>
-        </w:rPr>
-        <w:t xml:space="preserve"> The real data needed by the loop can be reduced by </w:t>
-      </w:r>
-      <w:r>
-        <w:rPr>
-          <w:rFonts w:cstheme="minorHAnsi"/>
-          <w:b/>
-          <w:lang w:val="en-US"/>
-        </w:rPr>
-        <w:t xml:space="preserve">allocating it actively</w:t>
-      </w:r>
-      <w:r>
-        <w:rPr>
-          <w:rFonts w:cstheme="minorHAnsi"/>
-          <w:lang w:val="en-US"/>
-        </w:rPr>
-        <w:t xml:space="preserve">: collect only the data the task needs to build the twin, learn so that the result is robust to the twin's errors, and collect only the few real-world data or interactions that close the remaining gap. Two signals, both computed from data the loop already collects, guide these choices: the </w:t>
+        <w:t xml:space="preserve">Goal of the dissertation.</w:t>
+      </w:r>
+      <w:r>
+        <w:rPr>
+          <w:rFonts w:cstheme="minorHAnsi"/>
+          <w:lang w:val="en-US"/>
+        </w:rPr>
+        <w:t xml:space="preserve"> The goal is to develop </w:t>
+      </w:r>
+      <w:r>
+        <w:rPr>
+          <w:rFonts w:cstheme="minorHAnsi"/>
+          <w:b/>
+          <w:lang w:val="en-US"/>
+        </w:rPr>
+        <w:t xml:space="preserve">a method</w:t>
+      </w:r>
+      <w:r>
+        <w:rPr>
+          <w:rFonts w:cstheme="minorHAnsi"/>
+          <w:lang w:val="en-US"/>
+        </w:rPr>
+        <w:t xml:space="preserve"> for learning in the real-to-sim-to-real loop that reaches a given real-world performance with </w:t>
+      </w:r>
+      <w:r>
+        <w:rPr>
+          <w:rFonts w:cstheme="minorHAnsi"/>
+          <w:b/>
+          <w:lang w:val="en-US"/>
+        </w:rPr>
+        <w:t xml:space="preserve">significantly less real data</w:t>
+      </w:r>
+      <w:r>
+        <w:rPr>
+          <w:rFonts w:cstheme="minorHAnsi"/>
+          <w:lang w:val="en-US"/>
+        </w:rPr>
+        <w:t xml:space="preserve"> than existing approaches. The method is one pipeline with three components, one per loop step: (C1) task-aware capture of the data that builds the twin, (C2) learning that is robust to the twin's errors, and (C3) active selection of the few real-world data or interactions that correct the twin and the model. Two signals, both computed from data the loop already collects, guide all three: the </w:t>
       </w:r>
       <w:r>
         <w:rPr>
@@ -4387,22 +4402,22 @@
           <w:rFonts w:cstheme="minorHAnsi"/>
           <w:lang w:val="en-US"/>
         </w:rPr>
-        <w:t xml:space="preserve"> (where its reconstruction or its identified parameters are unreliable) and the </w:t>
-      </w:r>
-      <w:r>
-        <w:rPr>
-          <w:rFonts w:cstheme="minorHAnsi"/>
-          <w:b/>
-          <w:lang w:val="en-US"/>
-        </w:rPr>
-        <w:t xml:space="preserve">learned model's own internal representations</w:t>
-      </w:r>
-      <w:r>
-        <w:rPr>
-          <w:rFonts w:cstheme="minorHAnsi"/>
-          <w:lang w:val="en-US"/>
-        </w:rPr>
-        <w:t xml:space="preserve"> (where twin and real inputs look different to it). The result is measured as a budget–performance curve: how much real data the loop needs to reach a given real task performance, compared with uniform allocation and with learning from real data only.</w:t>
+        <w:t xml:space="preserve"> (where it is unreliable) and the </w:t>
+      </w:r>
+      <w:r>
+        <w:rPr>
+          <w:rFonts w:cstheme="minorHAnsi"/>
+          <w:b/>
+          <w:lang w:val="en-US"/>
+        </w:rPr>
+        <w:t xml:space="preserve">learned model's own representations</w:t>
+      </w:r>
+      <w:r>
+        <w:rPr>
+          <w:rFonts w:cstheme="minorHAnsi"/>
+          <w:lang w:val="en-US"/>
+        </w:rPr>
+        <w:t xml:space="preserve"> (where twin and real inputs look different to it). The thesis is that the method needs at most a tenth of the real data of learning from real data only, and at least two times less than the strongest existing real-to-sim-to-real pipeline, measured as budget–performance curves in both testbeds.</w:t>
       </w:r>
     </w:p>
     <w:p>
@@ -5025,7 +5040,7 @@
           <w:rFonts w:cstheme="minorHAnsi"/>
           <w:lang w:val="en-US"/>
         </w:rPr>
-        <w:t xml:space="preserve"> Real-to-sim-to-real works, but its real-data cost is set by hand and spent uniformly, and each study measures it in one domain. Missing are (i) task-aware, uncertainty-guided capture of both appearance and physical parameters, judged by downstream success rather than reconstruction or parameter accuracy (RQ1), (ii) learning driven by the twin's uncertainty and by representation distance to a small real set (RQ2), (iii) active selection of the few real data that correct the twin and the policy (RQ3), and (iv) a total real-data budget curve of the full loop against real-only learning, measured the same way in manipulation and navigation (RQ4).</w:t>
+        <w:t xml:space="preserve"> Real-to-sim-to-real works, but its real-data cost is set by hand and spent uniformly, and measured in one domain per study. Missing is one method that allocates it actively at every step: (i) task-aware, uncertainty-guided capture of both appearance and physical parameters, judged by task success, not reconstruction or parameter accuracy (RQ1), (ii) learning driven by the twin's uncertainty and by representation distance to a small real set (RQ2), (iii) active selection of the few real data that correct twin and policy (RQ3), and (iv) evidence that it needs less real data than real-only learning and uniform pipelines, measured the same way in manipulation and navigation (RQ4).</w:t>
       </w:r>
     </w:p>
     <w:p>
@@ -5765,29 +5780,44 @@
           <w:b/>
           <w:lang w:val="en-US"/>
         </w:rPr>
-        <w:t xml:space="preserve">Thesis.</w:t>
-      </w:r>
-      <w:r>
-        <w:rPr>
-          <w:rFonts w:cstheme="minorHAnsi"/>
-          <w:lang w:val="en-US"/>
-        </w:rPr>
-        <w:t xml:space="preserve"> The real data needed in a real-to-sim-to-real loop can be reduced substantially by </w:t>
-      </w:r>
-      <w:r>
-        <w:rPr>
-          <w:rFonts w:cstheme="minorHAnsi"/>
-          <w:b/>
-          <w:lang w:val="en-US"/>
-        </w:rPr>
-        <w:t xml:space="preserve">allocating it actively</w:t>
-      </w:r>
-      <w:r>
-        <w:rPr>
-          <w:rFonts w:cstheme="minorHAnsi"/>
-          <w:lang w:val="en-US"/>
-        </w:rPr>
-        <w:t xml:space="preserve">: collect only the data the task needs to build the twin, learn so that the policy or model is robust to what the twin got wrong, and collect only the few real-world data that close the remaining gap. The twin's uncertainty and the model's own representations guide all three steps. Testbeds (equal status, same settings): robotic manipulation and visual navigation.</w:t>
+        <w:t xml:space="preserve">Goal and thesis.</w:t>
+      </w:r>
+      <w:r>
+        <w:rPr>
+          <w:rFonts w:cstheme="minorHAnsi"/>
+          <w:lang w:val="en-US"/>
+        </w:rPr>
+        <w:t xml:space="preserve"> The goal is </w:t>
+      </w:r>
+      <w:r>
+        <w:rPr>
+          <w:rFonts w:cstheme="minorHAnsi"/>
+          <w:b/>
+          <w:lang w:val="en-US"/>
+        </w:rPr>
+        <w:t xml:space="preserve">a method</w:t>
+      </w:r>
+      <w:r>
+        <w:rPr>
+          <w:rFonts w:cstheme="minorHAnsi"/>
+          <w:lang w:val="en-US"/>
+        </w:rPr>
+        <w:t xml:space="preserve"> for learning in the real-to-sim-to-real loop that reaches a given real-world performance with </w:t>
+      </w:r>
+      <w:r>
+        <w:rPr>
+          <w:rFonts w:cstheme="minorHAnsi"/>
+          <w:b/>
+          <w:lang w:val="en-US"/>
+        </w:rPr>
+        <w:t xml:space="preserve">significantly less real data</w:t>
+      </w:r>
+      <w:r>
+        <w:rPr>
+          <w:rFonts w:cstheme="minorHAnsi"/>
+          <w:lang w:val="en-US"/>
+        </w:rPr>
+        <w:t xml:space="preserve"> than existing approaches. It is one pipeline of three components, one per loop step: (C1) task-aware, uncertainty-guided capture to build the twin; (C2) uncertainty-aware learning of the policy or model in the imperfect twin; (C3) active selection of a few real-world data to correct twin and model. The twin's uncertainty and the model's representations guide all three. The thesis is H4; H1–H3 measure what each component saves at its own step (ablations of the method). Testbeds (equal status): robotic manipulation and visual navigation.</w:t>
       </w:r>
     </w:p>
     <w:p>
@@ -5838,7 +5868,7 @@
           <w:rFonts w:cstheme="minorHAnsi"/>
           <w:lang w:val="en-US"/>
         </w:rPr>
-        <w:t xml:space="preserve"> (neural reconstruction plus system identification) is built from a subset of a separate, cheaper capture, so the two share no data. Navigation: ≥ 20 public indoor scenes (10 held out), laser-scan and DSLR reference, twin from the phone capture. Manipulation: a physics simulator with held-out physical parameters and its own rendering, the weaker proxy, checked by tier B (published paired sim/real evaluations of real policies). Real data: capture = views and interaction samples given to the twin, real trials and demonstrations = episodes in the reference, summed in one operator-time cost. Metric P: task success rate in the reference. Tier A decides H1–H3 in both testbeds; tiers B and C (real robot) report agreement. Tests: one-sided, α = 0.05, scene/seed bootstrap, Holm-corrected per hypothesis, pre-registered.</w:t>
+        <w:t xml:space="preserve"> (neural reconstruction + system identification) is built from a subset of a separate, cheaper capture, sharing no data. Navigation: ≥ 20 public indoor scenes (10 held out), laser-scan and DSLR reference, twin from the phone capture. Manipulation: a physics simulator with held-out physical parameters and its own rendering (the weaker proxy; tier B, published paired sim/real evaluations, checks it). Real data (capture = views and interaction samples for the twin; trials and demonstrations = episodes in the reference) is summed in one operator-time cost. P = task success rate in the reference. Tier A decides H1–H4; tiers B and C (real robot) report agreement. Tests: one-sided, α = 0.05, scene/seed bootstrap, Holm correction, pre-registered.</w:t>
       </w:r>
     </w:p>
     <w:p>
@@ -5852,14 +5882,14 @@
           <w:b/>
           <w:lang w:val="en-US"/>
         </w:rPr>
-        <w:t xml:space="preserve">RQ1 (real → sim: capture less).</w:t>
-      </w:r>
-      <w:r>
-        <w:rPr>
-          <w:rFonts w:cstheme="minorHAnsi"/>
-          <w:lang w:val="en-US"/>
-        </w:rPr>
-        <w:t xml:space="preserve"> How little real data does a useful twin need, and can the task guide it?</w:t>
+        <w:t xml:space="preserve">RQ1 (C1: capture less).</w:t>
+      </w:r>
+      <w:r>
+        <w:rPr>
+          <w:rFonts w:cstheme="minorHAnsi"/>
+          <w:lang w:val="en-US"/>
+        </w:rPr>
+        <w:t xml:space="preserve"> How little capture does a twin need? Can the task guide it?</w:t>
       </w:r>
     </w:p>
     <w:p>
@@ -5880,7 +5910,7 @@
           <w:rFonts w:cstheme="minorHAnsi"/>
           <w:lang w:val="en-US"/>
         </w:rPr>
-        <w:t xml:space="preserve"> Task-aware, uncertainty-guided capture (next data where task-relevant parts of the twin are most uncertain) reaches the P of uniform capture with ≥ 40% less capture. </w:t>
+        <w:t xml:space="preserve"> C1 (next data where task-relevant parts of the twin are most uncertain) reaches the P of uniform capture with ≥ 40% less capture. </w:t>
       </w:r>
       <w:r>
         <w:rPr>
@@ -5909,14 +5939,14 @@
           <w:b/>
           <w:lang w:val="en-US"/>
         </w:rPr>
-        <w:t xml:space="preserve">RQ2 (in sim: learn robustly in an imperfect twin).</w:t>
-      </w:r>
-      <w:r>
-        <w:rPr>
-          <w:rFonts w:cstheme="minorHAnsi"/>
-          <w:lang w:val="en-US"/>
-        </w:rPr>
-        <w:t xml:space="preserve"> How should learning in the twin be made robust to its errors?</w:t>
+        <w:t xml:space="preserve">RQ2 (C2: learn in an imperfect twin).</w:t>
+      </w:r>
+      <w:r>
+        <w:rPr>
+          <w:rFonts w:cstheme="minorHAnsi"/>
+          <w:lang w:val="en-US"/>
+        </w:rPr>
+        <w:t xml:space="preserve"> How can learning be robust to the twin's errors?</w:t>
       </w:r>
     </w:p>
     <w:p>
@@ -5937,7 +5967,7 @@
           <w:rFonts w:cstheme="minorHAnsi"/>
           <w:lang w:val="en-US"/>
         </w:rPr>
-        <w:t xml:space="preserve"> Uncertainty-aware training (augmentation and sample weights from the twin's uncertainty and from the representation distance to a few held-out real samples) improves transfer over uniform domain randomization at an equal capture budget. </w:t>
+        <w:t xml:space="preserve"> C2 (augmentation and sample weights from the twin's uncertainty and from the representation distance to a few held-out real samples) improves transfer over uniform domain randomization at an equal capture budget. </w:t>
       </w:r>
       <w:r>
         <w:rPr>
@@ -5966,14 +5996,14 @@
           <w:b/>
           <w:lang w:val="en-US"/>
         </w:rPr>
-        <w:t xml:space="preserve">RQ3 (sim → real: few real data).</w:t>
-      </w:r>
-      <w:r>
-        <w:rPr>
-          <w:rFonts w:cstheme="minorHAnsi"/>
-          <w:lang w:val="en-US"/>
-        </w:rPr>
-        <w:t xml:space="preserve"> Which few real-world data close the remaining gap, and how should they correct twin and model?</w:t>
+        <w:t xml:space="preserve">RQ3 (C3: few real data).</w:t>
+      </w:r>
+      <w:r>
+        <w:rPr>
+          <w:rFonts w:cstheme="minorHAnsi"/>
+          <w:lang w:val="en-US"/>
+        </w:rPr>
+        <w:t xml:space="preserve"> Which few real data close the gap, and how should they be used?</w:t>
       </w:r>
     </w:p>
     <w:p>
@@ -5994,7 +6024,7 @@
           <w:rFonts w:cstheme="minorHAnsi"/>
           <w:lang w:val="en-US"/>
         </w:rPr>
-        <w:t xml:space="preserve"> Actively selected real trials (by predicted gap or uncertainty), used to correct twin and model, reach the target P with ≥ 50% fewer than random selection. </w:t>
+        <w:t xml:space="preserve"> C3 (real trials selected by predicted gap or uncertainty, used to correct twin and model) reaches the target P with ≥ 50% fewer trials than random selection. </w:t>
       </w:r>
       <w:r>
         <w:rPr>
@@ -6023,14 +6053,14 @@
           <w:b/>
           <w:lang w:val="en-US"/>
         </w:rPr>
-        <w:t xml:space="preserve">RQ4 (whole loop: budget and generality).</w:t>
-      </w:r>
-      <w:r>
-        <w:rPr>
-          <w:rFonts w:cstheme="minorHAnsi"/>
-          <w:lang w:val="en-US"/>
-        </w:rPr>
-        <w:t xml:space="preserve"> What real-data budget does the full loop need versus real-only learning, across domains?</w:t>
+        <w:t xml:space="preserve">RQ4 (the whole method).</w:t>
+      </w:r>
+      <w:r>
+        <w:rPr>
+          <w:rFonts w:cstheme="minorHAnsi"/>
+          <w:lang w:val="en-US"/>
+        </w:rPr>
+        <w:t xml:space="preserve"> How much real data does the method need versus real-only learning and existing pipelines?</w:t>
       </w:r>
     </w:p>
     <w:p>
@@ -6044,14 +6074,14 @@
           <w:b/>
           <w:lang w:val="en-US"/>
         </w:rPr>
-        <w:t xml:space="preserve">H4.</w:t>
-      </w:r>
-      <w:r>
-        <w:rPr>
-          <w:rFonts w:cstheme="minorHAnsi"/>
-          <w:lang w:val="en-US"/>
-        </w:rPr>
-        <w:t xml:space="preserve"> (a) In each testbed the full loop (H1–H3) reaches the target P with ≤ 10% of the real data needed by real-only learning (imitation of demonstrations in the reference, same encoder and initialization). </w:t>
+        <w:t xml:space="preserve">H4 (thesis).</w:t>
+      </w:r>
+      <w:r>
+        <w:rPr>
+          <w:rFonts w:cstheme="minorHAnsi"/>
+          <w:lang w:val="en-US"/>
+        </w:rPr>
+        <w:t xml:space="preserve"> In each testbed, with C1–C3 and their hyperparameters unchanged, the method reaches the target P with (a) ≤ 10% of the real data of real-only learning (imitation of demonstrations in the reference, same encoder and initialization) and (b) ≥ 2× less real data than the strongest existing pipeline (uniform capture, domain randomization, random real-data selection; RialTo-style). </w:t>
       </w:r>
       <w:r>
         <w:rPr>
@@ -6066,7 +6096,7 @@
           <w:rFonts w:cstheme="minorHAnsi"/>
           <w:lang w:val="en-US"/>
         </w:rPr>
-        <w:t xml:space="preserve"> B_loop(τ₄) ≤ 0.1 · B_real(τ₄), upper 95% bound of the ratio &lt; 0.2; τ₄ = P of real-only learning at its largest budget; also reported: a uniform loop and a world-model simulator. (b) This holds in both testbeds with the allocation methods and their hyperparameters unchanged, the H1–H3 effects keep their sign, and tier B agrees in direction.</w:t>
+        <w:t xml:space="preserve"> (a) B_M(τ₄) ≤ 0.1 · B_real(τ₄), upper 95% bound of the ratio &lt; 0.2; (b) B_M(τ₅) ≤ 0.5 · B_pipe(τ₅), upper 95% bound &lt; 1; τ₄, τ₅ = P of each comparator at its largest budget; H1–H3 effects keep their sign and tier B agrees in direction. Also reported: a world-model simulator.</w:t>
       </w:r>
     </w:p>
     <w:p>
@@ -6077,17 +6107,9 @@
       <w:r>
         <w:rPr>
           <w:rFonts w:cstheme="minorHAnsi"/>
-          <w:b/>
-          <w:lang w:val="en-US"/>
-        </w:rPr>
-        <w:t xml:space="preserve">Decision rule.</w:t>
-      </w:r>
-      <w:r>
-        <w:rPr>
-          <w:rFonts w:cstheme="minorHAnsi"/>
-          <w:lang w:val="en-US"/>
-        </w:rPr>
-        <w:t xml:space="preserve"> A hypothesis holds when all its parts pass; a failed one is reported as a measured budget curve and does not block the next step.</w:t>
+          <w:lang w:val="en-US"/>
+        </w:rPr>
+        <w:t xml:space="preserve">A hypothesis holds when all its parts pass; a failed one is reported as a budget curve.</w:t>
       </w:r>
     </w:p>
     <w:permEnd w:id="1295260508"/>
@@ -6412,7 +6434,7 @@
           <w:rFonts w:cstheme="minorHAnsi"/>
           <w:lang w:val="en-US"/>
         </w:rPr>
-        <w:t xml:space="preserve"> in general, task- and domain-agnostic: building a digital twin (appearance, geometry and, where relevant, physical parameters) from limited real data, learning a policy or model in it and transferring the result back to reality, and how to make this loop work with </w:t>
+        <w:t xml:space="preserve"> in general, task- and domain-agnostic: building a digital twin (appearance, geometry and, where relevant, physical parameters) from limited real data, learning a policy or model in it and transferring the result back to reality; it develops a method that makes this loop work with </w:t>
       </w:r>
       <w:r>
         <w:rPr>
@@ -6441,42 +6463,29 @@
           <w:b/>
           <w:lang w:val="en-US"/>
         </w:rPr>
-        <w:t xml:space="preserve">Key original contribution.</w:t>
-      </w:r>
-      <w:r>
-        <w:rPr>
-          <w:rFonts w:cstheme="minorHAnsi"/>
-          <w:lang w:val="en-US"/>
-        </w:rPr>
-        <w:t xml:space="preserve"> To our knowledge, the first treatment of the real data in the whole real-to-sim-to-real loop as </w:t>
-      </w:r>
-      <w:r>
-        <w:rPr>
-          <w:rFonts w:cstheme="minorHAnsi"/>
-          <w:b/>
-          <w:lang w:val="en-US"/>
-        </w:rPr>
-        <w:t xml:space="preserve">one budget to be allocated actively</w:t>
-      </w:r>
-      <w:r>
-        <w:rPr>
-          <w:rFonts w:cstheme="minorHAnsi"/>
-          <w:lang w:val="en-US"/>
-        </w:rPr>
-        <w:t xml:space="preserve">, with a method for each step of the loop and real-data budget curves measured with the same methods in two domains, robotic manipulation and visual navigation.</w:t>
-      </w:r>
-    </w:p>
-    <w:p>
-      <w:pPr>
-        <w:spacing w:after="120" w:line="240" w:lineRule="auto"/>
-        <w:jc w:val="both"/>
-      </w:pPr>
-      <w:r>
-        <w:rPr>
-          <w:rFonts w:cstheme="minorHAnsi"/>
-          <w:lang w:val="en-US"/>
-        </w:rPr>
-        <w:t xml:space="preserve">Contributions to machine learning methodology:</w:t>
+        <w:t xml:space="preserve">Key original contribution: the method.</w:t>
+      </w:r>
+      <w:r>
+        <w:rPr>
+          <w:rFonts w:cstheme="minorHAnsi"/>
+          <w:lang w:val="en-US"/>
+        </w:rPr>
+        <w:t xml:space="preserve"> To our knowledge, the first method for real-to-sim-to-real learning that treats the real data of the whole loop as </w:t>
+      </w:r>
+      <w:r>
+        <w:rPr>
+          <w:rFonts w:cstheme="minorHAnsi"/>
+          <w:b/>
+          <w:lang w:val="en-US"/>
+        </w:rPr>
+        <w:t xml:space="preserve">one budget allocated actively at every step</w:t>
+      </w:r>
+      <w:r>
+        <w:rPr>
+          <w:rFonts w:cstheme="minorHAnsi"/>
+          <w:lang w:val="en-US"/>
+        </w:rPr>
+        <w:t xml:space="preserve">, so that it reaches a given real-world performance with significantly less real data: at most a tenth of the data of learning from real data only and at least two times less than the strongest existing real-to-sim-to-real pipeline (RQ4, H4), with the same components and settings in two domains, robotic manipulation and visual navigation. Its three components are parts of this one method, not separate contributions; each is tested as an ablation at its own step:</w:t>
       </w:r>
     </w:p>
     <w:p>
@@ -6498,14 +6507,14 @@
           <w:b/>
           <w:lang w:val="en-US"/>
         </w:rPr>
-        <w:t xml:space="preserve">Capture less (RQ1, H1).</w:t>
-      </w:r>
-      <w:r>
-        <w:rPr>
-          <w:rFonts w:cstheme="minorHAnsi"/>
-          <w:lang w:val="en-US"/>
-        </w:rPr>
-        <w:t xml:space="preserve"> A task-aware capture method that chooses which real data to collect for a twin (views for its appearance and geometry, interactions for its physical parameters) from the twin's uncertainty in the parts that matter for the task, instead of for reconstruction quality alone, and a test of how much capture it saves against uniform and task-blind selection.</w:t>
+        <w:t xml:space="preserve">C1, capture less (RQ1, H1).</w:t>
+      </w:r>
+      <w:r>
+        <w:rPr>
+          <w:rFonts w:cstheme="minorHAnsi"/>
+          <w:lang w:val="en-US"/>
+        </w:rPr>
+        <w:t xml:space="preserve"> Task-aware capture that chooses which real data to collect for a twin (views for its appearance and geometry, interactions for its physical parameters) from the twin's uncertainty in the parts that matter for the task, not reconstruction quality alone; compared with uniform and task-blind selection.</w:t>
       </w:r>
     </w:p>
     <w:p>
@@ -6527,14 +6536,14 @@
           <w:b/>
           <w:lang w:val="en-US"/>
         </w:rPr>
-        <w:t xml:space="preserve">Learn robustly in an imperfect twin (RQ2, H2).</w:t>
-      </w:r>
-      <w:r>
-        <w:rPr>
-          <w:rFonts w:cstheme="minorHAnsi"/>
-          <w:lang w:val="en-US"/>
-        </w:rPr>
-        <w:t xml:space="preserve"> An uncertainty-aware training method that turns the twin's per-region and per-parameter uncertainty and the representation distance to a small set of real samples into augmentation and sample weights, compared with uniform domain randomization at an equal capture budget.</w:t>
+        <w:t xml:space="preserve">C2, learn robustly in an imperfect twin (RQ2, H2).</w:t>
+      </w:r>
+      <w:r>
+        <w:rPr>
+          <w:rFonts w:cstheme="minorHAnsi"/>
+          <w:lang w:val="en-US"/>
+        </w:rPr>
+        <w:t xml:space="preserve"> Uncertainty-aware training that turns the twin's per-region and per-parameter uncertainty and the representation distance to a few real samples into augmentation and sample weights; compared with uniform domain randomization at an equal capture budget.</w:t>
       </w:r>
     </w:p>
     <w:p>
@@ -6556,14 +6565,481 @@
           <w:b/>
           <w:lang w:val="en-US"/>
         </w:rPr>
-        <w:t xml:space="preserve">Transfer with few real data (RQ3, H3).</w:t>
-      </w:r>
-      <w:r>
-        <w:rPr>
-          <w:rFonts w:cstheme="minorHAnsi"/>
-          <w:lang w:val="en-US"/>
-        </w:rPr>
-        <w:t xml:space="preserve"> An active selection method for real-world trials or interactions, driven by the predicted twin-to-real gap and its uncertainty, and a procedure that uses them to correct both the twin and the learned model, compared with random selection.</w:t>
+        <w:t xml:space="preserve">C3, transfer with few real data (RQ3, H3).</w:t>
+      </w:r>
+      <w:r>
+        <w:rPr>
+          <w:rFonts w:cstheme="minorHAnsi"/>
+          <w:lang w:val="en-US"/>
+        </w:rPr>
+        <w:t xml:space="preserve"> Active selection of real-world trials or interactions by the predicted twin-to-real gap and its uncertainty, used to correct both the twin and the learned model; compared with random selection.</w:t>
+      </w:r>
+    </w:p>
+    <w:p>
+      <w:pPr>
+        <w:spacing w:after="120" w:line="240" w:lineRule="auto"/>
+        <w:jc w:val="both"/>
+      </w:pPr>
+      <w:r>
+        <w:rPr>
+          <w:rFonts w:cstheme="minorHAnsi"/>
+          <w:b/>
+          <w:lang w:val="en-US"/>
+        </w:rPr>
+        <w:t xml:space="preserve">How the method is evaluated and released</w:t>
+      </w:r>
+      <w:r>
+        <w:rPr>
+          <w:rFonts w:cstheme="minorHAnsi"/>
+          <w:lang w:val="en-US"/>
+        </w:rPr>
+        <w:t xml:space="preserve"> (supporting the method, not contributions in their own right). Budget–performance curves of the method against real-only learning and the existing pipeline, which give the "exchange rate" between twin and real data and tell practitioners roughly how much real data to collect for a new task or site; a proxy-reality protocol on public data that counts real data exactly without a robot (a reference from a separate, higher-fidelity source as "reality", a low-budget twin from a separate capture as the simulator), applied in each domain; and open-source code of the method, built on existing twin pipelines and simulators.</w:t>
+      </w:r>
+    </w:p>
+    <w:p>
+      <w:pPr>
+        <w:spacing w:after="120" w:line="240" w:lineRule="auto"/>
+        <w:jc w:val="both"/>
+      </w:pPr>
+      <w:r>
+        <w:rPr>
+          <w:rFonts w:cstheme="minorHAnsi"/>
+          <w:b/>
+          <w:lang w:val="en-US"/>
+        </w:rPr>
+        <w:t xml:space="preserve">Significance for the discipline.</w:t>
+      </w:r>
+      <w:r>
+        <w:rPr>
+          <w:rFonts w:cstheme="minorHAnsi"/>
+          <w:lang w:val="en-US"/>
+        </w:rPr>
+        <w:t xml:space="preserve"> Real target-domain data is the main cost of deploying learned systems. Methods that decide where it is worth spending, and a measured estimate of how much of it a twin can replace, are relevant to active learning, learning under distribution shift and uncertainty estimation in general, beyond robotics.</w:t>
+      </w:r>
+    </w:p>
+    <w:p>
+      <w:pPr>
+        <w:spacing w:after="0" w:line="240" w:lineRule="auto"/>
+        <w:jc w:val="both"/>
+      </w:pPr>
+      <w:r>
+        <w:rPr>
+          <w:rFonts w:cstheme="minorHAnsi"/>
+          <w:b/>
+          <w:lang w:val="en-US"/>
+        </w:rPr>
+        <w:t xml:space="preserve">Dissemination.</w:t>
+      </w:r>
+      <w:r>
+        <w:rPr>
+          <w:rFonts w:cstheme="minorHAnsi"/>
+          <w:lang w:val="en-US"/>
+        </w:rPr>
+        <w:t xml:space="preserve"> Results are planned for peer-reviewed conferences worth 200 points and assigned to ITiT on the ministerial list of 5.01.2024: NeurIPS, ICML and ICLR (machine learning) and CVPR (computer vision), with ICCV and ECCV for resubmissions. P1 (C1 and first C2 results, RQ1–RQ2) targets NeurIPS 2027; P2 (C3, RQ3) ICML 2028 or CVPR 2028; P3 (the whole method against real-only learning and the existing pipeline in both domains, RQ4) NeurIPS 2028, with ICLR 2029 as the fallback.</w:t>
+      </w:r>
+    </w:p>
+    <w:permEnd w:id="1098318749"/>
+    <w:p>
+      <w:pPr>
+        <w:spacing w:after="0" w:line="240" w:lineRule="auto"/>
+        <w:jc w:val="both"/>
+        <w:rPr>
+          <w:rFonts w:cstheme="minorHAnsi"/>
+          <w:szCs w:val="20"/>
+          <w:lang w:val="en-US"/>
+        </w:rPr>
+      </w:pPr>
+    </w:p>
+    <w:p>
+      <w:pPr>
+        <w:shd w:val="clear" w:color="auto" w:fill="E6E6FA"/>
+        <w:spacing w:after="120" w:line="240" w:lineRule="auto"/>
+        <w:jc w:val="both"/>
+        <w:rPr>
+          <w:rFonts w:cstheme="minorHAnsi"/>
+          <w:b/>
+          <w:sz w:val="28"/>
+          <w:szCs w:val="20"/>
+        </w:rPr>
+      </w:pPr>
+      <w:r>
+        <w:rPr>
+          <w:rFonts w:cstheme="minorHAnsi"/>
+          <w:b/>
+          <w:sz w:val="28"/>
+          <w:szCs w:val="20"/>
+        </w:rPr>
+        <w:t>9. </w:t>
+      </w:r>
+      <w:r>
+        <w:rPr>
+          <w:rFonts w:cstheme="minorHAnsi"/>
+          <w:b/>
+          <w:sz w:val="28"/>
+          <w:szCs w:val="20"/>
+        </w:rPr>
+        <w:t>P</w:t>
+      </w:r>
+      <w:r>
+        <w:rPr>
+          <w:rFonts w:cstheme="minorHAnsi"/>
+          <w:b/>
+          <w:sz w:val="28"/>
+          <w:szCs w:val="20"/>
+        </w:rPr>
+        <w:t>lanowane metody badawcze</w:t>
+      </w:r>
+      <w:r>
+        <w:rPr>
+          <w:rFonts w:cstheme="minorHAnsi"/>
+          <w:b/>
+          <w:sz w:val="28"/>
+          <w:szCs w:val="20"/>
+        </w:rPr>
+        <w:t> </w:t>
+      </w:r>
+      <w:r>
+        <w:rPr>
+          <w:rFonts w:cstheme="minorHAnsi"/>
+          <w:b/>
+          <w:sz w:val="28"/>
+          <w:szCs w:val="20"/>
+        </w:rPr>
+        <w:t>/</w:t>
+      </w:r>
+      <w:r>
+        <w:rPr>
+          <w:rFonts w:cstheme="minorHAnsi"/>
+          <w:b/>
+          <w:sz w:val="28"/>
+          <w:szCs w:val="20"/>
+        </w:rPr>
+        <w:t> </w:t>
+      </w:r>
+      <w:r>
+        <w:rPr>
+          <w:rFonts w:cstheme="minorHAnsi"/>
+          <w:b/>
+          <w:color w:val="4472C4" w:themeColor="accent1"/>
+          <w:sz w:val="28"/>
+          <w:szCs w:val="20"/>
+        </w:rPr>
+        <w:t>Planned research methods</w:t>
+      </w:r>
+    </w:p>
+    <w:p>
+      <w:pPr>
+        <w:shd w:val="clear" w:color="auto" w:fill="E7E6E6" w:themeFill="background2"/>
+        <w:spacing w:after="0" w:line="240" w:lineRule="auto"/>
+        <w:rPr>
+          <w:rFonts w:cstheme="minorHAnsi"/>
+          <w:i/>
+          <w:szCs w:val="20"/>
+          <w:lang w:val="en-US"/>
+        </w:rPr>
+      </w:pPr>
+      <w:r>
+        <w:rPr>
+          <w:rFonts w:cstheme="minorHAnsi"/>
+          <w:i/>
+          <w:szCs w:val="20"/>
+        </w:rPr>
+        <w:t xml:space="preserve">Krótki opis metod badawczych, które są będą użyte w czasie realizacji rozprawy doktorskiej dla </w:t>
+      </w:r>
+      <w:r>
+        <w:rPr>
+          <w:rFonts w:cstheme="minorHAnsi"/>
+          <w:i/>
+          <w:szCs w:val="20"/>
+        </w:rPr>
+        <w:t xml:space="preserve">(maks. </w:t>
+      </w:r>
+      <w:r>
+        <w:rPr>
+          <w:rFonts w:cstheme="minorHAnsi"/>
+          <w:i/>
+          <w:szCs w:val="20"/>
+          <w:lang w:val="en-US"/>
+        </w:rPr>
+        <w:t>2</w:t>
+      </w:r>
+      <w:r>
+        <w:rPr>
+          <w:rFonts w:cstheme="minorHAnsi"/>
+          <w:i/>
+          <w:szCs w:val="20"/>
+          <w:lang w:val="en-US"/>
+        </w:rPr>
+        <w:t xml:space="preserve"> stron</w:t>
+      </w:r>
+      <w:r>
+        <w:rPr>
+          <w:rFonts w:cstheme="minorHAnsi"/>
+          <w:i/>
+          <w:szCs w:val="20"/>
+          <w:lang w:val="en-US"/>
+        </w:rPr>
+        <w:t>y</w:t>
+      </w:r>
+      <w:r>
+        <w:rPr>
+          <w:rFonts w:cstheme="minorHAnsi"/>
+          <w:i/>
+          <w:szCs w:val="20"/>
+          <w:lang w:val="en-US"/>
+        </w:rPr>
+        <w:t>, czcionka 11 pt., interlinia 1).</w:t>
+      </w:r>
+      <w:r>
+        <w:rPr>
+          <w:rFonts w:cstheme="minorHAnsi"/>
+          <w:i/>
+          <w:szCs w:val="20"/>
+          <w:lang w:val="en-US"/>
+        </w:rPr>
+        <w:t xml:space="preserve"> </w:t>
+      </w:r>
+      <w:r>
+        <w:rPr>
+          <w:rFonts w:cstheme="minorHAnsi"/>
+          <w:i/>
+          <w:szCs w:val="20"/>
+          <w:lang w:val="en-US"/>
+        </w:rPr>
+        <w:t>/</w:t>
+      </w:r>
+      <w:r>
+        <w:rPr>
+          <w:rFonts w:cstheme="minorHAnsi"/>
+          <w:i/>
+          <w:color w:val="4472C4" w:themeColor="accent1"/>
+          <w:szCs w:val="20"/>
+          <w:lang w:val="en-US"/>
+        </w:rPr>
+        <w:t xml:space="preserve"> </w:t>
+      </w:r>
+      <w:r>
+        <w:rPr>
+          <w:rFonts w:cstheme="minorHAnsi"/>
+          <w:i/>
+          <w:color w:val="4472C4" w:themeColor="accent1"/>
+          <w:szCs w:val="20"/>
+          <w:lang w:val="en-US"/>
+        </w:rPr>
+        <w:t xml:space="preserve">Brief description of the research methods that will be used during the implementation of the doctoral dissertation </w:t>
+      </w:r>
+      <w:r>
+        <w:rPr>
+          <w:i/>
+          <w:color w:val="4472C4" w:themeColor="accent1"/>
+          <w:szCs w:val="20"/>
+          <w:lang w:val="en-US"/>
+        </w:rPr>
+        <w:t xml:space="preserve">(at </w:t>
+      </w:r>
+      <w:r>
+        <w:rPr>
+          <w:i/>
+          <w:color w:val="4472C4" w:themeColor="accent1"/>
+          <w:szCs w:val="20"/>
+          <w:lang w:val="en-US"/>
+        </w:rPr>
+        <w:t xml:space="preserve">most </w:t>
+      </w:r>
+      <w:r>
+        <w:rPr>
+          <w:i/>
+          <w:color w:val="4472C4" w:themeColor="accent1"/>
+          <w:szCs w:val="20"/>
+          <w:lang w:val="en-US"/>
+        </w:rPr>
+        <w:t>2</w:t>
+      </w:r>
+      <w:r>
+        <w:rPr>
+          <w:i/>
+          <w:color w:val="4472C4" w:themeColor="accent1"/>
+          <w:szCs w:val="20"/>
+          <w:lang w:val="en-US"/>
+        </w:rPr>
+        <w:t xml:space="preserve"> page</w:t>
+      </w:r>
+      <w:r>
+        <w:rPr>
+          <w:i/>
+          <w:color w:val="4472C4" w:themeColor="accent1"/>
+          <w:szCs w:val="20"/>
+          <w:lang w:val="en-US"/>
+        </w:rPr>
+        <w:t>s</w:t>
+      </w:r>
+      <w:r>
+        <w:rPr>
+          <w:i/>
+          <w:color w:val="4472C4" w:themeColor="accent1"/>
+          <w:szCs w:val="20"/>
+          <w:lang w:val="en-US"/>
+        </w:rPr>
+        <w:t>, font 11, line spacing 1)</w:t>
+      </w:r>
+      <w:r>
+        <w:rPr>
+          <w:i/>
+          <w:color w:val="4472C4" w:themeColor="accent1"/>
+          <w:szCs w:val="20"/>
+          <w:lang w:val="en-US"/>
+        </w:rPr>
+        <w:t>.</w:t>
+      </w:r>
+    </w:p>
+    <w:p>
+      <w:pPr>
+        <w:spacing w:after="0" w:line="240" w:lineRule="auto"/>
+        <w:jc w:val="both"/>
+        <w:rPr>
+          <w:rFonts w:cstheme="minorHAnsi"/>
+          <w:szCs w:val="20"/>
+          <w:lang w:val="en-US"/>
+        </w:rPr>
+      </w:pPr>
+    </w:p>
+    <w:p>
+      <w:pPr>
+        <w:spacing w:after="120" w:line="240" w:lineRule="auto"/>
+        <w:jc w:val="both"/>
+      </w:pPr>
+      <w:permStart w:id="32011344" w:edGrp="everyone"/>
+      <w:r>
+        <w:rPr>
+          <w:rFonts w:cstheme="minorHAnsi"/>
+          <w:lang w:val="en-US"/>
+        </w:rPr>
+        <w:t xml:space="preserve">The dissertation develops </w:t>
+      </w:r>
+      <w:r>
+        <w:rPr>
+          <w:rFonts w:cstheme="minorHAnsi"/>
+          <w:b/>
+          <w:lang w:val="en-US"/>
+        </w:rPr>
+        <w:t xml:space="preserve">one method</w:t>
+      </w:r>
+      <w:r>
+        <w:rPr>
+          <w:rFonts w:cstheme="minorHAnsi"/>
+          <w:lang w:val="en-US"/>
+        </w:rPr>
+        <w:t xml:space="preserve"> for the loop: real data → twin → learning in the twin → a few real trials → correction of the twin and the policy → deployment. Its three components, one per step, are developed and tested as ablations in Stages I–III (§3, §7): C1 task-aware capture (RQ1), C2 uncertainty-aware learning in an imperfect twin (RQ2) and C3 active selection of few real data (RQ3); Stage IV tests the whole method (RQ4, the thesis H4). The components are domain-agnostic: they act on the twin's uncertainty, on task relevance measured in the twin and on learned representations. The twin has two parts: geometry and appearance, reconstructed with existing open-source 3D Gaussian Splatting (3DGS) [2] pipelines, and physical or dynamic parameters, identified from real interactions as a posterior (BayesSim-type [9]). No simulator or benchmark is developed. Robotic manipulation and visual navigation are equal testbeds with the same protocol.</w:t>
+      </w:r>
+    </w:p>
+    <w:p>
+      <w:pPr>
+        <w:spacing w:after="120" w:line="240" w:lineRule="auto"/>
+        <w:jc w:val="both"/>
+      </w:pPr>
+      <w:r>
+        <w:rPr>
+          <w:rFonts w:cstheme="minorHAnsi"/>
+          <w:b/>
+          <w:lang w:val="en-US"/>
+        </w:rPr>
+        <w:t xml:space="preserve">Tier A protocol: proxy reality (decides the hypotheses).</w:t>
+      </w:r>
+      <w:r>
+        <w:rPr>
+          <w:rFonts w:cstheme="minorHAnsi"/>
+          <w:lang w:val="en-US"/>
+        </w:rPr>
+        <w:t xml:space="preserve"> In each testbed, "reality" is a reference from a separate, higher-fidelity source, and the twin is built from a subset of a separate, cheaper capture, sharing no data. </w:t>
+      </w:r>
+      <w:r>
+        <w:rPr>
+          <w:rFonts w:cstheme="minorHAnsi"/>
+          <w:i/>
+          <w:lang w:val="en-US"/>
+        </w:rPr>
+        <w:t xml:space="preserve">Navigation:</w:t>
+      </w:r>
+      <w:r>
+        <w:rPr>
+          <w:rFonts w:cstheme="minorHAnsi"/>
+          <w:lang w:val="en-US"/>
+        </w:rPr>
+        <w:t xml:space="preserve"> ScanNet++ [22] gives each scene a laser scan, DSLR images and a separate phone RGB-D stream. On ≥ 20 scenes (10 held out from all tuning), the reference is the laser-scan mesh textured from the DSLR images and rendered in Habitat [1] with a robot-camera model; the twin is 3DGS from a subset of the phone stream, run as a mesh (as in EmbodiedSplat [5]) or with a 3DGS renderer (GaussGym [7]); its physical part is the robot's actuation noise. Tasks: image-goal and point-goal navigation with a minimum geodesic distance set in a pilot so that P stays below its ceiling. </w:t>
+      </w:r>
+      <w:r>
+        <w:rPr>
+          <w:rFonts w:cstheme="minorHAnsi"/>
+          <w:i/>
+          <w:lang w:val="en-US"/>
+        </w:rPr>
+        <w:t xml:space="preserve">Manipulation:</w:t>
+      </w:r>
+      <w:r>
+        <w:rPr>
+          <w:rFonts w:cstheme="minorHAnsi"/>
+          <w:lang w:val="en-US"/>
+        </w:rPr>
+        <w:t xml:space="preserve"> ManiSkill3 [8] tasks (≥ 20 task–object configurations, 10 held out), where reality is the simulator with held-out ground-truth physical parameters (mass, friction, articulation) and its own rendering, and the twin is 3DGS from a subset of its views plus parameters identified from a few recorded interactions. Physics engine and object models are shared, so this is the weaker proxy (unmodelled dynamics are not tested); tier B checks it. </w:t>
+      </w:r>
+      <w:r>
+        <w:rPr>
+          <w:rFonts w:cstheme="minorHAnsi"/>
+          <w:i/>
+          <w:lang w:val="en-US"/>
+        </w:rPr>
+        <w:t xml:space="preserve">Both:</w:t>
+      </w:r>
+      <w:r>
+        <w:rPr>
+          <w:rFonts w:cstheme="minorHAnsi"/>
+          <w:lang w:val="en-US"/>
+        </w:rPr>
+        <w:t xml:space="preserve"> real data is counted exactly: capture = views and interaction samples given to the twin, real trials and demonstrations = episodes in the reference, summed in one operator-time cost at a pre-registered rate; the largest budget stays below the full capture. In navigation the proxy's error to held-out real images is reported (PSNR, LPIPS, depth) and each hypothesis is re-checked for sign with a second reference (3DGS from all DSLR images). </w:t>
+      </w:r>
+      <w:r>
+        <w:rPr>
+          <w:rFonts w:cstheme="minorHAnsi"/>
+          <w:i/>
+          <w:lang w:val="en-US"/>
+        </w:rPr>
+        <w:t xml:space="preserve">Tier B:</w:t>
+      </w:r>
+      <w:r>
+        <w:rPr>
+          <w:rFonts w:cstheme="minorHAnsi"/>
+          <w:lang w:val="en-US"/>
+        </w:rPr>
+        <w:t xml:space="preserve"> the twin must rank manipulation policies as published paired sim/real evaluations do (SIMPLER [34]). </w:t>
+      </w:r>
+      <w:r>
+        <w:rPr>
+          <w:rFonts w:cstheme="minorHAnsi"/>
+          <w:i/>
+          <w:lang w:val="en-US"/>
+        </w:rPr>
+        <w:t xml:space="preserve">Compute:</w:t>
+      </w:r>
+      <w:r>
+        <w:rPr>
+          <w:rFonts w:cstheme="minorHAnsi"/>
+          <w:lang w:val="en-US"/>
+        </w:rPr>
+        <w:t xml:space="preserve"> WCSS Lem (NVIDIA H100), PLGrid (to be applied for). Policies are small heads on frozen visual encoders, trained mainly by imitation of a privileged expert in the twin (shortest-path planner; motion-planning expert), with reinforcement learning on a subset. P = task success rate.</w:t>
+      </w:r>
+    </w:p>
+    <w:p>
+      <w:pPr>
+        <w:spacing w:after="120" w:line="240" w:lineRule="auto"/>
+        <w:jc w:val="both"/>
+      </w:pPr>
+      <w:r>
+        <w:rPr>
+          <w:rFonts w:cstheme="minorHAnsi"/>
+          <w:b/>
+          <w:lang w:val="en-US"/>
+        </w:rPr>
+        <w:t xml:space="preserve">Stage I – C1, task-aware capture (RQ1, H1; sem. 3–4).</w:t>
       </w:r>
     </w:p>
     <w:p>
@@ -6577,35 +7053,37 @@
           <w:rFonts w:cstheme="minorHAnsi"/>
           <w:lang w:val="en-US"/>
         </w:rPr>
-        <w:t xml:space="preserve">4.	</w:t>
-      </w:r>
-      <w:r>
-        <w:rPr>
-          <w:rFonts w:cstheme="minorHAnsi"/>
-          <w:b/>
-          <w:lang w:val="en-US"/>
-        </w:rPr>
-        <w:t xml:space="preserve">Budget curves for the loop (RQ4, H4).</w:t>
-      </w:r>
-      <w:r>
-        <w:rPr>
-          <w:rFonts w:cstheme="minorHAnsi"/>
-          <w:lang w:val="en-US"/>
-        </w:rPr>
-        <w:t xml:space="preserve"> Budget–performance curves of the full loop that give the "exchange rate" between twin and real data (how much real data the loop needs, relative to learning from real data only, to reach a given real task performance), and a test of whether the methods hold unchanged in both domains.</w:t>
-      </w:r>
-    </w:p>
-    <w:p>
-      <w:pPr>
-        <w:spacing w:after="120" w:line="240" w:lineRule="auto"/>
-        <w:jc w:val="both"/>
-      </w:pPr>
-      <w:r>
-        <w:rPr>
-          <w:rFonts w:cstheme="minorHAnsi"/>
-          <w:lang w:val="en-US"/>
-        </w:rPr>
-        <w:t xml:space="preserve">Contributions in engineering terms (ITiT):</w:t>
+        <w:t xml:space="preserve">•	</w:t>
+      </w:r>
+      <w:r>
+        <w:rPr>
+          <w:rFonts w:cstheme="minorHAnsi"/>
+          <w:i/>
+          <w:lang w:val="en-US"/>
+        </w:rPr>
+        <w:t xml:space="preserve">Method:</w:t>
+      </w:r>
+      <w:r>
+        <w:rPr>
+          <w:rFonts w:cstheme="minorHAnsi"/>
+          <w:lang w:val="en-US"/>
+        </w:rPr>
+        <w:t xml:space="preserve"> the twin's uncertainty, per region (Fisher information [17] or a Bayes' Rays-type [19] field, adapted to 3DGS) and per physical parameter (posterior spread), is weighted by </w:t>
+      </w:r>
+      <w:r>
+        <w:rPr>
+          <w:rFonts w:cstheme="minorHAnsi"/>
+          <w:b/>
+          <w:lang w:val="en-US"/>
+        </w:rPr>
+        <w:t xml:space="preserve">task relevance</w:t>
+      </w:r>
+      <w:r>
+        <w:rPr>
+          <w:rFonts w:cstheme="minorHAnsi"/>
+          <w:lang w:val="en-US"/>
+        </w:rPr>
+        <w:t xml:space="preserve"> measured in the current twin without training: how often expert trajectories pass through a region, and how much the expert's success changes across a parameter's posterior. The next views or interactions are chosen greedily where task-weighted uncertainty is highest until the budget is spent. Candidates come from the recorded pool; capture time is also estimated as a tour of the chosen views.</w:t>
       </w:r>
     </w:p>
     <w:p>
@@ -6619,22 +7097,80 @@
           <w:rFonts w:cstheme="minorHAnsi"/>
           <w:lang w:val="en-US"/>
         </w:rPr>
-        <w:t xml:space="preserve">5.	</w:t>
-      </w:r>
-      <w:r>
-        <w:rPr>
-          <w:rFonts w:cstheme="minorHAnsi"/>
-          <w:b/>
-          <w:lang w:val="en-US"/>
-        </w:rPr>
-        <w:t xml:space="preserve">Evaluation protocol and software (supports all RQs).</w:t>
-      </w:r>
-      <w:r>
-        <w:rPr>
-          <w:rFonts w:cstheme="minorHAnsi"/>
-          <w:lang w:val="en-US"/>
-        </w:rPr>
-        <w:t xml:space="preserve"> A proxy-reality protocol on public data that counts real data exactly without a robot (a reference from a separate, higher-fidelity source as "reality", a low-budget twin from a separate capture as the simulator), applied in each domain, and open-source code for the three methods and the budget curves, built on existing twin pipelines and simulators. It tells practitioners roughly how much real data to collect for a new task or site.</w:t>
+        <w:t xml:space="preserve">•	</w:t>
+      </w:r>
+      <w:r>
+        <w:rPr>
+          <w:rFonts w:cstheme="minorHAnsi"/>
+          <w:i/>
+          <w:lang w:val="en-US"/>
+        </w:rPr>
+        <w:t xml:space="preserve">Baselines:</w:t>
+      </w:r>
+      <w:r>
+        <w:rPr>
+          <w:rFonts w:cstheme="minorHAnsi"/>
+          <w:lang w:val="en-US"/>
+        </w:rPr>
+        <w:t xml:space="preserve"> uniform capture, task-blind uncertainty selection (FisherRF-type next-best-view [17]; ASID-type exploration for parameter accuracy [21]) and risk-weighted view selection [20], at the same budget.</w:t>
+      </w:r>
+    </w:p>
+    <w:p>
+      <w:pPr>
+        <w:spacing w:after="40" w:line="240" w:lineRule="auto"/>
+        <w:ind w:left="284" w:hanging="284"/>
+        <w:jc w:val="both"/>
+      </w:pPr>
+      <w:r>
+        <w:rPr>
+          <w:rFonts w:cstheme="minorHAnsi"/>
+          <w:lang w:val="en-US"/>
+        </w:rPr>
+        <w:t xml:space="preserve">•	</w:t>
+      </w:r>
+      <w:r>
+        <w:rPr>
+          <w:rFonts w:cstheme="minorHAnsi"/>
+          <w:i/>
+          <w:lang w:val="en-US"/>
+        </w:rPr>
+        <w:t xml:space="preserve">Metric:</w:t>
+      </w:r>
+      <w:r>
+        <w:rPr>
+          <w:rFonts w:cstheme="minorHAnsi"/>
+          <w:lang w:val="en-US"/>
+        </w:rPr>
+        <w:t xml:space="preserve"> budget–P curves on tier A with ≥ 4 capture budgets per testbed; capture needed to reach the P that uniform capture reaches at the largest budget.</w:t>
+      </w:r>
+    </w:p>
+    <w:p>
+      <w:pPr>
+        <w:spacing w:after="40" w:line="240" w:lineRule="auto"/>
+        <w:ind w:left="284" w:hanging="284"/>
+        <w:jc w:val="both"/>
+      </w:pPr>
+      <w:r>
+        <w:rPr>
+          <w:rFonts w:cstheme="minorHAnsi"/>
+          <w:lang w:val="en-US"/>
+        </w:rPr>
+        <w:t xml:space="preserve">•	</w:t>
+      </w:r>
+      <w:r>
+        <w:rPr>
+          <w:rFonts w:cstheme="minorHAnsi"/>
+          <w:i/>
+          <w:lang w:val="en-US"/>
+        </w:rPr>
+        <w:t xml:space="preserve">Success criterion (H1):</w:t>
+      </w:r>
+      <w:r>
+        <w:rPr>
+          <w:rFonts w:cstheme="minorHAnsi"/>
+          <w:lang w:val="en-US"/>
+        </w:rPr>
+        <w:t xml:space="preserve"> ≥ 40% less capture than uniform at equal P, and less than task-blind selection (upper 95% bound of the ratio &lt; 1), as in §7.</w:t>
       </w:r>
     </w:p>
     <w:p>
@@ -6648,14 +7184,347 @@
           <w:b/>
           <w:lang w:val="en-US"/>
         </w:rPr>
-        <w:t xml:space="preserve">Significance for the discipline.</w:t>
-      </w:r>
-      <w:r>
-        <w:rPr>
-          <w:rFonts w:cstheme="minorHAnsi"/>
-          <w:lang w:val="en-US"/>
-        </w:rPr>
-        <w:t xml:space="preserve"> Real target-domain data is the main cost of deploying learned systems. Methods that decide where it is worth spending, and a measured estimate of how much of it a twin can replace, are relevant to active learning, learning under distribution shift and uncertainty estimation in general, beyond robotics.</w:t>
+        <w:t xml:space="preserve">Stage II – C2, uncertainty-aware learning in an imperfect twin (RQ2, H2; sem. 4).</w:t>
+      </w:r>
+    </w:p>
+    <w:p>
+      <w:pPr>
+        <w:spacing w:after="40" w:line="240" w:lineRule="auto"/>
+        <w:ind w:left="284" w:hanging="284"/>
+        <w:jc w:val="both"/>
+      </w:pPr>
+      <w:r>
+        <w:rPr>
+          <w:rFonts w:cstheme="minorHAnsi"/>
+          <w:lang w:val="en-US"/>
+        </w:rPr>
+        <w:t xml:space="preserve">•	</w:t>
+      </w:r>
+      <w:r>
+        <w:rPr>
+          <w:rFonts w:cstheme="minorHAnsi"/>
+          <w:i/>
+          <w:lang w:val="en-US"/>
+        </w:rPr>
+        <w:t xml:space="preserve">Method:</w:t>
+      </w:r>
+      <w:r>
+        <w:rPr>
+          <w:rFonts w:cstheme="minorHAnsi"/>
+          <w:lang w:val="en-US"/>
+        </w:rPr>
+        <w:t xml:space="preserve"> (a) randomization whose strength follows the twin's uncertainty: appearance and geometry perturbations per region, and physical parameters sampled from their identified posterior instead of hand-set ranges; (b) down-weighting twin samples that lie far from a few real samples in frozen DINOv2 [27] feature space. The real samples are a held-out slice of the capture, not used to fit the twin, and count towards the budget.</w:t>
+      </w:r>
+    </w:p>
+    <w:p>
+      <w:pPr>
+        <w:spacing w:after="40" w:line="240" w:lineRule="auto"/>
+        <w:ind w:left="284" w:hanging="284"/>
+        <w:jc w:val="both"/>
+      </w:pPr>
+      <w:r>
+        <w:rPr>
+          <w:rFonts w:cstheme="minorHAnsi"/>
+          <w:lang w:val="en-US"/>
+        </w:rPr>
+        <w:t xml:space="preserve">•	</w:t>
+      </w:r>
+      <w:r>
+        <w:rPr>
+          <w:rFonts w:cstheme="minorHAnsi"/>
+          <w:i/>
+          <w:lang w:val="en-US"/>
+        </w:rPr>
+        <w:t xml:space="preserve">Baselines:</w:t>
+      </w:r>
+      <w:r>
+        <w:rPr>
+          <w:rFonts w:cstheme="minorHAnsi"/>
+          <w:lang w:val="en-US"/>
+        </w:rPr>
+        <w:t xml:space="preserve"> uniform domain randomization of appearance [23] and dynamics [24] (tuned ranges), no randomization, and feature alignment [26] as a comparator; same capture budget.</w:t>
+      </w:r>
+    </w:p>
+    <w:p>
+      <w:pPr>
+        <w:spacing w:after="40" w:line="240" w:lineRule="auto"/>
+        <w:ind w:left="284" w:hanging="284"/>
+        <w:jc w:val="both"/>
+      </w:pPr>
+      <w:r>
+        <w:rPr>
+          <w:rFonts w:cstheme="minorHAnsi"/>
+          <w:lang w:val="en-US"/>
+        </w:rPr>
+        <w:t xml:space="preserve">•	</w:t>
+      </w:r>
+      <w:r>
+        <w:rPr>
+          <w:rFonts w:cstheme="minorHAnsi"/>
+          <w:i/>
+          <w:lang w:val="en-US"/>
+        </w:rPr>
+        <w:t xml:space="preserve">Metric and criterion (H2):</w:t>
+      </w:r>
+      <w:r>
+        <w:rPr>
+          <w:rFonts w:cstheme="minorHAnsi"/>
+          <w:lang w:val="en-US"/>
+        </w:rPr>
+        <w:t xml:space="preserve"> tier-A P, paired by held-out scene; ≥ 10 pp higher P than uniform domain randomization (lower 95% bound &gt; 0) at each of ≥ 2 equal capture budgets.</w:t>
+      </w:r>
+    </w:p>
+    <w:p>
+      <w:pPr>
+        <w:spacing w:after="120" w:line="240" w:lineRule="auto"/>
+        <w:jc w:val="both"/>
+      </w:pPr>
+      <w:r>
+        <w:rPr>
+          <w:rFonts w:cstheme="minorHAnsi"/>
+          <w:b/>
+          <w:lang w:val="en-US"/>
+        </w:rPr>
+        <w:t xml:space="preserve">Stage III – C3, few real trials and correction (RQ3, H3; end of sem. 4 – sem. 5).</w:t>
+      </w:r>
+    </w:p>
+    <w:p>
+      <w:pPr>
+        <w:spacing w:after="40" w:line="240" w:lineRule="auto"/>
+        <w:ind w:left="284" w:hanging="284"/>
+        <w:jc w:val="both"/>
+      </w:pPr>
+      <w:r>
+        <w:rPr>
+          <w:rFonts w:cstheme="minorHAnsi"/>
+          <w:lang w:val="en-US"/>
+        </w:rPr>
+        <w:t xml:space="preserve">•	</w:t>
+      </w:r>
+      <w:r>
+        <w:rPr>
+          <w:rFonts w:cstheme="minorHAnsi"/>
+          <w:i/>
+          <w:lang w:val="en-US"/>
+        </w:rPr>
+        <w:t xml:space="preserve">Selection:</w:t>
+      </w:r>
+      <w:r>
+        <w:rPr>
+          <w:rFonts w:cstheme="minorHAnsi"/>
+          <w:lang w:val="en-US"/>
+        </w:rPr>
+        <w:t xml:space="preserve"> candidate trials (start–goal pairs, object configurations) are scored by the predicted twin-to-real gap: disagreement of a policy ensemble plus the twin's uncertainty along the planned trajectory. The top-k are run in reality (tier A: the reference).</w:t>
+      </w:r>
+    </w:p>
+    <w:p>
+      <w:pPr>
+        <w:spacing w:after="40" w:line="240" w:lineRule="auto"/>
+        <w:ind w:left="284" w:hanging="284"/>
+        <w:jc w:val="both"/>
+      </w:pPr>
+      <w:r>
+        <w:rPr>
+          <w:rFonts w:cstheme="minorHAnsi"/>
+          <w:lang w:val="en-US"/>
+        </w:rPr>
+        <w:t xml:space="preserve">•	</w:t>
+      </w:r>
+      <w:r>
+        <w:rPr>
+          <w:rFonts w:cstheme="minorHAnsi"/>
+          <w:i/>
+          <w:lang w:val="en-US"/>
+        </w:rPr>
+        <w:t xml:space="preserve">Use:</w:t>
+      </w:r>
+      <w:r>
+        <w:rPr>
+          <w:rFonts w:cstheme="minorHAnsi"/>
+          <w:lang w:val="en-US"/>
+        </w:rPr>
+        <w:t xml:space="preserve"> the trials (i) correct the twin, by re-capturing or re-weighting regions where real and twin observations disagree (photometric correction as in [35]; re-captured views are counted) and by updating the physical-parameter posterior [9, 25]; and (ii) fine-tune the policy by co-training with the real trials [15]. Real P is estimated from few trials with prediction-powered inference [32, 33].</w:t>
+      </w:r>
+    </w:p>
+    <w:p>
+      <w:pPr>
+        <w:spacing w:after="40" w:line="240" w:lineRule="auto"/>
+        <w:ind w:left="284" w:hanging="284"/>
+        <w:jc w:val="both"/>
+      </w:pPr>
+      <w:r>
+        <w:rPr>
+          <w:rFonts w:cstheme="minorHAnsi"/>
+          <w:lang w:val="en-US"/>
+        </w:rPr>
+        <w:t xml:space="preserve">•	</w:t>
+      </w:r>
+      <w:r>
+        <w:rPr>
+          <w:rFonts w:cstheme="minorHAnsi"/>
+          <w:i/>
+          <w:lang w:val="en-US"/>
+        </w:rPr>
+        <w:t xml:space="preserve">Baselines:</w:t>
+      </w:r>
+      <w:r>
+        <w:rPr>
+          <w:rFonts w:cstheme="minorHAnsi"/>
+          <w:lang w:val="en-US"/>
+        </w:rPr>
+        <w:t xml:space="preserve"> random selection and uniform coverage of the same number of trials; selection rules [29–31] where they apply.</w:t>
+      </w:r>
+    </w:p>
+    <w:p>
+      <w:pPr>
+        <w:spacing w:after="40" w:line="240" w:lineRule="auto"/>
+        <w:ind w:left="284" w:hanging="284"/>
+        <w:jc w:val="both"/>
+      </w:pPr>
+      <w:r>
+        <w:rPr>
+          <w:rFonts w:cstheme="minorHAnsi"/>
+          <w:lang w:val="en-US"/>
+        </w:rPr>
+        <w:t xml:space="preserve">•	</w:t>
+      </w:r>
+      <w:r>
+        <w:rPr>
+          <w:rFonts w:cstheme="minorHAnsi"/>
+          <w:i/>
+          <w:lang w:val="en-US"/>
+        </w:rPr>
+        <w:t xml:space="preserve">Success criterion (H3):</w:t>
+      </w:r>
+      <w:r>
+        <w:rPr>
+          <w:rFonts w:cstheme="minorHAnsi"/>
+          <w:lang w:val="en-US"/>
+        </w:rPr>
+        <w:t xml:space="preserve"> the target P is reached with ≥ 50% fewer real trials than random selection (upper 95% bound of the ratio &lt; 1).</w:t>
+      </w:r>
+    </w:p>
+    <w:p>
+      <w:pPr>
+        <w:spacing w:after="120" w:line="240" w:lineRule="auto"/>
+        <w:jc w:val="both"/>
+      </w:pPr>
+      <w:r>
+        <w:rPr>
+          <w:rFonts w:cstheme="minorHAnsi"/>
+          <w:b/>
+          <w:lang w:val="en-US"/>
+        </w:rPr>
+        <w:t xml:space="preserve">Stage IV – the whole method in both testbeds (RQ4, H4; sem. 6).</w:t>
+      </w:r>
+    </w:p>
+    <w:p>
+      <w:pPr>
+        <w:spacing w:after="40" w:line="240" w:lineRule="auto"/>
+        <w:ind w:left="284" w:hanging="284"/>
+        <w:jc w:val="both"/>
+      </w:pPr>
+      <w:r>
+        <w:rPr>
+          <w:rFonts w:cstheme="minorHAnsi"/>
+          <w:lang w:val="en-US"/>
+        </w:rPr>
+        <w:t xml:space="preserve">•	</w:t>
+      </w:r>
+      <w:r>
+        <w:rPr>
+          <w:rFonts w:cstheme="minorHAnsi"/>
+          <w:i/>
+          <w:lang w:val="en-US"/>
+        </w:rPr>
+        <w:t xml:space="preserve">Budget curves:</w:t>
+      </w:r>
+      <w:r>
+        <w:rPr>
+          <w:rFonts w:cstheme="minorHAnsi"/>
+          <w:lang w:val="en-US"/>
+        </w:rPr>
+        <w:t xml:space="preserve"> real data (capture + trials, one operator-time cost) against P for the method (C1–C3); for </w:t>
+      </w:r>
+      <w:r>
+        <w:rPr>
+          <w:rFonts w:cstheme="minorHAnsi"/>
+          <w:b/>
+          <w:lang w:val="en-US"/>
+        </w:rPr>
+        <w:t xml:space="preserve">real-only learning</w:t>
+      </w:r>
+      <w:r>
+        <w:rPr>
+          <w:rFonts w:cstheme="minorHAnsi"/>
+          <w:lang w:val="en-US"/>
+        </w:rPr>
+        <w:t xml:space="preserve">, imitation of expert demonstrations in the reference with the same frozen encoder and initialization (real-only reinforcement learning also shown); and for the </w:t>
+      </w:r>
+      <w:r>
+        <w:rPr>
+          <w:rFonts w:cstheme="minorHAnsi"/>
+          <w:b/>
+          <w:lang w:val="en-US"/>
+        </w:rPr>
+        <w:t xml:space="preserve">strongest existing pipeline</w:t>
+      </w:r>
+      <w:r>
+        <w:rPr>
+          <w:rFonts w:cstheme="minorHAnsi"/>
+          <w:lang w:val="en-US"/>
+        </w:rPr>
+        <w:t xml:space="preserve">, RialTo-style [3]: uniform capture, uniform domain randomization and random real trials, with the same twin, learner and correction. The "exchange rate" is the ratio of the budgets reaching the target P; real-only scaling [11, 12] suggests the curve shapes. Also reported: a released pretrained world model as the simulator (not trained).</w:t>
+      </w:r>
+    </w:p>
+    <w:p>
+      <w:pPr>
+        <w:spacing w:after="40" w:line="240" w:lineRule="auto"/>
+        <w:ind w:left="284" w:hanging="284"/>
+        <w:jc w:val="both"/>
+      </w:pPr>
+      <w:r>
+        <w:rPr>
+          <w:rFonts w:cstheme="minorHAnsi"/>
+          <w:lang w:val="en-US"/>
+        </w:rPr>
+        <w:t xml:space="preserve">•	</w:t>
+      </w:r>
+      <w:r>
+        <w:rPr>
+          <w:rFonts w:cstheme="minorHAnsi"/>
+          <w:i/>
+          <w:lang w:val="en-US"/>
+        </w:rPr>
+        <w:t xml:space="preserve">Success criterion (H4, the thesis; §7):</w:t>
+      </w:r>
+      <w:r>
+        <w:rPr>
+          <w:rFonts w:cstheme="minorHAnsi"/>
+          <w:lang w:val="en-US"/>
+        </w:rPr>
+        <w:t xml:space="preserve"> with C1–C3 and their hyperparameters unchanged (the learner is each task's standard one), in each testbed ≤ 10% of the real data of real-only learning (upper 95% bound &lt; 0.2) and ≥ 2× less than the existing pipeline (bound &lt; 1); H1–H3 effects keep their sign; tier B agrees in direction.</w:t>
+      </w:r>
+    </w:p>
+    <w:p>
+      <w:pPr>
+        <w:spacing w:after="120" w:line="240" w:lineRule="auto"/>
+        <w:jc w:val="both"/>
+      </w:pPr>
+      <w:r>
+        <w:rPr>
+          <w:rFonts w:cstheme="minorHAnsi"/>
+          <w:b/>
+          <w:lang w:val="en-US"/>
+        </w:rPr>
+        <w:t xml:space="preserve">Tier C validation.</w:t>
+      </w:r>
+      <w:r>
+        <w:rPr>
+          <w:rFonts w:cstheme="minorHAnsi"/>
+          <w:lang w:val="en-US"/>
+        </w:rPr>
+        <w:t xml:space="preserve"> Two robot campaigns (sem. 5 and 7) with own phone or RGB-D captures at PWr: a mobile robot in 2 rooms and, where access is agreed, a tabletop manipulator. Uniform capture versus the method, plus the few selected trials; about 8 robot-hours per campaign (3 policies × 2 settings × 30 episodes at ~2 min, plus 2 × 20 trials). Tier C reports agreement only and never tunes thresholds.</w:t>
       </w:r>
     </w:p>
     <w:p>
@@ -6669,17 +7538,17 @@
           <w:b/>
           <w:lang w:val="en-US"/>
         </w:rPr>
-        <w:t xml:space="preserve">Dissemination.</w:t>
-      </w:r>
-      <w:r>
-        <w:rPr>
-          <w:rFonts w:cstheme="minorHAnsi"/>
-          <w:lang w:val="en-US"/>
-        </w:rPr>
-        <w:t xml:space="preserve"> Results are planned for peer-reviewed conferences worth 200 points and assigned to ITiT on the ministerial list of 5.01.2024: NeurIPS, ICML and ICLR (machine learning) and CVPR (computer vision), with ICCV and ECCV for resubmissions. P1 (RQ1–RQ2, task-aware capture and first uncertainty-aware training results) targets NeurIPS 2027; P2 (RQ3, active selection of real data and twin correction) ICML 2028 or CVPR 2028; P3 (RQ4, budget curves in both domains) NeurIPS 2028, with ICLR 2029 as the fallback.</w:t>
-      </w:r>
-    </w:p>
-    <w:permEnd w:id="1098318749"/>
+        <w:t xml:space="preserve">Statistics and reproducibility.</w:t>
+      </w:r>
+      <w:r>
+        <w:rPr>
+          <w:rFonts w:cstheme="minorHAnsi"/>
+          <w:lang w:val="en-US"/>
+        </w:rPr>
+        <w:t xml:space="preserve"> Tests follow §7; the protocol is pre-registered before each stage and changes are logged. Code is released where the dataset licences permit.</w:t>
+      </w:r>
+    </w:p>
+    <w:permEnd w:id="32011344"/>
     <w:p>
       <w:pPr>
         <w:spacing w:after="0" w:line="240" w:lineRule="auto"/>
@@ -6710,25 +7579,16 @@
           <w:sz w:val="28"/>
           <w:szCs w:val="20"/>
         </w:rPr>
-        <w:t>9. </w:t>
-      </w:r>
-      <w:r>
-        <w:rPr>
-          <w:rFonts w:cstheme="minorHAnsi"/>
-          <w:b/>
-          <w:sz w:val="28"/>
-          <w:szCs w:val="20"/>
-        </w:rPr>
-        <w:t>P</w:t>
-      </w:r>
-      <w:r>
-        <w:rPr>
-          <w:rFonts w:cstheme="minorHAnsi"/>
-          <w:b/>
-          <w:sz w:val="28"/>
-          <w:szCs w:val="20"/>
-        </w:rPr>
-        <w:t>lanowane metody badawcze</w:t>
+        <w:t>10. </w:t>
+      </w:r>
+      <w:r>
+        <w:rPr>
+          <w:rFonts w:cstheme="minorHAnsi"/>
+          <w:b/>
+          <w:sz w:val="28"/>
+          <w:szCs w:val="20"/>
+        </w:rPr>
+        <w:t>Streszczenie popularnonaukowe</w:t>
       </w:r>
       <w:r>
         <w:rPr>
@@ -6765,7 +7625,7 @@
           <w:sz w:val="28"/>
           <w:szCs w:val="20"/>
         </w:rPr>
-        <w:t>Planned research methods</w:t>
+        <w:t>Abstract for general public</w:t>
       </w:r>
     </w:p>
     <w:p>
@@ -6775,61 +7635,36 @@
         <w:rPr>
           <w:rFonts w:cstheme="minorHAnsi"/>
           <w:i/>
-          <w:szCs w:val="20"/>
-          <w:lang w:val="en-US"/>
-        </w:rPr>
-      </w:pPr>
-      <w:r>
-        <w:rPr>
-          <w:rFonts w:cstheme="minorHAnsi"/>
-          <w:i/>
-          <w:szCs w:val="20"/>
-        </w:rPr>
-        <w:t xml:space="preserve">Krótki opis metod badawczych, które są będą użyte w czasie realizacji rozprawy doktorskiej dla </w:t>
-      </w:r>
-      <w:r>
-        <w:rPr>
-          <w:rFonts w:cstheme="minorHAnsi"/>
-          <w:i/>
-          <w:szCs w:val="20"/>
-        </w:rPr>
-        <w:t xml:space="preserve">(maks. </w:t>
-      </w:r>
-      <w:r>
-        <w:rPr>
-          <w:rFonts w:cstheme="minorHAnsi"/>
-          <w:i/>
-          <w:szCs w:val="20"/>
-          <w:lang w:val="en-US"/>
-        </w:rPr>
-        <w:t>2</w:t>
-      </w:r>
-      <w:r>
-        <w:rPr>
-          <w:rFonts w:cstheme="minorHAnsi"/>
-          <w:i/>
-          <w:szCs w:val="20"/>
-          <w:lang w:val="en-US"/>
-        </w:rPr>
-        <w:t xml:space="preserve"> stron</w:t>
-      </w:r>
-      <w:r>
-        <w:rPr>
-          <w:rFonts w:cstheme="minorHAnsi"/>
-          <w:i/>
-          <w:szCs w:val="20"/>
-          <w:lang w:val="en-US"/>
-        </w:rPr>
-        <w:t>y</w:t>
-      </w:r>
-      <w:r>
-        <w:rPr>
-          <w:rFonts w:cstheme="minorHAnsi"/>
-          <w:i/>
-          <w:szCs w:val="20"/>
-          <w:lang w:val="en-US"/>
-        </w:rPr>
-        <w:t>, czcionka 11 pt., interlinia 1).</w:t>
+          <w:color w:val="4472C4" w:themeColor="accent1"/>
+          <w:szCs w:val="20"/>
+          <w:lang w:val="en-US"/>
+        </w:rPr>
+      </w:pPr>
+      <w:r>
+        <w:rPr>
+          <w:rFonts w:cstheme="minorHAnsi"/>
+          <w:i/>
+          <w:szCs w:val="20"/>
+        </w:rPr>
+        <w:t xml:space="preserve">Streszczenie popularnonaukowe należy przygotować w dwóch językach: polskim i angielskim. Wersje językowe muszą być tożsame. Opis powinien być napisany językiem popularnonaukowym i zawierać cel rozprawy, opis planowanych badań naukowych oraz powodów, dla których podjęta została ta </w:t>
+      </w:r>
+      <w:r>
+        <w:rPr>
+          <w:rFonts w:cstheme="minorHAnsi"/>
+          <w:i/>
+          <w:szCs w:val="20"/>
+        </w:rPr>
+        <w:lastRenderedPageBreak/>
+        <w:t xml:space="preserve">tematyka badawcza, a także najważniejsze spodziewane efekty (maks. </w:t>
+      </w:r>
+      <w:r>
+        <w:rPr>
+          <w:rFonts w:cstheme="minorHAnsi"/>
+          <w:i/>
+          <w:szCs w:val="20"/>
+          <w:lang w:val="en-US"/>
+        </w:rPr>
+        <w:t>1 strona, czcionka 11 pt., interlinia 1).</w:t>
       </w:r>
       <w:r>
         <w:rPr>
@@ -6867,15 +7702,45 @@
           <w:szCs w:val="20"/>
           <w:lang w:val="en-US"/>
         </w:rPr>
-        <w:t xml:space="preserve">Brief description of the research methods that will be used during the implementation of the doctoral dissertation </w:t>
-      </w:r>
-      <w:r>
-        <w:rPr>
+        <w:t xml:space="preserve">The description for general public must be in Polish and in English. The language versions must be identical. The description should be written for general public and should include the </w:t>
+      </w:r>
+      <w:r>
+        <w:rPr>
+          <w:rFonts w:cstheme="minorHAnsi"/>
           <w:i/>
           <w:color w:val="4472C4" w:themeColor="accent1"/>
           <w:szCs w:val="20"/>
           <w:lang w:val="en-US"/>
         </w:rPr>
+        <w:t>doctoral dissertation</w:t>
+      </w:r>
+      <w:r>
+        <w:rPr>
+          <w:rFonts w:cstheme="minorHAnsi"/>
+          <w:i/>
+          <w:color w:val="4472C4" w:themeColor="accent1"/>
+          <w:szCs w:val="20"/>
+          <w:lang w:val="en-US"/>
+        </w:rPr>
+        <w:t xml:space="preserve"> goal, description of research, reasons for attempting a particular research topic and substantial results expected</w:t>
+      </w:r>
+      <w:r>
+        <w:rPr>
+          <w:rFonts w:cstheme="minorHAnsi"/>
+          <w:i/>
+          <w:color w:val="4472C4" w:themeColor="accent1"/>
+          <w:szCs w:val="20"/>
+          <w:lang w:val="en-US"/>
+        </w:rPr>
+        <w:t xml:space="preserve"> </w:t>
+      </w:r>
+      <w:r>
+        <w:rPr>
+          <w:i/>
+          <w:color w:val="4472C4" w:themeColor="accent1"/>
+          <w:szCs w:val="20"/>
+          <w:lang w:val="en-US"/>
+        </w:rPr>
         <w:t xml:space="preserve">(at </w:t>
       </w:r>
       <w:r>
@@ -6885,7 +7750,7 @@
           <w:szCs w:val="20"/>
           <w:lang w:val="en-US"/>
         </w:rPr>
-        <w:t xml:space="preserve">most </w:t>
+        <w:t>most 1</w:t>
       </w:r>
       <w:r>
         <w:rPr>
@@ -6894,34 +7759,7 @@
           <w:szCs w:val="20"/>
           <w:lang w:val="en-US"/>
         </w:rPr>
-        <w:t>2</w:t>
-      </w:r>
-      <w:r>
-        <w:rPr>
-          <w:i/>
-          <w:color w:val="4472C4" w:themeColor="accent1"/>
-          <w:szCs w:val="20"/>
-          <w:lang w:val="en-US"/>
-        </w:rPr>
-        <w:t xml:space="preserve"> page</w:t>
-      </w:r>
-      <w:r>
-        <w:rPr>
-          <w:i/>
-          <w:color w:val="4472C4" w:themeColor="accent1"/>
-          <w:szCs w:val="20"/>
-          <w:lang w:val="en-US"/>
-        </w:rPr>
-        <w:t>s</w:t>
-      </w:r>
-      <w:r>
-        <w:rPr>
-          <w:i/>
-          <w:color w:val="4472C4" w:themeColor="accent1"/>
-          <w:szCs w:val="20"/>
-          <w:lang w:val="en-US"/>
-        </w:rPr>
-        <w:t>, font 11, line spacing 1)</w:t>
+        <w:t xml:space="preserve"> page, font 11, line spacing 1)</w:t>
       </w:r>
       <w:r>
         <w:rPr>
@@ -6946,16 +7784,37 @@
     </w:p>
     <w:p>
       <w:pPr>
+        <w:spacing w:after="0" w:line="240" w:lineRule="auto"/>
+        <w:jc w:val="both"/>
+        <w:rPr>
+          <w:rFonts w:cstheme="minorHAnsi"/>
+          <w:b/>
+          <w:sz w:val="24"/>
+          <w:szCs w:val="20"/>
+        </w:rPr>
+      </w:pPr>
+      <w:r>
+        <w:rPr>
+          <w:rFonts w:cstheme="minorHAnsi"/>
+          <w:b/>
+          <w:sz w:val="24"/>
+          <w:szCs w:val="20"/>
+        </w:rPr>
+        <w:t>Streszczenie popularnonaukowe</w:t>
+      </w:r>
+    </w:p>
+    <w:p>
+      <w:pPr>
         <w:spacing w:after="120" w:line="240" w:lineRule="auto"/>
         <w:jc w:val="both"/>
       </w:pPr>
-      <w:permStart w:id="32011344" w:edGrp="everyone"/>
-      <w:r>
-        <w:rPr>
-          <w:rFonts w:cstheme="minorHAnsi"/>
-          <w:lang w:val="en-US"/>
-        </w:rPr>
-        <w:t xml:space="preserve">The research follows the loop: real data → twin → learning in the twin → a few real trials → correction of the twin and the policy → deployment. Four stages (I–IV) match §3 and the research questions of §7: capture less (RQ1), learn robustly in an imperfect twin (RQ2), collect few real data (RQ3), and measure the budget of the whole loop (RQ4). The methods are domain-agnostic: they act on the twin's uncertainty, on task relevance measured in the twin and on learned representations. The twin has two parts: geometry and appearance, reconstructed with existing open-source 3D Gaussian Splatting (3DGS) [2] pipelines, and physical or dynamic parameters, identified from real interactions as a posterior (BayesSim-type [9]). No simulator or benchmark is developed. Robotic manipulation and visual navigation are equal testbeds with the same protocol.</w:t>
+      <w:permStart w:id="301016009" w:edGrp="everyone"/>
+      <w:r>
+        <w:rPr>
+          <w:rFonts w:cstheme="minorHAnsi"/>
+          <w:lang w:val="pl-PL"/>
+        </w:rPr>
+        <w:t xml:space="preserve">Systemy sztucznej inteligencji, które działają w prawdziwym świecie, na przykład roboty chwytające przedmioty lub poruszające się po budynkach, uczą się na bardzo wielu przykładach i próbach. W rzeczywistości zbieranie takich danych jest powolne i kosztowne, dlatego systemy te często ćwiczą w symulacji komputerowej. Coraz częściej jest nią cyfrowy bliźniak: wierna kopia prawdziwego miejsca lub urządzenia, którą można odtworzyć z nagrań i pomiarów, łącznie z wyglądem, kształtem i tym, jak rzeczy się poruszają. Powstaje w ten sposób pętla: zbieramy dane w rzeczywistości, budujemy kopię, uczymy w niej system, sprawdzamy go w rzeczywistości, poprawiamy i dopiero wtedy wdrażamy. Każdy z tych kroków wymaga jednak prawdziwych danych, a ich zbieranie jest kosztowne.</w:t>
       </w:r>
     </w:p>
     <w:p>
@@ -6966,92 +7825,63 @@
       <w:r>
         <w:rPr>
           <w:rFonts w:cstheme="minorHAnsi"/>
-          <w:b/>
-          <w:lang w:val="en-US"/>
-        </w:rPr>
-        <w:t xml:space="preserve">Tier A protocol: proxy reality (decides the hypotheses).</w:t>
-      </w:r>
-      <w:r>
-        <w:rPr>
-          <w:rFonts w:cstheme="minorHAnsi"/>
-          <w:lang w:val="en-US"/>
-        </w:rPr>
-        <w:t xml:space="preserve"> In each testbed, "reality" is a reference from a separate, higher-fidelity source, and the twin is built from a subset of a separate, cheaper capture, so twin and reference share no data. </w:t>
-      </w:r>
-      <w:r>
-        <w:rPr>
-          <w:rFonts w:cstheme="minorHAnsi"/>
-          <w:i/>
-          <w:lang w:val="en-US"/>
-        </w:rPr>
-        <w:t xml:space="preserve">Navigation:</w:t>
-      </w:r>
-      <w:r>
-        <w:rPr>
-          <w:rFonts w:cstheme="minorHAnsi"/>
-          <w:lang w:val="en-US"/>
-        </w:rPr>
-        <w:t xml:space="preserve"> ScanNet++ [22] gives each scene a laser scan, DSLR images and a separate phone RGB-D stream. On ≥ 20 scenes (10 held out from all tuning), the reference is the laser-scan mesh textured from the DSLR images and rendered in Habitat [1] with a robot-camera model; the twin is 3DGS from a subset of the phone stream, run as a mesh (as in EmbodiedSplat [5]) or with a 3DGS renderer (GaussGym [7]); its physical part is the robot's actuation noise. Tasks: image-goal and point-goal navigation with a minimum geodesic distance set in a pilot so that P stays below its ceiling. </w:t>
-      </w:r>
-      <w:r>
-        <w:rPr>
-          <w:rFonts w:cstheme="minorHAnsi"/>
-          <w:i/>
-          <w:lang w:val="en-US"/>
-        </w:rPr>
-        <w:t xml:space="preserve">Manipulation:</w:t>
-      </w:r>
-      <w:r>
-        <w:rPr>
-          <w:rFonts w:cstheme="minorHAnsi"/>
-          <w:lang w:val="en-US"/>
-        </w:rPr>
-        <w:t xml:space="preserve"> ManiSkill3 [8] tasks (≥ 20 task–object configurations, 10 held out), where reality is the simulator with held-out ground-truth physical parameters (mass, friction, articulation) and its own rendering, and the twin is 3DGS from a subset of its views plus parameters identified from a few recorded interactions. Physics engine and object models are shared, so this is the weaker proxy (unmodelled dynamics are not tested); tier B checks it. </w:t>
-      </w:r>
-      <w:r>
-        <w:rPr>
-          <w:rFonts w:cstheme="minorHAnsi"/>
-          <w:i/>
-          <w:lang w:val="en-US"/>
-        </w:rPr>
-        <w:t xml:space="preserve">Both:</w:t>
-      </w:r>
-      <w:r>
-        <w:rPr>
-          <w:rFonts w:cstheme="minorHAnsi"/>
-          <w:lang w:val="en-US"/>
-        </w:rPr>
-        <w:t xml:space="preserve"> real data is counted exactly: capture = views and interaction samples given to the twin, real trials and demonstrations = episodes in the reference, summed in one operator-time cost at a pre-registered rate; the largest budget stays below the full capture. In navigation the proxy's error to held-out real images is reported (PSNR, LPIPS, depth) and each hypothesis is re-checked for sign with a second reference (3DGS from all DSLR images). </w:t>
-      </w:r>
-      <w:r>
-        <w:rPr>
-          <w:rFonts w:cstheme="minorHAnsi"/>
-          <w:i/>
-          <w:lang w:val="en-US"/>
-        </w:rPr>
-        <w:t xml:space="preserve">Tier B:</w:t>
-      </w:r>
-      <w:r>
-        <w:rPr>
-          <w:rFonts w:cstheme="minorHAnsi"/>
-          <w:lang w:val="en-US"/>
-        </w:rPr>
-        <w:t xml:space="preserve"> the twin must rank manipulation policies as published paired sim/real evaluations do (SIMPLER [34]). </w:t>
-      </w:r>
-      <w:r>
-        <w:rPr>
-          <w:rFonts w:cstheme="minorHAnsi"/>
-          <w:i/>
-          <w:lang w:val="en-US"/>
-        </w:rPr>
-        <w:t xml:space="preserve">Compute:</w:t>
-      </w:r>
-      <w:r>
-        <w:rPr>
-          <w:rFonts w:cstheme="minorHAnsi"/>
-          <w:lang w:val="en-US"/>
-        </w:rPr>
-        <w:t xml:space="preserve"> WCSS Lem (NVIDIA H100), PLGrid (to be applied for). Policies are small heads on frozen visual encoders, trained mainly by imitation of a privileged expert in the twin (shortest-path planner; motion-planning expert), with reinforcement learning on a subset. P = task success rate.</w:t>
+          <w:lang w:val="pl-PL"/>
+        </w:rPr>
+        <w:t xml:space="preserve">Celem rozprawy jest opracowanie metody, która przejdzie przez tę pętlę z dużo mniejszą ilością prawdziwych danych niż dotychczasowe podejścia, niezależnie od zadania. Metoda ma trzy części, po jednej na każdy krok pętli. Zamiast zbierać wszystko po równo, będziemy zbierać przede wszystkim te dane, które są ważne dla zadania i o których kopia wie jeszcze za mało. Ponieważ kopia nigdy nie jest idealna, nauczymy system tak, aby nie polegał na jej niepewnych fragmentach i radził sobie z jej błędami. Na koniec wybierzemy tylko te nieliczne próby w rzeczywistości, które najwięcej mówią o tym, gdzie system jeszcze zawodzi, i wykorzystamy je do poprawienia zarówno kopii, jak i systemu. Wskazówek dostarczy sama kopia, która wie, gdzie jest niepewna, oraz sposób, w jaki uczony system opisuje to, co widzi. Tę samą metodę sprawdzimy na dwóch różnych zadaniach: chwytaniu przedmiotów ramieniem robota i poruszaniu się robota po budynkach. Badania będą prowadzone przede wszystkim na publicznie dostępnych danych, a wybrane wyniki zostaną potwierdzone na prawdziwym robocie.</w:t>
+      </w:r>
+    </w:p>
+    <w:p>
+      <w:pPr>
+        <w:spacing w:after="0" w:line="240" w:lineRule="auto"/>
+        <w:jc w:val="both"/>
+      </w:pPr>
+      <w:r>
+        <w:rPr>
+          <w:rFonts w:cstheme="minorHAnsi"/>
+          <w:lang w:val="pl-PL"/>
+        </w:rPr>
+        <w:t xml:space="preserve">Spodziewanym efektem jest jedna metoda, która pozwoli zbierać mniej danych, uczyć skuteczniej i wykonywać mniej kosztownych prób w rzeczywistości, oraz pomiar, ile prawdziwych danych oszczędza w porównaniu z uczeniem wyłącznie na prawdziwych danych i z dotychczasowymi podejściami. Może to przyspieszyć i potanić wdrażanie uczących się systemów w fabrykach, magazynach, szpitalach i biurach. Opracowane oprogramowanie zostanie udostępnione publicznie.</w:t>
+      </w:r>
+    </w:p>
+    <w:permEnd w:id="301016009"/>
+    <w:p>
+      <w:pPr>
+        <w:spacing w:after="0" w:line="240" w:lineRule="auto"/>
+        <w:jc w:val="both"/>
+        <w:rPr>
+          <w:rFonts w:cstheme="minorHAnsi"/>
+          <w:szCs w:val="20"/>
+        </w:rPr>
+      </w:pPr>
+    </w:p>
+    <w:p>
+      <w:pPr>
+        <w:spacing w:after="0" w:line="240" w:lineRule="auto"/>
+        <w:jc w:val="both"/>
+        <w:rPr>
+          <w:rFonts w:cstheme="minorHAnsi"/>
+          <w:b/>
+          <w:sz w:val="24"/>
+          <w:szCs w:val="20"/>
+        </w:rPr>
+      </w:pPr>
+      <w:r>
+        <w:rPr>
+          <w:rFonts w:cstheme="minorHAnsi"/>
+          <w:b/>
+          <w:sz w:val="24"/>
+          <w:szCs w:val="20"/>
+        </w:rPr>
+        <w:t>Abstract</w:t>
+      </w:r>
+      <w:r>
+        <w:rPr>
+          <w:rFonts w:cstheme="minorHAnsi"/>
+          <w:b/>
+          <w:sz w:val="24"/>
+          <w:szCs w:val="20"/>
+        </w:rPr>
+        <w:t xml:space="preserve"> for general public</w:t>
       </w:r>
     </w:p>
     <w:p>
@@ -7059,144 +7889,13 @@
         <w:spacing w:after="120" w:line="240" w:lineRule="auto"/>
         <w:jc w:val="both"/>
       </w:pPr>
-      <w:r>
-        <w:rPr>
-          <w:rFonts w:cstheme="minorHAnsi"/>
-          <w:b/>
-          <w:lang w:val="en-US"/>
-        </w:rPr>
-        <w:t xml:space="preserve">Stage I – task-aware capture (RQ1, H1; sem. 3–4).</w:t>
-      </w:r>
-    </w:p>
-    <w:p>
-      <w:pPr>
-        <w:spacing w:after="40" w:line="240" w:lineRule="auto"/>
-        <w:ind w:left="284" w:hanging="284"/>
-        <w:jc w:val="both"/>
-      </w:pPr>
-      <w:r>
-        <w:rPr>
-          <w:rFonts w:cstheme="minorHAnsi"/>
-          <w:lang w:val="en-US"/>
-        </w:rPr>
-        <w:t xml:space="preserve">•	</w:t>
-      </w:r>
-      <w:r>
-        <w:rPr>
-          <w:rFonts w:cstheme="minorHAnsi"/>
-          <w:i/>
-          <w:lang w:val="en-US"/>
-        </w:rPr>
-        <w:t xml:space="preserve">Method:</w:t>
-      </w:r>
-      <w:r>
-        <w:rPr>
-          <w:rFonts w:cstheme="minorHAnsi"/>
-          <w:lang w:val="en-US"/>
-        </w:rPr>
-        <w:t xml:space="preserve"> the twin's uncertainty, per region (Fisher information [17] or a Bayes' Rays-type [19] field, adapted to 3DGS) and per physical parameter (posterior spread), is weighted by </w:t>
-      </w:r>
-      <w:r>
-        <w:rPr>
-          <w:rFonts w:cstheme="minorHAnsi"/>
-          <w:b/>
-          <w:lang w:val="en-US"/>
-        </w:rPr>
-        <w:t xml:space="preserve">task relevance</w:t>
-      </w:r>
-      <w:r>
-        <w:rPr>
-          <w:rFonts w:cstheme="minorHAnsi"/>
-          <w:lang w:val="en-US"/>
-        </w:rPr>
-        <w:t xml:space="preserve"> measured in the current twin without training: how often expert trajectories pass through a region, and how much the expert's success changes across a parameter's posterior. The next views or interactions are chosen greedily where task-weighted uncertainty is highest until the budget is spent. Candidates come from the recorded pool; capture time is also estimated as a tour of the chosen views.</w:t>
-      </w:r>
-    </w:p>
-    <w:p>
-      <w:pPr>
-        <w:spacing w:after="40" w:line="240" w:lineRule="auto"/>
-        <w:ind w:left="284" w:hanging="284"/>
-        <w:jc w:val="both"/>
-      </w:pPr>
-      <w:r>
-        <w:rPr>
-          <w:rFonts w:cstheme="minorHAnsi"/>
-          <w:lang w:val="en-US"/>
-        </w:rPr>
-        <w:t xml:space="preserve">•	</w:t>
-      </w:r>
-      <w:r>
-        <w:rPr>
-          <w:rFonts w:cstheme="minorHAnsi"/>
-          <w:i/>
-          <w:lang w:val="en-US"/>
-        </w:rPr>
-        <w:t xml:space="preserve">Baselines:</w:t>
-      </w:r>
-      <w:r>
-        <w:rPr>
-          <w:rFonts w:cstheme="minorHAnsi"/>
-          <w:lang w:val="en-US"/>
-        </w:rPr>
-        <w:t xml:space="preserve"> uniform capture, task-blind uncertainty selection (FisherRF-type next-best-view [17]; ASID-type exploration for parameter accuracy [21]) and risk-weighted view selection [20], at the same budget.</w:t>
-      </w:r>
-    </w:p>
-    <w:p>
-      <w:pPr>
-        <w:spacing w:after="40" w:line="240" w:lineRule="auto"/>
-        <w:ind w:left="284" w:hanging="284"/>
-        <w:jc w:val="both"/>
-      </w:pPr>
-      <w:r>
-        <w:rPr>
-          <w:rFonts w:cstheme="minorHAnsi"/>
-          <w:lang w:val="en-US"/>
-        </w:rPr>
-        <w:t xml:space="preserve">•	</w:t>
-      </w:r>
-      <w:r>
-        <w:rPr>
-          <w:rFonts w:cstheme="minorHAnsi"/>
-          <w:i/>
-          <w:lang w:val="en-US"/>
-        </w:rPr>
-        <w:t xml:space="preserve">Metric:</w:t>
-      </w:r>
-      <w:r>
-        <w:rPr>
-          <w:rFonts w:cstheme="minorHAnsi"/>
-          <w:lang w:val="en-US"/>
-        </w:rPr>
-        <w:t xml:space="preserve"> budget–P curves on tier A with ≥ 4 capture budgets per testbed; capture needed to reach the P that uniform capture reaches at the largest budget.</w:t>
-      </w:r>
-    </w:p>
-    <w:p>
-      <w:pPr>
-        <w:spacing w:after="40" w:line="240" w:lineRule="auto"/>
-        <w:ind w:left="284" w:hanging="284"/>
-        <w:jc w:val="both"/>
-      </w:pPr>
-      <w:r>
-        <w:rPr>
-          <w:rFonts w:cstheme="minorHAnsi"/>
-          <w:lang w:val="en-US"/>
-        </w:rPr>
-        <w:t xml:space="preserve">•	</w:t>
-      </w:r>
-      <w:r>
-        <w:rPr>
-          <w:rFonts w:cstheme="minorHAnsi"/>
-          <w:i/>
-          <w:lang w:val="en-US"/>
-        </w:rPr>
-        <w:t xml:space="preserve">Success criterion (H1):</w:t>
-      </w:r>
-      <w:r>
-        <w:rPr>
-          <w:rFonts w:cstheme="minorHAnsi"/>
-          <w:lang w:val="en-US"/>
-        </w:rPr>
-        <w:t xml:space="preserve"> ≥ 40% less capture than uniform at equal P, and less than task-blind selection (upper 95% bound of the ratio &lt; 1), as in §7.</w:t>
+      <w:permStart w:id="305530072" w:edGrp="everyone"/>
+      <w:r>
+        <w:rPr>
+          <w:rFonts w:cstheme="minorHAnsi"/>
+          <w:lang w:val="en-US"/>
+        </w:rPr>
+        <w:t xml:space="preserve">Artificial intelligence systems that act in the real world, for example robots that grasp objects or move around buildings, learn from a very large number of examples and trials. In reality, collecting such data is slow and costly, so these systems often practise in a computer simulation. Increasingly, this is a digital twin: a faithful copy of a real place or device that can be rebuilt from recordings and measurements, including how things look, their shape and how they move. This creates a loop: we collect data in reality, build the copy, train the system in it, check it in reality, correct it and only then deploy it. Each of these steps, however, needs real data, and collecting it is costly.</w:t>
       </w:r>
     </w:p>
     <w:p>
@@ -7207,335 +7906,9 @@
       <w:r>
         <w:rPr>
           <w:rFonts w:cstheme="minorHAnsi"/>
-          <w:b/>
-          <w:lang w:val="en-US"/>
-        </w:rPr>
-        <w:t xml:space="preserve">Stage II – uncertainty-aware learning in an imperfect twin (RQ2, H2; sem. 4).</w:t>
-      </w:r>
-    </w:p>
-    <w:p>
-      <w:pPr>
-        <w:spacing w:after="40" w:line="240" w:lineRule="auto"/>
-        <w:ind w:left="284" w:hanging="284"/>
-        <w:jc w:val="both"/>
-      </w:pPr>
-      <w:r>
-        <w:rPr>
-          <w:rFonts w:cstheme="minorHAnsi"/>
-          <w:lang w:val="en-US"/>
-        </w:rPr>
-        <w:t xml:space="preserve">•	</w:t>
-      </w:r>
-      <w:r>
-        <w:rPr>
-          <w:rFonts w:cstheme="minorHAnsi"/>
-          <w:i/>
-          <w:lang w:val="en-US"/>
-        </w:rPr>
-        <w:t xml:space="preserve">Method:</w:t>
-      </w:r>
-      <w:r>
-        <w:rPr>
-          <w:rFonts w:cstheme="minorHAnsi"/>
-          <w:lang w:val="en-US"/>
-        </w:rPr>
-        <w:t xml:space="preserve"> (a) randomization whose strength follows the twin's uncertainty: appearance and geometry perturbations per region, and physical parameters sampled from their identified posterior instead of hand-set ranges; (b) down-weighting twin samples that lie far from a few real samples in frozen DINOv2 [27] feature space. The real samples are a held-out slice of the capture, not used to fit the twin, and count towards the budget.</w:t>
-      </w:r>
-    </w:p>
-    <w:p>
-      <w:pPr>
-        <w:spacing w:after="40" w:line="240" w:lineRule="auto"/>
-        <w:ind w:left="284" w:hanging="284"/>
-        <w:jc w:val="both"/>
-      </w:pPr>
-      <w:r>
-        <w:rPr>
-          <w:rFonts w:cstheme="minorHAnsi"/>
-          <w:lang w:val="en-US"/>
-        </w:rPr>
-        <w:t xml:space="preserve">•	</w:t>
-      </w:r>
-      <w:r>
-        <w:rPr>
-          <w:rFonts w:cstheme="minorHAnsi"/>
-          <w:i/>
-          <w:lang w:val="en-US"/>
-        </w:rPr>
-        <w:t xml:space="preserve">Baselines:</w:t>
-      </w:r>
-      <w:r>
-        <w:rPr>
-          <w:rFonts w:cstheme="minorHAnsi"/>
-          <w:lang w:val="en-US"/>
-        </w:rPr>
-        <w:t xml:space="preserve"> uniform domain randomization of appearance [23] and dynamics [24] with tuned ranges, no randomization, and feature alignment [26] as an extra comparator; all at the same capture budget.</w:t>
-      </w:r>
-    </w:p>
-    <w:p>
-      <w:pPr>
-        <w:spacing w:after="40" w:line="240" w:lineRule="auto"/>
-        <w:ind w:left="284" w:hanging="284"/>
-        <w:jc w:val="both"/>
-      </w:pPr>
-      <w:r>
-        <w:rPr>
-          <w:rFonts w:cstheme="minorHAnsi"/>
-          <w:lang w:val="en-US"/>
-        </w:rPr>
-        <w:t xml:space="preserve">•	</w:t>
-      </w:r>
-      <w:r>
-        <w:rPr>
-          <w:rFonts w:cstheme="minorHAnsi"/>
-          <w:i/>
-          <w:lang w:val="en-US"/>
-        </w:rPr>
-        <w:t xml:space="preserve">Metric and criterion (H2):</w:t>
-      </w:r>
-      <w:r>
-        <w:rPr>
-          <w:rFonts w:cstheme="minorHAnsi"/>
-          <w:lang w:val="en-US"/>
-        </w:rPr>
-        <w:t xml:space="preserve"> tier-A P on held-out scenes, paired by scene; ≥ 10 pp higher P than uniform domain randomization at an equal capture budget (lower 95% bound &gt; 0), at each of ≥ 2 budgets.</w:t>
-      </w:r>
-    </w:p>
-    <w:p>
-      <w:pPr>
-        <w:spacing w:after="120" w:line="240" w:lineRule="auto"/>
-        <w:jc w:val="both"/>
-      </w:pPr>
-      <w:r>
-        <w:rPr>
-          <w:rFonts w:cstheme="minorHAnsi"/>
-          <w:b/>
-          <w:lang w:val="en-US"/>
-        </w:rPr>
-        <w:t xml:space="preserve">Stage III – few real trials and correction (RQ3, H3; end of sem. 4 – sem. 5).</w:t>
-      </w:r>
-    </w:p>
-    <w:p>
-      <w:pPr>
-        <w:spacing w:after="40" w:line="240" w:lineRule="auto"/>
-        <w:ind w:left="284" w:hanging="284"/>
-        <w:jc w:val="both"/>
-      </w:pPr>
-      <w:r>
-        <w:rPr>
-          <w:rFonts w:cstheme="minorHAnsi"/>
-          <w:lang w:val="en-US"/>
-        </w:rPr>
-        <w:t xml:space="preserve">•	</w:t>
-      </w:r>
-      <w:r>
-        <w:rPr>
-          <w:rFonts w:cstheme="minorHAnsi"/>
-          <w:i/>
-          <w:lang w:val="en-US"/>
-        </w:rPr>
-        <w:t xml:space="preserve">Selection:</w:t>
-      </w:r>
-      <w:r>
-        <w:rPr>
-          <w:rFonts w:cstheme="minorHAnsi"/>
-          <w:lang w:val="en-US"/>
-        </w:rPr>
-        <w:t xml:space="preserve"> candidate real trials (start–goal pairs, object configurations) are scored by the predicted twin-to-real gap: disagreement of a small policy ensemble plus the twin's uncertainty along the planned trajectory. The top-k are executed in reality (tier A: the reference).</w:t>
-      </w:r>
-    </w:p>
-    <w:p>
-      <w:pPr>
-        <w:spacing w:after="40" w:line="240" w:lineRule="auto"/>
-        <w:ind w:left="284" w:hanging="284"/>
-        <w:jc w:val="both"/>
-      </w:pPr>
-      <w:r>
-        <w:rPr>
-          <w:rFonts w:cstheme="minorHAnsi"/>
-          <w:lang w:val="en-US"/>
-        </w:rPr>
-        <w:t xml:space="preserve">•	</w:t>
-      </w:r>
-      <w:r>
-        <w:rPr>
-          <w:rFonts w:cstheme="minorHAnsi"/>
-          <w:i/>
-          <w:lang w:val="en-US"/>
-        </w:rPr>
-        <w:t xml:space="preserve">Use:</w:t>
-      </w:r>
-      <w:r>
-        <w:rPr>
-          <w:rFonts w:cstheme="minorHAnsi"/>
-          <w:lang w:val="en-US"/>
-        </w:rPr>
-        <w:t xml:space="preserve"> the trials (i) correct the twin, by re-capturing or re-weighting regions where real and twin observations disagree (photometric correction as in [35]; re-captured views are counted) and by updating the physical-parameter posterior [9, 25]; and (ii) fine-tune the policy by co-training with the real trials [15]. Real P is estimated from few trials with prediction-powered inference [32, 33].</w:t>
-      </w:r>
-    </w:p>
-    <w:p>
-      <w:pPr>
-        <w:spacing w:after="40" w:line="240" w:lineRule="auto"/>
-        <w:ind w:left="284" w:hanging="284"/>
-        <w:jc w:val="both"/>
-      </w:pPr>
-      <w:r>
-        <w:rPr>
-          <w:rFonts w:cstheme="minorHAnsi"/>
-          <w:lang w:val="en-US"/>
-        </w:rPr>
-        <w:t xml:space="preserve">•	</w:t>
-      </w:r>
-      <w:r>
-        <w:rPr>
-          <w:rFonts w:cstheme="minorHAnsi"/>
-          <w:i/>
-          <w:lang w:val="en-US"/>
-        </w:rPr>
-        <w:t xml:space="preserve">Baselines:</w:t>
-      </w:r>
-      <w:r>
-        <w:rPr>
-          <w:rFonts w:cstheme="minorHAnsi"/>
-          <w:lang w:val="en-US"/>
-        </w:rPr>
-        <w:t xml:space="preserve"> random selection and uniform coverage of the same number of trials; selection rules [29–31] where they apply.</w:t>
-      </w:r>
-    </w:p>
-    <w:p>
-      <w:pPr>
-        <w:spacing w:after="40" w:line="240" w:lineRule="auto"/>
-        <w:ind w:left="284" w:hanging="284"/>
-        <w:jc w:val="both"/>
-      </w:pPr>
-      <w:r>
-        <w:rPr>
-          <w:rFonts w:cstheme="minorHAnsi"/>
-          <w:lang w:val="en-US"/>
-        </w:rPr>
-        <w:t xml:space="preserve">•	</w:t>
-      </w:r>
-      <w:r>
-        <w:rPr>
-          <w:rFonts w:cstheme="minorHAnsi"/>
-          <w:i/>
-          <w:lang w:val="en-US"/>
-        </w:rPr>
-        <w:t xml:space="preserve">Success criterion (H3):</w:t>
-      </w:r>
-      <w:r>
-        <w:rPr>
-          <w:rFonts w:cstheme="minorHAnsi"/>
-          <w:lang w:val="en-US"/>
-        </w:rPr>
-        <w:t xml:space="preserve"> the target P is reached with ≥ 50% fewer real trials than random selection (upper 95% bound of the ratio &lt; 1).</w:t>
-      </w:r>
-    </w:p>
-    <w:p>
-      <w:pPr>
-        <w:spacing w:after="120" w:line="240" w:lineRule="auto"/>
-        <w:jc w:val="both"/>
-      </w:pPr>
-      <w:r>
-        <w:rPr>
-          <w:rFonts w:cstheme="minorHAnsi"/>
-          <w:b/>
-          <w:lang w:val="en-US"/>
-        </w:rPr>
-        <w:t xml:space="preserve">Stage IV – budget of the whole loop in both testbeds (RQ4, H4; sem. 6).</w:t>
-      </w:r>
-    </w:p>
-    <w:p>
-      <w:pPr>
-        <w:spacing w:after="40" w:line="240" w:lineRule="auto"/>
-        <w:ind w:left="284" w:hanging="284"/>
-        <w:jc w:val="both"/>
-      </w:pPr>
-      <w:r>
-        <w:rPr>
-          <w:rFonts w:cstheme="minorHAnsi"/>
-          <w:lang w:val="en-US"/>
-        </w:rPr>
-        <w:t xml:space="preserve">•	</w:t>
-      </w:r>
-      <w:r>
-        <w:rPr>
-          <w:rFonts w:cstheme="minorHAnsi"/>
-          <w:i/>
-          <w:lang w:val="en-US"/>
-        </w:rPr>
-        <w:t xml:space="preserve">Budget curve:</w:t>
-      </w:r>
-      <w:r>
-        <w:rPr>
-          <w:rFonts w:cstheme="minorHAnsi"/>
-          <w:lang w:val="en-US"/>
-        </w:rPr>
-        <w:t xml:space="preserve"> total real data (capture + trials, one operator-time cost) against P for the full loop (Stages I–III) and for </w:t>
-      </w:r>
-      <w:r>
-        <w:rPr>
-          <w:rFonts w:cstheme="minorHAnsi"/>
-          <w:b/>
-          <w:lang w:val="en-US"/>
-        </w:rPr>
-        <w:t xml:space="preserve">real-only learning</w:t>
-      </w:r>
-      <w:r>
-        <w:rPr>
-          <w:rFonts w:cstheme="minorHAnsi"/>
-          <w:lang w:val="en-US"/>
-        </w:rPr>
-        <w:t xml:space="preserve">: imitation of expert demonstrations collected in the reference with the same frozen encoder and initialization (real-only reinforcement learning also shown). The "exchange rate" is the ratio of the budgets that reach the target P; real-only scaling results [11, 12] suggest the curve shapes. The curve is also reported for a uniform loop and for a released pretrained world model as the simulator (not trained).</w:t>
-      </w:r>
-    </w:p>
-    <w:p>
-      <w:pPr>
-        <w:spacing w:after="40" w:line="240" w:lineRule="auto"/>
-        <w:ind w:left="284" w:hanging="284"/>
-        <w:jc w:val="both"/>
-      </w:pPr>
-      <w:r>
-        <w:rPr>
-          <w:rFonts w:cstheme="minorHAnsi"/>
-          <w:lang w:val="en-US"/>
-        </w:rPr>
-        <w:t xml:space="preserve">•	</w:t>
-      </w:r>
-      <w:r>
-        <w:rPr>
-          <w:rFonts w:cstheme="minorHAnsi"/>
-          <w:i/>
-          <w:lang w:val="en-US"/>
-        </w:rPr>
-        <w:t xml:space="preserve">Success criterion (H4):</w:t>
-      </w:r>
-      <w:r>
-        <w:rPr>
-          <w:rFonts w:cstheme="minorHAnsi"/>
-          <w:lang w:val="en-US"/>
-        </w:rPr>
-        <w:t xml:space="preserve"> with the three allocation methods and their hyperparameters unchanged (the learner is each task's standard one), in each testbed the loop reaches the target P with ≤ 10% of the real data needed by real-only learning (upper 95% bound of the ratio &lt; 0.2), the H1–H3 effects keep their sign, and tier B agrees in direction.</w:t>
-      </w:r>
-    </w:p>
-    <w:p>
-      <w:pPr>
-        <w:spacing w:after="120" w:line="240" w:lineRule="auto"/>
-        <w:jc w:val="both"/>
-      </w:pPr>
-      <w:r>
-        <w:rPr>
-          <w:rFonts w:cstheme="minorHAnsi"/>
-          <w:b/>
-          <w:lang w:val="en-US"/>
-        </w:rPr>
-        <w:t xml:space="preserve">Tier C validation.</w:t>
-      </w:r>
-      <w:r>
-        <w:rPr>
-          <w:rFonts w:cstheme="minorHAnsi"/>
-          <w:lang w:val="en-US"/>
-        </w:rPr>
-        <w:t xml:space="preserve"> Two robot campaigns (sem. 5 and 7) with own phone or RGB-D captures at PWr: a mobile robot in 2 rooms and, where access is agreed, a tabletop manipulator. Uniform capture versus the loop, plus the few selected trials; about 8 robot-hours per campaign (3 policies × 2 settings × 30 episodes at ~2 min, plus 2 × 20 trials). Tier C reports agreement only and never tunes thresholds.</w:t>
+          <w:lang w:val="en-US"/>
+        </w:rPr>
+        <w:t xml:space="preserve">The goal of this dissertation is to develop a method that goes through this loop with much less real data than existing approaches, whatever the task. The method has three parts, one for each step of the loop. Instead of collecting everything evenly, we will collect mainly the data that matters for the task and about which the copy still knows too little. Because the copy is never perfect, we will train the system so that it does not rely on the uncertain parts of the copy and copes with its errors. Finally, we will choose only the few trials in reality that tell the most about where the system still fails, and use them to correct both the copy and the system. Guidance will come from the copy itself, which knows where it is uncertain, and from the way the learning system describes what it sees. We will test the same method on two different tasks: grasping objects with a robot arm and a robot moving around buildings. The research will be carried out mainly on publicly available data, and selected results will be confirmed on a real robot.</w:t>
       </w:r>
     </w:p>
     <w:p>
@@ -7546,20 +7919,12 @@
       <w:r>
         <w:rPr>
           <w:rFonts w:cstheme="minorHAnsi"/>
-          <w:b/>
-          <w:lang w:val="en-US"/>
-        </w:rPr>
-        <w:t xml:space="preserve">Statistics and reproducibility.</w:t>
-      </w:r>
-      <w:r>
-        <w:rPr>
-          <w:rFonts w:cstheme="minorHAnsi"/>
-          <w:lang w:val="en-US"/>
-        </w:rPr>
-        <w:t xml:space="preserve"> Tests follow §7; the protocol is pre-registered before each stage and changes are logged. Code is released where the dataset licences permit.</w:t>
-      </w:r>
-    </w:p>
-    <w:permEnd w:id="32011344"/>
+          <w:lang w:val="en-US"/>
+        </w:rPr>
+        <w:t xml:space="preserve">The expected result is one method that makes it possible to collect less data, train more effectively and carry out fewer costly trials in reality, and a measurement of how much real data it saves compared with learning from real data only and with existing approaches. This may make deploying learning systems in factories, warehouses, hospitals and offices faster and cheaper. The software developed will be made publicly available.</w:t>
+      </w:r>
+    </w:p>
+    <w:permEnd w:id="305530072"/>
     <w:p>
       <w:pPr>
         <w:spacing w:after="0" w:line="240" w:lineRule="auto"/>
@@ -7567,7 +7932,6 @@
         <w:rPr>
           <w:rFonts w:cstheme="minorHAnsi"/>
           <w:szCs w:val="20"/>
-          <w:lang w:val="en-US"/>
         </w:rPr>
       </w:pPr>
     </w:p>
@@ -7581,32 +7945,86 @@
           <w:b/>
           <w:sz w:val="28"/>
           <w:szCs w:val="20"/>
-        </w:rPr>
-      </w:pPr>
-      <w:r>
-        <w:rPr>
-          <w:rFonts w:cstheme="minorHAnsi"/>
-          <w:b/>
-          <w:sz w:val="28"/>
-          <w:szCs w:val="20"/>
-        </w:rPr>
-        <w:t>10. </w:t>
-      </w:r>
-      <w:r>
-        <w:rPr>
-          <w:rFonts w:cstheme="minorHAnsi"/>
-          <w:b/>
-          <w:sz w:val="28"/>
-          <w:szCs w:val="20"/>
-        </w:rPr>
-        <w:t>Streszczenie popularnonaukowe</w:t>
-      </w:r>
-      <w:r>
-        <w:rPr>
-          <w:rFonts w:cstheme="minorHAnsi"/>
-          <w:b/>
-          <w:sz w:val="28"/>
-          <w:szCs w:val="20"/>
+          <w:lang w:val="en-US"/>
+        </w:rPr>
+      </w:pPr>
+      <w:r>
+        <w:rPr>
+          <w:rFonts w:cstheme="minorHAnsi"/>
+          <w:b/>
+          <w:sz w:val="28"/>
+          <w:szCs w:val="20"/>
+          <w:lang w:val="en-US"/>
+        </w:rPr>
+        <w:t>1</w:t>
+      </w:r>
+      <w:r>
+        <w:rPr>
+          <w:rFonts w:cstheme="minorHAnsi"/>
+          <w:b/>
+          <w:sz w:val="28"/>
+          <w:szCs w:val="20"/>
+          <w:lang w:val="en-US"/>
+        </w:rPr>
+        <w:t>1</w:t>
+      </w:r>
+      <w:r>
+        <w:rPr>
+          <w:rFonts w:cstheme="minorHAnsi"/>
+          <w:b/>
+          <w:sz w:val="28"/>
+          <w:szCs w:val="20"/>
+          <w:lang w:val="en-US"/>
+        </w:rPr>
+        <w:t>. </w:t>
+      </w:r>
+      <w:r>
+        <w:rPr>
+          <w:rFonts w:cstheme="minorHAnsi"/>
+          <w:b/>
+          <w:sz w:val="28"/>
+          <w:szCs w:val="20"/>
+          <w:lang w:val="en-US"/>
+        </w:rPr>
+        <w:t>T</w:t>
+      </w:r>
+      <w:r>
+        <w:rPr>
+          <w:rFonts w:cstheme="minorHAnsi"/>
+          <w:b/>
+          <w:sz w:val="28"/>
+          <w:szCs w:val="20"/>
+          <w:lang w:val="en-US"/>
+        </w:rPr>
+        <w:t>ermin oddania do druku artykułu</w:t>
+      </w:r>
+      <w:r>
+        <w:rPr>
+          <w:rFonts w:cstheme="minorHAnsi"/>
+          <w:b/>
+          <w:sz w:val="28"/>
+          <w:szCs w:val="20"/>
+          <w:lang w:val="en-US"/>
+        </w:rPr>
+        <w:t xml:space="preserve"> naukowego </w:t>
+      </w:r>
+      <w:r>
+        <w:rPr>
+          <w:rFonts w:cstheme="minorHAnsi"/>
+          <w:b/>
+          <w:sz w:val="28"/>
+          <w:szCs w:val="20"/>
+          <w:lang w:val="en-US"/>
+        </w:rPr>
+        <w:t>lub monografii</w:t>
+      </w:r>
+      <w:r>
+        <w:rPr>
+          <w:rFonts w:cstheme="minorHAnsi"/>
+          <w:b/>
+          <w:sz w:val="28"/>
+          <w:szCs w:val="20"/>
+          <w:lang w:val="en-US"/>
         </w:rPr>
         <w:t> </w:t>
       </w:r>
@@ -7616,6 +8034,7 @@
           <w:b/>
           <w:sz w:val="28"/>
           <w:szCs w:val="20"/>
+          <w:lang w:val="en-US"/>
         </w:rPr>
         <w:t>/</w:t>
       </w:r>
@@ -7625,6 +8044,7 @@
           <w:b/>
           <w:sz w:val="28"/>
           <w:szCs w:val="20"/>
+          <w:lang w:val="en-US"/>
         </w:rPr>
         <w:t> </w:t>
       </w:r>
@@ -7635,8 +8055,20 @@
           <w:color w:val="4472C4" w:themeColor="accent1"/>
           <w:sz w:val="28"/>
           <w:szCs w:val="20"/>
-        </w:rPr>
-        <w:t>Abstract for general public</w:t>
+          <w:lang w:val="en-US"/>
+        </w:rPr>
+        <w:t>Date of submission for publication of at least one scientific article</w:t>
+      </w:r>
+      <w:r>
+        <w:rPr>
+          <w:rFonts w:cstheme="minorHAnsi"/>
+          <w:b/>
+          <w:color w:val="4472C4" w:themeColor="accent1"/>
+          <w:sz w:val="28"/>
+          <w:szCs w:val="20"/>
+          <w:lang w:val="en-US"/>
+        </w:rPr>
+        <w:t xml:space="preserve"> or monography</w:t>
       </w:r>
     </w:p>
     <w:p>
@@ -7646,54 +8078,185 @@
         <w:rPr>
           <w:rFonts w:cstheme="minorHAnsi"/>
           <w:i/>
+          <w:szCs w:val="20"/>
+        </w:rPr>
+      </w:pPr>
+      <w:r>
+        <w:rPr>
+          <w:rFonts w:cstheme="minorHAnsi"/>
+          <w:i/>
+          <w:szCs w:val="20"/>
+        </w:rPr>
+        <w:t xml:space="preserve">Termin </w:t>
+      </w:r>
+      <w:r>
+        <w:rPr>
+          <w:rFonts w:cstheme="minorHAnsi"/>
+          <w:i/>
+          <w:szCs w:val="20"/>
+        </w:rPr>
+        <w:t xml:space="preserve">wysłania do recenzji </w:t>
+      </w:r>
+      <w:r>
+        <w:rPr>
+          <w:rFonts w:cstheme="minorHAnsi"/>
+          <w:i/>
+          <w:szCs w:val="20"/>
+        </w:rPr>
+        <w:t xml:space="preserve">artykułu naukowego lub monografii naukowej zgodnie z wymaganiami </w:t>
+      </w:r>
+      <w:r>
+        <w:rPr>
+          <w:rFonts w:cstheme="minorHAnsi"/>
+          <w:i/>
+          <w:szCs w:val="20"/>
+        </w:rPr>
+        <w:t>art.</w:t>
+      </w:r>
+      <w:r>
+        <w:rPr>
+          <w:rFonts w:cstheme="minorHAnsi"/>
+          <w:i/>
+          <w:szCs w:val="20"/>
+        </w:rPr>
+        <w:t> </w:t>
+      </w:r>
+      <w:r>
+        <w:rPr>
+          <w:rFonts w:cstheme="minorHAnsi"/>
+          <w:i/>
+          <w:szCs w:val="20"/>
+        </w:rPr>
+        <w:t>186 ust.</w:t>
+      </w:r>
+      <w:r>
+        <w:rPr>
+          <w:rFonts w:cstheme="minorHAnsi"/>
+          <w:i/>
+          <w:szCs w:val="20"/>
+        </w:rPr>
+        <w:t> </w:t>
+      </w:r>
+      <w:r>
+        <w:rPr>
+          <w:rFonts w:cstheme="minorHAnsi"/>
+          <w:i/>
+          <w:szCs w:val="20"/>
+        </w:rPr>
+        <w:t>1 pkt</w:t>
+      </w:r>
+      <w:r>
+        <w:rPr>
+          <w:rFonts w:cstheme="minorHAnsi"/>
+          <w:i/>
+          <w:szCs w:val="20"/>
+        </w:rPr>
+        <w:t> </w:t>
+      </w:r>
+      <w:r>
+        <w:rPr>
+          <w:rFonts w:cstheme="minorHAnsi"/>
+          <w:i/>
+          <w:szCs w:val="20"/>
+        </w:rPr>
+        <w:t>3 Ustawy</w:t>
+      </w:r>
+      <w:r>
+        <w:rPr>
+          <w:rFonts w:cstheme="minorHAnsi"/>
+          <w:i/>
+          <w:szCs w:val="20"/>
+        </w:rPr>
+        <w:t xml:space="preserve"> </w:t>
+      </w:r>
+      <w:r>
+        <w:rPr>
+          <w:rFonts w:cstheme="minorHAnsi"/>
+          <w:i/>
+          <w:szCs w:val="20"/>
+        </w:rPr>
+        <w:t>stawianymi osobie ubiegającej się stopień doktora</w:t>
+      </w:r>
+      <w:r>
+        <w:rPr>
+          <w:rFonts w:cstheme="minorHAnsi"/>
+          <w:i/>
+          <w:szCs w:val="20"/>
+        </w:rPr>
+        <w:t xml:space="preserve">. </w:t>
+      </w:r>
+      <w:r>
+        <w:rPr>
+          <w:rFonts w:cstheme="minorHAnsi"/>
+          <w:i/>
+          <w:szCs w:val="20"/>
+        </w:rPr>
+        <w:t>T</w:t>
+      </w:r>
+      <w:r>
+        <w:rPr>
+          <w:rFonts w:cstheme="minorHAnsi"/>
+          <w:i/>
+          <w:szCs w:val="20"/>
+        </w:rPr>
+        <w:t xml:space="preserve">ermin </w:t>
+      </w:r>
+      <w:r>
+        <w:rPr>
+          <w:rFonts w:cstheme="minorHAnsi"/>
+          <w:i/>
+          <w:szCs w:val="20"/>
+        </w:rPr>
+        <w:t xml:space="preserve">dotyczy </w:t>
+      </w:r>
+      <w:r>
+        <w:rPr>
+          <w:rFonts w:cstheme="minorHAnsi"/>
+          <w:i/>
+          <w:szCs w:val="20"/>
+        </w:rPr>
+        <w:t xml:space="preserve">oddania do druku co najmniej jednego artykułu naukowego opublikowanego w czasopiśmie naukowym lub w recenzowanych materiałach z konferencji międzynarodowej w odpowiedniej dyscyplinie naukowej, które w roku opublikowania artykułu w ostatecznej formie były ujęte w wykazie </w:t>
+      </w:r>
+      <w:r>
+        <w:rPr>
+          <w:rFonts w:cstheme="minorHAnsi"/>
+          <w:i/>
+          <w:szCs w:val="20"/>
+        </w:rPr>
+        <w:t xml:space="preserve">(„lista ministerialna”) </w:t>
+      </w:r>
+      <w:r>
+        <w:rPr>
+          <w:rFonts w:cstheme="minorHAnsi"/>
+          <w:i/>
+          <w:szCs w:val="20"/>
+        </w:rPr>
+        <w:t>sporządzonym zgodnie z przepisami wydanymi na podstawie Ustawy (art. 267 ust. 2 pkt 2 lit. b) lub 1 monografii naukowej wydanej przez wydawnictwo, które w roku opublikowania monografii w ostatecznej formie było ujęte w wykazie sporządzonym zgodnie z przepisami wydanymi na podstawie Ustawy (art. 267 ust. 2 pkt 2 lit. a)</w:t>
+      </w:r>
+      <w:r>
+        <w:rPr>
+          <w:rFonts w:cstheme="minorHAnsi"/>
+          <w:i/>
+          <w:szCs w:val="20"/>
+        </w:rPr>
+        <w:t>.</w:t>
+      </w:r>
+      <w:r>
+        <w:rPr>
+          <w:rFonts w:cstheme="minorHAnsi"/>
+          <w:i/>
+          <w:szCs w:val="20"/>
+        </w:rPr>
+        <w:t xml:space="preserve"> / </w:t>
+      </w:r>
+      <w:r>
+        <w:rPr>
+          <w:rFonts w:cstheme="minorHAnsi"/>
+          <w:i/>
           <w:color w:val="4472C4" w:themeColor="accent1"/>
           <w:szCs w:val="20"/>
-          <w:lang w:val="en-US"/>
-        </w:rPr>
-      </w:pPr>
-      <w:r>
-        <w:rPr>
-          <w:rFonts w:cstheme="minorHAnsi"/>
-          <w:i/>
-          <w:szCs w:val="20"/>
-        </w:rPr>
-        <w:t xml:space="preserve">Streszczenie popularnonaukowe należy przygotować w dwóch językach: polskim i angielskim. Wersje językowe muszą być tożsame. Opis powinien być napisany językiem popularnonaukowym i zawierać cel rozprawy, opis planowanych badań naukowych oraz powodów, dla których podjęta została ta </w:t>
-      </w:r>
-      <w:r>
-        <w:rPr>
-          <w:rFonts w:cstheme="minorHAnsi"/>
-          <w:i/>
-          <w:szCs w:val="20"/>
-        </w:rPr>
-        <w:lastRenderedPageBreak/>
-        <w:t xml:space="preserve">tematyka badawcza, a także najważniejsze spodziewane efekty (maks. </w:t>
-      </w:r>
-      <w:r>
-        <w:rPr>
-          <w:rFonts w:cstheme="minorHAnsi"/>
-          <w:i/>
-          <w:szCs w:val="20"/>
-          <w:lang w:val="en-US"/>
-        </w:rPr>
-        <w:t>1 strona, czcionka 11 pt., interlinia 1).</w:t>
-      </w:r>
-      <w:r>
-        <w:rPr>
-          <w:rFonts w:cstheme="minorHAnsi"/>
-          <w:i/>
-          <w:szCs w:val="20"/>
-          <w:lang w:val="en-US"/>
-        </w:rPr>
-        <w:t xml:space="preserve"> </w:t>
-      </w:r>
-      <w:r>
-        <w:rPr>
-          <w:rFonts w:cstheme="minorHAnsi"/>
-          <w:i/>
-          <w:szCs w:val="20"/>
-          <w:lang w:val="en-US"/>
-        </w:rPr>
-        <w:t>/</w:t>
+        </w:rPr>
+        <w:t>A</w:t>
       </w:r>
       <w:r>
         <w:rPr>
@@ -7701,9 +8264,8 @@
           <w:i/>
           <w:color w:val="4472C4" w:themeColor="accent1"/>
           <w:szCs w:val="20"/>
-          <w:lang w:val="en-US"/>
-        </w:rPr>
-        <w:t xml:space="preserve"> </w:t>
+        </w:rPr>
+        <w:t xml:space="preserve"> date of submission for publication of at least one scientific article published in a scientific journal or in the peer-reviewed materials of an international conference in the </w:t>
       </w:r>
       <w:r>
         <w:rPr>
@@ -7711,75 +8273,8 @@
           <w:i/>
           <w:color w:val="4472C4" w:themeColor="accent1"/>
           <w:szCs w:val="20"/>
-          <w:lang w:val="en-US"/>
-        </w:rPr>
-        <w:t xml:space="preserve">The description for general public must be in Polish and in English. The language versions must be identical. The description should be written for general public and should include the </w:t>
-      </w:r>
-      <w:r>
-        <w:rPr>
-          <w:rFonts w:cstheme="minorHAnsi"/>
-          <w:i/>
-          <w:color w:val="4472C4" w:themeColor="accent1"/>
-          <w:szCs w:val="20"/>
-          <w:lang w:val="en-US"/>
-        </w:rPr>
-        <w:t>doctoral dissertation</w:t>
-      </w:r>
-      <w:r>
-        <w:rPr>
-          <w:rFonts w:cstheme="minorHAnsi"/>
-          <w:i/>
-          <w:color w:val="4472C4" w:themeColor="accent1"/>
-          <w:szCs w:val="20"/>
-          <w:lang w:val="en-US"/>
-        </w:rPr>
-        <w:t xml:space="preserve"> goal, description of research, reasons for attempting a particular research topic and substantial results expected</w:t>
-      </w:r>
-      <w:r>
-        <w:rPr>
-          <w:rFonts w:cstheme="minorHAnsi"/>
-          <w:i/>
-          <w:color w:val="4472C4" w:themeColor="accent1"/>
-          <w:szCs w:val="20"/>
-          <w:lang w:val="en-US"/>
-        </w:rPr>
-        <w:t xml:space="preserve"> </w:t>
-      </w:r>
-      <w:r>
-        <w:rPr>
-          <w:i/>
-          <w:color w:val="4472C4" w:themeColor="accent1"/>
-          <w:szCs w:val="20"/>
-          <w:lang w:val="en-US"/>
-        </w:rPr>
-        <w:t xml:space="preserve">(at </w:t>
-      </w:r>
-      <w:r>
-        <w:rPr>
-          <w:i/>
-          <w:color w:val="4472C4" w:themeColor="accent1"/>
-          <w:szCs w:val="20"/>
-          <w:lang w:val="en-US"/>
-        </w:rPr>
-        <w:t>most 1</w:t>
-      </w:r>
-      <w:r>
-        <w:rPr>
-          <w:i/>
-          <w:color w:val="4472C4" w:themeColor="accent1"/>
-          <w:szCs w:val="20"/>
-          <w:lang w:val="en-US"/>
-        </w:rPr>
-        <w:t xml:space="preserve"> page, font 11, line spacing 1)</w:t>
-      </w:r>
-      <w:r>
-        <w:rPr>
-          <w:i/>
-          <w:color w:val="4472C4" w:themeColor="accent1"/>
-          <w:szCs w:val="20"/>
-          <w:lang w:val="en-US"/>
-        </w:rPr>
-        <w:t>.</w:t>
+        </w:rPr>
+        <w:t>relevant scientific discipline, which in the year of publication of the article in its final form were included in the list drawn up in accordance with the regulations issued under the Act (Art. 267 sec. 2 point 2(b) or 1 scientific monograph published by a publishing house, which in the year of publication of the monograph in its final form was included in the list drawn up in accordance with the regulations issued pursuant to the Act (Art. 267 sec. 2 point 2(a), referred to in Art. 186 sec. 1 point 3 of the Act.</w:t>
       </w:r>
     </w:p>
     <w:p>
@@ -7789,534 +8284,28 @@
         <w:rPr>
           <w:rFonts w:cstheme="minorHAnsi"/>
           <w:szCs w:val="20"/>
-          <w:lang w:val="en-US"/>
-        </w:rPr>
-      </w:pPr>
+        </w:rPr>
+      </w:pPr>
+    </w:p>
+    <w:p>
+      <w:pPr>
+        <w:spacing w:after="120" w:line="240" w:lineRule="auto"/>
+        <w:jc w:val="both"/>
+      </w:pPr>
+      <w:permStart w:id="641100817" w:edGrp="everyone"/>
+      <w:r>
+        <w:rPr>
+          <w:rFonts w:cstheme="minorHAnsi"/>
+          <w:b/>
+          <w:lang w:val="en-US"/>
+        </w:rPr>
+        <w:t xml:space="preserve">May 2027 / maj 2027</w:t>
+      </w:r>
     </w:p>
     <w:p>
       <w:pPr>
         <w:spacing w:after="0" w:line="240" w:lineRule="auto"/>
         <w:jc w:val="both"/>
-        <w:rPr>
-          <w:rFonts w:cstheme="minorHAnsi"/>
-          <w:b/>
-          <w:sz w:val="24"/>
-          <w:szCs w:val="20"/>
-        </w:rPr>
-      </w:pPr>
-      <w:r>
-        <w:rPr>
-          <w:rFonts w:cstheme="minorHAnsi"/>
-          <w:b/>
-          <w:sz w:val="24"/>
-          <w:szCs w:val="20"/>
-        </w:rPr>
-        <w:t>Streszczenie popularnonaukowe</w:t>
-      </w:r>
-    </w:p>
-    <w:p>
-      <w:pPr>
-        <w:spacing w:after="120" w:line="240" w:lineRule="auto"/>
-        <w:jc w:val="both"/>
-      </w:pPr>
-      <w:permStart w:id="301016009" w:edGrp="everyone"/>
-      <w:r>
-        <w:rPr>
-          <w:rFonts w:cstheme="minorHAnsi"/>
-          <w:lang w:val="pl-PL"/>
-        </w:rPr>
-        <w:t xml:space="preserve">Systemy sztucznej inteligencji, które działają w prawdziwym świecie, na przykład roboty chwytające przedmioty lub poruszające się po budynkach, uczą się na bardzo wielu przykładach i próbach. W rzeczywistości zbieranie takich danych jest powolne i kosztowne, dlatego systemy te często ćwiczą w symulacji komputerowej. Coraz częściej jest nią cyfrowy bliźniak: wierna kopia prawdziwego miejsca lub urządzenia, którą można odtworzyć z nagrań i pomiarów, łącznie z wyglądem, kształtem i tym, jak rzeczy się poruszają. Powstaje w ten sposób pętla: zbieramy dane w rzeczywistości, budujemy kopię, uczymy w niej system, sprawdzamy go w rzeczywistości, poprawiamy i dopiero wtedy wdrażamy. Każdy z tych kroków wymaga jednak prawdziwych danych, a ich zbieranie jest kosztowne.</w:t>
-      </w:r>
-    </w:p>
-    <w:p>
-      <w:pPr>
-        <w:spacing w:after="120" w:line="240" w:lineRule="auto"/>
-        <w:jc w:val="both"/>
-      </w:pPr>
-      <w:r>
-        <w:rPr>
-          <w:rFonts w:cstheme="minorHAnsi"/>
-          <w:lang w:val="pl-PL"/>
-        </w:rPr>
-        <w:t xml:space="preserve">Celem rozprawy jest sprawdzenie, jak przejść przez tę pętlę z jak najmniejszą ilością prawdziwych danych, niezależnie od zadania. Zamiast zbierać wszystko po równo, będziemy zbierać przede wszystkim te dane, które są ważne dla zadania i o których kopia wie jeszcze za mało. Ponieważ kopia nigdy nie jest idealna, nauczymy system tak, aby nie polegał na jej niepewnych fragmentach i radził sobie z jej błędami. Na koniec wybierzemy tylko te nieliczne próby w rzeczywistości, które najwięcej mówią o tym, gdzie system jeszcze zawodzi, i wykorzystamy je do poprawienia zarówno kopii, jak i systemu. Wskazówek dostarczy sama kopia, która wie, gdzie jest niepewna, oraz sposób, w jaki uczony system opisuje to, co widzi. Te same metody sprawdzimy na dwóch różnych zadaniach: chwytaniu przedmiotów ramieniem robota i poruszaniu się robota po budynkach. Badania będą prowadzone przede wszystkim na publicznie dostępnych danych, a wybrane wyniki zostaną potwierdzone na prawdziwym robocie.</w:t>
-      </w:r>
-    </w:p>
-    <w:p>
-      <w:pPr>
-        <w:spacing w:after="0" w:line="240" w:lineRule="auto"/>
-        <w:jc w:val="both"/>
-      </w:pPr>
-      <w:r>
-        <w:rPr>
-          <w:rFonts w:cstheme="minorHAnsi"/>
-          <w:lang w:val="pl-PL"/>
-        </w:rPr>
-        <w:t xml:space="preserve">Spodziewanym efektem są metody, które pozwolą zbierać mniej danych, uczyć skuteczniej i wykonywać mniej kosztownych prób w rzeczywistości, oraz pomiar, ile prawdziwych danych potrzeba, gdy system uczy się w cyfrowej kopii. Może to przyspieszyć i potanić wdrażanie uczących się systemów w fabrykach, magazynach, szpitalach i biurach. Opracowane oprogramowanie zostanie udostępnione publicznie.</w:t>
-      </w:r>
-    </w:p>
-    <w:permEnd w:id="301016009"/>
-    <w:p>
-      <w:pPr>
-        <w:spacing w:after="0" w:line="240" w:lineRule="auto"/>
-        <w:jc w:val="both"/>
-        <w:rPr>
-          <w:rFonts w:cstheme="minorHAnsi"/>
-          <w:szCs w:val="20"/>
-        </w:rPr>
-      </w:pPr>
-    </w:p>
-    <w:p>
-      <w:pPr>
-        <w:spacing w:after="0" w:line="240" w:lineRule="auto"/>
-        <w:jc w:val="both"/>
-        <w:rPr>
-          <w:rFonts w:cstheme="minorHAnsi"/>
-          <w:b/>
-          <w:sz w:val="24"/>
-          <w:szCs w:val="20"/>
-        </w:rPr>
-      </w:pPr>
-      <w:r>
-        <w:rPr>
-          <w:rFonts w:cstheme="minorHAnsi"/>
-          <w:b/>
-          <w:sz w:val="24"/>
-          <w:szCs w:val="20"/>
-        </w:rPr>
-        <w:t>Abstract</w:t>
-      </w:r>
-      <w:r>
-        <w:rPr>
-          <w:rFonts w:cstheme="minorHAnsi"/>
-          <w:b/>
-          <w:sz w:val="24"/>
-          <w:szCs w:val="20"/>
-        </w:rPr>
-        <w:t xml:space="preserve"> for general public</w:t>
-      </w:r>
-    </w:p>
-    <w:p>
-      <w:pPr>
-        <w:spacing w:after="120" w:line="240" w:lineRule="auto"/>
-        <w:jc w:val="both"/>
-      </w:pPr>
-      <w:permStart w:id="305530072" w:edGrp="everyone"/>
-      <w:r>
-        <w:rPr>
-          <w:rFonts w:cstheme="minorHAnsi"/>
-          <w:lang w:val="en-US"/>
-        </w:rPr>
-        <w:t xml:space="preserve">Artificial intelligence systems that act in the real world, for example robots that grasp objects or move around buildings, learn from a very large number of examples and trials. In reality, collecting such data is slow and costly, so these systems often practise in a computer simulation. Increasingly, this is a digital twin: a faithful copy of a real place or device that can be rebuilt from recordings and measurements, including how things look, their shape and how they move. This creates a loop: we collect data in reality, build the copy, train the system in it, check it in reality, correct it and only then deploy it. Each of these steps, however, needs real data, and collecting it is costly.</w:t>
-      </w:r>
-    </w:p>
-    <w:p>
-      <w:pPr>
-        <w:spacing w:after="120" w:line="240" w:lineRule="auto"/>
-        <w:jc w:val="both"/>
-      </w:pPr>
-      <w:r>
-        <w:rPr>
-          <w:rFonts w:cstheme="minorHAnsi"/>
-          <w:lang w:val="en-US"/>
-        </w:rPr>
-        <w:t xml:space="preserve">The goal of this dissertation is to find out how to go through this loop with as little real data as possible, whatever the task. Instead of collecting everything evenly, we will collect mainly the data that matters for the task and about which the copy still knows too little. Because the copy is never perfect, we will train the system so that it does not rely on the uncertain parts of the copy and copes with its errors. Finally, we will choose only the few trials in reality that tell the most about where the system still fails, and use them to correct both the copy and the system. Guidance will come from the copy itself, which knows where it is uncertain, and from the way the learning system describes what it sees. We will test the same methods on two different tasks: grasping objects with a robot arm and a robot moving around buildings. The research will be carried out mainly on publicly available data, and selected results will be confirmed on a real robot.</w:t>
-      </w:r>
-    </w:p>
-    <w:p>
-      <w:pPr>
-        <w:spacing w:after="0" w:line="240" w:lineRule="auto"/>
-        <w:jc w:val="both"/>
-      </w:pPr>
-      <w:r>
-        <w:rPr>
-          <w:rFonts w:cstheme="minorHAnsi"/>
-          <w:lang w:val="en-US"/>
-        </w:rPr>
-        <w:t xml:space="preserve">The expected result is methods that make it possible to collect less data, train more effectively and carry out fewer costly trials in reality, and a measurement of how much real data is needed when a system learns in a digital copy. This may make deploying learning systems in factories, warehouses, hospitals and offices faster and cheaper. The software developed will be made publicly available.</w:t>
-      </w:r>
-    </w:p>
-    <w:permEnd w:id="305530072"/>
-    <w:p>
-      <w:pPr>
-        <w:spacing w:after="0" w:line="240" w:lineRule="auto"/>
-        <w:jc w:val="both"/>
-        <w:rPr>
-          <w:rFonts w:cstheme="minorHAnsi"/>
-          <w:szCs w:val="20"/>
-        </w:rPr>
-      </w:pPr>
-    </w:p>
-    <w:p>
-      <w:pPr>
-        <w:shd w:val="clear" w:color="auto" w:fill="E6E6FA"/>
-        <w:spacing w:after="120" w:line="240" w:lineRule="auto"/>
-        <w:jc w:val="both"/>
-        <w:rPr>
-          <w:rFonts w:cstheme="minorHAnsi"/>
-          <w:b/>
-          <w:sz w:val="28"/>
-          <w:szCs w:val="20"/>
-          <w:lang w:val="en-US"/>
-        </w:rPr>
-      </w:pPr>
-      <w:r>
-        <w:rPr>
-          <w:rFonts w:cstheme="minorHAnsi"/>
-          <w:b/>
-          <w:sz w:val="28"/>
-          <w:szCs w:val="20"/>
-          <w:lang w:val="en-US"/>
-        </w:rPr>
-        <w:t>1</w:t>
-      </w:r>
-      <w:r>
-        <w:rPr>
-          <w:rFonts w:cstheme="minorHAnsi"/>
-          <w:b/>
-          <w:sz w:val="28"/>
-          <w:szCs w:val="20"/>
-          <w:lang w:val="en-US"/>
-        </w:rPr>
-        <w:t>1</w:t>
-      </w:r>
-      <w:r>
-        <w:rPr>
-          <w:rFonts w:cstheme="minorHAnsi"/>
-          <w:b/>
-          <w:sz w:val="28"/>
-          <w:szCs w:val="20"/>
-          <w:lang w:val="en-US"/>
-        </w:rPr>
-        <w:t>. </w:t>
-      </w:r>
-      <w:r>
-        <w:rPr>
-          <w:rFonts w:cstheme="minorHAnsi"/>
-          <w:b/>
-          <w:sz w:val="28"/>
-          <w:szCs w:val="20"/>
-          <w:lang w:val="en-US"/>
-        </w:rPr>
-        <w:t>T</w:t>
-      </w:r>
-      <w:r>
-        <w:rPr>
-          <w:rFonts w:cstheme="minorHAnsi"/>
-          <w:b/>
-          <w:sz w:val="28"/>
-          <w:szCs w:val="20"/>
-          <w:lang w:val="en-US"/>
-        </w:rPr>
-        <w:t>ermin oddania do druku artykułu</w:t>
-      </w:r>
-      <w:r>
-        <w:rPr>
-          <w:rFonts w:cstheme="minorHAnsi"/>
-          <w:b/>
-          <w:sz w:val="28"/>
-          <w:szCs w:val="20"/>
-          <w:lang w:val="en-US"/>
-        </w:rPr>
-        <w:t xml:space="preserve"> naukowego </w:t>
-      </w:r>
-      <w:r>
-        <w:rPr>
-          <w:rFonts w:cstheme="minorHAnsi"/>
-          <w:b/>
-          <w:sz w:val="28"/>
-          <w:szCs w:val="20"/>
-          <w:lang w:val="en-US"/>
-        </w:rPr>
-        <w:t>lub monografii</w:t>
-      </w:r>
-      <w:r>
-        <w:rPr>
-          <w:rFonts w:cstheme="minorHAnsi"/>
-          <w:b/>
-          <w:sz w:val="28"/>
-          <w:szCs w:val="20"/>
-          <w:lang w:val="en-US"/>
-        </w:rPr>
-        <w:t> </w:t>
-      </w:r>
-      <w:r>
-        <w:rPr>
-          <w:rFonts w:cstheme="minorHAnsi"/>
-          <w:b/>
-          <w:sz w:val="28"/>
-          <w:szCs w:val="20"/>
-          <w:lang w:val="en-US"/>
-        </w:rPr>
-        <w:t>/</w:t>
-      </w:r>
-      <w:r>
-        <w:rPr>
-          <w:rFonts w:cstheme="minorHAnsi"/>
-          <w:b/>
-          <w:sz w:val="28"/>
-          <w:szCs w:val="20"/>
-          <w:lang w:val="en-US"/>
-        </w:rPr>
-        <w:t> </w:t>
-      </w:r>
-      <w:r>
-        <w:rPr>
-          <w:rFonts w:cstheme="minorHAnsi"/>
-          <w:b/>
-          <w:color w:val="4472C4" w:themeColor="accent1"/>
-          <w:sz w:val="28"/>
-          <w:szCs w:val="20"/>
-          <w:lang w:val="en-US"/>
-        </w:rPr>
-        <w:t>Date of submission for publication of at least one scientific article</w:t>
-      </w:r>
-      <w:r>
-        <w:rPr>
-          <w:rFonts w:cstheme="minorHAnsi"/>
-          <w:b/>
-          <w:color w:val="4472C4" w:themeColor="accent1"/>
-          <w:sz w:val="28"/>
-          <w:szCs w:val="20"/>
-          <w:lang w:val="en-US"/>
-        </w:rPr>
-        <w:t xml:space="preserve"> or monography</w:t>
-      </w:r>
-    </w:p>
-    <w:p>
-      <w:pPr>
-        <w:shd w:val="clear" w:color="auto" w:fill="E7E6E6" w:themeFill="background2"/>
-        <w:spacing w:after="0" w:line="240" w:lineRule="auto"/>
-        <w:rPr>
-          <w:rFonts w:cstheme="minorHAnsi"/>
-          <w:i/>
-          <w:szCs w:val="20"/>
-        </w:rPr>
-      </w:pPr>
-      <w:r>
-        <w:rPr>
-          <w:rFonts w:cstheme="minorHAnsi"/>
-          <w:i/>
-          <w:szCs w:val="20"/>
-        </w:rPr>
-        <w:t xml:space="preserve">Termin </w:t>
-      </w:r>
-      <w:r>
-        <w:rPr>
-          <w:rFonts w:cstheme="minorHAnsi"/>
-          <w:i/>
-          <w:szCs w:val="20"/>
-        </w:rPr>
-        <w:t xml:space="preserve">wysłania do recenzji </w:t>
-      </w:r>
-      <w:r>
-        <w:rPr>
-          <w:rFonts w:cstheme="minorHAnsi"/>
-          <w:i/>
-          <w:szCs w:val="20"/>
-        </w:rPr>
-        <w:t xml:space="preserve">artykułu naukowego lub monografii naukowej zgodnie z wymaganiami </w:t>
-      </w:r>
-      <w:r>
-        <w:rPr>
-          <w:rFonts w:cstheme="minorHAnsi"/>
-          <w:i/>
-          <w:szCs w:val="20"/>
-        </w:rPr>
-        <w:t>art.</w:t>
-      </w:r>
-      <w:r>
-        <w:rPr>
-          <w:rFonts w:cstheme="minorHAnsi"/>
-          <w:i/>
-          <w:szCs w:val="20"/>
-        </w:rPr>
-        <w:t> </w:t>
-      </w:r>
-      <w:r>
-        <w:rPr>
-          <w:rFonts w:cstheme="minorHAnsi"/>
-          <w:i/>
-          <w:szCs w:val="20"/>
-        </w:rPr>
-        <w:t>186 ust.</w:t>
-      </w:r>
-      <w:r>
-        <w:rPr>
-          <w:rFonts w:cstheme="minorHAnsi"/>
-          <w:i/>
-          <w:szCs w:val="20"/>
-        </w:rPr>
-        <w:t> </w:t>
-      </w:r>
-      <w:r>
-        <w:rPr>
-          <w:rFonts w:cstheme="minorHAnsi"/>
-          <w:i/>
-          <w:szCs w:val="20"/>
-        </w:rPr>
-        <w:t>1 pkt</w:t>
-      </w:r>
-      <w:r>
-        <w:rPr>
-          <w:rFonts w:cstheme="minorHAnsi"/>
-          <w:i/>
-          <w:szCs w:val="20"/>
-        </w:rPr>
-        <w:t> </w:t>
-      </w:r>
-      <w:r>
-        <w:rPr>
-          <w:rFonts w:cstheme="minorHAnsi"/>
-          <w:i/>
-          <w:szCs w:val="20"/>
-        </w:rPr>
-        <w:t>3 Ustawy</w:t>
-      </w:r>
-      <w:r>
-        <w:rPr>
-          <w:rFonts w:cstheme="minorHAnsi"/>
-          <w:i/>
-          <w:szCs w:val="20"/>
-        </w:rPr>
-        <w:t xml:space="preserve"> </w:t>
-      </w:r>
-      <w:r>
-        <w:rPr>
-          <w:rFonts w:cstheme="minorHAnsi"/>
-          <w:i/>
-          <w:szCs w:val="20"/>
-        </w:rPr>
-        <w:t>stawianymi osobie ubiegającej się stopień doktora</w:t>
-      </w:r>
-      <w:r>
-        <w:rPr>
-          <w:rFonts w:cstheme="minorHAnsi"/>
-          <w:i/>
-          <w:szCs w:val="20"/>
-        </w:rPr>
-        <w:t xml:space="preserve">. </w:t>
-      </w:r>
-      <w:r>
-        <w:rPr>
-          <w:rFonts w:cstheme="minorHAnsi"/>
-          <w:i/>
-          <w:szCs w:val="20"/>
-        </w:rPr>
-        <w:t>T</w:t>
-      </w:r>
-      <w:r>
-        <w:rPr>
-          <w:rFonts w:cstheme="minorHAnsi"/>
-          <w:i/>
-          <w:szCs w:val="20"/>
-        </w:rPr>
-        <w:t xml:space="preserve">ermin </w:t>
-      </w:r>
-      <w:r>
-        <w:rPr>
-          <w:rFonts w:cstheme="minorHAnsi"/>
-          <w:i/>
-          <w:szCs w:val="20"/>
-        </w:rPr>
-        <w:t xml:space="preserve">dotyczy </w:t>
-      </w:r>
-      <w:r>
-        <w:rPr>
-          <w:rFonts w:cstheme="minorHAnsi"/>
-          <w:i/>
-          <w:szCs w:val="20"/>
-        </w:rPr>
-        <w:t xml:space="preserve">oddania do druku co najmniej jednego artykułu naukowego opublikowanego w czasopiśmie naukowym lub w recenzowanych materiałach z konferencji międzynarodowej w odpowiedniej dyscyplinie naukowej, które w roku opublikowania artykułu w ostatecznej formie były ujęte w wykazie </w:t>
-      </w:r>
-      <w:r>
-        <w:rPr>
-          <w:rFonts w:cstheme="minorHAnsi"/>
-          <w:i/>
-          <w:szCs w:val="20"/>
-        </w:rPr>
-        <w:t xml:space="preserve">(„lista ministerialna”) </w:t>
-      </w:r>
-      <w:r>
-        <w:rPr>
-          <w:rFonts w:cstheme="minorHAnsi"/>
-          <w:i/>
-          <w:szCs w:val="20"/>
-        </w:rPr>
-        <w:t>sporządzonym zgodnie z przepisami wydanymi na podstawie Ustawy (art. 267 ust. 2 pkt 2 lit. b) lub 1 monografii naukowej wydanej przez wydawnictwo, które w roku opublikowania monografii w ostatecznej formie było ujęte w wykazie sporządzonym zgodnie z przepisami wydanymi na podstawie Ustawy (art. 267 ust. 2 pkt 2 lit. a)</w:t>
-      </w:r>
-      <w:r>
-        <w:rPr>
-          <w:rFonts w:cstheme="minorHAnsi"/>
-          <w:i/>
-          <w:szCs w:val="20"/>
-        </w:rPr>
-        <w:t>.</w:t>
-      </w:r>
-      <w:r>
-        <w:rPr>
-          <w:rFonts w:cstheme="minorHAnsi"/>
-          <w:i/>
-          <w:szCs w:val="20"/>
-        </w:rPr>
-        <w:t xml:space="preserve"> / </w:t>
-      </w:r>
-      <w:r>
-        <w:rPr>
-          <w:rFonts w:cstheme="minorHAnsi"/>
-          <w:i/>
-          <w:color w:val="4472C4" w:themeColor="accent1"/>
-          <w:szCs w:val="20"/>
-        </w:rPr>
-        <w:t>A</w:t>
-      </w:r>
-      <w:r>
-        <w:rPr>
-          <w:rFonts w:cstheme="minorHAnsi"/>
-          <w:i/>
-          <w:color w:val="4472C4" w:themeColor="accent1"/>
-          <w:szCs w:val="20"/>
-        </w:rPr>
-        <w:t xml:space="preserve"> date of submission for publication of at least one scientific article published in a scientific journal or in the peer-reviewed materials of an international conference in the </w:t>
-      </w:r>
-      <w:r>
-        <w:rPr>
-          <w:rFonts w:cstheme="minorHAnsi"/>
-          <w:i/>
-          <w:color w:val="4472C4" w:themeColor="accent1"/>
-          <w:szCs w:val="20"/>
-        </w:rPr>
-        <w:t>relevant scientific discipline, which in the year of publication of the article in its final form were included in the list drawn up in accordance with the regulations issued under the Act (Art. 267 sec. 2 point 2(b) or 1 scientific monograph published by a publishing house, which in the year of publication of the monograph in its final form was included in the list drawn up in accordance with the regulations issued pursuant to the Act (Art. 267 sec. 2 point 2(a), referred to in Art. 186 sec. 1 point 3 of the Act.</w:t>
-      </w:r>
-    </w:p>
-    <w:p>
-      <w:pPr>
-        <w:spacing w:after="0" w:line="240" w:lineRule="auto"/>
-        <w:jc w:val="both"/>
-        <w:rPr>
-          <w:rFonts w:cstheme="minorHAnsi"/>
-          <w:szCs w:val="20"/>
-        </w:rPr>
-      </w:pPr>
-    </w:p>
-    <w:p>
-      <w:pPr>
-        <w:spacing w:after="120" w:line="240" w:lineRule="auto"/>
-        <w:jc w:val="both"/>
-      </w:pPr>
-      <w:permStart w:id="641100817" w:edGrp="everyone"/>
-      <w:r>
-        <w:rPr>
-          <w:rFonts w:cstheme="minorHAnsi"/>
-          <w:b/>
-          <w:lang w:val="en-US"/>
-        </w:rPr>
-        <w:t xml:space="preserve">May 2027 / maj 2027</w:t>
-      </w:r>
-    </w:p>
-    <w:p>
-      <w:pPr>
-        <w:spacing w:after="0" w:line="240" w:lineRule="auto"/>
-        <w:jc w:val="both"/>
       </w:pPr>
       <w:r>
         <w:rPr>
@@ -8383,7 +8372,7 @@
           <w:rFonts w:cstheme="minorHAnsi"/>
           <w:lang w:val="en-US"/>
         </w:rPr>
-        <w:t xml:space="preserve">. P1 reports Stage I and the first Stage II results (RQ1–RQ2): task-aware, uncertainty-guided capture of real data for digital twins (H1) and uncertainty-aware learning in imperfect twins (first H2 results), evaluated in manipulation and navigation by the real data they save (task T4.2). If it is rejected, the revised paper goes to </w:t>
+        <w:t xml:space="preserve">. P1 reports the first two components of the method (Stage I and the first Stage II results, RQ1–RQ2): C1, task-aware, uncertainty-guided capture of real data for digital twins (H1), and C2, uncertainty-aware learning in imperfect twins (first H2 results), evaluated in manipulation and navigation by the real data they save (task T4.2). If it is rejected, the revised paper goes to </w:t>
       </w:r>
       <w:r>
         <w:rPr>
@@ -8680,10 +8669,10 @@
       </w:tblPr>
       <w:tblGrid>
         <w:gridCol w:w="1269"/>
-        <w:gridCol w:w="3707"/>
-        <w:gridCol w:w="1269"/>
-        <w:gridCol w:w="1215"/>
-        <w:gridCol w:w="1612"/>
+        <w:gridCol w:w="3796"/>
+        <w:gridCol w:w="1043"/>
+        <w:gridCol w:w="1353"/>
+        <w:gridCol w:w="1611"/>
       </w:tblGrid>
       <w:tr>
         <w:tc>
@@ -8707,7 +8696,7 @@
         </w:tc>
         <w:tc>
           <w:tcPr>
-            <w:tcW w:w="3707" w:type="dxa"/>
+            <w:tcW w:w="3796" w:type="dxa"/>
           </w:tcPr>
           <w:p>
             <w:pPr>
@@ -8726,7 +8715,7 @@
         </w:tc>
         <w:tc>
           <w:tcPr>
-            <w:tcW w:w="1269" w:type="dxa"/>
+            <w:tcW w:w="1043" w:type="dxa"/>
           </w:tcPr>
           <w:p>
             <w:pPr>
@@ -8745,7 +8734,7 @@
         </w:tc>
         <w:tc>
           <w:tcPr>
-            <w:tcW w:w="1215" w:type="dxa"/>
+            <w:tcW w:w="1353" w:type="dxa"/>
           </w:tcPr>
           <w:p>
             <w:pPr>
@@ -8764,7 +8753,7 @@
         </w:tc>
         <w:tc>
           <w:tcPr>
-            <w:tcW w:w="1612" w:type="dxa"/>
+            <w:tcW w:w="1611" w:type="dxa"/>
           </w:tcPr>
           <w:p>
             <w:pPr>
@@ -8803,7 +8792,7 @@
         </w:tc>
         <w:tc>
           <w:tcPr>
-            <w:tcW w:w="3707" w:type="dxa"/>
+            <w:tcW w:w="3796" w:type="dxa"/>
           </w:tcPr>
           <w:p>
             <w:pPr>
@@ -8821,7 +8810,7 @@
         </w:tc>
         <w:tc>
           <w:tcPr>
-            <w:tcW w:w="1269" w:type="dxa"/>
+            <w:tcW w:w="1043" w:type="dxa"/>
           </w:tcPr>
           <w:p>
             <w:pPr>
@@ -8839,7 +8828,7 @@
         </w:tc>
         <w:tc>
           <w:tcPr>
-            <w:tcW w:w="1215" w:type="dxa"/>
+            <w:tcW w:w="1353" w:type="dxa"/>
           </w:tcPr>
           <w:p>
             <w:pPr>
@@ -8857,7 +8846,7 @@
         </w:tc>
         <w:tc>
           <w:tcPr>
-            <w:tcW w:w="1612" w:type="dxa"/>
+            <w:tcW w:w="1611" w:type="dxa"/>
           </w:tcPr>
           <w:p>
             <w:pPr>
@@ -8895,7 +8884,7 @@
         </w:tc>
         <w:tc>
           <w:tcPr>
-            <w:tcW w:w="3707" w:type="dxa"/>
+            <w:tcW w:w="3796" w:type="dxa"/>
           </w:tcPr>
           <w:p>
             <w:pPr>
@@ -8907,13 +8896,13 @@
                 <w:rFonts w:cstheme="minorHAnsi"/>
                 <w:lang w:val="en-US"/>
               </w:rPr>
-              <w:t xml:space="preserve">P1 (RQ1–RQ2, task-aware capture, first H2 results): NeurIPS 2027, May 2027 (§11)</w:t>
+              <w:t xml:space="preserve">P1 (method components C1 and first C2 results, RQ1–RQ2): NeurIPS 2027, May 2027 (§11)</w:t>
             </w:r>
           </w:p>
         </w:tc>
         <w:tc>
           <w:tcPr>
-            <w:tcW w:w="1269" w:type="dxa"/>
+            <w:tcW w:w="1043" w:type="dxa"/>
           </w:tcPr>
           <w:p>
             <w:pPr>
@@ -8931,7 +8920,7 @@
         </w:tc>
         <w:tc>
           <w:tcPr>
-            <w:tcW w:w="1215" w:type="dxa"/>
+            <w:tcW w:w="1353" w:type="dxa"/>
           </w:tcPr>
           <w:p>
             <w:pPr>
@@ -8949,7 +8938,7 @@
         </w:tc>
         <w:tc>
           <w:tcPr>
-            <w:tcW w:w="1612" w:type="dxa"/>
+            <w:tcW w:w="1611" w:type="dxa"/>
           </w:tcPr>
           <w:p>
             <w:pPr>
@@ -8987,7 +8976,7 @@
         </w:tc>
         <w:tc>
           <w:tcPr>
-            <w:tcW w:w="3707" w:type="dxa"/>
+            <w:tcW w:w="3796" w:type="dxa"/>
           </w:tcPr>
           <w:p>
             <w:pPr>
@@ -8999,13 +8988,13 @@
                 <w:rFonts w:cstheme="minorHAnsi"/>
                 <w:lang w:val="en-US"/>
               </w:rPr>
-              <w:t xml:space="preserve">P2 (RQ3, few real data, twin correction): ICML or CVPR 2028; P3 (RQ4, budget of the full loop in both testbeds): NeurIPS 2028</w:t>
+              <w:t xml:space="preserve">P2 (component C3, few real data, RQ3): ICML or CVPR 2028; P3 (the whole method in both testbeds, RQ4): NeurIPS 2028</w:t>
             </w:r>
           </w:p>
         </w:tc>
         <w:tc>
           <w:tcPr>
-            <w:tcW w:w="1269" w:type="dxa"/>
+            <w:tcW w:w="1043" w:type="dxa"/>
           </w:tcPr>
           <w:p>
             <w:pPr>
@@ -9017,13 +9006,13 @@
                 <w:rFonts w:cstheme="minorHAnsi"/>
                 <w:lang w:val="en-US"/>
               </w:rPr>
-              <w:t xml:space="preserve">Trial selection</w:t>
+              <w:t xml:space="preserve">C3 code</w:t>
             </w:r>
           </w:p>
         </w:tc>
         <w:tc>
           <w:tcPr>
-            <w:tcW w:w="1215" w:type="dxa"/>
+            <w:tcW w:w="1353" w:type="dxa"/>
           </w:tcPr>
           <w:p>
             <w:pPr>
@@ -9041,7 +9030,7 @@
         </w:tc>
         <w:tc>
           <w:tcPr>
-            <w:tcW w:w="1612" w:type="dxa"/>
+            <w:tcW w:w="1611" w:type="dxa"/>
           </w:tcPr>
           <w:p>
             <w:pPr>
@@ -9079,7 +9068,7 @@
         </w:tc>
         <w:tc>
           <w:tcPr>
-            <w:tcW w:w="3707" w:type="dxa"/>
+            <w:tcW w:w="3796" w:type="dxa"/>
           </w:tcPr>
           <w:p>
             <w:pPr>
@@ -9097,7 +9086,7 @@
         </w:tc>
         <w:tc>
           <w:tcPr>
-            <w:tcW w:w="1269" w:type="dxa"/>
+            <w:tcW w:w="1043" w:type="dxa"/>
           </w:tcPr>
           <w:p>
             <w:pPr>
@@ -9109,13 +9098,13 @@
                 <w:rFonts w:cstheme="minorHAnsi"/>
                 <w:lang w:val="en-US"/>
               </w:rPr>
-              <w:t xml:space="preserve">Full release</w:t>
+              <w:t xml:space="preserve">Method release</w:t>
             </w:r>
           </w:p>
         </w:tc>
         <w:tc>
           <w:tcPr>
-            <w:tcW w:w="1215" w:type="dxa"/>
+            <w:tcW w:w="1353" w:type="dxa"/>
           </w:tcPr>
           <w:p>
             <w:pPr>
@@ -9133,7 +9122,7 @@
         </w:tc>
         <w:tc>
           <w:tcPr>
-            <w:tcW w:w="1612" w:type="dxa"/>
+            <w:tcW w:w="1611" w:type="dxa"/>
           </w:tcPr>
           <w:p>
             <w:pPr>
@@ -9167,7 +9156,7 @@
           <w:rFonts w:cstheme="minorHAnsi"/>
           <w:lang w:val="en-US"/>
         </w:rPr>
-        <w:t xml:space="preserve">P1–P3 are the linked core of the dissertation; P4 is optional.</w:t>
+        <w:t xml:space="preserve">P1–P3 present one method, component by component and then as a whole; P4 is optional.</w:t>
       </w:r>
     </w:p>
     <w:p>
@@ -9267,14 +9256,14 @@
           <w:i/>
           <w:lang w:val="en-US"/>
         </w:rPr>
-        <w:t xml:space="preserve">Task-aware capture gives no gain</w:t>
-      </w:r>
-      <w:r>
-        <w:rPr>
-          <w:rFonts w:cstheme="minorHAnsi"/>
-          <w:lang w:val="en-US"/>
-        </w:rPr>
-        <w:t xml:space="preserve"> (3–4): the measured capture–P curves still answer RQ1, and Stages II–III have their own baselines (§7).</w:t>
+        <w:t xml:space="preserve">One component gives no gain</w:t>
+      </w:r>
+      <w:r>
+        <w:rPr>
+          <w:rFonts w:cstheme="minorHAnsi"/>
+          <w:lang w:val="en-US"/>
+        </w:rPr>
+        <w:t xml:space="preserve"> (3–5): its budget curve still answers its RQ, and H4 is still tested (§7).</w:t>
       </w:r>
     </w:p>
     <w:p>

</xml_diff>

<commit_message>
Wave 15: method uses open VLA fine-tuned sim-first in the twin, VLM-guided capture, twin-grounded world model; crowdedness check (TwinRL closest)
Closes #31, closes #32

Co-Authored-By: Claude Opus 5.5 <noreply@anthropic.com>
</commit_message>
<xml_diff>
--- a/output/IPB_Grzegorz_Piotrowski.docx
+++ b/output/IPB_Grzegorz_Piotrowski.docx
@@ -1098,7 +1098,7 @@
           <w:rFonts w:cstheme="minorHAnsi"/>
           <w:lang w:val="en-US"/>
         </w:rPr>
-        <w:t xml:space="preserve"> Metoda uczenia w pętli rzeczywistość–symulacja–rzeczywistość wymagająca mniej danych rzeczywistych: ukierunkowane na zadanie zbieranie danych do budowy cyfrowych bliźniaków, uczenie w nich z uwzględnieniem niepewności i aktywny wybór nielicznych danych rzeczywistych</w:t>
+        <w:t xml:space="preserve"> Metoda dostrajania modeli wizja–język–działanie w pętli rzeczywistość–symulacja–rzeczywistość wymagająca mniej danych rzeczywistych: ukierunkowane na zadanie zbieranie danych do budowy cyfrowych bliźniaków, uczenie w bliźniakach i modelach świata oraz aktywny wybór nielicznych danych rzeczywistych</w:t>
       </w:r>
       <w:bookmarkStart w:id="0" w:name="_Hlk95566638"/>
     </w:p>
@@ -1120,7 +1120,7 @@
           <w:rFonts w:cstheme="minorHAnsi"/>
           <w:lang w:val="en-US"/>
         </w:rPr>
-        <w:t xml:space="preserve"> A method for learning in the real-to-sim-to-real loop that needs less real data: task-aware capture for building digital twins, uncertainty-aware learning in them and active selection of few real-world data</w:t>
+        <w:t xml:space="preserve"> A method for fine-tuning vision-language-action models in the real-to-sim-to-real loop that needs less real data: task-aware capture for building digital twins, learning in twins and world models, and active selection of few real-world data</w:t>
       </w:r>
     </w:p>
     <w:bookmarkEnd w:id="0"/>
@@ -2247,7 +2247,7 @@
                 <w:rFonts w:cstheme="minorHAnsi"/>
                 <w:lang w:val="en-US"/>
               </w:rPr>
-              <w:t xml:space="preserve"> Tier A set-up in both testbeds (§9): navigation, ≥ 20 public scenes (10 held out) with laser-scan references and separate phone captures; manipulation, ≥ 20 simulator task–object configurations (10 held out) with held-out physical parameters. Existing 3DGS pipeline and system identification from the T2.2 shortlist; twins at ≥ 4 capture budgets; pilot fixing task difficulty (below the P ceiling) and the operator-time cost model; imitation-learned policies in the twins; pre-registration of the protocol (§7, §9). </w:t>
+              <w:t xml:space="preserve"> Tier A set-up in both testbeds (§9): navigation, ≥ 20 public scenes (10 held out) with laser-scan references and separate phone captures; manipulation, ≥ 20 simulator task–object configurations (10 held out) with held-out physical parameters. Existing 3DGS pipeline and system identification from the T2.2 shortlist; twins at ≥ 4 capture budgets; open VLA (LoRA fine-tuning), VLM and world-model checkpoints running on the twins (§9); pilot fixing task difficulty (below the P ceiling), the operator-time cost model and the measured GPU cost; WCSS/PLGrid computing grant; pre-registration of the protocol (§7, §9). </w:t>
             </w:r>
             <w:r>
               <w:rPr>
@@ -2349,7 +2349,7 @@
                 <w:rFonts w:cstheme="minorHAnsi"/>
                 <w:lang w:val="en-US"/>
               </w:rPr>
-              <w:t xml:space="preserve"> C1: task-aware, uncertainty-guided capture of views and interactions vs. uniform, task-blind and risk-weighted selection. </w:t>
+              <w:t xml:space="preserve"> C1: VLM-guided, task-aware, uncertainty-guided capture of views and interactions vs. uniform, task-blind, risk-weighted and VLM-guided reconstruction-quality selection, judged by the success of the VLA fine-tuned in each twin. </w:t>
             </w:r>
             <w:r>
               <w:rPr>
@@ -2456,7 +2456,7 @@
                 <w:b/>
                 <w:lang w:val="en-US"/>
               </w:rPr>
-              <w:t xml:space="preserve">Stage I completed; Stage II – method component C2: learn robustly in an imperfect twin (RQ1–RQ2, H1–H2).</w:t>
+              <w:t xml:space="preserve">Stage I completed; Stage II – method component C2: fine-tune in an imperfect twin and a twin-grounded world model (RQ1–RQ2, H1–H2).</w:t>
             </w:r>
           </w:p>
           <w:p>
@@ -2477,7 +2477,7 @@
                 <w:rFonts w:cstheme="minorHAnsi"/>
                 <w:lang w:val="en-US"/>
               </w:rPr>
-              <w:t xml:space="preserve"> C2: uncertainty-aware randomization (appearance, geometry, physical parameters) and representation-based weighting of twin samples vs. uniform domain randomization at an equal capture budget, in both testbeds. </w:t>
+              <w:t xml:space="preserve"> C2: uncertainty-aware LoRA fine-tuning of the VLA (SFT, then RL) in the twin, with uncertainty-driven randomization and sample weighting, vs. uniform domain randomization (H2a); the world model post-trained on twin rollouts and covering the twin's uncertain regions vs. the twin only (H2b); equal capture budgets, both testbeds. </w:t>
             </w:r>
             <w:r>
               <w:rPr>
@@ -2573,7 +2573,7 @@
                 <w:rFonts w:cstheme="minorHAnsi"/>
                 <w:lang w:val="en-US"/>
               </w:rPr>
-              <w:t xml:space="preserve"> (method component C1, H1, and first results of C2, H2, in manipulation and navigation). </w:t>
+              <w:t xml:space="preserve"> (method component C1, H1, and first results of C2, H2, for a VLA fine-tuned in twins, in manipulation and navigation). </w:t>
             </w:r>
             <w:r>
               <w:rPr>
@@ -2624,7 +2624,7 @@
                 <w:rFonts w:cstheme="minorHAnsi"/>
                 <w:lang w:val="en-US"/>
               </w:rPr>
-              <w:t xml:space="preserve"> Stage III set-up: C3 trial-selection and correction code on tier A (Jul–Sep 2027). </w:t>
+              <w:t xml:space="preserve"> Stage III set-up: C3 trial selection (gap predicted from twin, world-model and VLA uncertainty) and correction code on tier A (Jul–Sep 2027). </w:t>
             </w:r>
             <w:r>
               <w:rPr>
@@ -2804,7 +2804,7 @@
                 <w:rFonts w:cstheme="minorHAnsi"/>
                 <w:lang w:val="en-US"/>
               </w:rPr>
-              <w:t xml:space="preserve"> C3: active selection of real trials (predicted gap, uncertainty) vs. random selection; correction of the twin (appearance and physical parameters) and fine-tuning of the policy with the selected trials, in both testbeds. </w:t>
+              <w:t xml:space="preserve"> C3: active selection of real trials vs. random and twin-only failure-driven selection; correction of the twin (appearance and physical parameters) and the world model, and fine-tuning of the VLA with the selected trials, in both testbeds. </w:t>
             </w:r>
             <w:r>
               <w:rPr>
@@ -2870,7 +2870,7 @@
                 <w:rFonts w:cstheme="minorHAnsi"/>
                 <w:lang w:val="en-US"/>
               </w:rPr>
-              <w:t xml:space="preserve"> First robot validation campaign (tier C, 2 PWr settings, ~8 robot-hours): own captures, twins, uniform capture vs. the method. </w:t>
+              <w:t xml:space="preserve"> First robot validation campaign (tier C, 2 PWr settings, ~8 robot-hours): own captures, twins, the fine-tuned VLA, uniform capture vs. the method. </w:t>
             </w:r>
             <w:r>
               <w:rPr>
@@ -3050,7 +3050,7 @@
                 <w:rFonts w:cstheme="minorHAnsi"/>
                 <w:lang w:val="en-US"/>
               </w:rPr>
-              <w:t xml:space="preserve"> Real-data budget curves of the whole method vs. real-only learning ("exchange rate") and vs. the strongest existing real-to-sim-to-real pipeline on tier A in manipulation and navigation, with C1–C3 unchanged, plus the tier-B check against published paired sim/real evaluations. </w:t>
+              <w:t xml:space="preserve"> Real-data budget curves of the whole method vs. real-only fine-tuning of the same VLA ("exchange rate") and vs. the strongest existing twin fine-tuning pipeline for VLAs (TwinRL/RialTo-style) on tier A in manipulation and navigation, with C1–C3 unchanged, plus the tier-B check against published paired sim/real evaluations (SIMPLER). </w:t>
             </w:r>
             <w:r>
               <w:rPr>
@@ -3182,7 +3182,7 @@
                 <w:rFonts w:cstheme="minorHAnsi"/>
                 <w:lang w:val="en-US"/>
               </w:rPr>
-              <w:t xml:space="preserve"> (the whole method against real-only learning and the existing pipeline in both testbeds; working title "budget law") submitted to </w:t>
+              <w:t xml:space="preserve"> (the whole method against real-only fine-tuning and the existing twin pipeline in both testbeds; working title "budget law") submitted to </w:t>
             </w:r>
             <w:r>
               <w:rPr>
@@ -3362,7 +3362,7 @@
                 <w:rFonts w:cstheme="minorHAnsi"/>
                 <w:lang w:val="en-US"/>
               </w:rPr>
-              <w:t xml:space="preserve"> Release of the method's code and experiment scripts. </w:t>
+              <w:t xml:space="preserve"> Release of the method's code, experiment scripts and LoRA adapters (where model licences permit). </w:t>
             </w:r>
             <w:r>
               <w:rPr>
@@ -4270,7 +4270,22 @@
           <w:rFonts w:cstheme="minorHAnsi"/>
           <w:lang w:val="en-US"/>
         </w:rPr>
-        <w:t xml:space="preserve">. Systems that act in or measure the physical world, such as robot manipulators, mobile robots and other autonomous or perception systems, need large amounts of experience, and in the real world that data is slow, expensive and sometimes risky to collect. A policy or model is therefore often trained in simulation and then used on real data, where it often performs worse (the </w:t>
+        <w:t xml:space="preserve">. Robot manipulators, mobile robots and other systems acting in the physical world need much experience, which is slow, expensive and sometimes risky to collect in reality. Pretrained open </w:t>
+      </w:r>
+      <w:r>
+        <w:rPr>
+          <w:rFonts w:cstheme="minorHAnsi"/>
+          <w:b/>
+          <w:lang w:val="en-US"/>
+        </w:rPr>
+        <w:t xml:space="preserve">vision-language-action (VLA) models</w:t>
+      </w:r>
+      <w:r>
+        <w:rPr>
+          <w:rFonts w:cstheme="minorHAnsi"/>
+          <w:lang w:val="en-US"/>
+        </w:rPr>
+        <w:t xml:space="preserve">, trained on large robot datasets, have made the starting point much stronger, but they still need data from the target task and place to work there. Training in simulation avoids that cost but opens a </w:t>
       </w:r>
       <w:r>
         <w:rPr>
@@ -4285,7 +4300,7 @@
           <w:rFonts w:cstheme="minorHAnsi"/>
           <w:lang w:val="en-US"/>
         </w:rPr>
-        <w:t xml:space="preserve">).</w:t>
+        <w:t xml:space="preserve">.</w:t>
       </w:r>
     </w:p>
     <w:p>
@@ -4306,7 +4321,22 @@
           <w:rFonts w:cstheme="minorHAnsi"/>
           <w:lang w:val="en-US"/>
         </w:rPr>
-        <w:t xml:space="preserve"> built from real data narrow this gap. Neural scene reconstruction (3D Gaussian Splatting, Neural Radiance Fields) turns a short real capture into a photorealistic model of the geometry and appearance of a scene, and system identification estimates its physical and dynamic parameters (masses, friction, actuation) from a few real interactions. This gives a </w:t>
+        <w:t xml:space="preserve"> built from real data narrow this gap. Neural scene reconstruction (3D Gaussian Splatting, Neural Radiance Fields) turns a short real capture into a photorealistic model of the geometry and appearance of a scene, and system identification estimates its physical parameters (masses, friction, actuation) from a few real interactions. Learned </w:t>
+      </w:r>
+      <w:r>
+        <w:rPr>
+          <w:rFonts w:cstheme="minorHAnsi"/>
+          <w:b/>
+          <w:lang w:val="en-US"/>
+        </w:rPr>
+        <w:t xml:space="preserve">world models</w:t>
+      </w:r>
+      <w:r>
+        <w:rPr>
+          <w:rFonts w:cstheme="minorHAnsi"/>
+          <w:lang w:val="en-US"/>
+        </w:rPr>
+        <w:t xml:space="preserve"> can generate further variations. This gives a </w:t>
       </w:r>
       <w:r>
         <w:rPr>
@@ -4321,7 +4351,7 @@
           <w:rFonts w:cstheme="minorHAnsi"/>
           <w:lang w:val="en-US"/>
         </w:rPr>
-        <w:t xml:space="preserve">: collect real data, build a twin, learn in the twin, check and correct with a little more real data, deploy. Building twins has become routine, with dozens of papers a year and more than ten open-source twin simulators. What remains open is the </w:t>
+        <w:t xml:space="preserve">: collect real data, build a twin, fine-tune in the twin, check and correct with a little more real data, deploy. Building twins, fine-tuning VLAs in simulation and training them in world models are all active research areas. What remains open is the </w:t>
       </w:r>
       <w:r>
         <w:rPr>
@@ -4336,7 +4366,7 @@
           <w:rFonts w:cstheme="minorHAnsi"/>
           <w:lang w:val="en-US"/>
         </w:rPr>
-        <w:t xml:space="preserve"> the loop consumes. Each step spends it: the capture that builds the twin, the real data used to make learning robust to what the twin got wrong, and the real-world trials or interactions used to check and correct the result. Today these amounts are chosen by habit: data is collected uniformly, learning uses generic randomization, and real trials are picked at random or by hand. How much real data a twin actually saves has, to our knowledge, not been measured systematically across tasks.</w:t>
+        <w:t xml:space="preserve"> the whole loop consumes. Each step spends it: the capture that builds the twin, the real data used to make learning robust to what the twin got wrong, and the real-world trials used to check and correct the result. Today these amounts are chosen by habit: data is collected uniformly, learning uses generic randomization, and real trials are picked at random or by hand. How much real data a twin actually saves has, to our knowledge, not been measured systematically across tasks.</w:t>
       </w:r>
     </w:p>
     <w:p>
@@ -4387,37 +4417,22 @@
           <w:rFonts w:cstheme="minorHAnsi"/>
           <w:lang w:val="en-US"/>
         </w:rPr>
-        <w:t xml:space="preserve"> than existing approaches. The method is one pipeline with three components, one per loop step: (C1) task-aware capture of the data that builds the twin, (C2) learning that is robust to the twin's errors, and (C3) active selection of the few real-world data or interactions that correct the twin and the model. Two signals, both computed from data the loop already collects, guide all three: the </w:t>
-      </w:r>
-      <w:r>
-        <w:rPr>
-          <w:rFonts w:cstheme="minorHAnsi"/>
-          <w:b/>
-          <w:lang w:val="en-US"/>
-        </w:rPr>
-        <w:t xml:space="preserve">uncertainty of the twin</w:t>
-      </w:r>
-      <w:r>
-        <w:rPr>
-          <w:rFonts w:cstheme="minorHAnsi"/>
-          <w:lang w:val="en-US"/>
-        </w:rPr>
-        <w:t xml:space="preserve"> (where it is unreliable) and the </w:t>
-      </w:r>
-      <w:r>
-        <w:rPr>
-          <w:rFonts w:cstheme="minorHAnsi"/>
-          <w:b/>
-          <w:lang w:val="en-US"/>
-        </w:rPr>
-        <w:t xml:space="preserve">learned model's own representations</w:t>
-      </w:r>
-      <w:r>
-        <w:rPr>
-          <w:rFonts w:cstheme="minorHAnsi"/>
-          <w:lang w:val="en-US"/>
-        </w:rPr>
-        <w:t xml:space="preserve"> (where twin and real inputs look different to it). The thesis is that the method needs at most a tenth of the real data of learning from real data only, and at least two times less than the strongest existing real-to-sim-to-real pipeline, measured as budget–performance curves in both testbeds.</w:t>
+        <w:t xml:space="preserve"> than existing approaches. A pretrained open VLA is fine-tuned sim-first in the twin. The method has three components, one per loop step: (C1) capture guided by a vision-language model (VLM) to the task-relevant parts of the scene where the twin is most uncertain, (C2) parameter-efficient fine-tuning that is robust to the twin's errors, in the twin and in a world model grounded in it that covers what the twin got wrong, and (C3) active selection of the few real-world data that correct the twin, the world model and the VLA. The </w:t>
+      </w:r>
+      <w:r>
+        <w:rPr>
+          <w:rFonts w:cstheme="minorHAnsi"/>
+          <w:b/>
+          <w:lang w:val="en-US"/>
+        </w:rPr>
+        <w:t xml:space="preserve">uncertainty</w:t>
+      </w:r>
+      <w:r>
+        <w:rPr>
+          <w:rFonts w:cstheme="minorHAnsi"/>
+          <w:lang w:val="en-US"/>
+        </w:rPr>
+        <w:t xml:space="preserve"> of the twin, the world model and the VLA guides all three. The thesis is that the method needs at most a tenth of the real data of fine-tuning the same VLA on real data only, and at least two times less than the strongest existing twin fine-tuning pipeline, in both testbeds.</w:t>
       </w:r>
     </w:p>
     <w:p>
@@ -4438,7 +4453,7 @@
           <w:rFonts w:cstheme="minorHAnsi"/>
           <w:lang w:val="en-US"/>
         </w:rPr>
-        <w:t xml:space="preserve"> The object is a general, task- and domain-agnostic data-efficient learning methodology (active learning, learning under distribution shift, uncertainty estimation), not a particular robot, task, simulator or benchmark, which places it in </w:t>
+        <w:t xml:space="preserve"> The object is a general, task- and domain-agnostic data-efficient learning methodology (active learning, learning under distribution shift, uncertainty estimation, adaptation of foundation models), not a particular robot, task, simulator or benchmark, which places it in </w:t>
       </w:r>
       <w:r>
         <w:rPr>
@@ -4453,7 +4468,7 @@
           <w:rFonts w:cstheme="minorHAnsi"/>
           <w:lang w:val="en-US"/>
         </w:rPr>
-        <w:t xml:space="preserve">. The student uses existing twin pipelines, simulators and public datasets and does not develop new ones. The methods are tested with the same settings on two testbeds of equal status, </w:t>
+        <w:t xml:space="preserve">. The student builds on existing open models, twin pipelines, simulators and public datasets. The method is tested with the same settings on two testbeds of equal status, </w:t>
       </w:r>
       <w:r>
         <w:rPr>
@@ -4483,7 +4498,7 @@
           <w:rFonts w:cstheme="minorHAnsi"/>
           <w:lang w:val="en-US"/>
         </w:rPr>
-        <w:t xml:space="preserve">, where public data make it possible to count real data exactly without an own robot. Trials on a real robot (planned cooperation with a PWr robotics laboratory) validate, but do not decide, the conclusions. The topic fits the Department of Artificial Intelligence (K46), whose research groups include representation learning. The computation runs on the GPU infrastructure available to PWr researchers (WCSS, PLGrid).</w:t>
+        <w:t xml:space="preserve">, where public data make it possible to count real data exactly without an own robot. Trials on a real robot (planned cooperation with a PWr robotics laboratory) validate, but do not decide, the conclusions. The topic fits the Department of Artificial Intelligence (K46), whose research groups include representation learning. Parameter-efficient fine-tuning of open VLAs runs on the GPU infrastructure available to PWr researchers (WCSS, PLGrid).</w:t>
       </w:r>
     </w:p>
     <w:p>
@@ -4504,7 +4519,7 @@
           <w:rFonts w:cstheme="minorHAnsi"/>
           <w:lang w:val="en-US"/>
         </w:rPr>
-        <w:t xml:space="preserve"> faster and cheaper deployment of learned systems in new places, such as robot workcells, warehouses, buildings and inspection sites, with less time spent collecting data and supervising real trials; guidance on how much real data to collect for a twin; and, beyond robotics, any model trained on reconstructed or simulated data and used on real sensor data (industrial digital twins, perception for autonomous systems), where real data must be collected on a budget.</w:t>
+        <w:t xml:space="preserve"> faster and cheaper deployment of robot foundation models in new places, such as robot workcells, warehouses, buildings and inspection sites, with less time spent collecting data and supervising real trials; guidance on how much real data to collect for a twin; and, beyond robotics, any model adapted on reconstructed or simulated data and used on real sensor data.</w:t>
       </w:r>
     </w:p>
     <w:permEnd w:id="1178868985"/>
@@ -4897,22 +4912,21 @@
           <w:rFonts w:cstheme="minorHAnsi"/>
           <w:lang w:val="en-US"/>
         </w:rPr>
-        <w:t xml:space="preserve">) from real data, learns a policy or model in it and transfers it back. Generic simulators such as Habitat [1] train at scale, but not in the target scene. 3D Gaussian Splatting (3DGS) [2] turns a short camera capture into a real-time, photorealistic twin of geometry and appearance, and policies trained in such twins transfer in manipulation (RialTo [3], SplatSim [4]) and in navigation and locomotion (EmbodiedSplat [5], Vid2Sim [6], GaussGym [7]); GPU simulators ship twin environments (ManiSkill3 [8]). The physical side is identified from real data: BayesSim [9] infers a posterior over simulator parameters from real trajectories, and PhysTwin [10] recovers the geometry, physical properties and appearance of deformable objects from sparse videos. Building a twin is no longer the bottleneck; </w:t>
-      </w:r>
-      <w:r>
-        <w:rPr>
-          <w:rFonts w:cstheme="minorHAnsi"/>
-          <w:b/>
-          <w:lang w:val="en-US"/>
-        </w:rPr>
-        <w:t xml:space="preserve">real data</w:t>
-      </w:r>
-      <w:r>
-        <w:rPr>
-          <w:rFonts w:cstheme="minorHAnsi"/>
-          <w:lang w:val="en-US"/>
-        </w:rPr>
-        <w:t xml:space="preserve"> is: the capture that builds the twin and the real-world data or interactions that correct it and the policy. Current systems fix this cost by hand: EmbodiedSplat uses a 20–30-minute phone capture per scene, and RialTo's ablation over 0–15 real demonstrations is the closest published analysis of a real-data budget.</w:t>
+        <w:t xml:space="preserve">) from real data, learns a policy in it and transfers it back. Generic simulators such as Habitat [1] train at scale, but not in the target scene. 3D Gaussian Splatting (3DGS)</w:t>
+      </w:r>
+    </w:p>
+    <w:p>
+      <w:pPr>
+        <w:spacing w:after="0" w:line="240" w:lineRule="auto"/>
+        <w:ind w:left="397" w:hanging="397"/>
+        <w:jc w:val="left"/>
+      </w:pPr>
+      <w:r>
+        <w:rPr>
+          <w:rFonts w:cstheme="minorHAnsi"/>
+          <w:lang w:val="en-US"/>
+        </w:rPr>
+        <w:t xml:space="preserve">[2] turns a short camera capture into a photorealistic twin, and policies trained in such twins transfer</w:t>
       </w:r>
     </w:p>
     <w:p>
@@ -4923,25 +4937,24 @@
       <w:r>
         <w:rPr>
           <w:rFonts w:cstheme="minorHAnsi"/>
-          <w:b/>
-          <w:lang w:val="en-US"/>
-        </w:rPr>
-        <w:t xml:space="preserve">How much real data does transfer need?</w:t>
-      </w:r>
-      <w:r>
-        <w:rPr>
-          <w:rFonts w:cstheme="minorHAnsi"/>
-          <w:lang w:val="en-US"/>
-        </w:rPr>
-        <w:t xml:space="preserve"> Real-only scaling studies relate performance to the number of real demonstrations in manipulation [11]; in navigation, diversity matters more than quantity and more data from a known location saturates quickly [12]. On the twin side, CASHER [13] reports performance that scales super-linearly with human effort, X-Sim [14] matches behaviour cloning with ten times less data-collection time, and sim-and-real co-training raises real success by 38% on average [15]. Lower-fidelity simulation can transfer better [16], so more capture is not automatically better. All of these report results at fixed or hand-chosen budgets in one domain. </w:t>
-      </w:r>
-      <w:r>
-        <w:rPr>
-          <w:rFonts w:cstheme="minorHAnsi"/>
-          <w:b/>
-          <w:lang w:val="en-US"/>
-        </w:rPr>
-        <w:t xml:space="preserve">We found no study that varies the real-data budget of a twin as an experimental variable, or that fits real-data budget curves of the whole loop against real-only learning across domains.</w:t>
+          <w:lang w:val="en-US"/>
+        </w:rPr>
+        <w:t xml:space="preserve">in manipulation (RialTo [3], SplatSim [4]) and navigation (EmbodiedSplat [5]); GPU simulators ship twin environments (ManiSkill3 [6]). Physical parameters are inferred from real trajectories as a posterior (BayesSim [7]). Building a twin is no longer the bottleneck; </w:t>
+      </w:r>
+      <w:r>
+        <w:rPr>
+          <w:rFonts w:cstheme="minorHAnsi"/>
+          <w:b/>
+          <w:lang w:val="en-US"/>
+        </w:rPr>
+        <w:t xml:space="preserve">real data</w:t>
+      </w:r>
+      <w:r>
+        <w:rPr>
+          <w:rFonts w:cstheme="minorHAnsi"/>
+          <w:lang w:val="en-US"/>
+        </w:rPr>
+        <w:t xml:space="preserve"> is: the capture that builds the twin and the real trials that correct it. Current systems fix this cost by hand; RialTo's ablation over 0–15 real demonstrations is the closest published analysis of a real-data budget.</w:t>
       </w:r>
     </w:p>
     <w:p>
@@ -4955,14 +4968,14 @@
           <w:b/>
           <w:lang w:val="en-US"/>
         </w:rPr>
-        <w:t xml:space="preserve">Capturing less: active reconstruction and active identification.</w:t>
-      </w:r>
-      <w:r>
-        <w:rPr>
-          <w:rFonts w:cstheme="minorHAnsi"/>
-          <w:lang w:val="en-US"/>
-        </w:rPr>
-        <w:t xml:space="preserve"> Active view selection chooses the images that improve a reconstruction most: FisherRF [17] maximizes the expected information gain on radiance-field parameters, GenNBV [18] learns a next-best-view policy that generalizes across scenes, and Bayes' Rays [19] estimates a volumetric uncertainty field for a trained neural radiance field. Risk-aware view acquisition [20] weights FisherRF by safety-critical regions during exploration. For physical parameters, ASID [21] uses an initial simulator to design exploration that collects a small amount of informative real data for identifying articulation, mass and other parameters. Their objective is reconstruction quality, safe exploration or parameter accuracy, not the success of a policy trained in the twin; we found at most two task-aware capture papers a year in 2023–2026. Public data allow budgets to be varied offline: ScanNet++ [22] pairs laser scans with DSLR images and a separate phone stream.</w:t>
+        <w:t xml:space="preserve">Pretrained vision-language-action (VLA) policies.</w:t>
+      </w:r>
+      <w:r>
+        <w:rPr>
+          <w:rFonts w:cstheme="minorHAnsi"/>
+          <w:lang w:val="en-US"/>
+        </w:rPr>
+        <w:t xml:space="preserve"> Open VLA models map camera images and an instruction to actions: OpenVLA [8], π0 [9] and, for navigation, NaVILA [10]. They need fine-tuning for a new setup. Low-rank adaptation (LoRA) [11] makes this feasible on a single GPU [8], and the OFT recipe [12] raises success and speed. Fine-tuning still consumes real demonstrations: in navigation, more data from a known location saturates quickly [13], and sim-and-real co-training raises real success by 38% on average [14].</w:t>
       </w:r>
     </w:p>
     <w:p>
@@ -4976,29 +4989,29 @@
           <w:b/>
           <w:lang w:val="en-US"/>
         </w:rPr>
-        <w:t xml:space="preserve">Learning robustly in an imperfect twin.</w:t>
-      </w:r>
-      <w:r>
-        <w:rPr>
-          <w:rFonts w:cstheme="minorHAnsi"/>
-          <w:lang w:val="en-US"/>
-        </w:rPr>
-        <w:t xml:space="preserve"> Domain randomization varies appearance [23] or dynamics [24] uniformly within hand-set ranges, and SimOpt [25] adapts the randomization distribution from a few real rollouts. Domain adaptation aligns sim and real features in co-training [26]. Frozen encoders (DINOv2 [27]) make twin and real samples comparable, and Phys2Real [28] trains with uncertainty over physical parameters. Still, a twin's own </w:t>
-      </w:r>
-      <w:r>
-        <w:rPr>
-          <w:rFonts w:cstheme="minorHAnsi"/>
-          <w:b/>
-          <w:lang w:val="en-US"/>
-        </w:rPr>
-        <w:t xml:space="preserve">reconstruction uncertainty</w:t>
-      </w:r>
-      <w:r>
-        <w:rPr>
-          <w:rFonts w:cstheme="minorHAnsi"/>
-          <w:lang w:val="en-US"/>
-        </w:rPr>
-        <w:t xml:space="preserve"> is rarely used as a training signal, and weighting twin samples by representation distance to a small real set appeared in one paper in 2023–2026.</w:t>
+        <w:t xml:space="preserve">Fine-tuning VLAs in simulation, twins and world models (crowded).</w:t>
+      </w:r>
+      <w:r>
+        <w:rPr>
+          <w:rFonts w:cstheme="minorHAnsi"/>
+          <w:lang w:val="en-US"/>
+        </w:rPr>
+        <w:t xml:space="preserve"> Reinforcement learning (RL) fine-tuning of VLAs in simulation improves on supervised fine-tuning, especially under distribution shift [15, 16]. TwinRL [17] fine-tunes a VLA with RL in a twin reconstructed from a smartphone capture and uses the twin to find failure-prone configurations for targeted real rollouts, reporting 20 minutes of on-robot interaction. Learned </w:t>
+      </w:r>
+      <w:r>
+        <w:rPr>
+          <w:rFonts w:cstheme="minorHAnsi"/>
+          <w:b/>
+          <w:lang w:val="en-US"/>
+        </w:rPr>
+        <w:t xml:space="preserve">world models</w:t>
+      </w:r>
+      <w:r>
+        <w:rPr>
+          <w:rFonts w:cstheme="minorHAnsi"/>
+          <w:lang w:val="en-US"/>
+        </w:rPr>
+        <w:t xml:space="preserve"> serve as the simulator instead: open world foundation models are post-trained per setup (Cosmos [18]; NWM [19] for navigation), VLAs are optimized on-policy inside them without real interaction [20], and VLAW [21] improves a world model with real rollouts and then the VLA with its synthetic data. GigaWorld-0 [22] combines 3DGS reconstruction, system identification and video generation into a data engine for VLAs. Open vision-language models (VLMs) such as Qwen2.5-VL [23] can judge task success [24]. Here they are components and baselines, each reported at a fixed, hand-chosen real-data budget.</w:t>
       </w:r>
     </w:p>
     <w:p>
@@ -5012,14 +5025,14 @@
           <w:b/>
           <w:lang w:val="en-US"/>
         </w:rPr>
-        <w:t xml:space="preserve">Collecting few real data.</w:t>
-      </w:r>
-      <w:r>
-        <w:rPr>
-          <w:rFonts w:cstheme="minorHAnsi"/>
-          <w:lang w:val="en-US"/>
-        </w:rPr>
-        <w:t xml:space="preserve"> Active learning selects the most informative real samples for sim-to-real adaptation in grasping [29], AMF [30] chooses which tasks to demonstrate under a budget, and active experiment selection reduces the cost of real evaluation [31]. Prediction-powered inference [32] combines many cheap predictions with a few labels, SureSim [33] applies it to simulated and real trials, and SIMPLER [34] shows, on paired simulated and real evaluations, that simulation can track real performance of manipulation policies. GaussTwin [35] corrects a 3DGS twin from photometric error. They select demonstrations, tasks or trials, not the real data that should correct a twin and its policy.</w:t>
+        <w:t xml:space="preserve">Capturing less: active reconstruction and identification.</w:t>
+      </w:r>
+      <w:r>
+        <w:rPr>
+          <w:rFonts w:cstheme="minorHAnsi"/>
+          <w:lang w:val="en-US"/>
+        </w:rPr>
+        <w:t xml:space="preserve"> Active view selection chooses the images that improve a reconstruction most: FisherRF [25] maximizes expected information gain on radiance-field parameters, and Bayes' Rays [26] estimates an uncertainty field for a trained radiance field. Risk-aware view acquisition [27] weights FisherRF by safety-critical regions, ASID [28] designs exploration that identifies physical parameters from little real data, and AREA3D [29] adds VLM guidance to active reconstruction. Their objective is reconstruction quality, safe exploration or parameter accuracy, not the success of a policy fine-tuned in the twin; we found at most two task-aware capture papers a year in 2023–2026. ScanNet++ [30] pairs laser scans and DSLR images with a separate phone stream, so budgets can be varied offline.</w:t>
       </w:r>
     </w:p>
     <w:p>
@@ -5033,6 +5046,54 @@
           <w:b/>
           <w:lang w:val="en-US"/>
         </w:rPr>
+        <w:t xml:space="preserve">Learning in an imperfect twin, and collecting few real data.</w:t>
+      </w:r>
+      <w:r>
+        <w:rPr>
+          <w:rFonts w:cstheme="minorHAnsi"/>
+          <w:lang w:val="en-US"/>
+        </w:rPr>
+        <w:t xml:space="preserve"> Domain randomization varies appearance</w:t>
+      </w:r>
+    </w:p>
+    <w:p>
+      <w:pPr>
+        <w:spacing w:after="0" w:line="240" w:lineRule="auto"/>
+        <w:ind w:left="397" w:hanging="397"/>
+        <w:jc w:val="left"/>
+      </w:pPr>
+      <w:r>
+        <w:rPr>
+          <w:rFonts w:cstheme="minorHAnsi"/>
+          <w:lang w:val="en-US"/>
+        </w:rPr>
+        <w:t xml:space="preserve">[31] or dynamics [32] uniformly within hand-set ranges; frozen encoders (DINOv2 [33]) make twin and real</w:t>
+      </w:r>
+    </w:p>
+    <w:p>
+      <w:pPr>
+        <w:spacing w:after="120" w:line="240" w:lineRule="auto"/>
+        <w:jc w:val="both"/>
+      </w:pPr>
+      <w:r>
+        <w:rPr>
+          <w:rFonts w:cstheme="minorHAnsi"/>
+          <w:lang w:val="en-US"/>
+        </w:rPr>
+        <w:t xml:space="preserve">samples comparable. A twin's own reconstruction uncertainty is rarely used as a training signal, and we found no world model aimed at the regions where the twin is uncertain. On the real side, prediction-powered inference [34] combines many cheap predictions with a few labels, and SIMPLER [35] shows on paired simulated and real evaluations that simulation can track the real performance of manipulation policies. TwinRL picks failure-prone configurations for the policy, and VLAW corrects the world model with rollouts that are not selected; neither selects the few real trials by the joint uncertainty of twin, world model and policy under a counted budget.</w:t>
+      </w:r>
+    </w:p>
+    <w:p>
+      <w:pPr>
+        <w:spacing w:after="120" w:line="240" w:lineRule="auto"/>
+        <w:jc w:val="both"/>
+      </w:pPr>
+      <w:r>
+        <w:rPr>
+          <w:rFonts w:cstheme="minorHAnsi"/>
+          <w:b/>
+          <w:lang w:val="en-US"/>
+        </w:rPr>
         <w:t xml:space="preserve">Research gap.</w:t>
       </w:r>
       <w:r>
@@ -5040,7 +5101,7 @@
           <w:rFonts w:cstheme="minorHAnsi"/>
           <w:lang w:val="en-US"/>
         </w:rPr>
-        <w:t xml:space="preserve"> Real-to-sim-to-real works, but its real-data cost is set by hand and spent uniformly, and measured in one domain per study. Missing is one method that allocates it actively at every step: (i) task-aware, uncertainty-guided capture of both appearance and physical parameters, judged by task success, not reconstruction or parameter accuracy (RQ1), (ii) learning driven by the twin's uncertainty and by representation distance to a small real set (RQ2), (iii) active selection of the few real data that correct twin and policy (RQ3), and (iv) evidence that it needs less real data than real-only learning and uniform pipelines, measured the same way in manipulation and navigation (RQ4).</w:t>
+        <w:t xml:space="preserve"> Real-to-sim-to-real fine-tuning of VLAs works, but its real-data cost is set by hand, spent uniformly and measured in one domain per study. Missing is one method that allocates it actively at every step: (i) VLM-guided, task-aware capture of appearance and physical parameters, judged by task success (RQ1); (ii) fine-tuning in the twin and in a world model grounded in the twin, driven by the twin's uncertainty (RQ2); (iii) active selection of the few real data that correct twin, world model and VLA (RQ3); and (iv) evidence that it needs less real data than real-only fine-tuning of the same VLA and the strongest existing twin pipeline, measured the same way in manipulation and navigation (RQ4).</w:t>
       </w:r>
     </w:p>
     <w:p>
@@ -5139,7 +5200,7 @@
           <w:rFonts w:cstheme="minorHAnsi"/>
           <w:lang w:val="en-US"/>
         </w:rPr>
-        <w:t xml:space="preserve">[6] Z. Xie et al., "Vid2Sim," CVPR, 2025.</w:t>
+        <w:t xml:space="preserve">[6] S. Tao et al., "ManiSkill3," RSS, 2025.</w:t>
       </w:r>
     </w:p>
     <w:p>
@@ -5153,7 +5214,7 @@
           <w:rFonts w:cstheme="minorHAnsi"/>
           <w:lang w:val="en-US"/>
         </w:rPr>
-        <w:t xml:space="preserve">[7] A. Escontrela et al., "GaussGym," arXiv:2510.15352, 2025.</w:t>
+        <w:t xml:space="preserve">[7] F. Ramos et al., "BayesSim," RSS, 2019.</w:t>
       </w:r>
     </w:p>
     <w:p>
@@ -5167,7 +5228,7 @@
           <w:rFonts w:cstheme="minorHAnsi"/>
           <w:lang w:val="en-US"/>
         </w:rPr>
-        <w:t xml:space="preserve">[8] S. Tao et al., "ManiSkill3," RSS, 2025.</w:t>
+        <w:t xml:space="preserve">[8] M. J. Kim et al., "OpenVLA," CoRL, 2024.</w:t>
       </w:r>
     </w:p>
     <w:p>
@@ -5181,7 +5242,7 @@
           <w:rFonts w:cstheme="minorHAnsi"/>
           <w:lang w:val="en-US"/>
         </w:rPr>
-        <w:t xml:space="preserve">[9] F. Ramos et al., "BayesSim," RSS, 2019.</w:t>
+        <w:t xml:space="preserve">[9] K. Black et al., "π0," arXiv:2410.24164, 2024.</w:t>
       </w:r>
     </w:p>
     <w:p>
@@ -5195,7 +5256,7 @@
           <w:rFonts w:cstheme="minorHAnsi"/>
           <w:lang w:val="en-US"/>
         </w:rPr>
-        <w:t xml:space="preserve">[10] H. Jiang et al., "PhysTwin," ICCV, 2025.</w:t>
+        <w:t xml:space="preserve">[10] A.-C. Cheng et al., "NaVILA," arXiv:2412.04453, 2024.</w:t>
       </w:r>
     </w:p>
     <w:p>
@@ -5209,7 +5270,7 @@
           <w:rFonts w:cstheme="minorHAnsi"/>
           <w:lang w:val="en-US"/>
         </w:rPr>
-        <w:t xml:space="preserve">[11] F. Lin et al., "Data Scaling Laws in Imitation Learning…," ICLR, 2025.</w:t>
+        <w:t xml:space="preserve">[11] E. J. Hu et al., "LoRA," ICLR, 2022.</w:t>
       </w:r>
     </w:p>
     <w:p>
@@ -5223,7 +5284,7 @@
           <w:rFonts w:cstheme="minorHAnsi"/>
           <w:lang w:val="en-US"/>
         </w:rPr>
-        <w:t xml:space="preserve">[12] L. Suomela et al., "Data Scaling for Navigation…," IEEE RA-L, 2026.</w:t>
+        <w:t xml:space="preserve">[12] M. J. Kim, C. Finn, P. Liang, "Fine-Tuning Vision-Language-Action Models…," RSS, 2025.</w:t>
       </w:r>
     </w:p>
     <w:p>
@@ -5237,7 +5298,7 @@
           <w:rFonts w:cstheme="minorHAnsi"/>
           <w:lang w:val="en-US"/>
         </w:rPr>
-        <w:t xml:space="preserve">[13] M. Torne et al., "Robot Learning with Super-Linear Scaling," arXiv:2412.01770, 2024.</w:t>
+        <w:t xml:space="preserve">[13] L. Suomela et al., "Data Scaling for Navigation…," IEEE RA-L, 2026.</w:t>
       </w:r>
     </w:p>
     <w:p>
@@ -5251,7 +5312,7 @@
           <w:rFonts w:cstheme="minorHAnsi"/>
           <w:lang w:val="en-US"/>
         </w:rPr>
-        <w:t xml:space="preserve">[14] P. Dan et al., "X-Sim," arXiv:2505.07096, 2025.</w:t>
+        <w:t xml:space="preserve">[14] A. Maddukuri et al., "Sim-and-Real Co-Training," RSS, 2025.</w:t>
       </w:r>
     </w:p>
     <w:p>
@@ -5265,7 +5326,7 @@
           <w:rFonts w:cstheme="minorHAnsi"/>
           <w:lang w:val="en-US"/>
         </w:rPr>
-        <w:t xml:space="preserve">[15] A. Maddukuri et al., "Sim-and-Real Co-Training," RSS, 2025.</w:t>
+        <w:t xml:space="preserve">[15] H. Li et al., "SimpleVLA-RL," arXiv:2509.09674, 2025.</w:t>
       </w:r>
     </w:p>
     <w:p>
@@ -5279,7 +5340,7 @@
           <w:rFonts w:cstheme="minorHAnsi"/>
           <w:lang w:val="en-US"/>
         </w:rPr>
-        <w:t xml:space="preserve">[16] J. Truong et al., "Rethinking Sim2Real," CoRL, 2022.</w:t>
+        <w:t xml:space="preserve">[16] J. Liu et al., "What Can RL Bring to VLA Generalization?," NeurIPS, 2025.</w:t>
       </w:r>
     </w:p>
     <w:p>
@@ -5293,7 +5354,7 @@
           <w:rFonts w:cstheme="minorHAnsi"/>
           <w:lang w:val="en-US"/>
         </w:rPr>
-        <w:t xml:space="preserve">[17] W. Jiang et al., "FisherRF," ECCV, 2024.</w:t>
+        <w:t xml:space="preserve">[17] Q. Xu et al., "TwinRL," arXiv:2602.09023, 2026.</w:t>
       </w:r>
     </w:p>
     <w:p>
@@ -5307,7 +5368,7 @@
           <w:rFonts w:cstheme="minorHAnsi"/>
           <w:lang w:val="en-US"/>
         </w:rPr>
-        <w:t xml:space="preserve">[18] X. Chen et al., "GenNBV," CVPR, 2024.</w:t>
+        <w:t xml:space="preserve">[18] N. Agarwal et al., "Cosmos World Foundation Model Platform…," arXiv:2501.03575, 2025.</w:t>
       </w:r>
     </w:p>
     <w:p>
@@ -5321,7 +5382,7 @@
           <w:rFonts w:cstheme="minorHAnsi"/>
           <w:lang w:val="en-US"/>
         </w:rPr>
-        <w:t xml:space="preserve">[19] L. Goli et al., "Bayes' Rays," CVPR, 2024.</w:t>
+        <w:t xml:space="preserve">[19] A. Bar et al., "Navigation World Models," CVPR, 2025.</w:t>
       </w:r>
     </w:p>
     <w:p>
@@ -5335,7 +5396,7 @@
           <w:rFonts w:cstheme="minorHAnsi"/>
           <w:lang w:val="en-US"/>
         </w:rPr>
-        <w:t xml:space="preserve">[20] G. Liu et al., "Risk-Aware Active View Acquisition…," arXiv:2403.11396, 2024.</w:t>
+        <w:t xml:space="preserve">[20] F. Zhu et al., "WMPO," arXiv:2511.09515, 2025.</w:t>
       </w:r>
     </w:p>
     <w:p>
@@ -5349,7 +5410,7 @@
           <w:rFonts w:cstheme="minorHAnsi"/>
           <w:lang w:val="en-US"/>
         </w:rPr>
-        <w:t xml:space="preserve">[21] M. Memmel et al., "ASID," arXiv:2404.12308, 2024.</w:t>
+        <w:t xml:space="preserve">[21] Y. Guo et al., "VLAW," arXiv:2602.12063, 2026.</w:t>
       </w:r>
     </w:p>
     <w:p>
@@ -5363,7 +5424,7 @@
           <w:rFonts w:cstheme="minorHAnsi"/>
           <w:lang w:val="en-US"/>
         </w:rPr>
-        <w:t xml:space="preserve">[22] C. Yeshwanth et al., "ScanNet++," ICCV, 2023.</w:t>
+        <w:t xml:space="preserve">[22] GigaWorld Team, "GigaWorld-0," arXiv:2511.19861, 2025.</w:t>
       </w:r>
     </w:p>
     <w:p>
@@ -5377,7 +5438,7 @@
           <w:rFonts w:cstheme="minorHAnsi"/>
           <w:lang w:val="en-US"/>
         </w:rPr>
-        <w:t xml:space="preserve">[23] J. Tobin et al., "Domain Randomization…," IROS, 2017.</w:t>
+        <w:t xml:space="preserve">[23] S. Bai et al., "Qwen2.5-VL Technical Report," arXiv:2502.13923, 2025.</w:t>
       </w:r>
     </w:p>
     <w:p>
@@ -5391,7 +5452,7 @@
           <w:rFonts w:cstheme="minorHAnsi"/>
           <w:lang w:val="en-US"/>
         </w:rPr>
-        <w:t xml:space="preserve">[24] X. B. Peng et al., "Sim-to-Real Transfer… with Dynamics Randomization," ICRA, 2018.</w:t>
+        <w:t xml:space="preserve">[24] Y. Du et al., "Vision-Language Models as Success Detectors," CoLLAs, 2023.</w:t>
       </w:r>
     </w:p>
     <w:p>
@@ -5405,7 +5466,7 @@
           <w:rFonts w:cstheme="minorHAnsi"/>
           <w:lang w:val="en-US"/>
         </w:rPr>
-        <w:t xml:space="preserve">[25] Y. Chebotar et al., "Closing the Sim-to-Real Loop," ICRA, 2019.</w:t>
+        <w:t xml:space="preserve">[25] W. Jiang et al., "FisherRF," ECCV, 2024.</w:t>
       </w:r>
     </w:p>
     <w:p>
@@ -5419,7 +5480,7 @@
           <w:rFonts w:cstheme="minorHAnsi"/>
           <w:lang w:val="en-US"/>
         </w:rPr>
-        <w:t xml:space="preserve">[26] S. Cheng et al., "Generalizable Domain Adaptation for Sim-and-Real…," NeurIPS, 2025.</w:t>
+        <w:t xml:space="preserve">[26] L. Goli et al., "Bayes' Rays," CVPR, 2024.</w:t>
       </w:r>
     </w:p>
     <w:p>
@@ -5433,7 +5494,7 @@
           <w:rFonts w:cstheme="minorHAnsi"/>
           <w:lang w:val="en-US"/>
         </w:rPr>
-        <w:t xml:space="preserve">[27] M. Oquab et al., "DINOv2," TMLR, 2024.</w:t>
+        <w:t xml:space="preserve">[27] G. Liu et al., "Risk-Aware Active View Acquisition…," arXiv:2403.11396, 2024.</w:t>
       </w:r>
     </w:p>
     <w:p>
@@ -5447,7 +5508,7 @@
           <w:rFonts w:cstheme="minorHAnsi"/>
           <w:lang w:val="en-US"/>
         </w:rPr>
-        <w:t xml:space="preserve">[28] M. Wang et al., "Phys2Real," arXiv:2510.11689, 2025.</w:t>
+        <w:t xml:space="preserve">[28] M. Memmel et al., "ASID," arXiv:2404.12308, 2024.</w:t>
       </w:r>
     </w:p>
     <w:p>
@@ -5461,7 +5522,7 @@
           <w:rFonts w:cstheme="minorHAnsi"/>
           <w:lang w:val="en-US"/>
         </w:rPr>
-        <w:t xml:space="preserve">[29] M. Gilles et al., "MetaMVUC," IEEE RA-L, 2025.</w:t>
+        <w:t xml:space="preserve">[29] T. Xu et al., "AREA3D," arXiv:2512.05131, 2025.</w:t>
       </w:r>
     </w:p>
     <w:p>
@@ -5475,7 +5536,7 @@
           <w:rFonts w:cstheme="minorHAnsi"/>
           <w:lang w:val="en-US"/>
         </w:rPr>
-        <w:t xml:space="preserve">[30] M. Bagatella et al., "Active Fine-Tuning of Multi-Task Policies," ICML, 2025.</w:t>
+        <w:t xml:space="preserve">[30] C. Yeshwanth et al., "ScanNet++," ICCV, 2023.</w:t>
       </w:r>
     </w:p>
     <w:p>
@@ -5489,7 +5550,7 @@
           <w:rFonts w:cstheme="minorHAnsi"/>
           <w:lang w:val="en-US"/>
         </w:rPr>
-        <w:t xml:space="preserve">[31] A. Anwar et al., "Efficient Evaluation of Multi-Task Robot Policies…," arXiv:2502.09829, 2025.</w:t>
+        <w:t xml:space="preserve">[31] J. Tobin et al., "Domain Randomization…," IROS, 2017.</w:t>
       </w:r>
     </w:p>
     <w:p>
@@ -5503,7 +5564,7 @@
           <w:rFonts w:cstheme="minorHAnsi"/>
           <w:lang w:val="en-US"/>
         </w:rPr>
-        <w:t xml:space="preserve">[32] A. N. Angelopoulos et al., "Prediction-Powered Inference," Science, 2023.</w:t>
+        <w:t xml:space="preserve">[32] X. B. Peng et al., "Sim-to-Real Transfer… with Dynamics Randomization," ICRA, 2018.</w:t>
       </w:r>
     </w:p>
     <w:p>
@@ -5517,7 +5578,7 @@
           <w:rFonts w:cstheme="minorHAnsi"/>
           <w:lang w:val="en-US"/>
         </w:rPr>
-        <w:t xml:space="preserve">[33] A. Badithela et al., "Reliable and Scalable Robot Policy Evaluation…," arXiv:2510.04354, 2025.</w:t>
+        <w:t xml:space="preserve">[33] M. Oquab et al., "DINOv2," TMLR, 2024.</w:t>
       </w:r>
     </w:p>
     <w:p>
@@ -5531,7 +5592,7 @@
           <w:rFonts w:cstheme="minorHAnsi"/>
           <w:lang w:val="en-US"/>
         </w:rPr>
-        <w:t xml:space="preserve">[34] X. Li et al., "Evaluating Real-World Robot Manipulation Policies…," CoRL, 2024.</w:t>
+        <w:t xml:space="preserve">[34] A. N. Angelopoulos et al., "Prediction-Powered Inference," Science, 2023.</w:t>
       </w:r>
     </w:p>
     <w:p>
@@ -5545,7 +5606,7 @@
           <w:rFonts w:cstheme="minorHAnsi"/>
           <w:lang w:val="en-US"/>
         </w:rPr>
-        <w:t xml:space="preserve">[35] Y. Cai et al., "GaussTwin," arXiv:2603.05108, 2026.</w:t>
+        <w:t xml:space="preserve">[35] X. Li et al., "Evaluating Real-World Robot Manipulation Policies…," CoRL, 2024.</w:t>
       </w:r>
     </w:p>
     <w:permEnd w:id="174659581"/>
@@ -5817,7 +5878,37 @@
           <w:rFonts w:cstheme="minorHAnsi"/>
           <w:lang w:val="en-US"/>
         </w:rPr>
-        <w:t xml:space="preserve"> than existing approaches. It is one pipeline of three components, one per loop step: (C1) task-aware, uncertainty-guided capture to build the twin; (C2) uncertainty-aware learning of the policy or model in the imperfect twin; (C3) active selection of a few real-world data to correct twin and model. The twin's uncertainty and the model's representations guide all three. The thesis is H4; H1–H3 measure what each component saves at its own step (ablations of the method). Testbeds (equal status): robotic manipulation and visual navigation.</w:t>
+        <w:t xml:space="preserve"> than existing approaches: a pretrained open </w:t>
+      </w:r>
+      <w:r>
+        <w:rPr>
+          <w:rFonts w:cstheme="minorHAnsi"/>
+          <w:b/>
+          <w:lang w:val="en-US"/>
+        </w:rPr>
+        <w:t xml:space="preserve">vision-language-action (VLA) model</w:t>
+      </w:r>
+      <w:r>
+        <w:rPr>
+          <w:rFonts w:cstheme="minorHAnsi"/>
+          <w:lang w:val="en-US"/>
+        </w:rPr>
+        <w:t xml:space="preserve"> fine-tuned sim-first in a digital twin, with one component per loop step: (C1) capture guided by a vision-language model (VLM) to the task-relevant parts of the twin where it is most uncertain; (C2) uncertainty-aware, parameter-efficient fine-tuning in the twin and in a </w:t>
+      </w:r>
+      <w:r>
+        <w:rPr>
+          <w:rFonts w:cstheme="minorHAnsi"/>
+          <w:b/>
+          <w:lang w:val="en-US"/>
+        </w:rPr>
+        <w:t xml:space="preserve">world model grounded in the twin</w:t>
+      </w:r>
+      <w:r>
+        <w:rPr>
+          <w:rFonts w:cstheme="minorHAnsi"/>
+          <w:lang w:val="en-US"/>
+        </w:rPr>
+        <w:t xml:space="preserve"> that covers the twin's uncertain regions; (C3) active selection of a few real data to correct twin, world model and VLA. Thesis = H4; H1–H3 = component ablations. Testbeds (equal status): robotic manipulation and visual navigation.</w:t>
       </w:r>
     </w:p>
     <w:p>
@@ -5853,22 +5944,7 @@
           <w:rFonts w:cstheme="minorHAnsi"/>
           <w:lang w:val="en-US"/>
         </w:rPr>
-        <w:t xml:space="preserve">, and the </w:t>
-      </w:r>
-      <w:r>
-        <w:rPr>
-          <w:rFonts w:cstheme="minorHAnsi"/>
-          <w:i/>
-          <w:lang w:val="en-US"/>
-        </w:rPr>
-        <w:t xml:space="preserve">twin</w:t>
-      </w:r>
-      <w:r>
-        <w:rPr>
-          <w:rFonts w:cstheme="minorHAnsi"/>
-          <w:lang w:val="en-US"/>
-        </w:rPr>
-        <w:t xml:space="preserve"> (neural reconstruction + system identification) is built from a subset of a separate, cheaper capture, sharing no data. Navigation: ≥ 20 public indoor scenes (10 held out), laser-scan and DSLR reference, twin from the phone capture. Manipulation: a physics simulator with held-out physical parameters and its own rendering (the weaker proxy; tier B, published paired sim/real evaluations, checks it). Real data (capture = views and interaction samples for the twin; trials and demonstrations = episodes in the reference) is summed in one operator-time cost. P = task success rate in the reference. Tier A decides H1–H4; tiers B and C (real robot) report agreement. Tests: one-sided, α = 0.05, scene/seed bootstrap, Holm correction, pre-registered.</w:t>
+        <w:t xml:space="preserve">, and the twin (neural reconstruction + system identification) is built from a subset of a separate, cheaper capture, sharing no data. Navigation: ≥ 20 public indoor scenes (10 held out), laser-scan and DSLR reference, twin from the phone capture. Manipulation: a physics simulator with held-out physical parameters and its own rendering (the weaker proxy; tier B, published paired sim/real evaluations of open robot policies, checks it). Real data (capture = views and interaction samples; trials and demonstrations = episodes in the reference) is summed in one operator-time cost. P = task success rate in the reference. Tier A decides H1–H4; tiers B and C (real robot) report agreement. Tests: one-sided, α = 0.05, scene/seed bootstrap, Holm correction, pre-registered.</w:t>
       </w:r>
     </w:p>
     <w:p>
@@ -5889,7 +5965,7 @@
           <w:rFonts w:cstheme="minorHAnsi"/>
           <w:lang w:val="en-US"/>
         </w:rPr>
-        <w:t xml:space="preserve"> How little capture does a twin need? Can the task guide it?</w:t>
+        <w:t xml:space="preserve"> How little capture does a twin need, and can the task guide it?</w:t>
       </w:r>
     </w:p>
     <w:p>
@@ -5910,7 +5986,7 @@
           <w:rFonts w:cstheme="minorHAnsi"/>
           <w:lang w:val="en-US"/>
         </w:rPr>
-        <w:t xml:space="preserve"> C1 (next data where task-relevant parts of the twin are most uncertain) reaches the P of uniform capture with ≥ 40% less capture. </w:t>
+        <w:t xml:space="preserve"> C1 reaches the P of uniform capture with ≥ 40% less capture. </w:t>
       </w:r>
       <w:r>
         <w:rPr>
@@ -5946,7 +6022,7 @@
           <w:rFonts w:cstheme="minorHAnsi"/>
           <w:lang w:val="en-US"/>
         </w:rPr>
-        <w:t xml:space="preserve"> How can learning be robust to the twin's errors?</w:t>
+        <w:t xml:space="preserve"> How can fine-tuning be robust to the twin's errors?</w:t>
       </w:r>
     </w:p>
     <w:p>
@@ -5967,7 +6043,7 @@
           <w:rFonts w:cstheme="minorHAnsi"/>
           <w:lang w:val="en-US"/>
         </w:rPr>
-        <w:t xml:space="preserve"> C2 (augmentation and sample weights from the twin's uncertainty and from the representation distance to a few held-out real samples) improves transfer over uniform domain randomization at an equal capture budget. </w:t>
+        <w:t xml:space="preserve"> At an equal capture budget, (a) C2 (augmentation and sample weights from the twin's uncertainty and the representation distance to a few held-out real samples) beats uniform domain randomization, and (b) twin + world model beats twin only. </w:t>
       </w:r>
       <w:r>
         <w:rPr>
@@ -5982,7 +6058,7 @@
           <w:rFonts w:cstheme="minorHAnsi"/>
           <w:lang w:val="en-US"/>
         </w:rPr>
-        <w:t xml:space="preserve"> mean paired P gain ≥ 10 pp on held-out scenes, lower 95% bound &gt; 0, at each of ≥ 2 capture budgets.</w:t>
+        <w:t xml:space="preserve"> (a) mean paired P gain ≥ 10 pp on held-out scenes, lower 95% bound &gt; 0; (b) lower 95% bound of the paired gain &gt; 0; both at each of ≥ 2 capture budgets.</w:t>
       </w:r>
     </w:p>
     <w:p>
@@ -6003,7 +6079,7 @@
           <w:rFonts w:cstheme="minorHAnsi"/>
           <w:lang w:val="en-US"/>
         </w:rPr>
-        <w:t xml:space="preserve"> Which few real data close the gap, and how should they be used?</w:t>
+        <w:t xml:space="preserve"> Which few real data close the gap?</w:t>
       </w:r>
     </w:p>
     <w:p>
@@ -6024,7 +6100,7 @@
           <w:rFonts w:cstheme="minorHAnsi"/>
           <w:lang w:val="en-US"/>
         </w:rPr>
-        <w:t xml:space="preserve"> C3 (real trials selected by predicted gap or uncertainty, used to correct twin and model) reaches the target P with ≥ 50% fewer trials than random selection. </w:t>
+        <w:t xml:space="preserve"> C3 (trials selected by the gap predicted from twin, world model and VLA uncertainty) reaches the target P with ≥ 50% fewer trials than random selection. </w:t>
       </w:r>
       <w:r>
         <w:rPr>
@@ -6060,7 +6136,7 @@
           <w:rFonts w:cstheme="minorHAnsi"/>
           <w:lang w:val="en-US"/>
         </w:rPr>
-        <w:t xml:space="preserve"> How much real data does the method need versus real-only learning and existing pipelines?</w:t>
+        <w:t xml:space="preserve"> How much real data does the method need versus the alternatives?</w:t>
       </w:r>
     </w:p>
     <w:p>
@@ -6081,7 +6157,7 @@
           <w:rFonts w:cstheme="minorHAnsi"/>
           <w:lang w:val="en-US"/>
         </w:rPr>
-        <w:t xml:space="preserve"> In each testbed, with C1–C3 and their hyperparameters unchanged, the method reaches the target P with (a) ≤ 10% of the real data of real-only learning (imitation of demonstrations in the reference, same encoder and initialization) and (b) ≥ 2× less real data than the strongest existing pipeline (uniform capture, domain randomization, random real-data selection; RialTo-style). </w:t>
+        <w:t xml:space="preserve"> In each testbed, with C1–C3 and their hyperparameters unchanged, the method reaches the target P with (a) ≤ 10% of the real data of fine-tuning the same VLA on real data only and (b) ≥ 2× less real data than the strongest existing twin fine-tuning pipeline for VLAs (uniform capture, domain randomization, RL fine-tuning in the twin, random or failure-driven real trials). </w:t>
       </w:r>
       <w:r>
         <w:rPr>
@@ -6096,7 +6172,7 @@
           <w:rFonts w:cstheme="minorHAnsi"/>
           <w:lang w:val="en-US"/>
         </w:rPr>
-        <w:t xml:space="preserve"> (a) B_M(τ₄) ≤ 0.1 · B_real(τ₄), upper 95% bound of the ratio &lt; 0.2; (b) B_M(τ₅) ≤ 0.5 · B_pipe(τ₅), upper 95% bound &lt; 1; τ₄, τ₅ = P of each comparator at its largest budget; H1–H3 effects keep their sign and tier B agrees in direction. Also reported: a world-model simulator.</w:t>
+        <w:t xml:space="preserve"> (a) B_M(τ₄) ≤ 0.1 · B_real(τ₄), upper 95% bound of the ratio &lt; 0.2; (b) B_M(τ₅) ≤ 0.5 · B_pipe(τ₅), upper 95% bound &lt; 1; τ₄, τ₅ = P of each comparator at its largest budget; H1–H3 effects keep their sign and tier B agrees in direction.</w:t>
       </w:r>
     </w:p>
     <w:p>
@@ -6109,7 +6185,7 @@
           <w:rFonts w:cstheme="minorHAnsi"/>
           <w:lang w:val="en-US"/>
         </w:rPr>
-        <w:t xml:space="preserve">A hypothesis holds when all its parts pass; a failed one is reported as a budget curve.</w:t>
+        <w:t xml:space="preserve">A hypothesis holds when all its parts pass; a failed one is reported as a curve.</w:t>
       </w:r>
     </w:p>
     <w:permEnd w:id="1295260508"/>
@@ -6389,7 +6465,7 @@
           <w:rFonts w:cstheme="minorHAnsi"/>
           <w:lang w:val="en-US"/>
         </w:rPr>
-        <w:t xml:space="preserve">The dissertation is carried out in </w:t>
+        <w:t xml:space="preserve">The dissertation is in </w:t>
       </w:r>
       <w:r>
         <w:rPr>
@@ -6419,7 +6495,7 @@
           <w:rFonts w:cstheme="minorHAnsi"/>
           <w:lang w:val="en-US"/>
         </w:rPr>
-        <w:t xml:space="preserve">), in the area of machine learning. Its object is the </w:t>
+        <w:t xml:space="preserve">), area machine learning. Its object is the task- and domain-agnostic </w:t>
       </w:r>
       <w:r>
         <w:rPr>
@@ -6434,7 +6510,7 @@
           <w:rFonts w:cstheme="minorHAnsi"/>
           <w:lang w:val="en-US"/>
         </w:rPr>
-        <w:t xml:space="preserve"> in general, task- and domain-agnostic: building a digital twin (appearance, geometry and, where relevant, physical parameters) from limited real data, learning a policy or model in it and transferring the result back to reality; it develops a method that makes this loop work with </w:t>
+        <w:t xml:space="preserve">: building a digital twin (appearance, geometry and, where relevant, physical parameters) from limited real data, fine-tuning a policy (here a pretrained VLA) in it and transferring the result back to reality; it develops a method that makes this loop work with </w:t>
       </w:r>
       <w:r>
         <w:rPr>
@@ -6449,7 +6525,7 @@
           <w:rFonts w:cstheme="minorHAnsi"/>
           <w:lang w:val="en-US"/>
         </w:rPr>
-        <w:t xml:space="preserve">. Building twins, simulators or benchmarks, control design and mechanical engineering are not the object of the research; the student uses existing tools and public data.</w:t>
+        <w:t xml:space="preserve">. Building twins, world models, simulators or benchmarks, training foundation models from scratch, control design and mechanical engineering are not the object of the research; the student uses existing tools, open models and public data.</w:t>
       </w:r>
     </w:p>
     <w:p>
@@ -6485,7 +6561,7 @@
           <w:rFonts w:cstheme="minorHAnsi"/>
           <w:lang w:val="en-US"/>
         </w:rPr>
-        <w:t xml:space="preserve">, so that it reaches a given real-world performance with significantly less real data: at most a tenth of the data of learning from real data only and at least two times less than the strongest existing real-to-sim-to-real pipeline (RQ4, H4), with the same components and settings in two domains, robotic manipulation and visual navigation. Its three components are parts of this one method, not separate contributions; each is tested as an ablation at its own step:</w:t>
+        <w:t xml:space="preserve"> when a pretrained open vision-language-action (VLA) model is fine-tuned sim-first in a digital twin and in a world model grounded in it. It targets a given real-world performance with at most a tenth of the real data of real-only fine-tuning of the same VLA and at least two times less than the strongest existing twin fine-tuning pipeline (RQ4, H4), with the same settings in robotic manipulation and visual navigation. Fine-tuning VLAs in simulation and in world models is not new; spending the loop's real data where it matters is. The three components are parts of this one method, each tested as an ablation at its own step:</w:t>
       </w:r>
     </w:p>
     <w:p>
@@ -6514,7 +6590,7 @@
           <w:rFonts w:cstheme="minorHAnsi"/>
           <w:lang w:val="en-US"/>
         </w:rPr>
-        <w:t xml:space="preserve"> Task-aware capture that chooses which real data to collect for a twin (views for its appearance and geometry, interactions for its physical parameters) from the twin's uncertainty in the parts that matter for the task, not reconstruction quality alone; compared with uniform and task-blind selection.</w:t>
+        <w:t xml:space="preserve"> A vision-language model picks the task-relevant objects and regions from the instruction and scene, and capture (views for appearance and geometry, interactions for physical parameters) goes where the twin is most uncertain in them; compared with uniform and task-blind selection.</w:t>
       </w:r>
     </w:p>
     <w:p>
@@ -6543,7 +6619,7 @@
           <w:rFonts w:cstheme="minorHAnsi"/>
           <w:lang w:val="en-US"/>
         </w:rPr>
-        <w:t xml:space="preserve"> Uncertainty-aware training that turns the twin's per-region and per-parameter uncertainty and the representation distance to a few real samples into augmentation and sample weights; compared with uniform domain randomization at an equal capture budget.</w:t>
+        <w:t xml:space="preserve"> Parameter-efficient reinforcement and imitation fine-tuning with augmentation and sample weights from the twin's uncertainty and the representation distance to a few real samples, and a twin-grounded world model covering the twin's uncertain regions; compared with uniform domain randomization and with the twin alone.</w:t>
       </w:r>
     </w:p>
     <w:p>
@@ -6572,7 +6648,7 @@
           <w:rFonts w:cstheme="minorHAnsi"/>
           <w:lang w:val="en-US"/>
         </w:rPr>
-        <w:t xml:space="preserve"> Active selection of real-world trials or interactions by the predicted twin-to-real gap and its uncertainty, used to correct both the twin and the learned model; compared with random selection.</w:t>
+        <w:t xml:space="preserve"> Active selection of real-world trials by the twin-to-real gap predicted from the uncertainty of twin, world model and VLA, used to correct all three; compared with random selection.</w:t>
       </w:r>
     </w:p>
     <w:p>
@@ -6593,7 +6669,7 @@
           <w:rFonts w:cstheme="minorHAnsi"/>
           <w:lang w:val="en-US"/>
         </w:rPr>
-        <w:t xml:space="preserve"> (supporting the method, not contributions in their own right). Budget–performance curves of the method against real-only learning and the existing pipeline, which give the "exchange rate" between twin and real data and tell practitioners roughly how much real data to collect for a new task or site; a proxy-reality protocol on public data that counts real data exactly without a robot (a reference from a separate, higher-fidelity source as "reality", a low-budget twin from a separate capture as the simulator), applied in each domain; and open-source code of the method, built on existing twin pipelines and simulators.</w:t>
+        <w:t xml:space="preserve"> (supporting the method, not contributions in their own right). Budget–performance curves of the method against real-only fine-tuning and the existing pipeline, which give the "exchange rate" between twin and real data; a proxy-reality protocol on public data that counts real data exactly without a robot (a separate, higher-fidelity reference as "reality"), applied in each domain; and open-source code of the method, built on existing open models, twin pipelines and simulators.</w:t>
       </w:r>
     </w:p>
     <w:p>
@@ -6614,7 +6690,7 @@
           <w:rFonts w:cstheme="minorHAnsi"/>
           <w:lang w:val="en-US"/>
         </w:rPr>
-        <w:t xml:space="preserve"> Real target-domain data is the main cost of deploying learned systems. Methods that decide where it is worth spending, and a measured estimate of how much of it a twin can replace, are relevant to active learning, learning under distribution shift and uncertainty estimation in general, beyond robotics.</w:t>
+        <w:t xml:space="preserve"> Real target-domain data is the main cost of deploying learned systems; methods that decide where it is worth spending, and a measured estimate of how much of it a twin can replace, are relevant to active learning, learning under distribution shift, uncertainty estimation and adaptation of foundation models in general, beyond robotics.</w:t>
       </w:r>
     </w:p>
     <w:p>
@@ -6635,7 +6711,7 @@
           <w:rFonts w:cstheme="minorHAnsi"/>
           <w:lang w:val="en-US"/>
         </w:rPr>
-        <w:t xml:space="preserve"> Results are planned for peer-reviewed conferences worth 200 points and assigned to ITiT on the ministerial list of 5.01.2024: NeurIPS, ICML and ICLR (machine learning) and CVPR (computer vision), with ICCV and ECCV for resubmissions. P1 (C1 and first C2 results, RQ1–RQ2) targets NeurIPS 2027; P2 (C3, RQ3) ICML 2028 or CVPR 2028; P3 (the whole method against real-only learning and the existing pipeline in both domains, RQ4) NeurIPS 2028, with ICLR 2029 as the fallback.</w:t>
+        <w:t xml:space="preserve"> Results are planned for peer-reviewed conferences worth 200 points and assigned to ITiT on the ministerial list of 5.01.2024: NeurIPS, ICML and ICLR (machine learning) and CVPR (computer vision), with ICCV and ECCV for resubmissions. P1 (C1 and first C2 results, RQ1–RQ2) targets NeurIPS 2027; P2 (C3, RQ3) ICML 2028 or CVPR 2028; P3 (the whole method against real-only fine-tuning and the existing pipeline in both domains, RQ4) NeurIPS 2028, with ICLR 2029 as the fallback.</w:t>
       </w:r>
     </w:p>
     <w:permEnd w:id="1098318749"/>
@@ -6929,7 +7005,7 @@
           <w:rFonts w:cstheme="minorHAnsi"/>
           <w:lang w:val="en-US"/>
         </w:rPr>
-        <w:t xml:space="preserve"> for the loop: real data → twin → learning in the twin → a few real trials → correction of the twin and the policy → deployment. Its three components, one per step, are developed and tested as ablations in Stages I–III (§3, §7): C1 task-aware capture (RQ1), C2 uncertainty-aware learning in an imperfect twin (RQ2) and C3 active selection of few real data (RQ3); Stage IV tests the whole method (RQ4, the thesis H4). The components are domain-agnostic: they act on the twin's uncertainty, on task relevance measured in the twin and on learned representations. The twin has two parts: geometry and appearance, reconstructed with existing open-source 3D Gaussian Splatting (3DGS) [2] pipelines, and physical or dynamic parameters, identified from real interactions as a posterior (BayesSim-type [9]). No simulator or benchmark is developed. Robotic manipulation and visual navigation are equal testbeds with the same protocol.</w:t>
+        <w:t xml:space="preserve"> for the loop: real data → twin → sim-first fine-tuning of a pretrained VLA in the twin and in a world model grounded in it → a few real trials → correction of twin, world model and VLA → deployment. Stages I–III develop and ablate its components C1–C3 (RQ1–RQ3), and Stage IV tests the whole method (RQ4, the thesis H4). The twin has two parts: geometry and appearance from existing open-source 3D Gaussian Splatting (3DGS) [2] pipelines, and physical parameters identified from real interactions as a posterior (BayesSim-type [7]). No simulator, benchmark, VLA or world model is trained from scratch.</w:t>
       </w:r>
     </w:p>
     <w:p>
@@ -6943,89 +7019,66 @@
           <w:b/>
           <w:lang w:val="en-US"/>
         </w:rPr>
-        <w:t xml:space="preserve">Tier A protocol: proxy reality (decides the hypotheses).</w:t>
-      </w:r>
-      <w:r>
-        <w:rPr>
-          <w:rFonts w:cstheme="minorHAnsi"/>
-          <w:lang w:val="en-US"/>
-        </w:rPr>
-        <w:t xml:space="preserve"> In each testbed, "reality" is a reference from a separate, higher-fidelity source, and the twin is built from a subset of a separate, cheaper capture, sharing no data. </w:t>
-      </w:r>
-      <w:r>
-        <w:rPr>
-          <w:rFonts w:cstheme="minorHAnsi"/>
-          <w:i/>
-          <w:lang w:val="en-US"/>
-        </w:rPr>
-        <w:t xml:space="preserve">Navigation:</w:t>
-      </w:r>
-      <w:r>
-        <w:rPr>
-          <w:rFonts w:cstheme="minorHAnsi"/>
-          <w:lang w:val="en-US"/>
-        </w:rPr>
-        <w:t xml:space="preserve"> ScanNet++ [22] gives each scene a laser scan, DSLR images and a separate phone RGB-D stream. On ≥ 20 scenes (10 held out from all tuning), the reference is the laser-scan mesh textured from the DSLR images and rendered in Habitat [1] with a robot-camera model; the twin is 3DGS from a subset of the phone stream, run as a mesh (as in EmbodiedSplat [5]) or with a 3DGS renderer (GaussGym [7]); its physical part is the robot's actuation noise. Tasks: image-goal and point-goal navigation with a minimum geodesic distance set in a pilot so that P stays below its ceiling. </w:t>
-      </w:r>
-      <w:r>
-        <w:rPr>
-          <w:rFonts w:cstheme="minorHAnsi"/>
-          <w:i/>
-          <w:lang w:val="en-US"/>
-        </w:rPr>
-        <w:t xml:space="preserve">Manipulation:</w:t>
-      </w:r>
-      <w:r>
-        <w:rPr>
-          <w:rFonts w:cstheme="minorHAnsi"/>
-          <w:lang w:val="en-US"/>
-        </w:rPr>
-        <w:t xml:space="preserve"> ManiSkill3 [8] tasks (≥ 20 task–object configurations, 10 held out), where reality is the simulator with held-out ground-truth physical parameters (mass, friction, articulation) and its own rendering, and the twin is 3DGS from a subset of its views plus parameters identified from a few recorded interactions. Physics engine and object models are shared, so this is the weaker proxy (unmodelled dynamics are not tested); tier B checks it. </w:t>
-      </w:r>
-      <w:r>
-        <w:rPr>
-          <w:rFonts w:cstheme="minorHAnsi"/>
-          <w:i/>
-          <w:lang w:val="en-US"/>
-        </w:rPr>
-        <w:t xml:space="preserve">Both:</w:t>
-      </w:r>
-      <w:r>
-        <w:rPr>
-          <w:rFonts w:cstheme="minorHAnsi"/>
-          <w:lang w:val="en-US"/>
-        </w:rPr>
-        <w:t xml:space="preserve"> real data is counted exactly: capture = views and interaction samples given to the twin, real trials and demonstrations = episodes in the reference, summed in one operator-time cost at a pre-registered rate; the largest budget stays below the full capture. In navigation the proxy's error to held-out real images is reported (PSNR, LPIPS, depth) and each hypothesis is re-checked for sign with a second reference (3DGS from all DSLR images). </w:t>
-      </w:r>
-      <w:r>
-        <w:rPr>
-          <w:rFonts w:cstheme="minorHAnsi"/>
-          <w:i/>
-          <w:lang w:val="en-US"/>
-        </w:rPr>
-        <w:t xml:space="preserve">Tier B:</w:t>
-      </w:r>
-      <w:r>
-        <w:rPr>
-          <w:rFonts w:cstheme="minorHAnsi"/>
-          <w:lang w:val="en-US"/>
-        </w:rPr>
-        <w:t xml:space="preserve"> the twin must rank manipulation policies as published paired sim/real evaluations do (SIMPLER [34]). </w:t>
-      </w:r>
-      <w:r>
-        <w:rPr>
-          <w:rFonts w:cstheme="minorHAnsi"/>
-          <w:i/>
-          <w:lang w:val="en-US"/>
-        </w:rPr>
-        <w:t xml:space="preserve">Compute:</w:t>
-      </w:r>
-      <w:r>
-        <w:rPr>
-          <w:rFonts w:cstheme="minorHAnsi"/>
-          <w:lang w:val="en-US"/>
-        </w:rPr>
-        <w:t xml:space="preserve"> WCSS Lem (NVIDIA H100), PLGrid (to be applied for). Policies are small heads on frozen visual encoders, trained mainly by imitation of a privileged expert in the twin (shortest-path planner; motion-planning expert), with reinforcement learning on a subset. P = task success rate.</w:t>
+        <w:t xml:space="preserve">Models (open weights, adapted).</w:t>
+      </w:r>
+      <w:r>
+        <w:rPr>
+          <w:rFonts w:cstheme="minorHAnsi"/>
+          <w:lang w:val="en-US"/>
+        </w:rPr>
+        <w:t xml:space="preserve"> </w:t>
+      </w:r>
+      <w:r>
+        <w:rPr>
+          <w:rFonts w:cstheme="minorHAnsi"/>
+          <w:i/>
+          <w:lang w:val="en-US"/>
+        </w:rPr>
+        <w:t xml:space="preserve">VLA:</w:t>
+      </w:r>
+      <w:r>
+        <w:rPr>
+          <w:rFonts w:cstheme="minorHAnsi"/>
+          <w:lang w:val="en-US"/>
+        </w:rPr>
+        <w:t xml:space="preserve"> OpenVLA-OFT [8, 12] for manipulation, with π0 [9] (openpi) as a second backbone, and NaVILA [10] for navigation, whose mid-level actions ("move forward 75 cm") map onto Habitat actions. All VLA fine-tuning is parameter-efficient: LoRA [11] adapters, supervised fine-tuning (SFT) and then PPO, which generalizes best for VLAs [16], with open RL tooling [15]. </w:t>
+      </w:r>
+      <w:r>
+        <w:rPr>
+          <w:rFonts w:cstheme="minorHAnsi"/>
+          <w:i/>
+          <w:lang w:val="en-US"/>
+        </w:rPr>
+        <w:t xml:space="preserve">VLM:</w:t>
+      </w:r>
+      <w:r>
+        <w:rPr>
+          <w:rFonts w:cstheme="minorHAnsi"/>
+          <w:lang w:val="en-US"/>
+        </w:rPr>
+        <w:t xml:space="preserve"> Qwen2.5-VL-7B [23], zero-shot, grounds the instruction to task-relevant objects and regions (C1) and judges success</w:t>
+      </w:r>
+    </w:p>
+    <w:p>
+      <w:pPr>
+        <w:spacing w:after="0" w:line="240" w:lineRule="auto"/>
+        <w:ind w:left="397" w:hanging="397"/>
+        <w:jc w:val="left"/>
+      </w:pPr>
+      <w:r>
+        <w:rPr>
+          <w:rFonts w:cstheme="minorHAnsi"/>
+          <w:lang w:val="en-US"/>
+        </w:rPr>
+        <w:t xml:space="preserve">[24] where the simulator gives no ground truth (checked against it where it does). </w:t>
+      </w:r>
+      <w:r>
+        <w:rPr>
+          <w:rFonts w:cstheme="minorHAnsi"/>
+          <w:i/>
+          <w:lang w:val="en-US"/>
+        </w:rPr>
+        <w:t xml:space="preserve">World model:</w:t>
       </w:r>
     </w:p>
     <w:p>
@@ -7036,10 +7089,119 @@
       <w:r>
         <w:rPr>
           <w:rFonts w:cstheme="minorHAnsi"/>
-          <w:b/>
-          <w:lang w:val="en-US"/>
-        </w:rPr>
-        <w:t xml:space="preserve">Stage I – C1, task-aware capture (RQ1, H1; sem. 3–4).</w:t>
+          <w:lang w:val="en-US"/>
+        </w:rPr>
+        <w:t xml:space="preserve">Cosmos-Predict2 [18] (manipulation) and NWM [19] (navigation) checkpoints, post-trained on twin rollouts. </w:t>
+      </w:r>
+      <w:r>
+        <w:rPr>
+          <w:rFonts w:cstheme="minorHAnsi"/>
+          <w:i/>
+          <w:lang w:val="en-US"/>
+        </w:rPr>
+        <w:t xml:space="preserve">Compute:</w:t>
+      </w:r>
+      <w:r>
+        <w:rPr>
+          <w:rFonts w:cstheme="minorHAnsi"/>
+          <w:lang w:val="en-US"/>
+        </w:rPr>
+        <w:t xml:space="preserve"> published needs are ≥ ~27 GB of GPU memory for OpenVLA LoRA, &gt; 22.5 GB for π0 LoRA, and one 8-GPU node for RL of a VLA in simulation [15]. We estimate ~23k H100-hours for sem. 3–7 (~5 H100 on average): WCSS Lem and a PLGrid grant, applied for in T3.1; small VLAs are used for development.</w:t>
+      </w:r>
+    </w:p>
+    <w:p>
+      <w:pPr>
+        <w:spacing w:after="120" w:line="240" w:lineRule="auto"/>
+        <w:jc w:val="both"/>
+      </w:pPr>
+      <w:r>
+        <w:rPr>
+          <w:rFonts w:cstheme="minorHAnsi"/>
+          <w:b/>
+          <w:lang w:val="en-US"/>
+        </w:rPr>
+        <w:t xml:space="preserve">Tier A protocol: proxy reality (decides the hypotheses).</w:t>
+      </w:r>
+      <w:r>
+        <w:rPr>
+          <w:rFonts w:cstheme="minorHAnsi"/>
+          <w:lang w:val="en-US"/>
+        </w:rPr>
+        <w:t xml:space="preserve"> In each testbed "reality" is a reference from a separate, higher-fidelity source, and the twin is built from a subset of a separate, cheaper capture. </w:t>
+      </w:r>
+      <w:r>
+        <w:rPr>
+          <w:rFonts w:cstheme="minorHAnsi"/>
+          <w:i/>
+          <w:lang w:val="en-US"/>
+        </w:rPr>
+        <w:t xml:space="preserve">Navigation:</w:t>
+      </w:r>
+      <w:r>
+        <w:rPr>
+          <w:rFonts w:cstheme="minorHAnsi"/>
+          <w:lang w:val="en-US"/>
+        </w:rPr>
+        <w:t xml:space="preserve"> on ≥ 20 ScanNet++ [30] scenes (10 held out from all tuning), the reference is the laser-scan mesh textured from the DSLR images and rendered in Habitat [1] with a robot-camera model; the twin is 3DGS from a subset of the phone stream, run as a mesh (as in EmbodiedSplat [5]) or with a 3DGS renderer; its physical part is actuation noise. Tasks: instruction and image-goal navigation with a minimum geodesic distance set in a pilot so that P stays below its ceiling. </w:t>
+      </w:r>
+      <w:r>
+        <w:rPr>
+          <w:rFonts w:cstheme="minorHAnsi"/>
+          <w:i/>
+          <w:lang w:val="en-US"/>
+        </w:rPr>
+        <w:t xml:space="preserve">Manipulation:</w:t>
+      </w:r>
+      <w:r>
+        <w:rPr>
+          <w:rFonts w:cstheme="minorHAnsi"/>
+          <w:lang w:val="en-US"/>
+        </w:rPr>
+        <w:t xml:space="preserve"> ManiSkill3 [6] tasks (≥ 20 task–object configurations, 10 held out); reality is the simulator with held-out physical parameters and its own rendering; the twin is 3DGS from a subset of its views plus parameters identified from a few recorded interactions. Physics is shared, so this is the weaker proxy. </w:t>
+      </w:r>
+      <w:r>
+        <w:rPr>
+          <w:rFonts w:cstheme="minorHAnsi"/>
+          <w:i/>
+          <w:lang w:val="en-US"/>
+        </w:rPr>
+        <w:t xml:space="preserve">Both:</w:t>
+      </w:r>
+      <w:r>
+        <w:rPr>
+          <w:rFonts w:cstheme="minorHAnsi"/>
+          <w:lang w:val="en-US"/>
+        </w:rPr>
+        <w:t xml:space="preserve"> capture = views and interaction samples; trials and demonstrations = episodes in the reference; all summed in one operator-time cost; the largest budget stays below the full capture. In navigation the proxy's error to held-out real images is reported, and each hypothesis is re-checked for sign with a second reference (3DGS from all DSLR images). </w:t>
+      </w:r>
+      <w:r>
+        <w:rPr>
+          <w:rFonts w:cstheme="minorHAnsi"/>
+          <w:i/>
+          <w:lang w:val="en-US"/>
+        </w:rPr>
+        <w:t xml:space="preserve">Tier B:</w:t>
+      </w:r>
+      <w:r>
+        <w:rPr>
+          <w:rFonts w:cstheme="minorHAnsi"/>
+          <w:lang w:val="en-US"/>
+        </w:rPr>
+        <w:t xml:space="preserve"> SIMPLER [35] paired sim/real evaluations of published policies; the twin must reproduce their direction. P = task success rate.</w:t>
+      </w:r>
+    </w:p>
+    <w:p>
+      <w:pPr>
+        <w:spacing w:after="120" w:line="240" w:lineRule="auto"/>
+        <w:jc w:val="both"/>
+      </w:pPr>
+      <w:r>
+        <w:rPr>
+          <w:rFonts w:cstheme="minorHAnsi"/>
+          <w:b/>
+          <w:lang w:val="en-US"/>
+        </w:rPr>
+        <w:t xml:space="preserve">Stage I – C1, VLM-guided task-aware capture (RQ1, H1; sem. 3–4).</w:t>
       </w:r>
     </w:p>
     <w:p>
@@ -7068,22 +7230,7 @@
           <w:rFonts w:cstheme="minorHAnsi"/>
           <w:lang w:val="en-US"/>
         </w:rPr>
-        <w:t xml:space="preserve"> the twin's uncertainty, per region (Fisher information [17] or a Bayes' Rays-type [19] field, adapted to 3DGS) and per physical parameter (posterior spread), is weighted by </w:t>
-      </w:r>
-      <w:r>
-        <w:rPr>
-          <w:rFonts w:cstheme="minorHAnsi"/>
-          <w:b/>
-          <w:lang w:val="en-US"/>
-        </w:rPr>
-        <w:t xml:space="preserve">task relevance</w:t>
-      </w:r>
-      <w:r>
-        <w:rPr>
-          <w:rFonts w:cstheme="minorHAnsi"/>
-          <w:lang w:val="en-US"/>
-        </w:rPr>
-        <w:t xml:space="preserve"> measured in the current twin without training: how often expert trajectories pass through a region, and how much the expert's success changes across a parameter's posterior. The next views or interactions are chosen greedily where task-weighted uncertainty is highest until the budget is spent. Candidates come from the recorded pool; capture time is also estimated as a tour of the chosen views.</w:t>
+        <w:t xml:space="preserve"> the twin's uncertainty, per region (Fisher information [25] or a Bayes' Rays-type [26] field adapted to 3DGS) and per physical parameter (posterior spread), is weighted by task relevance: the VLM's grounding of the instruction, how often expert trajectories pass through a region, and how much expert success changes across a parameter's posterior. The next views or interactions are chosen greedily where task-weighted uncertainty is highest, from the recorded pool (capture time estimated as a tour).</w:t>
       </w:r>
     </w:p>
     <w:p>
@@ -7112,7 +7259,7 @@
           <w:rFonts w:cstheme="minorHAnsi"/>
           <w:lang w:val="en-US"/>
         </w:rPr>
-        <w:t xml:space="preserve"> uniform capture, task-blind uncertainty selection (FisherRF-type next-best-view [17]; ASID-type exploration for parameter accuracy [21]) and risk-weighted view selection [20], at the same budget.</w:t>
+        <w:t xml:space="preserve"> uniform capture; task-blind uncertainty selection (FisherRF-type [25], ASID-type [28]); risk-weighted [27] and VLM-guided reconstruction-quality selection (AREA3D-type [29]); same budget.</w:t>
       </w:r>
     </w:p>
     <w:p>
@@ -7134,14 +7281,28 @@
           <w:i/>
           <w:lang w:val="en-US"/>
         </w:rPr>
-        <w:t xml:space="preserve">Metric:</w:t>
-      </w:r>
-      <w:r>
-        <w:rPr>
-          <w:rFonts w:cstheme="minorHAnsi"/>
-          <w:lang w:val="en-US"/>
-        </w:rPr>
-        <w:t xml:space="preserve"> budget–P curves on tier A with ≥ 4 capture budgets per testbed; capture needed to reach the P that uniform capture reaches at the largest budget.</w:t>
+        <w:t xml:space="preserve">Metric and criterion (H1):</w:t>
+      </w:r>
+      <w:r>
+        <w:rPr>
+          <w:rFonts w:cstheme="minorHAnsi"/>
+          <w:lang w:val="en-US"/>
+        </w:rPr>
+        <w:t xml:space="preserve"> budget–P curves (≥ 4 budgets per testbed; the VLA LoRA-SFT-tuned in each twin); ≥ 40% less capture than uniform at equal P, and the upper 95% bound of C_task / C_recon &lt; 1 (§7).</w:t>
+      </w:r>
+    </w:p>
+    <w:p>
+      <w:pPr>
+        <w:spacing w:after="120" w:line="240" w:lineRule="auto"/>
+        <w:jc w:val="both"/>
+      </w:pPr>
+      <w:r>
+        <w:rPr>
+          <w:rFonts w:cstheme="minorHAnsi"/>
+          <w:b/>
+          <w:lang w:val="en-US"/>
+        </w:rPr>
+        <w:t xml:space="preserve">Stage II – C2, uncertainty-aware fine-tuning in the twin and a twin-grounded world model (RQ2, H2; sem. 4).</w:t>
       </w:r>
     </w:p>
     <w:p>
@@ -7163,28 +7324,14 @@
           <w:i/>
           <w:lang w:val="en-US"/>
         </w:rPr>
-        <w:t xml:space="preserve">Success criterion (H1):</w:t>
-      </w:r>
-      <w:r>
-        <w:rPr>
-          <w:rFonts w:cstheme="minorHAnsi"/>
-          <w:lang w:val="en-US"/>
-        </w:rPr>
-        <w:t xml:space="preserve"> ≥ 40% less capture than uniform at equal P, and less than task-blind selection (upper 95% bound of the ratio &lt; 1), as in §7.</w:t>
-      </w:r>
-    </w:p>
-    <w:p>
-      <w:pPr>
-        <w:spacing w:after="120" w:line="240" w:lineRule="auto"/>
-        <w:jc w:val="both"/>
-      </w:pPr>
-      <w:r>
-        <w:rPr>
-          <w:rFonts w:cstheme="minorHAnsi"/>
-          <w:b/>
-          <w:lang w:val="en-US"/>
-        </w:rPr>
-        <w:t xml:space="preserve">Stage II – C2, uncertainty-aware learning in an imperfect twin (RQ2, H2; sem. 4).</w:t>
+        <w:t xml:space="preserve">Method:</w:t>
+      </w:r>
+      <w:r>
+        <w:rPr>
+          <w:rFonts w:cstheme="minorHAnsi"/>
+          <w:lang w:val="en-US"/>
+        </w:rPr>
+        <w:t xml:space="preserve"> the VLA is LoRA-fine-tuned by SFT on expert (planner) demonstrations in the twin and then by RL. (a) Randomization strength follows the twin's uncertainty (per-region appearance and geometry, physical parameters from their posterior), and twin samples far from a few real samples in DINOv2 [33] space are down-weighted; the real samples are a held-out slice of the capture and count towards the budget. (b) The world model, post-trained on twin rollouts, generates extra rollouts from states in the twin's most uncertain regions for on-policy RL [20], weighted by that uncertainty.</w:t>
       </w:r>
     </w:p>
     <w:p>
@@ -7206,14 +7353,14 @@
           <w:i/>
           <w:lang w:val="en-US"/>
         </w:rPr>
-        <w:t xml:space="preserve">Method:</w:t>
-      </w:r>
-      <w:r>
-        <w:rPr>
-          <w:rFonts w:cstheme="minorHAnsi"/>
-          <w:lang w:val="en-US"/>
-        </w:rPr>
-        <w:t xml:space="preserve"> (a) randomization whose strength follows the twin's uncertainty: appearance and geometry perturbations per region, and physical parameters sampled from their identified posterior instead of hand-set ranges; (b) down-weighting twin samples that lie far from a few real samples in frozen DINOv2 [27] feature space. The real samples are a held-out slice of the capture, not used to fit the twin, and count towards the budget.</w:t>
+        <w:t xml:space="preserve">Baselines:</w:t>
+      </w:r>
+      <w:r>
+        <w:rPr>
+          <w:rFonts w:cstheme="minorHAnsi"/>
+          <w:lang w:val="en-US"/>
+        </w:rPr>
+        <w:t xml:space="preserve"> (a) uniform randomization of appearance [31] and dynamics [32], and none; (b) twin only (same C2 without the world model) and world model only; same capture budget.</w:t>
       </w:r>
     </w:p>
     <w:p>
@@ -7235,14 +7382,28 @@
           <w:i/>
           <w:lang w:val="en-US"/>
         </w:rPr>
-        <w:t xml:space="preserve">Baselines:</w:t>
-      </w:r>
-      <w:r>
-        <w:rPr>
-          <w:rFonts w:cstheme="minorHAnsi"/>
-          <w:lang w:val="en-US"/>
-        </w:rPr>
-        <w:t xml:space="preserve"> uniform domain randomization of appearance [23] and dynamics [24] (tuned ranges), no randomization, and feature alignment [26] as a comparator; same capture budget.</w:t>
+        <w:t xml:space="preserve">Criterion (H2):</w:t>
+      </w:r>
+      <w:r>
+        <w:rPr>
+          <w:rFonts w:cstheme="minorHAnsi"/>
+          <w:lang w:val="en-US"/>
+        </w:rPr>
+        <w:t xml:space="preserve"> (a) mean paired P gain over uniform randomization ≥ 10 pp on held-out scenes, lower 95% bound &gt; 0; (b) lower 95% bound of the paired gain of twin + world model over twin only &gt; 0; both at each of ≥ 2 capture budgets.</w:t>
+      </w:r>
+    </w:p>
+    <w:p>
+      <w:pPr>
+        <w:spacing w:after="120" w:line="240" w:lineRule="auto"/>
+        <w:jc w:val="both"/>
+      </w:pPr>
+      <w:r>
+        <w:rPr>
+          <w:rFonts w:cstheme="minorHAnsi"/>
+          <w:b/>
+          <w:lang w:val="en-US"/>
+        </w:rPr>
+        <w:t xml:space="preserve">Stage III – C3, few real trials and correction (RQ3, H3; end of sem. 4 – sem. 5).</w:t>
       </w:r>
     </w:p>
     <w:p>
@@ -7264,28 +7425,14 @@
           <w:i/>
           <w:lang w:val="en-US"/>
         </w:rPr>
-        <w:t xml:space="preserve">Metric and criterion (H2):</w:t>
-      </w:r>
-      <w:r>
-        <w:rPr>
-          <w:rFonts w:cstheme="minorHAnsi"/>
-          <w:lang w:val="en-US"/>
-        </w:rPr>
-        <w:t xml:space="preserve"> tier-A P, paired by held-out scene; ≥ 10 pp higher P than uniform domain randomization (lower 95% bound &gt; 0) at each of ≥ 2 equal capture budgets.</w:t>
-      </w:r>
-    </w:p>
-    <w:p>
-      <w:pPr>
-        <w:spacing w:after="120" w:line="240" w:lineRule="auto"/>
-        <w:jc w:val="both"/>
-      </w:pPr>
-      <w:r>
-        <w:rPr>
-          <w:rFonts w:cstheme="minorHAnsi"/>
-          <w:b/>
-          <w:lang w:val="en-US"/>
-        </w:rPr>
-        <w:t xml:space="preserve">Stage III – C3, few real trials and correction (RQ3, H3; end of sem. 4 – sem. 5).</w:t>
+        <w:t xml:space="preserve">Selection:</w:t>
+      </w:r>
+      <w:r>
+        <w:rPr>
+          <w:rFonts w:cstheme="minorHAnsi"/>
+          <w:lang w:val="en-US"/>
+        </w:rPr>
+        <w:t xml:space="preserve"> candidate trials are scored by the predicted gap: the twin's uncertainty along the planned trajectory, twin–world-model disagreement on the outcome and the VLA's uncertainty (spread of LoRA ensemble actions). The top-k are run in reality (tier A: the reference).</w:t>
       </w:r>
     </w:p>
     <w:p>
@@ -7307,14 +7454,14 @@
           <w:i/>
           <w:lang w:val="en-US"/>
         </w:rPr>
-        <w:t xml:space="preserve">Selection:</w:t>
-      </w:r>
-      <w:r>
-        <w:rPr>
-          <w:rFonts w:cstheme="minorHAnsi"/>
-          <w:lang w:val="en-US"/>
-        </w:rPr>
-        <w:t xml:space="preserve"> candidate trials (start–goal pairs, object configurations) are scored by the predicted twin-to-real gap: disagreement of a policy ensemble plus the twin's uncertainty along the planned trajectory. The top-k are run in reality (tier A: the reference).</w:t>
+        <w:t xml:space="preserve">Use:</w:t>
+      </w:r>
+      <w:r>
+        <w:rPr>
+          <w:rFonts w:cstheme="minorHAnsi"/>
+          <w:lang w:val="en-US"/>
+        </w:rPr>
+        <w:t xml:space="preserve"> the trials correct the twin (re-capture or re-weighting where real and twin observations disagree, counted in the budget; posterior update [7]), extend the world model's post-training data, and fine-tune the VLA by co-training with twin data [14]. Real P from few trials uses prediction-powered inference [34].</w:t>
       </w:r>
     </w:p>
     <w:p>
@@ -7336,14 +7483,14 @@
           <w:i/>
           <w:lang w:val="en-US"/>
         </w:rPr>
-        <w:t xml:space="preserve">Use:</w:t>
-      </w:r>
-      <w:r>
-        <w:rPr>
-          <w:rFonts w:cstheme="minorHAnsi"/>
-          <w:lang w:val="en-US"/>
-        </w:rPr>
-        <w:t xml:space="preserve"> the trials (i) correct the twin, by re-capturing or re-weighting regions where real and twin observations disagree (photometric correction as in [35]; re-captured views are counted) and by updating the physical-parameter posterior [9, 25]; and (ii) fine-tune the policy by co-training with the real trials [15]. Real P is estimated from few trials with prediction-powered inference [32, 33].</w:t>
+        <w:t xml:space="preserve">Baselines:</w:t>
+      </w:r>
+      <w:r>
+        <w:rPr>
+          <w:rFonts w:cstheme="minorHAnsi"/>
+          <w:lang w:val="en-US"/>
+        </w:rPr>
+        <w:t xml:space="preserve"> random selection, uniform coverage and failure-prone selection from the twin alone (TwinRL-type [17]); same number of trials.</w:t>
       </w:r>
     </w:p>
     <w:p>
@@ -7365,14 +7512,28 @@
           <w:i/>
           <w:lang w:val="en-US"/>
         </w:rPr>
-        <w:t xml:space="preserve">Baselines:</w:t>
-      </w:r>
-      <w:r>
-        <w:rPr>
-          <w:rFonts w:cstheme="minorHAnsi"/>
-          <w:lang w:val="en-US"/>
-        </w:rPr>
-        <w:t xml:space="preserve"> random selection and uniform coverage of the same number of trials; selection rules [29–31] where they apply.</w:t>
+        <w:t xml:space="preserve">Criterion (H3):</w:t>
+      </w:r>
+      <w:r>
+        <w:rPr>
+          <w:rFonts w:cstheme="minorHAnsi"/>
+          <w:lang w:val="en-US"/>
+        </w:rPr>
+        <w:t xml:space="preserve"> the target P with ≥ 50% fewer trials than random (upper 95% bound of the ratio &lt; 1).</w:t>
+      </w:r>
+    </w:p>
+    <w:p>
+      <w:pPr>
+        <w:spacing w:after="120" w:line="240" w:lineRule="auto"/>
+        <w:jc w:val="both"/>
+      </w:pPr>
+      <w:r>
+        <w:rPr>
+          <w:rFonts w:cstheme="minorHAnsi"/>
+          <w:b/>
+          <w:lang w:val="en-US"/>
+        </w:rPr>
+        <w:t xml:space="preserve">Stage IV – the whole method in both testbeds (RQ4, H4; sem. 6).</w:t>
       </w:r>
     </w:p>
     <w:p>
@@ -7394,28 +7555,44 @@
           <w:i/>
           <w:lang w:val="en-US"/>
         </w:rPr>
-        <w:t xml:space="preserve">Success criterion (H3):</w:t>
-      </w:r>
-      <w:r>
-        <w:rPr>
-          <w:rFonts w:cstheme="minorHAnsi"/>
-          <w:lang w:val="en-US"/>
-        </w:rPr>
-        <w:t xml:space="preserve"> the target P is reached with ≥ 50% fewer real trials than random selection (upper 95% bound of the ratio &lt; 1).</w:t>
-      </w:r>
-    </w:p>
-    <w:p>
-      <w:pPr>
-        <w:spacing w:after="120" w:line="240" w:lineRule="auto"/>
-        <w:jc w:val="both"/>
-      </w:pPr>
-      <w:r>
-        <w:rPr>
-          <w:rFonts w:cstheme="minorHAnsi"/>
-          <w:b/>
-          <w:lang w:val="en-US"/>
-        </w:rPr>
-        <w:t xml:space="preserve">Stage IV – the whole method in both testbeds (RQ4, H4; sem. 6).</w:t>
+        <w:t xml:space="preserve">Budget curves:</w:t>
+      </w:r>
+      <w:r>
+        <w:rPr>
+          <w:rFonts w:cstheme="minorHAnsi"/>
+          <w:lang w:val="en-US"/>
+        </w:rPr>
+        <w:t xml:space="preserve"> real data (capture + trials, one operator-time cost) against P for the method; for </w:t>
+      </w:r>
+      <w:r>
+        <w:rPr>
+          <w:rFonts w:cstheme="minorHAnsi"/>
+          <w:b/>
+          <w:lang w:val="en-US"/>
+        </w:rPr>
+        <w:t xml:space="preserve">real-only fine-tuning of the same VLA</w:t>
+      </w:r>
+      <w:r>
+        <w:rPr>
+          <w:rFonts w:cstheme="minorHAnsi"/>
+          <w:lang w:val="en-US"/>
+        </w:rPr>
+        <w:t xml:space="preserve"> (LoRA SFT on expert demonstrations in the reference, same initialization; real-only RL also shown); and for the </w:t>
+      </w:r>
+      <w:r>
+        <w:rPr>
+          <w:rFonts w:cstheme="minorHAnsi"/>
+          <w:b/>
+          <w:lang w:val="en-US"/>
+        </w:rPr>
+        <w:t xml:space="preserve">strongest existing twin fine-tuning pipeline for VLAs</w:t>
+      </w:r>
+      <w:r>
+        <w:rPr>
+          <w:rFonts w:cstheme="minorHAnsi"/>
+          <w:lang w:val="en-US"/>
+        </w:rPr>
+        <w:t xml:space="preserve">, TwinRL/RialTo-style [17, 3]: uniform capture, uniform randomization, SFT + RL of the same VLA in the twin, random or failure-driven real trials (the better is reported), with the same twin, learner and correction and TwinRL's released code where it applies. The exchange rate is the ratio of the budgets reaching the target P.</w:t>
       </w:r>
     </w:p>
     <w:p>
@@ -7437,65 +7614,6 @@
           <w:i/>
           <w:lang w:val="en-US"/>
         </w:rPr>
-        <w:t xml:space="preserve">Budget curves:</w:t>
-      </w:r>
-      <w:r>
-        <w:rPr>
-          <w:rFonts w:cstheme="minorHAnsi"/>
-          <w:lang w:val="en-US"/>
-        </w:rPr>
-        <w:t xml:space="preserve"> real data (capture + trials, one operator-time cost) against P for the method (C1–C3); for </w:t>
-      </w:r>
-      <w:r>
-        <w:rPr>
-          <w:rFonts w:cstheme="minorHAnsi"/>
-          <w:b/>
-          <w:lang w:val="en-US"/>
-        </w:rPr>
-        <w:t xml:space="preserve">real-only learning</w:t>
-      </w:r>
-      <w:r>
-        <w:rPr>
-          <w:rFonts w:cstheme="minorHAnsi"/>
-          <w:lang w:val="en-US"/>
-        </w:rPr>
-        <w:t xml:space="preserve">, imitation of expert demonstrations in the reference with the same frozen encoder and initialization (real-only reinforcement learning also shown); and for the </w:t>
-      </w:r>
-      <w:r>
-        <w:rPr>
-          <w:rFonts w:cstheme="minorHAnsi"/>
-          <w:b/>
-          <w:lang w:val="en-US"/>
-        </w:rPr>
-        <w:t xml:space="preserve">strongest existing pipeline</w:t>
-      </w:r>
-      <w:r>
-        <w:rPr>
-          <w:rFonts w:cstheme="minorHAnsi"/>
-          <w:lang w:val="en-US"/>
-        </w:rPr>
-        <w:t xml:space="preserve">, RialTo-style [3]: uniform capture, uniform domain randomization and random real trials, with the same twin, learner and correction. The "exchange rate" is the ratio of the budgets reaching the target P; real-only scaling [11, 12] suggests the curve shapes. Also reported: a released pretrained world model as the simulator (not trained).</w:t>
-      </w:r>
-    </w:p>
-    <w:p>
-      <w:pPr>
-        <w:spacing w:after="40" w:line="240" w:lineRule="auto"/>
-        <w:ind w:left="284" w:hanging="284"/>
-        <w:jc w:val="both"/>
-      </w:pPr>
-      <w:r>
-        <w:rPr>
-          <w:rFonts w:cstheme="minorHAnsi"/>
-          <w:lang w:val="en-US"/>
-        </w:rPr>
-        <w:t xml:space="preserve">•	</w:t>
-      </w:r>
-      <w:r>
-        <w:rPr>
-          <w:rFonts w:cstheme="minorHAnsi"/>
-          <w:i/>
-          <w:lang w:val="en-US"/>
-        </w:rPr>
         <w:t xml:space="preserve">Success criterion (H4, the thesis; §7):</w:t>
       </w:r>
       <w:r>
@@ -7503,28 +7621,7 @@
           <w:rFonts w:cstheme="minorHAnsi"/>
           <w:lang w:val="en-US"/>
         </w:rPr>
-        <w:t xml:space="preserve"> with C1–C3 and their hyperparameters unchanged (the learner is each task's standard one), in each testbed ≤ 10% of the real data of real-only learning (upper 95% bound &lt; 0.2) and ≥ 2× less than the existing pipeline (bound &lt; 1); H1–H3 effects keep their sign; tier B agrees in direction.</w:t>
-      </w:r>
-    </w:p>
-    <w:p>
-      <w:pPr>
-        <w:spacing w:after="120" w:line="240" w:lineRule="auto"/>
-        <w:jc w:val="both"/>
-      </w:pPr>
-      <w:r>
-        <w:rPr>
-          <w:rFonts w:cstheme="minorHAnsi"/>
-          <w:b/>
-          <w:lang w:val="en-US"/>
-        </w:rPr>
-        <w:t xml:space="preserve">Tier C validation.</w:t>
-      </w:r>
-      <w:r>
-        <w:rPr>
-          <w:rFonts w:cstheme="minorHAnsi"/>
-          <w:lang w:val="en-US"/>
-        </w:rPr>
-        <w:t xml:space="preserve"> Two robot campaigns (sem. 5 and 7) with own phone or RGB-D captures at PWr: a mobile robot in 2 rooms and, where access is agreed, a tabletop manipulator. Uniform capture versus the method, plus the few selected trials; about 8 robot-hours per campaign (3 policies × 2 settings × 30 episodes at ~2 min, plus 2 × 20 trials). Tier C reports agreement only and never tunes thresholds.</w:t>
+        <w:t xml:space="preserve"> with C1–C3 and their hyperparameters unchanged, in each testbed ≤ 10% of the real data of real-only fine-tuning (upper 95% bound &lt; 0.2) and ≥ 2× less than the pipeline (bound &lt; 1); H1–H3 effects keep their sign; tier B agrees in direction.</w:t>
       </w:r>
     </w:p>
     <w:p>
@@ -7538,14 +7635,29 @@
           <w:b/>
           <w:lang w:val="en-US"/>
         </w:rPr>
-        <w:t xml:space="preserve">Statistics and reproducibility.</w:t>
-      </w:r>
-      <w:r>
-        <w:rPr>
-          <w:rFonts w:cstheme="minorHAnsi"/>
-          <w:lang w:val="en-US"/>
-        </w:rPr>
-        <w:t xml:space="preserve"> Tests follow §7; the protocol is pre-registered before each stage and changes are logged. Code is released where the dataset licences permit.</w:t>
+        <w:t xml:space="preserve">Tier C validation.</w:t>
+      </w:r>
+      <w:r>
+        <w:rPr>
+          <w:rFonts w:cstheme="minorHAnsi"/>
+          <w:lang w:val="en-US"/>
+        </w:rPr>
+        <w:t xml:space="preserve"> Two robot campaigns (sem. 5 and 7) with own phone or RGB-D captures at PWr: a mobile robot in 2 rooms and, where access is agreed, a tabletop manipulator; uniform capture versus the method, ~8 robot-hours per campaign, agreement only. </w:t>
+      </w:r>
+      <w:r>
+        <w:rPr>
+          <w:rFonts w:cstheme="minorHAnsi"/>
+          <w:b/>
+          <w:lang w:val="en-US"/>
+        </w:rPr>
+        <w:t xml:space="preserve">Statistics:</w:t>
+      </w:r>
+      <w:r>
+        <w:rPr>
+          <w:rFonts w:cstheme="minorHAnsi"/>
+          <w:lang w:val="en-US"/>
+        </w:rPr>
+        <w:t xml:space="preserve"> tests follow §7; the protocol is pre-registered before each stage. Code is released where dataset and model licences permit.</w:t>
       </w:r>
     </w:p>
     <w:permEnd w:id="32011344"/>
@@ -7814,7 +7926,7 @@
           <w:rFonts w:cstheme="minorHAnsi"/>
           <w:lang w:val="pl-PL"/>
         </w:rPr>
-        <w:t xml:space="preserve">Systemy sztucznej inteligencji, które działają w prawdziwym świecie, na przykład roboty chwytające przedmioty lub poruszające się po budynkach, uczą się na bardzo wielu przykładach i próbach. W rzeczywistości zbieranie takich danych jest powolne i kosztowne, dlatego systemy te często ćwiczą w symulacji komputerowej. Coraz częściej jest nią cyfrowy bliźniak: wierna kopia prawdziwego miejsca lub urządzenia, którą można odtworzyć z nagrań i pomiarów, łącznie z wyglądem, kształtem i tym, jak rzeczy się poruszają. Powstaje w ten sposób pętla: zbieramy dane w rzeczywistości, budujemy kopię, uczymy w niej system, sprawdzamy go w rzeczywistości, poprawiamy i dopiero wtedy wdrażamy. Każdy z tych kroków wymaga jednak prawdziwych danych, a ich zbieranie jest kosztowne.</w:t>
+        <w:t xml:space="preserve">Roboty, które mają chwytać przedmioty lub poruszać się po budynkach, coraz częściej korzystają z dużych, wstępnie wytrenowanych modeli sztucznej inteligencji, które rozumieją obraz i polecenia wydane słowami i na ich podstawie wybierają ruchy. Aby taki model dobrze działał w nowym miejscu i przy nowym zadaniu, trzeba go jeszcze douczyć, a zbieranie prawdziwych danych i prób jest powolne i kosztowne. Dlatego douczanie coraz częściej odbywa się w cyfrowym bliźniaku: wiernej kopii prawdziwego miejsca, którą można odtworzyć z nagrań i pomiarów, łącznie z wyglądem, kształtem i tym, jak rzeczy się poruszają. Powstaje w ten sposób pętla: zbieramy dane w rzeczywistości, budujemy kopię, douczamy w niej model, sprawdzamy go w rzeczywistości, poprawiamy i dopiero wtedy wdrażamy. Każdy z tych kroków wymaga jednak prawdziwych danych.</w:t>
       </w:r>
     </w:p>
     <w:p>
@@ -7827,7 +7939,7 @@
           <w:rFonts w:cstheme="minorHAnsi"/>
           <w:lang w:val="pl-PL"/>
         </w:rPr>
-        <w:t xml:space="preserve">Celem rozprawy jest opracowanie metody, która przejdzie przez tę pętlę z dużo mniejszą ilością prawdziwych danych niż dotychczasowe podejścia, niezależnie od zadania. Metoda ma trzy części, po jednej na każdy krok pętli. Zamiast zbierać wszystko po równo, będziemy zbierać przede wszystkim te dane, które są ważne dla zadania i o których kopia wie jeszcze za mało. Ponieważ kopia nigdy nie jest idealna, nauczymy system tak, aby nie polegał na jej niepewnych fragmentach i radził sobie z jej błędami. Na koniec wybierzemy tylko te nieliczne próby w rzeczywistości, które najwięcej mówią o tym, gdzie system jeszcze zawodzi, i wykorzystamy je do poprawienia zarówno kopii, jak i systemu. Wskazówek dostarczy sama kopia, która wie, gdzie jest niepewna, oraz sposób, w jaki uczony system opisuje to, co widzi. Tę samą metodę sprawdzimy na dwóch różnych zadaniach: chwytaniu przedmiotów ramieniem robota i poruszaniu się robota po budynkach. Badania będą prowadzone przede wszystkim na publicznie dostępnych danych, a wybrane wyniki zostaną potwierdzone na prawdziwym robocie.</w:t>
+        <w:t xml:space="preserve">Celem rozprawy jest opracowanie metody, która przejdzie przez tę pętlę z dużo mniejszą ilością prawdziwych danych niż dotychczasowe podejścia, niezależnie od zadania. Metoda ma trzy części, po jednej na każdy krok pętli. Zamiast nagrywać wszystko po równo, model rozumiejący obraz i język wskaże, co jest ważne dla zadania, a nagrywać będziemy przede wszystkim te miejsca, o których kopia wie jeszcze za mało. Ponieważ kopia nigdy nie jest idealna, model będziemy douczać tak, aby nie polegał na jej niepewnych fragmentach, a tam, gdzie kopia jest niepewna, dodatkowe sytuacje wygeneruje model świata, czyli program, który uczy się przewidywać, co wydarzy się dalej. Na koniec wybierzemy tylko te nieliczne próby w rzeczywistości, które najwięcej mówią o tym, gdzie system jeszcze zawodzi, i wykorzystamy je do poprawienia kopii, modelu świata i samego modelu. Tę samą metodę sprawdzimy na dwóch różnych zadaniach: chwytaniu przedmiotów ramieniem robota i poruszaniu się robota po budynkach. Badania będą prowadzone przede wszystkim na publicznie dostępnych danych, a wybrane wyniki zostaną potwierdzone na prawdziwym robocie.</w:t>
       </w:r>
     </w:p>
     <w:p>
@@ -7840,7 +7952,7 @@
           <w:rFonts w:cstheme="minorHAnsi"/>
           <w:lang w:val="pl-PL"/>
         </w:rPr>
-        <w:t xml:space="preserve">Spodziewanym efektem jest jedna metoda, która pozwoli zbierać mniej danych, uczyć skuteczniej i wykonywać mniej kosztownych prób w rzeczywistości, oraz pomiar, ile prawdziwych danych oszczędza w porównaniu z uczeniem wyłącznie na prawdziwych danych i z dotychczasowymi podejściami. Może to przyspieszyć i potanić wdrażanie uczących się systemów w fabrykach, magazynach, szpitalach i biurach. Opracowane oprogramowanie zostanie udostępnione publicznie.</w:t>
+        <w:t xml:space="preserve">Spodziewanym efektem jest jedna metoda, która pozwoli zbierać mniej danych, uczyć skuteczniej i wykonywać mniej kosztownych prób w rzeczywistości, oraz pomiar, ile prawdziwych danych oszczędza w porównaniu z douczaniem wyłącznie na prawdziwych danych i z dotychczasowymi podejściami. Może to przyspieszyć i potanić wdrażanie robotów w fabrykach, magazynach, szpitalach i biurach. Opracowane oprogramowanie zostanie udostępnione publicznie.</w:t>
       </w:r>
     </w:p>
     <w:permEnd w:id="301016009"/>
@@ -7895,7 +8007,7 @@
           <w:rFonts w:cstheme="minorHAnsi"/>
           <w:lang w:val="en-US"/>
         </w:rPr>
-        <w:t xml:space="preserve">Artificial intelligence systems that act in the real world, for example robots that grasp objects or move around buildings, learn from a very large number of examples and trials. In reality, collecting such data is slow and costly, so these systems often practise in a computer simulation. Increasingly, this is a digital twin: a faithful copy of a real place or device that can be rebuilt from recordings and measurements, including how things look, their shape and how they move. This creates a loop: we collect data in reality, build the copy, train the system in it, check it in reality, correct it and only then deploy it. Each of these steps, however, needs real data, and collecting it is costly.</w:t>
+        <w:t xml:space="preserve">Robots that grasp objects or move around buildings increasingly rely on large, pretrained artificial intelligence models that understand images and spoken or written instructions and choose movements from them. For such a model to work well in a new place and on a new task, it still has to be trained further, and collecting real data and trials is slow and costly. That is why this further training increasingly takes place in a digital twin: a faithful copy of a real place that can be rebuilt from recordings and measurements, including how things look, their shape and how they move. This creates a loop: we collect data in reality, build the copy, train the model further in it, check it in reality, correct it and only then deploy it. Each of these steps, however, needs real data.</w:t>
       </w:r>
     </w:p>
     <w:p>
@@ -7908,7 +8020,7 @@
           <w:rFonts w:cstheme="minorHAnsi"/>
           <w:lang w:val="en-US"/>
         </w:rPr>
-        <w:t xml:space="preserve">The goal of this dissertation is to develop a method that goes through this loop with much less real data than existing approaches, whatever the task. The method has three parts, one for each step of the loop. Instead of collecting everything evenly, we will collect mainly the data that matters for the task and about which the copy still knows too little. Because the copy is never perfect, we will train the system so that it does not rely on the uncertain parts of the copy and copes with its errors. Finally, we will choose only the few trials in reality that tell the most about where the system still fails, and use them to correct both the copy and the system. Guidance will come from the copy itself, which knows where it is uncertain, and from the way the learning system describes what it sees. We will test the same method on two different tasks: grasping objects with a robot arm and a robot moving around buildings. The research will be carried out mainly on publicly available data, and selected results will be confirmed on a real robot.</w:t>
+        <w:t xml:space="preserve">The goal of this dissertation is to develop a method that goes through this loop with much less real data than existing approaches, whatever the task. The method has three parts, one for each step of the loop. Instead of recording everything evenly, a model that understands images and language will point out what matters for the task, and we will record mainly the places about which the copy still knows too little. Because the copy is never perfect, we will train the model so that it does not rely on the uncertain parts of the copy, and where the copy is uncertain, extra situations will be generated by a world model, a program that learns to predict what happens next. Finally, we will choose only the few trials in reality that tell the most about where the system still fails, and use them to correct the copy, the world model and the model itself. We will test the same method on two different tasks: grasping objects with a robot arm and a robot moving around buildings. The research will be carried out mainly on publicly available data, and selected results will be confirmed on a real robot.</w:t>
       </w:r>
     </w:p>
     <w:p>
@@ -7921,7 +8033,7 @@
           <w:rFonts w:cstheme="minorHAnsi"/>
           <w:lang w:val="en-US"/>
         </w:rPr>
-        <w:t xml:space="preserve">The expected result is one method that makes it possible to collect less data, train more effectively and carry out fewer costly trials in reality, and a measurement of how much real data it saves compared with learning from real data only and with existing approaches. This may make deploying learning systems in factories, warehouses, hospitals and offices faster and cheaper. The software developed will be made publicly available.</w:t>
+        <w:t xml:space="preserve">The expected result is one method that makes it possible to collect less data, train more effectively and carry out fewer costly trials in reality, and a measurement of how much real data it saves compared with training on real data only and with existing approaches. This may make deploying robots in factories, warehouses, hospitals and offices faster and cheaper. The software developed will be made publicly available.</w:t>
       </w:r>
     </w:p>
     <w:permEnd w:id="305530072"/>
@@ -8372,7 +8484,7 @@
           <w:rFonts w:cstheme="minorHAnsi"/>
           <w:lang w:val="en-US"/>
         </w:rPr>
-        <w:t xml:space="preserve">. P1 reports the first two components of the method (Stage I and the first Stage II results, RQ1–RQ2): C1, task-aware, uncertainty-guided capture of real data for digital twins (H1), and C2, uncertainty-aware learning in imperfect twins (first H2 results), evaluated in manipulation and navigation by the real data they save (task T4.2). If it is rejected, the revised paper goes to </w:t>
+        <w:t xml:space="preserve">. P1 reports the first two components of the method (Stage I and the first Stage II results, RQ1–RQ2) for a pretrained open vision-language-action model fine-tuned in digital twins: C1, capture of real data guided by a vision-language model to the task-relevant, uncertain parts of the twin (H1), and C2, uncertainty-aware, parameter-efficient fine-tuning in the twin and in a world model grounded in it (first H2 results). Both are evaluated in manipulation and navigation by the real data they save, not by the fine-tuning technique itself (task T4.2). If it is rejected, the revised paper goes to </w:t>
       </w:r>
       <w:r>
         <w:rPr>
@@ -9154,19 +9266,6 @@
       <w:r>
         <w:rPr>
           <w:rFonts w:cstheme="minorHAnsi"/>
-          <w:lang w:val="en-US"/>
-        </w:rPr>
-        <w:t xml:space="preserve">P1–P3 present one method, component by component and then as a whole; P4 is optional.</w:t>
-      </w:r>
-    </w:p>
-    <w:p>
-      <w:pPr>
-        <w:spacing w:after="120" w:line="240" w:lineRule="auto"/>
-        <w:jc w:val="both"/>
-      </w:pPr>
-      <w:r>
-        <w:rPr>
-          <w:rFonts w:cstheme="minorHAnsi"/>
           <w:b/>
           <w:lang w:val="en-US"/>
         </w:rPr>
@@ -9263,7 +9362,7 @@
           <w:rFonts w:cstheme="minorHAnsi"/>
           <w:lang w:val="en-US"/>
         </w:rPr>
-        <w:t xml:space="preserve"> (3–5): its budget curve still answers its RQ, and H4 is still tested (§7).</w:t>
+        <w:t xml:space="preserve"> (3–5): its budget curve still answers its RQ; H4 is still tested.</w:t>
       </w:r>
     </w:p>
     <w:p>
@@ -9292,7 +9391,7 @@
           <w:rFonts w:cstheme="minorHAnsi"/>
           <w:lang w:val="en-US"/>
         </w:rPr>
-        <w:t xml:space="preserve"> (3–4): two estimators and an ensemble fallback, checked against the reference.</w:t>
+        <w:t xml:space="preserve"> (3–4): two estimators and an ensemble fallback.</w:t>
       </w:r>
     </w:p>
     <w:p>
@@ -9343,14 +9442,14 @@
           <w:i/>
           <w:lang w:val="en-US"/>
         </w:rPr>
-        <w:t xml:space="preserve">Real-only learning is strong at small budgets</w:t>
-      </w:r>
-      <w:r>
-        <w:rPr>
-          <w:rFonts w:cstheme="minorHAnsi"/>
-          <w:lang w:val="en-US"/>
-        </w:rPr>
-        <w:t xml:space="preserve"> (6): gains saturate quickly in a known location [12]; H4 is reported as a full budget curve.</w:t>
+        <w:t xml:space="preserve">Real-only fine-tuning is strong at small budgets</w:t>
+      </w:r>
+      <w:r>
+        <w:rPr>
+          <w:rFonts w:cstheme="minorHAnsi"/>
+          <w:lang w:val="en-US"/>
+        </w:rPr>
+        <w:t xml:space="preserve"> (6): gains saturate quickly in a known location [13]; H4 is reported as a full budget curve.</w:t>
       </w:r>
     </w:p>
     <w:p>
@@ -9372,14 +9471,14 @@
           <w:i/>
           <w:lang w:val="en-US"/>
         </w:rPr>
-        <w:t xml:space="preserve">Scooping</w:t>
-      </w:r>
-      <w:r>
-        <w:rPr>
-          <w:rFonts w:cstheme="minorHAnsi"/>
-          <w:lang w:val="en-US"/>
-        </w:rPr>
-        <w:t xml:space="preserve"> (3–6): twin-based robot learning moves fast [3–7, 13]; early preprints, monthly monitoring.</w:t>
+        <w:t xml:space="preserve">Compute</w:t>
+      </w:r>
+      <w:r>
+        <w:rPr>
+          <w:rFonts w:cstheme="minorHAnsi"/>
+          <w:lang w:val="en-US"/>
+        </w:rPr>
+        <w:t xml:space="preserve"> (3–7): ~23k H100-hours (§9); WCSS and PLGrid grants in sem. 3; LoRA and small VLAs for development; if short, fewer seeds and one VLA.</w:t>
       </w:r>
     </w:p>
     <w:p>
@@ -9401,14 +9500,43 @@
           <w:i/>
           <w:lang w:val="en-US"/>
         </w:rPr>
-        <w:t xml:space="preserve">Dataset licence or robot access</w:t>
-      </w:r>
-      <w:r>
-        <w:rPr>
-          <w:rFonts w:cstheme="minorHAnsi"/>
-          <w:lang w:val="en-US"/>
-        </w:rPr>
-        <w:t xml:space="preserve"> (3, 5): other public scans with reference geometry, own phone captures of PWr rooms; without a robot, tier C moves by a semester and hypotheses are still decided on tier A.</w:t>
+        <w:t xml:space="preserve">Crowded field, scooping</w:t>
+      </w:r>
+      <w:r>
+        <w:rPr>
+          <w:rFonts w:cstheme="minorHAnsi"/>
+          <w:lang w:val="en-US"/>
+        </w:rPr>
+        <w:t xml:space="preserve"> (3–6): VLA fine-tuning in simulation and world models is crowded, and twin RL for VLAs exists [17, 21]; we claim only the real-data budget of the loop; early preprints.</w:t>
+      </w:r>
+    </w:p>
+    <w:p>
+      <w:pPr>
+        <w:spacing w:after="40" w:line="240" w:lineRule="auto"/>
+        <w:ind w:left="284" w:hanging="284"/>
+        <w:jc w:val="both"/>
+      </w:pPr>
+      <w:r>
+        <w:rPr>
+          <w:rFonts w:cstheme="minorHAnsi"/>
+          <w:lang w:val="en-US"/>
+        </w:rPr>
+        <w:t xml:space="preserve">•	</w:t>
+      </w:r>
+      <w:r>
+        <w:rPr>
+          <w:rFonts w:cstheme="minorHAnsi"/>
+          <w:i/>
+          <w:lang w:val="en-US"/>
+        </w:rPr>
+        <w:t xml:space="preserve">Licences, robot access</w:t>
+      </w:r>
+      <w:r>
+        <w:rPr>
+          <w:rFonts w:cstheme="minorHAnsi"/>
+          <w:lang w:val="en-US"/>
+        </w:rPr>
+        <w:t xml:space="preserve"> (3, 5, 7): OpenVLA weights carry Llama 2 terms and some checkpoints are gated, so openpi's π0 is the fallback; without a robot, tier C moves by a semester (tier A decides).</w:t>
       </w:r>
     </w:p>
     <w:p>

</xml_diff>

<commit_message>
Wave 16: v6 general rewrite - real data -> digital twin -> navigation models -> real, less real data
Closes #33

Co-Authored-By: Claude Opus 5.5 <noreply@anthropic.com>
</commit_message>
<xml_diff>
--- a/output/IPB_Grzegorz_Piotrowski.docx
+++ b/output/IPB_Grzegorz_Piotrowski.docx
@@ -1098,7 +1098,7 @@
           <w:rFonts w:cstheme="minorHAnsi"/>
           <w:lang w:val="en-US"/>
         </w:rPr>
-        <w:t xml:space="preserve"> Metoda dostrajania modeli wizja–język–działanie w pętli rzeczywistość–symulacja–rzeczywistość wymagająca mniej danych rzeczywistych: ukierunkowane na zadanie zbieranie danych do budowy cyfrowych bliźniaków, uczenie w bliźniakach i modelach świata oraz aktywny wybór nielicznych danych rzeczywistych</w:t>
+        <w:t xml:space="preserve"> Uczenie modeli nawigacji robotów w cyfrowych bliźniakach przy mniejszej ilości danych rzeczywistych: metoda rzeczywistość–symulacja–rzeczywistość</w:t>
       </w:r>
       <w:bookmarkStart w:id="0" w:name="_Hlk95566638"/>
     </w:p>
@@ -1120,7 +1120,7 @@
           <w:rFonts w:cstheme="minorHAnsi"/>
           <w:lang w:val="en-US"/>
         </w:rPr>
-        <w:t xml:space="preserve"> A method for fine-tuning vision-language-action models in the real-to-sim-to-real loop that needs less real data: task-aware capture for building digital twins, learning in twins and world models, and active selection of few real-world data</w:t>
+        <w:t xml:space="preserve"> Learning robot navigation models in digital twins with less real data: a real-to-sim-to-real method</w:t>
       </w:r>
     </w:p>
     <w:bookmarkEnd w:id="0"/>
@@ -2226,7 +2226,7 @@
                 <w:b/>
                 <w:lang w:val="en-US"/>
               </w:rPr>
-              <w:t xml:space="preserve">Stage I – method component C1: capture less (RQ1, H1).</w:t>
+              <w:t xml:space="preserve">Stage 1 – transfer of real data into a digital twin (RQ1, H1).</w:t>
             </w:r>
           </w:p>
           <w:p>
@@ -2247,7 +2247,7 @@
                 <w:rFonts w:cstheme="minorHAnsi"/>
                 <w:lang w:val="en-US"/>
               </w:rPr>
-              <w:t xml:space="preserve"> Tier A set-up in both testbeds (§9): navigation, ≥ 20 public scenes (10 held out) with laser-scan references and separate phone captures; manipulation, ≥ 20 simulator task–object configurations (10 held out) with held-out physical parameters. Existing 3DGS pipeline and system identification from the T2.2 shortlist; twins at ≥ 4 capture budgets; open VLA (LoRA fine-tuning), VLM and world-model checkpoints running on the twins (§9); pilot fixing task difficulty (below the P ceiling), the operator-time cost model and the measured GPU cost; WCSS/PLGrid computing grant; pre-registration of the protocol (§7, §9). </w:t>
+              <w:t xml:space="preserve"> Proxy-reality set-up (§9): ≥ 20 public indoor scenes (10 held out) with laser-scan references and separate phone captures; twins at ≥ 4 capture budgets with an existing neural reconstruction pipeline and the physical properties needed for navigation; navigation tasks, learner and pretrained models running on the twins; pilot fixing task difficulty (below the P ceiling), the operator-time cost model and the GPU cost; WCSS/PLGrid computing grant; pre-registration of the protocol (§9). </w:t>
             </w:r>
             <w:r>
               <w:rPr>
@@ -2262,7 +2262,7 @@
                 <w:rFonts w:cstheme="minorHAnsi"/>
                 <w:lang w:val="en-US"/>
               </w:rPr>
-              <w:t xml:space="preserve"> working loop and protocol in the repository for both testbeds, </w:t>
+              <w:t xml:space="preserve"> working pipeline and protocol in the repository, </w:t>
             </w:r>
             <w:r>
               <w:rPr>
@@ -2298,7 +2298,7 @@
                 <w:rFonts w:cstheme="minorHAnsi"/>
                 <w:lang w:val="en-US"/>
               </w:rPr>
-              <w:t xml:space="preserve"> Validation stand: written agreement on robot access (planned cooperation with the K29 Denali laboratory for the mobile robot; a PWr manipulator if available) and sensor decision (SzD Minigrant application if a sensor must be bought). </w:t>
+              <w:t xml:space="preserve"> Validation stand: written agreement on robot access (planned cooperation with the K29 Denali laboratory) and sensor decision (SzD Minigrant application if a sensor must be bought). </w:t>
             </w:r>
             <w:r>
               <w:rPr>
@@ -2349,7 +2349,7 @@
                 <w:rFonts w:cstheme="minorHAnsi"/>
                 <w:lang w:val="en-US"/>
               </w:rPr>
-              <w:t xml:space="preserve"> C1: VLM-guided, task-aware, uncertainty-guided capture of views and interactions vs. uniform, task-blind, risk-weighted and VLM-guided reconstruction-quality selection, judged by the success of the VLA fine-tuned in each twin. </w:t>
+              <w:t xml:space="preserve"> Stage 1 method: capture guided by the navigation task and the twin's uncertainty vs. uniform, task-blind and risk-weighted selection, judged by the success of the navigation model trained in each twin. </w:t>
             </w:r>
             <w:r>
               <w:rPr>
@@ -2456,7 +2456,7 @@
                 <w:b/>
                 <w:lang w:val="en-US"/>
               </w:rPr>
-              <w:t xml:space="preserve">Stage I completed; Stage II – method component C2: fine-tune in an imperfect twin and a twin-grounded world model (RQ1–RQ2, H1–H2).</w:t>
+              <w:t xml:space="preserve">Stage 1 completed; Stage 2 – training navigation models in the twin (RQ1–RQ2, H1–H2).</w:t>
             </w:r>
           </w:p>
           <w:p>
@@ -2477,7 +2477,7 @@
                 <w:rFonts w:cstheme="minorHAnsi"/>
                 <w:lang w:val="en-US"/>
               </w:rPr>
-              <w:t xml:space="preserve"> C2: uncertainty-aware LoRA fine-tuning of the VLA (SFT, then RL) in the twin, with uncertainty-driven randomization and sample weighting, vs. uniform domain randomization (H2a); the world model post-trained on twin rollouts and covering the twin's uncertain regions vs. the twin only (H2b); equal capture budgets, both testbeds. </w:t>
+              <w:t xml:space="preserve"> Stage 2 method: training that follows the twin's uncertainty, with the twin extended by a learned world model and the model initialized from pretrained foundation models, vs. uniform domain randomization, at equal capture budgets. </w:t>
             </w:r>
             <w:r>
               <w:rPr>
@@ -2507,7 +2507,7 @@
                 <w:rFonts w:cstheme="minorHAnsi"/>
                 <w:lang w:val="en-US"/>
               </w:rPr>
-              <w:t xml:space="preserve"> and first H2 result on tier A, </w:t>
+              <w:t xml:space="preserve"> and first H2 result, </w:t>
             </w:r>
             <w:r>
               <w:rPr>
@@ -2573,7 +2573,7 @@
                 <w:rFonts w:cstheme="minorHAnsi"/>
                 <w:lang w:val="en-US"/>
               </w:rPr>
-              <w:t xml:space="preserve"> (method component C1, H1, and first results of C2, H2, for a VLA fine-tuned in twins, in manipulation and navigation). </w:t>
+              <w:t xml:space="preserve"> (stage 1, H1, and first stage 2 results, H2). </w:t>
             </w:r>
             <w:r>
               <w:rPr>
@@ -2624,7 +2624,7 @@
                 <w:rFonts w:cstheme="minorHAnsi"/>
                 <w:lang w:val="en-US"/>
               </w:rPr>
-              <w:t xml:space="preserve"> Stage III set-up: C3 trial selection (gap predicted from twin, world-model and VLA uncertainty) and correction code on tier A (Jul–Sep 2027). </w:t>
+              <w:t xml:space="preserve"> Stage 3 set-up: selection of real trials by the predicted twin-to-reality gap and correction code on the proxy reality (Jul–Sep 2027). </w:t>
             </w:r>
             <w:r>
               <w:rPr>
@@ -2783,7 +2783,7 @@
                 <w:b/>
                 <w:lang w:val="en-US"/>
               </w:rPr>
-              <w:t xml:space="preserve">Stage III – method component C3: collect few real data (RQ3, H3).</w:t>
+              <w:t xml:space="preserve">Stage 3 – transfer back to reality with few real data (RQ3, H3).</w:t>
             </w:r>
           </w:p>
           <w:p>
@@ -2804,7 +2804,7 @@
                 <w:rFonts w:cstheme="minorHAnsi"/>
                 <w:lang w:val="en-US"/>
               </w:rPr>
-              <w:t xml:space="preserve"> C3: active selection of real trials vs. random and twin-only failure-driven selection; correction of the twin (appearance and physical parameters) and the world model, and fine-tuning of the VLA with the selected trials, in both testbeds. </w:t>
+              <w:t xml:space="preserve"> Stage 3 method: active selection of real trials vs. random and twin-only failure-driven selection; correction of the twin (appearance, geometry, physical properties) and of the navigation model with the selected trials. </w:t>
             </w:r>
             <w:r>
               <w:rPr>
@@ -2834,7 +2834,7 @@
                 <w:rFonts w:cstheme="minorHAnsi"/>
                 <w:lang w:val="en-US"/>
               </w:rPr>
-              <w:t xml:space="preserve"> on tier A, </w:t>
+              <w:t xml:space="preserve"> on the proxy reality, </w:t>
             </w:r>
             <w:r>
               <w:rPr>
@@ -2870,7 +2870,7 @@
                 <w:rFonts w:cstheme="minorHAnsi"/>
                 <w:lang w:val="en-US"/>
               </w:rPr>
-              <w:t xml:space="preserve"> First robot validation campaign (tier C, 2 PWr settings, ~8 robot-hours): own captures, twins, the fine-tuned VLA, uniform capture vs. the method. </w:t>
+              <w:t xml:space="preserve"> First robot validation campaign (2 PWr rooms, ~8 robot-hours): own captures, twins, uniform capture vs. the method. </w:t>
             </w:r>
             <w:r>
               <w:rPr>
@@ -2885,7 +2885,7 @@
                 <w:rFonts w:cstheme="minorHAnsi"/>
                 <w:lang w:val="en-US"/>
               </w:rPr>
-              <w:t xml:space="preserve"> validation report. Place: Denali (and the manipulator's lab, if agreed). Without robot access, the campaign moves to sem. 7; H1–H3 are decided on tier A either way.</w:t>
+              <w:t xml:space="preserve"> validation report. Place: Denali. Without robot access, the campaign moves to sem. 7; H1–H3 are decided on the proxy reality either way.</w:t>
             </w:r>
           </w:p>
           <w:p>
@@ -2921,7 +2921,7 @@
                 <w:rFonts w:cstheme="minorHAnsi"/>
                 <w:lang w:val="en-US"/>
               </w:rPr>
-              <w:t xml:space="preserve"> (method component C3: active selection of few real data and twin correction, RQ3) submitted to </w:t>
+              <w:t xml:space="preserve"> (stage 3: few real data and twin correction, RQ3) submitted to </w:t>
             </w:r>
             <w:r>
               <w:rPr>
@@ -3029,7 +3029,7 @@
                 <w:b/>
                 <w:lang w:val="en-US"/>
               </w:rPr>
-              <w:t xml:space="preserve">Stage IV – the whole method in both testbeds (RQ4, H4, the thesis).</w:t>
+              <w:t xml:space="preserve">The whole pipeline (RQ4, H4, the thesis).</w:t>
             </w:r>
           </w:p>
           <w:p>
@@ -3050,7 +3050,7 @@
                 <w:rFonts w:cstheme="minorHAnsi"/>
                 <w:lang w:val="en-US"/>
               </w:rPr>
-              <w:t xml:space="preserve"> Real-data budget curves of the whole method vs. real-only fine-tuning of the same VLA ("exchange rate") and vs. the strongest existing twin fine-tuning pipeline for VLAs (TwinRL/RialTo-style) on tier A in manipulation and navigation, with C1–C3 unchanged, plus the tier-B check against published paired sim/real evaluations (SIMPLER). </w:t>
+              <w:t xml:space="preserve"> Real-data budget curves of the whole method vs. the strongest existing real-to-sim-to-real approach and vs. learning from real data only ("exchange rate"), with the method's settings fixed in advance. </w:t>
             </w:r>
             <w:r>
               <w:rPr>
@@ -3065,7 +3065,7 @@
                 <w:rFonts w:cstheme="minorHAnsi"/>
                 <w:lang w:val="en-US"/>
               </w:rPr>
-              <w:t xml:space="preserve"> first-testbed result </w:t>
+              <w:t xml:space="preserve"> first result </w:t>
             </w:r>
             <w:r>
               <w:rPr>
@@ -3182,7 +3182,7 @@
                 <w:rFonts w:cstheme="minorHAnsi"/>
                 <w:lang w:val="en-US"/>
               </w:rPr>
-              <w:t xml:space="preserve"> (the whole method against real-only fine-tuning and the existing twin pipeline in both testbeds; working title "budget law") submitted to </w:t>
+              <w:t xml:space="preserve"> (the whole pipeline against existing approaches; working title "budget law") submitted to </w:t>
             </w:r>
             <w:r>
               <w:rPr>
@@ -3326,7 +3326,7 @@
                 <w:rFonts w:cstheme="minorHAnsi"/>
                 <w:lang w:val="en-US"/>
               </w:rPr>
-              <w:t xml:space="preserve"> Second robot validation campaign (tier C) of the whole method; final analysis of H1–H4 across tiers and testbeds. </w:t>
+              <w:t xml:space="preserve"> Second robot validation campaign of the whole method; final analysis of H1–H4. </w:t>
             </w:r>
             <w:r>
               <w:rPr>
@@ -3362,7 +3362,7 @@
                 <w:rFonts w:cstheme="minorHAnsi"/>
                 <w:lang w:val="en-US"/>
               </w:rPr>
-              <w:t xml:space="preserve"> Release of the method's code, experiment scripts and LoRA adapters (where model licences permit). </w:t>
+              <w:t xml:space="preserve"> Release of the method's code and experiment scripts (where dataset and model licences permit). </w:t>
             </w:r>
             <w:r>
               <w:rPr>
@@ -4255,37 +4255,22 @@
           <w:rFonts w:cstheme="minorHAnsi"/>
           <w:lang w:val="en-US"/>
         </w:rPr>
-        <w:t xml:space="preserve">Modern machine learning is limited less by models than by </w:t>
-      </w:r>
-      <w:r>
-        <w:rPr>
-          <w:rFonts w:cstheme="minorHAnsi"/>
-          <w:b/>
-          <w:lang w:val="en-US"/>
-        </w:rPr>
-        <w:t xml:space="preserve">data in the target domain</w:t>
-      </w:r>
-      <w:r>
-        <w:rPr>
-          <w:rFonts w:cstheme="minorHAnsi"/>
-          <w:lang w:val="en-US"/>
-        </w:rPr>
-        <w:t xml:space="preserve">. Robot manipulators, mobile robots and other systems acting in the physical world need much experience, which is slow, expensive and sometimes risky to collect in reality. Pretrained open </w:t>
-      </w:r>
-      <w:r>
-        <w:rPr>
-          <w:rFonts w:cstheme="minorHAnsi"/>
-          <w:b/>
-          <w:lang w:val="en-US"/>
-        </w:rPr>
-        <w:t xml:space="preserve">vision-language-action (VLA) models</w:t>
-      </w:r>
-      <w:r>
-        <w:rPr>
-          <w:rFonts w:cstheme="minorHAnsi"/>
-          <w:lang w:val="en-US"/>
-        </w:rPr>
-        <w:t xml:space="preserve">, trained on large robot datasets, have made the starting point much stronger, but they still need data from the target task and place to work there. Training in simulation avoids that cost but opens a </w:t>
+        <w:t xml:space="preserve">Mobile robots that move around buildings, such as service, delivery, inspection and assistive robots, rely increasingly on learned </w:t>
+      </w:r>
+      <w:r>
+        <w:rPr>
+          <w:rFonts w:cstheme="minorHAnsi"/>
+          <w:b/>
+          <w:lang w:val="en-US"/>
+        </w:rPr>
+        <w:t xml:space="preserve">navigation models</w:t>
+      </w:r>
+      <w:r>
+        <w:rPr>
+          <w:rFonts w:cstheme="minorHAnsi"/>
+          <w:lang w:val="en-US"/>
+        </w:rPr>
+        <w:t xml:space="preserve">. Such models need a lot of experience from the place where they will work, and collecting it in reality is slow, expensive and sometimes unsafe. Training in simulation avoids this cost but opens a </w:t>
       </w:r>
       <w:r>
         <w:rPr>
@@ -4300,7 +4285,7 @@
           <w:rFonts w:cstheme="minorHAnsi"/>
           <w:lang w:val="en-US"/>
         </w:rPr>
-        <w:t xml:space="preserve">.</w:t>
+        <w:t xml:space="preserve">: a model that works in a generic simulator often fails in a real building.</w:t>
       </w:r>
     </w:p>
     <w:p>
@@ -4321,7 +4306,7 @@
           <w:rFonts w:cstheme="minorHAnsi"/>
           <w:lang w:val="en-US"/>
         </w:rPr>
-        <w:t xml:space="preserve"> built from real data narrow this gap. Neural scene reconstruction (3D Gaussian Splatting, Neural Radiance Fields) turns a short real capture into a photorealistic model of the geometry and appearance of a scene, and system identification estimates its physical parameters (masses, friction, actuation) from a few real interactions. Learned </w:t>
+        <w:t xml:space="preserve"> built from real data narrow this gap. Neural scene reconstruction turns a short video or depth capture of a real building into a photorealistic model of its geometry and appearance, and a few measurements give the physical properties that matter for navigation. Learned </w:t>
       </w:r>
       <w:r>
         <w:rPr>
@@ -4336,22 +4321,37 @@
           <w:rFonts w:cstheme="minorHAnsi"/>
           <w:lang w:val="en-US"/>
         </w:rPr>
-        <w:t xml:space="preserve"> can generate further variations. This gives a </w:t>
-      </w:r>
-      <w:r>
-        <w:rPr>
-          <w:rFonts w:cstheme="minorHAnsi"/>
-          <w:b/>
-          <w:lang w:val="en-US"/>
-        </w:rPr>
-        <w:t xml:space="preserve">real-to-sim-to-real loop</w:t>
-      </w:r>
-      <w:r>
-        <w:rPr>
-          <w:rFonts w:cstheme="minorHAnsi"/>
-          <w:lang w:val="en-US"/>
-        </w:rPr>
-        <w:t xml:space="preserve">: collect real data, build a twin, fine-tune in the twin, check and correct with a little more real data, deploy. Building twins, fine-tuning VLAs in simulation and training them in world models are all active research areas. What remains open is the </w:t>
+        <w:t xml:space="preserve"> can generate further situations, and pretrained </w:t>
+      </w:r>
+      <w:r>
+        <w:rPr>
+          <w:rFonts w:cstheme="minorHAnsi"/>
+          <w:b/>
+          <w:lang w:val="en-US"/>
+        </w:rPr>
+        <w:t xml:space="preserve">foundation models</w:t>
+      </w:r>
+      <w:r>
+        <w:rPr>
+          <w:rFonts w:cstheme="minorHAnsi"/>
+          <w:lang w:val="en-US"/>
+        </w:rPr>
+        <w:t xml:space="preserve"> provide a strong starting point. This gives a </w:t>
+      </w:r>
+      <w:r>
+        <w:rPr>
+          <w:rFonts w:cstheme="minorHAnsi"/>
+          <w:b/>
+          <w:lang w:val="en-US"/>
+        </w:rPr>
+        <w:t xml:space="preserve">real-to-sim-to-real pipeline</w:t>
+      </w:r>
+      <w:r>
+        <w:rPr>
+          <w:rFonts w:cstheme="minorHAnsi"/>
+          <w:lang w:val="en-US"/>
+        </w:rPr>
+        <w:t xml:space="preserve">: acquire real data, build a twin, train the navigation model in it at scale, and transfer it back to reality, where a little more real data checks and corrects the twin and the model. Each of these parts is an active research area. What remains open is the </w:t>
       </w:r>
       <w:r>
         <w:rPr>
@@ -4366,7 +4366,7 @@
           <w:rFonts w:cstheme="minorHAnsi"/>
           <w:lang w:val="en-US"/>
         </w:rPr>
-        <w:t xml:space="preserve"> the whole loop consumes. Each step spends it: the capture that builds the twin, the real data used to make learning robust to what the twin got wrong, and the real-world trials used to check and correct the result. Today these amounts are chosen by habit: data is collected uniformly, learning uses generic randomization, and real trials are picked at random or by hand. How much real data a twin actually saves has, to our knowledge, not been measured systematically across tasks.</w:t>
+        <w:t xml:space="preserve"> the whole pipeline consumes: the capture that builds the twin, the real samples that make training robust to what the twin got wrong, and the real trials that correct the result. Today these amounts are chosen by habit: data is captured uniformly, training uses generic randomization, and real trials are picked at random or by hand. How much real data a twin actually saves in navigation has, to our knowledge, not been measured systematically.</w:t>
       </w:r>
     </w:p>
     <w:p>
@@ -4402,7 +4402,7 @@
           <w:rFonts w:cstheme="minorHAnsi"/>
           <w:lang w:val="en-US"/>
         </w:rPr>
-        <w:t xml:space="preserve"> for learning in the real-to-sim-to-real loop that reaches a given real-world performance with </w:t>
+        <w:t xml:space="preserve"> for real-to-sim-to-real learning of navigation models that reaches a given real-world navigation performance with </w:t>
       </w:r>
       <w:r>
         <w:rPr>
@@ -4417,22 +4417,7 @@
           <w:rFonts w:cstheme="minorHAnsi"/>
           <w:lang w:val="en-US"/>
         </w:rPr>
-        <w:t xml:space="preserve"> than existing approaches. A pretrained open VLA is fine-tuned sim-first in the twin. The method has three components, one per loop step: (C1) capture guided by a vision-language model (VLM) to the task-relevant parts of the scene where the twin is most uncertain, (C2) parameter-efficient fine-tuning that is robust to the twin's errors, in the twin and in a world model grounded in it that covers what the twin got wrong, and (C3) active selection of the few real-world data that correct the twin, the world model and the VLA. The </w:t>
-      </w:r>
-      <w:r>
-        <w:rPr>
-          <w:rFonts w:cstheme="minorHAnsi"/>
-          <w:b/>
-          <w:lang w:val="en-US"/>
-        </w:rPr>
-        <w:t xml:space="preserve">uncertainty</w:t>
-      </w:r>
-      <w:r>
-        <w:rPr>
-          <w:rFonts w:cstheme="minorHAnsi"/>
-          <w:lang w:val="en-US"/>
-        </w:rPr>
-        <w:t xml:space="preserve"> of the twin, the world model and the VLA guides all three. The thesis is that the method needs at most a tenth of the real data of fine-tuning the same VLA on real data only, and at least two times less than the strongest existing twin fine-tuning pipeline, in both testbeds.</w:t>
+        <w:t xml:space="preserve"> than existing approaches. The method covers the three stages of the pipeline: (1) deciding which real data is worth acquiring to build the twin, (2) training navigation models in the imperfect twin, extended with world models and foundation models, so that its errors do not transfer, and (3) choosing the few real data that best correct the twin and the model. The thesis is that the whole method needs at least two times less real data than the strongest existing real-to-sim-to-real approach.</w:t>
       </w:r>
     </w:p>
     <w:p>
@@ -4453,7 +4438,7 @@
           <w:rFonts w:cstheme="minorHAnsi"/>
           <w:lang w:val="en-US"/>
         </w:rPr>
-        <w:t xml:space="preserve"> The object is a general, task- and domain-agnostic data-efficient learning methodology (active learning, learning under distribution shift, uncertainty estimation, adaptation of foundation models), not a particular robot, task, simulator or benchmark, which places it in </w:t>
+        <w:t xml:space="preserve"> The object is a data-efficient learning method (active learning, learning under distribution shift, uncertainty estimation, adaptation of pretrained models), not a particular robot, simulator or benchmark, which places it in </w:t>
       </w:r>
       <w:r>
         <w:rPr>
@@ -4468,37 +4453,7 @@
           <w:rFonts w:cstheme="minorHAnsi"/>
           <w:lang w:val="en-US"/>
         </w:rPr>
-        <w:t xml:space="preserve">. The student builds on existing open models, twin pipelines, simulators and public datasets. The method is tested with the same settings on two testbeds of equal status, </w:t>
-      </w:r>
-      <w:r>
-        <w:rPr>
-          <w:rFonts w:cstheme="minorHAnsi"/>
-          <w:b/>
-          <w:lang w:val="en-US"/>
-        </w:rPr>
-        <w:t xml:space="preserve">robotic manipulation</w:t>
-      </w:r>
-      <w:r>
-        <w:rPr>
-          <w:rFonts w:cstheme="minorHAnsi"/>
-          <w:lang w:val="en-US"/>
-        </w:rPr>
-        <w:t xml:space="preserve"> and </w:t>
-      </w:r>
-      <w:r>
-        <w:rPr>
-          <w:rFonts w:cstheme="minorHAnsi"/>
-          <w:b/>
-          <w:lang w:val="en-US"/>
-        </w:rPr>
-        <w:t xml:space="preserve">visual navigation</w:t>
-      </w:r>
-      <w:r>
-        <w:rPr>
-          <w:rFonts w:cstheme="minorHAnsi"/>
-          <w:lang w:val="en-US"/>
-        </w:rPr>
-        <w:t xml:space="preserve">, where public data make it possible to count real data exactly without an own robot. Trials on a real robot (planned cooperation with a PWr robotics laboratory) validate, but do not decide, the conclusions. The topic fits the Department of Artificial Intelligence (K46), whose research groups include representation learning. Parameter-efficient fine-tuning of open VLAs runs on the GPU infrastructure available to PWr researchers (WCSS, PLGrid).</w:t>
+        <w:t xml:space="preserve">. The student builds on existing open reconstruction pipelines, simulators, pretrained models and public datasets. Public scans of real buildings make it possible to count real data exactly without an own robot; trials on a real robot (planned cooperation with a PWr robotics laboratory) validate, but do not decide, the conclusions. The topic fits the Department of Artificial Intelligence (K46), whose research groups include representation learning, and the training runs on the GPU infrastructure available to PWr researchers (WCSS, PLGrid).</w:t>
       </w:r>
     </w:p>
     <w:p>
@@ -4519,7 +4474,7 @@
           <w:rFonts w:cstheme="minorHAnsi"/>
           <w:lang w:val="en-US"/>
         </w:rPr>
-        <w:t xml:space="preserve"> faster and cheaper deployment of robot foundation models in new places, such as robot workcells, warehouses, buildings and inspection sites, with less time spent collecting data and supervising real trials; guidance on how much real data to collect for a twin; and, beyond robotics, any model adapted on reconstructed or simulated data and used on real sensor data.</w:t>
+        <w:t xml:space="preserve"> faster and cheaper deployment of mobile robots in new buildings, such as warehouses, hospitals, offices and inspection sites, with less time spent collecting data and supervising real trials; guidance on how much real data to collect for a twin; and, beyond robotics, any model trained on reconstructed or simulated data and used on real sensor data.</w:t>
       </w:r>
     </w:p>
     <w:permEnd w:id="1178868985"/>
@@ -4890,29 +4845,113 @@
           <w:b/>
           <w:lang w:val="en-US"/>
         </w:rPr>
-        <w:t xml:space="preserve">Real-to-sim-to-real with digital twins.</w:t>
-      </w:r>
-      <w:r>
-        <w:rPr>
-          <w:rFonts w:cstheme="minorHAnsi"/>
-          <w:lang w:val="en-US"/>
-        </w:rPr>
-        <w:t xml:space="preserve"> A real-to-sim-to-real loop builds a simulation of the target scene or object (a </w:t>
-      </w:r>
-      <w:r>
-        <w:rPr>
-          <w:rFonts w:cstheme="minorHAnsi"/>
-          <w:i/>
-          <w:lang w:val="en-US"/>
-        </w:rPr>
-        <w:t xml:space="preserve">digital twin</w:t>
-      </w:r>
-      <w:r>
-        <w:rPr>
-          <w:rFonts w:cstheme="minorHAnsi"/>
-          <w:lang w:val="en-US"/>
-        </w:rPr>
-        <w:t xml:space="preserve">) from real data, learns a policy in it and transfers it back. Generic simulators such as Habitat [1] train at scale, but not in the target scene. 3D Gaussian Splatting (3DGS)</w:t>
+        <w:t xml:space="preserve">Simulation and sim-to-real transfer in navigation.</w:t>
+      </w:r>
+      <w:r>
+        <w:rPr>
+          <w:rFonts w:cstheme="minorHAnsi"/>
+          <w:lang w:val="en-US"/>
+        </w:rPr>
+        <w:t xml:space="preserve"> Navigation models for mobile robots are commonly trained in simulators such as Habitat [1], where large-scale reinforcement learning essentially solves point-goal navigation after billions of steps [2]. Transfer to the real world is the open part: simulation success does not always predict real success, which motivated the Sim-vs-Real Correlation Coefficient [3], and lower-fidelity simulation can even transfer better [4]. Domain randomization varies appearance [5] or dynamics [6] uniformly within hand-set ranges, and real rollouts can adapt the simulation parameter distribution [7]. Real data still matters: in navigation, more data from a known location saturates quickly [8], and co-training on simulated and real data raises real success [9].</w:t>
+      </w:r>
+    </w:p>
+    <w:p>
+      <w:pPr>
+        <w:spacing w:after="120" w:line="240" w:lineRule="auto"/>
+        <w:jc w:val="both"/>
+      </w:pPr>
+      <w:r>
+        <w:rPr>
+          <w:rFonts w:cstheme="minorHAnsi"/>
+          <w:b/>
+          <w:lang w:val="en-US"/>
+        </w:rPr>
+        <w:t xml:space="preserve">From real data to digital twins.</w:t>
+      </w:r>
+      <w:r>
+        <w:rPr>
+          <w:rFonts w:cstheme="minorHAnsi"/>
+          <w:lang w:val="en-US"/>
+        </w:rPr>
+        <w:t xml:space="preserve"> Neural scene reconstruction, above all 3D Gaussian Splatting (3DGS) [10], turns a short real capture into a photorealistic model of a scene. Twins built this way train navigation models that transfer: EmbodiedSplat [11] reconstructs rooms from a phone capture and fine-tunes image-goal navigation in Habitat, Vid2Sim [12] builds interactive simulators for urban navigation from monocular video, and GaussGym [13] trains navigation and locomotion from pixels in reconstructed scenes. RialTo [14] shows the same loop for manipulation, building twins from small amounts of real data. The physical part of a twin can be identified from real trajectories as a posterior [15]. Datasets such as ScanNet++ [16] pair laser scans and DSLR images with a separate phone capture of the same scene. Building a twin is no longer the bottleneck; in these works the amount and choice of the real data that builds and corrects it are fixed by hand.</w:t>
+      </w:r>
+    </w:p>
+    <w:p>
+      <w:pPr>
+        <w:spacing w:after="120" w:line="240" w:lineRule="auto"/>
+        <w:jc w:val="both"/>
+      </w:pPr>
+      <w:r>
+        <w:rPr>
+          <w:rFonts w:cstheme="minorHAnsi"/>
+          <w:b/>
+          <w:lang w:val="en-US"/>
+        </w:rPr>
+        <w:t xml:space="preserve">Capturing the right real data.</w:t>
+      </w:r>
+      <w:r>
+        <w:rPr>
+          <w:rFonts w:cstheme="minorHAnsi"/>
+          <w:lang w:val="en-US"/>
+        </w:rPr>
+        <w:t xml:space="preserve"> Active view selection chooses the images that improve a reconstruction most: FisherRF [17] maximizes expected information gain, and Bayes' Rays [18] estimates an uncertainty field for a trained radiance field. Risk-aware view acquisition [19] weights FisherRF by safety-critical regions for navigation, and AREA3D [20] adds vision-language guidance. Their objective is reconstruction quality or safe exploration, not the success of a navigation model trained in the twin; we found at most two task-aware capture papers a year in 2023–2026.</w:t>
+      </w:r>
+    </w:p>
+    <w:p>
+      <w:pPr>
+        <w:spacing w:after="120" w:line="240" w:lineRule="auto"/>
+        <w:jc w:val="both"/>
+      </w:pPr>
+      <w:r>
+        <w:rPr>
+          <w:rFonts w:cstheme="minorHAnsi"/>
+          <w:b/>
+          <w:lang w:val="en-US"/>
+        </w:rPr>
+        <w:t xml:space="preserve">Foundation models and world models.</w:t>
+      </w:r>
+      <w:r>
+        <w:rPr>
+          <w:rFonts w:cstheme="minorHAnsi"/>
+          <w:lang w:val="en-US"/>
+        </w:rPr>
+        <w:t xml:space="preserve"> Pretrained navigation foundation models generalize across robots and environments (GNM [21], ViNT [22]), and vision-language-action models map images and instructions to actions, also for navigation [23, 24]; they still need data from the target place to work there. Learned world models predict future observations and can serve as simulators: navigation world models plan by imagining trajectories [25], and open world foundation models are post-trained per setup [26]. Recent work fine-tunes such models in a twin reconstructed from a phone capture and uses it to target real rollouts [27], or improves a world model with real rollouts [28]; each reports results at a fixed, hand-chosen amount of real data. Frozen visual encoders [29] make twin and real observations comparable, and prediction-powered inference [30] estimates real performance from many cheap predictions and a few real labels.</w:t>
+      </w:r>
+    </w:p>
+    <w:p>
+      <w:pPr>
+        <w:spacing w:after="120" w:line="240" w:lineRule="auto"/>
+        <w:jc w:val="both"/>
+      </w:pPr>
+      <w:r>
+        <w:rPr>
+          <w:rFonts w:cstheme="minorHAnsi"/>
+          <w:b/>
+          <w:lang w:val="en-US"/>
+        </w:rPr>
+        <w:t xml:space="preserve">Research gap.</w:t>
+      </w:r>
+      <w:r>
+        <w:rPr>
+          <w:rFonts w:cstheme="minorHAnsi"/>
+          <w:lang w:val="en-US"/>
+        </w:rPr>
+        <w:t xml:space="preserve"> Real-to-sim-to-real learning of navigation models works, but the real data it consumes is set by hand and spent uniformly at every stage. Missing is one method that decides, for navigation: (i) which real data to acquire to build the twin (RQ1); (ii) how to train in an imperfect twin, extended with world models and foundation models, so that its errors do not transfer (RQ2); (iii) which few real data to collect to correct twin and model (RQ3); and (iv) evidence that the whole pipeline needs less real data than existing real-to-sim-to-real approaches (RQ4).</w:t>
+      </w:r>
+    </w:p>
+    <w:p>
+      <w:pPr>
+        <w:keepNext/>
+        <w:spacing w:after="60" w:line="240" w:lineRule="auto"/>
+        <w:jc w:val="left"/>
+      </w:pPr>
+      <w:r>
+        <w:rPr>
+          <w:rFonts w:cstheme="minorHAnsi"/>
+          <w:b/>
+          <w:lang w:val="en-US"/>
+        </w:rPr>
+        <w:t xml:space="preserve">References</w:t>
       </w:r>
     </w:p>
     <w:p>
@@ -4926,134 +4965,7 @@
           <w:rFonts w:cstheme="minorHAnsi"/>
           <w:lang w:val="en-US"/>
         </w:rPr>
-        <w:t xml:space="preserve">[2] turns a short camera capture into a photorealistic twin, and policies trained in such twins transfer</w:t>
-      </w:r>
-    </w:p>
-    <w:p>
-      <w:pPr>
-        <w:spacing w:after="120" w:line="240" w:lineRule="auto"/>
-        <w:jc w:val="both"/>
-      </w:pPr>
-      <w:r>
-        <w:rPr>
-          <w:rFonts w:cstheme="minorHAnsi"/>
-          <w:lang w:val="en-US"/>
-        </w:rPr>
-        <w:t xml:space="preserve">in manipulation (RialTo [3], SplatSim [4]) and navigation (EmbodiedSplat [5]); GPU simulators ship twin environments (ManiSkill3 [6]). Physical parameters are inferred from real trajectories as a posterior (BayesSim [7]). Building a twin is no longer the bottleneck; </w:t>
-      </w:r>
-      <w:r>
-        <w:rPr>
-          <w:rFonts w:cstheme="minorHAnsi"/>
-          <w:b/>
-          <w:lang w:val="en-US"/>
-        </w:rPr>
-        <w:t xml:space="preserve">real data</w:t>
-      </w:r>
-      <w:r>
-        <w:rPr>
-          <w:rFonts w:cstheme="minorHAnsi"/>
-          <w:lang w:val="en-US"/>
-        </w:rPr>
-        <w:t xml:space="preserve"> is: the capture that builds the twin and the real trials that correct it. Current systems fix this cost by hand; RialTo's ablation over 0–15 real demonstrations is the closest published analysis of a real-data budget.</w:t>
-      </w:r>
-    </w:p>
-    <w:p>
-      <w:pPr>
-        <w:spacing w:after="120" w:line="240" w:lineRule="auto"/>
-        <w:jc w:val="both"/>
-      </w:pPr>
-      <w:r>
-        <w:rPr>
-          <w:rFonts w:cstheme="minorHAnsi"/>
-          <w:b/>
-          <w:lang w:val="en-US"/>
-        </w:rPr>
-        <w:t xml:space="preserve">Pretrained vision-language-action (VLA) policies.</w:t>
-      </w:r>
-      <w:r>
-        <w:rPr>
-          <w:rFonts w:cstheme="minorHAnsi"/>
-          <w:lang w:val="en-US"/>
-        </w:rPr>
-        <w:t xml:space="preserve"> Open VLA models map camera images and an instruction to actions: OpenVLA [8], π0 [9] and, for navigation, NaVILA [10]. They need fine-tuning for a new setup. Low-rank adaptation (LoRA) [11] makes this feasible on a single GPU [8], and the OFT recipe [12] raises success and speed. Fine-tuning still consumes real demonstrations: in navigation, more data from a known location saturates quickly [13], and sim-and-real co-training raises real success by 38% on average [14].</w:t>
-      </w:r>
-    </w:p>
-    <w:p>
-      <w:pPr>
-        <w:spacing w:after="120" w:line="240" w:lineRule="auto"/>
-        <w:jc w:val="both"/>
-      </w:pPr>
-      <w:r>
-        <w:rPr>
-          <w:rFonts w:cstheme="minorHAnsi"/>
-          <w:b/>
-          <w:lang w:val="en-US"/>
-        </w:rPr>
-        <w:t xml:space="preserve">Fine-tuning VLAs in simulation, twins and world models (crowded).</w:t>
-      </w:r>
-      <w:r>
-        <w:rPr>
-          <w:rFonts w:cstheme="minorHAnsi"/>
-          <w:lang w:val="en-US"/>
-        </w:rPr>
-        <w:t xml:space="preserve"> Reinforcement learning (RL) fine-tuning of VLAs in simulation improves on supervised fine-tuning, especially under distribution shift [15, 16]. TwinRL [17] fine-tunes a VLA with RL in a twin reconstructed from a smartphone capture and uses the twin to find failure-prone configurations for targeted real rollouts, reporting 20 minutes of on-robot interaction. Learned </w:t>
-      </w:r>
-      <w:r>
-        <w:rPr>
-          <w:rFonts w:cstheme="minorHAnsi"/>
-          <w:b/>
-          <w:lang w:val="en-US"/>
-        </w:rPr>
-        <w:t xml:space="preserve">world models</w:t>
-      </w:r>
-      <w:r>
-        <w:rPr>
-          <w:rFonts w:cstheme="minorHAnsi"/>
-          <w:lang w:val="en-US"/>
-        </w:rPr>
-        <w:t xml:space="preserve"> serve as the simulator instead: open world foundation models are post-trained per setup (Cosmos [18]; NWM [19] for navigation), VLAs are optimized on-policy inside them without real interaction [20], and VLAW [21] improves a world model with real rollouts and then the VLA with its synthetic data. GigaWorld-0 [22] combines 3DGS reconstruction, system identification and video generation into a data engine for VLAs. Open vision-language models (VLMs) such as Qwen2.5-VL [23] can judge task success [24]. Here they are components and baselines, each reported at a fixed, hand-chosen real-data budget.</w:t>
-      </w:r>
-    </w:p>
-    <w:p>
-      <w:pPr>
-        <w:spacing w:after="120" w:line="240" w:lineRule="auto"/>
-        <w:jc w:val="both"/>
-      </w:pPr>
-      <w:r>
-        <w:rPr>
-          <w:rFonts w:cstheme="minorHAnsi"/>
-          <w:b/>
-          <w:lang w:val="en-US"/>
-        </w:rPr>
-        <w:t xml:space="preserve">Capturing less: active reconstruction and identification.</w:t>
-      </w:r>
-      <w:r>
-        <w:rPr>
-          <w:rFonts w:cstheme="minorHAnsi"/>
-          <w:lang w:val="en-US"/>
-        </w:rPr>
-        <w:t xml:space="preserve"> Active view selection chooses the images that improve a reconstruction most: FisherRF [25] maximizes expected information gain on radiance-field parameters, and Bayes' Rays [26] estimates an uncertainty field for a trained radiance field. Risk-aware view acquisition [27] weights FisherRF by safety-critical regions, ASID [28] designs exploration that identifies physical parameters from little real data, and AREA3D [29] adds VLM guidance to active reconstruction. Their objective is reconstruction quality, safe exploration or parameter accuracy, not the success of a policy fine-tuned in the twin; we found at most two task-aware capture papers a year in 2023–2026. ScanNet++ [30] pairs laser scans and DSLR images with a separate phone stream, so budgets can be varied offline.</w:t>
-      </w:r>
-    </w:p>
-    <w:p>
-      <w:pPr>
-        <w:spacing w:after="120" w:line="240" w:lineRule="auto"/>
-        <w:jc w:val="both"/>
-      </w:pPr>
-      <w:r>
-        <w:rPr>
-          <w:rFonts w:cstheme="minorHAnsi"/>
-          <w:b/>
-          <w:lang w:val="en-US"/>
-        </w:rPr>
-        <w:t xml:space="preserve">Learning in an imperfect twin, and collecting few real data.</w:t>
-      </w:r>
-      <w:r>
-        <w:rPr>
-          <w:rFonts w:cstheme="minorHAnsi"/>
-          <w:lang w:val="en-US"/>
-        </w:rPr>
-        <w:t xml:space="preserve"> Domain randomization varies appearance</w:t>
+        <w:t xml:space="preserve">[1] M. Savva et al., "Habitat," ICCV, 2019.</w:t>
       </w:r>
     </w:p>
     <w:p>
@@ -5067,56 +4979,7 @@
           <w:rFonts w:cstheme="minorHAnsi"/>
           <w:lang w:val="en-US"/>
         </w:rPr>
-        <w:t xml:space="preserve">[31] or dynamics [32] uniformly within hand-set ranges; frozen encoders (DINOv2 [33]) make twin and real</w:t>
-      </w:r>
-    </w:p>
-    <w:p>
-      <w:pPr>
-        <w:spacing w:after="120" w:line="240" w:lineRule="auto"/>
-        <w:jc w:val="both"/>
-      </w:pPr>
-      <w:r>
-        <w:rPr>
-          <w:rFonts w:cstheme="minorHAnsi"/>
-          <w:lang w:val="en-US"/>
-        </w:rPr>
-        <w:t xml:space="preserve">samples comparable. A twin's own reconstruction uncertainty is rarely used as a training signal, and we found no world model aimed at the regions where the twin is uncertain. On the real side, prediction-powered inference [34] combines many cheap predictions with a few labels, and SIMPLER [35] shows on paired simulated and real evaluations that simulation can track the real performance of manipulation policies. TwinRL picks failure-prone configurations for the policy, and VLAW corrects the world model with rollouts that are not selected; neither selects the few real trials by the joint uncertainty of twin, world model and policy under a counted budget.</w:t>
-      </w:r>
-    </w:p>
-    <w:p>
-      <w:pPr>
-        <w:spacing w:after="120" w:line="240" w:lineRule="auto"/>
-        <w:jc w:val="both"/>
-      </w:pPr>
-      <w:r>
-        <w:rPr>
-          <w:rFonts w:cstheme="minorHAnsi"/>
-          <w:b/>
-          <w:lang w:val="en-US"/>
-        </w:rPr>
-        <w:t xml:space="preserve">Research gap.</w:t>
-      </w:r>
-      <w:r>
-        <w:rPr>
-          <w:rFonts w:cstheme="minorHAnsi"/>
-          <w:lang w:val="en-US"/>
-        </w:rPr>
-        <w:t xml:space="preserve"> Real-to-sim-to-real fine-tuning of VLAs works, but its real-data cost is set by hand, spent uniformly and measured in one domain per study. Missing is one method that allocates it actively at every step: (i) VLM-guided, task-aware capture of appearance and physical parameters, judged by task success (RQ1); (ii) fine-tuning in the twin and in a world model grounded in the twin, driven by the twin's uncertainty (RQ2); (iii) active selection of the few real data that correct twin, world model and VLA (RQ3); and (iv) evidence that it needs less real data than real-only fine-tuning of the same VLA and the strongest existing twin pipeline, measured the same way in manipulation and navigation (RQ4).</w:t>
-      </w:r>
-    </w:p>
-    <w:p>
-      <w:pPr>
-        <w:keepNext/>
-        <w:spacing w:after="60" w:line="240" w:lineRule="auto"/>
-        <w:jc w:val="left"/>
-      </w:pPr>
-      <w:r>
-        <w:rPr>
-          <w:rFonts w:cstheme="minorHAnsi"/>
-          <w:b/>
-          <w:lang w:val="en-US"/>
-        </w:rPr>
-        <w:t xml:space="preserve">References</w:t>
+        <w:t xml:space="preserve">[2] E. Wijmans et al., "DD-PPO," ICLR, 2020.</w:t>
       </w:r>
     </w:p>
     <w:p>
@@ -5130,7 +4993,7 @@
           <w:rFonts w:cstheme="minorHAnsi"/>
           <w:lang w:val="en-US"/>
         </w:rPr>
-        <w:t xml:space="preserve">[1] M. Savva et al., "Habitat," ICCV, 2019.</w:t>
+        <w:t xml:space="preserve">[3] A. Kadian et al., "Sim2Real Predictivity," IEEE RA-L, 2020.</w:t>
       </w:r>
     </w:p>
     <w:p>
@@ -5144,7 +5007,7 @@
           <w:rFonts w:cstheme="minorHAnsi"/>
           <w:lang w:val="en-US"/>
         </w:rPr>
-        <w:t xml:space="preserve">[2] B. Kerbl et al., "3D Gaussian Splatting," ACM TOG, 2023.</w:t>
+        <w:t xml:space="preserve">[4] J. Truong et al., "Rethinking Sim2Real," CoRL, 2022.</w:t>
       </w:r>
     </w:p>
     <w:p>
@@ -5158,7 +5021,7 @@
           <w:rFonts w:cstheme="minorHAnsi"/>
           <w:lang w:val="en-US"/>
         </w:rPr>
-        <w:t xml:space="preserve">[3] M. Torne et al., "Reconciling Reality through Simulation," RSS, 2024.</w:t>
+        <w:t xml:space="preserve">[5] J. Tobin et al., "Domain Randomization…," IROS, 2017.</w:t>
       </w:r>
     </w:p>
     <w:p>
@@ -5172,7 +5035,7 @@
           <w:rFonts w:cstheme="minorHAnsi"/>
           <w:lang w:val="en-US"/>
         </w:rPr>
-        <w:t xml:space="preserve">[4] M. N. Qureshi et al., "SplatSim," ICRA, 2025.</w:t>
+        <w:t xml:space="preserve">[6] X. B. Peng et al., "Sim-to-Real Transfer… with Dynamics Randomization," ICRA, 2018.</w:t>
       </w:r>
     </w:p>
     <w:p>
@@ -5186,7 +5049,7 @@
           <w:rFonts w:cstheme="minorHAnsi"/>
           <w:lang w:val="en-US"/>
         </w:rPr>
-        <w:t xml:space="preserve">[5] G. Chhablani et al., "EmbodiedSplat," ICCV, 2025.</w:t>
+        <w:t xml:space="preserve">[7] Y. Chebotar et al., "Closing the Sim-to-Real Loop," ICRA, 2019.</w:t>
       </w:r>
     </w:p>
     <w:p>
@@ -5200,7 +5063,7 @@
           <w:rFonts w:cstheme="minorHAnsi"/>
           <w:lang w:val="en-US"/>
         </w:rPr>
-        <w:t xml:space="preserve">[6] S. Tao et al., "ManiSkill3," RSS, 2025.</w:t>
+        <w:t xml:space="preserve">[8] L. Suomela et al., "Data Scaling for Navigation…," IEEE RA-L, 2026.</w:t>
       </w:r>
     </w:p>
     <w:p>
@@ -5214,7 +5077,7 @@
           <w:rFonts w:cstheme="minorHAnsi"/>
           <w:lang w:val="en-US"/>
         </w:rPr>
-        <w:t xml:space="preserve">[7] F. Ramos et al., "BayesSim," RSS, 2019.</w:t>
+        <w:t xml:space="preserve">[9] A. Maddukuri et al., "Sim-and-Real Co-Training," RSS, 2025.</w:t>
       </w:r>
     </w:p>
     <w:p>
@@ -5228,7 +5091,7 @@
           <w:rFonts w:cstheme="minorHAnsi"/>
           <w:lang w:val="en-US"/>
         </w:rPr>
-        <w:t xml:space="preserve">[8] M. J. Kim et al., "OpenVLA," CoRL, 2024.</w:t>
+        <w:t xml:space="preserve">[10] B. Kerbl et al., "3D Gaussian Splatting," ACM TOG, 2023.</w:t>
       </w:r>
     </w:p>
     <w:p>
@@ -5242,7 +5105,7 @@
           <w:rFonts w:cstheme="minorHAnsi"/>
           <w:lang w:val="en-US"/>
         </w:rPr>
-        <w:t xml:space="preserve">[9] K. Black et al., "π0," arXiv:2410.24164, 2024.</w:t>
+        <w:t xml:space="preserve">[11] G. Chhablani et al., "EmbodiedSplat," ICCV, 2025.</w:t>
       </w:r>
     </w:p>
     <w:p>
@@ -5256,7 +5119,7 @@
           <w:rFonts w:cstheme="minorHAnsi"/>
           <w:lang w:val="en-US"/>
         </w:rPr>
-        <w:t xml:space="preserve">[10] A.-C. Cheng et al., "NaVILA," arXiv:2412.04453, 2024.</w:t>
+        <w:t xml:space="preserve">[12] Z. Xie et al., "Vid2Sim," CVPR, 2025.</w:t>
       </w:r>
     </w:p>
     <w:p>
@@ -5270,7 +5133,7 @@
           <w:rFonts w:cstheme="minorHAnsi"/>
           <w:lang w:val="en-US"/>
         </w:rPr>
-        <w:t xml:space="preserve">[11] E. J. Hu et al., "LoRA," ICLR, 2022.</w:t>
+        <w:t xml:space="preserve">[13] A. Escontrela et al., "GaussGym," arXiv:2510.15352, 2025.</w:t>
       </w:r>
     </w:p>
     <w:p>
@@ -5284,7 +5147,7 @@
           <w:rFonts w:cstheme="minorHAnsi"/>
           <w:lang w:val="en-US"/>
         </w:rPr>
-        <w:t xml:space="preserve">[12] M. J. Kim, C. Finn, P. Liang, "Fine-Tuning Vision-Language-Action Models…," RSS, 2025.</w:t>
+        <w:t xml:space="preserve">[14] M. Torne et al., "Reconciling Reality through Simulation," RSS, 2024.</w:t>
       </w:r>
     </w:p>
     <w:p>
@@ -5298,7 +5161,7 @@
           <w:rFonts w:cstheme="minorHAnsi"/>
           <w:lang w:val="en-US"/>
         </w:rPr>
-        <w:t xml:space="preserve">[13] L. Suomela et al., "Data Scaling for Navigation…," IEEE RA-L, 2026.</w:t>
+        <w:t xml:space="preserve">[15] F. Ramos et al., "BayesSim," RSS, 2019.</w:t>
       </w:r>
     </w:p>
     <w:p>
@@ -5312,7 +5175,7 @@
           <w:rFonts w:cstheme="minorHAnsi"/>
           <w:lang w:val="en-US"/>
         </w:rPr>
-        <w:t xml:space="preserve">[14] A. Maddukuri et al., "Sim-and-Real Co-Training," RSS, 2025.</w:t>
+        <w:t xml:space="preserve">[16] C. Yeshwanth et al., "ScanNet++," ICCV, 2023.</w:t>
       </w:r>
     </w:p>
     <w:p>
@@ -5326,7 +5189,7 @@
           <w:rFonts w:cstheme="minorHAnsi"/>
           <w:lang w:val="en-US"/>
         </w:rPr>
-        <w:t xml:space="preserve">[15] H. Li et al., "SimpleVLA-RL," arXiv:2509.09674, 2025.</w:t>
+        <w:t xml:space="preserve">[17] W. Jiang et al., "FisherRF," ECCV, 2024.</w:t>
       </w:r>
     </w:p>
     <w:p>
@@ -5340,7 +5203,7 @@
           <w:rFonts w:cstheme="minorHAnsi"/>
           <w:lang w:val="en-US"/>
         </w:rPr>
-        <w:t xml:space="preserve">[16] J. Liu et al., "What Can RL Bring to VLA Generalization?," NeurIPS, 2025.</w:t>
+        <w:t xml:space="preserve">[18] L. Goli et al., "Bayes' Rays," CVPR, 2024.</w:t>
       </w:r>
     </w:p>
     <w:p>
@@ -5354,7 +5217,7 @@
           <w:rFonts w:cstheme="minorHAnsi"/>
           <w:lang w:val="en-US"/>
         </w:rPr>
-        <w:t xml:space="preserve">[17] Q. Xu et al., "TwinRL," arXiv:2602.09023, 2026.</w:t>
+        <w:t xml:space="preserve">[19] G. Liu et al., "Risk-Aware Active View Acquisition…," arXiv:2403.11396, 2024.</w:t>
       </w:r>
     </w:p>
     <w:p>
@@ -5368,7 +5231,7 @@
           <w:rFonts w:cstheme="minorHAnsi"/>
           <w:lang w:val="en-US"/>
         </w:rPr>
-        <w:t xml:space="preserve">[18] N. Agarwal et al., "Cosmos World Foundation Model Platform…," arXiv:2501.03575, 2025.</w:t>
+        <w:t xml:space="preserve">[20] T. Xu et al., "AREA3D," arXiv:2512.05131, 2025.</w:t>
       </w:r>
     </w:p>
     <w:p>
@@ -5382,7 +5245,7 @@
           <w:rFonts w:cstheme="minorHAnsi"/>
           <w:lang w:val="en-US"/>
         </w:rPr>
-        <w:t xml:space="preserve">[19] A. Bar et al., "Navigation World Models," CVPR, 2025.</w:t>
+        <w:t xml:space="preserve">[21] D. Shah et al., "GNM," ICRA, 2023.</w:t>
       </w:r>
     </w:p>
     <w:p>
@@ -5396,7 +5259,7 @@
           <w:rFonts w:cstheme="minorHAnsi"/>
           <w:lang w:val="en-US"/>
         </w:rPr>
-        <w:t xml:space="preserve">[20] F. Zhu et al., "WMPO," arXiv:2511.09515, 2025.</w:t>
+        <w:t xml:space="preserve">[22] D. Shah et al., "ViNT," CoRL, 2023.</w:t>
       </w:r>
     </w:p>
     <w:p>
@@ -5410,7 +5273,7 @@
           <w:rFonts w:cstheme="minorHAnsi"/>
           <w:lang w:val="en-US"/>
         </w:rPr>
-        <w:t xml:space="preserve">[21] Y. Guo et al., "VLAW," arXiv:2602.12063, 2026.</w:t>
+        <w:t xml:space="preserve">[23] M. J. Kim et al., "OpenVLA," CoRL, 2024.</w:t>
       </w:r>
     </w:p>
     <w:p>
@@ -5424,7 +5287,7 @@
           <w:rFonts w:cstheme="minorHAnsi"/>
           <w:lang w:val="en-US"/>
         </w:rPr>
-        <w:t xml:space="preserve">[22] GigaWorld Team, "GigaWorld-0," arXiv:2511.19861, 2025.</w:t>
+        <w:t xml:space="preserve">[24] A.-C. Cheng et al., "NaVILA," arXiv:2412.04453, 2024.</w:t>
       </w:r>
     </w:p>
     <w:p>
@@ -5438,7 +5301,7 @@
           <w:rFonts w:cstheme="minorHAnsi"/>
           <w:lang w:val="en-US"/>
         </w:rPr>
-        <w:t xml:space="preserve">[23] S. Bai et al., "Qwen2.5-VL Technical Report," arXiv:2502.13923, 2025.</w:t>
+        <w:t xml:space="preserve">[25] A. Bar et al., "Navigation World Models," CVPR, 2025.</w:t>
       </w:r>
     </w:p>
     <w:p>
@@ -5452,7 +5315,7 @@
           <w:rFonts w:cstheme="minorHAnsi"/>
           <w:lang w:val="en-US"/>
         </w:rPr>
-        <w:t xml:space="preserve">[24] Y. Du et al., "Vision-Language Models as Success Detectors," CoLLAs, 2023.</w:t>
+        <w:t xml:space="preserve">[26] N. Agarwal et al., "Cosmos World Foundation Model Platform…," arXiv:2501.03575, 2025.</w:t>
       </w:r>
     </w:p>
     <w:p>
@@ -5466,7 +5329,7 @@
           <w:rFonts w:cstheme="minorHAnsi"/>
           <w:lang w:val="en-US"/>
         </w:rPr>
-        <w:t xml:space="preserve">[25] W. Jiang et al., "FisherRF," ECCV, 2024.</w:t>
+        <w:t xml:space="preserve">[27] Q. Xu et al., "TwinRL," arXiv:2602.09023, 2026.</w:t>
       </w:r>
     </w:p>
     <w:p>
@@ -5480,7 +5343,7 @@
           <w:rFonts w:cstheme="minorHAnsi"/>
           <w:lang w:val="en-US"/>
         </w:rPr>
-        <w:t xml:space="preserve">[26] L. Goli et al., "Bayes' Rays," CVPR, 2024.</w:t>
+        <w:t xml:space="preserve">[28] Y. Guo et al., "VLAW," arXiv:2602.12063, 2026.</w:t>
       </w:r>
     </w:p>
     <w:p>
@@ -5494,7 +5357,7 @@
           <w:rFonts w:cstheme="minorHAnsi"/>
           <w:lang w:val="en-US"/>
         </w:rPr>
-        <w:t xml:space="preserve">[27] G. Liu et al., "Risk-Aware Active View Acquisition…," arXiv:2403.11396, 2024.</w:t>
+        <w:t xml:space="preserve">[29] M. Oquab et al., "DINOv2," TMLR, 2024.</w:t>
       </w:r>
     </w:p>
     <w:p>
@@ -5508,105 +5371,7 @@
           <w:rFonts w:cstheme="minorHAnsi"/>
           <w:lang w:val="en-US"/>
         </w:rPr>
-        <w:t xml:space="preserve">[28] M. Memmel et al., "ASID," arXiv:2404.12308, 2024.</w:t>
-      </w:r>
-    </w:p>
-    <w:p>
-      <w:pPr>
-        <w:spacing w:after="0" w:line="240" w:lineRule="auto"/>
-        <w:ind w:left="397" w:hanging="397"/>
-        <w:jc w:val="left"/>
-      </w:pPr>
-      <w:r>
-        <w:rPr>
-          <w:rFonts w:cstheme="minorHAnsi"/>
-          <w:lang w:val="en-US"/>
-        </w:rPr>
-        <w:t xml:space="preserve">[29] T. Xu et al., "AREA3D," arXiv:2512.05131, 2025.</w:t>
-      </w:r>
-    </w:p>
-    <w:p>
-      <w:pPr>
-        <w:spacing w:after="0" w:line="240" w:lineRule="auto"/>
-        <w:ind w:left="397" w:hanging="397"/>
-        <w:jc w:val="left"/>
-      </w:pPr>
-      <w:r>
-        <w:rPr>
-          <w:rFonts w:cstheme="minorHAnsi"/>
-          <w:lang w:val="en-US"/>
-        </w:rPr>
-        <w:t xml:space="preserve">[30] C. Yeshwanth et al., "ScanNet++," ICCV, 2023.</w:t>
-      </w:r>
-    </w:p>
-    <w:p>
-      <w:pPr>
-        <w:spacing w:after="0" w:line="240" w:lineRule="auto"/>
-        <w:ind w:left="397" w:hanging="397"/>
-        <w:jc w:val="left"/>
-      </w:pPr>
-      <w:r>
-        <w:rPr>
-          <w:rFonts w:cstheme="minorHAnsi"/>
-          <w:lang w:val="en-US"/>
-        </w:rPr>
-        <w:t xml:space="preserve">[31] J. Tobin et al., "Domain Randomization…," IROS, 2017.</w:t>
-      </w:r>
-    </w:p>
-    <w:p>
-      <w:pPr>
-        <w:spacing w:after="0" w:line="240" w:lineRule="auto"/>
-        <w:ind w:left="397" w:hanging="397"/>
-        <w:jc w:val="left"/>
-      </w:pPr>
-      <w:r>
-        <w:rPr>
-          <w:rFonts w:cstheme="minorHAnsi"/>
-          <w:lang w:val="en-US"/>
-        </w:rPr>
-        <w:t xml:space="preserve">[32] X. B. Peng et al., "Sim-to-Real Transfer… with Dynamics Randomization," ICRA, 2018.</w:t>
-      </w:r>
-    </w:p>
-    <w:p>
-      <w:pPr>
-        <w:spacing w:after="0" w:line="240" w:lineRule="auto"/>
-        <w:ind w:left="397" w:hanging="397"/>
-        <w:jc w:val="left"/>
-      </w:pPr>
-      <w:r>
-        <w:rPr>
-          <w:rFonts w:cstheme="minorHAnsi"/>
-          <w:lang w:val="en-US"/>
-        </w:rPr>
-        <w:t xml:space="preserve">[33] M. Oquab et al., "DINOv2," TMLR, 2024.</w:t>
-      </w:r>
-    </w:p>
-    <w:p>
-      <w:pPr>
-        <w:spacing w:after="0" w:line="240" w:lineRule="auto"/>
-        <w:ind w:left="397" w:hanging="397"/>
-        <w:jc w:val="left"/>
-      </w:pPr>
-      <w:r>
-        <w:rPr>
-          <w:rFonts w:cstheme="minorHAnsi"/>
-          <w:lang w:val="en-US"/>
-        </w:rPr>
-        <w:t xml:space="preserve">[34] A. N. Angelopoulos et al., "Prediction-Powered Inference," Science, 2023.</w:t>
-      </w:r>
-    </w:p>
-    <w:p>
-      <w:pPr>
-        <w:spacing w:after="0" w:line="240" w:lineRule="auto"/>
-        <w:ind w:left="397" w:hanging="397"/>
-        <w:jc w:val="left"/>
-      </w:pPr>
-      <w:r>
-        <w:rPr>
-          <w:rFonts w:cstheme="minorHAnsi"/>
-          <w:lang w:val="en-US"/>
-        </w:rPr>
-        <w:t xml:space="preserve">[35] X. Li et al., "Evaluating Real-World Robot Manipulation Policies…," CoRL, 2024.</w:t>
+        <w:t xml:space="preserve">[30] A. N. Angelopoulos et al., "Prediction-Powered Inference," Science, 2023.</w:t>
       </w:r>
     </w:p>
     <w:permEnd w:id="174659581"/>
@@ -5841,29 +5606,29 @@
           <w:b/>
           <w:lang w:val="en-US"/>
         </w:rPr>
-        <w:t xml:space="preserve">Goal and thesis.</w:t>
-      </w:r>
-      <w:r>
-        <w:rPr>
-          <w:rFonts w:cstheme="minorHAnsi"/>
-          <w:lang w:val="en-US"/>
-        </w:rPr>
-        <w:t xml:space="preserve"> The goal is </w:t>
-      </w:r>
-      <w:r>
-        <w:rPr>
-          <w:rFonts w:cstheme="minorHAnsi"/>
-          <w:b/>
-          <w:lang w:val="en-US"/>
-        </w:rPr>
-        <w:t xml:space="preserve">a method</w:t>
-      </w:r>
-      <w:r>
-        <w:rPr>
-          <w:rFonts w:cstheme="minorHAnsi"/>
-          <w:lang w:val="en-US"/>
-        </w:rPr>
-        <w:t xml:space="preserve"> for learning in the real-to-sim-to-real loop that reaches a given real-world performance with </w:t>
+        <w:t xml:space="preserve">Goal.</w:t>
+      </w:r>
+      <w:r>
+        <w:rPr>
+          <w:rFonts w:cstheme="minorHAnsi"/>
+          <w:lang w:val="en-US"/>
+        </w:rPr>
+        <w:t xml:space="preserve"> To develop a method for real-to-sim-to-real learning of </w:t>
+      </w:r>
+      <w:r>
+        <w:rPr>
+          <w:rFonts w:cstheme="minorHAnsi"/>
+          <w:b/>
+          <w:lang w:val="en-US"/>
+        </w:rPr>
+        <w:t xml:space="preserve">navigation models</w:t>
+      </w:r>
+      <w:r>
+        <w:rPr>
+          <w:rFonts w:cstheme="minorHAnsi"/>
+          <w:lang w:val="en-US"/>
+        </w:rPr>
+        <w:t xml:space="preserve"> for indoor mobile robots that reaches a given real-world navigation performance with </w:t>
       </w:r>
       <w:r>
         <w:rPr>
@@ -5878,37 +5643,7 @@
           <w:rFonts w:cstheme="minorHAnsi"/>
           <w:lang w:val="en-US"/>
         </w:rPr>
-        <w:t xml:space="preserve"> than existing approaches: a pretrained open </w:t>
-      </w:r>
-      <w:r>
-        <w:rPr>
-          <w:rFonts w:cstheme="minorHAnsi"/>
-          <w:b/>
-          <w:lang w:val="en-US"/>
-        </w:rPr>
-        <w:t xml:space="preserve">vision-language-action (VLA) model</w:t>
-      </w:r>
-      <w:r>
-        <w:rPr>
-          <w:rFonts w:cstheme="minorHAnsi"/>
-          <w:lang w:val="en-US"/>
-        </w:rPr>
-        <w:t xml:space="preserve"> fine-tuned sim-first in a digital twin, with one component per loop step: (C1) capture guided by a vision-language model (VLM) to the task-relevant parts of the twin where it is most uncertain; (C2) uncertainty-aware, parameter-efficient fine-tuning in the twin and in a </w:t>
-      </w:r>
-      <w:r>
-        <w:rPr>
-          <w:rFonts w:cstheme="minorHAnsi"/>
-          <w:b/>
-          <w:lang w:val="en-US"/>
-        </w:rPr>
-        <w:t xml:space="preserve">world model grounded in the twin</w:t>
-      </w:r>
-      <w:r>
-        <w:rPr>
-          <w:rFonts w:cstheme="minorHAnsi"/>
-          <w:lang w:val="en-US"/>
-        </w:rPr>
-        <w:t xml:space="preserve"> that covers the twin's uncertain regions; (C3) active selection of a few real data to correct twin, world model and VLA. Thesis = H4; H1–H3 = component ablations. Testbeds (equal status): robotic manipulation and visual navigation.</w:t>
+        <w:t xml:space="preserve"> than existing approaches. The method has three stages: (1) transfer of real-world data into a digital twin, (2) training navigation models in the twin, extended with learned world models and pretrained foundation models, and (3) transfer back to reality, where a small amount of real data corrects the twin and the model.</w:t>
       </w:r>
     </w:p>
     <w:p>
@@ -5922,29 +5657,14 @@
           <w:b/>
           <w:lang w:val="en-US"/>
         </w:rPr>
-        <w:t xml:space="preserve">Tier A protocol (proxy reality).</w:t>
-      </w:r>
-      <w:r>
-        <w:rPr>
-          <w:rFonts w:cstheme="minorHAnsi"/>
-          <w:lang w:val="en-US"/>
-        </w:rPr>
-        <w:t xml:space="preserve"> In each testbed a </w:t>
-      </w:r>
-      <w:r>
-        <w:rPr>
-          <w:rFonts w:cstheme="minorHAnsi"/>
-          <w:b/>
-          <w:lang w:val="en-US"/>
-        </w:rPr>
-        <w:t xml:space="preserve">reference from a separate, higher-fidelity source plays "reality"</w:t>
-      </w:r>
-      <w:r>
-        <w:rPr>
-          <w:rFonts w:cstheme="minorHAnsi"/>
-          <w:lang w:val="en-US"/>
-        </w:rPr>
-        <w:t xml:space="preserve">, and the twin (neural reconstruction + system identification) is built from a subset of a separate, cheaper capture, sharing no data. Navigation: ≥ 20 public indoor scenes (10 held out), laser-scan and DSLR reference, twin from the phone capture. Manipulation: a physics simulator with held-out physical parameters and its own rendering (the weaker proxy; tier B, published paired sim/real evaluations of open robot policies, checks it). Real data (capture = views and interaction samples; trials and demonstrations = episodes in the reference) is summed in one operator-time cost. P = task success rate in the reference. Tier A decides H1–H4; tiers B and C (real robot) report agreement. Tests: one-sided, α = 0.05, scene/seed bootstrap, Holm correction, pre-registered.</w:t>
+        <w:t xml:space="preserve">Thesis.</w:t>
+      </w:r>
+      <w:r>
+        <w:rPr>
+          <w:rFonts w:cstheme="minorHAnsi"/>
+          <w:lang w:val="en-US"/>
+        </w:rPr>
+        <w:t xml:space="preserve"> Deciding at every stage which real data to acquire and where the twin can be trusted makes the whole real-to-sim-to-real pipeline for navigation at least twice as economical in real data as existing real-to-sim-to-real approaches.</w:t>
       </w:r>
     </w:p>
     <w:p>
@@ -5958,14 +5678,14 @@
           <w:b/>
           <w:lang w:val="en-US"/>
         </w:rPr>
-        <w:t xml:space="preserve">RQ1 (C1: capture less).</w:t>
-      </w:r>
-      <w:r>
-        <w:rPr>
-          <w:rFonts w:cstheme="minorHAnsi"/>
-          <w:lang w:val="en-US"/>
-        </w:rPr>
-        <w:t xml:space="preserve"> How little capture does a twin need, and can the task guide it?</w:t>
+        <w:t xml:space="preserve">How the hypotheses are decided.</w:t>
+      </w:r>
+      <w:r>
+        <w:rPr>
+          <w:rFonts w:cstheme="minorHAnsi"/>
+          <w:lang w:val="en-US"/>
+        </w:rPr>
+        <w:t xml:space="preserve"> P is the navigation success rate in "reality". Real data (capture for the twin and real navigation trials) is counted in one operator-time cost. The hypotheses are decided on a non-circular proxy reality built from public scans of real buildings, in which "reality" and the twin come from separate captures; a real robot validates the direction of the results. Tests, confidence bounds and scene counts are given in §9.</w:t>
       </w:r>
     </w:p>
     <w:p>
@@ -5979,29 +5699,14 @@
           <w:b/>
           <w:lang w:val="en-US"/>
         </w:rPr>
-        <w:t xml:space="preserve">H1.</w:t>
-      </w:r>
-      <w:r>
-        <w:rPr>
-          <w:rFonts w:cstheme="minorHAnsi"/>
-          <w:lang w:val="en-US"/>
-        </w:rPr>
-        <w:t xml:space="preserve"> C1 reaches the P of uniform capture with ≥ 40% less capture. </w:t>
-      </w:r>
-      <w:r>
-        <w:rPr>
-          <w:rFonts w:cstheme="minorHAnsi"/>
-          <w:i/>
-          <w:lang w:val="en-US"/>
-        </w:rPr>
-        <w:t xml:space="preserve">Decision:</w:t>
-      </w:r>
-      <w:r>
-        <w:rPr>
-          <w:rFonts w:cstheme="minorHAnsi"/>
-          <w:lang w:val="en-US"/>
-        </w:rPr>
-        <w:t xml:space="preserve"> on fitted capture–P curves, C_task(τ₁) ≤ 0.6 · C_uniform(τ₁), and the upper 95% bound of C_task / C_recon (task-blind uncertainty selection) is &lt; 1; τ₁ = P of uniform capture at its largest budget.</w:t>
+        <w:t xml:space="preserve">RQ1 (stage 1: real data → twin).</w:t>
+      </w:r>
+      <w:r>
+        <w:rPr>
+          <w:rFonts w:cstheme="minorHAnsi"/>
+          <w:lang w:val="en-US"/>
+        </w:rPr>
+        <w:t xml:space="preserve"> Which real data is worth acquiring to build a twin for navigation?</w:t>
       </w:r>
     </w:p>
     <w:p>
@@ -6015,14 +5720,29 @@
           <w:b/>
           <w:lang w:val="en-US"/>
         </w:rPr>
-        <w:t xml:space="preserve">RQ2 (C2: learn in an imperfect twin).</w:t>
-      </w:r>
-      <w:r>
-        <w:rPr>
-          <w:rFonts w:cstheme="minorHAnsi"/>
-          <w:lang w:val="en-US"/>
-        </w:rPr>
-        <w:t xml:space="preserve"> How can fine-tuning be robust to the twin's errors?</w:t>
+        <w:t xml:space="preserve">H1.</w:t>
+      </w:r>
+      <w:r>
+        <w:rPr>
+          <w:rFonts w:cstheme="minorHAnsi"/>
+          <w:lang w:val="en-US"/>
+        </w:rPr>
+        <w:t xml:space="preserve"> Capture guided by what matters for the navigation task and by where the twin is uncertain reaches the P of uniform capture with </w:t>
+      </w:r>
+      <w:r>
+        <w:rPr>
+          <w:rFonts w:cstheme="minorHAnsi"/>
+          <w:b/>
+          <w:lang w:val="en-US"/>
+        </w:rPr>
+        <w:t xml:space="preserve">at least 40% less capture</w:t>
+      </w:r>
+      <w:r>
+        <w:rPr>
+          <w:rFonts w:cstheme="minorHAnsi"/>
+          <w:lang w:val="en-US"/>
+        </w:rPr>
+        <w:t xml:space="preserve">.</w:t>
       </w:r>
     </w:p>
     <w:p>
@@ -6036,29 +5756,14 @@
           <w:b/>
           <w:lang w:val="en-US"/>
         </w:rPr>
-        <w:t xml:space="preserve">H2.</w:t>
-      </w:r>
-      <w:r>
-        <w:rPr>
-          <w:rFonts w:cstheme="minorHAnsi"/>
-          <w:lang w:val="en-US"/>
-        </w:rPr>
-        <w:t xml:space="preserve"> At an equal capture budget, (a) C2 (augmentation and sample weights from the twin's uncertainty and the representation distance to a few held-out real samples) beats uniform domain randomization, and (b) twin + world model beats twin only. </w:t>
-      </w:r>
-      <w:r>
-        <w:rPr>
-          <w:rFonts w:cstheme="minorHAnsi"/>
-          <w:i/>
-          <w:lang w:val="en-US"/>
-        </w:rPr>
-        <w:t xml:space="preserve">Decision:</w:t>
-      </w:r>
-      <w:r>
-        <w:rPr>
-          <w:rFonts w:cstheme="minorHAnsi"/>
-          <w:lang w:val="en-US"/>
-        </w:rPr>
-        <w:t xml:space="preserve"> (a) mean paired P gain ≥ 10 pp on held-out scenes, lower 95% bound &gt; 0; (b) lower 95% bound of the paired gain &gt; 0; both at each of ≥ 2 capture budgets.</w:t>
+        <w:t xml:space="preserve">RQ2 (stage 2: learning in the twin).</w:t>
+      </w:r>
+      <w:r>
+        <w:rPr>
+          <w:rFonts w:cstheme="minorHAnsi"/>
+          <w:lang w:val="en-US"/>
+        </w:rPr>
+        <w:t xml:space="preserve"> How should navigation models be trained in an imperfect twin?</w:t>
       </w:r>
     </w:p>
     <w:p>
@@ -6072,14 +5777,29 @@
           <w:b/>
           <w:lang w:val="en-US"/>
         </w:rPr>
-        <w:t xml:space="preserve">RQ3 (C3: few real data).</w:t>
-      </w:r>
-      <w:r>
-        <w:rPr>
-          <w:rFonts w:cstheme="minorHAnsi"/>
-          <w:lang w:val="en-US"/>
-        </w:rPr>
-        <w:t xml:space="preserve"> Which few real data close the gap?</w:t>
+        <w:t xml:space="preserve">H2.</w:t>
+      </w:r>
+      <w:r>
+        <w:rPr>
+          <w:rFonts w:cstheme="minorHAnsi"/>
+          <w:lang w:val="en-US"/>
+        </w:rPr>
+        <w:t xml:space="preserve"> At the same real-data budget, training that follows the twin's uncertainty, with the twin extended by a learned world model, gives a P </w:t>
+      </w:r>
+      <w:r>
+        <w:rPr>
+          <w:rFonts w:cstheme="minorHAnsi"/>
+          <w:b/>
+          <w:lang w:val="en-US"/>
+        </w:rPr>
+        <w:t xml:space="preserve">at least 10 percentage points higher</w:t>
+      </w:r>
+      <w:r>
+        <w:rPr>
+          <w:rFonts w:cstheme="minorHAnsi"/>
+          <w:lang w:val="en-US"/>
+        </w:rPr>
+        <w:t xml:space="preserve"> than training with uniform domain randomization.</w:t>
       </w:r>
     </w:p>
     <w:p>
@@ -6093,29 +5813,14 @@
           <w:b/>
           <w:lang w:val="en-US"/>
         </w:rPr>
-        <w:t xml:space="preserve">H3.</w:t>
-      </w:r>
-      <w:r>
-        <w:rPr>
-          <w:rFonts w:cstheme="minorHAnsi"/>
-          <w:lang w:val="en-US"/>
-        </w:rPr>
-        <w:t xml:space="preserve"> C3 (trials selected by the gap predicted from twin, world model and VLA uncertainty) reaches the target P with ≥ 50% fewer trials than random selection. </w:t>
-      </w:r>
-      <w:r>
-        <w:rPr>
-          <w:rFonts w:cstheme="minorHAnsi"/>
-          <w:i/>
-          <w:lang w:val="en-US"/>
-        </w:rPr>
-        <w:t xml:space="preserve">Decision:</w:t>
-      </w:r>
-      <w:r>
-        <w:rPr>
-          <w:rFonts w:cstheme="minorHAnsi"/>
-          <w:lang w:val="en-US"/>
-        </w:rPr>
-        <w:t xml:space="preserve"> N_active(τ₃) ≤ 0.5 · N_random(τ₃) on fitted trial–P curves, upper 95% bound of the ratio &lt; 1; τ₃ = P of random selection at its largest budget.</w:t>
+        <w:t xml:space="preserve">RQ3 (stage 3: twin → reality).</w:t>
+      </w:r>
+      <w:r>
+        <w:rPr>
+          <w:rFonts w:cstheme="minorHAnsi"/>
+          <w:lang w:val="en-US"/>
+        </w:rPr>
+        <w:t xml:space="preserve"> Which few real data correct the twin and the model best?</w:t>
       </w:r>
     </w:p>
     <w:p>
@@ -6129,14 +5834,29 @@
           <w:b/>
           <w:lang w:val="en-US"/>
         </w:rPr>
-        <w:t xml:space="preserve">RQ4 (the whole method).</w:t>
-      </w:r>
-      <w:r>
-        <w:rPr>
-          <w:rFonts w:cstheme="minorHAnsi"/>
-          <w:lang w:val="en-US"/>
-        </w:rPr>
-        <w:t xml:space="preserve"> How much real data does the method need versus the alternatives?</w:t>
+        <w:t xml:space="preserve">H3.</w:t>
+      </w:r>
+      <w:r>
+        <w:rPr>
+          <w:rFonts w:cstheme="minorHAnsi"/>
+          <w:lang w:val="en-US"/>
+        </w:rPr>
+        <w:t xml:space="preserve"> Real trials selected by the predicted twin-to-reality gap reach the target P with </w:t>
+      </w:r>
+      <w:r>
+        <w:rPr>
+          <w:rFonts w:cstheme="minorHAnsi"/>
+          <w:b/>
+          <w:lang w:val="en-US"/>
+        </w:rPr>
+        <w:t xml:space="preserve">at least 50% fewer trials</w:t>
+      </w:r>
+      <w:r>
+        <w:rPr>
+          <w:rFonts w:cstheme="minorHAnsi"/>
+          <w:lang w:val="en-US"/>
+        </w:rPr>
+        <w:t xml:space="preserve"> than randomly selected trials.</w:t>
       </w:r>
     </w:p>
     <w:p>
@@ -6150,6 +5870,27 @@
           <w:b/>
           <w:lang w:val="en-US"/>
         </w:rPr>
+        <w:t xml:space="preserve">RQ4 (the whole pipeline).</w:t>
+      </w:r>
+      <w:r>
+        <w:rPr>
+          <w:rFonts w:cstheme="minorHAnsi"/>
+          <w:lang w:val="en-US"/>
+        </w:rPr>
+        <w:t xml:space="preserve"> How much real data does the method need compared with the alternatives?</w:t>
+      </w:r>
+    </w:p>
+    <w:p>
+      <w:pPr>
+        <w:spacing w:after="120" w:line="240" w:lineRule="auto"/>
+        <w:jc w:val="both"/>
+      </w:pPr>
+      <w:r>
+        <w:rPr>
+          <w:rFonts w:cstheme="minorHAnsi"/>
+          <w:b/>
+          <w:lang w:val="en-US"/>
+        </w:rPr>
         <w:t xml:space="preserve">H4 (thesis).</w:t>
       </w:r>
       <w:r>
@@ -6157,22 +5898,22 @@
           <w:rFonts w:cstheme="minorHAnsi"/>
           <w:lang w:val="en-US"/>
         </w:rPr>
-        <w:t xml:space="preserve"> In each testbed, with C1–C3 and their hyperparameters unchanged, the method reaches the target P with (a) ≤ 10% of the real data of fine-tuning the same VLA on real data only and (b) ≥ 2× less real data than the strongest existing twin fine-tuning pipeline for VLAs (uniform capture, domain randomization, RL fine-tuning in the twin, random or failure-driven real trials). </w:t>
-      </w:r>
-      <w:r>
-        <w:rPr>
-          <w:rFonts w:cstheme="minorHAnsi"/>
-          <w:i/>
-          <w:lang w:val="en-US"/>
-        </w:rPr>
-        <w:t xml:space="preserve">Decision:</w:t>
-      </w:r>
-      <w:r>
-        <w:rPr>
-          <w:rFonts w:cstheme="minorHAnsi"/>
-          <w:lang w:val="en-US"/>
-        </w:rPr>
-        <w:t xml:space="preserve"> (a) B_M(τ₄) ≤ 0.1 · B_real(τ₄), upper 95% bound of the ratio &lt; 0.2; (b) B_M(τ₅) ≤ 0.5 · B_pipe(τ₅), upper 95% bound &lt; 1; τ₄, τ₅ = P of each comparator at its largest budget; H1–H3 effects keep their sign and tier B agrees in direction.</w:t>
+        <w:t xml:space="preserve"> The whole method reaches the target P with </w:t>
+      </w:r>
+      <w:r>
+        <w:rPr>
+          <w:rFonts w:cstheme="minorHAnsi"/>
+          <w:b/>
+          <w:lang w:val="en-US"/>
+        </w:rPr>
+        <w:t xml:space="preserve">at least 2× less real data</w:t>
+      </w:r>
+      <w:r>
+        <w:rPr>
+          <w:rFonts w:cstheme="minorHAnsi"/>
+          <w:lang w:val="en-US"/>
+        </w:rPr>
+        <w:t xml:space="preserve"> than the strongest existing real-to-sim-to-real approach; learning from real data only is reported for reference.</w:t>
       </w:r>
     </w:p>
     <w:p>
@@ -6185,7 +5926,7 @@
           <w:rFonts w:cstheme="minorHAnsi"/>
           <w:lang w:val="en-US"/>
         </w:rPr>
-        <w:t xml:space="preserve">A hypothesis holds when all its parts pass; a failed one is reported as a curve.</w:t>
+        <w:t xml:space="preserve">A hypothesis that fails is reported as a measured curve, which still answers its question.</w:t>
       </w:r>
     </w:p>
     <w:permEnd w:id="1295260508"/>
@@ -6495,37 +6236,22 @@
           <w:rFonts w:cstheme="minorHAnsi"/>
           <w:lang w:val="en-US"/>
         </w:rPr>
-        <w:t xml:space="preserve">), area machine learning. Its object is the task- and domain-agnostic </w:t>
-      </w:r>
-      <w:r>
-        <w:rPr>
-          <w:rFonts w:cstheme="minorHAnsi"/>
-          <w:b/>
-          <w:lang w:val="en-US"/>
-        </w:rPr>
-        <w:t xml:space="preserve">real-to-sim-to-real learning loop</w:t>
-      </w:r>
-      <w:r>
-        <w:rPr>
-          <w:rFonts w:cstheme="minorHAnsi"/>
-          <w:lang w:val="en-US"/>
-        </w:rPr>
-        <w:t xml:space="preserve">: building a digital twin (appearance, geometry and, where relevant, physical parameters) from limited real data, fine-tuning a policy (here a pretrained VLA) in it and transferring the result back to reality; it develops a method that makes this loop work with </w:t>
-      </w:r>
-      <w:r>
-        <w:rPr>
-          <w:rFonts w:cstheme="minorHAnsi"/>
-          <w:b/>
-          <w:lang w:val="en-US"/>
-        </w:rPr>
-        <w:t xml:space="preserve">less real data</w:t>
-      </w:r>
-      <w:r>
-        <w:rPr>
-          <w:rFonts w:cstheme="minorHAnsi"/>
-          <w:lang w:val="en-US"/>
-        </w:rPr>
-        <w:t xml:space="preserve">. Building twins, world models, simulators or benchmarks, training foundation models from scratch, control design and mechanical engineering are not the object of the research; the student uses existing tools, open models and public data.</w:t>
+        <w:t xml:space="preserve">), area machine learning. Its object is the </w:t>
+      </w:r>
+      <w:r>
+        <w:rPr>
+          <w:rFonts w:cstheme="minorHAnsi"/>
+          <w:b/>
+          <w:lang w:val="en-US"/>
+        </w:rPr>
+        <w:t xml:space="preserve">real-to-sim-to-real pipeline for navigation models</w:t>
+      </w:r>
+      <w:r>
+        <w:rPr>
+          <w:rFonts w:cstheme="minorHAnsi"/>
+          <w:lang w:val="en-US"/>
+        </w:rPr>
+        <w:t xml:space="preserve">: transferring real-world data into a digital twin, training navigation models in it and transferring them back to reality. Building simulators, world models, foundation models or benchmarks from scratch, control design and mechanical engineering are not the object of the research; the student uses existing tools, pretrained models and public data.</w:t>
       </w:r>
     </w:p>
     <w:p>
@@ -6546,22 +6272,22 @@
           <w:rFonts w:cstheme="minorHAnsi"/>
           <w:lang w:val="en-US"/>
         </w:rPr>
-        <w:t xml:space="preserve"> To our knowledge, the first method for real-to-sim-to-real learning that treats the real data of the whole loop as </w:t>
-      </w:r>
-      <w:r>
-        <w:rPr>
-          <w:rFonts w:cstheme="minorHAnsi"/>
-          <w:b/>
-          <w:lang w:val="en-US"/>
-        </w:rPr>
-        <w:t xml:space="preserve">one budget allocated actively at every step</w:t>
-      </w:r>
-      <w:r>
-        <w:rPr>
-          <w:rFonts w:cstheme="minorHAnsi"/>
-          <w:lang w:val="en-US"/>
-        </w:rPr>
-        <w:t xml:space="preserve"> when a pretrained open vision-language-action (VLA) model is fine-tuned sim-first in a digital twin and in a world model grounded in it. It targets a given real-world performance with at most a tenth of the real data of real-only fine-tuning of the same VLA and at least two times less than the strongest existing twin fine-tuning pipeline (RQ4, H4), with the same settings in robotic manipulation and visual navigation. Fine-tuning VLAs in simulation and in world models is not new; spending the loop's real data where it matters is. The three components are parts of this one method, each tested as an ablation at its own step:</w:t>
+        <w:t xml:space="preserve"> To our knowledge, the first method for real-to-sim-to-real learning of navigation models that treats the real data of the whole pipeline as </w:t>
+      </w:r>
+      <w:r>
+        <w:rPr>
+          <w:rFonts w:cstheme="minorHAnsi"/>
+          <w:b/>
+          <w:lang w:val="en-US"/>
+        </w:rPr>
+        <w:t xml:space="preserve">one budget spent where it matters at every stage</w:t>
+      </w:r>
+      <w:r>
+        <w:rPr>
+          <w:rFonts w:cstheme="minorHAnsi"/>
+          <w:lang w:val="en-US"/>
+        </w:rPr>
+        <w:t xml:space="preserve">. It targets a given real-world navigation performance with at least two times less real data than the strongest existing real-to-sim-to-real approach (RQ4, H4). Building twins, training in simulation and using world models or foundation models are not new; deciding which real data the pipeline needs, and measuring how much it saves, is. The three stages are parts of this one method, each tested at its own step:</w:t>
       </w:r>
     </w:p>
     <w:p>
@@ -6583,14 +6309,14 @@
           <w:b/>
           <w:lang w:val="en-US"/>
         </w:rPr>
-        <w:t xml:space="preserve">C1, capture less (RQ1, H1).</w:t>
-      </w:r>
-      <w:r>
-        <w:rPr>
-          <w:rFonts w:cstheme="minorHAnsi"/>
-          <w:lang w:val="en-US"/>
-        </w:rPr>
-        <w:t xml:space="preserve"> A vision-language model picks the task-relevant objects and regions from the instruction and scene, and capture (views for appearance and geometry, interactions for physical parameters) goes where the twin is most uncertain in them; compared with uniform and task-blind selection.</w:t>
+        <w:t xml:space="preserve">Stage 1, real data → twin (RQ1, H1).</w:t>
+      </w:r>
+      <w:r>
+        <w:rPr>
+          <w:rFonts w:cstheme="minorHAnsi"/>
+          <w:lang w:val="en-US"/>
+        </w:rPr>
+        <w:t xml:space="preserve"> Capture of real data guided by what matters for the navigation task and by where the twin is still uncertain, for both appearance and geometry and the physical properties needed for navigation; compared with uniform and task-blind capture.</w:t>
       </w:r>
     </w:p>
     <w:p>
@@ -6612,14 +6338,14 @@
           <w:b/>
           <w:lang w:val="en-US"/>
         </w:rPr>
-        <w:t xml:space="preserve">C2, learn robustly in an imperfect twin (RQ2, H2).</w:t>
-      </w:r>
-      <w:r>
-        <w:rPr>
-          <w:rFonts w:cstheme="minorHAnsi"/>
-          <w:lang w:val="en-US"/>
-        </w:rPr>
-        <w:t xml:space="preserve"> Parameter-efficient reinforcement and imitation fine-tuning with augmentation and sample weights from the twin's uncertainty and the representation distance to a few real samples, and a twin-grounded world model covering the twin's uncertain regions; compared with uniform domain randomization and with the twin alone.</w:t>
+        <w:t xml:space="preserve">Stage 2, learning in the twin (RQ2, H2).</w:t>
+      </w:r>
+      <w:r>
+        <w:rPr>
+          <w:rFonts w:cstheme="minorHAnsi"/>
+          <w:lang w:val="en-US"/>
+        </w:rPr>
+        <w:t xml:space="preserve"> Training of navigation models that follows the twin's uncertainty, with the twin extended by a learned world model and the model initialized from pretrained foundation models; compared with uniform domain randomization.</w:t>
       </w:r>
     </w:p>
     <w:p>
@@ -6641,14 +6367,14 @@
           <w:b/>
           <w:lang w:val="en-US"/>
         </w:rPr>
-        <w:t xml:space="preserve">C3, transfer with few real data (RQ3, H3).</w:t>
-      </w:r>
-      <w:r>
-        <w:rPr>
-          <w:rFonts w:cstheme="minorHAnsi"/>
-          <w:lang w:val="en-US"/>
-        </w:rPr>
-        <w:t xml:space="preserve"> Active selection of real-world trials by the twin-to-real gap predicted from the uncertainty of twin, world model and VLA, used to correct all three; compared with random selection.</w:t>
+        <w:t xml:space="preserve">Stage 3, twin → reality (RQ3, H3).</w:t>
+      </w:r>
+      <w:r>
+        <w:rPr>
+          <w:rFonts w:cstheme="minorHAnsi"/>
+          <w:lang w:val="en-US"/>
+        </w:rPr>
+        <w:t xml:space="preserve"> Selection of the few real trials that the predicted twin-to-reality gap marks as most informative, used to correct both the twin and the model; compared with random selection.</w:t>
       </w:r>
     </w:p>
     <w:p>
@@ -6669,7 +6395,7 @@
           <w:rFonts w:cstheme="minorHAnsi"/>
           <w:lang w:val="en-US"/>
         </w:rPr>
-        <w:t xml:space="preserve"> (supporting the method, not contributions in their own right). Budget–performance curves of the method against real-only fine-tuning and the existing pipeline, which give the "exchange rate" between twin and real data; a proxy-reality protocol on public data that counts real data exactly without a robot (a separate, higher-fidelity reference as "reality"), applied in each domain; and open-source code of the method, built on existing open models, twin pipelines and simulators.</w:t>
+        <w:t xml:space="preserve"> (supporting the method, not contributions in their own right). Budget–performance curves of the method against existing real-to-sim-to-real approaches and learning from real data only, which give the "exchange rate" between twin and real data; a proxy-reality protocol on public scans of real buildings that counts real data exactly without a robot (a separate, higher-fidelity reference plays "reality"); and open-source code of the method, built on existing reconstruction pipelines, simulators and pretrained models.</w:t>
       </w:r>
     </w:p>
     <w:p>
@@ -6690,7 +6416,7 @@
           <w:rFonts w:cstheme="minorHAnsi"/>
           <w:lang w:val="en-US"/>
         </w:rPr>
-        <w:t xml:space="preserve"> Real target-domain data is the main cost of deploying learned systems; methods that decide where it is worth spending, and a measured estimate of how much of it a twin can replace, are relevant to active learning, learning under distribution shift, uncertainty estimation and adaptation of foundation models in general, beyond robotics.</w:t>
+        <w:t xml:space="preserve"> Real target-domain data is the main cost of deploying learned systems; methods that decide where it is worth spending, and a measured estimate of how much of it a twin can replace, are relevant to active learning, learning under distribution shift, uncertainty estimation and adaptation of pretrained models in general, beyond navigation.</w:t>
       </w:r>
     </w:p>
     <w:p>
@@ -6711,7 +6437,7 @@
           <w:rFonts w:cstheme="minorHAnsi"/>
           <w:lang w:val="en-US"/>
         </w:rPr>
-        <w:t xml:space="preserve"> Results are planned for peer-reviewed conferences worth 200 points and assigned to ITiT on the ministerial list of 5.01.2024: NeurIPS, ICML and ICLR (machine learning) and CVPR (computer vision), with ICCV and ECCV for resubmissions. P1 (C1 and first C2 results, RQ1–RQ2) targets NeurIPS 2027; P2 (C3, RQ3) ICML 2028 or CVPR 2028; P3 (the whole method against real-only fine-tuning and the existing pipeline in both domains, RQ4) NeurIPS 2028, with ICLR 2029 as the fallback.</w:t>
+        <w:t xml:space="preserve"> Results are planned for peer-reviewed conferences worth 200 points and assigned to ITiT on the ministerial list of 5.01.2024: NeurIPS, ICML and ICLR (machine learning) and CVPR (computer vision), with ICCV and ECCV for resubmissions. P1 (stage 1 and first stage 2 results, RQ1–RQ2) targets NeurIPS 2027; P2 (stage 3, RQ3) ICML 2028 or CVPR 2028; P3 (the whole pipeline against existing approaches, RQ4) NeurIPS 2028, with ICLR 2029 as the fallback.</w:t>
       </w:r>
     </w:p>
     <w:permEnd w:id="1098318749"/>
@@ -7005,7 +6731,7 @@
           <w:rFonts w:cstheme="minorHAnsi"/>
           <w:lang w:val="en-US"/>
         </w:rPr>
-        <w:t xml:space="preserve"> for the loop: real data → twin → sim-first fine-tuning of a pretrained VLA in the twin and in a world model grounded in it → a few real trials → correction of twin, world model and VLA → deployment. Stages I–III develop and ablate its components C1–C3 (RQ1–RQ3), and Stage IV tests the whole method (RQ4, the thesis H4). The twin has two parts: geometry and appearance from existing open-source 3D Gaussian Splatting (3DGS) [2] pipelines, and physical parameters identified from real interactions as a posterior (BayesSim-type [7]). No simulator, benchmark, VLA or world model is trained from scratch.</w:t>
+        <w:t xml:space="preserve"> with three stages: real data → digital twin → training of navigation models in the twin → transfer back to reality with a few real data that correct the twin and the model. Stages 1–3 are developed and tested one at a time (RQ1–RQ3); the whole pipeline is then tested against existing approaches (RQ4). Existing open-source tools are used throughout: no simulator, dataset or foundation model is built from scratch.</w:t>
       </w:r>
     </w:p>
     <w:p>
@@ -7019,66 +6745,14 @@
           <w:b/>
           <w:lang w:val="en-US"/>
         </w:rPr>
-        <w:t xml:space="preserve">Models (open weights, adapted).</w:t>
-      </w:r>
-      <w:r>
-        <w:rPr>
-          <w:rFonts w:cstheme="minorHAnsi"/>
-          <w:lang w:val="en-US"/>
-        </w:rPr>
-        <w:t xml:space="preserve"> </w:t>
-      </w:r>
-      <w:r>
-        <w:rPr>
-          <w:rFonts w:cstheme="minorHAnsi"/>
-          <w:i/>
-          <w:lang w:val="en-US"/>
-        </w:rPr>
-        <w:t xml:space="preserve">VLA:</w:t>
-      </w:r>
-      <w:r>
-        <w:rPr>
-          <w:rFonts w:cstheme="minorHAnsi"/>
-          <w:lang w:val="en-US"/>
-        </w:rPr>
-        <w:t xml:space="preserve"> OpenVLA-OFT [8, 12] for manipulation, with π0 [9] (openpi) as a second backbone, and NaVILA [10] for navigation, whose mid-level actions ("move forward 75 cm") map onto Habitat actions. All VLA fine-tuning is parameter-efficient: LoRA [11] adapters, supervised fine-tuning (SFT) and then PPO, which generalizes best for VLAs [16], with open RL tooling [15]. </w:t>
-      </w:r>
-      <w:r>
-        <w:rPr>
-          <w:rFonts w:cstheme="minorHAnsi"/>
-          <w:i/>
-          <w:lang w:val="en-US"/>
-        </w:rPr>
-        <w:t xml:space="preserve">VLM:</w:t>
-      </w:r>
-      <w:r>
-        <w:rPr>
-          <w:rFonts w:cstheme="minorHAnsi"/>
-          <w:lang w:val="en-US"/>
-        </w:rPr>
-        <w:t xml:space="preserve"> Qwen2.5-VL-7B [23], zero-shot, grounds the instruction to task-relevant objects and regions (C1) and judges success</w:t>
-      </w:r>
-    </w:p>
-    <w:p>
-      <w:pPr>
-        <w:spacing w:after="0" w:line="240" w:lineRule="auto"/>
-        <w:ind w:left="397" w:hanging="397"/>
-        <w:jc w:val="left"/>
-      </w:pPr>
-      <w:r>
-        <w:rPr>
-          <w:rFonts w:cstheme="minorHAnsi"/>
-          <w:lang w:val="en-US"/>
-        </w:rPr>
-        <w:t xml:space="preserve">[24] where the simulator gives no ground truth (checked against it where it does). </w:t>
-      </w:r>
-      <w:r>
-        <w:rPr>
-          <w:rFonts w:cstheme="minorHAnsi"/>
-          <w:i/>
-          <w:lang w:val="en-US"/>
-        </w:rPr>
-        <w:t xml:space="preserve">World model:</w:t>
+        <w:t xml:space="preserve">Evaluation protocol: proxy reality (decides the hypotheses).</w:t>
+      </w:r>
+      <w:r>
+        <w:rPr>
+          <w:rFonts w:cstheme="minorHAnsi"/>
+          <w:lang w:val="en-US"/>
+        </w:rPr>
+        <w:t xml:space="preserve"> On ≥ 20 public indoor scenes of ScanNet++ [16] (10 held out from all tuning), "reality" is the laser-scan mesh textured from the DSLR images and rendered in Habitat [1] with a robot-camera model. The twin is built from a subset of the separate phone capture of the same scene, so twin and "reality" share neither images nor reconstruction method; the largest capture budget stays below the full capture. Tasks are indoor goal-reaching navigation (e.g. image-goal and instruction-following), with a minimum path length set in a pilot so that P stays below its ceiling. Real data (captured views, real trials and demonstrations) is summed in one operator-time cost. The proxy's own error to held-out real images is reported, and every hypothesis is re-checked for sign with a second reference built from all DSLR images. P = success rate; path efficiency is also reported.</w:t>
       </w:r>
     </w:p>
     <w:p>
@@ -7089,119 +6763,10 @@
       <w:r>
         <w:rPr>
           <w:rFonts w:cstheme="minorHAnsi"/>
-          <w:lang w:val="en-US"/>
-        </w:rPr>
-        <w:t xml:space="preserve">Cosmos-Predict2 [18] (manipulation) and NWM [19] (navigation) checkpoints, post-trained on twin rollouts. </w:t>
-      </w:r>
-      <w:r>
-        <w:rPr>
-          <w:rFonts w:cstheme="minorHAnsi"/>
-          <w:i/>
-          <w:lang w:val="en-US"/>
-        </w:rPr>
-        <w:t xml:space="preserve">Compute:</w:t>
-      </w:r>
-      <w:r>
-        <w:rPr>
-          <w:rFonts w:cstheme="minorHAnsi"/>
-          <w:lang w:val="en-US"/>
-        </w:rPr>
-        <w:t xml:space="preserve"> published needs are ≥ ~27 GB of GPU memory for OpenVLA LoRA, &gt; 22.5 GB for π0 LoRA, and one 8-GPU node for RL of a VLA in simulation [15]. We estimate ~23k H100-hours for sem. 3–7 (~5 H100 on average): WCSS Lem and a PLGrid grant, applied for in T3.1; small VLAs are used for development.</w:t>
-      </w:r>
-    </w:p>
-    <w:p>
-      <w:pPr>
-        <w:spacing w:after="120" w:line="240" w:lineRule="auto"/>
-        <w:jc w:val="both"/>
-      </w:pPr>
-      <w:r>
-        <w:rPr>
-          <w:rFonts w:cstheme="minorHAnsi"/>
-          <w:b/>
-          <w:lang w:val="en-US"/>
-        </w:rPr>
-        <w:t xml:space="preserve">Tier A protocol: proxy reality (decides the hypotheses).</w:t>
-      </w:r>
-      <w:r>
-        <w:rPr>
-          <w:rFonts w:cstheme="minorHAnsi"/>
-          <w:lang w:val="en-US"/>
-        </w:rPr>
-        <w:t xml:space="preserve"> In each testbed "reality" is a reference from a separate, higher-fidelity source, and the twin is built from a subset of a separate, cheaper capture. </w:t>
-      </w:r>
-      <w:r>
-        <w:rPr>
-          <w:rFonts w:cstheme="minorHAnsi"/>
-          <w:i/>
-          <w:lang w:val="en-US"/>
-        </w:rPr>
-        <w:t xml:space="preserve">Navigation:</w:t>
-      </w:r>
-      <w:r>
-        <w:rPr>
-          <w:rFonts w:cstheme="minorHAnsi"/>
-          <w:lang w:val="en-US"/>
-        </w:rPr>
-        <w:t xml:space="preserve"> on ≥ 20 ScanNet++ [30] scenes (10 held out from all tuning), the reference is the laser-scan mesh textured from the DSLR images and rendered in Habitat [1] with a robot-camera model; the twin is 3DGS from a subset of the phone stream, run as a mesh (as in EmbodiedSplat [5]) or with a 3DGS renderer; its physical part is actuation noise. Tasks: instruction and image-goal navigation with a minimum geodesic distance set in a pilot so that P stays below its ceiling. </w:t>
-      </w:r>
-      <w:r>
-        <w:rPr>
-          <w:rFonts w:cstheme="minorHAnsi"/>
-          <w:i/>
-          <w:lang w:val="en-US"/>
-        </w:rPr>
-        <w:t xml:space="preserve">Manipulation:</w:t>
-      </w:r>
-      <w:r>
-        <w:rPr>
-          <w:rFonts w:cstheme="minorHAnsi"/>
-          <w:lang w:val="en-US"/>
-        </w:rPr>
-        <w:t xml:space="preserve"> ManiSkill3 [6] tasks (≥ 20 task–object configurations, 10 held out); reality is the simulator with held-out physical parameters and its own rendering; the twin is 3DGS from a subset of its views plus parameters identified from a few recorded interactions. Physics is shared, so this is the weaker proxy. </w:t>
-      </w:r>
-      <w:r>
-        <w:rPr>
-          <w:rFonts w:cstheme="minorHAnsi"/>
-          <w:i/>
-          <w:lang w:val="en-US"/>
-        </w:rPr>
-        <w:t xml:space="preserve">Both:</w:t>
-      </w:r>
-      <w:r>
-        <w:rPr>
-          <w:rFonts w:cstheme="minorHAnsi"/>
-          <w:lang w:val="en-US"/>
-        </w:rPr>
-        <w:t xml:space="preserve"> capture = views and interaction samples; trials and demonstrations = episodes in the reference; all summed in one operator-time cost; the largest budget stays below the full capture. In navigation the proxy's error to held-out real images is reported, and each hypothesis is re-checked for sign with a second reference (3DGS from all DSLR images). </w:t>
-      </w:r>
-      <w:r>
-        <w:rPr>
-          <w:rFonts w:cstheme="minorHAnsi"/>
-          <w:i/>
-          <w:lang w:val="en-US"/>
-        </w:rPr>
-        <w:t xml:space="preserve">Tier B:</w:t>
-      </w:r>
-      <w:r>
-        <w:rPr>
-          <w:rFonts w:cstheme="minorHAnsi"/>
-          <w:lang w:val="en-US"/>
-        </w:rPr>
-        <w:t xml:space="preserve"> SIMPLER [35] paired sim/real evaluations of published policies; the twin must reproduce their direction. P = task success rate.</w:t>
-      </w:r>
-    </w:p>
-    <w:p>
-      <w:pPr>
-        <w:spacing w:after="120" w:line="240" w:lineRule="auto"/>
-        <w:jc w:val="both"/>
-      </w:pPr>
-      <w:r>
-        <w:rPr>
-          <w:rFonts w:cstheme="minorHAnsi"/>
-          <w:b/>
-          <w:lang w:val="en-US"/>
-        </w:rPr>
-        <w:t xml:space="preserve">Stage I – C1, VLM-guided task-aware capture (RQ1, H1; sem. 3–4).</w:t>
+          <w:b/>
+          <w:lang w:val="en-US"/>
+        </w:rPr>
+        <w:t xml:space="preserve">Stage 1 – transfer of real data into a digital twin (RQ1, H1; sem. 3–4).</w:t>
       </w:r>
     </w:p>
     <w:p>
@@ -7230,7 +6795,7 @@
           <w:rFonts w:cstheme="minorHAnsi"/>
           <w:lang w:val="en-US"/>
         </w:rPr>
-        <w:t xml:space="preserve"> the twin's uncertainty, per region (Fisher information [25] or a Bayes' Rays-type [26] field adapted to 3DGS) and per physical parameter (posterior spread), is weighted by task relevance: the VLM's grounding of the instruction, how often expert trajectories pass through a region, and how much expert success changes across a parameter's posterior. The next views or interactions are chosen greedily where task-weighted uncertainty is highest, from the recorded pool (capture time estimated as a tour).</w:t>
+        <w:t xml:space="preserve"> the twin's appearance and geometry come from neural scene reconstruction (3DGS-type [10]), run as a mesh in the simulator (as in [11]) or rendered directly; its physical part (e.g. traversable surfaces, collisions, the robot's actuation noise) is estimated from a few measurements as a posterior [15]. The next views are chosen where the twin's uncertainty (e.g. Fisher information [17] or an uncertainty field [18] adapted to 3DGS) is highest in the regions that matter for navigation: along planner paths between likely goals and, optionally, where a pretrained vision-language model grounds the task. Candidates come from the recorded capture; capture time is estimated as a walking tour.</w:t>
       </w:r>
     </w:p>
     <w:p>
@@ -7252,14 +6817,14 @@
           <w:i/>
           <w:lang w:val="en-US"/>
         </w:rPr>
-        <w:t xml:space="preserve">Baselines:</w:t>
-      </w:r>
-      <w:r>
-        <w:rPr>
-          <w:rFonts w:cstheme="minorHAnsi"/>
-          <w:lang w:val="en-US"/>
-        </w:rPr>
-        <w:t xml:space="preserve"> uniform capture; task-blind uncertainty selection (FisherRF-type [25], ASID-type [28]); risk-weighted [27] and VLM-guided reconstruction-quality selection (AREA3D-type [29]); same budget.</w:t>
+        <w:t xml:space="preserve">Comparators:</w:t>
+      </w:r>
+      <w:r>
+        <w:rPr>
+          <w:rFonts w:cstheme="minorHAnsi"/>
+          <w:lang w:val="en-US"/>
+        </w:rPr>
+        <w:t xml:space="preserve"> uniform capture; task-blind and risk-weighted uncertainty selection [17, 19]; vision- language-guided reconstruction-quality selection [20].</w:t>
       </w:r>
     </w:p>
     <w:p>
@@ -7281,14 +6846,14 @@
           <w:i/>
           <w:lang w:val="en-US"/>
         </w:rPr>
-        <w:t xml:space="preserve">Metric and criterion (H1):</w:t>
-      </w:r>
-      <w:r>
-        <w:rPr>
-          <w:rFonts w:cstheme="minorHAnsi"/>
-          <w:lang w:val="en-US"/>
-        </w:rPr>
-        <w:t xml:space="preserve"> budget–P curves (≥ 4 budgets per testbed; the VLA LoRA-SFT-tuned in each twin); ≥ 40% less capture than uniform at equal P, and the upper 95% bound of C_task / C_recon &lt; 1 (§7).</w:t>
+        <w:t xml:space="preserve">Criterion (H1):</w:t>
+      </w:r>
+      <w:r>
+        <w:rPr>
+          <w:rFonts w:cstheme="minorHAnsi"/>
+          <w:lang w:val="en-US"/>
+        </w:rPr>
+        <w:t xml:space="preserve"> budget–P curves (≥ 4 budgets, the same navigation learner trained in each twin); ≥ 40% less capture than uniform at equal P, with the 95% bound of the ratio below 1.</w:t>
       </w:r>
     </w:p>
     <w:p>
@@ -7302,7 +6867,7 @@
           <w:b/>
           <w:lang w:val="en-US"/>
         </w:rPr>
-        <w:t xml:space="preserve">Stage II – C2, uncertainty-aware fine-tuning in the twin and a twin-grounded world model (RQ2, H2; sem. 4).</w:t>
+        <w:t xml:space="preserve">Stage 2 – training navigation models in the twin (RQ2, H2; sem. 4).</w:t>
       </w:r>
     </w:p>
     <w:p>
@@ -7331,7 +6896,7 @@
           <w:rFonts w:cstheme="minorHAnsi"/>
           <w:lang w:val="en-US"/>
         </w:rPr>
-        <w:t xml:space="preserve"> the VLA is LoRA-fine-tuned by SFT on expert (planner) demonstrations in the twin and then by RL. (a) Randomization strength follows the twin's uncertainty (per-region appearance and geometry, physical parameters from their posterior), and twin samples far from a few real samples in DINOv2 [33] space are down-weighted; the real samples are a held-out slice of the capture and count towards the budget. (b) The world model, post-trained on twin rollouts, generates extra rollouts from states in the twin's most uncertain regions for on-policy RL [20], weighted by that uncertainty.</w:t>
+        <w:t xml:space="preserve"> the navigation model is initialized from a pretrained foundation model (e.g. a general navigation model or a vision-language-action model [21–24]) and trained in the twin by imitation of planner demonstrations and then by reinforcement learning, with parameter-efficient adaptation where the model is large. Randomization strength follows the twin's uncertainty per region and per physical parameter, and twin samples far from a few real samples in a frozen-encoder space [29] are down-weighted; these real samples are held out from the capture and count towards its budget. A learned world model (e.g. a video world model [25, 26]) adapted on twin data generates additional trajectories where the twin is most uncertain.</w:t>
       </w:r>
     </w:p>
     <w:p>
@@ -7353,14 +6918,14 @@
           <w:i/>
           <w:lang w:val="en-US"/>
         </w:rPr>
-        <w:t xml:space="preserve">Baselines:</w:t>
-      </w:r>
-      <w:r>
-        <w:rPr>
-          <w:rFonts w:cstheme="minorHAnsi"/>
-          <w:lang w:val="en-US"/>
-        </w:rPr>
-        <w:t xml:space="preserve"> (a) uniform randomization of appearance [31] and dynamics [32], and none; (b) twin only (same C2 without the world model) and world model only; same capture budget.</w:t>
+        <w:t xml:space="preserve">Comparators:</w:t>
+      </w:r>
+      <w:r>
+        <w:rPr>
+          <w:rFonts w:cstheme="minorHAnsi"/>
+          <w:lang w:val="en-US"/>
+        </w:rPr>
+        <w:t xml:space="preserve"> uniform randomization of appearance [5] and dynamics [6], and none; ablations without the world model, without uncertainty weighting and without foundation-model initialization.</w:t>
       </w:r>
     </w:p>
     <w:p>
@@ -7389,7 +6954,7 @@
           <w:rFonts w:cstheme="minorHAnsi"/>
           <w:lang w:val="en-US"/>
         </w:rPr>
-        <w:t xml:space="preserve"> (a) mean paired P gain over uniform randomization ≥ 10 pp on held-out scenes, lower 95% bound &gt; 0; (b) lower 95% bound of the paired gain of twin + world model over twin only &gt; 0; both at each of ≥ 2 capture budgets.</w:t>
+        <w:t xml:space="preserve"> mean paired gain in P over uniform randomization ≥ 10 pp on held-out scenes, lower 95% bound &gt; 0, at each of ≥ 2 capture budgets.</w:t>
       </w:r>
     </w:p>
     <w:p>
@@ -7403,7 +6968,7 @@
           <w:b/>
           <w:lang w:val="en-US"/>
         </w:rPr>
-        <w:t xml:space="preserve">Stage III – C3, few real trials and correction (RQ3, H3; end of sem. 4 – sem. 5).</w:t>
+        <w:t xml:space="preserve">Stage 3 – transfer back to reality with few real data (RQ3, H3; end of sem. 4 – sem. 5).</w:t>
       </w:r>
     </w:p>
     <w:p>
@@ -7425,14 +6990,14 @@
           <w:i/>
           <w:lang w:val="en-US"/>
         </w:rPr>
-        <w:t xml:space="preserve">Selection:</w:t>
-      </w:r>
-      <w:r>
-        <w:rPr>
-          <w:rFonts w:cstheme="minorHAnsi"/>
-          <w:lang w:val="en-US"/>
-        </w:rPr>
-        <w:t xml:space="preserve"> candidate trials are scored by the predicted gap: the twin's uncertainty along the planned trajectory, twin–world-model disagreement on the outcome and the VLA's uncertainty (spread of LoRA ensemble actions). The top-k are run in reality (tier A: the reference).</w:t>
+        <w:t xml:space="preserve">Method:</w:t>
+      </w:r>
+      <w:r>
+        <w:rPr>
+          <w:rFonts w:cstheme="minorHAnsi"/>
+          <w:lang w:val="en-US"/>
+        </w:rPr>
+        <w:t xml:space="preserve"> candidate real trials are scored by the predicted twin-to-reality gap, combining the twin's uncertainty along the planned path, disagreement between twin and world model, and the navigation model's own uncertainty (ensemble spread). The top-ranked trials are run in reality; they correct the twin (re-capture where real and twin observations disagree, counted in the budget; posterior update of physical parameters [7, 15]) and the model (co-training with twin data [9]). Real P from few trials is estimated with prediction-powered inference [30].</w:t>
       </w:r>
     </w:p>
     <w:p>
@@ -7454,14 +7019,14 @@
           <w:i/>
           <w:lang w:val="en-US"/>
         </w:rPr>
-        <w:t xml:space="preserve">Use:</w:t>
-      </w:r>
-      <w:r>
-        <w:rPr>
-          <w:rFonts w:cstheme="minorHAnsi"/>
-          <w:lang w:val="en-US"/>
-        </w:rPr>
-        <w:t xml:space="preserve"> the trials correct the twin (re-capture or re-weighting where real and twin observations disagree, counted in the budget; posterior update [7]), extend the world model's post-training data, and fine-tune the VLA by co-training with twin data [14]. Real P from few trials uses prediction-powered inference [34].</w:t>
+        <w:t xml:space="preserve">Comparators:</w:t>
+      </w:r>
+      <w:r>
+        <w:rPr>
+          <w:rFonts w:cstheme="minorHAnsi"/>
+          <w:lang w:val="en-US"/>
+        </w:rPr>
+        <w:t xml:space="preserve"> random selection, uniform coverage and failure-prone selection from the twin alone [27].</w:t>
       </w:r>
     </w:p>
     <w:p>
@@ -7483,35 +7048,6 @@
           <w:i/>
           <w:lang w:val="en-US"/>
         </w:rPr>
-        <w:t xml:space="preserve">Baselines:</w:t>
-      </w:r>
-      <w:r>
-        <w:rPr>
-          <w:rFonts w:cstheme="minorHAnsi"/>
-          <w:lang w:val="en-US"/>
-        </w:rPr>
-        <w:t xml:space="preserve"> random selection, uniform coverage and failure-prone selection from the twin alone (TwinRL-type [17]); same number of trials.</w:t>
-      </w:r>
-    </w:p>
-    <w:p>
-      <w:pPr>
-        <w:spacing w:after="40" w:line="240" w:lineRule="auto"/>
-        <w:ind w:left="284" w:hanging="284"/>
-        <w:jc w:val="both"/>
-      </w:pPr>
-      <w:r>
-        <w:rPr>
-          <w:rFonts w:cstheme="minorHAnsi"/>
-          <w:lang w:val="en-US"/>
-        </w:rPr>
-        <w:t xml:space="preserve">•	</w:t>
-      </w:r>
-      <w:r>
-        <w:rPr>
-          <w:rFonts w:cstheme="minorHAnsi"/>
-          <w:i/>
-          <w:lang w:val="en-US"/>
-        </w:rPr>
         <w:t xml:space="preserve">Criterion (H3):</w:t>
       </w:r>
       <w:r>
@@ -7519,7 +7055,7 @@
           <w:rFonts w:cstheme="minorHAnsi"/>
           <w:lang w:val="en-US"/>
         </w:rPr>
-        <w:t xml:space="preserve"> the target P with ≥ 50% fewer trials than random (upper 95% bound of the ratio &lt; 1).</w:t>
+        <w:t xml:space="preserve"> the target P with ≥ 50% fewer trials than random selection (95% bound of the ratio below 1).</w:t>
       </w:r>
     </w:p>
     <w:p>
@@ -7533,95 +7069,50 @@
           <w:b/>
           <w:lang w:val="en-US"/>
         </w:rPr>
-        <w:t xml:space="preserve">Stage IV – the whole method in both testbeds (RQ4, H4; sem. 6).</w:t>
-      </w:r>
-    </w:p>
-    <w:p>
-      <w:pPr>
-        <w:spacing w:after="40" w:line="240" w:lineRule="auto"/>
-        <w:ind w:left="284" w:hanging="284"/>
+        <w:t xml:space="preserve">Whole pipeline (RQ4, H4; sem. 6).</w:t>
+      </w:r>
+      <w:r>
+        <w:rPr>
+          <w:rFonts w:cstheme="minorHAnsi"/>
+          <w:lang w:val="en-US"/>
+        </w:rPr>
+        <w:t xml:space="preserve"> Budget curves (real data against P) of the whole method, of the strongest existing real-to-sim-to-real approach (uniform capture, uniform randomization, training in the twin and random or failure-driven real trials, with the same twin, learner and correction; e.g. [14, 27]), and of learning from real data only (imitation of real demonstrations, same initialization). The method's settings are fixed before this stage. </w:t>
+      </w:r>
+      <w:r>
+        <w:rPr>
+          <w:rFonts w:cstheme="minorHAnsi"/>
+          <w:i/>
+          <w:lang w:val="en-US"/>
+        </w:rPr>
+        <w:t xml:space="preserve">Criterion (H4):</w:t>
+      </w:r>
+      <w:r>
+        <w:rPr>
+          <w:rFonts w:cstheme="minorHAnsi"/>
+          <w:lang w:val="en-US"/>
+        </w:rPr>
+        <w:t xml:space="preserve"> ≥ 2× less real data than the existing approach at the target P, with the 95% bound of the ratio below 1, and the stage 1–3 effects keep their sign.</w:t>
+      </w:r>
+    </w:p>
+    <w:p>
+      <w:pPr>
+        <w:spacing w:after="120" w:line="240" w:lineRule="auto"/>
         <w:jc w:val="both"/>
       </w:pPr>
       <w:r>
         <w:rPr>
           <w:rFonts w:cstheme="minorHAnsi"/>
-          <w:lang w:val="en-US"/>
-        </w:rPr>
-        <w:t xml:space="preserve">•	</w:t>
-      </w:r>
-      <w:r>
-        <w:rPr>
-          <w:rFonts w:cstheme="minorHAnsi"/>
-          <w:i/>
-          <w:lang w:val="en-US"/>
-        </w:rPr>
-        <w:t xml:space="preserve">Budget curves:</w:t>
-      </w:r>
-      <w:r>
-        <w:rPr>
-          <w:rFonts w:cstheme="minorHAnsi"/>
-          <w:lang w:val="en-US"/>
-        </w:rPr>
-        <w:t xml:space="preserve"> real data (capture + trials, one operator-time cost) against P for the method; for </w:t>
-      </w:r>
-      <w:r>
-        <w:rPr>
-          <w:rFonts w:cstheme="minorHAnsi"/>
-          <w:b/>
-          <w:lang w:val="en-US"/>
-        </w:rPr>
-        <w:t xml:space="preserve">real-only fine-tuning of the same VLA</w:t>
-      </w:r>
-      <w:r>
-        <w:rPr>
-          <w:rFonts w:cstheme="minorHAnsi"/>
-          <w:lang w:val="en-US"/>
-        </w:rPr>
-        <w:t xml:space="preserve"> (LoRA SFT on expert demonstrations in the reference, same initialization; real-only RL also shown); and for the </w:t>
-      </w:r>
-      <w:r>
-        <w:rPr>
-          <w:rFonts w:cstheme="minorHAnsi"/>
-          <w:b/>
-          <w:lang w:val="en-US"/>
-        </w:rPr>
-        <w:t xml:space="preserve">strongest existing twin fine-tuning pipeline for VLAs</w:t>
-      </w:r>
-      <w:r>
-        <w:rPr>
-          <w:rFonts w:cstheme="minorHAnsi"/>
-          <w:lang w:val="en-US"/>
-        </w:rPr>
-        <w:t xml:space="preserve">, TwinRL/RialTo-style [17, 3]: uniform capture, uniform randomization, SFT + RL of the same VLA in the twin, random or failure-driven real trials (the better is reported), with the same twin, learner and correction and TwinRL's released code where it applies. The exchange rate is the ratio of the budgets reaching the target P.</w:t>
-      </w:r>
-    </w:p>
-    <w:p>
-      <w:pPr>
-        <w:spacing w:after="40" w:line="240" w:lineRule="auto"/>
-        <w:ind w:left="284" w:hanging="284"/>
-        <w:jc w:val="both"/>
-      </w:pPr>
-      <w:r>
-        <w:rPr>
-          <w:rFonts w:cstheme="minorHAnsi"/>
-          <w:lang w:val="en-US"/>
-        </w:rPr>
-        <w:t xml:space="preserve">•	</w:t>
-      </w:r>
-      <w:r>
-        <w:rPr>
-          <w:rFonts w:cstheme="minorHAnsi"/>
-          <w:i/>
-          <w:lang w:val="en-US"/>
-        </w:rPr>
-        <w:t xml:space="preserve">Success criterion (H4, the thesis; §7):</w:t>
-      </w:r>
-      <w:r>
-        <w:rPr>
-          <w:rFonts w:cstheme="minorHAnsi"/>
-          <w:lang w:val="en-US"/>
-        </w:rPr>
-        <w:t xml:space="preserve"> with C1–C3 and their hyperparameters unchanged, in each testbed ≤ 10% of the real data of real-only fine-tuning (upper 95% bound &lt; 0.2) and ≥ 2× less than the pipeline (bound &lt; 1); H1–H3 effects keep their sign; tier B agrees in direction.</w:t>
+          <w:b/>
+          <w:lang w:val="en-US"/>
+        </w:rPr>
+        <w:t xml:space="preserve">Real-robot validation.</w:t>
+      </w:r>
+      <w:r>
+        <w:rPr>
+          <w:rFonts w:cstheme="minorHAnsi"/>
+          <w:lang w:val="en-US"/>
+        </w:rPr>
+        <w:t xml:space="preserve"> Two campaigns (sem. 5 and 7) with own phone or RGB-D captures of 2 rooms at PWr and a mobile robot: uniform capture versus the method, ~8 robot-hours per campaign; they check the direction of the results and never tune thresholds.</w:t>
       </w:r>
     </w:p>
     <w:p>
@@ -7635,29 +7126,14 @@
           <w:b/>
           <w:lang w:val="en-US"/>
         </w:rPr>
-        <w:t xml:space="preserve">Tier C validation.</w:t>
-      </w:r>
-      <w:r>
-        <w:rPr>
-          <w:rFonts w:cstheme="minorHAnsi"/>
-          <w:lang w:val="en-US"/>
-        </w:rPr>
-        <w:t xml:space="preserve"> Two robot campaigns (sem. 5 and 7) with own phone or RGB-D captures at PWr: a mobile robot in 2 rooms and, where access is agreed, a tabletop manipulator; uniform capture versus the method, ~8 robot-hours per campaign, agreement only. </w:t>
-      </w:r>
-      <w:r>
-        <w:rPr>
-          <w:rFonts w:cstheme="minorHAnsi"/>
-          <w:b/>
-          <w:lang w:val="en-US"/>
-        </w:rPr>
-        <w:t xml:space="preserve">Statistics:</w:t>
-      </w:r>
-      <w:r>
-        <w:rPr>
-          <w:rFonts w:cstheme="minorHAnsi"/>
-          <w:lang w:val="en-US"/>
-        </w:rPr>
-        <w:t xml:space="preserve"> tests follow §7; the protocol is pre-registered before each stage. Code is released where dataset and model licences permit.</w:t>
+        <w:t xml:space="preserve">Statistics and compute.</w:t>
+      </w:r>
+      <w:r>
+        <w:rPr>
+          <w:rFonts w:cstheme="minorHAnsi"/>
+          <w:lang w:val="en-US"/>
+        </w:rPr>
+        <w:t xml:space="preserve"> Targets are defined from each comparator's own curve at its largest budget. Tests are one-sided at α = 0.05 with a scene-level bootstrap and Holm correction, pre-registered before each stage. Training runs on WCSS and PLGrid GPUs (computing grant applied for in sem. 3); smaller models are used for development. Code is released where dataset and model licences permit.</w:t>
       </w:r>
     </w:p>
     <w:permEnd w:id="32011344"/>
@@ -7926,7 +7402,7 @@
           <w:rFonts w:cstheme="minorHAnsi"/>
           <w:lang w:val="pl-PL"/>
         </w:rPr>
-        <w:t xml:space="preserve">Roboty, które mają chwytać przedmioty lub poruszać się po budynkach, coraz częściej korzystają z dużych, wstępnie wytrenowanych modeli sztucznej inteligencji, które rozumieją obraz i polecenia wydane słowami i na ich podstawie wybierają ruchy. Aby taki model dobrze działał w nowym miejscu i przy nowym zadaniu, trzeba go jeszcze douczyć, a zbieranie prawdziwych danych i prób jest powolne i kosztowne. Dlatego douczanie coraz częściej odbywa się w cyfrowym bliźniaku: wiernej kopii prawdziwego miejsca, którą można odtworzyć z nagrań i pomiarów, łącznie z wyglądem, kształtem i tym, jak rzeczy się poruszają. Powstaje w ten sposób pętla: zbieramy dane w rzeczywistości, budujemy kopię, douczamy w niej model, sprawdzamy go w rzeczywistości, poprawiamy i dopiero wtedy wdrażamy. Każdy z tych kroków wymaga jednak prawdziwych danych.</w:t>
+        <w:t xml:space="preserve">Roboty, które poruszają się po budynkach, na przykład w magazynach, szpitalach czy biurach, coraz częściej korzystają z modeli nawigacji, które uczą się na podstawie doświadczenia. Aby taki model dobrze działał w konkretnym budynku, potrzebuje wielu danych z tego miejsca, a zbieranie ich w rzeczywistości jest powolne i kosztowne. Dlatego coraz częściej robot uczy się w cyfrowym bliźniaku: wiernej kopii prawdziwego budynku, którą można odtworzyć z krótkiego nagrania i kilku pomiarów. Powstaje w ten sposób droga w trzech krokach: zbieramy dane w rzeczywistości i budujemy z nich kopię, uczymy w niej model nawigacji, a następnie przenosimy go z powrotem do rzeczywistości i tam sprawdzamy oraz poprawiamy. Każdy z tych kroków wymaga jednak prawdziwych danych.</w:t>
       </w:r>
     </w:p>
     <w:p>
@@ -7939,7 +7415,7 @@
           <w:rFonts w:cstheme="minorHAnsi"/>
           <w:lang w:val="pl-PL"/>
         </w:rPr>
-        <w:t xml:space="preserve">Celem rozprawy jest opracowanie metody, która przejdzie przez tę pętlę z dużo mniejszą ilością prawdziwych danych niż dotychczasowe podejścia, niezależnie od zadania. Metoda ma trzy części, po jednej na każdy krok pętli. Zamiast nagrywać wszystko po równo, model rozumiejący obraz i język wskaże, co jest ważne dla zadania, a nagrywać będziemy przede wszystkim te miejsca, o których kopia wie jeszcze za mało. Ponieważ kopia nigdy nie jest idealna, model będziemy douczać tak, aby nie polegał na jej niepewnych fragmentach, a tam, gdzie kopia jest niepewna, dodatkowe sytuacje wygeneruje model świata, czyli program, który uczy się przewidywać, co wydarzy się dalej. Na koniec wybierzemy tylko te nieliczne próby w rzeczywistości, które najwięcej mówią o tym, gdzie system jeszcze zawodzi, i wykorzystamy je do poprawienia kopii, modelu świata i samego modelu. Tę samą metodę sprawdzimy na dwóch różnych zadaniach: chwytaniu przedmiotów ramieniem robota i poruszaniu się robota po budynkach. Badania będą prowadzone przede wszystkim na publicznie dostępnych danych, a wybrane wyniki zostaną potwierdzone na prawdziwym robocie.</w:t>
+        <w:t xml:space="preserve">Celem rozprawy jest opracowanie metody, która przejdzie tę drogę z dużo mniejszą ilością prawdziwych danych niż dotychczasowe podejścia. W pierwszym kroku zamiast nagrywać wszystko po równo, będziemy nagrywać przede wszystkim te miejsca, które są ważne dla poruszania się robota, a o których kopia wie jeszcze za mało. W drugim kroku, ponieważ kopia nigdy nie jest idealna, będziemy uczyć model tak, aby nie polegał na jej niepewnych fragmentach; pomogą w tym model świata, czyli program, który uczy się przewidywać, co wydarzy się dalej, oraz duże modele wstępnie wytrenowane na wielu innych danych. W trzecim kroku wybierzemy tylko te nieliczne próby w rzeczywistości, które najwięcej mówią o tym, gdzie kopia i model jeszcze się mylą, i wykorzystamy je do ich poprawienia. Badania będą prowadzone przede wszystkim na publicznie dostępnych skanach prawdziwych budynków, a wyniki zostaną potwierdzone na prawdziwym robocie.</w:t>
       </w:r>
     </w:p>
     <w:p>
@@ -7952,7 +7428,7 @@
           <w:rFonts w:cstheme="minorHAnsi"/>
           <w:lang w:val="pl-PL"/>
         </w:rPr>
-        <w:t xml:space="preserve">Spodziewanym efektem jest jedna metoda, która pozwoli zbierać mniej danych, uczyć skuteczniej i wykonywać mniej kosztownych prób w rzeczywistości, oraz pomiar, ile prawdziwych danych oszczędza w porównaniu z douczaniem wyłącznie na prawdziwych danych i z dotychczasowymi podejściami. Może to przyspieszyć i potanić wdrażanie robotów w fabrykach, magazynach, szpitalach i biurach. Opracowane oprogramowanie zostanie udostępnione publicznie.</w:t>
+        <w:t xml:space="preserve">Spodziewanym efektem jest metoda, która pozwoli nauczyć robota poruszania się w nowym budynku przy dużo mniejszej ilości prawdziwych danych, oraz pomiar, ile prawdziwych danych oszczędza w porównaniu z dotychczasowymi podejściami. Może to przyspieszyć i potanić wdrażanie robotów mobilnych w magazynach, szpitalach i biurach. Opracowane oprogramowanie zostanie udostępnione publicznie.</w:t>
       </w:r>
     </w:p>
     <w:permEnd w:id="301016009"/>
@@ -8007,7 +7483,7 @@
           <w:rFonts w:cstheme="minorHAnsi"/>
           <w:lang w:val="en-US"/>
         </w:rPr>
-        <w:t xml:space="preserve">Robots that grasp objects or move around buildings increasingly rely on large, pretrained artificial intelligence models that understand images and spoken or written instructions and choose movements from them. For such a model to work well in a new place and on a new task, it still has to be trained further, and collecting real data and trials is slow and costly. That is why this further training increasingly takes place in a digital twin: a faithful copy of a real place that can be rebuilt from recordings and measurements, including how things look, their shape and how they move. This creates a loop: we collect data in reality, build the copy, train the model further in it, check it in reality, correct it and only then deploy it. Each of these steps, however, needs real data.</w:t>
+        <w:t xml:space="preserve">Robots that move around buildings, for example in warehouses, hospitals or offices, increasingly rely on navigation models that learn from experience. For such a model to work well in a particular building, it needs a lot of data from that place, and collecting it in reality is slow and costly. That is why robots increasingly learn in a digital twin: a faithful copy of a real building that can be rebuilt from a short recording and a few measurements. This creates a path in three steps: we collect data in reality and build the copy from it, train the navigation model in the copy, and then transfer it back to reality, where we check and correct it. Each of these steps, however, needs real data.</w:t>
       </w:r>
     </w:p>
     <w:p>
@@ -8020,7 +7496,7 @@
           <w:rFonts w:cstheme="minorHAnsi"/>
           <w:lang w:val="en-US"/>
         </w:rPr>
-        <w:t xml:space="preserve">The goal of this dissertation is to develop a method that goes through this loop with much less real data than existing approaches, whatever the task. The method has three parts, one for each step of the loop. Instead of recording everything evenly, a model that understands images and language will point out what matters for the task, and we will record mainly the places about which the copy still knows too little. Because the copy is never perfect, we will train the model so that it does not rely on the uncertain parts of the copy, and where the copy is uncertain, extra situations will be generated by a world model, a program that learns to predict what happens next. Finally, we will choose only the few trials in reality that tell the most about where the system still fails, and use them to correct the copy, the world model and the model itself. We will test the same method on two different tasks: grasping objects with a robot arm and a robot moving around buildings. The research will be carried out mainly on publicly available data, and selected results will be confirmed on a real robot.</w:t>
+        <w:t xml:space="preserve">The goal of this dissertation is to develop a method that follows this path with much less real data than existing approaches. In the first step, instead of recording everything evenly, we will record mainly the places that matter for the robot's movement and about which the copy still knows too little. In the second step, because the copy is never perfect, we will train the model so that it does not rely on the uncertain parts of the copy; a world model, a program that learns to predict what happens next, and large models pretrained on much other data will help with this. In the third step, we will choose only the few trials in reality that tell the most about where the copy and the model are still wrong, and use them to correct both. The research will be carried out mainly on publicly available scans of real buildings, and the results will be confirmed on a real robot.</w:t>
       </w:r>
     </w:p>
     <w:p>
@@ -8033,7 +7509,7 @@
           <w:rFonts w:cstheme="minorHAnsi"/>
           <w:lang w:val="en-US"/>
         </w:rPr>
-        <w:t xml:space="preserve">The expected result is one method that makes it possible to collect less data, train more effectively and carry out fewer costly trials in reality, and a measurement of how much real data it saves compared with training on real data only and with existing approaches. This may make deploying robots in factories, warehouses, hospitals and offices faster and cheaper. The software developed will be made publicly available.</w:t>
+        <w:t xml:space="preserve">The expected result is a method that makes it possible to teach a robot to move around a new building with much less real data, and a measurement of how much real data it saves compared with existing approaches. This may make deploying mobile robots in warehouses, hospitals and offices faster and cheaper. The software developed will be made publicly available.</w:t>
       </w:r>
     </w:p>
     <w:permEnd w:id="305530072"/>
@@ -8484,7 +7960,7 @@
           <w:rFonts w:cstheme="minorHAnsi"/>
           <w:lang w:val="en-US"/>
         </w:rPr>
-        <w:t xml:space="preserve">. P1 reports the first two components of the method (Stage I and the first Stage II results, RQ1–RQ2) for a pretrained open vision-language-action model fine-tuned in digital twins: C1, capture of real data guided by a vision-language model to the task-relevant, uncertain parts of the twin (H1), and C2, uncertainty-aware, parameter-efficient fine-tuning in the twin and in a world model grounded in it (first H2 results). Both are evaluated in manipulation and navigation by the real data they save, not by the fine-tuning technique itself (task T4.2). If it is rejected, the revised paper goes to </w:t>
+        <w:t xml:space="preserve">. P1 reports the first two stages of the method for navigation models (stage 1 and the first stage 2 results, RQ1–RQ2): capture of real data guided by the navigation task and by the twin's uncertainty (H1), and training of navigation models that follows the twin's uncertainty, with the twin extended by a learned world model (first H2 results). Both are evaluated on public scans of real buildings by the real data they save (task T4.2). If it is rejected, the revised paper goes to </w:t>
       </w:r>
       <w:r>
         <w:rPr>
@@ -8781,9 +8257,9 @@
       </w:tblPr>
       <w:tblGrid>
         <w:gridCol w:w="1269"/>
-        <w:gridCol w:w="3796"/>
-        <w:gridCol w:w="1043"/>
-        <w:gridCol w:w="1353"/>
+        <w:gridCol w:w="3518"/>
+        <w:gridCol w:w="1156"/>
+        <w:gridCol w:w="1518"/>
         <w:gridCol w:w="1611"/>
       </w:tblGrid>
       <w:tr>
@@ -8808,7 +8284,7 @@
         </w:tc>
         <w:tc>
           <w:tcPr>
-            <w:tcW w:w="3796" w:type="dxa"/>
+            <w:tcW w:w="3518" w:type="dxa"/>
           </w:tcPr>
           <w:p>
             <w:pPr>
@@ -8827,7 +8303,7 @@
         </w:tc>
         <w:tc>
           <w:tcPr>
-            <w:tcW w:w="1043" w:type="dxa"/>
+            <w:tcW w:w="1156" w:type="dxa"/>
           </w:tcPr>
           <w:p>
             <w:pPr>
@@ -8846,7 +8322,7 @@
         </w:tc>
         <w:tc>
           <w:tcPr>
-            <w:tcW w:w="1353" w:type="dxa"/>
+            <w:tcW w:w="1518" w:type="dxa"/>
           </w:tcPr>
           <w:p>
             <w:pPr>
@@ -8904,7 +8380,7 @@
         </w:tc>
         <w:tc>
           <w:tcPr>
-            <w:tcW w:w="3796" w:type="dxa"/>
+            <w:tcW w:w="3518" w:type="dxa"/>
           </w:tcPr>
           <w:p>
             <w:pPr>
@@ -8922,7 +8398,7 @@
         </w:tc>
         <w:tc>
           <w:tcPr>
-            <w:tcW w:w="1043" w:type="dxa"/>
+            <w:tcW w:w="1156" w:type="dxa"/>
           </w:tcPr>
           <w:p>
             <w:pPr>
@@ -8940,7 +8416,7 @@
         </w:tc>
         <w:tc>
           <w:tcPr>
-            <w:tcW w:w="1353" w:type="dxa"/>
+            <w:tcW w:w="1518" w:type="dxa"/>
           </w:tcPr>
           <w:p>
             <w:pPr>
@@ -8996,7 +8472,7 @@
         </w:tc>
         <w:tc>
           <w:tcPr>
-            <w:tcW w:w="3796" w:type="dxa"/>
+            <w:tcW w:w="3518" w:type="dxa"/>
           </w:tcPr>
           <w:p>
             <w:pPr>
@@ -9008,13 +8484,13 @@
                 <w:rFonts w:cstheme="minorHAnsi"/>
                 <w:lang w:val="en-US"/>
               </w:rPr>
-              <w:t xml:space="preserve">P1 (method components C1 and first C2 results, RQ1–RQ2): NeurIPS 2027, May 2027 (§11)</w:t>
+              <w:t xml:space="preserve">P1 (stage 1 and first stage 2 results, RQ1–RQ2): NeurIPS 2027, May 2027 (§11)</w:t>
             </w:r>
           </w:p>
         </w:tc>
         <w:tc>
           <w:tcPr>
-            <w:tcW w:w="1043" w:type="dxa"/>
+            <w:tcW w:w="1156" w:type="dxa"/>
           </w:tcPr>
           <w:p>
             <w:pPr>
@@ -9026,13 +8502,13 @@
                 <w:rFonts w:cstheme="minorHAnsi"/>
                 <w:lang w:val="en-US"/>
               </w:rPr>
-              <w:t xml:space="preserve">Loop on tier A</w:t>
+              <w:t xml:space="preserve">Pipeline on public scans</w:t>
             </w:r>
           </w:p>
         </w:tc>
         <w:tc>
           <w:tcPr>
-            <w:tcW w:w="1353" w:type="dxa"/>
+            <w:tcW w:w="1518" w:type="dxa"/>
           </w:tcPr>
           <w:p>
             <w:pPr>
@@ -9088,7 +8564,7 @@
         </w:tc>
         <w:tc>
           <w:tcPr>
-            <w:tcW w:w="3796" w:type="dxa"/>
+            <w:tcW w:w="3518" w:type="dxa"/>
           </w:tcPr>
           <w:p>
             <w:pPr>
@@ -9100,13 +8576,13 @@
                 <w:rFonts w:cstheme="minorHAnsi"/>
                 <w:lang w:val="en-US"/>
               </w:rPr>
-              <w:t xml:space="preserve">P2 (component C3, few real data, RQ3): ICML or CVPR 2028; P3 (the whole method in both testbeds, RQ4): NeurIPS 2028</w:t>
+              <w:t xml:space="preserve">P2 (stage 3, few real data, RQ3): ICML or CVPR 2028; P3 (the whole pipeline, RQ4): NeurIPS 2028</w:t>
             </w:r>
           </w:p>
         </w:tc>
         <w:tc>
           <w:tcPr>
-            <w:tcW w:w="1043" w:type="dxa"/>
+            <w:tcW w:w="1156" w:type="dxa"/>
           </w:tcPr>
           <w:p>
             <w:pPr>
@@ -9118,13 +8594,13 @@
                 <w:rFonts w:cstheme="minorHAnsi"/>
                 <w:lang w:val="en-US"/>
               </w:rPr>
-              <w:t xml:space="preserve">C3 code</w:t>
+              <w:t xml:space="preserve">Stage 3 code</w:t>
             </w:r>
           </w:p>
         </w:tc>
         <w:tc>
           <w:tcPr>
-            <w:tcW w:w="1353" w:type="dxa"/>
+            <w:tcW w:w="1518" w:type="dxa"/>
           </w:tcPr>
           <w:p>
             <w:pPr>
@@ -9180,7 +8656,7 @@
         </w:tc>
         <w:tc>
           <w:tcPr>
-            <w:tcW w:w="3796" w:type="dxa"/>
+            <w:tcW w:w="3518" w:type="dxa"/>
           </w:tcPr>
           <w:p>
             <w:pPr>
@@ -9198,7 +8674,7 @@
         </w:tc>
         <w:tc>
           <w:tcPr>
-            <w:tcW w:w="1043" w:type="dxa"/>
+            <w:tcW w:w="1156" w:type="dxa"/>
           </w:tcPr>
           <w:p>
             <w:pPr>
@@ -9216,7 +8692,7 @@
         </w:tc>
         <w:tc>
           <w:tcPr>
-            <w:tcW w:w="1353" w:type="dxa"/>
+            <w:tcW w:w="1518" w:type="dxa"/>
           </w:tcPr>
           <w:p>
             <w:pPr>
@@ -9276,7 +8752,7 @@
           <w:rFonts w:cstheme="minorHAnsi"/>
           <w:lang w:val="en-US"/>
         </w:rPr>
-        <w:t xml:space="preserve"> (1) Z. Kira's group, Georgia Tech: EmbodiedSplat [5]. (2) Multi-robot Systems Lab, Stanford University (M. Schwager): Gaussian-splatting scene models. A European host (Erasmus+ route) working on active reconstruction or sim-to-real transfer, and a foreign co-author for P2, are sought with the supervisor in sem. 4.</w:t>
+        <w:t xml:space="preserve"> (1) Z. Kira's group, Georgia Tech: EmbodiedSplat [11]. (2) Multi-robot Systems Lab, Stanford University (M. Schwager): Gaussian-splatting scene models. A European host (Erasmus+ route) working on active reconstruction or sim-to-real transfer, and a foreign co-author for P2, are sought with the supervisor in sem. 4.</w:t>
       </w:r>
     </w:p>
     <w:p>
@@ -9312,7 +8788,7 @@
           <w:rFonts w:cstheme="minorHAnsi"/>
           <w:lang w:val="en-US"/>
         </w:rPr>
-        <w:t xml:space="preserve"> laboratory (Pioneer 3-DX, Jaguar 4x4, ROS 2) and, if available, a PWr manipulator; a written agreement is task T3.2 (Nov 2026).</w:t>
+        <w:t xml:space="preserve"> laboratory (Pioneer 3-DX, Jaguar 4x4, ROS 2); a written agreement is task T3.2 (Nov 2026).</w:t>
       </w:r>
     </w:p>
     <w:p>
@@ -9355,7 +8831,7 @@
           <w:i/>
           <w:lang w:val="en-US"/>
         </w:rPr>
-        <w:t xml:space="preserve">One component gives no gain</w:t>
+        <w:t xml:space="preserve">One stage gives no gain</w:t>
       </w:r>
       <w:r>
         <w:rPr>
@@ -9420,7 +8896,7 @@
           <w:rFonts w:cstheme="minorHAnsi"/>
           <w:lang w:val="en-US"/>
         </w:rPr>
-        <w:t xml:space="preserve"> (4–7): separate sources for twin and reference; tiers B and C check the direction (§9).</w:t>
+        <w:t xml:space="preserve"> (4–7): separate captures for twin and reference, a second reference and robot validation check the direction (§9).</w:t>
       </w:r>
     </w:p>
     <w:p>
@@ -9442,14 +8918,14 @@
           <w:i/>
           <w:lang w:val="en-US"/>
         </w:rPr>
-        <w:t xml:space="preserve">Real-only fine-tuning is strong at small budgets</w:t>
-      </w:r>
-      <w:r>
-        <w:rPr>
-          <w:rFonts w:cstheme="minorHAnsi"/>
-          <w:lang w:val="en-US"/>
-        </w:rPr>
-        <w:t xml:space="preserve"> (6): gains saturate quickly in a known location [13]; H4 is reported as a full budget curve.</w:t>
+        <w:t xml:space="preserve">Learning from real data only is strong at small budgets</w:t>
+      </w:r>
+      <w:r>
+        <w:rPr>
+          <w:rFonts w:cstheme="minorHAnsi"/>
+          <w:lang w:val="en-US"/>
+        </w:rPr>
+        <w:t xml:space="preserve"> (6): in navigation, gains from more data in a known location saturate quickly [8]; H4 is reported as a full budget curve.</w:t>
       </w:r>
     </w:p>
     <w:p>
@@ -9478,7 +8954,7 @@
           <w:rFonts w:cstheme="minorHAnsi"/>
           <w:lang w:val="en-US"/>
         </w:rPr>
-        <w:t xml:space="preserve"> (3–7): ~23k H100-hours (§9); WCSS and PLGrid grants in sem. 3; LoRA and small VLAs for development; if short, fewer seeds and one VLA.</w:t>
+        <w:t xml:space="preserve"> (3–7): WCSS and PLGrid grants in sem. 3; smaller models for development; fewer seeds.</w:t>
       </w:r>
     </w:p>
     <w:p>
@@ -9507,7 +8983,7 @@
           <w:rFonts w:cstheme="minorHAnsi"/>
           <w:lang w:val="en-US"/>
         </w:rPr>
-        <w:t xml:space="preserve"> (3–6): VLA fine-tuning in simulation and world models is crowded, and twin RL for VLAs exists [17, 21]; we claim only the real-data budget of the loop; early preprints.</w:t>
+        <w:t xml:space="preserve"> (3–6): twins, world models and fine-tuning in simulation are active areas, with targeted or real rollouts [27, 28]; we claim only the real-data budget; early preprints.</w:t>
       </w:r>
     </w:p>
     <w:p>
@@ -9536,7 +9012,7 @@
           <w:rFonts w:cstheme="minorHAnsi"/>
           <w:lang w:val="en-US"/>
         </w:rPr>
-        <w:t xml:space="preserve"> (3, 5, 7): OpenVLA weights carry Llama 2 terms and some checkpoints are gated, so openpi's π0 is the fallback; without a robot, tier C moves by a semester (tier A decides).</w:t>
+        <w:t xml:space="preserve"> (3, 5, 7): gated or restricted models have open alternatives; without a robot, validation moves by a semester (the proxy reality decides).</w:t>
       </w:r>
     </w:p>
     <w:p>
@@ -9566,6 +9042,27 @@
           <w:lang w:val="en-US"/>
         </w:rPr>
         <w:t xml:space="preserve"> (4–7): each paper has a resubmission path inside the 200-point set 2–4 months later (NeurIPS → CVPR → ICML → ECCV/ICCV).</w:t>
+      </w:r>
+    </w:p>
+    <w:p>
+      <w:pPr>
+        <w:spacing w:after="120" w:line="240" w:lineRule="auto"/>
+        <w:jc w:val="both"/>
+      </w:pPr>
+      <w:r>
+        <w:rPr>
+          <w:rFonts w:cstheme="minorHAnsi"/>
+          <w:b/>
+          <w:lang w:val="en-US"/>
+        </w:rPr>
+        <w:t xml:space="preserve">Future applicability.</w:t>
+      </w:r>
+      <w:r>
+        <w:rPr>
+          <w:rFonts w:cstheme="minorHAnsi"/>
+          <w:lang w:val="en-US"/>
+        </w:rPr>
+        <w:t xml:space="preserve"> The method is not specific to navigation; robotic manipulation is a natural extension after the dissertation.</w:t>
       </w:r>
     </w:p>
     <w:p>

</xml_diff>

<commit_message>
Wave 17: final review-4 of v6 IPB, fixes applied, docx rebuilt
Closes #34

Co-Authored-By: Claude Opus 5.5 <noreply@anthropic.com>
</commit_message>
<xml_diff>
--- a/output/IPB_Grzegorz_Piotrowski.docx
+++ b/output/IPB_Grzegorz_Piotrowski.docx
@@ -1098,7 +1098,7 @@
           <w:rFonts w:cstheme="minorHAnsi"/>
           <w:lang w:val="en-US"/>
         </w:rPr>
-        <w:t xml:space="preserve"> Uczenie modeli nawigacji robotów w cyfrowych bliźniakach przy mniejszej ilości danych rzeczywistych: metoda rzeczywistość–symulacja–rzeczywistość</w:t>
+        <w:t xml:space="preserve"> Uczenie modeli nawigacji robotów w cyfrowych bliźniakach przy mniejszej ilości danych rzeczywistych: metoda typu rzeczywistość–symulacja–rzeczywistość</w:t>
       </w:r>
       <w:bookmarkStart w:id="0" w:name="_Hlk95566638"/>
     </w:p>
@@ -2047,7 +2047,7 @@
                 <w:rFonts w:cstheme="minorHAnsi"/>
                 <w:lang w:val="en-US"/>
               </w:rPr>
-              <w:t xml:space="preserve"> Formulation of the data-efficient real-to-sim-to-real thesis, research questions RQ1–RQ4 (capture less, learn robustly in an imperfect twin, few real data, budget of the whole loop) and hypotheses H1–H4 with measurable decision rules and evaluation tiers A–C. </w:t>
+              <w:t xml:space="preserve"> Formulation of the data-efficient real-to-sim-to-real thesis, research questions RQ1–RQ4 (capture less, learn robustly in an imperfect twin, few real data, budget of the whole loop) and hypotheses H1–H4 with measurable decision rules and a proxy-reality evaluation protocol. </w:t>
             </w:r>
             <w:r>
               <w:rPr>
@@ -2247,7 +2247,7 @@
                 <w:rFonts w:cstheme="minorHAnsi"/>
                 <w:lang w:val="en-US"/>
               </w:rPr>
-              <w:t xml:space="preserve"> Proxy-reality set-up (§9): ≥ 20 public indoor scenes (10 held out) with laser-scan references and separate phone captures; twins at ≥ 4 capture budgets with an existing neural reconstruction pipeline and the physical properties needed for navigation; navigation tasks, learner and pretrained models running on the twins; pilot fixing task difficulty (below the P ceiling), the operator-time cost model and the GPU cost; WCSS/PLGrid computing grant; pre-registration of the protocol (§9). </w:t>
+              <w:t xml:space="preserve"> Proxy-reality set-up (§9): ≥ 20 public indoor scenes (10 held out) with laser-scan references and separate phone captures; twins at ≥ 4 capture budgets with an existing neural reconstruction pipeline and the physical properties needed for navigation; navigation tasks, learner and pretrained models running on the twins; pilot fixing task difficulty (so that P stays below its ceiling), the operator-time cost model and the GPU cost; WCSS/PLGrid computing grant; pre-registration of the protocol (§9). </w:t>
             </w:r>
             <w:r>
               <w:rPr>
@@ -2507,7 +2507,7 @@
                 <w:rFonts w:cstheme="minorHAnsi"/>
                 <w:lang w:val="en-US"/>
               </w:rPr>
-              <w:t xml:space="preserve"> and first H2 result, </w:t>
+              <w:t xml:space="preserve"> and first H2 result (uncertainty-following training), </w:t>
             </w:r>
             <w:r>
               <w:rPr>
@@ -2530,7 +2530,22 @@
                 <w:b/>
                 <w:lang w:val="en-US"/>
               </w:rPr>
-              <w:t xml:space="preserve">H2 completed, by Jul 2027</w:t>
+              <w:t xml:space="preserve">H2 completed</w:t>
+            </w:r>
+            <w:r>
+              <w:rPr>
+                <w:rFonts w:cstheme="minorHAnsi"/>
+                <w:lang w:val="en-US"/>
+              </w:rPr>
+              <w:t xml:space="preserve"> with the world-model extension, </w:t>
+            </w:r>
+            <w:r>
+              <w:rPr>
+                <w:rFonts w:cstheme="minorHAnsi"/>
+                <w:b/>
+                <w:lang w:val="en-US"/>
+              </w:rPr>
+              <w:t xml:space="preserve">by Jul 2027</w:t>
             </w:r>
             <w:r>
               <w:rPr>
@@ -3182,7 +3197,7 @@
                 <w:rFonts w:cstheme="minorHAnsi"/>
                 <w:lang w:val="en-US"/>
               </w:rPr>
-              <w:t xml:space="preserve"> (the whole pipeline against existing approaches; working title "budget law") submitted to </w:t>
+              <w:t xml:space="preserve"> (the whole pipeline against existing approaches) submitted to </w:t>
             </w:r>
             <w:r>
               <w:rPr>
@@ -4915,7 +4930,7 @@
           <w:rFonts w:cstheme="minorHAnsi"/>
           <w:lang w:val="en-US"/>
         </w:rPr>
-        <w:t xml:space="preserve"> Pretrained navigation foundation models generalize across robots and environments (GNM [21], ViNT [22]), and vision-language-action models map images and instructions to actions, also for navigation [23, 24]; they still need data from the target place to work there. Learned world models predict future observations and can serve as simulators: navigation world models plan by imagining trajectories [25], and open world foundation models are post-trained per setup [26]. Recent work fine-tunes such models in a twin reconstructed from a phone capture and uses it to target real rollouts [27], or improves a world model with real rollouts [28]; each reports results at a fixed, hand-chosen amount of real data. Frozen visual encoders [29] make twin and real observations comparable, and prediction-powered inference [30] estimates real performance from many cheap predictions and a few real labels.</w:t>
+        <w:t xml:space="preserve"> Pretrained navigation foundation models generalize across robots and environments (GNM [21], ViNT [22]), and vision-language-action models map images and instructions to actions, also for navigation [23, 24]; they still need data from the target place to work there. Learned world models predict future observations and can serve as simulators: navigation world models plan by imagining trajectories [25], and open world foundation models are post-trained per setup [26]. Recent work fine-tunes a pretrained policy in a twin reconstructed from a phone capture and uses the twin to target real rollouts [27], or improves a world model with real rollouts [28]; each reports results at a fixed, hand-chosen amount of real data. Frozen visual encoders [29] make twin and real observations comparable, and prediction-powered inference [30] estimates real performance from many cheap predictions and a few real labels.</w:t>
       </w:r>
     </w:p>
     <w:p>
@@ -6316,7 +6331,7 @@
           <w:rFonts w:cstheme="minorHAnsi"/>
           <w:lang w:val="en-US"/>
         </w:rPr>
-        <w:t xml:space="preserve"> Capture of real data guided by what matters for the navigation task and by where the twin is still uncertain, for both appearance and geometry and the physical properties needed for navigation; compared with uniform and task-blind capture.</w:t>
+        <w:t xml:space="preserve"> Capture of real data guided by what matters for the navigation task and by where the twin is still uncertain, for appearance, geometry and the physical properties needed for navigation; compared with uniform and task-blind capture.</w:t>
       </w:r>
     </w:p>
     <w:p>
@@ -6752,7 +6767,7 @@
           <w:rFonts w:cstheme="minorHAnsi"/>
           <w:lang w:val="en-US"/>
         </w:rPr>
-        <w:t xml:space="preserve"> On ≥ 20 public indoor scenes of ScanNet++ [16] (10 held out from all tuning), "reality" is the laser-scan mesh textured from the DSLR images and rendered in Habitat [1] with a robot-camera model. The twin is built from a subset of the separate phone capture of the same scene, so twin and "reality" share neither images nor reconstruction method; the largest capture budget stays below the full capture. Tasks are indoor goal-reaching navigation (e.g. image-goal and instruction-following), with a minimum path length set in a pilot so that P stays below its ceiling. Real data (captured views, real trials and demonstrations) is summed in one operator-time cost. The proxy's own error to held-out real images is reported, and every hypothesis is re-checked for sign with a second reference built from all DSLR images. P = success rate; path efficiency is also reported.</w:t>
+        <w:t xml:space="preserve"> On ≥ 20 public indoor scenes of ScanNet++ [16] (10 held out from all tuning), "reality" is the laser-scan mesh textured from the DSLR images and rendered in Habitat [1] with a robot-camera model. The twin is built from a subset of the separate phone capture of the same scene, so twin and "reality" share neither images nor reconstruction method; the largest capture budget stays below the full capture. Tasks are indoor goal-reaching navigation (e.g. image-goal and point-goal; instruction-following where instructions are available), with a minimum path length set in a pilot so that P stays below its ceiling. "Reality" also has its own physical parameters (e.g. actuation noise), hidden from the method and learned only from counted real data; this physical gap is synthetic, and the robot checks it. Real data (captured views, real trials and demonstrations) is summed in one operator-time cost. The proxy's own error to held-out real images is reported, and every hypothesis is re-checked for sign with a second reference built from all DSLR images. P = success rate; path efficiency is also reported.</w:t>
       </w:r>
     </w:p>
     <w:p>
@@ -6853,7 +6868,7 @@
           <w:rFonts w:cstheme="minorHAnsi"/>
           <w:lang w:val="en-US"/>
         </w:rPr>
-        <w:t xml:space="preserve"> budget–P curves (≥ 4 budgets, the same navigation learner trained in each twin); ≥ 40% less capture than uniform at equal P, with the 95% bound of the ratio below 1.</w:t>
+        <w:t xml:space="preserve"> budget–P curves (≥ 4 budgets, the same navigation learner trained in each twin); ≥ 40% less capture (in views; operator time also reported) than uniform at equal P, with the 95% bound of the ratio below 1.</w:t>
       </w:r>
     </w:p>
     <w:p>
@@ -6896,7 +6911,7 @@
           <w:rFonts w:cstheme="minorHAnsi"/>
           <w:lang w:val="en-US"/>
         </w:rPr>
-        <w:t xml:space="preserve"> the navigation model is initialized from a pretrained foundation model (e.g. a general navigation model or a vision-language-action model [21–24]) and trained in the twin by imitation of planner demonstrations and then by reinforcement learning, with parameter-efficient adaptation where the model is large. Randomization strength follows the twin's uncertainty per region and per physical parameter, and twin samples far from a few real samples in a frozen-encoder space [29] are down-weighted; these real samples are held out from the capture and count towards its budget. A learned world model (e.g. a video world model [25, 26]) adapted on twin data generates additional trajectories where the twin is most uncertain.</w:t>
+        <w:t xml:space="preserve"> the navigation model is initialized from a pretrained foundation model (e.g. a general navigation model or a vision-language-action model [21–24]) and trained in the twin by imitation of planner demonstrations and then by reinforcement learning on a subset of scenes, with parameter-efficient adaptation where the model is large. Randomization strength follows the twin's uncertainty per region and per physical parameter, and twin samples far from a few real samples in a frozen-encoder space [29] are down-weighted; these real samples are held out from the capture and count towards its budget. A learned world model (e.g. a video world model [25, 26]) adapted on twin data generates additional trajectories where the twin is most uncertain.</w:t>
       </w:r>
     </w:p>
     <w:p>
@@ -7076,7 +7091,7 @@
           <w:rFonts w:cstheme="minorHAnsi"/>
           <w:lang w:val="en-US"/>
         </w:rPr>
-        <w:t xml:space="preserve"> Budget curves (real data against P) of the whole method, of the strongest existing real-to-sim-to-real approach (uniform capture, uniform randomization, training in the twin and random or failure-driven real trials, with the same twin, learner and correction; e.g. [14, 27]), and of learning from real data only (imitation of real demonstrations, same initialization). The method's settings are fixed before this stage. </w:t>
+        <w:t xml:space="preserve"> Budget curves (real data against P) of the whole method, of the strongest existing real-to-sim-to-real approach, re-implemented for navigation and tuned with the same effort as the method (uniform capture, uniform randomization, training in the twin and random or failure-driven real trials, with the same reconstruction pipeline, learner and correction; e.g. [14, 27]), and of learning from real data only (imitation of real demonstrations, same initialization). The method's settings are fixed before this stage. </w:t>
       </w:r>
       <w:r>
         <w:rPr>
@@ -7415,7 +7430,7 @@
           <w:rFonts w:cstheme="minorHAnsi"/>
           <w:lang w:val="pl-PL"/>
         </w:rPr>
-        <w:t xml:space="preserve">Celem rozprawy jest opracowanie metody, która przejdzie tę drogę z dużo mniejszą ilością prawdziwych danych niż dotychczasowe podejścia. W pierwszym kroku zamiast nagrywać wszystko po równo, będziemy nagrywać przede wszystkim te miejsca, które są ważne dla poruszania się robota, a o których kopia wie jeszcze za mało. W drugim kroku, ponieważ kopia nigdy nie jest idealna, będziemy uczyć model tak, aby nie polegał na jej niepewnych fragmentach; pomogą w tym model świata, czyli program, który uczy się przewidywać, co wydarzy się dalej, oraz duże modele wstępnie wytrenowane na wielu innych danych. W trzecim kroku wybierzemy tylko te nieliczne próby w rzeczywistości, które najwięcej mówią o tym, gdzie kopia i model jeszcze się mylą, i wykorzystamy je do ich poprawienia. Badania będą prowadzone przede wszystkim na publicznie dostępnych skanach prawdziwych budynków, a wyniki zostaną potwierdzone na prawdziwym robocie.</w:t>
+        <w:t xml:space="preserve">Celem rozprawy jest opracowanie metody, która przejdzie tę drogę z dużo mniejszą ilością prawdziwych danych niż dotychczasowe podejścia. W pierwszym kroku, zamiast nagrywać wszystko po równo, będziemy nagrywać przede wszystkim te miejsca, które są ważne dla poruszania się robota, a o których kopia wie jeszcze za mało. W drugim kroku, ponieważ kopia nigdy nie jest idealna, będziemy uczyć model tak, aby nie polegał na jej niepewnych fragmentach; pomogą w tym model świata, czyli program, który uczy się przewidywać, co wydarzy się dalej, oraz duże modele wstępnie wytrenowane na wielu innych danych. W trzecim kroku wybierzemy tylko te nieliczne próby w rzeczywistości, które najwięcej mówią o tym, gdzie kopia i model jeszcze się mylą, i wykorzystamy je do ich poprawienia. Badania będą prowadzone przede wszystkim na publicznie dostępnych skanach prawdziwych budynków, a wyniki zostaną potwierdzone na prawdziwym robocie.</w:t>
       </w:r>
     </w:p>
     <w:p>
@@ -7428,7 +7443,7 @@
           <w:rFonts w:cstheme="minorHAnsi"/>
           <w:lang w:val="pl-PL"/>
         </w:rPr>
-        <w:t xml:space="preserve">Spodziewanym efektem jest metoda, która pozwoli nauczyć robota poruszania się w nowym budynku przy dużo mniejszej ilości prawdziwych danych, oraz pomiar, ile prawdziwych danych oszczędza w porównaniu z dotychczasowymi podejściami. Może to przyspieszyć i potanić wdrażanie robotów mobilnych w magazynach, szpitalach i biurach. Opracowane oprogramowanie zostanie udostępnione publicznie.</w:t>
+        <w:t xml:space="preserve">Spodziewanym efektem jest metoda, która pozwoli nauczyć robota poruszania się w nowym budynku przy dużo mniejszej ilości prawdziwych danych, oraz pomiar tego, ile prawdziwych danych pozwala ona zaoszczędzić w porównaniu z dotychczasowymi podejściami. Może to przyspieszyć i potanić wdrażanie robotów mobilnych w magazynach, szpitalach i biurach. Opracowane oprogramowanie zostanie udostępnione publicznie.</w:t>
       </w:r>
     </w:p>
     <w:permEnd w:id="301016009"/>
@@ -7960,7 +7975,7 @@
           <w:rFonts w:cstheme="minorHAnsi"/>
           <w:lang w:val="en-US"/>
         </w:rPr>
-        <w:t xml:space="preserve">. P1 reports the first two stages of the method for navigation models (stage 1 and the first stage 2 results, RQ1–RQ2): capture of real data guided by the navigation task and by the twin's uncertainty (H1), and training of navigation models that follows the twin's uncertainty, with the twin extended by a learned world model (first H2 results). Both are evaluated on public scans of real buildings by the real data they save (task T4.2). If it is rejected, the revised paper goes to </w:t>
+        <w:t xml:space="preserve">. P1 reports the first two stages of the method for navigation models (stage 1 and the first stage 2 results, RQ1–RQ2): capture of real data guided by the navigation task and by the twin's uncertainty (H1), and training of navigation models that follows the twin's uncertainty (first H2 results). Both are evaluated on public scans of real buildings by the real data they save (task T4.2). If it is rejected, the revised paper goes to </w:t>
       </w:r>
       <w:r>
         <w:rPr>

</xml_diff>

<commit_message>
Wave 18: v7 - method that reduces real data (3 mechanisms), nav main + manip generalization, deep-research recommendations applied
Closes #35

Co-Authored-By: Claude Opus 5.5 <noreply@anthropic.com>
</commit_message>
<xml_diff>
--- a/output/IPB_Grzegorz_Piotrowski.docx
+++ b/output/IPB_Grzegorz_Piotrowski.docx
@@ -1098,7 +1098,7 @@
           <w:rFonts w:cstheme="minorHAnsi"/>
           <w:lang w:val="en-US"/>
         </w:rPr>
-        <w:t xml:space="preserve"> Uczenie modeli nawigacji robotów w cyfrowych bliźniakach przy mniejszej ilości danych rzeczywistych: metoda typu rzeczywistość–symulacja–rzeczywistość</w:t>
+        <w:t xml:space="preserve"> Ograniczanie ilości danych rzeczywistych w uczeniu robotów w pętli rzeczywistość–symulacja– rzeczywistość z cyfrowymi bliźniakami: metoda z zastosowaniem w nawigacji i manipulacji</w:t>
       </w:r>
       <w:bookmarkStart w:id="0" w:name="_Hlk95566638"/>
     </w:p>
@@ -1120,7 +1120,7 @@
           <w:rFonts w:cstheme="minorHAnsi"/>
           <w:lang w:val="en-US"/>
         </w:rPr>
-        <w:t xml:space="preserve"> Learning robot navigation models in digital twins with less real data: a real-to-sim-to-real method</w:t>
+        <w:t xml:space="preserve"> Reducing the amount of real data in real-to-sim-to-real robot learning with digital twins: a method with applications to navigation and manipulation</w:t>
       </w:r>
     </w:p>
     <w:bookmarkEnd w:id="0"/>
@@ -2226,7 +2226,7 @@
                 <w:b/>
                 <w:lang w:val="en-US"/>
               </w:rPr>
-              <w:t xml:space="preserve">Stage 1 – transfer of real data into a digital twin (RQ1, H1).</w:t>
+              <w:t xml:space="preserve">Mechanism 1 – less capture (RQ1, H1).</w:t>
             </w:r>
           </w:p>
           <w:p>
@@ -2247,7 +2247,7 @@
                 <w:rFonts w:cstheme="minorHAnsi"/>
                 <w:lang w:val="en-US"/>
               </w:rPr>
-              <w:t xml:space="preserve"> Proxy-reality set-up (§9): ≥ 20 public indoor scenes (10 held out) with laser-scan references and separate phone captures; twins at ≥ 4 capture budgets with an existing neural reconstruction pipeline and the physical properties needed for navigation; navigation tasks, learner and pretrained models running on the twins; pilot fixing task difficulty (so that P stays below its ceiling), the operator-time cost model and the GPU cost; WCSS/PLGrid computing grant; pre-registration of the protocol (§9). </w:t>
+              <w:t xml:space="preserve"> Proxy-reality set-up (§9): application for the ScanNet++ licence (signed by the supervisor) and for a PLGrid computing grant in Oct 2026; ≥ 20 ScanNet++ scenes (10 held out) and the MuSHRoom rooms, with laser-scan or mesh references and separate phone captures; twins on the budget grid with the open simulator, 3DGS and structure-from-motion tools; hidden physical parameters of "reality"; navigation tasks, learner and pretrained models running on the twins; pilot fixing the difficulty regime, the operator-minute cost model, the sim-vs-real correlation between twin and "reality" and the GPU cost; pre-registration of the mechanism 1 baselines. </w:t>
             </w:r>
             <w:r>
               <w:rPr>
@@ -2262,7 +2262,7 @@
                 <w:rFonts w:cstheme="minorHAnsi"/>
                 <w:lang w:val="en-US"/>
               </w:rPr>
-              <w:t xml:space="preserve"> working pipeline and protocol in the repository, </w:t>
+              <w:t xml:space="preserve"> working pipeline and pre-registered protocol in the repository, </w:t>
             </w:r>
             <w:r>
               <w:rPr>
@@ -2298,7 +2298,7 @@
                 <w:rFonts w:cstheme="minorHAnsi"/>
                 <w:lang w:val="en-US"/>
               </w:rPr>
-              <w:t xml:space="preserve"> Validation stand: written agreement on robot access (planned cooperation with the K29 Denali laboratory) and sensor decision (SzD Minigrant application if a sensor must be bought). </w:t>
+              <w:t xml:space="preserve"> Validation stand: SzD Minigrant application for a small mobile robot, or a written agreement on robot access with the K29 Denali laboratory. </w:t>
             </w:r>
             <w:r>
               <w:rPr>
@@ -2313,7 +2313,7 @@
                 <w:rFonts w:cstheme="minorHAnsi"/>
                 <w:lang w:val="en-US"/>
               </w:rPr>
-              <w:t xml:space="preserve"> agreement, </w:t>
+              <w:t xml:space="preserve"> application or agreement, </w:t>
             </w:r>
             <w:r>
               <w:rPr>
@@ -2349,7 +2349,7 @@
                 <w:rFonts w:cstheme="minorHAnsi"/>
                 <w:lang w:val="en-US"/>
               </w:rPr>
-              <w:t xml:space="preserve"> Stage 1 method: capture guided by the navigation task and the twin's uncertainty vs. uniform, task-blind and risk-weighted selection, judged by the success of the navigation model trained in each twin. </w:t>
+              <w:t xml:space="preserve"> Mechanism 1: capture guided by the task and by the twin's uncertainty vs. uniform, task-blind and task-weighted selection, judged by the success of the model trained in each twin. </w:t>
             </w:r>
             <w:r>
               <w:rPr>
@@ -2456,7 +2456,7 @@
                 <w:b/>
                 <w:lang w:val="en-US"/>
               </w:rPr>
-              <w:t xml:space="preserve">Stage 1 completed; Stage 2 – training navigation models in the twin (RQ1–RQ2, H1–H2).</w:t>
+              <w:t xml:space="preserve">Mechanism 1 completed; mechanism 2 – better use of simulation (RQ1–RQ2, H1–H2).</w:t>
             </w:r>
           </w:p>
           <w:p>
@@ -2477,7 +2477,7 @@
                 <w:rFonts w:cstheme="minorHAnsi"/>
                 <w:lang w:val="en-US"/>
               </w:rPr>
-              <w:t xml:space="preserve"> Stage 2 method: training that follows the twin's uncertainty, with the twin extended by a learned world model and the model initialized from pretrained foundation models, vs. uniform domain randomization, at equal capture budgets. </w:t>
+              <w:t xml:space="preserve"> Mechanism 1 completed: full budget curves against all pre-registered baselines. </w:t>
             </w:r>
             <w:r>
               <w:rPr>
@@ -2507,7 +2507,7 @@
                 <w:rFonts w:cstheme="minorHAnsi"/>
                 <w:lang w:val="en-US"/>
               </w:rPr>
-              <w:t xml:space="preserve"> and first H2 result (uncertainty-following training), </w:t>
+              <w:t xml:space="preserve"> on the proxy reality and an early preprint of the result, </w:t>
             </w:r>
             <w:r>
               <w:rPr>
@@ -2522,37 +2522,7 @@
                 <w:rFonts w:cstheme="minorHAnsi"/>
                 <w:lang w:val="en-US"/>
               </w:rPr>
-              <w:t xml:space="preserve">; </w:t>
-            </w:r>
-            <w:r>
-              <w:rPr>
-                <w:rFonts w:cstheme="minorHAnsi"/>
-                <w:b/>
-                <w:lang w:val="en-US"/>
-              </w:rPr>
-              <w:t xml:space="preserve">H2 completed</w:t>
-            </w:r>
-            <w:r>
-              <w:rPr>
-                <w:rFonts w:cstheme="minorHAnsi"/>
-                <w:lang w:val="en-US"/>
-              </w:rPr>
-              <w:t xml:space="preserve"> with the world-model extension, </w:t>
-            </w:r>
-            <w:r>
-              <w:rPr>
-                <w:rFonts w:cstheme="minorHAnsi"/>
-                <w:b/>
-                <w:lang w:val="en-US"/>
-              </w:rPr>
-              <w:t xml:space="preserve">by Jul 2027</w:t>
-            </w:r>
-            <w:r>
-              <w:rPr>
-                <w:rFonts w:cstheme="minorHAnsi"/>
-                <w:lang w:val="en-US"/>
-              </w:rPr>
-              <w:t xml:space="preserve">. Place: K46, WCSS.</w:t>
+              <w:t xml:space="preserve">.</w:t>
             </w:r>
           </w:p>
           <w:p>
@@ -2588,7 +2558,7 @@
                 <w:rFonts w:cstheme="minorHAnsi"/>
                 <w:lang w:val="en-US"/>
               </w:rPr>
-              <w:t xml:space="preserve"> (stage 1, H1, and first stage 2 results, H2). </w:t>
+              <w:t xml:space="preserve"> (mechanism 1, H1, in navigation). </w:t>
             </w:r>
             <w:r>
               <w:rPr>
@@ -2639,7 +2609,7 @@
                 <w:rFonts w:cstheme="minorHAnsi"/>
                 <w:lang w:val="en-US"/>
               </w:rPr>
-              <w:t xml:space="preserve"> Stage 3 set-up: selection of real trials by the predicted twin-to-reality gap and correction code on the proxy reality (Jul–Sep 2027). </w:t>
+              <w:t xml:space="preserve"> Mechanism 2: training that follows the twin's uncertainty, initialized from pretrained foundation models, vs. uniform and no domain randomization in the pre-registered difficulty regime; the world-model extension as an ablation. </w:t>
             </w:r>
             <w:r>
               <w:rPr>
@@ -2654,7 +2624,7 @@
                 <w:rFonts w:cstheme="minorHAnsi"/>
                 <w:lang w:val="en-US"/>
               </w:rPr>
-              <w:t xml:space="preserve"> first H3 result, </w:t>
+              <w:t xml:space="preserve"> first H2 result </w:t>
             </w:r>
             <w:r>
               <w:rPr>
@@ -2662,14 +2632,44 @@
                 <w:b/>
                 <w:lang w:val="en-US"/>
               </w:rPr>
-              <w:t xml:space="preserve">by Sep 2027</w:t>
-            </w:r>
-            <w:r>
-              <w:rPr>
-                <w:rFonts w:cstheme="minorHAnsi"/>
-                <w:lang w:val="en-US"/>
-              </w:rPr>
-              <w:t xml:space="preserve">.</w:t>
+              <w:t xml:space="preserve">by Jun 2027</w:t>
+            </w:r>
+            <w:r>
+              <w:rPr>
+                <w:rFonts w:cstheme="minorHAnsi"/>
+                <w:lang w:val="en-US"/>
+              </w:rPr>
+              <w:t xml:space="preserve">; </w:t>
+            </w:r>
+            <w:r>
+              <w:rPr>
+                <w:rFonts w:cstheme="minorHAnsi"/>
+                <w:b/>
+                <w:lang w:val="en-US"/>
+              </w:rPr>
+              <w:t xml:space="preserve">H2 completed</w:t>
+            </w:r>
+            <w:r>
+              <w:rPr>
+                <w:rFonts w:cstheme="minorHAnsi"/>
+                <w:lang w:val="en-US"/>
+              </w:rPr>
+              <w:t xml:space="preserve"> with the ablations, </w:t>
+            </w:r>
+            <w:r>
+              <w:rPr>
+                <w:rFonts w:cstheme="minorHAnsi"/>
+                <w:b/>
+                <w:lang w:val="en-US"/>
+              </w:rPr>
+              <w:t xml:space="preserve">by Jul 2027</w:t>
+            </w:r>
+            <w:r>
+              <w:rPr>
+                <w:rFonts w:cstheme="minorHAnsi"/>
+                <w:lang w:val="en-US"/>
+              </w:rPr>
+              <w:t xml:space="preserve">. Place: K46, WCSS.</w:t>
             </w:r>
           </w:p>
           <w:p>
@@ -2684,6 +2684,57 @@
                 <w:lang w:val="en-US"/>
               </w:rPr>
               <w:t xml:space="preserve">T4.4</w:t>
+            </w:r>
+            <w:r>
+              <w:rPr>
+                <w:rFonts w:cstheme="minorHAnsi"/>
+                <w:lang w:val="en-US"/>
+              </w:rPr>
+              <w:t xml:space="preserve"> Mechanism 3 set-up: gap prediction, selection and correction code on the proxy reality, check of the sim-vs-real precondition (Jul–Sep 2027). </w:t>
+            </w:r>
+            <w:r>
+              <w:rPr>
+                <w:rFonts w:cstheme="minorHAnsi"/>
+                <w:i/>
+                <w:lang w:val="en-US"/>
+              </w:rPr>
+              <w:t xml:space="preserve">D:</w:t>
+            </w:r>
+            <w:r>
+              <w:rPr>
+                <w:rFonts w:cstheme="minorHAnsi"/>
+                <w:lang w:val="en-US"/>
+              </w:rPr>
+              <w:t xml:space="preserve"> first H3 result, </w:t>
+            </w:r>
+            <w:r>
+              <w:rPr>
+                <w:rFonts w:cstheme="minorHAnsi"/>
+                <w:b/>
+                <w:lang w:val="en-US"/>
+              </w:rPr>
+              <w:t xml:space="preserve">by Sep 2027</w:t>
+            </w:r>
+            <w:r>
+              <w:rPr>
+                <w:rFonts w:cstheme="minorHAnsi"/>
+                <w:lang w:val="en-US"/>
+              </w:rPr>
+              <w:t xml:space="preserve">.</w:t>
+            </w:r>
+          </w:p>
+          <w:p>
+            <w:pPr>
+              <w:spacing w:after="40" w:line="240" w:lineRule="auto"/>
+              <w:jc w:val="left"/>
+            </w:pPr>
+            <w:r>
+              <w:rPr>
+                <w:rFonts w:cstheme="minorHAnsi"/>
+                <w:b/>
+                <w:lang w:val="en-US"/>
+              </w:rPr>
+              <w:t xml:space="preserve">T4.5</w:t>
             </w:r>
             <w:r>
               <w:rPr>
@@ -2798,7 +2849,7 @@
                 <w:b/>
                 <w:lang w:val="en-US"/>
               </w:rPr>
-              <w:t xml:space="preserve">Stage 3 – transfer back to reality with few real data (RQ3, H3).</w:t>
+              <w:t xml:space="preserve">Mechanism 3 – fewer real trials (RQ3, H3); manipulation set-up.</w:t>
             </w:r>
           </w:p>
           <w:p>
@@ -2819,7 +2870,7 @@
                 <w:rFonts w:cstheme="minorHAnsi"/>
                 <w:lang w:val="en-US"/>
               </w:rPr>
-              <w:t xml:space="preserve"> Stage 3 method: active selection of real trials vs. random and twin-only failure-driven selection; correction of the twin (appearance, geometry, physical properties) and of the navigation model with the selected trials. </w:t>
+              <w:t xml:space="preserve"> Mechanism 3: selection of real trials by the predicted twin-to-reality gap vs. random, uniform-coverage and failure-driven selection; correction of the twin (appearance, geometry, physical parameters) and of the model with the selected trials. </w:t>
             </w:r>
             <w:r>
               <w:rPr>
@@ -2885,7 +2936,7 @@
                 <w:rFonts w:cstheme="minorHAnsi"/>
                 <w:lang w:val="en-US"/>
               </w:rPr>
-              <w:t xml:space="preserve"> First robot validation campaign (2 PWr rooms, ~8 robot-hours): own captures, twins, uniform capture vs. the method. </w:t>
+              <w:t xml:space="preserve"> First robot validation campaign (2 PWr rooms, ~8 robot-hours): own captures, twins, uniform capture vs. the method, sim-vs-real correlation between proxy and robot. </w:t>
             </w:r>
             <w:r>
               <w:rPr>
@@ -2900,7 +2951,7 @@
                 <w:rFonts w:cstheme="minorHAnsi"/>
                 <w:lang w:val="en-US"/>
               </w:rPr>
-              <w:t xml:space="preserve"> validation report. Place: Denali. Without robot access, the campaign moves to sem. 7; H1–H3 are decided on the proxy reality either way.</w:t>
+              <w:t xml:space="preserve"> validation report. Place: K46 or Denali. Without a robot, the campaign moves to sem. 7; H1–H3 are decided on the proxy reality either way.</w:t>
             </w:r>
           </w:p>
           <w:p>
@@ -2921,6 +2972,57 @@
                 <w:rFonts w:cstheme="minorHAnsi"/>
                 <w:lang w:val="en-US"/>
               </w:rPr>
+              <w:t xml:space="preserve"> Generalization set-up: manipulation proxy reality with hidden physical parameters (§9) and mechanisms 1–2 run on it unchanged. </w:t>
+            </w:r>
+            <w:r>
+              <w:rPr>
+                <w:rFonts w:cstheme="minorHAnsi"/>
+                <w:i/>
+                <w:lang w:val="en-US"/>
+              </w:rPr>
+              <w:t xml:space="preserve">D:</w:t>
+            </w:r>
+            <w:r>
+              <w:rPr>
+                <w:rFonts w:cstheme="minorHAnsi"/>
+                <w:lang w:val="en-US"/>
+              </w:rPr>
+              <w:t xml:space="preserve"> first manipulation budget curves, </w:t>
+            </w:r>
+            <w:r>
+              <w:rPr>
+                <w:rFonts w:cstheme="minorHAnsi"/>
+                <w:b/>
+                <w:lang w:val="en-US"/>
+              </w:rPr>
+              <w:t xml:space="preserve">by Dec 2027</w:t>
+            </w:r>
+            <w:r>
+              <w:rPr>
+                <w:rFonts w:cstheme="minorHAnsi"/>
+                <w:lang w:val="en-US"/>
+              </w:rPr>
+              <w:t xml:space="preserve">.</w:t>
+            </w:r>
+          </w:p>
+          <w:p>
+            <w:pPr>
+              <w:spacing w:after="40" w:line="240" w:lineRule="auto"/>
+              <w:jc w:val="left"/>
+            </w:pPr>
+            <w:r>
+              <w:rPr>
+                <w:rFonts w:cstheme="minorHAnsi"/>
+                <w:b/>
+                <w:lang w:val="en-US"/>
+              </w:rPr>
+              <w:t xml:space="preserve">T5.4</w:t>
+            </w:r>
+            <w:r>
+              <w:rPr>
+                <w:rFonts w:cstheme="minorHAnsi"/>
+                <w:lang w:val="en-US"/>
+              </w:rPr>
               <w:t xml:space="preserve"> </w:t>
             </w:r>
             <w:r>
@@ -2936,7 +3038,7 @@
                 <w:rFonts w:cstheme="minorHAnsi"/>
                 <w:lang w:val="en-US"/>
               </w:rPr>
-              <w:t xml:space="preserve"> (stage 3: few real data and twin correction, RQ3) submitted to </w:t>
+              <w:t xml:space="preserve"> (mechanisms 2–3, RQ2–RQ3, in navigation, with the first manipulation results) submitted to </w:t>
             </w:r>
             <w:r>
               <w:rPr>
@@ -3044,7 +3146,7 @@
                 <w:b/>
                 <w:lang w:val="en-US"/>
               </w:rPr>
-              <w:t xml:space="preserve">The whole pipeline (RQ4, H4, the thesis).</w:t>
+              <w:t xml:space="preserve">The whole method (RQ4, H4, the thesis) and its generalization.</w:t>
             </w:r>
           </w:p>
           <w:p>
@@ -3065,7 +3167,7 @@
                 <w:rFonts w:cstheme="minorHAnsi"/>
                 <w:lang w:val="en-US"/>
               </w:rPr>
-              <w:t xml:space="preserve"> Real-data budget curves of the whole method vs. the strongest existing real-to-sim-to-real approach and vs. learning from real data only ("exchange rate"), with the method's settings fixed in advance. </w:t>
+              <w:t xml:space="preserve"> Budget curves of the whole method vs. the assembled, pre-registered strongest existing real-to-sim-to-real approach and vs. learning from real data only, with the method's settings fixed in advance; the whole method, unchanged, in manipulation. </w:t>
             </w:r>
             <w:r>
               <w:rPr>
@@ -3080,7 +3182,7 @@
                 <w:rFonts w:cstheme="minorHAnsi"/>
                 <w:lang w:val="en-US"/>
               </w:rPr>
-              <w:t xml:space="preserve"> first result </w:t>
+              <w:t xml:space="preserve"> first H4 result </w:t>
             </w:r>
             <w:r>
               <w:rPr>
@@ -3089,6 +3191,21 @@
                 <w:lang w:val="en-US"/>
               </w:rPr>
               <w:t xml:space="preserve">by Apr 2028</w:t>
+            </w:r>
+            <w:r>
+              <w:rPr>
+                <w:rFonts w:cstheme="minorHAnsi"/>
+                <w:lang w:val="en-US"/>
+              </w:rPr>
+              <w:t xml:space="preserve">; manipulation curves </w:t>
+            </w:r>
+            <w:r>
+              <w:rPr>
+                <w:rFonts w:cstheme="minorHAnsi"/>
+                <w:b/>
+                <w:lang w:val="en-US"/>
+              </w:rPr>
+              <w:t xml:space="preserve">by Jul 2028</w:t>
             </w:r>
             <w:r>
               <w:rPr>
@@ -3197,7 +3314,7 @@
                 <w:rFonts w:cstheme="minorHAnsi"/>
                 <w:lang w:val="en-US"/>
               </w:rPr>
-              <w:t xml:space="preserve"> (the whole pipeline against existing approaches) submitted to </w:t>
+              <w:t xml:space="preserve"> (the whole method against existing approaches, with the generalization to manipulation) submitted to </w:t>
             </w:r>
             <w:r>
               <w:rPr>
@@ -3377,7 +3494,7 @@
                 <w:rFonts w:cstheme="minorHAnsi"/>
                 <w:lang w:val="en-US"/>
               </w:rPr>
-              <w:t xml:space="preserve"> Release of the method's code and experiment scripts (where dataset and model licences permit). </w:t>
+              <w:t xml:space="preserve"> Release of the method's code, configurations, scene lists, seeds, pre-registrations and the releasable twins (no assets derived from ScanNet++). </w:t>
             </w:r>
             <w:r>
               <w:rPr>
@@ -4270,22 +4387,7 @@
           <w:rFonts w:cstheme="minorHAnsi"/>
           <w:lang w:val="en-US"/>
         </w:rPr>
-        <w:t xml:space="preserve">Mobile robots that move around buildings, such as service, delivery, inspection and assistive robots, rely increasingly on learned </w:t>
-      </w:r>
-      <w:r>
-        <w:rPr>
-          <w:rFonts w:cstheme="minorHAnsi"/>
-          <w:b/>
-          <w:lang w:val="en-US"/>
-        </w:rPr>
-        <w:t xml:space="preserve">navigation models</w:t>
-      </w:r>
-      <w:r>
-        <w:rPr>
-          <w:rFonts w:cstheme="minorHAnsi"/>
-          <w:lang w:val="en-US"/>
-        </w:rPr>
-        <w:t xml:space="preserve">. Such models need a lot of experience from the place where they will work, and collecting it in reality is slow, expensive and sometimes unsafe. Training in simulation avoids this cost but opens a </w:t>
+        <w:t xml:space="preserve">Robots that learn a task from experience, such as moving around a building or handling objects, need a lot of that experience from the place where they will work, and collecting it in reality is slow, expensive and sometimes unsafe. Training in simulation avoids this cost but opens a </w:t>
       </w:r>
       <w:r>
         <w:rPr>
@@ -4300,7 +4402,37 @@
           <w:rFonts w:cstheme="minorHAnsi"/>
           <w:lang w:val="en-US"/>
         </w:rPr>
-        <w:t xml:space="preserve">: a model that works in a generic simulator often fails in a real building.</w:t>
+        <w:t xml:space="preserve">: a model that works in a generic simulator often fails in the real place. </w:t>
+      </w:r>
+      <w:r>
+        <w:rPr>
+          <w:rFonts w:cstheme="minorHAnsi"/>
+          <w:b/>
+          <w:lang w:val="en-US"/>
+        </w:rPr>
+        <w:t xml:space="preserve">Digital twins</w:t>
+      </w:r>
+      <w:r>
+        <w:rPr>
+          <w:rFonts w:cstheme="minorHAnsi"/>
+          <w:lang w:val="en-US"/>
+        </w:rPr>
+        <w:t xml:space="preserve"> built from real data narrow this gap. Neural scene reconstruction turns a short video of a real scene into a photorealistic model of its geometry and appearance, and a few measurements give the physical properties that matter for the task. This gives the </w:t>
+      </w:r>
+      <w:r>
+        <w:rPr>
+          <w:rFonts w:cstheme="minorHAnsi"/>
+          <w:b/>
+          <w:lang w:val="en-US"/>
+        </w:rPr>
+        <w:t xml:space="preserve">real-to-sim-to-real loop</w:t>
+      </w:r>
+      <w:r>
+        <w:rPr>
+          <w:rFonts w:cstheme="minorHAnsi"/>
+          <w:lang w:val="en-US"/>
+        </w:rPr>
+        <w:t xml:space="preserve">: acquire real data, build a twin, train the robot's model in it at scale, and transfer it back to reality, where a little more real data checks and corrects the twin and the model. Each part of the loop is an active research area, and twins built from a phone video already train navigation and manipulation models that work in reality.</w:t>
       </w:r>
     </w:p>
     <w:p>
@@ -4311,77 +4443,24 @@
       <w:r>
         <w:rPr>
           <w:rFonts w:cstheme="minorHAnsi"/>
-          <w:b/>
-          <w:lang w:val="en-US"/>
-        </w:rPr>
-        <w:t xml:space="preserve">Digital twins</w:t>
-      </w:r>
-      <w:r>
-        <w:rPr>
-          <w:rFonts w:cstheme="minorHAnsi"/>
-          <w:lang w:val="en-US"/>
-        </w:rPr>
-        <w:t xml:space="preserve"> built from real data narrow this gap. Neural scene reconstruction turns a short video or depth capture of a real building into a photorealistic model of its geometry and appearance, and a few measurements give the physical properties that matter for navigation. Learned </w:t>
-      </w:r>
-      <w:r>
-        <w:rPr>
-          <w:rFonts w:cstheme="minorHAnsi"/>
-          <w:b/>
-          <w:lang w:val="en-US"/>
-        </w:rPr>
-        <w:t xml:space="preserve">world models</w:t>
-      </w:r>
-      <w:r>
-        <w:rPr>
-          <w:rFonts w:cstheme="minorHAnsi"/>
-          <w:lang w:val="en-US"/>
-        </w:rPr>
-        <w:t xml:space="preserve"> can generate further situations, and pretrained </w:t>
-      </w:r>
-      <w:r>
-        <w:rPr>
-          <w:rFonts w:cstheme="minorHAnsi"/>
-          <w:b/>
-          <w:lang w:val="en-US"/>
-        </w:rPr>
-        <w:t xml:space="preserve">foundation models</w:t>
-      </w:r>
-      <w:r>
-        <w:rPr>
-          <w:rFonts w:cstheme="minorHAnsi"/>
-          <w:lang w:val="en-US"/>
-        </w:rPr>
-        <w:t xml:space="preserve"> provide a strong starting point. This gives a </w:t>
-      </w:r>
-      <w:r>
-        <w:rPr>
-          <w:rFonts w:cstheme="minorHAnsi"/>
-          <w:b/>
-          <w:lang w:val="en-US"/>
-        </w:rPr>
-        <w:t xml:space="preserve">real-to-sim-to-real pipeline</w:t>
-      </w:r>
-      <w:r>
-        <w:rPr>
-          <w:rFonts w:cstheme="minorHAnsi"/>
-          <w:lang w:val="en-US"/>
-        </w:rPr>
-        <w:t xml:space="preserve">: acquire real data, build a twin, train the navigation model in it at scale, and transfer it back to reality, where a little more real data checks and corrects the twin and the model. Each of these parts is an active research area. What remains open is the </w:t>
-      </w:r>
-      <w:r>
-        <w:rPr>
-          <w:rFonts w:cstheme="minorHAnsi"/>
-          <w:b/>
-          <w:lang w:val="en-US"/>
-        </w:rPr>
-        <w:t xml:space="preserve">real data</w:t>
-      </w:r>
-      <w:r>
-        <w:rPr>
-          <w:rFonts w:cstheme="minorHAnsi"/>
-          <w:lang w:val="en-US"/>
-        </w:rPr>
-        <w:t xml:space="preserve"> the whole pipeline consumes: the capture that builds the twin, the real samples that make training robust to what the twin got wrong, and the real trials that correct the result. Today these amounts are chosen by habit: data is captured uniformly, training uses generic randomization, and real trials are picked at random or by hand. How much real data a twin actually saves in navigation has, to our knowledge, not been measured systematically.</w:t>
+          <w:lang w:val="en-US"/>
+        </w:rPr>
+        <w:t xml:space="preserve">What remains open is </w:t>
+      </w:r>
+      <w:r>
+        <w:rPr>
+          <w:rFonts w:cstheme="minorHAnsi"/>
+          <w:b/>
+          <w:lang w:val="en-US"/>
+        </w:rPr>
+        <w:t xml:space="preserve">how much real data the loop needs, and how to need less of it</w:t>
+      </w:r>
+      <w:r>
+        <w:rPr>
+          <w:rFonts w:cstheme="minorHAnsi"/>
+          <w:lang w:val="en-US"/>
+        </w:rPr>
+        <w:t xml:space="preserve">. In every existing pipeline the amount is fixed by hand: the scene is captured uniformly, training uses generic randomization, and real trials, if any at all, are chosen at random or by hand. To our knowledge, no navigation pipeline has a stage that corrects the twin with real trials, and none reports how success depends on the real data spent; in manipulation such accounting exists only at single points.</w:t>
       </w:r>
     </w:p>
     <w:p>
@@ -4410,29 +4489,59 @@
           <w:b/>
           <w:lang w:val="en-US"/>
         </w:rPr>
-        <w:t xml:space="preserve">a method</w:t>
-      </w:r>
-      <w:r>
-        <w:rPr>
-          <w:rFonts w:cstheme="minorHAnsi"/>
-          <w:lang w:val="en-US"/>
-        </w:rPr>
-        <w:t xml:space="preserve"> for real-to-sim-to-real learning of navigation models that reaches a given real-world navigation performance with </w:t>
-      </w:r>
-      <w:r>
-        <w:rPr>
-          <w:rFonts w:cstheme="minorHAnsi"/>
-          <w:b/>
-          <w:lang w:val="en-US"/>
-        </w:rPr>
-        <w:t xml:space="preserve">significantly less real data</w:t>
-      </w:r>
-      <w:r>
-        <w:rPr>
-          <w:rFonts w:cstheme="minorHAnsi"/>
-          <w:lang w:val="en-US"/>
-        </w:rPr>
-        <w:t xml:space="preserve"> than existing approaches. The method covers the three stages of the pipeline: (1) deciding which real data is worth acquiring to build the twin, (2) training navigation models in the imperfect twin, extended with world models and foundation models, so that its errors do not transfer, and (3) choosing the few real data that best correct the twin and the model. The thesis is that the whole method needs at least two times less real data than the strongest existing real-to-sim-to-real approach.</w:t>
+        <w:t xml:space="preserve">a method that reduces the amount of real data</w:t>
+      </w:r>
+      <w:r>
+        <w:rPr>
+          <w:rFonts w:cstheme="minorHAnsi"/>
+          <w:lang w:val="en-US"/>
+        </w:rPr>
+        <w:t xml:space="preserve"> needed to teach a robot a task through the real-to-sim-to-real loop. The method acts at every step of the loop with one reduction mechanism: (1) </w:t>
+      </w:r>
+      <w:r>
+        <w:rPr>
+          <w:rFonts w:cstheme="minorHAnsi"/>
+          <w:b/>
+          <w:lang w:val="en-US"/>
+        </w:rPr>
+        <w:t xml:space="preserve">less capture</w:t>
+      </w:r>
+      <w:r>
+        <w:rPr>
+          <w:rFonts w:cstheme="minorHAnsi"/>
+          <w:lang w:val="en-US"/>
+        </w:rPr>
+        <w:t xml:space="preserve">: acquire only the real data that matters for the task and that the twin is still uncertain about; (2) </w:t>
+      </w:r>
+      <w:r>
+        <w:rPr>
+          <w:rFonts w:cstheme="minorHAnsi"/>
+          <w:b/>
+          <w:lang w:val="en-US"/>
+        </w:rPr>
+        <w:t xml:space="preserve">better use of simulation</w:t>
+      </w:r>
+      <w:r>
+        <w:rPr>
+          <w:rFonts w:cstheme="minorHAnsi"/>
+          <w:lang w:val="en-US"/>
+        </w:rPr>
+        <w:t xml:space="preserve">: train so that the twin's errors do not hurt, and fill its gaps with a learned world model; (3) </w:t>
+      </w:r>
+      <w:r>
+        <w:rPr>
+          <w:rFonts w:cstheme="minorHAnsi"/>
+          <w:b/>
+          <w:lang w:val="en-US"/>
+        </w:rPr>
+        <w:t xml:space="preserve">fewer real trials</w:t>
+      </w:r>
+      <w:r>
+        <w:rPr>
+          <w:rFonts w:cstheme="minorHAnsi"/>
+          <w:lang w:val="en-US"/>
+        </w:rPr>
+        <w:t xml:space="preserve">: choose the few real trials that correct the twin and the model the most. The thesis is that the method as a whole needs at least two times less real data than the strongest existing real-to-sim-to-real approach. The amount of real data, counted in minutes of operator work, is only how the method is evaluated; measuring it is not the goal. Indoor robot navigation is the main testbed, on which the hypotheses are decided; robotic manipulation tests whether the same method, unchanged, carries over to another task.</w:t>
       </w:r>
     </w:p>
     <w:p>
@@ -4468,7 +4577,7 @@
           <w:rFonts w:cstheme="minorHAnsi"/>
           <w:lang w:val="en-US"/>
         </w:rPr>
-        <w:t xml:space="preserve">. The student builds on existing open reconstruction pipelines, simulators, pretrained models and public datasets. Public scans of real buildings make it possible to count real data exactly without an own robot; trials on a real robot (planned cooperation with a PWr robotics laboratory) validate, but do not decide, the conclusions. The topic fits the Department of Artificial Intelligence (K46), whose research groups include representation learning, and the training runs on the GPU infrastructure available to PWr researchers (WCSS, PLGrid).</w:t>
+        <w:t xml:space="preserve">. The student builds on existing open reconstruction pipelines, simulators, pretrained models and public datasets. Public scans of real buildings make it possible to count real data exactly without an own robot; trials on a small mobile robot validate, but do not decide, the conclusions. The topic fits the Department of Artificial Intelligence (K46), whose research groups include representation learning, and the training runs on the GPU infrastructure available to PWr researchers (WCSS, PLGrid).</w:t>
       </w:r>
     </w:p>
     <w:p>
@@ -4489,7 +4598,7 @@
           <w:rFonts w:cstheme="minorHAnsi"/>
           <w:lang w:val="en-US"/>
         </w:rPr>
-        <w:t xml:space="preserve"> faster and cheaper deployment of mobile robots in new buildings, such as warehouses, hospitals, offices and inspection sites, with less time spent collecting data and supervising real trials; guidance on how much real data to collect for a twin; and, beyond robotics, any model trained on reconstructed or simulated data and used on real sensor data.</w:t>
+        <w:t xml:space="preserve"> faster and cheaper deployment of robots in new places, such as warehouses, hospitals, offices and inspection sites, with less time spent collecting data and supervising real trials; guidance on how much real data to collect for a twin; and, beyond robotics, any model trained on reconstructed or simulated data and used on real sensor data.</w:t>
       </w:r>
     </w:p>
     <w:permEnd w:id="1178868985"/>
@@ -4860,14 +4969,14 @@
           <w:b/>
           <w:lang w:val="en-US"/>
         </w:rPr>
-        <w:t xml:space="preserve">Simulation and sim-to-real transfer in navigation.</w:t>
-      </w:r>
-      <w:r>
-        <w:rPr>
-          <w:rFonts w:cstheme="minorHAnsi"/>
-          <w:lang w:val="en-US"/>
-        </w:rPr>
-        <w:t xml:space="preserve"> Navigation models for mobile robots are commonly trained in simulators such as Habitat [1], where large-scale reinforcement learning essentially solves point-goal navigation after billions of steps [2]. Transfer to the real world is the open part: simulation success does not always predict real success, which motivated the Sim-vs-Real Correlation Coefficient [3], and lower-fidelity simulation can even transfer better [4]. Domain randomization varies appearance [5] or dynamics [6] uniformly within hand-set ranges, and real rollouts can adapt the simulation parameter distribution [7]. Real data still matters: in navigation, more data from a known location saturates quickly [8], and co-training on simulated and real data raises real success [9].</w:t>
+        <w:t xml:space="preserve">Simulation and sim-to-real transfer.</w:t>
+      </w:r>
+      <w:r>
+        <w:rPr>
+          <w:rFonts w:cstheme="minorHAnsi"/>
+          <w:lang w:val="en-US"/>
+        </w:rPr>
+        <w:t xml:space="preserve"> Robot models for navigation and manipulation are commonly trained in simulators such as Habitat [1] and ManiSkill3 [2], where large-scale reinforcement learning essentially solves point-goal navigation after billions of steps [3]. Transfer to the real world is the open part: simulation success does not always predict real success, which motivated the Sim-vs-Real Correlation Coefficient in navigation (it rose from 0.18 to 0.84 once one collision artefact was removed [4]) and paired sim-and-real evaluations in manipulation [5]. Domain randomization varies appearance [6] or dynamics [7] uniformly within hand-set ranges, and a few real rollouts can adapt the simulation parameter distribution [8]. Real data still matters: in navigation, more data from a known location saturates quickly [9], and co-training on simulated and real data raises real success [10].</w:t>
       </w:r>
     </w:p>
     <w:p>
@@ -4888,7 +4997,7 @@
           <w:rFonts w:cstheme="minorHAnsi"/>
           <w:lang w:val="en-US"/>
         </w:rPr>
-        <w:t xml:space="preserve"> Neural scene reconstruction, above all 3D Gaussian Splatting (3DGS) [10], turns a short real capture into a photorealistic model of a scene. Twins built this way train navigation models that transfer: EmbodiedSplat [11] reconstructs rooms from a phone capture and fine-tunes image-goal navigation in Habitat, Vid2Sim [12] builds interactive simulators for urban navigation from monocular video, and GaussGym [13] trains navigation and locomotion from pixels in reconstructed scenes. RialTo [14] shows the same loop for manipulation, building twins from small amounts of real data. The physical part of a twin can be identified from real trajectories as a posterior [15]. Datasets such as ScanNet++ [16] pair laser scans and DSLR images with a separate phone capture of the same scene. Building a twin is no longer the bottleneck; in these works the amount and choice of the real data that builds and corrects it are fixed by hand.</w:t>
+        <w:t xml:space="preserve"> Neural scene reconstruction, above all 3D Gaussian Splatting (3DGS) [11], turns a short real capture into a photorealistic model of a scene. Twins built this way train models that transfer. In navigation, EmbodiedSplat [12] reconstructs rooms from a phone capture and fine-tunes image-goal navigation in Habitat, Vid2Sim [13] builds simulators for urban navigation from monocular video, GaussGym [14] trains navigation and locomotion from pixels, and ReaDy-Go [15] adds moving obstacles. In manipulation, RialTo [16] builds a twin from a scan and a few demonstrations, X-Sim [17] from a minute of human video, and TwinRL [18] fine-tunes a pretrained policy in a phone-captured twin and targets its few real rollouts at configurations where the twin predicts failure. The physical part of a twin can be identified from a small amount of real data, as a posterior over simulator parameters [19] or by exploration designed for identification [20]. Datasets such as ScanNet++ [21] pair laser scans and DSLR images with a separate phone capture of the same scene, and MuSHRoom [22] pairs phone and depth-camera captures with a reference mesh under an open licence. In all these works the amount of real data is fixed by hand: the navigation twins use between 15 seconds and 30 minutes of video per scene and no real training trials, and the manipulation works report single points (e.g. a scan and 15 demonstrations instead of 50 demonstrations [16]) rather than curves.</w:t>
       </w:r>
     </w:p>
     <w:p>
@@ -4909,7 +5018,7 @@
           <w:rFonts w:cstheme="minorHAnsi"/>
           <w:lang w:val="en-US"/>
         </w:rPr>
-        <w:t xml:space="preserve"> Active view selection chooses the images that improve a reconstruction most: FisherRF [17] maximizes expected information gain, and Bayes' Rays [18] estimates an uncertainty field for a trained radiance field. Risk-aware view acquisition [19] weights FisherRF by safety-critical regions for navigation, and AREA3D [20] adds vision-language guidance. Their objective is reconstruction quality or safe exploration, not the success of a navigation model trained in the twin; we found at most two task-aware capture papers a year in 2023–2026.</w:t>
+        <w:t xml:space="preserve"> Active view selection chooses the images that improve a reconstruction most: FisherRF [23] maximizes expected information gain, and Bayes' Rays [24] estimates an uncertainty field for a trained radiance field. Risk-aware view acquisition [25] weights FisherRF by safety-critical regions for navigation, and AREA3D [26] adds vision-language guidance. Their objective is reconstruction quality or safe exploration; none measures the success of a model trained in the resulting twin, and we found at most two task-aware capture papers a year in 2023–2026.</w:t>
       </w:r>
     </w:p>
     <w:p>
@@ -4923,14 +5032,58 @@
           <w:b/>
           <w:lang w:val="en-US"/>
         </w:rPr>
-        <w:t xml:space="preserve">Foundation models and world models.</w:t>
-      </w:r>
-      <w:r>
-        <w:rPr>
-          <w:rFonts w:cstheme="minorHAnsi"/>
-          <w:lang w:val="en-US"/>
-        </w:rPr>
-        <w:t xml:space="preserve"> Pretrained navigation foundation models generalize across robots and environments (GNM [21], ViNT [22]), and vision-language-action models map images and instructions to actions, also for navigation [23, 24]; they still need data from the target place to work there. Learned world models predict future observations and can serve as simulators: navigation world models plan by imagining trajectories [25], and open world foundation models are post-trained per setup [26]. Recent work fine-tunes a pretrained policy in a twin reconstructed from a phone capture and uses the twin to target real rollouts [27], or improves a world model with real rollouts [28]; each reports results at a fixed, hand-chosen amount of real data. Frozen visual encoders [29] make twin and real observations comparable, and prediction-powered inference [30] estimates real performance from many cheap predictions and a few real labels.</w:t>
+        <w:t xml:space="preserve">Foundation models, world models and real trials.</w:t>
+      </w:r>
+      <w:r>
+        <w:rPr>
+          <w:rFonts w:cstheme="minorHAnsi"/>
+          <w:lang w:val="en-US"/>
+        </w:rPr>
+        <w:t xml:space="preserve"> Pretrained navigation foundation models generalize across robots and environments (GNM [27], ViNT [28]), and vision-language-action models map images and instructions to actions [29]; they still need data from the target place to work there. Learned world models predict future observations: navigation world models plan by imagining trajectories [30], and open world foundation models are post-trained per setup [31]; VLAW [32] improves a world model with real rollouts, at a fixed, hand-chosen number of them. Choosing which real trials to run has been studied for </w:t>
+      </w:r>
+      <w:r>
+        <w:rPr>
+          <w:rFonts w:cstheme="minorHAnsi"/>
+          <w:i/>
+          <w:lang w:val="en-US"/>
+        </w:rPr>
+        <w:t xml:space="preserve">evaluating</w:t>
+      </w:r>
+      <w:r>
+        <w:rPr>
+          <w:rFonts w:cstheme="minorHAnsi"/>
+          <w:lang w:val="en-US"/>
+        </w:rPr>
+        <w:t xml:space="preserve"> policies, where combining simulated and real trials saves a fifth to a quarter of the real-robot effort [33], not for </w:t>
+      </w:r>
+      <w:r>
+        <w:rPr>
+          <w:rFonts w:cstheme="minorHAnsi"/>
+          <w:i/>
+          <w:lang w:val="en-US"/>
+        </w:rPr>
+        <w:t xml:space="preserve">correcting</w:t>
+      </w:r>
+      <w:r>
+        <w:rPr>
+          <w:rFonts w:cstheme="minorHAnsi"/>
+          <w:lang w:val="en-US"/>
+        </w:rPr>
+        <w:t xml:space="preserve"> a twin and the model trained in it. Frozen visual encoders [34] make twin and real observations comparable, and prediction-powered inference</w:t>
+      </w:r>
+    </w:p>
+    <w:p>
+      <w:pPr>
+        <w:spacing w:after="0" w:line="240" w:lineRule="auto"/>
+        <w:ind w:left="397" w:hanging="397"/>
+        <w:jc w:val="left"/>
+      </w:pPr>
+      <w:r>
+        <w:rPr>
+          <w:rFonts w:cstheme="minorHAnsi"/>
+          <w:lang w:val="en-US"/>
+        </w:rPr>
+        <w:t xml:space="preserve">[35] estimates real performance from many cheap predictions and a few real labels.</w:t>
       </w:r>
     </w:p>
     <w:p>
@@ -4951,7 +5104,7 @@
           <w:rFonts w:cstheme="minorHAnsi"/>
           <w:lang w:val="en-US"/>
         </w:rPr>
-        <w:t xml:space="preserve"> Real-to-sim-to-real learning of navigation models works, but the real data it consumes is set by hand and spent uniformly at every stage. Missing is one method that decides, for navigation: (i) which real data to acquire to build the twin (RQ1); (ii) how to train in an imperfect twin, extended with world models and foundation models, so that its errors do not transfer (RQ2); (iii) which few real data to collect to correct twin and model (RQ3); and (iv) evidence that the whole pipeline needs less real data than existing real-to-sim-to-real approaches (RQ4).</w:t>
+        <w:t xml:space="preserve"> Real-to-sim-to-real learning works, but the real data it consumes is set by hand and spent uniformly at every step. No navigation pipeline has a stage that corrects the twin with real trials, and none reports how success depends on the real data spent; in manipulation the real data is accounted at single points, against learning from real data only, never against another real-to-sim-to-real pipeline. Missing is one method that reduces the real data at every step of the loop: (i) capture only what the task needs and the twin lacks (RQ1); (ii) train so that the twin's errors do not hurt, and fill its gaps with a learned world model (RQ2); (iii) run only the few real trials that correct twin and model most (RQ3); and (iv) evidence, in one unit and on one budget grid, that the whole method needs less real data than the strongest existing real-to-sim-to-real approach (RQ4).</w:t>
       </w:r>
     </w:p>
     <w:p>
@@ -4994,7 +5147,7 @@
           <w:rFonts w:cstheme="minorHAnsi"/>
           <w:lang w:val="en-US"/>
         </w:rPr>
-        <w:t xml:space="preserve">[2] E. Wijmans et al., "DD-PPO," ICLR, 2020.</w:t>
+        <w:t xml:space="preserve">[2] S. Tao et al., "ManiSkill3," RSS, 2025.</w:t>
       </w:r>
     </w:p>
     <w:p>
@@ -5008,7 +5161,7 @@
           <w:rFonts w:cstheme="minorHAnsi"/>
           <w:lang w:val="en-US"/>
         </w:rPr>
-        <w:t xml:space="preserve">[3] A. Kadian et al., "Sim2Real Predictivity," IEEE RA-L, 2020.</w:t>
+        <w:t xml:space="preserve">[3] E. Wijmans et al., "DD-PPO," ICLR, 2020.</w:t>
       </w:r>
     </w:p>
     <w:p>
@@ -5022,7 +5175,7 @@
           <w:rFonts w:cstheme="minorHAnsi"/>
           <w:lang w:val="en-US"/>
         </w:rPr>
-        <w:t xml:space="preserve">[4] J. Truong et al., "Rethinking Sim2Real," CoRL, 2022.</w:t>
+        <w:t xml:space="preserve">[4] A. Kadian et al., "Sim2Real Predictivity," IEEE RA-L, 2020.</w:t>
       </w:r>
     </w:p>
     <w:p>
@@ -5036,7 +5189,7 @@
           <w:rFonts w:cstheme="minorHAnsi"/>
           <w:lang w:val="en-US"/>
         </w:rPr>
-        <w:t xml:space="preserve">[5] J. Tobin et al., "Domain Randomization…," IROS, 2017.</w:t>
+        <w:t xml:space="preserve">[5] X. Li et al., "Evaluating Real-World Robot Manipulation Policies…," CoRL, 2024.</w:t>
       </w:r>
     </w:p>
     <w:p>
@@ -5050,7 +5203,7 @@
           <w:rFonts w:cstheme="minorHAnsi"/>
           <w:lang w:val="en-US"/>
         </w:rPr>
-        <w:t xml:space="preserve">[6] X. B. Peng et al., "Sim-to-Real Transfer… with Dynamics Randomization," ICRA, 2018.</w:t>
+        <w:t xml:space="preserve">[6] J. Tobin et al., "Domain Randomization…," IROS, 2017.</w:t>
       </w:r>
     </w:p>
     <w:p>
@@ -5064,7 +5217,7 @@
           <w:rFonts w:cstheme="minorHAnsi"/>
           <w:lang w:val="en-US"/>
         </w:rPr>
-        <w:t xml:space="preserve">[7] Y. Chebotar et al., "Closing the Sim-to-Real Loop," ICRA, 2019.</w:t>
+        <w:t xml:space="preserve">[7] X. B. Peng et al., "Sim-to-Real Transfer… with Dynamics Randomization," ICRA, 2018.</w:t>
       </w:r>
     </w:p>
     <w:p>
@@ -5078,7 +5231,7 @@
           <w:rFonts w:cstheme="minorHAnsi"/>
           <w:lang w:val="en-US"/>
         </w:rPr>
-        <w:t xml:space="preserve">[8] L. Suomela et al., "Data Scaling for Navigation…," IEEE RA-L, 2026.</w:t>
+        <w:t xml:space="preserve">[8] Y. Chebotar et al., "Closing the Sim-to-Real Loop," ICRA, 2019.</w:t>
       </w:r>
     </w:p>
     <w:p>
@@ -5092,7 +5245,7 @@
           <w:rFonts w:cstheme="minorHAnsi"/>
           <w:lang w:val="en-US"/>
         </w:rPr>
-        <w:t xml:space="preserve">[9] A. Maddukuri et al., "Sim-and-Real Co-Training," RSS, 2025.</w:t>
+        <w:t xml:space="preserve">[9] L. Suomela et al., "Data Scaling for Navigation…," IEEE RA-L, 2026.</w:t>
       </w:r>
     </w:p>
     <w:p>
@@ -5106,7 +5259,7 @@
           <w:rFonts w:cstheme="minorHAnsi"/>
           <w:lang w:val="en-US"/>
         </w:rPr>
-        <w:t xml:space="preserve">[10] B. Kerbl et al., "3D Gaussian Splatting," ACM TOG, 2023.</w:t>
+        <w:t xml:space="preserve">[10] A. Maddukuri et al., "Sim-and-Real Co-Training," RSS, 2025.</w:t>
       </w:r>
     </w:p>
     <w:p>
@@ -5120,7 +5273,7 @@
           <w:rFonts w:cstheme="minorHAnsi"/>
           <w:lang w:val="en-US"/>
         </w:rPr>
-        <w:t xml:space="preserve">[11] G. Chhablani et al., "EmbodiedSplat," ICCV, 2025.</w:t>
+        <w:t xml:space="preserve">[11] B. Kerbl et al., "3D Gaussian Splatting," ACM TOG, 2023.</w:t>
       </w:r>
     </w:p>
     <w:p>
@@ -5134,7 +5287,7 @@
           <w:rFonts w:cstheme="minorHAnsi"/>
           <w:lang w:val="en-US"/>
         </w:rPr>
-        <w:t xml:space="preserve">[12] Z. Xie et al., "Vid2Sim," CVPR, 2025.</w:t>
+        <w:t xml:space="preserve">[12] G. Chhablani et al., "EmbodiedSplat," ICCV, 2025.</w:t>
       </w:r>
     </w:p>
     <w:p>
@@ -5148,7 +5301,7 @@
           <w:rFonts w:cstheme="minorHAnsi"/>
           <w:lang w:val="en-US"/>
         </w:rPr>
-        <w:t xml:space="preserve">[13] A. Escontrela et al., "GaussGym," arXiv:2510.15352, 2025.</w:t>
+        <w:t xml:space="preserve">[13] Z. Xie et al., "Vid2Sim," CVPR, 2025.</w:t>
       </w:r>
     </w:p>
     <w:p>
@@ -5162,7 +5315,7 @@
           <w:rFonts w:cstheme="minorHAnsi"/>
           <w:lang w:val="en-US"/>
         </w:rPr>
-        <w:t xml:space="preserve">[14] M. Torne et al., "Reconciling Reality through Simulation," RSS, 2024.</w:t>
+        <w:t xml:space="preserve">[14] A. Escontrela et al., "GaussGym," arXiv:2510.15352, 2025.</w:t>
       </w:r>
     </w:p>
     <w:p>
@@ -5176,7 +5329,7 @@
           <w:rFonts w:cstheme="minorHAnsi"/>
           <w:lang w:val="en-US"/>
         </w:rPr>
-        <w:t xml:space="preserve">[15] F. Ramos et al., "BayesSim," RSS, 2019.</w:t>
+        <w:t xml:space="preserve">[15] S. Yoo et al., "ReaDy-Go," IEEE RA-L, 2026.</w:t>
       </w:r>
     </w:p>
     <w:p>
@@ -5190,7 +5343,7 @@
           <w:rFonts w:cstheme="minorHAnsi"/>
           <w:lang w:val="en-US"/>
         </w:rPr>
-        <w:t xml:space="preserve">[16] C. Yeshwanth et al., "ScanNet++," ICCV, 2023.</w:t>
+        <w:t xml:space="preserve">[16] M. Torne et al., "Reconciling Reality through Simulation," RSS, 2024.</w:t>
       </w:r>
     </w:p>
     <w:p>
@@ -5204,7 +5357,7 @@
           <w:rFonts w:cstheme="minorHAnsi"/>
           <w:lang w:val="en-US"/>
         </w:rPr>
-        <w:t xml:space="preserve">[17] W. Jiang et al., "FisherRF," ECCV, 2024.</w:t>
+        <w:t xml:space="preserve">[17] P. Dan et al., "X-Sim," arXiv:2505.07096, 2025.</w:t>
       </w:r>
     </w:p>
     <w:p>
@@ -5218,7 +5371,7 @@
           <w:rFonts w:cstheme="minorHAnsi"/>
           <w:lang w:val="en-US"/>
         </w:rPr>
-        <w:t xml:space="preserve">[18] L. Goli et al., "Bayes' Rays," CVPR, 2024.</w:t>
+        <w:t xml:space="preserve">[18] Q. Xu et al., "TwinRL," arXiv:2602.09023, 2026.</w:t>
       </w:r>
     </w:p>
     <w:p>
@@ -5232,7 +5385,7 @@
           <w:rFonts w:cstheme="minorHAnsi"/>
           <w:lang w:val="en-US"/>
         </w:rPr>
-        <w:t xml:space="preserve">[19] G. Liu et al., "Risk-Aware Active View Acquisition…," arXiv:2403.11396, 2024.</w:t>
+        <w:t xml:space="preserve">[19] F. Ramos et al., "BayesSim," RSS, 2019.</w:t>
       </w:r>
     </w:p>
     <w:p>
@@ -5246,7 +5399,7 @@
           <w:rFonts w:cstheme="minorHAnsi"/>
           <w:lang w:val="en-US"/>
         </w:rPr>
-        <w:t xml:space="preserve">[20] T. Xu et al., "AREA3D," arXiv:2512.05131, 2025.</w:t>
+        <w:t xml:space="preserve">[20] M. Memmel et al., "ASID," arXiv:2404.12308, 2024.</w:t>
       </w:r>
     </w:p>
     <w:p>
@@ -5260,7 +5413,7 @@
           <w:rFonts w:cstheme="minorHAnsi"/>
           <w:lang w:val="en-US"/>
         </w:rPr>
-        <w:t xml:space="preserve">[21] D. Shah et al., "GNM," ICRA, 2023.</w:t>
+        <w:t xml:space="preserve">[21] C. Yeshwanth et al., "ScanNet++," ICCV, 2023.</w:t>
       </w:r>
     </w:p>
     <w:p>
@@ -5274,7 +5427,7 @@
           <w:rFonts w:cstheme="minorHAnsi"/>
           <w:lang w:val="en-US"/>
         </w:rPr>
-        <w:t xml:space="preserve">[22] D. Shah et al., "ViNT," CoRL, 2023.</w:t>
+        <w:t xml:space="preserve">[22] X. Ren et al., "MuSHRoom," arXiv:2311.02778, 2023.</w:t>
       </w:r>
     </w:p>
     <w:p>
@@ -5288,7 +5441,7 @@
           <w:rFonts w:cstheme="minorHAnsi"/>
           <w:lang w:val="en-US"/>
         </w:rPr>
-        <w:t xml:space="preserve">[23] M. J. Kim et al., "OpenVLA," CoRL, 2024.</w:t>
+        <w:t xml:space="preserve">[23] W. Jiang et al., "FisherRF," ECCV, 2024.</w:t>
       </w:r>
     </w:p>
     <w:p>
@@ -5302,7 +5455,7 @@
           <w:rFonts w:cstheme="minorHAnsi"/>
           <w:lang w:val="en-US"/>
         </w:rPr>
-        <w:t xml:space="preserve">[24] A.-C. Cheng et al., "NaVILA," arXiv:2412.04453, 2024.</w:t>
+        <w:t xml:space="preserve">[24] L. Goli et al., "Bayes' Rays," CVPR, 2024.</w:t>
       </w:r>
     </w:p>
     <w:p>
@@ -5316,7 +5469,7 @@
           <w:rFonts w:cstheme="minorHAnsi"/>
           <w:lang w:val="en-US"/>
         </w:rPr>
-        <w:t xml:space="preserve">[25] A. Bar et al., "Navigation World Models," CVPR, 2025.</w:t>
+        <w:t xml:space="preserve">[25] G. Liu et al., "Risk-Aware Active View Acquisition…," arXiv:2403.11396, 2024.</w:t>
       </w:r>
     </w:p>
     <w:p>
@@ -5330,7 +5483,7 @@
           <w:rFonts w:cstheme="minorHAnsi"/>
           <w:lang w:val="en-US"/>
         </w:rPr>
-        <w:t xml:space="preserve">[26] N. Agarwal et al., "Cosmos World Foundation Model Platform…," arXiv:2501.03575, 2025.</w:t>
+        <w:t xml:space="preserve">[26] T. Xu et al., "AREA3D," arXiv:2512.05131, 2025.</w:t>
       </w:r>
     </w:p>
     <w:p>
@@ -5344,7 +5497,7 @@
           <w:rFonts w:cstheme="minorHAnsi"/>
           <w:lang w:val="en-US"/>
         </w:rPr>
-        <w:t xml:space="preserve">[27] Q. Xu et al., "TwinRL," arXiv:2602.09023, 2026.</w:t>
+        <w:t xml:space="preserve">[27] D. Shah et al., "GNM," ICRA, 2023.</w:t>
       </w:r>
     </w:p>
     <w:p>
@@ -5358,7 +5511,7 @@
           <w:rFonts w:cstheme="minorHAnsi"/>
           <w:lang w:val="en-US"/>
         </w:rPr>
-        <w:t xml:space="preserve">[28] Y. Guo et al., "VLAW," arXiv:2602.12063, 2026.</w:t>
+        <w:t xml:space="preserve">[28] D. Shah et al., "ViNT," CoRL, 2023.</w:t>
       </w:r>
     </w:p>
     <w:p>
@@ -5372,7 +5525,7 @@
           <w:rFonts w:cstheme="minorHAnsi"/>
           <w:lang w:val="en-US"/>
         </w:rPr>
-        <w:t xml:space="preserve">[29] M. Oquab et al., "DINOv2," TMLR, 2024.</w:t>
+        <w:t xml:space="preserve">[29] M. J. Kim et al., "OpenVLA," CoRL, 2024.</w:t>
       </w:r>
     </w:p>
     <w:p>
@@ -5386,7 +5539,77 @@
           <w:rFonts w:cstheme="minorHAnsi"/>
           <w:lang w:val="en-US"/>
         </w:rPr>
-        <w:t xml:space="preserve">[30] A. N. Angelopoulos et al., "Prediction-Powered Inference," Science, 2023.</w:t>
+        <w:t xml:space="preserve">[30] A. Bar et al., "Navigation World Models," CVPR, 2025.</w:t>
+      </w:r>
+    </w:p>
+    <w:p>
+      <w:pPr>
+        <w:spacing w:after="0" w:line="240" w:lineRule="auto"/>
+        <w:ind w:left="397" w:hanging="397"/>
+        <w:jc w:val="left"/>
+      </w:pPr>
+      <w:r>
+        <w:rPr>
+          <w:rFonts w:cstheme="minorHAnsi"/>
+          <w:lang w:val="en-US"/>
+        </w:rPr>
+        <w:t xml:space="preserve">[31] N. Agarwal et al., "Cosmos World Foundation Model Platform…," arXiv:2501.03575, 2025.</w:t>
+      </w:r>
+    </w:p>
+    <w:p>
+      <w:pPr>
+        <w:spacing w:after="0" w:line="240" w:lineRule="auto"/>
+        <w:ind w:left="397" w:hanging="397"/>
+        <w:jc w:val="left"/>
+      </w:pPr>
+      <w:r>
+        <w:rPr>
+          <w:rFonts w:cstheme="minorHAnsi"/>
+          <w:lang w:val="en-US"/>
+        </w:rPr>
+        <w:t xml:space="preserve">[32] Y. Guo et al., "VLAW," arXiv:2602.12063, 2026.</w:t>
+      </w:r>
+    </w:p>
+    <w:p>
+      <w:pPr>
+        <w:spacing w:after="0" w:line="240" w:lineRule="auto"/>
+        <w:ind w:left="397" w:hanging="397"/>
+        <w:jc w:val="left"/>
+      </w:pPr>
+      <w:r>
+        <w:rPr>
+          <w:rFonts w:cstheme="minorHAnsi"/>
+          <w:lang w:val="en-US"/>
+        </w:rPr>
+        <w:t xml:space="preserve">[33] A. Badithela et al., "Reliable and Scalable Robot Policy Evaluation…," arXiv:2510.04354, 2025.</w:t>
+      </w:r>
+    </w:p>
+    <w:p>
+      <w:pPr>
+        <w:spacing w:after="0" w:line="240" w:lineRule="auto"/>
+        <w:ind w:left="397" w:hanging="397"/>
+        <w:jc w:val="left"/>
+      </w:pPr>
+      <w:r>
+        <w:rPr>
+          <w:rFonts w:cstheme="minorHAnsi"/>
+          <w:lang w:val="en-US"/>
+        </w:rPr>
+        <w:t xml:space="preserve">[34] M. Oquab et al., "DINOv2," TMLR, 2024.</w:t>
+      </w:r>
+    </w:p>
+    <w:p>
+      <w:pPr>
+        <w:spacing w:after="0" w:line="240" w:lineRule="auto"/>
+        <w:ind w:left="397" w:hanging="397"/>
+        <w:jc w:val="left"/>
+      </w:pPr>
+      <w:r>
+        <w:rPr>
+          <w:rFonts w:cstheme="minorHAnsi"/>
+          <w:lang w:val="en-US"/>
+        </w:rPr>
+        <w:t xml:space="preserve">[35] A. N. Angelopoulos et al., "Prediction-Powered Inference," Science, 2023.</w:t>
       </w:r>
     </w:p>
     <w:permEnd w:id="174659581"/>
@@ -5628,37 +5851,67 @@
           <w:rFonts w:cstheme="minorHAnsi"/>
           <w:lang w:val="en-US"/>
         </w:rPr>
-        <w:t xml:space="preserve"> To develop a method for real-to-sim-to-real learning of </w:t>
-      </w:r>
-      <w:r>
-        <w:rPr>
-          <w:rFonts w:cstheme="minorHAnsi"/>
-          <w:b/>
-          <w:lang w:val="en-US"/>
-        </w:rPr>
-        <w:t xml:space="preserve">navigation models</w:t>
-      </w:r>
-      <w:r>
-        <w:rPr>
-          <w:rFonts w:cstheme="minorHAnsi"/>
-          <w:lang w:val="en-US"/>
-        </w:rPr>
-        <w:t xml:space="preserve"> for indoor mobile robots that reaches a given real-world navigation performance with </w:t>
-      </w:r>
-      <w:r>
-        <w:rPr>
-          <w:rFonts w:cstheme="minorHAnsi"/>
-          <w:b/>
-          <w:lang w:val="en-US"/>
-        </w:rPr>
-        <w:t xml:space="preserve">significantly less real data</w:t>
-      </w:r>
-      <w:r>
-        <w:rPr>
-          <w:rFonts w:cstheme="minorHAnsi"/>
-          <w:lang w:val="en-US"/>
-        </w:rPr>
-        <w:t xml:space="preserve"> than existing approaches. The method has three stages: (1) transfer of real-world data into a digital twin, (2) training navigation models in the twin, extended with learned world models and pretrained foundation models, and (3) transfer back to reality, where a small amount of real data corrects the twin and the model.</w:t>
+        <w:t xml:space="preserve"> To develop a method that </w:t>
+      </w:r>
+      <w:r>
+        <w:rPr>
+          <w:rFonts w:cstheme="minorHAnsi"/>
+          <w:b/>
+          <w:lang w:val="en-US"/>
+        </w:rPr>
+        <w:t xml:space="preserve">reduces the amount of real data</w:t>
+      </w:r>
+      <w:r>
+        <w:rPr>
+          <w:rFonts w:cstheme="minorHAnsi"/>
+          <w:lang w:val="en-US"/>
+        </w:rPr>
+        <w:t xml:space="preserve"> needed to teach a robot a task through the real-to-sim-to-real loop: real data → digital twin → training in the twin → transfer back to reality. The method has three reduction mechanisms, one per step of the loop: (1) </w:t>
+      </w:r>
+      <w:r>
+        <w:rPr>
+          <w:rFonts w:cstheme="minorHAnsi"/>
+          <w:b/>
+          <w:lang w:val="en-US"/>
+        </w:rPr>
+        <w:t xml:space="preserve">less capture</w:t>
+      </w:r>
+      <w:r>
+        <w:rPr>
+          <w:rFonts w:cstheme="minorHAnsi"/>
+          <w:lang w:val="en-US"/>
+        </w:rPr>
+        <w:t xml:space="preserve">, (2) </w:t>
+      </w:r>
+      <w:r>
+        <w:rPr>
+          <w:rFonts w:cstheme="minorHAnsi"/>
+          <w:b/>
+          <w:lang w:val="en-US"/>
+        </w:rPr>
+        <w:t xml:space="preserve">better use of simulation</w:t>
+      </w:r>
+      <w:r>
+        <w:rPr>
+          <w:rFonts w:cstheme="minorHAnsi"/>
+          <w:lang w:val="en-US"/>
+        </w:rPr>
+        <w:t xml:space="preserve">, (3) </w:t>
+      </w:r>
+      <w:r>
+        <w:rPr>
+          <w:rFonts w:cstheme="minorHAnsi"/>
+          <w:b/>
+          <w:lang w:val="en-US"/>
+        </w:rPr>
+        <w:t xml:space="preserve">fewer real trials</w:t>
+      </w:r>
+      <w:r>
+        <w:rPr>
+          <w:rFonts w:cstheme="minorHAnsi"/>
+          <w:lang w:val="en-US"/>
+        </w:rPr>
+        <w:t xml:space="preserve">. Indoor robot navigation is the main testbed, on which H1–H4 are decided; robotic manipulation is the generalization test of the same method, unchanged.</w:t>
       </w:r>
     </w:p>
     <w:p>
@@ -5679,7 +5932,7 @@
           <w:rFonts w:cstheme="minorHAnsi"/>
           <w:lang w:val="en-US"/>
         </w:rPr>
-        <w:t xml:space="preserve"> Deciding at every stage which real data to acquire and where the twin can be trusted makes the whole real-to-sim-to-real pipeline for navigation at least twice as economical in real data as existing real-to-sim-to-real approaches.</w:t>
+        <w:t xml:space="preserve"> Capturing only what the task needs and the twin lacks, training so that the twin's errors do not hurt, and running only the real trials that correct the twin and the model most makes the whole real-to-sim-to-real loop at least twice as economical in real data as the strongest existing real-to-sim-to-real approach.</w:t>
       </w:r>
     </w:p>
     <w:p>
@@ -5700,7 +5953,22 @@
           <w:rFonts w:cstheme="minorHAnsi"/>
           <w:lang w:val="en-US"/>
         </w:rPr>
-        <w:t xml:space="preserve"> P is the navigation success rate in "reality". Real data (capture for the twin and real navigation trials) is counted in one operator-time cost. The hypotheses are decided on a non-circular proxy reality built from public scans of real buildings, in which "reality" and the twin come from separate captures; a real robot validates the direction of the results. Tests, confidence bounds and scene counts are given in §9.</w:t>
+        <w:t xml:space="preserve"> All real effort is counted in one unit, </w:t>
+      </w:r>
+      <w:r>
+        <w:rPr>
+          <w:rFonts w:cstheme="minorHAnsi"/>
+          <w:b/>
+          <w:lang w:val="en-US"/>
+        </w:rPr>
+        <w:t xml:space="preserve">operator minutes</w:t>
+      </w:r>
+      <w:r>
+        <w:rPr>
+          <w:rFonts w:cstheme="minorHAnsi"/>
+          <w:lang w:val="en-US"/>
+        </w:rPr>
+        <w:t xml:space="preserve"> (capture, demonstrations and on-robot trials with resets), and every approach is evaluated on the same budget grid. P is the task success rate in "reality"; the target P is defined as a fraction of the baseline's plateau. The hypotheses are decided on a non-circular proxy reality built from public scans of real buildings, in which "reality" and the twin come from separate captures; every baseline is pre-registered; a real robot validates the direction of the results and the validity of the proxy. Tests, bounds and counts are in §9.</w:t>
       </w:r>
     </w:p>
     <w:p>
@@ -5714,14 +5982,14 @@
           <w:b/>
           <w:lang w:val="en-US"/>
         </w:rPr>
-        <w:t xml:space="preserve">RQ1 (stage 1: real data → twin).</w:t>
-      </w:r>
-      <w:r>
-        <w:rPr>
-          <w:rFonts w:cstheme="minorHAnsi"/>
-          <w:lang w:val="en-US"/>
-        </w:rPr>
-        <w:t xml:space="preserve"> Which real data is worth acquiring to build a twin for navigation?</w:t>
+        <w:t xml:space="preserve">RQ1 (step 1: real data → twin).</w:t>
+      </w:r>
+      <w:r>
+        <w:rPr>
+          <w:rFonts w:cstheme="minorHAnsi"/>
+          <w:lang w:val="en-US"/>
+        </w:rPr>
+        <w:t xml:space="preserve"> Which real data is worth acquiring to build the twin?</w:t>
       </w:r>
     </w:p>
     <w:p>
@@ -5742,7 +6010,7 @@
           <w:rFonts w:cstheme="minorHAnsi"/>
           <w:lang w:val="en-US"/>
         </w:rPr>
-        <w:t xml:space="preserve"> Capture guided by what matters for the navigation task and by where the twin is uncertain reaches the P of uniform capture with </w:t>
+        <w:t xml:space="preserve"> Capture guided by what matters for the task and by where the twin is uncertain reaches the P of uniform capture with </w:t>
       </w:r>
       <w:r>
         <w:rPr>
@@ -5771,14 +6039,44 @@
           <w:b/>
           <w:lang w:val="en-US"/>
         </w:rPr>
-        <w:t xml:space="preserve">RQ2 (stage 2: learning in the twin).</w:t>
-      </w:r>
-      <w:r>
-        <w:rPr>
-          <w:rFonts w:cstheme="minorHAnsi"/>
-          <w:lang w:val="en-US"/>
-        </w:rPr>
-        <w:t xml:space="preserve"> How should navigation models be trained in an imperfect twin?</w:t>
+        <w:t xml:space="preserve">RQ2 (step 2: learning in the twin).</w:t>
+      </w:r>
+      <w:r>
+        <w:rPr>
+          <w:rFonts w:cstheme="minorHAnsi"/>
+          <w:lang w:val="en-US"/>
+        </w:rPr>
+        <w:t xml:space="preserve"> How should the model be trained so that the twin's errors do not hurt? </w:t>
+      </w:r>
+      <w:r>
+        <w:rPr>
+          <w:rFonts w:cstheme="minorHAnsi"/>
+          <w:b/>
+          <w:lang w:val="en-US"/>
+        </w:rPr>
+        <w:t xml:space="preserve">H2.</w:t>
+      </w:r>
+      <w:r>
+        <w:rPr>
+          <w:rFonts w:cstheme="minorHAnsi"/>
+          <w:lang w:val="en-US"/>
+        </w:rPr>
+        <w:t xml:space="preserve"> At the same real-data budget, training that follows the twin's uncertainty gives a P </w:t>
+      </w:r>
+      <w:r>
+        <w:rPr>
+          <w:rFonts w:cstheme="minorHAnsi"/>
+          <w:b/>
+          <w:lang w:val="en-US"/>
+        </w:rPr>
+        <w:t xml:space="preserve">at least 10 percentage points higher</w:t>
+      </w:r>
+      <w:r>
+        <w:rPr>
+          <w:rFonts w:cstheme="minorHAnsi"/>
+          <w:lang w:val="en-US"/>
+        </w:rPr>
+        <w:t xml:space="preserve"> than uniform domain randomization, in a pre-registered difficulty regime where the baseline succeeds in at most about 75% of episodes; filling the twin's gaps with a learned world model is an ablation of this step.</w:t>
       </w:r>
     </w:p>
     <w:p>
@@ -5792,29 +6090,14 @@
           <w:b/>
           <w:lang w:val="en-US"/>
         </w:rPr>
-        <w:t xml:space="preserve">H2.</w:t>
-      </w:r>
-      <w:r>
-        <w:rPr>
-          <w:rFonts w:cstheme="minorHAnsi"/>
-          <w:lang w:val="en-US"/>
-        </w:rPr>
-        <w:t xml:space="preserve"> At the same real-data budget, training that follows the twin's uncertainty, with the twin extended by a learned world model, gives a P </w:t>
-      </w:r>
-      <w:r>
-        <w:rPr>
-          <w:rFonts w:cstheme="minorHAnsi"/>
-          <w:b/>
-          <w:lang w:val="en-US"/>
-        </w:rPr>
-        <w:t xml:space="preserve">at least 10 percentage points higher</w:t>
-      </w:r>
-      <w:r>
-        <w:rPr>
-          <w:rFonts w:cstheme="minorHAnsi"/>
-          <w:lang w:val="en-US"/>
-        </w:rPr>
-        <w:t xml:space="preserve"> than training with uniform domain randomization.</w:t>
+        <w:t xml:space="preserve">RQ3 (step 3: twin → reality).</w:t>
+      </w:r>
+      <w:r>
+        <w:rPr>
+          <w:rFonts w:cstheme="minorHAnsi"/>
+          <w:lang w:val="en-US"/>
+        </w:rPr>
+        <w:t xml:space="preserve"> Which few real trials correct the twin and the model best?</w:t>
       </w:r>
     </w:p>
     <w:p>
@@ -5828,14 +6111,29 @@
           <w:b/>
           <w:lang w:val="en-US"/>
         </w:rPr>
-        <w:t xml:space="preserve">RQ3 (stage 3: twin → reality).</w:t>
-      </w:r>
-      <w:r>
-        <w:rPr>
-          <w:rFonts w:cstheme="minorHAnsi"/>
-          <w:lang w:val="en-US"/>
-        </w:rPr>
-        <w:t xml:space="preserve"> Which few real data correct the twin and the model best?</w:t>
+        <w:t xml:space="preserve">H3.</w:t>
+      </w:r>
+      <w:r>
+        <w:rPr>
+          <w:rFonts w:cstheme="minorHAnsi"/>
+          <w:lang w:val="en-US"/>
+        </w:rPr>
+        <w:t xml:space="preserve"> Real trials selected by the predicted twin-to-reality gap reach the target P with </w:t>
+      </w:r>
+      <w:r>
+        <w:rPr>
+          <w:rFonts w:cstheme="minorHAnsi"/>
+          <w:b/>
+          <w:lang w:val="en-US"/>
+        </w:rPr>
+        <w:t xml:space="preserve">at least 50% fewer trials</w:t>
+      </w:r>
+      <w:r>
+        <w:rPr>
+          <w:rFonts w:cstheme="minorHAnsi"/>
+          <w:lang w:val="en-US"/>
+        </w:rPr>
+        <w:t xml:space="preserve"> than randomly selected trials, and with fewer trials than a failure-driven rule, provided the twin predicts reality well enough (a minimum sim-vs-real correlation, §9).</w:t>
       </w:r>
     </w:p>
     <w:p>
@@ -5849,57 +6147,15 @@
           <w:b/>
           <w:lang w:val="en-US"/>
         </w:rPr>
-        <w:t xml:space="preserve">H3.</w:t>
-      </w:r>
-      <w:r>
-        <w:rPr>
-          <w:rFonts w:cstheme="minorHAnsi"/>
-          <w:lang w:val="en-US"/>
-        </w:rPr>
-        <w:t xml:space="preserve"> Real trials selected by the predicted twin-to-reality gap reach the target P with </w:t>
-      </w:r>
-      <w:r>
-        <w:rPr>
-          <w:rFonts w:cstheme="minorHAnsi"/>
-          <w:b/>
-          <w:lang w:val="en-US"/>
-        </w:rPr>
-        <w:t xml:space="preserve">at least 50% fewer trials</w:t>
-      </w:r>
-      <w:r>
-        <w:rPr>
-          <w:rFonts w:cstheme="minorHAnsi"/>
-          <w:lang w:val="en-US"/>
-        </w:rPr>
-        <w:t xml:space="preserve"> than randomly selected trials.</w:t>
-      </w:r>
-    </w:p>
-    <w:p>
-      <w:pPr>
-        <w:spacing w:after="120" w:line="240" w:lineRule="auto"/>
-        <w:jc w:val="both"/>
-      </w:pPr>
-      <w:r>
-        <w:rPr>
-          <w:rFonts w:cstheme="minorHAnsi"/>
-          <w:b/>
-          <w:lang w:val="en-US"/>
-        </w:rPr>
-        <w:t xml:space="preserve">RQ4 (the whole pipeline).</w:t>
-      </w:r>
-      <w:r>
-        <w:rPr>
-          <w:rFonts w:cstheme="minorHAnsi"/>
-          <w:lang w:val="en-US"/>
-        </w:rPr>
-        <w:t xml:space="preserve"> How much real data does the method need compared with the alternatives?</w:t>
-      </w:r>
-    </w:p>
-    <w:p>
-      <w:pPr>
-        <w:spacing w:after="120" w:line="240" w:lineRule="auto"/>
-        <w:jc w:val="both"/>
-      </w:pPr>
+        <w:t xml:space="preserve">RQ4 (the whole loop).</w:t>
+      </w:r>
+      <w:r>
+        <w:rPr>
+          <w:rFonts w:cstheme="minorHAnsi"/>
+          <w:lang w:val="en-US"/>
+        </w:rPr>
+        <w:t xml:space="preserve"> How much real data does the method need compared with the strongest existing approach, and does it carry over to another task? </w:t>
+      </w:r>
       <w:r>
         <w:rPr>
           <w:rFonts w:cstheme="minorHAnsi"/>
@@ -5928,7 +6184,7 @@
           <w:rFonts w:cstheme="minorHAnsi"/>
           <w:lang w:val="en-US"/>
         </w:rPr>
-        <w:t xml:space="preserve"> than the strongest existing real-to-sim-to-real approach; learning from real data only is reported for reference.</w:t>
+        <w:t xml:space="preserve"> than the strongest existing real-to-sim-to-real approach, assembled and pre-registered with the same budget; learning from real data only is reported for reference. In manipulation, with the method unchanged, the effects of H1–H4 keep their sign.</w:t>
       </w:r>
     </w:p>
     <w:p>
@@ -6259,14 +6515,14 @@
           <w:b/>
           <w:lang w:val="en-US"/>
         </w:rPr>
-        <w:t xml:space="preserve">real-to-sim-to-real pipeline for navigation models</w:t>
-      </w:r>
-      <w:r>
-        <w:rPr>
-          <w:rFonts w:cstheme="minorHAnsi"/>
-          <w:lang w:val="en-US"/>
-        </w:rPr>
-        <w:t xml:space="preserve">: transferring real-world data into a digital twin, training navigation models in it and transferring them back to reality. Building simulators, world models, foundation models or benchmarks from scratch, control design and mechanical engineering are not the object of the research; the student uses existing tools, pretrained models and public data.</w:t>
+        <w:t xml:space="preserve">real-to-sim-to-real loop of robot learning and the real data it consumes</w:t>
+      </w:r>
+      <w:r>
+        <w:rPr>
+          <w:rFonts w:cstheme="minorHAnsi"/>
+          <w:lang w:val="en-US"/>
+        </w:rPr>
+        <w:t xml:space="preserve">: transferring real-world data into a digital twin, training a model in it and transferring the model back to reality. Building simulators, world models, foundation models or benchmarks from scratch, control design and mechanical engineering are not the object of the research; the student uses existing tools, pretrained models and public data.</w:t>
       </w:r>
     </w:p>
     <w:p>
@@ -6280,29 +6536,14 @@
           <w:b/>
           <w:lang w:val="en-US"/>
         </w:rPr>
-        <w:t xml:space="preserve">Key original contribution: the method.</w:t>
-      </w:r>
-      <w:r>
-        <w:rPr>
-          <w:rFonts w:cstheme="minorHAnsi"/>
-          <w:lang w:val="en-US"/>
-        </w:rPr>
-        <w:t xml:space="preserve"> To our knowledge, the first method for real-to-sim-to-real learning of navigation models that treats the real data of the whole pipeline as </w:t>
-      </w:r>
-      <w:r>
-        <w:rPr>
-          <w:rFonts w:cstheme="minorHAnsi"/>
-          <w:b/>
-          <w:lang w:val="en-US"/>
-        </w:rPr>
-        <w:t xml:space="preserve">one budget spent where it matters at every stage</w:t>
-      </w:r>
-      <w:r>
-        <w:rPr>
-          <w:rFonts w:cstheme="minorHAnsi"/>
-          <w:lang w:val="en-US"/>
-        </w:rPr>
-        <w:t xml:space="preserve">. It targets a given real-world navigation performance with at least two times less real data than the strongest existing real-to-sim-to-real approach (RQ4, H4). Building twins, training in simulation and using world models or foundation models are not new; deciding which real data the pipeline needs, and measuring how much it saves, is. The three stages are parts of this one method, each tested at its own step:</w:t>
+        <w:t xml:space="preserve">Key original contribution: a method that reduces real data.</w:t>
+      </w:r>
+      <w:r>
+        <w:rPr>
+          <w:rFonts w:cstheme="minorHAnsi"/>
+          <w:lang w:val="en-US"/>
+        </w:rPr>
+        <w:t xml:space="preserve"> To our knowledge, the first method for real-to-sim-to-real robot learning that reduces the real data of the whole loop by acting at every one of its steps, with the first measurement, in one unit and on one budget grid, of how much real data such a loop needs. Its claim: a given real-world performance with at least two times less real data than the strongest existing real-to-sim-to-real approach (RQ4, H4). Building twins, training in simulation and using world models or foundation models are not new; reducing the real data they need is. The three reduction mechanisms are parts of this one method, each tested at its own step:</w:t>
       </w:r>
     </w:p>
     <w:p>
@@ -6324,14 +6565,14 @@
           <w:b/>
           <w:lang w:val="en-US"/>
         </w:rPr>
-        <w:t xml:space="preserve">Stage 1, real data → twin (RQ1, H1).</w:t>
-      </w:r>
-      <w:r>
-        <w:rPr>
-          <w:rFonts w:cstheme="minorHAnsi"/>
-          <w:lang w:val="en-US"/>
-        </w:rPr>
-        <w:t xml:space="preserve"> Capture of real data guided by what matters for the navigation task and by where the twin is still uncertain, for appearance, geometry and the physical properties needed for navigation; compared with uniform and task-blind capture.</w:t>
+        <w:t xml:space="preserve">Less capture (RQ1, H1).</w:t>
+      </w:r>
+      <w:r>
+        <w:rPr>
+          <w:rFonts w:cstheme="minorHAnsi"/>
+          <w:lang w:val="en-US"/>
+        </w:rPr>
+        <w:t xml:space="preserve"> Capture of real data guided by what matters for the task and by where the twin is still uncertain, for appearance, geometry and the physical properties the task needs; compared with uniform capture and with task-blind and task-weighted selection aimed at reconstruction quality.</w:t>
       </w:r>
     </w:p>
     <w:p>
@@ -6353,14 +6594,14 @@
           <w:b/>
           <w:lang w:val="en-US"/>
         </w:rPr>
-        <w:t xml:space="preserve">Stage 2, learning in the twin (RQ2, H2).</w:t>
-      </w:r>
-      <w:r>
-        <w:rPr>
-          <w:rFonts w:cstheme="minorHAnsi"/>
-          <w:lang w:val="en-US"/>
-        </w:rPr>
-        <w:t xml:space="preserve"> Training of navigation models that follows the twin's uncertainty, with the twin extended by a learned world model and the model initialized from pretrained foundation models; compared with uniform domain randomization.</w:t>
+        <w:t xml:space="preserve">Better use of simulation (RQ2, H2).</w:t>
+      </w:r>
+      <w:r>
+        <w:rPr>
+          <w:rFonts w:cstheme="minorHAnsi"/>
+          <w:lang w:val="en-US"/>
+        </w:rPr>
+        <w:t xml:space="preserve"> Training that follows the twin's uncertainty, so that its errors do not transfer, with a learned world model filling the twin's gaps; compared with uniform and with no domain randomization.</w:t>
       </w:r>
     </w:p>
     <w:p>
@@ -6382,14 +6623,14 @@
           <w:b/>
           <w:lang w:val="en-US"/>
         </w:rPr>
-        <w:t xml:space="preserve">Stage 3, twin → reality (RQ3, H3).</w:t>
-      </w:r>
-      <w:r>
-        <w:rPr>
-          <w:rFonts w:cstheme="minorHAnsi"/>
-          <w:lang w:val="en-US"/>
-        </w:rPr>
-        <w:t xml:space="preserve"> Selection of the few real trials that the predicted twin-to-reality gap marks as most informative, used to correct both the twin and the model; compared with random selection.</w:t>
+        <w:t xml:space="preserve">Fewer real trials (RQ3, H3).</w:t>
+      </w:r>
+      <w:r>
+        <w:rPr>
+          <w:rFonts w:cstheme="minorHAnsi"/>
+          <w:lang w:val="en-US"/>
+        </w:rPr>
+        <w:t xml:space="preserve"> Selection of the few real trials that the predicted twin-to-reality gap marks as most informative, used to correct both the twin and the model; compared with random and with failure-driven selection.</w:t>
       </w:r>
     </w:p>
     <w:p>
@@ -6403,14 +6644,14 @@
           <w:b/>
           <w:lang w:val="en-US"/>
         </w:rPr>
-        <w:t xml:space="preserve">How the method is evaluated and released</w:t>
-      </w:r>
-      <w:r>
-        <w:rPr>
-          <w:rFonts w:cstheme="minorHAnsi"/>
-          <w:lang w:val="en-US"/>
-        </w:rPr>
-        <w:t xml:space="preserve"> (supporting the method, not contributions in their own right). Budget–performance curves of the method against existing real-to-sim-to-real approaches and learning from real data only, which give the "exchange rate" between twin and real data; a proxy-reality protocol on public scans of real buildings that counts real data exactly without a robot (a separate, higher-fidelity reference plays "reality"); and open-source code of the method, built on existing reconstruction pipelines, simulators and pretrained models.</w:t>
+        <w:t xml:space="preserve">Generalization.</w:t>
+      </w:r>
+      <w:r>
+        <w:rPr>
+          <w:rFonts w:cstheme="minorHAnsi"/>
+          <w:lang w:val="en-US"/>
+        </w:rPr>
+        <w:t xml:space="preserve"> H1–H4 are decided in indoor robot navigation; the same method, unchanged, is then run in robotic manipulation as a generalization test, with no separate thresholds.</w:t>
       </w:r>
     </w:p>
     <w:p>
@@ -6424,6 +6665,27 @@
           <w:b/>
           <w:lang w:val="en-US"/>
         </w:rPr>
+        <w:t xml:space="preserve">How the method is evaluated and released</w:t>
+      </w:r>
+      <w:r>
+        <w:rPr>
+          <w:rFonts w:cstheme="minorHAnsi"/>
+          <w:lang w:val="en-US"/>
+        </w:rPr>
+        <w:t xml:space="preserve"> (supporting the method, not contributions in their own right). Curves of success against operator minutes on a shared budget grid, against pre-registered baselines and learning from real data only; a proxy-reality protocol on public scans of real buildings that counts real data exactly without a robot (a separate, higher-fidelity reference with hidden physical parameters plays "reality"), validated against a real robot; and open code, configurations, scene lists, seeds and pre-registrations, built on existing tools.</w:t>
+      </w:r>
+    </w:p>
+    <w:p>
+      <w:pPr>
+        <w:spacing w:after="120" w:line="240" w:lineRule="auto"/>
+        <w:jc w:val="both"/>
+      </w:pPr>
+      <w:r>
+        <w:rPr>
+          <w:rFonts w:cstheme="minorHAnsi"/>
+          <w:b/>
+          <w:lang w:val="en-US"/>
+        </w:rPr>
         <w:t xml:space="preserve">Significance for the discipline.</w:t>
       </w:r>
       <w:r>
@@ -6431,7 +6693,7 @@
           <w:rFonts w:cstheme="minorHAnsi"/>
           <w:lang w:val="en-US"/>
         </w:rPr>
-        <w:t xml:space="preserve"> Real target-domain data is the main cost of deploying learned systems; methods that decide where it is worth spending, and a measured estimate of how much of it a twin can replace, are relevant to active learning, learning under distribution shift, uncertainty estimation and adaptation of pretrained models in general, beyond navigation.</w:t>
+        <w:t xml:space="preserve"> Real target-domain data is the main cost of deploying learned systems; a method that decides where it is worth spending, and a measured estimate of how much of it a twin can replace, are relevant to active learning, learning under distribution shift, uncertainty estimation and adaptation of pretrained models in general, beyond robotics.</w:t>
       </w:r>
     </w:p>
     <w:p>
@@ -6452,7 +6714,7 @@
           <w:rFonts w:cstheme="minorHAnsi"/>
           <w:lang w:val="en-US"/>
         </w:rPr>
-        <w:t xml:space="preserve"> Results are planned for peer-reviewed conferences worth 200 points and assigned to ITiT on the ministerial list of 5.01.2024: NeurIPS, ICML and ICLR (machine learning) and CVPR (computer vision), with ICCV and ECCV for resubmissions. P1 (stage 1 and first stage 2 results, RQ1–RQ2) targets NeurIPS 2027; P2 (stage 3, RQ3) ICML 2028 or CVPR 2028; P3 (the whole pipeline against existing approaches, RQ4) NeurIPS 2028, with ICLR 2029 as the fallback.</w:t>
+        <w:t xml:space="preserve"> Results are planned for peer-reviewed conferences worth 200 points and assigned to ITiT on the ministerial list of 5.01.2024: NeurIPS, ICML and ICLR (machine learning) and CVPR (computer vision), with ICCV and ECCV for resubmissions. P1 (mechanism 1, RQ1, in navigation) targets NeurIPS 2027; P2 (mechanisms 2–3, RQ2–RQ3, in navigation, with first manipulation results) ICML 2028 or CVPR 2028; P3 (the whole method against existing approaches, RQ4, with the generalization to manipulation) NeurIPS 2028, with ICLR 2029 as the fallback.</w:t>
       </w:r>
     </w:p>
     <w:permEnd w:id="1098318749"/>
@@ -6746,7 +7008,7 @@
           <w:rFonts w:cstheme="minorHAnsi"/>
           <w:lang w:val="en-US"/>
         </w:rPr>
-        <w:t xml:space="preserve"> with three stages: real data → digital twin → training of navigation models in the twin → transfer back to reality with a few real data that correct the twin and the model. Stages 1–3 are developed and tested one at a time (RQ1–RQ3); the whole pipeline is then tested against existing approaches (RQ4). Existing open-source tools are used throughout: no simulator, dataset or foundation model is built from scratch.</w:t>
+        <w:t xml:space="preserve"> with three reduction mechanisms, one per step of the real-to-sim-to-real loop: less capture, better use of simulation, fewer real trials. Each mechanism is developed and tested at its own step (RQ1–RQ3); the whole method is then tested against the strongest existing approach (RQ4). Existing open tools that run on the data-centre GPUs of WCSS and PLGrid are used throughout (Habitat-Sim/Lab [1], an open 3DGS library, COLMAP); nothing is built from scratch.</w:t>
       </w:r>
     </w:p>
     <w:p>
@@ -6760,14 +7022,29 @@
           <w:b/>
           <w:lang w:val="en-US"/>
         </w:rPr>
-        <w:t xml:space="preserve">Evaluation protocol: proxy reality (decides the hypotheses).</w:t>
-      </w:r>
-      <w:r>
-        <w:rPr>
-          <w:rFonts w:cstheme="minorHAnsi"/>
-          <w:lang w:val="en-US"/>
-        </w:rPr>
-        <w:t xml:space="preserve"> On ≥ 20 public indoor scenes of ScanNet++ [16] (10 held out from all tuning), "reality" is the laser-scan mesh textured from the DSLR images and rendered in Habitat [1] with a robot-camera model. The twin is built from a subset of the separate phone capture of the same scene, so twin and "reality" share neither images nor reconstruction method; the largest capture budget stays below the full capture. Tasks are indoor goal-reaching navigation (e.g. image-goal and point-goal; instruction-following where instructions are available), with a minimum path length set in a pilot so that P stays below its ceiling. "Reality" also has its own physical parameters (e.g. actuation noise), hidden from the method and learned only from counted real data; this physical gap is synthetic, and the robot checks it. Real data (captured views, real trials and demonstrations) is summed in one operator-time cost. The proxy's own error to held-out real images is reported, and every hypothesis is re-checked for sign with a second reference built from all DSLR images. P = success rate; path efficiency is also reported.</w:t>
+        <w:t xml:space="preserve">Real data: one unit, one grid.</w:t>
+      </w:r>
+      <w:r>
+        <w:rPr>
+          <w:rFonts w:cstheme="minorHAnsi"/>
+          <w:lang w:val="en-US"/>
+        </w:rPr>
+        <w:t xml:space="preserve"> All real effort is counted in </w:t>
+      </w:r>
+      <w:r>
+        <w:rPr>
+          <w:rFonts w:cstheme="minorHAnsi"/>
+          <w:b/>
+          <w:lang w:val="en-US"/>
+        </w:rPr>
+        <w:t xml:space="preserve">operator minutes</w:t>
+      </w:r>
+      <w:r>
+        <w:rPr>
+          <w:rFonts w:cstheme="minorHAnsi"/>
+          <w:lang w:val="en-US"/>
+        </w:rPr>
+        <w:t xml:space="preserve"> B = capture + demonstrations + on-robot trials with resets; raw counts (frames, trials) are reported. Every approach gets the same budget grid, e.g. B ∈ {5, 10, 20, 40, 80} min, the same initialization, compute in the twin and test episodes. Each comparison yields the budget at which an approach reaches the target P, with a scene-level bootstrap interval for the budget ratio. The target P is a fraction of the baseline's plateau (e.g. 90% of its P at the largest budget), so "40%" and "2×" stay well defined when the baseline's curve flattens.</w:t>
       </w:r>
     </w:p>
     <w:p>
@@ -6781,7 +7058,28 @@
           <w:b/>
           <w:lang w:val="en-US"/>
         </w:rPr>
-        <w:t xml:space="preserve">Stage 1 – transfer of real data into a digital twin (RQ1, H1; sem. 3–4).</w:t>
+        <w:t xml:space="preserve">Proxy reality (decides H1–H4).</w:t>
+      </w:r>
+      <w:r>
+        <w:rPr>
+          <w:rFonts w:cstheme="minorHAnsi"/>
+          <w:lang w:val="en-US"/>
+        </w:rPr>
+        <w:t xml:space="preserve"> On ≥ 20 scenes of ScanNet++ [21] (10 held out; licence signed by the supervisor; derived twins not published) and the rooms of MuSHRoom [22] (open licence; twins releasable), "reality" is the laser-scan mesh textured from the DSLR images and rendered in Habitat with a robot-camera model, with its own physical parameters (e.g. actuation noise, friction) hidden from the method and learned only from counted real data; this physical gap is synthetic, and the robot checks it. The twin is built from a subset of the separate phone capture of the same scene, so twin and "reality" share neither images nor reconstruction method; the largest budget stays below the full capture. Tasks are goal-reaching navigation (image-goal and point-goal) in static indoor scenes, with the difficulty set in a pilot. The sim-vs-real correlation [4] between twin and "reality" is measured per scene and must exceed a pre-registered threshold for H3. The proxy's own error is reported, and every hypothesis is re-checked for sign with a second reference from all DSLR images. P = success rate; path efficiency is also reported.</w:t>
+      </w:r>
+    </w:p>
+    <w:p>
+      <w:pPr>
+        <w:spacing w:after="120" w:line="240" w:lineRule="auto"/>
+        <w:jc w:val="both"/>
+      </w:pPr>
+      <w:r>
+        <w:rPr>
+          <w:rFonts w:cstheme="minorHAnsi"/>
+          <w:b/>
+          <w:lang w:val="en-US"/>
+        </w:rPr>
+        <w:t xml:space="preserve">Mechanism 1 – less capture (RQ1, H1; sem. 3–4).</w:t>
       </w:r>
     </w:p>
     <w:p>
@@ -6810,7 +7108,7 @@
           <w:rFonts w:cstheme="minorHAnsi"/>
           <w:lang w:val="en-US"/>
         </w:rPr>
-        <w:t xml:space="preserve"> the twin's appearance and geometry come from neural scene reconstruction (3DGS-type [10]), run as a mesh in the simulator (as in [11]) or rendered directly; its physical part (e.g. traversable surfaces, collisions, the robot's actuation noise) is estimated from a few measurements as a posterior [15]. The next views are chosen where the twin's uncertainty (e.g. Fisher information [17] or an uncertainty field [18] adapted to 3DGS) is highest in the regions that matter for navigation: along planner paths between likely goals and, optionally, where a pretrained vision-language model grounds the task. Candidates come from the recorded capture; capture time is estimated as a walking tour.</w:t>
+        <w:t xml:space="preserve"> the twin's appearance and geometry come from 3DGS [11], run as a mesh in the simulator (as in [12]); its physical part is identified from a few trajectories as a posterior [19]. The next views are chosen where the twin's uncertainty (Fisher information [23] or an uncertainty field [24] adapted to 3DGS) is highest in the regions that matter for the task, e.g. along planner paths between likely goals; one task-weighted information criterion covers both views and physical parameters. Candidates come from the recorded capture, timed as a walking tour.</w:t>
       </w:r>
     </w:p>
     <w:p>
@@ -6832,14 +7130,14 @@
           <w:i/>
           <w:lang w:val="en-US"/>
         </w:rPr>
-        <w:t xml:space="preserve">Comparators:</w:t>
-      </w:r>
-      <w:r>
-        <w:rPr>
-          <w:rFonts w:cstheme="minorHAnsi"/>
-          <w:lang w:val="en-US"/>
-        </w:rPr>
-        <w:t xml:space="preserve"> uniform capture; task-blind and risk-weighted uncertainty selection [17, 19]; vision- language-guided reconstruction-quality selection [20].</w:t>
+        <w:t xml:space="preserve">Pre-registered baselines:</w:t>
+      </w:r>
+      <w:r>
+        <w:rPr>
+          <w:rFonts w:cstheme="minorHAnsi"/>
+          <w:lang w:val="en-US"/>
+        </w:rPr>
+        <w:t xml:space="preserve"> uniform capture; task-blind information-driven selection [23]; risk- and semantics-weighted selection with a reconstruction objective [25, 26]; task-blind identification of the physical part [20].</w:t>
       </w:r>
     </w:p>
     <w:p>
@@ -6868,7 +7166,7 @@
           <w:rFonts w:cstheme="minorHAnsi"/>
           <w:lang w:val="en-US"/>
         </w:rPr>
-        <w:t xml:space="preserve"> budget–P curves (≥ 4 budgets, the same navigation learner trained in each twin); ≥ 40% less capture (in views; operator time also reported) than uniform at equal P, with the 95% bound of the ratio below 1.</w:t>
+        <w:t xml:space="preserve"> ≥ 40% less capture than uniform at the target P (same learner in each twin; reference budget below the plateau), upper 95% bound of the ratio below 1; against task-blind selection only the upper bound below 1 is claimed.</w:t>
       </w:r>
     </w:p>
     <w:p>
@@ -6882,7 +7180,7 @@
           <w:b/>
           <w:lang w:val="en-US"/>
         </w:rPr>
-        <w:t xml:space="preserve">Stage 2 – training navigation models in the twin (RQ2, H2; sem. 4).</w:t>
+        <w:t xml:space="preserve">Mechanism 2 – better use of simulation (RQ2, H2; sem. 4).</w:t>
       </w:r>
     </w:p>
     <w:p>
@@ -6911,7 +7209,7 @@
           <w:rFonts w:cstheme="minorHAnsi"/>
           <w:lang w:val="en-US"/>
         </w:rPr>
-        <w:t xml:space="preserve"> the navigation model is initialized from a pretrained foundation model (e.g. a general navigation model or a vision-language-action model [21–24]) and trained in the twin by imitation of planner demonstrations and then by reinforcement learning on a subset of scenes, with parameter-efficient adaptation where the model is large. Randomization strength follows the twin's uncertainty per region and per physical parameter, and twin samples far from a few real samples in a frozen-encoder space [29] are down-weighted; these real samples are held out from the capture and count towards its budget. A learned world model (e.g. a video world model [25, 26]) adapted on twin data generates additional trajectories where the twin is most uncertain.</w:t>
+        <w:t xml:space="preserve"> the model is initialized from a pretrained foundation model (e.g. a general navigation model or a vision-language-action model [27–29]) and trained in the twin by imitation of planner demonstrations, then by reinforcement learning on a subset of scenes. Randomization strength follows the twin's uncertainty per region and per physical parameter, and twin samples far from a few real samples (held out from the capture and counted in its budget) in a frozen-encoder space [34] are down-weighted. A learned world model (e.g. a video world model [30, 31]) adapted on twin data generates additional trajectories where the twin is most uncertain; it is an ablation without its own threshold.</w:t>
       </w:r>
     </w:p>
     <w:p>
@@ -6933,14 +7231,14 @@
           <w:i/>
           <w:lang w:val="en-US"/>
         </w:rPr>
-        <w:t xml:space="preserve">Comparators:</w:t>
-      </w:r>
-      <w:r>
-        <w:rPr>
-          <w:rFonts w:cstheme="minorHAnsi"/>
-          <w:lang w:val="en-US"/>
-        </w:rPr>
-        <w:t xml:space="preserve"> uniform randomization of appearance [5] and dynamics [6], and none; ablations without the world model, without uncertainty weighting and without foundation-model initialization.</w:t>
+        <w:t xml:space="preserve">Pre-registered baselines:</w:t>
+      </w:r>
+      <w:r>
+        <w:rPr>
+          <w:rFonts w:cstheme="minorHAnsi"/>
+          <w:lang w:val="en-US"/>
+        </w:rPr>
+        <w:t xml:space="preserve"> uniform randomization of appearance [6] and dynamics [7]; no randomization; ablations without the world model, uncertainty weighting and foundation-model initialization.</w:t>
       </w:r>
     </w:p>
     <w:p>
@@ -6969,7 +7267,7 @@
           <w:rFonts w:cstheme="minorHAnsi"/>
           <w:lang w:val="en-US"/>
         </w:rPr>
-        <w:t xml:space="preserve"> mean paired gain in P over uniform randomization ≥ 10 pp on held-out scenes, lower 95% bound &gt; 0, at each of ≥ 2 capture budgets.</w:t>
+        <w:t xml:space="preserve"> mean paired gain in P over uniform randomization ≥ 10 pp on held-out scenes, lower 95% bound &gt; 0, at each of ≥ 2 budgets, in a pre-registered difficulty regime where the baseline reaches at most ~75% success, with the 150–300 episodes per arm needed to detect 10 pp.</w:t>
       </w:r>
     </w:p>
     <w:p>
@@ -6983,7 +7281,7 @@
           <w:b/>
           <w:lang w:val="en-US"/>
         </w:rPr>
-        <w:t xml:space="preserve">Stage 3 – transfer back to reality with few real data (RQ3, H3; end of sem. 4 – sem. 5).</w:t>
+        <w:t xml:space="preserve">Mechanism 3 – fewer real trials (RQ3, H3; end of sem. 4 – sem. 5).</w:t>
       </w:r>
     </w:p>
     <w:p>
@@ -7012,7 +7310,7 @@
           <w:rFonts w:cstheme="minorHAnsi"/>
           <w:lang w:val="en-US"/>
         </w:rPr>
-        <w:t xml:space="preserve"> candidate real trials are scored by the predicted twin-to-reality gap, combining the twin's uncertainty along the planned path, disagreement between twin and world model, and the navigation model's own uncertainty (ensemble spread). The top-ranked trials are run in reality; they correct the twin (re-capture where real and twin observations disagree, counted in the budget; posterior update of physical parameters [7, 15]) and the model (co-training with twin data [9]). Real P from few trials is estimated with prediction-powered inference [30].</w:t>
+        <w:t xml:space="preserve"> candidate real trials are scored by the predicted twin-to-reality gap, combining the twin's uncertainty along the planned path, disagreement between twin and world model, and the model's own uncertainty (ensemble spread). The top-ranked trials are run in reality; they correct the twin (re-capture where real and twin observations disagree, counted in the budget; posterior update of the physical parameters [8, 19]) and the model (co-training with twin data [10]). Real P from few trials is estimated with prediction-powered inference [35].</w:t>
       </w:r>
     </w:p>
     <w:p>
@@ -7034,14 +7332,14 @@
           <w:i/>
           <w:lang w:val="en-US"/>
         </w:rPr>
-        <w:t xml:space="preserve">Comparators:</w:t>
-      </w:r>
-      <w:r>
-        <w:rPr>
-          <w:rFonts w:cstheme="minorHAnsi"/>
-          <w:lang w:val="en-US"/>
-        </w:rPr>
-        <w:t xml:space="preserve"> random selection, uniform coverage and failure-prone selection from the twin alone [27].</w:t>
+        <w:t xml:space="preserve">Pre-registered baselines:</w:t>
+      </w:r>
+      <w:r>
+        <w:rPr>
+          <w:rFonts w:cstheme="minorHAnsi"/>
+          <w:lang w:val="en-US"/>
+        </w:rPr>
+        <w:t xml:space="preserve"> random selection; uniform coverage; a failure-driven rule that runs the configurations where the twin predicts failure (as in [18]).</w:t>
       </w:r>
     </w:p>
     <w:p>
@@ -7070,7 +7368,7 @@
           <w:rFonts w:cstheme="minorHAnsi"/>
           <w:lang w:val="en-US"/>
         </w:rPr>
-        <w:t xml:space="preserve"> the target P with ≥ 50% fewer trials than random selection (95% bound of the ratio below 1).</w:t>
+        <w:t xml:space="preserve"> the target P with ≥ 50% fewer trials than random selection (upper 95% bound of the ratio below 1), several runs per arm; against the failure-driven rule only the upper bound below 1 is claimed. Published selection rules save 20–40% of trials [33]; 50% is expected only where the gap concentrates in few configurations, hence the sim-vs-real precondition above.</w:t>
       </w:r>
     </w:p>
     <w:p>
@@ -7084,14 +7382,29 @@
           <w:b/>
           <w:lang w:val="en-US"/>
         </w:rPr>
-        <w:t xml:space="preserve">Whole pipeline (RQ4, H4; sem. 6).</w:t>
-      </w:r>
-      <w:r>
-        <w:rPr>
-          <w:rFonts w:cstheme="minorHAnsi"/>
-          <w:lang w:val="en-US"/>
-        </w:rPr>
-        <w:t xml:space="preserve"> Budget curves (real data against P) of the whole method, of the strongest existing real-to-sim-to-real approach, re-implemented for navigation and tuned with the same effort as the method (uniform capture, uniform randomization, training in the twin and random or failure-driven real trials, with the same reconstruction pipeline, learner and correction; e.g. [14, 27]), and of learning from real data only (imitation of real demonstrations, same initialization). The method's settings are fixed before this stage. </w:t>
+        <w:t xml:space="preserve">Whole method (RQ4, H4; sem. 6).</w:t>
+      </w:r>
+      <w:r>
+        <w:rPr>
+          <w:rFonts w:cstheme="minorHAnsi"/>
+          <w:lang w:val="en-US"/>
+        </w:rPr>
+        <w:t xml:space="preserve"> Budget curves of the whole method and of the strongest existing approach. No navigation pipeline with a real-trial step exists, so this baseline is </w:t>
+      </w:r>
+      <w:r>
+        <w:rPr>
+          <w:rFonts w:cstheme="minorHAnsi"/>
+          <w:i/>
+          <w:lang w:val="en-US"/>
+        </w:rPr>
+        <w:t xml:space="preserve">assembled and pre-registered</w:t>
+      </w:r>
+      <w:r>
+        <w:rPr>
+          <w:rFonts w:cstheme="minorHAnsi"/>
+          <w:lang w:val="en-US"/>
+        </w:rPr>
+        <w:t xml:space="preserve">: capture and fine-tuning as in [12] plus real-trial correction as in [16, 18], with the same reconstruction pipeline, learner, compute and budget; a zero-shot twin and learning from real data only (imitation, same initialization) are reference curves; the method's settings are fixed beforehand. </w:t>
       </w:r>
       <w:r>
         <w:rPr>
@@ -7106,7 +7419,7 @@
           <w:rFonts w:cstheme="minorHAnsi"/>
           <w:lang w:val="en-US"/>
         </w:rPr>
-        <w:t xml:space="preserve"> ≥ 2× less real data than the existing approach at the target P, with the 95% bound of the ratio below 1, and the stage 1–3 effects keep their sign.</w:t>
+        <w:t xml:space="preserve"> ≥ 2× less real data than the assembled baseline at the target P, upper 95% bound of the ratio below 1, and the mechanism 1–3 effects keep their sign; ≥ 30–50 episodes per point.</w:t>
       </w:r>
     </w:p>
     <w:p>
@@ -7120,6 +7433,27 @@
           <w:b/>
           <w:lang w:val="en-US"/>
         </w:rPr>
+        <w:t xml:space="preserve">Generalization to manipulation (sem. 5–6).</w:t>
+      </w:r>
+      <w:r>
+        <w:rPr>
+          <w:rFonts w:cstheme="minorHAnsi"/>
+          <w:lang w:val="en-US"/>
+        </w:rPr>
+        <w:t xml:space="preserve"> The same method, settings unchanged, runs on tabletop tasks in ManiSkill3 [2], where a scene with hidden ground-truth physical parameters and its own rendering is "reality" and the twin is reconstructed from a subset of its views and a few interactions; this weaker proxy is checked against published paired sim-and-real evaluations [5]. No separate thresholds: only budget curves and the sign of the H1–H4 effects.</w:t>
+      </w:r>
+    </w:p>
+    <w:p>
+      <w:pPr>
+        <w:spacing w:after="120" w:line="240" w:lineRule="auto"/>
+        <w:jc w:val="both"/>
+      </w:pPr>
+      <w:r>
+        <w:rPr>
+          <w:rFonts w:cstheme="minorHAnsi"/>
+          <w:b/>
+          <w:lang w:val="en-US"/>
+        </w:rPr>
         <w:t xml:space="preserve">Real-robot validation.</w:t>
       </w:r>
       <w:r>
@@ -7127,7 +7461,7 @@
           <w:rFonts w:cstheme="minorHAnsi"/>
           <w:lang w:val="en-US"/>
         </w:rPr>
-        <w:t xml:space="preserve"> Two campaigns (sem. 5 and 7) with own phone or RGB-D captures of 2 rooms at PWr and a mobile robot: uniform capture versus the method, ~8 robot-hours per campaign; they check the direction of the results and never tune thresholds.</w:t>
+        <w:t xml:space="preserve"> Two campaigns (sem. 5 and 7) in 2 rooms at PWr with a small mobile robot (a TurtleBot 4 Lite from an SzD Minigrant, or a robot of the K29 laboratory), ~8 robot-hours each: own captures, uniform capture versus the method, and the proxy-vs-robot sim-vs-real correlation (the proxy's validity); the robot checks the direction of the results, never the thresholds.</w:t>
       </w:r>
     </w:p>
     <w:p>
@@ -7141,14 +7475,14 @@
           <w:b/>
           <w:lang w:val="en-US"/>
         </w:rPr>
-        <w:t xml:space="preserve">Statistics and compute.</w:t>
-      </w:r>
-      <w:r>
-        <w:rPr>
-          <w:rFonts w:cstheme="minorHAnsi"/>
-          <w:lang w:val="en-US"/>
-        </w:rPr>
-        <w:t xml:space="preserve"> Targets are defined from each comparator's own curve at its largest budget. Tests are one-sided at α = 0.05 with a scene-level bootstrap and Holm correction, pre-registered before each stage. Training runs on WCSS and PLGrid GPUs (computing grant applied for in sem. 3); smaller models are used for development. Code is released where dataset and model licences permit.</w:t>
+        <w:t xml:space="preserve">Statistics, compute, openness.</w:t>
+      </w:r>
+      <w:r>
+        <w:rPr>
+          <w:rFonts w:cstheme="minorHAnsi"/>
+          <w:lang w:val="en-US"/>
+        </w:rPr>
+        <w:t xml:space="preserve"> Tests are one-sided at α = 0.05 with a scene-level bootstrap and Holm correction; each stage is pre-registered (baselines, thresholds, difficulty regime, correlation threshold). Training runs on WCSS and PLGrid GPUs (grant in sem. 3); costs are measured in the pilot. Released: code, configurations, scene lists, seeds, pre-registrations and the MuSHRoom-based twins; no assets derived from ScanNet++.</w:t>
       </w:r>
     </w:p>
     <w:permEnd w:id="32011344"/>
@@ -7417,7 +7751,7 @@
           <w:rFonts w:cstheme="minorHAnsi"/>
           <w:lang w:val="pl-PL"/>
         </w:rPr>
-        <w:t xml:space="preserve">Roboty, które poruszają się po budynkach, na przykład w magazynach, szpitalach czy biurach, coraz częściej korzystają z modeli nawigacji, które uczą się na podstawie doświadczenia. Aby taki model dobrze działał w konkretnym budynku, potrzebuje wielu danych z tego miejsca, a zbieranie ich w rzeczywistości jest powolne i kosztowne. Dlatego coraz częściej robot uczy się w cyfrowym bliźniaku: wiernej kopii prawdziwego budynku, którą można odtworzyć z krótkiego nagrania i kilku pomiarów. Powstaje w ten sposób droga w trzech krokach: zbieramy dane w rzeczywistości i budujemy z nich kopię, uczymy w niej model nawigacji, a następnie przenosimy go z powrotem do rzeczywistości i tam sprawdzamy oraz poprawiamy. Każdy z tych kroków wymaga jednak prawdziwych danych.</w:t>
+        <w:t xml:space="preserve">Roboty, które uczą się zadania na podstawie doświadczenia, na przykład poruszania się po budynku albo przenoszenia przedmiotów, potrzebują wielu takich doświadczeń z miejsca, w którym będą pracować, a zbieranie ich w rzeczywistości jest powolne i kosztowne. Dlatego coraz częściej robot uczy się w cyfrowym bliźniaku: wiernej kopii prawdziwego miejsca, którą można odtworzyć z krótkiego nagrania i kilku pomiarów. Powstaje w ten sposób droga w trzech krokach: zbieramy dane w rzeczywistości i budujemy z nich kopię, uczymy w niej model robota, a następnie przenosimy go z powrotem do rzeczywistości i tam sprawdzamy oraz poprawiamy. Każdy z tych kroków wymaga jednak prawdziwych danych, a dziś nikt nie wie, jak mało by wystarczyło.</w:t>
       </w:r>
     </w:p>
     <w:p>
@@ -7430,7 +7764,7 @@
           <w:rFonts w:cstheme="minorHAnsi"/>
           <w:lang w:val="pl-PL"/>
         </w:rPr>
-        <w:t xml:space="preserve">Celem rozprawy jest opracowanie metody, która przejdzie tę drogę z dużo mniejszą ilością prawdziwych danych niż dotychczasowe podejścia. W pierwszym kroku, zamiast nagrywać wszystko po równo, będziemy nagrywać przede wszystkim te miejsca, które są ważne dla poruszania się robota, a o których kopia wie jeszcze za mało. W drugim kroku, ponieważ kopia nigdy nie jest idealna, będziemy uczyć model tak, aby nie polegał na jej niepewnych fragmentach; pomogą w tym model świata, czyli program, który uczy się przewidywać, co wydarzy się dalej, oraz duże modele wstępnie wytrenowane na wielu innych danych. W trzecim kroku wybierzemy tylko te nieliczne próby w rzeczywistości, które najwięcej mówią o tym, gdzie kopia i model jeszcze się mylą, i wykorzystamy je do ich poprawienia. Badania będą prowadzone przede wszystkim na publicznie dostępnych skanach prawdziwych budynków, a wyniki zostaną potwierdzone na prawdziwym robocie.</w:t>
+        <w:t xml:space="preserve">Celem rozprawy jest opracowanie metody, która zmniejsza ilość prawdziwych danych potrzebnych na tej drodze. Metoda działa na każdym z trzech kroków. W pierwszym, zamiast nagrywać wszystko po równo, nagrywamy przede wszystkim te miejsca, które są ważne dla zadania, a o których kopia wie jeszcze za mało. W drugim, ponieważ kopia nigdy nie jest idealna, uczymy model tak, aby nie polegał na jej niepewnych fragmentach, a luki w kopii wypełnia program, który uczy się przewidywać, co wydarzy się dalej. W trzecim wybieramy tylko te nieliczne próby w rzeczywistości, które najwięcej mówią o tym, gdzie kopia i model jeszcze się mylą, i wykorzystujemy je do poprawienia obu. Metoda jest opracowywana i sprawdzana na nawigacji robotów mobilnych w budynkach, a następnie, bez zmian, na robotach, które przenoszą przedmioty. Badania są prowadzone przede wszystkim na publicznie dostępnych skanach prawdziwych budynków, a wyniki są potwierdzane na prawdziwym robocie.</w:t>
       </w:r>
     </w:p>
     <w:p>
@@ -7443,7 +7777,7 @@
           <w:rFonts w:cstheme="minorHAnsi"/>
           <w:lang w:val="pl-PL"/>
         </w:rPr>
-        <w:t xml:space="preserve">Spodziewanym efektem jest metoda, która pozwoli nauczyć robota poruszania się w nowym budynku przy dużo mniejszej ilości prawdziwych danych, oraz pomiar tego, ile prawdziwych danych pozwala ona zaoszczędzić w porównaniu z dotychczasowymi podejściami. Może to przyspieszyć i potanić wdrażanie robotów mobilnych w magazynach, szpitalach i biurach. Opracowane oprogramowanie zostanie udostępnione publicznie.</w:t>
+        <w:t xml:space="preserve">Spodziewanym efektem jest metoda, która pozwala nauczyć robota zadania przy dużo mniejszej ilości prawdziwych danych niż dotychczasowe podejścia; to, ile danych oszczędza, mierzymy w minutach pracy człowieka, w ten sam sposób dla każdego podejścia. Może to przyspieszyć i potanić wdrażanie robotów w magazynach, szpitalach i biurach. Opracowane oprogramowanie zostanie udostępnione publicznie.</w:t>
       </w:r>
     </w:p>
     <w:permEnd w:id="301016009"/>
@@ -7498,7 +7832,7 @@
           <w:rFonts w:cstheme="minorHAnsi"/>
           <w:lang w:val="en-US"/>
         </w:rPr>
-        <w:t xml:space="preserve">Robots that move around buildings, for example in warehouses, hospitals or offices, increasingly rely on navigation models that learn from experience. For such a model to work well in a particular building, it needs a lot of data from that place, and collecting it in reality is slow and costly. That is why robots increasingly learn in a digital twin: a faithful copy of a real building that can be rebuilt from a short recording and a few measurements. This creates a path in three steps: we collect data in reality and build the copy from it, train the navigation model in the copy, and then transfer it back to reality, where we check and correct it. Each of these steps, however, needs real data.</w:t>
+        <w:t xml:space="preserve">Robots that learn a task from experience, for example moving around a building or handling objects, need a lot of that experience from the place where they will work, and collecting it in reality is slow and costly. That is why robots increasingly learn in a digital twin: a faithful copy of a real place that can be rebuilt from a short recording and a few measurements. This creates a path in three steps: we collect data in reality and build the copy from it, train the robot's model in the copy, and then transfer it back to reality, where we check and correct it. Each of these steps, however, needs real data, and today nobody knows how little would be enough.</w:t>
       </w:r>
     </w:p>
     <w:p>
@@ -7511,7 +7845,7 @@
           <w:rFonts w:cstheme="minorHAnsi"/>
           <w:lang w:val="en-US"/>
         </w:rPr>
-        <w:t xml:space="preserve">The goal of this dissertation is to develop a method that follows this path with much less real data than existing approaches. In the first step, instead of recording everything evenly, we will record mainly the places that matter for the robot's movement and about which the copy still knows too little. In the second step, because the copy is never perfect, we will train the model so that it does not rely on the uncertain parts of the copy; a world model, a program that learns to predict what happens next, and large models pretrained on much other data will help with this. In the third step, we will choose only the few trials in reality that tell the most about where the copy and the model are still wrong, and use them to correct both. The research will be carried out mainly on publicly available scans of real buildings, and the results will be confirmed on a real robot.</w:t>
+        <w:t xml:space="preserve">The goal of this dissertation is to develop a method that reduces the amount of real data this path needs. The method acts at each of the three steps. In the first, instead of recording everything evenly, we record mainly the places that matter for the task and about which the copy still knows too little. In the second, because the copy is never perfect, we train the model so that it does not rely on the copy's uncertain parts, and a program that learns to predict what happens next fills the gaps in the copy. In the third, we choose only the few trials in reality that tell the most about where the copy and the model are still wrong, and use them to correct both. The method is developed and tested on the navigation of mobile robots in buildings, and then, unchanged, on robots that handle objects. The research is carried out mainly on publicly available scans of real buildings, and the results are confirmed on a real robot.</w:t>
       </w:r>
     </w:p>
     <w:p>
@@ -7524,7 +7858,7 @@
           <w:rFonts w:cstheme="minorHAnsi"/>
           <w:lang w:val="en-US"/>
         </w:rPr>
-        <w:t xml:space="preserve">The expected result is a method that makes it possible to teach a robot to move around a new building with much less real data, and a measurement of how much real data it saves compared with existing approaches. This may make deploying mobile robots in warehouses, hospitals and offices faster and cheaper. The software developed will be made publicly available.</w:t>
+        <w:t xml:space="preserve">The expected result is a method that makes it possible to teach a robot a task with much less real data than existing approaches; how much data it saves is measured in minutes of a person's work, in the same way for every approach. This may make deploying robots in warehouses, hospitals and offices faster and cheaper. The software developed will be made publicly available.</w:t>
       </w:r>
     </w:p>
     <w:permEnd w:id="305530072"/>
@@ -7975,7 +8309,22 @@
           <w:rFonts w:cstheme="minorHAnsi"/>
           <w:lang w:val="en-US"/>
         </w:rPr>
-        <w:t xml:space="preserve">. P1 reports the first two stages of the method for navigation models (stage 1 and the first stage 2 results, RQ1–RQ2): capture of real data guided by the navigation task and by the twin's uncertainty (H1), and training of navigation models that follows the twin's uncertainty (first H2 results). Both are evaluated on public scans of real buildings by the real data they save (task T4.2). If it is rejected, the revised paper goes to </w:t>
+        <w:t xml:space="preserve">. P1 reports the first reduction mechanism of the method, </w:t>
+      </w:r>
+      <w:r>
+        <w:rPr>
+          <w:rFonts w:cstheme="minorHAnsi"/>
+          <w:b/>
+          <w:lang w:val="en-US"/>
+        </w:rPr>
+        <w:t xml:space="preserve">less capture</w:t>
+      </w:r>
+      <w:r>
+        <w:rPr>
+          <w:rFonts w:cstheme="minorHAnsi"/>
+          <w:lang w:val="en-US"/>
+        </w:rPr>
+        <w:t xml:space="preserve"> (RQ1, H1), in indoor robot navigation: capture of real data guided by the task and by the twin's uncertainty, evaluated on public scans of real buildings by the real data it saves, in operator minutes, against pre-registered baselines (task T4.2). Because this mechanism is the most exposed to being published first by others, its result is also released as an early preprint. If P1 is rejected, the revised paper goes to </w:t>
       </w:r>
       <w:r>
         <w:rPr>
@@ -8272,10 +8621,10 @@
       </w:tblPr>
       <w:tblGrid>
         <w:gridCol w:w="1269"/>
-        <w:gridCol w:w="3518"/>
-        <w:gridCol w:w="1156"/>
-        <w:gridCol w:w="1518"/>
-        <w:gridCol w:w="1611"/>
+        <w:gridCol w:w="3449"/>
+        <w:gridCol w:w="1269"/>
+        <w:gridCol w:w="1473"/>
+        <w:gridCol w:w="1612"/>
       </w:tblGrid>
       <w:tr>
         <w:tc>
@@ -8299,7 +8648,7 @@
         </w:tc>
         <w:tc>
           <w:tcPr>
-            <w:tcW w:w="3518" w:type="dxa"/>
+            <w:tcW w:w="3449" w:type="dxa"/>
           </w:tcPr>
           <w:p>
             <w:pPr>
@@ -8318,7 +8667,7 @@
         </w:tc>
         <w:tc>
           <w:tcPr>
-            <w:tcW w:w="1156" w:type="dxa"/>
+            <w:tcW w:w="1269" w:type="dxa"/>
           </w:tcPr>
           <w:p>
             <w:pPr>
@@ -8337,7 +8686,7 @@
         </w:tc>
         <w:tc>
           <w:tcPr>
-            <w:tcW w:w="1518" w:type="dxa"/>
+            <w:tcW w:w="1473" w:type="dxa"/>
           </w:tcPr>
           <w:p>
             <w:pPr>
@@ -8350,13 +8699,13 @@
                 <w:b/>
                 <w:lang w:val="en-US"/>
               </w:rPr>
-              <w:t xml:space="preserve">Grants</w:t>
+              <w:t xml:space="preserve">Grants, licences</w:t>
             </w:r>
           </w:p>
         </w:tc>
         <w:tc>
           <w:tcPr>
-            <w:tcW w:w="1611" w:type="dxa"/>
+            <w:tcW w:w="1612" w:type="dxa"/>
           </w:tcPr>
           <w:p>
             <w:pPr>
@@ -8395,7 +8744,7 @@
         </w:tc>
         <w:tc>
           <w:tcPr>
-            <w:tcW w:w="3518" w:type="dxa"/>
+            <w:tcW w:w="3449" w:type="dxa"/>
           </w:tcPr>
           <w:p>
             <w:pPr>
@@ -8413,7 +8762,7 @@
         </w:tc>
         <w:tc>
           <w:tcPr>
-            <w:tcW w:w="1156" w:type="dxa"/>
+            <w:tcW w:w="1269" w:type="dxa"/>
           </w:tcPr>
           <w:p>
             <w:pPr>
@@ -8431,7 +8780,7 @@
         </w:tc>
         <w:tc>
           <w:tcPr>
-            <w:tcW w:w="1518" w:type="dxa"/>
+            <w:tcW w:w="1473" w:type="dxa"/>
           </w:tcPr>
           <w:p>
             <w:pPr>
@@ -8449,7 +8798,7 @@
         </w:tc>
         <w:tc>
           <w:tcPr>
-            <w:tcW w:w="1611" w:type="dxa"/>
+            <w:tcW w:w="1612" w:type="dxa"/>
           </w:tcPr>
           <w:p>
             <w:pPr>
@@ -8487,7 +8836,7 @@
         </w:tc>
         <w:tc>
           <w:tcPr>
-            <w:tcW w:w="3518" w:type="dxa"/>
+            <w:tcW w:w="3449" w:type="dxa"/>
           </w:tcPr>
           <w:p>
             <w:pPr>
@@ -8499,13 +8848,13 @@
                 <w:rFonts w:cstheme="minorHAnsi"/>
                 <w:lang w:val="en-US"/>
               </w:rPr>
-              <w:t xml:space="preserve">P1 (stage 1 and first stage 2 results, RQ1–RQ2): NeurIPS 2027, May 2027 (§11)</w:t>
+              <w:t xml:space="preserve">P1 (mechanism 1, RQ1): NeurIPS 2027, May 2027 (§11)</w:t>
             </w:r>
           </w:p>
         </w:tc>
         <w:tc>
           <w:tcPr>
-            <w:tcW w:w="1156" w:type="dxa"/>
+            <w:tcW w:w="1269" w:type="dxa"/>
           </w:tcPr>
           <w:p>
             <w:pPr>
@@ -8517,13 +8866,13 @@
                 <w:rFonts w:cstheme="minorHAnsi"/>
                 <w:lang w:val="en-US"/>
               </w:rPr>
-              <w:t xml:space="preserve">Pipeline on public scans</w:t>
+              <w:t xml:space="preserve">Proxy pipeline</w:t>
             </w:r>
           </w:p>
         </w:tc>
         <w:tc>
           <w:tcPr>
-            <w:tcW w:w="1518" w:type="dxa"/>
+            <w:tcW w:w="1473" w:type="dxa"/>
           </w:tcPr>
           <w:p>
             <w:pPr>
@@ -8535,13 +8884,13 @@
                 <w:rFonts w:cstheme="minorHAnsi"/>
                 <w:lang w:val="en-US"/>
               </w:rPr>
-              <w:t xml:space="preserve">SzD Minigrant; NCN PRELUDIUM; NAWA Bekker</w:t>
+              <w:t xml:space="preserve">ScanNet++; PLGrid; Minigrant; PRELUDIUM; Bekker</w:t>
             </w:r>
           </w:p>
         </w:tc>
         <w:tc>
           <w:tcPr>
-            <w:tcW w:w="1611" w:type="dxa"/>
+            <w:tcW w:w="1612" w:type="dxa"/>
           </w:tcPr>
           <w:p>
             <w:pPr>
@@ -8579,7 +8928,7 @@
         </w:tc>
         <w:tc>
           <w:tcPr>
-            <w:tcW w:w="3518" w:type="dxa"/>
+            <w:tcW w:w="3449" w:type="dxa"/>
           </w:tcPr>
           <w:p>
             <w:pPr>
@@ -8591,13 +8940,13 @@
                 <w:rFonts w:cstheme="minorHAnsi"/>
                 <w:lang w:val="en-US"/>
               </w:rPr>
-              <w:t xml:space="preserve">P2 (stage 3, few real data, RQ3): ICML or CVPR 2028; P3 (the whole pipeline, RQ4): NeurIPS 2028</w:t>
+              <w:t xml:space="preserve">P2 (mechanisms 2–3, RQ2–RQ3, first manipulation results): ICML/CVPR 2028; P3 (whole method, RQ4): NeurIPS 2028</w:t>
             </w:r>
           </w:p>
         </w:tc>
         <w:tc>
           <w:tcPr>
-            <w:tcW w:w="1156" w:type="dxa"/>
+            <w:tcW w:w="1269" w:type="dxa"/>
           </w:tcPr>
           <w:p>
             <w:pPr>
@@ -8609,13 +8958,13 @@
                 <w:rFonts w:cstheme="minorHAnsi"/>
                 <w:lang w:val="en-US"/>
               </w:rPr>
-              <w:t xml:space="preserve">Stage 3 code</w:t>
+              <w:t xml:space="preserve">Mechanism 3 code</w:t>
             </w:r>
           </w:p>
         </w:tc>
         <w:tc>
           <w:tcPr>
-            <w:tcW w:w="1518" w:type="dxa"/>
+            <w:tcW w:w="1473" w:type="dxa"/>
           </w:tcPr>
           <w:p>
             <w:pPr>
@@ -8633,7 +8982,7 @@
         </w:tc>
         <w:tc>
           <w:tcPr>
-            <w:tcW w:w="1611" w:type="dxa"/>
+            <w:tcW w:w="1612" w:type="dxa"/>
           </w:tcPr>
           <w:p>
             <w:pPr>
@@ -8645,7 +8994,7 @@
                 <w:rFonts w:cstheme="minorHAnsi"/>
                 <w:lang w:val="en-US"/>
               </w:rPr>
-              <w:t xml:space="preserve">Mid-term; 3-month visit (sem. 6)</w:t>
+              <w:t xml:space="preserve">Mid-term; visit (sem. 6)</w:t>
             </w:r>
           </w:p>
         </w:tc>
@@ -8671,7 +9020,7 @@
         </w:tc>
         <w:tc>
           <w:tcPr>
-            <w:tcW w:w="3518" w:type="dxa"/>
+            <w:tcW w:w="3449" w:type="dxa"/>
           </w:tcPr>
           <w:p>
             <w:pPr>
@@ -8689,7 +9038,7 @@
         </w:tc>
         <w:tc>
           <w:tcPr>
-            <w:tcW w:w="1156" w:type="dxa"/>
+            <w:tcW w:w="1269" w:type="dxa"/>
           </w:tcPr>
           <w:p>
             <w:pPr>
@@ -8707,7 +9056,7 @@
         </w:tc>
         <w:tc>
           <w:tcPr>
-            <w:tcW w:w="1518" w:type="dxa"/>
+            <w:tcW w:w="1473" w:type="dxa"/>
           </w:tcPr>
           <w:p>
             <w:pPr>
@@ -8725,7 +9074,7 @@
         </w:tc>
         <w:tc>
           <w:tcPr>
-            <w:tcW w:w="1611" w:type="dxa"/>
+            <w:tcW w:w="1612" w:type="dxa"/>
           </w:tcPr>
           <w:p>
             <w:pPr>
@@ -8760,14 +9109,14 @@
           <w:b/>
           <w:lang w:val="en-US"/>
         </w:rPr>
-        <w:t xml:space="preserve">Foreign research visit (candidate hosts, not yet contacted).</w:t>
-      </w:r>
-      <w:r>
-        <w:rPr>
-          <w:rFonts w:cstheme="minorHAnsi"/>
-          <w:lang w:val="en-US"/>
-        </w:rPr>
-        <w:t xml:space="preserve"> (1) Z. Kira's group, Georgia Tech: EmbodiedSplat [11]. (2) Multi-robot Systems Lab, Stanford University (M. Schwager): Gaussian-splatting scene models. A European host (Erasmus+ route) working on active reconstruction or sim-to-real transfer, and a foreign co-author for P2, are sought with the supervisor in sem. 4.</w:t>
+        <w:t xml:space="preserve">Foreign research visit (candidate hosts, not yet contacted):</w:t>
+      </w:r>
+      <w:r>
+        <w:rPr>
+          <w:rFonts w:cstheme="minorHAnsi"/>
+          <w:lang w:val="en-US"/>
+        </w:rPr>
+        <w:t xml:space="preserve"> Z. Kira's group, Georgia Tech (EmbodiedSplat [12]); M. Schwager's lab, Stanford (Gaussian-splatting scene models); a European host (Erasmus+) and a foreign co-author for P2 are sought in sem. 4.</w:t>
       </w:r>
     </w:p>
     <w:p>
@@ -8781,14 +9130,14 @@
           <w:b/>
           <w:lang w:val="en-US"/>
         </w:rPr>
-        <w:t xml:space="preserve">Collaboration at PWr.</w:t>
-      </w:r>
-      <w:r>
-        <w:rPr>
-          <w:rFonts w:cstheme="minorHAnsi"/>
-          <w:lang w:val="en-US"/>
-        </w:rPr>
-        <w:t xml:space="preserve"> Robot validation is planned with the K29 </w:t>
+        <w:t xml:space="preserve">Robot and scope.</w:t>
+      </w:r>
+      <w:r>
+        <w:rPr>
+          <w:rFonts w:cstheme="minorHAnsi"/>
+          <w:lang w:val="en-US"/>
+        </w:rPr>
+        <w:t xml:space="preserve"> A small mobile robot from an SzD Minigrant or one of the K29 </w:t>
       </w:r>
       <w:r>
         <w:rPr>
@@ -8803,7 +9152,7 @@
           <w:rFonts w:cstheme="minorHAnsi"/>
           <w:lang w:val="en-US"/>
         </w:rPr>
-        <w:t xml:space="preserve"> laboratory (Pioneer 3-DX, Jaguar 4x4, ROS 2); a written agreement is task T3.2 (Nov 2026).</w:t>
+        <w:t xml:space="preserve"> laboratory (task T3.2, Nov 2026); static indoor scenes only, moving people are future work.</w:t>
       </w:r>
     </w:p>
     <w:p>
@@ -8846,14 +9195,14 @@
           <w:i/>
           <w:lang w:val="en-US"/>
         </w:rPr>
-        <w:t xml:space="preserve">One stage gives no gain</w:t>
-      </w:r>
-      <w:r>
-        <w:rPr>
-          <w:rFonts w:cstheme="minorHAnsi"/>
-          <w:lang w:val="en-US"/>
-        </w:rPr>
-        <w:t xml:space="preserve"> (3–5): its budget curve still answers its RQ; H4 is still tested.</w:t>
+        <w:t xml:space="preserve">Proxy validity</w:t>
+      </w:r>
+      <w:r>
+        <w:rPr>
+          <w:rFonts w:cstheme="minorHAnsi"/>
+          <w:lang w:val="en-US"/>
+        </w:rPr>
+        <w:t xml:space="preserve"> (3–7): a rendered scan is itself a simulator, and one collision artefact can destroy sim-to-real predictivity [4]; separate captures, a second reference and the sim-vs-real correlation measured against the robot (§9); conclusions are ranking-preserving.</w:t>
       </w:r>
     </w:p>
     <w:p>
@@ -8875,14 +9224,14 @@
           <w:i/>
           <w:lang w:val="en-US"/>
         </w:rPr>
-        <w:t xml:space="preserve">Twin uncertainty is poorly calibrated</w:t>
-      </w:r>
-      <w:r>
-        <w:rPr>
-          <w:rFonts w:cstheme="minorHAnsi"/>
-          <w:lang w:val="en-US"/>
-        </w:rPr>
-        <w:t xml:space="preserve"> (3–4): two estimators and an ensemble fallback.</w:t>
+        <w:t xml:space="preserve">Physical gap</w:t>
+      </w:r>
+      <w:r>
+        <w:rPr>
+          <w:rFonts w:cstheme="minorHAnsi"/>
+          <w:lang w:val="en-US"/>
+        </w:rPr>
+        <w:t xml:space="preserve"> (3–6): friction, slip and actuation delays are absent from meshes; "reality" gets hidden physical parameters, mechanism 3 corrects them, the robot checks them.</w:t>
       </w:r>
     </w:p>
     <w:p>
@@ -8904,14 +9253,14 @@
           <w:i/>
           <w:lang w:val="en-US"/>
         </w:rPr>
-        <w:t xml:space="preserve">Proxy reality is easier than reality</w:t>
-      </w:r>
-      <w:r>
-        <w:rPr>
-          <w:rFonts w:cstheme="minorHAnsi"/>
-          <w:lang w:val="en-US"/>
-        </w:rPr>
-        <w:t xml:space="preserve"> (4–7): separate captures for twin and reference, a second reference and robot validation check the direction (§9).</w:t>
+        <w:t xml:space="preserve">Success ceiling and noise</w:t>
+      </w:r>
+      <w:r>
+        <w:rPr>
+          <w:rFonts w:cstheme="minorHAnsi"/>
+          <w:lang w:val="en-US"/>
+        </w:rPr>
+        <w:t xml:space="preserve"> (3–6): twins already reach high zero-shot success; a pre-registered difficulty regime, hundreds of proxy episodes per arm and targets from the baseline's plateau; robot trials confirm the direction only.</w:t>
       </w:r>
     </w:p>
     <w:p>
@@ -8933,14 +9282,14 @@
           <w:i/>
           <w:lang w:val="en-US"/>
         </w:rPr>
-        <w:t xml:space="preserve">Learning from real data only is strong at small budgets</w:t>
-      </w:r>
-      <w:r>
-        <w:rPr>
-          <w:rFonts w:cstheme="minorHAnsi"/>
-          <w:lang w:val="en-US"/>
-        </w:rPr>
-        <w:t xml:space="preserve"> (6): in navigation, gains from more data in a known location saturate quickly [8]; H4 is reported as a full budget curve.</w:t>
+        <w:t xml:space="preserve">No gain from one mechanism, or real-only learning strong at small budgets</w:t>
+      </w:r>
+      <w:r>
+        <w:rPr>
+          <w:rFonts w:cstheme="minorHAnsi"/>
+          <w:lang w:val="en-US"/>
+        </w:rPr>
+        <w:t xml:space="preserve"> (3–6): every curve still answers its RQ, H4 is a full budget curve, and gains from a known location saturate quickly [9].</w:t>
       </w:r>
     </w:p>
     <w:p>
@@ -8962,14 +9311,14 @@
           <w:i/>
           <w:lang w:val="en-US"/>
         </w:rPr>
-        <w:t xml:space="preserve">Compute</w:t>
-      </w:r>
-      <w:r>
-        <w:rPr>
-          <w:rFonts w:cstheme="minorHAnsi"/>
-          <w:lang w:val="en-US"/>
-        </w:rPr>
-        <w:t xml:space="preserve"> (3–7): WCSS and PLGrid grants in sem. 3; smaller models for development; fewer seeds.</w:t>
+        <w:t xml:space="preserve">Scooping</w:t>
+      </w:r>
+      <w:r>
+        <w:rPr>
+          <w:rFonts w:cstheme="minorHAnsi"/>
+          <w:lang w:val="en-US"/>
+        </w:rPr>
+        <w:t xml:space="preserve"> (3–6): several groups are one step from a budget curve [12, 18, 32]; H1 is published early (preprint, sem. 4), the literature is re-checked quarterly; we claim the reduction, not the twin.</w:t>
       </w:r>
     </w:p>
     <w:p>
@@ -8991,14 +9340,14 @@
           <w:i/>
           <w:lang w:val="en-US"/>
         </w:rPr>
-        <w:t xml:space="preserve">Crowded field, scooping</w:t>
-      </w:r>
-      <w:r>
-        <w:rPr>
-          <w:rFonts w:cstheme="minorHAnsi"/>
-          <w:lang w:val="en-US"/>
-        </w:rPr>
-        <w:t xml:space="preserve"> (3–6): twins, world models and fine-tuning in simulation are active areas, with targeted or real rollouts [27, 28]; we claim only the real-data budget; early preprints.</w:t>
+        <w:t xml:space="preserve">ScanNet++ licence</w:t>
+      </w:r>
+      <w:r>
+        <w:rPr>
+          <w:rFonts w:cstheme="minorHAnsi"/>
+          <w:lang w:val="en-US"/>
+        </w:rPr>
+        <w:t xml:space="preserve"> (3–7): non-commercial, revocable, no redistribution; the supervisor signs; MuSHRoom and own PWr rooms are the releasable fallback; no derived ScanNet++ assets.</w:t>
       </w:r>
     </w:p>
     <w:p>
@@ -9020,14 +9369,14 @@
           <w:i/>
           <w:lang w:val="en-US"/>
         </w:rPr>
-        <w:t xml:space="preserve">Licences, robot access</w:t>
-      </w:r>
-      <w:r>
-        <w:rPr>
-          <w:rFonts w:cstheme="minorHAnsi"/>
-          <w:lang w:val="en-US"/>
-        </w:rPr>
-        <w:t xml:space="preserve"> (3, 5, 7): gated or restricted models have open alternatives; without a robot, validation moves by a semester (the proxy reality decides).</w:t>
+        <w:t xml:space="preserve">Compute, robot access</w:t>
+      </w:r>
+      <w:r>
+        <w:rPr>
+          <w:rFonts w:cstheme="minorHAnsi"/>
+          <w:lang w:val="en-US"/>
+        </w:rPr>
+        <w:t xml:space="preserve"> (3–7): standard PLGrid grant and WCSS, smaller models; without a robot, validation moves by a semester (the proxy decides).</w:t>
       </w:r>
     </w:p>
     <w:p>
@@ -9049,56 +9398,14 @@
           <w:i/>
           <w:lang w:val="en-US"/>
         </w:rPr>
-        <w:t xml:space="preserve">Rejection at a top venue</w:t>
-      </w:r>
-      <w:r>
-        <w:rPr>
-          <w:rFonts w:cstheme="minorHAnsi"/>
-          <w:lang w:val="en-US"/>
-        </w:rPr>
-        <w:t xml:space="preserve"> (4–7): each paper has a resubmission path inside the 200-point set 2–4 months later (NeurIPS → CVPR → ICML → ECCV/ICCV).</w:t>
-      </w:r>
-    </w:p>
-    <w:p>
-      <w:pPr>
-        <w:spacing w:after="120" w:line="240" w:lineRule="auto"/>
-        <w:jc w:val="both"/>
-      </w:pPr>
-      <w:r>
-        <w:rPr>
-          <w:rFonts w:cstheme="minorHAnsi"/>
-          <w:b/>
-          <w:lang w:val="en-US"/>
-        </w:rPr>
-        <w:t xml:space="preserve">Future applicability.</w:t>
-      </w:r>
-      <w:r>
-        <w:rPr>
-          <w:rFonts w:cstheme="minorHAnsi"/>
-          <w:lang w:val="en-US"/>
-        </w:rPr>
-        <w:t xml:space="preserve"> The method is not specific to navigation; robotic manipulation is a natural extension after the dissertation.</w:t>
-      </w:r>
-    </w:p>
-    <w:p>
-      <w:pPr>
-        <w:spacing w:after="120" w:line="240" w:lineRule="auto"/>
-        <w:jc w:val="both"/>
-      </w:pPr>
-      <w:r>
-        <w:rPr>
-          <w:rFonts w:cstheme="minorHAnsi"/>
-          <w:b/>
-          <w:lang w:val="en-US"/>
-        </w:rPr>
-        <w:t xml:space="preserve">Prior work (background only).</w:t>
-      </w:r>
-      <w:r>
-        <w:rPr>
-          <w:rFonts w:cstheme="minorHAnsi"/>
-          <w:lang w:val="en-US"/>
-        </w:rPr>
-        <w:t xml:space="preserve"> A pre-PhD NLP paper (ACL 2025 SRW, forecasting from hidden states); not part of the dissertation.</w:t>
+        <w:t xml:space="preserve">Rejection</w:t>
+      </w:r>
+      <w:r>
+        <w:rPr>
+          <w:rFonts w:cstheme="minorHAnsi"/>
+          <w:lang w:val="en-US"/>
+        </w:rPr>
+        <w:t xml:space="preserve"> (4–7): resubmission inside the 200-point set 2–4 months later (NeurIPS → CVPR → ICML → ECCV/ICCV).</w:t>
       </w:r>
     </w:p>
     <w:p>
@@ -9112,14 +9419,14 @@
           <w:b/>
           <w:lang w:val="en-US"/>
         </w:rPr>
-        <w:t xml:space="preserve">Ethics and data.</w:t>
-      </w:r>
-      <w:r>
-        <w:rPr>
-          <w:rFonts w:cstheme="minorHAnsi"/>
-          <w:lang w:val="en-US"/>
-        </w:rPr>
-        <w:t xml:space="preserve"> Own captures are anonymized (GDPR); public datasets are used under their licences.</w:t>
+        <w:t xml:space="preserve">Prior work, ethics.</w:t>
+      </w:r>
+      <w:r>
+        <w:rPr>
+          <w:rFonts w:cstheme="minorHAnsi"/>
+          <w:lang w:val="en-US"/>
+        </w:rPr>
+        <w:t xml:space="preserve"> A pre-PhD NLP paper (ACL 2025 SRW) is background only. Own captures are anonymized (GDPR); public datasets are used under their licences.</w:t>
       </w:r>
     </w:p>
     <w:permEnd w:id="1742865563"/>
@@ -9426,6 +9733,35 @@
           <w:lang w:val="en-US"/>
         </w:rPr>
         <w:t xml:space="preserve"> against the IPB schedule (§3), before each annual report and the mid-term evaluation. Deviations from the plan and their reasons are recorded and agreed with the supervisor.</w:t>
+      </w:r>
+    </w:p>
+    <w:p>
+      <w:pPr>
+        <w:spacing w:after="40" w:line="240" w:lineRule="auto"/>
+        <w:ind w:left="284" w:hanging="284"/>
+        <w:jc w:val="both"/>
+      </w:pPr>
+      <w:r>
+        <w:rPr>
+          <w:rFonts w:cstheme="minorHAnsi"/>
+          <w:lang w:val="en-US"/>
+        </w:rPr>
+        <w:t xml:space="preserve">•	</w:t>
+      </w:r>
+      <w:r>
+        <w:rPr>
+          <w:rFonts w:cstheme="minorHAnsi"/>
+          <w:b/>
+          <w:lang w:val="en-US"/>
+        </w:rPr>
+        <w:t xml:space="preserve">Pre-registrations and formal steps.</w:t>
+      </w:r>
+      <w:r>
+        <w:rPr>
+          <w:rFonts w:cstheme="minorHAnsi"/>
+          <w:lang w:val="en-US"/>
+        </w:rPr>
+        <w:t xml:space="preserve"> The supervisor approves the pre-registration of each stage (baselines, thresholds, difficulty regime) before its experiments start, signs the dataset licence application (ScanNet++, Oct 2026) and co-signs the grant applications (§12).</w:t>
       </w:r>
     </w:p>
     <w:p>

</xml_diff>

<commit_message>
Scientific core: problem as sequential experimental design, value-of-real-data principle, domain-adaptation bound; title and §5-§10 reframed; review-5
Co-Authored-By: Claude Opus 5.5 <noreply@anthropic.com>
</commit_message>
<xml_diff>
--- a/output/IPB_Grzegorz_Piotrowski.docx
+++ b/output/IPB_Grzegorz_Piotrowski.docx
@@ -1098,7 +1098,7 @@
           <w:rFonts w:cstheme="minorHAnsi"/>
           <w:lang w:val="en-US"/>
         </w:rPr>
-        <w:t xml:space="preserve"> Ograniczanie ilości danych rzeczywistych w uczeniu robotów w pętli rzeczywistość–symulacja– rzeczywistość z cyfrowymi bliźniakami: metoda z zastosowaniem w nawigacji i manipulacji</w:t>
+        <w:t xml:space="preserve"> Wartość informacyjna danych rzeczywistych w uczeniu robotów w pętli rzeczywistość–symulacja– rzeczywistość: metoda ograniczania ich ilości z zastosowaniem w nawigacji i manipulacji</w:t>
       </w:r>
       <w:bookmarkStart w:id="0" w:name="_Hlk95566638"/>
     </w:p>
@@ -1120,7 +1120,7 @@
           <w:rFonts w:cstheme="minorHAnsi"/>
           <w:lang w:val="en-US"/>
         </w:rPr>
-        <w:t xml:space="preserve"> Reducing the amount of real data in real-to-sim-to-real robot learning with digital twins: a method with applications to navigation and manipulation</w:t>
+        <w:t xml:space="preserve"> The value of real data in real-to-sim-to-real robot learning: a method for reducing its amount, with applications to navigation and manipulation</w:t>
       </w:r>
     </w:p>
     <w:bookmarkEnd w:id="0"/>
@@ -4474,29 +4474,29 @@
           <w:b/>
           <w:lang w:val="en-US"/>
         </w:rPr>
-        <w:t xml:space="preserve">Goal of the dissertation.</w:t>
-      </w:r>
-      <w:r>
-        <w:rPr>
-          <w:rFonts w:cstheme="minorHAnsi"/>
-          <w:lang w:val="en-US"/>
-        </w:rPr>
-        <w:t xml:space="preserve"> The goal is to develop </w:t>
-      </w:r>
-      <w:r>
-        <w:rPr>
-          <w:rFonts w:cstheme="minorHAnsi"/>
-          <w:b/>
-          <w:lang w:val="en-US"/>
-        </w:rPr>
-        <w:t xml:space="preserve">a method that reduces the amount of real data</w:t>
-      </w:r>
-      <w:r>
-        <w:rPr>
-          <w:rFonts w:cstheme="minorHAnsi"/>
-          <w:lang w:val="en-US"/>
-        </w:rPr>
-        <w:t xml:space="preserve"> needed to teach a robot a task through the real-to-sim-to-real loop. The method acts at every step of the loop with one reduction mechanism: (1) </w:t>
+        <w:t xml:space="preserve">Scientific problem and goal.</w:t>
+      </w:r>
+      <w:r>
+        <w:rPr>
+          <w:rFonts w:cstheme="minorHAnsi"/>
+          <w:lang w:val="en-US"/>
+        </w:rPr>
+        <w:t xml:space="preserve"> The underlying problem is scientific: learning under distribution shift when target-domain data can be bought at a cost at several points of a learning loop. The dissertation poses the real-to-sim-to-real loop as sequential experimental design over a real-data budget, values each real datum by its expected reduction of the twin-to-reality performance gap per unit cost, and derives when twin data can replace real data. The goal is </w:t>
+      </w:r>
+      <w:r>
+        <w:rPr>
+          <w:rFonts w:cstheme="minorHAnsi"/>
+          <w:b/>
+          <w:lang w:val="en-US"/>
+        </w:rPr>
+        <w:t xml:space="preserve">a method, grounded in this principle, that reduces the amount of real data</w:t>
+      </w:r>
+      <w:r>
+        <w:rPr>
+          <w:rFonts w:cstheme="minorHAnsi"/>
+          <w:lang w:val="en-US"/>
+        </w:rPr>
+        <w:t xml:space="preserve"> needed to teach a robot a task, with one mechanism per step: (1) </w:t>
       </w:r>
       <w:r>
         <w:rPr>
@@ -4511,7 +4511,7 @@
           <w:rFonts w:cstheme="minorHAnsi"/>
           <w:lang w:val="en-US"/>
         </w:rPr>
-        <w:t xml:space="preserve">: acquire only the real data that matters for the task and that the twin is still uncertain about; (2) </w:t>
+        <w:t xml:space="preserve">; (2) </w:t>
       </w:r>
       <w:r>
         <w:rPr>
@@ -4526,7 +4526,7 @@
           <w:rFonts w:cstheme="minorHAnsi"/>
           <w:lang w:val="en-US"/>
         </w:rPr>
-        <w:t xml:space="preserve">: train so that the twin's errors do not hurt, and fill its gaps with a learned world model; (3) </w:t>
+        <w:t xml:space="preserve">, training so that the twin's errors do not transfer; (3) </w:t>
       </w:r>
       <w:r>
         <w:rPr>
@@ -4541,7 +4541,7 @@
           <w:rFonts w:cstheme="minorHAnsi"/>
           <w:lang w:val="en-US"/>
         </w:rPr>
-        <w:t xml:space="preserve">: choose the few real trials that correct the twin and the model the most. The thesis is that the method as a whole needs at least two times less real data than the strongest existing real-to-sim-to-real approach. The amount of real data, counted in minutes of operator work, is only how the method is evaluated; measuring it is not the goal. Indoor robot navigation is the main testbed, on which the hypotheses are decided; robotic manipulation tests whether the same method, unchanged, carries over to another task.</w:t>
+        <w:t xml:space="preserve">, choosing those that correct twin and model most. The thesis is that the method needs at least two times less real data than the strongest existing real-to-sim-to-real approach. Operator minutes are only the evaluation measure. Indoor navigation is the main testbed; manipulation tests whether the same method carries over.</w:t>
       </w:r>
     </w:p>
     <w:p>
@@ -4976,7 +4976,7 @@
           <w:rFonts w:cstheme="minorHAnsi"/>
           <w:lang w:val="en-US"/>
         </w:rPr>
-        <w:t xml:space="preserve"> Robot models for navigation and manipulation are commonly trained in simulators such as Habitat [1] and ManiSkill3 [2], where large-scale reinforcement learning essentially solves point-goal navigation after billions of steps [3]. Transfer to the real world is the open part: simulation success does not always predict real success, which motivated the Sim-vs-Real Correlation Coefficient in navigation (it rose from 0.18 to 0.84 once one collision artefact was removed [4]) and paired sim-and-real evaluations in manipulation [5]. Domain randomization varies appearance [6] or dynamics [7] uniformly within hand-set ranges, and a few real rollouts can adapt the simulation parameter distribution [8]. Real data still matters: in navigation, more data from a known location saturates quickly [9], and co-training on simulated and real data raises real success [10].</w:t>
+        <w:t xml:space="preserve"> Robot models for navigation and manipulation are commonly trained in simulators such as Habitat [1] and ManiSkill3 [2], where large-scale reinforcement learning essentially solves point-goal navigation after billions of steps [3]. Transfer to the real world is the open part: simulation success need not predict real success (the Sim-vs-Real Correlation Coefficient rose from 0.18 to 0.84 once one collision artefact was removed [4]; paired evaluations in manipulation [5]). Domain randomization varies appearance [6] or dynamics [7] uniformly within hand-set ranges, and a few real rollouts can adapt the simulation parameter distribution [8]. In navigation, more data from a known location saturates quickly [9]; sim-and-real co-training raises real success [10].</w:t>
       </w:r>
     </w:p>
     <w:p>
@@ -4997,7 +4997,7 @@
           <w:rFonts w:cstheme="minorHAnsi"/>
           <w:lang w:val="en-US"/>
         </w:rPr>
-        <w:t xml:space="preserve"> Neural scene reconstruction, above all 3D Gaussian Splatting (3DGS) [11], turns a short real capture into a photorealistic model of a scene. Twins built this way train models that transfer. In navigation, EmbodiedSplat [12] reconstructs rooms from a phone capture and fine-tunes image-goal navigation in Habitat, Vid2Sim [13] builds simulators for urban navigation from monocular video, GaussGym [14] trains navigation and locomotion from pixels, and ReaDy-Go [15] adds moving obstacles. In manipulation, RialTo [16] builds a twin from a scan and a few demonstrations, X-Sim [17] from a minute of human video, and TwinRL [18] fine-tunes a pretrained policy in a phone-captured twin and targets its few real rollouts at configurations where the twin predicts failure. The physical part of a twin can be identified from a small amount of real data, as a posterior over simulator parameters [19] or by exploration designed for identification [20]. Datasets such as ScanNet++ [21] pair laser scans and DSLR images with a separate phone capture of the same scene, and MuSHRoom [22] pairs phone and depth-camera captures with a reference mesh under an open licence. In all these works the amount of real data is fixed by hand: the navigation twins use between 15 seconds and 30 minutes of video per scene and no real training trials, and the manipulation works report single points (e.g. a scan and 15 demonstrations instead of 50 demonstrations [16]) rather than curves.</w:t>
+        <w:t xml:space="preserve"> Neural scene reconstruction, above all 3D Gaussian Splatting (3DGS) [11], turns a short real capture into a photorealistic model of a scene. Twins built this way train models that transfer. In navigation, EmbodiedSplat [12] reconstructs rooms from a phone capture and fine-tunes image-goal navigation in Habitat, Vid2Sim [13] builds simulators for urban navigation from monocular video, GaussGym [14] trains from pixels, and ReaDy-Go [15] adds moving obstacles. In manipulation, RialTo [16] builds a twin from a scan and a few demonstrations, X-Sim [17] from a minute of human video, and TwinRL [18] fine-tunes a pretrained policy in a phone-captured twin and targets its few real rollouts at configurations where the twin predicts failure. The physical part of a twin can be identified from a small amount of real data, as a posterior over simulator parameters [19] or by exploration designed for identification [20]. Datasets such as ScanNet++ [21] pair laser scans and DSLR images with a separate phone capture of the same scene, and MuSHRoom [22] pairs phone and depth-camera captures with a reference mesh under an open licence. In all these works the amount of real data is fixed by hand: the navigation twins use between 15 seconds and 30 minutes of video per scene and no real training trials, and the manipulation works report single points (e.g. a scan and 15 demonstrations instead of 50 demonstrations [16]) rather than curves.</w:t>
       </w:r>
     </w:p>
     <w:p>
@@ -5018,7 +5018,7 @@
           <w:rFonts w:cstheme="minorHAnsi"/>
           <w:lang w:val="en-US"/>
         </w:rPr>
-        <w:t xml:space="preserve"> Active view selection chooses the images that improve a reconstruction most: FisherRF [23] maximizes expected information gain, and Bayes' Rays [24] estimates an uncertainty field for a trained radiance field. Risk-aware view acquisition [25] weights FisherRF by safety-critical regions for navigation, and AREA3D [26] adds vision-language guidance. Their objective is reconstruction quality or safe exploration; none measures the success of a model trained in the resulting twin, and we found at most two task-aware capture papers a year in 2023–2026.</w:t>
+        <w:t xml:space="preserve"> Active view selection chooses the images that improve a reconstruction most: FisherRF [23] maximizes expected information gain, and Bayes' Rays [24] estimates an uncertainty field for a trained radiance field. Risk-aware view acquisition [25] weights FisherRF by safety-critical regions for navigation, and AREA3D [26] adds vision-language guidance. None measures the success of a model trained in the resulting twin (at most two task-aware capture papers a year, 2023–2026).</w:t>
       </w:r>
     </w:p>
     <w:p>
@@ -5039,7 +5039,7 @@
           <w:rFonts w:cstheme="minorHAnsi"/>
           <w:lang w:val="en-US"/>
         </w:rPr>
-        <w:t xml:space="preserve"> Pretrained navigation foundation models generalize across robots and environments (GNM [27], ViNT [28]), and vision-language-action models map images and instructions to actions [29]; they still need data from the target place to work there. Learned world models predict future observations: navigation world models plan by imagining trajectories [30], and open world foundation models are post-trained per setup [31]; VLAW [32] improves a world model with real rollouts, at a fixed, hand-chosen number of them. Choosing which real trials to run has been studied for </w:t>
+        <w:t xml:space="preserve"> Pretrained navigation foundation models generalize across robots and environments (GNM [27], ViNT [28]), and vision-language-action models map images and instructions to actions [29]; they still need data from the target place to work there. Learned world models predict future observations: navigation world models plan by imagining trajectories [30], and open world foundation models are post-trained per setup [31]; VLAW [32] improves a world model with real rollouts, at a fixed, hand-chosen number of them. Choosing real trials has been studied for </w:t>
       </w:r>
       <w:r>
         <w:rPr>
@@ -5054,7 +5054,7 @@
           <w:rFonts w:cstheme="minorHAnsi"/>
           <w:lang w:val="en-US"/>
         </w:rPr>
-        <w:t xml:space="preserve"> policies, where combining simulated and real trials saves a fifth to a quarter of the real-robot effort [33], not for </w:t>
+        <w:t xml:space="preserve"> policies (a fifth to a quarter less robot effort [33]), not for </w:t>
       </w:r>
       <w:r>
         <w:rPr>
@@ -5069,7 +5069,7 @@
           <w:rFonts w:cstheme="minorHAnsi"/>
           <w:lang w:val="en-US"/>
         </w:rPr>
-        <w:t xml:space="preserve"> a twin and the model trained in it. Frozen visual encoders [34] make twin and real observations comparable, and prediction-powered inference</w:t>
+        <w:t xml:space="preserve"> a twin and its model. Frozen visual encoders [34] make twin and real observations comparable, and prediction-powered inference</w:t>
       </w:r>
     </w:p>
     <w:p>
@@ -5097,6 +5097,27 @@
           <w:b/>
           <w:lang w:val="en-US"/>
         </w:rPr>
+        <w:t xml:space="preserve">Theory.</w:t>
+      </w:r>
+      <w:r>
+        <w:rPr>
+          <w:rFonts w:cstheme="minorHAnsi"/>
+          <w:lang w:val="en-US"/>
+        </w:rPr>
+        <w:t xml:space="preserve"> Domain-adaptation theory bounds target error by source error plus a discrepancy between domains [38], and Bayesian experimental design chooses measurements by expected information gain [36, 37]; neither has been applied to the allocation of real data across a real-to-sim-to-real loop.</w:t>
+      </w:r>
+    </w:p>
+    <w:p>
+      <w:pPr>
+        <w:spacing w:after="120" w:line="240" w:lineRule="auto"/>
+        <w:jc w:val="both"/>
+      </w:pPr>
+      <w:r>
+        <w:rPr>
+          <w:rFonts w:cstheme="minorHAnsi"/>
+          <w:b/>
+          <w:lang w:val="en-US"/>
+        </w:rPr>
         <w:t xml:space="preserve">Research gap.</w:t>
       </w:r>
       <w:r>
@@ -5104,7 +5125,7 @@
           <w:rFonts w:cstheme="minorHAnsi"/>
           <w:lang w:val="en-US"/>
         </w:rPr>
-        <w:t xml:space="preserve"> Real-to-sim-to-real learning works, but the real data it consumes is set by hand and spent uniformly at every step. No navigation pipeline has a stage that corrects the twin with real trials, and none reports how success depends on the real data spent; in manipulation the real data is accounted at single points, against learning from real data only, never against another real-to-sim-to-real pipeline. Missing is one method that reduces the real data at every step of the loop: (i) capture only what the task needs and the twin lacks (RQ1); (ii) train so that the twin's errors do not hurt, and fill its gaps with a learned world model (RQ2); (iii) run only the few real trials that correct twin and model most (RQ3); and (iv) evidence, in one unit and on one budget grid, that the whole method needs less real data than the strongest existing real-to-sim-to-real approach (RQ4).</w:t>
+        <w:t xml:space="preserve"> Real-to-sim-to-real learning works, but the real data it consumes is set by hand and spent uniformly at every step. No navigation pipeline has a stage that corrects the twin with real trials, and none reports how success depends on the real data spent; in manipulation the real data is accounted at single points, against learning from real data only, never against another real-to-sim-to-real pipeline. Missing are a principled criterion for spending real data across the whole loop, its theory, and a method built on it that reduces real data at every step (RQ1–RQ3) and in total (RQ4).</w:t>
       </w:r>
     </w:p>
     <w:p>
@@ -5612,6 +5633,48 @@
         <w:t xml:space="preserve">[35] A. N. Angelopoulos et al., "Prediction-Powered Inference," Science, 2023.</w:t>
       </w:r>
     </w:p>
+    <w:p>
+      <w:pPr>
+        <w:spacing w:after="0" w:line="240" w:lineRule="auto"/>
+        <w:ind w:left="397" w:hanging="397"/>
+        <w:jc w:val="left"/>
+      </w:pPr>
+      <w:r>
+        <w:rPr>
+          <w:rFonts w:cstheme="minorHAnsi"/>
+          <w:lang w:val="en-US"/>
+        </w:rPr>
+        <w:t xml:space="preserve">[36] K. Chaloner, I. Verdinelli, "Bayesian Experimental Design: A Review," Statistical Science, 1995.</w:t>
+      </w:r>
+    </w:p>
+    <w:p>
+      <w:pPr>
+        <w:spacing w:after="0" w:line="240" w:lineRule="auto"/>
+        <w:ind w:left="397" w:hanging="397"/>
+        <w:jc w:val="left"/>
+      </w:pPr>
+      <w:r>
+        <w:rPr>
+          <w:rFonts w:cstheme="minorHAnsi"/>
+          <w:lang w:val="en-US"/>
+        </w:rPr>
+        <w:t xml:space="preserve">[37] T. Rainforth et al., "Modern Bayesian Experimental Design," Statistical Science, 2024.</w:t>
+      </w:r>
+    </w:p>
+    <w:p>
+      <w:pPr>
+        <w:spacing w:after="0" w:line="240" w:lineRule="auto"/>
+        <w:ind w:left="397" w:hanging="397"/>
+        <w:jc w:val="left"/>
+      </w:pPr>
+      <w:r>
+        <w:rPr>
+          <w:rFonts w:cstheme="minorHAnsi"/>
+          <w:lang w:val="en-US"/>
+        </w:rPr>
+        <w:t xml:space="preserve">[38] S. Ben-David et al., "A theory of learning from different domains," Machine Learning, 2010.</w:t>
+      </w:r>
+    </w:p>
     <w:permEnd w:id="174659581"/>
     <w:p>
       <w:pPr>
@@ -5844,74 +5907,29 @@
           <w:b/>
           <w:lang w:val="en-US"/>
         </w:rPr>
-        <w:t xml:space="preserve">Goal.</w:t>
-      </w:r>
-      <w:r>
-        <w:rPr>
-          <w:rFonts w:cstheme="minorHAnsi"/>
-          <w:lang w:val="en-US"/>
-        </w:rPr>
-        <w:t xml:space="preserve"> To develop a method that </w:t>
-      </w:r>
-      <w:r>
-        <w:rPr>
-          <w:rFonts w:cstheme="minorHAnsi"/>
-          <w:b/>
-          <w:lang w:val="en-US"/>
-        </w:rPr>
-        <w:t xml:space="preserve">reduces the amount of real data</w:t>
-      </w:r>
-      <w:r>
-        <w:rPr>
-          <w:rFonts w:cstheme="minorHAnsi"/>
-          <w:lang w:val="en-US"/>
-        </w:rPr>
-        <w:t xml:space="preserve"> needed to teach a robot a task through the real-to-sim-to-real loop: real data → digital twin → training in the twin → transfer back to reality. The method has three reduction mechanisms, one per step of the loop: (1) </w:t>
-      </w:r>
-      <w:r>
-        <w:rPr>
-          <w:rFonts w:cstheme="minorHAnsi"/>
-          <w:b/>
-          <w:lang w:val="en-US"/>
-        </w:rPr>
-        <w:t xml:space="preserve">less capture</w:t>
-      </w:r>
-      <w:r>
-        <w:rPr>
-          <w:rFonts w:cstheme="minorHAnsi"/>
-          <w:lang w:val="en-US"/>
-        </w:rPr>
-        <w:t xml:space="preserve">, (2) </w:t>
-      </w:r>
-      <w:r>
-        <w:rPr>
-          <w:rFonts w:cstheme="minorHAnsi"/>
-          <w:b/>
-          <w:lang w:val="en-US"/>
-        </w:rPr>
-        <w:t xml:space="preserve">better use of simulation</w:t>
-      </w:r>
-      <w:r>
-        <w:rPr>
-          <w:rFonts w:cstheme="minorHAnsi"/>
-          <w:lang w:val="en-US"/>
-        </w:rPr>
-        <w:t xml:space="preserve">, (3) </w:t>
-      </w:r>
-      <w:r>
-        <w:rPr>
-          <w:rFonts w:cstheme="minorHAnsi"/>
-          <w:b/>
-          <w:lang w:val="en-US"/>
-        </w:rPr>
-        <w:t xml:space="preserve">fewer real trials</w:t>
-      </w:r>
-      <w:r>
-        <w:rPr>
-          <w:rFonts w:cstheme="minorHAnsi"/>
-          <w:lang w:val="en-US"/>
-        </w:rPr>
-        <w:t xml:space="preserve">. Indoor robot navigation is the main testbed, on which H1–H4 are decided; robotic manipulation is the generalization test of the same method, unchanged.</w:t>
+        <w:t xml:space="preserve">Scientific problem.</w:t>
+      </w:r>
+      <w:r>
+        <w:rPr>
+          <w:rFonts w:cstheme="minorHAnsi"/>
+          <w:lang w:val="en-US"/>
+        </w:rPr>
+        <w:t xml:space="preserve"> Learning with a digital twin is learning under distribution shift in which the learner can </w:t>
+      </w:r>
+      <w:r>
+        <w:rPr>
+          <w:rFonts w:cstheme="minorHAnsi"/>
+          <w:i/>
+          <w:lang w:val="en-US"/>
+        </w:rPr>
+        <w:t xml:space="preserve">buy</w:t>
+      </w:r>
+      <w:r>
+        <w:rPr>
+          <w:rFonts w:cstheme="minorHAnsi"/>
+          <w:lang w:val="en-US"/>
+        </w:rPr>
+        <w:t xml:space="preserve"> target-domain (real) data at a cost, at three points of the real-to-sim-to-real loop: to build the twin, to train in it and to correct the model in reality. How to allocate a scarce real-data budget across these points so that the loss of real-world performance is smallest is an open problem of sequential experimental design [36, 37] that has not been posed for the whole loop.</w:t>
       </w:r>
     </w:p>
     <w:p>
@@ -5925,14 +5943,29 @@
           <w:b/>
           <w:lang w:val="en-US"/>
         </w:rPr>
-        <w:t xml:space="preserve">Thesis.</w:t>
-      </w:r>
-      <w:r>
-        <w:rPr>
-          <w:rFonts w:cstheme="minorHAnsi"/>
-          <w:lang w:val="en-US"/>
-        </w:rPr>
-        <w:t xml:space="preserve"> Capturing only what the task needs and the twin lacks, training so that the twin's errors do not hurt, and running only the real trials that correct the twin and the model most makes the whole real-to-sim-to-real loop at least twice as economical in real data as the strongest existing real-to-sim-to-real approach.</w:t>
+        <w:t xml:space="preserve">Principle and theoretical claim.</w:t>
+      </w:r>
+      <w:r>
+        <w:rPr>
+          <w:rFonts w:cstheme="minorHAnsi"/>
+          <w:lang w:val="en-US"/>
+        </w:rPr>
+        <w:t xml:space="preserve"> The loop is formalised as sequential Bayesian experimental design in which each real datum (a view, an interaction, a trial) is valued by its </w:t>
+      </w:r>
+      <w:r>
+        <w:rPr>
+          <w:rFonts w:cstheme="minorHAnsi"/>
+          <w:b/>
+          <w:lang w:val="en-US"/>
+        </w:rPr>
+        <w:t xml:space="preserve">expected reduction of the twin-to-reality performance gap per unit cost</w:t>
+      </w:r>
+      <w:r>
+        <w:rPr>
+          <w:rFonts w:cstheme="minorHAnsi"/>
+          <w:lang w:val="en-US"/>
+        </w:rPr>
+        <w:t xml:space="preserve">. Following domain-adaptation theory [38], the real performance of a model trained in the twin is bounded by its twin performance plus a discrepancy term on the states the task visits; the dissertation derives a task-weighted, uncertainty-based estimate of this term and the conditions under which spending real data on it pays off. The three mechanisms of the method, (1) less capture, (2) better use of simulation, (3) fewer real trials, are instances of this one criterion.</w:t>
       </w:r>
     </w:p>
     <w:p>
@@ -5946,29 +5979,14 @@
           <w:b/>
           <w:lang w:val="en-US"/>
         </w:rPr>
-        <w:t xml:space="preserve">How the hypotheses are decided.</w:t>
-      </w:r>
-      <w:r>
-        <w:rPr>
-          <w:rFonts w:cstheme="minorHAnsi"/>
-          <w:lang w:val="en-US"/>
-        </w:rPr>
-        <w:t xml:space="preserve"> All real effort is counted in one unit, </w:t>
-      </w:r>
-      <w:r>
-        <w:rPr>
-          <w:rFonts w:cstheme="minorHAnsi"/>
-          <w:b/>
-          <w:lang w:val="en-US"/>
-        </w:rPr>
-        <w:t xml:space="preserve">operator minutes</w:t>
-      </w:r>
-      <w:r>
-        <w:rPr>
-          <w:rFonts w:cstheme="minorHAnsi"/>
-          <w:lang w:val="en-US"/>
-        </w:rPr>
-        <w:t xml:space="preserve"> (capture, demonstrations and on-robot trials with resets), and every approach is evaluated on the same budget grid. P is the task success rate in "reality"; the target P is defined as a fraction of the baseline's plateau. The hypotheses are decided on a non-circular proxy reality built from public scans of real buildings, in which "reality" and the twin come from separate captures; every baseline is pre-registered; a real robot validates the direction of the results and the validity of the proxy. Tests, bounds and counts are in §9.</w:t>
+        <w:t xml:space="preserve">Thesis.</w:t>
+      </w:r>
+      <w:r>
+        <w:rPr>
+          <w:rFonts w:cstheme="minorHAnsi"/>
+          <w:lang w:val="en-US"/>
+        </w:rPr>
+        <w:t xml:space="preserve"> Allocating real data by its expected gap reduction, rather than uniformly or by hand, makes the loop at least twice as economical in real data as the strongest existing real-to-sim-to-real approach.</w:t>
       </w:r>
     </w:p>
     <w:p>
@@ -5982,14 +6000,29 @@
           <w:b/>
           <w:lang w:val="en-US"/>
         </w:rPr>
-        <w:t xml:space="preserve">RQ1 (step 1: real data → twin).</w:t>
-      </w:r>
-      <w:r>
-        <w:rPr>
-          <w:rFonts w:cstheme="minorHAnsi"/>
-          <w:lang w:val="en-US"/>
-        </w:rPr>
-        <w:t xml:space="preserve"> Which real data is worth acquiring to build the twin?</w:t>
+        <w:t xml:space="preserve">How the hypotheses are decided.</w:t>
+      </w:r>
+      <w:r>
+        <w:rPr>
+          <w:rFonts w:cstheme="minorHAnsi"/>
+          <w:lang w:val="en-US"/>
+        </w:rPr>
+        <w:t xml:space="preserve"> Real effort is counted in </w:t>
+      </w:r>
+      <w:r>
+        <w:rPr>
+          <w:rFonts w:cstheme="minorHAnsi"/>
+          <w:b/>
+          <w:lang w:val="en-US"/>
+        </w:rPr>
+        <w:t xml:space="preserve">operator minutes</w:t>
+      </w:r>
+      <w:r>
+        <w:rPr>
+          <w:rFonts w:cstheme="minorHAnsi"/>
+          <w:lang w:val="en-US"/>
+        </w:rPr>
+        <w:t xml:space="preserve"> on one budget grid; P is the success rate in "reality" and the target P a fraction of the baseline's plateau. Decisions are made on a non-circular proxy reality from public scans of real buildings, with pre-registered baselines; a real robot validates the direction and the proxy. Navigation decides H1–H4; manipulation tests the same method, unchanged. Details are in §9.</w:t>
       </w:r>
     </w:p>
     <w:p>
@@ -6003,6 +6036,21 @@
           <w:b/>
           <w:lang w:val="en-US"/>
         </w:rPr>
+        <w:t xml:space="preserve">RQ1 (step 1).</w:t>
+      </w:r>
+      <w:r>
+        <w:rPr>
+          <w:rFonts w:cstheme="minorHAnsi"/>
+          <w:lang w:val="en-US"/>
+        </w:rPr>
+        <w:t xml:space="preserve"> Which real data is worth acquiring to build the twin? </w:t>
+      </w:r>
+      <w:r>
+        <w:rPr>
+          <w:rFonts w:cstheme="minorHAnsi"/>
+          <w:b/>
+          <w:lang w:val="en-US"/>
+        </w:rPr>
         <w:t xml:space="preserve">H1.</w:t>
       </w:r>
       <w:r>
@@ -6010,7 +6058,7 @@
           <w:rFonts w:cstheme="minorHAnsi"/>
           <w:lang w:val="en-US"/>
         </w:rPr>
-        <w:t xml:space="preserve"> Capture guided by what matters for the task and by where the twin is uncertain reaches the P of uniform capture with </w:t>
+        <w:t xml:space="preserve"> Capture chosen by the criterion reaches the P of uniform capture with </w:t>
       </w:r>
       <w:r>
         <w:rPr>
@@ -6039,14 +6087,14 @@
           <w:b/>
           <w:lang w:val="en-US"/>
         </w:rPr>
-        <w:t xml:space="preserve">RQ2 (step 2: learning in the twin).</w:t>
-      </w:r>
-      <w:r>
-        <w:rPr>
-          <w:rFonts w:cstheme="minorHAnsi"/>
-          <w:lang w:val="en-US"/>
-        </w:rPr>
-        <w:t xml:space="preserve"> How should the model be trained so that the twin's errors do not hurt? </w:t>
+        <w:t xml:space="preserve">RQ2 (step 2).</w:t>
+      </w:r>
+      <w:r>
+        <w:rPr>
+          <w:rFonts w:cstheme="minorHAnsi"/>
+          <w:lang w:val="en-US"/>
+        </w:rPr>
+        <w:t xml:space="preserve"> How should the model be trained so that the twin's errors do not transfer? </w:t>
       </w:r>
       <w:r>
         <w:rPr>
@@ -6061,22 +6109,22 @@
           <w:rFonts w:cstheme="minorHAnsi"/>
           <w:lang w:val="en-US"/>
         </w:rPr>
-        <w:t xml:space="preserve"> At the same real-data budget, training that follows the twin's uncertainty gives a P </w:t>
-      </w:r>
-      <w:r>
-        <w:rPr>
-          <w:rFonts w:cstheme="minorHAnsi"/>
-          <w:b/>
-          <w:lang w:val="en-US"/>
-        </w:rPr>
-        <w:t xml:space="preserve">at least 10 percentage points higher</w:t>
-      </w:r>
-      <w:r>
-        <w:rPr>
-          <w:rFonts w:cstheme="minorHAnsi"/>
-          <w:lang w:val="en-US"/>
-        </w:rPr>
-        <w:t xml:space="preserve"> than uniform domain randomization, in a pre-registered difficulty regime where the baseline succeeds in at most about 75% of episodes; filling the twin's gaps with a learned world model is an ablation of this step.</w:t>
+        <w:t xml:space="preserve"> At the same budget, training weighted by the twin's uncertainty gives a P </w:t>
+      </w:r>
+      <w:r>
+        <w:rPr>
+          <w:rFonts w:cstheme="minorHAnsi"/>
+          <w:b/>
+          <w:lang w:val="en-US"/>
+        </w:rPr>
+        <w:t xml:space="preserve">at least 10 pp higher</w:t>
+      </w:r>
+      <w:r>
+        <w:rPr>
+          <w:rFonts w:cstheme="minorHAnsi"/>
+          <w:lang w:val="en-US"/>
+        </w:rPr>
+        <w:t xml:space="preserve"> than uniform domain randomization, in a pre-registered regime where the baseline succeeds in ≤ ~75% of episodes; a learned world model filling the twin's gaps is an ablation.</w:t>
       </w:r>
     </w:p>
     <w:p>
@@ -6090,14 +6138,44 @@
           <w:b/>
           <w:lang w:val="en-US"/>
         </w:rPr>
-        <w:t xml:space="preserve">RQ3 (step 3: twin → reality).</w:t>
-      </w:r>
-      <w:r>
-        <w:rPr>
-          <w:rFonts w:cstheme="minorHAnsi"/>
-          <w:lang w:val="en-US"/>
-        </w:rPr>
-        <w:t xml:space="preserve"> Which few real trials correct the twin and the model best?</w:t>
+        <w:t xml:space="preserve">RQ3 (step 3).</w:t>
+      </w:r>
+      <w:r>
+        <w:rPr>
+          <w:rFonts w:cstheme="minorHAnsi"/>
+          <w:lang w:val="en-US"/>
+        </w:rPr>
+        <w:t xml:space="preserve"> Which few real trials correct the twin and the model best? </w:t>
+      </w:r>
+      <w:r>
+        <w:rPr>
+          <w:rFonts w:cstheme="minorHAnsi"/>
+          <w:b/>
+          <w:lang w:val="en-US"/>
+        </w:rPr>
+        <w:t xml:space="preserve">H3.</w:t>
+      </w:r>
+      <w:r>
+        <w:rPr>
+          <w:rFonts w:cstheme="minorHAnsi"/>
+          <w:lang w:val="en-US"/>
+        </w:rPr>
+        <w:t xml:space="preserve"> Trials chosen by the predicted gap reach the target P with </w:t>
+      </w:r>
+      <w:r>
+        <w:rPr>
+          <w:rFonts w:cstheme="minorHAnsi"/>
+          <w:b/>
+          <w:lang w:val="en-US"/>
+        </w:rPr>
+        <w:t xml:space="preserve">at least 50% fewer trials</w:t>
+      </w:r>
+      <w:r>
+        <w:rPr>
+          <w:rFonts w:cstheme="minorHAnsi"/>
+          <w:lang w:val="en-US"/>
+        </w:rPr>
+        <w:t xml:space="preserve"> than random ones, and fewer than a failure-driven rule, if the twin predicts reality well enough (minimum sim-vs-real correlation, §9).</w:t>
       </w:r>
     </w:p>
     <w:p>
@@ -6111,50 +6189,14 @@
           <w:b/>
           <w:lang w:val="en-US"/>
         </w:rPr>
-        <w:t xml:space="preserve">H3.</w:t>
-      </w:r>
-      <w:r>
-        <w:rPr>
-          <w:rFonts w:cstheme="minorHAnsi"/>
-          <w:lang w:val="en-US"/>
-        </w:rPr>
-        <w:t xml:space="preserve"> Real trials selected by the predicted twin-to-reality gap reach the target P with </w:t>
-      </w:r>
-      <w:r>
-        <w:rPr>
-          <w:rFonts w:cstheme="minorHAnsi"/>
-          <w:b/>
-          <w:lang w:val="en-US"/>
-        </w:rPr>
-        <w:t xml:space="preserve">at least 50% fewer trials</w:t>
-      </w:r>
-      <w:r>
-        <w:rPr>
-          <w:rFonts w:cstheme="minorHAnsi"/>
-          <w:lang w:val="en-US"/>
-        </w:rPr>
-        <w:t xml:space="preserve"> than randomly selected trials, and with fewer trials than a failure-driven rule, provided the twin predicts reality well enough (a minimum sim-vs-real correlation, §9).</w:t>
-      </w:r>
-    </w:p>
-    <w:p>
-      <w:pPr>
-        <w:spacing w:after="120" w:line="240" w:lineRule="auto"/>
-        <w:jc w:val="both"/>
-      </w:pPr>
-      <w:r>
-        <w:rPr>
-          <w:rFonts w:cstheme="minorHAnsi"/>
-          <w:b/>
-          <w:lang w:val="en-US"/>
-        </w:rPr>
-        <w:t xml:space="preserve">RQ4 (the whole loop).</w:t>
-      </w:r>
-      <w:r>
-        <w:rPr>
-          <w:rFonts w:cstheme="minorHAnsi"/>
-          <w:lang w:val="en-US"/>
-        </w:rPr>
-        <w:t xml:space="preserve"> How much real data does the method need compared with the strongest existing approach, and does it carry over to another task? </w:t>
+        <w:t xml:space="preserve">RQ4 (theory and the whole loop).</w:t>
+      </w:r>
+      <w:r>
+        <w:rPr>
+          <w:rFonts w:cstheme="minorHAnsi"/>
+          <w:lang w:val="en-US"/>
+        </w:rPr>
+        <w:t xml:space="preserve"> When and why can twin data replace real data? </w:t>
       </w:r>
       <w:r>
         <w:rPr>
@@ -6184,7 +6226,7 @@
           <w:rFonts w:cstheme="minorHAnsi"/>
           <w:lang w:val="en-US"/>
         </w:rPr>
-        <w:t xml:space="preserve"> than the strongest existing real-to-sim-to-real approach, assembled and pre-registered with the same budget; learning from real data only is reported for reference. In manipulation, with the method unchanged, the effects of H1–H4 keep their sign.</w:t>
+        <w:t xml:space="preserve"> than the strongest existing approach (assembled, pre-registered, same budget), and the savings follow the conditions predicted by the theory: they grow with the twin-to-reality correlation and with how concentrated the gap is. In manipulation the effects keep their sign.</w:t>
       </w:r>
     </w:p>
     <w:p>
@@ -6536,14 +6578,14 @@
           <w:b/>
           <w:lang w:val="en-US"/>
         </w:rPr>
-        <w:t xml:space="preserve">Key original contribution: a method that reduces real data.</w:t>
-      </w:r>
-      <w:r>
-        <w:rPr>
-          <w:rFonts w:cstheme="minorHAnsi"/>
-          <w:lang w:val="en-US"/>
-        </w:rPr>
-        <w:t xml:space="preserve"> To our knowledge, the first method for real-to-sim-to-real robot learning that reduces the real data of the whole loop by acting at every one of its steps, with the first measurement, in one unit and on one budget grid, of how much real data such a loop needs. Its claim: a given real-world performance with at least two times less real data than the strongest existing real-to-sim-to-real approach (RQ4, H4). Building twins, training in simulation and using world models or foundation models are not new; reducing the real data they need is. The three reduction mechanisms are parts of this one method, each tested at its own step:</w:t>
+        <w:t xml:space="preserve">Key original contribution: a scientific answer to how real data should be spent.</w:t>
+      </w:r>
+      <w:r>
+        <w:rPr>
+          <w:rFonts w:cstheme="minorHAnsi"/>
+          <w:lang w:val="en-US"/>
+        </w:rPr>
+        <w:t xml:space="preserve"> (i) A formulation of the real-to-sim-to-real loop as sequential experimental design over a real-data budget, with one criterion (expected reduction of the twin-to-reality performance gap per unit cost) and a domain-adaptation-style bound [38] that states when twin data can replace real data; (ii) a method that instantiates this criterion at every step of the loop and reaches a given real-world performance with at least two times less real data than the strongest existing approach (RQ4, H4); (iii) empirical knowledge of when and why the savings arise. What is new is not the twin but the principled spending of real data. The three mechanisms are instances of the criterion, each tested at its own step:</w:t>
       </w:r>
     </w:p>
     <w:p>
@@ -6665,14 +6707,14 @@
           <w:b/>
           <w:lang w:val="en-US"/>
         </w:rPr>
-        <w:t xml:space="preserve">How the method is evaluated and released</w:t>
-      </w:r>
-      <w:r>
-        <w:rPr>
-          <w:rFonts w:cstheme="minorHAnsi"/>
-          <w:lang w:val="en-US"/>
-        </w:rPr>
-        <w:t xml:space="preserve"> (supporting the method, not contributions in their own right). Curves of success against operator minutes on a shared budget grid, against pre-registered baselines and learning from real data only; a proxy-reality protocol on public scans of real buildings that counts real data exactly without a robot (a separate, higher-fidelity reference with hidden physical parameters plays "reality"), validated against a real robot; and open code, configurations, scene lists, seeds and pre-registrations, built on existing tools.</w:t>
+        <w:t xml:space="preserve">How it is evaluated and released</w:t>
+      </w:r>
+      <w:r>
+        <w:rPr>
+          <w:rFonts w:cstheme="minorHAnsi"/>
+          <w:lang w:val="en-US"/>
+        </w:rPr>
+        <w:t xml:space="preserve"> (supporting, not contributions in their own right). Curves of success against operator minutes on a shared budget grid, against pre-registered baselines and learning from real data only; a proxy-reality protocol on public scans of real buildings that counts real data exactly without a robot (a separate, higher-fidelity reference with hidden physical parameters plays "reality"), validated against a real robot; and open code, configurations, scene lists, seeds and pre-registrations, built on existing tools.</w:t>
       </w:r>
     </w:p>
     <w:p>
@@ -7022,6 +7064,27 @@
           <w:b/>
           <w:lang w:val="en-US"/>
         </w:rPr>
+        <w:t xml:space="preserve">Theoretical part (RQ4; sem. 3–5, then refined).</w:t>
+      </w:r>
+      <w:r>
+        <w:rPr>
+          <w:rFonts w:cstheme="minorHAnsi"/>
+          <w:lang w:val="en-US"/>
+        </w:rPr>
+        <w:t xml:space="preserve"> The loop is written as sequential Bayesian experimental design [36, 37]: a posterior over the twin (geometry, appearance, physical parameters) and over the model's twin-to-reality gap, updated by each real datum. A task-weighted discrepancy bound in the spirit of [38] links the twin's uncertainty on the states the task visits to the loss of real performance; the acquisition criterion (expected gap reduction per operator minute) follows from it and is used at all three steps. The predictions of the analysis, when each mechanism saves data and how much, are tested against the measured budget curves (H4).</w:t>
+      </w:r>
+    </w:p>
+    <w:p>
+      <w:pPr>
+        <w:spacing w:after="120" w:line="240" w:lineRule="auto"/>
+        <w:jc w:val="both"/>
+      </w:pPr>
+      <w:r>
+        <w:rPr>
+          <w:rFonts w:cstheme="minorHAnsi"/>
+          <w:b/>
+          <w:lang w:val="en-US"/>
+        </w:rPr>
         <w:t xml:space="preserve">Real data: one unit, one grid.</w:t>
       </w:r>
       <w:r>
@@ -7108,7 +7171,7 @@
           <w:rFonts w:cstheme="minorHAnsi"/>
           <w:lang w:val="en-US"/>
         </w:rPr>
-        <w:t xml:space="preserve"> the twin's appearance and geometry come from 3DGS [11], run as a mesh in the simulator (as in [12]); its physical part is identified from a few trajectories as a posterior [19]. The next views are chosen where the twin's uncertainty (Fisher information [23] or an uncertainty field [24] adapted to 3DGS) is highest in the regions that matter for the task, e.g. along planner paths between likely goals; one task-weighted information criterion covers both views and physical parameters. Candidates come from the recorded capture, timed as a walking tour.</w:t>
+        <w:t xml:space="preserve"> the twin's appearance and geometry come from 3DGS [11], run as a mesh in the simulator (as in [12]); its physical part is identified from a few trajectories as a posterior [19]. The next views are chosen where the twin's uncertainty (Fisher information [23] or an uncertainty field [24] adapted to 3DGS) is highest in the regions that matter for the task, e.g. along planner paths between likely goals; one criterion covers views and physical parameters.</w:t>
       </w:r>
     </w:p>
     <w:p>
@@ -7267,7 +7330,7 @@
           <w:rFonts w:cstheme="minorHAnsi"/>
           <w:lang w:val="en-US"/>
         </w:rPr>
-        <w:t xml:space="preserve"> mean paired gain in P over uniform randomization ≥ 10 pp on held-out scenes, lower 95% bound &gt; 0, at each of ≥ 2 budgets, in a pre-registered difficulty regime where the baseline reaches at most ~75% success, with the 150–300 episodes per arm needed to detect 10 pp.</w:t>
+        <w:t xml:space="preserve"> paired gain ≥ 10 pp on held-out scenes, lower 95% bound &gt; 0, at ≥ 2 budgets, in the pre-registered regime (baseline ≤ ~75% success), 150–300 episodes per arm.</w:t>
       </w:r>
     </w:p>
     <w:p>
@@ -7368,7 +7431,7 @@
           <w:rFonts w:cstheme="minorHAnsi"/>
           <w:lang w:val="en-US"/>
         </w:rPr>
-        <w:t xml:space="preserve"> the target P with ≥ 50% fewer trials than random selection (upper 95% bound of the ratio below 1), several runs per arm; against the failure-driven rule only the upper bound below 1 is claimed. Published selection rules save 20–40% of trials [33]; 50% is expected only where the gap concentrates in few configurations, hence the sim-vs-real precondition above.</w:t>
+        <w:t xml:space="preserve"> the target P with ≥ 50% fewer trials than random selection (upper 95% bound of the ratio below 1), several runs per arm; against the failure-driven rule only the upper bound below 1 is claimed. Published rules save 20–40% [33]; 50% is expected only where the gap is concentrated.</w:t>
       </w:r>
     </w:p>
     <w:p>
@@ -7461,7 +7524,7 @@
           <w:rFonts w:cstheme="minorHAnsi"/>
           <w:lang w:val="en-US"/>
         </w:rPr>
-        <w:t xml:space="preserve"> Two campaigns (sem. 5 and 7) in 2 rooms at PWr with a small mobile robot (a TurtleBot 4 Lite from an SzD Minigrant, or a robot of the K29 laboratory), ~8 robot-hours each: own captures, uniform capture versus the method, and the proxy-vs-robot sim-vs-real correlation (the proxy's validity); the robot checks the direction of the results, never the thresholds.</w:t>
+        <w:t xml:space="preserve"> Two campaigns (sem. 5, 7) in 2 PWr rooms with a small mobile robot (TurtleBot 4 Lite from an SzD Minigrant, or K29), ~8 robot-hours each; they check direction and the proxy's validity.</w:t>
       </w:r>
     </w:p>
     <w:p>
@@ -7482,7 +7545,7 @@
           <w:rFonts w:cstheme="minorHAnsi"/>
           <w:lang w:val="en-US"/>
         </w:rPr>
-        <w:t xml:space="preserve"> Tests are one-sided at α = 0.05 with a scene-level bootstrap and Holm correction; each stage is pre-registered (baselines, thresholds, difficulty regime, correlation threshold). Training runs on WCSS and PLGrid GPUs (grant in sem. 3); costs are measured in the pilot. Released: code, configurations, scene lists, seeds, pre-registrations and the MuSHRoom-based twins; no assets derived from ScanNet++.</w:t>
+        <w:t xml:space="preserve"> One-sided tests, α = 0.05, scene-level bootstrap, Holm correction; every stage pre-registered. WCSS and PLGrid GPUs. Released: code, configurations, scene lists, seeds and MuSHRoom-based twins; nothing derived from ScanNet++.</w:t>
       </w:r>
     </w:p>
     <w:permEnd w:id="32011344"/>
@@ -7764,7 +7827,7 @@
           <w:rFonts w:cstheme="minorHAnsi"/>
           <w:lang w:val="pl-PL"/>
         </w:rPr>
-        <w:t xml:space="preserve">Celem rozprawy jest opracowanie metody, która zmniejsza ilość prawdziwych danych potrzebnych na tej drodze. Metoda działa na każdym z trzech kroków. W pierwszym, zamiast nagrywać wszystko po równo, nagrywamy przede wszystkim te miejsca, które są ważne dla zadania, a o których kopia wie jeszcze za mało. W drugim, ponieważ kopia nigdy nie jest idealna, uczymy model tak, aby nie polegał na jej niepewnych fragmentach, a luki w kopii wypełnia program, który uczy się przewidywać, co wydarzy się dalej. W trzecim wybieramy tylko te nieliczne próby w rzeczywistości, które najwięcej mówią o tym, gdzie kopia i model jeszcze się mylą, i wykorzystujemy je do poprawienia obu. Metoda jest opracowywana i sprawdzana na nawigacji robotów mobilnych w budynkach, a następnie, bez zmian, na robotach, które przenoszą przedmioty. Badania są prowadzone przede wszystkim na publicznie dostępnych skanach prawdziwych budynków, a wyniki są potwierdzane na prawdziwym robocie.</w:t>
+        <w:t xml:space="preserve">Celem rozprawy jest opracowanie metody, która zmniejsza ilość prawdziwych danych potrzebnych na tej drodze. U jej podstaw leży jedno pytanie naukowe: ile wiedzy o rzeczywistości wnosi każda porcja prawdziwych danych w stosunku do jej kosztu, i kiedy kopia może je zastąpić. Metoda działa na każdym z trzech kroków. W pierwszym, zamiast nagrywać wszystko po równo, nagrywamy przede wszystkim te miejsca, które są ważne dla zadania, a o których kopia wie jeszcze za mało. W drugim, ponieważ kopia nigdy nie jest idealna, uczymy model tak, aby nie polegał na jej niepewnych fragmentach, a luki w kopii wypełnia program, który uczy się przewidywać, co wydarzy się dalej. W trzecim wybieramy tylko te nieliczne próby w rzeczywistości, które najwięcej mówią o tym, gdzie kopia i model jeszcze się mylą, i wykorzystujemy je do poprawienia obu. Metoda jest opracowywana i sprawdzana na nawigacji robotów mobilnych w budynkach, a następnie, bez zmian, na robotach, które przenoszą przedmioty. Badania są prowadzone przede wszystkim na publicznie dostępnych skanach prawdziwych budynków, a wyniki są potwierdzane na prawdziwym robocie.</w:t>
       </w:r>
     </w:p>
     <w:p>
@@ -7845,7 +7908,7 @@
           <w:rFonts w:cstheme="minorHAnsi"/>
           <w:lang w:val="en-US"/>
         </w:rPr>
-        <w:t xml:space="preserve">The goal of this dissertation is to develop a method that reduces the amount of real data this path needs. The method acts at each of the three steps. In the first, instead of recording everything evenly, we record mainly the places that matter for the task and about which the copy still knows too little. In the second, because the copy is never perfect, we train the model so that it does not rely on the copy's uncertain parts, and a program that learns to predict what happens next fills the gaps in the copy. In the third, we choose only the few trials in reality that tell the most about where the copy and the model are still wrong, and use them to correct both. The method is developed and tested on the navigation of mobile robots in buildings, and then, unchanged, on robots that handle objects. The research is carried out mainly on publicly available scans of real buildings, and the results are confirmed on a real robot.</w:t>
+        <w:t xml:space="preserve">The goal of this dissertation is to develop a method that reduces the amount of real data this path needs. At its core lies one scientific question: how much each piece of real data tells us about reality relative to its cost, and when the copy can replace it. The method acts at each of the three steps. In the first, instead of recording everything evenly, we record mainly the places that matter for the task and about which the copy still knows too little. In the second, because the copy is never perfect, we train the model so that it does not rely on the copy's uncertain parts, and a program that learns to predict what happens next fills the gaps in the copy. In the third, we choose only the few trials in reality that tell the most about where the copy and the model are still wrong, and use them to correct both. The method is developed and tested on the navigation of mobile robots in buildings, and then, unchanged, on robots that handle objects. The research is carried out mainly on publicly available scans of real buildings, and the results are confirmed on a real robot.</w:t>
       </w:r>
     </w:p>
     <w:p>

</xml_diff>

<commit_message>
v8: rewrite IPB in the style of an accepted K46 IPB - generalization of DL models in real-to-sim-to-real for physical AI; simple RQs, narrative sections
Co-Authored-By: Claude Opus 5.5 <noreply@anthropic.com>
</commit_message>
<xml_diff>
--- a/output/IPB_Grzegorz_Piotrowski.docx
+++ b/output/IPB_Grzegorz_Piotrowski.docx
@@ -1081,47 +1081,18 @@
     </w:p>
     <w:p>
       <w:pPr>
-        <w:spacing w:after="120" w:line="240" w:lineRule="auto"/>
+        <w:spacing w:after="0" w:line="240" w:lineRule="auto"/>
         <w:jc w:val="both"/>
       </w:pPr>
       <w:permStart w:id="1964588398" w:edGrp="everyone"/>
       <w:r>
         <w:rPr>
           <w:rFonts w:cstheme="minorHAnsi"/>
-          <w:b/>
-          <w:lang w:val="en-US"/>
-        </w:rPr>
-        <w:t xml:space="preserve">PL:</w:t>
-      </w:r>
-      <w:r>
-        <w:rPr>
-          <w:rFonts w:cstheme="minorHAnsi"/>
-          <w:lang w:val="en-US"/>
-        </w:rPr>
-        <w:t xml:space="preserve"> Wartość informacyjna danych rzeczywistych w uczeniu robotów w pętli rzeczywistość–symulacja– rzeczywistość: metoda ograniczania ich ilości z zastosowaniem w nawigacji i manipulacji</w:t>
+          <w:lang w:val="en-US"/>
+        </w:rPr>
+        <w:t xml:space="preserve">Improving generalization of deep learning models in real-to-sim-to-real transfer for physical AI.</w:t>
       </w:r>
       <w:bookmarkStart w:id="0" w:name="_Hlk95566638"/>
-    </w:p>
-    <w:p>
-      <w:pPr>
-        <w:spacing w:after="0" w:line="240" w:lineRule="auto"/>
-        <w:jc w:val="both"/>
-      </w:pPr>
-      <w:r>
-        <w:rPr>
-          <w:rFonts w:cstheme="minorHAnsi"/>
-          <w:b/>
-          <w:lang w:val="en-US"/>
-        </w:rPr>
-        <w:t xml:space="preserve">EN:</w:t>
-      </w:r>
-      <w:r>
-        <w:rPr>
-          <w:rFonts w:cstheme="minorHAnsi"/>
-          <w:lang w:val="en-US"/>
-        </w:rPr>
-        <w:t xml:space="preserve"> The value of real data in real-to-sim-to-real robot learning: a method for reducing its amount, with applications to navigation and manipulation</w:t>
-      </w:r>
     </w:p>
     <w:bookmarkEnd w:id="0"/>
     <w:permEnd w:id="1964588398"/>
@@ -1823,25 +1794,9 @@
             <w:r>
               <w:rPr>
                 <w:rFonts w:cstheme="minorHAnsi"/>
-                <w:i/>
                 <w:lang w:val="en-US"/>
               </w:rPr>
-              <w:t xml:space="preserve">(Oct 2025 – Feb 2026)</w:t>
-            </w:r>
-            <w:r>
-              <w:rPr>
-                <w:rFonts w:cstheme="minorHAnsi"/>
-                <w:lang w:val="en-US"/>
-              </w:rPr>
-              <w:t xml:space="preserve"> </w:t>
-            </w:r>
-            <w:r>
-              <w:rPr>
-                <w:rFonts w:cstheme="minorHAnsi"/>
-                <w:b/>
-                <w:lang w:val="en-US"/>
-              </w:rPr>
-              <w:t xml:space="preserve">Research target: define the problem and map the state of the art.</w:t>
+              <w:t xml:space="preserve">1. Literature review in the scope of sim-to-real transfer, domain randomization and domain adaptation, neural scene reconstruction (NeRF, 3D Gaussian Splatting) and learning-based robot navigation and manipulation.</w:t>
             </w:r>
           </w:p>
           <w:p>
@@ -1852,32 +1807,9 @@
             <w:r>
               <w:rPr>
                 <w:rFonts w:cstheme="minorHAnsi"/>
-                <w:b/>
                 <w:lang w:val="en-US"/>
               </w:rPr>
-              <w:t xml:space="preserve">T1.1</w:t>
-            </w:r>
-            <w:r>
-              <w:rPr>
-                <w:rFonts w:cstheme="minorHAnsi"/>
-                <w:lang w:val="en-US"/>
-              </w:rPr>
-              <w:t xml:space="preserve"> Systematic literature review in four areas: (a) sim-to-real transfer and domain randomization, (b) learning under distribution shift and domain adaptation, (c) neural scene reconstruction (NeRF, 3D Gaussian Splatting), (d) learning-based visual navigation. </w:t>
-            </w:r>
-            <w:r>
-              <w:rPr>
-                <w:rFonts w:cstheme="minorHAnsi"/>
-                <w:i/>
-                <w:lang w:val="en-US"/>
-              </w:rPr>
-              <w:t xml:space="preserve">D:</w:t>
-            </w:r>
-            <w:r>
-              <w:rPr>
-                <w:rFonts w:cstheme="minorHAnsi"/>
-                <w:lang w:val="en-US"/>
-              </w:rPr>
-              <w:t xml:space="preserve"> annotated bibliography and a written research-gap statement (basis of §6).</w:t>
+              <w:t xml:space="preserve">2. Identification of the most important research gaps in the generalization of models trained in simulation and in digital twins.</w:t>
             </w:r>
           </w:p>
           <w:p>
@@ -1888,32 +1820,9 @@
             <w:r>
               <w:rPr>
                 <w:rFonts w:cstheme="minorHAnsi"/>
-                <w:b/>
                 <w:lang w:val="en-US"/>
               </w:rPr>
-              <w:t xml:space="preserve">T1.2</w:t>
-            </w:r>
-            <w:r>
-              <w:rPr>
-                <w:rFonts w:cstheme="minorHAnsi"/>
-                <w:lang w:val="en-US"/>
-              </w:rPr>
-              <w:t xml:space="preserve"> Identification of the open problem: how much real data sim-to-real transfer needs, and whether reconstructed scenes can replace real data. </w:t>
-            </w:r>
-            <w:r>
-              <w:rPr>
-                <w:rFonts w:cstheme="minorHAnsi"/>
-                <w:i/>
-                <w:lang w:val="en-US"/>
-              </w:rPr>
-              <w:t xml:space="preserve">D:</w:t>
-            </w:r>
-            <w:r>
-              <w:rPr>
-                <w:rFonts w:cstheme="minorHAnsi"/>
-                <w:lang w:val="en-US"/>
-              </w:rPr>
-              <w:t xml:space="preserve"> problem statement and preliminary research questions, discussed with the supervisor.</w:t>
+              <w:t xml:space="preserve">3. Extending theoretical knowledge, including machine learning theory and learning under distribution shift, necessary for further work on the PhD thesis.</w:t>
             </w:r>
           </w:p>
           <w:p>
@@ -1924,32 +1833,9 @@
             <w:r>
               <w:rPr>
                 <w:rFonts w:cstheme="minorHAnsi"/>
-                <w:b/>
                 <w:lang w:val="en-US"/>
               </w:rPr>
-              <w:t xml:space="preserve">T1.3</w:t>
-            </w:r>
-            <w:r>
-              <w:rPr>
-                <w:rFonts w:cstheme="minorHAnsi"/>
-                <w:lang w:val="en-US"/>
-              </w:rPr>
-              <w:t xml:space="preserve"> Doctoral School courses of semester 1. </w:t>
-            </w:r>
-            <w:r>
-              <w:rPr>
-                <w:rFonts w:cstheme="minorHAnsi"/>
-                <w:i/>
-                <w:lang w:val="en-US"/>
-              </w:rPr>
-              <w:t xml:space="preserve">D:</w:t>
-            </w:r>
-            <w:r>
-              <w:rPr>
-                <w:rFonts w:cstheme="minorHAnsi"/>
-                <w:lang w:val="en-US"/>
-              </w:rPr>
-              <w:t xml:space="preserve"> completed courses. Place: K46.</w:t>
+              <w:t xml:space="preserve">4. Participation in the Doctoral School courses.</w:t>
             </w:r>
             <w:permEnd w:id="717358524"/>
           </w:p>
@@ -2008,25 +1894,9 @@
             <w:r>
               <w:rPr>
                 <w:rFonts w:cstheme="minorHAnsi"/>
-                <w:i/>
                 <w:lang w:val="en-US"/>
               </w:rPr>
-              <w:t xml:space="preserve">(Mar – Sep 2026)</w:t>
-            </w:r>
-            <w:r>
-              <w:rPr>
-                <w:rFonts w:cstheme="minorHAnsi"/>
-                <w:lang w:val="en-US"/>
-              </w:rPr>
-              <w:t xml:space="preserve"> </w:t>
-            </w:r>
-            <w:r>
-              <w:rPr>
-                <w:rFonts w:cstheme="minorHAnsi"/>
-                <w:b/>
-                <w:lang w:val="en-US"/>
-              </w:rPr>
-              <w:t xml:space="preserve">Research target: formulate the research plan and select the experimental basis.</w:t>
+              <w:t xml:space="preserve">1. Continuation of the literature review – participation in the internal reading group, discussing novel methods in sim-to-real transfer and embodied AI.</w:t>
             </w:r>
           </w:p>
           <w:p>
@@ -2037,32 +1907,9 @@
             <w:r>
               <w:rPr>
                 <w:rFonts w:cstheme="minorHAnsi"/>
-                <w:b/>
                 <w:lang w:val="en-US"/>
               </w:rPr>
-              <w:t xml:space="preserve">T2.1</w:t>
-            </w:r>
-            <w:r>
-              <w:rPr>
-                <w:rFonts w:cstheme="minorHAnsi"/>
-                <w:lang w:val="en-US"/>
-              </w:rPr>
-              <w:t xml:space="preserve"> Formulation of the data-efficient real-to-sim-to-real thesis, research questions RQ1–RQ4 (capture less, learn robustly in an imperfect twin, few real data, budget of the whole loop) and hypotheses H1–H4 with measurable decision rules and a proxy-reality evaluation protocol. </w:t>
-            </w:r>
-            <w:r>
-              <w:rPr>
-                <w:rFonts w:cstheme="minorHAnsi"/>
-                <w:i/>
-                <w:lang w:val="en-US"/>
-              </w:rPr>
-              <w:t xml:space="preserve">D:</w:t>
-            </w:r>
-            <w:r>
-              <w:rPr>
-                <w:rFonts w:cstheme="minorHAnsi"/>
-                <w:lang w:val="en-US"/>
-              </w:rPr>
-              <w:t xml:space="preserve"> §7 and §9 of this IPB.</w:t>
+              <w:t xml:space="preserve">2. Initial experiments with building digital twins from real captures and training navigation models in them.</w:t>
             </w:r>
           </w:p>
           <w:p>
@@ -2073,32 +1920,9 @@
             <w:r>
               <w:rPr>
                 <w:rFonts w:cstheme="minorHAnsi"/>
-                <w:b/>
                 <w:lang w:val="en-US"/>
               </w:rPr>
-              <w:t xml:space="preserve">T2.2</w:t>
-            </w:r>
-            <w:r>
-              <w:rPr>
-                <w:rFonts w:cstheme="minorHAnsi"/>
-                <w:lang w:val="en-US"/>
-              </w:rPr>
-              <w:t xml:space="preserve"> Comparative survey of public benchmarks and datasets (e.g. ScanNet++, HM3D), simulators (e.g. Habitat-Sim) and 3D Gaussian Splatting implementations against the needs of RQ1–RQ4 (real video + reference scan, licence, compute cost). </w:t>
-            </w:r>
-            <w:r>
-              <w:rPr>
-                <w:rFonts w:cstheme="minorHAnsi"/>
-                <w:i/>
-                <w:lang w:val="en-US"/>
-              </w:rPr>
-              <w:t xml:space="preserve">D:</w:t>
-            </w:r>
-            <w:r>
-              <w:rPr>
-                <w:rFonts w:cstheme="minorHAnsi"/>
-                <w:lang w:val="en-US"/>
-              </w:rPr>
-              <w:t xml:space="preserve"> tool-selection note with a shortlist for Stage I.</w:t>
+              <w:t xml:space="preserve">3. Specifying the Individual Research Plan.</w:t>
             </w:r>
           </w:p>
           <w:p>
@@ -2109,47 +1933,9 @@
             <w:r>
               <w:rPr>
                 <w:rFonts w:cstheme="minorHAnsi"/>
-                <w:b/>
                 <w:lang w:val="en-US"/>
               </w:rPr>
-              <w:t xml:space="preserve">T2.3</w:t>
-            </w:r>
-            <w:r>
-              <w:rPr>
-                <w:rFonts w:cstheme="minorHAnsi"/>
-                <w:lang w:val="en-US"/>
-              </w:rPr>
-              <w:t xml:space="preserve"> Individual Research Plan agreed with the supervisor. </w:t>
-            </w:r>
-            <w:r>
-              <w:rPr>
-                <w:rFonts w:cstheme="minorHAnsi"/>
-                <w:i/>
-                <w:lang w:val="en-US"/>
-              </w:rPr>
-              <w:t xml:space="preserve">D:</w:t>
-            </w:r>
-            <w:r>
-              <w:rPr>
-                <w:rFonts w:cstheme="minorHAnsi"/>
-                <w:lang w:val="en-US"/>
-              </w:rPr>
-              <w:t xml:space="preserve"> this IPB, signed and submitted by </w:t>
-            </w:r>
-            <w:r>
-              <w:rPr>
-                <w:rFonts w:cstheme="minorHAnsi"/>
-                <w:b/>
-                <w:lang w:val="en-US"/>
-              </w:rPr>
-              <w:t xml:space="preserve">30.09.2026</w:t>
-            </w:r>
-            <w:r>
-              <w:rPr>
-                <w:rFonts w:cstheme="minorHAnsi"/>
-                <w:lang w:val="en-US"/>
-              </w:rPr>
-              <w:t xml:space="preserve">. Place: K46.</w:t>
+              <w:t xml:space="preserve">4. Participation in a machine learning summer school or conference with a poster.</w:t>
             </w:r>
             <w:permEnd w:id="1791499248"/>
           </w:p>
@@ -2208,25 +1994,9 @@
             <w:r>
               <w:rPr>
                 <w:rFonts w:cstheme="minorHAnsi"/>
-                <w:i/>
                 <w:lang w:val="en-US"/>
               </w:rPr>
-              <w:t xml:space="preserve">(Oct 2026 – Feb 2027)</w:t>
-            </w:r>
-            <w:r>
-              <w:rPr>
-                <w:rFonts w:cstheme="minorHAnsi"/>
-                <w:lang w:val="en-US"/>
-              </w:rPr>
-              <w:t xml:space="preserve"> </w:t>
-            </w:r>
-            <w:r>
-              <w:rPr>
-                <w:rFonts w:cstheme="minorHAnsi"/>
-                <w:b/>
-                <w:lang w:val="en-US"/>
-              </w:rPr>
-              <w:t xml:space="preserve">Mechanism 1 – less capture (RQ1, H1).</w:t>
+              <w:t xml:space="preserve">1. Continuation of the literature review – participation in the internal reading group.</w:t>
             </w:r>
           </w:p>
           <w:p>
@@ -2237,47 +2007,9 @@
             <w:r>
               <w:rPr>
                 <w:rFonts w:cstheme="minorHAnsi"/>
-                <w:b/>
                 <w:lang w:val="en-US"/>
               </w:rPr>
-              <w:t xml:space="preserve">T3.1</w:t>
-            </w:r>
-            <w:r>
-              <w:rPr>
-                <w:rFonts w:cstheme="minorHAnsi"/>
-                <w:lang w:val="en-US"/>
-              </w:rPr>
-              <w:t xml:space="preserve"> Proxy-reality set-up (§9): application for the ScanNet++ licence (signed by the supervisor) and for a PLGrid computing grant in Oct 2026; ≥ 20 ScanNet++ scenes (10 held out) and the MuSHRoom rooms, with laser-scan or mesh references and separate phone captures; twins on the budget grid with the open simulator, 3DGS and structure-from-motion tools; hidden physical parameters of "reality"; navigation tasks, learner and pretrained models running on the twins; pilot fixing the difficulty regime, the operator-minute cost model, the sim-vs-real correlation between twin and "reality" and the GPU cost; pre-registration of the mechanism 1 baselines. </w:t>
-            </w:r>
-            <w:r>
-              <w:rPr>
-                <w:rFonts w:cstheme="minorHAnsi"/>
-                <w:i/>
-                <w:lang w:val="en-US"/>
-              </w:rPr>
-              <w:t xml:space="preserve">D:</w:t>
-            </w:r>
-            <w:r>
-              <w:rPr>
-                <w:rFonts w:cstheme="minorHAnsi"/>
-                <w:lang w:val="en-US"/>
-              </w:rPr>
-              <w:t xml:space="preserve"> working pipeline and pre-registered protocol in the repository, </w:t>
-            </w:r>
-            <w:r>
-              <w:rPr>
-                <w:rFonts w:cstheme="minorHAnsi"/>
-                <w:b/>
-                <w:lang w:val="en-US"/>
-              </w:rPr>
-              <w:t xml:space="preserve">by Jan 2027</w:t>
-            </w:r>
-            <w:r>
-              <w:rPr>
-                <w:rFonts w:cstheme="minorHAnsi"/>
-                <w:lang w:val="en-US"/>
-              </w:rPr>
-              <w:t xml:space="preserve">. Place: K46, WCSS.</w:t>
+              <w:t xml:space="preserve">2. Conducting research on which properties of digital twins built from real data determine the generalization of models trained in them.</w:t>
             </w:r>
           </w:p>
           <w:p>
@@ -2288,47 +2020,9 @@
             <w:r>
               <w:rPr>
                 <w:rFonts w:cstheme="minorHAnsi"/>
-                <w:b/>
                 <w:lang w:val="en-US"/>
               </w:rPr>
-              <w:t xml:space="preserve">T3.2</w:t>
-            </w:r>
-            <w:r>
-              <w:rPr>
-                <w:rFonts w:cstheme="minorHAnsi"/>
-                <w:lang w:val="en-US"/>
-              </w:rPr>
-              <w:t xml:space="preserve"> Validation stand: SzD Minigrant application for a small mobile robot, or a written agreement on robot access with the K29 Denali laboratory. </w:t>
-            </w:r>
-            <w:r>
-              <w:rPr>
-                <w:rFonts w:cstheme="minorHAnsi"/>
-                <w:i/>
-                <w:lang w:val="en-US"/>
-              </w:rPr>
-              <w:t xml:space="preserve">D:</w:t>
-            </w:r>
-            <w:r>
-              <w:rPr>
-                <w:rFonts w:cstheme="minorHAnsi"/>
-                <w:lang w:val="en-US"/>
-              </w:rPr>
-              <w:t xml:space="preserve"> application or agreement, </w:t>
-            </w:r>
-            <w:r>
-              <w:rPr>
-                <w:rFonts w:cstheme="minorHAnsi"/>
-                <w:b/>
-                <w:lang w:val="en-US"/>
-              </w:rPr>
-              <w:t xml:space="preserve">by Nov 2026</w:t>
-            </w:r>
-            <w:r>
-              <w:rPr>
-                <w:rFonts w:cstheme="minorHAnsi"/>
-                <w:lang w:val="en-US"/>
-              </w:rPr>
-              <w:t xml:space="preserve">.</w:t>
+              <w:t xml:space="preserve">3. Preparation of the experimental environment (public datasets of real scenes, simulator, reconstruction tools) and applications for computing resources (PLGrid) and a small research grant (SzD Minigrant).</w:t>
             </w:r>
           </w:p>
           <w:p>
@@ -2339,47 +2033,9 @@
             <w:r>
               <w:rPr>
                 <w:rFonts w:cstheme="minorHAnsi"/>
-                <w:b/>
                 <w:lang w:val="en-US"/>
               </w:rPr>
-              <w:t xml:space="preserve">T3.3</w:t>
-            </w:r>
-            <w:r>
-              <w:rPr>
-                <w:rFonts w:cstheme="minorHAnsi"/>
-                <w:lang w:val="en-US"/>
-              </w:rPr>
-              <w:t xml:space="preserve"> Mechanism 1: capture guided by the task and by the twin's uncertainty vs. uniform, task-blind and task-weighted selection, judged by the success of the model trained in each twin. </w:t>
-            </w:r>
-            <w:r>
-              <w:rPr>
-                <w:rFonts w:cstheme="minorHAnsi"/>
-                <w:i/>
-                <w:lang w:val="en-US"/>
-              </w:rPr>
-              <w:t xml:space="preserve">D:</w:t>
-            </w:r>
-            <w:r>
-              <w:rPr>
-                <w:rFonts w:cstheme="minorHAnsi"/>
-                <w:lang w:val="en-US"/>
-              </w:rPr>
-              <w:t xml:space="preserve"> first budget–success curves (first H1 result), </w:t>
-            </w:r>
-            <w:r>
-              <w:rPr>
-                <w:rFonts w:cstheme="minorHAnsi"/>
-                <w:b/>
-                <w:lang w:val="en-US"/>
-              </w:rPr>
-              <w:t xml:space="preserve">by Feb 2027</w:t>
-            </w:r>
-            <w:r>
-              <w:rPr>
-                <w:rFonts w:cstheme="minorHAnsi"/>
-                <w:lang w:val="en-US"/>
-              </w:rPr>
-              <w:t xml:space="preserve">.</w:t>
+              <w:t xml:space="preserve">4. Writing a scientific article for a conference from the ministerial list (regarding generalization-aware digital twins).</w:t>
             </w:r>
             <w:permEnd w:id="1413760106"/>
           </w:p>
@@ -2438,25 +2094,9 @@
             <w:r>
               <w:rPr>
                 <w:rFonts w:cstheme="minorHAnsi"/>
-                <w:i/>
                 <w:lang w:val="en-US"/>
               </w:rPr>
-              <w:t xml:space="preserve">(Mar – Sep 2027)</w:t>
-            </w:r>
-            <w:r>
-              <w:rPr>
-                <w:rFonts w:cstheme="minorHAnsi"/>
-                <w:lang w:val="en-US"/>
-              </w:rPr>
-              <w:t xml:space="preserve"> </w:t>
-            </w:r>
-            <w:r>
-              <w:rPr>
-                <w:rFonts w:cstheme="minorHAnsi"/>
-                <w:b/>
-                <w:lang w:val="en-US"/>
-              </w:rPr>
-              <w:t xml:space="preserve">Mechanism 1 completed; mechanism 2 – better use of simulation (RQ1–RQ2, H1–H2).</w:t>
+              <w:t xml:space="preserve">1. Continuation of the literature review – participation in the internal reading group.</w:t>
             </w:r>
           </w:p>
           <w:p>
@@ -2467,62 +2107,9 @@
             <w:r>
               <w:rPr>
                 <w:rFonts w:cstheme="minorHAnsi"/>
-                <w:b/>
                 <w:lang w:val="en-US"/>
               </w:rPr>
-              <w:t xml:space="preserve">T4.1</w:t>
-            </w:r>
-            <w:r>
-              <w:rPr>
-                <w:rFonts w:cstheme="minorHAnsi"/>
-                <w:lang w:val="en-US"/>
-              </w:rPr>
-              <w:t xml:space="preserve"> Mechanism 1 completed: full budget curves against all pre-registered baselines. </w:t>
-            </w:r>
-            <w:r>
-              <w:rPr>
-                <w:rFonts w:cstheme="minorHAnsi"/>
-                <w:i/>
-                <w:lang w:val="en-US"/>
-              </w:rPr>
-              <w:t xml:space="preserve">D:</w:t>
-            </w:r>
-            <w:r>
-              <w:rPr>
-                <w:rFonts w:cstheme="minorHAnsi"/>
-                <w:lang w:val="en-US"/>
-              </w:rPr>
-              <w:t xml:space="preserve"> </w:t>
-            </w:r>
-            <w:r>
-              <w:rPr>
-                <w:rFonts w:cstheme="minorHAnsi"/>
-                <w:b/>
-                <w:lang w:val="en-US"/>
-              </w:rPr>
-              <w:t xml:space="preserve">H1 completed</w:t>
-            </w:r>
-            <w:r>
-              <w:rPr>
-                <w:rFonts w:cstheme="minorHAnsi"/>
-                <w:lang w:val="en-US"/>
-              </w:rPr>
-              <w:t xml:space="preserve"> on the proxy reality and an early preprint of the result, </w:t>
-            </w:r>
-            <w:r>
-              <w:rPr>
-                <w:rFonts w:cstheme="minorHAnsi"/>
-                <w:b/>
-                <w:lang w:val="en-US"/>
-              </w:rPr>
-              <w:t xml:space="preserve">by Apr 2027</w:t>
-            </w:r>
-            <w:r>
-              <w:rPr>
-                <w:rFonts w:cstheme="minorHAnsi"/>
-                <w:lang w:val="en-US"/>
-              </w:rPr>
-              <w:t xml:space="preserve">.</w:t>
+              <w:t xml:space="preserve">2. Continuing and finishing the research on generalization-aware digital twins.</w:t>
             </w:r>
           </w:p>
           <w:p>
@@ -2533,62 +2120,9 @@
             <w:r>
               <w:rPr>
                 <w:rFonts w:cstheme="minorHAnsi"/>
-                <w:b/>
                 <w:lang w:val="en-US"/>
               </w:rPr>
-              <w:t xml:space="preserve">T4.2</w:t>
-            </w:r>
-            <w:r>
-              <w:rPr>
-                <w:rFonts w:cstheme="minorHAnsi"/>
-                <w:lang w:val="en-US"/>
-              </w:rPr>
-              <w:t xml:space="preserve"> </w:t>
-            </w:r>
-            <w:r>
-              <w:rPr>
-                <w:rFonts w:cstheme="minorHAnsi"/>
-                <w:b/>
-                <w:lang w:val="en-US"/>
-              </w:rPr>
-              <w:t xml:space="preserve">Prepare and submit article P1 to NeurIPS 2027</w:t>
-            </w:r>
-            <w:r>
-              <w:rPr>
-                <w:rFonts w:cstheme="minorHAnsi"/>
-                <w:lang w:val="en-US"/>
-              </w:rPr>
-              <w:t xml:space="preserve"> (mechanism 1, H1, in navigation). </w:t>
-            </w:r>
-            <w:r>
-              <w:rPr>
-                <w:rFonts w:cstheme="minorHAnsi"/>
-                <w:i/>
-                <w:lang w:val="en-US"/>
-              </w:rPr>
-              <w:t xml:space="preserve">D:</w:t>
-            </w:r>
-            <w:r>
-              <w:rPr>
-                <w:rFonts w:cstheme="minorHAnsi"/>
-                <w:lang w:val="en-US"/>
-              </w:rPr>
-              <w:t xml:space="preserve"> submission, </w:t>
-            </w:r>
-            <w:r>
-              <w:rPr>
-                <w:rFonts w:cstheme="minorHAnsi"/>
-                <w:b/>
-                <w:lang w:val="en-US"/>
-              </w:rPr>
-              <w:t xml:space="preserve">May 2027</w:t>
-            </w:r>
-            <w:r>
-              <w:rPr>
-                <w:rFonts w:cstheme="minorHAnsi"/>
-                <w:lang w:val="en-US"/>
-              </w:rPr>
-              <w:t xml:space="preserve"> (§11).</w:t>
+              <w:t xml:space="preserve">3. Research on learning representations invariant to the difference between simulation and reality.</w:t>
             </w:r>
           </w:p>
           <w:p>
@@ -2599,77 +2133,9 @@
             <w:r>
               <w:rPr>
                 <w:rFonts w:cstheme="minorHAnsi"/>
-                <w:b/>
                 <w:lang w:val="en-US"/>
               </w:rPr>
-              <w:t xml:space="preserve">T4.3</w:t>
-            </w:r>
-            <w:r>
-              <w:rPr>
-                <w:rFonts w:cstheme="minorHAnsi"/>
-                <w:lang w:val="en-US"/>
-              </w:rPr>
-              <w:t xml:space="preserve"> Mechanism 2: training that follows the twin's uncertainty, initialized from pretrained foundation models, vs. uniform and no domain randomization in the pre-registered difficulty regime; the world-model extension as an ablation. </w:t>
-            </w:r>
-            <w:r>
-              <w:rPr>
-                <w:rFonts w:cstheme="minorHAnsi"/>
-                <w:i/>
-                <w:lang w:val="en-US"/>
-              </w:rPr>
-              <w:t xml:space="preserve">D:</w:t>
-            </w:r>
-            <w:r>
-              <w:rPr>
-                <w:rFonts w:cstheme="minorHAnsi"/>
-                <w:lang w:val="en-US"/>
-              </w:rPr>
-              <w:t xml:space="preserve"> first H2 result </w:t>
-            </w:r>
-            <w:r>
-              <w:rPr>
-                <w:rFonts w:cstheme="minorHAnsi"/>
-                <w:b/>
-                <w:lang w:val="en-US"/>
-              </w:rPr>
-              <w:t xml:space="preserve">by Jun 2027</w:t>
-            </w:r>
-            <w:r>
-              <w:rPr>
-                <w:rFonts w:cstheme="minorHAnsi"/>
-                <w:lang w:val="en-US"/>
-              </w:rPr>
-              <w:t xml:space="preserve">; </w:t>
-            </w:r>
-            <w:r>
-              <w:rPr>
-                <w:rFonts w:cstheme="minorHAnsi"/>
-                <w:b/>
-                <w:lang w:val="en-US"/>
-              </w:rPr>
-              <w:t xml:space="preserve">H2 completed</w:t>
-            </w:r>
-            <w:r>
-              <w:rPr>
-                <w:rFonts w:cstheme="minorHAnsi"/>
-                <w:lang w:val="en-US"/>
-              </w:rPr>
-              <w:t xml:space="preserve"> with the ablations, </w:t>
-            </w:r>
-            <w:r>
-              <w:rPr>
-                <w:rFonts w:cstheme="minorHAnsi"/>
-                <w:b/>
-                <w:lang w:val="en-US"/>
-              </w:rPr>
-              <w:t xml:space="preserve">by Jul 2027</w:t>
-            </w:r>
-            <w:r>
-              <w:rPr>
-                <w:rFonts w:cstheme="minorHAnsi"/>
-                <w:lang w:val="en-US"/>
-              </w:rPr>
-              <w:t xml:space="preserve">. Place: K46, WCSS.</w:t>
+              <w:t xml:space="preserve">4. Preparation of the Preludium research grant proposal to the National Science Centre.</w:t>
             </w:r>
           </w:p>
           <w:p>
@@ -2680,83 +2146,9 @@
             <w:r>
               <w:rPr>
                 <w:rFonts w:cstheme="minorHAnsi"/>
-                <w:b/>
                 <w:lang w:val="en-US"/>
               </w:rPr>
-              <w:t xml:space="preserve">T4.4</w:t>
-            </w:r>
-            <w:r>
-              <w:rPr>
-                <w:rFonts w:cstheme="minorHAnsi"/>
-                <w:lang w:val="en-US"/>
-              </w:rPr>
-              <w:t xml:space="preserve"> Mechanism 3 set-up: gap prediction, selection and correction code on the proxy reality, check of the sim-vs-real precondition (Jul–Sep 2027). </w:t>
-            </w:r>
-            <w:r>
-              <w:rPr>
-                <w:rFonts w:cstheme="minorHAnsi"/>
-                <w:i/>
-                <w:lang w:val="en-US"/>
-              </w:rPr>
-              <w:t xml:space="preserve">D:</w:t>
-            </w:r>
-            <w:r>
-              <w:rPr>
-                <w:rFonts w:cstheme="minorHAnsi"/>
-                <w:lang w:val="en-US"/>
-              </w:rPr>
-              <w:t xml:space="preserve"> first H3 result, </w:t>
-            </w:r>
-            <w:r>
-              <w:rPr>
-                <w:rFonts w:cstheme="minorHAnsi"/>
-                <w:b/>
-                <w:lang w:val="en-US"/>
-              </w:rPr>
-              <w:t xml:space="preserve">by Sep 2027</w:t>
-            </w:r>
-            <w:r>
-              <w:rPr>
-                <w:rFonts w:cstheme="minorHAnsi"/>
-                <w:lang w:val="en-US"/>
-              </w:rPr>
-              <w:t xml:space="preserve">.</w:t>
-            </w:r>
-          </w:p>
-          <w:p>
-            <w:pPr>
-              <w:spacing w:after="40" w:line="240" w:lineRule="auto"/>
-              <w:jc w:val="left"/>
-            </w:pPr>
-            <w:r>
-              <w:rPr>
-                <w:rFonts w:cstheme="minorHAnsi"/>
-                <w:b/>
-                <w:lang w:val="en-US"/>
-              </w:rPr>
-              <w:t xml:space="preserve">T4.5</w:t>
-            </w:r>
-            <w:r>
-              <w:rPr>
-                <w:rFonts w:cstheme="minorHAnsi"/>
-                <w:lang w:val="en-US"/>
-              </w:rPr>
-              <w:t xml:space="preserve"> Grants and international activity: NCN PRELUDIUM application; poster at an international summer school; foreign co-author sought for P2; NAWA Bekker application for the sem. 6 visit. </w:t>
-            </w:r>
-            <w:r>
-              <w:rPr>
-                <w:rFonts w:cstheme="minorHAnsi"/>
-                <w:i/>
-                <w:lang w:val="en-US"/>
-              </w:rPr>
-              <w:t xml:space="preserve">D:</w:t>
-            </w:r>
-            <w:r>
-              <w:rPr>
-                <w:rFonts w:cstheme="minorHAnsi"/>
-                <w:lang w:val="en-US"/>
-              </w:rPr>
-              <w:t xml:space="preserve"> applications, poster.</w:t>
+              <w:t xml:space="preserve">5. Participation in a scientific conference, preferably with own article.</w:t>
             </w:r>
             <w:permEnd w:id="379417658"/>
           </w:p>
@@ -2816,40 +2208,9 @@
             <w:r>
               <w:rPr>
                 <w:rFonts w:cstheme="minorHAnsi"/>
-                <w:i/>
                 <w:lang w:val="en-US"/>
               </w:rPr>
-              <w:t xml:space="preserve">(Oct 2027 – Feb 2028)</w:t>
-            </w:r>
-            <w:r>
-              <w:rPr>
-                <w:rFonts w:cstheme="minorHAnsi"/>
-                <w:lang w:val="en-US"/>
-              </w:rPr>
-              <w:t xml:space="preserve"> </w:t>
-            </w:r>
-            <w:r>
-              <w:rPr>
-                <w:rFonts w:cstheme="minorHAnsi"/>
-                <w:b/>
-                <w:lang w:val="en-US"/>
-              </w:rPr>
-              <w:t xml:space="preserve">Mid-term evaluation</w:t>
-            </w:r>
-            <w:r>
-              <w:rPr>
-                <w:rFonts w:cstheme="minorHAnsi"/>
-                <w:lang w:val="en-US"/>
-              </w:rPr>
-              <w:t xml:space="preserve"> (Nov 2027): autoreferat (≤ 5 pages, ~mid-Oct 2027) and 15-min presentation. </w:t>
-            </w:r>
-            <w:r>
-              <w:rPr>
-                <w:rFonts w:cstheme="minorHAnsi"/>
-                <w:b/>
-                <w:lang w:val="en-US"/>
-              </w:rPr>
-              <w:t xml:space="preserve">Mechanism 3 – fewer real trials (RQ3, H3); manipulation set-up.</w:t>
+              <w:t xml:space="preserve">1. Continuation of the literature review – participation in the internal reading group.</w:t>
             </w:r>
           </w:p>
           <w:p>
@@ -2860,62 +2221,9 @@
             <w:r>
               <w:rPr>
                 <w:rFonts w:cstheme="minorHAnsi"/>
-                <w:b/>
                 <w:lang w:val="en-US"/>
               </w:rPr>
-              <w:t xml:space="preserve">T5.1</w:t>
-            </w:r>
-            <w:r>
-              <w:rPr>
-                <w:rFonts w:cstheme="minorHAnsi"/>
-                <w:lang w:val="en-US"/>
-              </w:rPr>
-              <w:t xml:space="preserve"> Mechanism 3: selection of real trials by the predicted twin-to-reality gap vs. random, uniform-coverage and failure-driven selection; correction of the twin (appearance, geometry, physical parameters) and of the model with the selected trials. </w:t>
-            </w:r>
-            <w:r>
-              <w:rPr>
-                <w:rFonts w:cstheme="minorHAnsi"/>
-                <w:i/>
-                <w:lang w:val="en-US"/>
-              </w:rPr>
-              <w:t xml:space="preserve">D:</w:t>
-            </w:r>
-            <w:r>
-              <w:rPr>
-                <w:rFonts w:cstheme="minorHAnsi"/>
-                <w:lang w:val="en-US"/>
-              </w:rPr>
-              <w:t xml:space="preserve"> </w:t>
-            </w:r>
-            <w:r>
-              <w:rPr>
-                <w:rFonts w:cstheme="minorHAnsi"/>
-                <w:b/>
-                <w:lang w:val="en-US"/>
-              </w:rPr>
-              <w:t xml:space="preserve">H3 completed</w:t>
-            </w:r>
-            <w:r>
-              <w:rPr>
-                <w:rFonts w:cstheme="minorHAnsi"/>
-                <w:lang w:val="en-US"/>
-              </w:rPr>
-              <w:t xml:space="preserve"> on the proxy reality, </w:t>
-            </w:r>
-            <w:r>
-              <w:rPr>
-                <w:rFonts w:cstheme="minorHAnsi"/>
-                <w:b/>
-                <w:lang w:val="en-US"/>
-              </w:rPr>
-              <w:t xml:space="preserve">by Jan 2028</w:t>
-            </w:r>
-            <w:r>
-              <w:rPr>
-                <w:rFonts w:cstheme="minorHAnsi"/>
-                <w:lang w:val="en-US"/>
-              </w:rPr>
-              <w:t xml:space="preserve">. Place: K46, WCSS.</w:t>
+              <w:t xml:space="preserve">2. Continuing research on sim-to-real invariant representations, including the use of pretrained foundation models and learned world models.</w:t>
             </w:r>
           </w:p>
           <w:p>
@@ -2926,32 +2234,9 @@
             <w:r>
               <w:rPr>
                 <w:rFonts w:cstheme="minorHAnsi"/>
-                <w:b/>
                 <w:lang w:val="en-US"/>
               </w:rPr>
-              <w:t xml:space="preserve">T5.2</w:t>
-            </w:r>
-            <w:r>
-              <w:rPr>
-                <w:rFonts w:cstheme="minorHAnsi"/>
-                <w:lang w:val="en-US"/>
-              </w:rPr>
-              <w:t xml:space="preserve"> First robot validation campaign (2 PWr rooms, ~8 robot-hours): own captures, twins, uniform capture vs. the method, sim-vs-real correlation between proxy and robot. </w:t>
-            </w:r>
-            <w:r>
-              <w:rPr>
-                <w:rFonts w:cstheme="minorHAnsi"/>
-                <w:i/>
-                <w:lang w:val="en-US"/>
-              </w:rPr>
-              <w:t xml:space="preserve">D:</w:t>
-            </w:r>
-            <w:r>
-              <w:rPr>
-                <w:rFonts w:cstheme="minorHAnsi"/>
-                <w:lang w:val="en-US"/>
-              </w:rPr>
-              <w:t xml:space="preserve"> validation report. Place: K46 or Denali. Without a robot, the campaign moves to sem. 7; H1–H3 are decided on the proxy reality either way.</w:t>
+              <w:t xml:space="preserve">3. Research on adapting models trained in simulation to reality with a small amount of real data.</w:t>
             </w:r>
           </w:p>
           <w:p>
@@ -2962,47 +2247,9 @@
             <w:r>
               <w:rPr>
                 <w:rFonts w:cstheme="minorHAnsi"/>
-                <w:b/>
                 <w:lang w:val="en-US"/>
               </w:rPr>
-              <w:t xml:space="preserve">T5.3</w:t>
-            </w:r>
-            <w:r>
-              <w:rPr>
-                <w:rFonts w:cstheme="minorHAnsi"/>
-                <w:lang w:val="en-US"/>
-              </w:rPr>
-              <w:t xml:space="preserve"> Generalization set-up: manipulation proxy reality with hidden physical parameters (§9) and mechanisms 1–2 run on it unchanged. </w:t>
-            </w:r>
-            <w:r>
-              <w:rPr>
-                <w:rFonts w:cstheme="minorHAnsi"/>
-                <w:i/>
-                <w:lang w:val="en-US"/>
-              </w:rPr>
-              <w:t xml:space="preserve">D:</w:t>
-            </w:r>
-            <w:r>
-              <w:rPr>
-                <w:rFonts w:cstheme="minorHAnsi"/>
-                <w:lang w:val="en-US"/>
-              </w:rPr>
-              <w:t xml:space="preserve"> first manipulation budget curves, </w:t>
-            </w:r>
-            <w:r>
-              <w:rPr>
-                <w:rFonts w:cstheme="minorHAnsi"/>
-                <w:b/>
-                <w:lang w:val="en-US"/>
-              </w:rPr>
-              <w:t xml:space="preserve">by Dec 2027</w:t>
-            </w:r>
-            <w:r>
-              <w:rPr>
-                <w:rFonts w:cstheme="minorHAnsi"/>
-                <w:lang w:val="en-US"/>
-              </w:rPr>
-              <w:t xml:space="preserve">.</w:t>
+              <w:t xml:space="preserve">4. Validation of the results on a real mobile robot.</w:t>
             </w:r>
           </w:p>
           <w:p>
@@ -3013,62 +2260,9 @@
             <w:r>
               <w:rPr>
                 <w:rFonts w:cstheme="minorHAnsi"/>
-                <w:b/>
                 <w:lang w:val="en-US"/>
               </w:rPr>
-              <w:t xml:space="preserve">T5.4</w:t>
-            </w:r>
-            <w:r>
-              <w:rPr>
-                <w:rFonts w:cstheme="minorHAnsi"/>
-                <w:lang w:val="en-US"/>
-              </w:rPr>
-              <w:t xml:space="preserve"> </w:t>
-            </w:r>
-            <w:r>
-              <w:rPr>
-                <w:rFonts w:cstheme="minorHAnsi"/>
-                <w:b/>
-                <w:lang w:val="en-US"/>
-              </w:rPr>
-              <w:t xml:space="preserve">Article P2</w:t>
-            </w:r>
-            <w:r>
-              <w:rPr>
-                <w:rFonts w:cstheme="minorHAnsi"/>
-                <w:lang w:val="en-US"/>
-              </w:rPr>
-              <w:t xml:space="preserve"> (mechanisms 2–3, RQ2–RQ3, in navigation, with the first manipulation results) submitted to </w:t>
-            </w:r>
-            <w:r>
-              <w:rPr>
-                <w:rFonts w:cstheme="minorHAnsi"/>
-                <w:b/>
-                <w:lang w:val="en-US"/>
-              </w:rPr>
-              <w:t xml:space="preserve">ICML 2028</w:t>
-            </w:r>
-            <w:r>
-              <w:rPr>
-                <w:rFonts w:cstheme="minorHAnsi"/>
-                <w:lang w:val="en-US"/>
-              </w:rPr>
-              <w:t xml:space="preserve"> (~late Jan 2028; CVPR 2028, ~Nov 2027, only if H3 is complete by then). If P1 was rejected, its revision goes to CVPR 2028. </w:t>
-            </w:r>
-            <w:r>
-              <w:rPr>
-                <w:rFonts w:cstheme="minorHAnsi"/>
-                <w:i/>
-                <w:lang w:val="en-US"/>
-              </w:rPr>
-              <w:t xml:space="preserve">D:</w:t>
-            </w:r>
-            <w:r>
-              <w:rPr>
-                <w:rFonts w:cstheme="minorHAnsi"/>
-                <w:lang w:val="en-US"/>
-              </w:rPr>
-              <w:t xml:space="preserve"> submission(s).</w:t>
+              <w:t xml:space="preserve">5. Writing a scientific article for a conference from the ministerial list (regarding invariant representations and adaptation).</w:t>
             </w:r>
             <w:permEnd w:id="930623221"/>
           </w:p>
@@ -3128,25 +2322,9 @@
             <w:r>
               <w:rPr>
                 <w:rFonts w:cstheme="minorHAnsi"/>
-                <w:i/>
                 <w:lang w:val="en-US"/>
               </w:rPr>
-              <w:t xml:space="preserve">(Mar – Sep 2028)</w:t>
-            </w:r>
-            <w:r>
-              <w:rPr>
-                <w:rFonts w:cstheme="minorHAnsi"/>
-                <w:lang w:val="en-US"/>
-              </w:rPr>
-              <w:t xml:space="preserve"> </w:t>
-            </w:r>
-            <w:r>
-              <w:rPr>
-                <w:rFonts w:cstheme="minorHAnsi"/>
-                <w:b/>
-                <w:lang w:val="en-US"/>
-              </w:rPr>
-              <w:t xml:space="preserve">The whole method (RQ4, H4, the thesis) and its generalization.</w:t>
+              <w:t xml:space="preserve">1. Continuation of the literature review – participation in the internal reading group.</w:t>
             </w:r>
           </w:p>
           <w:p>
@@ -3157,77 +2335,9 @@
             <w:r>
               <w:rPr>
                 <w:rFonts w:cstheme="minorHAnsi"/>
-                <w:b/>
                 <w:lang w:val="en-US"/>
               </w:rPr>
-              <w:t xml:space="preserve">T6.1</w:t>
-            </w:r>
-            <w:r>
-              <w:rPr>
-                <w:rFonts w:cstheme="minorHAnsi"/>
-                <w:lang w:val="en-US"/>
-              </w:rPr>
-              <w:t xml:space="preserve"> Budget curves of the whole method vs. the assembled, pre-registered strongest existing real-to-sim-to-real approach and vs. learning from real data only, with the method's settings fixed in advance; the whole method, unchanged, in manipulation. </w:t>
-            </w:r>
-            <w:r>
-              <w:rPr>
-                <w:rFonts w:cstheme="minorHAnsi"/>
-                <w:i/>
-                <w:lang w:val="en-US"/>
-              </w:rPr>
-              <w:t xml:space="preserve">D:</w:t>
-            </w:r>
-            <w:r>
-              <w:rPr>
-                <w:rFonts w:cstheme="minorHAnsi"/>
-                <w:lang w:val="en-US"/>
-              </w:rPr>
-              <w:t xml:space="preserve"> first H4 result </w:t>
-            </w:r>
-            <w:r>
-              <w:rPr>
-                <w:rFonts w:cstheme="minorHAnsi"/>
-                <w:b/>
-                <w:lang w:val="en-US"/>
-              </w:rPr>
-              <w:t xml:space="preserve">by Apr 2028</w:t>
-            </w:r>
-            <w:r>
-              <w:rPr>
-                <w:rFonts w:cstheme="minorHAnsi"/>
-                <w:lang w:val="en-US"/>
-              </w:rPr>
-              <w:t xml:space="preserve">; manipulation curves </w:t>
-            </w:r>
-            <w:r>
-              <w:rPr>
-                <w:rFonts w:cstheme="minorHAnsi"/>
-                <w:b/>
-                <w:lang w:val="en-US"/>
-              </w:rPr>
-              <w:t xml:space="preserve">by Jul 2028</w:t>
-            </w:r>
-            <w:r>
-              <w:rPr>
-                <w:rFonts w:cstheme="minorHAnsi"/>
-                <w:lang w:val="en-US"/>
-              </w:rPr>
-              <w:t xml:space="preserve">; </w:t>
-            </w:r>
-            <w:r>
-              <w:rPr>
-                <w:rFonts w:cstheme="minorHAnsi"/>
-                <w:b/>
-                <w:lang w:val="en-US"/>
-              </w:rPr>
-              <w:t xml:space="preserve">H4 completed, by Sep 2028</w:t>
-            </w:r>
-            <w:r>
-              <w:rPr>
-                <w:rFonts w:cstheme="minorHAnsi"/>
-                <w:lang w:val="en-US"/>
-              </w:rPr>
-              <w:t xml:space="preserve">. Place: K46, WCSS.</w:t>
+              <w:t xml:space="preserve">2. Research on the generalization of the developed methods to unseen environments and to another physical task (robotic manipulation).</w:t>
             </w:r>
           </w:p>
           <w:p>
@@ -3238,47 +2348,9 @@
             <w:r>
               <w:rPr>
                 <w:rFonts w:cstheme="minorHAnsi"/>
-                <w:b/>
                 <w:lang w:val="en-US"/>
               </w:rPr>
-              <w:t xml:space="preserve">T6.2</w:t>
-            </w:r>
-            <w:r>
-              <w:rPr>
-                <w:rFonts w:cstheme="minorHAnsi"/>
-                <w:lang w:val="en-US"/>
-              </w:rPr>
-              <w:t xml:space="preserve"> </w:t>
-            </w:r>
-            <w:r>
-              <w:rPr>
-                <w:rFonts w:cstheme="minorHAnsi"/>
-                <w:b/>
-                <w:lang w:val="en-US"/>
-              </w:rPr>
-              <w:t xml:space="preserve">Foreign research visit</w:t>
-            </w:r>
-            <w:r>
-              <w:rPr>
-                <w:rFonts w:cstheme="minorHAnsi"/>
-                <w:lang w:val="en-US"/>
-              </w:rPr>
-              <w:t xml:space="preserve"> (3 months, NAWA Bekker; if not funded, a 5–30-day Erasmus+ short-term mobility to a European lab; hosts in §12): joint experiments. </w:t>
-            </w:r>
-            <w:r>
-              <w:rPr>
-                <w:rFonts w:cstheme="minorHAnsi"/>
-                <w:i/>
-                <w:lang w:val="en-US"/>
-              </w:rPr>
-              <w:t xml:space="preserve">D:</w:t>
-            </w:r>
-            <w:r>
-              <w:rPr>
-                <w:rFonts w:cstheme="minorHAnsi"/>
-                <w:lang w:val="en-US"/>
-              </w:rPr>
-              <w:t xml:space="preserve"> visit report.</w:t>
+              <w:t xml:space="preserve">3. Research internship at a foreign research centre working on robot learning.</w:t>
             </w:r>
           </w:p>
           <w:p>
@@ -3289,77 +2361,9 @@
             <w:r>
               <w:rPr>
                 <w:rFonts w:cstheme="minorHAnsi"/>
-                <w:b/>
                 <w:lang w:val="en-US"/>
               </w:rPr>
-              <w:t xml:space="preserve">T6.3</w:t>
-            </w:r>
-            <w:r>
-              <w:rPr>
-                <w:rFonts w:cstheme="minorHAnsi"/>
-                <w:lang w:val="en-US"/>
-              </w:rPr>
-              <w:t xml:space="preserve"> </w:t>
-            </w:r>
-            <w:r>
-              <w:rPr>
-                <w:rFonts w:cstheme="minorHAnsi"/>
-                <w:b/>
-                <w:lang w:val="en-US"/>
-              </w:rPr>
-              <w:t xml:space="preserve">Article P3</w:t>
-            </w:r>
-            <w:r>
-              <w:rPr>
-                <w:rFonts w:cstheme="minorHAnsi"/>
-                <w:lang w:val="en-US"/>
-              </w:rPr>
-              <w:t xml:space="preserve"> (the whole method against existing approaches, with the generalization to manipulation) submitted to </w:t>
-            </w:r>
-            <w:r>
-              <w:rPr>
-                <w:rFonts w:cstheme="minorHAnsi"/>
-                <w:b/>
-                <w:lang w:val="en-US"/>
-              </w:rPr>
-              <w:t xml:space="preserve">NeurIPS 2028</w:t>
-            </w:r>
-            <w:r>
-              <w:rPr>
-                <w:rFonts w:cstheme="minorHAnsi"/>
-                <w:lang w:val="en-US"/>
-              </w:rPr>
-              <w:t xml:space="preserve"> (~May 2028); if not ready, to </w:t>
-            </w:r>
-            <w:r>
-              <w:rPr>
-                <w:rFonts w:cstheme="minorHAnsi"/>
-                <w:b/>
-                <w:lang w:val="en-US"/>
-              </w:rPr>
-              <w:t xml:space="preserve">ICLR 2029</w:t>
-            </w:r>
-            <w:r>
-              <w:rPr>
-                <w:rFonts w:cstheme="minorHAnsi"/>
-                <w:lang w:val="en-US"/>
-              </w:rPr>
-              <w:t xml:space="preserve"> (~late Sep 2028). </w:t>
-            </w:r>
-            <w:r>
-              <w:rPr>
-                <w:rFonts w:cstheme="minorHAnsi"/>
-                <w:i/>
-                <w:lang w:val="en-US"/>
-              </w:rPr>
-              <w:t xml:space="preserve">D:</w:t>
-            </w:r>
-            <w:r>
-              <w:rPr>
-                <w:rFonts w:cstheme="minorHAnsi"/>
-                <w:lang w:val="en-US"/>
-              </w:rPr>
-              <w:t xml:space="preserve"> submission.</w:t>
+              <w:t xml:space="preserve">4. Writing a scientific article for a conference from the ministerial list (regarding generalization across scenes and tasks).</w:t>
             </w:r>
             <w:permEnd w:id="1544439300"/>
           </w:p>
@@ -3419,25 +2423,9 @@
             <w:r>
               <w:rPr>
                 <w:rFonts w:cstheme="minorHAnsi"/>
-                <w:i/>
                 <w:lang w:val="en-US"/>
               </w:rPr>
-              <w:t xml:space="preserve">(Oct 2028 – Feb 2029)</w:t>
-            </w:r>
-            <w:r>
-              <w:rPr>
-                <w:rFonts w:cstheme="minorHAnsi"/>
-                <w:lang w:val="en-US"/>
-              </w:rPr>
-              <w:t xml:space="preserve"> </w:t>
-            </w:r>
-            <w:r>
-              <w:rPr>
-                <w:rFonts w:cstheme="minorHAnsi"/>
-                <w:b/>
-                <w:lang w:val="en-US"/>
-              </w:rPr>
-              <w:t xml:space="preserve">Consolidation (RQ1–RQ4).</w:t>
+              <w:t xml:space="preserve">1. Continuation of the literature review – participation in the internal reading group.</w:t>
             </w:r>
           </w:p>
           <w:p>
@@ -3448,32 +2436,9 @@
             <w:r>
               <w:rPr>
                 <w:rFonts w:cstheme="minorHAnsi"/>
-                <w:b/>
                 <w:lang w:val="en-US"/>
               </w:rPr>
-              <w:t xml:space="preserve">T7.1</w:t>
-            </w:r>
-            <w:r>
-              <w:rPr>
-                <w:rFonts w:cstheme="minorHAnsi"/>
-                <w:lang w:val="en-US"/>
-              </w:rPr>
-              <w:t xml:space="preserve"> Second robot validation campaign of the whole method; final analysis of H1–H4. </w:t>
-            </w:r>
-            <w:r>
-              <w:rPr>
-                <w:rFonts w:cstheme="minorHAnsi"/>
-                <w:i/>
-                <w:lang w:val="en-US"/>
-              </w:rPr>
-              <w:t xml:space="preserve">D:</w:t>
-            </w:r>
-            <w:r>
-              <w:rPr>
-                <w:rFonts w:cstheme="minorHAnsi"/>
-                <w:lang w:val="en-US"/>
-              </w:rPr>
-              <w:t xml:space="preserve"> final results. Place: K46, Denali.</w:t>
+              <w:t xml:space="preserve">2. Finishing the studies, final experiments and validation on a real robot, and writing an article for a conference from the ministerial list based on the obtained outcomes.</w:t>
             </w:r>
           </w:p>
           <w:p>
@@ -3484,32 +2449,9 @@
             <w:r>
               <w:rPr>
                 <w:rFonts w:cstheme="minorHAnsi"/>
-                <w:b/>
                 <w:lang w:val="en-US"/>
               </w:rPr>
-              <w:t xml:space="preserve">T7.2</w:t>
-            </w:r>
-            <w:r>
-              <w:rPr>
-                <w:rFonts w:cstheme="minorHAnsi"/>
-                <w:lang w:val="en-US"/>
-              </w:rPr>
-              <w:t xml:space="preserve"> Release of the method's code, configurations, scene lists, seeds, pre-registrations and the releasable twins (no assets derived from ScanNet++). </w:t>
-            </w:r>
-            <w:r>
-              <w:rPr>
-                <w:rFonts w:cstheme="minorHAnsi"/>
-                <w:i/>
-                <w:lang w:val="en-US"/>
-              </w:rPr>
-              <w:t xml:space="preserve">D:</w:t>
-            </w:r>
-            <w:r>
-              <w:rPr>
-                <w:rFonts w:cstheme="minorHAnsi"/>
-                <w:lang w:val="en-US"/>
-              </w:rPr>
-              <w:t xml:space="preserve"> public repository.</w:t>
+              <w:t xml:space="preserve">3. Participation in a scientific conference.</w:t>
             </w:r>
           </w:p>
           <w:p>
@@ -3520,32 +2462,9 @@
             <w:r>
               <w:rPr>
                 <w:rFonts w:cstheme="minorHAnsi"/>
-                <w:b/>
                 <w:lang w:val="en-US"/>
               </w:rPr>
-              <w:t xml:space="preserve">T7.3</w:t>
-            </w:r>
-            <w:r>
-              <w:rPr>
-                <w:rFonts w:cstheme="minorHAnsi"/>
-                <w:lang w:val="en-US"/>
-              </w:rPr>
-              <w:t xml:space="preserve"> Optional article P4 (consolidated study) to ICLR 2029 (~late Sep 2028) or CVPR 2029 (~Nov 2028); start of dissertation writing. </w:t>
-            </w:r>
-            <w:r>
-              <w:rPr>
-                <w:rFonts w:cstheme="minorHAnsi"/>
-                <w:i/>
-                <w:lang w:val="en-US"/>
-              </w:rPr>
-              <w:t xml:space="preserve">D:</w:t>
-            </w:r>
-            <w:r>
-              <w:rPr>
-                <w:rFonts w:cstheme="minorHAnsi"/>
-                <w:lang w:val="en-US"/>
-              </w:rPr>
-              <w:t xml:space="preserve"> submission (optional), dissertation outline.</w:t>
+              <w:t xml:space="preserve">4. Preparing the structure and sketch of the doctoral dissertation.</w:t>
             </w:r>
             <w:permEnd w:id="565201535"/>
           </w:p>
@@ -3604,113 +2523,9 @@
             <w:r>
               <w:rPr>
                 <w:rFonts w:cstheme="minorHAnsi"/>
-                <w:i/>
                 <w:lang w:val="en-US"/>
               </w:rPr>
-              <w:t xml:space="preserve">(Mar – Sep 2029)</w:t>
-            </w:r>
-            <w:r>
-              <w:rPr>
-                <w:rFonts w:cstheme="minorHAnsi"/>
-                <w:lang w:val="en-US"/>
-              </w:rPr>
-              <w:t xml:space="preserve"> </w:t>
-            </w:r>
-            <w:r>
-              <w:rPr>
-                <w:rFonts w:cstheme="minorHAnsi"/>
-                <w:b/>
-                <w:lang w:val="en-US"/>
-              </w:rPr>
-              <w:t xml:space="preserve">T8.1</w:t>
-            </w:r>
-            <w:r>
-              <w:rPr>
-                <w:rFonts w:cstheme="minorHAnsi"/>
-                <w:lang w:val="en-US"/>
-              </w:rPr>
-              <w:t xml:space="preserve"> </w:t>
-            </w:r>
-            <w:r>
-              <w:rPr>
-                <w:rFonts w:cstheme="minorHAnsi"/>
-                <w:b/>
-                <w:lang w:val="en-US"/>
-              </w:rPr>
-              <w:t xml:space="preserve">Editing of the doctoral dissertation</w:t>
-            </w:r>
-            <w:r>
-              <w:rPr>
-                <w:rFonts w:cstheme="minorHAnsi"/>
-                <w:lang w:val="en-US"/>
-              </w:rPr>
-              <w:t xml:space="preserve">; final version. </w:t>
-            </w:r>
-            <w:r>
-              <w:rPr>
-                <w:rFonts w:cstheme="minorHAnsi"/>
-                <w:i/>
-                <w:lang w:val="en-US"/>
-              </w:rPr>
-              <w:t xml:space="preserve">D:</w:t>
-            </w:r>
-            <w:r>
-              <w:rPr>
-                <w:rFonts w:cstheme="minorHAnsi"/>
-                <w:lang w:val="en-US"/>
-              </w:rPr>
-              <w:t xml:space="preserve"> dissertation submitted by </w:t>
-            </w:r>
-            <w:r>
-              <w:rPr>
-                <w:rFonts w:cstheme="minorHAnsi"/>
-                <w:b/>
-                <w:lang w:val="en-US"/>
-              </w:rPr>
-              <w:t xml:space="preserve">30.09.2029</w:t>
-            </w:r>
-            <w:r>
-              <w:rPr>
-                <w:rFonts w:cstheme="minorHAnsi"/>
-                <w:lang w:val="en-US"/>
-              </w:rPr>
-              <w:t xml:space="preserve"> (§4).</w:t>
-            </w:r>
-          </w:p>
-          <w:p>
-            <w:pPr>
-              <w:spacing w:after="40" w:line="240" w:lineRule="auto"/>
-              <w:jc w:val="left"/>
-            </w:pPr>
-            <w:r>
-              <w:rPr>
-                <w:rFonts w:cstheme="minorHAnsi"/>
-                <w:b/>
-                <w:lang w:val="en-US"/>
-              </w:rPr>
-              <w:t xml:space="preserve">T8.2</w:t>
-            </w:r>
-            <w:r>
-              <w:rPr>
-                <w:rFonts w:cstheme="minorHAnsi"/>
-                <w:lang w:val="en-US"/>
-              </w:rPr>
-              <w:t xml:space="preserve"> Responses to reviews and camera-ready versions of pending articles. </w:t>
-            </w:r>
-            <w:r>
-              <w:rPr>
-                <w:rFonts w:cstheme="minorHAnsi"/>
-                <w:i/>
-                <w:lang w:val="en-US"/>
-              </w:rPr>
-              <w:t xml:space="preserve">D:</w:t>
-            </w:r>
-            <w:r>
-              <w:rPr>
-                <w:rFonts w:cstheme="minorHAnsi"/>
-                <w:lang w:val="en-US"/>
-              </w:rPr>
-              <w:t xml:space="preserve"> revised manuscripts.</w:t>
+              <w:t xml:space="preserve">Editing the doctoral dissertation, preparation of the final version of the document.</w:t>
             </w:r>
             <w:permEnd w:id="490215942"/>
           </w:p>
@@ -4021,7 +2836,7 @@
           <w:b/>
           <w:szCs w:val="24"/>
         </w:rPr>
-        <w:t xml:space="preserve">30.09.2029</w:t>
+        <w:t xml:space="preserve">September 2029</w:t>
       </w:r>
     </w:p>
     <w:p>
@@ -4387,52 +3202,7 @@
           <w:rFonts w:cstheme="minorHAnsi"/>
           <w:lang w:val="en-US"/>
         </w:rPr>
-        <w:t xml:space="preserve">Robots that learn a task from experience, such as moving around a building or handling objects, need a lot of that experience from the place where they will work, and collecting it in reality is slow, expensive and sometimes unsafe. Training in simulation avoids this cost but opens a </w:t>
-      </w:r>
-      <w:r>
-        <w:rPr>
-          <w:rFonts w:cstheme="minorHAnsi"/>
-          <w:b/>
-          <w:lang w:val="en-US"/>
-        </w:rPr>
-        <w:t xml:space="preserve">sim-to-real gap</w:t>
-      </w:r>
-      <w:r>
-        <w:rPr>
-          <w:rFonts w:cstheme="minorHAnsi"/>
-          <w:lang w:val="en-US"/>
-        </w:rPr>
-        <w:t xml:space="preserve">: a model that works in a generic simulator often fails in the real place. </w:t>
-      </w:r>
-      <w:r>
-        <w:rPr>
-          <w:rFonts w:cstheme="minorHAnsi"/>
-          <w:b/>
-          <w:lang w:val="en-US"/>
-        </w:rPr>
-        <w:t xml:space="preserve">Digital twins</w:t>
-      </w:r>
-      <w:r>
-        <w:rPr>
-          <w:rFonts w:cstheme="minorHAnsi"/>
-          <w:lang w:val="en-US"/>
-        </w:rPr>
-        <w:t xml:space="preserve"> built from real data narrow this gap. Neural scene reconstruction turns a short video of a real scene into a photorealistic model of its geometry and appearance, and a few measurements give the physical properties that matter for the task. This gives the </w:t>
-      </w:r>
-      <w:r>
-        <w:rPr>
-          <w:rFonts w:cstheme="minorHAnsi"/>
-          <w:b/>
-          <w:lang w:val="en-US"/>
-        </w:rPr>
-        <w:t xml:space="preserve">real-to-sim-to-real loop</w:t>
-      </w:r>
-      <w:r>
-        <w:rPr>
-          <w:rFonts w:cstheme="minorHAnsi"/>
-          <w:lang w:val="en-US"/>
-        </w:rPr>
-        <w:t xml:space="preserve">: acquire real data, build a twin, train the robot's model in it at scale, and transfer it back to reality, where a little more real data checks and corrects the twin and the model. Each part of the loop is an active research area, and twins built from a phone video already train navigation and manipulation models that work in reality.</w:t>
+        <w:t xml:space="preserve">Deep learning has led to impressive results in computer vision and natural language processing, and it is now increasingly applied to physical AI: robots and other embodied systems that perceive and act in the real world, such as mobile robots navigating buildings or robotic arms manipulating objects. Unlike models trained on images or text, such models need very large amounts of interaction data, which is slow, expensive and sometimes unsafe to collect in the real world. Therefore, they are commonly trained in simulation. Recently, digital twins built from real data became a promising alternative to hand-made simulators: neural scene reconstruction methods, such as Neural Radiance Fields and 3D Gaussian Splatting, turn a short video of a real place into a photorealistic 3D model in which a robot can be trained at scale. This gives the real-to-sim-to-real loop: real data is transferred into a simulation, a model is trained there, and the model is transferred back to the real world.</w:t>
       </w:r>
     </w:p>
     <w:p>
@@ -4445,160 +3215,20 @@
           <w:rFonts w:cstheme="minorHAnsi"/>
           <w:lang w:val="en-US"/>
         </w:rPr>
-        <w:t xml:space="preserve">What remains open is </w:t>
-      </w:r>
-      <w:r>
-        <w:rPr>
-          <w:rFonts w:cstheme="minorHAnsi"/>
-          <w:b/>
-          <w:lang w:val="en-US"/>
-        </w:rPr>
-        <w:t xml:space="preserve">how much real data the loop needs, and how to need less of it</w:t>
-      </w:r>
-      <w:r>
-        <w:rPr>
-          <w:rFonts w:cstheme="minorHAnsi"/>
-          <w:lang w:val="en-US"/>
-        </w:rPr>
-        <w:t xml:space="preserve">. In every existing pipeline the amount is fixed by hand: the scene is captured uniformly, training uses generic randomization, and real trials, if any at all, are chosen at random or by hand. To our knowledge, no navigation pipeline has a stage that corrects the twin with real trials, and none reports how success depends on the real data spent; in manipulation such accounting exists only at single points.</w:t>
-      </w:r>
-    </w:p>
-    <w:p>
-      <w:pPr>
-        <w:spacing w:after="120" w:line="240" w:lineRule="auto"/>
+        <w:t xml:space="preserve">However, the usefulness of this loop depends entirely on how well the trained models generalize. A model that performs very well in simulation often fails in reality, because a digital twin never reproduces the real world exactly: appearance, lighting, geometry and physical properties differ. Moreover, models often fail again in places or tasks that were not seen during training. This sim-to-real generalization gap remains one of the main obstacles for physical AI. The methods proposed so far, such as domain randomization, rely largely on hand-tuned heuristics, are typically evaluated on a single task and a few scenes, and do not explain which properties of the simulation and of the learned representations actually determine generalization to reality. Therefore, the dissertation aims at developing methods that improve the generalization of deep learning models trained in real-to-sim-to-real loops, with a particular focus on the digital twin itself, the representations learned in it, and the adaptation of models to reality with little real data.</w:t>
+      </w:r>
+    </w:p>
+    <w:p>
+      <w:pPr>
+        <w:spacing w:after="0" w:line="240" w:lineRule="auto"/>
         <w:jc w:val="both"/>
       </w:pPr>
       <w:r>
         <w:rPr>
           <w:rFonts w:cstheme="minorHAnsi"/>
-          <w:b/>
-          <w:lang w:val="en-US"/>
-        </w:rPr>
-        <w:t xml:space="preserve">Scientific problem and goal.</w:t>
-      </w:r>
-      <w:r>
-        <w:rPr>
-          <w:rFonts w:cstheme="minorHAnsi"/>
-          <w:lang w:val="en-US"/>
-        </w:rPr>
-        <w:t xml:space="preserve"> The underlying problem is scientific: learning under distribution shift when target-domain data can be bought at a cost at several points of a learning loop. The dissertation poses the real-to-sim-to-real loop as sequential experimental design over a real-data budget, values each real datum by its expected reduction of the twin-to-reality performance gap per unit cost, and derives when twin data can replace real data. The goal is </w:t>
-      </w:r>
-      <w:r>
-        <w:rPr>
-          <w:rFonts w:cstheme="minorHAnsi"/>
-          <w:b/>
-          <w:lang w:val="en-US"/>
-        </w:rPr>
-        <w:t xml:space="preserve">a method, grounded in this principle, that reduces the amount of real data</w:t>
-      </w:r>
-      <w:r>
-        <w:rPr>
-          <w:rFonts w:cstheme="minorHAnsi"/>
-          <w:lang w:val="en-US"/>
-        </w:rPr>
-        <w:t xml:space="preserve"> needed to teach a robot a task, with one mechanism per step: (1) </w:t>
-      </w:r>
-      <w:r>
-        <w:rPr>
-          <w:rFonts w:cstheme="minorHAnsi"/>
-          <w:b/>
-          <w:lang w:val="en-US"/>
-        </w:rPr>
-        <w:t xml:space="preserve">less capture</w:t>
-      </w:r>
-      <w:r>
-        <w:rPr>
-          <w:rFonts w:cstheme="minorHAnsi"/>
-          <w:lang w:val="en-US"/>
-        </w:rPr>
-        <w:t xml:space="preserve">; (2) </w:t>
-      </w:r>
-      <w:r>
-        <w:rPr>
-          <w:rFonts w:cstheme="minorHAnsi"/>
-          <w:b/>
-          <w:lang w:val="en-US"/>
-        </w:rPr>
-        <w:t xml:space="preserve">better use of simulation</w:t>
-      </w:r>
-      <w:r>
-        <w:rPr>
-          <w:rFonts w:cstheme="minorHAnsi"/>
-          <w:lang w:val="en-US"/>
-        </w:rPr>
-        <w:t xml:space="preserve">, training so that the twin's errors do not transfer; (3) </w:t>
-      </w:r>
-      <w:r>
-        <w:rPr>
-          <w:rFonts w:cstheme="minorHAnsi"/>
-          <w:b/>
-          <w:lang w:val="en-US"/>
-        </w:rPr>
-        <w:t xml:space="preserve">fewer real trials</w:t>
-      </w:r>
-      <w:r>
-        <w:rPr>
-          <w:rFonts w:cstheme="minorHAnsi"/>
-          <w:lang w:val="en-US"/>
-        </w:rPr>
-        <w:t xml:space="preserve">, choosing those that correct twin and model most. The thesis is that the method needs at least two times less real data than the strongest existing real-to-sim-to-real approach. Operator minutes are only the evaluation measure. Indoor navigation is the main testbed; manipulation tests whether the same method carries over.</w:t>
-      </w:r>
-    </w:p>
-    <w:p>
-      <w:pPr>
-        <w:spacing w:after="120" w:line="240" w:lineRule="auto"/>
-        <w:jc w:val="both"/>
-      </w:pPr>
-      <w:r>
-        <w:rPr>
-          <w:rFonts w:cstheme="minorHAnsi"/>
-          <w:b/>
-          <w:lang w:val="en-US"/>
-        </w:rPr>
-        <w:t xml:space="preserve">Why this topic, and why in this discipline.</w:t>
-      </w:r>
-      <w:r>
-        <w:rPr>
-          <w:rFonts w:cstheme="minorHAnsi"/>
-          <w:lang w:val="en-US"/>
-        </w:rPr>
-        <w:t xml:space="preserve"> The object is a data-efficient learning method (active learning, learning under distribution shift, uncertainty estimation, adaptation of pretrained models), not a particular robot, simulator or benchmark, which places it in </w:t>
-      </w:r>
-      <w:r>
-        <w:rPr>
-          <w:rFonts w:cstheme="minorHAnsi"/>
-          <w:i/>
-          <w:lang w:val="en-US"/>
-        </w:rPr>
-        <w:t xml:space="preserve">information and communication technology</w:t>
-      </w:r>
-      <w:r>
-        <w:rPr>
-          <w:rFonts w:cstheme="minorHAnsi"/>
-          <w:lang w:val="en-US"/>
-        </w:rPr>
-        <w:t xml:space="preserve">. The student builds on existing open reconstruction pipelines, simulators, pretrained models and public datasets. Public scans of real buildings make it possible to count real data exactly without an own robot; trials on a small mobile robot validate, but do not decide, the conclusions. The topic fits the Department of Artificial Intelligence (K46), whose research groups include representation learning, and the training runs on the GPU infrastructure available to PWr researchers (WCSS, PLGrid).</w:t>
-      </w:r>
-    </w:p>
-    <w:p>
-      <w:pPr>
-        <w:spacing w:after="0" w:line="240" w:lineRule="auto"/>
-        <w:jc w:val="both"/>
-      </w:pPr>
-      <w:r>
-        <w:rPr>
-          <w:rFonts w:cstheme="minorHAnsi"/>
-          <w:b/>
-          <w:lang w:val="en-US"/>
-        </w:rPr>
-        <w:t xml:space="preserve">Potential application areas:</w:t>
-      </w:r>
-      <w:r>
-        <w:rPr>
-          <w:rFonts w:cstheme="minorHAnsi"/>
-          <w:lang w:val="en-US"/>
-        </w:rPr>
-        <w:t xml:space="preserve"> faster and cheaper deployment of robots in new places, such as warehouses, hospitals, offices and inspection sites, with less time spent collecting data and supervising real trials; guidance on how much real data to collect for a twin; and, beyond robotics, any model trained on reconstructed or simulated data and used on real sensor data.</w:t>
+          <w:lang w:val="en-US"/>
+        </w:rPr>
+        <w:t xml:space="preserve">The research is relevant to machine learning in general, as it concerns learning under distribution shift and the generalization of representations, and it could help to understand why models trained on synthetic data succeed or fail on real data. The results have potential applications in service and logistic robotics, where robots could be trained in a digital copy of a new warehouse, hospital or office and work there reliably, as well as in autonomous systems and any other domain where models are trained on simulated or reconstructed data and used on real sensor data.</w:t>
       </w:r>
     </w:p>
     <w:permEnd w:id="1178868985"/>
@@ -4966,17 +3596,9 @@
       <w:r>
         <w:rPr>
           <w:rFonts w:cstheme="minorHAnsi"/>
-          <w:b/>
-          <w:lang w:val="en-US"/>
-        </w:rPr>
-        <w:t xml:space="preserve">Simulation and sim-to-real transfer.</w:t>
-      </w:r>
-      <w:r>
-        <w:rPr>
-          <w:rFonts w:cstheme="minorHAnsi"/>
-          <w:lang w:val="en-US"/>
-        </w:rPr>
-        <w:t xml:space="preserve"> Robot models for navigation and manipulation are commonly trained in simulators such as Habitat [1] and ManiSkill3 [2], where large-scale reinforcement learning essentially solves point-goal navigation after billions of steps [3]. Transfer to the real world is the open part: simulation success need not predict real success (the Sim-vs-Real Correlation Coefficient rose from 0.18 to 0.84 once one collision artefact was removed [4]; paired evaluations in manipulation [5]). Domain randomization varies appearance [6] or dynamics [7] uniformly within hand-set ranges, and a few real rollouts can adapt the simulation parameter distribution [8]. In navigation, more data from a known location saturates quickly [9]; sim-and-real co-training raises real success [10].</w:t>
+          <w:lang w:val="en-US"/>
+        </w:rPr>
+        <w:t xml:space="preserve">Deep reinforcement and imitation learning made it possible to train robots for complex tasks such as visual navigation and manipulation. Since such methods require very large amounts of experience, simulation became the standard training environment. Platforms such as Habitat [1] and ManiSkill3 [2] allow training at the scale of billions of steps, and in simulation point-goal navigation has been practically solved [3]. However, the performance of models in simulation does not always predict their performance in the real world [4], and the transfer of models from simulation to reality, known as the sim-to-real problem, remains one of the central challenges of robot learning [5, 6].</w:t>
       </w:r>
     </w:p>
     <w:p>
@@ -4987,17 +3609,23 @@
       <w:r>
         <w:rPr>
           <w:rFonts w:cstheme="minorHAnsi"/>
-          <w:b/>
-          <w:lang w:val="en-US"/>
-        </w:rPr>
-        <w:t xml:space="preserve">From real data to digital twins.</w:t>
-      </w:r>
-      <w:r>
-        <w:rPr>
-          <w:rFonts w:cstheme="minorHAnsi"/>
-          <w:lang w:val="en-US"/>
-        </w:rPr>
-        <w:t xml:space="preserve"> Neural scene reconstruction, above all 3D Gaussian Splatting (3DGS) [11], turns a short real capture into a photorealistic model of a scene. Twins built this way train models that transfer. In navigation, EmbodiedSplat [12] reconstructs rooms from a phone capture and fine-tunes image-goal navigation in Habitat, Vid2Sim [13] builds simulators for urban navigation from monocular video, GaussGym [14] trains from pixels, and ReaDy-Go [15] adds moving obstacles. In manipulation, RialTo [16] builds a twin from a scan and a few demonstrations, X-Sim [17] from a minute of human video, and TwinRL [18] fine-tunes a pretrained policy in a phone-captured twin and targets its few real rollouts at configurations where the twin predicts failure. The physical part of a twin can be identified from a small amount of real data, as a posterior over simulator parameters [19] or by exploration designed for identification [20]. Datasets such as ScanNet++ [21] pair laser scans and DSLR images with a separate phone capture of the same scene, and MuSHRoom [22] pairs phone and depth-camera captures with a reference mesh under an open licence. In all these works the amount of real data is fixed by hand: the navigation twins use between 15 seconds and 30 minutes of video per scene and no real training trials, and the manipulation works report single points (e.g. a scan and 15 demonstrations instead of 50 demonstrations [16]) rather than curves.</w:t>
+          <w:lang w:val="en-US"/>
+        </w:rPr>
+        <w:t xml:space="preserve">The most common approach to the sim-to-real problem is domain randomization, which varies the appearance</w:t>
+      </w:r>
+    </w:p>
+    <w:p>
+      <w:pPr>
+        <w:spacing w:after="0" w:line="240" w:lineRule="auto"/>
+        <w:ind w:left="397" w:hanging="397"/>
+        <w:jc w:val="left"/>
+      </w:pPr>
+      <w:r>
+        <w:rPr>
+          <w:rFonts w:cstheme="minorHAnsi"/>
+          <w:lang w:val="en-US"/>
+        </w:rPr>
+        <w:t xml:space="preserve">[7] or the dynamics [8] of the simulation so that reality appears as one more variation. Other works adapt</w:t>
       </w:r>
     </w:p>
     <w:p>
@@ -5008,17 +3636,9 @@
       <w:r>
         <w:rPr>
           <w:rFonts w:cstheme="minorHAnsi"/>
-          <w:b/>
-          <w:lang w:val="en-US"/>
-        </w:rPr>
-        <w:t xml:space="preserve">Capturing the right real data.</w:t>
-      </w:r>
-      <w:r>
-        <w:rPr>
-          <w:rFonts w:cstheme="minorHAnsi"/>
-          <w:lang w:val="en-US"/>
-        </w:rPr>
-        <w:t xml:space="preserve"> Active view selection chooses the images that improve a reconstruction most: FisherRF [23] maximizes expected information gain, and Bayes' Rays [24] estimates an uncertainty field for a trained radiance field. Risk-aware view acquisition [25] weights FisherRF by safety-critical regions for navigation, and AREA3D [26] adds vision-language guidance. None measures the success of a model trained in the resulting twin (at most two task-aware capture papers a year, 2023–2026).</w:t>
+          <w:lang w:val="en-US"/>
+        </w:rPr>
+        <w:t xml:space="preserve">the parameters of the simulator to a few real-world rollouts [9]. Interestingly, the fidelity of the simulator alone does not guarantee better transfer, as lower-fidelity simulation can transfer better in navigation [10]. From the machine learning perspective, the sim-to-real problem is an instance of learning under distribution shift. Domain adaptation theory bounds the error on the target domain by the error on the source domain and a discrepancy between the two domains [11], and domain-adversarial training learns representations that are invariant across domains [12]. Nevertheless, such principled approaches are rarely applied to models trained in simulation for physical tasks, where randomization heuristics dominate.</w:t>
       </w:r>
     </w:p>
     <w:p>
@@ -5029,61 +3649,9 @@
       <w:r>
         <w:rPr>
           <w:rFonts w:cstheme="minorHAnsi"/>
-          <w:b/>
-          <w:lang w:val="en-US"/>
-        </w:rPr>
-        <w:t xml:space="preserve">Foundation models, world models and real trials.</w:t>
-      </w:r>
-      <w:r>
-        <w:rPr>
-          <w:rFonts w:cstheme="minorHAnsi"/>
-          <w:lang w:val="en-US"/>
-        </w:rPr>
-        <w:t xml:space="preserve"> Pretrained navigation foundation models generalize across robots and environments (GNM [27], ViNT [28]), and vision-language-action models map images and instructions to actions [29]; they still need data from the target place to work there. Learned world models predict future observations: navigation world models plan by imagining trajectories [30], and open world foundation models are post-trained per setup [31]; VLAW [32] improves a world model with real rollouts, at a fixed, hand-chosen number of them. Choosing real trials has been studied for </w:t>
-      </w:r>
-      <w:r>
-        <w:rPr>
-          <w:rFonts w:cstheme="minorHAnsi"/>
-          <w:i/>
-          <w:lang w:val="en-US"/>
-        </w:rPr>
-        <w:t xml:space="preserve">evaluating</w:t>
-      </w:r>
-      <w:r>
-        <w:rPr>
-          <w:rFonts w:cstheme="minorHAnsi"/>
-          <w:lang w:val="en-US"/>
-        </w:rPr>
-        <w:t xml:space="preserve"> policies (a fifth to a quarter less robot effort [33]), not for </w:t>
-      </w:r>
-      <w:r>
-        <w:rPr>
-          <w:rFonts w:cstheme="minorHAnsi"/>
-          <w:i/>
-          <w:lang w:val="en-US"/>
-        </w:rPr>
-        <w:t xml:space="preserve">correcting</w:t>
-      </w:r>
-      <w:r>
-        <w:rPr>
-          <w:rFonts w:cstheme="minorHAnsi"/>
-          <w:lang w:val="en-US"/>
-        </w:rPr>
-        <w:t xml:space="preserve"> a twin and its model. Frozen visual encoders [34] make twin and real observations comparable, and prediction-powered inference</w:t>
-      </w:r>
-    </w:p>
-    <w:p>
-      <w:pPr>
-        <w:spacing w:after="0" w:line="240" w:lineRule="auto"/>
-        <w:ind w:left="397" w:hanging="397"/>
-        <w:jc w:val="left"/>
-      </w:pPr>
-      <w:r>
-        <w:rPr>
-          <w:rFonts w:cstheme="minorHAnsi"/>
-          <w:lang w:val="en-US"/>
-        </w:rPr>
-        <w:t xml:space="preserve">[35] estimates real performance from many cheap predictions and a few real labels.</w:t>
+          <w:lang w:val="en-US"/>
+        </w:rPr>
+        <w:t xml:space="preserve">A major recent development is the construction of simulations directly from real data. Neural Radiance Fields [13] and 3D Gaussian Splatting [14] reconstruct photorealistic 3D scenes from ordinary images, and datasets such as ScanNet++ [15] provide real indoor scenes captured both with high-end and consumer devices. Such digital twins have been used to train navigation models from a phone capture of a room [16] or from monocular videos of urban scenes [17], and robotic manipulation policies from a scan of the target scene [18], showing that real-to-sim-to-real learning improves real-world performance in comparison with generic simulators. The physical parameters of a digital twin can be estimated from a small amount of real data [19]. However, these works treat the digital twin mostly as a fixed, as-accurate-as-possible copy of reality. It is not known which properties of a twin (appearance, geometry, lighting or physics) actually determine the generalization of the trained models, and the twins are randomized uniformly rather than according to where they are uncertain or where it matters for the task. Moreover, the evaluation is usually limited to a handful of scenes and a single task.</w:t>
       </w:r>
     </w:p>
     <w:p>
@@ -5094,17 +3662,9 @@
       <w:r>
         <w:rPr>
           <w:rFonts w:cstheme="minorHAnsi"/>
-          <w:b/>
-          <w:lang w:val="en-US"/>
-        </w:rPr>
-        <w:t xml:space="preserve">Theory.</w:t>
-      </w:r>
-      <w:r>
-        <w:rPr>
-          <w:rFonts w:cstheme="minorHAnsi"/>
-          <w:lang w:val="en-US"/>
-        </w:rPr>
-        <w:t xml:space="preserve"> Domain-adaptation theory bounds target error by source error plus a discrepancy between domains [38], and Bayesian experimental design chooses measurements by expected information gain [36, 37]; neither has been applied to the allocation of real data across a real-to-sim-to-real loop.</w:t>
+          <w:lang w:val="en-US"/>
+        </w:rPr>
+        <w:t xml:space="preserve">In parallel, pretrained foundation models changed how robot policies are built. General navigation models trained on data from many robots [20, 21] and vision-language-action models [22] transfer to new robots and environments, and self-supervised visual encoders [23] provide representations that are robust to many appearance changes. Learned world models predict future observations and can be used for planning in navigation [24]. These models are a promising basis for generalization, but it has not been studied how their representations behave under the specific shift between a digital twin and reality, and how they should be trained in a twin so that this shift does not harm their performance. Finally, adapting a model trained in simulation to reality usually relies on real data collected at random or by hand, and on co-training with simulated data [25], without selecting the real data that is most informative about the remaining gap.</w:t>
       </w:r>
     </w:p>
     <w:p>
@@ -5115,17 +3675,9 @@
       <w:r>
         <w:rPr>
           <w:rFonts w:cstheme="minorHAnsi"/>
-          <w:b/>
-          <w:lang w:val="en-US"/>
-        </w:rPr>
-        <w:t xml:space="preserve">Research gap.</w:t>
-      </w:r>
-      <w:r>
-        <w:rPr>
-          <w:rFonts w:cstheme="minorHAnsi"/>
-          <w:lang w:val="en-US"/>
-        </w:rPr>
-        <w:t xml:space="preserve"> Real-to-sim-to-real learning works, but the real data it consumes is set by hand and spent uniformly at every step. No navigation pipeline has a stage that corrects the twin with real trials, and none reports how success depends on the real data spent; in manipulation the real data is accounted at single points, against learning from real data only, never against another real-to-sim-to-real pipeline. Missing are a principled criterion for spending real data across the whole loop, its theory, and a method built on it that reduces real data at every step (RQ1–RQ3) and in total (RQ4).</w:t>
+          <w:lang w:val="en-US"/>
+        </w:rPr>
+        <w:t xml:space="preserve">In summary, the literature shows that real-to-sim-to-real learning is effective, but the generalization of the trained models to reality, to unseen scenes and to other tasks is still limited and poorly understood. The proposed dissertation addresses this gap by studying the generalization of deep learning models at each stage of the real-to-sim-to-real loop.</w:t>
       </w:r>
     </w:p>
     <w:p>
@@ -5154,7 +3706,7 @@
           <w:rFonts w:cstheme="minorHAnsi"/>
           <w:lang w:val="en-US"/>
         </w:rPr>
-        <w:t xml:space="preserve">[1] M. Savva et al., "Habitat," ICCV, 2019.</w:t>
+        <w:t xml:space="preserve">[1] Savva, M., Kadian, A., Maksymets, O., et al. (2019). Habitat: A platform for embodied AI research. ICCV.</w:t>
       </w:r>
     </w:p>
     <w:p>
@@ -5168,7 +3720,7 @@
           <w:rFonts w:cstheme="minorHAnsi"/>
           <w:lang w:val="en-US"/>
         </w:rPr>
-        <w:t xml:space="preserve">[2] S. Tao et al., "ManiSkill3," RSS, 2025.</w:t>
+        <w:t xml:space="preserve">[2] Tao, S., et al. (2025). ManiSkill3: GPU parallelized robotics simulation and rendering for generalizable embodied AI. RSS.</w:t>
       </w:r>
     </w:p>
     <w:p>
@@ -5182,7 +3734,7 @@
           <w:rFonts w:cstheme="minorHAnsi"/>
           <w:lang w:val="en-US"/>
         </w:rPr>
-        <w:t xml:space="preserve">[3] E. Wijmans et al., "DD-PPO," ICLR, 2020.</w:t>
+        <w:t xml:space="preserve">[3] Wijmans, E., et al. (2020). DD-PPO: Learning near-perfect PointGoal navigators from 2.5 billion frames. ICLR.</w:t>
       </w:r>
     </w:p>
     <w:p>
@@ -5196,7 +3748,7 @@
           <w:rFonts w:cstheme="minorHAnsi"/>
           <w:lang w:val="en-US"/>
         </w:rPr>
-        <w:t xml:space="preserve">[4] A. Kadian et al., "Sim2Real Predictivity," IEEE RA-L, 2020.</w:t>
+        <w:t xml:space="preserve">[4] Kadian, A., et al. (2020). Sim2Real predictivity: Does evaluation in simulation predict real-world performance? IEEE Robotics and Automation Letters, 5(4).</w:t>
       </w:r>
     </w:p>
     <w:p>
@@ -5210,7 +3762,7 @@
           <w:rFonts w:cstheme="minorHAnsi"/>
           <w:lang w:val="en-US"/>
         </w:rPr>
-        <w:t xml:space="preserve">[5] X. Li et al., "Evaluating Real-World Robot Manipulation Policies…," CoRL, 2024.</w:t>
+        <w:t xml:space="preserve">[5] Zhao, W., Queralta, J. P., &amp; Westerlund, T. (2020). Sim-to-real transfer in deep reinforcement learning for robotics: a survey. IEEE SSCI.</w:t>
       </w:r>
     </w:p>
     <w:p>
@@ -5224,7 +3776,7 @@
           <w:rFonts w:cstheme="minorHAnsi"/>
           <w:lang w:val="en-US"/>
         </w:rPr>
-        <w:t xml:space="preserve">[6] J. Tobin et al., "Domain Randomization…," IROS, 2017.</w:t>
+        <w:t xml:space="preserve">[6] Höfer, S., et al. (2021). Sim2Real in robotics and automation: Applications and challenges. IEEE Transactions on Automation Science and Engineering, 18(2).</w:t>
       </w:r>
     </w:p>
     <w:p>
@@ -5238,7 +3790,7 @@
           <w:rFonts w:cstheme="minorHAnsi"/>
           <w:lang w:val="en-US"/>
         </w:rPr>
-        <w:t xml:space="preserve">[7] X. B. Peng et al., "Sim-to-Real Transfer… with Dynamics Randomization," ICRA, 2018.</w:t>
+        <w:t xml:space="preserve">[7] Tobin, J., et al. (2017). Domain randomization for transferring deep neural networks from simulation to the real world. IROS.</w:t>
       </w:r>
     </w:p>
     <w:p>
@@ -5252,7 +3804,7 @@
           <w:rFonts w:cstheme="minorHAnsi"/>
           <w:lang w:val="en-US"/>
         </w:rPr>
-        <w:t xml:space="preserve">[8] Y. Chebotar et al., "Closing the Sim-to-Real Loop," ICRA, 2019.</w:t>
+        <w:t xml:space="preserve">[8] Peng, X. B., Andrychowicz, M., Zaremba, W., &amp; Abbeel, P. (2018). Sim-to-real transfer of robotic control with dynamics randomization. ICRA.</w:t>
       </w:r>
     </w:p>
     <w:p>
@@ -5266,7 +3818,7 @@
           <w:rFonts w:cstheme="minorHAnsi"/>
           <w:lang w:val="en-US"/>
         </w:rPr>
-        <w:t xml:space="preserve">[9] L. Suomela et al., "Data Scaling for Navigation…," IEEE RA-L, 2026.</w:t>
+        <w:t xml:space="preserve">[9] Chebotar, Y., et al. (2019). Closing the sim-to-real loop: Adapting simulation randomization with real world experience. ICRA.</w:t>
       </w:r>
     </w:p>
     <w:p>
@@ -5280,7 +3832,7 @@
           <w:rFonts w:cstheme="minorHAnsi"/>
           <w:lang w:val="en-US"/>
         </w:rPr>
-        <w:t xml:space="preserve">[10] A. Maddukuri et al., "Sim-and-Real Co-Training," RSS, 2025.</w:t>
+        <w:t xml:space="preserve">[10] Truong, J., et al. (2022). Rethinking sim2real: Lower fidelity simulation leads to higher sim2real transfer in navigation. CoRL.</w:t>
       </w:r>
     </w:p>
     <w:p>
@@ -5294,7 +3846,7 @@
           <w:rFonts w:cstheme="minorHAnsi"/>
           <w:lang w:val="en-US"/>
         </w:rPr>
-        <w:t xml:space="preserve">[11] B. Kerbl et al., "3D Gaussian Splatting," ACM TOG, 2023.</w:t>
+        <w:t xml:space="preserve">[11] Ben-David, S., et al. (2010). A theory of learning from different domains. Machine Learning, 79.</w:t>
       </w:r>
     </w:p>
     <w:p>
@@ -5308,7 +3860,7 @@
           <w:rFonts w:cstheme="minorHAnsi"/>
           <w:lang w:val="en-US"/>
         </w:rPr>
-        <w:t xml:space="preserve">[12] G. Chhablani et al., "EmbodiedSplat," ICCV, 2025.</w:t>
+        <w:t xml:space="preserve">[12] Ganin, Y., et al. (2016). Domain-adversarial training of neural networks. Journal of Machine Learning Research, 17.</w:t>
       </w:r>
     </w:p>
     <w:p>
@@ -5322,7 +3874,7 @@
           <w:rFonts w:cstheme="minorHAnsi"/>
           <w:lang w:val="en-US"/>
         </w:rPr>
-        <w:t xml:space="preserve">[13] Z. Xie et al., "Vid2Sim," CVPR, 2025.</w:t>
+        <w:t xml:space="preserve">[13] Mildenhall, B., et al. (2020). NeRF: Representing scenes as neural radiance fields for view synthesis. ECCV.</w:t>
       </w:r>
     </w:p>
     <w:p>
@@ -5336,7 +3888,7 @@
           <w:rFonts w:cstheme="minorHAnsi"/>
           <w:lang w:val="en-US"/>
         </w:rPr>
-        <w:t xml:space="preserve">[14] A. Escontrela et al., "GaussGym," arXiv:2510.15352, 2025.</w:t>
+        <w:t xml:space="preserve">[14] Kerbl, B., Kopanas, G., Leimkühler, T., &amp; Drettakis, G. (2023). 3D Gaussian splatting for real-time radiance field rendering. ACM Transactions on Graphics, 42(4).</w:t>
       </w:r>
     </w:p>
     <w:p>
@@ -5350,7 +3902,7 @@
           <w:rFonts w:cstheme="minorHAnsi"/>
           <w:lang w:val="en-US"/>
         </w:rPr>
-        <w:t xml:space="preserve">[15] S. Yoo et al., "ReaDy-Go," IEEE RA-L, 2026.</w:t>
+        <w:t xml:space="preserve">[15] Yeshwanth, C., Liu, Y.-C., Nießner, M., &amp; Dai, A. (2023). ScanNet++: A high-fidelity dataset of 3D indoor scenes. ICCV.</w:t>
       </w:r>
     </w:p>
     <w:p>
@@ -5364,7 +3916,7 @@
           <w:rFonts w:cstheme="minorHAnsi"/>
           <w:lang w:val="en-US"/>
         </w:rPr>
-        <w:t xml:space="preserve">[16] M. Torne et al., "Reconciling Reality through Simulation," RSS, 2024.</w:t>
+        <w:t xml:space="preserve">[16] Chhablani, G., et al. (2025). EmbodiedSplat. ICCV. arXiv:2509.17430.</w:t>
       </w:r>
     </w:p>
     <w:p>
@@ -5378,7 +3930,7 @@
           <w:rFonts w:cstheme="minorHAnsi"/>
           <w:lang w:val="en-US"/>
         </w:rPr>
-        <w:t xml:space="preserve">[17] P. Dan et al., "X-Sim," arXiv:2505.07096, 2025.</w:t>
+        <w:t xml:space="preserve">[17] Xie, Z., et al. (2025). Vid2Sim: Realistic and interactive simulation from video for urban navigation. CVPR.</w:t>
       </w:r>
     </w:p>
     <w:p>
@@ -5392,7 +3944,7 @@
           <w:rFonts w:cstheme="minorHAnsi"/>
           <w:lang w:val="en-US"/>
         </w:rPr>
-        <w:t xml:space="preserve">[18] Q. Xu et al., "TwinRL," arXiv:2602.09023, 2026.</w:t>
+        <w:t xml:space="preserve">[18] Torne, M., et al. (2024). Reconciling reality through simulation: A real-to-sim-to-real approach for robust manipulation. RSS.</w:t>
       </w:r>
     </w:p>
     <w:p>
@@ -5406,7 +3958,7 @@
           <w:rFonts w:cstheme="minorHAnsi"/>
           <w:lang w:val="en-US"/>
         </w:rPr>
-        <w:t xml:space="preserve">[19] F. Ramos et al., "BayesSim," RSS, 2019.</w:t>
+        <w:t xml:space="preserve">[19] Ramos, F., Possas, R., &amp; Fox, D. (2019). BayesSim: Adaptive domain randomization via probabilistic inference for robotics simulators. RSS.</w:t>
       </w:r>
     </w:p>
     <w:p>
@@ -5420,7 +3972,7 @@
           <w:rFonts w:cstheme="minorHAnsi"/>
           <w:lang w:val="en-US"/>
         </w:rPr>
-        <w:t xml:space="preserve">[20] M. Memmel et al., "ASID," arXiv:2404.12308, 2024.</w:t>
+        <w:t xml:space="preserve">[20] Shah, D., et al. (2023). GNM: A general navigation model to drive any robot. ICRA.</w:t>
       </w:r>
     </w:p>
     <w:p>
@@ -5434,7 +3986,7 @@
           <w:rFonts w:cstheme="minorHAnsi"/>
           <w:lang w:val="en-US"/>
         </w:rPr>
-        <w:t xml:space="preserve">[21] C. Yeshwanth et al., "ScanNet++," ICCV, 2023.</w:t>
+        <w:t xml:space="preserve">[21] Shah, D., et al. (2023). ViNT: A foundation model for visual navigation. CoRL.</w:t>
       </w:r>
     </w:p>
     <w:p>
@@ -5448,7 +4000,7 @@
           <w:rFonts w:cstheme="minorHAnsi"/>
           <w:lang w:val="en-US"/>
         </w:rPr>
-        <w:t xml:space="preserve">[22] X. Ren et al., "MuSHRoom," arXiv:2311.02778, 2023.</w:t>
+        <w:t xml:space="preserve">[22] Kim, M. J., et al. (2024). OpenVLA: An open-source vision-language-action model. CoRL.</w:t>
       </w:r>
     </w:p>
     <w:p>
@@ -5462,7 +4014,7 @@
           <w:rFonts w:cstheme="minorHAnsi"/>
           <w:lang w:val="en-US"/>
         </w:rPr>
-        <w:t xml:space="preserve">[23] W. Jiang et al., "FisherRF," ECCV, 2024.</w:t>
+        <w:t xml:space="preserve">[23] Oquab, M., et al. (2024). DINOv2: Learning robust visual features without supervision. TMLR.</w:t>
       </w:r>
     </w:p>
     <w:p>
@@ -5476,7 +4028,7 @@
           <w:rFonts w:cstheme="minorHAnsi"/>
           <w:lang w:val="en-US"/>
         </w:rPr>
-        <w:t xml:space="preserve">[24] L. Goli et al., "Bayes' Rays," CVPR, 2024.</w:t>
+        <w:t xml:space="preserve">[24] Bar, A., et al. (2025). Navigation world models. CVPR.</w:t>
       </w:r>
     </w:p>
     <w:p>
@@ -5490,189 +4042,7 @@
           <w:rFonts w:cstheme="minorHAnsi"/>
           <w:lang w:val="en-US"/>
         </w:rPr>
-        <w:t xml:space="preserve">[25] G. Liu et al., "Risk-Aware Active View Acquisition…," arXiv:2403.11396, 2024.</w:t>
-      </w:r>
-    </w:p>
-    <w:p>
-      <w:pPr>
-        <w:spacing w:after="0" w:line="240" w:lineRule="auto"/>
-        <w:ind w:left="397" w:hanging="397"/>
-        <w:jc w:val="left"/>
-      </w:pPr>
-      <w:r>
-        <w:rPr>
-          <w:rFonts w:cstheme="minorHAnsi"/>
-          <w:lang w:val="en-US"/>
-        </w:rPr>
-        <w:t xml:space="preserve">[26] T. Xu et al., "AREA3D," arXiv:2512.05131, 2025.</w:t>
-      </w:r>
-    </w:p>
-    <w:p>
-      <w:pPr>
-        <w:spacing w:after="0" w:line="240" w:lineRule="auto"/>
-        <w:ind w:left="397" w:hanging="397"/>
-        <w:jc w:val="left"/>
-      </w:pPr>
-      <w:r>
-        <w:rPr>
-          <w:rFonts w:cstheme="minorHAnsi"/>
-          <w:lang w:val="en-US"/>
-        </w:rPr>
-        <w:t xml:space="preserve">[27] D. Shah et al., "GNM," ICRA, 2023.</w:t>
-      </w:r>
-    </w:p>
-    <w:p>
-      <w:pPr>
-        <w:spacing w:after="0" w:line="240" w:lineRule="auto"/>
-        <w:ind w:left="397" w:hanging="397"/>
-        <w:jc w:val="left"/>
-      </w:pPr>
-      <w:r>
-        <w:rPr>
-          <w:rFonts w:cstheme="minorHAnsi"/>
-          <w:lang w:val="en-US"/>
-        </w:rPr>
-        <w:t xml:space="preserve">[28] D. Shah et al., "ViNT," CoRL, 2023.</w:t>
-      </w:r>
-    </w:p>
-    <w:p>
-      <w:pPr>
-        <w:spacing w:after="0" w:line="240" w:lineRule="auto"/>
-        <w:ind w:left="397" w:hanging="397"/>
-        <w:jc w:val="left"/>
-      </w:pPr>
-      <w:r>
-        <w:rPr>
-          <w:rFonts w:cstheme="minorHAnsi"/>
-          <w:lang w:val="en-US"/>
-        </w:rPr>
-        <w:t xml:space="preserve">[29] M. J. Kim et al., "OpenVLA," CoRL, 2024.</w:t>
-      </w:r>
-    </w:p>
-    <w:p>
-      <w:pPr>
-        <w:spacing w:after="0" w:line="240" w:lineRule="auto"/>
-        <w:ind w:left="397" w:hanging="397"/>
-        <w:jc w:val="left"/>
-      </w:pPr>
-      <w:r>
-        <w:rPr>
-          <w:rFonts w:cstheme="minorHAnsi"/>
-          <w:lang w:val="en-US"/>
-        </w:rPr>
-        <w:t xml:space="preserve">[30] A. Bar et al., "Navigation World Models," CVPR, 2025.</w:t>
-      </w:r>
-    </w:p>
-    <w:p>
-      <w:pPr>
-        <w:spacing w:after="0" w:line="240" w:lineRule="auto"/>
-        <w:ind w:left="397" w:hanging="397"/>
-        <w:jc w:val="left"/>
-      </w:pPr>
-      <w:r>
-        <w:rPr>
-          <w:rFonts w:cstheme="minorHAnsi"/>
-          <w:lang w:val="en-US"/>
-        </w:rPr>
-        <w:t xml:space="preserve">[31] N. Agarwal et al., "Cosmos World Foundation Model Platform…," arXiv:2501.03575, 2025.</w:t>
-      </w:r>
-    </w:p>
-    <w:p>
-      <w:pPr>
-        <w:spacing w:after="0" w:line="240" w:lineRule="auto"/>
-        <w:ind w:left="397" w:hanging="397"/>
-        <w:jc w:val="left"/>
-      </w:pPr>
-      <w:r>
-        <w:rPr>
-          <w:rFonts w:cstheme="minorHAnsi"/>
-          <w:lang w:val="en-US"/>
-        </w:rPr>
-        <w:t xml:space="preserve">[32] Y. Guo et al., "VLAW," arXiv:2602.12063, 2026.</w:t>
-      </w:r>
-    </w:p>
-    <w:p>
-      <w:pPr>
-        <w:spacing w:after="0" w:line="240" w:lineRule="auto"/>
-        <w:ind w:left="397" w:hanging="397"/>
-        <w:jc w:val="left"/>
-      </w:pPr>
-      <w:r>
-        <w:rPr>
-          <w:rFonts w:cstheme="minorHAnsi"/>
-          <w:lang w:val="en-US"/>
-        </w:rPr>
-        <w:t xml:space="preserve">[33] A. Badithela et al., "Reliable and Scalable Robot Policy Evaluation…," arXiv:2510.04354, 2025.</w:t>
-      </w:r>
-    </w:p>
-    <w:p>
-      <w:pPr>
-        <w:spacing w:after="0" w:line="240" w:lineRule="auto"/>
-        <w:ind w:left="397" w:hanging="397"/>
-        <w:jc w:val="left"/>
-      </w:pPr>
-      <w:r>
-        <w:rPr>
-          <w:rFonts w:cstheme="minorHAnsi"/>
-          <w:lang w:val="en-US"/>
-        </w:rPr>
-        <w:t xml:space="preserve">[34] M. Oquab et al., "DINOv2," TMLR, 2024.</w:t>
-      </w:r>
-    </w:p>
-    <w:p>
-      <w:pPr>
-        <w:spacing w:after="0" w:line="240" w:lineRule="auto"/>
-        <w:ind w:left="397" w:hanging="397"/>
-        <w:jc w:val="left"/>
-      </w:pPr>
-      <w:r>
-        <w:rPr>
-          <w:rFonts w:cstheme="minorHAnsi"/>
-          <w:lang w:val="en-US"/>
-        </w:rPr>
-        <w:t xml:space="preserve">[35] A. N. Angelopoulos et al., "Prediction-Powered Inference," Science, 2023.</w:t>
-      </w:r>
-    </w:p>
-    <w:p>
-      <w:pPr>
-        <w:spacing w:after="0" w:line="240" w:lineRule="auto"/>
-        <w:ind w:left="397" w:hanging="397"/>
-        <w:jc w:val="left"/>
-      </w:pPr>
-      <w:r>
-        <w:rPr>
-          <w:rFonts w:cstheme="minorHAnsi"/>
-          <w:lang w:val="en-US"/>
-        </w:rPr>
-        <w:t xml:space="preserve">[36] K. Chaloner, I. Verdinelli, "Bayesian Experimental Design: A Review," Statistical Science, 1995.</w:t>
-      </w:r>
-    </w:p>
-    <w:p>
-      <w:pPr>
-        <w:spacing w:after="0" w:line="240" w:lineRule="auto"/>
-        <w:ind w:left="397" w:hanging="397"/>
-        <w:jc w:val="left"/>
-      </w:pPr>
-      <w:r>
-        <w:rPr>
-          <w:rFonts w:cstheme="minorHAnsi"/>
-          <w:lang w:val="en-US"/>
-        </w:rPr>
-        <w:t xml:space="preserve">[37] T. Rainforth et al., "Modern Bayesian Experimental Design," Statistical Science, 2024.</w:t>
-      </w:r>
-    </w:p>
-    <w:p>
-      <w:pPr>
-        <w:spacing w:after="0" w:line="240" w:lineRule="auto"/>
-        <w:ind w:left="397" w:hanging="397"/>
-        <w:jc w:val="left"/>
-      </w:pPr>
-      <w:r>
-        <w:rPr>
-          <w:rFonts w:cstheme="minorHAnsi"/>
-          <w:lang w:val="en-US"/>
-        </w:rPr>
-        <w:t xml:space="preserve">[38] S. Ben-David et al., "A theory of learning from different domains," Machine Learning, 2010.</w:t>
+        <w:t xml:space="preserve">[25] Maddukuri, A., et al. (2025). Sim-and-real co-training: A simple recipe for vision-based robotic manipulation. RSS.</w:t>
       </w:r>
     </w:p>
     <w:permEnd w:id="174659581"/>
@@ -5904,342 +4274,125 @@
       <w:r>
         <w:rPr>
           <w:rFonts w:cstheme="minorHAnsi"/>
-          <w:b/>
-          <w:lang w:val="en-US"/>
-        </w:rPr>
-        <w:t xml:space="preserve">Scientific problem.</w:t>
-      </w:r>
-      <w:r>
-        <w:rPr>
-          <w:rFonts w:cstheme="minorHAnsi"/>
-          <w:lang w:val="en-US"/>
-        </w:rPr>
-        <w:t xml:space="preserve"> Learning with a digital twin is learning under distribution shift in which the learner can </w:t>
-      </w:r>
-      <w:r>
-        <w:rPr>
-          <w:rFonts w:cstheme="minorHAnsi"/>
-          <w:i/>
-          <w:lang w:val="en-US"/>
-        </w:rPr>
-        <w:t xml:space="preserve">buy</w:t>
-      </w:r>
-      <w:r>
-        <w:rPr>
-          <w:rFonts w:cstheme="minorHAnsi"/>
-          <w:lang w:val="en-US"/>
-        </w:rPr>
-        <w:t xml:space="preserve"> target-domain (real) data at a cost, at three points of the real-to-sim-to-real loop: to build the twin, to train in it and to correct the model in reality. How to allocate a scarce real-data budget across these points so that the loss of real-world performance is smallest is an open problem of sequential experimental design [36, 37] that has not been posed for the whole loop.</w:t>
-      </w:r>
-    </w:p>
-    <w:p>
-      <w:pPr>
-        <w:spacing w:after="120" w:line="240" w:lineRule="auto"/>
+          <w:lang w:val="en-US"/>
+        </w:rPr>
+        <w:t xml:space="preserve">The research carried out in the proposed doctoral dissertation is aimed at studying the following research questions.</w:t>
+      </w:r>
+    </w:p>
+    <w:p>
+      <w:pPr>
+        <w:spacing w:after="40" w:line="240" w:lineRule="auto"/>
+        <w:ind w:left="284" w:hanging="284"/>
         <w:jc w:val="both"/>
       </w:pPr>
       <w:r>
         <w:rPr>
           <w:rFonts w:cstheme="minorHAnsi"/>
-          <w:b/>
-          <w:lang w:val="en-US"/>
-        </w:rPr>
-        <w:t xml:space="preserve">Principle and theoretical claim.</w:t>
-      </w:r>
-      <w:r>
-        <w:rPr>
-          <w:rFonts w:cstheme="minorHAnsi"/>
-          <w:lang w:val="en-US"/>
-        </w:rPr>
-        <w:t xml:space="preserve"> The loop is formalised as sequential Bayesian experimental design in which each real datum (a view, an interaction, a trial) is valued by its </w:t>
-      </w:r>
-      <w:r>
-        <w:rPr>
-          <w:rFonts w:cstheme="minorHAnsi"/>
-          <w:b/>
-          <w:lang w:val="en-US"/>
-        </w:rPr>
-        <w:t xml:space="preserve">expected reduction of the twin-to-reality performance gap per unit cost</w:t>
-      </w:r>
-      <w:r>
-        <w:rPr>
-          <w:rFonts w:cstheme="minorHAnsi"/>
-          <w:lang w:val="en-US"/>
-        </w:rPr>
-        <w:t xml:space="preserve">. Following domain-adaptation theory [38], the real performance of a model trained in the twin is bounded by its twin performance plus a discrepancy term on the states the task visits; the dissertation derives a task-weighted, uncertainty-based estimate of this term and the conditions under which spending real data on it pays off. The three mechanisms of the method, (1) less capture, (2) better use of simulation, (3) fewer real trials, are instances of this one criterion.</w:t>
-      </w:r>
-    </w:p>
-    <w:p>
-      <w:pPr>
-        <w:spacing w:after="120" w:line="240" w:lineRule="auto"/>
+          <w:lang w:val="en-US"/>
+        </w:rPr>
+        <w:t xml:space="preserve">1.	</w:t>
+      </w:r>
+      <w:r>
+        <w:rPr>
+          <w:rFonts w:cstheme="minorHAnsi"/>
+          <w:b/>
+          <w:lang w:val="en-US"/>
+        </w:rPr>
+        <w:t xml:space="preserve">Which properties of a digital twin built from real data determine the generalization of models trained in it?</w:t>
+      </w:r>
+      <w:r>
+        <w:rPr>
+          <w:rFonts w:cstheme="minorHAnsi"/>
+          <w:lang w:val="en-US"/>
+        </w:rPr>
+        <w:t xml:space="preserve"> A digital twin reproduces the appearance, geometry, lighting and physical properties of a real scene only approximately, and the errors differ between regions of the scene. It is hypothesized that not all of these errors are equally harmful, and that a model generalizes better to reality when the twin is accurate and varied where it matters for the task and where the reconstruction is uncertain, rather than randomized uniformly. The research should identify these properties and develop a method for building and varying digital twins accordingly.</w:t>
+      </w:r>
+    </w:p>
+    <w:p>
+      <w:pPr>
+        <w:spacing w:after="40" w:line="240" w:lineRule="auto"/>
+        <w:ind w:left="284" w:hanging="284"/>
         <w:jc w:val="both"/>
       </w:pPr>
       <w:r>
         <w:rPr>
           <w:rFonts w:cstheme="minorHAnsi"/>
-          <w:b/>
-          <w:lang w:val="en-US"/>
-        </w:rPr>
-        <w:t xml:space="preserve">Thesis.</w:t>
-      </w:r>
-      <w:r>
-        <w:rPr>
-          <w:rFonts w:cstheme="minorHAnsi"/>
-          <w:lang w:val="en-US"/>
-        </w:rPr>
-        <w:t xml:space="preserve"> Allocating real data by its expected gap reduction, rather than uniformly or by hand, makes the loop at least twice as economical in real data as the strongest existing real-to-sim-to-real approach.</w:t>
-      </w:r>
-    </w:p>
-    <w:p>
-      <w:pPr>
-        <w:spacing w:after="120" w:line="240" w:lineRule="auto"/>
+          <w:lang w:val="en-US"/>
+        </w:rPr>
+        <w:t xml:space="preserve">2.	</w:t>
+      </w:r>
+      <w:r>
+        <w:rPr>
+          <w:rFonts w:cstheme="minorHAnsi"/>
+          <w:b/>
+          <w:lang w:val="en-US"/>
+        </w:rPr>
+        <w:t xml:space="preserve">How to learn representations that are invariant to the difference between simulation and reality?</w:t>
+      </w:r>
+      <w:r>
+        <w:rPr>
+          <w:rFonts w:cstheme="minorHAnsi"/>
+          <w:lang w:val="en-US"/>
+        </w:rPr>
+        <w:t xml:space="preserve"> Models trained in a digital twin tend to exploit features that do not exist in reality, such as reconstruction artifacts. Pretrained foundation models and self-supervised encoders provide robust representations, but it is not known how they behave under the shift between a twin and reality. It is hypothesized that training objectives which enforce invariance between paired observations from the twin and from reality, possibly supported by learned world models, reduce the generalization gap. The research should also examine where in the model this gap arises.</w:t>
+      </w:r>
+    </w:p>
+    <w:p>
+      <w:pPr>
+        <w:spacing w:after="40" w:line="240" w:lineRule="auto"/>
+        <w:ind w:left="284" w:hanging="284"/>
         <w:jc w:val="both"/>
       </w:pPr>
       <w:r>
         <w:rPr>
           <w:rFonts w:cstheme="minorHAnsi"/>
-          <w:b/>
-          <w:lang w:val="en-US"/>
-        </w:rPr>
-        <w:t xml:space="preserve">How the hypotheses are decided.</w:t>
-      </w:r>
-      <w:r>
-        <w:rPr>
-          <w:rFonts w:cstheme="minorHAnsi"/>
-          <w:lang w:val="en-US"/>
-        </w:rPr>
-        <w:t xml:space="preserve"> Real effort is counted in </w:t>
-      </w:r>
-      <w:r>
-        <w:rPr>
-          <w:rFonts w:cstheme="minorHAnsi"/>
-          <w:b/>
-          <w:lang w:val="en-US"/>
-        </w:rPr>
-        <w:t xml:space="preserve">operator minutes</w:t>
-      </w:r>
-      <w:r>
-        <w:rPr>
-          <w:rFonts w:cstheme="minorHAnsi"/>
-          <w:lang w:val="en-US"/>
-        </w:rPr>
-        <w:t xml:space="preserve"> on one budget grid; P is the success rate in "reality" and the target P a fraction of the baseline's plateau. Decisions are made on a non-circular proxy reality from public scans of real buildings, with pre-registered baselines; a real robot validates the direction and the proxy. Navigation decides H1–H4; manipulation tests the same method, unchanged. Details are in §9.</w:t>
-      </w:r>
-    </w:p>
-    <w:p>
-      <w:pPr>
-        <w:spacing w:after="120" w:line="240" w:lineRule="auto"/>
+          <w:lang w:val="en-US"/>
+        </w:rPr>
+        <w:t xml:space="preserve">3.	</w:t>
+      </w:r>
+      <w:r>
+        <w:rPr>
+          <w:rFonts w:cstheme="minorHAnsi"/>
+          <w:b/>
+          <w:lang w:val="en-US"/>
+        </w:rPr>
+        <w:t xml:space="preserve">How to adapt a model trained in simulation to reality using a small amount of real data?</w:t>
+      </w:r>
+      <w:r>
+        <w:rPr>
+          <w:rFonts w:cstheme="minorHAnsi"/>
+          <w:lang w:val="en-US"/>
+        </w:rPr>
+        <w:t xml:space="preserve"> Some difference between the twin and reality always remains. It is hypothesized that selecting the real data where the twin and reality disagree the most allows the model, and the twin itself, to be corrected with much less real data than random selection.</w:t>
+      </w:r>
+    </w:p>
+    <w:p>
+      <w:pPr>
+        <w:spacing w:after="0" w:line="240" w:lineRule="auto"/>
+        <w:ind w:left="284" w:hanging="284"/>
         <w:jc w:val="both"/>
       </w:pPr>
       <w:r>
         <w:rPr>
           <w:rFonts w:cstheme="minorHAnsi"/>
-          <w:b/>
-          <w:lang w:val="en-US"/>
-        </w:rPr>
-        <w:t xml:space="preserve">RQ1 (step 1).</w:t>
-      </w:r>
-      <w:r>
-        <w:rPr>
-          <w:rFonts w:cstheme="minorHAnsi"/>
-          <w:lang w:val="en-US"/>
-        </w:rPr>
-        <w:t xml:space="preserve"> Which real data is worth acquiring to build the twin? </w:t>
-      </w:r>
-      <w:r>
-        <w:rPr>
-          <w:rFonts w:cstheme="minorHAnsi"/>
-          <w:b/>
-          <w:lang w:val="en-US"/>
-        </w:rPr>
-        <w:t xml:space="preserve">H1.</w:t>
-      </w:r>
-      <w:r>
-        <w:rPr>
-          <w:rFonts w:cstheme="minorHAnsi"/>
-          <w:lang w:val="en-US"/>
-        </w:rPr>
-        <w:t xml:space="preserve"> Capture chosen by the criterion reaches the P of uniform capture with </w:t>
-      </w:r>
-      <w:r>
-        <w:rPr>
-          <w:rFonts w:cstheme="minorHAnsi"/>
-          <w:b/>
-          <w:lang w:val="en-US"/>
-        </w:rPr>
-        <w:t xml:space="preserve">at least 40% less capture</w:t>
-      </w:r>
-      <w:r>
-        <w:rPr>
-          <w:rFonts w:cstheme="minorHAnsi"/>
-          <w:lang w:val="en-US"/>
-        </w:rPr>
-        <w:t xml:space="preserve">.</w:t>
-      </w:r>
-    </w:p>
-    <w:p>
-      <w:pPr>
-        <w:spacing w:after="120" w:line="240" w:lineRule="auto"/>
-        <w:jc w:val="both"/>
-      </w:pPr>
-      <w:r>
-        <w:rPr>
-          <w:rFonts w:cstheme="minorHAnsi"/>
-          <w:b/>
-          <w:lang w:val="en-US"/>
-        </w:rPr>
-        <w:t xml:space="preserve">RQ2 (step 2).</w:t>
-      </w:r>
-      <w:r>
-        <w:rPr>
-          <w:rFonts w:cstheme="minorHAnsi"/>
-          <w:lang w:val="en-US"/>
-        </w:rPr>
-        <w:t xml:space="preserve"> How should the model be trained so that the twin's errors do not transfer? </w:t>
-      </w:r>
-      <w:r>
-        <w:rPr>
-          <w:rFonts w:cstheme="minorHAnsi"/>
-          <w:b/>
-          <w:lang w:val="en-US"/>
-        </w:rPr>
-        <w:t xml:space="preserve">H2.</w:t>
-      </w:r>
-      <w:r>
-        <w:rPr>
-          <w:rFonts w:cstheme="minorHAnsi"/>
-          <w:lang w:val="en-US"/>
-        </w:rPr>
-        <w:t xml:space="preserve"> At the same budget, training weighted by the twin's uncertainty gives a P </w:t>
-      </w:r>
-      <w:r>
-        <w:rPr>
-          <w:rFonts w:cstheme="minorHAnsi"/>
-          <w:b/>
-          <w:lang w:val="en-US"/>
-        </w:rPr>
-        <w:t xml:space="preserve">at least 10 pp higher</w:t>
-      </w:r>
-      <w:r>
-        <w:rPr>
-          <w:rFonts w:cstheme="minorHAnsi"/>
-          <w:lang w:val="en-US"/>
-        </w:rPr>
-        <w:t xml:space="preserve"> than uniform domain randomization, in a pre-registered regime where the baseline succeeds in ≤ ~75% of episodes; a learned world model filling the twin's gaps is an ablation.</w:t>
-      </w:r>
-    </w:p>
-    <w:p>
-      <w:pPr>
-        <w:spacing w:after="120" w:line="240" w:lineRule="auto"/>
-        <w:jc w:val="both"/>
-      </w:pPr>
-      <w:r>
-        <w:rPr>
-          <w:rFonts w:cstheme="minorHAnsi"/>
-          <w:b/>
-          <w:lang w:val="en-US"/>
-        </w:rPr>
-        <w:t xml:space="preserve">RQ3 (step 3).</w:t>
-      </w:r>
-      <w:r>
-        <w:rPr>
-          <w:rFonts w:cstheme="minorHAnsi"/>
-          <w:lang w:val="en-US"/>
-        </w:rPr>
-        <w:t xml:space="preserve"> Which few real trials correct the twin and the model best? </w:t>
-      </w:r>
-      <w:r>
-        <w:rPr>
-          <w:rFonts w:cstheme="minorHAnsi"/>
-          <w:b/>
-          <w:lang w:val="en-US"/>
-        </w:rPr>
-        <w:t xml:space="preserve">H3.</w:t>
-      </w:r>
-      <w:r>
-        <w:rPr>
-          <w:rFonts w:cstheme="minorHAnsi"/>
-          <w:lang w:val="en-US"/>
-        </w:rPr>
-        <w:t xml:space="preserve"> Trials chosen by the predicted gap reach the target P with </w:t>
-      </w:r>
-      <w:r>
-        <w:rPr>
-          <w:rFonts w:cstheme="minorHAnsi"/>
-          <w:b/>
-          <w:lang w:val="en-US"/>
-        </w:rPr>
-        <w:t xml:space="preserve">at least 50% fewer trials</w:t>
-      </w:r>
-      <w:r>
-        <w:rPr>
-          <w:rFonts w:cstheme="minorHAnsi"/>
-          <w:lang w:val="en-US"/>
-        </w:rPr>
-        <w:t xml:space="preserve"> than random ones, and fewer than a failure-driven rule, if the twin predicts reality well enough (minimum sim-vs-real correlation, §9).</w:t>
-      </w:r>
-    </w:p>
-    <w:p>
-      <w:pPr>
-        <w:spacing w:after="120" w:line="240" w:lineRule="auto"/>
-        <w:jc w:val="both"/>
-      </w:pPr>
-      <w:r>
-        <w:rPr>
-          <w:rFonts w:cstheme="minorHAnsi"/>
-          <w:b/>
-          <w:lang w:val="en-US"/>
-        </w:rPr>
-        <w:t xml:space="preserve">RQ4 (theory and the whole loop).</w:t>
-      </w:r>
-      <w:r>
-        <w:rPr>
-          <w:rFonts w:cstheme="minorHAnsi"/>
-          <w:lang w:val="en-US"/>
-        </w:rPr>
-        <w:t xml:space="preserve"> When and why can twin data replace real data? </w:t>
-      </w:r>
-      <w:r>
-        <w:rPr>
-          <w:rFonts w:cstheme="minorHAnsi"/>
-          <w:b/>
-          <w:lang w:val="en-US"/>
-        </w:rPr>
-        <w:t xml:space="preserve">H4 (thesis).</w:t>
-      </w:r>
-      <w:r>
-        <w:rPr>
-          <w:rFonts w:cstheme="minorHAnsi"/>
-          <w:lang w:val="en-US"/>
-        </w:rPr>
-        <w:t xml:space="preserve"> The whole method reaches the target P with </w:t>
-      </w:r>
-      <w:r>
-        <w:rPr>
-          <w:rFonts w:cstheme="minorHAnsi"/>
-          <w:b/>
-          <w:lang w:val="en-US"/>
-        </w:rPr>
-        <w:t xml:space="preserve">at least 2× less real data</w:t>
-      </w:r>
-      <w:r>
-        <w:rPr>
-          <w:rFonts w:cstheme="minorHAnsi"/>
-          <w:lang w:val="en-US"/>
-        </w:rPr>
-        <w:t xml:space="preserve"> than the strongest existing approach (assembled, pre-registered, same budget), and the savings follow the conditions predicted by the theory: they grow with the twin-to-reality correlation and with how concentrated the gap is. In manipulation the effects keep their sign.</w:t>
-      </w:r>
-    </w:p>
-    <w:p>
-      <w:pPr>
-        <w:spacing w:after="0" w:line="240" w:lineRule="auto"/>
-        <w:jc w:val="both"/>
-      </w:pPr>
-      <w:r>
-        <w:rPr>
-          <w:rFonts w:cstheme="minorHAnsi"/>
-          <w:lang w:val="en-US"/>
-        </w:rPr>
-        <w:t xml:space="preserve">A hypothesis that fails is reported as a measured curve, which still answers its question.</w:t>
+          <w:lang w:val="en-US"/>
+        </w:rPr>
+        <w:t xml:space="preserve">4.	</w:t>
+      </w:r>
+      <w:r>
+        <w:rPr>
+          <w:rFonts w:cstheme="minorHAnsi"/>
+          <w:b/>
+          <w:lang w:val="en-US"/>
+        </w:rPr>
+        <w:t xml:space="preserve">Do the improvements generalize to unseen environments and to other physical tasks?</w:t>
+      </w:r>
+      <w:r>
+        <w:rPr>
+          <w:rFonts w:cstheme="minorHAnsi"/>
+          <w:lang w:val="en-US"/>
+        </w:rPr>
+        <w:t xml:space="preserve"> A valuable method should not be tied to a single scene or task. Therefore, the developed methods shall be examined on environments not seen during training and on two different physical tasks, robot navigation and robotic manipulation, to verify that the improvements in generalization are general.</w:t>
       </w:r>
     </w:p>
     <w:permEnd w:id="1295260508"/>
@@ -6519,52 +4672,7 @@
           <w:rFonts w:cstheme="minorHAnsi"/>
           <w:lang w:val="en-US"/>
         </w:rPr>
-        <w:t xml:space="preserve">The dissertation is in </w:t>
-      </w:r>
-      <w:r>
-        <w:rPr>
-          <w:rFonts w:cstheme="minorHAnsi"/>
-          <w:b/>
-          <w:lang w:val="en-US"/>
-        </w:rPr>
-        <w:t xml:space="preserve">information and communication technology</w:t>
-      </w:r>
-      <w:r>
-        <w:rPr>
-          <w:rFonts w:cstheme="minorHAnsi"/>
-          <w:lang w:val="en-US"/>
-        </w:rPr>
-        <w:t xml:space="preserve"> (</w:t>
-      </w:r>
-      <w:r>
-        <w:rPr>
-          <w:rFonts w:cstheme="minorHAnsi"/>
-          <w:i/>
-          <w:lang w:val="en-US"/>
-        </w:rPr>
-        <w:t xml:space="preserve">informatyka techniczna i telekomunikacja</w:t>
-      </w:r>
-      <w:r>
-        <w:rPr>
-          <w:rFonts w:cstheme="minorHAnsi"/>
-          <w:lang w:val="en-US"/>
-        </w:rPr>
-        <w:t xml:space="preserve">), area machine learning. Its object is the </w:t>
-      </w:r>
-      <w:r>
-        <w:rPr>
-          <w:rFonts w:cstheme="minorHAnsi"/>
-          <w:b/>
-          <w:lang w:val="en-US"/>
-        </w:rPr>
-        <w:t xml:space="preserve">real-to-sim-to-real loop of robot learning and the real data it consumes</w:t>
-      </w:r>
-      <w:r>
-        <w:rPr>
-          <w:rFonts w:cstheme="minorHAnsi"/>
-          <w:lang w:val="en-US"/>
-        </w:rPr>
-        <w:t xml:space="preserve">: transferring real-world data into a digital twin, training a model in it and transferring the model back to reality. Building simulators, world models, foundation models or benchmarks from scratch, control design and mechanical engineering are not the object of the research; the student uses existing tools, pretrained models and public data.</w:t>
+        <w:t xml:space="preserve">The proposed Ph.D. dissertation aims to introduce several contributions to the development of the scientific discipline. First and foremost, the research is intended to provide new methods that improve the generalization of deep learning models trained in simulations built from real data, which is one of the main obstacles in applying machine learning to physical AI. The methods are intended to be general, i.e., not tied to a particular robot, scene or task, and are planned to be evaluated on robot navigation and robotic manipulation.</w:t>
       </w:r>
     </w:p>
     <w:p>
@@ -6575,23 +4683,14 @@
       <w:r>
         <w:rPr>
           <w:rFonts w:cstheme="minorHAnsi"/>
-          <w:b/>
-          <w:lang w:val="en-US"/>
-        </w:rPr>
-        <w:t xml:space="preserve">Key original contribution: a scientific answer to how real data should be spent.</w:t>
-      </w:r>
-      <w:r>
-        <w:rPr>
-          <w:rFonts w:cstheme="minorHAnsi"/>
-          <w:lang w:val="en-US"/>
-        </w:rPr>
-        <w:t xml:space="preserve"> (i) A formulation of the real-to-sim-to-real loop as sequential experimental design over a real-data budget, with one criterion (expected reduction of the twin-to-reality performance gap per unit cost) and a domain-adaptation-style bound [38] that states when twin data can replace real data; (ii) a method that instantiates this criterion at every step of the loop and reaches a given real-world performance with at least two times less real data than the strongest existing approach (RQ4, H4); (iii) empirical knowledge of when and why the savings arise. What is new is not the twin but the principled spending of real data. The three mechanisms are instances of the criterion, each tested at its own step:</w:t>
-      </w:r>
-    </w:p>
-    <w:p>
-      <w:pPr>
-        <w:spacing w:after="40" w:line="240" w:lineRule="auto"/>
-        <w:ind w:left="284" w:hanging="284"/>
+          <w:lang w:val="en-US"/>
+        </w:rPr>
+        <w:t xml:space="preserve">Furthermore, the research seeks to provide a better understanding of the sim-to-real generalization gap: which properties of a digital twin matter for the generalization of the trained model, and where in the model the gap arises. Such knowledge could introduce new perspectives for the design of simulations and of training procedures, and could help to build more principled and interpretable approaches than the currently dominating randomization heuristics. Since the sim-to-real problem is an instance of learning under distribution shift, the findings are also expected to be relevant to domain adaptation, representation learning and the adaptation of pretrained foundation models in general.</w:t>
+      </w:r>
+    </w:p>
+    <w:p>
+      <w:pPr>
+        <w:spacing w:after="0" w:line="240" w:lineRule="auto"/>
         <w:jc w:val="both"/>
       </w:pPr>
       <w:r>
@@ -6599,164 +4698,7 @@
           <w:rFonts w:cstheme="minorHAnsi"/>
           <w:lang w:val="en-US"/>
         </w:rPr>
-        <w:t xml:space="preserve">1.	</w:t>
-      </w:r>
-      <w:r>
-        <w:rPr>
-          <w:rFonts w:cstheme="minorHAnsi"/>
-          <w:b/>
-          <w:lang w:val="en-US"/>
-        </w:rPr>
-        <w:t xml:space="preserve">Less capture (RQ1, H1).</w:t>
-      </w:r>
-      <w:r>
-        <w:rPr>
-          <w:rFonts w:cstheme="minorHAnsi"/>
-          <w:lang w:val="en-US"/>
-        </w:rPr>
-        <w:t xml:space="preserve"> Capture of real data guided by what matters for the task and by where the twin is still uncertain, for appearance, geometry and the physical properties the task needs; compared with uniform capture and with task-blind and task-weighted selection aimed at reconstruction quality.</w:t>
-      </w:r>
-    </w:p>
-    <w:p>
-      <w:pPr>
-        <w:spacing w:after="40" w:line="240" w:lineRule="auto"/>
-        <w:ind w:left="284" w:hanging="284"/>
-        <w:jc w:val="both"/>
-      </w:pPr>
-      <w:r>
-        <w:rPr>
-          <w:rFonts w:cstheme="minorHAnsi"/>
-          <w:lang w:val="en-US"/>
-        </w:rPr>
-        <w:t xml:space="preserve">2.	</w:t>
-      </w:r>
-      <w:r>
-        <w:rPr>
-          <w:rFonts w:cstheme="minorHAnsi"/>
-          <w:b/>
-          <w:lang w:val="en-US"/>
-        </w:rPr>
-        <w:t xml:space="preserve">Better use of simulation (RQ2, H2).</w:t>
-      </w:r>
-      <w:r>
-        <w:rPr>
-          <w:rFonts w:cstheme="minorHAnsi"/>
-          <w:lang w:val="en-US"/>
-        </w:rPr>
-        <w:t xml:space="preserve"> Training that follows the twin's uncertainty, so that its errors do not transfer, with a learned world model filling the twin's gaps; compared with uniform and with no domain randomization.</w:t>
-      </w:r>
-    </w:p>
-    <w:p>
-      <w:pPr>
-        <w:spacing w:after="40" w:line="240" w:lineRule="auto"/>
-        <w:ind w:left="284" w:hanging="284"/>
-        <w:jc w:val="both"/>
-      </w:pPr>
-      <w:r>
-        <w:rPr>
-          <w:rFonts w:cstheme="minorHAnsi"/>
-          <w:lang w:val="en-US"/>
-        </w:rPr>
-        <w:t xml:space="preserve">3.	</w:t>
-      </w:r>
-      <w:r>
-        <w:rPr>
-          <w:rFonts w:cstheme="minorHAnsi"/>
-          <w:b/>
-          <w:lang w:val="en-US"/>
-        </w:rPr>
-        <w:t xml:space="preserve">Fewer real trials (RQ3, H3).</w:t>
-      </w:r>
-      <w:r>
-        <w:rPr>
-          <w:rFonts w:cstheme="minorHAnsi"/>
-          <w:lang w:val="en-US"/>
-        </w:rPr>
-        <w:t xml:space="preserve"> Selection of the few real trials that the predicted twin-to-reality gap marks as most informative, used to correct both the twin and the model; compared with random and with failure-driven selection.</w:t>
-      </w:r>
-    </w:p>
-    <w:p>
-      <w:pPr>
-        <w:spacing w:after="120" w:line="240" w:lineRule="auto"/>
-        <w:jc w:val="both"/>
-      </w:pPr>
-      <w:r>
-        <w:rPr>
-          <w:rFonts w:cstheme="minorHAnsi"/>
-          <w:b/>
-          <w:lang w:val="en-US"/>
-        </w:rPr>
-        <w:t xml:space="preserve">Generalization.</w:t>
-      </w:r>
-      <w:r>
-        <w:rPr>
-          <w:rFonts w:cstheme="minorHAnsi"/>
-          <w:lang w:val="en-US"/>
-        </w:rPr>
-        <w:t xml:space="preserve"> H1–H4 are decided in indoor robot navigation; the same method, unchanged, is then run in robotic manipulation as a generalization test, with no separate thresholds.</w:t>
-      </w:r>
-    </w:p>
-    <w:p>
-      <w:pPr>
-        <w:spacing w:after="120" w:line="240" w:lineRule="auto"/>
-        <w:jc w:val="both"/>
-      </w:pPr>
-      <w:r>
-        <w:rPr>
-          <w:rFonts w:cstheme="minorHAnsi"/>
-          <w:b/>
-          <w:lang w:val="en-US"/>
-        </w:rPr>
-        <w:t xml:space="preserve">How it is evaluated and released</w:t>
-      </w:r>
-      <w:r>
-        <w:rPr>
-          <w:rFonts w:cstheme="minorHAnsi"/>
-          <w:lang w:val="en-US"/>
-        </w:rPr>
-        <w:t xml:space="preserve"> (supporting, not contributions in their own right). Curves of success against operator minutes on a shared budget grid, against pre-registered baselines and learning from real data only; a proxy-reality protocol on public scans of real buildings that counts real data exactly without a robot (a separate, higher-fidelity reference with hidden physical parameters plays "reality"), validated against a real robot; and open code, configurations, scene lists, seeds and pre-registrations, built on existing tools.</w:t>
-      </w:r>
-    </w:p>
-    <w:p>
-      <w:pPr>
-        <w:spacing w:after="120" w:line="240" w:lineRule="auto"/>
-        <w:jc w:val="both"/>
-      </w:pPr>
-      <w:r>
-        <w:rPr>
-          <w:rFonts w:cstheme="minorHAnsi"/>
-          <w:b/>
-          <w:lang w:val="en-US"/>
-        </w:rPr>
-        <w:t xml:space="preserve">Significance for the discipline.</w:t>
-      </w:r>
-      <w:r>
-        <w:rPr>
-          <w:rFonts w:cstheme="minorHAnsi"/>
-          <w:lang w:val="en-US"/>
-        </w:rPr>
-        <w:t xml:space="preserve"> Real target-domain data is the main cost of deploying learned systems; a method that decides where it is worth spending, and a measured estimate of how much of it a twin can replace, are relevant to active learning, learning under distribution shift, uncertainty estimation and adaptation of pretrained models in general, beyond robotics.</w:t>
-      </w:r>
-    </w:p>
-    <w:p>
-      <w:pPr>
-        <w:spacing w:after="0" w:line="240" w:lineRule="auto"/>
-        <w:jc w:val="both"/>
-      </w:pPr>
-      <w:r>
-        <w:rPr>
-          <w:rFonts w:cstheme="minorHAnsi"/>
-          <w:b/>
-          <w:lang w:val="en-US"/>
-        </w:rPr>
-        <w:t xml:space="preserve">Dissemination.</w:t>
-      </w:r>
-      <w:r>
-        <w:rPr>
-          <w:rFonts w:cstheme="minorHAnsi"/>
-          <w:lang w:val="en-US"/>
-        </w:rPr>
-        <w:t xml:space="preserve"> Results are planned for peer-reviewed conferences worth 200 points and assigned to ITiT on the ministerial list of 5.01.2024: NeurIPS, ICML and ICLR (machine learning) and CVPR (computer vision), with ICCV and ECCV for resubmissions. P1 (mechanism 1, RQ1, in navigation) targets NeurIPS 2027; P2 (mechanisms 2–3, RQ2–RQ3, in navigation, with first manipulation results) ICML 2028 or CVPR 2028; P3 (the whole method against existing approaches, RQ4, with the generalization to manipulation) NeurIPS 2028, with ICLR 2029 as the fallback.</w:t>
+        <w:t xml:space="preserve">Finally, the developed methods for adapting models to reality with a small amount of real data could reduce the cost of deploying learning-based robots in new environments. The source code and the experimental setups are planned to be released, which could facilitate further research in the field and attract other researchers. Apart from purely scientific results, the methods could be used in real-world applications such as service, logistic and inspection robotics.</w:t>
       </w:r>
     </w:p>
     <w:permEnd w:id="1098318749"/>
@@ -7035,22 +4977,7 @@
           <w:rFonts w:cstheme="minorHAnsi"/>
           <w:lang w:val="en-US"/>
         </w:rPr>
-        <w:t xml:space="preserve">The dissertation develops </w:t>
-      </w:r>
-      <w:r>
-        <w:rPr>
-          <w:rFonts w:cstheme="minorHAnsi"/>
-          <w:b/>
-          <w:lang w:val="en-US"/>
-        </w:rPr>
-        <w:t xml:space="preserve">one method</w:t>
-      </w:r>
-      <w:r>
-        <w:rPr>
-          <w:rFonts w:cstheme="minorHAnsi"/>
-          <w:lang w:val="en-US"/>
-        </w:rPr>
-        <w:t xml:space="preserve"> with three reduction mechanisms, one per step of the real-to-sim-to-real loop: less capture, better use of simulation, fewer real trials. Each mechanism is developed and tested at its own step (RQ1–RQ3); the whole method is then tested against the strongest existing approach (RQ4). Existing open tools that run on the data-centre GPUs of WCSS and PLGrid are used throughout (Habitat-Sim/Lab [1], an open 3DGS library, COLMAP); nothing is built from scratch.</w:t>
+        <w:t xml:space="preserve">The research will follow the methods commonly adopted in machine learning and robot learning projects. Since there is no mathematically proven practice for achieving generalization from simulation to reality, the dominant part of the research will be based on empirical methods. The proposed methods will be described theoretically, and their properties or bounds will be analysed whenever possible, in particular with the use of domain adaptation theory.</w:t>
       </w:r>
     </w:p>
     <w:p>
@@ -7061,17 +4988,9 @@
       <w:r>
         <w:rPr>
           <w:rFonts w:cstheme="minorHAnsi"/>
-          <w:b/>
-          <w:lang w:val="en-US"/>
-        </w:rPr>
-        <w:t xml:space="preserve">Theoretical part (RQ4; sem. 3–5, then refined).</w:t>
-      </w:r>
-      <w:r>
-        <w:rPr>
-          <w:rFonts w:cstheme="minorHAnsi"/>
-          <w:lang w:val="en-US"/>
-        </w:rPr>
-        <w:t xml:space="preserve"> The loop is written as sequential Bayesian experimental design [36, 37]: a posterior over the twin (geometry, appearance, physical parameters) and over the model's twin-to-reality gap, updated by each real datum. A task-weighted discrepancy bound in the spirit of [38] links the twin's uncertainty on the states the task visits to the loss of real performance; the acquisition criterion (expected gap reduction per operator minute) follows from it and is used at all three steps. The predictions of the analysis, when each mechanism saves data and how much, are tested against the measured budget curves (H4).</w:t>
+          <w:lang w:val="en-US"/>
+        </w:rPr>
+        <w:t xml:space="preserve">Digital twins will be built from real captures of indoor scenes using neural scene reconstruction methods (3D Gaussian Splatting and related methods) and structure-from-motion tools, and imported into robot simulators (e.g. Habitat for navigation and ManiSkill3 for manipulation). Experiments will be conducted mainly on public datasets of real scenes, such as ScanNet++ and MuSHRoom, which contain captures of the same scenes made with different devices. This allows building the twin from one capture and using a separate, higher-fidelity capture as a reference for "reality", so that the sim-to-real gap can be studied in a controlled way on many scenes without an own robot. Navigation and manipulation models will be trained with reinforcement and imitation learning, starting from pretrained foundation models whenever possible. The results will be validated on a real mobile robot in rooms at the university, in cooperation with the robotics laboratories of Wrocław University of Science and Technology.</w:t>
       </w:r>
     </w:p>
     <w:p>
@@ -7082,32 +5001,9 @@
       <w:r>
         <w:rPr>
           <w:rFonts w:cstheme="minorHAnsi"/>
-          <w:b/>
-          <w:lang w:val="en-US"/>
-        </w:rPr>
-        <w:t xml:space="preserve">Real data: one unit, one grid.</w:t>
-      </w:r>
-      <w:r>
-        <w:rPr>
-          <w:rFonts w:cstheme="minorHAnsi"/>
-          <w:lang w:val="en-US"/>
-        </w:rPr>
-        <w:t xml:space="preserve"> All real effort is counted in </w:t>
-      </w:r>
-      <w:r>
-        <w:rPr>
-          <w:rFonts w:cstheme="minorHAnsi"/>
-          <w:b/>
-          <w:lang w:val="en-US"/>
-        </w:rPr>
-        <w:t xml:space="preserve">operator minutes</w:t>
-      </w:r>
-      <w:r>
-        <w:rPr>
-          <w:rFonts w:cstheme="minorHAnsi"/>
-          <w:lang w:val="en-US"/>
-        </w:rPr>
-        <w:t xml:space="preserve"> B = capture + demonstrations + on-robot trials with resets; raw counts (frames, trials) are reported. Every approach gets the same budget grid, e.g. B ∈ {5, 10, 20, 40, 80} min, the same initialization, compute in the twin and test episodes. Each comparison yields the budget at which an approach reaches the target P, with a scene-level bootstrap interval for the budget ratio. The target P is a fraction of the baseline's plateau (e.g. 90% of its P at the largest budget), so "40%" and "2×" stay well defined when the baseline's curve flattens.</w:t>
+          <w:lang w:val="en-US"/>
+        </w:rPr>
+        <w:t xml:space="preserve">The quantitative evaluation will rely on standard metrics for embodied tasks, such as success rate and success weighted by path length, and on the generalization gap, i.e., the difference between the performance in simulation and in reality. Particular attention will be paid to generalization, so the evaluation will separate the scenes used for training from unseen scenes, and will include a second physical task. Statistical methods will be leveraged to provide reliable outcomes, including repeated experiments with different random seeds and statistical tests for comparisons with baseline methods. Qualitative evaluation will focus on analysing the learned representations, e.g. by probing, visualizing the latent space and analysing failure cases.</w:t>
       </w:r>
     </w:p>
     <w:p>
@@ -7118,434 +5014,22 @@
       <w:r>
         <w:rPr>
           <w:rFonts w:cstheme="minorHAnsi"/>
-          <w:b/>
-          <w:lang w:val="en-US"/>
-        </w:rPr>
-        <w:t xml:space="preserve">Proxy reality (decides H1–H4).</w:t>
-      </w:r>
-      <w:r>
-        <w:rPr>
-          <w:rFonts w:cstheme="minorHAnsi"/>
-          <w:lang w:val="en-US"/>
-        </w:rPr>
-        <w:t xml:space="preserve"> On ≥ 20 scenes of ScanNet++ [21] (10 held out; licence signed by the supervisor; derived twins not published) and the rooms of MuSHRoom [22] (open licence; twins releasable), "reality" is the laser-scan mesh textured from the DSLR images and rendered in Habitat with a robot-camera model, with its own physical parameters (e.g. actuation noise, friction) hidden from the method and learned only from counted real data; this physical gap is synthetic, and the robot checks it. The twin is built from a subset of the separate phone capture of the same scene, so twin and "reality" share neither images nor reconstruction method; the largest budget stays below the full capture. Tasks are goal-reaching navigation (image-goal and point-goal) in static indoor scenes, with the difficulty set in a pilot. The sim-vs-real correlation [4] between twin and "reality" is measured per scene and must exceed a pre-registered threshold for H3. The proxy's own error is reported, and every hypothesis is re-checked for sign with a second reference from all DSLR images. P = success rate; path efficiency is also reported.</w:t>
-      </w:r>
-    </w:p>
-    <w:p>
-      <w:pPr>
-        <w:spacing w:after="120" w:line="240" w:lineRule="auto"/>
+          <w:lang w:val="en-US"/>
+        </w:rPr>
+        <w:t xml:space="preserve">The implementation of experiments will be done mainly in the Python programming language with the PyTorch deep learning library. Source code will be managed with the Git version control system, and experiments will be tracked to provide reproducible results. Due to the high computational demand, the experiments will run on GPU clusters provided by the Department and on the Polish computing infrastructure (WCSS, PLGrid). The work will be partly conducted in cooperation with other Ph.D. students and senior researchers. Code and data are supposed to be opened whenever possible, following open science standards and the licences of the datasets used.</w:t>
+      </w:r>
+    </w:p>
+    <w:p>
+      <w:pPr>
+        <w:spacing w:after="0" w:line="240" w:lineRule="auto"/>
         <w:jc w:val="both"/>
       </w:pPr>
       <w:r>
         <w:rPr>
           <w:rFonts w:cstheme="minorHAnsi"/>
-          <w:b/>
-          <w:lang w:val="en-US"/>
-        </w:rPr>
-        <w:t xml:space="preserve">Mechanism 1 – less capture (RQ1, H1; sem. 3–4).</w:t>
-      </w:r>
-    </w:p>
-    <w:p>
-      <w:pPr>
-        <w:spacing w:after="40" w:line="240" w:lineRule="auto"/>
-        <w:ind w:left="284" w:hanging="284"/>
-        <w:jc w:val="both"/>
-      </w:pPr>
-      <w:r>
-        <w:rPr>
-          <w:rFonts w:cstheme="minorHAnsi"/>
-          <w:lang w:val="en-US"/>
-        </w:rPr>
-        <w:t xml:space="preserve">•	</w:t>
-      </w:r>
-      <w:r>
-        <w:rPr>
-          <w:rFonts w:cstheme="minorHAnsi"/>
-          <w:i/>
-          <w:lang w:val="en-US"/>
-        </w:rPr>
-        <w:t xml:space="preserve">Method:</w:t>
-      </w:r>
-      <w:r>
-        <w:rPr>
-          <w:rFonts w:cstheme="minorHAnsi"/>
-          <w:lang w:val="en-US"/>
-        </w:rPr>
-        <w:t xml:space="preserve"> the twin's appearance and geometry come from 3DGS [11], run as a mesh in the simulator (as in [12]); its physical part is identified from a few trajectories as a posterior [19]. The next views are chosen where the twin's uncertainty (Fisher information [23] or an uncertainty field [24] adapted to 3DGS) is highest in the regions that matter for the task, e.g. along planner paths between likely goals; one criterion covers views and physical parameters.</w:t>
-      </w:r>
-    </w:p>
-    <w:p>
-      <w:pPr>
-        <w:spacing w:after="40" w:line="240" w:lineRule="auto"/>
-        <w:ind w:left="284" w:hanging="284"/>
-        <w:jc w:val="both"/>
-      </w:pPr>
-      <w:r>
-        <w:rPr>
-          <w:rFonts w:cstheme="minorHAnsi"/>
-          <w:lang w:val="en-US"/>
-        </w:rPr>
-        <w:t xml:space="preserve">•	</w:t>
-      </w:r>
-      <w:r>
-        <w:rPr>
-          <w:rFonts w:cstheme="minorHAnsi"/>
-          <w:i/>
-          <w:lang w:val="en-US"/>
-        </w:rPr>
-        <w:t xml:space="preserve">Pre-registered baselines:</w:t>
-      </w:r>
-      <w:r>
-        <w:rPr>
-          <w:rFonts w:cstheme="minorHAnsi"/>
-          <w:lang w:val="en-US"/>
-        </w:rPr>
-        <w:t xml:space="preserve"> uniform capture; task-blind information-driven selection [23]; risk- and semantics-weighted selection with a reconstruction objective [25, 26]; task-blind identification of the physical part [20].</w:t>
-      </w:r>
-    </w:p>
-    <w:p>
-      <w:pPr>
-        <w:spacing w:after="40" w:line="240" w:lineRule="auto"/>
-        <w:ind w:left="284" w:hanging="284"/>
-        <w:jc w:val="both"/>
-      </w:pPr>
-      <w:r>
-        <w:rPr>
-          <w:rFonts w:cstheme="minorHAnsi"/>
-          <w:lang w:val="en-US"/>
-        </w:rPr>
-        <w:t xml:space="preserve">•	</w:t>
-      </w:r>
-      <w:r>
-        <w:rPr>
-          <w:rFonts w:cstheme="minorHAnsi"/>
-          <w:i/>
-          <w:lang w:val="en-US"/>
-        </w:rPr>
-        <w:t xml:space="preserve">Criterion (H1):</w:t>
-      </w:r>
-      <w:r>
-        <w:rPr>
-          <w:rFonts w:cstheme="minorHAnsi"/>
-          <w:lang w:val="en-US"/>
-        </w:rPr>
-        <w:t xml:space="preserve"> ≥ 40% less capture than uniform at the target P (same learner in each twin; reference budget below the plateau), upper 95% bound of the ratio below 1; against task-blind selection only the upper bound below 1 is claimed.</w:t>
-      </w:r>
-    </w:p>
-    <w:p>
-      <w:pPr>
-        <w:spacing w:after="120" w:line="240" w:lineRule="auto"/>
-        <w:jc w:val="both"/>
-      </w:pPr>
-      <w:r>
-        <w:rPr>
-          <w:rFonts w:cstheme="minorHAnsi"/>
-          <w:b/>
-          <w:lang w:val="en-US"/>
-        </w:rPr>
-        <w:t xml:space="preserve">Mechanism 2 – better use of simulation (RQ2, H2; sem. 4).</w:t>
-      </w:r>
-    </w:p>
-    <w:p>
-      <w:pPr>
-        <w:spacing w:after="40" w:line="240" w:lineRule="auto"/>
-        <w:ind w:left="284" w:hanging="284"/>
-        <w:jc w:val="both"/>
-      </w:pPr>
-      <w:r>
-        <w:rPr>
-          <w:rFonts w:cstheme="minorHAnsi"/>
-          <w:lang w:val="en-US"/>
-        </w:rPr>
-        <w:t xml:space="preserve">•	</w:t>
-      </w:r>
-      <w:r>
-        <w:rPr>
-          <w:rFonts w:cstheme="minorHAnsi"/>
-          <w:i/>
-          <w:lang w:val="en-US"/>
-        </w:rPr>
-        <w:t xml:space="preserve">Method:</w:t>
-      </w:r>
-      <w:r>
-        <w:rPr>
-          <w:rFonts w:cstheme="minorHAnsi"/>
-          <w:lang w:val="en-US"/>
-        </w:rPr>
-        <w:t xml:space="preserve"> the model is initialized from a pretrained foundation model (e.g. a general navigation model or a vision-language-action model [27–29]) and trained in the twin by imitation of planner demonstrations, then by reinforcement learning on a subset of scenes. Randomization strength follows the twin's uncertainty per region and per physical parameter, and twin samples far from a few real samples (held out from the capture and counted in its budget) in a frozen-encoder space [34] are down-weighted. A learned world model (e.g. a video world model [30, 31]) adapted on twin data generates additional trajectories where the twin is most uncertain; it is an ablation without its own threshold.</w:t>
-      </w:r>
-    </w:p>
-    <w:p>
-      <w:pPr>
-        <w:spacing w:after="40" w:line="240" w:lineRule="auto"/>
-        <w:ind w:left="284" w:hanging="284"/>
-        <w:jc w:val="both"/>
-      </w:pPr>
-      <w:r>
-        <w:rPr>
-          <w:rFonts w:cstheme="minorHAnsi"/>
-          <w:lang w:val="en-US"/>
-        </w:rPr>
-        <w:t xml:space="preserve">•	</w:t>
-      </w:r>
-      <w:r>
-        <w:rPr>
-          <w:rFonts w:cstheme="minorHAnsi"/>
-          <w:i/>
-          <w:lang w:val="en-US"/>
-        </w:rPr>
-        <w:t xml:space="preserve">Pre-registered baselines:</w:t>
-      </w:r>
-      <w:r>
-        <w:rPr>
-          <w:rFonts w:cstheme="minorHAnsi"/>
-          <w:lang w:val="en-US"/>
-        </w:rPr>
-        <w:t xml:space="preserve"> uniform randomization of appearance [6] and dynamics [7]; no randomization; ablations without the world model, uncertainty weighting and foundation-model initialization.</w:t>
-      </w:r>
-    </w:p>
-    <w:p>
-      <w:pPr>
-        <w:spacing w:after="40" w:line="240" w:lineRule="auto"/>
-        <w:ind w:left="284" w:hanging="284"/>
-        <w:jc w:val="both"/>
-      </w:pPr>
-      <w:r>
-        <w:rPr>
-          <w:rFonts w:cstheme="minorHAnsi"/>
-          <w:lang w:val="en-US"/>
-        </w:rPr>
-        <w:t xml:space="preserve">•	</w:t>
-      </w:r>
-      <w:r>
-        <w:rPr>
-          <w:rFonts w:cstheme="minorHAnsi"/>
-          <w:i/>
-          <w:lang w:val="en-US"/>
-        </w:rPr>
-        <w:t xml:space="preserve">Criterion (H2):</w:t>
-      </w:r>
-      <w:r>
-        <w:rPr>
-          <w:rFonts w:cstheme="minorHAnsi"/>
-          <w:lang w:val="en-US"/>
-        </w:rPr>
-        <w:t xml:space="preserve"> paired gain ≥ 10 pp on held-out scenes, lower 95% bound &gt; 0, at ≥ 2 budgets, in the pre-registered regime (baseline ≤ ~75% success), 150–300 episodes per arm.</w:t>
-      </w:r>
-    </w:p>
-    <w:p>
-      <w:pPr>
-        <w:spacing w:after="120" w:line="240" w:lineRule="auto"/>
-        <w:jc w:val="both"/>
-      </w:pPr>
-      <w:r>
-        <w:rPr>
-          <w:rFonts w:cstheme="minorHAnsi"/>
-          <w:b/>
-          <w:lang w:val="en-US"/>
-        </w:rPr>
-        <w:t xml:space="preserve">Mechanism 3 – fewer real trials (RQ3, H3; end of sem. 4 – sem. 5).</w:t>
-      </w:r>
-    </w:p>
-    <w:p>
-      <w:pPr>
-        <w:spacing w:after="40" w:line="240" w:lineRule="auto"/>
-        <w:ind w:left="284" w:hanging="284"/>
-        <w:jc w:val="both"/>
-      </w:pPr>
-      <w:r>
-        <w:rPr>
-          <w:rFonts w:cstheme="minorHAnsi"/>
-          <w:lang w:val="en-US"/>
-        </w:rPr>
-        <w:t xml:space="preserve">•	</w:t>
-      </w:r>
-      <w:r>
-        <w:rPr>
-          <w:rFonts w:cstheme="minorHAnsi"/>
-          <w:i/>
-          <w:lang w:val="en-US"/>
-        </w:rPr>
-        <w:t xml:space="preserve">Method:</w:t>
-      </w:r>
-      <w:r>
-        <w:rPr>
-          <w:rFonts w:cstheme="minorHAnsi"/>
-          <w:lang w:val="en-US"/>
-        </w:rPr>
-        <w:t xml:space="preserve"> candidate real trials are scored by the predicted twin-to-reality gap, combining the twin's uncertainty along the planned path, disagreement between twin and world model, and the model's own uncertainty (ensemble spread). The top-ranked trials are run in reality; they correct the twin (re-capture where real and twin observations disagree, counted in the budget; posterior update of the physical parameters [8, 19]) and the model (co-training with twin data [10]). Real P from few trials is estimated with prediction-powered inference [35].</w:t>
-      </w:r>
-    </w:p>
-    <w:p>
-      <w:pPr>
-        <w:spacing w:after="40" w:line="240" w:lineRule="auto"/>
-        <w:ind w:left="284" w:hanging="284"/>
-        <w:jc w:val="both"/>
-      </w:pPr>
-      <w:r>
-        <w:rPr>
-          <w:rFonts w:cstheme="minorHAnsi"/>
-          <w:lang w:val="en-US"/>
-        </w:rPr>
-        <w:t xml:space="preserve">•	</w:t>
-      </w:r>
-      <w:r>
-        <w:rPr>
-          <w:rFonts w:cstheme="minorHAnsi"/>
-          <w:i/>
-          <w:lang w:val="en-US"/>
-        </w:rPr>
-        <w:t xml:space="preserve">Pre-registered baselines:</w:t>
-      </w:r>
-      <w:r>
-        <w:rPr>
-          <w:rFonts w:cstheme="minorHAnsi"/>
-          <w:lang w:val="en-US"/>
-        </w:rPr>
-        <w:t xml:space="preserve"> random selection; uniform coverage; a failure-driven rule that runs the configurations where the twin predicts failure (as in [18]).</w:t>
-      </w:r>
-    </w:p>
-    <w:p>
-      <w:pPr>
-        <w:spacing w:after="40" w:line="240" w:lineRule="auto"/>
-        <w:ind w:left="284" w:hanging="284"/>
-        <w:jc w:val="both"/>
-      </w:pPr>
-      <w:r>
-        <w:rPr>
-          <w:rFonts w:cstheme="minorHAnsi"/>
-          <w:lang w:val="en-US"/>
-        </w:rPr>
-        <w:t xml:space="preserve">•	</w:t>
-      </w:r>
-      <w:r>
-        <w:rPr>
-          <w:rFonts w:cstheme="minorHAnsi"/>
-          <w:i/>
-          <w:lang w:val="en-US"/>
-        </w:rPr>
-        <w:t xml:space="preserve">Criterion (H3):</w:t>
-      </w:r>
-      <w:r>
-        <w:rPr>
-          <w:rFonts w:cstheme="minorHAnsi"/>
-          <w:lang w:val="en-US"/>
-        </w:rPr>
-        <w:t xml:space="preserve"> the target P with ≥ 50% fewer trials than random selection (upper 95% bound of the ratio below 1), several runs per arm; against the failure-driven rule only the upper bound below 1 is claimed. Published rules save 20–40% [33]; 50% is expected only where the gap is concentrated.</w:t>
-      </w:r>
-    </w:p>
-    <w:p>
-      <w:pPr>
-        <w:spacing w:after="120" w:line="240" w:lineRule="auto"/>
-        <w:jc w:val="both"/>
-      </w:pPr>
-      <w:r>
-        <w:rPr>
-          <w:rFonts w:cstheme="minorHAnsi"/>
-          <w:b/>
-          <w:lang w:val="en-US"/>
-        </w:rPr>
-        <w:t xml:space="preserve">Whole method (RQ4, H4; sem. 6).</w:t>
-      </w:r>
-      <w:r>
-        <w:rPr>
-          <w:rFonts w:cstheme="minorHAnsi"/>
-          <w:lang w:val="en-US"/>
-        </w:rPr>
-        <w:t xml:space="preserve"> Budget curves of the whole method and of the strongest existing approach. No navigation pipeline with a real-trial step exists, so this baseline is </w:t>
-      </w:r>
-      <w:r>
-        <w:rPr>
-          <w:rFonts w:cstheme="minorHAnsi"/>
-          <w:i/>
-          <w:lang w:val="en-US"/>
-        </w:rPr>
-        <w:t xml:space="preserve">assembled and pre-registered</w:t>
-      </w:r>
-      <w:r>
-        <w:rPr>
-          <w:rFonts w:cstheme="minorHAnsi"/>
-          <w:lang w:val="en-US"/>
-        </w:rPr>
-        <w:t xml:space="preserve">: capture and fine-tuning as in [12] plus real-trial correction as in [16, 18], with the same reconstruction pipeline, learner, compute and budget; a zero-shot twin and learning from real data only (imitation, same initialization) are reference curves; the method's settings are fixed beforehand. </w:t>
-      </w:r>
-      <w:r>
-        <w:rPr>
-          <w:rFonts w:cstheme="minorHAnsi"/>
-          <w:i/>
-          <w:lang w:val="en-US"/>
-        </w:rPr>
-        <w:t xml:space="preserve">Criterion (H4):</w:t>
-      </w:r>
-      <w:r>
-        <w:rPr>
-          <w:rFonts w:cstheme="minorHAnsi"/>
-          <w:lang w:val="en-US"/>
-        </w:rPr>
-        <w:t xml:space="preserve"> ≥ 2× less real data than the assembled baseline at the target P, upper 95% bound of the ratio below 1, and the mechanism 1–3 effects keep their sign; ≥ 30–50 episodes per point.</w:t>
-      </w:r>
-    </w:p>
-    <w:p>
-      <w:pPr>
-        <w:spacing w:after="120" w:line="240" w:lineRule="auto"/>
-        <w:jc w:val="both"/>
-      </w:pPr>
-      <w:r>
-        <w:rPr>
-          <w:rFonts w:cstheme="minorHAnsi"/>
-          <w:b/>
-          <w:lang w:val="en-US"/>
-        </w:rPr>
-        <w:t xml:space="preserve">Generalization to manipulation (sem. 5–6).</w:t>
-      </w:r>
-      <w:r>
-        <w:rPr>
-          <w:rFonts w:cstheme="minorHAnsi"/>
-          <w:lang w:val="en-US"/>
-        </w:rPr>
-        <w:t xml:space="preserve"> The same method, settings unchanged, runs on tabletop tasks in ManiSkill3 [2], where a scene with hidden ground-truth physical parameters and its own rendering is "reality" and the twin is reconstructed from a subset of its views and a few interactions; this weaker proxy is checked against published paired sim-and-real evaluations [5]. No separate thresholds: only budget curves and the sign of the H1–H4 effects.</w:t>
-      </w:r>
-    </w:p>
-    <w:p>
-      <w:pPr>
-        <w:spacing w:after="120" w:line="240" w:lineRule="auto"/>
-        <w:jc w:val="both"/>
-      </w:pPr>
-      <w:r>
-        <w:rPr>
-          <w:rFonts w:cstheme="minorHAnsi"/>
-          <w:b/>
-          <w:lang w:val="en-US"/>
-        </w:rPr>
-        <w:t xml:space="preserve">Real-robot validation.</w:t>
-      </w:r>
-      <w:r>
-        <w:rPr>
-          <w:rFonts w:cstheme="minorHAnsi"/>
-          <w:lang w:val="en-US"/>
-        </w:rPr>
-        <w:t xml:space="preserve"> Two campaigns (sem. 5, 7) in 2 PWr rooms with a small mobile robot (TurtleBot 4 Lite from an SzD Minigrant, or K29), ~8 robot-hours each; they check direction and the proxy's validity.</w:t>
-      </w:r>
-    </w:p>
-    <w:p>
-      <w:pPr>
-        <w:spacing w:after="0" w:line="240" w:lineRule="auto"/>
-        <w:jc w:val="both"/>
-      </w:pPr>
-      <w:r>
-        <w:rPr>
-          <w:rFonts w:cstheme="minorHAnsi"/>
-          <w:b/>
-          <w:lang w:val="en-US"/>
-        </w:rPr>
-        <w:t xml:space="preserve">Statistics, compute, openness.</w:t>
-      </w:r>
-      <w:r>
-        <w:rPr>
-          <w:rFonts w:cstheme="minorHAnsi"/>
-          <w:lang w:val="en-US"/>
-        </w:rPr>
-        <w:t xml:space="preserve"> One-sided tests, α = 0.05, scene-level bootstrap, Holm correction; every stage pre-registered. WCSS and PLGrid GPUs. Released: code, configurations, scene lists, seeds and MuSHRoom-based twins; nothing derived from ScanNet++.</w:t>
+          <w:lang w:val="en-US"/>
+        </w:rPr>
+        <w:t xml:space="preserve">The findings will be published at leading machine learning, computer vision and robotics conferences from the ministerial list, such as NeurIPS, ICML, ICLR, CVPR and RSS. In order to further promote the work and establish new collaborations, it is planned to present results at smaller conferences and workshops, like MLinPL, and at summer schools.</w:t>
       </w:r>
     </w:p>
     <w:permEnd w:id="32011344"/>
@@ -7805,7 +5289,7 @@
     </w:p>
     <w:p>
       <w:pPr>
-        <w:spacing w:after="120" w:line="240" w:lineRule="auto"/>
+        <w:spacing w:after="0" w:line="240" w:lineRule="auto"/>
         <w:jc w:val="both"/>
       </w:pPr>
       <w:permStart w:id="301016009" w:edGrp="everyone"/>
@@ -7814,80 +5298,54 @@
           <w:rFonts w:cstheme="minorHAnsi"/>
           <w:lang w:val="pl-PL"/>
         </w:rPr>
-        <w:t xml:space="preserve">Roboty, które uczą się zadania na podstawie doświadczenia, na przykład poruszania się po budynku albo przenoszenia przedmiotów, potrzebują wielu takich doświadczeń z miejsca, w którym będą pracować, a zbieranie ich w rzeczywistości jest powolne i kosztowne. Dlatego coraz częściej robot uczy się w cyfrowym bliźniaku: wiernej kopii prawdziwego miejsca, którą można odtworzyć z krótkiego nagrania i kilku pomiarów. Powstaje w ten sposób droga w trzech krokach: zbieramy dane w rzeczywistości i budujemy z nich kopię, uczymy w niej model robota, a następnie przenosimy go z powrotem do rzeczywistości i tam sprawdzamy oraz poprawiamy. Każdy z tych kroków wymaga jednak prawdziwych danych, a dziś nikt nie wie, jak mało by wystarczyło.</w:t>
-      </w:r>
-    </w:p>
-    <w:p>
-      <w:pPr>
-        <w:spacing w:after="120" w:line="240" w:lineRule="auto"/>
+        <w:t xml:space="preserve">Sztuczna inteligencja coraz częściej wychodzi poza ekrany komputerów i trafia do robotów, które poruszają się po budynkach albo przenoszą przedmioty. Aby się tego nauczyć, roboty potrzebują ogromnej liczby przykładów, których zebranie w prawdziwym świecie jest powolne i kosztowne. Dlatego coraz częściej uczą się w symulacji, a w szczególności w cyfrowych bliźniakach, czyli wiernych wirtualnych kopiach prawdziwych miejsc, które można odtworzyć z krótkiego nagrania. Taka kopia nigdy nie jest jednak idealna i model, który w symulacji działa bardzo dobrze, w prawdziwym świecie często popełnia błędy, zwłaszcza w miejscach, których wcześniej nie widział. Celem rozprawy jest opracowanie metod, dzięki którym modele uczone w cyfrowych bliźniakach będą lepiej działać w rzeczywistości. Badania obejmą sprawdzenie, które cechy wirtualnej kopii są naprawdę ważne, nauczenie modeli pomijania różnic między kopią a rzeczywistością oraz dostosowanie modeli do rzeczywistości przy użyciu niewielu prawdziwych przykładów. Metody zostaną sprawdzone na nawigacji robotów mobilnych i na robotach przenoszących przedmioty. Oczekuje się, że pozwolą one w przyszłości szybciej i taniej uczyć roboty pracy w nowych miejscach, takich jak magazyny, szpitale czy biura.</w:t>
+      </w:r>
+    </w:p>
+    <w:permEnd w:id="301016009"/>
+    <w:p>
+      <w:pPr>
+        <w:spacing w:after="0" w:line="240" w:lineRule="auto"/>
         <w:jc w:val="both"/>
-      </w:pPr>
-      <w:r>
-        <w:rPr>
-          <w:rFonts w:cstheme="minorHAnsi"/>
-          <w:lang w:val="pl-PL"/>
-        </w:rPr>
-        <w:t xml:space="preserve">Celem rozprawy jest opracowanie metody, która zmniejsza ilość prawdziwych danych potrzebnych na tej drodze. U jej podstaw leży jedno pytanie naukowe: ile wiedzy o rzeczywistości wnosi każda porcja prawdziwych danych w stosunku do jej kosztu, i kiedy kopia może je zastąpić. Metoda działa na każdym z trzech kroków. W pierwszym, zamiast nagrywać wszystko po równo, nagrywamy przede wszystkim te miejsca, które są ważne dla zadania, a o których kopia wie jeszcze za mało. W drugim, ponieważ kopia nigdy nie jest idealna, uczymy model tak, aby nie polegał na jej niepewnych fragmentach, a luki w kopii wypełnia program, który uczy się przewidywać, co wydarzy się dalej. W trzecim wybieramy tylko te nieliczne próby w rzeczywistości, które najwięcej mówią o tym, gdzie kopia i model jeszcze się mylą, i wykorzystujemy je do poprawienia obu. Metoda jest opracowywana i sprawdzana na nawigacji robotów mobilnych w budynkach, a następnie, bez zmian, na robotach, które przenoszą przedmioty. Badania są prowadzone przede wszystkim na publicznie dostępnych skanach prawdziwych budynków, a wyniki są potwierdzane na prawdziwym robocie.</w:t>
-      </w:r>
+        <w:rPr>
+          <w:rFonts w:cstheme="minorHAnsi"/>
+          <w:szCs w:val="20"/>
+        </w:rPr>
+      </w:pPr>
     </w:p>
     <w:p>
       <w:pPr>
         <w:spacing w:after="0" w:line="240" w:lineRule="auto"/>
         <w:jc w:val="both"/>
-      </w:pPr>
-      <w:r>
-        <w:rPr>
-          <w:rFonts w:cstheme="minorHAnsi"/>
-          <w:lang w:val="pl-PL"/>
-        </w:rPr>
-        <w:t xml:space="preserve">Spodziewanym efektem jest metoda, która pozwala nauczyć robota zadania przy dużo mniejszej ilości prawdziwych danych niż dotychczasowe podejścia; to, ile danych oszczędza, mierzymy w minutach pracy człowieka, w ten sam sposób dla każdego podejścia. Może to przyspieszyć i potanić wdrażanie robotów w magazynach, szpitalach i biurach. Opracowane oprogramowanie zostanie udostępnione publicznie.</w:t>
-      </w:r>
-    </w:p>
-    <w:permEnd w:id="301016009"/>
+        <w:rPr>
+          <w:rFonts w:cstheme="minorHAnsi"/>
+          <w:b/>
+          <w:sz w:val="24"/>
+          <w:szCs w:val="20"/>
+        </w:rPr>
+      </w:pPr>
+      <w:r>
+        <w:rPr>
+          <w:rFonts w:cstheme="minorHAnsi"/>
+          <w:b/>
+          <w:sz w:val="24"/>
+          <w:szCs w:val="20"/>
+        </w:rPr>
+        <w:t>Abstract</w:t>
+      </w:r>
+      <w:r>
+        <w:rPr>
+          <w:rFonts w:cstheme="minorHAnsi"/>
+          <w:b/>
+          <w:sz w:val="24"/>
+          <w:szCs w:val="20"/>
+        </w:rPr>
+        <w:t xml:space="preserve"> for general public</w:t>
+      </w:r>
+    </w:p>
     <w:p>
       <w:pPr>
         <w:spacing w:after="0" w:line="240" w:lineRule="auto"/>
         <w:jc w:val="both"/>
-        <w:rPr>
-          <w:rFonts w:cstheme="minorHAnsi"/>
-          <w:szCs w:val="20"/>
-        </w:rPr>
-      </w:pPr>
-    </w:p>
-    <w:p>
-      <w:pPr>
-        <w:spacing w:after="0" w:line="240" w:lineRule="auto"/>
-        <w:jc w:val="both"/>
-        <w:rPr>
-          <w:rFonts w:cstheme="minorHAnsi"/>
-          <w:b/>
-          <w:sz w:val="24"/>
-          <w:szCs w:val="20"/>
-        </w:rPr>
-      </w:pPr>
-      <w:r>
-        <w:rPr>
-          <w:rFonts w:cstheme="minorHAnsi"/>
-          <w:b/>
-          <w:sz w:val="24"/>
-          <w:szCs w:val="20"/>
-        </w:rPr>
-        <w:t>Abstract</w:t>
-      </w:r>
-      <w:r>
-        <w:rPr>
-          <w:rFonts w:cstheme="minorHAnsi"/>
-          <w:b/>
-          <w:sz w:val="24"/>
-          <w:szCs w:val="20"/>
-        </w:rPr>
-        <w:t xml:space="preserve"> for general public</w:t>
-      </w:r>
-    </w:p>
-    <w:p>
-      <w:pPr>
-        <w:spacing w:after="120" w:line="240" w:lineRule="auto"/>
-        <w:jc w:val="both"/>
       </w:pPr>
       <w:permStart w:id="305530072" w:edGrp="everyone"/>
       <w:r>
@@ -7895,33 +5353,7 @@
           <w:rFonts w:cstheme="minorHAnsi"/>
           <w:lang w:val="en-US"/>
         </w:rPr>
-        <w:t xml:space="preserve">Robots that learn a task from experience, for example moving around a building or handling objects, need a lot of that experience from the place where they will work, and collecting it in reality is slow and costly. That is why robots increasingly learn in a digital twin: a faithful copy of a real place that can be rebuilt from a short recording and a few measurements. This creates a path in three steps: we collect data in reality and build the copy from it, train the robot's model in the copy, and then transfer it back to reality, where we check and correct it. Each of these steps, however, needs real data, and today nobody knows how little would be enough.</w:t>
-      </w:r>
-    </w:p>
-    <w:p>
-      <w:pPr>
-        <w:spacing w:after="120" w:line="240" w:lineRule="auto"/>
-        <w:jc w:val="both"/>
-      </w:pPr>
-      <w:r>
-        <w:rPr>
-          <w:rFonts w:cstheme="minorHAnsi"/>
-          <w:lang w:val="en-US"/>
-        </w:rPr>
-        <w:t xml:space="preserve">The goal of this dissertation is to develop a method that reduces the amount of real data this path needs. At its core lies one scientific question: how much each piece of real data tells us about reality relative to its cost, and when the copy can replace it. The method acts at each of the three steps. In the first, instead of recording everything evenly, we record mainly the places that matter for the task and about which the copy still knows too little. In the second, because the copy is never perfect, we train the model so that it does not rely on the copy's uncertain parts, and a program that learns to predict what happens next fills the gaps in the copy. In the third, we choose only the few trials in reality that tell the most about where the copy and the model are still wrong, and use them to correct both. The method is developed and tested on the navigation of mobile robots in buildings, and then, unchanged, on robots that handle objects. The research is carried out mainly on publicly available scans of real buildings, and the results are confirmed on a real robot.</w:t>
-      </w:r>
-    </w:p>
-    <w:p>
-      <w:pPr>
-        <w:spacing w:after="0" w:line="240" w:lineRule="auto"/>
-        <w:jc w:val="both"/>
-      </w:pPr>
-      <w:r>
-        <w:rPr>
-          <w:rFonts w:cstheme="minorHAnsi"/>
-          <w:lang w:val="en-US"/>
-        </w:rPr>
-        <w:t xml:space="preserve">The expected result is a method that makes it possible to teach a robot a task with much less real data than existing approaches; how much data it saves is measured in minutes of a person's work, in the same way for every approach. This may make deploying robots in warehouses, hospitals and offices faster and cheaper. The software developed will be made publicly available.</w:t>
+        <w:t xml:space="preserve">Artificial intelligence is increasingly moving beyond computer screens into robots that move around buildings or handle objects. To learn this, robots need a huge number of examples, which are slow and costly to collect in the real world. That is why they increasingly learn in simulation, and in particular in digital twins, that is, faithful virtual copies of real places that can be rebuilt from a short recording. Such a copy is never perfect, however, and a model that works very well in simulation often makes mistakes in the real world, especially in places it has not seen before. The goal of the dissertation is to develop methods that make models trained in digital twins work better in reality. The research will cover finding out which features of the virtual copy really matter, teaching models to ignore the differences between the copy and reality, and adapting models to reality using only a few real examples. The methods will be tested on the navigation of mobile robots and on robots that handle objects. They are expected to make it faster and cheaper in the future to teach robots to work in new places, such as warehouses, hospitals or offices.</w:t>
       </w:r>
     </w:p>
     <w:permEnd w:id="305530072"/>
@@ -8289,120 +5721,16 @@
     </w:p>
     <w:p>
       <w:pPr>
-        <w:spacing w:after="120" w:line="240" w:lineRule="auto"/>
+        <w:spacing w:after="0" w:line="240" w:lineRule="auto"/>
         <w:jc w:val="both"/>
       </w:pPr>
       <w:permStart w:id="641100817" w:edGrp="everyone"/>
       <w:r>
         <w:rPr>
           <w:rFonts w:cstheme="minorHAnsi"/>
-          <w:b/>
-          <w:lang w:val="en-US"/>
-        </w:rPr>
-        <w:t xml:space="preserve">May 2027 / maj 2027</w:t>
-      </w:r>
-    </w:p>
-    <w:p>
-      <w:pPr>
-        <w:spacing w:after="0" w:line="240" w:lineRule="auto"/>
-        <w:jc w:val="both"/>
-      </w:pPr>
-      <w:r>
-        <w:rPr>
-          <w:rFonts w:cstheme="minorHAnsi"/>
-          <w:lang w:val="en-US"/>
-        </w:rPr>
-        <w:t xml:space="preserve">Paper </w:t>
-      </w:r>
-      <w:r>
-        <w:rPr>
-          <w:rFonts w:cstheme="minorHAnsi"/>
-          <w:b/>
-          <w:lang w:val="en-US"/>
-        </w:rPr>
-        <w:t xml:space="preserve">P1</w:t>
-      </w:r>
-      <w:r>
-        <w:rPr>
-          <w:rFonts w:cstheme="minorHAnsi"/>
-          <w:lang w:val="en-US"/>
-        </w:rPr>
-        <w:t xml:space="preserve"> submitted for review to the main track of the </w:t>
-      </w:r>
-      <w:r>
-        <w:rPr>
-          <w:rFonts w:cstheme="minorHAnsi"/>
-          <w:b/>
-          <w:lang w:val="en-US"/>
-        </w:rPr>
-        <w:t xml:space="preserve">Conference on Neural Information Processing Systems (NeurIPS 2027)</w:t>
-      </w:r>
-      <w:r>
-        <w:rPr>
-          <w:rFonts w:cstheme="minorHAnsi"/>
-          <w:lang w:val="en-US"/>
-        </w:rPr>
-        <w:t xml:space="preserve">. NeurIPS is peer-reviewed international conference proceedings worth </w:t>
-      </w:r>
-      <w:r>
-        <w:rPr>
-          <w:rFonts w:cstheme="minorHAnsi"/>
-          <w:b/>
-          <w:lang w:val="en-US"/>
-        </w:rPr>
-        <w:t xml:space="preserve">200 points</w:t>
-      </w:r>
-      <w:r>
-        <w:rPr>
-          <w:rFonts w:cstheme="minorHAnsi"/>
-          <w:lang w:val="en-US"/>
-        </w:rPr>
-        <w:t xml:space="preserve"> on the ministerial list (conference Lp. 87), assigned to the discipline </w:t>
-      </w:r>
-      <w:r>
-        <w:rPr>
-          <w:rFonts w:cstheme="minorHAnsi"/>
-          <w:i/>
-          <w:lang w:val="en-US"/>
-        </w:rPr>
-        <w:t xml:space="preserve">informatyka techniczna i telekomunikacja</w:t>
-      </w:r>
-      <w:r>
-        <w:rPr>
-          <w:rFonts w:cstheme="minorHAnsi"/>
-          <w:lang w:val="en-US"/>
-        </w:rPr>
-        <w:t xml:space="preserve">. P1 reports the first reduction mechanism of the method, </w:t>
-      </w:r>
-      <w:r>
-        <w:rPr>
-          <w:rFonts w:cstheme="minorHAnsi"/>
-          <w:b/>
-          <w:lang w:val="en-US"/>
-        </w:rPr>
-        <w:t xml:space="preserve">less capture</w:t>
-      </w:r>
-      <w:r>
-        <w:rPr>
-          <w:rFonts w:cstheme="minorHAnsi"/>
-          <w:lang w:val="en-US"/>
-        </w:rPr>
-        <w:t xml:space="preserve"> (RQ1, H1), in indoor robot navigation: capture of real data guided by the task and by the twin's uncertainty, evaluated on public scans of real buildings by the real data it saves, in operator minutes, against pre-registered baselines (task T4.2). Because this mechanism is the most exposed to being published first by others, its result is also released as an early preprint. If P1 is rejected, the revised paper goes to </w:t>
-      </w:r>
-      <w:r>
-        <w:rPr>
-          <w:rFonts w:cstheme="minorHAnsi"/>
-          <w:b/>
-          <w:lang w:val="en-US"/>
-        </w:rPr>
-        <w:t xml:space="preserve">CVPR 2028</w:t>
-      </w:r>
-      <w:r>
-        <w:rPr>
-          <w:rFonts w:cstheme="minorHAnsi"/>
-          <w:lang w:val="en-US"/>
-        </w:rPr>
-        <w:t xml:space="preserve"> (expected deadline November 2027, also 200 points), and then to the next 200-point conference (§12).</w:t>
+          <w:lang w:val="en-US"/>
+        </w:rPr>
+        <w:t xml:space="preserve">May 2027</w:t>
       </w:r>
     </w:p>
     <w:permEnd w:id="641100817"/>
@@ -8656,840 +5984,22 @@
     </w:p>
     <w:p>
       <w:pPr>
-        <w:spacing w:after="120" w:line="240" w:lineRule="auto"/>
+        <w:spacing w:after="0" w:line="240" w:lineRule="auto"/>
         <w:jc w:val="both"/>
+        <w:rPr>
+          <w:rFonts w:cstheme="minorHAnsi"/>
+          <w:szCs w:val="24"/>
+          <w:lang w:val="en-US"/>
+        </w:rPr>
       </w:pPr>
       <w:permStart w:id="1742865563" w:edGrp="everyone"/>
       <w:r>
         <w:rPr>
           <w:rFonts w:cstheme="minorHAnsi"/>
-          <w:b/>
-          <w:lang w:val="en-US"/>
-        </w:rPr>
-        <w:t xml:space="preserve">Planned outputs by year</w:t>
-      </w:r>
-      <w:r>
-        <w:rPr>
-          <w:rFonts w:cstheme="minorHAnsi"/>
-          <w:lang w:val="en-US"/>
-        </w:rPr>
-        <w:t xml:space="preserve"> (200-point conferences assigned to the discipline, list of 5.01.2024).</w:t>
-      </w:r>
-    </w:p>
-    <w:tbl>
-      <w:tblPr>
-        <w:tblStyle w:val="Tabela-Siatka"/>
-        <w:tblW w:w="9072" w:type="dxa"/>
-        <w:tblLayout w:type="fixed"/>
-      </w:tblPr>
-      <w:tblGrid>
-        <w:gridCol w:w="1269"/>
-        <w:gridCol w:w="3449"/>
-        <w:gridCol w:w="1269"/>
-        <w:gridCol w:w="1473"/>
-        <w:gridCol w:w="1612"/>
-      </w:tblGrid>
-      <w:tr>
-        <w:tc>
-          <w:tcPr>
-            <w:tcW w:w="1269" w:type="dxa"/>
-          </w:tcPr>
-          <w:p>
-            <w:pPr>
-              <w:spacing w:after="0" w:line="240" w:lineRule="auto"/>
-              <w:jc w:val="left"/>
-            </w:pPr>
-            <w:r>
-              <w:rPr>
-                <w:rFonts w:cstheme="minorHAnsi"/>
-                <w:b/>
-                <w:lang w:val="en-US"/>
-              </w:rPr>
-              <w:t xml:space="preserve">Year</w:t>
-            </w:r>
-          </w:p>
-        </w:tc>
-        <w:tc>
-          <w:tcPr>
-            <w:tcW w:w="3449" w:type="dxa"/>
-          </w:tcPr>
-          <w:p>
-            <w:pPr>
-              <w:spacing w:after="0" w:line="240" w:lineRule="auto"/>
-              <w:jc w:val="left"/>
-            </w:pPr>
-            <w:r>
-              <w:rPr>
-                <w:rFonts w:cstheme="minorHAnsi"/>
-                <w:b/>
-                <w:lang w:val="en-US"/>
-              </w:rPr>
-              <w:t xml:space="preserve">Papers (planned submission, 200 points each)</w:t>
-            </w:r>
-          </w:p>
-        </w:tc>
-        <w:tc>
-          <w:tcPr>
-            <w:tcW w:w="1269" w:type="dxa"/>
-          </w:tcPr>
-          <w:p>
-            <w:pPr>
-              <w:spacing w:after="0" w:line="240" w:lineRule="auto"/>
-              <w:jc w:val="left"/>
-            </w:pPr>
-            <w:r>
-              <w:rPr>
-                <w:rFonts w:cstheme="minorHAnsi"/>
-                <w:b/>
-                <w:lang w:val="en-US"/>
-              </w:rPr>
-              <w:t xml:space="preserve">Code</w:t>
-            </w:r>
-          </w:p>
-        </w:tc>
-        <w:tc>
-          <w:tcPr>
-            <w:tcW w:w="1473" w:type="dxa"/>
-          </w:tcPr>
-          <w:p>
-            <w:pPr>
-              <w:spacing w:after="0" w:line="240" w:lineRule="auto"/>
-              <w:jc w:val="left"/>
-            </w:pPr>
-            <w:r>
-              <w:rPr>
-                <w:rFonts w:cstheme="minorHAnsi"/>
-                <w:b/>
-                <w:lang w:val="en-US"/>
-              </w:rPr>
-              <w:t xml:space="preserve">Grants, licences</w:t>
-            </w:r>
-          </w:p>
-        </w:tc>
-        <w:tc>
-          <w:tcPr>
-            <w:tcW w:w="1612" w:type="dxa"/>
-          </w:tcPr>
-          <w:p>
-            <w:pPr>
-              <w:spacing w:after="0" w:line="240" w:lineRule="auto"/>
-              <w:jc w:val="left"/>
-            </w:pPr>
-            <w:r>
-              <w:rPr>
-                <w:rFonts w:cstheme="minorHAnsi"/>
-                <w:b/>
-                <w:lang w:val="en-US"/>
-              </w:rPr>
-              <w:t xml:space="preserve">Mobility, events</w:t>
-            </w:r>
-          </w:p>
-        </w:tc>
-      </w:tr>
-      <w:tr>
-        <w:tc>
-          <w:tcPr>
-            <w:tcW w:w="1269" w:type="dxa"/>
-          </w:tcPr>
-          <w:p>
-            <w:pPr>
-              <w:spacing w:after="0" w:line="240" w:lineRule="auto"/>
-              <w:jc w:val="left"/>
-            </w:pPr>
-            <w:r>
-              <w:rPr>
-                <w:rFonts w:cstheme="minorHAnsi"/>
-                <w:lang w:val="en-US"/>
-              </w:rPr>
-              <w:t xml:space="preserve">1 (2025/26)</w:t>
-            </w:r>
-          </w:p>
-        </w:tc>
-        <w:tc>
-          <w:tcPr>
-            <w:tcW w:w="3449" w:type="dxa"/>
-          </w:tcPr>
-          <w:p>
-            <w:pPr>
-              <w:spacing w:after="0" w:line="240" w:lineRule="auto"/>
-              <w:jc w:val="left"/>
-            </w:pPr>
-            <w:r>
-              <w:rPr>
-                <w:rFonts w:cstheme="minorHAnsi"/>
-                <w:lang w:val="en-US"/>
-              </w:rPr>
-              <w:t xml:space="preserve">—</w:t>
-            </w:r>
-          </w:p>
-        </w:tc>
-        <w:tc>
-          <w:tcPr>
-            <w:tcW w:w="1269" w:type="dxa"/>
-          </w:tcPr>
-          <w:p>
-            <w:pPr>
-              <w:spacing w:after="0" w:line="240" w:lineRule="auto"/>
-              <w:jc w:val="left"/>
-            </w:pPr>
-            <w:r>
-              <w:rPr>
-                <w:rFonts w:cstheme="minorHAnsi"/>
-                <w:lang w:val="en-US"/>
-              </w:rPr>
-              <w:t xml:space="preserve">—</w:t>
-            </w:r>
-          </w:p>
-        </w:tc>
-        <w:tc>
-          <w:tcPr>
-            <w:tcW w:w="1473" w:type="dxa"/>
-          </w:tcPr>
-          <w:p>
-            <w:pPr>
-              <w:spacing w:after="0" w:line="240" w:lineRule="auto"/>
-              <w:jc w:val="left"/>
-            </w:pPr>
-            <w:r>
-              <w:rPr>
-                <w:rFonts w:cstheme="minorHAnsi"/>
-                <w:lang w:val="en-US"/>
-              </w:rPr>
-              <w:t xml:space="preserve">—</w:t>
-            </w:r>
-          </w:p>
-        </w:tc>
-        <w:tc>
-          <w:tcPr>
-            <w:tcW w:w="1612" w:type="dxa"/>
-          </w:tcPr>
-          <w:p>
-            <w:pPr>
-              <w:spacing w:after="0" w:line="240" w:lineRule="auto"/>
-              <w:jc w:val="left"/>
-            </w:pPr>
-            <w:r>
-              <w:rPr>
-                <w:rFonts w:cstheme="minorHAnsi"/>
-                <w:lang w:val="en-US"/>
-              </w:rPr>
-              <w:t xml:space="preserve">—</w:t>
-            </w:r>
-          </w:p>
-        </w:tc>
-      </w:tr>
-      <w:tr>
-        <w:tc>
-          <w:tcPr>
-            <w:tcW w:w="1269" w:type="dxa"/>
-          </w:tcPr>
-          <w:p>
-            <w:pPr>
-              <w:spacing w:after="0" w:line="240" w:lineRule="auto"/>
-              <w:jc w:val="left"/>
-            </w:pPr>
-            <w:r>
-              <w:rPr>
-                <w:rFonts w:cstheme="minorHAnsi"/>
-                <w:lang w:val="en-US"/>
-              </w:rPr>
-              <w:t xml:space="preserve">2 (2026/27)</w:t>
-            </w:r>
-          </w:p>
-        </w:tc>
-        <w:tc>
-          <w:tcPr>
-            <w:tcW w:w="3449" w:type="dxa"/>
-          </w:tcPr>
-          <w:p>
-            <w:pPr>
-              <w:spacing w:after="0" w:line="240" w:lineRule="auto"/>
-              <w:jc w:val="left"/>
-            </w:pPr>
-            <w:r>
-              <w:rPr>
-                <w:rFonts w:cstheme="minorHAnsi"/>
-                <w:lang w:val="en-US"/>
-              </w:rPr>
-              <w:t xml:space="preserve">P1 (mechanism 1, RQ1): NeurIPS 2027, May 2027 (§11)</w:t>
-            </w:r>
-          </w:p>
-        </w:tc>
-        <w:tc>
-          <w:tcPr>
-            <w:tcW w:w="1269" w:type="dxa"/>
-          </w:tcPr>
-          <w:p>
-            <w:pPr>
-              <w:spacing w:after="0" w:line="240" w:lineRule="auto"/>
-              <w:jc w:val="left"/>
-            </w:pPr>
-            <w:r>
-              <w:rPr>
-                <w:rFonts w:cstheme="minorHAnsi"/>
-                <w:lang w:val="en-US"/>
-              </w:rPr>
-              <w:t xml:space="preserve">Proxy pipeline</w:t>
-            </w:r>
-          </w:p>
-        </w:tc>
-        <w:tc>
-          <w:tcPr>
-            <w:tcW w:w="1473" w:type="dxa"/>
-          </w:tcPr>
-          <w:p>
-            <w:pPr>
-              <w:spacing w:after="0" w:line="240" w:lineRule="auto"/>
-              <w:jc w:val="left"/>
-            </w:pPr>
-            <w:r>
-              <w:rPr>
-                <w:rFonts w:cstheme="minorHAnsi"/>
-                <w:lang w:val="en-US"/>
-              </w:rPr>
-              <w:t xml:space="preserve">ScanNet++; PLGrid; Minigrant; PRELUDIUM; Bekker</w:t>
-            </w:r>
-          </w:p>
-        </w:tc>
-        <w:tc>
-          <w:tcPr>
-            <w:tcW w:w="1612" w:type="dxa"/>
-          </w:tcPr>
-          <w:p>
-            <w:pPr>
-              <w:spacing w:after="0" w:line="240" w:lineRule="auto"/>
-              <w:jc w:val="left"/>
-            </w:pPr>
-            <w:r>
-              <w:rPr>
-                <w:rFonts w:cstheme="minorHAnsi"/>
-                <w:lang w:val="en-US"/>
-              </w:rPr>
-              <w:t xml:space="preserve">Summer school poster</w:t>
-            </w:r>
-          </w:p>
-        </w:tc>
-      </w:tr>
-      <w:tr>
-        <w:tc>
-          <w:tcPr>
-            <w:tcW w:w="1269" w:type="dxa"/>
-          </w:tcPr>
-          <w:p>
-            <w:pPr>
-              <w:spacing w:after="0" w:line="240" w:lineRule="auto"/>
-              <w:jc w:val="left"/>
-            </w:pPr>
-            <w:r>
-              <w:rPr>
-                <w:rFonts w:cstheme="minorHAnsi"/>
-                <w:lang w:val="en-US"/>
-              </w:rPr>
-              <w:t xml:space="preserve">3 (2027/28)</w:t>
-            </w:r>
-          </w:p>
-        </w:tc>
-        <w:tc>
-          <w:tcPr>
-            <w:tcW w:w="3449" w:type="dxa"/>
-          </w:tcPr>
-          <w:p>
-            <w:pPr>
-              <w:spacing w:after="0" w:line="240" w:lineRule="auto"/>
-              <w:jc w:val="left"/>
-            </w:pPr>
-            <w:r>
-              <w:rPr>
-                <w:rFonts w:cstheme="minorHAnsi"/>
-                <w:lang w:val="en-US"/>
-              </w:rPr>
-              <w:t xml:space="preserve">P2 (mechanisms 2–3, RQ2–RQ3, first manipulation results): ICML/CVPR 2028; P3 (whole method, RQ4): NeurIPS 2028</w:t>
-            </w:r>
-          </w:p>
-        </w:tc>
-        <w:tc>
-          <w:tcPr>
-            <w:tcW w:w="1269" w:type="dxa"/>
-          </w:tcPr>
-          <w:p>
-            <w:pPr>
-              <w:spacing w:after="0" w:line="240" w:lineRule="auto"/>
-              <w:jc w:val="left"/>
-            </w:pPr>
-            <w:r>
-              <w:rPr>
-                <w:rFonts w:cstheme="minorHAnsi"/>
-                <w:lang w:val="en-US"/>
-              </w:rPr>
-              <w:t xml:space="preserve">Mechanism 3 code</w:t>
-            </w:r>
-          </w:p>
-        </w:tc>
-        <w:tc>
-          <w:tcPr>
-            <w:tcW w:w="1473" w:type="dxa"/>
-          </w:tcPr>
-          <w:p>
-            <w:pPr>
-              <w:spacing w:after="0" w:line="240" w:lineRule="auto"/>
-              <w:jc w:val="left"/>
-            </w:pPr>
-            <w:r>
-              <w:rPr>
-                <w:rFonts w:cstheme="minorHAnsi"/>
-                <w:lang w:val="en-US"/>
-              </w:rPr>
-              <w:t xml:space="preserve">—</w:t>
-            </w:r>
-          </w:p>
-        </w:tc>
-        <w:tc>
-          <w:tcPr>
-            <w:tcW w:w="1612" w:type="dxa"/>
-          </w:tcPr>
-          <w:p>
-            <w:pPr>
-              <w:spacing w:after="0" w:line="240" w:lineRule="auto"/>
-              <w:jc w:val="left"/>
-            </w:pPr>
-            <w:r>
-              <w:rPr>
-                <w:rFonts w:cstheme="minorHAnsi"/>
-                <w:lang w:val="en-US"/>
-              </w:rPr>
-              <w:t xml:space="preserve">Mid-term; visit (sem. 6)</w:t>
-            </w:r>
-          </w:p>
-        </w:tc>
-      </w:tr>
-      <w:tr>
-        <w:tc>
-          <w:tcPr>
-            <w:tcW w:w="1269" w:type="dxa"/>
-          </w:tcPr>
-          <w:p>
-            <w:pPr>
-              <w:spacing w:after="0" w:line="240" w:lineRule="auto"/>
-              <w:jc w:val="left"/>
-            </w:pPr>
-            <w:r>
-              <w:rPr>
-                <w:rFonts w:cstheme="minorHAnsi"/>
-                <w:lang w:val="en-US"/>
-              </w:rPr>
-              <w:t xml:space="preserve">4 (2028/29)</w:t>
-            </w:r>
-          </w:p>
-        </w:tc>
-        <w:tc>
-          <w:tcPr>
-            <w:tcW w:w="3449" w:type="dxa"/>
-          </w:tcPr>
-          <w:p>
-            <w:pPr>
-              <w:spacing w:after="0" w:line="240" w:lineRule="auto"/>
-              <w:jc w:val="left"/>
-            </w:pPr>
-            <w:r>
-              <w:rPr>
-                <w:rFonts w:cstheme="minorHAnsi"/>
-                <w:lang w:val="en-US"/>
-              </w:rPr>
-              <w:t xml:space="preserve">Optional P4, consolidated study: ICLR 2029 or CVPR 2029</w:t>
-            </w:r>
-          </w:p>
-        </w:tc>
-        <w:tc>
-          <w:tcPr>
-            <w:tcW w:w="1269" w:type="dxa"/>
-          </w:tcPr>
-          <w:p>
-            <w:pPr>
-              <w:spacing w:after="0" w:line="240" w:lineRule="auto"/>
-              <w:jc w:val="left"/>
-            </w:pPr>
-            <w:r>
-              <w:rPr>
-                <w:rFonts w:cstheme="minorHAnsi"/>
-                <w:lang w:val="en-US"/>
-              </w:rPr>
-              <w:t xml:space="preserve">Method release</w:t>
-            </w:r>
-          </w:p>
-        </w:tc>
-        <w:tc>
-          <w:tcPr>
-            <w:tcW w:w="1473" w:type="dxa"/>
-          </w:tcPr>
-          <w:p>
-            <w:pPr>
-              <w:spacing w:after="0" w:line="240" w:lineRule="auto"/>
-              <w:jc w:val="left"/>
-            </w:pPr>
-            <w:r>
-              <w:rPr>
-                <w:rFonts w:cstheme="minorHAnsi"/>
-                <w:lang w:val="en-US"/>
-              </w:rPr>
-              <w:t xml:space="preserve">—</w:t>
-            </w:r>
-          </w:p>
-        </w:tc>
-        <w:tc>
-          <w:tcPr>
-            <w:tcW w:w="1612" w:type="dxa"/>
-          </w:tcPr>
-          <w:p>
-            <w:pPr>
-              <w:spacing w:after="0" w:line="240" w:lineRule="auto"/>
-              <w:jc w:val="left"/>
-            </w:pPr>
-            <w:r>
-              <w:rPr>
-                <w:rFonts w:cstheme="minorHAnsi"/>
-                <w:lang w:val="en-US"/>
-              </w:rPr>
-              <w:t xml:space="preserve">Dissertation</w:t>
-            </w:r>
-          </w:p>
-        </w:tc>
-      </w:tr>
-    </w:tbl>
-    <w:p>
-      <w:pPr>
-        <w:spacing w:after="0" w:line="240" w:lineRule="auto"/>
-        <w:jc w:val="both"/>
-      </w:pPr>
-    </w:p>
-    <w:p>
-      <w:pPr>
-        <w:spacing w:after="120" w:line="240" w:lineRule="auto"/>
-        <w:jc w:val="both"/>
-      </w:pPr>
-      <w:r>
-        <w:rPr>
-          <w:rFonts w:cstheme="minorHAnsi"/>
-          <w:b/>
-          <w:lang w:val="en-US"/>
-        </w:rPr>
-        <w:t xml:space="preserve">Foreign research visit (candidate hosts, not yet contacted):</w:t>
-      </w:r>
-      <w:r>
-        <w:rPr>
-          <w:rFonts w:cstheme="minorHAnsi"/>
-          <w:lang w:val="en-US"/>
-        </w:rPr>
-        <w:t xml:space="preserve"> Z. Kira's group, Georgia Tech (EmbodiedSplat [12]); M. Schwager's lab, Stanford (Gaussian-splatting scene models); a European host (Erasmus+) and a foreign co-author for P2 are sought in sem. 4.</w:t>
-      </w:r>
-    </w:p>
-    <w:p>
-      <w:pPr>
-        <w:spacing w:after="120" w:line="240" w:lineRule="auto"/>
-        <w:jc w:val="both"/>
-      </w:pPr>
-      <w:r>
-        <w:rPr>
-          <w:rFonts w:cstheme="minorHAnsi"/>
-          <w:b/>
-          <w:lang w:val="en-US"/>
-        </w:rPr>
-        <w:t xml:space="preserve">Robot and scope.</w:t>
-      </w:r>
-      <w:r>
-        <w:rPr>
-          <w:rFonts w:cstheme="minorHAnsi"/>
-          <w:lang w:val="en-US"/>
-        </w:rPr>
-        <w:t xml:space="preserve"> A small mobile robot from an SzD Minigrant or one of the K29 </w:t>
-      </w:r>
-      <w:r>
-        <w:rPr>
-          <w:rFonts w:cstheme="minorHAnsi"/>
-          <w:i/>
-          <w:lang w:val="en-US"/>
-        </w:rPr>
-        <w:t xml:space="preserve">Denali</w:t>
-      </w:r>
-      <w:r>
-        <w:rPr>
-          <w:rFonts w:cstheme="minorHAnsi"/>
-          <w:lang w:val="en-US"/>
-        </w:rPr>
-        <w:t xml:space="preserve"> laboratory (task T3.2, Nov 2026); static indoor scenes only, moving people are future work.</w:t>
-      </w:r>
-    </w:p>
-    <w:p>
-      <w:pPr>
-        <w:spacing w:after="120" w:line="240" w:lineRule="auto"/>
-        <w:jc w:val="both"/>
-      </w:pPr>
-      <w:r>
-        <w:rPr>
-          <w:rFonts w:cstheme="minorHAnsi"/>
-          <w:b/>
-          <w:lang w:val="en-US"/>
-        </w:rPr>
-        <w:t xml:space="preserve">Risks and mitigation</w:t>
-      </w:r>
-      <w:r>
-        <w:rPr>
-          <w:rFonts w:cstheme="minorHAnsi"/>
-          <w:lang w:val="en-US"/>
-        </w:rPr>
-        <w:t xml:space="preserve"> (semester affected).</w:t>
-      </w:r>
-    </w:p>
-    <w:p>
-      <w:pPr>
-        <w:spacing w:after="40" w:line="240" w:lineRule="auto"/>
-        <w:ind w:left="284" w:hanging="284"/>
-        <w:jc w:val="both"/>
-      </w:pPr>
-      <w:r>
-        <w:rPr>
-          <w:rFonts w:cstheme="minorHAnsi"/>
-          <w:lang w:val="en-US"/>
-        </w:rPr>
-        <w:t xml:space="preserve">•	</w:t>
-      </w:r>
-      <w:r>
-        <w:rPr>
-          <w:rFonts w:cstheme="minorHAnsi"/>
-          <w:i/>
-          <w:lang w:val="en-US"/>
-        </w:rPr>
-        <w:t xml:space="preserve">Proxy validity</w:t>
-      </w:r>
-      <w:r>
-        <w:rPr>
-          <w:rFonts w:cstheme="minorHAnsi"/>
-          <w:lang w:val="en-US"/>
-        </w:rPr>
-        <w:t xml:space="preserve"> (3–7): a rendered scan is itself a simulator, and one collision artefact can destroy sim-to-real predictivity [4]; separate captures, a second reference and the sim-vs-real correlation measured against the robot (§9); conclusions are ranking-preserving.</w:t>
-      </w:r>
-    </w:p>
-    <w:p>
-      <w:pPr>
-        <w:spacing w:after="40" w:line="240" w:lineRule="auto"/>
-        <w:ind w:left="284" w:hanging="284"/>
-        <w:jc w:val="both"/>
-      </w:pPr>
-      <w:r>
-        <w:rPr>
-          <w:rFonts w:cstheme="minorHAnsi"/>
-          <w:lang w:val="en-US"/>
-        </w:rPr>
-        <w:t xml:space="preserve">•	</w:t>
-      </w:r>
-      <w:r>
-        <w:rPr>
-          <w:rFonts w:cstheme="minorHAnsi"/>
-          <w:i/>
-          <w:lang w:val="en-US"/>
-        </w:rPr>
-        <w:t xml:space="preserve">Physical gap</w:t>
-      </w:r>
-      <w:r>
-        <w:rPr>
-          <w:rFonts w:cstheme="minorHAnsi"/>
-          <w:lang w:val="en-US"/>
-        </w:rPr>
-        <w:t xml:space="preserve"> (3–6): friction, slip and actuation delays are absent from meshes; "reality" gets hidden physical parameters, mechanism 3 corrects them, the robot checks them.</w:t>
-      </w:r>
-    </w:p>
-    <w:p>
-      <w:pPr>
-        <w:spacing w:after="40" w:line="240" w:lineRule="auto"/>
-        <w:ind w:left="284" w:hanging="284"/>
-        <w:jc w:val="both"/>
-      </w:pPr>
-      <w:r>
-        <w:rPr>
-          <w:rFonts w:cstheme="minorHAnsi"/>
-          <w:lang w:val="en-US"/>
-        </w:rPr>
-        <w:t xml:space="preserve">•	</w:t>
-      </w:r>
-      <w:r>
-        <w:rPr>
-          <w:rFonts w:cstheme="minorHAnsi"/>
-          <w:i/>
-          <w:lang w:val="en-US"/>
-        </w:rPr>
-        <w:t xml:space="preserve">Success ceiling and noise</w:t>
-      </w:r>
-      <w:r>
-        <w:rPr>
-          <w:rFonts w:cstheme="minorHAnsi"/>
-          <w:lang w:val="en-US"/>
-        </w:rPr>
-        <w:t xml:space="preserve"> (3–6): twins already reach high zero-shot success; a pre-registered difficulty regime, hundreds of proxy episodes per arm and targets from the baseline's plateau; robot trials confirm the direction only.</w:t>
-      </w:r>
-    </w:p>
-    <w:p>
-      <w:pPr>
-        <w:spacing w:after="40" w:line="240" w:lineRule="auto"/>
-        <w:ind w:left="284" w:hanging="284"/>
-        <w:jc w:val="both"/>
-      </w:pPr>
-      <w:r>
-        <w:rPr>
-          <w:rFonts w:cstheme="minorHAnsi"/>
-          <w:lang w:val="en-US"/>
-        </w:rPr>
-        <w:t xml:space="preserve">•	</w:t>
-      </w:r>
-      <w:r>
-        <w:rPr>
-          <w:rFonts w:cstheme="minorHAnsi"/>
-          <w:i/>
-          <w:lang w:val="en-US"/>
-        </w:rPr>
-        <w:t xml:space="preserve">No gain from one mechanism, or real-only learning strong at small budgets</w:t>
-      </w:r>
-      <w:r>
-        <w:rPr>
-          <w:rFonts w:cstheme="minorHAnsi"/>
-          <w:lang w:val="en-US"/>
-        </w:rPr>
-        <w:t xml:space="preserve"> (3–6): every curve still answers its RQ, H4 is a full budget curve, and gains from a known location saturate quickly [9].</w:t>
-      </w:r>
-    </w:p>
-    <w:p>
-      <w:pPr>
-        <w:spacing w:after="40" w:line="240" w:lineRule="auto"/>
-        <w:ind w:left="284" w:hanging="284"/>
-        <w:jc w:val="both"/>
-      </w:pPr>
-      <w:r>
-        <w:rPr>
-          <w:rFonts w:cstheme="minorHAnsi"/>
-          <w:lang w:val="en-US"/>
-        </w:rPr>
-        <w:t xml:space="preserve">•	</w:t>
-      </w:r>
-      <w:r>
-        <w:rPr>
-          <w:rFonts w:cstheme="minorHAnsi"/>
-          <w:i/>
-          <w:lang w:val="en-US"/>
-        </w:rPr>
-        <w:t xml:space="preserve">Scooping</w:t>
-      </w:r>
-      <w:r>
-        <w:rPr>
-          <w:rFonts w:cstheme="minorHAnsi"/>
-          <w:lang w:val="en-US"/>
-        </w:rPr>
-        <w:t xml:space="preserve"> (3–6): several groups are one step from a budget curve [12, 18, 32]; H1 is published early (preprint, sem. 4), the literature is re-checked quarterly; we claim the reduction, not the twin.</w:t>
-      </w:r>
-    </w:p>
-    <w:p>
-      <w:pPr>
-        <w:spacing w:after="40" w:line="240" w:lineRule="auto"/>
-        <w:ind w:left="284" w:hanging="284"/>
-        <w:jc w:val="both"/>
-      </w:pPr>
-      <w:r>
-        <w:rPr>
-          <w:rFonts w:cstheme="minorHAnsi"/>
-          <w:lang w:val="en-US"/>
-        </w:rPr>
-        <w:t xml:space="preserve">•	</w:t>
-      </w:r>
-      <w:r>
-        <w:rPr>
-          <w:rFonts w:cstheme="minorHAnsi"/>
-          <w:i/>
-          <w:lang w:val="en-US"/>
-        </w:rPr>
-        <w:t xml:space="preserve">ScanNet++ licence</w:t>
-      </w:r>
-      <w:r>
-        <w:rPr>
-          <w:rFonts w:cstheme="minorHAnsi"/>
-          <w:lang w:val="en-US"/>
-        </w:rPr>
-        <w:t xml:space="preserve"> (3–7): non-commercial, revocable, no redistribution; the supervisor signs; MuSHRoom and own PWr rooms are the releasable fallback; no derived ScanNet++ assets.</w:t>
-      </w:r>
-    </w:p>
-    <w:p>
-      <w:pPr>
-        <w:spacing w:after="40" w:line="240" w:lineRule="auto"/>
-        <w:ind w:left="284" w:hanging="284"/>
-        <w:jc w:val="both"/>
-      </w:pPr>
-      <w:r>
-        <w:rPr>
-          <w:rFonts w:cstheme="minorHAnsi"/>
-          <w:lang w:val="en-US"/>
-        </w:rPr>
-        <w:t xml:space="preserve">•	</w:t>
-      </w:r>
-      <w:r>
-        <w:rPr>
-          <w:rFonts w:cstheme="minorHAnsi"/>
-          <w:i/>
-          <w:lang w:val="en-US"/>
-        </w:rPr>
-        <w:t xml:space="preserve">Compute, robot access</w:t>
-      </w:r>
-      <w:r>
-        <w:rPr>
-          <w:rFonts w:cstheme="minorHAnsi"/>
-          <w:lang w:val="en-US"/>
-        </w:rPr>
-        <w:t xml:space="preserve"> (3–7): standard PLGrid grant and WCSS, smaller models; without a robot, validation moves by a semester (the proxy decides).</w:t>
-      </w:r>
-    </w:p>
-    <w:p>
-      <w:pPr>
-        <w:spacing w:after="40" w:line="240" w:lineRule="auto"/>
-        <w:ind w:left="284" w:hanging="284"/>
-        <w:jc w:val="both"/>
-      </w:pPr>
-      <w:r>
-        <w:rPr>
-          <w:rFonts w:cstheme="minorHAnsi"/>
-          <w:lang w:val="en-US"/>
-        </w:rPr>
-        <w:t xml:space="preserve">•	</w:t>
-      </w:r>
-      <w:r>
-        <w:rPr>
-          <w:rFonts w:cstheme="minorHAnsi"/>
-          <w:i/>
-          <w:lang w:val="en-US"/>
-        </w:rPr>
-        <w:t xml:space="preserve">Rejection</w:t>
-      </w:r>
-      <w:r>
-        <w:rPr>
-          <w:rFonts w:cstheme="minorHAnsi"/>
-          <w:lang w:val="en-US"/>
-        </w:rPr>
-        <w:t xml:space="preserve"> (4–7): resubmission inside the 200-point set 2–4 months later (NeurIPS → CVPR → ICML → ECCV/ICCV).</w:t>
-      </w:r>
-    </w:p>
-    <w:p>
-      <w:pPr>
-        <w:spacing w:after="0" w:line="240" w:lineRule="auto"/>
-        <w:jc w:val="both"/>
-      </w:pPr>
-      <w:r>
-        <w:rPr>
-          <w:rFonts w:cstheme="minorHAnsi"/>
-          <w:b/>
-          <w:lang w:val="en-US"/>
-        </w:rPr>
-        <w:t xml:space="preserve">Prior work, ethics.</w:t>
-      </w:r>
-      <w:r>
-        <w:rPr>
-          <w:rFonts w:cstheme="minorHAnsi"/>
-          <w:lang w:val="en-US"/>
-        </w:rPr>
-        <w:t xml:space="preserve"> A pre-PhD NLP paper (ACL 2025 SRW) is background only. Own captures are anonymized (GDPR); public datasets are used under their licences.</w:t>
+          <w:szCs w:val="24"/>
+          <w:lang w:val="en-US"/>
+        </w:rPr>
+        <w:t xml:space="preserve">                                                                                                                                                  </w:t>
       </w:r>
     </w:p>
     <w:permEnd w:id="1742865563"/>
@@ -9697,8 +6207,7 @@
     </w:p>
     <w:p>
       <w:pPr>
-        <w:spacing w:after="40" w:line="240" w:lineRule="auto"/>
-        <w:ind w:left="284" w:hanging="284"/>
+        <w:spacing w:after="0" w:line="240" w:lineRule="auto"/>
         <w:jc w:val="both"/>
       </w:pPr>
       <w:permStart w:id="1548510783" w:edGrp="everyone"/>
@@ -9707,211 +6216,7 @@
           <w:rFonts w:cstheme="minorHAnsi"/>
           <w:lang w:val="en-US"/>
         </w:rPr>
-        <w:t xml:space="preserve">•	</w:t>
-      </w:r>
-      <w:r>
-        <w:rPr>
-          <w:rFonts w:cstheme="minorHAnsi"/>
-          <w:b/>
-          <w:lang w:val="en-US"/>
-        </w:rPr>
-        <w:t xml:space="preserve">Weekly meeting</w:t>
-      </w:r>
-      <w:r>
-        <w:rPr>
-          <w:rFonts w:cstheme="minorHAnsi"/>
-          <w:lang w:val="en-US"/>
-        </w:rPr>
-        <w:t xml:space="preserve"> (~1 h, in person at K46 or online via MS Teams) to discuss progress, results and next steps.</w:t>
-      </w:r>
-    </w:p>
-    <w:p>
-      <w:pPr>
-        <w:spacing w:after="40" w:line="240" w:lineRule="auto"/>
-        <w:ind w:left="284" w:hanging="284"/>
-        <w:jc w:val="both"/>
-      </w:pPr>
-      <w:r>
-        <w:rPr>
-          <w:rFonts w:cstheme="minorHAnsi"/>
-          <w:lang w:val="en-US"/>
-        </w:rPr>
-        <w:t xml:space="preserve">•	</w:t>
-      </w:r>
-      <w:r>
-        <w:rPr>
-          <w:rFonts w:cstheme="minorHAnsi"/>
-          <w:b/>
-          <w:lang w:val="en-US"/>
-        </w:rPr>
-        <w:t xml:space="preserve">Monthly written progress summary</w:t>
-      </w:r>
-      <w:r>
-        <w:rPr>
-          <w:rFonts w:cstheme="minorHAnsi"/>
-          <w:lang w:val="en-US"/>
-        </w:rPr>
-        <w:t xml:space="preserve"> (completed tasks, results, problems, plan). It lists every IPB task from §3 with its </w:t>
-      </w:r>
-      <w:r>
-        <w:rPr>
-          <w:rFonts w:cstheme="minorHAnsi"/>
-          <w:b/>
-          <w:lang w:val="en-US"/>
-        </w:rPr>
-        <w:t xml:space="preserve">% completion</w:t>
-      </w:r>
-      <w:r>
-        <w:rPr>
-          <w:rFonts w:cstheme="minorHAnsi"/>
-          <w:lang w:val="en-US"/>
-        </w:rPr>
-        <w:t xml:space="preserve">, in the same form as the task table of the mid-term self-report.</w:t>
-      </w:r>
-    </w:p>
-    <w:p>
-      <w:pPr>
-        <w:spacing w:after="40" w:line="240" w:lineRule="auto"/>
-        <w:ind w:left="284" w:hanging="284"/>
-        <w:jc w:val="both"/>
-      </w:pPr>
-      <w:r>
-        <w:rPr>
-          <w:rFonts w:cstheme="minorHAnsi"/>
-          <w:lang w:val="en-US"/>
-        </w:rPr>
-        <w:t xml:space="preserve">•	</w:t>
-      </w:r>
-      <w:r>
-        <w:rPr>
-          <w:rFonts w:cstheme="minorHAnsi"/>
-          <w:b/>
-          <w:lang w:val="en-US"/>
-        </w:rPr>
-        <w:t xml:space="preserve">Semester review</w:t>
-      </w:r>
-      <w:r>
-        <w:rPr>
-          <w:rFonts w:cstheme="minorHAnsi"/>
-          <w:lang w:val="en-US"/>
-        </w:rPr>
-        <w:t xml:space="preserve"> against the IPB schedule (§3), before each annual report and the mid-term evaluation. Deviations from the plan and their reasons are recorded and agreed with the supervisor.</w:t>
-      </w:r>
-    </w:p>
-    <w:p>
-      <w:pPr>
-        <w:spacing w:after="40" w:line="240" w:lineRule="auto"/>
-        <w:ind w:left="284" w:hanging="284"/>
-        <w:jc w:val="both"/>
-      </w:pPr>
-      <w:r>
-        <w:rPr>
-          <w:rFonts w:cstheme="minorHAnsi"/>
-          <w:lang w:val="en-US"/>
-        </w:rPr>
-        <w:t xml:space="preserve">•	</w:t>
-      </w:r>
-      <w:r>
-        <w:rPr>
-          <w:rFonts w:cstheme="minorHAnsi"/>
-          <w:b/>
-          <w:lang w:val="en-US"/>
-        </w:rPr>
-        <w:t xml:space="preserve">Pre-registrations and formal steps.</w:t>
-      </w:r>
-      <w:r>
-        <w:rPr>
-          <w:rFonts w:cstheme="minorHAnsi"/>
-          <w:lang w:val="en-US"/>
-        </w:rPr>
-        <w:t xml:space="preserve"> The supervisor approves the pre-registration of each stage (baselines, thresholds, difficulty regime) before its experiments start, signs the dataset licence application (ScanNet++, Oct 2026) and co-signs the grant applications (§12).</w:t>
-      </w:r>
-    </w:p>
-    <w:p>
-      <w:pPr>
-        <w:spacing w:after="40" w:line="240" w:lineRule="auto"/>
-        <w:ind w:left="284" w:hanging="284"/>
-        <w:jc w:val="both"/>
-      </w:pPr>
-      <w:r>
-        <w:rPr>
-          <w:rFonts w:cstheme="minorHAnsi"/>
-          <w:lang w:val="en-US"/>
-        </w:rPr>
-        <w:t xml:space="preserve">•	</w:t>
-      </w:r>
-      <w:r>
-        <w:rPr>
-          <w:rFonts w:cstheme="minorHAnsi"/>
-          <w:b/>
-          <w:lang w:val="en-US"/>
-        </w:rPr>
-        <w:t xml:space="preserve">Supervisor co-signs</w:t>
-      </w:r>
-      <w:r>
-        <w:rPr>
-          <w:rFonts w:cstheme="minorHAnsi"/>
-          <w:lang w:val="en-US"/>
-        </w:rPr>
-        <w:t xml:space="preserve"> the annual reports and the mid-term self-report (autoreferat).</w:t>
-      </w:r>
-    </w:p>
-    <w:p>
-      <w:pPr>
-        <w:spacing w:after="40" w:line="240" w:lineRule="auto"/>
-        <w:ind w:left="284" w:hanging="284"/>
-        <w:jc w:val="both"/>
-      </w:pPr>
-      <w:r>
-        <w:rPr>
-          <w:rFonts w:cstheme="minorHAnsi"/>
-          <w:lang w:val="en-US"/>
-        </w:rPr>
-        <w:t xml:space="preserve">•	</w:t>
-      </w:r>
-      <w:r>
-        <w:rPr>
-          <w:rFonts w:cstheme="minorHAnsi"/>
-          <w:b/>
-          <w:lang w:val="en-US"/>
-        </w:rPr>
-        <w:t xml:space="preserve">Paper-writing sprints</w:t>
-      </w:r>
-      <w:r>
-        <w:rPr>
-          <w:rFonts w:cstheme="minorHAnsi"/>
-          <w:lang w:val="en-US"/>
-        </w:rPr>
-        <w:t xml:space="preserve"> before each submission deadline, with joint editing in Overleaf. The supervisor co-authors and reviews the papers before submission.</w:t>
-      </w:r>
-    </w:p>
-    <w:p>
-      <w:pPr>
-        <w:spacing w:after="0" w:line="240" w:lineRule="auto"/>
-        <w:ind w:left="284" w:hanging="284"/>
-        <w:jc w:val="both"/>
-      </w:pPr>
-      <w:r>
-        <w:rPr>
-          <w:rFonts w:cstheme="minorHAnsi"/>
-          <w:lang w:val="en-US"/>
-        </w:rPr>
-        <w:t xml:space="preserve">•	</w:t>
-      </w:r>
-      <w:r>
-        <w:rPr>
-          <w:rFonts w:cstheme="minorHAnsi"/>
-          <w:b/>
-          <w:lang w:val="en-US"/>
-        </w:rPr>
-        <w:t xml:space="preserve">Ongoing communication</w:t>
-      </w:r>
-      <w:r>
-        <w:rPr>
-          <w:rFonts w:cstheme="minorHAnsi"/>
-          <w:lang w:val="en-US"/>
-        </w:rPr>
-        <w:t xml:space="preserve"> via e-mail / Teams chat. The code and experiment logs are in a shared Git repository that the supervisor can access.</w:t>
+        <w:t xml:space="preserve">It is planned to have weekly meetings with the supervisor. The meetings are planned to consist of results presentations, discussions, reviews and joint work on papers. The scope of meetings is also supposed to include the evaluation of progress and the planning of further activities. Moreover, it is planned to discuss results, issues and recent advancements in the field with other Ph.D. students weekly, with the supervisor's participation. Day-to-day communication will take place by e-mail and instant messaging.</w:t>
       </w:r>
     </w:p>
     <w:permEnd w:id="1548510783"/>

</xml_diff>

<commit_message>
Wave 20 (ultracode): final IPB - generalization in real-to-sim-to-real for physical AI; judge-panel core RQs, section writers, 3 review rounds with adversarial verification
Co-Authored-By: Claude Opus 5.5 <noreply@anthropic.com>
</commit_message>
<xml_diff>
--- a/output/IPB_Grzegorz_Piotrowski.docx
+++ b/output/IPB_Grzegorz_Piotrowski.docx
@@ -1090,7 +1090,7 @@
           <w:rFonts w:cstheme="minorHAnsi"/>
           <w:lang w:val="en-US"/>
         </w:rPr>
-        <w:t xml:space="preserve">Improving generalization of deep learning models in real-to-sim-to-real transfer for physical AI.</w:t>
+        <w:t xml:space="preserve">Improving the generalization of deep learning models in real-to-sim-to-real transfer for physical AI. (PL: Poprawa zdolności generalizacji modeli uczenia głębokiego w transferze rzeczywistość–symulacja–rzeczywistość dla fizycznej sztucznej inteligencji.)</w:t>
       </w:r>
       <w:bookmarkStart w:id="0" w:name="_Hlk95566638"/>
     </w:p>
@@ -1796,7 +1796,7 @@
                 <w:rFonts w:cstheme="minorHAnsi"/>
                 <w:lang w:val="en-US"/>
               </w:rPr>
-              <w:t xml:space="preserve">1. Literature review in the scope of sim-to-real transfer, domain randomization and domain adaptation, neural scene reconstruction (NeRF, 3D Gaussian Splatting) and learning-based robot navigation and manipulation.</w:t>
+              <w:t xml:space="preserve">1. Literature review in the scope of sim-to-real transfer, domain randomization and domain adaptation, neural scene reconstruction from real data (such as 3D Gaussian Splatting) and deep learning for robot navigation and manipulation.</w:t>
             </w:r>
           </w:p>
           <w:p>
@@ -1809,7 +1809,7 @@
                 <w:rFonts w:cstheme="minorHAnsi"/>
                 <w:lang w:val="en-US"/>
               </w:rPr>
-              <w:t xml:space="preserve">2. Identification of the most important research gaps in the generalization of models trained in simulation and in digital twins.</w:t>
+              <w:t xml:space="preserve">2. Identification of the most important research gaps in the generalization of deep learning models trained in simulations built from real data.</w:t>
             </w:r>
           </w:p>
           <w:p>
@@ -1896,7 +1896,7 @@
                 <w:rFonts w:cstheme="minorHAnsi"/>
                 <w:lang w:val="en-US"/>
               </w:rPr>
-              <w:t xml:space="preserve">1. Continuation of the literature review – participation in the internal reading group, discussing novel methods in sim-to-real transfer and embodied AI.</w:t>
+              <w:t xml:space="preserve">1. Continuation of the literature review - participation in the internal reading group, discussing novel methods regarding sim-to-real transfer and physical AI.</w:t>
             </w:r>
           </w:p>
           <w:p>
@@ -1909,7 +1909,7 @@
                 <w:rFonts w:cstheme="minorHAnsi"/>
                 <w:lang w:val="en-US"/>
               </w:rPr>
-              <w:t xml:space="preserve">2. Initial experiments with building digital twins from real captures and training navigation models in them.</w:t>
+              <w:t xml:space="preserve">2. Initial pilot experiments on reconstructing real scenes with 3D Gaussian Splatting and importing them into a navigation simulator, with regard to the gaps identified during the literature review.</w:t>
             </w:r>
           </w:p>
           <w:p>
@@ -1935,7 +1935,7 @@
                 <w:rFonts w:cstheme="minorHAnsi"/>
                 <w:lang w:val="en-US"/>
               </w:rPr>
-              <w:t xml:space="preserve">4. Participation in a machine learning summer school or conference with a poster.</w:t>
+              <w:t xml:space="preserve">4. Participation in the Doctoral School courses.</w:t>
             </w:r>
             <w:permEnd w:id="1791499248"/>
           </w:p>
@@ -1996,7 +1996,7 @@
                 <w:rFonts w:cstheme="minorHAnsi"/>
                 <w:lang w:val="en-US"/>
               </w:rPr>
-              <w:t xml:space="preserve">1. Continuation of the literature review – participation in the internal reading group.</w:t>
+              <w:t xml:space="preserve">1. Continuation of the literature review - participation in the internal reading group, discussing novel methods regarding sim-to-real transfer and physical AI.</w:t>
             </w:r>
           </w:p>
           <w:p>
@@ -2009,7 +2009,7 @@
                 <w:rFonts w:cstheme="minorHAnsi"/>
                 <w:lang w:val="en-US"/>
               </w:rPr>
-              <w:t xml:space="preserve">2. Conducting research on which properties of digital twins built from real data determine the generalization of models trained in them.</w:t>
+              <w:t xml:space="preserve">2. Preparation of the research environment, including real scene captures, simulations built from them, a manipulation environment with hidden visual and physical parameters, and computing resources.</w:t>
             </w:r>
           </w:p>
           <w:p>
@@ -2022,7 +2022,7 @@
                 <w:rFonts w:cstheme="minorHAnsi"/>
                 <w:lang w:val="en-US"/>
               </w:rPr>
-              <w:t xml:space="preserve">3. Preparation of the experimental environment (public datasets of real scenes, simulator, reconstruction tools) and applications for computing resources (PLGrid) and a small research grant (SzD Minigrant).</w:t>
+              <w:t xml:space="preserve">3. Conducting research on which components of the discrepancy between a simulation built from real data and reality determine the generalization of models trained in it.</w:t>
             </w:r>
           </w:p>
           <w:p>
@@ -2035,7 +2035,7 @@
                 <w:rFonts w:cstheme="minorHAnsi"/>
                 <w:lang w:val="en-US"/>
               </w:rPr>
-              <w:t xml:space="preserve">4. Writing a scientific article for a conference from the ministerial list (regarding generalization-aware digital twins).</w:t>
+              <w:t xml:space="preserve">4. Carrying out initial analysis of where inside a model trained in simulation the simulation-to-reality gap arises.</w:t>
             </w:r>
             <w:permEnd w:id="1413760106"/>
           </w:p>
@@ -2096,7 +2096,7 @@
                 <w:rFonts w:cstheme="minorHAnsi"/>
                 <w:lang w:val="en-US"/>
               </w:rPr>
-              <w:t xml:space="preserve">1. Continuation of the literature review – participation in the internal reading group.</w:t>
+              <w:t xml:space="preserve">1. Continuation of the literature review - participation in the internal reading group, discussing novel methods regarding sim-to-real transfer and physical AI.</w:t>
             </w:r>
           </w:p>
           <w:p>
@@ -2109,7 +2109,7 @@
                 <w:rFonts w:cstheme="minorHAnsi"/>
                 <w:lang w:val="en-US"/>
               </w:rPr>
-              <w:t xml:space="preserve">2. Continuing and finishing the research on generalization-aware digital twins.</w:t>
+              <w:t xml:space="preserve">2. Continuing and finishing the research on the components of the simulation-to-reality discrepancy, including physical components in the manipulation setting, and on shaping the training distribution to target the harmful components.</w:t>
             </w:r>
           </w:p>
           <w:p>
@@ -2122,7 +2122,7 @@
                 <w:rFonts w:cstheme="minorHAnsi"/>
                 <w:lang w:val="en-US"/>
               </w:rPr>
-              <w:t xml:space="preserve">3. Research on learning representations invariant to the difference between simulation and reality.</w:t>
+              <w:t xml:space="preserve">3. Writing a scientific article for a conference from the ministerial list (regarding the components of the simulation-to-reality discrepancy that determine generalization).</w:t>
             </w:r>
           </w:p>
           <w:p>
@@ -2135,7 +2135,7 @@
                 <w:rFonts w:cstheme="minorHAnsi"/>
                 <w:lang w:val="en-US"/>
               </w:rPr>
-              <w:t xml:space="preserve">4. Preparation of the Preludium research grant proposal to the National Science Centre.</w:t>
+              <w:t xml:space="preserve">4. Continuing the research on localizing the simulation-to-reality gap inside the model and on task-relevant invariant representations.</w:t>
             </w:r>
           </w:p>
           <w:p>
@@ -2148,7 +2148,20 @@
                 <w:rFonts w:cstheme="minorHAnsi"/>
                 <w:lang w:val="en-US"/>
               </w:rPr>
-              <w:t xml:space="preserve">5. Participation in a scientific conference, preferably with own article.</w:t>
+              <w:t xml:space="preserve">5. Preparation of the Preludium research grant proposal to the National Science Centre.</w:t>
+            </w:r>
+          </w:p>
+          <w:p>
+            <w:pPr>
+              <w:spacing w:after="40" w:line="240" w:lineRule="auto"/>
+              <w:jc w:val="left"/>
+            </w:pPr>
+            <w:r>
+              <w:rPr>
+                <w:rFonts w:cstheme="minorHAnsi"/>
+                <w:lang w:val="en-US"/>
+              </w:rPr>
+              <w:t xml:space="preserve">6. Participation in an international scientific conference.</w:t>
             </w:r>
             <w:permEnd w:id="379417658"/>
           </w:p>
@@ -2210,7 +2223,7 @@
                 <w:rFonts w:cstheme="minorHAnsi"/>
                 <w:lang w:val="en-US"/>
               </w:rPr>
-              <w:t xml:space="preserve">1. Continuation of the literature review – participation in the internal reading group.</w:t>
+              <w:t xml:space="preserve">1. Continuation of the literature review - participation in the internal reading group, discussing novel methods regarding sim-to-real transfer and physical AI.</w:t>
             </w:r>
           </w:p>
           <w:p>
@@ -2223,7 +2236,7 @@
                 <w:rFonts w:cstheme="minorHAnsi"/>
                 <w:lang w:val="en-US"/>
               </w:rPr>
-              <w:t xml:space="preserve">2. Continuing research on sim-to-real invariant representations, including the use of pretrained foundation models and learned world models.</w:t>
+              <w:t xml:space="preserve">2. Finishing the research on localizing the simulation-to-reality gap and on task-relevant invariance at that location.</w:t>
             </w:r>
           </w:p>
           <w:p>
@@ -2236,7 +2249,7 @@
                 <w:rFonts w:cstheme="minorHAnsi"/>
                 <w:lang w:val="en-US"/>
               </w:rPr>
-              <w:t xml:space="preserve">3. Research on adapting models trained in simulation to reality with a small amount of real data.</w:t>
+              <w:t xml:space="preserve">3. Writing a scientific article for a conference from the ministerial list (regarding the localization of the simulation-to-reality gap inside deep models).</w:t>
             </w:r>
           </w:p>
           <w:p>
@@ -2249,7 +2262,7 @@
                 <w:rFonts w:cstheme="minorHAnsi"/>
                 <w:lang w:val="en-US"/>
               </w:rPr>
-              <w:t xml:space="preserve">4. Validation of the results on a real mobile robot.</w:t>
+              <w:t xml:space="preserve">4. Carrying out research on selecting real data under a limited budget to correct both the simulation and the model.</w:t>
             </w:r>
           </w:p>
           <w:p>
@@ -2262,7 +2275,7 @@
                 <w:rFonts w:cstheme="minorHAnsi"/>
                 <w:lang w:val="en-US"/>
               </w:rPr>
-              <w:t xml:space="preserve">5. Writing a scientific article for a conference from the ministerial list (regarding invariant representations and adaptation).</w:t>
+              <w:t xml:space="preserve">5. Initial validation of the developed navigation methods on a real mobile robot.</w:t>
             </w:r>
             <w:permEnd w:id="930623221"/>
           </w:p>
@@ -2324,7 +2337,7 @@
                 <w:rFonts w:cstheme="minorHAnsi"/>
                 <w:lang w:val="en-US"/>
               </w:rPr>
-              <w:t xml:space="preserve">1. Continuation of the literature review – participation in the internal reading group.</w:t>
+              <w:t xml:space="preserve">1. Continuation of the literature review - participation in the internal reading group, discussing novel methods regarding sim-to-real transfer and physical AI.</w:t>
             </w:r>
           </w:p>
           <w:p>
@@ -2337,7 +2350,7 @@
                 <w:rFonts w:cstheme="minorHAnsi"/>
                 <w:lang w:val="en-US"/>
               </w:rPr>
-              <w:t xml:space="preserve">2. Research on the generalization of the developed methods to unseen environments and to another physical task (robotic manipulation).</w:t>
+              <w:t xml:space="preserve">2. Continuing and finishing the research on the selection of real data for correcting both the simulation and the model.</w:t>
             </w:r>
           </w:p>
           <w:p>
@@ -2350,7 +2363,7 @@
                 <w:rFonts w:cstheme="minorHAnsi"/>
                 <w:lang w:val="en-US"/>
               </w:rPr>
-              <w:t xml:space="preserve">3. Research internship at a foreign research centre working on robot learning.</w:t>
+              <w:t xml:space="preserve">3. Writing a scientific article for a conference from the ministerial list (regarding the selection of real data under a limited budget).</w:t>
             </w:r>
           </w:p>
           <w:p>
@@ -2363,7 +2376,20 @@
                 <w:rFonts w:cstheme="minorHAnsi"/>
                 <w:lang w:val="en-US"/>
               </w:rPr>
-              <w:t xml:space="preserve">4. Writing a scientific article for a conference from the ministerial list (regarding generalization across scenes and tasks).</w:t>
+              <w:t xml:space="preserve">4. Research on the generalization of the developed methods to unseen environments and to robotic manipulation as a controlled second task.</w:t>
+            </w:r>
+          </w:p>
+          <w:p>
+            <w:pPr>
+              <w:spacing w:after="40" w:line="240" w:lineRule="auto"/>
+              <w:jc w:val="left"/>
+            </w:pPr>
+            <w:r>
+              <w:rPr>
+                <w:rFonts w:cstheme="minorHAnsi"/>
+                <w:lang w:val="en-US"/>
+              </w:rPr>
+              <w:t xml:space="preserve">5. Research internship at a foreign research group working on robot learning and sim-to-real transfer.</w:t>
             </w:r>
             <w:permEnd w:id="1544439300"/>
           </w:p>
@@ -2425,7 +2451,7 @@
                 <w:rFonts w:cstheme="minorHAnsi"/>
                 <w:lang w:val="en-US"/>
               </w:rPr>
-              <w:t xml:space="preserve">1. Continuation of the literature review – participation in the internal reading group.</w:t>
+              <w:t xml:space="preserve">1. Continuation of the literature review - participation in the internal reading group, discussing novel methods regarding sim-to-real transfer and physical AI.</w:t>
             </w:r>
           </w:p>
           <w:p>
@@ -2438,7 +2464,7 @@
                 <w:rFonts w:cstheme="minorHAnsi"/>
                 <w:lang w:val="en-US"/>
               </w:rPr>
-              <w:t xml:space="preserve">2. Finishing the studies, final experiments and validation on a real robot, and writing an article for a conference from the ministerial list based on the obtained outcomes.</w:t>
+              <w:t xml:space="preserve">2. Finishing the studies on the generalization of the developed methods across environments and tasks, including final validation of navigation on a real robot.</w:t>
             </w:r>
           </w:p>
           <w:p>
@@ -2451,7 +2477,7 @@
                 <w:rFonts w:cstheme="minorHAnsi"/>
                 <w:lang w:val="en-US"/>
               </w:rPr>
-              <w:t xml:space="preserve">3. Participation in a scientific conference.</w:t>
+              <w:t xml:space="preserve">3. Writing a scientific article for a conference from the ministerial list (regarding which properties of the shift explain when improvements generalize).</w:t>
             </w:r>
           </w:p>
           <w:p>
@@ -2464,7 +2490,20 @@
                 <w:rFonts w:cstheme="minorHAnsi"/>
                 <w:lang w:val="en-US"/>
               </w:rPr>
-              <w:t xml:space="preserve">4. Preparing the structure and sketch of the doctoral dissertation.</w:t>
+              <w:t xml:space="preserve">4. Participation in an international scientific conference.</w:t>
+            </w:r>
+          </w:p>
+          <w:p>
+            <w:pPr>
+              <w:spacing w:after="40" w:line="240" w:lineRule="auto"/>
+              <w:jc w:val="left"/>
+            </w:pPr>
+            <w:r>
+              <w:rPr>
+                <w:rFonts w:cstheme="minorHAnsi"/>
+                <w:lang w:val="en-US"/>
+              </w:rPr>
+              <w:t xml:space="preserve">5. Preparing the structure and sketch of the doctoral dissertation.</w:t>
             </w:r>
             <w:permEnd w:id="565201535"/>
           </w:p>
@@ -2525,7 +2564,20 @@
                 <w:rFonts w:cstheme="minorHAnsi"/>
                 <w:lang w:val="en-US"/>
               </w:rPr>
-              <w:t xml:space="preserve">Editing the doctoral dissertation, preparation of the final version of the document.</w:t>
+              <w:t xml:space="preserve">1. Preparation of a journal article from the ministerial list summarizing the results on the generalization of the developed methods across environments and tasks.</w:t>
+            </w:r>
+          </w:p>
+          <w:p>
+            <w:pPr>
+              <w:spacing w:after="40" w:line="240" w:lineRule="auto"/>
+              <w:jc w:val="left"/>
+            </w:pPr>
+            <w:r>
+              <w:rPr>
+                <w:rFonts w:cstheme="minorHAnsi"/>
+                <w:lang w:val="en-US"/>
+              </w:rPr>
+              <w:t xml:space="preserve">2. Editing the doctoral dissertation, preparation of the final version of the document.</w:t>
             </w:r>
             <w:permEnd w:id="490215942"/>
           </w:p>
@@ -3202,7 +3254,7 @@
           <w:rFonts w:cstheme="minorHAnsi"/>
           <w:lang w:val="en-US"/>
         </w:rPr>
-        <w:t xml:space="preserve">Deep learning has led to impressive results in computer vision and natural language processing, and it is now increasingly applied to physical AI: robots and other embodied systems that perceive and act in the real world, such as mobile robots navigating buildings or robotic arms manipulating objects. Unlike models trained on images or text, such models need very large amounts of interaction data, which is slow, expensive and sometimes unsafe to collect in the real world. Therefore, they are commonly trained in simulation. Recently, digital twins built from real data became a promising alternative to hand-made simulators: neural scene reconstruction methods, such as Neural Radiance Fields and 3D Gaussian Splatting, turn a short video of a real place into a photorealistic 3D model in which a robot can be trained at scale. This gives the real-to-sim-to-real loop: real data is transferred into a simulation, a model is trained there, and the model is transferred back to the real world.</w:t>
+        <w:t xml:space="preserve">Deep learning has brought remarkable progress in computer vision and natural language processing, largely thanks to vast amounts of data collected from the web. Physical AI, i.e., AI in robots and other embodied systems that perceive and act in the real world, cannot rely on such data. Its models need interaction data, which are slow, expensive and sometimes unsafe to collect with real robots. Therefore, such models are commonly trained in simulation. Recently, simulations built from real data have become a promising alternative to hand-crafted simulators: neural scene reconstruction methods, such as 3D Gaussian Splatting, turn a short recording of a real place into a photorealistic digital twin in which a model can be trained at scale. This forms a real-to-sim-to-real loop, in which real data are turned into a simulation, a model is trained there, and the model is transferred back to reality.</w:t>
       </w:r>
     </w:p>
     <w:p>
@@ -3215,12 +3267,12 @@
           <w:rFonts w:cstheme="minorHAnsi"/>
           <w:lang w:val="en-US"/>
         </w:rPr>
-        <w:t xml:space="preserve">However, the usefulness of this loop depends entirely on how well the trained models generalize. A model that performs very well in simulation often fails in reality, because a digital twin never reproduces the real world exactly: appearance, lighting, geometry and physical properties differ. Moreover, models often fail again in places or tasks that were not seen during training. This sim-to-real generalization gap remains one of the main obstacles for physical AI. The methods proposed so far, such as domain randomization, rely largely on hand-tuned heuristics, are typically evaluated on a single task and a few scenes, and do not explain which properties of the simulation and of the learned representations actually determine generalization to reality. Therefore, the dissertation aims at developing methods that improve the generalization of deep learning models trained in real-to-sim-to-real loops, with a particular focus on the digital twin itself, the representations learned in it, and the adaptation of models to reality with little real data.</w:t>
-      </w:r>
-    </w:p>
-    <w:p>
-      <w:pPr>
-        <w:spacing w:after="0" w:line="240" w:lineRule="auto"/>
+        <w:t xml:space="preserve">However, the value of this loop depends on how well the trained models generalize. A model that performs well in simulation often fails in reality, since no simulation reproduces the real world exactly: appearance, geometry, lighting and physics are only approximated, and reconstruction errors differ between regions of a scene. This simulation-to-reality generalization gap is caused by the shift between the distributions of simulated and real data, which makes it a particular case of learning under distribution shift and a central obstacle to physical AI. The methods proposed so far have several limitations. Domain randomization, even when fitted to real data, varies a few global parameters regardless of where the simulation is inaccurate, and invariant representations may discard information needed for the task. Moreover, the real data used for adaptation are usually chosen at random, by hand or by simple heuristics such as observed failures, and serve to correct either the model or the simulation, but not both. Finally, most methods are evaluated on a single task and a few scenes, and it is not known which properties of the simulation and of the learned representations determine whether a model generalizes to reality.</w:t>
+      </w:r>
+    </w:p>
+    <w:p>
+      <w:pPr>
+        <w:spacing w:after="120" w:line="240" w:lineRule="auto"/>
         <w:jc w:val="both"/>
       </w:pPr>
       <w:r>
@@ -3228,7 +3280,20 @@
           <w:rFonts w:cstheme="minorHAnsi"/>
           <w:lang w:val="en-US"/>
         </w:rPr>
-        <w:t xml:space="preserve">The research is relevant to machine learning in general, as it concerns learning under distribution shift and the generalization of representations, and it could help to understand why models trained on synthetic data succeed or fail on real data. The results have potential applications in service and logistic robotics, where robots could be trained in a digital copy of a new warehouse, hospital or office and work there reliably, as well as in autonomous systems and any other domain where models are trained on simulated or reconstructed data and used on real sensor data.</w:t>
+        <w:t xml:space="preserve">Therefore, the dissertation aims to improve the generalization of deep learning models in real-to-sim-to-real transfer at the points of the loop where the gap arises. The research shall focus on understanding which errors of a simulation built from real data are harmful to generalization, on localizing where inside a model the gap arises and reducing it there, on choosing the small amount of real data that corrects both the simulation and the model most efficiently, and on verifying whether the obtained improvements carry over to unseen environments and to another physical task, and which properties of the shift explain when they do. Robot navigation shall serve as the main testbed and robotic manipulation as the second task. Beyond more reliable models, the research could help explain why models trained on synthetic data succeed or fail on real data, which is relevant to machine learning in general.</w:t>
+      </w:r>
+    </w:p>
+    <w:p>
+      <w:pPr>
+        <w:spacing w:after="0" w:line="240" w:lineRule="auto"/>
+        <w:jc w:val="both"/>
+      </w:pPr>
+      <w:r>
+        <w:rPr>
+          <w:rFonts w:cstheme="minorHAnsi"/>
+          <w:lang w:val="en-US"/>
+        </w:rPr>
+        <w:t xml:space="preserve">The results have potential applications in service, logistics and assistive robotics, where a robot could be trained in a digital copy of a new warehouse, hospital or home and operate there reliably after little real-world adaptation. More broadly, they concern any domain in which models are trained on simulated or reconstructed data and deployed on real sensor data, such as autonomous driving or inspection robots.</w:t>
       </w:r>
     </w:p>
     <w:permEnd w:id="1178868985"/>
@@ -3598,7 +3663,7 @@
           <w:rFonts w:cstheme="minorHAnsi"/>
           <w:lang w:val="en-US"/>
         </w:rPr>
-        <w:t xml:space="preserve">Deep reinforcement and imitation learning made it possible to train robots for complex tasks such as visual navigation and manipulation. Since such methods require very large amounts of experience, simulation became the standard training environment. Platforms such as Habitat [1] and ManiSkill3 [2] allow training at the scale of billions of steps, and in simulation point-goal navigation has been practically solved [3]. However, the performance of models in simulation does not always predict their performance in the real world [4], and the transfer of models from simulation to reality, known as the sim-to-real problem, remains one of the central challenges of robot learning [5, 6].</w:t>
+        <w:t xml:space="preserve">Deep learning models for navigation and manipulation need more experience than real robots can provide, so they are usually trained in simulation. However, performance in simulation can be an unreliable predictor of real-world performance unless the simulator is carefully tuned [1], and higher fidelity alone does not ensure better transfer [2]. This is an instance of learning under distribution shift: domain adaptation theory bounds the error of a model on the target domain by its error on the source domain and the discrepancy between the two distributions [3]. This suggests two levers: a training distribution that covers reality, and a model insensitive to the remaining discrepancy.</w:t>
       </w:r>
     </w:p>
     <w:p>
@@ -3611,21 +3676,7 @@
           <w:rFonts w:cstheme="minorHAnsi"/>
           <w:lang w:val="en-US"/>
         </w:rPr>
-        <w:t xml:space="preserve">The most common approach to the sim-to-real problem is domain randomization, which varies the appearance</w:t>
-      </w:r>
-    </w:p>
-    <w:p>
-      <w:pPr>
-        <w:spacing w:after="0" w:line="240" w:lineRule="auto"/>
-        <w:ind w:left="397" w:hanging="397"/>
-        <w:jc w:val="left"/>
-      </w:pPr>
-      <w:r>
-        <w:rPr>
-          <w:rFonts w:cstheme="minorHAnsi"/>
-          <w:lang w:val="en-US"/>
-        </w:rPr>
-        <w:t xml:space="preserve">[7] or the dynamics [8] of the simulation so that reality appears as one more variation. Other works adapt</w:t>
+        <w:t xml:space="preserve">The first lever is exploited by domain randomization, which varies simulator parameters such as textures so that reality appears as one more variation [4]. Since overly wide randomization leads to conservative behaviour, later works shape its distribution: they fit it to a few real rollouts [5], infer a posterior over simulator parameters [6], or maximize its entropy while preserving task success [7]. Yet they act on a few global parameters of a synthetic simulator, not on errors that vary across a scene.</w:t>
       </w:r>
     </w:p>
     <w:p>
@@ -3638,7 +3689,7 @@
           <w:rFonts w:cstheme="minorHAnsi"/>
           <w:lang w:val="en-US"/>
         </w:rPr>
-        <w:t xml:space="preserve">the parameters of the simulator to a few real-world rollouts [9]. Interestingly, the fidelity of the simulator alone does not guarantee better transfer, as lower-fidelity simulation can transfer better in navigation [10]. From the machine learning perspective, the sim-to-real problem is an instance of learning under distribution shift. Domain adaptation theory bounds the error on the target domain by the error on the source domain and a discrepancy between the two domains [11], and domain-adversarial training learns representations that are invariant across domains [12]. Nevertheless, such principled approaches are rarely applied to models trained in simulation for physical tasks, where randomization heuristics dominate.</w:t>
+        <w:t xml:space="preserve">The second lever is invariance. Domain-adversarial training aligns features across domains [8]. In robotics, randomized and real images were mapped to a canonical image [9], and aligning the joint distributions of observations and actions in simulated and real data improved co-trained policies in reality [10]. However, invariance with low source error does not guarantee transfer [11], and full invariance may discard task information. Moreover, it is usually enforced at a fixed location, the input or final features.</w:t>
       </w:r>
     </w:p>
     <w:p>
@@ -3651,7 +3702,7 @@
           <w:rFonts w:cstheme="minorHAnsi"/>
           <w:lang w:val="en-US"/>
         </w:rPr>
-        <w:t xml:space="preserve">A major recent development is the construction of simulations directly from real data. Neural Radiance Fields [13] and 3D Gaussian Splatting [14] reconstruct photorealistic 3D scenes from ordinary images, and datasets such as ScanNet++ [15] provide real indoor scenes captured both with high-end and consumer devices. Such digital twins have been used to train navigation models from a phone capture of a room [16] or from monocular videos of urban scenes [17], and robotic manipulation policies from a scan of the target scene [18], showing that real-to-sim-to-real learning improves real-world performance in comparison with generic simulators. The physical parameters of a digital twin can be estimated from a small amount of real data [19]. However, these works treat the digital twin mostly as a fixed, as-accurate-as-possible copy of reality. It is not known which properties of a twin (appearance, geometry, lighting or physics) actually determine the generalization of the trained models, and the twins are randomized uniformly rather than according to where they are uncertain or where it matters for the task. Moreover, the evaluation is usually limited to a handful of scenes and a single task.</w:t>
+        <w:t xml:space="preserve">A recent development is building simulations from real data. 3D Gaussian Splatting [12] reconstructs photorealistic scenes from ordinary images, and digital twins built from real data have been used to train manipulation policies from a scan of the target scene [13] and navigation policies from a phone capture of a room [14]. In twins, uncertainty has so far been modelled mainly for physical parameters [15]; beyond this, a twin is typically treated as a fixed copy of reality. It is unknown which of its errors, in appearance, geometry, lighting or physics, harm generalization, and existing training variation ignores how uncertain the reconstruction is in each region.</w:t>
       </w:r>
     </w:p>
     <w:p>
@@ -3664,7 +3715,7 @@
           <w:rFonts w:cstheme="minorHAnsi"/>
           <w:lang w:val="en-US"/>
         </w:rPr>
-        <w:t xml:space="preserve">In parallel, pretrained foundation models changed how robot policies are built. General navigation models trained on data from many robots [20, 21] and vision-language-action models [22] transfer to new robots and environments, and self-supervised visual encoders [23] provide representations that are robust to many appearance changes. Learned world models predict future observations and can be used for planning in navigation [24]. These models are a promising basis for generalization, but it has not been studied how their representations behave under the specific shift between a digital twin and reality, and how they should be trained in a twin so that this shift does not harm their performance. Finally, adapting a model trained in simulation to reality usually relies on real data collected at random or by hand, and on co-training with simulated data [25], without selecting the real data that is most informative about the remaining gap.</w:t>
+        <w:t xml:space="preserve">It is also unclear where inside a model the gap arises. Self-supervised features are robust to many appearance changes [16], yet no representation dominates across navigation, manipulation and locomotion [17], and manipulation encoders degrade under lighting and texture shifts [18]. Probing showed that action fine-tuning degrades the visual representations of robot policies [19], and the best layers to adapt depend on the type of shift [20], but neither localizes the gap in models trained in reconstructed simulations.</w:t>
       </w:r>
     </w:p>
     <w:p>
@@ -3677,7 +3728,33 @@
           <w:rFonts w:cstheme="minorHAnsi"/>
           <w:lang w:val="en-US"/>
         </w:rPr>
-        <w:t xml:space="preserve">In summary, the literature shows that real-to-sim-to-real learning is effective, but the generalization of the trained models to reality, to unseen scenes and to other tasks is still limited and poorly understood. The proposed dissertation addresses this gap by studying the generalization of deep learning models at each stage of the real-to-sim-to-real loop.</w:t>
+        <w:t xml:space="preserve">The remaining gap is usually reduced with little real data. Co-training with a small real set yields large gains [21], and active system identification collects the real trajectories most informative about physics [22]. In vision, selecting images to label by domain discrepancy and uncertainty beats random selection [23]. The closest work uses a twin to find failure-prone configurations for real rollouts [24]. However, robotic methods correct either the model or the simulation and choose real data at random, by hand, at the model's failures, or by their informativeness about physical parameters; to the best of our knowledge, none uses the reconstruction uncertainty of a simulation built from real data, or the same data to correct both.</w:t>
+      </w:r>
+    </w:p>
+    <w:p>
+      <w:pPr>
+        <w:spacing w:after="120" w:line="240" w:lineRule="auto"/>
+        <w:jc w:val="both"/>
+      </w:pPr>
+      <w:r>
+        <w:rPr>
+          <w:rFonts w:cstheme="minorHAnsi"/>
+          <w:lang w:val="en-US"/>
+        </w:rPr>
+        <w:t xml:space="preserve">Finally, generalization to unseen scenes depends on training-scene diversity [25], and the gap can be decomposed into factors of variation whose difficulty ordering is largely consistent between simulation and reality [26]. However, it is rarely studied whether a sim-to-real method keeps its benefit when the scene or the task changes.</w:t>
+      </w:r>
+    </w:p>
+    <w:p>
+      <w:pPr>
+        <w:spacing w:after="120" w:line="240" w:lineRule="auto"/>
+        <w:jc w:val="both"/>
+      </w:pPr>
+      <w:r>
+        <w:rPr>
+          <w:rFonts w:cstheme="minorHAnsi"/>
+          <w:lang w:val="en-US"/>
+        </w:rPr>
+        <w:t xml:space="preserve">In summary, it is open which simulation errors govern generalization, where inside a model the gap arises, which real data best correct model and simulation, and when improvements hold in new environments and tasks; these gaps motivate the questions in Section 7.</w:t>
       </w:r>
     </w:p>
     <w:p>
@@ -3706,7 +3783,7 @@
           <w:rFonts w:cstheme="minorHAnsi"/>
           <w:lang w:val="en-US"/>
         </w:rPr>
-        <w:t xml:space="preserve">[1] Savva, M., Kadian, A., Maksymets, O., et al. (2019). Habitat: A platform for embodied AI research. ICCV.</w:t>
+        <w:t xml:space="preserve">[1] Kadian, A., et al. (2020). Sim2Real predictivity: Does evaluation in simulation predict real-world performance? RA-L.</w:t>
       </w:r>
     </w:p>
     <w:p>
@@ -3720,7 +3797,7 @@
           <w:rFonts w:cstheme="minorHAnsi"/>
           <w:lang w:val="en-US"/>
         </w:rPr>
-        <w:t xml:space="preserve">[2] Tao, S., et al. (2025). ManiSkill3: GPU parallelized robotics simulation and rendering for generalizable embodied AI. RSS.</w:t>
+        <w:t xml:space="preserve">[2] Truong, J., et al. (2022). Rethinking sim2real: Lower fidelity simulation leads to higher sim2real transfer in navigation. CoRL.</w:t>
       </w:r>
     </w:p>
     <w:p>
@@ -3734,7 +3811,7 @@
           <w:rFonts w:cstheme="minorHAnsi"/>
           <w:lang w:val="en-US"/>
         </w:rPr>
-        <w:t xml:space="preserve">[3] Wijmans, E., et al. (2020). DD-PPO: Learning near-perfect PointGoal navigators from 2.5 billion frames. ICLR.</w:t>
+        <w:t xml:space="preserve">[3] Ben-David, S., et al. (2010). A theory of learning from different domains. Machine Learning.</w:t>
       </w:r>
     </w:p>
     <w:p>
@@ -3748,7 +3825,7 @@
           <w:rFonts w:cstheme="minorHAnsi"/>
           <w:lang w:val="en-US"/>
         </w:rPr>
-        <w:t xml:space="preserve">[4] Kadian, A., et al. (2020). Sim2Real predictivity: Does evaluation in simulation predict real-world performance? IEEE Robotics and Automation Letters, 5(4).</w:t>
+        <w:t xml:space="preserve">[4] Tobin, J., et al. (2017). Domain randomization for transferring deep neural networks from simulation to the real world. IROS.</w:t>
       </w:r>
     </w:p>
     <w:p>
@@ -3762,7 +3839,7 @@
           <w:rFonts w:cstheme="minorHAnsi"/>
           <w:lang w:val="en-US"/>
         </w:rPr>
-        <w:t xml:space="preserve">[5] Zhao, W., Queralta, J. P., &amp; Westerlund, T. (2020). Sim-to-real transfer in deep reinforcement learning for robotics: a survey. IEEE SSCI.</w:t>
+        <w:t xml:space="preserve">[5] Chebotar, Y., et al. (2019). Closing the sim-to-real loop: Adapting simulation randomization with real world experience. ICRA.</w:t>
       </w:r>
     </w:p>
     <w:p>
@@ -3776,7 +3853,7 @@
           <w:rFonts w:cstheme="minorHAnsi"/>
           <w:lang w:val="en-US"/>
         </w:rPr>
-        <w:t xml:space="preserve">[6] Höfer, S., et al. (2021). Sim2Real in robotics and automation: Applications and challenges. IEEE Transactions on Automation Science and Engineering, 18(2).</w:t>
+        <w:t xml:space="preserve">[6] Ramos, F., et al. (2019). BayesSim: Adaptive domain randomization via probabilistic inference for robotics simulators. RSS.</w:t>
       </w:r>
     </w:p>
     <w:p>
@@ -3790,7 +3867,7 @@
           <w:rFonts w:cstheme="minorHAnsi"/>
           <w:lang w:val="en-US"/>
         </w:rPr>
-        <w:t xml:space="preserve">[7] Tobin, J., et al. (2017). Domain randomization for transferring deep neural networks from simulation to the real world. IROS.</w:t>
+        <w:t xml:space="preserve">[7] Tiboni, G., et al. (2024). Domain randomization via entropy maximization. ICLR.</w:t>
       </w:r>
     </w:p>
     <w:p>
@@ -3804,7 +3881,7 @@
           <w:rFonts w:cstheme="minorHAnsi"/>
           <w:lang w:val="en-US"/>
         </w:rPr>
-        <w:t xml:space="preserve">[8] Peng, X. B., Andrychowicz, M., Zaremba, W., &amp; Abbeel, P. (2018). Sim-to-real transfer of robotic control with dynamics randomization. ICRA.</w:t>
+        <w:t xml:space="preserve">[8] Ganin, Y., et al. (2016). Domain-adversarial training of neural networks. JMLR.</w:t>
       </w:r>
     </w:p>
     <w:p>
@@ -3818,7 +3895,7 @@
           <w:rFonts w:cstheme="minorHAnsi"/>
           <w:lang w:val="en-US"/>
         </w:rPr>
-        <w:t xml:space="preserve">[9] Chebotar, Y., et al. (2019). Closing the sim-to-real loop: Adapting simulation randomization with real world experience. ICRA.</w:t>
+        <w:t xml:space="preserve">[9] James, S., et al. (2019). Sim-to-real via sim-to-sim: Data-efficient robotic grasping via randomized-to-canonical adaptation networks. CVPR.</w:t>
       </w:r>
     </w:p>
     <w:p>
@@ -3832,7 +3909,7 @@
           <w:rFonts w:cstheme="minorHAnsi"/>
           <w:lang w:val="en-US"/>
         </w:rPr>
-        <w:t xml:space="preserve">[10] Truong, J., et al. (2022). Rethinking sim2real: Lower fidelity simulation leads to higher sim2real transfer in navigation. CoRL.</w:t>
+        <w:t xml:space="preserve">[10] Cheng, S., et al. (2025). Generalizable domain adaptation for sim-and-real policy co-training. NeurIPS.</w:t>
       </w:r>
     </w:p>
     <w:p>
@@ -3846,7 +3923,7 @@
           <w:rFonts w:cstheme="minorHAnsi"/>
           <w:lang w:val="en-US"/>
         </w:rPr>
-        <w:t xml:space="preserve">[11] Ben-David, S., et al. (2010). A theory of learning from different domains. Machine Learning, 79.</w:t>
+        <w:t xml:space="preserve">[11] Zhao, H., et al. (2019). On learning invariant representations for domain adaptation. ICML.</w:t>
       </w:r>
     </w:p>
     <w:p>
@@ -3860,7 +3937,7 @@
           <w:rFonts w:cstheme="minorHAnsi"/>
           <w:lang w:val="en-US"/>
         </w:rPr>
-        <w:t xml:space="preserve">[12] Ganin, Y., et al. (2016). Domain-adversarial training of neural networks. Journal of Machine Learning Research, 17.</w:t>
+        <w:t xml:space="preserve">[12] Kerbl, B., et al. (2023). 3D Gaussian splatting for real-time radiance field rendering. ACM TOG.</w:t>
       </w:r>
     </w:p>
     <w:p>
@@ -3874,7 +3951,7 @@
           <w:rFonts w:cstheme="minorHAnsi"/>
           <w:lang w:val="en-US"/>
         </w:rPr>
-        <w:t xml:space="preserve">[13] Mildenhall, B., et al. (2020). NeRF: Representing scenes as neural radiance fields for view synthesis. ECCV.</w:t>
+        <w:t xml:space="preserve">[13] Torne, M., et al. (2024). Reconciling reality through simulation: A real-to-sim-to-real approach for robust manipulation. RSS.</w:t>
       </w:r>
     </w:p>
     <w:p>
@@ -3888,7 +3965,7 @@
           <w:rFonts w:cstheme="minorHAnsi"/>
           <w:lang w:val="en-US"/>
         </w:rPr>
-        <w:t xml:space="preserve">[14] Kerbl, B., Kopanas, G., Leimkühler, T., &amp; Drettakis, G. (2023). 3D Gaussian splatting for real-time radiance field rendering. ACM Transactions on Graphics, 42(4).</w:t>
+        <w:t xml:space="preserve">[14] Chhablani, G., et al. (2025). EmbodiedSplat: Personalized real-to-sim-to-real navigation with Gaussian splats from a mobile device. ICCV.</w:t>
       </w:r>
     </w:p>
     <w:p>
@@ -3902,7 +3979,7 @@
           <w:rFonts w:cstheme="minorHAnsi"/>
           <w:lang w:val="en-US"/>
         </w:rPr>
-        <w:t xml:space="preserve">[15] Yeshwanth, C., Liu, Y.-C., Nießner, M., &amp; Dai, A. (2023). ScanNet++: A high-fidelity dataset of 3D indoor scenes. ICCV.</w:t>
+        <w:t xml:space="preserve">[15] Wang, M., et al. (2026). Phys2Real: Fusing VLM priors with interactive online adaptation for uncertainty-aware sim-to-real manipulation. ICRA.</w:t>
       </w:r>
     </w:p>
     <w:p>
@@ -3916,7 +3993,7 @@
           <w:rFonts w:cstheme="minorHAnsi"/>
           <w:lang w:val="en-US"/>
         </w:rPr>
-        <w:t xml:space="preserve">[16] Chhablani, G., et al. (2025). EmbodiedSplat. ICCV. arXiv:2509.17430.</w:t>
+        <w:t xml:space="preserve">[16] Oquab, M., et al. (2024). DINOv2: Learning robust visual features without supervision. TMLR.</w:t>
       </w:r>
     </w:p>
     <w:p>
@@ -3930,7 +4007,7 @@
           <w:rFonts w:cstheme="minorHAnsi"/>
           <w:lang w:val="en-US"/>
         </w:rPr>
-        <w:t xml:space="preserve">[17] Xie, Z., et al. (2025). Vid2Sim: Realistic and interactive simulation from video for urban navigation. CVPR.</w:t>
+        <w:t xml:space="preserve">[17] Majumdar, A., et al. (2023). Where are we in the search for an artificial visual cortex for embodied intelligence? NeurIPS.</w:t>
       </w:r>
     </w:p>
     <w:p>
@@ -3944,7 +4021,7 @@
           <w:rFonts w:cstheme="minorHAnsi"/>
           <w:lang w:val="en-US"/>
         </w:rPr>
-        <w:t xml:space="preserve">[18] Torne, M., et al. (2024). Reconciling reality through simulation: A real-to-sim-to-real approach for robust manipulation. RSS.</w:t>
+        <w:t xml:space="preserve">[18] Burns, K., et al. (2024). What makes pre-trained visual representations successful for robust manipulation? CoRL.</w:t>
       </w:r>
     </w:p>
     <w:p>
@@ -3958,7 +4035,7 @@
           <w:rFonts w:cstheme="minorHAnsi"/>
           <w:lang w:val="en-US"/>
         </w:rPr>
-        <w:t xml:space="preserve">[19] Ramos, F., Possas, R., &amp; Fox, D. (2019). BayesSim: Adaptive domain randomization via probabilistic inference for robotics simulators. RSS.</w:t>
+        <w:t xml:space="preserve">[19] Kachaev, N., et al. (2026). Don't blind your VLA: Aligning visual representations for OOD generalization. AAMAS.</w:t>
       </w:r>
     </w:p>
     <w:p>
@@ -3972,7 +4049,7 @@
           <w:rFonts w:cstheme="minorHAnsi"/>
           <w:lang w:val="en-US"/>
         </w:rPr>
-        <w:t xml:space="preserve">[20] Shah, D., et al. (2023). GNM: A general navigation model to drive any robot. ICRA.</w:t>
+        <w:t xml:space="preserve">[20] Lee, Y., et al. (2023). Surgical fine-tuning improves adaptation to distribution shifts. ICLR.</w:t>
       </w:r>
     </w:p>
     <w:p>
@@ -3986,7 +4063,7 @@
           <w:rFonts w:cstheme="minorHAnsi"/>
           <w:lang w:val="en-US"/>
         </w:rPr>
-        <w:t xml:space="preserve">[21] Shah, D., et al. (2023). ViNT: A foundation model for visual navigation. CoRL.</w:t>
+        <w:t xml:space="preserve">[21] Maddukuri, A., et al. (2025). Sim-and-real co-training: A simple recipe for vision-based robotic manipulation. RSS.</w:t>
       </w:r>
     </w:p>
     <w:p>
@@ -4000,7 +4077,7 @@
           <w:rFonts w:cstheme="minorHAnsi"/>
           <w:lang w:val="en-US"/>
         </w:rPr>
-        <w:t xml:space="preserve">[22] Kim, M. J., et al. (2024). OpenVLA: An open-source vision-language-action model. CoRL.</w:t>
+        <w:t xml:space="preserve">[22] Memmel, M., et al. (2024). ASID: Active exploration for system identification in robotic manipulation. ICLR.</w:t>
       </w:r>
     </w:p>
     <w:p>
@@ -4014,7 +4091,7 @@
           <w:rFonts w:cstheme="minorHAnsi"/>
           <w:lang w:val="en-US"/>
         </w:rPr>
-        <w:t xml:space="preserve">[23] Oquab, M., et al. (2024). DINOv2: Learning robust visual features without supervision. TMLR.</w:t>
+        <w:t xml:space="preserve">[23] Su, J.-C., et al. (2020). Active adversarial domain adaptation. WACV.</w:t>
       </w:r>
     </w:p>
     <w:p>
@@ -4028,7 +4105,7 @@
           <w:rFonts w:cstheme="minorHAnsi"/>
           <w:lang w:val="en-US"/>
         </w:rPr>
-        <w:t xml:space="preserve">[24] Bar, A., et al. (2025). Navigation world models. CVPR.</w:t>
+        <w:t xml:space="preserve">[24] Xu, Q., et al. (2026). TwinRL: Digital twin-driven reinforcement learning for real-world robotic manipulation. arXiv:2602.09023.</w:t>
       </w:r>
     </w:p>
     <w:p>
@@ -4042,7 +4119,21 @@
           <w:rFonts w:cstheme="minorHAnsi"/>
           <w:lang w:val="en-US"/>
         </w:rPr>
-        <w:t xml:space="preserve">[25] Maddukuri, A., et al. (2025). Sim-and-real co-training: A simple recipe for vision-based robotic manipulation. RSS.</w:t>
+        <w:t xml:space="preserve">[25] Deitke, M., et al. (2022). ProcTHOR: Large-scale embodied AI using procedural generation. NeurIPS.</w:t>
+      </w:r>
+    </w:p>
+    <w:p>
+      <w:pPr>
+        <w:spacing w:after="0" w:line="240" w:lineRule="auto"/>
+        <w:ind w:left="397" w:hanging="397"/>
+        <w:jc w:val="left"/>
+      </w:pPr>
+      <w:r>
+        <w:rPr>
+          <w:rFonts w:cstheme="minorHAnsi"/>
+          <w:lang w:val="en-US"/>
+        </w:rPr>
+        <w:t xml:space="preserve">[26] Xie, A., et al. (2024). Decomposing the generalization gap in imitation learning for visual robotic manipulation. ICRA.</w:t>
       </w:r>
     </w:p>
     <w:permEnd w:id="174659581"/>
@@ -4298,14 +4389,14 @@
           <w:b/>
           <w:lang w:val="en-US"/>
         </w:rPr>
-        <w:t xml:space="preserve">Which properties of a digital twin built from real data determine the generalization of models trained in it?</w:t>
-      </w:r>
-      <w:r>
-        <w:rPr>
-          <w:rFonts w:cstheme="minorHAnsi"/>
-          <w:lang w:val="en-US"/>
-        </w:rPr>
-        <w:t xml:space="preserve"> A digital twin reproduces the appearance, geometry, lighting and physical properties of a real scene only approximately, and the errors differ between regions of the scene. It is hypothesized that not all of these errors are equally harmful, and that a model generalizes better to reality when the twin is accurate and varied where it matters for the task and where the reconstruction is uncertain, rather than randomized uniformly. The research should identify these properties and develop a method for building and varying digital twins accordingly.</w:t>
+        <w:t xml:space="preserve">Which components of the discrepancy between a simulation built from real data and reality determine how well models trained in it generalize?</w:t>
+      </w:r>
+      <w:r>
+        <w:rPr>
+          <w:rFonts w:cstheme="minorHAnsi"/>
+          <w:lang w:val="en-US"/>
+        </w:rPr>
+        <w:t xml:space="preserve"> Domain adaptation theory bounds the real-world error of a model by its error in simulation and by the discrepancy between the simulated and the real distributions. A simulation built from real data reproduces appearance, geometry, lighting and physics only approximately, and its errors differ between regions of a scene. It is hypothesized that the harm caused by a simulation error is predicted better by the change it induces in the task-relevant representations of the model than by its magnitude in the image or geometry, so that errors of similar size differ strongly in their effect on generalization. Hence, training variation should follow the reconstruction uncertainty and task relevance of each region rather than be spread uniformly. The research will attribute the gap to types of simulation error and derive a principled way to shape the training distribution accordingly.</w:t>
       </w:r>
     </w:p>
     <w:p>
@@ -4327,14 +4418,14 @@
           <w:b/>
           <w:lang w:val="en-US"/>
         </w:rPr>
-        <w:t xml:space="preserve">How to learn representations that are invariant to the difference between simulation and reality?</w:t>
-      </w:r>
-      <w:r>
-        <w:rPr>
-          <w:rFonts w:cstheme="minorHAnsi"/>
-          <w:lang w:val="en-US"/>
-        </w:rPr>
-        <w:t xml:space="preserve"> Models trained in a digital twin tend to exploit features that do not exist in reality, such as reconstruction artifacts. Pretrained foundation models and self-supervised encoders provide robust representations, but it is not known how they behave under the shift between a twin and reality. It is hypothesized that training objectives which enforce invariance between paired observations from the twin and from reality, possibly supported by learned world models, reduce the generalization gap. The research should also examine where in the model this gap arises.</w:t>
+        <w:t xml:space="preserve">Where inside a model trained in simulation does the simulation-to-reality gap arise, and can task-relevant invariance at that location reduce it?</w:t>
+      </w:r>
+      <w:r>
+        <w:rPr>
+          <w:rFonts w:cstheme="minorHAnsi"/>
+          <w:lang w:val="en-US"/>
+        </w:rPr>
+        <w:t xml:space="preserve"> Models trained in simulation can rely on features absent in reality, such as reconstruction artifacts. Invariant representations reduce the discrepancy between domains, yet full invariance does not guarantee transfer and may remove information needed for the task. Moreover, it is not known at which stage of such a model, from early visual features to the action output, the shift turns into errors. It is hypothesized that the gap arises in a limited part of the model, and that enforcing invariance there, only for task-relevant features and from a few paired simulated and real observations, yields better generalization than invariance at the input or at the final features. The research will use probing of hidden states to localize the gap before intervening.</w:t>
       </w:r>
     </w:p>
     <w:p>
@@ -4356,14 +4447,14 @@
           <w:b/>
           <w:lang w:val="en-US"/>
         </w:rPr>
-        <w:t xml:space="preserve">How to adapt a model trained in simulation to reality using a small amount of real data?</w:t>
-      </w:r>
-      <w:r>
-        <w:rPr>
-          <w:rFonts w:cstheme="minorHAnsi"/>
-          <w:lang w:val="en-US"/>
-        </w:rPr>
-        <w:t xml:space="preserve"> Some difference between the twin and reality always remains. It is hypothesized that selecting the real data where the twin and reality disagree the most allows the model, and the twin itself, to be corrected with much less real data than random selection.</w:t>
+        <w:t xml:space="preserve">Which real data, chosen under a limited budget, most efficiently correct both the simulation and the model, and thereby reduce the generalization gap?</w:t>
+      </w:r>
+      <w:r>
+        <w:rPr>
+          <w:rFonts w:cstheme="minorHAnsi"/>
+          <w:lang w:val="en-US"/>
+        </w:rPr>
+        <w:t xml:space="preserve"> Real interaction data, such as robot trials or demonstrations, are expensive to collect. Existing robotic methods correct either the model or the simulation and choose real data at random, by hand, where the model fails, or by their informativeness about physical parameters; selection by domain discrepancy has so far been studied only for labelling images. It is hypothesized that the most informative real data are those where the simulation is predicted to disagree with reality in task-relevant ways, as estimated from its reconstruction uncertainty, the distance between the task-relevant representations of simulated and cheaply captured real observations, and the sensitivity of the predicted action. Using the selected data to correct both the simulation and the model is expected to reduce the gap with less real data than random or failure-driven selection. The research will develop such a selection rule and study it under different budgets.</w:t>
       </w:r>
     </w:p>
     <w:p>
@@ -4385,14 +4476,14 @@
           <w:b/>
           <w:lang w:val="en-US"/>
         </w:rPr>
-        <w:t xml:space="preserve">Do the improvements generalize to unseen environments and to other physical tasks?</w:t>
-      </w:r>
-      <w:r>
-        <w:rPr>
-          <w:rFonts w:cstheme="minorHAnsi"/>
-          <w:lang w:val="en-US"/>
-        </w:rPr>
-        <w:t xml:space="preserve"> A valuable method should not be tied to a single scene or task. Therefore, the developed methods shall be examined on environments not seen during training and on two different physical tasks, robot navigation and robotic manipulation, to verify that the improvements in generalization are general.</w:t>
+        <w:t xml:space="preserve">Do the improvements generalize to unseen environments and to another physical task, and which properties of the shift explain when they do?</w:t>
+      </w:r>
+      <w:r>
+        <w:rPr>
+          <w:rFonts w:cstheme="minorHAnsi"/>
+          <w:lang w:val="en-US"/>
+        </w:rPr>
+        <w:t xml:space="preserve"> A valuable method should not be tied to a single scene or task, and no single visual representation is known to be best for both navigation and manipulation. Therefore, the developed methods shall be examined, with unchanged settings, on environments held out from training and on two physical tasks: robot navigation and, as a controlled second task, robotic manipulation. It is hypothesized that the attribution of the gap from the first question and its localization from the second, measured in the new setting before a method is applied, predict whether its improvement transfers. The research will decompose the gap into factors of variation and relate the measured attribution and localization to the observed transfer across held-out scenes and tasks.</w:t>
       </w:r>
     </w:p>
     <w:permEnd w:id="1295260508"/>
@@ -4672,7 +4763,7 @@
           <w:rFonts w:cstheme="minorHAnsi"/>
           <w:lang w:val="en-US"/>
         </w:rPr>
-        <w:t xml:space="preserve">The proposed Ph.D. dissertation aims to introduce several contributions to the development of the scientific discipline. First and foremost, the research is intended to provide new methods that improve the generalization of deep learning models trained in simulations built from real data, which is one of the main obstacles in applying machine learning to physical AI. The methods are intended to be general, i.e., not tied to a particular robot, scene or task, and are planned to be evaluated on robot navigation and robotic manipulation.</w:t>
+        <w:t xml:space="preserve">The proposed PhD dissertation aims to introduce several contributions to the development of the scientific discipline. The central scientific problem addressed is explaining and reducing the generalization gap caused by the distribution shift between a simulation built from real data and reality; poor generalization of models trained in simulation remains one of the main obstacles to applying machine learning in physical AI. The central claim of the dissertation is that this gap is concentrated in a small set of task-relevant discrepancies, which can be identified in the simulation, localized inside the model and targeted with little real data, and that addressing them there yields better generalization than uniform randomization, invariance of the whole representation or randomly chosen real data. Research questions 1-3 test the three parts of this claim, and question 4 tests whether it holds across environments and tasks; the methods derived from it are intended to be general, i.e., not tied to a particular robot, scene or task, and will be examined on robot navigation and robotic manipulation.</w:t>
       </w:r>
     </w:p>
     <w:p>
@@ -4685,12 +4776,12 @@
           <w:rFonts w:cstheme="minorHAnsi"/>
           <w:lang w:val="en-US"/>
         </w:rPr>
-        <w:t xml:space="preserve">Furthermore, the research seeks to provide a better understanding of the sim-to-real generalization gap: which properties of a digital twin matter for the generalization of the trained model, and where in the model the gap arises. Such knowledge could introduce new perspectives for the design of simulations and of training procedures, and could help to build more principled and interpretable approaches than the currently dominating randomization heuristics. Since the sim-to-real problem is an instance of learning under distribution shift, the findings are also expected to be relevant to domain adaptation, representation learning and the adaptation of pretrained foundation models in general.</w:t>
-      </w:r>
-    </w:p>
-    <w:p>
-      <w:pPr>
-        <w:spacing w:after="0" w:line="240" w:lineRule="auto"/>
+        <w:t xml:space="preserve">Furthermore, the research is expected to deliver new methods and findings that do not exist at present: a principle for shaping the training distribution of a simulation built from real data by the reconstruction uncertainty and task relevance of each region; a method for localizing the simulation-to-reality gap inside a deep model and for enforcing task-relevant invariance only there; a rule for selecting real data that corrects the simulation and the model at the same time; and an empirical account of which properties of the shift determine whether these improvements carry over across environments and tasks. Such knowledge could complement the currently dominant randomization heuristics with more principled and interpretable approaches, and could introduce new perspectives for the design of simulations and of training procedures.</w:t>
+      </w:r>
+    </w:p>
+    <w:p>
+      <w:pPr>
+        <w:spacing w:after="120" w:line="240" w:lineRule="auto"/>
         <w:jc w:val="both"/>
       </w:pPr>
       <w:r>
@@ -4698,7 +4789,20 @@
           <w:rFonts w:cstheme="minorHAnsi"/>
           <w:lang w:val="en-US"/>
         </w:rPr>
-        <w:t xml:space="preserve">Finally, the developed methods for adapting models to reality with a small amount of real data could reduce the cost of deploying learning-based robots in new environments. The source code and the experimental setups are planned to be released, which could facilitate further research in the field and attract other researchers. Apart from purely scientific results, the methods could be used in real-world applications such as service, logistic and inspection robotics.</w:t>
+        <w:t xml:space="preserve">Since transfer from simulation to reality is an instance of learning under distribution shift, the findings are also expected to be relevant to machine learning in general. The analysis of which errors in the training distribution are harmful concerns domain adaptation; the localization of the simulation-to-reality gap inside a model extends probing methods developed for language and vision models and contributes to representation learning; and the selection of informative data under a budget concerns active learning and the adaptation of pretrained foundation models to new domains from a few examples.</w:t>
+      </w:r>
+    </w:p>
+    <w:p>
+      <w:pPr>
+        <w:spacing w:after="0" w:line="240" w:lineRule="auto"/>
+        <w:jc w:val="both"/>
+      </w:pPr>
+      <w:r>
+        <w:rPr>
+          <w:rFonts w:cstheme="minorHAnsi"/>
+          <w:lang w:val="en-US"/>
+        </w:rPr>
+        <w:t xml:space="preserve">Finally, the developed methods could reduce the amount of real data, and thus the cost, needed to deploy learning-based robots in new environments. The source code and the experimental setups are planned to be released, which could facilitate further research in the field and attract other researchers. Apart from purely scientific results, the methods could be used in real-world applications such as service, logistics and inspection robotics, as well as in other domains where models are trained in simulation, e.g., autonomous driving.</w:t>
       </w:r>
     </w:p>
     <w:permEnd w:id="1098318749"/>
@@ -4977,7 +5081,7 @@
           <w:rFonts w:cstheme="minorHAnsi"/>
           <w:lang w:val="en-US"/>
         </w:rPr>
-        <w:t xml:space="preserve">The research will follow the methods commonly adopted in machine learning and robot learning projects. Since there is no mathematically proven practice for achieving generalization from simulation to reality, the dominant part of the research will be based on empirical methods. The proposed methods will be described theoretically, and their properties or bounds will be analysed whenever possible, in particular with the use of domain adaptation theory.</w:t>
+        <w:t xml:space="preserve">The research will follow the methods commonly adopted in machine learning and robot learning projects. Since no established theory guarantees generalization from simulation to reality, the research will be mainly empirical. The proposed methods will be described theoretically, and their properties or bounds will be analysed whenever possible, in particular using domain adaptation theory, which relates the error of a model in reality to its error in simulation and to the discrepancy between the two distributions. Numbers in brackets refer to the references listed in Section 6.</w:t>
       </w:r>
     </w:p>
     <w:p>
@@ -4990,7 +5094,7 @@
           <w:rFonts w:cstheme="minorHAnsi"/>
           <w:lang w:val="en-US"/>
         </w:rPr>
-        <w:t xml:space="preserve">Digital twins will be built from real captures of indoor scenes using neural scene reconstruction methods (3D Gaussian Splatting and related methods) and structure-from-motion tools, and imported into robot simulators (e.g. Habitat for navigation and ManiSkill3 for manipulation). Experiments will be conducted mainly on public datasets of real scenes, such as ScanNet++ and MuSHRoom, which contain captures of the same scenes made with different devices. This allows building the twin from one capture and using a separate, higher-fidelity capture as a reference for "reality", so that the sim-to-real gap can be studied in a controlled way on many scenes without an own robot. Navigation and manipulation models will be trained with reinforcement and imitation learning, starting from pretrained foundation models whenever possible. The results will be validated on a real mobile robot in rooms at the university, in cooperation with the robotics laboratories of Wrocław University of Science and Technology.</w:t>
+        <w:t xml:space="preserve">Simulations will be built from real captures of indoor scenes, using structure-from-motion for camera poses and neural scene reconstruction, such as 3D Gaussian Splatting, for appearance and geometry, and then coupled with robot simulators, e.g., Habitat for navigation and ManiSkill3 for manipulation, with geometry for collisions and physics and appearance rendered from the reconstruction or from a mesh extracted from it. Reconstruction uncertainty will be estimated per region, e.g., from view coverage and the disagreement of an ensemble of reconstructions. Models for goal-directed indoor navigation (e.g., point-goal or image-goal) and tabletop pick-and-place manipulation will be trained with reinforcement and imitation learning, starting from pretrained models when possible.</w:t>
       </w:r>
     </w:p>
     <w:p>
@@ -5003,7 +5107,7 @@
           <w:rFonts w:cstheme="minorHAnsi"/>
           <w:lang w:val="en-US"/>
         </w:rPr>
-        <w:t xml:space="preserve">The quantitative evaluation will rely on standard metrics for embodied tasks, such as success rate and success weighted by path length, and on the generalization gap, i.e., the difference between the performance in simulation and in reality. Particular attention will be paid to generalization, so the evaluation will separate the scenes used for training from unseen scenes, and will include a second physical task. Statistical methods will be leveraged to provide reliable outcomes, including repeated experiments with different random seeds and statistical tests for comparisons with baseline methods. Qualitative evaluation will focus on analysing the learned representations, e.g. by probing, visualizing the latent space and analysing failure cases.</w:t>
+        <w:t xml:space="preserve">Experiments will be conducted mainly on public datasets of real scenes, such as ScanNet++ and MuSHRoom, which contain separate captures of the same scenes made with different devices. This allows building the simulation from one capture and using another, independent capture as a proxy for reality. Real frames of the independent capture will serve for open-loop evaluation, which measures the discrepancy between representations of paired simulated and real views, the agreement of predicted actions, and probing accuracy. A reference simulation built from the independent, higher-fidelity capture (e.g., the laser scan and DSLR images in ScanNet++) will serve as a proxy for closed-loop evaluation. Thus, the gap can be studied on many scenes without a robot. For manipulation, where real data with known physical properties are scarce, a simulation whose visual and physical parameters are hidden from the learner will serve as a controlled proxy.</w:t>
       </w:r>
     </w:p>
     <w:p>
@@ -5016,12 +5120,12 @@
           <w:rFonts w:cstheme="minorHAnsi"/>
           <w:lang w:val="en-US"/>
         </w:rPr>
-        <w:t xml:space="preserve">The implementation of experiments will be done mainly in the Python programming language with the PyTorch deep learning library. Source code will be managed with the Git version control system, and experiments will be tracked to provide reproducible results. Due to the high computational demand, the experiments will run on GPU clusters provided by the Department and on the Polish computing infrastructure (WCSS, PLGrid). The work will be partly conducted in cooperation with other Ph.D. students and senior researchers. Code and data are supposed to be opened whenever possible, following open science standards and the licences of the datasets used.</w:t>
-      </w:r>
-    </w:p>
-    <w:p>
-      <w:pPr>
-        <w:spacing w:after="0" w:line="240" w:lineRule="auto"/>
+        <w:t xml:space="preserve">For the first question, controlled variants of a simulation, in which components such as appearance, geometry or lighting are degraded or replaced, will be used to attribute the gap to types of simulation error; physical components will be studied in manipulation, where they can be controlled. The task relevance of a region will be estimated from the sensitivity of the model's actions to it, e.g., with gradient-based attribution or by occluding the region. The training distribution will then be shaped by randomizing appearance (colour and opacity of Gaussians), geometry and, where the representation allows relighting, lighting per region in proportion to its reconstruction uncertainty and task relevance, and compared with uniform randomization, randomization fitted to real rollouts [5] and entropy-maximizing randomization [7]. For the second question, probing of hidden states will be adapted to find at which layers simulated and real observations become distinguishable and where task-relevant information is lost. An alignment loss (e.g., distribution-discrepancy or contrastive) will then be applied at the identified layers to a few paired simulated and real views at the same camera poses, restricted to the features on which the predicted action depends. It will be compared with alignment at the input, domain-adversarial alignment of the final features [8] and full fine-tuning.</w:t>
+      </w:r>
+    </w:p>
+    <w:p>
+      <w:pPr>
+        <w:spacing w:after="120" w:line="240" w:lineRule="auto"/>
         <w:jc w:val="both"/>
       </w:pPr>
       <w:r>
@@ -5029,7 +5133,59 @@
           <w:rFonts w:cstheme="minorHAnsi"/>
           <w:lang w:val="en-US"/>
         </w:rPr>
-        <w:t xml:space="preserve">The findings will be published at leading machine learning, computer vision and robotics conferences from the ministerial list, such as NeurIPS, ICML, ICLR, CVPR and RSS. In order to further promote the work and establish new collaborations, it is planned to present results at smaller conferences and workshops, like MLinPL, and at summer schools.</w:t>
+        <w:t xml:space="preserve">For the third question, the budget refers to real interaction data, such as robot trials or demonstrations, while unlabelled real images are assumed available. On the dataset-based proxy, a unit of interaction data will be an expert or policy episode executed in the reference simulation, paired with the real frames of the independent capture at the visited poses; in manipulation, an episode in the simulation with hidden parameters; and on the physical robot, a real trial or demonstration. Episodes (start and goal configurations), poses and scene regions used for final evaluation will be disjoint from those available for selection, and results will also be reported on held-out scenes whose independent capture is never used for correction. Real data will be selected by scores combining reconstruction uncertainty, the distance between the task-relevant representations of simulated and real observations, and the sensitivity of the predicted action. Each selected location will thus yield both real views, used to refine the simulation by re-optimizing the reconstruction in uncertain regions (and, in manipulation, by re-estimating physical parameters), and interaction data, used to adapt the model by fine-tuning or co-training on simulated and real data. This will be compared with random and failure-driven selection, in manipulation also with selection by informativeness about physics [22], with the same score without task relevance, and with correcting only the model or only the simulation, at equal amounts of real data across budgets. For the fourth question, the methods will be applied with unchanged settings to held-out scenes and to manipulation, the gap will be decomposed into factors of variation, and the attribution and localization measured in a new setting will be related, across many held-out scenes and both tasks, to the size of the improvement there, e.g., by rank correlation.</w:t>
+      </w:r>
+    </w:p>
+    <w:p>
+      <w:pPr>
+        <w:spacing w:after="120" w:line="240" w:lineRule="auto"/>
+        <w:jc w:val="both"/>
+      </w:pPr>
+      <w:r>
+        <w:rPr>
+          <w:rFonts w:cstheme="minorHAnsi"/>
+          <w:lang w:val="en-US"/>
+        </w:rPr>
+        <w:t xml:space="preserve">The quantitative evaluation will rely on standard metrics for embodied tasks, such as success rate and success weighted by path length (SPL), and on the generalization gap, defined at two levels: on the dataset-based proxy, as the difference between the performance in the training simulation and in the reference simulation, complemented by the open-loop measures on real frames; and on the physical robot, as the difference between the closed-loop performance in simulation and in reality. The agreement between the two levels will also be measured, e.g., by the rank correlation of model scores. All methods will be compared with baselines under equal training effort and an equal amount of real data. Statistical methods will be leveraged to provide reliable outcomes, including repeated experiments with different random seeds and scenes, confidence intervals, and statistical tests for comparisons with baseline methods. According to accepted standards, the data used for training, model selection and final evaluation will be kept separate. The analysis of the learned representations will combine quantitative and qualitative methods: representations of paired simulated and real observations will be compared with representation similarity measures, visualized in the latent space, and related to failure cases.</w:t>
+      </w:r>
+    </w:p>
+    <w:p>
+      <w:pPr>
+        <w:spacing w:after="120" w:line="240" w:lineRule="auto"/>
+        <w:jc w:val="both"/>
+      </w:pPr>
+      <w:r>
+        <w:rPr>
+          <w:rFonts w:cstheme="minorHAnsi"/>
+          <w:lang w:val="en-US"/>
+        </w:rPr>
+        <w:t xml:space="preserve">The navigation results will be validated on a wheeled mobile robot with an RGB-D camera, e.g., in the robotics laboratories of the university. The validation will measure closed-loop success rate and SPL in reality and check whether the conclusions drawn with the dataset-based proxy also hold on a physical robot. Should robot access be limited, the conclusions will rest on the dataset-based proxy and on a reduced set of real trials, and the agreement between the two levels will be reported for the trials performed.</w:t>
+      </w:r>
+    </w:p>
+    <w:p>
+      <w:pPr>
+        <w:spacing w:after="120" w:line="240" w:lineRule="auto"/>
+        <w:jc w:val="both"/>
+      </w:pPr>
+      <w:r>
+        <w:rPr>
+          <w:rFonts w:cstheme="minorHAnsi"/>
+          <w:lang w:val="en-US"/>
+        </w:rPr>
+        <w:t xml:space="preserve">Experiments will be implemented mainly in Python with the PyTorch deep learning library. Source code will be managed with the Git version control system, and datasets, configurations and results will be versioned and tracked with experiment tracking tools to provide reproducible results. Due to the high computational demand of scene reconstruction and policy training, the experiments will run on GPU clusters provided by the Department and on the Polish computing infrastructure (WCSS and PLGrid). The work will be partly conducted in cooperation with other PhD students and senior researchers to increase the quality of the research. Code and data will be made publicly available whenever possible, following open science standards and respecting the licences of the datasets used.</w:t>
+      </w:r>
+    </w:p>
+    <w:p>
+      <w:pPr>
+        <w:spacing w:after="0" w:line="240" w:lineRule="auto"/>
+        <w:jc w:val="both"/>
+      </w:pPr>
+      <w:r>
+        <w:rPr>
+          <w:rFonts w:cstheme="minorHAnsi"/>
+          <w:lang w:val="en-US"/>
+        </w:rPr>
+        <w:t xml:space="preserve">The findings will be published at leading international machine learning, computer vision and robotics conferences, such as NeurIPS, ICML, ICLR, CVPR and RSS, and in journals from the ministerial list. To promote the work and establish new collaborations, it is planned to present results at smaller conferences and workshops, such as MLinPL, and at summer schools, and to seek foreign co-authorship during the research internship.</w:t>
       </w:r>
     </w:p>
     <w:permEnd w:id="32011344"/>
@@ -5298,7 +5454,7 @@
           <w:rFonts w:cstheme="minorHAnsi"/>
           <w:lang w:val="pl-PL"/>
         </w:rPr>
-        <w:t xml:space="preserve">Sztuczna inteligencja coraz częściej wychodzi poza ekrany komputerów i trafia do robotów, które poruszają się po budynkach albo przenoszą przedmioty. Aby się tego nauczyć, roboty potrzebują ogromnej liczby przykładów, których zebranie w prawdziwym świecie jest powolne i kosztowne. Dlatego coraz częściej uczą się w symulacji, a w szczególności w cyfrowych bliźniakach, czyli wiernych wirtualnych kopiach prawdziwych miejsc, które można odtworzyć z krótkiego nagrania. Taka kopia nigdy nie jest jednak idealna i model, który w symulacji działa bardzo dobrze, w prawdziwym świecie często popełnia błędy, zwłaszcza w miejscach, których wcześniej nie widział. Celem rozprawy jest opracowanie metod, dzięki którym modele uczone w cyfrowych bliźniakach będą lepiej działać w rzeczywistości. Badania obejmą sprawdzenie, które cechy wirtualnej kopii są naprawdę ważne, nauczenie modeli pomijania różnic między kopią a rzeczywistością oraz dostosowanie modeli do rzeczywistości przy użyciu niewielu prawdziwych przykładów. Metody zostaną sprawdzone na nawigacji robotów mobilnych i na robotach przenoszących przedmioty. Oczekuje się, że pozwolą one w przyszłości szybciej i taniej uczyć roboty pracy w nowych miejscach, takich jak magazyny, szpitale czy biura.</w:t>
+        <w:t xml:space="preserve">Sztuczna inteligencja coraz częściej wychodzi poza ekrany komputerów i trafia do systemów fizycznych, takich jak roboty poruszające się po budynkach lub przenoszące przedmioty. Modele uczenia głębokiego sterujące takimi robotami potrzebują ogromnej liczby przykładów, których zebranie w prawdziwym świecie jest powolne, kosztowne, a czasem niebezpieczne. Dlatego modele te uczy się zwykle w symulacji, a coraz częściej w cyfrowych bliźniakach, czyli wirtualnych kopiach rzeczywistych miejsc odtworzonych na podstawie ich nagrań. Taka kopia nigdy nie jest jednak idealna, a model, który dobrze działa w symulacji, w rzeczywistości często zawodzi, zwłaszcza w miejscach, których wcześniej nie widział, co pozostaje jedną z głównych przeszkód na drodze do szerszego zastosowania fizycznej sztucznej inteligencji. Celem rozprawy jest poprawa zdolności generalizacji modeli uczenia głębokiego trenowanych w symulacjach zbudowanych na podstawie danych rzeczywistych, czyli umiejętności poprawnego działania w warunkach innych niż te, w których je trenowano, a zwłaszcza w rzeczywistości. Badania w pierwszej kolejności pozwolą ustalić, które różnice między symulacją a rzeczywistością faktycznie szkodzą modelowi i na którym etapie przetwarzania w modelu przekształcają się one w błędy. Na tej podstawie zostaną opracowane metody, które nauczą model pomijać nieistotne różnice i więcej ćwiczyć tam, gdzie wirtualna kopia jest najmniej dokładna, a także metody wyboru nielicznych rzeczywistych przykładów, które najlepiej poprawiają zarówno model, jak i symulację. Metody zostaną sprawdzone w zadaniach nawigacji robotów i manipulacji robotycznej, w środowiskach, które nie były wykorzystywane podczas uczenia, a nawigacja zostanie zweryfikowana na prawdziwym robocie mobilnym. Oczekuje się, że rozprawa przyniesie lepsze zrozumienie przyczyn, dla których modele uczone w symulacji zawodzą w rzeczywistości, a także metody, dzięki którym roboty będą mogły szybciej, taniej i bezpieczniej uczyć się pracy w nowych miejscach i przy różnych zadaniach.</w:t>
       </w:r>
     </w:p>
     <w:permEnd w:id="301016009"/>
@@ -5353,7 +5509,7 @@
           <w:rFonts w:cstheme="minorHAnsi"/>
           <w:lang w:val="en-US"/>
         </w:rPr>
-        <w:t xml:space="preserve">Artificial intelligence is increasingly moving beyond computer screens into robots that move around buildings or handle objects. To learn this, robots need a huge number of examples, which are slow and costly to collect in the real world. That is why they increasingly learn in simulation, and in particular in digital twins, that is, faithful virtual copies of real places that can be rebuilt from a short recording. Such a copy is never perfect, however, and a model that works very well in simulation often makes mistakes in the real world, especially in places it has not seen before. The goal of the dissertation is to develop methods that make models trained in digital twins work better in reality. The research will cover finding out which features of the virtual copy really matter, teaching models to ignore the differences between the copy and reality, and adapting models to reality using only a few real examples. The methods will be tested on the navigation of mobile robots and on robots that handle objects. They are expected to make it faster and cheaper in the future to teach robots to work in new places, such as warehouses, hospitals or offices.</w:t>
+        <w:t xml:space="preserve">Artificial intelligence is increasingly moving beyond computer screens into physical systems, such as robots that move around buildings or carry objects. Deep learning models that control such robots need a huge number of examples, which are slow, costly and sometimes unsafe to collect in the real world. Therefore, such models are usually trained in simulation, and increasingly in digital twins, that is, virtual copies of real places rebuilt from recordings of those places. Such a copy is never perfect, however, and a model that works well in simulation often fails in reality, especially in places it has not seen before, which remains one of the main obstacles to the wider use of physical artificial intelligence. The goal of the dissertation is to improve the generalization of deep learning models trained in simulations built from real data, i.e., their ability to work correctly in conditions different from those they were trained in, and in particular in reality. The research will first establish which differences between simulation and reality actually harm the model, and at which stage of processing inside the model they turn into errors. On this basis, methods will be developed that teach the model to ignore irrelevant differences and to practise more where the virtual copy is least accurate, together with methods that choose the few real examples that best correct both the model and the simulation. The methods will be examined on robot navigation and robotic manipulation tasks, in environments that were not used during training, and navigation will be verified on a real mobile robot. The dissertation is expected to bring a better understanding of why models trained in simulation fail in reality, as well as methods that allow robots to learn to work in new places and on different tasks faster, more cheaply and more safely.</w:t>
       </w:r>
     </w:p>
     <w:permEnd w:id="305530072"/>

</xml_diff>

<commit_message>
Revalidate against 2025-cohort K46 IPB: bilingual topic, venues in schedule, explicit hypotheses, §11 venue, remove stale §3 table
Co-Authored-By: Claude Opus 5.5 <noreply@anthropic.com>
</commit_message>
<xml_diff>
--- a/output/IPB_Grzegorz_Piotrowski.docx
+++ b/output/IPB_Grzegorz_Piotrowski.docx
@@ -1090,7 +1090,7 @@
           <w:rFonts w:cstheme="minorHAnsi"/>
           <w:lang w:val="en-US"/>
         </w:rPr>
-        <w:t xml:space="preserve">Improving the generalization of deep learning models in real-to-sim-to-real transfer for physical AI. (PL: Poprawa zdolności generalizacji modeli uczenia głębokiego w transferze rzeczywistość–symulacja–rzeczywistość dla fizycznej sztucznej inteligencji.)</w:t>
+        <w:t xml:space="preserve">Poprawa zdolności generalizacji modeli uczenia głębokiego w transferze rzeczywistość–symulacja–rzeczywistość dla fizycznej sztucznej inteligencji / Improving the generalization of deep learning models in real-to-sim-to-real transfer for physical AI</w:t>
       </w:r>
       <w:bookmarkStart w:id="0" w:name="_Hlk95566638"/>
     </w:p>
@@ -2122,7 +2122,7 @@
                 <w:rFonts w:cstheme="minorHAnsi"/>
                 <w:lang w:val="en-US"/>
               </w:rPr>
-              <w:t xml:space="preserve">3. Writing a scientific article for a conference from the ministerial list (regarding the components of the simulation-to-reality discrepancy that determine generalization).</w:t>
+              <w:t xml:space="preserve">3. Writing a scientific article for a conference from the ministerial list (regarding the components of the simulation-to-reality discrepancy that determine generalization), planned for submission to NeurIPS 2027 (200 points).</w:t>
             </w:r>
           </w:p>
           <w:p>
@@ -2249,7 +2249,7 @@
                 <w:rFonts w:cstheme="minorHAnsi"/>
                 <w:lang w:val="en-US"/>
               </w:rPr>
-              <w:t xml:space="preserve">3. Writing a scientific article for a conference from the ministerial list (regarding the localization of the simulation-to-reality gap inside deep models).</w:t>
+              <w:t xml:space="preserve">3. Writing a scientific article for a conference from the ministerial list (regarding the localization of the simulation-to-reality gap inside deep models), planned for submission to ICML 2028 or CVPR 2028 (200 points).</w:t>
             </w:r>
           </w:p>
           <w:p>
@@ -2363,7 +2363,7 @@
                 <w:rFonts w:cstheme="minorHAnsi"/>
                 <w:lang w:val="en-US"/>
               </w:rPr>
-              <w:t xml:space="preserve">3. Writing a scientific article for a conference from the ministerial list (regarding the selection of real data under a limited budget).</w:t>
+              <w:t xml:space="preserve">3. Writing a scientific article for a conference from the ministerial list (regarding the selection of real data under a limited budget), planned for submission to NeurIPS 2028 (200 points).</w:t>
             </w:r>
           </w:p>
           <w:p>
@@ -2477,7 +2477,7 @@
                 <w:rFonts w:cstheme="minorHAnsi"/>
                 <w:lang w:val="en-US"/>
               </w:rPr>
-              <w:t xml:space="preserve">3. Writing a scientific article for a conference from the ministerial list (regarding which properties of the shift explain when improvements generalize).</w:t>
+              <w:t xml:space="preserve">3. Writing a scientific article for a conference from the ministerial list (regarding which properties of the shift explain when improvements generalize), e.g. ICLR 2029 or CVPR 2029 (200 points).</w:t>
             </w:r>
           </w:p>
           <w:p>
@@ -4396,7 +4396,22 @@
           <w:rFonts w:cstheme="minorHAnsi"/>
           <w:lang w:val="en-US"/>
         </w:rPr>
-        <w:t xml:space="preserve"> Domain adaptation theory bounds the real-world error of a model by its error in simulation and by the discrepancy between the simulated and the real distributions. A simulation built from real data reproduces appearance, geometry, lighting and physics only approximately, and its errors differ between regions of a scene. It is hypothesized that the harm caused by a simulation error is predicted better by the change it induces in the task-relevant representations of the model than by its magnitude in the image or geometry, so that errors of similar size differ strongly in their effect on generalization. Hence, training variation should follow the reconstruction uncertainty and task relevance of each region rather than be spread uniformly. The research will attribute the gap to types of simulation error and derive a principled way to shape the training distribution accordingly.</w:t>
+        <w:t xml:space="preserve"> Domain adaptation theory bounds the real-world error of a model by its error in simulation and by the discrepancy between the simulated and the real distributions. A simulation built from real data reproduces appearance, geometry, lighting and physics only approximately, and its errors differ between regions of a scene. </w:t>
+      </w:r>
+      <w:r>
+        <w:rPr>
+          <w:rFonts w:cstheme="minorHAnsi"/>
+          <w:i/>
+          <w:lang w:val="en-US"/>
+        </w:rPr>
+        <w:t xml:space="preserve">Hypothesis:</w:t>
+      </w:r>
+      <w:r>
+        <w:rPr>
+          <w:rFonts w:cstheme="minorHAnsi"/>
+          <w:lang w:val="en-US"/>
+        </w:rPr>
+        <w:t xml:space="preserve"> The harm caused by a simulation error is predicted better by the change it induces in the task-relevant representations of the model than by its magnitude in the image or geometry, so that errors of similar size differ strongly in their effect on generalization. Hence, training variation should follow the reconstruction uncertainty and task relevance of each region rather than be spread uniformly. The research will attribute the gap to types of simulation error and derive a principled way to shape the training distribution accordingly.</w:t>
       </w:r>
     </w:p>
     <w:p>
@@ -4425,7 +4440,22 @@
           <w:rFonts w:cstheme="minorHAnsi"/>
           <w:lang w:val="en-US"/>
         </w:rPr>
-        <w:t xml:space="preserve"> Models trained in simulation can rely on features absent in reality, such as reconstruction artifacts. Invariant representations reduce the discrepancy between domains, yet full invariance does not guarantee transfer and may remove information needed for the task. Moreover, it is not known at which stage of such a model, from early visual features to the action output, the shift turns into errors. It is hypothesized that the gap arises in a limited part of the model, and that enforcing invariance there, only for task-relevant features and from a few paired simulated and real observations, yields better generalization than invariance at the input or at the final features. The research will use probing of hidden states to localize the gap before intervening.</w:t>
+        <w:t xml:space="preserve"> Models trained in simulation can rely on features absent in reality, such as reconstruction artifacts. Invariant representations reduce the discrepancy between domains, yet full invariance does not guarantee transfer and may remove information needed for the task. Moreover, it is not known at which stage of such a model, from early visual features to the action output, the shift turns into errors. </w:t>
+      </w:r>
+      <w:r>
+        <w:rPr>
+          <w:rFonts w:cstheme="minorHAnsi"/>
+          <w:i/>
+          <w:lang w:val="en-US"/>
+        </w:rPr>
+        <w:t xml:space="preserve">Hypothesis:</w:t>
+      </w:r>
+      <w:r>
+        <w:rPr>
+          <w:rFonts w:cstheme="minorHAnsi"/>
+          <w:lang w:val="en-US"/>
+        </w:rPr>
+        <w:t xml:space="preserve"> The gap arises in a limited part of the model, and enforcing invariance there, only for task-relevant features and from a few paired simulated and real observations, yields better generalization than invariance at the input or at the final features. The research will use probing of hidden states to localize the gap before intervening.</w:t>
       </w:r>
     </w:p>
     <w:p>
@@ -4454,7 +4484,22 @@
           <w:rFonts w:cstheme="minorHAnsi"/>
           <w:lang w:val="en-US"/>
         </w:rPr>
-        <w:t xml:space="preserve"> Real interaction data, such as robot trials or demonstrations, are expensive to collect. Existing robotic methods correct either the model or the simulation and choose real data at random, by hand, where the model fails, or by their informativeness about physical parameters; selection by domain discrepancy has so far been studied only for labelling images. It is hypothesized that the most informative real data are those where the simulation is predicted to disagree with reality in task-relevant ways, as estimated from its reconstruction uncertainty, the distance between the task-relevant representations of simulated and cheaply captured real observations, and the sensitivity of the predicted action. Using the selected data to correct both the simulation and the model is expected to reduce the gap with less real data than random or failure-driven selection. The research will develop such a selection rule and study it under different budgets.</w:t>
+        <w:t xml:space="preserve"> Real interaction data, such as robot trials or demonstrations, are expensive to collect. Existing robotic methods correct either the model or the simulation and choose real data at random, by hand, where the model fails, or by their informativeness about physical parameters; selection by domain discrepancy has so far been studied only for labelling images. </w:t>
+      </w:r>
+      <w:r>
+        <w:rPr>
+          <w:rFonts w:cstheme="minorHAnsi"/>
+          <w:i/>
+          <w:lang w:val="en-US"/>
+        </w:rPr>
+        <w:t xml:space="preserve">Hypothesis:</w:t>
+      </w:r>
+      <w:r>
+        <w:rPr>
+          <w:rFonts w:cstheme="minorHAnsi"/>
+          <w:lang w:val="en-US"/>
+        </w:rPr>
+        <w:t xml:space="preserve"> The most informative real data are those where the simulation is predicted to disagree with reality in task-relevant ways, as estimated from its reconstruction uncertainty, the distance between the task-relevant representations of simulated and cheaply captured real observations, and the sensitivity of the predicted action. Using the selected data to correct both the simulation and the model is expected to reduce the gap with less real data than random or failure-driven selection. The research will develop such a selection rule and study it under different budgets.</w:t>
       </w:r>
     </w:p>
     <w:p>
@@ -4483,7 +4528,22 @@
           <w:rFonts w:cstheme="minorHAnsi"/>
           <w:lang w:val="en-US"/>
         </w:rPr>
-        <w:t xml:space="preserve"> A valuable method should not be tied to a single scene or task, and no single visual representation is known to be best for both navigation and manipulation. Therefore, the developed methods shall be examined, with unchanged settings, on environments held out from training and on two physical tasks: robot navigation and, as a controlled second task, robotic manipulation. It is hypothesized that the attribution of the gap from the first question and its localization from the second, measured in the new setting before a method is applied, predict whether its improvement transfers. The research will decompose the gap into factors of variation and relate the measured attribution and localization to the observed transfer across held-out scenes and tasks.</w:t>
+        <w:t xml:space="preserve"> A valuable method should not be tied to a single scene or task, and no single visual representation is known to be best for both navigation and manipulation. Therefore, the developed methods shall be examined, with unchanged settings, on environments held out from training and on two physical tasks: robot navigation and, as a controlled second task, robotic manipulation. </w:t>
+      </w:r>
+      <w:r>
+        <w:rPr>
+          <w:rFonts w:cstheme="minorHAnsi"/>
+          <w:i/>
+          <w:lang w:val="en-US"/>
+        </w:rPr>
+        <w:t xml:space="preserve">Hypothesis:</w:t>
+      </w:r>
+      <w:r>
+        <w:rPr>
+          <w:rFonts w:cstheme="minorHAnsi"/>
+          <w:lang w:val="en-US"/>
+        </w:rPr>
+        <w:t xml:space="preserve"> The attribution of the gap from the first question and its localization from the second, measured in the new setting before a method is applied, predict whether its improvement transfers. The research will decompose the gap into factors of variation and relate the measured attribution and localization to the observed transfer across held-out scenes and tasks.</w:t>
       </w:r>
     </w:p>
     <w:permEnd w:id="1295260508"/>
@@ -5886,7 +5946,7 @@
           <w:rFonts w:cstheme="minorHAnsi"/>
           <w:lang w:val="en-US"/>
         </w:rPr>
-        <w:t xml:space="preserve">May 2027</w:t>
+        <w:t xml:space="preserve">May 2027 (planned submission to the NeurIPS 2027 conference, 200 points on the ministerial list).</w:t>
       </w:r>
     </w:p>
     <w:permEnd w:id="641100817"/>

</xml_diff>

<commit_message>
Wave 21: apply validation fixes - navigation main task, manipulation as sim-to-sim confirmation, 3+1 papers, proxy honesty, narrowed RQ1/RQ2 (task decodability), RQ3 correct-both, RQ4 vs simple predictors, Lei/Jin/Qian 2026 in §6
Co-Authored-By: Claude Opus 5.5 <noreply@anthropic.com>
</commit_message>
<xml_diff>
--- a/output/IPB_Grzegorz_Piotrowski.docx
+++ b/output/IPB_Grzegorz_Piotrowski.docx
@@ -2009,7 +2009,7 @@
                 <w:rFonts w:cstheme="minorHAnsi"/>
                 <w:lang w:val="en-US"/>
               </w:rPr>
-              <w:t xml:space="preserve">2. Preparation of the research environment, including real scene captures, simulations built from them, a manipulation environment with hidden visual and physical parameters, and computing resources.</w:t>
+              <w:t xml:space="preserve">2. Preparation of the research environment for robot navigation, including real scene captures, 3D reconstruction, a navigation simulator built from the reconstructions, a dataset-based proxy measuring the reconstruction-fidelity gap, and computing resources.</w:t>
             </w:r>
           </w:p>
           <w:p>
@@ -2022,20 +2022,7 @@
                 <w:rFonts w:cstheme="minorHAnsi"/>
                 <w:lang w:val="en-US"/>
               </w:rPr>
-              <w:t xml:space="preserve">3. Conducting research on which components of the discrepancy between a simulation built from real data and reality determine the generalization of models trained in it.</w:t>
-            </w:r>
-          </w:p>
-          <w:p>
-            <w:pPr>
-              <w:spacing w:after="40" w:line="240" w:lineRule="auto"/>
-              <w:jc w:val="left"/>
-            </w:pPr>
-            <w:r>
-              <w:rPr>
-                <w:rFonts w:cstheme="minorHAnsi"/>
-                <w:lang w:val="en-US"/>
-              </w:rPr>
-              <w:t xml:space="preserve">4. Carrying out initial analysis of where inside a model trained in simulation the simulation-to-reality gap arises.</w:t>
+              <w:t xml:space="preserve">3. Conducting research on which reconstruction errors of a digital twin, varying across a scene, determine the generalization of navigation models trained in it.</w:t>
             </w:r>
             <w:permEnd w:id="1413760106"/>
           </w:p>
@@ -2109,7 +2096,7 @@
                 <w:rFonts w:cstheme="minorHAnsi"/>
                 <w:lang w:val="en-US"/>
               </w:rPr>
-              <w:t xml:space="preserve">2. Continuing and finishing the research on the components of the simulation-to-reality discrepancy, including physical components in the manipulation setting, and on shaping the training distribution to target the harmful components.</w:t>
+              <w:t xml:space="preserve">2. Finishing the research on the harmful reconstruction errors and on randomizing each region of a digital twin according to its reconstruction uncertainty and task relevance.</w:t>
             </w:r>
           </w:p>
           <w:p>
@@ -2122,7 +2109,7 @@
                 <w:rFonts w:cstheme="minorHAnsi"/>
                 <w:lang w:val="en-US"/>
               </w:rPr>
-              <w:t xml:space="preserve">3. Writing a scientific article for a conference from the ministerial list (regarding the components of the simulation-to-reality discrepancy that determine generalization), planned for submission to NeurIPS 2027 (200 points).</w:t>
+              <w:t xml:space="preserve">3. Writing a scientific article for a conference from the ministerial list (regarding the reconstruction errors that determine generalization), planned for submission to NeurIPS 2027 (200 points).</w:t>
             </w:r>
           </w:p>
           <w:p>
@@ -2135,7 +2122,7 @@
                 <w:rFonts w:cstheme="minorHAnsi"/>
                 <w:lang w:val="en-US"/>
               </w:rPr>
-              <w:t xml:space="preserve">4. Continuing the research on localizing the simulation-to-reality gap inside the model and on task-relevant invariant representations.</w:t>
+              <w:t xml:space="preserve">4. Starting the research on localizing the sim-to-real gap inside the model, with first results on the stage at which task information is lost on real inputs.</w:t>
             </w:r>
           </w:p>
           <w:p>
@@ -2236,7 +2223,7 @@
                 <w:rFonts w:cstheme="minorHAnsi"/>
                 <w:lang w:val="en-US"/>
               </w:rPr>
-              <w:t xml:space="preserve">2. Finishing the research on localizing the simulation-to-reality gap and on task-relevant invariance at that location.</w:t>
+              <w:t xml:space="preserve">2. Finishing the research on localizing the sim-to-real gap inside the model and on aligning representations at that stage.</w:t>
             </w:r>
           </w:p>
           <w:p>
@@ -2249,7 +2236,7 @@
                 <w:rFonts w:cstheme="minorHAnsi"/>
                 <w:lang w:val="en-US"/>
               </w:rPr>
-              <w:t xml:space="preserve">3. Writing a scientific article for a conference from the ministerial list (regarding the localization of the simulation-to-reality gap inside deep models), planned for submission to ICML 2028 or CVPR 2028 (200 points).</w:t>
+              <w:t xml:space="preserve">3. Writing a scientific article for a conference from the ministerial list (regarding the localization of the sim-to-real gap inside deep models), planned for submission to ICML 2028 or CVPR 2028 (200 points).</w:t>
             </w:r>
           </w:p>
           <w:p>
@@ -2262,20 +2249,7 @@
                 <w:rFonts w:cstheme="minorHAnsi"/>
                 <w:lang w:val="en-US"/>
               </w:rPr>
-              <w:t xml:space="preserve">4. Carrying out research on selecting real data under a limited budget to correct both the simulation and the model.</w:t>
-            </w:r>
-          </w:p>
-          <w:p>
-            <w:pPr>
-              <w:spacing w:after="40" w:line="240" w:lineRule="auto"/>
-              <w:jc w:val="left"/>
-            </w:pPr>
-            <w:r>
-              <w:rPr>
-                <w:rFonts w:cstheme="minorHAnsi"/>
-                <w:lang w:val="en-US"/>
-              </w:rPr>
-              <w:t xml:space="preserve">5. Initial validation of the developed navigation methods on a real mobile robot.</w:t>
+              <w:t xml:space="preserve">4. Carrying out research on selecting real data under a limited budget to correct both the digital twin and the model.</w:t>
             </w:r>
             <w:permEnd w:id="930623221"/>
           </w:p>
@@ -2350,7 +2324,7 @@
                 <w:rFonts w:cstheme="minorHAnsi"/>
                 <w:lang w:val="en-US"/>
               </w:rPr>
-              <w:t xml:space="preserve">2. Continuing and finishing the research on the selection of real data for correcting both the simulation and the model.</w:t>
+              <w:t xml:space="preserve">2. Finishing the research on the selection of real data, and research on predicting whether the improvements transfer to unseen environments, confirmed on robotic manipulation in a controlled sim-to-sim setting with hidden physical parameters.</w:t>
             </w:r>
           </w:p>
           <w:p>
@@ -2363,7 +2337,7 @@
                 <w:rFonts w:cstheme="minorHAnsi"/>
                 <w:lang w:val="en-US"/>
               </w:rPr>
-              <w:t xml:space="preserve">3. Writing a scientific article for a conference from the ministerial list (regarding the selection of real data under a limited budget), planned for submission to NeurIPS 2028 (200 points).</w:t>
+              <w:t xml:space="preserve">3. Writing a scientific article for a conference from the ministerial list (regarding the selection of real data under a limited budget and the prediction of transfer), planned for submission to NeurIPS 2028 (200 points).</w:t>
             </w:r>
           </w:p>
           <w:p>
@@ -2376,7 +2350,7 @@
                 <w:rFonts w:cstheme="minorHAnsi"/>
                 <w:lang w:val="en-US"/>
               </w:rPr>
-              <w:t xml:space="preserve">4. Research on the generalization of the developed methods to unseen environments and to robotic manipulation as a controlled second task.</w:t>
+              <w:t xml:space="preserve">4. Validation of the developed navigation methods on a real mobile robot, in cooperation with a robotics laboratory of Wrocław University of Science and Technology.</w:t>
             </w:r>
           </w:p>
           <w:p>
@@ -2464,7 +2438,7 @@
                 <w:rFonts w:cstheme="minorHAnsi"/>
                 <w:lang w:val="en-US"/>
               </w:rPr>
-              <w:t xml:space="preserve">2. Finishing the studies on the generalization of the developed methods across environments and tasks, including final validation of navigation on a real robot.</w:t>
+              <w:t xml:space="preserve">2. Finishing the validation of the developed navigation methods on a real mobile robot.</w:t>
             </w:r>
           </w:p>
           <w:p>
@@ -2477,7 +2451,7 @@
                 <w:rFonts w:cstheme="minorHAnsi"/>
                 <w:lang w:val="en-US"/>
               </w:rPr>
-              <w:t xml:space="preserve">3. Writing a scientific article for a conference from the ministerial list (regarding which properties of the shift explain when improvements generalize), e.g. ICLR 2029 or CVPR 2029 (200 points).</w:t>
+              <w:t xml:space="preserve">3. Writing a journal article from the ministerial list summarizing the results on the generalization of the developed methods across environments, tasks and the real robot.</w:t>
             </w:r>
           </w:p>
           <w:p>
@@ -2564,7 +2538,7 @@
                 <w:rFonts w:cstheme="minorHAnsi"/>
                 <w:lang w:val="en-US"/>
               </w:rPr>
-              <w:t xml:space="preserve">1. Preparation of a journal article from the ministerial list summarizing the results on the generalization of the developed methods across environments and tasks.</w:t>
+              <w:t xml:space="preserve">1. Completing and submitting the journal article.</w:t>
             </w:r>
           </w:p>
           <w:p>
@@ -3254,7 +3228,7 @@
           <w:rFonts w:cstheme="minorHAnsi"/>
           <w:lang w:val="en-US"/>
         </w:rPr>
-        <w:t xml:space="preserve">Deep learning has brought remarkable progress in computer vision and natural language processing, largely thanks to vast amounts of data collected from the web. Physical AI, i.e., AI in robots and other embodied systems that perceive and act in the real world, cannot rely on such data. Its models need interaction data, which are slow, expensive and sometimes unsafe to collect with real robots. Therefore, such models are commonly trained in simulation. Recently, simulations built from real data have become a promising alternative to hand-crafted simulators: neural scene reconstruction methods, such as 3D Gaussian Splatting, turn a short recording of a real place into a photorealistic digital twin in which a model can be trained at scale. This forms a real-to-sim-to-real loop, in which real data are turned into a simulation, a model is trained there, and the model is transferred back to reality.</w:t>
+        <w:t xml:space="preserve">Deep learning has brought remarkable progress in computer vision and natural language processing, largely thanks to vast amounts of data collected from the web. Physical AI, i.e., AI in robots and other embodied systems that perceive and act in the real world, cannot rely on such data. Its models need interaction data, which are slow, expensive and sometimes unsafe to collect with real robots. Therefore, such models are commonly trained in simulation. Recently, digital twins, i.e., simulations built from real data, have become a promising alternative to hand-crafted simulators: neural scene reconstruction methods, such as 3D Gaussian Splatting, turn a short recording of a real place into a photorealistic digital twin in which a model can be trained at scale. This forms a real-to-sim-to-real loop, in which real data are turned into a simulation, a model is trained there, and the model is transferred back to reality.</w:t>
       </w:r>
     </w:p>
     <w:p>
@@ -3267,7 +3241,7 @@
           <w:rFonts w:cstheme="minorHAnsi"/>
           <w:lang w:val="en-US"/>
         </w:rPr>
-        <w:t xml:space="preserve">However, the value of this loop depends on how well the trained models generalize. A model that performs well in simulation often fails in reality, since no simulation reproduces the real world exactly: appearance, geometry, lighting and physics are only approximated, and reconstruction errors differ between regions of a scene. This simulation-to-reality generalization gap is caused by the shift between the distributions of simulated and real data, which makes it a particular case of learning under distribution shift and a central obstacle to physical AI. The methods proposed so far have several limitations. Domain randomization, even when fitted to real data, varies a few global parameters regardless of where the simulation is inaccurate, and invariant representations may discard information needed for the task. Moreover, the real data used for adaptation are usually chosen at random, by hand or by simple heuristics such as observed failures, and serve to correct either the model or the simulation, but not both. Finally, most methods are evaluated on a single task and a few scenes, and it is not known which properties of the simulation and of the learned representations determine whether a model generalizes to reality.</w:t>
+        <w:t xml:space="preserve">However, the value of this loop depends on how well the trained models generalize. A model that performs well in simulation often fails in reality, since no simulation reproduces the real world exactly: appearance, geometry, lighting and physics are only approximated, and reconstruction errors differ between regions of a scene. The resulting drop in performance, called the sim-to-real gap, is caused by the shift between the distributions of simulated and real data, which makes it a particular case of learning under distribution shift and a central obstacle to physical AI. The methods proposed so far have several limitations. Domain randomization, even when fitted to real data, varies a few global parameters regardless of where the simulation is inaccurate, and invariant representations may discard information needed for the task. Moreover, the few real data used for adaptation usually serve to correct either the model or the simulation, but not both. Finally, most methods are evaluated on a single task and a few scenes, and it is not known which properties of the digital twin and of the learned representations determine whether a model generalizes to reality.</w:t>
       </w:r>
     </w:p>
     <w:p>
@@ -3280,7 +3254,7 @@
           <w:rFonts w:cstheme="minorHAnsi"/>
           <w:lang w:val="en-US"/>
         </w:rPr>
-        <w:t xml:space="preserve">Therefore, the dissertation aims to improve the generalization of deep learning models in real-to-sim-to-real transfer at the points of the loop where the gap arises. The research shall focus on understanding which errors of a simulation built from real data are harmful to generalization, on localizing where inside a model the gap arises and reducing it there, on choosing the small amount of real data that corrects both the simulation and the model most efficiently, and on verifying whether the obtained improvements carry over to unseen environments and to another physical task, and which properties of the shift explain when they do. Robot navigation shall serve as the main testbed and robotic manipulation as the second task. Beyond more reliable models, the research could help explain why models trained on synthetic data succeed or fail on real data, which is relevant to machine learning in general.</w:t>
+        <w:t xml:space="preserve">Therefore, the dissertation aims to improve the generalization of deep learning models in real-to-sim-to-real transfer at the points of the loop where the sim-to-real gap arises. The research shall focus on understanding which reconstruction errors of a digital twin are harmful to generalization, on localizing where inside a model the gap arises and reducing it there, on choosing the small amount of real data that corrects both the digital twin and the model most efficiently, and on verifying whether the obtained improvements carry over to unseen environments and to another physical task, and which properties of the shift explain when they do. Robot navigation shall serve as the main task, and robotic manipulation, in a controlled simulated setting, as a confirmation test. Most experiments shall use public recordings of real scenes, in which a second, independent capture measures the reconstruction-fidelity gap, while a real robot shall provide the main evidence for differences in actuation and sensors. Beyond more reliable models, the research could help explain why models trained on synthetic data succeed or fail on real data, which is relevant to machine learning in general.</w:t>
       </w:r>
     </w:p>
     <w:p>
@@ -3663,7 +3637,7 @@
           <w:rFonts w:cstheme="minorHAnsi"/>
           <w:lang w:val="en-US"/>
         </w:rPr>
-        <w:t xml:space="preserve">Deep learning models for navigation and manipulation need more experience than real robots can provide, so they are usually trained in simulation. However, performance in simulation can be an unreliable predictor of real-world performance unless the simulator is carefully tuned [1], and higher fidelity alone does not ensure better transfer [2]. This is an instance of learning under distribution shift: domain adaptation theory bounds the error of a model on the target domain by its error on the source domain and the discrepancy between the two distributions [3]. This suggests two levers: a training distribution that covers reality, and a model insensitive to the remaining discrepancy.</w:t>
+        <w:t xml:space="preserve">Deep learning models for navigation and manipulation need more experience than real robots can provide, so they are usually trained in simulation. Yet performance in simulation can poorly predict real-world performance unless the simulator is carefully tuned [1]. The sim-to-real gap is an instance of learning under distribution shift: domain adaptation theory bounds the error of a model on the target domain by its error on the source domain, the discrepancy between the two distributions, and the joint error of the best single model on both domains [2]. Used as motivation only, the bound suggests three levers: a training distribution that covers reality, a model insensitive to the remaining discrepancy, and, since invariance cannot reduce the joint error, a simulation corrected towards reality.</w:t>
       </w:r>
     </w:p>
     <w:p>
@@ -3676,7 +3650,7 @@
           <w:rFonts w:cstheme="minorHAnsi"/>
           <w:lang w:val="en-US"/>
         </w:rPr>
-        <w:t xml:space="preserve">The first lever is exploited by domain randomization, which varies simulator parameters such as textures so that reality appears as one more variation [4]. Since overly wide randomization leads to conservative behaviour, later works shape its distribution: they fit it to a few real rollouts [5], infer a posterior over simulator parameters [6], or maximize its entropy while preserving task success [7]. Yet they act on a few global parameters of a synthetic simulator, not on errors that vary across a scene.</w:t>
+        <w:t xml:space="preserve">The first lever is exploited by domain randomization, which varies simulator parameters such as textures so that reality appears as one more variation [3]. Since overly wide randomization leads to conservative behaviour, later works shape its distribution: they fit it to a few real rollouts [4] or maximize its entropy while preserving task success [5]. Yet they act on a few global parameters of a synthetic simulator, not on errors that vary across a scene.</w:t>
       </w:r>
     </w:p>
     <w:p>
@@ -3689,7 +3663,7 @@
           <w:rFonts w:cstheme="minorHAnsi"/>
           <w:lang w:val="en-US"/>
         </w:rPr>
-        <w:t xml:space="preserve">The second lever is invariance. Domain-adversarial training aligns features across domains [8]. In robotics, randomized and real images were mapped to a canonical image [9], and aligning the joint distributions of observations and actions in simulated and real data improved co-trained policies in reality [10]. However, invariance with low source error does not guarantee transfer [11], and full invariance may discard task information. Moreover, it is usually enforced at a fixed location, the input or final features.</w:t>
+        <w:t xml:space="preserve">The second lever is invariance. Domain-adversarial training aligns features across domains [6]. In robotics, aligning the joint distributions of observations and actions in simulated and real data improved co-trained policies, i.e., models that map observations to actions, in reality [7]. However, invariance with low source error does not guarantee transfer, as it can increase the joint error term [8], and full invariance may discard task information. Effective sim-and-real co-training aligns the two domains while keeping them distinguishable [9], so domain separability alone does not show where the gap harms the task. Moreover, invariance is usually enforced at a fixed location, the input or the final features.</w:t>
       </w:r>
     </w:p>
     <w:p>
@@ -3702,7 +3676,7 @@
           <w:rFonts w:cstheme="minorHAnsi"/>
           <w:lang w:val="en-US"/>
         </w:rPr>
-        <w:t xml:space="preserve">A recent development is building simulations from real data. 3D Gaussian Splatting [12] reconstructs photorealistic scenes from ordinary images, and digital twins built from real data have been used to train manipulation policies from a scan of the target scene [13] and navigation policies from a phone capture of a room [14]. In twins, uncertainty has so far been modelled mainly for physical parameters [15]; beyond this, a twin is typically treated as a fixed copy of reality. It is unknown which of its errors, in appearance, geometry, lighting or physics, harm generalization, and existing training variation ignores how uncertain the reconstruction is in each region.</w:t>
+        <w:t xml:space="preserve">A recent development is building digital twins. 3D Gaussian Splatting [10] reconstructs photorealistic scenes from ordinary images, and twins have been used to train manipulation policies from a scan of the target scene [11] and navigation policies from a phone capture of a room [12]. In twins, uncertainty has so far been modelled mainly for physical parameters [13]. Which simulation factors matter has been studied mainly globally: a large real-world manipulation study compared randomization, photorealistic rendering and physics realism [14], and in robotic ultrasound, the fidelity of task-relevant feature changes predicted transfer better than single-frame realism [15]. It remains open which reconstruction errors that vary across a scene harm generalization, and how training variation should follow the reconstruction uncertainty of each region.</w:t>
       </w:r>
     </w:p>
     <w:p>
@@ -3715,7 +3689,7 @@
           <w:rFonts w:cstheme="minorHAnsi"/>
           <w:lang w:val="en-US"/>
         </w:rPr>
-        <w:t xml:space="preserve">It is also unclear where inside a model the gap arises. Self-supervised features are robust to many appearance changes [16], yet no representation dominates across navigation, manipulation and locomotion [17], and manipulation encoders degrade under lighting and texture shifts [18]. Probing showed that action fine-tuning degrades the visual representations of robot policies [19], and the best layers to adapt depend on the type of shift [20], but neither localizes the gap in models trained in reconstructed simulations.</w:t>
+        <w:t xml:space="preserve">It is also unclear where inside a model the gap arises. Manipulation encoders degrade under lighting and texture shifts [16]. Probing, i.e., reading out information from hidden states with simple classifiers, showed that action fine-tuning degrades the visual representations of robot policies [17], and the best layers to adapt depend on the type of shift [18]. However, the stage at which task information available in simulation stops being recoverable from real inputs has not been located in models trained in twins.</w:t>
       </w:r>
     </w:p>
     <w:p>
@@ -3728,7 +3702,7 @@
           <w:rFonts w:cstheme="minorHAnsi"/>
           <w:lang w:val="en-US"/>
         </w:rPr>
-        <w:t xml:space="preserve">The remaining gap is usually reduced with little real data. Co-training with a small real set yields large gains [21], and active system identification collects the real trajectories most informative about physics [22]. In vision, selecting images to label by domain discrepancy and uncertainty beats random selection [23]. The closest work uses a twin to find failure-prone configurations for real rollouts [24]. However, robotic methods correct either the model or the simulation and choose real data at random, by hand, at the model's failures, or by their informativeness about physical parameters; to the best of our knowledge, none uses the reconstruction uncertainty of a simulation built from real data, or the same data to correct both.</w:t>
+        <w:t xml:space="preserve">The remaining gap is usually reduced with little real data. Co-training with a small real set yields large gains [19], and active system identification collects the real trajectories most informative about physics [20]. In vision, selecting images to label by domain discrepancy and uncertainty beats random selection [21]. The closest work uses a twin to find failure-prone configurations for real rollouts [22]. However, these methods correct either the model or the simulation; correcting both from the same selected data, guided by the twin's reconstruction uncertainty, has, to our knowledge, not been studied.</w:t>
       </w:r>
     </w:p>
     <w:p>
@@ -3741,7 +3715,7 @@
           <w:rFonts w:cstheme="minorHAnsi"/>
           <w:lang w:val="en-US"/>
         </w:rPr>
-        <w:t xml:space="preserve">Finally, generalization to unseen scenes depends on training-scene diversity [25], and the gap can be decomposed into factors of variation whose difficulty ordering is largely consistent between simulation and reality [26]. However, it is rarely studied whether a sim-to-real method keeps its benefit when the scene or the task changes.</w:t>
+        <w:t xml:space="preserve">Finally, the gap can be decomposed into factors of variation whose difficulty ordering is largely consistent between simulation and reality [23]. However, it is rarely tested whether measurements taken before a method is applied predict, better than simple indicators such as the size of the gap, whether its benefit carries over to a new scene or task.</w:t>
       </w:r>
     </w:p>
     <w:p>
@@ -3754,7 +3728,7 @@
           <w:rFonts w:cstheme="minorHAnsi"/>
           <w:lang w:val="en-US"/>
         </w:rPr>
-        <w:t xml:space="preserve">In summary, it is open which simulation errors govern generalization, where inside a model the gap arises, which real data best correct model and simulation, and when improvements hold in new environments and tasks; these gaps motivate the questions in Section 7.</w:t>
+        <w:t xml:space="preserve">These open problems motivate the research questions in Section 7.</w:t>
       </w:r>
     </w:p>
     <w:p>
@@ -3797,7 +3771,7 @@
           <w:rFonts w:cstheme="minorHAnsi"/>
           <w:lang w:val="en-US"/>
         </w:rPr>
-        <w:t xml:space="preserve">[2] Truong, J., et al. (2022). Rethinking sim2real: Lower fidelity simulation leads to higher sim2real transfer in navigation. CoRL.</w:t>
+        <w:t xml:space="preserve">[2] Ben-David, S., et al. (2010). A theory of learning from different domains. Machine Learning.</w:t>
       </w:r>
     </w:p>
     <w:p>
@@ -3811,7 +3785,7 @@
           <w:rFonts w:cstheme="minorHAnsi"/>
           <w:lang w:val="en-US"/>
         </w:rPr>
-        <w:t xml:space="preserve">[3] Ben-David, S., et al. (2010). A theory of learning from different domains. Machine Learning.</w:t>
+        <w:t xml:space="preserve">[3] Tobin, J., et al. (2017). Domain randomization for transferring deep neural networks from simulation to the real world. IROS.</w:t>
       </w:r>
     </w:p>
     <w:p>
@@ -3825,7 +3799,7 @@
           <w:rFonts w:cstheme="minorHAnsi"/>
           <w:lang w:val="en-US"/>
         </w:rPr>
-        <w:t xml:space="preserve">[4] Tobin, J., et al. (2017). Domain randomization for transferring deep neural networks from simulation to the real world. IROS.</w:t>
+        <w:t xml:space="preserve">[4] Chebotar, Y., et al. (2019). Closing the sim-to-real loop: Adapting simulation randomization with real world experience. ICRA.</w:t>
       </w:r>
     </w:p>
     <w:p>
@@ -3839,7 +3813,7 @@
           <w:rFonts w:cstheme="minorHAnsi"/>
           <w:lang w:val="en-US"/>
         </w:rPr>
-        <w:t xml:space="preserve">[5] Chebotar, Y., et al. (2019). Closing the sim-to-real loop: Adapting simulation randomization with real world experience. ICRA.</w:t>
+        <w:t xml:space="preserve">[5] Tiboni, G., et al. (2024). Domain randomization via entropy maximization. ICLR.</w:t>
       </w:r>
     </w:p>
     <w:p>
@@ -3853,7 +3827,7 @@
           <w:rFonts w:cstheme="minorHAnsi"/>
           <w:lang w:val="en-US"/>
         </w:rPr>
-        <w:t xml:space="preserve">[6] Ramos, F., et al. (2019). BayesSim: Adaptive domain randomization via probabilistic inference for robotics simulators. RSS.</w:t>
+        <w:t xml:space="preserve">[6] Ganin, Y., et al. (2016). Domain-adversarial training of neural networks. JMLR.</w:t>
       </w:r>
     </w:p>
     <w:p>
@@ -3867,7 +3841,7 @@
           <w:rFonts w:cstheme="minorHAnsi"/>
           <w:lang w:val="en-US"/>
         </w:rPr>
-        <w:t xml:space="preserve">[7] Tiboni, G., et al. (2024). Domain randomization via entropy maximization. ICLR.</w:t>
+        <w:t xml:space="preserve">[7] Cheng, S., et al. (2025). Generalizable domain adaptation for sim-and-real policy co-training. NeurIPS.</w:t>
       </w:r>
     </w:p>
     <w:p>
@@ -3881,7 +3855,7 @@
           <w:rFonts w:cstheme="minorHAnsi"/>
           <w:lang w:val="en-US"/>
         </w:rPr>
-        <w:t xml:space="preserve">[8] Ganin, Y., et al. (2016). Domain-adversarial training of neural networks. JMLR.</w:t>
+        <w:t xml:space="preserve">[8] Zhao, H., et al. (2019). On learning invariant representations for domain adaptation. ICML.</w:t>
       </w:r>
     </w:p>
     <w:p>
@@ -3895,7 +3869,7 @@
           <w:rFonts w:cstheme="minorHAnsi"/>
           <w:lang w:val="en-US"/>
         </w:rPr>
-        <w:t xml:space="preserve">[9] James, S., et al. (2019). Sim-to-real via sim-to-sim: Data-efficient robotic grasping via randomized-to-canonical adaptation networks. CVPR.</w:t>
+        <w:t xml:space="preserve">[9] Lei, Y., et al. (2026). A Mechanistic Analysis of Sim-and-Real Co-Training in Generative Robot Policies. arXiv:2604.13645.</w:t>
       </w:r>
     </w:p>
     <w:p>
@@ -3909,7 +3883,7 @@
           <w:rFonts w:cstheme="minorHAnsi"/>
           <w:lang w:val="en-US"/>
         </w:rPr>
-        <w:t xml:space="preserve">[10] Cheng, S., et al. (2025). Generalizable domain adaptation for sim-and-real policy co-training. NeurIPS.</w:t>
+        <w:t xml:space="preserve">[10] Kerbl, B., et al. (2023). 3D Gaussian splatting for real-time radiance field rendering. ACM TOG.</w:t>
       </w:r>
     </w:p>
     <w:p>
@@ -3923,7 +3897,7 @@
           <w:rFonts w:cstheme="minorHAnsi"/>
           <w:lang w:val="en-US"/>
         </w:rPr>
-        <w:t xml:space="preserve">[11] Zhao, H., et al. (2019). On learning invariant representations for domain adaptation. ICML.</w:t>
+        <w:t xml:space="preserve">[11] Torne, M., et al. (2024). Reconciling reality through simulation: A real-to-sim-to-real approach for robust manipulation. RSS.</w:t>
       </w:r>
     </w:p>
     <w:p>
@@ -3937,7 +3911,7 @@
           <w:rFonts w:cstheme="minorHAnsi"/>
           <w:lang w:val="en-US"/>
         </w:rPr>
-        <w:t xml:space="preserve">[12] Kerbl, B., et al. (2023). 3D Gaussian splatting for real-time radiance field rendering. ACM TOG.</w:t>
+        <w:t xml:space="preserve">[12] Chhablani, G., et al. (2025). EmbodiedSplat: Personalized real-to-sim-to-real navigation with Gaussian splats from a mobile device. ICCV.</w:t>
       </w:r>
     </w:p>
     <w:p>
@@ -3951,7 +3925,7 @@
           <w:rFonts w:cstheme="minorHAnsi"/>
           <w:lang w:val="en-US"/>
         </w:rPr>
-        <w:t xml:space="preserve">[13] Torne, M., et al. (2024). Reconciling reality through simulation: A real-to-sim-to-real approach for robust manipulation. RSS.</w:t>
+        <w:t xml:space="preserve">[13] Wang, M., et al. (2026). Phys2Real: Fusing VLM priors with interactive online adaptation for uncertainty-aware sim-to-real manipulation. ICRA.</w:t>
       </w:r>
     </w:p>
     <w:p>
@@ -3965,7 +3939,7 @@
           <w:rFonts w:cstheme="minorHAnsi"/>
           <w:lang w:val="en-US"/>
         </w:rPr>
-        <w:t xml:space="preserve">[14] Chhablani, G., et al. (2025). EmbodiedSplat: Personalized real-to-sim-to-real navigation with Gaussian splats from a mobile device. ICCV.</w:t>
+        <w:t xml:space="preserve">[14] Jin, R., et al. (2026). Grounding Sim-to-Real Generalization in Robotic Manipulation: An Empirical Study with Vision-Language-Action Models. arXiv:2603.22876.</w:t>
       </w:r>
     </w:p>
     <w:p>
@@ -3979,7 +3953,7 @@
           <w:rFonts w:cstheme="minorHAnsi"/>
           <w:lang w:val="en-US"/>
         </w:rPr>
-        <w:t xml:space="preserve">[15] Wang, M., et al. (2026). Phys2Real: Fusing VLM priors with interactive online adaptation for uncertainty-aware sim-to-real manipulation. ICRA.</w:t>
+        <w:t xml:space="preserve">[15] Qian, Y., et al. (2026). Task-Relevant Feature-Dynamics Fidelity Enables Zero-Shot Sim-to-Real Transfer for Robotic Ultrasound Scanning. arXiv:2608.29516.</w:t>
       </w:r>
     </w:p>
     <w:p>
@@ -3993,7 +3967,7 @@
           <w:rFonts w:cstheme="minorHAnsi"/>
           <w:lang w:val="en-US"/>
         </w:rPr>
-        <w:t xml:space="preserve">[16] Oquab, M., et al. (2024). DINOv2: Learning robust visual features without supervision. TMLR.</w:t>
+        <w:t xml:space="preserve">[16] Burns, K., et al. (2024). What makes pre-trained visual representations successful for robust manipulation? CoRL.</w:t>
       </w:r>
     </w:p>
     <w:p>
@@ -4007,7 +3981,7 @@
           <w:rFonts w:cstheme="minorHAnsi"/>
           <w:lang w:val="en-US"/>
         </w:rPr>
-        <w:t xml:space="preserve">[17] Majumdar, A., et al. (2023). Where are we in the search for an artificial visual cortex for embodied intelligence? NeurIPS.</w:t>
+        <w:t xml:space="preserve">[17] Kachaev, N., et al. (2026). Don't blind your VLA: Aligning visual representations for OOD generalization. AAMAS.</w:t>
       </w:r>
     </w:p>
     <w:p>
@@ -4021,7 +3995,7 @@
           <w:rFonts w:cstheme="minorHAnsi"/>
           <w:lang w:val="en-US"/>
         </w:rPr>
-        <w:t xml:space="preserve">[18] Burns, K., et al. (2024). What makes pre-trained visual representations successful for robust manipulation? CoRL.</w:t>
+        <w:t xml:space="preserve">[18] Lee, Y., et al. (2023). Surgical fine-tuning improves adaptation to distribution shifts. ICLR.</w:t>
       </w:r>
     </w:p>
     <w:p>
@@ -4035,7 +4009,7 @@
           <w:rFonts w:cstheme="minorHAnsi"/>
           <w:lang w:val="en-US"/>
         </w:rPr>
-        <w:t xml:space="preserve">[19] Kachaev, N., et al. (2026). Don't blind your VLA: Aligning visual representations for OOD generalization. AAMAS.</w:t>
+        <w:t xml:space="preserve">[19] Maddukuri, A., et al. (2025). Sim-and-real co-training: A simple recipe for vision-based robotic manipulation. RSS.</w:t>
       </w:r>
     </w:p>
     <w:p>
@@ -4049,7 +4023,7 @@
           <w:rFonts w:cstheme="minorHAnsi"/>
           <w:lang w:val="en-US"/>
         </w:rPr>
-        <w:t xml:space="preserve">[20] Lee, Y., et al. (2023). Surgical fine-tuning improves adaptation to distribution shifts. ICLR.</w:t>
+        <w:t xml:space="preserve">[20] Memmel, M., et al. (2024). ASID: Active exploration for system identification in robotic manipulation. ICLR.</w:t>
       </w:r>
     </w:p>
     <w:p>
@@ -4063,7 +4037,7 @@
           <w:rFonts w:cstheme="minorHAnsi"/>
           <w:lang w:val="en-US"/>
         </w:rPr>
-        <w:t xml:space="preserve">[21] Maddukuri, A., et al. (2025). Sim-and-real co-training: A simple recipe for vision-based robotic manipulation. RSS.</w:t>
+        <w:t xml:space="preserve">[21] Su, J.-C., et al. (2020). Active adversarial domain adaptation. WACV.</w:t>
       </w:r>
     </w:p>
     <w:p>
@@ -4077,7 +4051,7 @@
           <w:rFonts w:cstheme="minorHAnsi"/>
           <w:lang w:val="en-US"/>
         </w:rPr>
-        <w:t xml:space="preserve">[22] Memmel, M., et al. (2024). ASID: Active exploration for system identification in robotic manipulation. ICLR.</w:t>
+        <w:t xml:space="preserve">[22] Xu, Q., et al. (2026). TwinRL: Digital twin-driven reinforcement learning for real-world robotic manipulation. arXiv:2602.09023.</w:t>
       </w:r>
     </w:p>
     <w:p>
@@ -4091,49 +4065,7 @@
           <w:rFonts w:cstheme="minorHAnsi"/>
           <w:lang w:val="en-US"/>
         </w:rPr>
-        <w:t xml:space="preserve">[23] Su, J.-C., et al. (2020). Active adversarial domain adaptation. WACV.</w:t>
-      </w:r>
-    </w:p>
-    <w:p>
-      <w:pPr>
-        <w:spacing w:after="0" w:line="240" w:lineRule="auto"/>
-        <w:ind w:left="397" w:hanging="397"/>
-        <w:jc w:val="left"/>
-      </w:pPr>
-      <w:r>
-        <w:rPr>
-          <w:rFonts w:cstheme="minorHAnsi"/>
-          <w:lang w:val="en-US"/>
-        </w:rPr>
-        <w:t xml:space="preserve">[24] Xu, Q., et al. (2026). TwinRL: Digital twin-driven reinforcement learning for real-world robotic manipulation. arXiv:2602.09023.</w:t>
-      </w:r>
-    </w:p>
-    <w:p>
-      <w:pPr>
-        <w:spacing w:after="0" w:line="240" w:lineRule="auto"/>
-        <w:ind w:left="397" w:hanging="397"/>
-        <w:jc w:val="left"/>
-      </w:pPr>
-      <w:r>
-        <w:rPr>
-          <w:rFonts w:cstheme="minorHAnsi"/>
-          <w:lang w:val="en-US"/>
-        </w:rPr>
-        <w:t xml:space="preserve">[25] Deitke, M., et al. (2022). ProcTHOR: Large-scale embodied AI using procedural generation. NeurIPS.</w:t>
-      </w:r>
-    </w:p>
-    <w:p>
-      <w:pPr>
-        <w:spacing w:after="0" w:line="240" w:lineRule="auto"/>
-        <w:ind w:left="397" w:hanging="397"/>
-        <w:jc w:val="left"/>
-      </w:pPr>
-      <w:r>
-        <w:rPr>
-          <w:rFonts w:cstheme="minorHAnsi"/>
-          <w:lang w:val="en-US"/>
-        </w:rPr>
-        <w:t xml:space="preserve">[26] Xie, A., et al. (2024). Decomposing the generalization gap in imitation learning for visual robotic manipulation. ICRA.</w:t>
+        <w:t xml:space="preserve">[23] Xie, A., et al. (2024). Decomposing the generalization gap in imitation learning for visual robotic manipulation. ICRA.</w:t>
       </w:r>
     </w:p>
     <w:permEnd w:id="174659581"/>
@@ -4389,14 +4321,14 @@
           <w:b/>
           <w:lang w:val="en-US"/>
         </w:rPr>
-        <w:t xml:space="preserve">Which components of the discrepancy between a simulation built from real data and reality determine how well models trained in it generalize?</w:t>
-      </w:r>
-      <w:r>
-        <w:rPr>
-          <w:rFonts w:cstheme="minorHAnsi"/>
-          <w:lang w:val="en-US"/>
-        </w:rPr>
-        <w:t xml:space="preserve"> Domain adaptation theory bounds the real-world error of a model by its error in simulation and by the discrepancy between the simulated and the real distributions. A simulation built from real data reproduces appearance, geometry, lighting and physics only approximately, and its errors differ between regions of a scene. </w:t>
+        <w:t xml:space="preserve">Which reconstruction errors of a digital twin, varying across a scene, determine how well models trained in it generalize?</w:t>
+      </w:r>
+      <w:r>
+        <w:rPr>
+          <w:rFonts w:cstheme="minorHAnsi"/>
+          <w:lang w:val="en-US"/>
+        </w:rPr>
+        <w:t xml:space="preserve"> Domain adaptation theory, used here as motivation, bounds the real-world error of a model by its error in simulation, the discrepancy between the simulated and real distributions, and a joint error term. A digital twin reproduces appearance, geometry and lighting only approximately, and its errors differ between regions of a scene. </w:t>
       </w:r>
       <w:r>
         <w:rPr>
@@ -4411,7 +4343,7 @@
           <w:rFonts w:cstheme="minorHAnsi"/>
           <w:lang w:val="en-US"/>
         </w:rPr>
-        <w:t xml:space="preserve"> The harm caused by a simulation error is predicted better by the change it induces in the task-relevant representations of the model than by its magnitude in the image or geometry, so that errors of similar size differ strongly in their effect on generalization. Hence, training variation should follow the reconstruction uncertainty and task relevance of each region rather than be spread uniformly. The research will attribute the gap to types of simulation error and derive a principled way to shape the training distribution accordingly.</w:t>
+        <w:t xml:space="preserve"> The harm caused by a reconstruction error is predicted better by the change it induces in the representation of a fixed reference model on held-out paired views than by its magnitude in the image or geometry. Separately, randomizing each region in proportion to its reconstruction uncertainty and task relevance yields better generalization than uniform randomization. The research will replace components of the twin with a more accurate reference and measure the effect. If harm follows error magnitude, this attribution will itself be reported, and the third question will rely on reconstruction uncertainty and action sensitivity only.</w:t>
       </w:r>
     </w:p>
     <w:p>
@@ -4433,14 +4365,14 @@
           <w:b/>
           <w:lang w:val="en-US"/>
         </w:rPr>
-        <w:t xml:space="preserve">Where inside a model trained in simulation does the simulation-to-reality gap arise, and can task-relevant invariance at that location reduce it?</w:t>
-      </w:r>
-      <w:r>
-        <w:rPr>
-          <w:rFonts w:cstheme="minorHAnsi"/>
-          <w:lang w:val="en-US"/>
-        </w:rPr>
-        <w:t xml:space="preserve"> Models trained in simulation can rely on features absent in reality, such as reconstruction artifacts. Invariant representations reduce the discrepancy between domains, yet full invariance does not guarantee transfer and may remove information needed for the task. Moreover, it is not known at which stage of such a model, from early visual features to the action output, the shift turns into errors. </w:t>
+        <w:t xml:space="preserve">Where inside a model trained in simulation does the sim-to-real gap arise, and can aligning representations at that stage reduce it?</w:t>
+      </w:r>
+      <w:r>
+        <w:rPr>
+          <w:rFonts w:cstheme="minorHAnsi"/>
+          <w:lang w:val="en-US"/>
+        </w:rPr>
+        <w:t xml:space="preserve"> Models trained in simulation can rely on features absent in reality, such as reconstruction artifacts. Simulated and real inputs remain distinguishable even in models that transfer well, so the gap should be localized by what the model loses about the task, not by whether the domains can be told apart. </w:t>
       </w:r>
       <w:r>
         <w:rPr>
@@ -4455,7 +4387,7 @@
           <w:rFonts w:cstheme="minorHAnsi"/>
           <w:lang w:val="en-US"/>
         </w:rPr>
-        <w:t xml:space="preserve"> The gap arises in a limited part of the model, and enforcing invariance there, only for task-relevant features and from a few paired simulated and real observations, yields better generalization than invariance at the input or at the final features. The research will use probing of hidden states to localize the gap before intervening.</w:t>
+        <w:t xml:space="preserve"> There is a first stage of the model at which task information that can be decoded from simulated inputs can no longer be decoded from real ones. Aligning simulated and real representations at that stage, from a few paired views, yields better generalization than aligning them at the input, at the final features or everywhere. The research will use probing of hidden states to find this stage before intervening.</w:t>
       </w:r>
     </w:p>
     <w:p>
@@ -4477,14 +4409,14 @@
           <w:b/>
           <w:lang w:val="en-US"/>
         </w:rPr>
-        <w:t xml:space="preserve">Which real data, chosen under a limited budget, most efficiently correct both the simulation and the model, and thereby reduce the generalization gap?</w:t>
-      </w:r>
-      <w:r>
-        <w:rPr>
-          <w:rFonts w:cstheme="minorHAnsi"/>
-          <w:lang w:val="en-US"/>
-        </w:rPr>
-        <w:t xml:space="preserve"> Real interaction data, such as robot trials or demonstrations, are expensive to collect. Existing robotic methods correct either the model or the simulation and choose real data at random, by hand, where the model fails, or by their informativeness about physical parameters; selection by domain discrepancy has so far been studied only for labelling images. </w:t>
+        <w:t xml:space="preserve">Which real data, chosen under a limited budget, most efficiently correct both the simulation and the model?</w:t>
+      </w:r>
+      <w:r>
+        <w:rPr>
+          <w:rFonts w:cstheme="minorHAnsi"/>
+          <w:lang w:val="en-US"/>
+        </w:rPr>
+        <w:t xml:space="preserve"> Real data are expensive, and existing methods use them to correct either the model or the simulation. However, the joint error term cannot be reduced by invariance, only by making the simulation closer to reality. </w:t>
       </w:r>
       <w:r>
         <w:rPr>
@@ -4499,7 +4431,7 @@
           <w:rFonts w:cstheme="minorHAnsi"/>
           <w:lang w:val="en-US"/>
         </w:rPr>
-        <w:t xml:space="preserve"> The most informative real data are those where the simulation is predicted to disagree with reality in task-relevant ways, as estimated from its reconstruction uncertainty, the distance between the task-relevant representations of simulated and cheaply captured real observations, and the sensitivity of the predicted action. Using the selected data to correct both the simulation and the model is expected to reduce the gap with less real data than random or failure-driven selection. The research will develop such a selection rule and study it under different budgets.</w:t>
+        <w:t xml:space="preserve"> Correcting both the digital twin and the model from the same selected real data reduces the gap more than correcting either one alone. The data should be selected where the twin is predicted to disagree with reality in task-relevant ways. This disagreement can be estimated from the reconstruction uncertainty, the representation distance between simulated and real views, and the sensitivity of the predicted action. Such selection is expected to beat random and failure-driven selection. The research will compare selection rules at equal budgets, counting unlabelled real images as real data.</w:t>
       </w:r>
     </w:p>
     <w:p>
@@ -4528,7 +4460,7 @@
           <w:rFonts w:cstheme="minorHAnsi"/>
           <w:lang w:val="en-US"/>
         </w:rPr>
-        <w:t xml:space="preserve"> A valuable method should not be tied to a single scene or task, and no single visual representation is known to be best for both navigation and manipulation. Therefore, the developed methods shall be examined, with unchanged settings, on environments held out from training and on two physical tasks: robot navigation and, as a controlled second task, robotic manipulation. </w:t>
+        <w:t xml:space="preserve"> A valuable method should not be tied to a single scene or task. Therefore, the developed methods shall be applied with unchanged settings to many navigation scenes held out from training, and to robotic manipulation as a confirmation test in a controlled sim-to-sim setting with hidden physical parameters. </w:t>
       </w:r>
       <w:r>
         <w:rPr>
@@ -4543,7 +4475,7 @@
           <w:rFonts w:cstheme="minorHAnsi"/>
           <w:lang w:val="en-US"/>
         </w:rPr>
-        <w:t xml:space="preserve"> The attribution of the gap from the first question and its localization from the second, measured in the new setting before a method is applied, predict whether its improvement transfers. The research will decompose the gap into factors of variation and relate the measured attribution and localization to the observed transfer across held-out scenes and tasks.</w:t>
+        <w:t xml:space="preserve"> The attribution of the gap from the first question and its localization from the second can be measured in a new setting before a method is applied. These measurements predict whether the improvement transfers. They predict it better than simple indicators, such as the raw size of the gap or the image-level discrepancy. The research will test this prediction across held-out scenes and confirm it on manipulation.</w:t>
       </w:r>
     </w:p>
     <w:permEnd w:id="1295260508"/>
@@ -4823,7 +4755,7 @@
           <w:rFonts w:cstheme="minorHAnsi"/>
           <w:lang w:val="en-US"/>
         </w:rPr>
-        <w:t xml:space="preserve">The proposed PhD dissertation aims to introduce several contributions to the development of the scientific discipline. The central scientific problem addressed is explaining and reducing the generalization gap caused by the distribution shift between a simulation built from real data and reality; poor generalization of models trained in simulation remains one of the main obstacles to applying machine learning in physical AI. The central claim of the dissertation is that this gap is concentrated in a small set of task-relevant discrepancies, which can be identified in the simulation, localized inside the model and targeted with little real data, and that addressing them there yields better generalization than uniform randomization, invariance of the whole representation or randomly chosen real data. Research questions 1-3 test the three parts of this claim, and question 4 tests whether it holds across environments and tasks; the methods derived from it are intended to be general, i.e., not tied to a particular robot, scene or task, and will be examined on robot navigation and robotic manipulation.</w:t>
+        <w:t xml:space="preserve">The proposed PhD dissertation aims to introduce several contributions to the development of the scientific discipline. The central scientific problem addressed is explaining and reducing the sim-to-real gap caused by the distribution shift between a digital twin and reality; poor generalization of models trained in simulation remains one of the main obstacles to applying machine learning in physical AI. The central claim of the dissertation is that this gap is concentrated in a small set of task-relevant discrepancies, which can be identified among the reconstruction errors of the digital twin, localized at the stage of the model where task information is lost, and reduced by correcting both the digital twin and the model from the same small set of real data. Addressing them there is expected to yield better generalization than uniform randomization, alignment at a fixed location of the model, or real data chosen at random or at the model's failures. Research questions 1-3 test the three parts of this claim, and question 4 tests whether it holds across environments and tasks; the methods derived from it are intended to be general, i.e., not tied to a particular robot, scene or task, and will be examined mainly on robot navigation, with robotic manipulation as a controlled confirmation test.</w:t>
       </w:r>
     </w:p>
     <w:p>
@@ -4836,7 +4768,7 @@
           <w:rFonts w:cstheme="minorHAnsi"/>
           <w:lang w:val="en-US"/>
         </w:rPr>
-        <w:t xml:space="preserve">Furthermore, the research is expected to deliver new methods and findings that do not exist at present: a principle for shaping the training distribution of a simulation built from real data by the reconstruction uncertainty and task relevance of each region; a method for localizing the simulation-to-reality gap inside a deep model and for enforcing task-relevant invariance only there; a rule for selecting real data that corrects the simulation and the model at the same time; and an empirical account of which properties of the shift determine whether these improvements carry over across environments and tasks. Such knowledge could complement the currently dominant randomization heuristics with more principled and interpretable approaches, and could introduce new perspectives for the design of simulations and of training procedures.</w:t>
+        <w:t xml:space="preserve">Furthermore, the research is expected to deliver new methods and findings that do not exist at present: an attribution of the sim-to-real gap to reconstruction errors that vary across a scene, with a principle for randomizing each region of a digital twin according to its reconstruction uncertainty and task relevance; a method for localizing the gap as the first stage of a deep model at which task information is lost on real inputs, and for aligning representations only there; a rule for selecting real data that corrects the digital twin and the model at the same time; and an empirical account of whether properties of the shift, measured before a method is applied, predict better than simple indicators when these improvements carry over across environments and tasks. Such knowledge could complement the currently dominant randomization heuristics with more principled and interpretable approaches, and could introduce new perspectives for the design of simulations and of training procedures.</w:t>
       </w:r>
     </w:p>
     <w:p>
@@ -4849,7 +4781,7 @@
           <w:rFonts w:cstheme="minorHAnsi"/>
           <w:lang w:val="en-US"/>
         </w:rPr>
-        <w:t xml:space="preserve">Since transfer from simulation to reality is an instance of learning under distribution shift, the findings are also expected to be relevant to machine learning in general. The analysis of which errors in the training distribution are harmful concerns domain adaptation; the localization of the simulation-to-reality gap inside a model extends probing methods developed for language and vision models and contributes to representation learning; and the selection of informative data under a budget concerns active learning and the adaptation of pretrained foundation models to new domains from a few examples.</w:t>
+        <w:t xml:space="preserve">Since transfer from simulation to reality is an instance of learning under distribution shift, the findings are also expected to be relevant to machine learning in general. The analysis of which errors in the training distribution are harmful concerns domain adaptation; the localization of the sim-to-real gap inside a model extends probing methods developed for language and vision models and contributes to representation learning; and the selection of informative data under a budget concerns active learning and the adaptation of pretrained foundation models to new domains from a few examples.</w:t>
       </w:r>
     </w:p>
     <w:p>
@@ -5141,7 +5073,7 @@
           <w:rFonts w:cstheme="minorHAnsi"/>
           <w:lang w:val="en-US"/>
         </w:rPr>
-        <w:t xml:space="preserve">The research will follow the methods commonly adopted in machine learning and robot learning projects. Since no established theory guarantees generalization from simulation to reality, the research will be mainly empirical. The proposed methods will be described theoretically, and their properties or bounds will be analysed whenever possible, in particular using domain adaptation theory, which relates the error of a model in reality to its error in simulation and to the discrepancy between the two distributions. Numbers in brackets refer to the references listed in Section 6.</w:t>
+        <w:t xml:space="preserve">The research will follow the methods commonly adopted in machine learning and robot learning projects. Since no established theory guarantees generalization from simulation to reality, the research will be mainly empirical. Domain adaptation theory, which relates the error of a model in reality to its error in simulation, the discrepancy between the two distributions and a joint error term, will serve as motivation, and the properties of the proposed methods will be analysed theoretically whenever possible. Numbers in brackets refer to the references listed in Section 6.</w:t>
       </w:r>
     </w:p>
     <w:p>
@@ -5154,7 +5086,7 @@
           <w:rFonts w:cstheme="minorHAnsi"/>
           <w:lang w:val="en-US"/>
         </w:rPr>
-        <w:t xml:space="preserve">Simulations will be built from real captures of indoor scenes, using structure-from-motion for camera poses and neural scene reconstruction, such as 3D Gaussian Splatting, for appearance and geometry, and then coupled with robot simulators, e.g., Habitat for navigation and ManiSkill3 for manipulation, with geometry for collisions and physics and appearance rendered from the reconstruction or from a mesh extracted from it. Reconstruction uncertainty will be estimated per region, e.g., from view coverage and the disagreement of an ensemble of reconstructions. Models for goal-directed indoor navigation (e.g., point-goal or image-goal) and tabletop pick-and-place manipulation will be trained with reinforcement and imitation learning, starting from pretrained models when possible.</w:t>
+        <w:t xml:space="preserve">Digital twins will be built from real captures of indoor scenes, using structure-from-motion for camera poses and neural scene reconstruction, such as 3D Gaussian Splatting, for appearance and geometry, and then coupled with a navigation simulator, e.g., Habitat, with geometry for collisions and appearance rendered from the reconstruction. Reconstruction uncertainty will be estimated per region, e.g., from view coverage and the disagreement of an ensemble of reconstructions. Models for goal-directed indoor navigation (e.g., point-goal or image-goal) will be trained with reinforcement and imitation learning, starting from pretrained models when possible.</w:t>
       </w:r>
     </w:p>
     <w:p>
@@ -5167,7 +5099,7 @@
           <w:rFonts w:cstheme="minorHAnsi"/>
           <w:lang w:val="en-US"/>
         </w:rPr>
-        <w:t xml:space="preserve">Experiments will be conducted mainly on public datasets of real scenes, such as ScanNet++ and MuSHRoom, which contain separate captures of the same scenes made with different devices. This allows building the simulation from one capture and using another, independent capture as a proxy for reality. Real frames of the independent capture will serve for open-loop evaluation, which measures the discrepancy between representations of paired simulated and real views, the agreement of predicted actions, and probing accuracy. A reference simulation built from the independent, higher-fidelity capture (e.g., the laser scan and DSLR images in ScanNet++) will serve as a proxy for closed-loop evaluation. Thus, the gap can be studied on many scenes without a robot. For manipulation, where real data with known physical properties are scarce, a simulation whose visual and physical parameters are hidden from the learner will serve as a controlled proxy.</w:t>
+        <w:t xml:space="preserve">Experiments will be conducted mainly on public datasets of real scenes, such as ScanNet++ and MuSHRoom, which contain separate captures of the same scenes made with different devices. This allows building the digital twin from one capture and using another, independent capture as a reference. Real frames of the independent capture will serve for open-loop evaluation, in which the model does not act, measuring the discrepancy between representations of paired simulated and real views, the agreement of predicted actions, and probing accuracy. A reference simulation built from the independent, higher-fidelity capture (e.g., the laser scan and DSLR images in ScanNet++) will serve for closed-loop evaluation, in which the model's actions determine what it observes next. The difference between the two simulations measures the reconstruction-fidelity gap on many scenes without a robot, but not differences in actuation and sensors.</w:t>
       </w:r>
     </w:p>
     <w:p>
@@ -5180,7 +5112,7 @@
           <w:rFonts w:cstheme="minorHAnsi"/>
           <w:lang w:val="en-US"/>
         </w:rPr>
-        <w:t xml:space="preserve">For the first question, controlled variants of a simulation, in which components such as appearance, geometry or lighting are degraded or replaced, will be used to attribute the gap to types of simulation error; physical components will be studied in manipulation, where they can be controlled. The task relevance of a region will be estimated from the sensitivity of the model's actions to it, e.g., with gradient-based attribution or by occluding the region. The training distribution will then be shaped by randomizing appearance (colour and opacity of Gaussians), geometry and, where the representation allows relighting, lighting per region in proportion to its reconstruction uncertainty and task relevance, and compared with uniform randomization, randomization fitted to real rollouts [5] and entropy-maximizing randomization [7]. For the second question, probing of hidden states will be adapted to find at which layers simulated and real observations become distinguishable and where task-relevant information is lost. An alignment loss (e.g., distribution-discrepancy or contrastive) will then be applied at the identified layers to a few paired simulated and real views at the same camera poses, restricted to the features on which the predicted action depends. It will be compared with alignment at the input, domain-adversarial alignment of the final features [8] and full fine-tuning.</w:t>
+        <w:t xml:space="preserve">For the first question, variants of the digital twin will be built in which one component of a region, i.e., its appearance, geometry or lighting, is replaced by its counterpart from the reference reconstruction, and the resulting change of the gap will attribute it to types of reconstruction error. The harm of each error will be related to two predictors: its magnitude in the image or geometry, and the change it induces in the representation of a fixed reference model, e.g., a pretrained visual encoder, on held-out paired views. If harm follows error magnitude, this attribution will be reported as a result, and the third question will then use only reconstruction uncertainty and action sensitivity. As a separate claim, the training distribution will be shaped by randomizing appearance (colour and opacity of Gaussians), geometry and, where the representation allows relighting, lighting per region in proportion to its reconstruction uncertainty and task relevance, the latter estimated from the sensitivity of the model's actions to the region, e.g., by occluding it. This will be compared with uniform randomization, randomization fitted to real rollouts [4] and entropy-maximizing randomization [5].</w:t>
       </w:r>
     </w:p>
     <w:p>
@@ -5193,7 +5125,7 @@
           <w:rFonts w:cstheme="minorHAnsi"/>
           <w:lang w:val="en-US"/>
         </w:rPr>
-        <w:t xml:space="preserve">For the third question, the budget refers to real interaction data, such as robot trials or demonstrations, while unlabelled real images are assumed available. On the dataset-based proxy, a unit of interaction data will be an expert or policy episode executed in the reference simulation, paired with the real frames of the independent capture at the visited poses; in manipulation, an episode in the simulation with hidden parameters; and on the physical robot, a real trial or demonstration. Episodes (start and goal configurations), poses and scene regions used for final evaluation will be disjoint from those available for selection, and results will also be reported on held-out scenes whose independent capture is never used for correction. Real data will be selected by scores combining reconstruction uncertainty, the distance between the task-relevant representations of simulated and real observations, and the sensitivity of the predicted action. Each selected location will thus yield both real views, used to refine the simulation by re-optimizing the reconstruction in uncertain regions (and, in manipulation, by re-estimating physical parameters), and interaction data, used to adapt the model by fine-tuning or co-training on simulated and real data. This will be compared with random and failure-driven selection, in manipulation also with selection by informativeness about physics [22], with the same score without task relevance, and with correcting only the model or only the simulation, at equal amounts of real data across budgets. For the fourth question, the methods will be applied with unchanged settings to held-out scenes and to manipulation, the gap will be decomposed into factors of variation, and the attribution and localization measured in a new setting will be related, across many held-out scenes and both tasks, to the size of the improvement there, e.g., by rank correlation.</w:t>
+        <w:t xml:space="preserve">For the second question, probes, i.e., simple classifiers, will be trained at each layer on simulated hidden states to decode task variables, such as the direction and distance to the goal or the presence of obstacles, and tested on the paired real views. The first stage at which task information decodable in simulation can no longer be decoded from real inputs will localize the gap. Unlike the separability of the two domains, which can remain high even in models that transfer well [9], this criterion refers to the task. An alignment loss (e.g., distribution-discrepancy or contrastive) will then be applied at that stage to a few paired simulated and real views at the same camera poses, and compared with alignment at the input, domain-adversarial alignment of the final features [6], alignment at all layers and full fine-tuning.</w:t>
       </w:r>
     </w:p>
     <w:p>
@@ -5206,7 +5138,7 @@
           <w:rFonts w:cstheme="minorHAnsi"/>
           <w:lang w:val="en-US"/>
         </w:rPr>
-        <w:t xml:space="preserve">The quantitative evaluation will rely on standard metrics for embodied tasks, such as success rate and success weighted by path length (SPL), and on the generalization gap, defined at two levels: on the dataset-based proxy, as the difference between the performance in the training simulation and in the reference simulation, complemented by the open-loop measures on real frames; and on the physical robot, as the difference between the closed-loop performance in simulation and in reality. The agreement between the two levels will also be measured, e.g., by the rank correlation of model scores. All methods will be compared with baselines under equal training effort and an equal amount of real data. Statistical methods will be leveraged to provide reliable outcomes, including repeated experiments with different random seeds and scenes, confidence intervals, and statistical tests for comparisons with baseline methods. According to accepted standards, the data used for training, model selection and final evaluation will be kept separate. The analysis of the learned representations will combine quantitative and qualitative methods: representations of paired simulated and real observations will be compared with representation similarity measures, visualized in the latent space, and related to failure cases.</w:t>
+        <w:t xml:space="preserve">For the third question, the budget will count all real data: unlabelled real images as well as interaction data, such as robot trials or demonstrations. On the dataset-based proxy, a unit of interaction data will be an expert or policy episode executed in the reference simulation, paired with the real frames at the visited poses; on the physical robot, a real trial or demonstration. Real data will be selected by scores combining reconstruction uncertainty, the distance between representations of simulated and real views, and the sensitivity of the predicted action. The same selected data will be used to refine the digital twin, by re-optimizing the reconstruction in uncertain regions, and to adapt the model, by fine-tuning or co-training on simulated and real data. This will be compared with random and failure-driven selection [22], with the same score without task relevance, and with correcting only the model or only the digital twin, at equal real-data budgets. Data used for final evaluation will be disjoint from those available for selection.</w:t>
       </w:r>
     </w:p>
     <w:p>
@@ -5219,7 +5151,7 @@
           <w:rFonts w:cstheme="minorHAnsi"/>
           <w:lang w:val="en-US"/>
         </w:rPr>
-        <w:t xml:space="preserve">The navigation results will be validated on a wheeled mobile robot with an RGB-D camera, e.g., in the robotics laboratories of the university. The validation will measure closed-loop success rate and SPL in reality and check whether the conclusions drawn with the dataset-based proxy also hold on a physical robot. Should robot access be limited, the conclusions will rest on the dataset-based proxy and on a reduced set of real trials, and the agreement between the two levels will be reported for the trials performed.</w:t>
+        <w:t xml:space="preserve">For the fourth question, the methods will be applied with unchanged settings to many held-out navigation scenes. The attribution and localization measured in each scene before a method is applied will be related to the size of the improvement there, e.g., by rank correlation, and compared with simple predictors: the raw size of the gap and the image-level discrepancy between simulated and real views. The relation will then be confirmed on tabletop manipulation in a controlled sim-to-sim setting, e.g., in ManiSkill3, in which a simulation whose visual and physical parameters are hidden from the learner stands in for reality.</w:t>
       </w:r>
     </w:p>
     <w:p>
@@ -5232,12 +5164,12 @@
           <w:rFonts w:cstheme="minorHAnsi"/>
           <w:lang w:val="en-US"/>
         </w:rPr>
-        <w:t xml:space="preserve">Experiments will be implemented mainly in Python with the PyTorch deep learning library. Source code will be managed with the Git version control system, and datasets, configurations and results will be versioned and tracked with experiment tracking tools to provide reproducible results. Due to the high computational demand of scene reconstruction and policy training, the experiments will run on GPU clusters provided by the Department and on the Polish computing infrastructure (WCSS and PLGrid). The work will be partly conducted in cooperation with other PhD students and senior researchers to increase the quality of the research. Code and data will be made publicly available whenever possible, following open science standards and respecting the licences of the datasets used.</w:t>
-      </w:r>
-    </w:p>
-    <w:p>
-      <w:pPr>
-        <w:spacing w:after="0" w:line="240" w:lineRule="auto"/>
+        <w:t xml:space="preserve">The quantitative evaluation will rely on standard metrics for embodied tasks, such as success rate and success weighted by path length (SPL), and on the sim-to-real gap, defined at two levels: on the dataset-based proxy, as the difference between the performance in the digital twin and in the reference simulation, complemented by the open-loop measures on real frames; and on the physical robot, as the difference between the closed-loop performance in simulation and in reality. The agreement between the two levels will be reported as a result, e.g., by the rank correlation of model scores. All methods will be compared with baselines under equal training effort and an equal amount of real data. Statistical methods will be leveraged to provide reliable outcomes, including repeated experiments with different random seeds and scenes, confidence intervals, and statistical tests for comparisons with baseline methods. According to accepted standards, the data used for training, model selection and final evaluation will be kept separate.</w:t>
+      </w:r>
+    </w:p>
+    <w:p>
+      <w:pPr>
+        <w:spacing w:after="120" w:line="240" w:lineRule="auto"/>
         <w:jc w:val="both"/>
       </w:pPr>
       <w:r>
@@ -5245,7 +5177,33 @@
           <w:rFonts w:cstheme="minorHAnsi"/>
           <w:lang w:val="en-US"/>
         </w:rPr>
-        <w:t xml:space="preserve">The findings will be published at leading international machine learning, computer vision and robotics conferences, such as NeurIPS, ICML, ICLR, CVPR and RSS, and in journals from the ministerial list. To promote the work and establish new collaborations, it is planned to present results at smaller conferences and workshops, such as MLinPL, and at summer schools, and to seek foreign co-authorship during the research internship.</w:t>
+        <w:t xml:space="preserve">The navigation results will be validated in one block in semesters 6-7 on a wheeled mobile robot with an RGB-D camera, in cooperation with a robotics laboratory of the university. The validation will measure closed-loop success rate and SPL in reality and provide the main evidence for differences in actuation and sensors. Should robot access be limited, the conclusions will rest on the dataset-based proxy and a reduced set of real trials.</w:t>
+      </w:r>
+    </w:p>
+    <w:p>
+      <w:pPr>
+        <w:spacing w:after="120" w:line="240" w:lineRule="auto"/>
+        <w:jc w:val="both"/>
+      </w:pPr>
+      <w:r>
+        <w:rPr>
+          <w:rFonts w:cstheme="minorHAnsi"/>
+          <w:lang w:val="en-US"/>
+        </w:rPr>
+        <w:t xml:space="preserve">Experiments will be implemented mainly in Python with the PyTorch deep learning library. Code, datasets, configurations and results will be versioned with Git and experiment tracking tools for reproducibility. Scene reconstruction and policy training will run on GPU clusters of the Department and on the Polish computing infrastructure (WCSS and PLGrid). Code and data will be made publicly available whenever possible, following open science standards and respecting the licences of the datasets used.</w:t>
+      </w:r>
+    </w:p>
+    <w:p>
+      <w:pPr>
+        <w:spacing w:after="0" w:line="240" w:lineRule="auto"/>
+        <w:jc w:val="both"/>
+      </w:pPr>
+      <w:r>
+        <w:rPr>
+          <w:rFonts w:cstheme="minorHAnsi"/>
+          <w:lang w:val="en-US"/>
+        </w:rPr>
+        <w:t xml:space="preserve">The findings will be published at leading international machine learning, computer vision and robotics conferences, such as NeurIPS, ICML, ICLR, CVPR and RSS, and in journals from the ministerial list. Results will also be presented at smaller conferences and workshops, such as MLinPL, and at summer schools.</w:t>
       </w:r>
     </w:p>
     <w:permEnd w:id="32011344"/>
@@ -5514,7 +5472,7 @@
           <w:rFonts w:cstheme="minorHAnsi"/>
           <w:lang w:val="pl-PL"/>
         </w:rPr>
-        <w:t xml:space="preserve">Sztuczna inteligencja coraz częściej wychodzi poza ekrany komputerów i trafia do systemów fizycznych, takich jak roboty poruszające się po budynkach lub przenoszące przedmioty. Modele uczenia głębokiego sterujące takimi robotami potrzebują ogromnej liczby przykładów, których zebranie w prawdziwym świecie jest powolne, kosztowne, a czasem niebezpieczne. Dlatego modele te uczy się zwykle w symulacji, a coraz częściej w cyfrowych bliźniakach, czyli wirtualnych kopiach rzeczywistych miejsc odtworzonych na podstawie ich nagrań. Taka kopia nigdy nie jest jednak idealna, a model, który dobrze działa w symulacji, w rzeczywistości często zawodzi, zwłaszcza w miejscach, których wcześniej nie widział, co pozostaje jedną z głównych przeszkód na drodze do szerszego zastosowania fizycznej sztucznej inteligencji. Celem rozprawy jest poprawa zdolności generalizacji modeli uczenia głębokiego trenowanych w symulacjach zbudowanych na podstawie danych rzeczywistych, czyli umiejętności poprawnego działania w warunkach innych niż te, w których je trenowano, a zwłaszcza w rzeczywistości. Badania w pierwszej kolejności pozwolą ustalić, które różnice między symulacją a rzeczywistością faktycznie szkodzą modelowi i na którym etapie przetwarzania w modelu przekształcają się one w błędy. Na tej podstawie zostaną opracowane metody, które nauczą model pomijać nieistotne różnice i więcej ćwiczyć tam, gdzie wirtualna kopia jest najmniej dokładna, a także metody wyboru nielicznych rzeczywistych przykładów, które najlepiej poprawiają zarówno model, jak i symulację. Metody zostaną sprawdzone w zadaniach nawigacji robotów i manipulacji robotycznej, w środowiskach, które nie były wykorzystywane podczas uczenia, a nawigacja zostanie zweryfikowana na prawdziwym robocie mobilnym. Oczekuje się, że rozprawa przyniesie lepsze zrozumienie przyczyn, dla których modele uczone w symulacji zawodzą w rzeczywistości, a także metody, dzięki którym roboty będą mogły szybciej, taniej i bezpieczniej uczyć się pracy w nowych miejscach i przy różnych zadaniach.</w:t>
+        <w:t xml:space="preserve">Sztuczna inteligencja coraz częściej wychodzi poza ekrany komputerów i trafia do systemów fizycznych, takich jak roboty poruszające się po budynkach lub przenoszące przedmioty. Modele uczenia głębokiego sterujące takimi robotami potrzebują ogromnej liczby przykładów, których zebranie w prawdziwym świecie jest powolne, kosztowne, a czasem niebezpieczne. Dlatego modele te uczy się zwykle w symulacji, a coraz częściej w cyfrowych bliźniakach, czyli wirtualnych kopiach rzeczywistych miejsc odtworzonych na podstawie ich nagrań. Taka kopia nigdy nie jest jednak idealna. Na przykład szklane drzwi lub odbicie w lustrze mogą zostać odtworzone błędnie i zmylić robota. W efekcie model, który dobrze działa w symulacji, w rzeczywistości często zawodzi, zwłaszcza w miejscach, których wcześniej nie widział. Pozostaje to jedną z głównych przeszkód na drodze do szerszego zastosowania fizycznej sztucznej inteligencji. Celem rozprawy jest poprawa zdolności generalizacji modeli uczenia głębokiego trenowanych w cyfrowych bliźniakach, czyli umiejętności poprawnego działania w warunkach innych niż te, w których je trenowano, a zwłaszcza w rzeczywistości. Badania w pierwszej kolejności pozwolą ustalić, które różnice między symulacją a rzeczywistością faktycznie szkodzą modelowi i na którym etapie przetwarzania w modelu przekształcają się one w błędy. Na tej podstawie zostaną opracowane metody, które nauczą model pomijać nieistotne różnice i więcej ćwiczyć tam, gdzie cyfrowy bliźniak jest najmniej dokładny, a także metody wyboru nielicznych rzeczywistych przykładów, które najlepiej poprawiają zarówno model, jak i cyfrowego bliźniaka. Metody zostaną sprawdzone przede wszystkim w zadaniu nawigacji robotów, w środowiskach, które nie były wykorzystywane podczas uczenia, i zweryfikowane na prawdziwym robocie mobilnym. Zostaną też przetestowane w symulowanym zadaniu manipulacji robotycznej. Oczekuje się, że rozprawa przyniesie lepsze zrozumienie przyczyn, dla których modele uczone w symulacji zawodzą w rzeczywistości, a także metody, dzięki którym roboty będą mogły szybciej, taniej i bezpieczniej uczyć się pracy w nowych miejscach i przy więcej niż jednym zadaniu.</w:t>
       </w:r>
     </w:p>
     <w:permEnd w:id="301016009"/>
@@ -5569,7 +5527,7 @@
           <w:rFonts w:cstheme="minorHAnsi"/>
           <w:lang w:val="en-US"/>
         </w:rPr>
-        <w:t xml:space="preserve">Artificial intelligence is increasingly moving beyond computer screens into physical systems, such as robots that move around buildings or carry objects. Deep learning models that control such robots need a huge number of examples, which are slow, costly and sometimes unsafe to collect in the real world. Therefore, such models are usually trained in simulation, and increasingly in digital twins, that is, virtual copies of real places rebuilt from recordings of those places. Such a copy is never perfect, however, and a model that works well in simulation often fails in reality, especially in places it has not seen before, which remains one of the main obstacles to the wider use of physical artificial intelligence. The goal of the dissertation is to improve the generalization of deep learning models trained in simulations built from real data, i.e., their ability to work correctly in conditions different from those they were trained in, and in particular in reality. The research will first establish which differences between simulation and reality actually harm the model, and at which stage of processing inside the model they turn into errors. On this basis, methods will be developed that teach the model to ignore irrelevant differences and to practise more where the virtual copy is least accurate, together with methods that choose the few real examples that best correct both the model and the simulation. The methods will be examined on robot navigation and robotic manipulation tasks, in environments that were not used during training, and navigation will be verified on a real mobile robot. The dissertation is expected to bring a better understanding of why models trained in simulation fail in reality, as well as methods that allow robots to learn to work in new places and on different tasks faster, more cheaply and more safely.</w:t>
+        <w:t xml:space="preserve">Artificial intelligence is increasingly moving beyond computer screens into physical systems, such as robots that move around buildings or carry objects. Deep learning models that control such robots need a huge number of examples, which are slow, costly and sometimes unsafe to collect in the real world. Therefore, such models are usually trained in simulation, and increasingly in digital twins, that is, virtual copies of real places rebuilt from recordings of those places. Such a copy is never perfect, however. For example, a glass door or a reflection in a mirror may be rebuilt incorrectly and mislead the robot. As a result, a model that works well in simulation often fails in reality, especially in places it has not seen before. This remains one of the main obstacles to the wider use of physical artificial intelligence. The goal of the dissertation is to improve the generalization of deep learning models trained in digital twins, i.e., their ability to work correctly in conditions different from those they were trained in, and in particular in reality. The research will first establish which differences between simulation and reality actually harm the model, and at which stage of processing inside the model they turn into errors. On this basis, methods will be developed that teach the model to ignore irrelevant differences and to practise more where the digital twin is least accurate, together with methods that choose the few real examples that best correct both the model and the digital twin. The methods will be examined mainly on robot navigation, in environments that were not used during training, and verified on a real mobile robot. They will also be tested on a simulated robotic manipulation task. The dissertation is expected to bring a better understanding of why models trained in simulation fail in reality, as well as methods that allow robots to learn to work in new places and on more than one task faster, more cheaply and more safely.</w:t>
       </w:r>
     </w:p>
     <w:permEnd w:id="305530072"/>

</xml_diff>

<commit_message>
Wave 22: navigation and manipulation as equal real-to-sim-to-real testbeds (manipulation twins from real robot-dataset images, SIMPLER paired real results)
Co-Authored-By: Claude Opus 5.5 <noreply@anthropic.com>
</commit_message>
<xml_diff>
--- a/output/IPB_Grzegorz_Piotrowski.docx
+++ b/output/IPB_Grzegorz_Piotrowski.docx
@@ -1909,7 +1909,7 @@
                 <w:rFonts w:cstheme="minorHAnsi"/>
                 <w:lang w:val="en-US"/>
               </w:rPr>
-              <w:t xml:space="preserve">2. Initial pilot experiments on reconstructing real scenes with 3D Gaussian Splatting and importing them into a navigation simulator, with regard to the gaps identified during the literature review.</w:t>
+              <w:t xml:space="preserve">2. Initial pilot experiments on reconstructing real scenes with 3D Gaussian Splatting and importing them into navigation and manipulation simulators, with regard to the gaps identified during the literature review.</w:t>
             </w:r>
           </w:p>
           <w:p>
@@ -2009,7 +2009,7 @@
                 <w:rFonts w:cstheme="minorHAnsi"/>
                 <w:lang w:val="en-US"/>
               </w:rPr>
-              <w:t xml:space="preserve">2. Preparation of the research environment for robot navigation, including real scene captures, 3D reconstruction, a navigation simulator built from the reconstructions, a dataset-based proxy measuring the reconstruction-fidelity gap, and computing resources.</w:t>
+              <w:t xml:space="preserve">2. Preparation of the research environment for robot navigation and robotic manipulation, with shared reconstruction tools: for navigation, real scene captures, digital twins in a navigation simulator and a dataset-based proxy measuring the reconstruction-fidelity gap; for manipulation, digital twins of real tabletop scenes built from images of public robot datasets and own captures, in a manipulation simulator, paired with published real-robot results of the same policies; and computing resources.</w:t>
             </w:r>
           </w:p>
           <w:p>
@@ -2022,7 +2022,7 @@
                 <w:rFonts w:cstheme="minorHAnsi"/>
                 <w:lang w:val="en-US"/>
               </w:rPr>
-              <w:t xml:space="preserve">3. Conducting research on which reconstruction errors of a digital twin, varying across a scene, determine the generalization of navigation models trained in it.</w:t>
+              <w:t xml:space="preserve">3. Conducting research on which reconstruction errors of a digital twin, varying across a scene, determine the generalization of navigation and manipulation models trained in it.</w:t>
             </w:r>
             <w:permEnd w:id="1413760106"/>
           </w:p>
@@ -2096,7 +2096,7 @@
                 <w:rFonts w:cstheme="minorHAnsi"/>
                 <w:lang w:val="en-US"/>
               </w:rPr>
-              <w:t xml:space="preserve">2. Finishing the research on the harmful reconstruction errors and on randomizing each region of a digital twin according to its reconstruction uncertainty and task relevance.</w:t>
+              <w:t xml:space="preserve">2. Finishing the research on the harmful reconstruction errors in both tasks and on randomizing each region of a digital twin according to its reconstruction uncertainty and task relevance.</w:t>
             </w:r>
           </w:p>
           <w:p>
@@ -2109,7 +2109,7 @@
                 <w:rFonts w:cstheme="minorHAnsi"/>
                 <w:lang w:val="en-US"/>
               </w:rPr>
-              <w:t xml:space="preserve">3. Writing a scientific article for a conference from the ministerial list (regarding the reconstruction errors that determine generalization), planned for submission to NeurIPS 2027 (200 points).</w:t>
+              <w:t xml:space="preserve">3. Writing a scientific article for a conference from the ministerial list (regarding the reconstruction errors that determine generalization in navigation and manipulation), planned for submission to NeurIPS 2027 (200 points).</w:t>
             </w:r>
           </w:p>
           <w:p>
@@ -2122,7 +2122,7 @@
                 <w:rFonts w:cstheme="minorHAnsi"/>
                 <w:lang w:val="en-US"/>
               </w:rPr>
-              <w:t xml:space="preserve">4. Starting the research on localizing the sim-to-real gap inside the model, with first results on the stage at which task information is lost on real inputs.</w:t>
+              <w:t xml:space="preserve">4. Starting the research on localizing the sim-to-real gap inside navigation and manipulation models, with first results on the stage at which task information is lost on real inputs.</w:t>
             </w:r>
           </w:p>
           <w:p>
@@ -2223,7 +2223,7 @@
                 <w:rFonts w:cstheme="minorHAnsi"/>
                 <w:lang w:val="en-US"/>
               </w:rPr>
-              <w:t xml:space="preserve">2. Finishing the research on localizing the sim-to-real gap inside the model and on aligning representations at that stage.</w:t>
+              <w:t xml:space="preserve">2. Finishing the research on localizing the sim-to-real gap inside the models of both tasks and on aligning representations at that stage.</w:t>
             </w:r>
           </w:p>
           <w:p>
@@ -2249,7 +2249,20 @@
                 <w:rFonts w:cstheme="minorHAnsi"/>
                 <w:lang w:val="en-US"/>
               </w:rPr>
-              <w:t xml:space="preserve">4. Carrying out research on selecting real data under a limited budget to correct both the digital twin and the model.</w:t>
+              <w:t xml:space="preserve">4. Carrying out research on selecting real data under a limited budget to correct both the digital twin and the model in both tasks.</w:t>
+            </w:r>
+          </w:p>
+          <w:p>
+            <w:pPr>
+              <w:spacing w:after="40" w:line="240" w:lineRule="auto"/>
+              <w:jc w:val="left"/>
+            </w:pPr>
+            <w:r>
+              <w:rPr>
+                <w:rFonts w:cstheme="minorHAnsi"/>
+                <w:lang w:val="en-US"/>
+              </w:rPr>
+              <w:t xml:space="preserve">5. Starting the research on predicting whether the improvements transfer to unseen environments and between navigation and manipulation.</w:t>
             </w:r>
             <w:permEnd w:id="930623221"/>
           </w:p>
@@ -2324,7 +2337,7 @@
                 <w:rFonts w:cstheme="minorHAnsi"/>
                 <w:lang w:val="en-US"/>
               </w:rPr>
-              <w:t xml:space="preserve">2. Finishing the research on the selection of real data, and research on predicting whether the improvements transfer to unseen environments, confirmed on robotic manipulation in a controlled sim-to-sim setting with hidden physical parameters.</w:t>
+              <w:t xml:space="preserve">2. Finishing the research on the selection of real data and on predicting the transfer of improvements across environments and tasks, complemented by controlled studies of physical parameters in a simulator with hidden parameters.</w:t>
             </w:r>
           </w:p>
           <w:p>
@@ -2350,7 +2363,7 @@
                 <w:rFonts w:cstheme="minorHAnsi"/>
                 <w:lang w:val="en-US"/>
               </w:rPr>
-              <w:t xml:space="preserve">4. Validation of the developed navigation methods on a real mobile robot, in cooperation with a robotics laboratory of Wrocław University of Science and Technology.</w:t>
+              <w:t xml:space="preserve">4. Validation of the developed methods on a real mobile robot and, if access allows, on a robot arm, in cooperation with a robotics laboratory of Wrocław University of Science and Technology.</w:t>
             </w:r>
           </w:p>
           <w:p>
@@ -2438,7 +2451,7 @@
                 <w:rFonts w:cstheme="minorHAnsi"/>
                 <w:lang w:val="en-US"/>
               </w:rPr>
-              <w:t xml:space="preserve">2. Finishing the validation of the developed navigation methods on a real mobile robot.</w:t>
+              <w:t xml:space="preserve">2. Finishing the validation of the developed methods on a real mobile robot and, if available, on a robot arm.</w:t>
             </w:r>
           </w:p>
           <w:p>
@@ -2451,7 +2464,7 @@
                 <w:rFonts w:cstheme="minorHAnsi"/>
                 <w:lang w:val="en-US"/>
               </w:rPr>
-              <w:t xml:space="preserve">3. Writing a journal article from the ministerial list summarizing the results on the generalization of the developed methods across environments, tasks and the real robot.</w:t>
+              <w:t xml:space="preserve">3. Writing a journal article from the ministerial list summarizing the results on the generalization of the developed methods across environments, tasks and real robots.</w:t>
             </w:r>
           </w:p>
           <w:p>
@@ -3254,7 +3267,7 @@
           <w:rFonts w:cstheme="minorHAnsi"/>
           <w:lang w:val="en-US"/>
         </w:rPr>
-        <w:t xml:space="preserve">Therefore, the dissertation aims to improve the generalization of deep learning models in real-to-sim-to-real transfer at the points of the loop where the sim-to-real gap arises. The research shall focus on understanding which reconstruction errors of a digital twin are harmful to generalization, on localizing where inside a model the gap arises and reducing it there, on choosing the small amount of real data that corrects both the digital twin and the model most efficiently, and on verifying whether the obtained improvements carry over to unseen environments and to another physical task, and which properties of the shift explain when they do. Robot navigation shall serve as the main task, and robotic manipulation, in a controlled simulated setting, as a confirmation test. Most experiments shall use public recordings of real scenes, in which a second, independent capture measures the reconstruction-fidelity gap, while a real robot shall provide the main evidence for differences in actuation and sensors. Beyond more reliable models, the research could help explain why models trained on synthetic data succeed or fail on real data, which is relevant to machine learning in general.</w:t>
+        <w:t xml:space="preserve">Therefore, the dissertation aims to improve the generalization of deep learning models in real-to-sim-to-real transfer at the points of the loop where the sim-to-real gap arises. The research shall focus on understanding which reconstruction errors of a digital twin are harmful to generalization, on localizing where inside a model the gap arises and reducing it there, on choosing the small amount of real data that corrects both the digital twin and the model most efficiently, and on verifying whether the obtained improvements carry over to unseen environments and from one physical task to another, and which properties of the shift explain when they do. The methods shall not be tied to a particular task, and robot navigation and robotic manipulation shall serve as two equal testbeds. For navigation, public recordings of real scenes, in which a second, independent capture measures the reconstruction-fidelity gap, shall be complemented by a real robot, which provides the main evidence for differences in actuation and sensors. For manipulation, digital twins of real tabletop scenes shall be built from images of public robot datasets and compared with published real-robot results of the same policies. Beyond more reliable models, the research could help explain why models trained on synthetic data succeed or fail on real data, which is relevant to machine learning in general.</w:t>
       </w:r>
     </w:p>
     <w:p>
@@ -3676,7 +3689,7 @@
           <w:rFonts w:cstheme="minorHAnsi"/>
           <w:lang w:val="en-US"/>
         </w:rPr>
-        <w:t xml:space="preserve">A recent development is building digital twins. 3D Gaussian Splatting [10] reconstructs photorealistic scenes from ordinary images, and twins have been used to train manipulation policies from a scan of the target scene [11] and navigation policies from a phone capture of a room [12]. In twins, uncertainty has so far been modelled mainly for physical parameters [13]. Which simulation factors matter has been studied mainly globally: a large real-world manipulation study compared randomization, photorealistic rendering and physics realism [14], and in robotic ultrasound, the fidelity of task-relevant feature changes predicted transfer better than single-frame realism [15]. It remains open which reconstruction errors that vary across a scene harm generalization, and how training variation should follow the reconstruction uncertainty of each region.</w:t>
+        <w:t xml:space="preserve">A recent development is building digital twins. 3D Gaussian Splatting [10] reconstructs photorealistic scenes from ordinary images. In manipulation, twins have been used to train policies from a scan of the target scene [11], to transfer image-based policies to reality without real data [12] and to guide real-world reinforcement learning from a phone capture [13]. Paired simulated and real evaluations showed that scenes visually matched to real images of two robot setups track the real-world performance of the same policies [14]. In navigation, policies have been trained in twins built from a phone capture of a room [15] and from a monocular video of urban scenes [16]. Which simulation factors matter has been studied mainly globally, e.g., randomization, photorealism and physics realism in real-world manipulation [17], or task-relevant fidelity in robotic ultrasound [18]. It remains open, in either task, which reconstruction errors that vary across a scene harm generalization, and how training variation should follow the reconstruction uncertainty of each region.</w:t>
       </w:r>
     </w:p>
     <w:p>
@@ -3689,7 +3702,7 @@
           <w:rFonts w:cstheme="minorHAnsi"/>
           <w:lang w:val="en-US"/>
         </w:rPr>
-        <w:t xml:space="preserve">It is also unclear where inside a model the gap arises. Manipulation encoders degrade under lighting and texture shifts [16]. Probing, i.e., reading out information from hidden states with simple classifiers, showed that action fine-tuning degrades the visual representations of robot policies [17], and the best layers to adapt depend on the type of shift [18]. However, the stage at which task information available in simulation stops being recoverable from real inputs has not been located in models trained in twins.</w:t>
+        <w:t xml:space="preserve">It is also unclear where inside a model the gap arises. Probing, i.e., reading out information from hidden states with simple classifiers, showed that action fine-tuning degrades the visual representations of robot policies [19], and the best layers to adapt depend on the type of shift [20]. However, the stage at which task information available in simulation stops being recoverable from real inputs has not been located in models trained in twins.</w:t>
       </w:r>
     </w:p>
     <w:p>
@@ -3702,7 +3715,7 @@
           <w:rFonts w:cstheme="minorHAnsi"/>
           <w:lang w:val="en-US"/>
         </w:rPr>
-        <w:t xml:space="preserve">The remaining gap is usually reduced with little real data. Co-training with a small real set yields large gains [19], and active system identification collects the real trajectories most informative about physics [20]. In vision, selecting images to label by domain discrepancy and uncertainty beats random selection [21]. The closest work uses a twin to find failure-prone configurations for real rollouts [22]. However, these methods correct either the model or the simulation; correcting both from the same selected data, guided by the twin's reconstruction uncertainty, has, to our knowledge, not been studied.</w:t>
+        <w:t xml:space="preserve">The remaining gap is usually reduced with little real data. Co-training with a small real set yields large gains [21], and active system identification collects the real trajectories most informative about physics [22]. The closest work uses a twin to find failure-prone configurations for real rollouts [13]. However, these methods correct either the model or the simulation; correcting both from the same selected data, guided by the twin's reconstruction uncertainty, has, to our knowledge, not been studied.</w:t>
       </w:r>
     </w:p>
     <w:p>
@@ -3715,20 +3728,7 @@
           <w:rFonts w:cstheme="minorHAnsi"/>
           <w:lang w:val="en-US"/>
         </w:rPr>
-        <w:t xml:space="preserve">Finally, the gap can be decomposed into factors of variation whose difficulty ordering is largely consistent between simulation and reality [23]. However, it is rarely tested whether measurements taken before a method is applied predict, better than simple indicators such as the size of the gap, whether its benefit carries over to a new scene or task.</w:t>
-      </w:r>
-    </w:p>
-    <w:p>
-      <w:pPr>
-        <w:spacing w:after="120" w:line="240" w:lineRule="auto"/>
-        <w:jc w:val="both"/>
-      </w:pPr>
-      <w:r>
-        <w:rPr>
-          <w:rFonts w:cstheme="minorHAnsi"/>
-          <w:lang w:val="en-US"/>
-        </w:rPr>
-        <w:t xml:space="preserve">These open problems motivate the research questions in Section 7.</w:t>
+        <w:t xml:space="preserve">Finally, the gap can be decomposed into factors of variation whose difficulty ordering is largely consistent between simulation and reality [23]. However, it is rarely tested whether measurements taken before a method is applied predict, better than simple indicators such as the size of the gap, whether its benefit carries over to a new scene or to another task.</w:t>
       </w:r>
     </w:p>
     <w:p>
@@ -3911,7 +3911,7 @@
           <w:rFonts w:cstheme="minorHAnsi"/>
           <w:lang w:val="en-US"/>
         </w:rPr>
-        <w:t xml:space="preserve">[12] Chhablani, G., et al. (2025). EmbodiedSplat: Personalized real-to-sim-to-real navigation with Gaussian splats from a mobile device. ICCV.</w:t>
+        <w:t xml:space="preserve">[12] Qureshi, M. N., et al. (2025). SplatSim: Zero-shot Sim2Real transfer of RGB manipulation policies using Gaussian splatting. ICRA.</w:t>
       </w:r>
     </w:p>
     <w:p>
@@ -3925,7 +3925,7 @@
           <w:rFonts w:cstheme="minorHAnsi"/>
           <w:lang w:val="en-US"/>
         </w:rPr>
-        <w:t xml:space="preserve">[13] Wang, M., et al. (2026). Phys2Real: Fusing VLM priors with interactive online adaptation for uncertainty-aware sim-to-real manipulation. ICRA.</w:t>
+        <w:t xml:space="preserve">[13] Xu, Q., et al. (2026). TwinRL: Digital twin-driven reinforcement learning for real-world robotic manipulation. arXiv:2602.09023.</w:t>
       </w:r>
     </w:p>
     <w:p>
@@ -3939,7 +3939,7 @@
           <w:rFonts w:cstheme="minorHAnsi"/>
           <w:lang w:val="en-US"/>
         </w:rPr>
-        <w:t xml:space="preserve">[14] Jin, R., et al. (2026). Grounding Sim-to-Real Generalization in Robotic Manipulation: An Empirical Study with Vision-Language-Action Models. arXiv:2603.22876.</w:t>
+        <w:t xml:space="preserve">[14] Li, X., et al. (2024). Evaluating real-world robot manipulation policies in simulation. CoRL.</w:t>
       </w:r>
     </w:p>
     <w:p>
@@ -3953,7 +3953,7 @@
           <w:rFonts w:cstheme="minorHAnsi"/>
           <w:lang w:val="en-US"/>
         </w:rPr>
-        <w:t xml:space="preserve">[15] Qian, Y., et al. (2026). Task-Relevant Feature-Dynamics Fidelity Enables Zero-Shot Sim-to-Real Transfer for Robotic Ultrasound Scanning. arXiv:2608.29516.</w:t>
+        <w:t xml:space="preserve">[15] Chhablani, G., et al. (2025). EmbodiedSplat: Personalized real-to-sim-to-real navigation with Gaussian splats from a mobile device. ICCV.</w:t>
       </w:r>
     </w:p>
     <w:p>
@@ -3967,7 +3967,7 @@
           <w:rFonts w:cstheme="minorHAnsi"/>
           <w:lang w:val="en-US"/>
         </w:rPr>
-        <w:t xml:space="preserve">[16] Burns, K., et al. (2024). What makes pre-trained visual representations successful for robust manipulation? CoRL.</w:t>
+        <w:t xml:space="preserve">[16] Xie, Z., et al. (2025). Vid2Sim: Realistic and interactive simulation from video for urban navigation. CVPR.</w:t>
       </w:r>
     </w:p>
     <w:p>
@@ -3981,7 +3981,7 @@
           <w:rFonts w:cstheme="minorHAnsi"/>
           <w:lang w:val="en-US"/>
         </w:rPr>
-        <w:t xml:space="preserve">[17] Kachaev, N., et al. (2026). Don't blind your VLA: Aligning visual representations for OOD generalization. AAMAS.</w:t>
+        <w:t xml:space="preserve">[17] Jin, R., et al. (2026). Grounding Sim-to-Real Generalization in Robotic Manipulation: An Empirical Study with Vision-Language-Action Models. arXiv:2603.22876.</w:t>
       </w:r>
     </w:p>
     <w:p>
@@ -3995,7 +3995,7 @@
           <w:rFonts w:cstheme="minorHAnsi"/>
           <w:lang w:val="en-US"/>
         </w:rPr>
-        <w:t xml:space="preserve">[18] Lee, Y., et al. (2023). Surgical fine-tuning improves adaptation to distribution shifts. ICLR.</w:t>
+        <w:t xml:space="preserve">[18] Qian, Y., et al. (2026). Task-Relevant Feature-Dynamics Fidelity Enables Zero-Shot Sim-to-Real Transfer for Robotic Ultrasound Scanning. arXiv:2608.29516.</w:t>
       </w:r>
     </w:p>
     <w:p>
@@ -4009,7 +4009,7 @@
           <w:rFonts w:cstheme="minorHAnsi"/>
           <w:lang w:val="en-US"/>
         </w:rPr>
-        <w:t xml:space="preserve">[19] Maddukuri, A., et al. (2025). Sim-and-real co-training: A simple recipe for vision-based robotic manipulation. RSS.</w:t>
+        <w:t xml:space="preserve">[19] Kachaev, N., et al. (2026). Don't blind your VLA: Aligning visual representations for OOD generalization. AAMAS.</w:t>
       </w:r>
     </w:p>
     <w:p>
@@ -4023,7 +4023,7 @@
           <w:rFonts w:cstheme="minorHAnsi"/>
           <w:lang w:val="en-US"/>
         </w:rPr>
-        <w:t xml:space="preserve">[20] Memmel, M., et al. (2024). ASID: Active exploration for system identification in robotic manipulation. ICLR.</w:t>
+        <w:t xml:space="preserve">[20] Lee, Y., et al. (2023). Surgical fine-tuning improves adaptation to distribution shifts. ICLR.</w:t>
       </w:r>
     </w:p>
     <w:p>
@@ -4037,7 +4037,7 @@
           <w:rFonts w:cstheme="minorHAnsi"/>
           <w:lang w:val="en-US"/>
         </w:rPr>
-        <w:t xml:space="preserve">[21] Su, J.-C., et al. (2020). Active adversarial domain adaptation. WACV.</w:t>
+        <w:t xml:space="preserve">[21] Maddukuri, A., et al. (2025). Sim-and-real co-training: A simple recipe for vision-based robotic manipulation. RSS.</w:t>
       </w:r>
     </w:p>
     <w:p>
@@ -4051,7 +4051,7 @@
           <w:rFonts w:cstheme="minorHAnsi"/>
           <w:lang w:val="en-US"/>
         </w:rPr>
-        <w:t xml:space="preserve">[22] Xu, Q., et al. (2026). TwinRL: Digital twin-driven reinforcement learning for real-world robotic manipulation. arXiv:2602.09023.</w:t>
+        <w:t xml:space="preserve">[22] Memmel, M., et al. (2024). ASID: Active exploration for system identification in robotic manipulation. ICLR.</w:t>
       </w:r>
     </w:p>
     <w:p>
@@ -4299,7 +4299,7 @@
           <w:rFonts w:cstheme="minorHAnsi"/>
           <w:lang w:val="en-US"/>
         </w:rPr>
-        <w:t xml:space="preserve">The research carried out in the proposed doctoral dissertation is aimed at studying the following research questions.</w:t>
+        <w:t xml:space="preserve">The research carried out in the proposed doctoral dissertation is aimed at studying the following research questions, each on two physical AI tasks: robot navigation and robotic manipulation.</w:t>
       </w:r>
     </w:p>
     <w:p>
@@ -4321,14 +4321,14 @@
           <w:b/>
           <w:lang w:val="en-US"/>
         </w:rPr>
-        <w:t xml:space="preserve">Which reconstruction errors of a digital twin, varying across a scene, determine how well models trained in it generalize?</w:t>
-      </w:r>
-      <w:r>
-        <w:rPr>
-          <w:rFonts w:cstheme="minorHAnsi"/>
-          <w:lang w:val="en-US"/>
-        </w:rPr>
-        <w:t xml:space="preserve"> Domain adaptation theory, used here as motivation, bounds the real-world error of a model by its error in simulation, the discrepancy between the simulated and real distributions, and a joint error term. A digital twin reproduces appearance, geometry and lighting only approximately, and its errors differ between regions of a scene. </w:t>
+        <w:t xml:space="preserve">Which reconstruction errors of a digital twin, varying across a scene, determine how well navigation and manipulation models trained in it generalize?</w:t>
+      </w:r>
+      <w:r>
+        <w:rPr>
+          <w:rFonts w:cstheme="minorHAnsi"/>
+          <w:lang w:val="en-US"/>
+        </w:rPr>
+        <w:t xml:space="preserve"> Domain adaptation theory, used here as motivation, bounds the real-world error of a model by its error in simulation, the discrepancy between the simulated and real distributions, and a joint error term. A digital twin of a room or a tabletop reproduces appearance, geometry and lighting only approximately, and its errors differ between regions of a scene. </w:t>
       </w:r>
       <w:r>
         <w:rPr>
@@ -4387,7 +4387,7 @@
           <w:rFonts w:cstheme="minorHAnsi"/>
           <w:lang w:val="en-US"/>
         </w:rPr>
-        <w:t xml:space="preserve"> There is a first stage of the model at which task information that can be decoded from simulated inputs can no longer be decoded from real ones. Aligning simulated and real representations at that stage, from a few paired views, yields better generalization than aligning them at the input, at the final features or everywhere. The research will use probing of hidden states to find this stage before intervening.</w:t>
+        <w:t xml:space="preserve"> In both tasks, there is a first stage of the model at which task information that can be decoded from simulated inputs can no longer be decoded from real ones. Aligning simulated and real representations at that stage, from a few paired views, yields better generalization than aligning them at the input, at the final features or everywhere. The research will use probing of hidden states to find this stage before intervening.</w:t>
       </w:r>
     </w:p>
     <w:p>
@@ -4431,7 +4431,7 @@
           <w:rFonts w:cstheme="minorHAnsi"/>
           <w:lang w:val="en-US"/>
         </w:rPr>
-        <w:t xml:space="preserve"> Correcting both the digital twin and the model from the same selected real data reduces the gap more than correcting either one alone. The data should be selected where the twin is predicted to disagree with reality in task-relevant ways. This disagreement can be estimated from the reconstruction uncertainty, the representation distance between simulated and real views, and the sensitivity of the predicted action. Such selection is expected to beat random and failure-driven selection. The research will compare selection rules at equal budgets, counting unlabelled real images as real data.</w:t>
+        <w:t xml:space="preserve"> Correcting both the digital twin and the model from the same selected real data reduces the gap more than correcting either one alone. The data should be selected where the twin is predicted to disagree with reality in task-relevant ways. This disagreement can be estimated from the reconstruction uncertainty, the representation distance between simulated and real views, and the sensitivity of the predicted action. Such selection is expected to beat random and failure-driven selection. The research will compare selection rules at equal budgets in both tasks, counting unlabelled real images as real data.</w:t>
       </w:r>
     </w:p>
     <w:p>
@@ -4453,14 +4453,14 @@
           <w:b/>
           <w:lang w:val="en-US"/>
         </w:rPr>
-        <w:t xml:space="preserve">Do the improvements generalize to unseen environments and to another physical task, and which properties of the shift explain when they do?</w:t>
-      </w:r>
-      <w:r>
-        <w:rPr>
-          <w:rFonts w:cstheme="minorHAnsi"/>
-          <w:lang w:val="en-US"/>
-        </w:rPr>
-        <w:t xml:space="preserve"> A valuable method should not be tied to a single scene or task. Therefore, the developed methods shall be applied with unchanged settings to many navigation scenes held out from training, and to robotic manipulation as a confirmation test in a controlled sim-to-sim setting with hidden physical parameters. </w:t>
+        <w:t xml:space="preserve">Do the improvements generalize to unseen environments and from one task to the other, and which properties of the shift explain when they do?</w:t>
+      </w:r>
+      <w:r>
+        <w:rPr>
+          <w:rFonts w:cstheme="minorHAnsi"/>
+          <w:lang w:val="en-US"/>
+        </w:rPr>
+        <w:t xml:space="preserve"> A valuable method should not be tied to a single scene or task. Therefore, the developed methods shall be applied with unchanged settings to many held-out scenes of both tasks, and an improvement found in one task shall be tested in the other. </w:t>
       </w:r>
       <w:r>
         <w:rPr>
@@ -4475,7 +4475,7 @@
           <w:rFonts w:cstheme="minorHAnsi"/>
           <w:lang w:val="en-US"/>
         </w:rPr>
-        <w:t xml:space="preserve"> The attribution of the gap from the first question and its localization from the second can be measured in a new setting before a method is applied. These measurements predict whether the improvement transfers. They predict it better than simple indicators, such as the raw size of the gap or the image-level discrepancy. The research will test this prediction across held-out scenes and confirm it on manipulation.</w:t>
+        <w:t xml:space="preserve"> The attribution of the gap from the first question and its localization from the second can be measured in a new scene or task before a method is applied. These measurements predict whether the improvement transfers, also between the tasks. They predict it better than simple indicators, such as the raw size of the gap or the image-level discrepancy. The research will test this prediction across many held-out scenes of navigation and manipulation.</w:t>
       </w:r>
     </w:p>
     <w:permEnd w:id="1295260508"/>
@@ -4755,7 +4755,7 @@
           <w:rFonts w:cstheme="minorHAnsi"/>
           <w:lang w:val="en-US"/>
         </w:rPr>
-        <w:t xml:space="preserve">The proposed PhD dissertation aims to introduce several contributions to the development of the scientific discipline. The central scientific problem addressed is explaining and reducing the sim-to-real gap caused by the distribution shift between a digital twin and reality; poor generalization of models trained in simulation remains one of the main obstacles to applying machine learning in physical AI. The central claim of the dissertation is that this gap is concentrated in a small set of task-relevant discrepancies, which can be identified among the reconstruction errors of the digital twin, localized at the stage of the model where task information is lost, and reduced by correcting both the digital twin and the model from the same small set of real data. Addressing them there is expected to yield better generalization than uniform randomization, alignment at a fixed location of the model, or real data chosen at random or at the model's failures. Research questions 1-3 test the three parts of this claim, and question 4 tests whether it holds across environments and tasks; the methods derived from it are intended to be general, i.e., not tied to a particular robot, scene or task, and will be examined mainly on robot navigation, with robotic manipulation as a controlled confirmation test.</w:t>
+        <w:t xml:space="preserve">The proposed PhD dissertation aims to introduce several contributions to the development of the scientific discipline. The central scientific problem addressed is explaining and reducing the sim-to-real gap caused by the distribution shift between a digital twin and reality; poor generalization of models trained in simulation remains one of the main obstacles to applying machine learning in physical AI. The central claim of the dissertation is that this gap is concentrated in a small set of task-relevant discrepancies, which can be identified among the reconstruction errors of the digital twin, localized at the stage of the model where task information is lost, and reduced by correcting both the digital twin and the model from the same small set of real data. Addressing them there is expected to yield better generalization than uniform randomization, alignment at a fixed location of the model, or real data chosen at random or at the model's failures. Research questions 1-3 test the three parts of this claim, and question 4 tests whether it holds across environments and tasks; the methods derived from it are intended to be general, i.e., not tied to a particular robot, scene or task, and will be examined on two equal physical AI tasks, robot navigation and robotic manipulation.</w:t>
       </w:r>
     </w:p>
     <w:p>
@@ -4768,7 +4768,7 @@
           <w:rFonts w:cstheme="minorHAnsi"/>
           <w:lang w:val="en-US"/>
         </w:rPr>
-        <w:t xml:space="preserve">Furthermore, the research is expected to deliver new methods and findings that do not exist at present: an attribution of the sim-to-real gap to reconstruction errors that vary across a scene, with a principle for randomizing each region of a digital twin according to its reconstruction uncertainty and task relevance; a method for localizing the gap as the first stage of a deep model at which task information is lost on real inputs, and for aligning representations only there; a rule for selecting real data that corrects the digital twin and the model at the same time; and an empirical account of whether properties of the shift, measured before a method is applied, predict better than simple indicators when these improvements carry over across environments and tasks. Such knowledge could complement the currently dominant randomization heuristics with more principled and interpretable approaches, and could introduce new perspectives for the design of simulations and of training procedures.</w:t>
+        <w:t xml:space="preserve">Furthermore, the research is expected to deliver new methods and findings that do not exist at present: an attribution of the sim-to-real gap to reconstruction errors that vary across a scene, with a principle for randomizing each region of a digital twin according to its reconstruction uncertainty and task relevance; a method for localizing the gap as the first stage of a deep model at which task information is lost on real inputs, and for aligning representations only there; a rule for selecting real data that corrects the digital twin and the model at the same time; and an empirical account of whether properties of the shift, measured before a method is applied, predict better than simple indicators when these improvements carry over across environments and from one task to another. Such knowledge could complement the currently dominant randomization heuristics with more principled and interpretable approaches, and could introduce new perspectives for the design of simulations and of training procedures.</w:t>
       </w:r>
     </w:p>
     <w:p>
@@ -5086,7 +5086,7 @@
           <w:rFonts w:cstheme="minorHAnsi"/>
           <w:lang w:val="en-US"/>
         </w:rPr>
-        <w:t xml:space="preserve">Digital twins will be built from real captures of indoor scenes, using structure-from-motion for camera poses and neural scene reconstruction, such as 3D Gaussian Splatting, for appearance and geometry, and then coupled with a navigation simulator, e.g., Habitat, with geometry for collisions and appearance rendered from the reconstruction. Reconstruction uncertainty will be estimated per region, e.g., from view coverage and the disagreement of an ensemble of reconstructions. Models for goal-directed indoor navigation (e.g., point-goal or image-goal) will be trained with reinforcement and imitation learning, starting from pretrained models when possible.</w:t>
+        <w:t xml:space="preserve">The methods will be task-agnostic and examined on two equal physical AI tasks, robot navigation and robotic manipulation, which share the reconstruction tools. Digital twins will be built from real images, using structure-from-motion for camera poses and neural scene reconstruction, such as 3D Gaussian Splatting, for appearance and geometry, with reconstruction uncertainty estimated per region, e.g., from view coverage and the disagreement of an ensemble of reconstructions. Twins of indoor scenes will be coupled with a navigation simulator, e.g., Habitat, to train models for goal-directed navigation (e.g., point-goal or image-goal), and twins of tabletop scenes with a manipulation simulator, e.g., ManiSkill3, to train or fine-tune models that map camera images and instructions to arm actions, with reinforcement and imitation learning from pretrained models when possible.</w:t>
       </w:r>
     </w:p>
     <w:p>
@@ -5099,7 +5099,7 @@
           <w:rFonts w:cstheme="minorHAnsi"/>
           <w:lang w:val="en-US"/>
         </w:rPr>
-        <w:t xml:space="preserve">Experiments will be conducted mainly on public datasets of real scenes, such as ScanNet++ and MuSHRoom, which contain separate captures of the same scenes made with different devices. This allows building the digital twin from one capture and using another, independent capture as a reference. Real frames of the independent capture will serve for open-loop evaluation, in which the model does not act, measuring the discrepancy between representations of paired simulated and real views, the agreement of predicted actions, and probing accuracy. A reference simulation built from the independent, higher-fidelity capture (e.g., the laser scan and DSLR images in ScanNet++) will serve for closed-loop evaluation, in which the model's actions determine what it observes next. The difference between the two simulations measures the reconstruction-fidelity gap on many scenes without a robot, but not differences in actuation and sensors.</w:t>
+        <w:t xml:space="preserve">For navigation, experiments will use public datasets of real scenes, such as ScanNet++ and MuSHRoom, which contain separate captures of the same scenes made with different devices. The twin will be built from one capture, and real frames of the other, independent capture will serve for open-loop evaluation, in which the model does not act, measuring the discrepancy between representations of paired simulated and real views, the agreement of predicted actions, and probing accuracy. A reference simulation built from the higher- fidelity capture (e.g., the laser scan and DSLR images in ScanNet++) will serve for closed-loop evaluation, in which the model's actions determine what it observes next. The difference between the two simulations measures the reconstruction-fidelity gap on many scenes, but not differences in actuation and sensors.</w:t>
       </w:r>
     </w:p>
     <w:p>
@@ -5112,7 +5112,7 @@
           <w:rFonts w:cstheme="minorHAnsi"/>
           <w:lang w:val="en-US"/>
         </w:rPr>
-        <w:t xml:space="preserve">For the first question, variants of the digital twin will be built in which one component of a region, i.e., its appearance, geometry or lighting, is replaced by its counterpart from the reference reconstruction, and the resulting change of the gap will attribute it to types of reconstruction error. The harm of each error will be related to two predictors: its magnitude in the image or geometry, and the change it induces in the representation of a fixed reference model, e.g., a pretrained visual encoder, on held-out paired views. If harm follows error magnitude, this attribution will be reported as a result, and the third question will then use only reconstruction uncertainty and action sensitivity. As a separate claim, the training distribution will be shaped by randomizing appearance (colour and opacity of Gaussians), geometry and, where the representation allows relighting, lighting per region in proportion to its reconstruction uncertainty and task relevance, the latter estimated from the sensitivity of the model's actions to the region, e.g., by occluding it. This will be compared with uniform randomization, randomization fitted to real rollouts [4] and entropy-maximizing randomization [5].</w:t>
+        <w:t xml:space="preserve">For manipulation, twins will be built from real camera frames of public robot datasets, such as BridgeData V2 and Open X-Embodiment, and from own phone captures of tabletop scenes, following the visual matching of SIMPLER [14], in which real backgrounds are combined with simulated objects whose textures are matched to real images. SIMPLER reports paired simulated and real-robot evaluations of the same policies on the Google Robot and WidowX (BridgeData V2) setups. These published real results will serve as the real reference for the gap of those policies, and real frames of the datasets for open-loop evaluation, as in navigation. Since published real results cover only released policies, models trained in this research will also be evaluated closed-loop in a simulation whose visual and physical parameters are hidden from the learner, which also allows controlled studies of physical parameters.</w:t>
       </w:r>
     </w:p>
     <w:p>
@@ -5125,7 +5125,7 @@
           <w:rFonts w:cstheme="minorHAnsi"/>
           <w:lang w:val="en-US"/>
         </w:rPr>
-        <w:t xml:space="preserve">For the second question, probes, i.e., simple classifiers, will be trained at each layer on simulated hidden states to decode task variables, such as the direction and distance to the goal or the presence of obstacles, and tested on the paired real views. The first stage at which task information decodable in simulation can no longer be decoded from real inputs will localize the gap. Unlike the separability of the two domains, which can remain high even in models that transfer well [9], this criterion refers to the task. An alignment loss (e.g., distribution-discrepancy or contrastive) will then be applied at that stage to a few paired simulated and real views at the same camera poses, and compared with alignment at the input, domain-adversarial alignment of the final features [6], alignment at all layers and full fine-tuning.</w:t>
+        <w:t xml:space="preserve">For the first question, variants of the digital twin will be built in which one component of a region, i.e., its appearance, geometry or lighting, is replaced by its counterpart from a more accurate reference (the independent capture in navigation, the real images in manipulation), and the resulting change of the gap will attribute it to types of reconstruction error. The harm of each error will be related to two predictors: its magnitude in the image or geometry, and the change it induces in the representation of a fixed reference model on held-out paired views. If harm follows error magnitude, this attribution will be reported as a result, and the third question will then use only reconstruction uncertainty and action sensitivity. As a separate claim, the training distribution will be shaped by randomizing appearance, geometry and, where possible, lighting per region in proportion to its reconstruction uncertainty and task relevance, the latter estimated from the sensitivity of the model's actions to the region, e.g., by occluding it. This will be compared with uniform randomization, randomization fitted to real rollouts [4] and entropy-maximizing randomization [5].</w:t>
       </w:r>
     </w:p>
     <w:p>
@@ -5138,7 +5138,7 @@
           <w:rFonts w:cstheme="minorHAnsi"/>
           <w:lang w:val="en-US"/>
         </w:rPr>
-        <w:t xml:space="preserve">For the third question, the budget will count all real data: unlabelled real images as well as interaction data, such as robot trials or demonstrations. On the dataset-based proxy, a unit of interaction data will be an expert or policy episode executed in the reference simulation, paired with the real frames at the visited poses; on the physical robot, a real trial or demonstration. Real data will be selected by scores combining reconstruction uncertainty, the distance between representations of simulated and real views, and the sensitivity of the predicted action. The same selected data will be used to refine the digital twin, by re-optimizing the reconstruction in uncertain regions, and to adapt the model, by fine-tuning or co-training on simulated and real data. This will be compared with random and failure-driven selection [22], with the same score without task relevance, and with correcting only the model or only the digital twin, at equal real-data budgets. Data used for final evaluation will be disjoint from those available for selection.</w:t>
+        <w:t xml:space="preserve">For the second question, probes, i.e., simple classifiers, will be trained at each layer on simulated hidden states to decode task variables, such as the direction and distance to the goal in navigation or the position of the target object in manipulation, and tested on the paired real views. The first stage at which task information decodable in simulation can no longer be decoded from real inputs will localize the gap. Unlike domain separability, which can remain high even in models that transfer well [9], this criterion refers to the task. An alignment loss (e.g., distribution-discrepancy or contrastive) will then be applied at that stage to a few paired simulated and real views, and compared with alignment at the input, domain- adversarial alignment of the final features [6], alignment at all layers and fine-tuning.</w:t>
       </w:r>
     </w:p>
     <w:p>
@@ -5151,7 +5151,7 @@
           <w:rFonts w:cstheme="minorHAnsi"/>
           <w:lang w:val="en-US"/>
         </w:rPr>
-        <w:t xml:space="preserve">For the fourth question, the methods will be applied with unchanged settings to many held-out navigation scenes. The attribution and localization measured in each scene before a method is applied will be related to the size of the improvement there, e.g., by rank correlation, and compared with simple predictors: the raw size of the gap and the image-level discrepancy between simulated and real views. The relation will then be confirmed on tabletop manipulation in a controlled sim-to-sim setting, e.g., in ManiSkill3, in which a simulation whose visual and physical parameters are hidden from the learner stands in for reality.</w:t>
+        <w:t xml:space="preserve">For the third question, the budget will count all real data: unlabelled real images as well as interaction data. A unit of interaction data will be, on the navigation proxy, an episode executed in the reference simulation, paired with the real frames at the visited poses; in manipulation, a recorded real demonstration; on a physical robot, a real trial. Real data will be selected by scores combining reconstruction uncertainty, sim-real representation distance and action sensitivity. The same data will be used to refine the digital twin, by re-optimizing the reconstruction in uncertain regions, and to adapt the model, by fine-tuning or co-training. This will be compared with random and failure-driven selection [13], with the same score without task relevance, and with correcting only the model or only the twin, at equal real-data budgets.</w:t>
       </w:r>
     </w:p>
     <w:p>
@@ -5164,7 +5164,7 @@
           <w:rFonts w:cstheme="minorHAnsi"/>
           <w:lang w:val="en-US"/>
         </w:rPr>
-        <w:t xml:space="preserve">The quantitative evaluation will rely on standard metrics for embodied tasks, such as success rate and success weighted by path length (SPL), and on the sim-to-real gap, defined at two levels: on the dataset-based proxy, as the difference between the performance in the digital twin and in the reference simulation, complemented by the open-loop measures on real frames; and on the physical robot, as the difference between the closed-loop performance in simulation and in reality. The agreement between the two levels will be reported as a result, e.g., by the rank correlation of model scores. All methods will be compared with baselines under equal training effort and an equal amount of real data. Statistical methods will be leveraged to provide reliable outcomes, including repeated experiments with different random seeds and scenes, confidence intervals, and statistical tests for comparisons with baseline methods. According to accepted standards, the data used for training, model selection and final evaluation will be kept separate.</w:t>
+        <w:t xml:space="preserve">For the fourth question, the methods will be applied with unchanged settings to many held-out scenes of both tasks, and each improvement found in one task will be applied to the other. The attribution and localization measured before a method is applied will be related to the size of the improvement, e.g., by rank correlation across the scenes of both tasks, and compared with simple predictors: the raw size of the gap and the image-level discrepancy between simulated and real views.</w:t>
       </w:r>
     </w:p>
     <w:p>
@@ -5177,7 +5177,7 @@
           <w:rFonts w:cstheme="minorHAnsi"/>
           <w:lang w:val="en-US"/>
         </w:rPr>
-        <w:t xml:space="preserve">The navigation results will be validated in one block in semesters 6-7 on a wheeled mobile robot with an RGB-D camera, in cooperation with a robotics laboratory of the university. The validation will measure closed-loop success rate and SPL in reality and provide the main evidence for differences in actuation and sensors. Should robot access be limited, the conclusions will rest on the dataset-based proxy and a reduced set of real trials.</w:t>
+        <w:t xml:space="preserve">The evaluation will use success rate, in navigation also weighted by path length (SPL), and the sim-to-real gap: on the navigation proxy, the difference between the performance in the twin and in the reference simulation; in manipulation, between the twin and the published real results of the same policies, or the hidden-parameter simulation for new models; and on a physical robot, between simulation and reality, all complemented by open-loop measures on real frames; their agreement will be reported as a result. Methods will be compared with baselines under equal training effort and real data, over repeated seeds and scenes, with confidence intervals and statistical tests. Data for training, model selection, real-data selection and final evaluation will be kept separate.</w:t>
       </w:r>
     </w:p>
     <w:p>
@@ -5190,7 +5190,7 @@
           <w:rFonts w:cstheme="minorHAnsi"/>
           <w:lang w:val="en-US"/>
         </w:rPr>
-        <w:t xml:space="preserve">Experiments will be implemented mainly in Python with the PyTorch deep learning library. Code, datasets, configurations and results will be versioned with Git and experiment tracking tools for reproducibility. Scene reconstruction and policy training will run on GPU clusters of the Department and on the Polish computing infrastructure (WCSS and PLGrid). Code and data will be made publicly available whenever possible, following open science standards and respecting the licences of the datasets used.</w:t>
+        <w:t xml:space="preserve">The results will be validated in one block in semesters 6-7 on a wheeled mobile robot with an RGB-D camera and, if access allows, on a robot arm, in cooperation with a robotics laboratory of the university. This will provide the main evidence for differences in actuation and sensors. Should robot access be limited, the conclusions will rest on the proxies, the published real results and fewer real trials.</w:t>
       </w:r>
     </w:p>
     <w:p>
@@ -5203,7 +5203,7 @@
           <w:rFonts w:cstheme="minorHAnsi"/>
           <w:lang w:val="en-US"/>
         </w:rPr>
-        <w:t xml:space="preserve">The findings will be published at leading international machine learning, computer vision and robotics conferences, such as NeurIPS, ICML, ICLR, CVPR and RSS, and in journals from the ministerial list. Results will also be presented at smaller conferences and workshops, such as MLinPL, and at summer schools.</w:t>
+        <w:t xml:space="preserve">Experiments will be implemented in Python with PyTorch, tracked with Git and experiment tracking tools, and run on GPU clusters of the Department, WCSS and PLGrid. Code and data will be released whenever the dataset licences allow. The findings will be published at conferences such as NeurIPS, ICML, ICLR, CVPR and RSS, in journals from the ministerial list, and presented at workshops such as MLinPL.</w:t>
       </w:r>
     </w:p>
     <w:permEnd w:id="32011344"/>
@@ -5472,7 +5472,7 @@
           <w:rFonts w:cstheme="minorHAnsi"/>
           <w:lang w:val="pl-PL"/>
         </w:rPr>
-        <w:t xml:space="preserve">Sztuczna inteligencja coraz częściej wychodzi poza ekrany komputerów i trafia do systemów fizycznych, takich jak roboty poruszające się po budynkach lub przenoszące przedmioty. Modele uczenia głębokiego sterujące takimi robotami potrzebują ogromnej liczby przykładów, których zebranie w prawdziwym świecie jest powolne, kosztowne, a czasem niebezpieczne. Dlatego modele te uczy się zwykle w symulacji, a coraz częściej w cyfrowych bliźniakach, czyli wirtualnych kopiach rzeczywistych miejsc odtworzonych na podstawie ich nagrań. Taka kopia nigdy nie jest jednak idealna. Na przykład szklane drzwi lub odbicie w lustrze mogą zostać odtworzone błędnie i zmylić robota. W efekcie model, który dobrze działa w symulacji, w rzeczywistości często zawodzi, zwłaszcza w miejscach, których wcześniej nie widział. Pozostaje to jedną z głównych przeszkód na drodze do szerszego zastosowania fizycznej sztucznej inteligencji. Celem rozprawy jest poprawa zdolności generalizacji modeli uczenia głębokiego trenowanych w cyfrowych bliźniakach, czyli umiejętności poprawnego działania w warunkach innych niż te, w których je trenowano, a zwłaszcza w rzeczywistości. Badania w pierwszej kolejności pozwolą ustalić, które różnice między symulacją a rzeczywistością faktycznie szkodzą modelowi i na którym etapie przetwarzania w modelu przekształcają się one w błędy. Na tej podstawie zostaną opracowane metody, które nauczą model pomijać nieistotne różnice i więcej ćwiczyć tam, gdzie cyfrowy bliźniak jest najmniej dokładny, a także metody wyboru nielicznych rzeczywistych przykładów, które najlepiej poprawiają zarówno model, jak i cyfrowego bliźniaka. Metody zostaną sprawdzone przede wszystkim w zadaniu nawigacji robotów, w środowiskach, które nie były wykorzystywane podczas uczenia, i zweryfikowane na prawdziwym robocie mobilnym. Zostaną też przetestowane w symulowanym zadaniu manipulacji robotycznej. Oczekuje się, że rozprawa przyniesie lepsze zrozumienie przyczyn, dla których modele uczone w symulacji zawodzą w rzeczywistości, a także metody, dzięki którym roboty będą mogły szybciej, taniej i bezpieczniej uczyć się pracy w nowych miejscach i przy więcej niż jednym zadaniu.</w:t>
+        <w:t xml:space="preserve">Sztuczna inteligencja coraz częściej wychodzi poza ekrany komputerów i trafia do systemów fizycznych, takich jak roboty poruszające się po budynkach lub przenoszące przedmioty. Modele uczenia głębokiego sterujące takimi robotami potrzebują ogromnej liczby przykładów, których zebranie w prawdziwym świecie jest powolne, kosztowne, a czasem niebezpieczne. Dlatego modele te uczy się zwykle w symulacji, a coraz częściej w cyfrowych bliźniakach, czyli wirtualnych kopiach rzeczywistych miejsc odtworzonych na podstawie ich nagrań. Taka kopia nigdy nie jest jednak idealna. Na przykład szklane drzwi lub odbicie w lustrze mogą zostać odtworzone błędnie i zmylić robota. W efekcie model, który dobrze działa w symulacji, w rzeczywistości często zawodzi, zwłaszcza w miejscach, których wcześniej nie widział. Pozostaje to jedną z głównych przeszkód na drodze do szerszego zastosowania fizycznej sztucznej inteligencji. Celem rozprawy jest poprawa zdolności generalizacji modeli uczenia głębokiego trenowanych w cyfrowych bliźniakach, czyli umiejętności poprawnego działania w warunkach innych niż te, w których je trenowano, a zwłaszcza w rzeczywistości. Badania w pierwszej kolejności pozwolą ustalić, które różnice między symulacją a rzeczywistością faktycznie szkodzą modelowi i na którym etapie przetwarzania w modelu przekształcają się one w błędy. Na tej podstawie zostaną opracowane metody, które nauczą model pomijać nieistotne różnice i więcej ćwiczyć tam, gdzie cyfrowy bliźniak jest najmniej dokładny, a także metody wyboru nielicznych rzeczywistych przykładów, które najlepiej poprawiają zarówno model, jak i cyfrowego bliźniaka. Metody zostaną sprawdzone w dwóch równorzędnych zadaniach, nawigacji robotów oraz manipulacji robotycznej, czyli chwytaniu i przestawianiu przedmiotów na stole, w środowiskach, które nie były wykorzystywane podczas uczenia. Wyniki uzyskane w symulacji zostaną porównane z opublikowanymi wynikami prawdziwych robotów i zweryfikowane na prawdziwym robocie mobilnym. Zbadane zostanie też, czy poprawa uzyskana w jednym zadaniu przenosi się na drugie. Oczekuje się, że rozprawa przyniesie lepsze zrozumienie przyczyn, dla których modele uczone w symulacji zawodzą w rzeczywistości, a także metody, dzięki którym roboty będą mogły szybciej, taniej i bezpieczniej uczyć się pracy w nowych miejscach i przy więcej niż jednym zadaniu.</w:t>
       </w:r>
     </w:p>
     <w:permEnd w:id="301016009"/>
@@ -5527,7 +5527,7 @@
           <w:rFonts w:cstheme="minorHAnsi"/>
           <w:lang w:val="en-US"/>
         </w:rPr>
-        <w:t xml:space="preserve">Artificial intelligence is increasingly moving beyond computer screens into physical systems, such as robots that move around buildings or carry objects. Deep learning models that control such robots need a huge number of examples, which are slow, costly and sometimes unsafe to collect in the real world. Therefore, such models are usually trained in simulation, and increasingly in digital twins, that is, virtual copies of real places rebuilt from recordings of those places. Such a copy is never perfect, however. For example, a glass door or a reflection in a mirror may be rebuilt incorrectly and mislead the robot. As a result, a model that works well in simulation often fails in reality, especially in places it has not seen before. This remains one of the main obstacles to the wider use of physical artificial intelligence. The goal of the dissertation is to improve the generalization of deep learning models trained in digital twins, i.e., their ability to work correctly in conditions different from those they were trained in, and in particular in reality. The research will first establish which differences between simulation and reality actually harm the model, and at which stage of processing inside the model they turn into errors. On this basis, methods will be developed that teach the model to ignore irrelevant differences and to practise more where the digital twin is least accurate, together with methods that choose the few real examples that best correct both the model and the digital twin. The methods will be examined mainly on robot navigation, in environments that were not used during training, and verified on a real mobile robot. They will also be tested on a simulated robotic manipulation task. The dissertation is expected to bring a better understanding of why models trained in simulation fail in reality, as well as methods that allow robots to learn to work in new places and on more than one task faster, more cheaply and more safely.</w:t>
+        <w:t xml:space="preserve">Artificial intelligence is increasingly moving beyond computer screens into physical systems, such as robots that move around buildings or carry objects. Deep learning models that control such robots need a huge number of examples, which are slow, costly and sometimes unsafe to collect in the real world. Therefore, such models are usually trained in simulation, and increasingly in digital twins, that is, virtual copies of real places rebuilt from recordings of those places. Such a copy is never perfect, however. For example, a glass door or a reflection in a mirror may be rebuilt incorrectly and mislead the robot. As a result, a model that works well in simulation often fails in reality, especially in places it has not seen before. This remains one of the main obstacles to the wider use of physical artificial intelligence. The goal of the dissertation is to improve the generalization of deep learning models trained in digital twins, i.e., their ability to work correctly in conditions different from those they were trained in, and in particular in reality. The research will first establish which differences between simulation and reality actually harm the model, and at which stage of processing inside the model they turn into errors. On this basis, methods will be developed that teach the model to ignore irrelevant differences and to practise more where the digital twin is least accurate, together with methods that choose the few real examples that best correct both the model and the digital twin. The methods will be examined on two equal tasks, robot navigation and robotic manipulation, i.e., grasping and moving objects on a table, in environments that were not used during training. The results obtained in simulation will be compared with published results of real robots and verified on a real mobile robot. It will also be checked whether an improvement obtained in one task carries over to the other. The dissertation is expected to bring a better understanding of why models trained in simulation fail in reality, as well as methods that allow robots to learn to work in new places and on more than one task faster, more cheaply and more safely.</w:t>
       </w:r>
     </w:p>
     <w:permEnd w:id="305530072"/>

</xml_diff>

<commit_message>
Wave 23: tone down promises to reference level (venues as e.g., robot/internship conditional, no extra journal, hedged §8, §9 trimmed to ~580 words); remove stale §3 table again
Co-Authored-By: Claude Opus 5.5 <noreply@anthropic.com>
</commit_message>
<xml_diff>
--- a/output/IPB_Grzegorz_Piotrowski.docx
+++ b/output/IPB_Grzegorz_Piotrowski.docx
@@ -2109,7 +2109,7 @@
                 <w:rFonts w:cstheme="minorHAnsi"/>
                 <w:lang w:val="en-US"/>
               </w:rPr>
-              <w:t xml:space="preserve">3. Writing a scientific article for a conference from the ministerial list (regarding the reconstruction errors that determine generalization in navigation and manipulation), planned for submission to NeurIPS 2027 (200 points).</w:t>
+              <w:t xml:space="preserve">3. Writing a scientific article for a conference from the ministerial list (regarding the reconstruction errors that determine generalization in navigation and manipulation), planned for submission to e.g. NeurIPS 2027.</w:t>
             </w:r>
           </w:p>
           <w:p>
@@ -2236,7 +2236,7 @@
                 <w:rFonts w:cstheme="minorHAnsi"/>
                 <w:lang w:val="en-US"/>
               </w:rPr>
-              <w:t xml:space="preserve">3. Writing a scientific article for a conference from the ministerial list (regarding the localization of the sim-to-real gap inside deep models), planned for submission to ICML 2028 or CVPR 2028 (200 points).</w:t>
+              <w:t xml:space="preserve">3. Writing a scientific article for a conference from the ministerial list (regarding the localization of the sim-to-real gap inside deep models), e.g. ICML 2028 or CVPR 2028.</w:t>
             </w:r>
           </w:p>
           <w:p>
@@ -2350,7 +2350,7 @@
                 <w:rFonts w:cstheme="minorHAnsi"/>
                 <w:lang w:val="en-US"/>
               </w:rPr>
-              <w:t xml:space="preserve">3. Writing a scientific article for a conference from the ministerial list (regarding the selection of real data under a limited budget and the prediction of transfer), planned for submission to NeurIPS 2028 (200 points).</w:t>
+              <w:t xml:space="preserve">3. Writing a scientific article for a conference from the ministerial list (regarding the selection of real data under a limited budget and the prediction of transfer), e.g. NeurIPS 2028.</w:t>
             </w:r>
           </w:p>
           <w:p>
@@ -2363,7 +2363,7 @@
                 <w:rFonts w:cstheme="minorHAnsi"/>
                 <w:lang w:val="en-US"/>
               </w:rPr>
-              <w:t xml:space="preserve">4. Validation of the developed methods on a real mobile robot and, if access allows, on a robot arm, in cooperation with a robotics laboratory of Wrocław University of Science and Technology.</w:t>
+              <w:t xml:space="preserve">4. Initial validation of the developed methods on a real robot, if access to a robotics laboratory of Wrocław University of Science and Technology allows.</w:t>
             </w:r>
           </w:p>
           <w:p>
@@ -2376,7 +2376,7 @@
                 <w:rFonts w:cstheme="minorHAnsi"/>
                 <w:lang w:val="en-US"/>
               </w:rPr>
-              <w:t xml:space="preserve">5. Research internship at a foreign research group working on robot learning and sim-to-real transfer.</w:t>
+              <w:t xml:space="preserve">5. Research internship at a foreign research group working on robot learning, if funding allows.</w:t>
             </w:r>
             <w:permEnd w:id="1544439300"/>
           </w:p>
@@ -2451,7 +2451,7 @@
                 <w:rFonts w:cstheme="minorHAnsi"/>
                 <w:lang w:val="en-US"/>
               </w:rPr>
-              <w:t xml:space="preserve">2. Finishing the validation of the developed methods on a real mobile robot and, if available, on a robot arm.</w:t>
+              <w:t xml:space="preserve">2. Finishing the experiments and, if possible, the validation on a real robot.</w:t>
             </w:r>
           </w:p>
           <w:p>
@@ -2464,7 +2464,7 @@
                 <w:rFonts w:cstheme="minorHAnsi"/>
                 <w:lang w:val="en-US"/>
               </w:rPr>
-              <w:t xml:space="preserve">3. Writing a journal article from the ministerial list summarizing the results on the generalization of the developed methods across environments, tasks and real robots.</w:t>
+              <w:t xml:space="preserve">3. Writing a scientific article for a conference or journal from the ministerial list summarizing the obtained results.</w:t>
             </w:r>
           </w:p>
           <w:p>
@@ -2551,20 +2551,7 @@
                 <w:rFonts w:cstheme="minorHAnsi"/>
                 <w:lang w:val="en-US"/>
               </w:rPr>
-              <w:t xml:space="preserve">1. Completing and submitting the journal article.</w:t>
-            </w:r>
-          </w:p>
-          <w:p>
-            <w:pPr>
-              <w:spacing w:after="40" w:line="240" w:lineRule="auto"/>
-              <w:jc w:val="left"/>
-            </w:pPr>
-            <w:r>
-              <w:rPr>
-                <w:rFonts w:cstheme="minorHAnsi"/>
-                <w:lang w:val="en-US"/>
-              </w:rPr>
-              <w:t xml:space="preserve">2. Editing the doctoral dissertation, preparation of the final version of the document.</w:t>
+              <w:t xml:space="preserve">Editing the doctoral dissertation, preparation of the final version of the document.</w:t>
             </w:r>
             <w:permEnd w:id="490215942"/>
           </w:p>
@@ -4755,7 +4742,7 @@
           <w:rFonts w:cstheme="minorHAnsi"/>
           <w:lang w:val="en-US"/>
         </w:rPr>
-        <w:t xml:space="preserve">The proposed PhD dissertation aims to introduce several contributions to the development of the scientific discipline. The central scientific problem addressed is explaining and reducing the sim-to-real gap caused by the distribution shift between a digital twin and reality; poor generalization of models trained in simulation remains one of the main obstacles to applying machine learning in physical AI. The central claim of the dissertation is that this gap is concentrated in a small set of task-relevant discrepancies, which can be identified among the reconstruction errors of the digital twin, localized at the stage of the model where task information is lost, and reduced by correcting both the digital twin and the model from the same small set of real data. Addressing them there is expected to yield better generalization than uniform randomization, alignment at a fixed location of the model, or real data chosen at random or at the model's failures. Research questions 1-3 test the three parts of this claim, and question 4 tests whether it holds across environments and tasks; the methods derived from it are intended to be general, i.e., not tied to a particular robot, scene or task, and will be examined on two equal physical AI tasks, robot navigation and robotic manipulation.</w:t>
+        <w:t xml:space="preserve">The proposed PhD dissertation aims to contribute to the development of the scientific discipline by addressing the generalization of deep learning models trained in simulations built from real data, which remains one of the main obstacles to applying machine learning in physical AI. The working assumption of the dissertation is that the sim-to-real gap is caused mainly by a limited set of task-relevant discrepancies, which may be identified among the reconstruction errors of a digital twin, localized inside the model, and reduced with a small amount of well-chosen real data. The methods are intended to be general, i.e., not tied to a particular robot, scene or task, and are planned to be examined on robot navigation and robotic manipulation.</w:t>
       </w:r>
     </w:p>
     <w:p>
@@ -4768,12 +4755,12 @@
           <w:rFonts w:cstheme="minorHAnsi"/>
           <w:lang w:val="en-US"/>
         </w:rPr>
-        <w:t xml:space="preserve">Furthermore, the research is expected to deliver new methods and findings that do not exist at present: an attribution of the sim-to-real gap to reconstruction errors that vary across a scene, with a principle for randomizing each region of a digital twin according to its reconstruction uncertainty and task relevance; a method for localizing the gap as the first stage of a deep model at which task information is lost on real inputs, and for aligning representations only there; a rule for selecting real data that corrects the digital twin and the model at the same time; and an empirical account of whether properties of the shift, measured before a method is applied, predict better than simple indicators when these improvements carry over across environments and from one task to another. Such knowledge could complement the currently dominant randomization heuristics with more principled and interpretable approaches, and could introduce new perspectives for the design of simulations and of training procedures.</w:t>
-      </w:r>
-    </w:p>
-    <w:p>
-      <w:pPr>
-        <w:spacing w:after="120" w:line="240" w:lineRule="auto"/>
+        <w:t xml:space="preserve">First, the research is intended to provide a better understanding of which reconstruction errors of a digital twin harm generalization, and a method for varying the twin accordingly instead of uniformly. Second, it aims to develop a way of finding where inside a deep model the sim-to-real gap arises and of reducing it at that stage. Third, it aims to propose a rule for selecting a small amount of real data that corrects both the digital twin and the model. Finally, it will examine when such improvements carry over to unseen environments and between tasks. Such knowledge could complement the currently dominant randomization heuristics with more principled and interpretable approaches.</w:t>
+      </w:r>
+    </w:p>
+    <w:p>
+      <w:pPr>
+        <w:spacing w:after="0" w:line="240" w:lineRule="auto"/>
         <w:jc w:val="both"/>
       </w:pPr>
       <w:r>
@@ -4781,20 +4768,7 @@
           <w:rFonts w:cstheme="minorHAnsi"/>
           <w:lang w:val="en-US"/>
         </w:rPr>
-        <w:t xml:space="preserve">Since transfer from simulation to reality is an instance of learning under distribution shift, the findings are also expected to be relevant to machine learning in general. The analysis of which errors in the training distribution are harmful concerns domain adaptation; the localization of the sim-to-real gap inside a model extends probing methods developed for language and vision models and contributes to representation learning; and the selection of informative data under a budget concerns active learning and the adaptation of pretrained foundation models to new domains from a few examples.</w:t>
-      </w:r>
-    </w:p>
-    <w:p>
-      <w:pPr>
-        <w:spacing w:after="0" w:line="240" w:lineRule="auto"/>
-        <w:jc w:val="both"/>
-      </w:pPr>
-      <w:r>
-        <w:rPr>
-          <w:rFonts w:cstheme="minorHAnsi"/>
-          <w:lang w:val="en-US"/>
-        </w:rPr>
-        <w:t xml:space="preserve">Finally, the developed methods could reduce the amount of real data, and thus the cost, needed to deploy learning-based robots in new environments. The source code and the experimental setups are planned to be released, which could facilitate further research in the field and attract other researchers. Apart from purely scientific results, the methods could be used in real-world applications such as service, logistics and inspection robotics, as well as in other domains where models are trained in simulation, e.g., autonomous driving.</w:t>
+        <w:t xml:space="preserve">Since transfer from simulation to reality is an instance of learning under distribution shift, the findings may also be relevant to machine learning in general, in particular to domain adaptation, representation learning and active learning. Apart from purely scientific results, the methods could reduce the cost of deploying learning-based robots in new environments, e.g., in service, logistics and inspection robotics. The source code is planned to be released, which could facilitate further research in the field.</w:t>
       </w:r>
     </w:p>
     <w:permEnd w:id="1098318749"/>
@@ -5073,7 +5047,7 @@
           <w:rFonts w:cstheme="minorHAnsi"/>
           <w:lang w:val="en-US"/>
         </w:rPr>
-        <w:t xml:space="preserve">The research will follow the methods commonly adopted in machine learning and robot learning projects. Since no established theory guarantees generalization from simulation to reality, the research will be mainly empirical. Domain adaptation theory, which relates the error of a model in reality to its error in simulation, the discrepancy between the two distributions and a joint error term, will serve as motivation, and the properties of the proposed methods will be analysed theoretically whenever possible. Numbers in brackets refer to the references listed in Section 6.</w:t>
+        <w:t xml:space="preserve">The research will follow the methods commonly adopted in machine learning and robot learning projects. Since no established theory guarantees generalization from simulation to reality, the dominant part of the work will be empirical. Domain adaptation theory, which relates the error of a model in reality to its error in simulation and to the discrepancy between the two, will serve as motivation, and the properties of the proposed methods will be analysed theoretically whenever possible.</w:t>
       </w:r>
     </w:p>
     <w:p>
@@ -5086,7 +5060,7 @@
           <w:rFonts w:cstheme="minorHAnsi"/>
           <w:lang w:val="en-US"/>
         </w:rPr>
-        <w:t xml:space="preserve">The methods will be task-agnostic and examined on two equal physical AI tasks, robot navigation and robotic manipulation, which share the reconstruction tools. Digital twins will be built from real images, using structure-from-motion for camera poses and neural scene reconstruction, such as 3D Gaussian Splatting, for appearance and geometry, with reconstruction uncertainty estimated per region, e.g., from view coverage and the disagreement of an ensemble of reconstructions. Twins of indoor scenes will be coupled with a navigation simulator, e.g., Habitat, to train models for goal-directed navigation (e.g., point-goal or image-goal), and twins of tabletop scenes with a manipulation simulator, e.g., ManiSkill3, to train or fine-tune models that map camera images and instructions to arm actions, with reinforcement and imitation learning from pretrained models when possible.</w:t>
+        <w:t xml:space="preserve">The methods will be examined on two physical AI tasks, robot navigation and robotic manipulation, which share the reconstruction tools. Digital twins will be built from real images with neural scene reconstruction, e.g., 3D Gaussian Splatting, and coupled with simulators for navigation (e.g., Habitat) and manipulation (e.g., ManiSkill3), in which models mapping camera images to actions will be trained or fine-tuned, where possible starting from pretrained models.</w:t>
       </w:r>
     </w:p>
     <w:p>
@@ -5099,7 +5073,7 @@
           <w:rFonts w:cstheme="minorHAnsi"/>
           <w:lang w:val="en-US"/>
         </w:rPr>
-        <w:t xml:space="preserve">For navigation, experiments will use public datasets of real scenes, such as ScanNet++ and MuSHRoom, which contain separate captures of the same scenes made with different devices. The twin will be built from one capture, and real frames of the other, independent capture will serve for open-loop evaluation, in which the model does not act, measuring the discrepancy between representations of paired simulated and real views, the agreement of predicted actions, and probing accuracy. A reference simulation built from the higher- fidelity capture (e.g., the laser scan and DSLR images in ScanNet++) will serve for closed-loop evaluation, in which the model's actions determine what it observes next. The difference between the two simulations measures the reconstruction-fidelity gap on many scenes, but not differences in actuation and sensors.</w:t>
+        <w:t xml:space="preserve">Since the research does not rely on an own robot, the evaluation will use public data. For navigation, public datasets of real indoor scenes with independent captures of the same scenes (e.g., ScanNet++) will be used: the twin will be built from one capture, and the other will provide real frames and a dataset-based reference simulation. This reference measures the gap caused by reconstruction fidelity, not differences in actuation and sensors. For manipulation, twins of real tabletop scenes will be built from images of public robot datasets, following the visual matching of SIMPLER [14], and compared with published real-robot results of the same policies; new models will additionally be evaluated in simulations whose parameters are hidden from the learner.</w:t>
       </w:r>
     </w:p>
     <w:p>
@@ -5112,7 +5086,7 @@
           <w:rFonts w:cstheme="minorHAnsi"/>
           <w:lang w:val="en-US"/>
         </w:rPr>
-        <w:t xml:space="preserve">For manipulation, twins will be built from real camera frames of public robot datasets, such as BridgeData V2 and Open X-Embodiment, and from own phone captures of tabletop scenes, following the visual matching of SIMPLER [14], in which real backgrounds are combined with simulated objects whose textures are matched to real images. SIMPLER reports paired simulated and real-robot evaluations of the same policies on the Google Robot and WidowX (BridgeData V2) setups. These published real results will serve as the real reference for the gap of those policies, and real frames of the datasets for open-loop evaluation, as in navigation. Since published real results cover only released policies, models trained in this research will also be evaluated closed-loop in a simulation whose visual and physical parameters are hidden from the learner, which also allows controlled studies of physical parameters.</w:t>
+        <w:t xml:space="preserve">For the first research question, variants of the twin in which one type of reconstruction error is corrected will be examined to attribute the gap to types of error, and randomization guided by reconstruction uncertainty and task relevance will be studied. For the second question, simple probes on the hidden states of models will be used to examine at which stage task information decodable in simulation is lost on real inputs, and alignment at that stage will be compared with alternatives. For the third question, ways of selecting a small amount of real data used to correct both the twin and the model will be examined. For the fourth question, the methods will be applied to held-out scenes of both tasks, and it will be examined whether the measured attribution and localization predict the improvement better than simple predictors.</w:t>
       </w:r>
     </w:p>
     <w:p>
@@ -5125,12 +5099,12 @@
           <w:rFonts w:cstheme="minorHAnsi"/>
           <w:lang w:val="en-US"/>
         </w:rPr>
-        <w:t xml:space="preserve">For the first question, variants of the digital twin will be built in which one component of a region, i.e., its appearance, geometry or lighting, is replaced by its counterpart from a more accurate reference (the independent capture in navigation, the real images in manipulation), and the resulting change of the gap will attribute it to types of reconstruction error. The harm of each error will be related to two predictors: its magnitude in the image or geometry, and the change it induces in the representation of a fixed reference model on held-out paired views. If harm follows error magnitude, this attribution will be reported as a result, and the third question will then use only reconstruction uncertainty and action sensitivity. As a separate claim, the training distribution will be shaped by randomizing appearance, geometry and, where possible, lighting per region in proportion to its reconstruction uncertainty and task relevance, the latter estimated from the sensitivity of the model's actions to the region, e.g., by occluding it. This will be compared with uniform randomization, randomization fitted to real rollouts [4] and entropy-maximizing randomization [5].</w:t>
-      </w:r>
-    </w:p>
-    <w:p>
-      <w:pPr>
-        <w:spacing w:after="120" w:line="240" w:lineRule="auto"/>
+        <w:t xml:space="preserve">The evaluation will rely on standard metrics, such as success rate, and on the sim-to-real gap, measured on held-out scenes in both tasks and complemented where possible by open-loop measures on real frames. Methods will be compared with relevant baselines under comparable training effort and real data. Statistical methods will be used to provide reliable outcomes, including repeated runs over seeds and scenes and statistical tests for comparisons, and ablation studies will determine the contribution of individual components. Data for training, model selection and final evaluation will be kept separate. If access allows, selected results will be validated on a real robot in cooperation with a robotics laboratory of the university.</w:t>
+      </w:r>
+    </w:p>
+    <w:p>
+      <w:pPr>
+        <w:spacing w:after="0" w:line="240" w:lineRule="auto"/>
         <w:jc w:val="both"/>
       </w:pPr>
       <w:r>
@@ -5138,72 +5112,7 @@
           <w:rFonts w:cstheme="minorHAnsi"/>
           <w:lang w:val="en-US"/>
         </w:rPr>
-        <w:t xml:space="preserve">For the second question, probes, i.e., simple classifiers, will be trained at each layer on simulated hidden states to decode task variables, such as the direction and distance to the goal in navigation or the position of the target object in manipulation, and tested on the paired real views. The first stage at which task information decodable in simulation can no longer be decoded from real inputs will localize the gap. Unlike domain separability, which can remain high even in models that transfer well [9], this criterion refers to the task. An alignment loss (e.g., distribution-discrepancy or contrastive) will then be applied at that stage to a few paired simulated and real views, and compared with alignment at the input, domain- adversarial alignment of the final features [6], alignment at all layers and fine-tuning.</w:t>
-      </w:r>
-    </w:p>
-    <w:p>
-      <w:pPr>
-        <w:spacing w:after="120" w:line="240" w:lineRule="auto"/>
-        <w:jc w:val="both"/>
-      </w:pPr>
-      <w:r>
-        <w:rPr>
-          <w:rFonts w:cstheme="minorHAnsi"/>
-          <w:lang w:val="en-US"/>
-        </w:rPr>
-        <w:t xml:space="preserve">For the third question, the budget will count all real data: unlabelled real images as well as interaction data. A unit of interaction data will be, on the navigation proxy, an episode executed in the reference simulation, paired with the real frames at the visited poses; in manipulation, a recorded real demonstration; on a physical robot, a real trial. Real data will be selected by scores combining reconstruction uncertainty, sim-real representation distance and action sensitivity. The same data will be used to refine the digital twin, by re-optimizing the reconstruction in uncertain regions, and to adapt the model, by fine-tuning or co-training. This will be compared with random and failure-driven selection [13], with the same score without task relevance, and with correcting only the model or only the twin, at equal real-data budgets.</w:t>
-      </w:r>
-    </w:p>
-    <w:p>
-      <w:pPr>
-        <w:spacing w:after="120" w:line="240" w:lineRule="auto"/>
-        <w:jc w:val="both"/>
-      </w:pPr>
-      <w:r>
-        <w:rPr>
-          <w:rFonts w:cstheme="minorHAnsi"/>
-          <w:lang w:val="en-US"/>
-        </w:rPr>
-        <w:t xml:space="preserve">For the fourth question, the methods will be applied with unchanged settings to many held-out scenes of both tasks, and each improvement found in one task will be applied to the other. The attribution and localization measured before a method is applied will be related to the size of the improvement, e.g., by rank correlation across the scenes of both tasks, and compared with simple predictors: the raw size of the gap and the image-level discrepancy between simulated and real views.</w:t>
-      </w:r>
-    </w:p>
-    <w:p>
-      <w:pPr>
-        <w:spacing w:after="120" w:line="240" w:lineRule="auto"/>
-        <w:jc w:val="both"/>
-      </w:pPr>
-      <w:r>
-        <w:rPr>
-          <w:rFonts w:cstheme="minorHAnsi"/>
-          <w:lang w:val="en-US"/>
-        </w:rPr>
-        <w:t xml:space="preserve">The evaluation will use success rate, in navigation also weighted by path length (SPL), and the sim-to-real gap: on the navigation proxy, the difference between the performance in the twin and in the reference simulation; in manipulation, between the twin and the published real results of the same policies, or the hidden-parameter simulation for new models; and on a physical robot, between simulation and reality, all complemented by open-loop measures on real frames; their agreement will be reported as a result. Methods will be compared with baselines under equal training effort and real data, over repeated seeds and scenes, with confidence intervals and statistical tests. Data for training, model selection, real-data selection and final evaluation will be kept separate.</w:t>
-      </w:r>
-    </w:p>
-    <w:p>
-      <w:pPr>
-        <w:spacing w:after="120" w:line="240" w:lineRule="auto"/>
-        <w:jc w:val="both"/>
-      </w:pPr>
-      <w:r>
-        <w:rPr>
-          <w:rFonts w:cstheme="minorHAnsi"/>
-          <w:lang w:val="en-US"/>
-        </w:rPr>
-        <w:t xml:space="preserve">The results will be validated in one block in semesters 6-7 on a wheeled mobile robot with an RGB-D camera and, if access allows, on a robot arm, in cooperation with a robotics laboratory of the university. This will provide the main evidence for differences in actuation and sensors. Should robot access be limited, the conclusions will rest on the proxies, the published real results and fewer real trials.</w:t>
-      </w:r>
-    </w:p>
-    <w:p>
-      <w:pPr>
-        <w:spacing w:after="0" w:line="240" w:lineRule="auto"/>
-        <w:jc w:val="both"/>
-      </w:pPr>
-      <w:r>
-        <w:rPr>
-          <w:rFonts w:cstheme="minorHAnsi"/>
-          <w:lang w:val="en-US"/>
-        </w:rPr>
-        <w:t xml:space="preserve">Experiments will be implemented in Python with PyTorch, tracked with Git and experiment tracking tools, and run on GPU clusters of the Department, WCSS and PLGrid. Code and data will be released whenever the dataset licences allow. The findings will be published at conferences such as NeurIPS, ICML, ICLR, CVPR and RSS, in journals from the ministerial list, and presented at workshops such as MLinPL.</w:t>
+        <w:t xml:space="preserve">Experiments will be implemented mainly in Python with PyTorch, with source code managed in Git, and run on GPU clusters of the Department, WCSS and PLGrid. Code and data will be released whenever licences allow, following open science standards. The findings will be published at leading conferences from the ministerial list, such as NeurIPS, ICML, ICLR, CVPR and RSS, and presented at smaller venues such as MLinPL.</w:t>
       </w:r>
     </w:p>
     <w:permEnd w:id="32011344"/>

</xml_diff>

<commit_message>
§10: robot validation conditional (PL/EN), consistent with §3/§9
Co-Authored-By: Claude Opus 5.5 <noreply@anthropic.com>
</commit_message>
<xml_diff>
--- a/output/IPB_Grzegorz_Piotrowski.docx
+++ b/output/IPB_Grzegorz_Piotrowski.docx
@@ -5381,7 +5381,7 @@
           <w:rFonts w:cstheme="minorHAnsi"/>
           <w:lang w:val="pl-PL"/>
         </w:rPr>
-        <w:t xml:space="preserve">Sztuczna inteligencja coraz częściej wychodzi poza ekrany komputerów i trafia do systemów fizycznych, takich jak roboty poruszające się po budynkach lub przenoszące przedmioty. Modele uczenia głębokiego sterujące takimi robotami potrzebują ogromnej liczby przykładów, których zebranie w prawdziwym świecie jest powolne, kosztowne, a czasem niebezpieczne. Dlatego modele te uczy się zwykle w symulacji, a coraz częściej w cyfrowych bliźniakach, czyli wirtualnych kopiach rzeczywistych miejsc odtworzonych na podstawie ich nagrań. Taka kopia nigdy nie jest jednak idealna. Na przykład szklane drzwi lub odbicie w lustrze mogą zostać odtworzone błędnie i zmylić robota. W efekcie model, który dobrze działa w symulacji, w rzeczywistości często zawodzi, zwłaszcza w miejscach, których wcześniej nie widział. Pozostaje to jedną z głównych przeszkód na drodze do szerszego zastosowania fizycznej sztucznej inteligencji. Celem rozprawy jest poprawa zdolności generalizacji modeli uczenia głębokiego trenowanych w cyfrowych bliźniakach, czyli umiejętności poprawnego działania w warunkach innych niż te, w których je trenowano, a zwłaszcza w rzeczywistości. Badania w pierwszej kolejności pozwolą ustalić, które różnice między symulacją a rzeczywistością faktycznie szkodzą modelowi i na którym etapie przetwarzania w modelu przekształcają się one w błędy. Na tej podstawie zostaną opracowane metody, które nauczą model pomijać nieistotne różnice i więcej ćwiczyć tam, gdzie cyfrowy bliźniak jest najmniej dokładny, a także metody wyboru nielicznych rzeczywistych przykładów, które najlepiej poprawiają zarówno model, jak i cyfrowego bliźniaka. Metody zostaną sprawdzone w dwóch równorzędnych zadaniach, nawigacji robotów oraz manipulacji robotycznej, czyli chwytaniu i przestawianiu przedmiotów na stole, w środowiskach, które nie były wykorzystywane podczas uczenia. Wyniki uzyskane w symulacji zostaną porównane z opublikowanymi wynikami prawdziwych robotów i zweryfikowane na prawdziwym robocie mobilnym. Zbadane zostanie też, czy poprawa uzyskana w jednym zadaniu przenosi się na drugie. Oczekuje się, że rozprawa przyniesie lepsze zrozumienie przyczyn, dla których modele uczone w symulacji zawodzą w rzeczywistości, a także metody, dzięki którym roboty będą mogły szybciej, taniej i bezpieczniej uczyć się pracy w nowych miejscach i przy więcej niż jednym zadaniu.</w:t>
+        <w:t xml:space="preserve">Sztuczna inteligencja coraz częściej wychodzi poza ekrany komputerów i trafia do systemów fizycznych, takich jak roboty poruszające się po budynkach lub przenoszące przedmioty. Modele uczenia głębokiego sterujące takimi robotami potrzebują ogromnej liczby przykładów, których zebranie w prawdziwym świecie jest powolne, kosztowne, a czasem niebezpieczne. Dlatego modele te uczy się zwykle w symulacji, a coraz częściej w cyfrowych bliźniakach, czyli wirtualnych kopiach rzeczywistych miejsc odtworzonych na podstawie ich nagrań. Taka kopia nigdy nie jest jednak idealna. Na przykład szklane drzwi lub odbicie w lustrze mogą zostać odtworzone błędnie i zmylić robota. W efekcie model, który dobrze działa w symulacji, w rzeczywistości często zawodzi, zwłaszcza w miejscach, których wcześniej nie widział. Pozostaje to jedną z głównych przeszkód na drodze do szerszego zastosowania fizycznej sztucznej inteligencji. Celem rozprawy jest poprawa zdolności generalizacji modeli uczenia głębokiego trenowanych w cyfrowych bliźniakach, czyli umiejętności poprawnego działania w warunkach innych niż te, w których je trenowano, a zwłaszcza w rzeczywistości. Badania w pierwszej kolejności pozwolą ustalić, które różnice między symulacją a rzeczywistością faktycznie szkodzą modelowi i na którym etapie przetwarzania w modelu przekształcają się one w błędy. Na tej podstawie zostaną opracowane metody, które nauczą model pomijać nieistotne różnice i więcej ćwiczyć tam, gdzie cyfrowy bliźniak jest najmniej dokładny, a także metody wyboru nielicznych rzeczywistych przykładów, które najlepiej poprawiają zarówno model, jak i cyfrowego bliźniaka. Metody zostaną sprawdzone w dwóch równorzędnych zadaniach, nawigacji robotów oraz manipulacji robotycznej, czyli chwytaniu i przestawianiu przedmiotów na stole, w środowiskach, które nie były wykorzystywane podczas uczenia. Wyniki uzyskane w symulacji zostaną porównane z opublikowanymi wynikami prawdziwych robotów, a jeśli będzie to możliwe, sprawdzone również na prawdziwym robocie. Zbadane zostanie też, czy poprawa uzyskana w jednym zadaniu przenosi się na drugie. Oczekuje się, że rozprawa przyniesie lepsze zrozumienie przyczyn, dla których modele uczone w symulacji zawodzą w rzeczywistości, a także metody, dzięki którym roboty będą mogły szybciej, taniej i bezpieczniej uczyć się pracy w nowych miejscach i przy więcej niż jednym zadaniu.</w:t>
       </w:r>
     </w:p>
     <w:permEnd w:id="301016009"/>
@@ -5436,7 +5436,7 @@
           <w:rFonts w:cstheme="minorHAnsi"/>
           <w:lang w:val="en-US"/>
         </w:rPr>
-        <w:t xml:space="preserve">Artificial intelligence is increasingly moving beyond computer screens into physical systems, such as robots that move around buildings or carry objects. Deep learning models that control such robots need a huge number of examples, which are slow, costly and sometimes unsafe to collect in the real world. Therefore, such models are usually trained in simulation, and increasingly in digital twins, that is, virtual copies of real places rebuilt from recordings of those places. Such a copy is never perfect, however. For example, a glass door or a reflection in a mirror may be rebuilt incorrectly and mislead the robot. As a result, a model that works well in simulation often fails in reality, especially in places it has not seen before. This remains one of the main obstacles to the wider use of physical artificial intelligence. The goal of the dissertation is to improve the generalization of deep learning models trained in digital twins, i.e., their ability to work correctly in conditions different from those they were trained in, and in particular in reality. The research will first establish which differences between simulation and reality actually harm the model, and at which stage of processing inside the model they turn into errors. On this basis, methods will be developed that teach the model to ignore irrelevant differences and to practise more where the digital twin is least accurate, together with methods that choose the few real examples that best correct both the model and the digital twin. The methods will be examined on two equal tasks, robot navigation and robotic manipulation, i.e., grasping and moving objects on a table, in environments that were not used during training. The results obtained in simulation will be compared with published results of real robots and verified on a real mobile robot. It will also be checked whether an improvement obtained in one task carries over to the other. The dissertation is expected to bring a better understanding of why models trained in simulation fail in reality, as well as methods that allow robots to learn to work in new places and on more than one task faster, more cheaply and more safely.</w:t>
+        <w:t xml:space="preserve">Artificial intelligence is increasingly moving beyond computer screens into physical systems, such as robots that move around buildings or carry objects. Deep learning models that control such robots need a huge number of examples, which are slow, costly and sometimes unsafe to collect in the real world. Therefore, such models are usually trained in simulation, and increasingly in digital twins, that is, virtual copies of real places rebuilt from recordings of those places. Such a copy is never perfect, however. For example, a glass door or a reflection in a mirror may be rebuilt incorrectly and mislead the robot. As a result, a model that works well in simulation often fails in reality, especially in places it has not seen before. This remains one of the main obstacles to the wider use of physical artificial intelligence. The goal of the dissertation is to improve the generalization of deep learning models trained in digital twins, i.e., their ability to work correctly in conditions different from those they were trained in, and in particular in reality. The research will first establish which differences between simulation and reality actually harm the model, and at which stage of processing inside the model they turn into errors. On this basis, methods will be developed that teach the model to ignore irrelevant differences and to practise more where the digital twin is least accurate, together with methods that choose the few real examples that best correct both the model and the digital twin. The methods will be examined on two equal tasks, robot navigation and robotic manipulation, i.e., grasping and moving objects on a table, in environments that were not used during training. The results obtained in simulation will be compared with published results of real robots and, where possible, also checked on a real robot. It will also be checked whether an improvement obtained in one task carries over to the other. The dissertation is expected to bring a better understanding of why models trained in simulation fail in reality, as well as methods that allow robots to learn to work in new places and on more than one task faster, more cheaply and more safely.</w:t>
       </w:r>
     </w:p>
     <w:permEnd w:id="305530072"/>

</xml_diff>

<commit_message>
Wave 24: humanize prose (§3, §5–§10) with the humanizer skill (blader/humanizer, MIT) using accepted K46 IPBs as voice sample; remove stale §3 table hidden after comments
Co-Authored-By: Claude Opus 5.5 <noreply@anthropic.com>
</commit_message>
<xml_diff>
--- a/output/IPB_Grzegorz_Piotrowski.docx
+++ b/output/IPB_Grzegorz_Piotrowski.docx
@@ -1796,7 +1796,7 @@
                 <w:rFonts w:cstheme="minorHAnsi"/>
                 <w:lang w:val="en-US"/>
               </w:rPr>
-              <w:t xml:space="preserve">1. Literature review in the scope of sim-to-real transfer, domain randomization and domain adaptation, neural scene reconstruction from real data (such as 3D Gaussian Splatting) and deep learning for robot navigation and manipulation.</w:t>
+              <w:t xml:space="preserve">1. Literature review covering sim-to-real transfer, domain randomization and domain adaptation, neural scene reconstruction from real data (such as 3D Gaussian Splatting) and deep learning for robot navigation and manipulation.</w:t>
             </w:r>
           </w:p>
           <w:p>
@@ -1822,7 +1822,7 @@
                 <w:rFonts w:cstheme="minorHAnsi"/>
                 <w:lang w:val="en-US"/>
               </w:rPr>
-              <w:t xml:space="preserve">3. Extending theoretical knowledge, including machine learning theory and learning under distribution shift, necessary for further work on the PhD thesis.</w:t>
+              <w:t xml:space="preserve">3. Extending theoretical knowledge needed for further work on the PhD thesis, including machine learning theory and learning under distribution shift.</w:t>
             </w:r>
           </w:p>
           <w:p>
@@ -1896,7 +1896,7 @@
                 <w:rFonts w:cstheme="minorHAnsi"/>
                 <w:lang w:val="en-US"/>
               </w:rPr>
-              <w:t xml:space="preserve">1. Continuation of the literature review - participation in the internal reading group, discussing novel methods regarding sim-to-real transfer and physical AI.</w:t>
+              <w:t xml:space="preserve">1. Continuation of the literature review, including participation in the internal reading group that discusses new methods of sim-to-real transfer and physical AI.</w:t>
             </w:r>
           </w:p>
           <w:p>
@@ -1909,7 +1909,7 @@
                 <w:rFonts w:cstheme="minorHAnsi"/>
                 <w:lang w:val="en-US"/>
               </w:rPr>
-              <w:t xml:space="preserve">2. Initial pilot experiments on reconstructing real scenes with 3D Gaussian Splatting and importing them into navigation and manipulation simulators, with regard to the gaps identified during the literature review.</w:t>
+              <w:t xml:space="preserve">2. Pilot experiments on reconstructing real scenes with 3D Gaussian Splatting and importing them into navigation and manipulation simulators, addressing the gaps identified in the literature review.</w:t>
             </w:r>
           </w:p>
           <w:p>
@@ -1996,7 +1996,7 @@
                 <w:rFonts w:cstheme="minorHAnsi"/>
                 <w:lang w:val="en-US"/>
               </w:rPr>
-              <w:t xml:space="preserve">1. Continuation of the literature review - participation in the internal reading group, discussing novel methods regarding sim-to-real transfer and physical AI.</w:t>
+              <w:t xml:space="preserve">1. Continuation of the literature review, including participation in the internal reading group that discusses new methods of sim-to-real transfer and physical AI.</w:t>
             </w:r>
           </w:p>
           <w:p>
@@ -2009,7 +2009,7 @@
                 <w:rFonts w:cstheme="minorHAnsi"/>
                 <w:lang w:val="en-US"/>
               </w:rPr>
-              <w:t xml:space="preserve">2. Preparation of the research environment for robot navigation and robotic manipulation, with shared reconstruction tools: for navigation, real scene captures, digital twins in a navigation simulator and a dataset-based proxy measuring the reconstruction-fidelity gap; for manipulation, digital twins of real tabletop scenes built from images of public robot datasets and own captures, in a manipulation simulator, paired with published real-robot results of the same policies; and computing resources.</w:t>
+              <w:t xml:space="preserve">2. Preparation of the research environment for robot navigation and robotic manipulation, with shared reconstruction tools and computing resources. For navigation, it includes real scene captures, digital twins in a navigation simulator and a dataset-based proxy that measures the reconstruction-fidelity gap. For manipulation, it includes digital twins of real tabletop scenes in a manipulation simulator, built from images of public robot datasets and own captures and paired with published real-robot results of the same policies.</w:t>
             </w:r>
           </w:p>
           <w:p>
@@ -2022,7 +2022,7 @@
                 <w:rFonts w:cstheme="minorHAnsi"/>
                 <w:lang w:val="en-US"/>
               </w:rPr>
-              <w:t xml:space="preserve">3. Conducting research on which reconstruction errors of a digital twin, varying across a scene, determine the generalization of navigation and manipulation models trained in it.</w:t>
+              <w:t xml:space="preserve">3. Research on which reconstruction errors of a digital twin, which vary across a scene, determine the generalization of navigation and manipulation models trained in it.</w:t>
             </w:r>
             <w:permEnd w:id="1413760106"/>
           </w:p>
@@ -2083,7 +2083,7 @@
                 <w:rFonts w:cstheme="minorHAnsi"/>
                 <w:lang w:val="en-US"/>
               </w:rPr>
-              <w:t xml:space="preserve">1. Continuation of the literature review - participation in the internal reading group, discussing novel methods regarding sim-to-real transfer and physical AI.</w:t>
+              <w:t xml:space="preserve">1. Continuation of the literature review, including participation in the internal reading group that discusses new methods of sim-to-real transfer and physical AI.</w:t>
             </w:r>
           </w:p>
           <w:p>
@@ -2096,7 +2096,7 @@
                 <w:rFonts w:cstheme="minorHAnsi"/>
                 <w:lang w:val="en-US"/>
               </w:rPr>
-              <w:t xml:space="preserve">2. Finishing the research on the harmful reconstruction errors in both tasks and on randomizing each region of a digital twin according to its reconstruction uncertainty and task relevance.</w:t>
+              <w:t xml:space="preserve">2. Finishing the research on harmful reconstruction errors in both tasks and on randomizing each region of a digital twin according to its reconstruction uncertainty and task relevance.</w:t>
             </w:r>
           </w:p>
           <w:p>
@@ -2109,7 +2109,7 @@
                 <w:rFonts w:cstheme="minorHAnsi"/>
                 <w:lang w:val="en-US"/>
               </w:rPr>
-              <w:t xml:space="preserve">3. Writing a scientific article for a conference from the ministerial list (regarding the reconstruction errors that determine generalization in navigation and manipulation), planned for submission to e.g. NeurIPS 2027.</w:t>
+              <w:t xml:space="preserve">3. Writing a scientific article for a conference from the ministerial list on the reconstruction errors that determine generalization in navigation and manipulation, planned for submission to e.g. NeurIPS 2027.</w:t>
             </w:r>
           </w:p>
           <w:p>
@@ -2210,7 +2210,7 @@
                 <w:rFonts w:cstheme="minorHAnsi"/>
                 <w:lang w:val="en-US"/>
               </w:rPr>
-              <w:t xml:space="preserve">1. Continuation of the literature review - participation in the internal reading group, discussing novel methods regarding sim-to-real transfer and physical AI.</w:t>
+              <w:t xml:space="preserve">1. Continuation of the literature review, including participation in the internal reading group that discusses new methods of sim-to-real transfer and physical AI.</w:t>
             </w:r>
           </w:p>
           <w:p>
@@ -2236,7 +2236,7 @@
                 <w:rFonts w:cstheme="minorHAnsi"/>
                 <w:lang w:val="en-US"/>
               </w:rPr>
-              <w:t xml:space="preserve">3. Writing a scientific article for a conference from the ministerial list (regarding the localization of the sim-to-real gap inside deep models), e.g. ICML 2028 or CVPR 2028.</w:t>
+              <w:t xml:space="preserve">3. Writing a scientific article for a conference from the ministerial list on localizing the sim-to-real gap inside deep models, e.g. ICML 2028 or CVPR 2028.</w:t>
             </w:r>
           </w:p>
           <w:p>
@@ -2249,7 +2249,7 @@
                 <w:rFonts w:cstheme="minorHAnsi"/>
                 <w:lang w:val="en-US"/>
               </w:rPr>
-              <w:t xml:space="preserve">4. Carrying out research on selecting real data under a limited budget to correct both the digital twin and the model in both tasks.</w:t>
+              <w:t xml:space="preserve">4. Research on selecting real data under a limited budget to correct both the digital twin and the model in both tasks.</w:t>
             </w:r>
           </w:p>
           <w:p>
@@ -2324,7 +2324,7 @@
                 <w:rFonts w:cstheme="minorHAnsi"/>
                 <w:lang w:val="en-US"/>
               </w:rPr>
-              <w:t xml:space="preserve">1. Continuation of the literature review - participation in the internal reading group, discussing novel methods regarding sim-to-real transfer and physical AI.</w:t>
+              <w:t xml:space="preserve">1. Continuation of the literature review, including participation in the internal reading group that discusses new methods of sim-to-real transfer and physical AI.</w:t>
             </w:r>
           </w:p>
           <w:p>
@@ -2337,7 +2337,7 @@
                 <w:rFonts w:cstheme="minorHAnsi"/>
                 <w:lang w:val="en-US"/>
               </w:rPr>
-              <w:t xml:space="preserve">2. Finishing the research on the selection of real data and on predicting the transfer of improvements across environments and tasks, complemented by controlled studies of physical parameters in a simulator with hidden parameters.</w:t>
+              <w:t xml:space="preserve">2. Finishing the research on selecting real data and on predicting the transfer of improvements across environments and tasks, complemented by controlled studies of physical parameters in a simulator with hidden parameters.</w:t>
             </w:r>
           </w:p>
           <w:p>
@@ -2350,7 +2350,7 @@
                 <w:rFonts w:cstheme="minorHAnsi"/>
                 <w:lang w:val="en-US"/>
               </w:rPr>
-              <w:t xml:space="preserve">3. Writing a scientific article for a conference from the ministerial list (regarding the selection of real data under a limited budget and the prediction of transfer), e.g. NeurIPS 2028.</w:t>
+              <w:t xml:space="preserve">3. Writing a scientific article for a conference from the ministerial list on selecting real data under a limited budget and predicting transfer, e.g. NeurIPS 2028.</w:t>
             </w:r>
           </w:p>
           <w:p>
@@ -2376,7 +2376,7 @@
                 <w:rFonts w:cstheme="minorHAnsi"/>
                 <w:lang w:val="en-US"/>
               </w:rPr>
-              <w:t xml:space="preserve">5. Research internship at a foreign research group working on robot learning, if funding allows.</w:t>
+              <w:t xml:space="preserve">5. Research internship in a foreign research group working on robot learning, if funding allows.</w:t>
             </w:r>
             <w:permEnd w:id="1544439300"/>
           </w:p>
@@ -2438,7 +2438,7 @@
                 <w:rFonts w:cstheme="minorHAnsi"/>
                 <w:lang w:val="en-US"/>
               </w:rPr>
-              <w:t xml:space="preserve">1. Continuation of the literature review - participation in the internal reading group, discussing novel methods regarding sim-to-real transfer and physical AI.</w:t>
+              <w:t xml:space="preserve">1. Continuation of the literature review, including participation in the internal reading group that discusses new methods of sim-to-real transfer and physical AI.</w:t>
             </w:r>
           </w:p>
           <w:p>
@@ -2464,7 +2464,7 @@
                 <w:rFonts w:cstheme="minorHAnsi"/>
                 <w:lang w:val="en-US"/>
               </w:rPr>
-              <w:t xml:space="preserve">3. Writing a scientific article for a conference or journal from the ministerial list summarizing the obtained results.</w:t>
+              <w:t xml:space="preserve">3. Writing a scientific article summarizing the results for a conference or journal from the ministerial list.</w:t>
             </w:r>
           </w:p>
           <w:p>
@@ -2490,7 +2490,7 @@
                 <w:rFonts w:cstheme="minorHAnsi"/>
                 <w:lang w:val="en-US"/>
               </w:rPr>
-              <w:t xml:space="preserve">5. Preparing the structure and sketch of the doctoral dissertation.</w:t>
+              <w:t xml:space="preserve">5. Preparing the structure and outline of the doctoral dissertation.</w:t>
             </w:r>
             <w:permEnd w:id="565201535"/>
           </w:p>
@@ -2551,7 +2551,7 @@
                 <w:rFonts w:cstheme="minorHAnsi"/>
                 <w:lang w:val="en-US"/>
               </w:rPr>
-              <w:t xml:space="preserve">Editing the doctoral dissertation, preparation of the final version of the document.</w:t>
+              <w:t xml:space="preserve">Editing the doctoral dissertation and preparing the final version of the document.</w:t>
             </w:r>
             <w:permEnd w:id="490215942"/>
           </w:p>
@@ -3228,7 +3228,7 @@
           <w:rFonts w:cstheme="minorHAnsi"/>
           <w:lang w:val="en-US"/>
         </w:rPr>
-        <w:t xml:space="preserve">Deep learning has brought remarkable progress in computer vision and natural language processing, largely thanks to vast amounts of data collected from the web. Physical AI, i.e., AI in robots and other embodied systems that perceive and act in the real world, cannot rely on such data. Its models need interaction data, which are slow, expensive and sometimes unsafe to collect with real robots. Therefore, such models are commonly trained in simulation. Recently, digital twins, i.e., simulations built from real data, have become a promising alternative to hand-crafted simulators: neural scene reconstruction methods, such as 3D Gaussian Splatting, turn a short recording of a real place into a photorealistic digital twin in which a model can be trained at scale. This forms a real-to-sim-to-real loop, in which real data are turned into a simulation, a model is trained there, and the model is transferred back to reality.</w:t>
+        <w:t xml:space="preserve">Deep learning has made great progress in computer vision and natural language processing, largely thanks to vast amounts of data collected from the web. Physical AI, i.e., AI in robots and other embodied systems that perceive and act in the real world, cannot rely on such data. Its models need interaction data, which are slow, expensive and sometimes unsafe to collect with real robots, so they are commonly trained in simulation. Recently, digital twins, i.e., simulations built from real data, have become a promising alternative to hand-crafted simulators. Neural scene reconstruction methods, such as 3D Gaussian Splatting, turn a short recording of a real place into a photorealistic digital twin in which a model can be trained at scale. Real data are turned into a simulation, a model is trained there and then transferred back to reality, which forms a real-to-sim-to-real loop.</w:t>
       </w:r>
     </w:p>
     <w:p>
@@ -3241,7 +3241,7 @@
           <w:rFonts w:cstheme="minorHAnsi"/>
           <w:lang w:val="en-US"/>
         </w:rPr>
-        <w:t xml:space="preserve">However, the value of this loop depends on how well the trained models generalize. A model that performs well in simulation often fails in reality, since no simulation reproduces the real world exactly: appearance, geometry, lighting and physics are only approximated, and reconstruction errors differ between regions of a scene. The resulting drop in performance, called the sim-to-real gap, is caused by the shift between the distributions of simulated and real data, which makes it a particular case of learning under distribution shift and a central obstacle to physical AI. The methods proposed so far have several limitations. Domain randomization, even when fitted to real data, varies a few global parameters regardless of where the simulation is inaccurate, and invariant representations may discard information needed for the task. Moreover, the few real data used for adaptation usually serve to correct either the model or the simulation, but not both. Finally, most methods are evaluated on a single task and a few scenes, and it is not known which properties of the digital twin and of the learned representations determine whether a model generalizes to reality.</w:t>
+        <w:t xml:space="preserve">However, the value of this loop depends on how well the trained models generalize. A model that performs well in simulation often fails in reality, since no simulation reproduces the real world exactly: appearance, geometry, lighting and physics are only approximated, and reconstruction errors differ between regions of a scene. The resulting drop in performance is called the sim-to-real gap. It is caused by the shift between the distributions of simulated and real data, so it is a particular case of learning under distribution shift and one of the main obstacles to physical AI. The methods proposed so far have several limitations. Domain randomization, even when fitted to real data, varies a few global parameters regardless of where the simulation is inaccurate, and invariant representations may discard information needed for the task. Moreover, the few real data used for adaptation usually correct either the model or the simulation, but not both. Finally, most methods are evaluated on a single task and a few scenes, and it is not known which properties of the digital twin and of the learned representations determine whether a model generalizes to reality.</w:t>
       </w:r>
     </w:p>
     <w:p>
@@ -3254,7 +3254,7 @@
           <w:rFonts w:cstheme="minorHAnsi"/>
           <w:lang w:val="en-US"/>
         </w:rPr>
-        <w:t xml:space="preserve">Therefore, the dissertation aims to improve the generalization of deep learning models in real-to-sim-to-real transfer at the points of the loop where the sim-to-real gap arises. The research shall focus on understanding which reconstruction errors of a digital twin are harmful to generalization, on localizing where inside a model the gap arises and reducing it there, on choosing the small amount of real data that corrects both the digital twin and the model most efficiently, and on verifying whether the obtained improvements carry over to unseen environments and from one physical task to another, and which properties of the shift explain when they do. The methods shall not be tied to a particular task, and robot navigation and robotic manipulation shall serve as two equal testbeds. For navigation, public recordings of real scenes, in which a second, independent capture measures the reconstruction-fidelity gap, shall be complemented by a real robot, which provides the main evidence for differences in actuation and sensors. For manipulation, digital twins of real tabletop scenes shall be built from images of public robot datasets and compared with published real-robot results of the same policies. Beyond more reliable models, the research could help explain why models trained on synthetic data succeed or fail on real data, which is relevant to machine learning in general.</w:t>
+        <w:t xml:space="preserve">Therefore, the dissertation aims to improve the generalization of deep learning models in real-to-sim-to-real transfer at the points of the loop where the sim-to-real gap arises. The research shall focus on understanding which reconstruction errors of a digital twin are harmful to generalization, on localizing where inside a model the gap arises and reducing it there, and on choosing the small amount of real data that corrects both the digital twin and the model most efficiently. It shall also verify whether the obtained improvements carry over to unseen environments and from one physical task to another, and which properties of the shift explain when they do. The methods shall not be tied to a particular task; robot navigation and robotic manipulation are planned as two equal testbeds. For navigation, public recordings of real scenes, in which a second, independent capture measures the reconstruction-fidelity gap, shall be complemented by a real robot, which provides the main evidence for differences in actuation and sensors. For manipulation, digital twins of real tabletop scenes shall be built from images of public robot datasets and compared with published real-robot results of the same policies. Apart from more reliable models, the research could help explain why models trained on synthetic data succeed or fail on real data, which is relevant to machine learning in general.</w:t>
       </w:r>
     </w:p>
     <w:p>
@@ -3267,7 +3267,7 @@
           <w:rFonts w:cstheme="minorHAnsi"/>
           <w:lang w:val="en-US"/>
         </w:rPr>
-        <w:t xml:space="preserve">The results have potential applications in service, logistics and assistive robotics, where a robot could be trained in a digital copy of a new warehouse, hospital or home and operate there reliably after little real-world adaptation. More broadly, they concern any domain in which models are trained on simulated or reconstructed data and deployed on real sensor data, such as autonomous driving or inspection robots.</w:t>
+        <w:t xml:space="preserve">The results could be applied in service, logistics and assistive robotics, where a robot could be trained in a digital copy of a new warehouse, hospital or home and then operate there reliably after little real-world adaptation. They also concern other domains in which models are trained on simulated or reconstructed data and deployed on real sensor data, such as autonomous driving or inspection robots.</w:t>
       </w:r>
     </w:p>
     <w:permEnd w:id="1178868985"/>
@@ -3637,7 +3637,7 @@
           <w:rFonts w:cstheme="minorHAnsi"/>
           <w:lang w:val="en-US"/>
         </w:rPr>
-        <w:t xml:space="preserve">Deep learning models for navigation and manipulation need more experience than real robots can provide, so they are usually trained in simulation. Yet performance in simulation can poorly predict real-world performance unless the simulator is carefully tuned [1]. The sim-to-real gap is an instance of learning under distribution shift: domain adaptation theory bounds the error of a model on the target domain by its error on the source domain, the discrepancy between the two distributions, and the joint error of the best single model on both domains [2]. Used as motivation only, the bound suggests three levers: a training distribution that covers reality, a model insensitive to the remaining discrepancy, and, since invariance cannot reduce the joint error, a simulation corrected towards reality.</w:t>
+        <w:t xml:space="preserve">Deep learning models for navigation and manipulation need more experience than real robots can provide, so they are usually trained in simulation. However, performance in simulation can poorly predict real-world performance unless the simulator is carefully tuned [1]. The sim-to-real gap is a case of learning under distribution shift. Domain adaptation theory bounds the error of a model on the target domain by its error on the source domain, the discrepancy between the two distributions, and the joint error of the best single model on both domains [2]. Taken only as motivation, the bound suggests making the training distribution cover reality, making the model insensitive to the remaining discrepancy and, since invariance cannot reduce the joint error, correcting the simulation towards reality.</w:t>
       </w:r>
     </w:p>
     <w:p>
@@ -3650,7 +3650,7 @@
           <w:rFonts w:cstheme="minorHAnsi"/>
           <w:lang w:val="en-US"/>
         </w:rPr>
-        <w:t xml:space="preserve">The first lever is exploited by domain randomization, which varies simulator parameters such as textures so that reality appears as one more variation [3]. Since overly wide randomization leads to conservative behaviour, later works shape its distribution: they fit it to a few real rollouts [4] or maximize its entropy while preserving task success [5]. Yet they act on a few global parameters of a synthetic simulator, not on errors that vary across a scene.</w:t>
+        <w:t xml:space="preserve">Domain randomization varies simulator parameters such as textures so that reality appears as one more variation [3]. Overly wide randomization leads to conservative behaviour, so later works shape its distribution by fitting it to a few real rollouts [4] or by maximizing its entropy while preserving task success [5]. These methods tune a few global parameters of a synthetic simulator and do not address errors that vary across a scene.</w:t>
       </w:r>
     </w:p>
     <w:p>
@@ -3663,7 +3663,7 @@
           <w:rFonts w:cstheme="minorHAnsi"/>
           <w:lang w:val="en-US"/>
         </w:rPr>
-        <w:t xml:space="preserve">The second lever is invariance. Domain-adversarial training aligns features across domains [6]. In robotics, aligning the joint distributions of observations and actions in simulated and real data improved co-trained policies, i.e., models that map observations to actions, in reality [7]. However, invariance with low source error does not guarantee transfer, as it can increase the joint error term [8], and full invariance may discard task information. Effective sim-and-real co-training aligns the two domains while keeping them distinguishable [9], so domain separability alone does not show where the gap harms the task. Moreover, invariance is usually enforced at a fixed location, the input or the final features.</w:t>
+        <w:t xml:space="preserve">Invariance is another option. Domain-adversarial training aligns features across domains [6]. In robotics, aligning the joint distributions of observations and actions in simulated and real data improved co-trained policies, i.e., models that map observations to actions, in reality [7]. However, invariance with low source error does not guarantee transfer, as it can increase the joint error term [8], and full invariance may discard task information. Effective sim-and-real co-training aligns the two domains while keeping them distinguishable [9], so domain separability alone does not show where the gap harms the task. Invariance is also usually enforced at a fixed location, the input or the final features.</w:t>
       </w:r>
     </w:p>
     <w:p>
@@ -3676,7 +3676,7 @@
           <w:rFonts w:cstheme="minorHAnsi"/>
           <w:lang w:val="en-US"/>
         </w:rPr>
-        <w:t xml:space="preserve">A recent development is building digital twins. 3D Gaussian Splatting [10] reconstructs photorealistic scenes from ordinary images. In manipulation, twins have been used to train policies from a scan of the target scene [11], to transfer image-based policies to reality without real data [12] and to guide real-world reinforcement learning from a phone capture [13]. Paired simulated and real evaluations showed that scenes visually matched to real images of two robot setups track the real-world performance of the same policies [14]. In navigation, policies have been trained in twins built from a phone capture of a room [15] and from a monocular video of urban scenes [16]. Which simulation factors matter has been studied mainly globally, e.g., randomization, photorealism and physics realism in real-world manipulation [17], or task-relevant fidelity in robotic ultrasound [18]. It remains open, in either task, which reconstruction errors that vary across a scene harm generalization, and how training variation should follow the reconstruction uncertainty of each region.</w:t>
+        <w:t xml:space="preserve">Digital twins are a more recent approach. 3D Gaussian Splatting [10] reconstructs photorealistic scenes from ordinary images. In manipulation, twins have been used to train policies from a scan of the target scene [11], to transfer image-based policies to reality without real data [12] and to guide real-world reinforcement learning from a phone capture [13]. Paired simulated and real evaluations showed that scenes visually matched to real images of two robot setups track the real-world performance of the same policies [14]. In navigation, policies have been trained in twins built from a phone capture of a room [15] and from a monocular video of urban scenes [16]. The effect of simulation factors has been studied mainly globally, e.g., randomization, photorealism and physics realism in real-world manipulation [17], or task-relevant fidelity in robotic ultrasound [18]. For both tasks it remains open which reconstruction errors that vary across a scene harm generalization, and how training variation should follow the reconstruction uncertainty of each region.</w:t>
       </w:r>
     </w:p>
     <w:p>
@@ -3689,7 +3689,7 @@
           <w:rFonts w:cstheme="minorHAnsi"/>
           <w:lang w:val="en-US"/>
         </w:rPr>
-        <w:t xml:space="preserve">It is also unclear where inside a model the gap arises. Probing, i.e., reading out information from hidden states with simple classifiers, showed that action fine-tuning degrades the visual representations of robot policies [19], and the best layers to adapt depend on the type of shift [20]. However, the stage at which task information available in simulation stops being recoverable from real inputs has not been located in models trained in twins.</w:t>
+        <w:t xml:space="preserve">It is also unclear where inside a model the gap arises. Probing, i.e., reading out information from hidden states with simple classifiers, showed that action fine-tuning degrades the visual representations of robot policies [19], and the best layers to adapt depend on the type of shift [20]. In models trained in twins, the stage at which task information available in simulation stops being recoverable from real inputs has not been located.</w:t>
       </w:r>
     </w:p>
     <w:p>
@@ -3702,7 +3702,7 @@
           <w:rFonts w:cstheme="minorHAnsi"/>
           <w:lang w:val="en-US"/>
         </w:rPr>
-        <w:t xml:space="preserve">The remaining gap is usually reduced with little real data. Co-training with a small real set yields large gains [21], and active system identification collects the real trajectories most informative about physics [22]. The closest work uses a twin to find failure-prone configurations for real rollouts [13]. However, these methods correct either the model or the simulation; correcting both from the same selected data, guided by the twin's reconstruction uncertainty, has, to our knowledge, not been studied.</w:t>
+        <w:t xml:space="preserve">The remaining gap is usually reduced with little real data. Co-training with a small real set yields large gains [21], and active system identification collects the real trajectories most informative about physics [22]. The closest work uses a twin to find failure-prone configurations for real rollouts [13]. These methods correct either the model or the simulation. To our knowledge, correcting both from the same selected data, guided by the twin's reconstruction uncertainty, has not been studied.</w:t>
       </w:r>
     </w:p>
     <w:p>
@@ -3715,7 +3715,7 @@
           <w:rFonts w:cstheme="minorHAnsi"/>
           <w:lang w:val="en-US"/>
         </w:rPr>
-        <w:t xml:space="preserve">Finally, the gap can be decomposed into factors of variation whose difficulty ordering is largely consistent between simulation and reality [23]. However, it is rarely tested whether measurements taken before a method is applied predict, better than simple indicators such as the size of the gap, whether its benefit carries over to a new scene or to another task.</w:t>
+        <w:t xml:space="preserve">Finally, the gap can be decomposed into factors of variation whose difficulty ordering is largely consistent between simulation and reality [23]. It is rarely tested whether measurements taken before a method is applied predict, better than simple indicators such as the size of the gap, whether its benefit carries over to a new scene or to another task.</w:t>
       </w:r>
     </w:p>
     <w:p>
@@ -4330,7 +4330,7 @@
           <w:rFonts w:cstheme="minorHAnsi"/>
           <w:lang w:val="en-US"/>
         </w:rPr>
-        <w:t xml:space="preserve"> The harm caused by a reconstruction error is predicted better by the change it induces in the representation of a fixed reference model on held-out paired views than by its magnitude in the image or geometry. Separately, randomizing each region in proportion to its reconstruction uncertainty and task relevance yields better generalization than uniform randomization. The research will replace components of the twin with a more accurate reference and measure the effect. If harm follows error magnitude, this attribution will itself be reported, and the third question will rely on reconstruction uncertainty and action sensitivity only.</w:t>
+        <w:t xml:space="preserve"> The harm caused by a reconstruction error is predicted better by the change it induces in the representation of a fixed reference model on held-out paired views than by its magnitude in the image or geometry. Separately, randomizing each region in proportion to its reconstruction uncertainty and task relevance yields better generalization than uniform randomization. To test this, the research will replace components of the twin with a more accurate reference and measure the effect. If harm follows error magnitude, this attribution will itself be reported, and the third question will rely on reconstruction uncertainty and action sensitivity only.</w:t>
       </w:r>
     </w:p>
     <w:p>
@@ -4359,7 +4359,7 @@
           <w:rFonts w:cstheme="minorHAnsi"/>
           <w:lang w:val="en-US"/>
         </w:rPr>
-        <w:t xml:space="preserve"> Models trained in simulation can rely on features absent in reality, such as reconstruction artifacts. Simulated and real inputs remain distinguishable even in models that transfer well, so the gap should be localized by what the model loses about the task, not by whether the domains can be told apart. </w:t>
+        <w:t xml:space="preserve"> Models trained in simulation can rely on features absent in reality, such as reconstruction artifacts. Even in models that transfer well, simulated and real inputs remain distinguishable, so the gap is better localized by the task information the model loses on real inputs. </w:t>
       </w:r>
       <w:r>
         <w:rPr>
@@ -4374,7 +4374,7 @@
           <w:rFonts w:cstheme="minorHAnsi"/>
           <w:lang w:val="en-US"/>
         </w:rPr>
-        <w:t xml:space="preserve"> In both tasks, there is a first stage of the model at which task information that can be decoded from simulated inputs can no longer be decoded from real ones. Aligning simulated and real representations at that stage, from a few paired views, yields better generalization than aligning them at the input, at the final features or everywhere. The research will use probing of hidden states to find this stage before intervening.</w:t>
+        <w:t xml:space="preserve"> In both tasks, there is a first stage of the model at which task information that can be decoded from simulated inputs can no longer be decoded from real ones. Aligning simulated and real representations at that stage, from a few paired views, yields better generalization than aligning them at the input, at the final features or everywhere. Probing of hidden states will locate this stage before any intervention.</w:t>
       </w:r>
     </w:p>
     <w:p>
@@ -4403,7 +4403,7 @@
           <w:rFonts w:cstheme="minorHAnsi"/>
           <w:lang w:val="en-US"/>
         </w:rPr>
-        <w:t xml:space="preserve"> Real data are expensive, and existing methods use them to correct either the model or the simulation. However, the joint error term cannot be reduced by invariance, only by making the simulation closer to reality. </w:t>
+        <w:t xml:space="preserve"> Real data are expensive, and existing methods use them to correct either the model or the simulation. Invariance does not reduce the joint error term, which shrinks only as the simulation gets closer to reality. </w:t>
       </w:r>
       <w:r>
         <w:rPr>
@@ -4418,7 +4418,7 @@
           <w:rFonts w:cstheme="minorHAnsi"/>
           <w:lang w:val="en-US"/>
         </w:rPr>
-        <w:t xml:space="preserve"> Correcting both the digital twin and the model from the same selected real data reduces the gap more than correcting either one alone. The data should be selected where the twin is predicted to disagree with reality in task-relevant ways. This disagreement can be estimated from the reconstruction uncertainty, the representation distance between simulated and real views, and the sensitivity of the predicted action. Such selection is expected to beat random and failure-driven selection. The research will compare selection rules at equal budgets in both tasks, counting unlabelled real images as real data.</w:t>
+        <w:t xml:space="preserve"> Correcting both the digital twin and the model from the same selected real data reduces the gap more than correcting either one alone. The data should be selected where the twin is predicted to disagree with reality in task-relevant ways, as estimated from the reconstruction uncertainty, the representation distance between simulated and real views and the sensitivity of the predicted action. Such selection is expected to beat random and failure-driven selection. Selection rules will be compared at equal budgets in both tasks, with unlabelled real images counted as real data.</w:t>
       </w:r>
     </w:p>
     <w:p>
@@ -4447,7 +4447,7 @@
           <w:rFonts w:cstheme="minorHAnsi"/>
           <w:lang w:val="en-US"/>
         </w:rPr>
-        <w:t xml:space="preserve"> A valuable method should not be tied to a single scene or task. Therefore, the developed methods shall be applied with unchanged settings to many held-out scenes of both tasks, and an improvement found in one task shall be tested in the other. </w:t>
+        <w:t xml:space="preserve"> A useful method should work beyond a single scene or task. The developed methods shall therefore be applied with unchanged settings to many held-out scenes of both tasks, and an improvement found in one task shall be tested in the other. </w:t>
       </w:r>
       <w:r>
         <w:rPr>
@@ -4462,7 +4462,7 @@
           <w:rFonts w:cstheme="minorHAnsi"/>
           <w:lang w:val="en-US"/>
         </w:rPr>
-        <w:t xml:space="preserve"> The attribution of the gap from the first question and its localization from the second can be measured in a new scene or task before a method is applied. These measurements predict whether the improvement transfers, also between the tasks. They predict it better than simple indicators, such as the raw size of the gap or the image-level discrepancy. The research will test this prediction across many held-out scenes of navigation and manipulation.</w:t>
+        <w:t xml:space="preserve"> The attribution of the gap from the first question and its localization from the second can be measured in a new scene or task before a method is applied. These measurements predict whether the improvement transfers, also between the tasks, better than simple indicators such as the raw size of the gap or the image-level discrepancy. This prediction will be tested across many held-out scenes of navigation and manipulation.</w:t>
       </w:r>
     </w:p>
     <w:permEnd w:id="1295260508"/>
@@ -4742,7 +4742,7 @@
           <w:rFonts w:cstheme="minorHAnsi"/>
           <w:lang w:val="en-US"/>
         </w:rPr>
-        <w:t xml:space="preserve">The proposed PhD dissertation aims to contribute to the development of the scientific discipline by addressing the generalization of deep learning models trained in simulations built from real data, which remains one of the main obstacles to applying machine learning in physical AI. The working assumption of the dissertation is that the sim-to-real gap is caused mainly by a limited set of task-relevant discrepancies, which may be identified among the reconstruction errors of a digital twin, localized inside the model, and reduced with a small amount of well-chosen real data. The methods are intended to be general, i.e., not tied to a particular robot, scene or task, and are planned to be examined on robot navigation and robotic manipulation.</w:t>
+        <w:t xml:space="preserve">The proposed PhD dissertation aims to contribute to the development of the scientific discipline by addressing the generalization of deep learning models trained in simulations built from real data, which remains one of the main obstacles to applying machine learning in physical AI. The working assumption of the dissertation is that the sim-to-real gap is caused mainly by a limited set of task-relevant discrepancies. These may be identified among the reconstruction errors of a digital twin, localized inside the model, and reduced with a small amount of well-chosen real data. The methods are intended to be general, i.e., not tied to a particular robot, scene or task, and will be examined on robot navigation and robotic manipulation.</w:t>
       </w:r>
     </w:p>
     <w:p>
@@ -4755,7 +4755,7 @@
           <w:rFonts w:cstheme="minorHAnsi"/>
           <w:lang w:val="en-US"/>
         </w:rPr>
-        <w:t xml:space="preserve">First, the research is intended to provide a better understanding of which reconstruction errors of a digital twin harm generalization, and a method for varying the twin accordingly instead of uniformly. Second, it aims to develop a way of finding where inside a deep model the sim-to-real gap arises and of reducing it at that stage. Third, it aims to propose a rule for selecting a small amount of real data that corrects both the digital twin and the model. Finally, it will examine when such improvements carry over to unseen environments and between tasks. Such knowledge could complement the currently dominant randomization heuristics with more principled and interpretable approaches.</w:t>
+        <w:t xml:space="preserve">First, the research is intended to provide a better understanding of which reconstruction errors of a digital twin harm generalization, together with a method that varies the twin accordingly rather than uniformly. Second, it aims to develop a way of finding where inside a deep model the sim-to-real gap arises and of reducing it at that stage. Third, it aims to propose a rule for selecting a small amount of real data that corrects both the digital twin and the model. Finally, it will examine when such improvements carry over to unseen environments and between tasks. This knowledge could complement the currently dominant randomization heuristics with more principled and interpretable approaches.</w:t>
       </w:r>
     </w:p>
     <w:p>
@@ -5047,7 +5047,7 @@
           <w:rFonts w:cstheme="minorHAnsi"/>
           <w:lang w:val="en-US"/>
         </w:rPr>
-        <w:t xml:space="preserve">The research will follow the methods commonly adopted in machine learning and robot learning projects. Since no established theory guarantees generalization from simulation to reality, the dominant part of the work will be empirical. Domain adaptation theory, which relates the error of a model in reality to its error in simulation and to the discrepancy between the two, will serve as motivation, and the properties of the proposed methods will be analysed theoretically whenever possible.</w:t>
+        <w:t xml:space="preserve">The research will follow the methods commonly adopted in machine learning and robot learning projects. Since no established theory guarantees generalization from simulation to reality, the dominant part of the work will be empirical. Domain adaptation theory relates the error of a model in reality to its error in simulation and to the discrepancy between the two. It is used as motivation, and the properties of the proposed methods will be analysed theoretically whenever possible.</w:t>
       </w:r>
     </w:p>
     <w:p>
@@ -5060,7 +5060,7 @@
           <w:rFonts w:cstheme="minorHAnsi"/>
           <w:lang w:val="en-US"/>
         </w:rPr>
-        <w:t xml:space="preserve">The methods will be examined on two physical AI tasks, robot navigation and robotic manipulation, which share the reconstruction tools. Digital twins will be built from real images with neural scene reconstruction, e.g., 3D Gaussian Splatting, and coupled with simulators for navigation (e.g., Habitat) and manipulation (e.g., ManiSkill3), in which models mapping camera images to actions will be trained or fine-tuned, where possible starting from pretrained models.</w:t>
+        <w:t xml:space="preserve">The methods will be examined on two physical AI tasks, robot navigation and robotic manipulation, which share the reconstruction tools. Digital twins will be built from real images with neural scene reconstruction, e.g., 3D Gaussian Splatting, and coupled with simulators for navigation (e.g., Habitat) and manipulation (e.g., ManiSkill3). Models that map camera images to actions will be trained or fine-tuned in these simulators, starting from pretrained models where possible.</w:t>
       </w:r>
     </w:p>
     <w:p>
@@ -5073,7 +5073,7 @@
           <w:rFonts w:cstheme="minorHAnsi"/>
           <w:lang w:val="en-US"/>
         </w:rPr>
-        <w:t xml:space="preserve">Since the research does not rely on an own robot, the evaluation will use public data. For navigation, public datasets of real indoor scenes with independent captures of the same scenes (e.g., ScanNet++) will be used: the twin will be built from one capture, and the other will provide real frames and a dataset-based reference simulation. This reference measures the gap caused by reconstruction fidelity, not differences in actuation and sensors. For manipulation, twins of real tabletop scenes will be built from images of public robot datasets, following the visual matching of SIMPLER [14], and compared with published real-robot results of the same policies; new models will additionally be evaluated in simulations whose parameters are hidden from the learner.</w:t>
+        <w:t xml:space="preserve">The research does not rely on a robot of its own, so the evaluation will use public data. For navigation, it will use public datasets of real indoor scenes with independent captures of the same scenes (e.g., ScanNet++). The twin will be built from one capture, and the other will provide real frames and a dataset-based reference simulation. This reference isolates the gap caused by reconstruction fidelity and leaves out differences in actuation and sensors. For manipulation, twins of real tabletop scenes will be built from images of public robot datasets, following the visual matching of SIMPLER [14], and compared with published real-robot results of the same policies. New models will also be evaluated in simulations whose parameters are hidden from the learner.</w:t>
       </w:r>
     </w:p>
     <w:p>
@@ -5086,7 +5086,7 @@
           <w:rFonts w:cstheme="minorHAnsi"/>
           <w:lang w:val="en-US"/>
         </w:rPr>
-        <w:t xml:space="preserve">For the first research question, variants of the twin in which one type of reconstruction error is corrected will be examined to attribute the gap to types of error, and randomization guided by reconstruction uncertainty and task relevance will be studied. For the second question, simple probes on the hidden states of models will be used to examine at which stage task information decodable in simulation is lost on real inputs, and alignment at that stage will be compared with alternatives. For the third question, ways of selecting a small amount of real data used to correct both the twin and the model will be examined. For the fourth question, the methods will be applied to held-out scenes of both tasks, and it will be examined whether the measured attribution and localization predict the improvement better than simple predictors.</w:t>
+        <w:t xml:space="preserve">For the first research question, the research will examine variants of the twin in which one type of reconstruction error is corrected, to attribute the gap to types of error, and will study randomization guided by reconstruction uncertainty and task relevance. For the second question, simple probes on the hidden states of models will show at which stage task information decodable in simulation is lost on real inputs, and alignment at that stage will be compared with alternatives. The third question concerns ways of selecting a small amount of real data used to correct both the twin and the model. For the fourth question, the methods will be applied to held-out scenes of both tasks to check whether the measured attribution and localization predict the improvement better than simple predictors.</w:t>
       </w:r>
     </w:p>
     <w:p>
@@ -5381,7 +5381,7 @@
           <w:rFonts w:cstheme="minorHAnsi"/>
           <w:lang w:val="pl-PL"/>
         </w:rPr>
-        <w:t xml:space="preserve">Sztuczna inteligencja coraz częściej wychodzi poza ekrany komputerów i trafia do systemów fizycznych, takich jak roboty poruszające się po budynkach lub przenoszące przedmioty. Modele uczenia głębokiego sterujące takimi robotami potrzebują ogromnej liczby przykładów, których zebranie w prawdziwym świecie jest powolne, kosztowne, a czasem niebezpieczne. Dlatego modele te uczy się zwykle w symulacji, a coraz częściej w cyfrowych bliźniakach, czyli wirtualnych kopiach rzeczywistych miejsc odtworzonych na podstawie ich nagrań. Taka kopia nigdy nie jest jednak idealna. Na przykład szklane drzwi lub odbicie w lustrze mogą zostać odtworzone błędnie i zmylić robota. W efekcie model, który dobrze działa w symulacji, w rzeczywistości często zawodzi, zwłaszcza w miejscach, których wcześniej nie widział. Pozostaje to jedną z głównych przeszkód na drodze do szerszego zastosowania fizycznej sztucznej inteligencji. Celem rozprawy jest poprawa zdolności generalizacji modeli uczenia głębokiego trenowanych w cyfrowych bliźniakach, czyli umiejętności poprawnego działania w warunkach innych niż te, w których je trenowano, a zwłaszcza w rzeczywistości. Badania w pierwszej kolejności pozwolą ustalić, które różnice między symulacją a rzeczywistością faktycznie szkodzą modelowi i na którym etapie przetwarzania w modelu przekształcają się one w błędy. Na tej podstawie zostaną opracowane metody, które nauczą model pomijać nieistotne różnice i więcej ćwiczyć tam, gdzie cyfrowy bliźniak jest najmniej dokładny, a także metody wyboru nielicznych rzeczywistych przykładów, które najlepiej poprawiają zarówno model, jak i cyfrowego bliźniaka. Metody zostaną sprawdzone w dwóch równorzędnych zadaniach, nawigacji robotów oraz manipulacji robotycznej, czyli chwytaniu i przestawianiu przedmiotów na stole, w środowiskach, które nie były wykorzystywane podczas uczenia. Wyniki uzyskane w symulacji zostaną porównane z opublikowanymi wynikami prawdziwych robotów, a jeśli będzie to możliwe, sprawdzone również na prawdziwym robocie. Zbadane zostanie też, czy poprawa uzyskana w jednym zadaniu przenosi się na drugie. Oczekuje się, że rozprawa przyniesie lepsze zrozumienie przyczyn, dla których modele uczone w symulacji zawodzą w rzeczywistości, a także metody, dzięki którym roboty będą mogły szybciej, taniej i bezpieczniej uczyć się pracy w nowych miejscach i przy więcej niż jednym zadaniu.</w:t>
+        <w:t xml:space="preserve">Sztuczna inteligencja coraz częściej trafia do systemów fizycznych, takich jak roboty poruszające się po budynkach lub przenoszące przedmioty. Sterujące nimi modele uczenia głębokiego potrzebują ogromnej liczby przykładów, a zbieranie ich w prawdziwym świecie jest powolne, kosztowne i czasem niebezpieczne. Dlatego modele te uczy się zwykle w symulacji, a coraz częściej w cyfrowych bliźniakach, czyli wirtualnych kopiach rzeczywistych miejsc odtworzonych na podstawie ich nagrań. Taka kopia nigdy nie jest jednak idealna. Na przykład szklane drzwi lub odbicie w lustrze mogą zostać odtworzone błędnie i zmylić robota. W efekcie model, który dobrze działa w symulacji, w rzeczywistości często zawodzi, zwłaszcza w miejscach, których wcześniej nie widział. To jedna z głównych przeszkód w szerszym stosowaniu fizycznej sztucznej inteligencji. Celem rozprawy jest poprawa zdolności generalizacji modeli uczenia głębokiego trenowanych w cyfrowych bliźniakach. Generalizacja oznacza tu umiejętność poprawnego działania w warunkach innych niż te, w których model trenowano, a zwłaszcza w rzeczywistości. Badania w pierwszej kolejności ustalą, które różnice między symulacją a rzeczywistością faktycznie szkodzą modelowi i na którym etapie przetwarzania w modelu zamieniają się w błędy. Na tej podstawie powstaną metody, które nauczą model pomijać nieistotne różnice i więcej ćwiczyć tam, gdzie cyfrowy bliźniak jest najmniej dokładny. Powstaną też metody wyboru nielicznych rzeczywistych przykładów, które najlepiej poprawiają zarówno model, jak i cyfrowego bliźniaka. Metody zostaną sprawdzone w dwóch równorzędnych zadaniach, nawigacji robotów oraz manipulacji robotycznej (chwytaniu i przestawianiu przedmiotów na stole), w środowiskach, których nie używano podczas uczenia. Wyniki uzyskane w symulacji zostaną porównane z opublikowanymi wynikami prawdziwych robotów, a jeśli to będzie możliwe, sprawdzone także na prawdziwym robocie. Zbadane zostanie też, czy poprawa uzyskana w jednym zadaniu przenosi się na drugie. Oczekiwanym wynikiem rozprawy jest lepsze zrozumienie, dlaczego modele uczone w symulacji zawodzą w rzeczywistości, oraz metody, dzięki którym roboty będą mogły szybciej, taniej i bezpieczniej uczyć się pracy w nowych miejscach i przy więcej niż jednym zadaniu.</w:t>
       </w:r>
     </w:p>
     <w:permEnd w:id="301016009"/>
@@ -5436,7 +5436,7 @@
           <w:rFonts w:cstheme="minorHAnsi"/>
           <w:lang w:val="en-US"/>
         </w:rPr>
-        <w:t xml:space="preserve">Artificial intelligence is increasingly moving beyond computer screens into physical systems, such as robots that move around buildings or carry objects. Deep learning models that control such robots need a huge number of examples, which are slow, costly and sometimes unsafe to collect in the real world. Therefore, such models are usually trained in simulation, and increasingly in digital twins, that is, virtual copies of real places rebuilt from recordings of those places. Such a copy is never perfect, however. For example, a glass door or a reflection in a mirror may be rebuilt incorrectly and mislead the robot. As a result, a model that works well in simulation often fails in reality, especially in places it has not seen before. This remains one of the main obstacles to the wider use of physical artificial intelligence. The goal of the dissertation is to improve the generalization of deep learning models trained in digital twins, i.e., their ability to work correctly in conditions different from those they were trained in, and in particular in reality. The research will first establish which differences between simulation and reality actually harm the model, and at which stage of processing inside the model they turn into errors. On this basis, methods will be developed that teach the model to ignore irrelevant differences and to practise more where the digital twin is least accurate, together with methods that choose the few real examples that best correct both the model and the digital twin. The methods will be examined on two equal tasks, robot navigation and robotic manipulation, i.e., grasping and moving objects on a table, in environments that were not used during training. The results obtained in simulation will be compared with published results of real robots and, where possible, also checked on a real robot. It will also be checked whether an improvement obtained in one task carries over to the other. The dissertation is expected to bring a better understanding of why models trained in simulation fail in reality, as well as methods that allow robots to learn to work in new places and on more than one task faster, more cheaply and more safely.</w:t>
+        <w:t xml:space="preserve">Artificial intelligence is increasingly used in physical systems, such as robots that move around buildings or carry objects. The deep learning models that control them need a huge number of examples, and collecting these in the real world is slow, costly and sometimes unsafe. Such models are therefore usually trained in simulation, and increasingly in digital twins, that is, virtual copies of real places rebuilt from recordings of those places. Such a copy is never perfect, however. For example, a glass door or a reflection in a mirror may be rebuilt incorrectly and mislead the robot. As a result, a model that works well in simulation often fails in reality, especially in places it has not seen before. This is one of the main obstacles to wider use of physical artificial intelligence. The goal of the dissertation is to improve the generalization of deep learning models trained in digital twins. Generalization here means the ability to work correctly in conditions different from those the model was trained in, and in particular in reality. The research will first establish which differences between simulation and reality actually harm the model, and at which stage of processing inside the model they turn into errors. On this basis, methods will be developed that teach the model to ignore irrelevant differences and to practise more where the digital twin is least accurate. Methods will also be developed for choosing the few real examples that best correct both the model and the digital twin. The methods will be tested on two tasks of equal weight, robot navigation and robotic manipulation (grasping and moving objects on a table), in environments that were not used during training. The results obtained in simulation will be compared with published results of real robots and, where possible, also checked on a real robot. The research will also check whether an improvement obtained in one task carries over to the other. The expected outcome of the dissertation is a better understanding of why models trained in simulation fail in reality, and methods that let robots learn to work in new places and on more than one task faster, more cheaply and more safely.</w:t>
       </w:r>
     </w:p>
     <w:permEnd w:id="305530072"/>

</xml_diff>

<commit_message>
§3: semesters 1-2 clean (courses, choosing area, IPB); research starts in semester 3
Co-Authored-By: Claude Opus 5.5 <noreply@anthropic.com>
</commit_message>
<xml_diff>
--- a/output/IPB_Grzegorz_Piotrowski.docx
+++ b/output/IPB_Grzegorz_Piotrowski.docx
@@ -1796,7 +1796,7 @@
                 <w:rFonts w:cstheme="minorHAnsi"/>
                 <w:lang w:val="en-US"/>
               </w:rPr>
-              <w:t xml:space="preserve">1. Literature review covering sim-to-real transfer, domain randomization and domain adaptation, neural scene reconstruction from real data (such as 3D Gaussian Splatting) and deep learning for robot navigation and manipulation.</w:t>
+              <w:t xml:space="preserve">1. Participation in the Doctoral School courses.</w:t>
             </w:r>
           </w:p>
           <w:p>
@@ -1809,33 +1809,7 @@
                 <w:rFonts w:cstheme="minorHAnsi"/>
                 <w:lang w:val="en-US"/>
               </w:rPr>
-              <w:t xml:space="preserve">2. Identification of the most important research gaps in the generalization of deep learning models trained in simulations built from real data.</w:t>
-            </w:r>
-          </w:p>
-          <w:p>
-            <w:pPr>
-              <w:spacing w:after="40" w:line="240" w:lineRule="auto"/>
-              <w:jc w:val="left"/>
-            </w:pPr>
-            <w:r>
-              <w:rPr>
-                <w:rFonts w:cstheme="minorHAnsi"/>
-                <w:lang w:val="en-US"/>
-              </w:rPr>
-              <w:t xml:space="preserve">3. Extending theoretical knowledge needed for further work on the PhD thesis, including machine learning theory and learning under distribution shift.</w:t>
-            </w:r>
-          </w:p>
-          <w:p>
-            <w:pPr>
-              <w:spacing w:after="40" w:line="240" w:lineRule="auto"/>
-              <w:jc w:val="left"/>
-            </w:pPr>
-            <w:r>
-              <w:rPr>
-                <w:rFonts w:cstheme="minorHAnsi"/>
-                <w:lang w:val="en-US"/>
-              </w:rPr>
-              <w:t xml:space="preserve">4. Participation in the Doctoral School courses.</w:t>
+              <w:t xml:space="preserve">2. Getting acquainted with the research carried out in the Department of Artificial Intelligence and choosing the research area together with the supervisor.</w:t>
             </w:r>
             <w:permEnd w:id="717358524"/>
           </w:p>
@@ -1896,7 +1870,7 @@
                 <w:rFonts w:cstheme="minorHAnsi"/>
                 <w:lang w:val="en-US"/>
               </w:rPr>
-              <w:t xml:space="preserve">1. Continuation of the literature review, including participation in the internal reading group that discusses new methods of sim-to-real transfer and physical AI.</w:t>
+              <w:t xml:space="preserve">1. Participation in the Doctoral School courses.</w:t>
             </w:r>
           </w:p>
           <w:p>
@@ -1909,33 +1883,7 @@
                 <w:rFonts w:cstheme="minorHAnsi"/>
                 <w:lang w:val="en-US"/>
               </w:rPr>
-              <w:t xml:space="preserve">2. Pilot experiments on reconstructing real scenes with 3D Gaussian Splatting and importing them into navigation and manipulation simulators, addressing the gaps identified in the literature review.</w:t>
-            </w:r>
-          </w:p>
-          <w:p>
-            <w:pPr>
-              <w:spacing w:after="40" w:line="240" w:lineRule="auto"/>
-              <w:jc w:val="left"/>
-            </w:pPr>
-            <w:r>
-              <w:rPr>
-                <w:rFonts w:cstheme="minorHAnsi"/>
-                <w:lang w:val="en-US"/>
-              </w:rPr>
-              <w:t xml:space="preserve">3. Specifying the Individual Research Plan.</w:t>
-            </w:r>
-          </w:p>
-          <w:p>
-            <w:pPr>
-              <w:spacing w:after="40" w:line="240" w:lineRule="auto"/>
-              <w:jc w:val="left"/>
-            </w:pPr>
-            <w:r>
-              <w:rPr>
-                <w:rFonts w:cstheme="minorHAnsi"/>
-                <w:lang w:val="en-US"/>
-              </w:rPr>
-              <w:t xml:space="preserve">4. Participation in the Doctoral School courses.</w:t>
+              <w:t xml:space="preserve">2. Specifying the topic of the doctoral dissertation and preparing the Individual Research Plan.</w:t>
             </w:r>
             <w:permEnd w:id="1791499248"/>
           </w:p>
@@ -1996,7 +1944,7 @@
                 <w:rFonts w:cstheme="minorHAnsi"/>
                 <w:lang w:val="en-US"/>
               </w:rPr>
-              <w:t xml:space="preserve">1. Continuation of the literature review, including participation in the internal reading group that discusses new methods of sim-to-real transfer and physical AI.</w:t>
+              <w:t xml:space="preserve">1. Literature review covering sim-to-real transfer, domain randomization and domain adaptation, neural scene reconstruction from real data (such as 3D Gaussian Splatting) and deep learning for robot navigation and manipulation, including participation in the internal reading group.</w:t>
             </w:r>
           </w:p>
           <w:p>
@@ -2009,7 +1957,7 @@
                 <w:rFonts w:cstheme="minorHAnsi"/>
                 <w:lang w:val="en-US"/>
               </w:rPr>
-              <w:t xml:space="preserve">2. Preparation of the research environment for robot navigation and robotic manipulation, with shared reconstruction tools and computing resources. For navigation, it includes real scene captures, digital twins in a navigation simulator and a dataset-based proxy that measures the reconstruction-fidelity gap. For manipulation, it includes digital twins of real tabletop scenes in a manipulation simulator, built from images of public robot datasets and own captures and paired with published real-robot results of the same policies.</w:t>
+              <w:t xml:space="preserve">2. Identification of the most important research gaps in the generalization of deep learning models trained in simulations built from real data.</w:t>
             </w:r>
           </w:p>
           <w:p>
@@ -2022,7 +1970,20 @@
                 <w:rFonts w:cstheme="minorHAnsi"/>
                 <w:lang w:val="en-US"/>
               </w:rPr>
-              <w:t xml:space="preserve">3. Research on which reconstruction errors of a digital twin, which vary across a scene, determine the generalization of navigation and manipulation models trained in it.</w:t>
+              <w:t xml:space="preserve">3. Preparation of the research environment for robot navigation and robotic manipulation, with shared reconstruction tools and computing resources. For navigation, it includes real scene captures, digital twins in a navigation simulator and a dataset-based proxy that measures the reconstruction-fidelity gap. For manipulation, it includes digital twins of real tabletop scenes built from images of public robot datasets and paired with published real-robot results of the same policies.</w:t>
+            </w:r>
+          </w:p>
+          <w:p>
+            <w:pPr>
+              <w:spacing w:after="40" w:line="240" w:lineRule="auto"/>
+              <w:jc w:val="left"/>
+            </w:pPr>
+            <w:r>
+              <w:rPr>
+                <w:rFonts w:cstheme="minorHAnsi"/>
+                <w:lang w:val="en-US"/>
+              </w:rPr>
+              <w:t xml:space="preserve">4. Starting the research on which reconstruction errors of a digital twin, which vary across a scene, determine the generalization of navigation and manipulation models trained in it.</w:t>
             </w:r>
             <w:permEnd w:id="1413760106"/>
           </w:p>

</xml_diff>

<commit_message>
Year 2: target a robotics/physical-AI venue (e.g. ICRA 2028 or IEEE RA-L, Sep 2027) instead of NeurIPS 2027; §11, §9 and PL copy updated
Co-Authored-By: Claude Opus 5.5 <noreply@anthropic.com>
</commit_message>
<xml_diff>
--- a/output/IPB_Grzegorz_Piotrowski.docx
+++ b/output/IPB_Grzegorz_Piotrowski.docx
@@ -2070,7 +2070,7 @@
                 <w:rFonts w:cstheme="minorHAnsi"/>
                 <w:lang w:val="en-US"/>
               </w:rPr>
-              <w:t xml:space="preserve">3. Writing a scientific article for a conference from the ministerial list on the reconstruction errors that determine generalization in navigation and manipulation, planned for submission to e.g. NeurIPS 2027.</w:t>
+              <w:t xml:space="preserve">3. Writing a scientific article for a conference from the ministerial list on the reconstruction errors that determine generalization in navigation and manipulation, planned for submission to a robotics conference or journal from the ministerial list focused on physical AI, e.g. ICRA 2028 or IEEE Robotics and Automation Letters (RA-L).</w:t>
             </w:r>
           </w:p>
           <w:p>
@@ -5073,7 +5073,7 @@
           <w:rFonts w:cstheme="minorHAnsi"/>
           <w:lang w:val="en-US"/>
         </w:rPr>
-        <w:t xml:space="preserve">Experiments will be implemented mainly in Python with PyTorch, with source code managed in Git, and run on GPU clusters of the Department, WCSS and PLGrid. Code and data will be released whenever licences allow, following open science standards. The findings will be published at leading conferences from the ministerial list, such as NeurIPS, ICML, ICLR, CVPR and RSS, and presented at smaller venues such as MLinPL.</w:t>
+        <w:t xml:space="preserve">Experiments will be implemented mainly in Python with PyTorch, with source code managed in Git, and run on GPU clusters of the Department, WCSS and PLGrid. Code and data will be released whenever licences allow, following open science standards. The findings will be published at leading conferences from the ministerial list, such as ICRA, IROS, RSS and IEEE RA-L, as well as NeurIPS, ICML, ICLR and CVPR, and presented at smaller venues such as MLinPL.</w:t>
       </w:r>
     </w:p>
     <w:permEnd w:id="32011344"/>
@@ -5774,7 +5774,7 @@
           <w:rFonts w:cstheme="minorHAnsi"/>
           <w:lang w:val="en-US"/>
         </w:rPr>
-        <w:t xml:space="preserve">May 2027 (planned submission to the NeurIPS 2027 conference, 200 points on the ministerial list).</w:t>
+        <w:t xml:space="preserve">September 2027 (planned submission to a robotics conference or journal from the ministerial list, e.g. ICRA 2028 or IEEE Robotics and Automation Letters).</w:t>
       </w:r>
     </w:p>
     <w:permEnd w:id="641100817"/>

</xml_diff>

<commit_message>
Expand abbreviated anglicisms: sim-to-real -> simulation-to-reality, real-to-sim-to-real -> real-to-simulation-to-real (EN); Polish equivalents in PL copy
Co-Authored-By: Claude Opus 5.5 <noreply@anthropic.com>
</commit_message>
<xml_diff>
--- a/output/IPB_Grzegorz_Piotrowski.docx
+++ b/output/IPB_Grzegorz_Piotrowski.docx
@@ -1090,7 +1090,7 @@
           <w:rFonts w:cstheme="minorHAnsi"/>
           <w:lang w:val="en-US"/>
         </w:rPr>
-        <w:t xml:space="preserve">Poprawa zdolności generalizacji modeli uczenia głębokiego w transferze rzeczywistość–symulacja–rzeczywistość dla fizycznej sztucznej inteligencji / Improving the generalization of deep learning models in real-to-sim-to-real transfer for physical AI</w:t>
+        <w:t xml:space="preserve">Poprawa zdolności generalizacji modeli uczenia głębokiego w transferze rzeczywistość–symulacja–rzeczywistość dla fizycznej sztucznej inteligencji / Improving the generalization of deep learning models in real-to-simulation-to-real transfer for physical AI</w:t>
       </w:r>
       <w:bookmarkStart w:id="0" w:name="_Hlk95566638"/>
     </w:p>
@@ -1944,7 +1944,7 @@
                 <w:rFonts w:cstheme="minorHAnsi"/>
                 <w:lang w:val="en-US"/>
               </w:rPr>
-              <w:t xml:space="preserve">1. Literature review covering sim-to-real transfer, domain randomization and domain adaptation, neural scene reconstruction from real data (such as 3D Gaussian Splatting) and deep learning for robot navigation and manipulation, including participation in the internal reading group.</w:t>
+              <w:t xml:space="preserve">1. Literature review covering simulation-to-reality transfer, domain randomization and domain adaptation, neural scene reconstruction from real data (such as 3D Gaussian Splatting) and deep learning for robot navigation and manipulation, including participation in the internal reading group.</w:t>
             </w:r>
           </w:p>
           <w:p>
@@ -2044,7 +2044,7 @@
                 <w:rFonts w:cstheme="minorHAnsi"/>
                 <w:lang w:val="en-US"/>
               </w:rPr>
-              <w:t xml:space="preserve">1. Continuation of the literature review, including participation in the internal reading group that discusses new methods of sim-to-real transfer and physical AI.</w:t>
+              <w:t xml:space="preserve">1. Continuation of the literature review, including participation in the internal reading group that discusses new methods of simulation-to-reality transfer and physical AI.</w:t>
             </w:r>
           </w:p>
           <w:p>
@@ -2083,7 +2083,7 @@
                 <w:rFonts w:cstheme="minorHAnsi"/>
                 <w:lang w:val="en-US"/>
               </w:rPr>
-              <w:t xml:space="preserve">4. Starting the research on localizing the sim-to-real gap inside navigation and manipulation models, with first results on the stage at which task information is lost on real inputs.</w:t>
+              <w:t xml:space="preserve">4. Starting the research on localizing the simulation-to-reality gap inside navigation and manipulation models, with first results on the stage at which task information is lost on real inputs.</w:t>
             </w:r>
           </w:p>
           <w:p>
@@ -2171,7 +2171,7 @@
                 <w:rFonts w:cstheme="minorHAnsi"/>
                 <w:lang w:val="en-US"/>
               </w:rPr>
-              <w:t xml:space="preserve">1. Continuation of the literature review, including participation in the internal reading group that discusses new methods of sim-to-real transfer and physical AI.</w:t>
+              <w:t xml:space="preserve">1. Continuation of the literature review, including participation in the internal reading group that discusses new methods of simulation-to-reality transfer and physical AI.</w:t>
             </w:r>
           </w:p>
           <w:p>
@@ -2184,7 +2184,7 @@
                 <w:rFonts w:cstheme="minorHAnsi"/>
                 <w:lang w:val="en-US"/>
               </w:rPr>
-              <w:t xml:space="preserve">2. Finishing the research on localizing the sim-to-real gap inside the models of both tasks and on aligning representations at that stage.</w:t>
+              <w:t xml:space="preserve">2. Finishing the research on localizing the simulation-to-reality gap inside the models of both tasks and on aligning representations at that stage.</w:t>
             </w:r>
           </w:p>
           <w:p>
@@ -2197,7 +2197,7 @@
                 <w:rFonts w:cstheme="minorHAnsi"/>
                 <w:lang w:val="en-US"/>
               </w:rPr>
-              <w:t xml:space="preserve">3. Writing a scientific article for a conference from the ministerial list on localizing the sim-to-real gap inside deep models, e.g. ICML 2028 or CVPR 2028.</w:t>
+              <w:t xml:space="preserve">3. Writing a scientific article for a conference from the ministerial list on localizing the simulation-to-reality gap inside deep models, e.g. ICML 2028 or CVPR 2028.</w:t>
             </w:r>
           </w:p>
           <w:p>
@@ -2285,7 +2285,7 @@
                 <w:rFonts w:cstheme="minorHAnsi"/>
                 <w:lang w:val="en-US"/>
               </w:rPr>
-              <w:t xml:space="preserve">1. Continuation of the literature review, including participation in the internal reading group that discusses new methods of sim-to-real transfer and physical AI.</w:t>
+              <w:t xml:space="preserve">1. Continuation of the literature review, including participation in the internal reading group that discusses new methods of simulation-to-reality transfer and physical AI.</w:t>
             </w:r>
           </w:p>
           <w:p>
@@ -2399,7 +2399,7 @@
                 <w:rFonts w:cstheme="minorHAnsi"/>
                 <w:lang w:val="en-US"/>
               </w:rPr>
-              <w:t xml:space="preserve">1. Continuation of the literature review, including participation in the internal reading group that discusses new methods of sim-to-real transfer and physical AI.</w:t>
+              <w:t xml:space="preserve">1. Continuation of the literature review, including participation in the internal reading group that discusses new methods of simulation-to-reality transfer and physical AI.</w:t>
             </w:r>
           </w:p>
           <w:p>
@@ -3189,7 +3189,7 @@
           <w:rFonts w:cstheme="minorHAnsi"/>
           <w:lang w:val="en-US"/>
         </w:rPr>
-        <w:t xml:space="preserve">Deep learning has made great progress in computer vision and natural language processing, largely thanks to vast amounts of data collected from the web. Physical AI, i.e., AI in robots and other embodied systems that perceive and act in the real world, cannot rely on such data. Its models need interaction data, which are slow, expensive and sometimes unsafe to collect with real robots, so they are commonly trained in simulation. Recently, digital twins, i.e., simulations built from real data, have become a promising alternative to hand-crafted simulators. Neural scene reconstruction methods, such as 3D Gaussian Splatting, turn a short recording of a real place into a photorealistic digital twin in which a model can be trained at scale. Real data are turned into a simulation, a model is trained there and then transferred back to reality, which forms a real-to-sim-to-real loop.</w:t>
+        <w:t xml:space="preserve">Deep learning has made great progress in computer vision and natural language processing, largely thanks to vast amounts of data collected from the web. Physical AI, i.e., AI in robots and other embodied systems that perceive and act in the real world, cannot rely on such data. Its models need interaction data, which are slow, expensive and sometimes unsafe to collect with real robots, so they are commonly trained in simulation. Recently, digital twins, i.e., simulations built from real data, have become a promising alternative to hand-crafted simulators. Neural scene reconstruction methods, such as 3D Gaussian Splatting, turn a short recording of a real place into a photorealistic digital twin in which a model can be trained at scale. Real data are turned into a simulation, a model is trained there and then transferred back to reality, which forms a real-to-simulation-to-real loop.</w:t>
       </w:r>
     </w:p>
     <w:p>
@@ -3202,7 +3202,7 @@
           <w:rFonts w:cstheme="minorHAnsi"/>
           <w:lang w:val="en-US"/>
         </w:rPr>
-        <w:t xml:space="preserve">However, the value of this loop depends on how well the trained models generalize. A model that performs well in simulation often fails in reality, since no simulation reproduces the real world exactly: appearance, geometry, lighting and physics are only approximated, and reconstruction errors differ between regions of a scene. The resulting drop in performance is called the sim-to-real gap. It is caused by the shift between the distributions of simulated and real data, so it is a particular case of learning under distribution shift and one of the main obstacles to physical AI. The methods proposed so far have several limitations. Domain randomization, even when fitted to real data, varies a few global parameters regardless of where the simulation is inaccurate, and invariant representations may discard information needed for the task. Moreover, the few real data used for adaptation usually correct either the model or the simulation, but not both. Finally, most methods are evaluated on a single task and a few scenes, and it is not known which properties of the digital twin and of the learned representations determine whether a model generalizes to reality.</w:t>
+        <w:t xml:space="preserve">However, the value of this loop depends on how well the trained models generalize. A model that performs well in simulation often fails in reality, since no simulation reproduces the real world exactly: appearance, geometry, lighting and physics are only approximated, and reconstruction errors differ between regions of a scene. The resulting drop in performance is called the simulation-to-reality gap. It is caused by the shift between the distributions of simulated and real data, so it is a particular case of learning under distribution shift and one of the main obstacles to physical AI. The methods proposed so far have several limitations. Domain randomization, even when fitted to real data, varies a few global parameters regardless of where the simulation is inaccurate, and invariant representations may discard information needed for the task. Moreover, the few real data used for adaptation usually correct either the model or the simulation, but not both. Finally, most methods are evaluated on a single task and a few scenes, and it is not known which properties of the digital twin and of the learned representations determine whether a model generalizes to reality.</w:t>
       </w:r>
     </w:p>
     <w:p>
@@ -3215,7 +3215,7 @@
           <w:rFonts w:cstheme="minorHAnsi"/>
           <w:lang w:val="en-US"/>
         </w:rPr>
-        <w:t xml:space="preserve">Therefore, the dissertation aims to improve the generalization of deep learning models in real-to-sim-to-real transfer at the points of the loop where the sim-to-real gap arises. The research shall focus on understanding which reconstruction errors of a digital twin are harmful to generalization, on localizing where inside a model the gap arises and reducing it there, and on choosing the small amount of real data that corrects both the digital twin and the model most efficiently. It shall also verify whether the obtained improvements carry over to unseen environments and from one physical task to another, and which properties of the shift explain when they do. The methods shall not be tied to a particular task; robot navigation and robotic manipulation are planned as two equal testbeds. For navigation, public recordings of real scenes, in which a second, independent capture measures the reconstruction-fidelity gap, shall be complemented by a real robot, which provides the main evidence for differences in actuation and sensors. For manipulation, digital twins of real tabletop scenes shall be built from images of public robot datasets and compared with published real-robot results of the same policies. Apart from more reliable models, the research could help explain why models trained on synthetic data succeed or fail on real data, which is relevant to machine learning in general.</w:t>
+        <w:t xml:space="preserve">Therefore, the dissertation aims to improve the generalization of deep learning models in real-to-simulation-to-real transfer at the points of the loop where the simulation-to-reality gap arises. The research shall focus on understanding which reconstruction errors of a digital twin are harmful to generalization, on localizing where inside a model the gap arises and reducing it there, and on choosing the small amount of real data that corrects both the digital twin and the model most efficiently. It shall also verify whether the obtained improvements carry over to unseen environments and from one physical task to another, and which properties of the shift explain when they do. The methods shall not be tied to a particular task; robot navigation and robotic manipulation are planned as two equal testbeds. For navigation, public recordings of real scenes, in which a second, independent capture measures the reconstruction-fidelity gap, shall be complemented by a real robot, which provides the main evidence for differences in actuation and sensors. For manipulation, digital twins of real tabletop scenes shall be built from images of public robot datasets and compared with published real-robot results of the same policies. Apart from more reliable models, the research could help explain why models trained on synthetic data succeed or fail on real data, which is relevant to machine learning in general.</w:t>
       </w:r>
     </w:p>
     <w:p>
@@ -3598,7 +3598,7 @@
           <w:rFonts w:cstheme="minorHAnsi"/>
           <w:lang w:val="en-US"/>
         </w:rPr>
-        <w:t xml:space="preserve">Deep learning models for navigation and manipulation need more experience than real robots can provide, so they are usually trained in simulation. However, performance in simulation can poorly predict real-world performance unless the simulator is carefully tuned [1]. The sim-to-real gap is a case of learning under distribution shift. Domain adaptation theory bounds the error of a model on the target domain by its error on the source domain, the discrepancy between the two distributions, and the joint error of the best single model on both domains [2]. Taken only as motivation, the bound suggests making the training distribution cover reality, making the model insensitive to the remaining discrepancy and, since invariance cannot reduce the joint error, correcting the simulation towards reality.</w:t>
+        <w:t xml:space="preserve">Deep learning models for navigation and manipulation need more experience than real robots can provide, so they are usually trained in simulation. However, performance in simulation can poorly predict real-world performance unless the simulator is carefully tuned [1]. The simulation-to-reality gap is a case of learning under distribution shift. Domain adaptation theory bounds the error of a model on the target domain by its error on the source domain, the discrepancy between the two distributions, and the joint error of the best single model on both domains [2]. Taken only as motivation, the bound suggests making the training distribution cover reality, making the model insensitive to the remaining discrepancy and, since invariance cannot reduce the joint error, correcting the simulation towards reality.</w:t>
       </w:r>
     </w:p>
     <w:p>
@@ -3624,7 +3624,7 @@
           <w:rFonts w:cstheme="minorHAnsi"/>
           <w:lang w:val="en-US"/>
         </w:rPr>
-        <w:t xml:space="preserve">Invariance is another option. Domain-adversarial training aligns features across domains [6]. In robotics, aligning the joint distributions of observations and actions in simulated and real data improved co-trained policies, i.e., models that map observations to actions, in reality [7]. However, invariance with low source error does not guarantee transfer, as it can increase the joint error term [8], and full invariance may discard task information. Effective sim-and-real co-training aligns the two domains while keeping them distinguishable [9], so domain separability alone does not show where the gap harms the task. Invariance is also usually enforced at a fixed location, the input or the final features.</w:t>
+        <w:t xml:space="preserve">Invariance is another option. Domain-adversarial training aligns features across domains [6]. In robotics, aligning the joint distributions of observations and actions in simulated and real data improved co-trained policies, i.e., models that map observations to actions, in reality [7]. However, invariance with low source error does not guarantee transfer, as it can increase the joint error term [8], and full invariance may discard task information. Effective simulation-and-real co-training aligns the two domains while keeping them distinguishable [9], so domain separability alone does not show where the gap harms the task. Invariance is also usually enforced at a fixed location, the input or the final features.</w:t>
       </w:r>
     </w:p>
     <w:p>
@@ -4313,7 +4313,7 @@
           <w:b/>
           <w:lang w:val="en-US"/>
         </w:rPr>
-        <w:t xml:space="preserve">Where inside a model trained in simulation does the sim-to-real gap arise, and can aligning representations at that stage reduce it?</w:t>
+        <w:t xml:space="preserve">Where inside a model trained in simulation does the simulation-to-reality gap arise, and can aligning representations at that stage reduce it?</w:t>
       </w:r>
       <w:r>
         <w:rPr>
@@ -4703,7 +4703,7 @@
           <w:rFonts w:cstheme="minorHAnsi"/>
           <w:lang w:val="en-US"/>
         </w:rPr>
-        <w:t xml:space="preserve">The proposed PhD dissertation aims to contribute to the development of the scientific discipline by addressing the generalization of deep learning models trained in simulations built from real data, which remains one of the main obstacles to applying machine learning in physical AI. The working assumption of the dissertation is that the sim-to-real gap is caused mainly by a limited set of task-relevant discrepancies. These may be identified among the reconstruction errors of a digital twin, localized inside the model, and reduced with a small amount of well-chosen real data. The methods are intended to be general, i.e., not tied to a particular robot, scene or task, and will be examined on robot navigation and robotic manipulation.</w:t>
+        <w:t xml:space="preserve">The proposed PhD dissertation aims to contribute to the development of the scientific discipline by addressing the generalization of deep learning models trained in simulations built from real data, which remains one of the main obstacles to applying machine learning in physical AI. The working assumption of the dissertation is that the simulation-to-reality gap is caused mainly by a limited set of task-relevant discrepancies. These may be identified among the reconstruction errors of a digital twin, localized inside the model, and reduced with a small amount of well-chosen real data. The methods are intended to be general, i.e., not tied to a particular robot, scene or task, and will be examined on robot navigation and robotic manipulation.</w:t>
       </w:r>
     </w:p>
     <w:p>
@@ -4716,7 +4716,7 @@
           <w:rFonts w:cstheme="minorHAnsi"/>
           <w:lang w:val="en-US"/>
         </w:rPr>
-        <w:t xml:space="preserve">First, the research is intended to provide a better understanding of which reconstruction errors of a digital twin harm generalization, together with a method that varies the twin accordingly rather than uniformly. Second, it aims to develop a way of finding where inside a deep model the sim-to-real gap arises and of reducing it at that stage. Third, it aims to propose a rule for selecting a small amount of real data that corrects both the digital twin and the model. Finally, it will examine when such improvements carry over to unseen environments and between tasks. This knowledge could complement the currently dominant randomization heuristics with more principled and interpretable approaches.</w:t>
+        <w:t xml:space="preserve">First, the research is intended to provide a better understanding of which reconstruction errors of a digital twin harm generalization, together with a method that varies the twin accordingly rather than uniformly. Second, it aims to develop a way of finding where inside a deep model the simulation-to-reality gap arises and of reducing it at that stage. Third, it aims to propose a rule for selecting a small amount of real data that corrects both the digital twin and the model. Finally, it will examine when such improvements carry over to unseen environments and between tasks. This knowledge could complement the currently dominant randomization heuristics with more principled and interpretable approaches.</w:t>
       </w:r>
     </w:p>
     <w:p>
@@ -5060,7 +5060,7 @@
           <w:rFonts w:cstheme="minorHAnsi"/>
           <w:lang w:val="en-US"/>
         </w:rPr>
-        <w:t xml:space="preserve">The evaluation will rely on standard metrics, such as success rate, and on the sim-to-real gap, measured on held-out scenes in both tasks and complemented where possible by open-loop measures on real frames. Methods will be compared with relevant baselines under comparable training effort and real data. Statistical methods will be used to provide reliable outcomes, including repeated runs over seeds and scenes and statistical tests for comparisons, and ablation studies will determine the contribution of individual components. Data for training, model selection and final evaluation will be kept separate. If access allows, selected results will be validated on a real robot in cooperation with a robotics laboratory of the university.</w:t>
+        <w:t xml:space="preserve">The evaluation will rely on standard metrics, such as success rate, and on the simulation-to-reality gap, measured on held-out scenes in both tasks and complemented where possible by open-loop measures on real frames. Methods will be compared with relevant baselines under comparable training effort and real data. Statistical methods will be used to provide reliable outcomes, including repeated runs over seeds and scenes and statistical tests for comparisons, and ablation studies will determine the contribution of individual components. Data for training, model selection and final evaluation will be kept separate. If access allows, selected results will be validated on a real robot in cooperation with a robotics laboratory of the university.</w:t>
       </w:r>
     </w:p>
     <w:p>

</xml_diff>

<commit_message>
Topic in the style of the accepted K46 IPB: 'Representation learning methods for simulation-to-reality generalization of deep learning models in physical AI' (PL/EN); §5 goal aligned
Co-Authored-By: Claude Opus 5.5 <noreply@anthropic.com>
</commit_message>
<xml_diff>
--- a/output/IPB_Grzegorz_Piotrowski.docx
+++ b/output/IPB_Grzegorz_Piotrowski.docx
@@ -1090,7 +1090,7 @@
           <w:rFonts w:cstheme="minorHAnsi"/>
           <w:lang w:val="en-US"/>
         </w:rPr>
-        <w:t xml:space="preserve">Poprawa zdolności generalizacji modeli uczenia głębokiego w transferze rzeczywistość–symulacja–rzeczywistość dla fizycznej sztucznej inteligencji / Improving the generalization of deep learning models in real-to-simulation-to-real transfer for physical AI</w:t>
+        <w:t xml:space="preserve">Metody uczenia reprezentacji dla generalizacji modeli uczenia głębokiego między symulacją a rzeczywistością w fizycznej sztucznej inteligencji / Representation learning methods for simulation-to-reality generalization of deep learning models in physical AI</w:t>
       </w:r>
       <w:bookmarkStart w:id="0" w:name="_Hlk95566638"/>
     </w:p>
@@ -3215,7 +3215,7 @@
           <w:rFonts w:cstheme="minorHAnsi"/>
           <w:lang w:val="en-US"/>
         </w:rPr>
-        <w:t xml:space="preserve">Therefore, the dissertation aims to improve the generalization of deep learning models in real-to-simulation-to-real transfer at the points of the loop where the simulation-to-reality gap arises. The research shall focus on understanding which reconstruction errors of a digital twin are harmful to generalization, on localizing where inside a model the gap arises and reducing it there, and on choosing the small amount of real data that corrects both the digital twin and the model most efficiently. It shall also verify whether the obtained improvements carry over to unseen environments and from one physical task to another, and which properties of the shift explain when they do. The methods shall not be tied to a particular task; robot navigation and robotic manipulation are planned as two equal testbeds. For navigation, public recordings of real scenes, in which a second, independent capture measures the reconstruction-fidelity gap, shall be complemented by a real robot, which provides the main evidence for differences in actuation and sensors. For manipulation, digital twins of real tabletop scenes shall be built from images of public robot datasets and compared with published real-robot results of the same policies. Apart from more reliable models, the research could help explain why models trained on synthetic data succeed or fail on real data, which is relevant to machine learning in general.</w:t>
+        <w:t xml:space="preserve">Therefore, the dissertation aims to improve the generalization of deep learning models in real-to-simulation-to-real transfer with representation learning methods, at the points of the loop where the simulation-to-reality gap arises. The research shall focus on understanding which reconstruction errors of a digital twin are harmful to generalization, on localizing where inside a model the gap arises and reducing it there, and on choosing the small amount of real data that corrects both the digital twin and the model most efficiently. It shall also verify whether the obtained improvements carry over to unseen environments and from one physical task to another, and which properties of the shift explain when they do. The methods shall not be tied to a particular task; robot navigation and robotic manipulation are planned as two equal testbeds. For navigation, public recordings of real scenes, in which a second, independent capture measures the reconstruction-fidelity gap, shall be complemented by a real robot, which provides the main evidence for differences in actuation and sensors. For manipulation, digital twins of real tabletop scenes shall be built from images of public robot datasets and compared with published real-robot results of the same policies. Apart from more reliable models, the research could help explain why models trained on synthetic data succeed or fail on real data, which is relevant to machine learning in general.</w:t>
       </w:r>
     </w:p>
     <w:p>

</xml_diff>

<commit_message>
Wave 27: mechanism-level rewording and citation-audit fixes (ReVeal added, TwinRL-VLA ACM MM, Jin ECCV, joint-error claim corrected, robot role consistent)
Co-Authored-By: Claude Opus 5.5 <noreply@anthropic.com>
</commit_message>
<xml_diff>
--- a/output/IPB_Grzegorz_Piotrowski.docx
+++ b/output/IPB_Grzegorz_Piotrowski.docx
@@ -2057,7 +2057,7 @@
                 <w:rFonts w:cstheme="minorHAnsi"/>
                 <w:lang w:val="en-US"/>
               </w:rPr>
-              <w:t xml:space="preserve">2. Finishing the research on harmful reconstruction errors in both tasks and on randomizing each region of a digital twin according to its reconstruction uncertainty and task relevance.</w:t>
+              <w:t xml:space="preserve">2. Finishing the research on harmful reconstruction errors in both tasks and on randomizing each region of a digital twin according to its estimated reconstruction error and task relevance.</w:t>
             </w:r>
           </w:p>
           <w:p>
@@ -3215,7 +3215,7 @@
           <w:rFonts w:cstheme="minorHAnsi"/>
           <w:lang w:val="en-US"/>
         </w:rPr>
-        <w:t xml:space="preserve">Therefore, the dissertation aims to improve the generalization of deep learning models in real-to-simulation-to-real transfer with representation learning methods, at the points of the loop where the simulation-to-reality gap arises. The research shall focus on understanding which reconstruction errors of a digital twin are harmful to generalization, on localizing where inside a model the gap arises and reducing it there, and on choosing the small amount of real data that corrects both the digital twin and the model most efficiently. It shall also verify whether the obtained improvements carry over to unseen environments and from one physical task to another, and which properties of the shift explain when they do. The methods shall not be tied to a particular task; robot navigation and robotic manipulation are planned as two equal testbeds. For navigation, public recordings of real scenes, in which a second, independent capture measures the reconstruction-fidelity gap, shall be complemented by a real robot, which provides the main evidence for differences in actuation and sensors. For manipulation, digital twins of real tabletop scenes shall be built from images of public robot datasets and compared with published real-robot results of the same policies. Apart from more reliable models, the research could help explain why models trained on synthetic data succeed or fail on real data, which is relevant to machine learning in general.</w:t>
+        <w:t xml:space="preserve">Therefore, the dissertation aims to improve the generalization of deep learning models in real-to-simulation-to-real transfer with methods that analyse and align the models' learned representations, applied at the points of the loop where the simulation-to-reality gap arises. The research shall focus on understanding which reconstruction errors of a digital twin are harmful to generalization, on localizing the stage of a model at which task information is lost on real inputs and reducing the gap there, and on choosing, under a fixed budget, the small amount of real data that best corrects both the digital twin and the model. It shall also verify whether the obtained improvements carry over to unseen environments and from one physical task to another, and whether properties of the shift measured beforehand predict when they do. The methods shall not be tied to a particular task; robot navigation and robotic manipulation are planned as two equal testbeds. For navigation, a second, independent capture in public recordings of real scenes shall measure the reconstruction-fidelity gap, and, if access allows, a real robot shall check the direction of the results and the validity of this proxy. For manipulation, digital twins of real tabletop scenes shall be built from images of public robot datasets and compared with published real-robot results of the same policies. Apart from more reliable models, the research could help explain why models trained on synthetic data succeed or fail on real data, which is relevant to machine learning in general.</w:t>
       </w:r>
     </w:p>
     <w:p>
@@ -3598,7 +3598,7 @@
           <w:rFonts w:cstheme="minorHAnsi"/>
           <w:lang w:val="en-US"/>
         </w:rPr>
-        <w:t xml:space="preserve">Deep learning models for navigation and manipulation need more experience than real robots can provide, so they are usually trained in simulation. However, performance in simulation can poorly predict real-world performance unless the simulator is carefully tuned [1]. The simulation-to-reality gap is a case of learning under distribution shift. Domain adaptation theory bounds the error of a model on the target domain by its error on the source domain, the discrepancy between the two distributions, and the joint error of the best single model on both domains [2]. Taken only as motivation, the bound suggests making the training distribution cover reality, making the model insensitive to the remaining discrepancy and, since invariance cannot reduce the joint error, correcting the simulation towards reality.</w:t>
+        <w:t xml:space="preserve">Deep learning models for navigation and manipulation need more experience than real robots can provide, so they are usually trained in simulation. However, performance in simulation can poorly predict real-world performance unless the simulator is carefully tuned [1]. The simulation-to-reality gap is a case of learning under distribution shift. Domain adaptation theory bounds the error of a model on the target domain by its error on the source domain, the discrepancy between the two distributions, and the joint error of the best single model on both domains [2]. Taken only as motivation, the bound suggests making the training distribution cover reality, making the model insensitive to the remaining discrepancy and, since invariance does not target the joint error and can even increase it, correcting the simulation towards reality, which can reduce this error directly.</w:t>
       </w:r>
     </w:p>
     <w:p>
@@ -3624,7 +3624,7 @@
           <w:rFonts w:cstheme="minorHAnsi"/>
           <w:lang w:val="en-US"/>
         </w:rPr>
-        <w:t xml:space="preserve">Invariance is another option. Domain-adversarial training aligns features across domains [6]. In robotics, aligning the joint distributions of observations and actions in simulated and real data improved co-trained policies, i.e., models that map observations to actions, in reality [7]. However, invariance with low source error does not guarantee transfer, as it can increase the joint error term [8], and full invariance may discard task information. Effective simulation-and-real co-training aligns the two domains while keeping them distinguishable [9], so domain separability alone does not show where the gap harms the task. Invariance is also usually enforced at a fixed location, the input or the final features.</w:t>
+        <w:t xml:space="preserve">Invariance is another option. Domain-adversarial training aligns features across domains [6]. In robotics, aligning the joint distributions of observations and actions in simulated and real data improved co-trained policies, i.e., models that map observations to actions, in reality [7]. However, invariance with low source error does not guarantee transfer, as it can increase the joint error term when the label distributions, here the actions, differ between domains [8], and full invariance may discard task information. Effective simulation-and-real co-training aligns the two domains while keeping them distinguishable [9], so domain separability alone does not show where the gap harms the task. Invariance is also usually enforced at locations chosen in advance, such as the input, the final features or fixed layers, rather than where the gap is measured to arise.</w:t>
       </w:r>
     </w:p>
     <w:p>
@@ -3637,7 +3637,7 @@
           <w:rFonts w:cstheme="minorHAnsi"/>
           <w:lang w:val="en-US"/>
         </w:rPr>
-        <w:t xml:space="preserve">Digital twins are a more recent approach. 3D Gaussian Splatting [10] reconstructs photorealistic scenes from ordinary images. In manipulation, twins have been used to train policies from a scan of the target scene [11], to transfer image-based policies to reality without real data [12] and to guide real-world reinforcement learning from a phone capture [13]. Paired simulated and real evaluations showed that scenes visually matched to real images of two robot setups track the real-world performance of the same policies [14]. In navigation, policies have been trained in twins built from a phone capture of a room [15] and from a monocular video of urban scenes [16]. The effect of simulation factors has been studied mainly globally, e.g., randomization, photorealism and physics realism in real-world manipulation [17], or task-relevant fidelity in robotic ultrasound [18]. For both tasks it remains open which reconstruction errors that vary across a scene harm generalization, and how training variation should follow the reconstruction uncertainty of each region.</w:t>
+        <w:t xml:space="preserve">Digital twins are more recent. 3D Gaussian Splatting [10] reconstructs photorealistic scenes from multi-view photographs. In manipulation, twins have been used to train policies from a scan of the target scene [11], to transfer image-based policies to reality without real-world demonstrations [12] and to guide real-world reinforcement learning from a phone capture [13]. Paired simulated and real evaluations showed that scenes matched to real images and controllers of two robot setups track the real-world performance of the same policies [14]. In navigation, policies have been fine-tuned in twins built from a phone capture of a room [15] and trained in twins from monocular urban videos [16]. The effect of simulation factors has been studied mainly globally, e.g., randomization, photorealism and physics realism in real manipulation [17]. For whole workspaces, pretrained feature similarity between rendered and real views predicted the agreement of simulated and real performance better than LPIPS or PSNR [18]. For both tasks it remains open which reconstruction errors that vary across a scene harm generalization, and how training variation should follow the reconstruction error and task relevance of each region.</w:t>
       </w:r>
     </w:p>
     <w:p>
@@ -3650,7 +3650,7 @@
           <w:rFonts w:cstheme="minorHAnsi"/>
           <w:lang w:val="en-US"/>
         </w:rPr>
-        <w:t xml:space="preserve">It is also unclear where inside a model the gap arises. Probing, i.e., reading out information from hidden states with simple classifiers, showed that action fine-tuning degrades the visual representations of robot policies [19], and the best layers to adapt depend on the type of shift [20]. In models trained in twins, the stage at which task information available in simulation stops being recoverable from real inputs has not been located.</w:t>
+        <w:t xml:space="preserve">It is also unclear where inside a model the gap arises. Probing, i.e., reading out information from hidden states with simple classifiers, showed that action fine-tuning degrades the visual representations of vision-language-action models [19]. Separately, fine-tuning selected layers showed that the best layers to adapt depend on the type of shift [20]. To our knowledge, in models trained in twins, the stage at which task information available in simulation stops being recoverable from real inputs has not been located.</w:t>
       </w:r>
     </w:p>
     <w:p>
@@ -3663,7 +3663,7 @@
           <w:rFonts w:cstheme="minorHAnsi"/>
           <w:lang w:val="en-US"/>
         </w:rPr>
-        <w:t xml:space="preserve">The remaining gap is usually reduced with little real data. Co-training with a small real set yields large gains [21], and active system identification collects the real trajectories most informative about physics [22]. The closest work uses a twin to find failure-prone configurations for real rollouts [13]. These methods correct either the model or the simulation. To our knowledge, correcting both from the same selected data, guided by the twin's reconstruction uncertainty, has not been studied.</w:t>
+        <w:t xml:space="preserve">The remaining gap is reduced with little real data. Co-training with a small real set yields large gains [21], and active system identification designs, in simulation, an exploration policy whose real trajectory is most informative about physical parameters [22]. The closest work uses a twin to find failure-prone configurations for real rollouts [13]. They use the selected real data to correct either the model or the simulation. To our knowledge, correcting both from the same selected data has not been studied.</w:t>
       </w:r>
     </w:p>
     <w:p>
@@ -3676,7 +3676,7 @@
           <w:rFonts w:cstheme="minorHAnsi"/>
           <w:lang w:val="en-US"/>
         </w:rPr>
-        <w:t xml:space="preserve">Finally, the gap can be decomposed into factors of variation whose difficulty ordering is largely consistent between simulation and reality [23]. It is rarely tested whether measurements taken before a method is applied predict, better than simple indicators such as the size of the gap, whether its benefit carries over to a new scene or to another task.</w:t>
+        <w:t xml:space="preserve">The gap can also be decomposed into factors of variation whose difficulty ordering is largely consistent between simulation and reality [23]. It is rarely tested whether measurements taken before a method is applied predict, better than simple indicators such as the size of the gap, whether its benefit carries over to a new scene or to another task.</w:t>
       </w:r>
     </w:p>
     <w:p>
@@ -3817,7 +3817,7 @@
           <w:rFonts w:cstheme="minorHAnsi"/>
           <w:lang w:val="en-US"/>
         </w:rPr>
-        <w:t xml:space="preserve">[9] Lei, Y., et al. (2026). A Mechanistic Analysis of Sim-and-Real Co-Training in Generative Robot Policies. arXiv:2604.13645.</w:t>
+        <w:t xml:space="preserve">[9] Lei, Y., et al. (2026). A mechanistic analysis of sim-and-real co-training in generative robot policies. arXiv preprint arXiv:2604.13645.</w:t>
       </w:r>
     </w:p>
     <w:p>
@@ -3873,7 +3873,7 @@
           <w:rFonts w:cstheme="minorHAnsi"/>
           <w:lang w:val="en-US"/>
         </w:rPr>
-        <w:t xml:space="preserve">[13] Xu, Q., et al. (2026). TwinRL: Digital twin-driven reinforcement learning for real-world robotic manipulation. arXiv:2602.09023.</w:t>
+        <w:t xml:space="preserve">[13] Xu, Q., et al. (2026). TwinRL-VLA: Digital twin-driven reinforcement learning for real-world robotic manipulation. ACM MM (arXiv:2602.09023).</w:t>
       </w:r>
     </w:p>
     <w:p>
@@ -3929,7 +3929,7 @@
           <w:rFonts w:cstheme="minorHAnsi"/>
           <w:lang w:val="en-US"/>
         </w:rPr>
-        <w:t xml:space="preserve">[17] Jin, R., et al. (2026). Grounding Sim-to-Real Generalization in Robotic Manipulation: An Empirical Study with Vision-Language-Action Models. arXiv:2603.22876.</w:t>
+        <w:t xml:space="preserve">[17] Jin, R., et al. (2026). Grounding sim-to-real generalization in robotic manipulation: An empirical study with vision-language-action models. ECCV.</w:t>
       </w:r>
     </w:p>
     <w:p>
@@ -3943,7 +3943,7 @@
           <w:rFonts w:cstheme="minorHAnsi"/>
           <w:lang w:val="en-US"/>
         </w:rPr>
-        <w:t xml:space="preserve">[18] Qian, Y., et al. (2026). Task-Relevant Feature-Dynamics Fidelity Enables Zero-Shot Sim-to-Real Transfer for Robotic Ultrasound Scanning. arXiv:2608.29516.</w:t>
+        <w:t xml:space="preserve">[18] Wang, X., et al. (2026). ReVeal: A reconstruction-aware real-to-sim framework for VLA policy evaluation. arXiv preprint arXiv:2609.23910.</w:t>
       </w:r>
     </w:p>
     <w:p>
@@ -4247,7 +4247,7 @@
           <w:rFonts w:cstheme="minorHAnsi"/>
           <w:lang w:val="en-US"/>
         </w:rPr>
-        <w:t xml:space="preserve">The research carried out in the proposed doctoral dissertation is aimed at studying the following research questions, each on two physical AI tasks: robot navigation and robotic manipulation.</w:t>
+        <w:t xml:space="preserve">The research in the proposed doctoral dissertation addresses the following research questions, each on two physical AI tasks: robot navigation and robotic manipulation.</w:t>
       </w:r>
     </w:p>
     <w:p>
@@ -4276,7 +4276,7 @@
           <w:rFonts w:cstheme="minorHAnsi"/>
           <w:lang w:val="en-US"/>
         </w:rPr>
-        <w:t xml:space="preserve"> Domain adaptation theory, used here as motivation, bounds the real-world error of a model by its error in simulation, the discrepancy between the simulated and real distributions, and a joint error term. A digital twin of a room or a tabletop reproduces appearance, geometry and lighting only approximately, and its errors differ between regions of a scene. </w:t>
+        <w:t xml:space="preserve"> Twin errors in appearance, geometry and lighting differ across a scene. </w:t>
       </w:r>
       <w:r>
         <w:rPr>
@@ -4291,7 +4291,7 @@
           <w:rFonts w:cstheme="minorHAnsi"/>
           <w:lang w:val="en-US"/>
         </w:rPr>
-        <w:t xml:space="preserve"> The harm caused by a reconstruction error is predicted better by the change it induces in the representation of a fixed reference model on held-out paired views than by its magnitude in the image or geometry. Separately, randomizing each region in proportion to its reconstruction uncertainty and task relevance yields better generalization than uniform randomization. To test this, the research will replace components of the twin with a more accurate reference and measure the effect. If harm follows error magnitude, this attribution will itself be reported, and the third question will rely on reconstruction uncertainty and action sensitivity only.</w:t>
+        <w:t xml:space="preserve"> The performance drop caused by each type of reconstruction error in a region is predicted better by the feature distance of a fixed pretrained visual encoder between held-out views rendered with and without the error than by the error size in image or geometry, e.g., PSNR, LPIPS or depth error. Separately, randomizing the appearance and geometry of each region with a strength growing with its estimated reconstruction error and task relevance generalizes better than uniform randomization of equal total strength. To test this, one error type at a time will be corrected in selected regions, e.g., geometry from a laser scan, or injected into a high-fidelity reference. If harm follows error size, this will be reported and the third question will rely on reconstruction uncertainty and action sensitivity, although uncertainty misses consistently reproduced errors.</w:t>
       </w:r>
     </w:p>
     <w:p>
@@ -4313,14 +4313,14 @@
           <w:b/>
           <w:lang w:val="en-US"/>
         </w:rPr>
-        <w:t xml:space="preserve">Where inside a model trained in simulation does the simulation-to-reality gap arise, and can aligning representations at that stage reduce it?</w:t>
-      </w:r>
-      <w:r>
-        <w:rPr>
-          <w:rFonts w:cstheme="minorHAnsi"/>
-          <w:lang w:val="en-US"/>
-        </w:rPr>
-        <w:t xml:space="preserve"> Models trained in simulation can rely on features absent in reality, such as reconstruction artifacts. Even in models that transfer well, simulated and real inputs remain distinguishable, so the gap is better localized by the task information the model loses on real inputs. </w:t>
+        <w:t xml:space="preserve">At which stage of a model trained or fine-tuned in a twin do real inputs first lose task information available for simulated inputs, and does aligning representations at that stage reduce the simulation-to-reality gap?</w:t>
+      </w:r>
+      <w:r>
+        <w:rPr>
+          <w:rFonts w:cstheme="minorHAnsi"/>
+          <w:lang w:val="en-US"/>
+        </w:rPr>
+        <w:t xml:space="preserve"> </w:t>
       </w:r>
       <w:r>
         <w:rPr>
@@ -4335,7 +4335,7 @@
           <w:rFonts w:cstheme="minorHAnsi"/>
           <w:lang w:val="en-US"/>
         </w:rPr>
-        <w:t xml:space="preserve"> In both tasks, there is a first stage of the model at which task information that can be decoded from simulated inputs can no longer be decoded from real ones. Aligning simulated and real representations at that stage, from a few paired views, yields better generalization than aligning them at the input, at the final features or everywhere. Probing of hidden states will locate this stage before any intervention.</w:t>
+        <w:t xml:space="preserve"> In both tasks, there is an identifiable earliest stage, or a narrow range of stages, at which a linear probe trained on simulated hidden states loses accuracy on paired real ones well beyond a control-task baseline, and the lost information influences the actions. Fine-tuning the layers up to that stage with a loss matching real to paired simulated representations from a few views reduces the gap more than the same loss at the input, the final features, all stages or layers chosen by existing criteria, under equal data and effort. Probes with control tasks will locate this stage, and patching the probed subspace from simulated into real inputs will test whether the model uses this information.</w:t>
       </w:r>
     </w:p>
     <w:p>
@@ -4357,14 +4357,14 @@
           <w:b/>
           <w:lang w:val="en-US"/>
         </w:rPr>
-        <w:t xml:space="preserve">Which real data, chosen under a limited budget, most efficiently correct both the simulation and the model?</w:t>
-      </w:r>
-      <w:r>
-        <w:rPr>
-          <w:rFonts w:cstheme="minorHAnsi"/>
-          <w:lang w:val="en-US"/>
-        </w:rPr>
-        <w:t xml:space="preserve"> Real data are expensive, and existing methods use them to correct either the model or the simulation. Invariance does not reduce the joint error term, which shrinks only as the simulation gets closer to reality. </w:t>
+        <w:t xml:space="preserve">Which real data, chosen under a fixed budget, most reduce the simulation-to-reality gap when used to correct both the digital twin and the model?</w:t>
+      </w:r>
+      <w:r>
+        <w:rPr>
+          <w:rFonts w:cstheme="minorHAnsi"/>
+          <w:lang w:val="en-US"/>
+        </w:rPr>
+        <w:t xml:space="preserve"> Existing methods correct either the model or the simulation, or both with different, unselected real data. Enforcing invariance does not target the joint error term of the domain adaptation bound and can increase it when simulated and real data require different actions, whereas bringing the simulation closer to reality can reduce it directly. </w:t>
       </w:r>
       <w:r>
         <w:rPr>
@@ -4379,7 +4379,7 @@
           <w:rFonts w:cstheme="minorHAnsi"/>
           <w:lang w:val="en-US"/>
         </w:rPr>
-        <w:t xml:space="preserve"> Correcting both the digital twin and the model from the same selected real data reduces the gap more than correcting either one alone. The data should be selected where the twin is predicted to disagree with reality in task-relevant ways, as estimated from the reconstruction uncertainty, the representation distance between simulated and real views and the sensitivity of the predicted action. Such selection is expected to beat random and failure-driven selection. Selection rules will be compared at equal budgets in both tasks, with unlabelled real images counted as real data.</w:t>
+        <w:t xml:space="preserve"> At an equal budget, using the same selected real data to correct both the twin and the model reduces the gap more than correcting either one alone. Candidate views are scored by the reconstruction uncertainty at their pose, by how much the predicted action changes when the twin is perturbed within it and, if an unlabelled real image is available, by the representation distance between the rendered and the real view. The selection will be compared with random and failure-driven selection over a range of budgets counted in real images for navigation and in real episodes or frames for manipulation, including unlabelled images.</w:t>
       </w:r>
     </w:p>
     <w:p>
@@ -4401,14 +4401,14 @@
           <w:b/>
           <w:lang w:val="en-US"/>
         </w:rPr>
-        <w:t xml:space="preserve">Do the improvements generalize to unseen environments and from one task to the other, and which properties of the shift explain when they do?</w:t>
-      </w:r>
-      <w:r>
-        <w:rPr>
-          <w:rFonts w:cstheme="minorHAnsi"/>
-          <w:lang w:val="en-US"/>
-        </w:rPr>
-        <w:t xml:space="preserve"> A useful method should work beyond a single scene or task. The developed methods shall therefore be applied with unchanged settings to many held-out scenes of both tasks, and an improvement found in one task shall be tested in the other. </w:t>
+        <w:t xml:space="preserve">Do the methods, applied with unchanged settings, improve generalization in unseen scenes and in the other task, and can properties of the shift measured beforehand predict when they do?</w:t>
+      </w:r>
+      <w:r>
+        <w:rPr>
+          <w:rFonts w:cstheme="minorHAnsi"/>
+          <w:lang w:val="en-US"/>
+        </w:rPr>
+        <w:t xml:space="preserve"> </w:t>
       </w:r>
       <w:r>
         <w:rPr>
@@ -4423,7 +4423,7 @@
           <w:rFonts w:cstheme="minorHAnsi"/>
           <w:lang w:val="en-US"/>
         </w:rPr>
-        <w:t xml:space="preserve"> The attribution of the gap from the first question and its localization from the second can be measured in a new scene or task before a method is applied. These measurements predict whether the improvement transfers, also between the tasks, better than simple indicators such as the raw size of the gap or the image-level discrepancy. This prediction will be tested across many held-out scenes of navigation and manipulation.</w:t>
+        <w:t xml:space="preserve"> The attribution of the gap from the first question and its localization from the second, measured in a new scene or task from a reference reconstruction and a few paired views without applying the method, are more strongly rank-correlated across held-out scenes with the gap reduction a method achieves than simple indicators are, such as the base model's gap or the image-level discrepancy. This will be tested on about a hundred held-out navigation scenes with tests for dependent correlations and, exploratively, on the manipulation scenes and between the tasks.</w:t>
       </w:r>
     </w:p>
     <w:permEnd w:id="1295260508"/>
@@ -4716,7 +4716,7 @@
           <w:rFonts w:cstheme="minorHAnsi"/>
           <w:lang w:val="en-US"/>
         </w:rPr>
-        <w:t xml:space="preserve">First, the research is intended to provide a better understanding of which reconstruction errors of a digital twin harm generalization, together with a method that varies the twin accordingly rather than uniformly. Second, it aims to develop a way of finding where inside a deep model the simulation-to-reality gap arises and of reducing it at that stage. Third, it aims to propose a rule for selecting a small amount of real data that corrects both the digital twin and the model. Finally, it will examine when such improvements carry over to unseen environments and between tasks. This knowledge could complement the currently dominant randomization heuristics with more principled and interpretable approaches.</w:t>
+        <w:t xml:space="preserve">First, the research is intended to provide a better understanding of which reconstruction errors of a digital twin harm generalization, together with a method that varies the twin accordingly rather than uniformly. Second, it aims to develop a way of locating the stage of a deep model at which task information available for simulated inputs is lost for real ones, using probes with control tasks and causal interventions, and of reducing the gap by aligning simulated and real representations at that stage. Third, it aims to propose a rule for selecting a small amount of real data that corrects both the digital twin and the model. Finally, it will examine when such improvements carry over to unseen environments and between tasks. This knowledge could complement the currently dominant randomization heuristics with more principled and interpretable approaches.</w:t>
       </w:r>
     </w:p>
     <w:p>
@@ -5008,7 +5008,7 @@
           <w:rFonts w:cstheme="minorHAnsi"/>
           <w:lang w:val="en-US"/>
         </w:rPr>
-        <w:t xml:space="preserve">The research will follow the methods commonly adopted in machine learning and robot learning projects. Since no established theory guarantees generalization from simulation to reality, the dominant part of the work will be empirical. Domain adaptation theory relates the error of a model in reality to its error in simulation and to the discrepancy between the two. It is used as motivation, and the properties of the proposed methods will be analysed theoretically whenever possible.</w:t>
+        <w:t xml:space="preserve">The research will follow the methods commonly adopted in machine learning and robot learning projects. Since no established theory guarantees generalization from simulation to reality, the dominant part of the work will be empirical. Domain adaptation theory relates the error of a model in reality to its error in simulation, the discrepancy between the two distributions and the error of the best model on both. It is used as motivation, and the properties of the proposed methods will be analysed theoretically whenever possible.</w:t>
       </w:r>
     </w:p>
     <w:p>
@@ -5021,7 +5021,7 @@
           <w:rFonts w:cstheme="minorHAnsi"/>
           <w:lang w:val="en-US"/>
         </w:rPr>
-        <w:t xml:space="preserve">The methods will be examined on two physical AI tasks, robot navigation and robotic manipulation, which share the reconstruction tools. Digital twins will be built from real images with neural scene reconstruction, e.g., 3D Gaussian Splatting, and coupled with simulators for navigation (e.g., Habitat) and manipulation (e.g., ManiSkill3). Models that map camera images to actions will be trained or fine-tuned in these simulators, starting from pretrained models where possible.</w:t>
+        <w:t xml:space="preserve">The methods will be examined on two physical AI tasks, robot navigation and robotic manipulation, which share the reconstruction tools. Digital twins will be built from real images with neural scene reconstruction, e.g., 3D Gaussian Splatting [10], and coupled with simulators for navigation (e.g., Habitat) and manipulation (e.g., ManiSkill3). Models that map camera images to actions will be trained or fine-tuned in these simulators, starting from pretrained models where possible.</w:t>
       </w:r>
     </w:p>
     <w:p>
@@ -5047,7 +5047,7 @@
           <w:rFonts w:cstheme="minorHAnsi"/>
           <w:lang w:val="en-US"/>
         </w:rPr>
-        <w:t xml:space="preserve">For the first research question, the research will examine variants of the twin in which one type of reconstruction error is corrected, to attribute the gap to types of error, and will study randomization guided by reconstruction uncertainty and task relevance. For the second question, simple probes on the hidden states of models will show at which stage task information decodable in simulation is lost on real inputs, and alignment at that stage will be compared with alternatives. The third question concerns ways of selecting a small amount of real data used to correct both the twin and the model. For the fourth question, the methods will be applied to held-out scenes of both tasks to check whether the measured attribution and localization predict the improvement better than simple predictors.</w:t>
+        <w:t xml:space="preserve">For the first research question, the research will examine variants of the twin in which one type of reconstruction error is corrected in selected regions using a more accurate reference, e.g., the laser scans of ScanNet++, or injected in a controlled way, to attribute the gap to types of error, and will study randomization of appearance and geometry whose per-region strength follows the estimated reconstruction error and task relevance, compared with uniform randomization of equal total strength. For the second question, linear probes with control tasks, trained on simulated hidden states and tested on paired real ones, will show at which stage task information is lost on real inputs. Causal interventions on hidden states will test whether this information is used, and a paired alignment loss attached at that stage will be compared with the same loss at the input, at the final features, at all stages and at layers chosen by existing criteria. For the third question, rules for selecting a small amount of real data will be compared at equal budgets with random and failure-driven selection. The selected data will refine the reconstruction of the twin and enter the training of the model, and correcting both will be compared with correcting only one. For the fourth question, the methods will be applied to held-out scenes of both tasks to check whether the attribution and localization measured before applying a method predict its gain in each scene better than simple predictors, using rank correlations compared with tests for dependent correlations.</w:t>
       </w:r>
     </w:p>
     <w:p>
@@ -5060,7 +5060,7 @@
           <w:rFonts w:cstheme="minorHAnsi"/>
           <w:lang w:val="en-US"/>
         </w:rPr>
-        <w:t xml:space="preserve">The evaluation will rely on standard metrics, such as success rate, and on the simulation-to-reality gap, measured on held-out scenes in both tasks and complemented where possible by open-loop measures on real frames. Methods will be compared with relevant baselines under comparable training effort and real data. Statistical methods will be used to provide reliable outcomes, including repeated runs over seeds and scenes and statistical tests for comparisons, and ablation studies will determine the contribution of individual components. Data for training, model selection and final evaluation will be kept separate. If access allows, selected results will be validated on a real robot in cooperation with a robotics laboratory of the university.</w:t>
+        <w:t xml:space="preserve">The evaluation will rely on standard metrics, such as success rate, and on the simulation-to-reality gap, i.e., the difference between the performance of the same model in the twin and in reality or its reference, measured per held-out scene in both tasks and complemented where possible by open-loop measures on real frames. Methods will be compared with relevant baselines under comparable training effort and real data. Statistical methods will be used to provide reliable outcomes, including repeated runs over seeds and scenes and statistical tests for comparisons, and ablation studies will determine the contribution of individual components. Data for training, model selection and final evaluation will be kept separate. If access allows, a real robot in a robotics laboratory of the university will be used to check the direction of selected results and the validity of the dataset-based proxy.</w:t>
       </w:r>
     </w:p>
     <w:p>

</xml_diff>

<commit_message>
Wave 28: restyle after the accepted 2025 IPB (first person, one-line schedule, goal+constraints+numbered RQs/hypotheses, practical methods, AI disclosure and bibliography in §12); rephrase passages that overlapped verbatim with the reference plan
Co-Authored-By: Claude Opus 5.5 <noreply@anthropic.com>
</commit_message>
<xml_diff>
--- a/output/IPB_Grzegorz_Piotrowski.docx
+++ b/output/IPB_Grzegorz_Piotrowski.docx
@@ -1796,20 +1796,7 @@
                 <w:rFonts w:cstheme="minorHAnsi"/>
                 <w:lang w:val="en-US"/>
               </w:rPr>
-              <w:t xml:space="preserve">1. Participation in the Doctoral School courses.</w:t>
-            </w:r>
-          </w:p>
-          <w:p>
-            <w:pPr>
-              <w:spacing w:after="40" w:line="240" w:lineRule="auto"/>
-              <w:jc w:val="left"/>
-            </w:pPr>
-            <w:r>
-              <w:rPr>
-                <w:rFonts w:cstheme="minorHAnsi"/>
-                <w:lang w:val="en-US"/>
-              </w:rPr>
-              <w:t xml:space="preserve">2. Getting acquainted with the research carried out in the Department of Artificial Intelligence and choosing the research area together with the supervisor.</w:t>
+              <w:t xml:space="preserve">Doctoral School courses; reading the literature and considering possible research directions</w:t>
             </w:r>
             <w:permEnd w:id="717358524"/>
           </w:p>
@@ -1870,20 +1857,7 @@
                 <w:rFonts w:cstheme="minorHAnsi"/>
                 <w:lang w:val="en-US"/>
               </w:rPr>
-              <w:t xml:space="preserve">1. Participation in the Doctoral School courses.</w:t>
-            </w:r>
-          </w:p>
-          <w:p>
-            <w:pPr>
-              <w:spacing w:after="40" w:line="240" w:lineRule="auto"/>
-              <w:jc w:val="left"/>
-            </w:pPr>
-            <w:r>
-              <w:rPr>
-                <w:rFonts w:cstheme="minorHAnsi"/>
-                <w:lang w:val="en-US"/>
-              </w:rPr>
-              <w:t xml:space="preserve">2. Specifying the topic of the doctoral dissertation and preparing the Individual Research Plan.</w:t>
+              <w:t xml:space="preserve">Doctoral School courses; literature review; choice of the dissertation topic with the supervisor; preparing the Individual Research Plan</w:t>
             </w:r>
             <w:permEnd w:id="1791499248"/>
           </w:p>
@@ -1944,46 +1918,7 @@
                 <w:rFonts w:cstheme="minorHAnsi"/>
                 <w:lang w:val="en-US"/>
               </w:rPr>
-              <w:t xml:space="preserve">1. Literature review covering simulation-to-reality transfer, domain randomization and domain adaptation, neural scene reconstruction from real data (such as 3D Gaussian Splatting) and deep learning for robot navigation and manipulation, including participation in the internal reading group.</w:t>
-            </w:r>
-          </w:p>
-          <w:p>
-            <w:pPr>
-              <w:spacing w:after="40" w:line="240" w:lineRule="auto"/>
-              <w:jc w:val="left"/>
-            </w:pPr>
-            <w:r>
-              <w:rPr>
-                <w:rFonts w:cstheme="minorHAnsi"/>
-                <w:lang w:val="en-US"/>
-              </w:rPr>
-              <w:t xml:space="preserve">2. Identification of the most important research gaps in the generalization of deep learning models trained in simulations built from real data.</w:t>
-            </w:r>
-          </w:p>
-          <w:p>
-            <w:pPr>
-              <w:spacing w:after="40" w:line="240" w:lineRule="auto"/>
-              <w:jc w:val="left"/>
-            </w:pPr>
-            <w:r>
-              <w:rPr>
-                <w:rFonts w:cstheme="minorHAnsi"/>
-                <w:lang w:val="en-US"/>
-              </w:rPr>
-              <w:t xml:space="preserve">3. Preparation of the research environment for robot navigation and robotic manipulation, with shared reconstruction tools and computing resources. For navigation, it includes real scene captures, digital twins in a navigation simulator and a dataset-based proxy that measures the reconstruction-fidelity gap. For manipulation, it includes digital twins of real tabletop scenes built from images of public robot datasets and paired with published real-robot results of the same policies.</w:t>
-            </w:r>
-          </w:p>
-          <w:p>
-            <w:pPr>
-              <w:spacing w:after="40" w:line="240" w:lineRule="auto"/>
-              <w:jc w:val="left"/>
-            </w:pPr>
-            <w:r>
-              <w:rPr>
-                <w:rFonts w:cstheme="minorHAnsi"/>
-                <w:lang w:val="en-US"/>
-              </w:rPr>
-              <w:t xml:space="preserve">4. Starting the research on which reconstruction errors of a digital twin, which vary across a scene, determine the generalization of navigation and manipulation models trained in it.</w:t>
+              <w:t xml:space="preserve">Preparing the research environment (digital twins, simulators, public datasets); initial experiments on harmful reconstruction errors (RQ1)</w:t>
             </w:r>
             <w:permEnd w:id="1413760106"/>
           </w:p>
@@ -2044,72 +1979,7 @@
                 <w:rFonts w:cstheme="minorHAnsi"/>
                 <w:lang w:val="en-US"/>
               </w:rPr>
-              <w:t xml:space="preserve">1. Continuation of the literature review, including participation in the internal reading group that discusses new methods of simulation-to-reality transfer and physical AI.</w:t>
-            </w:r>
-          </w:p>
-          <w:p>
-            <w:pPr>
-              <w:spacing w:after="40" w:line="240" w:lineRule="auto"/>
-              <w:jc w:val="left"/>
-            </w:pPr>
-            <w:r>
-              <w:rPr>
-                <w:rFonts w:cstheme="minorHAnsi"/>
-                <w:lang w:val="en-US"/>
-              </w:rPr>
-              <w:t xml:space="preserve">2. Finishing the research on harmful reconstruction errors in both tasks and on randomizing each region of a digital twin according to its estimated reconstruction error and task relevance.</w:t>
-            </w:r>
-          </w:p>
-          <w:p>
-            <w:pPr>
- 